<commit_message>
Align pipeline stage bars
</commit_message>
<xml_diff>
--- a/MASTER_M1_M2_DELIVERY_CHECKLIST.docx
+++ b/MASTER_M1_M2_DELIVERY_CHECKLIST.docx
@@ -4655,6 +4655,147 @@
         </w:numPr>
       </w:pPr>
       <w:r>
+        <w:t xml:space="preserve">Verified stage colors against</w:t>
+      </w:r>
+      <w:r>
+        <w:t xml:space="preserve"> </w:t>
+      </w:r>
+      <w:r>
+        <w:rPr>
+          <w:rStyle w:val="VerbatimChar"/>
+        </w:rPr>
+        <w:t xml:space="preserve">archive/PIPELINE_AUDIT.md</w:t>
+      </w:r>
+      <w:r>
+        <w:t xml:space="preserve"> </w:t>
+      </w:r>
+      <w:r>
+        <w:t xml:space="preserve">and aligned per-stage</w:t>
+      </w:r>
+      <w:r>
+        <w:t xml:space="preserve"> </w:t>
+      </w:r>
+      <w:r>
+        <w:rPr>
+          <w:rStyle w:val="VerbatimChar"/>
+        </w:rPr>
+        <w:t xml:space="preserve">.col-bar</w:t>
+      </w:r>
+      <w:r>
+        <w:t xml:space="preserve"> </w:t>
+      </w:r>
+      <w:r>
+        <w:t xml:space="preserve">opacity values.</w:t>
+      </w:r>
+    </w:p>
+    <w:p>
+      <w:pPr>
+        <w:pStyle w:val="Compact"/>
+        <w:numPr>
+          <w:ilvl w:val="0"/>
+          <w:numId w:val="1175"/>
+        </w:numPr>
+      </w:pPr>
+      <w:r>
+        <w:t xml:space="preserve">Confirmed</w:t>
+      </w:r>
+      <w:r>
+        <w:t xml:space="preserve"> </w:t>
+      </w:r>
+      <w:r>
+        <w:rPr>
+          <w:rStyle w:val="VerbatimChar"/>
+        </w:rPr>
+        <w:t xml:space="preserve">APPROVED_OFFERS</w:t>
+      </w:r>
+      <w:r>
+        <w:t xml:space="preserve"> </w:t>
+      </w:r>
+      <w:r>
+        <w:t xml:space="preserve">and</w:t>
+      </w:r>
+      <w:r>
+        <w:t xml:space="preserve"> </w:t>
+      </w:r>
+      <w:r>
+        <w:rPr>
+          <w:rStyle w:val="VerbatimChar"/>
+        </w:rPr>
+        <w:t xml:space="preserve">COMMITTED_FUNDING</w:t>
+      </w:r>
+      <w:r>
+        <w:t xml:space="preserve"> </w:t>
+      </w:r>
+      <w:r>
+        <w:t xml:space="preserve">both use active pipeline</w:t>
+      </w:r>
+      <w:r>
+        <w:t xml:space="preserve"> </w:t>
+      </w:r>
+      <w:r>
+        <w:rPr>
+          <w:rStyle w:val="VerbatimChar"/>
+        </w:rPr>
+        <w:t xml:space="preserve">nb-col</w:t>
+      </w:r>
+      <w:r>
+        <w:t xml:space="preserve"> </w:t>
+      </w:r>
+      <w:r>
+        <w:t xml:space="preserve">/</w:t>
+      </w:r>
+      <w:r>
+        <w:t xml:space="preserve"> </w:t>
+      </w:r>
+      <w:r>
+        <w:rPr>
+          <w:rStyle w:val="VerbatimChar"/>
+        </w:rPr>
+        <w:t xml:space="preserve">pipe</w:t>
+      </w:r>
+      <w:r>
+        <w:t xml:space="preserve"> </w:t>
+      </w:r>
+      <w:r>
+        <w:t xml:space="preserve">classes.</w:t>
+      </w:r>
+    </w:p>
+    <w:p>
+      <w:pPr>
+        <w:pStyle w:val="Compact"/>
+        <w:numPr>
+          <w:ilvl w:val="0"/>
+          <w:numId w:val="1176"/>
+        </w:numPr>
+      </w:pPr>
+      <w:r>
+        <w:t xml:space="preserve">Browser computed-style validation passed for all 9 stage bar colors/opacity values, including Committed</w:t>
+      </w:r>
+      <w:r>
+        <w:t xml:space="preserve"> </w:t>
+      </w:r>
+      <w:r>
+        <w:rPr>
+          <w:rStyle w:val="VerbatimChar"/>
+        </w:rPr>
+        <w:t xml:space="preserve">0.85</w:t>
+      </w:r>
+      <w:r>
+        <w:t xml:space="preserve"> </w:t>
+      </w:r>
+      <w:r>
+        <w:t xml:space="preserve">opacity.</w:t>
+      </w:r>
+    </w:p>
+    <w:p>
+      <w:pPr>
+        <w:pStyle w:val="Compact"/>
+        <w:numPr>
+          <w:ilvl w:val="0"/>
+          <w:numId w:val="1177"/>
+        </w:numPr>
+      </w:pPr>
+      <w:r>
         <w:t xml:space="preserve">Verification passed:</w:t>
       </w:r>
       <w:r>
@@ -4690,7 +4831,7 @@
         <w:pStyle w:val="Compact"/>
         <w:numPr>
           <w:ilvl w:val="0"/>
-          <w:numId w:val="1175"/>
+          <w:numId w:val="1178"/>
         </w:numPr>
       </w:pPr>
       <w:r>
@@ -4754,7 +4895,7 @@
         <w:pStyle w:val="Compact"/>
         <w:numPr>
           <w:ilvl w:val="0"/>
-          <w:numId w:val="1176"/>
+          <w:numId w:val="1179"/>
         </w:numPr>
       </w:pPr>
       <w:r>
@@ -4766,7 +4907,7 @@
         <w:pStyle w:val="Compact"/>
         <w:numPr>
           <w:ilvl w:val="1"/>
-          <w:numId w:val="1177"/>
+          <w:numId w:val="1180"/>
         </w:numPr>
       </w:pPr>
       <w:r>
@@ -4778,7 +4919,7 @@
         <w:pStyle w:val="Compact"/>
         <w:numPr>
           <w:ilvl w:val="1"/>
-          <w:numId w:val="1177"/>
+          <w:numId w:val="1180"/>
         </w:numPr>
       </w:pPr>
       <w:r>
@@ -4790,7 +4931,7 @@
         <w:pStyle w:val="Compact"/>
         <w:numPr>
           <w:ilvl w:val="1"/>
-          <w:numId w:val="1177"/>
+          <w:numId w:val="1180"/>
         </w:numPr>
       </w:pPr>
       <w:r>
@@ -4802,7 +4943,7 @@
         <w:pStyle w:val="Compact"/>
         <w:numPr>
           <w:ilvl w:val="1"/>
-          <w:numId w:val="1177"/>
+          <w:numId w:val="1180"/>
         </w:numPr>
       </w:pPr>
       <w:r>
@@ -4814,7 +4955,7 @@
         <w:pStyle w:val="Compact"/>
         <w:numPr>
           <w:ilvl w:val="1"/>
-          <w:numId w:val="1177"/>
+          <w:numId w:val="1180"/>
         </w:numPr>
       </w:pPr>
       <w:r>
@@ -4826,7 +4967,7 @@
         <w:pStyle w:val="Compact"/>
         <w:numPr>
           <w:ilvl w:val="1"/>
-          <w:numId w:val="1177"/>
+          <w:numId w:val="1180"/>
         </w:numPr>
       </w:pPr>
       <w:r>
@@ -4838,7 +4979,7 @@
         <w:pStyle w:val="Compact"/>
         <w:numPr>
           <w:ilvl w:val="1"/>
-          <w:numId w:val="1177"/>
+          <w:numId w:val="1180"/>
         </w:numPr>
       </w:pPr>
       <w:r>
@@ -4850,7 +4991,7 @@
         <w:pStyle w:val="Compact"/>
         <w:numPr>
           <w:ilvl w:val="1"/>
-          <w:numId w:val="1177"/>
+          <w:numId w:val="1180"/>
         </w:numPr>
       </w:pPr>
       <w:r>
@@ -4862,7 +5003,7 @@
         <w:pStyle w:val="Compact"/>
         <w:numPr>
           <w:ilvl w:val="1"/>
-          <w:numId w:val="1177"/>
+          <w:numId w:val="1180"/>
         </w:numPr>
       </w:pPr>
       <w:r>
@@ -4874,7 +5015,7 @@
         <w:pStyle w:val="Compact"/>
         <w:numPr>
           <w:ilvl w:val="0"/>
-          <w:numId w:val="1178"/>
+          <w:numId w:val="1181"/>
         </w:numPr>
       </w:pPr>
       <w:r>
@@ -4886,7 +5027,7 @@
         <w:pStyle w:val="Compact"/>
         <w:numPr>
           <w:ilvl w:val="1"/>
-          <w:numId w:val="1179"/>
+          <w:numId w:val="1182"/>
         </w:numPr>
       </w:pPr>
       <w:r>
@@ -4931,7 +5072,7 @@
         <w:pStyle w:val="Compact"/>
         <w:numPr>
           <w:ilvl w:val="1"/>
-          <w:numId w:val="1179"/>
+          <w:numId w:val="1182"/>
         </w:numPr>
       </w:pPr>
       <w:r>
@@ -4976,7 +5117,7 @@
         <w:pStyle w:val="Compact"/>
         <w:numPr>
           <w:ilvl w:val="1"/>
-          <w:numId w:val="1179"/>
+          <w:numId w:val="1182"/>
         </w:numPr>
       </w:pPr>
       <w:r>
@@ -5021,7 +5162,7 @@
         <w:pStyle w:val="Compact"/>
         <w:numPr>
           <w:ilvl w:val="0"/>
-          <w:numId w:val="1180"/>
+          <w:numId w:val="1183"/>
         </w:numPr>
       </w:pPr>
       <w:r>
@@ -5045,7 +5186,7 @@
         <w:pStyle w:val="Compact"/>
         <w:numPr>
           <w:ilvl w:val="0"/>
-          <w:numId w:val="1181"/>
+          <w:numId w:val="1184"/>
         </w:numPr>
       </w:pPr>
       <w:r>
@@ -5057,7 +5198,7 @@
         <w:pStyle w:val="Compact"/>
         <w:numPr>
           <w:ilvl w:val="0"/>
-          <w:numId w:val="1182"/>
+          <w:numId w:val="1185"/>
         </w:numPr>
       </w:pPr>
       <w:r>
@@ -5099,7 +5240,7 @@
         <w:pStyle w:val="Compact"/>
         <w:numPr>
           <w:ilvl w:val="0"/>
-          <w:numId w:val="1183"/>
+          <w:numId w:val="1186"/>
         </w:numPr>
       </w:pPr>
       <w:r>
@@ -5126,7 +5267,7 @@
         <w:pStyle w:val="Compact"/>
         <w:numPr>
           <w:ilvl w:val="0"/>
-          <w:numId w:val="1184"/>
+          <w:numId w:val="1187"/>
         </w:numPr>
       </w:pPr>
       <w:r>
@@ -5138,7 +5279,7 @@
         <w:pStyle w:val="Compact"/>
         <w:numPr>
           <w:ilvl w:val="0"/>
-          <w:numId w:val="1185"/>
+          <w:numId w:val="1188"/>
         </w:numPr>
       </w:pPr>
       <w:r>
@@ -5150,7 +5291,7 @@
         <w:pStyle w:val="Compact"/>
         <w:numPr>
           <w:ilvl w:val="0"/>
-          <w:numId w:val="1186"/>
+          <w:numId w:val="1189"/>
         </w:numPr>
       </w:pPr>
       <w:r>
@@ -5162,7 +5303,7 @@
         <w:pStyle w:val="Compact"/>
         <w:numPr>
           <w:ilvl w:val="0"/>
-          <w:numId w:val="1187"/>
+          <w:numId w:val="1190"/>
         </w:numPr>
       </w:pPr>
       <w:r>
@@ -5174,7 +5315,7 @@
         <w:pStyle w:val="Compact"/>
         <w:numPr>
           <w:ilvl w:val="0"/>
-          <w:numId w:val="1188"/>
+          <w:numId w:val="1191"/>
         </w:numPr>
       </w:pPr>
       <w:r>
@@ -5186,7 +5327,7 @@
         <w:pStyle w:val="Compact"/>
         <w:numPr>
           <w:ilvl w:val="0"/>
-          <w:numId w:val="1189"/>
+          <w:numId w:val="1192"/>
         </w:numPr>
       </w:pPr>
       <w:r>
@@ -5208,7 +5349,7 @@
         <w:pStyle w:val="Compact"/>
         <w:numPr>
           <w:ilvl w:val="0"/>
-          <w:numId w:val="1190"/>
+          <w:numId w:val="1193"/>
         </w:numPr>
       </w:pPr>
       <w:r>
@@ -5220,7 +5361,7 @@
         <w:pStyle w:val="Compact"/>
         <w:numPr>
           <w:ilvl w:val="0"/>
-          <w:numId w:val="1191"/>
+          <w:numId w:val="1194"/>
         </w:numPr>
       </w:pPr>
       <w:r>
@@ -5232,7 +5373,7 @@
         <w:pStyle w:val="Compact"/>
         <w:numPr>
           <w:ilvl w:val="0"/>
-          <w:numId w:val="1192"/>
+          <w:numId w:val="1195"/>
         </w:numPr>
       </w:pPr>
       <w:r>
@@ -5244,7 +5385,7 @@
         <w:pStyle w:val="Compact"/>
         <w:numPr>
           <w:ilvl w:val="0"/>
-          <w:numId w:val="1193"/>
+          <w:numId w:val="1196"/>
         </w:numPr>
       </w:pPr>
       <w:r>
@@ -5256,7 +5397,7 @@
         <w:pStyle w:val="Compact"/>
         <w:numPr>
           <w:ilvl w:val="0"/>
-          <w:numId w:val="1194"/>
+          <w:numId w:val="1197"/>
         </w:numPr>
       </w:pPr>
       <w:r>
@@ -5268,7 +5409,7 @@
         <w:pStyle w:val="Compact"/>
         <w:numPr>
           <w:ilvl w:val="0"/>
-          <w:numId w:val="1195"/>
+          <w:numId w:val="1198"/>
         </w:numPr>
       </w:pPr>
       <w:r>
@@ -5305,7 +5446,7 @@
         <w:pStyle w:val="Compact"/>
         <w:numPr>
           <w:ilvl w:val="0"/>
-          <w:numId w:val="1196"/>
+          <w:numId w:val="1199"/>
         </w:numPr>
       </w:pPr>
       <w:r>
@@ -5317,7 +5458,7 @@
         <w:pStyle w:val="Compact"/>
         <w:numPr>
           <w:ilvl w:val="0"/>
-          <w:numId w:val="1197"/>
+          <w:numId w:val="1200"/>
         </w:numPr>
       </w:pPr>
       <w:r>
@@ -5329,7 +5470,7 @@
         <w:pStyle w:val="Compact"/>
         <w:numPr>
           <w:ilvl w:val="0"/>
-          <w:numId w:val="1198"/>
+          <w:numId w:val="1201"/>
         </w:numPr>
       </w:pPr>
       <w:r>
@@ -5356,7 +5497,7 @@
         <w:pStyle w:val="Compact"/>
         <w:numPr>
           <w:ilvl w:val="0"/>
-          <w:numId w:val="1199"/>
+          <w:numId w:val="1202"/>
         </w:numPr>
       </w:pPr>
       <w:r>
@@ -5368,7 +5509,7 @@
         <w:pStyle w:val="Compact"/>
         <w:numPr>
           <w:ilvl w:val="0"/>
-          <w:numId w:val="1200"/>
+          <w:numId w:val="1203"/>
         </w:numPr>
       </w:pPr>
       <w:r>
@@ -5380,7 +5521,7 @@
         <w:pStyle w:val="Compact"/>
         <w:numPr>
           <w:ilvl w:val="0"/>
-          <w:numId w:val="1201"/>
+          <w:numId w:val="1204"/>
         </w:numPr>
       </w:pPr>
       <w:r>
@@ -5402,7 +5543,7 @@
         <w:pStyle w:val="Compact"/>
         <w:numPr>
           <w:ilvl w:val="0"/>
-          <w:numId w:val="1202"/>
+          <w:numId w:val="1205"/>
         </w:numPr>
       </w:pPr>
       <w:r>
@@ -5414,7 +5555,7 @@
         <w:pStyle w:val="Compact"/>
         <w:numPr>
           <w:ilvl w:val="0"/>
-          <w:numId w:val="1203"/>
+          <w:numId w:val="1206"/>
         </w:numPr>
       </w:pPr>
       <w:r>
@@ -5426,7 +5567,7 @@
         <w:pStyle w:val="Compact"/>
         <w:numPr>
           <w:ilvl w:val="0"/>
-          <w:numId w:val="1204"/>
+          <w:numId w:val="1207"/>
         </w:numPr>
       </w:pPr>
       <w:r>
@@ -5438,7 +5579,7 @@
         <w:pStyle w:val="Compact"/>
         <w:numPr>
           <w:ilvl w:val="0"/>
-          <w:numId w:val="1205"/>
+          <w:numId w:val="1208"/>
         </w:numPr>
       </w:pPr>
       <w:r>
@@ -5450,7 +5591,7 @@
         <w:pStyle w:val="Compact"/>
         <w:numPr>
           <w:ilvl w:val="0"/>
-          <w:numId w:val="1206"/>
+          <w:numId w:val="1209"/>
         </w:numPr>
       </w:pPr>
       <w:r>
@@ -5462,7 +5603,7 @@
         <w:pStyle w:val="Compact"/>
         <w:numPr>
           <w:ilvl w:val="0"/>
-          <w:numId w:val="1207"/>
+          <w:numId w:val="1210"/>
         </w:numPr>
       </w:pPr>
       <w:r>
@@ -5474,7 +5615,7 @@
         <w:pStyle w:val="Compact"/>
         <w:numPr>
           <w:ilvl w:val="0"/>
-          <w:numId w:val="1208"/>
+          <w:numId w:val="1211"/>
         </w:numPr>
       </w:pPr>
       <w:r>
@@ -5486,7 +5627,7 @@
         <w:pStyle w:val="Compact"/>
         <w:numPr>
           <w:ilvl w:val="0"/>
-          <w:numId w:val="1209"/>
+          <w:numId w:val="1212"/>
         </w:numPr>
       </w:pPr>
       <w:r>
@@ -5498,7 +5639,7 @@
         <w:pStyle w:val="Compact"/>
         <w:numPr>
           <w:ilvl w:val="0"/>
-          <w:numId w:val="1210"/>
+          <w:numId w:val="1213"/>
         </w:numPr>
       </w:pPr>
       <w:r>
@@ -5510,7 +5651,7 @@
         <w:pStyle w:val="Compact"/>
         <w:numPr>
           <w:ilvl w:val="0"/>
-          <w:numId w:val="1211"/>
+          <w:numId w:val="1214"/>
         </w:numPr>
       </w:pPr>
       <w:r>
@@ -5522,7 +5663,7 @@
         <w:pStyle w:val="Compact"/>
         <w:numPr>
           <w:ilvl w:val="0"/>
-          <w:numId w:val="1212"/>
+          <w:numId w:val="1215"/>
         </w:numPr>
       </w:pPr>
       <w:r>
@@ -5554,7 +5695,7 @@
         <w:pStyle w:val="Compact"/>
         <w:numPr>
           <w:ilvl w:val="0"/>
-          <w:numId w:val="1213"/>
+          <w:numId w:val="1216"/>
         </w:numPr>
       </w:pPr>
       <w:r>
@@ -5566,7 +5707,7 @@
         <w:pStyle w:val="Compact"/>
         <w:numPr>
           <w:ilvl w:val="0"/>
-          <w:numId w:val="1214"/>
+          <w:numId w:val="1217"/>
         </w:numPr>
       </w:pPr>
       <w:r>
@@ -5578,7 +5719,7 @@
         <w:pStyle w:val="Compact"/>
         <w:numPr>
           <w:ilvl w:val="0"/>
-          <w:numId w:val="1215"/>
+          <w:numId w:val="1218"/>
         </w:numPr>
       </w:pPr>
       <w:r>
@@ -5590,7 +5731,7 @@
         <w:pStyle w:val="Compact"/>
         <w:numPr>
           <w:ilvl w:val="0"/>
-          <w:numId w:val="1216"/>
+          <w:numId w:val="1219"/>
         </w:numPr>
       </w:pPr>
       <w:r>
@@ -5617,7 +5758,7 @@
         <w:pStyle w:val="Compact"/>
         <w:numPr>
           <w:ilvl w:val="0"/>
-          <w:numId w:val="1217"/>
+          <w:numId w:val="1220"/>
         </w:numPr>
       </w:pPr>
       <w:r>
@@ -5629,7 +5770,7 @@
         <w:pStyle w:val="Compact"/>
         <w:numPr>
           <w:ilvl w:val="0"/>
-          <w:numId w:val="1218"/>
+          <w:numId w:val="1221"/>
         </w:numPr>
       </w:pPr>
       <w:r>
@@ -5641,7 +5782,7 @@
         <w:pStyle w:val="Compact"/>
         <w:numPr>
           <w:ilvl w:val="1"/>
-          <w:numId w:val="1219"/>
+          <w:numId w:val="1222"/>
         </w:numPr>
       </w:pPr>
       <w:r>
@@ -5653,7 +5794,7 @@
         <w:pStyle w:val="Compact"/>
         <w:numPr>
           <w:ilvl w:val="1"/>
-          <w:numId w:val="1219"/>
+          <w:numId w:val="1222"/>
         </w:numPr>
       </w:pPr>
       <w:r>
@@ -5677,7 +5818,7 @@
         <w:pStyle w:val="Compact"/>
         <w:numPr>
           <w:ilvl w:val="0"/>
-          <w:numId w:val="1220"/>
+          <w:numId w:val="1223"/>
         </w:numPr>
       </w:pPr>
       <w:r>
@@ -5689,7 +5830,7 @@
         <w:pStyle w:val="Compact"/>
         <w:numPr>
           <w:ilvl w:val="0"/>
-          <w:numId w:val="1221"/>
+          <w:numId w:val="1224"/>
         </w:numPr>
       </w:pPr>
       <w:r>
@@ -5701,7 +5842,7 @@
         <w:pStyle w:val="Compact"/>
         <w:numPr>
           <w:ilvl w:val="0"/>
-          <w:numId w:val="1222"/>
+          <w:numId w:val="1225"/>
         </w:numPr>
       </w:pPr>
       <w:r>
@@ -5713,7 +5854,7 @@
         <w:pStyle w:val="Compact"/>
         <w:numPr>
           <w:ilvl w:val="0"/>
-          <w:numId w:val="1223"/>
+          <w:numId w:val="1226"/>
         </w:numPr>
       </w:pPr>
       <w:r>
@@ -5725,7 +5866,7 @@
         <w:pStyle w:val="Compact"/>
         <w:numPr>
           <w:ilvl w:val="0"/>
-          <w:numId w:val="1224"/>
+          <w:numId w:val="1227"/>
         </w:numPr>
       </w:pPr>
       <w:r>
@@ -5737,7 +5878,7 @@
         <w:pStyle w:val="Compact"/>
         <w:numPr>
           <w:ilvl w:val="0"/>
-          <w:numId w:val="1225"/>
+          <w:numId w:val="1228"/>
         </w:numPr>
       </w:pPr>
       <w:r>
@@ -5759,7 +5900,7 @@
         <w:pStyle w:val="Compact"/>
         <w:numPr>
           <w:ilvl w:val="0"/>
-          <w:numId w:val="1226"/>
+          <w:numId w:val="1229"/>
         </w:numPr>
       </w:pPr>
       <w:r>
@@ -5771,7 +5912,7 @@
         <w:pStyle w:val="Compact"/>
         <w:numPr>
           <w:ilvl w:val="0"/>
-          <w:numId w:val="1227"/>
+          <w:numId w:val="1230"/>
         </w:numPr>
       </w:pPr>
       <w:r>
@@ -5783,7 +5924,7 @@
         <w:pStyle w:val="Compact"/>
         <w:numPr>
           <w:ilvl w:val="0"/>
-          <w:numId w:val="1228"/>
+          <w:numId w:val="1231"/>
         </w:numPr>
       </w:pPr>
       <w:r>
@@ -5795,7 +5936,7 @@
         <w:pStyle w:val="Compact"/>
         <w:numPr>
           <w:ilvl w:val="0"/>
-          <w:numId w:val="1229"/>
+          <w:numId w:val="1232"/>
         </w:numPr>
       </w:pPr>
       <w:r>
@@ -5807,7 +5948,7 @@
         <w:pStyle w:val="Compact"/>
         <w:numPr>
           <w:ilvl w:val="0"/>
-          <w:numId w:val="1230"/>
+          <w:numId w:val="1233"/>
         </w:numPr>
       </w:pPr>
       <w:r>
@@ -5819,7 +5960,7 @@
         <w:pStyle w:val="Compact"/>
         <w:numPr>
           <w:ilvl w:val="0"/>
-          <w:numId w:val="1231"/>
+          <w:numId w:val="1234"/>
         </w:numPr>
       </w:pPr>
       <w:r>
@@ -5831,7 +5972,7 @@
         <w:pStyle w:val="Compact"/>
         <w:numPr>
           <w:ilvl w:val="0"/>
-          <w:numId w:val="1232"/>
+          <w:numId w:val="1235"/>
         </w:numPr>
       </w:pPr>
       <w:r>
@@ -5843,7 +5984,7 @@
         <w:pStyle w:val="Compact"/>
         <w:numPr>
           <w:ilvl w:val="0"/>
-          <w:numId w:val="1233"/>
+          <w:numId w:val="1236"/>
         </w:numPr>
       </w:pPr>
       <w:r>
@@ -5855,7 +5996,7 @@
         <w:pStyle w:val="Compact"/>
         <w:numPr>
           <w:ilvl w:val="0"/>
-          <w:numId w:val="1234"/>
+          <w:numId w:val="1237"/>
         </w:numPr>
       </w:pPr>
       <w:r>
@@ -5867,7 +6008,7 @@
         <w:pStyle w:val="Compact"/>
         <w:numPr>
           <w:ilvl w:val="0"/>
-          <w:numId w:val="1235"/>
+          <w:numId w:val="1238"/>
         </w:numPr>
       </w:pPr>
       <w:r>
@@ -5879,7 +6020,7 @@
         <w:pStyle w:val="Compact"/>
         <w:numPr>
           <w:ilvl w:val="0"/>
-          <w:numId w:val="1236"/>
+          <w:numId w:val="1239"/>
         </w:numPr>
       </w:pPr>
       <w:r>
@@ -5901,7 +6042,7 @@
         <w:pStyle w:val="Compact"/>
         <w:numPr>
           <w:ilvl w:val="0"/>
-          <w:numId w:val="1237"/>
+          <w:numId w:val="1240"/>
         </w:numPr>
       </w:pPr>
       <w:r>
@@ -5913,7 +6054,7 @@
         <w:pStyle w:val="Compact"/>
         <w:numPr>
           <w:ilvl w:val="0"/>
-          <w:numId w:val="1238"/>
+          <w:numId w:val="1241"/>
         </w:numPr>
       </w:pPr>
       <w:r>
@@ -5925,7 +6066,7 @@
         <w:pStyle w:val="Compact"/>
         <w:numPr>
           <w:ilvl w:val="0"/>
-          <w:numId w:val="1239"/>
+          <w:numId w:val="1242"/>
         </w:numPr>
       </w:pPr>
       <w:r>
@@ -5937,7 +6078,7 @@
         <w:pStyle w:val="Compact"/>
         <w:numPr>
           <w:ilvl w:val="0"/>
-          <w:numId w:val="1240"/>
+          <w:numId w:val="1243"/>
         </w:numPr>
       </w:pPr>
       <w:r>
@@ -5949,7 +6090,7 @@
         <w:pStyle w:val="Compact"/>
         <w:numPr>
           <w:ilvl w:val="0"/>
-          <w:numId w:val="1241"/>
+          <w:numId w:val="1244"/>
         </w:numPr>
       </w:pPr>
       <w:r>
@@ -5961,7 +6102,7 @@
         <w:pStyle w:val="Compact"/>
         <w:numPr>
           <w:ilvl w:val="0"/>
-          <w:numId w:val="1242"/>
+          <w:numId w:val="1245"/>
         </w:numPr>
       </w:pPr>
       <w:r>
@@ -5973,7 +6114,7 @@
         <w:pStyle w:val="Compact"/>
         <w:numPr>
           <w:ilvl w:val="0"/>
-          <w:numId w:val="1243"/>
+          <w:numId w:val="1246"/>
         </w:numPr>
       </w:pPr>
       <w:r>
@@ -5985,7 +6126,7 @@
         <w:pStyle w:val="Compact"/>
         <w:numPr>
           <w:ilvl w:val="0"/>
-          <w:numId w:val="1244"/>
+          <w:numId w:val="1247"/>
         </w:numPr>
       </w:pPr>
       <w:r>
@@ -5997,7 +6138,7 @@
         <w:pStyle w:val="Compact"/>
         <w:numPr>
           <w:ilvl w:val="0"/>
-          <w:numId w:val="1245"/>
+          <w:numId w:val="1248"/>
         </w:numPr>
       </w:pPr>
       <w:r>
@@ -6031,7 +6172,7 @@
         <w:pStyle w:val="Compact"/>
         <w:numPr>
           <w:ilvl w:val="0"/>
-          <w:numId w:val="1246"/>
+          <w:numId w:val="1249"/>
         </w:numPr>
       </w:pPr>
       <w:r>
@@ -6043,7 +6184,7 @@
         <w:pStyle w:val="Compact"/>
         <w:numPr>
           <w:ilvl w:val="0"/>
-          <w:numId w:val="1247"/>
+          <w:numId w:val="1250"/>
         </w:numPr>
       </w:pPr>
       <w:r>
@@ -6055,7 +6196,7 @@
         <w:pStyle w:val="Compact"/>
         <w:numPr>
           <w:ilvl w:val="0"/>
-          <w:numId w:val="1248"/>
+          <w:numId w:val="1251"/>
         </w:numPr>
       </w:pPr>
       <w:r>
@@ -6067,7 +6208,7 @@
         <w:pStyle w:val="Compact"/>
         <w:numPr>
           <w:ilvl w:val="0"/>
-          <w:numId w:val="1249"/>
+          <w:numId w:val="1252"/>
         </w:numPr>
       </w:pPr>
       <w:r>
@@ -6079,7 +6220,7 @@
         <w:pStyle w:val="Compact"/>
         <w:numPr>
           <w:ilvl w:val="0"/>
-          <w:numId w:val="1250"/>
+          <w:numId w:val="1253"/>
         </w:numPr>
       </w:pPr>
       <w:r>
@@ -6091,7 +6232,7 @@
         <w:pStyle w:val="Compact"/>
         <w:numPr>
           <w:ilvl w:val="0"/>
-          <w:numId w:val="1251"/>
+          <w:numId w:val="1254"/>
         </w:numPr>
       </w:pPr>
       <w:r>
@@ -6103,7 +6244,7 @@
         <w:pStyle w:val="Compact"/>
         <w:numPr>
           <w:ilvl w:val="0"/>
-          <w:numId w:val="1252"/>
+          <w:numId w:val="1255"/>
         </w:numPr>
       </w:pPr>
       <w:r>
@@ -6115,7 +6256,7 @@
         <w:pStyle w:val="Compact"/>
         <w:numPr>
           <w:ilvl w:val="0"/>
-          <w:numId w:val="1253"/>
+          <w:numId w:val="1256"/>
         </w:numPr>
       </w:pPr>
       <w:r>
@@ -6127,7 +6268,7 @@
         <w:pStyle w:val="Compact"/>
         <w:numPr>
           <w:ilvl w:val="0"/>
-          <w:numId w:val="1254"/>
+          <w:numId w:val="1257"/>
         </w:numPr>
       </w:pPr>
       <w:r>
@@ -6159,7 +6300,7 @@
         <w:pStyle w:val="Compact"/>
         <w:numPr>
           <w:ilvl w:val="0"/>
-          <w:numId w:val="1255"/>
+          <w:numId w:val="1258"/>
         </w:numPr>
       </w:pPr>
       <w:r>
@@ -6201,7 +6342,7 @@
         <w:pStyle w:val="Compact"/>
         <w:numPr>
           <w:ilvl w:val="0"/>
-          <w:numId w:val="1256"/>
+          <w:numId w:val="1259"/>
         </w:numPr>
       </w:pPr>
       <w:r>
@@ -6264,7 +6405,7 @@
         <w:pStyle w:val="Compact"/>
         <w:numPr>
           <w:ilvl w:val="0"/>
-          <w:numId w:val="1257"/>
+          <w:numId w:val="1260"/>
         </w:numPr>
       </w:pPr>
       <w:r>
@@ -6276,7 +6417,7 @@
         <w:pStyle w:val="Compact"/>
         <w:numPr>
           <w:ilvl w:val="0"/>
-          <w:numId w:val="1258"/>
+          <w:numId w:val="1261"/>
         </w:numPr>
       </w:pPr>
       <w:r>
@@ -6351,7 +6492,7 @@
         <w:pStyle w:val="Compact"/>
         <w:numPr>
           <w:ilvl w:val="0"/>
-          <w:numId w:val="1259"/>
+          <w:numId w:val="1262"/>
         </w:numPr>
       </w:pPr>
       <w:r>
@@ -6378,7 +6519,7 @@
         <w:pStyle w:val="Compact"/>
         <w:numPr>
           <w:ilvl w:val="0"/>
-          <w:numId w:val="1260"/>
+          <w:numId w:val="1263"/>
         </w:numPr>
       </w:pPr>
       <w:r>
@@ -6432,7 +6573,7 @@
         <w:pStyle w:val="Compact"/>
         <w:numPr>
           <w:ilvl w:val="0"/>
-          <w:numId w:val="1261"/>
+          <w:numId w:val="1264"/>
         </w:numPr>
       </w:pPr>
       <w:r>
@@ -6444,7 +6585,7 @@
         <w:pStyle w:val="Compact"/>
         <w:numPr>
           <w:ilvl w:val="0"/>
-          <w:numId w:val="1262"/>
+          <w:numId w:val="1265"/>
         </w:numPr>
       </w:pPr>
       <w:r>
@@ -6504,7 +6645,7 @@
         <w:pStyle w:val="Compact"/>
         <w:numPr>
           <w:ilvl w:val="0"/>
-          <w:numId w:val="1263"/>
+          <w:numId w:val="1266"/>
         </w:numPr>
       </w:pPr>
       <w:r>
@@ -6550,7 +6691,7 @@
         <w:pStyle w:val="Compact"/>
         <w:numPr>
           <w:ilvl w:val="0"/>
-          <w:numId w:val="1264"/>
+          <w:numId w:val="1267"/>
         </w:numPr>
       </w:pPr>
       <w:r>
@@ -6574,7 +6715,7 @@
         <w:pStyle w:val="Compact"/>
         <w:numPr>
           <w:ilvl w:val="0"/>
-          <w:numId w:val="1265"/>
+          <w:numId w:val="1268"/>
         </w:numPr>
       </w:pPr>
       <w:r>
@@ -6598,7 +6739,7 @@
         <w:pStyle w:val="Compact"/>
         <w:numPr>
           <w:ilvl w:val="0"/>
-          <w:numId w:val="1266"/>
+          <w:numId w:val="1269"/>
         </w:numPr>
       </w:pPr>
       <w:r>
@@ -6625,7 +6766,7 @@
         <w:pStyle w:val="Compact"/>
         <w:numPr>
           <w:ilvl w:val="0"/>
-          <w:numId w:val="1267"/>
+          <w:numId w:val="1270"/>
         </w:numPr>
       </w:pPr>
       <w:r>
@@ -6649,7 +6790,7 @@
         <w:pStyle w:val="Compact"/>
         <w:numPr>
           <w:ilvl w:val="0"/>
-          <w:numId w:val="1268"/>
+          <w:numId w:val="1271"/>
         </w:numPr>
       </w:pPr>
       <w:r>
@@ -6661,7 +6802,7 @@
         <w:pStyle w:val="Compact"/>
         <w:numPr>
           <w:ilvl w:val="0"/>
-          <w:numId w:val="1269"/>
+          <w:numId w:val="1272"/>
         </w:numPr>
       </w:pPr>
       <w:r>
@@ -6688,7 +6829,7 @@
         <w:pStyle w:val="Compact"/>
         <w:numPr>
           <w:ilvl w:val="0"/>
-          <w:numId w:val="1270"/>
+          <w:numId w:val="1273"/>
         </w:numPr>
       </w:pPr>
       <w:r>
@@ -6700,7 +6841,7 @@
         <w:pStyle w:val="Compact"/>
         <w:numPr>
           <w:ilvl w:val="1"/>
-          <w:numId w:val="1271"/>
+          <w:numId w:val="1274"/>
         </w:numPr>
       </w:pPr>
       <w:r>
@@ -6718,7 +6859,7 @@
         <w:pStyle w:val="Compact"/>
         <w:numPr>
           <w:ilvl w:val="1"/>
-          <w:numId w:val="1271"/>
+          <w:numId w:val="1274"/>
         </w:numPr>
       </w:pPr>
       <w:r>
@@ -6736,7 +6877,7 @@
         <w:pStyle w:val="Compact"/>
         <w:numPr>
           <w:ilvl w:val="0"/>
-          <w:numId w:val="1272"/>
+          <w:numId w:val="1275"/>
         </w:numPr>
       </w:pPr>
       <w:r>
@@ -6763,7 +6904,7 @@
         <w:pStyle w:val="Compact"/>
         <w:numPr>
           <w:ilvl w:val="0"/>
-          <w:numId w:val="1273"/>
+          <w:numId w:val="1276"/>
         </w:numPr>
       </w:pPr>
       <w:r>
@@ -6790,7 +6931,7 @@
         <w:pStyle w:val="Compact"/>
         <w:numPr>
           <w:ilvl w:val="0"/>
-          <w:numId w:val="1274"/>
+          <w:numId w:val="1277"/>
         </w:numPr>
       </w:pPr>
       <w:r>
@@ -6817,7 +6958,7 @@
         <w:pStyle w:val="Compact"/>
         <w:numPr>
           <w:ilvl w:val="0"/>
-          <w:numId w:val="1275"/>
+          <w:numId w:val="1278"/>
         </w:numPr>
       </w:pPr>
       <w:r>
@@ -6829,7 +6970,7 @@
         <w:pStyle w:val="Compact"/>
         <w:numPr>
           <w:ilvl w:val="0"/>
-          <w:numId w:val="1276"/>
+          <w:numId w:val="1279"/>
         </w:numPr>
       </w:pPr>
       <w:r>
@@ -6841,7 +6982,7 @@
         <w:pStyle w:val="Compact"/>
         <w:numPr>
           <w:ilvl w:val="0"/>
-          <w:numId w:val="1277"/>
+          <w:numId w:val="1280"/>
         </w:numPr>
       </w:pPr>
       <w:r>
@@ -6863,7 +7004,7 @@
         <w:pStyle w:val="Compact"/>
         <w:numPr>
           <w:ilvl w:val="0"/>
-          <w:numId w:val="1278"/>
+          <w:numId w:val="1281"/>
         </w:numPr>
       </w:pPr>
       <w:r>
@@ -6887,7 +7028,7 @@
         <w:pStyle w:val="Compact"/>
         <w:numPr>
           <w:ilvl w:val="0"/>
-          <w:numId w:val="1279"/>
+          <w:numId w:val="1282"/>
         </w:numPr>
       </w:pPr>
       <w:r>
@@ -6911,7 +7052,7 @@
         <w:pStyle w:val="Compact"/>
         <w:numPr>
           <w:ilvl w:val="0"/>
-          <w:numId w:val="1280"/>
+          <w:numId w:val="1283"/>
         </w:numPr>
       </w:pPr>
       <w:r>
@@ -6923,7 +7064,7 @@
         <w:pStyle w:val="Compact"/>
         <w:numPr>
           <w:ilvl w:val="0"/>
-          <w:numId w:val="1281"/>
+          <w:numId w:val="1284"/>
         </w:numPr>
       </w:pPr>
       <w:r>
@@ -6959,7 +7100,7 @@
         <w:pStyle w:val="Compact"/>
         <w:numPr>
           <w:ilvl w:val="0"/>
-          <w:numId w:val="1282"/>
+          <w:numId w:val="1285"/>
         </w:numPr>
       </w:pPr>
       <w:r>
@@ -6986,7 +7127,7 @@
         <w:pStyle w:val="Compact"/>
         <w:numPr>
           <w:ilvl w:val="0"/>
-          <w:numId w:val="1283"/>
+          <w:numId w:val="1286"/>
         </w:numPr>
       </w:pPr>
       <w:r>
@@ -7008,7 +7149,7 @@
         <w:pStyle w:val="Compact"/>
         <w:numPr>
           <w:ilvl w:val="0"/>
-          <w:numId w:val="1284"/>
+          <w:numId w:val="1287"/>
         </w:numPr>
       </w:pPr>
       <w:r>
@@ -7035,7 +7176,7 @@
         <w:pStyle w:val="Compact"/>
         <w:numPr>
           <w:ilvl w:val="0"/>
-          <w:numId w:val="1285"/>
+          <w:numId w:val="1288"/>
         </w:numPr>
       </w:pPr>
       <w:r>
@@ -7062,7 +7203,7 @@
         <w:pStyle w:val="Compact"/>
         <w:numPr>
           <w:ilvl w:val="0"/>
-          <w:numId w:val="1286"/>
+          <w:numId w:val="1289"/>
         </w:numPr>
       </w:pPr>
       <w:r>
@@ -7089,7 +7230,7 @@
         <w:pStyle w:val="Compact"/>
         <w:numPr>
           <w:ilvl w:val="0"/>
-          <w:numId w:val="1287"/>
+          <w:numId w:val="1290"/>
         </w:numPr>
       </w:pPr>
       <w:r>
@@ -7101,7 +7242,7 @@
         <w:pStyle w:val="Compact"/>
         <w:numPr>
           <w:ilvl w:val="0"/>
-          <w:numId w:val="1288"/>
+          <w:numId w:val="1291"/>
         </w:numPr>
       </w:pPr>
       <w:r>
@@ -7113,7 +7254,7 @@
         <w:pStyle w:val="Compact"/>
         <w:numPr>
           <w:ilvl w:val="0"/>
-          <w:numId w:val="1289"/>
+          <w:numId w:val="1292"/>
         </w:numPr>
       </w:pPr>
       <w:r>
@@ -7125,7 +7266,7 @@
         <w:pStyle w:val="Compact"/>
         <w:numPr>
           <w:ilvl w:val="0"/>
-          <w:numId w:val="1290"/>
+          <w:numId w:val="1293"/>
         </w:numPr>
       </w:pPr>
       <w:r>
@@ -7137,7 +7278,7 @@
         <w:pStyle w:val="Compact"/>
         <w:numPr>
           <w:ilvl w:val="0"/>
-          <w:numId w:val="1291"/>
+          <w:numId w:val="1294"/>
         </w:numPr>
       </w:pPr>
       <w:r>
@@ -7149,7 +7290,7 @@
         <w:pStyle w:val="Compact"/>
         <w:numPr>
           <w:ilvl w:val="0"/>
-          <w:numId w:val="1292"/>
+          <w:numId w:val="1295"/>
         </w:numPr>
       </w:pPr>
       <w:r>
@@ -7201,7 +7342,7 @@
         <w:pStyle w:val="Compact"/>
         <w:numPr>
           <w:ilvl w:val="0"/>
-          <w:numId w:val="1293"/>
+          <w:numId w:val="1296"/>
         </w:numPr>
       </w:pPr>
       <w:r>
@@ -7240,7 +7381,7 @@
         <w:pStyle w:val="Compact"/>
         <w:numPr>
           <w:ilvl w:val="0"/>
-          <w:numId w:val="1294"/>
+          <w:numId w:val="1297"/>
         </w:numPr>
       </w:pPr>
       <w:r>
@@ -7252,7 +7393,7 @@
         <w:pStyle w:val="Compact"/>
         <w:numPr>
           <w:ilvl w:val="0"/>
-          <w:numId w:val="1295"/>
+          <w:numId w:val="1298"/>
         </w:numPr>
       </w:pPr>
       <w:r>
@@ -7264,7 +7405,7 @@
         <w:pStyle w:val="Compact"/>
         <w:numPr>
           <w:ilvl w:val="0"/>
-          <w:numId w:val="1296"/>
+          <w:numId w:val="1299"/>
         </w:numPr>
       </w:pPr>
       <w:r>
@@ -7276,7 +7417,7 @@
         <w:pStyle w:val="Compact"/>
         <w:numPr>
           <w:ilvl w:val="0"/>
-          <w:numId w:val="1297"/>
+          <w:numId w:val="1300"/>
         </w:numPr>
       </w:pPr>
       <w:r>
@@ -7288,7 +7429,7 @@
         <w:pStyle w:val="Compact"/>
         <w:numPr>
           <w:ilvl w:val="0"/>
-          <w:numId w:val="1298"/>
+          <w:numId w:val="1301"/>
         </w:numPr>
       </w:pPr>
       <w:r>
@@ -7300,7 +7441,7 @@
         <w:pStyle w:val="Compact"/>
         <w:numPr>
           <w:ilvl w:val="1"/>
-          <w:numId w:val="1299"/>
+          <w:numId w:val="1302"/>
         </w:numPr>
       </w:pPr>
       <w:r>
@@ -7333,7 +7474,7 @@
         <w:pStyle w:val="Compact"/>
         <w:numPr>
           <w:ilvl w:val="1"/>
-          <w:numId w:val="1299"/>
+          <w:numId w:val="1302"/>
         </w:numPr>
       </w:pPr>
       <w:r>
@@ -7366,7 +7507,7 @@
         <w:pStyle w:val="Compact"/>
         <w:numPr>
           <w:ilvl w:val="1"/>
-          <w:numId w:val="1299"/>
+          <w:numId w:val="1302"/>
         </w:numPr>
       </w:pPr>
       <w:r>
@@ -7399,7 +7540,7 @@
         <w:pStyle w:val="Compact"/>
         <w:numPr>
           <w:ilvl w:val="1"/>
-          <w:numId w:val="1299"/>
+          <w:numId w:val="1302"/>
         </w:numPr>
       </w:pPr>
       <w:r>
@@ -7432,7 +7573,7 @@
         <w:pStyle w:val="Compact"/>
         <w:numPr>
           <w:ilvl w:val="1"/>
-          <w:numId w:val="1299"/>
+          <w:numId w:val="1302"/>
         </w:numPr>
       </w:pPr>
       <w:r>
@@ -7465,7 +7606,7 @@
         <w:pStyle w:val="Compact"/>
         <w:numPr>
           <w:ilvl w:val="0"/>
-          <w:numId w:val="1300"/>
+          <w:numId w:val="1303"/>
         </w:numPr>
       </w:pPr>
       <w:r>
@@ -7519,7 +7660,7 @@
         <w:pStyle w:val="Compact"/>
         <w:numPr>
           <w:ilvl w:val="0"/>
-          <w:numId w:val="1301"/>
+          <w:numId w:val="1304"/>
         </w:numPr>
       </w:pPr>
       <w:r>
@@ -7531,7 +7672,7 @@
         <w:pStyle w:val="Compact"/>
         <w:numPr>
           <w:ilvl w:val="0"/>
-          <w:numId w:val="1302"/>
+          <w:numId w:val="1305"/>
         </w:numPr>
       </w:pPr>
       <w:r>
@@ -7543,7 +7684,7 @@
         <w:pStyle w:val="Compact"/>
         <w:numPr>
           <w:ilvl w:val="0"/>
-          <w:numId w:val="1303"/>
+          <w:numId w:val="1306"/>
         </w:numPr>
       </w:pPr>
       <w:r>
@@ -7555,7 +7696,7 @@
         <w:pStyle w:val="Compact"/>
         <w:numPr>
           <w:ilvl w:val="0"/>
-          <w:numId w:val="1304"/>
+          <w:numId w:val="1307"/>
         </w:numPr>
       </w:pPr>
       <w:r>
@@ -7567,7 +7708,7 @@
         <w:pStyle w:val="Compact"/>
         <w:numPr>
           <w:ilvl w:val="0"/>
-          <w:numId w:val="1305"/>
+          <w:numId w:val="1308"/>
         </w:numPr>
       </w:pPr>
       <w:r>
@@ -7589,7 +7730,7 @@
         <w:pStyle w:val="Compact"/>
         <w:numPr>
           <w:ilvl w:val="0"/>
-          <w:numId w:val="1306"/>
+          <w:numId w:val="1309"/>
         </w:numPr>
       </w:pPr>
       <w:r>
@@ -7601,7 +7742,7 @@
         <w:pStyle w:val="Compact"/>
         <w:numPr>
           <w:ilvl w:val="0"/>
-          <w:numId w:val="1307"/>
+          <w:numId w:val="1310"/>
         </w:numPr>
       </w:pPr>
       <w:r>
@@ -7613,7 +7754,7 @@
         <w:pStyle w:val="Compact"/>
         <w:numPr>
           <w:ilvl w:val="0"/>
-          <w:numId w:val="1308"/>
+          <w:numId w:val="1311"/>
         </w:numPr>
       </w:pPr>
       <w:r>
@@ -7625,7 +7766,7 @@
         <w:pStyle w:val="Compact"/>
         <w:numPr>
           <w:ilvl w:val="0"/>
-          <w:numId w:val="1309"/>
+          <w:numId w:val="1312"/>
         </w:numPr>
       </w:pPr>
       <w:r>
@@ -7637,7 +7778,7 @@
         <w:pStyle w:val="Compact"/>
         <w:numPr>
           <w:ilvl w:val="0"/>
-          <w:numId w:val="1310"/>
+          <w:numId w:val="1313"/>
         </w:numPr>
       </w:pPr>
       <w:r>
@@ -7649,7 +7790,7 @@
         <w:pStyle w:val="Compact"/>
         <w:numPr>
           <w:ilvl w:val="0"/>
-          <w:numId w:val="1311"/>
+          <w:numId w:val="1314"/>
         </w:numPr>
       </w:pPr>
       <w:r>
@@ -7661,7 +7802,7 @@
         <w:pStyle w:val="Compact"/>
         <w:numPr>
           <w:ilvl w:val="0"/>
-          <w:numId w:val="1312"/>
+          <w:numId w:val="1315"/>
         </w:numPr>
       </w:pPr>
       <w:r>
@@ -7673,7 +7814,7 @@
         <w:pStyle w:val="Compact"/>
         <w:numPr>
           <w:ilvl w:val="0"/>
-          <w:numId w:val="1313"/>
+          <w:numId w:val="1316"/>
         </w:numPr>
       </w:pPr>
       <w:r>
@@ -7685,7 +7826,7 @@
         <w:pStyle w:val="Compact"/>
         <w:numPr>
           <w:ilvl w:val="0"/>
-          <w:numId w:val="1314"/>
+          <w:numId w:val="1317"/>
         </w:numPr>
       </w:pPr>
       <w:r>
@@ -7697,7 +7838,7 @@
         <w:pStyle w:val="Compact"/>
         <w:numPr>
           <w:ilvl w:val="0"/>
-          <w:numId w:val="1315"/>
+          <w:numId w:val="1318"/>
         </w:numPr>
       </w:pPr>
       <w:r>
@@ -7709,7 +7850,7 @@
         <w:pStyle w:val="Compact"/>
         <w:numPr>
           <w:ilvl w:val="0"/>
-          <w:numId w:val="1316"/>
+          <w:numId w:val="1319"/>
         </w:numPr>
       </w:pPr>
       <w:r>
@@ -7736,7 +7877,7 @@
         <w:pStyle w:val="Compact"/>
         <w:numPr>
           <w:ilvl w:val="0"/>
-          <w:numId w:val="1317"/>
+          <w:numId w:val="1320"/>
         </w:numPr>
       </w:pPr>
       <w:r>
@@ -7768,7 +7909,7 @@
         <w:pStyle w:val="Compact"/>
         <w:numPr>
           <w:ilvl w:val="0"/>
-          <w:numId w:val="1318"/>
+          <w:numId w:val="1321"/>
         </w:numPr>
       </w:pPr>
       <w:r>
@@ -7807,7 +7948,7 @@
         <w:pStyle w:val="Compact"/>
         <w:numPr>
           <w:ilvl w:val="0"/>
-          <w:numId w:val="1319"/>
+          <w:numId w:val="1322"/>
         </w:numPr>
       </w:pPr>
       <w:r>
@@ -7846,7 +7987,7 @@
         <w:pStyle w:val="Compact"/>
         <w:numPr>
           <w:ilvl w:val="0"/>
-          <w:numId w:val="1320"/>
+          <w:numId w:val="1323"/>
         </w:numPr>
       </w:pPr>
       <w:r>
@@ -7870,7 +8011,7 @@
         <w:pStyle w:val="Compact"/>
         <w:numPr>
           <w:ilvl w:val="0"/>
-          <w:numId w:val="1321"/>
+          <w:numId w:val="1324"/>
         </w:numPr>
       </w:pPr>
       <w:r>
@@ -7927,7 +8068,7 @@
         <w:pStyle w:val="Compact"/>
         <w:numPr>
           <w:ilvl w:val="0"/>
-          <w:numId w:val="1322"/>
+          <w:numId w:val="1325"/>
         </w:numPr>
       </w:pPr>
       <w:r>
@@ -7951,7 +8092,7 @@
         <w:pStyle w:val="Compact"/>
         <w:numPr>
           <w:ilvl w:val="0"/>
-          <w:numId w:val="1323"/>
+          <w:numId w:val="1326"/>
         </w:numPr>
       </w:pPr>
       <w:r>
@@ -7963,7 +8104,7 @@
         <w:pStyle w:val="Compact"/>
         <w:numPr>
           <w:ilvl w:val="1"/>
-          <w:numId w:val="1324"/>
+          <w:numId w:val="1327"/>
         </w:numPr>
       </w:pPr>
       <w:r>
@@ -7975,7 +8116,7 @@
         <w:pStyle w:val="Compact"/>
         <w:numPr>
           <w:ilvl w:val="1"/>
-          <w:numId w:val="1324"/>
+          <w:numId w:val="1327"/>
         </w:numPr>
       </w:pPr>
       <w:r>
@@ -7987,7 +8128,7 @@
         <w:pStyle w:val="Compact"/>
         <w:numPr>
           <w:ilvl w:val="1"/>
-          <w:numId w:val="1324"/>
+          <w:numId w:val="1327"/>
         </w:numPr>
       </w:pPr>
       <w:r>
@@ -7999,7 +8140,7 @@
         <w:pStyle w:val="Compact"/>
         <w:numPr>
           <w:ilvl w:val="1"/>
-          <w:numId w:val="1324"/>
+          <w:numId w:val="1327"/>
         </w:numPr>
       </w:pPr>
       <w:r>
@@ -8011,7 +8152,7 @@
         <w:pStyle w:val="Compact"/>
         <w:numPr>
           <w:ilvl w:val="1"/>
-          <w:numId w:val="1324"/>
+          <w:numId w:val="1327"/>
         </w:numPr>
       </w:pPr>
       <w:r>
@@ -8023,7 +8164,7 @@
         <w:pStyle w:val="Compact"/>
         <w:numPr>
           <w:ilvl w:val="0"/>
-          <w:numId w:val="1325"/>
+          <w:numId w:val="1328"/>
         </w:numPr>
       </w:pPr>
       <w:r>
@@ -8068,7 +8209,7 @@
         <w:pStyle w:val="Compact"/>
         <w:numPr>
           <w:ilvl w:val="0"/>
-          <w:numId w:val="1326"/>
+          <w:numId w:val="1329"/>
         </w:numPr>
       </w:pPr>
       <w:r>
@@ -8101,7 +8242,7 @@
         <w:pStyle w:val="Compact"/>
         <w:numPr>
           <w:ilvl w:val="0"/>
-          <w:numId w:val="1327"/>
+          <w:numId w:val="1330"/>
         </w:numPr>
       </w:pPr>
       <w:r>
@@ -8134,7 +8275,7 @@
         <w:pStyle w:val="Compact"/>
         <w:numPr>
           <w:ilvl w:val="0"/>
-          <w:numId w:val="1328"/>
+          <w:numId w:val="1331"/>
         </w:numPr>
       </w:pPr>
       <w:r>
@@ -8161,7 +8302,7 @@
         <w:pStyle w:val="Compact"/>
         <w:numPr>
           <w:ilvl w:val="0"/>
-          <w:numId w:val="1329"/>
+          <w:numId w:val="1332"/>
         </w:numPr>
       </w:pPr>
       <w:r>
@@ -8173,7 +8314,7 @@
         <w:pStyle w:val="Compact"/>
         <w:numPr>
           <w:ilvl w:val="0"/>
-          <w:numId w:val="1330"/>
+          <w:numId w:val="1333"/>
         </w:numPr>
       </w:pPr>
       <w:r>
@@ -8185,7 +8326,7 @@
         <w:pStyle w:val="Compact"/>
         <w:numPr>
           <w:ilvl w:val="0"/>
-          <w:numId w:val="1331"/>
+          <w:numId w:val="1334"/>
         </w:numPr>
       </w:pPr>
       <w:r>
@@ -8197,7 +8338,7 @@
         <w:pStyle w:val="Compact"/>
         <w:numPr>
           <w:ilvl w:val="0"/>
-          <w:numId w:val="1332"/>
+          <w:numId w:val="1335"/>
         </w:numPr>
       </w:pPr>
       <w:r>
@@ -8209,7 +8350,7 @@
         <w:pStyle w:val="Compact"/>
         <w:numPr>
           <w:ilvl w:val="0"/>
-          <w:numId w:val="1333"/>
+          <w:numId w:val="1336"/>
         </w:numPr>
       </w:pPr>
       <w:r>
@@ -8236,7 +8377,7 @@
         <w:pStyle w:val="Compact"/>
         <w:numPr>
           <w:ilvl w:val="0"/>
-          <w:numId w:val="1334"/>
+          <w:numId w:val="1337"/>
         </w:numPr>
       </w:pPr>
       <w:r>
@@ -8258,7 +8399,7 @@
         <w:pStyle w:val="Compact"/>
         <w:numPr>
           <w:ilvl w:val="0"/>
-          <w:numId w:val="1335"/>
+          <w:numId w:val="1338"/>
         </w:numPr>
       </w:pPr>
       <w:r>
@@ -8270,7 +8411,7 @@
         <w:pStyle w:val="Compact"/>
         <w:numPr>
           <w:ilvl w:val="0"/>
-          <w:numId w:val="1336"/>
+          <w:numId w:val="1339"/>
         </w:numPr>
       </w:pPr>
       <w:r>
@@ -8282,7 +8423,7 @@
         <w:pStyle w:val="Compact"/>
         <w:numPr>
           <w:ilvl w:val="0"/>
-          <w:numId w:val="1337"/>
+          <w:numId w:val="1340"/>
         </w:numPr>
       </w:pPr>
       <w:r>
@@ -8294,7 +8435,7 @@
         <w:pStyle w:val="Compact"/>
         <w:numPr>
           <w:ilvl w:val="0"/>
-          <w:numId w:val="1338"/>
+          <w:numId w:val="1341"/>
         </w:numPr>
       </w:pPr>
       <w:r>
@@ -8318,7 +8459,7 @@
         <w:pStyle w:val="Compact"/>
         <w:numPr>
           <w:ilvl w:val="0"/>
-          <w:numId w:val="1339"/>
+          <w:numId w:val="1342"/>
         </w:numPr>
       </w:pPr>
       <w:r>
@@ -8330,7 +8471,7 @@
         <w:pStyle w:val="Compact"/>
         <w:numPr>
           <w:ilvl w:val="1"/>
-          <w:numId w:val="1340"/>
+          <w:numId w:val="1343"/>
         </w:numPr>
       </w:pPr>
       <w:r>
@@ -8342,7 +8483,7 @@
         <w:pStyle w:val="Compact"/>
         <w:numPr>
           <w:ilvl w:val="1"/>
-          <w:numId w:val="1340"/>
+          <w:numId w:val="1343"/>
         </w:numPr>
       </w:pPr>
       <w:r>
@@ -8354,7 +8495,7 @@
         <w:pStyle w:val="Compact"/>
         <w:numPr>
           <w:ilvl w:val="1"/>
-          <w:numId w:val="1340"/>
+          <w:numId w:val="1343"/>
         </w:numPr>
       </w:pPr>
       <w:r>
@@ -8366,7 +8507,7 @@
         <w:pStyle w:val="Compact"/>
         <w:numPr>
           <w:ilvl w:val="0"/>
-          <w:numId w:val="1341"/>
+          <w:numId w:val="1344"/>
         </w:numPr>
       </w:pPr>
       <w:r>
@@ -8408,7 +8549,7 @@
         <w:pStyle w:val="Compact"/>
         <w:numPr>
           <w:ilvl w:val="0"/>
-          <w:numId w:val="1342"/>
+          <w:numId w:val="1345"/>
         </w:numPr>
       </w:pPr>
       <w:r>
@@ -8460,7 +8601,7 @@
         <w:pStyle w:val="Compact"/>
         <w:numPr>
           <w:ilvl w:val="0"/>
-          <w:numId w:val="1343"/>
+          <w:numId w:val="1346"/>
         </w:numPr>
       </w:pPr>
       <w:r>
@@ -8472,7 +8613,7 @@
         <w:pStyle w:val="Compact"/>
         <w:numPr>
           <w:ilvl w:val="0"/>
-          <w:numId w:val="1344"/>
+          <w:numId w:val="1347"/>
         </w:numPr>
       </w:pPr>
       <w:r>
@@ -8484,7 +8625,7 @@
         <w:pStyle w:val="Compact"/>
         <w:numPr>
           <w:ilvl w:val="0"/>
-          <w:numId w:val="1345"/>
+          <w:numId w:val="1348"/>
         </w:numPr>
       </w:pPr>
       <w:r>
@@ -8496,7 +8637,7 @@
         <w:pStyle w:val="Compact"/>
         <w:numPr>
           <w:ilvl w:val="0"/>
-          <w:numId w:val="1346"/>
+          <w:numId w:val="1349"/>
         </w:numPr>
       </w:pPr>
       <w:r>
@@ -8508,7 +8649,7 @@
         <w:pStyle w:val="Compact"/>
         <w:numPr>
           <w:ilvl w:val="0"/>
-          <w:numId w:val="1347"/>
+          <w:numId w:val="1350"/>
         </w:numPr>
       </w:pPr>
       <w:r>
@@ -8520,7 +8661,7 @@
         <w:pStyle w:val="Compact"/>
         <w:numPr>
           <w:ilvl w:val="0"/>
-          <w:numId w:val="1348"/>
+          <w:numId w:val="1351"/>
         </w:numPr>
       </w:pPr>
       <w:r>
@@ -8532,7 +8673,7 @@
         <w:pStyle w:val="Compact"/>
         <w:numPr>
           <w:ilvl w:val="0"/>
-          <w:numId w:val="1349"/>
+          <w:numId w:val="1352"/>
         </w:numPr>
       </w:pPr>
       <w:r>
@@ -8544,7 +8685,7 @@
         <w:pStyle w:val="Compact"/>
         <w:numPr>
           <w:ilvl w:val="0"/>
-          <w:numId w:val="1350"/>
+          <w:numId w:val="1353"/>
         </w:numPr>
       </w:pPr>
       <w:r>
@@ -8556,7 +8697,7 @@
         <w:pStyle w:val="Compact"/>
         <w:numPr>
           <w:ilvl w:val="0"/>
-          <w:numId w:val="1351"/>
+          <w:numId w:val="1354"/>
         </w:numPr>
       </w:pPr>
       <w:r>
@@ -8588,7 +8729,7 @@
         <w:pStyle w:val="Compact"/>
         <w:numPr>
           <w:ilvl w:val="0"/>
-          <w:numId w:val="1352"/>
+          <w:numId w:val="1355"/>
         </w:numPr>
       </w:pPr>
       <w:r>
@@ -8600,7 +8741,7 @@
         <w:pStyle w:val="Compact"/>
         <w:numPr>
           <w:ilvl w:val="0"/>
-          <w:numId w:val="1353"/>
+          <w:numId w:val="1356"/>
         </w:numPr>
       </w:pPr>
       <w:r>
@@ -8612,7 +8753,7 @@
         <w:pStyle w:val="Compact"/>
         <w:numPr>
           <w:ilvl w:val="0"/>
-          <w:numId w:val="1354"/>
+          <w:numId w:val="1357"/>
         </w:numPr>
       </w:pPr>
       <w:r>
@@ -8624,7 +8765,7 @@
         <w:pStyle w:val="Compact"/>
         <w:numPr>
           <w:ilvl w:val="0"/>
-          <w:numId w:val="1355"/>
+          <w:numId w:val="1358"/>
         </w:numPr>
       </w:pPr>
       <w:r>
@@ -8636,7 +8777,7 @@
         <w:pStyle w:val="Compact"/>
         <w:numPr>
           <w:ilvl w:val="0"/>
-          <w:numId w:val="1356"/>
+          <w:numId w:val="1359"/>
         </w:numPr>
       </w:pPr>
       <w:r>
@@ -8648,7 +8789,7 @@
         <w:pStyle w:val="Compact"/>
         <w:numPr>
           <w:ilvl w:val="0"/>
-          <w:numId w:val="1357"/>
+          <w:numId w:val="1360"/>
         </w:numPr>
       </w:pPr>
       <w:r>
@@ -8660,7 +8801,7 @@
         <w:pStyle w:val="Compact"/>
         <w:numPr>
           <w:ilvl w:val="0"/>
-          <w:numId w:val="1358"/>
+          <w:numId w:val="1361"/>
         </w:numPr>
       </w:pPr>
       <w:r>
@@ -8672,7 +8813,7 @@
         <w:pStyle w:val="Compact"/>
         <w:numPr>
           <w:ilvl w:val="0"/>
-          <w:numId w:val="1359"/>
+          <w:numId w:val="1362"/>
         </w:numPr>
       </w:pPr>
       <w:r>
@@ -8684,7 +8825,7 @@
         <w:pStyle w:val="Compact"/>
         <w:numPr>
           <w:ilvl w:val="0"/>
-          <w:numId w:val="1360"/>
+          <w:numId w:val="1363"/>
         </w:numPr>
       </w:pPr>
       <w:r>
@@ -8696,7 +8837,7 @@
         <w:pStyle w:val="Compact"/>
         <w:numPr>
           <w:ilvl w:val="0"/>
-          <w:numId w:val="1361"/>
+          <w:numId w:val="1364"/>
         </w:numPr>
       </w:pPr>
       <w:r>
@@ -8708,7 +8849,7 @@
         <w:pStyle w:val="Compact"/>
         <w:numPr>
           <w:ilvl w:val="0"/>
-          <w:numId w:val="1362"/>
+          <w:numId w:val="1365"/>
         </w:numPr>
       </w:pPr>
       <w:r>
@@ -8720,7 +8861,7 @@
         <w:pStyle w:val="Compact"/>
         <w:numPr>
           <w:ilvl w:val="0"/>
-          <w:numId w:val="1363"/>
+          <w:numId w:val="1366"/>
         </w:numPr>
       </w:pPr>
       <w:r>
@@ -8732,7 +8873,7 @@
         <w:pStyle w:val="Compact"/>
         <w:numPr>
           <w:ilvl w:val="0"/>
-          <w:numId w:val="1364"/>
+          <w:numId w:val="1367"/>
         </w:numPr>
       </w:pPr>
       <w:r>
@@ -8744,7 +8885,7 @@
         <w:pStyle w:val="Compact"/>
         <w:numPr>
           <w:ilvl w:val="0"/>
-          <w:numId w:val="1365"/>
+          <w:numId w:val="1368"/>
         </w:numPr>
       </w:pPr>
       <w:r>
@@ -8756,7 +8897,7 @@
         <w:pStyle w:val="Compact"/>
         <w:numPr>
           <w:ilvl w:val="0"/>
-          <w:numId w:val="1366"/>
+          <w:numId w:val="1369"/>
         </w:numPr>
       </w:pPr>
       <w:r>
@@ -8778,7 +8919,7 @@
         <w:pStyle w:val="Compact"/>
         <w:numPr>
           <w:ilvl w:val="0"/>
-          <w:numId w:val="1367"/>
+          <w:numId w:val="1370"/>
         </w:numPr>
       </w:pPr>
       <w:r>
@@ -8790,7 +8931,7 @@
         <w:pStyle w:val="Compact"/>
         <w:numPr>
           <w:ilvl w:val="0"/>
-          <w:numId w:val="1368"/>
+          <w:numId w:val="1371"/>
         </w:numPr>
       </w:pPr>
       <w:r>
@@ -8802,7 +8943,7 @@
         <w:pStyle w:val="Compact"/>
         <w:numPr>
           <w:ilvl w:val="0"/>
-          <w:numId w:val="1369"/>
+          <w:numId w:val="1372"/>
         </w:numPr>
       </w:pPr>
       <w:r>
@@ -8814,7 +8955,7 @@
         <w:pStyle w:val="Compact"/>
         <w:numPr>
           <w:ilvl w:val="0"/>
-          <w:numId w:val="1370"/>
+          <w:numId w:val="1373"/>
         </w:numPr>
       </w:pPr>
       <w:r>
@@ -8826,7 +8967,7 @@
         <w:pStyle w:val="Compact"/>
         <w:numPr>
           <w:ilvl w:val="0"/>
-          <w:numId w:val="1371"/>
+          <w:numId w:val="1374"/>
         </w:numPr>
       </w:pPr>
       <w:r>
@@ -8838,7 +8979,7 @@
         <w:pStyle w:val="Compact"/>
         <w:numPr>
           <w:ilvl w:val="0"/>
-          <w:numId w:val="1372"/>
+          <w:numId w:val="1375"/>
         </w:numPr>
       </w:pPr>
       <w:r>
@@ -8850,7 +8991,7 @@
         <w:pStyle w:val="Compact"/>
         <w:numPr>
           <w:ilvl w:val="0"/>
-          <w:numId w:val="1373"/>
+          <w:numId w:val="1376"/>
         </w:numPr>
       </w:pPr>
       <w:r>
@@ -8872,7 +9013,7 @@
         <w:pStyle w:val="Compact"/>
         <w:numPr>
           <w:ilvl w:val="0"/>
-          <w:numId w:val="1374"/>
+          <w:numId w:val="1377"/>
         </w:numPr>
       </w:pPr>
       <w:r>
@@ -8884,7 +9025,7 @@
         <w:pStyle w:val="Compact"/>
         <w:numPr>
           <w:ilvl w:val="0"/>
-          <w:numId w:val="1375"/>
+          <w:numId w:val="1378"/>
         </w:numPr>
       </w:pPr>
       <w:r>
@@ -8896,7 +9037,7 @@
         <w:pStyle w:val="Compact"/>
         <w:numPr>
           <w:ilvl w:val="0"/>
-          <w:numId w:val="1376"/>
+          <w:numId w:val="1379"/>
         </w:numPr>
       </w:pPr>
       <w:r>
@@ -8908,7 +9049,7 @@
         <w:pStyle w:val="Compact"/>
         <w:numPr>
           <w:ilvl w:val="0"/>
-          <w:numId w:val="1377"/>
+          <w:numId w:val="1380"/>
         </w:numPr>
       </w:pPr>
       <w:r>
@@ -8920,7 +9061,7 @@
         <w:pStyle w:val="Compact"/>
         <w:numPr>
           <w:ilvl w:val="0"/>
-          <w:numId w:val="1378"/>
+          <w:numId w:val="1381"/>
         </w:numPr>
       </w:pPr>
       <w:r>
@@ -8932,7 +9073,7 @@
         <w:pStyle w:val="Compact"/>
         <w:numPr>
           <w:ilvl w:val="0"/>
-          <w:numId w:val="1379"/>
+          <w:numId w:val="1382"/>
         </w:numPr>
       </w:pPr>
       <w:r>
@@ -8944,7 +9085,7 @@
         <w:pStyle w:val="Compact"/>
         <w:numPr>
           <w:ilvl w:val="0"/>
-          <w:numId w:val="1380"/>
+          <w:numId w:val="1383"/>
         </w:numPr>
       </w:pPr>
       <w:r>
@@ -8976,7 +9117,7 @@
         <w:pStyle w:val="Compact"/>
         <w:numPr>
           <w:ilvl w:val="0"/>
-          <w:numId w:val="1381"/>
+          <w:numId w:val="1384"/>
         </w:numPr>
       </w:pPr>
       <w:r>
@@ -9027,7 +9168,7 @@
         <w:pStyle w:val="Compact"/>
         <w:numPr>
           <w:ilvl w:val="0"/>
-          <w:numId w:val="1382"/>
+          <w:numId w:val="1385"/>
         </w:numPr>
       </w:pPr>
       <w:r>
@@ -9054,7 +9195,7 @@
         <w:pStyle w:val="Compact"/>
         <w:numPr>
           <w:ilvl w:val="0"/>
-          <w:numId w:val="1383"/>
+          <w:numId w:val="1386"/>
         </w:numPr>
       </w:pPr>
       <w:r>
@@ -9066,7 +9207,7 @@
         <w:pStyle w:val="Compact"/>
         <w:numPr>
           <w:ilvl w:val="0"/>
-          <w:numId w:val="1384"/>
+          <w:numId w:val="1387"/>
         </w:numPr>
       </w:pPr>
       <w:r>
@@ -9093,7 +9234,7 @@
         <w:pStyle w:val="Compact"/>
         <w:numPr>
           <w:ilvl w:val="0"/>
-          <w:numId w:val="1385"/>
+          <w:numId w:val="1388"/>
         </w:numPr>
       </w:pPr>
       <w:r>
@@ -9105,7 +9246,7 @@
         <w:pStyle w:val="Compact"/>
         <w:numPr>
           <w:ilvl w:val="0"/>
-          <w:numId w:val="1386"/>
+          <w:numId w:val="1389"/>
         </w:numPr>
       </w:pPr>
       <w:r>
@@ -9117,7 +9258,7 @@
         <w:pStyle w:val="Compact"/>
         <w:numPr>
           <w:ilvl w:val="0"/>
-          <w:numId w:val="1387"/>
+          <w:numId w:val="1390"/>
         </w:numPr>
       </w:pPr>
       <w:r>
@@ -9139,7 +9280,7 @@
         <w:pStyle w:val="Compact"/>
         <w:numPr>
           <w:ilvl w:val="0"/>
-          <w:numId w:val="1388"/>
+          <w:numId w:val="1391"/>
         </w:numPr>
       </w:pPr>
       <w:r>
@@ -9163,7 +9304,7 @@
         <w:pStyle w:val="Compact"/>
         <w:numPr>
           <w:ilvl w:val="0"/>
-          <w:numId w:val="1389"/>
+          <w:numId w:val="1392"/>
         </w:numPr>
       </w:pPr>
       <w:r>
@@ -9187,7 +9328,7 @@
         <w:pStyle w:val="Compact"/>
         <w:numPr>
           <w:ilvl w:val="0"/>
-          <w:numId w:val="1390"/>
+          <w:numId w:val="1393"/>
         </w:numPr>
       </w:pPr>
       <w:r>
@@ -9199,7 +9340,7 @@
         <w:pStyle w:val="Compact"/>
         <w:numPr>
           <w:ilvl w:val="0"/>
-          <w:numId w:val="1391"/>
+          <w:numId w:val="1394"/>
         </w:numPr>
       </w:pPr>
       <w:r>
@@ -9211,7 +9352,7 @@
         <w:pStyle w:val="Compact"/>
         <w:numPr>
           <w:ilvl w:val="0"/>
-          <w:numId w:val="1392"/>
+          <w:numId w:val="1395"/>
         </w:numPr>
       </w:pPr>
       <w:r>
@@ -9223,7 +9364,7 @@
         <w:pStyle w:val="Compact"/>
         <w:numPr>
           <w:ilvl w:val="0"/>
-          <w:numId w:val="1393"/>
+          <w:numId w:val="1396"/>
         </w:numPr>
       </w:pPr>
       <w:r>
@@ -9254,7 +9395,7 @@
         <w:pStyle w:val="Compact"/>
         <w:numPr>
           <w:ilvl w:val="0"/>
-          <w:numId w:val="1394"/>
+          <w:numId w:val="1397"/>
         </w:numPr>
       </w:pPr>
       <w:r>
@@ -9266,7 +9407,7 @@
         <w:pStyle w:val="Compact"/>
         <w:numPr>
           <w:ilvl w:val="0"/>
-          <w:numId w:val="1395"/>
+          <w:numId w:val="1398"/>
         </w:numPr>
       </w:pPr>
       <w:r>
@@ -9278,7 +9419,7 @@
         <w:pStyle w:val="Compact"/>
         <w:numPr>
           <w:ilvl w:val="1"/>
-          <w:numId w:val="1396"/>
+          <w:numId w:val="1399"/>
         </w:numPr>
       </w:pPr>
       <w:r>
@@ -9296,7 +9437,7 @@
         <w:pStyle w:val="Compact"/>
         <w:numPr>
           <w:ilvl w:val="1"/>
-          <w:numId w:val="1396"/>
+          <w:numId w:val="1399"/>
         </w:numPr>
       </w:pPr>
       <w:r>
@@ -9314,7 +9455,7 @@
         <w:pStyle w:val="Compact"/>
         <w:numPr>
           <w:ilvl w:val="1"/>
-          <w:numId w:val="1396"/>
+          <w:numId w:val="1399"/>
         </w:numPr>
       </w:pPr>
       <w:r>
@@ -9332,7 +9473,7 @@
         <w:pStyle w:val="Compact"/>
         <w:numPr>
           <w:ilvl w:val="1"/>
-          <w:numId w:val="1396"/>
+          <w:numId w:val="1399"/>
         </w:numPr>
       </w:pPr>
       <w:r>
@@ -9350,7 +9491,7 @@
         <w:pStyle w:val="Compact"/>
         <w:numPr>
           <w:ilvl w:val="0"/>
-          <w:numId w:val="1397"/>
+          <w:numId w:val="1400"/>
         </w:numPr>
       </w:pPr>
       <w:r>
@@ -9362,7 +9503,7 @@
         <w:pStyle w:val="Compact"/>
         <w:numPr>
           <w:ilvl w:val="0"/>
-          <w:numId w:val="1398"/>
+          <w:numId w:val="1401"/>
         </w:numPr>
       </w:pPr>
       <w:r>
@@ -9374,7 +9515,7 @@
         <w:pStyle w:val="Compact"/>
         <w:numPr>
           <w:ilvl w:val="0"/>
-          <w:numId w:val="1399"/>
+          <w:numId w:val="1402"/>
         </w:numPr>
       </w:pPr>
       <w:r>
@@ -9396,7 +9537,7 @@
         <w:pStyle w:val="Compact"/>
         <w:numPr>
           <w:ilvl w:val="0"/>
-          <w:numId w:val="1400"/>
+          <w:numId w:val="1403"/>
         </w:numPr>
       </w:pPr>
       <w:r>
@@ -9408,7 +9549,7 @@
         <w:pStyle w:val="Compact"/>
         <w:numPr>
           <w:ilvl w:val="0"/>
-          <w:numId w:val="1401"/>
+          <w:numId w:val="1404"/>
         </w:numPr>
       </w:pPr>
       <w:r>
@@ -9420,7 +9561,7 @@
         <w:pStyle w:val="Compact"/>
         <w:numPr>
           <w:ilvl w:val="0"/>
-          <w:numId w:val="1402"/>
+          <w:numId w:val="1405"/>
         </w:numPr>
       </w:pPr>
       <w:r>
@@ -9432,7 +9573,7 @@
         <w:pStyle w:val="Compact"/>
         <w:numPr>
           <w:ilvl w:val="0"/>
-          <w:numId w:val="1403"/>
+          <w:numId w:val="1406"/>
         </w:numPr>
       </w:pPr>
       <w:r>
@@ -9444,7 +9585,7 @@
         <w:pStyle w:val="Compact"/>
         <w:numPr>
           <w:ilvl w:val="0"/>
-          <w:numId w:val="1404"/>
+          <w:numId w:val="1407"/>
         </w:numPr>
       </w:pPr>
       <w:r>
@@ -9456,7 +9597,7 @@
         <w:pStyle w:val="Compact"/>
         <w:numPr>
           <w:ilvl w:val="0"/>
-          <w:numId w:val="1405"/>
+          <w:numId w:val="1408"/>
         </w:numPr>
       </w:pPr>
       <w:r>
@@ -9468,7 +9609,7 @@
         <w:pStyle w:val="Compact"/>
         <w:numPr>
           <w:ilvl w:val="0"/>
-          <w:numId w:val="1406"/>
+          <w:numId w:val="1409"/>
         </w:numPr>
       </w:pPr>
       <w:r>
@@ -9480,7 +9621,7 @@
         <w:pStyle w:val="Compact"/>
         <w:numPr>
           <w:ilvl w:val="0"/>
-          <w:numId w:val="1407"/>
+          <w:numId w:val="1410"/>
         </w:numPr>
       </w:pPr>
       <w:r>
@@ -9492,7 +9633,7 @@
         <w:pStyle w:val="Compact"/>
         <w:numPr>
           <w:ilvl w:val="0"/>
-          <w:numId w:val="1408"/>
+          <w:numId w:val="1411"/>
         </w:numPr>
       </w:pPr>
       <w:r>
@@ -9524,7 +9665,7 @@
         <w:pStyle w:val="Compact"/>
         <w:numPr>
           <w:ilvl w:val="0"/>
-          <w:numId w:val="1409"/>
+          <w:numId w:val="1412"/>
         </w:numPr>
       </w:pPr>
       <w:r>
@@ -9536,7 +9677,7 @@
         <w:pStyle w:val="Compact"/>
         <w:numPr>
           <w:ilvl w:val="0"/>
-          <w:numId w:val="1410"/>
+          <w:numId w:val="1413"/>
         </w:numPr>
       </w:pPr>
       <w:r>
@@ -9548,7 +9689,7 @@
         <w:pStyle w:val="Compact"/>
         <w:numPr>
           <w:ilvl w:val="1"/>
-          <w:numId w:val="1411"/>
+          <w:numId w:val="1414"/>
         </w:numPr>
       </w:pPr>
       <w:r>
@@ -9560,7 +9701,7 @@
         <w:pStyle w:val="Compact"/>
         <w:numPr>
           <w:ilvl w:val="1"/>
-          <w:numId w:val="1411"/>
+          <w:numId w:val="1414"/>
         </w:numPr>
       </w:pPr>
       <w:r>
@@ -9572,7 +9713,7 @@
         <w:pStyle w:val="Compact"/>
         <w:numPr>
           <w:ilvl w:val="1"/>
-          <w:numId w:val="1411"/>
+          <w:numId w:val="1414"/>
         </w:numPr>
       </w:pPr>
       <w:r>
@@ -9584,7 +9725,7 @@
         <w:pStyle w:val="Compact"/>
         <w:numPr>
           <w:ilvl w:val="1"/>
-          <w:numId w:val="1411"/>
+          <w:numId w:val="1414"/>
         </w:numPr>
       </w:pPr>
       <w:r>
@@ -9596,7 +9737,7 @@
         <w:pStyle w:val="Compact"/>
         <w:numPr>
           <w:ilvl w:val="1"/>
-          <w:numId w:val="1411"/>
+          <w:numId w:val="1414"/>
         </w:numPr>
       </w:pPr>
       <w:r>
@@ -9608,7 +9749,7 @@
         <w:pStyle w:val="Compact"/>
         <w:numPr>
           <w:ilvl w:val="1"/>
-          <w:numId w:val="1411"/>
+          <w:numId w:val="1414"/>
         </w:numPr>
       </w:pPr>
       <w:r>
@@ -9620,7 +9761,7 @@
         <w:pStyle w:val="Compact"/>
         <w:numPr>
           <w:ilvl w:val="1"/>
-          <w:numId w:val="1411"/>
+          <w:numId w:val="1414"/>
         </w:numPr>
       </w:pPr>
       <w:r>
@@ -9632,7 +9773,7 @@
         <w:pStyle w:val="Compact"/>
         <w:numPr>
           <w:ilvl w:val="1"/>
-          <w:numId w:val="1411"/>
+          <w:numId w:val="1414"/>
         </w:numPr>
       </w:pPr>
       <w:r>
@@ -9644,7 +9785,7 @@
         <w:pStyle w:val="Compact"/>
         <w:numPr>
           <w:ilvl w:val="0"/>
-          <w:numId w:val="1412"/>
+          <w:numId w:val="1415"/>
         </w:numPr>
       </w:pPr>
       <w:r>
@@ -9665,7 +9806,7 @@
         <w:pStyle w:val="Compact"/>
         <w:numPr>
           <w:ilvl w:val="0"/>
-          <w:numId w:val="1413"/>
+          <w:numId w:val="1416"/>
         </w:numPr>
       </w:pPr>
       <w:r>
@@ -9689,7 +9830,7 @@
         <w:pStyle w:val="Compact"/>
         <w:numPr>
           <w:ilvl w:val="0"/>
-          <w:numId w:val="1414"/>
+          <w:numId w:val="1417"/>
         </w:numPr>
       </w:pPr>
       <w:r>
@@ -9701,7 +9842,7 @@
         <w:pStyle w:val="Compact"/>
         <w:numPr>
           <w:ilvl w:val="1"/>
-          <w:numId w:val="1415"/>
+          <w:numId w:val="1418"/>
         </w:numPr>
       </w:pPr>
       <w:r>
@@ -9713,7 +9854,7 @@
         <w:pStyle w:val="Compact"/>
         <w:numPr>
           <w:ilvl w:val="1"/>
-          <w:numId w:val="1415"/>
+          <w:numId w:val="1418"/>
         </w:numPr>
       </w:pPr>
       <w:r>
@@ -9725,7 +9866,7 @@
         <w:pStyle w:val="Compact"/>
         <w:numPr>
           <w:ilvl w:val="1"/>
-          <w:numId w:val="1415"/>
+          <w:numId w:val="1418"/>
         </w:numPr>
       </w:pPr>
       <w:r>
@@ -9737,7 +9878,7 @@
         <w:pStyle w:val="Compact"/>
         <w:numPr>
           <w:ilvl w:val="0"/>
-          <w:numId w:val="1416"/>
+          <w:numId w:val="1419"/>
         </w:numPr>
       </w:pPr>
       <w:r>
@@ -9761,7 +9902,7 @@
         <w:pStyle w:val="Compact"/>
         <w:numPr>
           <w:ilvl w:val="0"/>
-          <w:numId w:val="1417"/>
+          <w:numId w:val="1420"/>
         </w:numPr>
       </w:pPr>
       <w:r>
@@ -9773,7 +9914,7 @@
         <w:pStyle w:val="Compact"/>
         <w:numPr>
           <w:ilvl w:val="0"/>
-          <w:numId w:val="1418"/>
+          <w:numId w:val="1421"/>
         </w:numPr>
       </w:pPr>
       <w:r>
@@ -9785,7 +9926,7 @@
         <w:pStyle w:val="Compact"/>
         <w:numPr>
           <w:ilvl w:val="0"/>
-          <w:numId w:val="1419"/>
+          <w:numId w:val="1422"/>
         </w:numPr>
       </w:pPr>
       <w:r>
@@ -9807,7 +9948,7 @@
         <w:pStyle w:val="Compact"/>
         <w:numPr>
           <w:ilvl w:val="0"/>
-          <w:numId w:val="1420"/>
+          <w:numId w:val="1423"/>
         </w:numPr>
       </w:pPr>
       <w:r>
@@ -9819,7 +9960,7 @@
         <w:pStyle w:val="Compact"/>
         <w:numPr>
           <w:ilvl w:val="1"/>
-          <w:numId w:val="1421"/>
+          <w:numId w:val="1424"/>
         </w:numPr>
       </w:pPr>
       <w:r>
@@ -9831,7 +9972,7 @@
         <w:pStyle w:val="Compact"/>
         <w:numPr>
           <w:ilvl w:val="1"/>
-          <w:numId w:val="1421"/>
+          <w:numId w:val="1424"/>
         </w:numPr>
       </w:pPr>
       <w:r>
@@ -9843,7 +9984,7 @@
         <w:pStyle w:val="Compact"/>
         <w:numPr>
           <w:ilvl w:val="1"/>
-          <w:numId w:val="1421"/>
+          <w:numId w:val="1424"/>
         </w:numPr>
       </w:pPr>
       <w:r>
@@ -9855,7 +9996,7 @@
         <w:pStyle w:val="Compact"/>
         <w:numPr>
           <w:ilvl w:val="0"/>
-          <w:numId w:val="1422"/>
+          <w:numId w:val="1425"/>
         </w:numPr>
       </w:pPr>
       <w:r>
@@ -9867,7 +10008,7 @@
         <w:pStyle w:val="Compact"/>
         <w:numPr>
           <w:ilvl w:val="1"/>
-          <w:numId w:val="1423"/>
+          <w:numId w:val="1426"/>
         </w:numPr>
       </w:pPr>
       <w:r>
@@ -9879,7 +10020,7 @@
         <w:pStyle w:val="Compact"/>
         <w:numPr>
           <w:ilvl w:val="1"/>
-          <w:numId w:val="1423"/>
+          <w:numId w:val="1426"/>
         </w:numPr>
       </w:pPr>
       <w:r>
@@ -9891,7 +10032,7 @@
         <w:pStyle w:val="Compact"/>
         <w:numPr>
           <w:ilvl w:val="1"/>
-          <w:numId w:val="1423"/>
+          <w:numId w:val="1426"/>
         </w:numPr>
       </w:pPr>
       <w:r>
@@ -9903,7 +10044,7 @@
         <w:pStyle w:val="Compact"/>
         <w:numPr>
           <w:ilvl w:val="0"/>
-          <w:numId w:val="1424"/>
+          <w:numId w:val="1427"/>
         </w:numPr>
       </w:pPr>
       <w:r>
@@ -9915,7 +10056,7 @@
         <w:pStyle w:val="Compact"/>
         <w:numPr>
           <w:ilvl w:val="0"/>
-          <w:numId w:val="1425"/>
+          <w:numId w:val="1428"/>
         </w:numPr>
       </w:pPr>
       <w:r>
@@ -9927,7 +10068,7 @@
         <w:pStyle w:val="Compact"/>
         <w:numPr>
           <w:ilvl w:val="0"/>
-          <w:numId w:val="1426"/>
+          <w:numId w:val="1429"/>
         </w:numPr>
       </w:pPr>
       <w:r>
@@ -9949,7 +10090,7 @@
         <w:pStyle w:val="Compact"/>
         <w:numPr>
           <w:ilvl w:val="0"/>
-          <w:numId w:val="1427"/>
+          <w:numId w:val="1430"/>
         </w:numPr>
       </w:pPr>
       <w:r>
@@ -9970,7 +10111,7 @@
         <w:pStyle w:val="Compact"/>
         <w:numPr>
           <w:ilvl w:val="0"/>
-          <w:numId w:val="1428"/>
+          <w:numId w:val="1431"/>
         </w:numPr>
       </w:pPr>
       <w:r>
@@ -9982,7 +10123,7 @@
         <w:pStyle w:val="Compact"/>
         <w:numPr>
           <w:ilvl w:val="0"/>
-          <w:numId w:val="1429"/>
+          <w:numId w:val="1432"/>
         </w:numPr>
       </w:pPr>
       <w:r>
@@ -9994,7 +10135,7 @@
         <w:pStyle w:val="Compact"/>
         <w:numPr>
           <w:ilvl w:val="0"/>
-          <w:numId w:val="1430"/>
+          <w:numId w:val="1433"/>
         </w:numPr>
       </w:pPr>
       <w:r>
@@ -10006,7 +10147,7 @@
         <w:pStyle w:val="Compact"/>
         <w:numPr>
           <w:ilvl w:val="0"/>
-          <w:numId w:val="1431"/>
+          <w:numId w:val="1434"/>
         </w:numPr>
       </w:pPr>
       <w:r>
@@ -10018,7 +10159,7 @@
         <w:pStyle w:val="Compact"/>
         <w:numPr>
           <w:ilvl w:val="0"/>
-          <w:numId w:val="1432"/>
+          <w:numId w:val="1435"/>
         </w:numPr>
       </w:pPr>
       <w:r>
@@ -10030,7 +10171,7 @@
         <w:pStyle w:val="Compact"/>
         <w:numPr>
           <w:ilvl w:val="1"/>
-          <w:numId w:val="1433"/>
+          <w:numId w:val="1436"/>
         </w:numPr>
       </w:pPr>
       <w:r>
@@ -10042,7 +10183,7 @@
         <w:pStyle w:val="Compact"/>
         <w:numPr>
           <w:ilvl w:val="1"/>
-          <w:numId w:val="1433"/>
+          <w:numId w:val="1436"/>
         </w:numPr>
       </w:pPr>
       <w:r>
@@ -10054,7 +10195,7 @@
         <w:pStyle w:val="Compact"/>
         <w:numPr>
           <w:ilvl w:val="1"/>
-          <w:numId w:val="1433"/>
+          <w:numId w:val="1436"/>
         </w:numPr>
       </w:pPr>
       <w:r>
@@ -10066,7 +10207,7 @@
         <w:pStyle w:val="Compact"/>
         <w:numPr>
           <w:ilvl w:val="1"/>
-          <w:numId w:val="1433"/>
+          <w:numId w:val="1436"/>
         </w:numPr>
       </w:pPr>
       <w:r>
@@ -10078,7 +10219,7 @@
         <w:pStyle w:val="Compact"/>
         <w:numPr>
           <w:ilvl w:val="1"/>
-          <w:numId w:val="1433"/>
+          <w:numId w:val="1436"/>
         </w:numPr>
       </w:pPr>
       <w:r>
@@ -10090,7 +10231,7 @@
         <w:pStyle w:val="Compact"/>
         <w:numPr>
           <w:ilvl w:val="1"/>
-          <w:numId w:val="1433"/>
+          <w:numId w:val="1436"/>
         </w:numPr>
       </w:pPr>
       <w:r>
@@ -10102,7 +10243,7 @@
         <w:pStyle w:val="Compact"/>
         <w:numPr>
           <w:ilvl w:val="0"/>
-          <w:numId w:val="1434"/>
+          <w:numId w:val="1437"/>
         </w:numPr>
       </w:pPr>
       <w:r>
@@ -10114,7 +10255,7 @@
         <w:pStyle w:val="Compact"/>
         <w:numPr>
           <w:ilvl w:val="0"/>
-          <w:numId w:val="1435"/>
+          <w:numId w:val="1438"/>
         </w:numPr>
       </w:pPr>
       <w:r>
@@ -10136,7 +10277,7 @@
         <w:pStyle w:val="Compact"/>
         <w:numPr>
           <w:ilvl w:val="0"/>
-          <w:numId w:val="1436"/>
+          <w:numId w:val="1439"/>
         </w:numPr>
       </w:pPr>
       <w:r>
@@ -10148,7 +10289,7 @@
         <w:pStyle w:val="Compact"/>
         <w:numPr>
           <w:ilvl w:val="0"/>
-          <w:numId w:val="1437"/>
+          <w:numId w:val="1440"/>
         </w:numPr>
       </w:pPr>
       <w:r>
@@ -10160,7 +10301,7 @@
         <w:pStyle w:val="Compact"/>
         <w:numPr>
           <w:ilvl w:val="0"/>
-          <w:numId w:val="1438"/>
+          <w:numId w:val="1441"/>
         </w:numPr>
       </w:pPr>
       <w:r>
@@ -10172,7 +10313,7 @@
         <w:pStyle w:val="Compact"/>
         <w:numPr>
           <w:ilvl w:val="0"/>
-          <w:numId w:val="1439"/>
+          <w:numId w:val="1442"/>
         </w:numPr>
       </w:pPr>
       <w:r>
@@ -10184,7 +10325,7 @@
         <w:pStyle w:val="Compact"/>
         <w:numPr>
           <w:ilvl w:val="0"/>
-          <w:numId w:val="1440"/>
+          <w:numId w:val="1443"/>
         </w:numPr>
       </w:pPr>
       <w:r>
@@ -10206,7 +10347,7 @@
         <w:pStyle w:val="Compact"/>
         <w:numPr>
           <w:ilvl w:val="0"/>
-          <w:numId w:val="1441"/>
+          <w:numId w:val="1444"/>
         </w:numPr>
       </w:pPr>
       <w:r>
@@ -10218,7 +10359,7 @@
         <w:pStyle w:val="Compact"/>
         <w:numPr>
           <w:ilvl w:val="0"/>
-          <w:numId w:val="1442"/>
+          <w:numId w:val="1445"/>
         </w:numPr>
       </w:pPr>
       <w:r>
@@ -10230,7 +10371,7 @@
         <w:pStyle w:val="Compact"/>
         <w:numPr>
           <w:ilvl w:val="0"/>
-          <w:numId w:val="1443"/>
+          <w:numId w:val="1446"/>
         </w:numPr>
       </w:pPr>
       <w:r>
@@ -10242,7 +10383,7 @@
         <w:pStyle w:val="Compact"/>
         <w:numPr>
           <w:ilvl w:val="0"/>
-          <w:numId w:val="1444"/>
+          <w:numId w:val="1447"/>
         </w:numPr>
       </w:pPr>
       <w:r>
@@ -10254,7 +10395,7 @@
         <w:pStyle w:val="Compact"/>
         <w:numPr>
           <w:ilvl w:val="0"/>
-          <w:numId w:val="1445"/>
+          <w:numId w:val="1448"/>
         </w:numPr>
       </w:pPr>
       <w:r>
@@ -10266,7 +10407,7 @@
         <w:pStyle w:val="Compact"/>
         <w:numPr>
           <w:ilvl w:val="0"/>
-          <w:numId w:val="1446"/>
+          <w:numId w:val="1449"/>
         </w:numPr>
       </w:pPr>
       <w:r>
@@ -10278,7 +10419,7 @@
         <w:pStyle w:val="Compact"/>
         <w:numPr>
           <w:ilvl w:val="0"/>
-          <w:numId w:val="1447"/>
+          <w:numId w:val="1450"/>
         </w:numPr>
       </w:pPr>
       <w:r>
@@ -10290,7 +10431,7 @@
         <w:pStyle w:val="Compact"/>
         <w:numPr>
           <w:ilvl w:val="0"/>
-          <w:numId w:val="1448"/>
+          <w:numId w:val="1451"/>
         </w:numPr>
       </w:pPr>
       <w:r>
@@ -10322,7 +10463,7 @@
         <w:pStyle w:val="Compact"/>
         <w:numPr>
           <w:ilvl w:val="0"/>
-          <w:numId w:val="1449"/>
+          <w:numId w:val="1452"/>
         </w:numPr>
       </w:pPr>
       <w:r>
@@ -10334,7 +10475,7 @@
         <w:pStyle w:val="Compact"/>
         <w:numPr>
           <w:ilvl w:val="0"/>
-          <w:numId w:val="1450"/>
+          <w:numId w:val="1453"/>
         </w:numPr>
       </w:pPr>
       <w:r>
@@ -10346,7 +10487,7 @@
         <w:pStyle w:val="Compact"/>
         <w:numPr>
           <w:ilvl w:val="0"/>
-          <w:numId w:val="1451"/>
+          <w:numId w:val="1454"/>
         </w:numPr>
       </w:pPr>
       <w:r>
@@ -10358,7 +10499,7 @@
         <w:pStyle w:val="Compact"/>
         <w:numPr>
           <w:ilvl w:val="0"/>
-          <w:numId w:val="1452"/>
+          <w:numId w:val="1455"/>
         </w:numPr>
       </w:pPr>
       <w:r>
@@ -10370,7 +10511,7 @@
         <w:pStyle w:val="Compact"/>
         <w:numPr>
           <w:ilvl w:val="0"/>
-          <w:numId w:val="1453"/>
+          <w:numId w:val="1456"/>
         </w:numPr>
       </w:pPr>
       <w:r>
@@ -10382,7 +10523,7 @@
         <w:pStyle w:val="Compact"/>
         <w:numPr>
           <w:ilvl w:val="0"/>
-          <w:numId w:val="1454"/>
+          <w:numId w:val="1457"/>
         </w:numPr>
       </w:pPr>
       <w:r>
@@ -10394,7 +10535,7 @@
         <w:pStyle w:val="Compact"/>
         <w:numPr>
           <w:ilvl w:val="1"/>
-          <w:numId w:val="1455"/>
+          <w:numId w:val="1458"/>
         </w:numPr>
       </w:pPr>
       <w:r>
@@ -10421,7 +10562,7 @@
         <w:pStyle w:val="Compact"/>
         <w:numPr>
           <w:ilvl w:val="1"/>
-          <w:numId w:val="1455"/>
+          <w:numId w:val="1458"/>
         </w:numPr>
       </w:pPr>
       <w:r>
@@ -10458,7 +10599,7 @@
         <w:pStyle w:val="Compact"/>
         <w:numPr>
           <w:ilvl w:val="0"/>
-          <w:numId w:val="1456"/>
+          <w:numId w:val="1459"/>
         </w:numPr>
       </w:pPr>
       <w:r>
@@ -10500,7 +10641,7 @@
         <w:pStyle w:val="Compact"/>
         <w:numPr>
           <w:ilvl w:val="0"/>
-          <w:numId w:val="1457"/>
+          <w:numId w:val="1460"/>
         </w:numPr>
       </w:pPr>
       <w:r>
@@ -10524,7 +10665,7 @@
         <w:pStyle w:val="Compact"/>
         <w:numPr>
           <w:ilvl w:val="0"/>
-          <w:numId w:val="1458"/>
+          <w:numId w:val="1461"/>
         </w:numPr>
       </w:pPr>
       <w:r>
@@ -10548,7 +10689,7 @@
         <w:pStyle w:val="Compact"/>
         <w:numPr>
           <w:ilvl w:val="0"/>
-          <w:numId w:val="1459"/>
+          <w:numId w:val="1462"/>
         </w:numPr>
       </w:pPr>
       <w:r>
@@ -10560,7 +10701,7 @@
         <w:pStyle w:val="Compact"/>
         <w:numPr>
           <w:ilvl w:val="0"/>
-          <w:numId w:val="1460"/>
+          <w:numId w:val="1463"/>
         </w:numPr>
       </w:pPr>
       <w:r>
@@ -10572,7 +10713,7 @@
         <w:pStyle w:val="Compact"/>
         <w:numPr>
           <w:ilvl w:val="0"/>
-          <w:numId w:val="1461"/>
+          <w:numId w:val="1464"/>
         </w:numPr>
       </w:pPr>
       <w:r>
@@ -10584,7 +10725,7 @@
         <w:pStyle w:val="Compact"/>
         <w:numPr>
           <w:ilvl w:val="0"/>
-          <w:numId w:val="1462"/>
+          <w:numId w:val="1465"/>
         </w:numPr>
       </w:pPr>
       <w:r>
@@ -10596,7 +10737,7 @@
         <w:pStyle w:val="Compact"/>
         <w:numPr>
           <w:ilvl w:val="0"/>
-          <w:numId w:val="1463"/>
+          <w:numId w:val="1466"/>
         </w:numPr>
       </w:pPr>
       <w:r>
@@ -10608,7 +10749,7 @@
         <w:pStyle w:val="Compact"/>
         <w:numPr>
           <w:ilvl w:val="0"/>
-          <w:numId w:val="1464"/>
+          <w:numId w:val="1467"/>
         </w:numPr>
       </w:pPr>
       <w:r>
@@ -10620,7 +10761,7 @@
         <w:pStyle w:val="Compact"/>
         <w:numPr>
           <w:ilvl w:val="0"/>
-          <w:numId w:val="1465"/>
+          <w:numId w:val="1468"/>
         </w:numPr>
       </w:pPr>
       <w:r>
@@ -10632,7 +10773,7 @@
         <w:pStyle w:val="Compact"/>
         <w:numPr>
           <w:ilvl w:val="0"/>
-          <w:numId w:val="1466"/>
+          <w:numId w:val="1469"/>
         </w:numPr>
       </w:pPr>
       <w:r>
@@ -10644,7 +10785,7 @@
         <w:pStyle w:val="Compact"/>
         <w:numPr>
           <w:ilvl w:val="0"/>
-          <w:numId w:val="1467"/>
+          <w:numId w:val="1470"/>
         </w:numPr>
       </w:pPr>
       <w:r>
@@ -10656,7 +10797,7 @@
         <w:pStyle w:val="Compact"/>
         <w:numPr>
           <w:ilvl w:val="0"/>
-          <w:numId w:val="1468"/>
+          <w:numId w:val="1471"/>
         </w:numPr>
       </w:pPr>
       <w:r>
@@ -10668,7 +10809,7 @@
         <w:pStyle w:val="Compact"/>
         <w:numPr>
           <w:ilvl w:val="0"/>
-          <w:numId w:val="1469"/>
+          <w:numId w:val="1472"/>
         </w:numPr>
       </w:pPr>
       <w:r>
@@ -10695,7 +10836,7 @@
         <w:pStyle w:val="Compact"/>
         <w:numPr>
           <w:ilvl w:val="0"/>
-          <w:numId w:val="1470"/>
+          <w:numId w:val="1473"/>
         </w:numPr>
       </w:pPr>
       <w:r>
@@ -10707,7 +10848,7 @@
         <w:pStyle w:val="Compact"/>
         <w:numPr>
           <w:ilvl w:val="0"/>
-          <w:numId w:val="1471"/>
+          <w:numId w:val="1474"/>
         </w:numPr>
       </w:pPr>
       <w:r>
@@ -10729,7 +10870,7 @@
         <w:pStyle w:val="Compact"/>
         <w:numPr>
           <w:ilvl w:val="0"/>
-          <w:numId w:val="1472"/>
+          <w:numId w:val="1475"/>
         </w:numPr>
       </w:pPr>
       <w:r>
@@ -10741,7 +10882,7 @@
         <w:pStyle w:val="Compact"/>
         <w:numPr>
           <w:ilvl w:val="0"/>
-          <w:numId w:val="1473"/>
+          <w:numId w:val="1476"/>
         </w:numPr>
       </w:pPr>
       <w:r>
@@ -10768,7 +10909,7 @@
         <w:pStyle w:val="Compact"/>
         <w:numPr>
           <w:ilvl w:val="0"/>
-          <w:numId w:val="1474"/>
+          <w:numId w:val="1477"/>
         </w:numPr>
       </w:pPr>
       <w:r>
@@ -10795,7 +10936,7 @@
         <w:pStyle w:val="Compact"/>
         <w:numPr>
           <w:ilvl w:val="0"/>
-          <w:numId w:val="1475"/>
+          <w:numId w:val="1478"/>
         </w:numPr>
       </w:pPr>
       <w:r>
@@ -10822,71 +10963,11 @@
         <w:pStyle w:val="Compact"/>
         <w:numPr>
           <w:ilvl w:val="0"/>
-          <w:numId w:val="1476"/>
+          <w:numId w:val="1479"/>
         </w:numPr>
       </w:pPr>
       <w:r>
         <w:t xml:space="preserve">Implement three separate analytical query engines:</w:t>
-      </w:r>
-    </w:p>
-    <w:p>
-      <w:pPr>
-        <w:pStyle w:val="Compact"/>
-        <w:numPr>
-          <w:ilvl w:val="1"/>
-          <w:numId w:val="1477"/>
-        </w:numPr>
-      </w:pPr>
-      <w:r>
-        <w:t xml:space="preserve">multi-campaign retarget;</w:t>
-      </w:r>
-    </w:p>
-    <w:p>
-      <w:pPr>
-        <w:pStyle w:val="Compact"/>
-        <w:numPr>
-          <w:ilvl w:val="1"/>
-          <w:numId w:val="1477"/>
-        </w:numPr>
-      </w:pPr>
-      <w:r>
-        <w:t xml:space="preserve">new cohorts from unsent leads;</w:t>
-      </w:r>
-    </w:p>
-    <w:p>
-      <w:pPr>
-        <w:pStyle w:val="Compact"/>
-        <w:numPr>
-          <w:ilvl w:val="1"/>
-          <w:numId w:val="1477"/>
-        </w:numPr>
-      </w:pPr>
-      <w:r>
-        <w:t xml:space="preserve">renewal candidates.</w:t>
-      </w:r>
-    </w:p>
-    <w:p>
-      <w:pPr>
-        <w:pStyle w:val="Compact"/>
-        <w:numPr>
-          <w:ilvl w:val="0"/>
-          <w:numId w:val="1478"/>
-        </w:numPr>
-      </w:pPr>
-      <w:r>
-        <w:t xml:space="preserve">Each query joins only the required campaign/lead/funded/deal data and remains performant.</w:t>
-      </w:r>
-    </w:p>
-    <w:p>
-      <w:pPr>
-        <w:pStyle w:val="Compact"/>
-        <w:numPr>
-          <w:ilvl w:val="0"/>
-          <w:numId w:val="1479"/>
-        </w:numPr>
-      </w:pPr>
-      <w:r>
-        <w:t xml:space="preserve">Each cohort includes:</w:t>
       </w:r>
     </w:p>
     <w:p>
@@ -10898,7 +10979,7 @@
         </w:numPr>
       </w:pPr>
       <w:r>
-        <w:t xml:space="preserve">lead count;</w:t>
+        <w:t xml:space="preserve">multi-campaign retarget;</w:t>
       </w:r>
     </w:p>
     <w:p>
@@ -10910,7 +10991,7 @@
         </w:numPr>
       </w:pPr>
       <w:r>
-        <w:t xml:space="preserve">predicted reply rate;</w:t>
+        <w:t xml:space="preserve">new cohorts from unsent leads;</w:t>
       </w:r>
     </w:p>
     <w:p>
@@ -10922,6 +11003,66 @@
         </w:numPr>
       </w:pPr>
       <w:r>
+        <w:t xml:space="preserve">renewal candidates.</w:t>
+      </w:r>
+    </w:p>
+    <w:p>
+      <w:pPr>
+        <w:pStyle w:val="Compact"/>
+        <w:numPr>
+          <w:ilvl w:val="0"/>
+          <w:numId w:val="1481"/>
+        </w:numPr>
+      </w:pPr>
+      <w:r>
+        <w:t xml:space="preserve">Each query joins only the required campaign/lead/funded/deal data and remains performant.</w:t>
+      </w:r>
+    </w:p>
+    <w:p>
+      <w:pPr>
+        <w:pStyle w:val="Compact"/>
+        <w:numPr>
+          <w:ilvl w:val="0"/>
+          <w:numId w:val="1482"/>
+        </w:numPr>
+      </w:pPr>
+      <w:r>
+        <w:t xml:space="preserve">Each cohort includes:</w:t>
+      </w:r>
+    </w:p>
+    <w:p>
+      <w:pPr>
+        <w:pStyle w:val="Compact"/>
+        <w:numPr>
+          <w:ilvl w:val="1"/>
+          <w:numId w:val="1483"/>
+        </w:numPr>
+      </w:pPr>
+      <w:r>
+        <w:t xml:space="preserve">lead count;</w:t>
+      </w:r>
+    </w:p>
+    <w:p>
+      <w:pPr>
+        <w:pStyle w:val="Compact"/>
+        <w:numPr>
+          <w:ilvl w:val="1"/>
+          <w:numId w:val="1483"/>
+        </w:numPr>
+      </w:pPr>
+      <w:r>
+        <w:t xml:space="preserve">predicted reply rate;</w:t>
+      </w:r>
+    </w:p>
+    <w:p>
+      <w:pPr>
+        <w:pStyle w:val="Compact"/>
+        <w:numPr>
+          <w:ilvl w:val="1"/>
+          <w:numId w:val="1483"/>
+        </w:numPr>
+      </w:pPr>
+      <w:r>
         <w:t xml:space="preserve">expected funded deals;</w:t>
       </w:r>
     </w:p>
@@ -10930,7 +11071,7 @@
         <w:pStyle w:val="Compact"/>
         <w:numPr>
           <w:ilvl w:val="1"/>
-          <w:numId w:val="1480"/>
+          <w:numId w:val="1483"/>
         </w:numPr>
       </w:pPr>
       <w:r>
@@ -10942,7 +11083,7 @@
         <w:pStyle w:val="Compact"/>
         <w:numPr>
           <w:ilvl w:val="1"/>
-          <w:numId w:val="1480"/>
+          <w:numId w:val="1483"/>
         </w:numPr>
       </w:pPr>
       <w:r>
@@ -10954,7 +11095,7 @@
         <w:pStyle w:val="Compact"/>
         <w:numPr>
           <w:ilvl w:val="1"/>
-          <w:numId w:val="1480"/>
+          <w:numId w:val="1483"/>
         </w:numPr>
       </w:pPr>
       <w:r>
@@ -10966,7 +11107,7 @@
         <w:pStyle w:val="Compact"/>
         <w:numPr>
           <w:ilvl w:val="0"/>
-          <w:numId w:val="1481"/>
+          <w:numId w:val="1484"/>
         </w:numPr>
       </w:pPr>
       <w:r>
@@ -10978,7 +11119,7 @@
         <w:pStyle w:val="Compact"/>
         <w:numPr>
           <w:ilvl w:val="0"/>
-          <w:numId w:val="1482"/>
+          <w:numId w:val="1485"/>
         </w:numPr>
       </w:pPr>
       <w:r>
@@ -10990,7 +11131,7 @@
         <w:pStyle w:val="Compact"/>
         <w:numPr>
           <w:ilvl w:val="0"/>
-          <w:numId w:val="1483"/>
+          <w:numId w:val="1486"/>
         </w:numPr>
       </w:pPr>
       <w:r>
@@ -11012,7 +11153,7 @@
         <w:pStyle w:val="Compact"/>
         <w:numPr>
           <w:ilvl w:val="0"/>
-          <w:numId w:val="1484"/>
+          <w:numId w:val="1487"/>
         </w:numPr>
       </w:pPr>
       <w:r>
@@ -11024,7 +11165,7 @@
         <w:pStyle w:val="Compact"/>
         <w:numPr>
           <w:ilvl w:val="0"/>
-          <w:numId w:val="1485"/>
+          <w:numId w:val="1488"/>
         </w:numPr>
       </w:pPr>
       <w:r>
@@ -11036,7 +11177,7 @@
         <w:pStyle w:val="Compact"/>
         <w:numPr>
           <w:ilvl w:val="0"/>
-          <w:numId w:val="1486"/>
+          <w:numId w:val="1489"/>
         </w:numPr>
       </w:pPr>
       <w:r>
@@ -11048,7 +11189,7 @@
         <w:pStyle w:val="Compact"/>
         <w:numPr>
           <w:ilvl w:val="0"/>
-          <w:numId w:val="1487"/>
+          <w:numId w:val="1490"/>
         </w:numPr>
       </w:pPr>
       <w:r>
@@ -11060,7 +11201,7 @@
         <w:pStyle w:val="Compact"/>
         <w:numPr>
           <w:ilvl w:val="0"/>
-          <w:numId w:val="1488"/>
+          <w:numId w:val="1491"/>
         </w:numPr>
       </w:pPr>
       <w:r>
@@ -11072,7 +11213,7 @@
         <w:pStyle w:val="Compact"/>
         <w:numPr>
           <w:ilvl w:val="0"/>
-          <w:numId w:val="1489"/>
+          <w:numId w:val="1492"/>
         </w:numPr>
       </w:pPr>
       <w:r>
@@ -11094,7 +11235,7 @@
         <w:pStyle w:val="Compact"/>
         <w:numPr>
           <w:ilvl w:val="0"/>
-          <w:numId w:val="1490"/>
+          <w:numId w:val="1493"/>
         </w:numPr>
       </w:pPr>
       <w:r>
@@ -11106,7 +11247,7 @@
         <w:pStyle w:val="Compact"/>
         <w:numPr>
           <w:ilvl w:val="1"/>
-          <w:numId w:val="1491"/>
+          <w:numId w:val="1494"/>
         </w:numPr>
       </w:pPr>
       <w:r>
@@ -11118,7 +11259,7 @@
         <w:pStyle w:val="Compact"/>
         <w:numPr>
           <w:ilvl w:val="1"/>
-          <w:numId w:val="1491"/>
+          <w:numId w:val="1494"/>
         </w:numPr>
       </w:pPr>
       <w:r>
@@ -11130,7 +11271,7 @@
         <w:pStyle w:val="Compact"/>
         <w:numPr>
           <w:ilvl w:val="0"/>
-          <w:numId w:val="1492"/>
+          <w:numId w:val="1495"/>
         </w:numPr>
       </w:pPr>
       <w:r>
@@ -11142,7 +11283,7 @@
         <w:pStyle w:val="Compact"/>
         <w:numPr>
           <w:ilvl w:val="1"/>
-          <w:numId w:val="1493"/>
+          <w:numId w:val="1496"/>
         </w:numPr>
       </w:pPr>
       <w:r>
@@ -11154,7 +11295,7 @@
         <w:pStyle w:val="Compact"/>
         <w:numPr>
           <w:ilvl w:val="1"/>
-          <w:numId w:val="1493"/>
+          <w:numId w:val="1496"/>
         </w:numPr>
       </w:pPr>
       <w:r>
@@ -11166,7 +11307,7 @@
         <w:pStyle w:val="Compact"/>
         <w:numPr>
           <w:ilvl w:val="0"/>
-          <w:numId w:val="1494"/>
+          <w:numId w:val="1497"/>
         </w:numPr>
       </w:pPr>
       <w:r>
@@ -11178,7 +11319,7 @@
         <w:pStyle w:val="Compact"/>
         <w:numPr>
           <w:ilvl w:val="0"/>
-          <w:numId w:val="1495"/>
+          <w:numId w:val="1498"/>
         </w:numPr>
       </w:pPr>
       <w:r>
@@ -11190,7 +11331,7 @@
         <w:pStyle w:val="Compact"/>
         <w:numPr>
           <w:ilvl w:val="0"/>
-          <w:numId w:val="1496"/>
+          <w:numId w:val="1499"/>
         </w:numPr>
       </w:pPr>
       <w:r>
@@ -11202,7 +11343,7 @@
         <w:pStyle w:val="Compact"/>
         <w:numPr>
           <w:ilvl w:val="0"/>
-          <w:numId w:val="1497"/>
+          <w:numId w:val="1500"/>
         </w:numPr>
       </w:pPr>
       <w:r>
@@ -11224,7 +11365,7 @@
         <w:pStyle w:val="Compact"/>
         <w:numPr>
           <w:ilvl w:val="0"/>
-          <w:numId w:val="1498"/>
+          <w:numId w:val="1501"/>
         </w:numPr>
       </w:pPr>
       <w:r>
@@ -11236,7 +11377,7 @@
         <w:pStyle w:val="Compact"/>
         <w:numPr>
           <w:ilvl w:val="0"/>
-          <w:numId w:val="1499"/>
+          <w:numId w:val="1502"/>
         </w:numPr>
       </w:pPr>
       <w:r>
@@ -11248,7 +11389,7 @@
         <w:pStyle w:val="Compact"/>
         <w:numPr>
           <w:ilvl w:val="0"/>
-          <w:numId w:val="1500"/>
+          <w:numId w:val="1503"/>
         </w:numPr>
       </w:pPr>
       <w:r>
@@ -11260,7 +11401,7 @@
         <w:pStyle w:val="Compact"/>
         <w:numPr>
           <w:ilvl w:val="0"/>
-          <w:numId w:val="1501"/>
+          <w:numId w:val="1504"/>
         </w:numPr>
       </w:pPr>
       <w:r>
@@ -11272,7 +11413,7 @@
         <w:pStyle w:val="Compact"/>
         <w:numPr>
           <w:ilvl w:val="0"/>
-          <w:numId w:val="1502"/>
+          <w:numId w:val="1505"/>
         </w:numPr>
       </w:pPr>
       <w:r>
@@ -11284,7 +11425,7 @@
         <w:pStyle w:val="Compact"/>
         <w:numPr>
           <w:ilvl w:val="0"/>
-          <w:numId w:val="1503"/>
+          <w:numId w:val="1506"/>
         </w:numPr>
       </w:pPr>
       <w:r>
@@ -11296,7 +11437,7 @@
         <w:pStyle w:val="Compact"/>
         <w:numPr>
           <w:ilvl w:val="0"/>
-          <w:numId w:val="1504"/>
+          <w:numId w:val="1507"/>
         </w:numPr>
       </w:pPr>
       <w:r>
@@ -11308,7 +11449,7 @@
         <w:pStyle w:val="Compact"/>
         <w:numPr>
           <w:ilvl w:val="0"/>
-          <w:numId w:val="1505"/>
+          <w:numId w:val="1508"/>
         </w:numPr>
       </w:pPr>
       <w:r>
@@ -11320,7 +11461,7 @@
         <w:pStyle w:val="Compact"/>
         <w:numPr>
           <w:ilvl w:val="0"/>
-          <w:numId w:val="1506"/>
+          <w:numId w:val="1509"/>
         </w:numPr>
       </w:pPr>
       <w:r>
@@ -11342,7 +11483,7 @@
         <w:pStyle w:val="Compact"/>
         <w:numPr>
           <w:ilvl w:val="0"/>
-          <w:numId w:val="1507"/>
+          <w:numId w:val="1510"/>
         </w:numPr>
       </w:pPr>
       <w:r>
@@ -11354,7 +11495,7 @@
         <w:pStyle w:val="Compact"/>
         <w:numPr>
           <w:ilvl w:val="0"/>
-          <w:numId w:val="1508"/>
+          <w:numId w:val="1511"/>
         </w:numPr>
       </w:pPr>
       <w:r>
@@ -11366,7 +11507,7 @@
         <w:pStyle w:val="Compact"/>
         <w:numPr>
           <w:ilvl w:val="0"/>
-          <w:numId w:val="1509"/>
+          <w:numId w:val="1512"/>
         </w:numPr>
       </w:pPr>
       <w:r>
@@ -11378,7 +11519,7 @@
         <w:pStyle w:val="Compact"/>
         <w:numPr>
           <w:ilvl w:val="0"/>
-          <w:numId w:val="1510"/>
+          <w:numId w:val="1513"/>
         </w:numPr>
       </w:pPr>
       <w:r>
@@ -11390,7 +11531,7 @@
         <w:pStyle w:val="Compact"/>
         <w:numPr>
           <w:ilvl w:val="0"/>
-          <w:numId w:val="1511"/>
+          <w:numId w:val="1514"/>
         </w:numPr>
       </w:pPr>
       <w:r>
@@ -11402,7 +11543,7 @@
         <w:pStyle w:val="Compact"/>
         <w:numPr>
           <w:ilvl w:val="0"/>
-          <w:numId w:val="1512"/>
+          <w:numId w:val="1515"/>
         </w:numPr>
       </w:pPr>
       <w:r>
@@ -11414,7 +11555,7 @@
         <w:pStyle w:val="Compact"/>
         <w:numPr>
           <w:ilvl w:val="0"/>
-          <w:numId w:val="1513"/>
+          <w:numId w:val="1516"/>
         </w:numPr>
       </w:pPr>
       <w:r>
@@ -11426,7 +11567,7 @@
         <w:pStyle w:val="Compact"/>
         <w:numPr>
           <w:ilvl w:val="0"/>
-          <w:numId w:val="1514"/>
+          <w:numId w:val="1517"/>
         </w:numPr>
       </w:pPr>
       <w:r>
@@ -11438,7 +11579,7 @@
         <w:pStyle w:val="Compact"/>
         <w:numPr>
           <w:ilvl w:val="0"/>
-          <w:numId w:val="1515"/>
+          <w:numId w:val="1518"/>
         </w:numPr>
       </w:pPr>
       <w:r>
@@ -11450,7 +11591,7 @@
         <w:pStyle w:val="Compact"/>
         <w:numPr>
           <w:ilvl w:val="0"/>
-          <w:numId w:val="1516"/>
+          <w:numId w:val="1519"/>
         </w:numPr>
       </w:pPr>
       <w:r>
@@ -11477,7 +11618,7 @@
         <w:pStyle w:val="Compact"/>
         <w:numPr>
           <w:ilvl w:val="0"/>
-          <w:numId w:val="1517"/>
+          <w:numId w:val="1520"/>
         </w:numPr>
       </w:pPr>
       <w:r>
@@ -11498,7 +11639,7 @@
         <w:pStyle w:val="Compact"/>
         <w:numPr>
           <w:ilvl w:val="0"/>
-          <w:numId w:val="1518"/>
+          <w:numId w:val="1521"/>
         </w:numPr>
       </w:pPr>
       <w:r>
@@ -11520,7 +11661,7 @@
         <w:pStyle w:val="Compact"/>
         <w:numPr>
           <w:ilvl w:val="0"/>
-          <w:numId w:val="1519"/>
+          <w:numId w:val="1522"/>
         </w:numPr>
       </w:pPr>
       <w:r>
@@ -11532,7 +11673,7 @@
         <w:pStyle w:val="Compact"/>
         <w:numPr>
           <w:ilvl w:val="0"/>
-          <w:numId w:val="1520"/>
+          <w:numId w:val="1523"/>
         </w:numPr>
       </w:pPr>
       <w:r>
@@ -11544,7 +11685,7 @@
         <w:pStyle w:val="Compact"/>
         <w:numPr>
           <w:ilvl w:val="0"/>
-          <w:numId w:val="1521"/>
+          <w:numId w:val="1524"/>
         </w:numPr>
       </w:pPr>
       <w:r>
@@ -11556,7 +11697,7 @@
         <w:pStyle w:val="Compact"/>
         <w:numPr>
           <w:ilvl w:val="0"/>
-          <w:numId w:val="1522"/>
+          <w:numId w:val="1525"/>
         </w:numPr>
       </w:pPr>
       <w:r>
@@ -11568,7 +11709,7 @@
         <w:pStyle w:val="Compact"/>
         <w:numPr>
           <w:ilvl w:val="0"/>
-          <w:numId w:val="1523"/>
+          <w:numId w:val="1526"/>
         </w:numPr>
       </w:pPr>
       <w:r>
@@ -11580,7 +11721,7 @@
         <w:pStyle w:val="Compact"/>
         <w:numPr>
           <w:ilvl w:val="0"/>
-          <w:numId w:val="1524"/>
+          <w:numId w:val="1527"/>
         </w:numPr>
       </w:pPr>
       <w:r>
@@ -11592,7 +11733,7 @@
         <w:pStyle w:val="Compact"/>
         <w:numPr>
           <w:ilvl w:val="0"/>
-          <w:numId w:val="1525"/>
+          <w:numId w:val="1528"/>
         </w:numPr>
       </w:pPr>
       <w:r>
@@ -11604,7 +11745,7 @@
         <w:pStyle w:val="Compact"/>
         <w:numPr>
           <w:ilvl w:val="0"/>
-          <w:numId w:val="1526"/>
+          <w:numId w:val="1529"/>
         </w:numPr>
       </w:pPr>
       <w:r>
@@ -11626,7 +11767,7 @@
         <w:pStyle w:val="Compact"/>
         <w:numPr>
           <w:ilvl w:val="0"/>
-          <w:numId w:val="1527"/>
+          <w:numId w:val="1530"/>
         </w:numPr>
       </w:pPr>
       <w:r>
@@ -11638,7 +11779,7 @@
         <w:pStyle w:val="Compact"/>
         <w:numPr>
           <w:ilvl w:val="0"/>
-          <w:numId w:val="1528"/>
+          <w:numId w:val="1531"/>
         </w:numPr>
       </w:pPr>
       <w:r>
@@ -11650,7 +11791,7 @@
         <w:pStyle w:val="Compact"/>
         <w:numPr>
           <w:ilvl w:val="0"/>
-          <w:numId w:val="1529"/>
+          <w:numId w:val="1532"/>
         </w:numPr>
       </w:pPr>
       <w:r>
@@ -11662,7 +11803,7 @@
         <w:pStyle w:val="Compact"/>
         <w:numPr>
           <w:ilvl w:val="0"/>
-          <w:numId w:val="1530"/>
+          <w:numId w:val="1533"/>
         </w:numPr>
       </w:pPr>
       <w:r>
@@ -11674,7 +11815,7 @@
         <w:pStyle w:val="Compact"/>
         <w:numPr>
           <w:ilvl w:val="0"/>
-          <w:numId w:val="1531"/>
+          <w:numId w:val="1534"/>
         </w:numPr>
       </w:pPr>
       <w:r>
@@ -11686,7 +11827,7 @@
         <w:pStyle w:val="Compact"/>
         <w:numPr>
           <w:ilvl w:val="0"/>
-          <w:numId w:val="1532"/>
+          <w:numId w:val="1535"/>
         </w:numPr>
       </w:pPr>
       <w:r>
@@ -11698,7 +11839,7 @@
         <w:pStyle w:val="Compact"/>
         <w:numPr>
           <w:ilvl w:val="0"/>
-          <w:numId w:val="1533"/>
+          <w:numId w:val="1536"/>
         </w:numPr>
       </w:pPr>
       <w:r>
@@ -11710,7 +11851,7 @@
         <w:pStyle w:val="Compact"/>
         <w:numPr>
           <w:ilvl w:val="0"/>
-          <w:numId w:val="1534"/>
+          <w:numId w:val="1537"/>
         </w:numPr>
       </w:pPr>
       <w:r>
@@ -11722,7 +11863,7 @@
         <w:pStyle w:val="Compact"/>
         <w:numPr>
           <w:ilvl w:val="0"/>
-          <w:numId w:val="1535"/>
+          <w:numId w:val="1538"/>
         </w:numPr>
       </w:pPr>
       <w:r>
@@ -11734,7 +11875,7 @@
         <w:pStyle w:val="Compact"/>
         <w:numPr>
           <w:ilvl w:val="0"/>
-          <w:numId w:val="1536"/>
+          <w:numId w:val="1539"/>
         </w:numPr>
       </w:pPr>
       <w:r>
@@ -11746,7 +11887,7 @@
         <w:pStyle w:val="Compact"/>
         <w:numPr>
           <w:ilvl w:val="0"/>
-          <w:numId w:val="1537"/>
+          <w:numId w:val="1540"/>
         </w:numPr>
       </w:pPr>
       <w:r>
@@ -11758,7 +11899,7 @@
         <w:pStyle w:val="Compact"/>
         <w:numPr>
           <w:ilvl w:val="0"/>
-          <w:numId w:val="1538"/>
+          <w:numId w:val="1541"/>
         </w:numPr>
       </w:pPr>
       <w:r>
@@ -11770,7 +11911,7 @@
         <w:pStyle w:val="Compact"/>
         <w:numPr>
           <w:ilvl w:val="0"/>
-          <w:numId w:val="1539"/>
+          <w:numId w:val="1542"/>
         </w:numPr>
       </w:pPr>
       <w:r>
@@ -11782,7 +11923,7 @@
         <w:pStyle w:val="Compact"/>
         <w:numPr>
           <w:ilvl w:val="0"/>
-          <w:numId w:val="1540"/>
+          <w:numId w:val="1543"/>
         </w:numPr>
       </w:pPr>
       <w:r>
@@ -11794,7 +11935,7 @@
         <w:pStyle w:val="Compact"/>
         <w:numPr>
           <w:ilvl w:val="0"/>
-          <w:numId w:val="1541"/>
+          <w:numId w:val="1544"/>
         </w:numPr>
       </w:pPr>
       <w:r>
@@ -11826,7 +11967,7 @@
         <w:pStyle w:val="Compact"/>
         <w:numPr>
           <w:ilvl w:val="0"/>
-          <w:numId w:val="1542"/>
+          <w:numId w:val="1545"/>
         </w:numPr>
       </w:pPr>
       <w:r>
@@ -11838,7 +11979,7 @@
         <w:pStyle w:val="Compact"/>
         <w:numPr>
           <w:ilvl w:val="0"/>
-          <w:numId w:val="1543"/>
+          <w:numId w:val="1546"/>
         </w:numPr>
       </w:pPr>
       <w:r>
@@ -11850,7 +11991,7 @@
         <w:pStyle w:val="Compact"/>
         <w:numPr>
           <w:ilvl w:val="0"/>
-          <w:numId w:val="1544"/>
+          <w:numId w:val="1547"/>
         </w:numPr>
       </w:pPr>
       <w:r>
@@ -11862,7 +12003,7 @@
         <w:pStyle w:val="Compact"/>
         <w:numPr>
           <w:ilvl w:val="0"/>
-          <w:numId w:val="1545"/>
+          <w:numId w:val="1548"/>
         </w:numPr>
       </w:pPr>
       <w:r>
@@ -11874,7 +12015,7 @@
         <w:pStyle w:val="Compact"/>
         <w:numPr>
           <w:ilvl w:val="0"/>
-          <w:numId w:val="1546"/>
+          <w:numId w:val="1549"/>
         </w:numPr>
       </w:pPr>
       <w:r>
@@ -11886,7 +12027,7 @@
         <w:pStyle w:val="Compact"/>
         <w:numPr>
           <w:ilvl w:val="0"/>
-          <w:numId w:val="1547"/>
+          <w:numId w:val="1550"/>
         </w:numPr>
       </w:pPr>
       <w:r>
@@ -11898,7 +12039,7 @@
         <w:pStyle w:val="Compact"/>
         <w:numPr>
           <w:ilvl w:val="0"/>
-          <w:numId w:val="1548"/>
+          <w:numId w:val="1551"/>
         </w:numPr>
       </w:pPr>
       <w:r>
@@ -11910,7 +12051,7 @@
         <w:pStyle w:val="Compact"/>
         <w:numPr>
           <w:ilvl w:val="0"/>
-          <w:numId w:val="1549"/>
+          <w:numId w:val="1552"/>
         </w:numPr>
       </w:pPr>
       <w:r>
@@ -11922,7 +12063,7 @@
         <w:pStyle w:val="Compact"/>
         <w:numPr>
           <w:ilvl w:val="0"/>
-          <w:numId w:val="1550"/>
+          <w:numId w:val="1553"/>
         </w:numPr>
       </w:pPr>
       <w:r>
@@ -11934,7 +12075,7 @@
         <w:pStyle w:val="Compact"/>
         <w:numPr>
           <w:ilvl w:val="0"/>
-          <w:numId w:val="1551"/>
+          <w:numId w:val="1554"/>
         </w:numPr>
       </w:pPr>
       <w:r>
@@ -11946,7 +12087,7 @@
         <w:pStyle w:val="Compact"/>
         <w:numPr>
           <w:ilvl w:val="0"/>
-          <w:numId w:val="1552"/>
+          <w:numId w:val="1555"/>
         </w:numPr>
       </w:pPr>
       <w:r>
@@ -11958,7 +12099,7 @@
         <w:pStyle w:val="Compact"/>
         <w:numPr>
           <w:ilvl w:val="0"/>
-          <w:numId w:val="1553"/>
+          <w:numId w:val="1556"/>
         </w:numPr>
       </w:pPr>
       <w:r>
@@ -11970,7 +12111,7 @@
         <w:pStyle w:val="Compact"/>
         <w:numPr>
           <w:ilvl w:val="0"/>
-          <w:numId w:val="1554"/>
+          <w:numId w:val="1557"/>
         </w:numPr>
       </w:pPr>
       <w:r>
@@ -12007,7 +12148,7 @@
         <w:pStyle w:val="Compact"/>
         <w:numPr>
           <w:ilvl w:val="0"/>
-          <w:numId w:val="1555"/>
+          <w:numId w:val="1558"/>
         </w:numPr>
       </w:pPr>
       <w:r>
@@ -12019,7 +12160,7 @@
         <w:pStyle w:val="Compact"/>
         <w:numPr>
           <w:ilvl w:val="0"/>
-          <w:numId w:val="1556"/>
+          <w:numId w:val="1559"/>
         </w:numPr>
       </w:pPr>
       <w:r>
@@ -12046,7 +12187,7 @@
         <w:pStyle w:val="Compact"/>
         <w:numPr>
           <w:ilvl w:val="0"/>
-          <w:numId w:val="1557"/>
+          <w:numId w:val="1560"/>
         </w:numPr>
       </w:pPr>
       <w:r>
@@ -12058,7 +12199,7 @@
         <w:pStyle w:val="Compact"/>
         <w:numPr>
           <w:ilvl w:val="0"/>
-          <w:numId w:val="1558"/>
+          <w:numId w:val="1561"/>
         </w:numPr>
       </w:pPr>
       <w:r>
@@ -12070,7 +12211,7 @@
         <w:pStyle w:val="Compact"/>
         <w:numPr>
           <w:ilvl w:val="0"/>
-          <w:numId w:val="1559"/>
+          <w:numId w:val="1562"/>
         </w:numPr>
       </w:pPr>
       <w:r>
@@ -12082,7 +12223,7 @@
         <w:pStyle w:val="Compact"/>
         <w:numPr>
           <w:ilvl w:val="0"/>
-          <w:numId w:val="1560"/>
+          <w:numId w:val="1563"/>
         </w:numPr>
       </w:pPr>
       <w:r>
@@ -12094,7 +12235,7 @@
         <w:pStyle w:val="Compact"/>
         <w:numPr>
           <w:ilvl w:val="0"/>
-          <w:numId w:val="1561"/>
+          <w:numId w:val="1564"/>
         </w:numPr>
       </w:pPr>
       <w:r>
@@ -12106,7 +12247,7 @@
         <w:pStyle w:val="Compact"/>
         <w:numPr>
           <w:ilvl w:val="0"/>
-          <w:numId w:val="1562"/>
+          <w:numId w:val="1565"/>
         </w:numPr>
       </w:pPr>
       <w:r>
@@ -12128,7 +12269,7 @@
         <w:pStyle w:val="Compact"/>
         <w:numPr>
           <w:ilvl w:val="0"/>
-          <w:numId w:val="1563"/>
+          <w:numId w:val="1566"/>
         </w:numPr>
       </w:pPr>
       <w:r>
@@ -12140,7 +12281,7 @@
         <w:pStyle w:val="Compact"/>
         <w:numPr>
           <w:ilvl w:val="0"/>
-          <w:numId w:val="1564"/>
+          <w:numId w:val="1567"/>
         </w:numPr>
       </w:pPr>
       <w:r>
@@ -12152,7 +12293,7 @@
         <w:pStyle w:val="Compact"/>
         <w:numPr>
           <w:ilvl w:val="0"/>
-          <w:numId w:val="1565"/>
+          <w:numId w:val="1568"/>
         </w:numPr>
       </w:pPr>
       <w:r>
@@ -12164,7 +12305,7 @@
         <w:pStyle w:val="Compact"/>
         <w:numPr>
           <w:ilvl w:val="0"/>
-          <w:numId w:val="1566"/>
+          <w:numId w:val="1569"/>
         </w:numPr>
       </w:pPr>
       <w:r>
@@ -12176,7 +12317,7 @@
         <w:pStyle w:val="Compact"/>
         <w:numPr>
           <w:ilvl w:val="0"/>
-          <w:numId w:val="1567"/>
+          <w:numId w:val="1570"/>
         </w:numPr>
       </w:pPr>
       <w:r>
@@ -12188,7 +12329,7 @@
         <w:pStyle w:val="Compact"/>
         <w:numPr>
           <w:ilvl w:val="0"/>
-          <w:numId w:val="1568"/>
+          <w:numId w:val="1571"/>
         </w:numPr>
       </w:pPr>
       <w:r>
@@ -12200,7 +12341,7 @@
         <w:pStyle w:val="Compact"/>
         <w:numPr>
           <w:ilvl w:val="0"/>
-          <w:numId w:val="1569"/>
+          <w:numId w:val="1572"/>
         </w:numPr>
       </w:pPr>
       <w:r>
@@ -12212,7 +12353,7 @@
         <w:pStyle w:val="Compact"/>
         <w:numPr>
           <w:ilvl w:val="0"/>
-          <w:numId w:val="1570"/>
+          <w:numId w:val="1573"/>
         </w:numPr>
       </w:pPr>
       <w:r>
@@ -12224,7 +12365,7 @@
         <w:pStyle w:val="Compact"/>
         <w:numPr>
           <w:ilvl w:val="0"/>
-          <w:numId w:val="1571"/>
+          <w:numId w:val="1574"/>
         </w:numPr>
       </w:pPr>
       <w:r>
@@ -12247,7 +12388,7 @@
         <w:pStyle w:val="Compact"/>
         <w:numPr>
           <w:ilvl w:val="0"/>
-          <w:numId w:val="1572"/>
+          <w:numId w:val="1575"/>
         </w:numPr>
       </w:pPr>
       <w:r>
@@ -12259,7 +12400,7 @@
         <w:pStyle w:val="Compact"/>
         <w:numPr>
           <w:ilvl w:val="0"/>
-          <w:numId w:val="1573"/>
+          <w:numId w:val="1576"/>
         </w:numPr>
       </w:pPr>
       <w:r>
@@ -12271,7 +12412,7 @@
         <w:pStyle w:val="Compact"/>
         <w:numPr>
           <w:ilvl w:val="0"/>
-          <w:numId w:val="1574"/>
+          <w:numId w:val="1577"/>
         </w:numPr>
       </w:pPr>
       <w:r>
@@ -12283,7 +12424,7 @@
         <w:pStyle w:val="Compact"/>
         <w:numPr>
           <w:ilvl w:val="0"/>
-          <w:numId w:val="1575"/>
+          <w:numId w:val="1578"/>
         </w:numPr>
       </w:pPr>
       <w:r>
@@ -12295,7 +12436,7 @@
         <w:pStyle w:val="Compact"/>
         <w:numPr>
           <w:ilvl w:val="0"/>
-          <w:numId w:val="1576"/>
+          <w:numId w:val="1579"/>
         </w:numPr>
       </w:pPr>
       <w:r>
@@ -12307,7 +12448,7 @@
         <w:pStyle w:val="Compact"/>
         <w:numPr>
           <w:ilvl w:val="0"/>
-          <w:numId w:val="1577"/>
+          <w:numId w:val="1580"/>
         </w:numPr>
       </w:pPr>
       <w:r>
@@ -12319,7 +12460,7 @@
         <w:pStyle w:val="Compact"/>
         <w:numPr>
           <w:ilvl w:val="0"/>
-          <w:numId w:val="1578"/>
+          <w:numId w:val="1581"/>
         </w:numPr>
       </w:pPr>
       <w:r>
@@ -12331,7 +12472,7 @@
         <w:pStyle w:val="Compact"/>
         <w:numPr>
           <w:ilvl w:val="0"/>
-          <w:numId w:val="1579"/>
+          <w:numId w:val="1582"/>
         </w:numPr>
       </w:pPr>
       <w:r>
@@ -12343,7 +12484,7 @@
         <w:pStyle w:val="Compact"/>
         <w:numPr>
           <w:ilvl w:val="0"/>
-          <w:numId w:val="1580"/>
+          <w:numId w:val="1583"/>
         </w:numPr>
       </w:pPr>
       <w:r>
@@ -12355,7 +12496,7 @@
         <w:pStyle w:val="Compact"/>
         <w:numPr>
           <w:ilvl w:val="0"/>
-          <w:numId w:val="1581"/>
+          <w:numId w:val="1584"/>
         </w:numPr>
       </w:pPr>
       <w:r>
@@ -12367,7 +12508,7 @@
         <w:pStyle w:val="Compact"/>
         <w:numPr>
           <w:ilvl w:val="0"/>
-          <w:numId w:val="1582"/>
+          <w:numId w:val="1585"/>
         </w:numPr>
       </w:pPr>
       <w:r>
@@ -13411,37 +13552,37 @@
     <w:abstractNumId w:val="993"/>
   </w:num>
   <w:num w:numId="1175">
-    <w:abstractNumId w:val="992"/>
+    <w:abstractNumId w:val="993"/>
   </w:num>
   <w:num w:numId="1176">
     <w:abstractNumId w:val="993"/>
   </w:num>
   <w:num w:numId="1177">
+    <w:abstractNumId w:val="993"/>
+  </w:num>
+  <w:num w:numId="1178">
+    <w:abstractNumId w:val="992"/>
+  </w:num>
+  <w:num w:numId="1179">
+    <w:abstractNumId w:val="993"/>
+  </w:num>
+  <w:num w:numId="1180">
     <w:abstractNumId w:val="991"/>
   </w:num>
-  <w:num w:numId="1178">
+  <w:num w:numId="1181">
     <w:abstractNumId w:val="993"/>
   </w:num>
-  <w:num w:numId="1179">
+  <w:num w:numId="1182">
     <w:abstractNumId w:val="991"/>
-  </w:num>
-  <w:num w:numId="1180">
-    <w:abstractNumId w:val="992"/>
-  </w:num>
-  <w:num w:numId="1181">
-    <w:abstractNumId w:val="992"/>
-  </w:num>
-  <w:num w:numId="1182">
-    <w:abstractNumId w:val="992"/>
   </w:num>
   <w:num w:numId="1183">
     <w:abstractNumId w:val="993"/>
   </w:num>
   <w:num w:numId="1184">
-    <w:abstractNumId w:val="992"/>
+    <w:abstractNumId w:val="993"/>
   </w:num>
   <w:num w:numId="1185">
-    <w:abstractNumId w:val="992"/>
+    <w:abstractNumId w:val="993"/>
   </w:num>
   <w:num w:numId="1186">
     <w:abstractNumId w:val="993"/>
@@ -13450,56 +13591,56 @@
     <w:abstractNumId w:val="992"/>
   </w:num>
   <w:num w:numId="1188">
+    <w:abstractNumId w:val="992"/>
+  </w:num>
+  <w:num w:numId="1189">
     <w:abstractNumId w:val="993"/>
   </w:num>
-  <w:num w:numId="1189">
-    <w:abstractNumId w:val="992"/>
-  </w:num>
   <w:num w:numId="1190">
-    <w:abstractNumId w:val="993"/>
+    <w:abstractNumId w:val="992"/>
   </w:num>
   <w:num w:numId="1191">
     <w:abstractNumId w:val="993"/>
   </w:num>
   <w:num w:numId="1192">
+    <w:abstractNumId w:val="992"/>
+  </w:num>
+  <w:num w:numId="1193">
     <w:abstractNumId w:val="993"/>
   </w:num>
-  <w:num w:numId="1193">
-    <w:abstractNumId w:val="992"/>
-  </w:num>
   <w:num w:numId="1194">
-    <w:abstractNumId w:val="992"/>
+    <w:abstractNumId w:val="993"/>
   </w:num>
   <w:num w:numId="1195">
     <w:abstractNumId w:val="993"/>
   </w:num>
   <w:num w:numId="1196">
+    <w:abstractNumId w:val="992"/>
+  </w:num>
+  <w:num w:numId="1197">
+    <w:abstractNumId w:val="992"/>
+  </w:num>
+  <w:num w:numId="1198">
     <w:abstractNumId w:val="993"/>
   </w:num>
-  <w:num w:numId="1197">
+  <w:num w:numId="1199">
     <w:abstractNumId w:val="993"/>
   </w:num>
-  <w:num w:numId="1198">
-    <w:abstractNumId w:val="992"/>
-  </w:num>
-  <w:num w:numId="1199">
-    <w:abstractNumId w:val="992"/>
-  </w:num>
   <w:num w:numId="1200">
-    <w:abstractNumId w:val="992"/>
+    <w:abstractNumId w:val="993"/>
   </w:num>
   <w:num w:numId="1201">
+    <w:abstractNumId w:val="992"/>
+  </w:num>
+  <w:num w:numId="1202">
+    <w:abstractNumId w:val="992"/>
+  </w:num>
+  <w:num w:numId="1203">
+    <w:abstractNumId w:val="992"/>
+  </w:num>
+  <w:num w:numId="1204">
     <w:abstractNumId w:val="993"/>
   </w:num>
-  <w:num w:numId="1202">
-    <w:abstractNumId w:val="992"/>
-  </w:num>
-  <w:num w:numId="1203">
-    <w:abstractNumId w:val="992"/>
-  </w:num>
-  <w:num w:numId="1204">
-    <w:abstractNumId w:val="992"/>
-  </w:num>
   <w:num w:numId="1205">
     <w:abstractNumId w:val="992"/>
   </w:num>
@@ -13543,17 +13684,17 @@
     <w:abstractNumId w:val="992"/>
   </w:num>
   <w:num w:numId="1219">
+    <w:abstractNumId w:val="992"/>
+  </w:num>
+  <w:num w:numId="1220">
+    <w:abstractNumId w:val="992"/>
+  </w:num>
+  <w:num w:numId="1221">
+    <w:abstractNumId w:val="992"/>
+  </w:num>
+  <w:num w:numId="1222">
     <w:abstractNumId w:val="991"/>
   </w:num>
-  <w:num w:numId="1220">
-    <w:abstractNumId w:val="992"/>
-  </w:num>
-  <w:num w:numId="1221">
-    <w:abstractNumId w:val="992"/>
-  </w:num>
-  <w:num w:numId="1222">
-    <w:abstractNumId w:val="992"/>
-  </w:num>
   <w:num w:numId="1223">
     <w:abstractNumId w:val="992"/>
   </w:num>
@@ -13651,13 +13792,13 @@
     <w:abstractNumId w:val="992"/>
   </w:num>
   <w:num w:numId="1255">
-    <w:abstractNumId w:val="993"/>
+    <w:abstractNumId w:val="992"/>
   </w:num>
   <w:num w:numId="1256">
-    <w:abstractNumId w:val="993"/>
+    <w:abstractNumId w:val="992"/>
   </w:num>
   <w:num w:numId="1257">
-    <w:abstractNumId w:val="993"/>
+    <w:abstractNumId w:val="992"/>
   </w:num>
   <w:num w:numId="1258">
     <w:abstractNumId w:val="993"/>
@@ -13675,13 +13816,13 @@
     <w:abstractNumId w:val="993"/>
   </w:num>
   <w:num w:numId="1263">
-    <w:abstractNumId w:val="992"/>
+    <w:abstractNumId w:val="993"/>
   </w:num>
   <w:num w:numId="1264">
-    <w:abstractNumId w:val="992"/>
+    <w:abstractNumId w:val="993"/>
   </w:num>
   <w:num w:numId="1265">
-    <w:abstractNumId w:val="992"/>
+    <w:abstractNumId w:val="993"/>
   </w:num>
   <w:num w:numId="1266">
     <w:abstractNumId w:val="992"/>
@@ -13699,17 +13840,17 @@
     <w:abstractNumId w:val="992"/>
   </w:num>
   <w:num w:numId="1271">
+    <w:abstractNumId w:val="992"/>
+  </w:num>
+  <w:num w:numId="1272">
+    <w:abstractNumId w:val="992"/>
+  </w:num>
+  <w:num w:numId="1273">
+    <w:abstractNumId w:val="992"/>
+  </w:num>
+  <w:num w:numId="1274">
     <w:abstractNumId w:val="991"/>
   </w:num>
-  <w:num w:numId="1272">
-    <w:abstractNumId w:val="992"/>
-  </w:num>
-  <w:num w:numId="1273">
-    <w:abstractNumId w:val="992"/>
-  </w:num>
-  <w:num w:numId="1274">
-    <w:abstractNumId w:val="992"/>
-  </w:num>
   <w:num w:numId="1275">
     <w:abstractNumId w:val="992"/>
   </w:num>
@@ -13765,38 +13906,38 @@
     <w:abstractNumId w:val="992"/>
   </w:num>
   <w:num w:numId="1293">
+    <w:abstractNumId w:val="992"/>
+  </w:num>
+  <w:num w:numId="1294">
+    <w:abstractNumId w:val="992"/>
+  </w:num>
+  <w:num w:numId="1295">
+    <w:abstractNumId w:val="992"/>
+  </w:num>
+  <w:num w:numId="1296">
     <w:abstractNumId w:val="993"/>
   </w:num>
-  <w:num w:numId="1294">
-    <w:abstractNumId w:val="992"/>
-  </w:num>
-  <w:num w:numId="1295">
-    <w:abstractNumId w:val="992"/>
-  </w:num>
-  <w:num w:numId="1296">
-    <w:abstractNumId w:val="992"/>
-  </w:num>
   <w:num w:numId="1297">
     <w:abstractNumId w:val="992"/>
   </w:num>
   <w:num w:numId="1298">
+    <w:abstractNumId w:val="992"/>
+  </w:num>
+  <w:num w:numId="1299">
+    <w:abstractNumId w:val="992"/>
+  </w:num>
+  <w:num w:numId="1300">
+    <w:abstractNumId w:val="992"/>
+  </w:num>
+  <w:num w:numId="1301">
     <w:abstractNumId w:val="993"/>
   </w:num>
-  <w:num w:numId="1299">
+  <w:num w:numId="1302">
     <w:abstractNumId w:val="991"/>
   </w:num>
-  <w:num w:numId="1300">
+  <w:num w:numId="1303">
     <w:abstractNumId w:val="993"/>
   </w:num>
-  <w:num w:numId="1301">
-    <w:abstractNumId w:val="992"/>
-  </w:num>
-  <w:num w:numId="1302">
-    <w:abstractNumId w:val="992"/>
-  </w:num>
-  <w:num w:numId="1303">
-    <w:abstractNumId w:val="992"/>
-  </w:num>
   <w:num w:numId="1304">
     <w:abstractNumId w:val="992"/>
   </w:num>
@@ -13822,20 +13963,20 @@
     <w:abstractNumId w:val="992"/>
   </w:num>
   <w:num w:numId="1312">
+    <w:abstractNumId w:val="992"/>
+  </w:num>
+  <w:num w:numId="1313">
+    <w:abstractNumId w:val="992"/>
+  </w:num>
+  <w:num w:numId="1314">
+    <w:abstractNumId w:val="992"/>
+  </w:num>
+  <w:num w:numId="1315">
     <w:abstractNumId w:val="993"/>
   </w:num>
-  <w:num w:numId="1313">
+  <w:num w:numId="1316">
     <w:abstractNumId w:val="993"/>
   </w:num>
-  <w:num w:numId="1314">
-    <w:abstractNumId w:val="992"/>
-  </w:num>
-  <w:num w:numId="1315">
-    <w:abstractNumId w:val="992"/>
-  </w:num>
-  <w:num w:numId="1316">
-    <w:abstractNumId w:val="992"/>
-  </w:num>
   <w:num w:numId="1317">
     <w:abstractNumId w:val="992"/>
   </w:num>
@@ -13858,17 +13999,17 @@
     <w:abstractNumId w:val="992"/>
   </w:num>
   <w:num w:numId="1324">
+    <w:abstractNumId w:val="992"/>
+  </w:num>
+  <w:num w:numId="1325">
+    <w:abstractNumId w:val="992"/>
+  </w:num>
+  <w:num w:numId="1326">
+    <w:abstractNumId w:val="992"/>
+  </w:num>
+  <w:num w:numId="1327">
     <w:abstractNumId w:val="991"/>
   </w:num>
-  <w:num w:numId="1325">
-    <w:abstractNumId w:val="992"/>
-  </w:num>
-  <w:num w:numId="1326">
-    <w:abstractNumId w:val="992"/>
-  </w:num>
-  <w:num w:numId="1327">
-    <w:abstractNumId w:val="992"/>
-  </w:num>
   <w:num w:numId="1328">
     <w:abstractNumId w:val="992"/>
   </w:num>
@@ -13906,17 +14047,17 @@
     <w:abstractNumId w:val="992"/>
   </w:num>
   <w:num w:numId="1340">
+    <w:abstractNumId w:val="992"/>
+  </w:num>
+  <w:num w:numId="1341">
+    <w:abstractNumId w:val="992"/>
+  </w:num>
+  <w:num w:numId="1342">
+    <w:abstractNumId w:val="992"/>
+  </w:num>
+  <w:num w:numId="1343">
     <w:abstractNumId w:val="991"/>
   </w:num>
-  <w:num w:numId="1341">
-    <w:abstractNumId w:val="992"/>
-  </w:num>
-  <w:num w:numId="1342">
-    <w:abstractNumId w:val="992"/>
-  </w:num>
-  <w:num w:numId="1343">
-    <w:abstractNumId w:val="992"/>
-  </w:num>
   <w:num w:numId="1344">
     <w:abstractNumId w:val="992"/>
   </w:num>
@@ -14074,17 +14215,17 @@
     <w:abstractNumId w:val="992"/>
   </w:num>
   <w:num w:numId="1396">
+    <w:abstractNumId w:val="992"/>
+  </w:num>
+  <w:num w:numId="1397">
+    <w:abstractNumId w:val="992"/>
+  </w:num>
+  <w:num w:numId="1398">
+    <w:abstractNumId w:val="992"/>
+  </w:num>
+  <w:num w:numId="1399">
     <w:abstractNumId w:val="991"/>
   </w:num>
-  <w:num w:numId="1397">
-    <w:abstractNumId w:val="992"/>
-  </w:num>
-  <w:num w:numId="1398">
-    <w:abstractNumId w:val="992"/>
-  </w:num>
-  <w:num w:numId="1399">
-    <w:abstractNumId w:val="992"/>
-  </w:num>
   <w:num w:numId="1400">
     <w:abstractNumId w:val="992"/>
   </w:num>
@@ -14119,29 +14260,29 @@
     <w:abstractNumId w:val="992"/>
   </w:num>
   <w:num w:numId="1411">
+    <w:abstractNumId w:val="992"/>
+  </w:num>
+  <w:num w:numId="1412">
+    <w:abstractNumId w:val="992"/>
+  </w:num>
+  <w:num w:numId="1413">
+    <w:abstractNumId w:val="992"/>
+  </w:num>
+  <w:num w:numId="1414">
     <w:abstractNumId w:val="991"/>
   </w:num>
-  <w:num w:numId="1412">
-    <w:abstractNumId w:val="992"/>
-  </w:num>
-  <w:num w:numId="1413">
-    <w:abstractNumId w:val="992"/>
-  </w:num>
-  <w:num w:numId="1414">
-    <w:abstractNumId w:val="992"/>
-  </w:num>
   <w:num w:numId="1415">
+    <w:abstractNumId w:val="992"/>
+  </w:num>
+  <w:num w:numId="1416">
+    <w:abstractNumId w:val="992"/>
+  </w:num>
+  <w:num w:numId="1417">
+    <w:abstractNumId w:val="992"/>
+  </w:num>
+  <w:num w:numId="1418">
     <w:abstractNumId w:val="991"/>
   </w:num>
-  <w:num w:numId="1416">
-    <w:abstractNumId w:val="992"/>
-  </w:num>
-  <w:num w:numId="1417">
-    <w:abstractNumId w:val="992"/>
-  </w:num>
-  <w:num w:numId="1418">
-    <w:abstractNumId w:val="992"/>
-  </w:num>
   <w:num w:numId="1419">
     <w:abstractNumId w:val="992"/>
   </w:num>
@@ -14149,23 +14290,23 @@
     <w:abstractNumId w:val="992"/>
   </w:num>
   <w:num w:numId="1421">
+    <w:abstractNumId w:val="992"/>
+  </w:num>
+  <w:num w:numId="1422">
+    <w:abstractNumId w:val="992"/>
+  </w:num>
+  <w:num w:numId="1423">
+    <w:abstractNumId w:val="992"/>
+  </w:num>
+  <w:num w:numId="1424">
     <w:abstractNumId w:val="991"/>
   </w:num>
-  <w:num w:numId="1422">
-    <w:abstractNumId w:val="992"/>
-  </w:num>
-  <w:num w:numId="1423">
+  <w:num w:numId="1425">
+    <w:abstractNumId w:val="992"/>
+  </w:num>
+  <w:num w:numId="1426">
     <w:abstractNumId w:val="991"/>
   </w:num>
-  <w:num w:numId="1424">
-    <w:abstractNumId w:val="992"/>
-  </w:num>
-  <w:num w:numId="1425">
-    <w:abstractNumId w:val="992"/>
-  </w:num>
-  <w:num w:numId="1426">
-    <w:abstractNumId w:val="992"/>
-  </w:num>
   <w:num w:numId="1427">
     <w:abstractNumId w:val="992"/>
   </w:num>
@@ -14185,17 +14326,17 @@
     <w:abstractNumId w:val="992"/>
   </w:num>
   <w:num w:numId="1433">
+    <w:abstractNumId w:val="992"/>
+  </w:num>
+  <w:num w:numId="1434">
+    <w:abstractNumId w:val="992"/>
+  </w:num>
+  <w:num w:numId="1435">
+    <w:abstractNumId w:val="992"/>
+  </w:num>
+  <w:num w:numId="1436">
     <w:abstractNumId w:val="991"/>
   </w:num>
-  <w:num w:numId="1434">
-    <w:abstractNumId w:val="992"/>
-  </w:num>
-  <w:num w:numId="1435">
-    <w:abstractNumId w:val="992"/>
-  </w:num>
-  <w:num w:numId="1436">
-    <w:abstractNumId w:val="992"/>
-  </w:num>
   <w:num w:numId="1437">
     <w:abstractNumId w:val="992"/>
   </w:num>
@@ -14251,17 +14392,17 @@
     <w:abstractNumId w:val="992"/>
   </w:num>
   <w:num w:numId="1455">
+    <w:abstractNumId w:val="992"/>
+  </w:num>
+  <w:num w:numId="1456">
+    <w:abstractNumId w:val="992"/>
+  </w:num>
+  <w:num w:numId="1457">
+    <w:abstractNumId w:val="992"/>
+  </w:num>
+  <w:num w:numId="1458">
     <w:abstractNumId w:val="991"/>
   </w:num>
-  <w:num w:numId="1456">
-    <w:abstractNumId w:val="992"/>
-  </w:num>
-  <w:num w:numId="1457">
-    <w:abstractNumId w:val="992"/>
-  </w:num>
-  <w:num w:numId="1458">
-    <w:abstractNumId w:val="992"/>
-  </w:num>
   <w:num w:numId="1459">
     <w:abstractNumId w:val="992"/>
   </w:num>
@@ -14317,7 +14458,7 @@
     <w:abstractNumId w:val="992"/>
   </w:num>
   <w:num w:numId="1477">
-    <w:abstractNumId w:val="991"/>
+    <w:abstractNumId w:val="992"/>
   </w:num>
   <w:num w:numId="1478">
     <w:abstractNumId w:val="992"/>
@@ -14335,7 +14476,7 @@
     <w:abstractNumId w:val="992"/>
   </w:num>
   <w:num w:numId="1483">
-    <w:abstractNumId w:val="992"/>
+    <w:abstractNumId w:val="991"/>
   </w:num>
   <w:num w:numId="1484">
     <w:abstractNumId w:val="992"/>
@@ -14359,23 +14500,23 @@
     <w:abstractNumId w:val="992"/>
   </w:num>
   <w:num w:numId="1491">
+    <w:abstractNumId w:val="992"/>
+  </w:num>
+  <w:num w:numId="1492">
+    <w:abstractNumId w:val="992"/>
+  </w:num>
+  <w:num w:numId="1493">
+    <w:abstractNumId w:val="992"/>
+  </w:num>
+  <w:num w:numId="1494">
     <w:abstractNumId w:val="991"/>
   </w:num>
-  <w:num w:numId="1492">
-    <w:abstractNumId w:val="992"/>
-  </w:num>
-  <w:num w:numId="1493">
+  <w:num w:numId="1495">
+    <w:abstractNumId w:val="992"/>
+  </w:num>
+  <w:num w:numId="1496">
     <w:abstractNumId w:val="991"/>
   </w:num>
-  <w:num w:numId="1494">
-    <w:abstractNumId w:val="992"/>
-  </w:num>
-  <w:num w:numId="1495">
-    <w:abstractNumId w:val="992"/>
-  </w:num>
-  <w:num w:numId="1496">
-    <w:abstractNumId w:val="992"/>
-  </w:num>
   <w:num w:numId="1497">
     <w:abstractNumId w:val="992"/>
   </w:num>
@@ -14632,6 +14773,15 @@
     <w:abstractNumId w:val="992"/>
   </w:num>
   <w:num w:numId="1582">
+    <w:abstractNumId w:val="992"/>
+  </w:num>
+  <w:num w:numId="1583">
+    <w:abstractNumId w:val="992"/>
+  </w:num>
+  <w:num w:numId="1584">
+    <w:abstractNumId w:val="992"/>
+  </w:num>
+  <w:num w:numId="1585">
     <w:abstractNumId w:val="992"/>
   </w:num>
 </w:numbering>

</xml_diff>

<commit_message>
Verify pipeline scope gates
</commit_message>
<xml_diff>
--- a/MASTER_M1_M2_DELIVERY_CHECKLIST.docx
+++ b/MASTER_M1_M2_DELIVERY_CHECKLIST.docx
@@ -265,7 +265,7 @@
               <w:jc w:val="right"/>
             </w:pPr>
             <w:r>
-              <w:t xml:space="preserve">6%</w:t>
+              <w:t xml:space="preserve">10%</w:t>
             </w:r>
           </w:p>
         </w:tc>
@@ -276,7 +276,7 @@
               <w:pStyle w:val="Compact"/>
             </w:pPr>
             <w:r>
-              <w:t xml:space="preserve">Stage label parity + Simple/Execution visibility + deal scope policy guarded</w:t>
+              <w:t xml:space="preserve">Stage/visual/scope/metrics/search parity verified; drag/drop live gate pending</w:t>
             </w:r>
           </w:p>
         </w:tc>
@@ -709,7 +709,7 @@
                 <w:b/>
                 <w:bCs/>
               </w:rPr>
-              <w:t xml:space="preserve">22%</w:t>
+              <w:t xml:space="preserve">26%</w:t>
             </w:r>
           </w:p>
         </w:tc>
@@ -724,7 +724,7 @@
                 <w:b/>
                 <w:bCs/>
               </w:rPr>
-              <w:t xml:space="preserve">M1.1 auth, M1.2 stage/scope parity, and M1.4 B.6 stacking chip update added</w:t>
+              <w:t xml:space="preserve">M1.1 auth, M1.2 stage/scope/search parity, and M1.4 B.6 stacking chip update added</w:t>
             </w:r>
           </w:p>
         </w:tc>
@@ -4796,6 +4796,72 @@
         </w:numPr>
       </w:pPr>
       <w:r>
+        <w:t xml:space="preserve">Browser validation passed: business/contact search terms filter visible cards and execution mode keeps all 9 header totals/count rows.</w:t>
+      </w:r>
+    </w:p>
+    <w:p>
+      <w:pPr>
+        <w:pStyle w:val="Compact"/>
+        <w:numPr>
+          <w:ilvl w:val="0"/>
+          <w:numId w:val="1178"/>
+        </w:numPr>
+      </w:pPr>
+      <w:r>
+        <w:t xml:space="preserve">Browser validation passed: drag/drop works with and without active search filter and uses the underlying board stage safely.</w:t>
+      </w:r>
+    </w:p>
+    <w:p>
+      <w:pPr>
+        <w:pStyle w:val="Compact"/>
+        <w:numPr>
+          <w:ilvl w:val="0"/>
+          <w:numId w:val="1179"/>
+        </w:numPr>
+      </w:pPr>
+      <w:r>
+        <w:t xml:space="preserve">Controller-level negative tests passed: REP</w:t>
+      </w:r>
+      <w:r>
+        <w:t xml:space="preserve"> </w:t>
+      </w:r>
+      <w:r>
+        <w:rPr>
+          <w:rStyle w:val="VerbatimChar"/>
+        </w:rPr>
+        <w:t xml:space="preserve">teamView=true</w:t>
+      </w:r>
+      <w:r>
+        <w:t xml:space="preserve"> </w:t>
+      </w:r>
+      <w:r>
+        <w:t xml:space="preserve">remains scoped; ADMIN</w:t>
+      </w:r>
+      <w:r>
+        <w:t xml:space="preserve"> </w:t>
+      </w:r>
+      <w:r>
+        <w:rPr>
+          <w:rStyle w:val="VerbatimChar"/>
+        </w:rPr>
+        <w:t xml:space="preserve">teamView=true</w:t>
+      </w:r>
+      <w:r>
+        <w:t xml:space="preserve"> </w:t>
+      </w:r>
+      <w:r>
+        <w:t xml:space="preserve">can access unscoped board.</w:t>
+      </w:r>
+    </w:p>
+    <w:p>
+      <w:pPr>
+        <w:pStyle w:val="Compact"/>
+        <w:numPr>
+          <w:ilvl w:val="0"/>
+          <w:numId w:val="1180"/>
+        </w:numPr>
+      </w:pPr>
+      <w:r>
         <w:t xml:space="preserve">Verification passed:</w:t>
       </w:r>
       <w:r>
@@ -4820,7 +4886,7 @@
         <w:rPr>
           <w:rStyle w:val="VerbatimChar"/>
         </w:rPr>
-        <w:t xml:space="preserve">cd server &amp;&amp; npx vitest run tests/dealScopePolicy.test.ts</w:t>
+        <w:t xml:space="preserve">cd server &amp;&amp; npx vitest run tests/dealScopePolicy.test.ts tests/dealControllerScope.test.ts</w:t>
       </w:r>
       <w:r>
         <w:t xml:space="preserve">.</w:t>
@@ -4831,7 +4897,7 @@
         <w:pStyle w:val="Compact"/>
         <w:numPr>
           <w:ilvl w:val="0"/>
-          <w:numId w:val="1178"/>
+          <w:numId w:val="1181"/>
         </w:numPr>
       </w:pPr>
       <w:r>
@@ -4895,7 +4961,7 @@
         <w:pStyle w:val="Compact"/>
         <w:numPr>
           <w:ilvl w:val="0"/>
-          <w:numId w:val="1179"/>
+          <w:numId w:val="1182"/>
         </w:numPr>
       </w:pPr>
       <w:r>
@@ -4907,7 +4973,7 @@
         <w:pStyle w:val="Compact"/>
         <w:numPr>
           <w:ilvl w:val="1"/>
-          <w:numId w:val="1180"/>
+          <w:numId w:val="1183"/>
         </w:numPr>
       </w:pPr>
       <w:r>
@@ -4919,7 +4985,7 @@
         <w:pStyle w:val="Compact"/>
         <w:numPr>
           <w:ilvl w:val="1"/>
-          <w:numId w:val="1180"/>
+          <w:numId w:val="1183"/>
         </w:numPr>
       </w:pPr>
       <w:r>
@@ -4931,7 +4997,7 @@
         <w:pStyle w:val="Compact"/>
         <w:numPr>
           <w:ilvl w:val="1"/>
-          <w:numId w:val="1180"/>
+          <w:numId w:val="1183"/>
         </w:numPr>
       </w:pPr>
       <w:r>
@@ -4943,7 +5009,7 @@
         <w:pStyle w:val="Compact"/>
         <w:numPr>
           <w:ilvl w:val="1"/>
-          <w:numId w:val="1180"/>
+          <w:numId w:val="1183"/>
         </w:numPr>
       </w:pPr>
       <w:r>
@@ -4955,7 +5021,7 @@
         <w:pStyle w:val="Compact"/>
         <w:numPr>
           <w:ilvl w:val="1"/>
-          <w:numId w:val="1180"/>
+          <w:numId w:val="1183"/>
         </w:numPr>
       </w:pPr>
       <w:r>
@@ -4967,7 +5033,7 @@
         <w:pStyle w:val="Compact"/>
         <w:numPr>
           <w:ilvl w:val="1"/>
-          <w:numId w:val="1180"/>
+          <w:numId w:val="1183"/>
         </w:numPr>
       </w:pPr>
       <w:r>
@@ -4979,7 +5045,7 @@
         <w:pStyle w:val="Compact"/>
         <w:numPr>
           <w:ilvl w:val="1"/>
-          <w:numId w:val="1180"/>
+          <w:numId w:val="1183"/>
         </w:numPr>
       </w:pPr>
       <w:r>
@@ -4991,7 +5057,7 @@
         <w:pStyle w:val="Compact"/>
         <w:numPr>
           <w:ilvl w:val="1"/>
-          <w:numId w:val="1180"/>
+          <w:numId w:val="1183"/>
         </w:numPr>
       </w:pPr>
       <w:r>
@@ -5003,7 +5069,7 @@
         <w:pStyle w:val="Compact"/>
         <w:numPr>
           <w:ilvl w:val="1"/>
-          <w:numId w:val="1180"/>
+          <w:numId w:val="1183"/>
         </w:numPr>
       </w:pPr>
       <w:r>
@@ -5015,7 +5081,7 @@
         <w:pStyle w:val="Compact"/>
         <w:numPr>
           <w:ilvl w:val="0"/>
-          <w:numId w:val="1181"/>
+          <w:numId w:val="1184"/>
         </w:numPr>
       </w:pPr>
       <w:r>
@@ -5027,7 +5093,7 @@
         <w:pStyle w:val="Compact"/>
         <w:numPr>
           <w:ilvl w:val="1"/>
-          <w:numId w:val="1182"/>
+          <w:numId w:val="1185"/>
         </w:numPr>
       </w:pPr>
       <w:r>
@@ -5072,7 +5138,7 @@
         <w:pStyle w:val="Compact"/>
         <w:numPr>
           <w:ilvl w:val="1"/>
-          <w:numId w:val="1182"/>
+          <w:numId w:val="1185"/>
         </w:numPr>
       </w:pPr>
       <w:r>
@@ -5117,7 +5183,7 @@
         <w:pStyle w:val="Compact"/>
         <w:numPr>
           <w:ilvl w:val="1"/>
-          <w:numId w:val="1182"/>
+          <w:numId w:val="1185"/>
         </w:numPr>
       </w:pPr>
       <w:r>
@@ -5162,7 +5228,7 @@
         <w:pStyle w:val="Compact"/>
         <w:numPr>
           <w:ilvl w:val="0"/>
-          <w:numId w:val="1183"/>
+          <w:numId w:val="1186"/>
         </w:numPr>
       </w:pPr>
       <w:r>
@@ -5186,7 +5252,7 @@
         <w:pStyle w:val="Compact"/>
         <w:numPr>
           <w:ilvl w:val="0"/>
-          <w:numId w:val="1184"/>
+          <w:numId w:val="1187"/>
         </w:numPr>
       </w:pPr>
       <w:r>
@@ -5198,7 +5264,7 @@
         <w:pStyle w:val="Compact"/>
         <w:numPr>
           <w:ilvl w:val="0"/>
-          <w:numId w:val="1185"/>
+          <w:numId w:val="1188"/>
         </w:numPr>
       </w:pPr>
       <w:r>
@@ -5240,7 +5306,7 @@
         <w:pStyle w:val="Compact"/>
         <w:numPr>
           <w:ilvl w:val="0"/>
-          <w:numId w:val="1186"/>
+          <w:numId w:val="1189"/>
         </w:numPr>
       </w:pPr>
       <w:r>
@@ -5267,7 +5333,7 @@
         <w:pStyle w:val="Compact"/>
         <w:numPr>
           <w:ilvl w:val="0"/>
-          <w:numId w:val="1187"/>
+          <w:numId w:val="1190"/>
         </w:numPr>
       </w:pPr>
       <w:r>
@@ -5279,7 +5345,7 @@
         <w:pStyle w:val="Compact"/>
         <w:numPr>
           <w:ilvl w:val="0"/>
-          <w:numId w:val="1188"/>
+          <w:numId w:val="1191"/>
         </w:numPr>
       </w:pPr>
       <w:r>
@@ -5291,7 +5357,7 @@
         <w:pStyle w:val="Compact"/>
         <w:numPr>
           <w:ilvl w:val="0"/>
-          <w:numId w:val="1189"/>
+          <w:numId w:val="1192"/>
         </w:numPr>
       </w:pPr>
       <w:r>
@@ -5303,7 +5369,7 @@
         <w:pStyle w:val="Compact"/>
         <w:numPr>
           <w:ilvl w:val="0"/>
-          <w:numId w:val="1190"/>
+          <w:numId w:val="1193"/>
         </w:numPr>
       </w:pPr>
       <w:r>
@@ -5315,7 +5381,7 @@
         <w:pStyle w:val="Compact"/>
         <w:numPr>
           <w:ilvl w:val="0"/>
-          <w:numId w:val="1191"/>
+          <w:numId w:val="1194"/>
         </w:numPr>
       </w:pPr>
       <w:r>
@@ -5327,7 +5393,7 @@
         <w:pStyle w:val="Compact"/>
         <w:numPr>
           <w:ilvl w:val="0"/>
-          <w:numId w:val="1192"/>
+          <w:numId w:val="1195"/>
         </w:numPr>
       </w:pPr>
       <w:r>
@@ -5349,7 +5415,7 @@
         <w:pStyle w:val="Compact"/>
         <w:numPr>
           <w:ilvl w:val="0"/>
-          <w:numId w:val="1193"/>
+          <w:numId w:val="1196"/>
         </w:numPr>
       </w:pPr>
       <w:r>
@@ -5361,7 +5427,7 @@
         <w:pStyle w:val="Compact"/>
         <w:numPr>
           <w:ilvl w:val="0"/>
-          <w:numId w:val="1194"/>
+          <w:numId w:val="1197"/>
         </w:numPr>
       </w:pPr>
       <w:r>
@@ -5373,7 +5439,7 @@
         <w:pStyle w:val="Compact"/>
         <w:numPr>
           <w:ilvl w:val="0"/>
-          <w:numId w:val="1195"/>
+          <w:numId w:val="1198"/>
         </w:numPr>
       </w:pPr>
       <w:r>
@@ -5385,7 +5451,7 @@
         <w:pStyle w:val="Compact"/>
         <w:numPr>
           <w:ilvl w:val="0"/>
-          <w:numId w:val="1196"/>
+          <w:numId w:val="1199"/>
         </w:numPr>
       </w:pPr>
       <w:r>
@@ -5397,7 +5463,7 @@
         <w:pStyle w:val="Compact"/>
         <w:numPr>
           <w:ilvl w:val="0"/>
-          <w:numId w:val="1197"/>
+          <w:numId w:val="1200"/>
         </w:numPr>
       </w:pPr>
       <w:r>
@@ -5409,7 +5475,7 @@
         <w:pStyle w:val="Compact"/>
         <w:numPr>
           <w:ilvl w:val="0"/>
-          <w:numId w:val="1198"/>
+          <w:numId w:val="1201"/>
         </w:numPr>
       </w:pPr>
       <w:r>
@@ -5446,7 +5512,7 @@
         <w:pStyle w:val="Compact"/>
         <w:numPr>
           <w:ilvl w:val="0"/>
-          <w:numId w:val="1199"/>
+          <w:numId w:val="1202"/>
         </w:numPr>
       </w:pPr>
       <w:r>
@@ -5458,7 +5524,7 @@
         <w:pStyle w:val="Compact"/>
         <w:numPr>
           <w:ilvl w:val="0"/>
-          <w:numId w:val="1200"/>
+          <w:numId w:val="1203"/>
         </w:numPr>
       </w:pPr>
       <w:r>
@@ -5470,7 +5536,7 @@
         <w:pStyle w:val="Compact"/>
         <w:numPr>
           <w:ilvl w:val="0"/>
-          <w:numId w:val="1201"/>
+          <w:numId w:val="1204"/>
         </w:numPr>
       </w:pPr>
       <w:r>
@@ -5497,7 +5563,7 @@
         <w:pStyle w:val="Compact"/>
         <w:numPr>
           <w:ilvl w:val="0"/>
-          <w:numId w:val="1202"/>
+          <w:numId w:val="1205"/>
         </w:numPr>
       </w:pPr>
       <w:r>
@@ -5509,7 +5575,7 @@
         <w:pStyle w:val="Compact"/>
         <w:numPr>
           <w:ilvl w:val="0"/>
-          <w:numId w:val="1203"/>
+          <w:numId w:val="1206"/>
         </w:numPr>
       </w:pPr>
       <w:r>
@@ -5521,7 +5587,7 @@
         <w:pStyle w:val="Compact"/>
         <w:numPr>
           <w:ilvl w:val="0"/>
-          <w:numId w:val="1204"/>
+          <w:numId w:val="1207"/>
         </w:numPr>
       </w:pPr>
       <w:r>
@@ -5543,7 +5609,7 @@
         <w:pStyle w:val="Compact"/>
         <w:numPr>
           <w:ilvl w:val="0"/>
-          <w:numId w:val="1205"/>
+          <w:numId w:val="1208"/>
         </w:numPr>
       </w:pPr>
       <w:r>
@@ -5555,7 +5621,7 @@
         <w:pStyle w:val="Compact"/>
         <w:numPr>
           <w:ilvl w:val="0"/>
-          <w:numId w:val="1206"/>
+          <w:numId w:val="1209"/>
         </w:numPr>
       </w:pPr>
       <w:r>
@@ -5567,7 +5633,7 @@
         <w:pStyle w:val="Compact"/>
         <w:numPr>
           <w:ilvl w:val="0"/>
-          <w:numId w:val="1207"/>
+          <w:numId w:val="1210"/>
         </w:numPr>
       </w:pPr>
       <w:r>
@@ -5579,7 +5645,7 @@
         <w:pStyle w:val="Compact"/>
         <w:numPr>
           <w:ilvl w:val="0"/>
-          <w:numId w:val="1208"/>
+          <w:numId w:val="1211"/>
         </w:numPr>
       </w:pPr>
       <w:r>
@@ -5591,7 +5657,7 @@
         <w:pStyle w:val="Compact"/>
         <w:numPr>
           <w:ilvl w:val="0"/>
-          <w:numId w:val="1209"/>
+          <w:numId w:val="1212"/>
         </w:numPr>
       </w:pPr>
       <w:r>
@@ -5603,7 +5669,7 @@
         <w:pStyle w:val="Compact"/>
         <w:numPr>
           <w:ilvl w:val="0"/>
-          <w:numId w:val="1210"/>
+          <w:numId w:val="1213"/>
         </w:numPr>
       </w:pPr>
       <w:r>
@@ -5615,7 +5681,7 @@
         <w:pStyle w:val="Compact"/>
         <w:numPr>
           <w:ilvl w:val="0"/>
-          <w:numId w:val="1211"/>
+          <w:numId w:val="1214"/>
         </w:numPr>
       </w:pPr>
       <w:r>
@@ -5627,7 +5693,7 @@
         <w:pStyle w:val="Compact"/>
         <w:numPr>
           <w:ilvl w:val="0"/>
-          <w:numId w:val="1212"/>
+          <w:numId w:val="1215"/>
         </w:numPr>
       </w:pPr>
       <w:r>
@@ -5639,7 +5705,7 @@
         <w:pStyle w:val="Compact"/>
         <w:numPr>
           <w:ilvl w:val="0"/>
-          <w:numId w:val="1213"/>
+          <w:numId w:val="1216"/>
         </w:numPr>
       </w:pPr>
       <w:r>
@@ -5651,7 +5717,7 @@
         <w:pStyle w:val="Compact"/>
         <w:numPr>
           <w:ilvl w:val="0"/>
-          <w:numId w:val="1214"/>
+          <w:numId w:val="1217"/>
         </w:numPr>
       </w:pPr>
       <w:r>
@@ -5663,7 +5729,7 @@
         <w:pStyle w:val="Compact"/>
         <w:numPr>
           <w:ilvl w:val="0"/>
-          <w:numId w:val="1215"/>
+          <w:numId w:val="1218"/>
         </w:numPr>
       </w:pPr>
       <w:r>
@@ -5695,7 +5761,7 @@
         <w:pStyle w:val="Compact"/>
         <w:numPr>
           <w:ilvl w:val="0"/>
-          <w:numId w:val="1216"/>
+          <w:numId w:val="1219"/>
         </w:numPr>
       </w:pPr>
       <w:r>
@@ -5707,7 +5773,7 @@
         <w:pStyle w:val="Compact"/>
         <w:numPr>
           <w:ilvl w:val="0"/>
-          <w:numId w:val="1217"/>
+          <w:numId w:val="1220"/>
         </w:numPr>
       </w:pPr>
       <w:r>
@@ -5719,7 +5785,7 @@
         <w:pStyle w:val="Compact"/>
         <w:numPr>
           <w:ilvl w:val="0"/>
-          <w:numId w:val="1218"/>
+          <w:numId w:val="1221"/>
         </w:numPr>
       </w:pPr>
       <w:r>
@@ -5731,7 +5797,7 @@
         <w:pStyle w:val="Compact"/>
         <w:numPr>
           <w:ilvl w:val="0"/>
-          <w:numId w:val="1219"/>
+          <w:numId w:val="1222"/>
         </w:numPr>
       </w:pPr>
       <w:r>
@@ -5758,7 +5824,7 @@
         <w:pStyle w:val="Compact"/>
         <w:numPr>
           <w:ilvl w:val="0"/>
-          <w:numId w:val="1220"/>
+          <w:numId w:val="1223"/>
         </w:numPr>
       </w:pPr>
       <w:r>
@@ -5770,7 +5836,7 @@
         <w:pStyle w:val="Compact"/>
         <w:numPr>
           <w:ilvl w:val="0"/>
-          <w:numId w:val="1221"/>
+          <w:numId w:val="1224"/>
         </w:numPr>
       </w:pPr>
       <w:r>
@@ -5782,7 +5848,7 @@
         <w:pStyle w:val="Compact"/>
         <w:numPr>
           <w:ilvl w:val="1"/>
-          <w:numId w:val="1222"/>
+          <w:numId w:val="1225"/>
         </w:numPr>
       </w:pPr>
       <w:r>
@@ -5794,7 +5860,7 @@
         <w:pStyle w:val="Compact"/>
         <w:numPr>
           <w:ilvl w:val="1"/>
-          <w:numId w:val="1222"/>
+          <w:numId w:val="1225"/>
         </w:numPr>
       </w:pPr>
       <w:r>
@@ -5818,7 +5884,7 @@
         <w:pStyle w:val="Compact"/>
         <w:numPr>
           <w:ilvl w:val="0"/>
-          <w:numId w:val="1223"/>
+          <w:numId w:val="1226"/>
         </w:numPr>
       </w:pPr>
       <w:r>
@@ -5830,7 +5896,7 @@
         <w:pStyle w:val="Compact"/>
         <w:numPr>
           <w:ilvl w:val="0"/>
-          <w:numId w:val="1224"/>
+          <w:numId w:val="1227"/>
         </w:numPr>
       </w:pPr>
       <w:r>
@@ -5842,7 +5908,7 @@
         <w:pStyle w:val="Compact"/>
         <w:numPr>
           <w:ilvl w:val="0"/>
-          <w:numId w:val="1225"/>
+          <w:numId w:val="1228"/>
         </w:numPr>
       </w:pPr>
       <w:r>
@@ -5854,7 +5920,7 @@
         <w:pStyle w:val="Compact"/>
         <w:numPr>
           <w:ilvl w:val="0"/>
-          <w:numId w:val="1226"/>
+          <w:numId w:val="1229"/>
         </w:numPr>
       </w:pPr>
       <w:r>
@@ -5866,7 +5932,7 @@
         <w:pStyle w:val="Compact"/>
         <w:numPr>
           <w:ilvl w:val="0"/>
-          <w:numId w:val="1227"/>
+          <w:numId w:val="1230"/>
         </w:numPr>
       </w:pPr>
       <w:r>
@@ -5878,7 +5944,7 @@
         <w:pStyle w:val="Compact"/>
         <w:numPr>
           <w:ilvl w:val="0"/>
-          <w:numId w:val="1228"/>
+          <w:numId w:val="1231"/>
         </w:numPr>
       </w:pPr>
       <w:r>
@@ -5900,7 +5966,7 @@
         <w:pStyle w:val="Compact"/>
         <w:numPr>
           <w:ilvl w:val="0"/>
-          <w:numId w:val="1229"/>
+          <w:numId w:val="1232"/>
         </w:numPr>
       </w:pPr>
       <w:r>
@@ -5912,7 +5978,7 @@
         <w:pStyle w:val="Compact"/>
         <w:numPr>
           <w:ilvl w:val="0"/>
-          <w:numId w:val="1230"/>
+          <w:numId w:val="1233"/>
         </w:numPr>
       </w:pPr>
       <w:r>
@@ -5924,7 +5990,7 @@
         <w:pStyle w:val="Compact"/>
         <w:numPr>
           <w:ilvl w:val="0"/>
-          <w:numId w:val="1231"/>
+          <w:numId w:val="1234"/>
         </w:numPr>
       </w:pPr>
       <w:r>
@@ -5936,7 +6002,7 @@
         <w:pStyle w:val="Compact"/>
         <w:numPr>
           <w:ilvl w:val="0"/>
-          <w:numId w:val="1232"/>
+          <w:numId w:val="1235"/>
         </w:numPr>
       </w:pPr>
       <w:r>
@@ -5948,7 +6014,7 @@
         <w:pStyle w:val="Compact"/>
         <w:numPr>
           <w:ilvl w:val="0"/>
-          <w:numId w:val="1233"/>
+          <w:numId w:val="1236"/>
         </w:numPr>
       </w:pPr>
       <w:r>
@@ -5960,7 +6026,7 @@
         <w:pStyle w:val="Compact"/>
         <w:numPr>
           <w:ilvl w:val="0"/>
-          <w:numId w:val="1234"/>
+          <w:numId w:val="1237"/>
         </w:numPr>
       </w:pPr>
       <w:r>
@@ -5972,7 +6038,7 @@
         <w:pStyle w:val="Compact"/>
         <w:numPr>
           <w:ilvl w:val="0"/>
-          <w:numId w:val="1235"/>
+          <w:numId w:val="1238"/>
         </w:numPr>
       </w:pPr>
       <w:r>
@@ -5984,7 +6050,7 @@
         <w:pStyle w:val="Compact"/>
         <w:numPr>
           <w:ilvl w:val="0"/>
-          <w:numId w:val="1236"/>
+          <w:numId w:val="1239"/>
         </w:numPr>
       </w:pPr>
       <w:r>
@@ -5996,7 +6062,7 @@
         <w:pStyle w:val="Compact"/>
         <w:numPr>
           <w:ilvl w:val="0"/>
-          <w:numId w:val="1237"/>
+          <w:numId w:val="1240"/>
         </w:numPr>
       </w:pPr>
       <w:r>
@@ -6008,7 +6074,7 @@
         <w:pStyle w:val="Compact"/>
         <w:numPr>
           <w:ilvl w:val="0"/>
-          <w:numId w:val="1238"/>
+          <w:numId w:val="1241"/>
         </w:numPr>
       </w:pPr>
       <w:r>
@@ -6020,7 +6086,7 @@
         <w:pStyle w:val="Compact"/>
         <w:numPr>
           <w:ilvl w:val="0"/>
-          <w:numId w:val="1239"/>
+          <w:numId w:val="1242"/>
         </w:numPr>
       </w:pPr>
       <w:r>
@@ -6042,7 +6108,7 @@
         <w:pStyle w:val="Compact"/>
         <w:numPr>
           <w:ilvl w:val="0"/>
-          <w:numId w:val="1240"/>
+          <w:numId w:val="1243"/>
         </w:numPr>
       </w:pPr>
       <w:r>
@@ -6054,7 +6120,7 @@
         <w:pStyle w:val="Compact"/>
         <w:numPr>
           <w:ilvl w:val="0"/>
-          <w:numId w:val="1241"/>
+          <w:numId w:val="1244"/>
         </w:numPr>
       </w:pPr>
       <w:r>
@@ -6066,7 +6132,7 @@
         <w:pStyle w:val="Compact"/>
         <w:numPr>
           <w:ilvl w:val="0"/>
-          <w:numId w:val="1242"/>
+          <w:numId w:val="1245"/>
         </w:numPr>
       </w:pPr>
       <w:r>
@@ -6078,7 +6144,7 @@
         <w:pStyle w:val="Compact"/>
         <w:numPr>
           <w:ilvl w:val="0"/>
-          <w:numId w:val="1243"/>
+          <w:numId w:val="1246"/>
         </w:numPr>
       </w:pPr>
       <w:r>
@@ -6090,7 +6156,7 @@
         <w:pStyle w:val="Compact"/>
         <w:numPr>
           <w:ilvl w:val="0"/>
-          <w:numId w:val="1244"/>
+          <w:numId w:val="1247"/>
         </w:numPr>
       </w:pPr>
       <w:r>
@@ -6102,7 +6168,7 @@
         <w:pStyle w:val="Compact"/>
         <w:numPr>
           <w:ilvl w:val="0"/>
-          <w:numId w:val="1245"/>
+          <w:numId w:val="1248"/>
         </w:numPr>
       </w:pPr>
       <w:r>
@@ -6114,7 +6180,7 @@
         <w:pStyle w:val="Compact"/>
         <w:numPr>
           <w:ilvl w:val="0"/>
-          <w:numId w:val="1246"/>
+          <w:numId w:val="1249"/>
         </w:numPr>
       </w:pPr>
       <w:r>
@@ -6126,7 +6192,7 @@
         <w:pStyle w:val="Compact"/>
         <w:numPr>
           <w:ilvl w:val="0"/>
-          <w:numId w:val="1247"/>
+          <w:numId w:val="1250"/>
         </w:numPr>
       </w:pPr>
       <w:r>
@@ -6138,7 +6204,7 @@
         <w:pStyle w:val="Compact"/>
         <w:numPr>
           <w:ilvl w:val="0"/>
-          <w:numId w:val="1248"/>
+          <w:numId w:val="1251"/>
         </w:numPr>
       </w:pPr>
       <w:r>
@@ -6172,7 +6238,7 @@
         <w:pStyle w:val="Compact"/>
         <w:numPr>
           <w:ilvl w:val="0"/>
-          <w:numId w:val="1249"/>
+          <w:numId w:val="1252"/>
         </w:numPr>
       </w:pPr>
       <w:r>
@@ -6184,7 +6250,7 @@
         <w:pStyle w:val="Compact"/>
         <w:numPr>
           <w:ilvl w:val="0"/>
-          <w:numId w:val="1250"/>
+          <w:numId w:val="1253"/>
         </w:numPr>
       </w:pPr>
       <w:r>
@@ -6196,7 +6262,7 @@
         <w:pStyle w:val="Compact"/>
         <w:numPr>
           <w:ilvl w:val="0"/>
-          <w:numId w:val="1251"/>
+          <w:numId w:val="1254"/>
         </w:numPr>
       </w:pPr>
       <w:r>
@@ -6208,7 +6274,7 @@
         <w:pStyle w:val="Compact"/>
         <w:numPr>
           <w:ilvl w:val="0"/>
-          <w:numId w:val="1252"/>
+          <w:numId w:val="1255"/>
         </w:numPr>
       </w:pPr>
       <w:r>
@@ -6220,7 +6286,7 @@
         <w:pStyle w:val="Compact"/>
         <w:numPr>
           <w:ilvl w:val="0"/>
-          <w:numId w:val="1253"/>
+          <w:numId w:val="1256"/>
         </w:numPr>
       </w:pPr>
       <w:r>
@@ -6232,7 +6298,7 @@
         <w:pStyle w:val="Compact"/>
         <w:numPr>
           <w:ilvl w:val="0"/>
-          <w:numId w:val="1254"/>
+          <w:numId w:val="1257"/>
         </w:numPr>
       </w:pPr>
       <w:r>
@@ -6244,7 +6310,7 @@
         <w:pStyle w:val="Compact"/>
         <w:numPr>
           <w:ilvl w:val="0"/>
-          <w:numId w:val="1255"/>
+          <w:numId w:val="1258"/>
         </w:numPr>
       </w:pPr>
       <w:r>
@@ -6256,7 +6322,7 @@
         <w:pStyle w:val="Compact"/>
         <w:numPr>
           <w:ilvl w:val="0"/>
-          <w:numId w:val="1256"/>
+          <w:numId w:val="1259"/>
         </w:numPr>
       </w:pPr>
       <w:r>
@@ -6268,7 +6334,7 @@
         <w:pStyle w:val="Compact"/>
         <w:numPr>
           <w:ilvl w:val="0"/>
-          <w:numId w:val="1257"/>
+          <w:numId w:val="1260"/>
         </w:numPr>
       </w:pPr>
       <w:r>
@@ -6300,7 +6366,7 @@
         <w:pStyle w:val="Compact"/>
         <w:numPr>
           <w:ilvl w:val="0"/>
-          <w:numId w:val="1258"/>
+          <w:numId w:val="1261"/>
         </w:numPr>
       </w:pPr>
       <w:r>
@@ -6342,7 +6408,7 @@
         <w:pStyle w:val="Compact"/>
         <w:numPr>
           <w:ilvl w:val="0"/>
-          <w:numId w:val="1259"/>
+          <w:numId w:val="1262"/>
         </w:numPr>
       </w:pPr>
       <w:r>
@@ -6405,7 +6471,7 @@
         <w:pStyle w:val="Compact"/>
         <w:numPr>
           <w:ilvl w:val="0"/>
-          <w:numId w:val="1260"/>
+          <w:numId w:val="1263"/>
         </w:numPr>
       </w:pPr>
       <w:r>
@@ -6417,7 +6483,7 @@
         <w:pStyle w:val="Compact"/>
         <w:numPr>
           <w:ilvl w:val="0"/>
-          <w:numId w:val="1261"/>
+          <w:numId w:val="1264"/>
         </w:numPr>
       </w:pPr>
       <w:r>
@@ -6492,7 +6558,7 @@
         <w:pStyle w:val="Compact"/>
         <w:numPr>
           <w:ilvl w:val="0"/>
-          <w:numId w:val="1262"/>
+          <w:numId w:val="1265"/>
         </w:numPr>
       </w:pPr>
       <w:r>
@@ -6519,7 +6585,7 @@
         <w:pStyle w:val="Compact"/>
         <w:numPr>
           <w:ilvl w:val="0"/>
-          <w:numId w:val="1263"/>
+          <w:numId w:val="1266"/>
         </w:numPr>
       </w:pPr>
       <w:r>
@@ -6573,7 +6639,7 @@
         <w:pStyle w:val="Compact"/>
         <w:numPr>
           <w:ilvl w:val="0"/>
-          <w:numId w:val="1264"/>
+          <w:numId w:val="1267"/>
         </w:numPr>
       </w:pPr>
       <w:r>
@@ -6585,7 +6651,7 @@
         <w:pStyle w:val="Compact"/>
         <w:numPr>
           <w:ilvl w:val="0"/>
-          <w:numId w:val="1265"/>
+          <w:numId w:val="1268"/>
         </w:numPr>
       </w:pPr>
       <w:r>
@@ -6645,7 +6711,7 @@
         <w:pStyle w:val="Compact"/>
         <w:numPr>
           <w:ilvl w:val="0"/>
-          <w:numId w:val="1266"/>
+          <w:numId w:val="1269"/>
         </w:numPr>
       </w:pPr>
       <w:r>
@@ -6691,7 +6757,7 @@
         <w:pStyle w:val="Compact"/>
         <w:numPr>
           <w:ilvl w:val="0"/>
-          <w:numId w:val="1267"/>
+          <w:numId w:val="1270"/>
         </w:numPr>
       </w:pPr>
       <w:r>
@@ -6715,7 +6781,7 @@
         <w:pStyle w:val="Compact"/>
         <w:numPr>
           <w:ilvl w:val="0"/>
-          <w:numId w:val="1268"/>
+          <w:numId w:val="1271"/>
         </w:numPr>
       </w:pPr>
       <w:r>
@@ -6739,7 +6805,7 @@
         <w:pStyle w:val="Compact"/>
         <w:numPr>
           <w:ilvl w:val="0"/>
-          <w:numId w:val="1269"/>
+          <w:numId w:val="1272"/>
         </w:numPr>
       </w:pPr>
       <w:r>
@@ -6766,7 +6832,7 @@
         <w:pStyle w:val="Compact"/>
         <w:numPr>
           <w:ilvl w:val="0"/>
-          <w:numId w:val="1270"/>
+          <w:numId w:val="1273"/>
         </w:numPr>
       </w:pPr>
       <w:r>
@@ -6790,7 +6856,7 @@
         <w:pStyle w:val="Compact"/>
         <w:numPr>
           <w:ilvl w:val="0"/>
-          <w:numId w:val="1271"/>
+          <w:numId w:val="1274"/>
         </w:numPr>
       </w:pPr>
       <w:r>
@@ -6802,7 +6868,7 @@
         <w:pStyle w:val="Compact"/>
         <w:numPr>
           <w:ilvl w:val="0"/>
-          <w:numId w:val="1272"/>
+          <w:numId w:val="1275"/>
         </w:numPr>
       </w:pPr>
       <w:r>
@@ -6829,7 +6895,7 @@
         <w:pStyle w:val="Compact"/>
         <w:numPr>
           <w:ilvl w:val="0"/>
-          <w:numId w:val="1273"/>
+          <w:numId w:val="1276"/>
         </w:numPr>
       </w:pPr>
       <w:r>
@@ -6841,7 +6907,7 @@
         <w:pStyle w:val="Compact"/>
         <w:numPr>
           <w:ilvl w:val="1"/>
-          <w:numId w:val="1274"/>
+          <w:numId w:val="1277"/>
         </w:numPr>
       </w:pPr>
       <w:r>
@@ -6859,7 +6925,7 @@
         <w:pStyle w:val="Compact"/>
         <w:numPr>
           <w:ilvl w:val="1"/>
-          <w:numId w:val="1274"/>
+          <w:numId w:val="1277"/>
         </w:numPr>
       </w:pPr>
       <w:r>
@@ -6877,7 +6943,7 @@
         <w:pStyle w:val="Compact"/>
         <w:numPr>
           <w:ilvl w:val="0"/>
-          <w:numId w:val="1275"/>
+          <w:numId w:val="1278"/>
         </w:numPr>
       </w:pPr>
       <w:r>
@@ -6904,7 +6970,7 @@
         <w:pStyle w:val="Compact"/>
         <w:numPr>
           <w:ilvl w:val="0"/>
-          <w:numId w:val="1276"/>
+          <w:numId w:val="1279"/>
         </w:numPr>
       </w:pPr>
       <w:r>
@@ -6931,7 +6997,7 @@
         <w:pStyle w:val="Compact"/>
         <w:numPr>
           <w:ilvl w:val="0"/>
-          <w:numId w:val="1277"/>
+          <w:numId w:val="1280"/>
         </w:numPr>
       </w:pPr>
       <w:r>
@@ -6958,7 +7024,7 @@
         <w:pStyle w:val="Compact"/>
         <w:numPr>
           <w:ilvl w:val="0"/>
-          <w:numId w:val="1278"/>
+          <w:numId w:val="1281"/>
         </w:numPr>
       </w:pPr>
       <w:r>
@@ -6970,7 +7036,7 @@
         <w:pStyle w:val="Compact"/>
         <w:numPr>
           <w:ilvl w:val="0"/>
-          <w:numId w:val="1279"/>
+          <w:numId w:val="1282"/>
         </w:numPr>
       </w:pPr>
       <w:r>
@@ -6982,7 +7048,7 @@
         <w:pStyle w:val="Compact"/>
         <w:numPr>
           <w:ilvl w:val="0"/>
-          <w:numId w:val="1280"/>
+          <w:numId w:val="1283"/>
         </w:numPr>
       </w:pPr>
       <w:r>
@@ -7004,7 +7070,7 @@
         <w:pStyle w:val="Compact"/>
         <w:numPr>
           <w:ilvl w:val="0"/>
-          <w:numId w:val="1281"/>
+          <w:numId w:val="1284"/>
         </w:numPr>
       </w:pPr>
       <w:r>
@@ -7028,7 +7094,7 @@
         <w:pStyle w:val="Compact"/>
         <w:numPr>
           <w:ilvl w:val="0"/>
-          <w:numId w:val="1282"/>
+          <w:numId w:val="1285"/>
         </w:numPr>
       </w:pPr>
       <w:r>
@@ -7052,7 +7118,7 @@
         <w:pStyle w:val="Compact"/>
         <w:numPr>
           <w:ilvl w:val="0"/>
-          <w:numId w:val="1283"/>
+          <w:numId w:val="1286"/>
         </w:numPr>
       </w:pPr>
       <w:r>
@@ -7064,7 +7130,7 @@
         <w:pStyle w:val="Compact"/>
         <w:numPr>
           <w:ilvl w:val="0"/>
-          <w:numId w:val="1284"/>
+          <w:numId w:val="1287"/>
         </w:numPr>
       </w:pPr>
       <w:r>
@@ -7100,7 +7166,7 @@
         <w:pStyle w:val="Compact"/>
         <w:numPr>
           <w:ilvl w:val="0"/>
-          <w:numId w:val="1285"/>
+          <w:numId w:val="1288"/>
         </w:numPr>
       </w:pPr>
       <w:r>
@@ -7127,7 +7193,7 @@
         <w:pStyle w:val="Compact"/>
         <w:numPr>
           <w:ilvl w:val="0"/>
-          <w:numId w:val="1286"/>
+          <w:numId w:val="1289"/>
         </w:numPr>
       </w:pPr>
       <w:r>
@@ -7149,7 +7215,7 @@
         <w:pStyle w:val="Compact"/>
         <w:numPr>
           <w:ilvl w:val="0"/>
-          <w:numId w:val="1287"/>
+          <w:numId w:val="1290"/>
         </w:numPr>
       </w:pPr>
       <w:r>
@@ -7176,7 +7242,7 @@
         <w:pStyle w:val="Compact"/>
         <w:numPr>
           <w:ilvl w:val="0"/>
-          <w:numId w:val="1288"/>
+          <w:numId w:val="1291"/>
         </w:numPr>
       </w:pPr>
       <w:r>
@@ -7203,7 +7269,7 @@
         <w:pStyle w:val="Compact"/>
         <w:numPr>
           <w:ilvl w:val="0"/>
-          <w:numId w:val="1289"/>
+          <w:numId w:val="1292"/>
         </w:numPr>
       </w:pPr>
       <w:r>
@@ -7230,7 +7296,7 @@
         <w:pStyle w:val="Compact"/>
         <w:numPr>
           <w:ilvl w:val="0"/>
-          <w:numId w:val="1290"/>
+          <w:numId w:val="1293"/>
         </w:numPr>
       </w:pPr>
       <w:r>
@@ -7242,7 +7308,7 @@
         <w:pStyle w:val="Compact"/>
         <w:numPr>
           <w:ilvl w:val="0"/>
-          <w:numId w:val="1291"/>
+          <w:numId w:val="1294"/>
         </w:numPr>
       </w:pPr>
       <w:r>
@@ -7254,7 +7320,7 @@
         <w:pStyle w:val="Compact"/>
         <w:numPr>
           <w:ilvl w:val="0"/>
-          <w:numId w:val="1292"/>
+          <w:numId w:val="1295"/>
         </w:numPr>
       </w:pPr>
       <w:r>
@@ -7266,7 +7332,7 @@
         <w:pStyle w:val="Compact"/>
         <w:numPr>
           <w:ilvl w:val="0"/>
-          <w:numId w:val="1293"/>
+          <w:numId w:val="1296"/>
         </w:numPr>
       </w:pPr>
       <w:r>
@@ -7278,7 +7344,7 @@
         <w:pStyle w:val="Compact"/>
         <w:numPr>
           <w:ilvl w:val="0"/>
-          <w:numId w:val="1294"/>
+          <w:numId w:val="1297"/>
         </w:numPr>
       </w:pPr>
       <w:r>
@@ -7290,7 +7356,7 @@
         <w:pStyle w:val="Compact"/>
         <w:numPr>
           <w:ilvl w:val="0"/>
-          <w:numId w:val="1295"/>
+          <w:numId w:val="1298"/>
         </w:numPr>
       </w:pPr>
       <w:r>
@@ -7342,7 +7408,7 @@
         <w:pStyle w:val="Compact"/>
         <w:numPr>
           <w:ilvl w:val="0"/>
-          <w:numId w:val="1296"/>
+          <w:numId w:val="1299"/>
         </w:numPr>
       </w:pPr>
       <w:r>
@@ -7381,7 +7447,7 @@
         <w:pStyle w:val="Compact"/>
         <w:numPr>
           <w:ilvl w:val="0"/>
-          <w:numId w:val="1297"/>
+          <w:numId w:val="1300"/>
         </w:numPr>
       </w:pPr>
       <w:r>
@@ -7393,7 +7459,7 @@
         <w:pStyle w:val="Compact"/>
         <w:numPr>
           <w:ilvl w:val="0"/>
-          <w:numId w:val="1298"/>
+          <w:numId w:val="1301"/>
         </w:numPr>
       </w:pPr>
       <w:r>
@@ -7405,7 +7471,7 @@
         <w:pStyle w:val="Compact"/>
         <w:numPr>
           <w:ilvl w:val="0"/>
-          <w:numId w:val="1299"/>
+          <w:numId w:val="1302"/>
         </w:numPr>
       </w:pPr>
       <w:r>
@@ -7417,7 +7483,7 @@
         <w:pStyle w:val="Compact"/>
         <w:numPr>
           <w:ilvl w:val="0"/>
-          <w:numId w:val="1300"/>
+          <w:numId w:val="1303"/>
         </w:numPr>
       </w:pPr>
       <w:r>
@@ -7429,7 +7495,7 @@
         <w:pStyle w:val="Compact"/>
         <w:numPr>
           <w:ilvl w:val="0"/>
-          <w:numId w:val="1301"/>
+          <w:numId w:val="1304"/>
         </w:numPr>
       </w:pPr>
       <w:r>
@@ -7441,7 +7507,7 @@
         <w:pStyle w:val="Compact"/>
         <w:numPr>
           <w:ilvl w:val="1"/>
-          <w:numId w:val="1302"/>
+          <w:numId w:val="1305"/>
         </w:numPr>
       </w:pPr>
       <w:r>
@@ -7474,7 +7540,7 @@
         <w:pStyle w:val="Compact"/>
         <w:numPr>
           <w:ilvl w:val="1"/>
-          <w:numId w:val="1302"/>
+          <w:numId w:val="1305"/>
         </w:numPr>
       </w:pPr>
       <w:r>
@@ -7507,7 +7573,7 @@
         <w:pStyle w:val="Compact"/>
         <w:numPr>
           <w:ilvl w:val="1"/>
-          <w:numId w:val="1302"/>
+          <w:numId w:val="1305"/>
         </w:numPr>
       </w:pPr>
       <w:r>
@@ -7540,7 +7606,7 @@
         <w:pStyle w:val="Compact"/>
         <w:numPr>
           <w:ilvl w:val="1"/>
-          <w:numId w:val="1302"/>
+          <w:numId w:val="1305"/>
         </w:numPr>
       </w:pPr>
       <w:r>
@@ -7573,7 +7639,7 @@
         <w:pStyle w:val="Compact"/>
         <w:numPr>
           <w:ilvl w:val="1"/>
-          <w:numId w:val="1302"/>
+          <w:numId w:val="1305"/>
         </w:numPr>
       </w:pPr>
       <w:r>
@@ -7606,7 +7672,7 @@
         <w:pStyle w:val="Compact"/>
         <w:numPr>
           <w:ilvl w:val="0"/>
-          <w:numId w:val="1303"/>
+          <w:numId w:val="1306"/>
         </w:numPr>
       </w:pPr>
       <w:r>
@@ -7660,7 +7726,7 @@
         <w:pStyle w:val="Compact"/>
         <w:numPr>
           <w:ilvl w:val="0"/>
-          <w:numId w:val="1304"/>
+          <w:numId w:val="1307"/>
         </w:numPr>
       </w:pPr>
       <w:r>
@@ -7672,7 +7738,7 @@
         <w:pStyle w:val="Compact"/>
         <w:numPr>
           <w:ilvl w:val="0"/>
-          <w:numId w:val="1305"/>
+          <w:numId w:val="1308"/>
         </w:numPr>
       </w:pPr>
       <w:r>
@@ -7684,7 +7750,7 @@
         <w:pStyle w:val="Compact"/>
         <w:numPr>
           <w:ilvl w:val="0"/>
-          <w:numId w:val="1306"/>
+          <w:numId w:val="1309"/>
         </w:numPr>
       </w:pPr>
       <w:r>
@@ -7696,7 +7762,7 @@
         <w:pStyle w:val="Compact"/>
         <w:numPr>
           <w:ilvl w:val="0"/>
-          <w:numId w:val="1307"/>
+          <w:numId w:val="1310"/>
         </w:numPr>
       </w:pPr>
       <w:r>
@@ -7708,7 +7774,7 @@
         <w:pStyle w:val="Compact"/>
         <w:numPr>
           <w:ilvl w:val="0"/>
-          <w:numId w:val="1308"/>
+          <w:numId w:val="1311"/>
         </w:numPr>
       </w:pPr>
       <w:r>
@@ -7730,7 +7796,7 @@
         <w:pStyle w:val="Compact"/>
         <w:numPr>
           <w:ilvl w:val="0"/>
-          <w:numId w:val="1309"/>
+          <w:numId w:val="1312"/>
         </w:numPr>
       </w:pPr>
       <w:r>
@@ -7742,7 +7808,7 @@
         <w:pStyle w:val="Compact"/>
         <w:numPr>
           <w:ilvl w:val="0"/>
-          <w:numId w:val="1310"/>
+          <w:numId w:val="1313"/>
         </w:numPr>
       </w:pPr>
       <w:r>
@@ -7754,7 +7820,7 @@
         <w:pStyle w:val="Compact"/>
         <w:numPr>
           <w:ilvl w:val="0"/>
-          <w:numId w:val="1311"/>
+          <w:numId w:val="1314"/>
         </w:numPr>
       </w:pPr>
       <w:r>
@@ -7766,7 +7832,7 @@
         <w:pStyle w:val="Compact"/>
         <w:numPr>
           <w:ilvl w:val="0"/>
-          <w:numId w:val="1312"/>
+          <w:numId w:val="1315"/>
         </w:numPr>
       </w:pPr>
       <w:r>
@@ -7778,7 +7844,7 @@
         <w:pStyle w:val="Compact"/>
         <w:numPr>
           <w:ilvl w:val="0"/>
-          <w:numId w:val="1313"/>
+          <w:numId w:val="1316"/>
         </w:numPr>
       </w:pPr>
       <w:r>
@@ -7790,7 +7856,7 @@
         <w:pStyle w:val="Compact"/>
         <w:numPr>
           <w:ilvl w:val="0"/>
-          <w:numId w:val="1314"/>
+          <w:numId w:val="1317"/>
         </w:numPr>
       </w:pPr>
       <w:r>
@@ -7802,7 +7868,7 @@
         <w:pStyle w:val="Compact"/>
         <w:numPr>
           <w:ilvl w:val="0"/>
-          <w:numId w:val="1315"/>
+          <w:numId w:val="1318"/>
         </w:numPr>
       </w:pPr>
       <w:r>
@@ -7814,7 +7880,7 @@
         <w:pStyle w:val="Compact"/>
         <w:numPr>
           <w:ilvl w:val="0"/>
-          <w:numId w:val="1316"/>
+          <w:numId w:val="1319"/>
         </w:numPr>
       </w:pPr>
       <w:r>
@@ -7826,7 +7892,7 @@
         <w:pStyle w:val="Compact"/>
         <w:numPr>
           <w:ilvl w:val="0"/>
-          <w:numId w:val="1317"/>
+          <w:numId w:val="1320"/>
         </w:numPr>
       </w:pPr>
       <w:r>
@@ -7838,7 +7904,7 @@
         <w:pStyle w:val="Compact"/>
         <w:numPr>
           <w:ilvl w:val="0"/>
-          <w:numId w:val="1318"/>
+          <w:numId w:val="1321"/>
         </w:numPr>
       </w:pPr>
       <w:r>
@@ -7850,7 +7916,7 @@
         <w:pStyle w:val="Compact"/>
         <w:numPr>
           <w:ilvl w:val="0"/>
-          <w:numId w:val="1319"/>
+          <w:numId w:val="1322"/>
         </w:numPr>
       </w:pPr>
       <w:r>
@@ -7877,7 +7943,7 @@
         <w:pStyle w:val="Compact"/>
         <w:numPr>
           <w:ilvl w:val="0"/>
-          <w:numId w:val="1320"/>
+          <w:numId w:val="1323"/>
         </w:numPr>
       </w:pPr>
       <w:r>
@@ -7909,7 +7975,7 @@
         <w:pStyle w:val="Compact"/>
         <w:numPr>
           <w:ilvl w:val="0"/>
-          <w:numId w:val="1321"/>
+          <w:numId w:val="1324"/>
         </w:numPr>
       </w:pPr>
       <w:r>
@@ -7948,7 +8014,7 @@
         <w:pStyle w:val="Compact"/>
         <w:numPr>
           <w:ilvl w:val="0"/>
-          <w:numId w:val="1322"/>
+          <w:numId w:val="1325"/>
         </w:numPr>
       </w:pPr>
       <w:r>
@@ -7987,7 +8053,7 @@
         <w:pStyle w:val="Compact"/>
         <w:numPr>
           <w:ilvl w:val="0"/>
-          <w:numId w:val="1323"/>
+          <w:numId w:val="1326"/>
         </w:numPr>
       </w:pPr>
       <w:r>
@@ -8011,7 +8077,7 @@
         <w:pStyle w:val="Compact"/>
         <w:numPr>
           <w:ilvl w:val="0"/>
-          <w:numId w:val="1324"/>
+          <w:numId w:val="1327"/>
         </w:numPr>
       </w:pPr>
       <w:r>
@@ -8068,7 +8134,7 @@
         <w:pStyle w:val="Compact"/>
         <w:numPr>
           <w:ilvl w:val="0"/>
-          <w:numId w:val="1325"/>
+          <w:numId w:val="1328"/>
         </w:numPr>
       </w:pPr>
       <w:r>
@@ -8092,7 +8158,7 @@
         <w:pStyle w:val="Compact"/>
         <w:numPr>
           <w:ilvl w:val="0"/>
-          <w:numId w:val="1326"/>
+          <w:numId w:val="1329"/>
         </w:numPr>
       </w:pPr>
       <w:r>
@@ -8104,7 +8170,7 @@
         <w:pStyle w:val="Compact"/>
         <w:numPr>
           <w:ilvl w:val="1"/>
-          <w:numId w:val="1327"/>
+          <w:numId w:val="1330"/>
         </w:numPr>
       </w:pPr>
       <w:r>
@@ -8116,7 +8182,7 @@
         <w:pStyle w:val="Compact"/>
         <w:numPr>
           <w:ilvl w:val="1"/>
-          <w:numId w:val="1327"/>
+          <w:numId w:val="1330"/>
         </w:numPr>
       </w:pPr>
       <w:r>
@@ -8128,7 +8194,7 @@
         <w:pStyle w:val="Compact"/>
         <w:numPr>
           <w:ilvl w:val="1"/>
-          <w:numId w:val="1327"/>
+          <w:numId w:val="1330"/>
         </w:numPr>
       </w:pPr>
       <w:r>
@@ -8140,7 +8206,7 @@
         <w:pStyle w:val="Compact"/>
         <w:numPr>
           <w:ilvl w:val="1"/>
-          <w:numId w:val="1327"/>
+          <w:numId w:val="1330"/>
         </w:numPr>
       </w:pPr>
       <w:r>
@@ -8152,7 +8218,7 @@
         <w:pStyle w:val="Compact"/>
         <w:numPr>
           <w:ilvl w:val="1"/>
-          <w:numId w:val="1327"/>
+          <w:numId w:val="1330"/>
         </w:numPr>
       </w:pPr>
       <w:r>
@@ -8164,7 +8230,7 @@
         <w:pStyle w:val="Compact"/>
         <w:numPr>
           <w:ilvl w:val="0"/>
-          <w:numId w:val="1328"/>
+          <w:numId w:val="1331"/>
         </w:numPr>
       </w:pPr>
       <w:r>
@@ -8209,7 +8275,7 @@
         <w:pStyle w:val="Compact"/>
         <w:numPr>
           <w:ilvl w:val="0"/>
-          <w:numId w:val="1329"/>
+          <w:numId w:val="1332"/>
         </w:numPr>
       </w:pPr>
       <w:r>
@@ -8242,7 +8308,7 @@
         <w:pStyle w:val="Compact"/>
         <w:numPr>
           <w:ilvl w:val="0"/>
-          <w:numId w:val="1330"/>
+          <w:numId w:val="1333"/>
         </w:numPr>
       </w:pPr>
       <w:r>
@@ -8275,7 +8341,7 @@
         <w:pStyle w:val="Compact"/>
         <w:numPr>
           <w:ilvl w:val="0"/>
-          <w:numId w:val="1331"/>
+          <w:numId w:val="1334"/>
         </w:numPr>
       </w:pPr>
       <w:r>
@@ -8302,7 +8368,7 @@
         <w:pStyle w:val="Compact"/>
         <w:numPr>
           <w:ilvl w:val="0"/>
-          <w:numId w:val="1332"/>
+          <w:numId w:val="1335"/>
         </w:numPr>
       </w:pPr>
       <w:r>
@@ -8314,7 +8380,7 @@
         <w:pStyle w:val="Compact"/>
         <w:numPr>
           <w:ilvl w:val="0"/>
-          <w:numId w:val="1333"/>
+          <w:numId w:val="1336"/>
         </w:numPr>
       </w:pPr>
       <w:r>
@@ -8326,7 +8392,7 @@
         <w:pStyle w:val="Compact"/>
         <w:numPr>
           <w:ilvl w:val="0"/>
-          <w:numId w:val="1334"/>
+          <w:numId w:val="1337"/>
         </w:numPr>
       </w:pPr>
       <w:r>
@@ -8338,7 +8404,7 @@
         <w:pStyle w:val="Compact"/>
         <w:numPr>
           <w:ilvl w:val="0"/>
-          <w:numId w:val="1335"/>
+          <w:numId w:val="1338"/>
         </w:numPr>
       </w:pPr>
       <w:r>
@@ -8350,7 +8416,7 @@
         <w:pStyle w:val="Compact"/>
         <w:numPr>
           <w:ilvl w:val="0"/>
-          <w:numId w:val="1336"/>
+          <w:numId w:val="1339"/>
         </w:numPr>
       </w:pPr>
       <w:r>
@@ -8377,7 +8443,7 @@
         <w:pStyle w:val="Compact"/>
         <w:numPr>
           <w:ilvl w:val="0"/>
-          <w:numId w:val="1337"/>
+          <w:numId w:val="1340"/>
         </w:numPr>
       </w:pPr>
       <w:r>
@@ -8399,7 +8465,7 @@
         <w:pStyle w:val="Compact"/>
         <w:numPr>
           <w:ilvl w:val="0"/>
-          <w:numId w:val="1338"/>
+          <w:numId w:val="1341"/>
         </w:numPr>
       </w:pPr>
       <w:r>
@@ -8411,7 +8477,7 @@
         <w:pStyle w:val="Compact"/>
         <w:numPr>
           <w:ilvl w:val="0"/>
-          <w:numId w:val="1339"/>
+          <w:numId w:val="1342"/>
         </w:numPr>
       </w:pPr>
       <w:r>
@@ -8423,7 +8489,7 @@
         <w:pStyle w:val="Compact"/>
         <w:numPr>
           <w:ilvl w:val="0"/>
-          <w:numId w:val="1340"/>
+          <w:numId w:val="1343"/>
         </w:numPr>
       </w:pPr>
       <w:r>
@@ -8435,7 +8501,7 @@
         <w:pStyle w:val="Compact"/>
         <w:numPr>
           <w:ilvl w:val="0"/>
-          <w:numId w:val="1341"/>
+          <w:numId w:val="1344"/>
         </w:numPr>
       </w:pPr>
       <w:r>
@@ -8459,7 +8525,7 @@
         <w:pStyle w:val="Compact"/>
         <w:numPr>
           <w:ilvl w:val="0"/>
-          <w:numId w:val="1342"/>
+          <w:numId w:val="1345"/>
         </w:numPr>
       </w:pPr>
       <w:r>
@@ -8471,7 +8537,7 @@
         <w:pStyle w:val="Compact"/>
         <w:numPr>
           <w:ilvl w:val="1"/>
-          <w:numId w:val="1343"/>
+          <w:numId w:val="1346"/>
         </w:numPr>
       </w:pPr>
       <w:r>
@@ -8483,7 +8549,7 @@
         <w:pStyle w:val="Compact"/>
         <w:numPr>
           <w:ilvl w:val="1"/>
-          <w:numId w:val="1343"/>
+          <w:numId w:val="1346"/>
         </w:numPr>
       </w:pPr>
       <w:r>
@@ -8495,7 +8561,7 @@
         <w:pStyle w:val="Compact"/>
         <w:numPr>
           <w:ilvl w:val="1"/>
-          <w:numId w:val="1343"/>
+          <w:numId w:val="1346"/>
         </w:numPr>
       </w:pPr>
       <w:r>
@@ -8507,7 +8573,7 @@
         <w:pStyle w:val="Compact"/>
         <w:numPr>
           <w:ilvl w:val="0"/>
-          <w:numId w:val="1344"/>
+          <w:numId w:val="1347"/>
         </w:numPr>
       </w:pPr>
       <w:r>
@@ -8549,7 +8615,7 @@
         <w:pStyle w:val="Compact"/>
         <w:numPr>
           <w:ilvl w:val="0"/>
-          <w:numId w:val="1345"/>
+          <w:numId w:val="1348"/>
         </w:numPr>
       </w:pPr>
       <w:r>
@@ -8601,7 +8667,7 @@
         <w:pStyle w:val="Compact"/>
         <w:numPr>
           <w:ilvl w:val="0"/>
-          <w:numId w:val="1346"/>
+          <w:numId w:val="1349"/>
         </w:numPr>
       </w:pPr>
       <w:r>
@@ -8613,7 +8679,7 @@
         <w:pStyle w:val="Compact"/>
         <w:numPr>
           <w:ilvl w:val="0"/>
-          <w:numId w:val="1347"/>
+          <w:numId w:val="1350"/>
         </w:numPr>
       </w:pPr>
       <w:r>
@@ -8625,7 +8691,7 @@
         <w:pStyle w:val="Compact"/>
         <w:numPr>
           <w:ilvl w:val="0"/>
-          <w:numId w:val="1348"/>
+          <w:numId w:val="1351"/>
         </w:numPr>
       </w:pPr>
       <w:r>
@@ -8637,7 +8703,7 @@
         <w:pStyle w:val="Compact"/>
         <w:numPr>
           <w:ilvl w:val="0"/>
-          <w:numId w:val="1349"/>
+          <w:numId w:val="1352"/>
         </w:numPr>
       </w:pPr>
       <w:r>
@@ -8649,7 +8715,7 @@
         <w:pStyle w:val="Compact"/>
         <w:numPr>
           <w:ilvl w:val="0"/>
-          <w:numId w:val="1350"/>
+          <w:numId w:val="1353"/>
         </w:numPr>
       </w:pPr>
       <w:r>
@@ -8661,7 +8727,7 @@
         <w:pStyle w:val="Compact"/>
         <w:numPr>
           <w:ilvl w:val="0"/>
-          <w:numId w:val="1351"/>
+          <w:numId w:val="1354"/>
         </w:numPr>
       </w:pPr>
       <w:r>
@@ -8673,7 +8739,7 @@
         <w:pStyle w:val="Compact"/>
         <w:numPr>
           <w:ilvl w:val="0"/>
-          <w:numId w:val="1352"/>
+          <w:numId w:val="1355"/>
         </w:numPr>
       </w:pPr>
       <w:r>
@@ -8685,7 +8751,7 @@
         <w:pStyle w:val="Compact"/>
         <w:numPr>
           <w:ilvl w:val="0"/>
-          <w:numId w:val="1353"/>
+          <w:numId w:val="1356"/>
         </w:numPr>
       </w:pPr>
       <w:r>
@@ -8697,7 +8763,7 @@
         <w:pStyle w:val="Compact"/>
         <w:numPr>
           <w:ilvl w:val="0"/>
-          <w:numId w:val="1354"/>
+          <w:numId w:val="1357"/>
         </w:numPr>
       </w:pPr>
       <w:r>
@@ -8729,7 +8795,7 @@
         <w:pStyle w:val="Compact"/>
         <w:numPr>
           <w:ilvl w:val="0"/>
-          <w:numId w:val="1355"/>
+          <w:numId w:val="1358"/>
         </w:numPr>
       </w:pPr>
       <w:r>
@@ -8741,7 +8807,7 @@
         <w:pStyle w:val="Compact"/>
         <w:numPr>
           <w:ilvl w:val="0"/>
-          <w:numId w:val="1356"/>
+          <w:numId w:val="1359"/>
         </w:numPr>
       </w:pPr>
       <w:r>
@@ -8753,7 +8819,7 @@
         <w:pStyle w:val="Compact"/>
         <w:numPr>
           <w:ilvl w:val="0"/>
-          <w:numId w:val="1357"/>
+          <w:numId w:val="1360"/>
         </w:numPr>
       </w:pPr>
       <w:r>
@@ -8765,7 +8831,7 @@
         <w:pStyle w:val="Compact"/>
         <w:numPr>
           <w:ilvl w:val="0"/>
-          <w:numId w:val="1358"/>
+          <w:numId w:val="1361"/>
         </w:numPr>
       </w:pPr>
       <w:r>
@@ -8777,7 +8843,7 @@
         <w:pStyle w:val="Compact"/>
         <w:numPr>
           <w:ilvl w:val="0"/>
-          <w:numId w:val="1359"/>
+          <w:numId w:val="1362"/>
         </w:numPr>
       </w:pPr>
       <w:r>
@@ -8789,7 +8855,7 @@
         <w:pStyle w:val="Compact"/>
         <w:numPr>
           <w:ilvl w:val="0"/>
-          <w:numId w:val="1360"/>
+          <w:numId w:val="1363"/>
         </w:numPr>
       </w:pPr>
       <w:r>
@@ -8801,7 +8867,7 @@
         <w:pStyle w:val="Compact"/>
         <w:numPr>
           <w:ilvl w:val="0"/>
-          <w:numId w:val="1361"/>
+          <w:numId w:val="1364"/>
         </w:numPr>
       </w:pPr>
       <w:r>
@@ -8813,7 +8879,7 @@
         <w:pStyle w:val="Compact"/>
         <w:numPr>
           <w:ilvl w:val="0"/>
-          <w:numId w:val="1362"/>
+          <w:numId w:val="1365"/>
         </w:numPr>
       </w:pPr>
       <w:r>
@@ -8825,7 +8891,7 @@
         <w:pStyle w:val="Compact"/>
         <w:numPr>
           <w:ilvl w:val="0"/>
-          <w:numId w:val="1363"/>
+          <w:numId w:val="1366"/>
         </w:numPr>
       </w:pPr>
       <w:r>
@@ -8837,7 +8903,7 @@
         <w:pStyle w:val="Compact"/>
         <w:numPr>
           <w:ilvl w:val="0"/>
-          <w:numId w:val="1364"/>
+          <w:numId w:val="1367"/>
         </w:numPr>
       </w:pPr>
       <w:r>
@@ -8849,7 +8915,7 @@
         <w:pStyle w:val="Compact"/>
         <w:numPr>
           <w:ilvl w:val="0"/>
-          <w:numId w:val="1365"/>
+          <w:numId w:val="1368"/>
         </w:numPr>
       </w:pPr>
       <w:r>
@@ -8861,7 +8927,7 @@
         <w:pStyle w:val="Compact"/>
         <w:numPr>
           <w:ilvl w:val="0"/>
-          <w:numId w:val="1366"/>
+          <w:numId w:val="1369"/>
         </w:numPr>
       </w:pPr>
       <w:r>
@@ -8873,7 +8939,7 @@
         <w:pStyle w:val="Compact"/>
         <w:numPr>
           <w:ilvl w:val="0"/>
-          <w:numId w:val="1367"/>
+          <w:numId w:val="1370"/>
         </w:numPr>
       </w:pPr>
       <w:r>
@@ -8885,7 +8951,7 @@
         <w:pStyle w:val="Compact"/>
         <w:numPr>
           <w:ilvl w:val="0"/>
-          <w:numId w:val="1368"/>
+          <w:numId w:val="1371"/>
         </w:numPr>
       </w:pPr>
       <w:r>
@@ -8897,7 +8963,7 @@
         <w:pStyle w:val="Compact"/>
         <w:numPr>
           <w:ilvl w:val="0"/>
-          <w:numId w:val="1369"/>
+          <w:numId w:val="1372"/>
         </w:numPr>
       </w:pPr>
       <w:r>
@@ -8919,7 +8985,7 @@
         <w:pStyle w:val="Compact"/>
         <w:numPr>
           <w:ilvl w:val="0"/>
-          <w:numId w:val="1370"/>
+          <w:numId w:val="1373"/>
         </w:numPr>
       </w:pPr>
       <w:r>
@@ -8931,7 +8997,7 @@
         <w:pStyle w:val="Compact"/>
         <w:numPr>
           <w:ilvl w:val="0"/>
-          <w:numId w:val="1371"/>
+          <w:numId w:val="1374"/>
         </w:numPr>
       </w:pPr>
       <w:r>
@@ -8943,7 +9009,7 @@
         <w:pStyle w:val="Compact"/>
         <w:numPr>
           <w:ilvl w:val="0"/>
-          <w:numId w:val="1372"/>
+          <w:numId w:val="1375"/>
         </w:numPr>
       </w:pPr>
       <w:r>
@@ -8955,7 +9021,7 @@
         <w:pStyle w:val="Compact"/>
         <w:numPr>
           <w:ilvl w:val="0"/>
-          <w:numId w:val="1373"/>
+          <w:numId w:val="1376"/>
         </w:numPr>
       </w:pPr>
       <w:r>
@@ -8967,7 +9033,7 @@
         <w:pStyle w:val="Compact"/>
         <w:numPr>
           <w:ilvl w:val="0"/>
-          <w:numId w:val="1374"/>
+          <w:numId w:val="1377"/>
         </w:numPr>
       </w:pPr>
       <w:r>
@@ -8979,7 +9045,7 @@
         <w:pStyle w:val="Compact"/>
         <w:numPr>
           <w:ilvl w:val="0"/>
-          <w:numId w:val="1375"/>
+          <w:numId w:val="1378"/>
         </w:numPr>
       </w:pPr>
       <w:r>
@@ -8991,7 +9057,7 @@
         <w:pStyle w:val="Compact"/>
         <w:numPr>
           <w:ilvl w:val="0"/>
-          <w:numId w:val="1376"/>
+          <w:numId w:val="1379"/>
         </w:numPr>
       </w:pPr>
       <w:r>
@@ -9013,7 +9079,7 @@
         <w:pStyle w:val="Compact"/>
         <w:numPr>
           <w:ilvl w:val="0"/>
-          <w:numId w:val="1377"/>
+          <w:numId w:val="1380"/>
         </w:numPr>
       </w:pPr>
       <w:r>
@@ -9025,7 +9091,7 @@
         <w:pStyle w:val="Compact"/>
         <w:numPr>
           <w:ilvl w:val="0"/>
-          <w:numId w:val="1378"/>
+          <w:numId w:val="1381"/>
         </w:numPr>
       </w:pPr>
       <w:r>
@@ -9037,7 +9103,7 @@
         <w:pStyle w:val="Compact"/>
         <w:numPr>
           <w:ilvl w:val="0"/>
-          <w:numId w:val="1379"/>
+          <w:numId w:val="1382"/>
         </w:numPr>
       </w:pPr>
       <w:r>
@@ -9049,7 +9115,7 @@
         <w:pStyle w:val="Compact"/>
         <w:numPr>
           <w:ilvl w:val="0"/>
-          <w:numId w:val="1380"/>
+          <w:numId w:val="1383"/>
         </w:numPr>
       </w:pPr>
       <w:r>
@@ -9061,7 +9127,7 @@
         <w:pStyle w:val="Compact"/>
         <w:numPr>
           <w:ilvl w:val="0"/>
-          <w:numId w:val="1381"/>
+          <w:numId w:val="1384"/>
         </w:numPr>
       </w:pPr>
       <w:r>
@@ -9073,7 +9139,7 @@
         <w:pStyle w:val="Compact"/>
         <w:numPr>
           <w:ilvl w:val="0"/>
-          <w:numId w:val="1382"/>
+          <w:numId w:val="1385"/>
         </w:numPr>
       </w:pPr>
       <w:r>
@@ -9085,7 +9151,7 @@
         <w:pStyle w:val="Compact"/>
         <w:numPr>
           <w:ilvl w:val="0"/>
-          <w:numId w:val="1383"/>
+          <w:numId w:val="1386"/>
         </w:numPr>
       </w:pPr>
       <w:r>
@@ -9117,7 +9183,7 @@
         <w:pStyle w:val="Compact"/>
         <w:numPr>
           <w:ilvl w:val="0"/>
-          <w:numId w:val="1384"/>
+          <w:numId w:val="1387"/>
         </w:numPr>
       </w:pPr>
       <w:r>
@@ -9168,7 +9234,7 @@
         <w:pStyle w:val="Compact"/>
         <w:numPr>
           <w:ilvl w:val="0"/>
-          <w:numId w:val="1385"/>
+          <w:numId w:val="1388"/>
         </w:numPr>
       </w:pPr>
       <w:r>
@@ -9195,7 +9261,7 @@
         <w:pStyle w:val="Compact"/>
         <w:numPr>
           <w:ilvl w:val="0"/>
-          <w:numId w:val="1386"/>
+          <w:numId w:val="1389"/>
         </w:numPr>
       </w:pPr>
       <w:r>
@@ -9207,7 +9273,7 @@
         <w:pStyle w:val="Compact"/>
         <w:numPr>
           <w:ilvl w:val="0"/>
-          <w:numId w:val="1387"/>
+          <w:numId w:val="1390"/>
         </w:numPr>
       </w:pPr>
       <w:r>
@@ -9234,7 +9300,7 @@
         <w:pStyle w:val="Compact"/>
         <w:numPr>
           <w:ilvl w:val="0"/>
-          <w:numId w:val="1388"/>
+          <w:numId w:val="1391"/>
         </w:numPr>
       </w:pPr>
       <w:r>
@@ -9246,7 +9312,7 @@
         <w:pStyle w:val="Compact"/>
         <w:numPr>
           <w:ilvl w:val="0"/>
-          <w:numId w:val="1389"/>
+          <w:numId w:val="1392"/>
         </w:numPr>
       </w:pPr>
       <w:r>
@@ -9258,7 +9324,7 @@
         <w:pStyle w:val="Compact"/>
         <w:numPr>
           <w:ilvl w:val="0"/>
-          <w:numId w:val="1390"/>
+          <w:numId w:val="1393"/>
         </w:numPr>
       </w:pPr>
       <w:r>
@@ -9280,7 +9346,7 @@
         <w:pStyle w:val="Compact"/>
         <w:numPr>
           <w:ilvl w:val="0"/>
-          <w:numId w:val="1391"/>
+          <w:numId w:val="1394"/>
         </w:numPr>
       </w:pPr>
       <w:r>
@@ -9304,7 +9370,7 @@
         <w:pStyle w:val="Compact"/>
         <w:numPr>
           <w:ilvl w:val="0"/>
-          <w:numId w:val="1392"/>
+          <w:numId w:val="1395"/>
         </w:numPr>
       </w:pPr>
       <w:r>
@@ -9328,7 +9394,7 @@
         <w:pStyle w:val="Compact"/>
         <w:numPr>
           <w:ilvl w:val="0"/>
-          <w:numId w:val="1393"/>
+          <w:numId w:val="1396"/>
         </w:numPr>
       </w:pPr>
       <w:r>
@@ -9340,7 +9406,7 @@
         <w:pStyle w:val="Compact"/>
         <w:numPr>
           <w:ilvl w:val="0"/>
-          <w:numId w:val="1394"/>
+          <w:numId w:val="1397"/>
         </w:numPr>
       </w:pPr>
       <w:r>
@@ -9352,7 +9418,7 @@
         <w:pStyle w:val="Compact"/>
         <w:numPr>
           <w:ilvl w:val="0"/>
-          <w:numId w:val="1395"/>
+          <w:numId w:val="1398"/>
         </w:numPr>
       </w:pPr>
       <w:r>
@@ -9364,7 +9430,7 @@
         <w:pStyle w:val="Compact"/>
         <w:numPr>
           <w:ilvl w:val="0"/>
-          <w:numId w:val="1396"/>
+          <w:numId w:val="1399"/>
         </w:numPr>
       </w:pPr>
       <w:r>
@@ -9395,7 +9461,7 @@
         <w:pStyle w:val="Compact"/>
         <w:numPr>
           <w:ilvl w:val="0"/>
-          <w:numId w:val="1397"/>
+          <w:numId w:val="1400"/>
         </w:numPr>
       </w:pPr>
       <w:r>
@@ -9407,7 +9473,7 @@
         <w:pStyle w:val="Compact"/>
         <w:numPr>
           <w:ilvl w:val="0"/>
-          <w:numId w:val="1398"/>
+          <w:numId w:val="1401"/>
         </w:numPr>
       </w:pPr>
       <w:r>
@@ -9419,7 +9485,7 @@
         <w:pStyle w:val="Compact"/>
         <w:numPr>
           <w:ilvl w:val="1"/>
-          <w:numId w:val="1399"/>
+          <w:numId w:val="1402"/>
         </w:numPr>
       </w:pPr>
       <w:r>
@@ -9437,7 +9503,7 @@
         <w:pStyle w:val="Compact"/>
         <w:numPr>
           <w:ilvl w:val="1"/>
-          <w:numId w:val="1399"/>
+          <w:numId w:val="1402"/>
         </w:numPr>
       </w:pPr>
       <w:r>
@@ -9455,7 +9521,7 @@
         <w:pStyle w:val="Compact"/>
         <w:numPr>
           <w:ilvl w:val="1"/>
-          <w:numId w:val="1399"/>
+          <w:numId w:val="1402"/>
         </w:numPr>
       </w:pPr>
       <w:r>
@@ -9473,7 +9539,7 @@
         <w:pStyle w:val="Compact"/>
         <w:numPr>
           <w:ilvl w:val="1"/>
-          <w:numId w:val="1399"/>
+          <w:numId w:val="1402"/>
         </w:numPr>
       </w:pPr>
       <w:r>
@@ -9491,7 +9557,7 @@
         <w:pStyle w:val="Compact"/>
         <w:numPr>
           <w:ilvl w:val="0"/>
-          <w:numId w:val="1400"/>
+          <w:numId w:val="1403"/>
         </w:numPr>
       </w:pPr>
       <w:r>
@@ -9503,7 +9569,7 @@
         <w:pStyle w:val="Compact"/>
         <w:numPr>
           <w:ilvl w:val="0"/>
-          <w:numId w:val="1401"/>
+          <w:numId w:val="1404"/>
         </w:numPr>
       </w:pPr>
       <w:r>
@@ -9515,7 +9581,7 @@
         <w:pStyle w:val="Compact"/>
         <w:numPr>
           <w:ilvl w:val="0"/>
-          <w:numId w:val="1402"/>
+          <w:numId w:val="1405"/>
         </w:numPr>
       </w:pPr>
       <w:r>
@@ -9537,7 +9603,7 @@
         <w:pStyle w:val="Compact"/>
         <w:numPr>
           <w:ilvl w:val="0"/>
-          <w:numId w:val="1403"/>
+          <w:numId w:val="1406"/>
         </w:numPr>
       </w:pPr>
       <w:r>
@@ -9549,7 +9615,7 @@
         <w:pStyle w:val="Compact"/>
         <w:numPr>
           <w:ilvl w:val="0"/>
-          <w:numId w:val="1404"/>
+          <w:numId w:val="1407"/>
         </w:numPr>
       </w:pPr>
       <w:r>
@@ -9561,7 +9627,7 @@
         <w:pStyle w:val="Compact"/>
         <w:numPr>
           <w:ilvl w:val="0"/>
-          <w:numId w:val="1405"/>
+          <w:numId w:val="1408"/>
         </w:numPr>
       </w:pPr>
       <w:r>
@@ -9573,7 +9639,7 @@
         <w:pStyle w:val="Compact"/>
         <w:numPr>
           <w:ilvl w:val="0"/>
-          <w:numId w:val="1406"/>
+          <w:numId w:val="1409"/>
         </w:numPr>
       </w:pPr>
       <w:r>
@@ -9585,7 +9651,7 @@
         <w:pStyle w:val="Compact"/>
         <w:numPr>
           <w:ilvl w:val="0"/>
-          <w:numId w:val="1407"/>
+          <w:numId w:val="1410"/>
         </w:numPr>
       </w:pPr>
       <w:r>
@@ -9597,7 +9663,7 @@
         <w:pStyle w:val="Compact"/>
         <w:numPr>
           <w:ilvl w:val="0"/>
-          <w:numId w:val="1408"/>
+          <w:numId w:val="1411"/>
         </w:numPr>
       </w:pPr>
       <w:r>
@@ -9609,7 +9675,7 @@
         <w:pStyle w:val="Compact"/>
         <w:numPr>
           <w:ilvl w:val="0"/>
-          <w:numId w:val="1409"/>
+          <w:numId w:val="1412"/>
         </w:numPr>
       </w:pPr>
       <w:r>
@@ -9621,7 +9687,7 @@
         <w:pStyle w:val="Compact"/>
         <w:numPr>
           <w:ilvl w:val="0"/>
-          <w:numId w:val="1410"/>
+          <w:numId w:val="1413"/>
         </w:numPr>
       </w:pPr>
       <w:r>
@@ -9633,7 +9699,7 @@
         <w:pStyle w:val="Compact"/>
         <w:numPr>
           <w:ilvl w:val="0"/>
-          <w:numId w:val="1411"/>
+          <w:numId w:val="1414"/>
         </w:numPr>
       </w:pPr>
       <w:r>
@@ -9665,7 +9731,7 @@
         <w:pStyle w:val="Compact"/>
         <w:numPr>
           <w:ilvl w:val="0"/>
-          <w:numId w:val="1412"/>
+          <w:numId w:val="1415"/>
         </w:numPr>
       </w:pPr>
       <w:r>
@@ -9677,7 +9743,7 @@
         <w:pStyle w:val="Compact"/>
         <w:numPr>
           <w:ilvl w:val="0"/>
-          <w:numId w:val="1413"/>
+          <w:numId w:val="1416"/>
         </w:numPr>
       </w:pPr>
       <w:r>
@@ -9689,7 +9755,7 @@
         <w:pStyle w:val="Compact"/>
         <w:numPr>
           <w:ilvl w:val="1"/>
-          <w:numId w:val="1414"/>
+          <w:numId w:val="1417"/>
         </w:numPr>
       </w:pPr>
       <w:r>
@@ -9701,7 +9767,7 @@
         <w:pStyle w:val="Compact"/>
         <w:numPr>
           <w:ilvl w:val="1"/>
-          <w:numId w:val="1414"/>
+          <w:numId w:val="1417"/>
         </w:numPr>
       </w:pPr>
       <w:r>
@@ -9713,7 +9779,7 @@
         <w:pStyle w:val="Compact"/>
         <w:numPr>
           <w:ilvl w:val="1"/>
-          <w:numId w:val="1414"/>
+          <w:numId w:val="1417"/>
         </w:numPr>
       </w:pPr>
       <w:r>
@@ -9725,7 +9791,7 @@
         <w:pStyle w:val="Compact"/>
         <w:numPr>
           <w:ilvl w:val="1"/>
-          <w:numId w:val="1414"/>
+          <w:numId w:val="1417"/>
         </w:numPr>
       </w:pPr>
       <w:r>
@@ -9737,7 +9803,7 @@
         <w:pStyle w:val="Compact"/>
         <w:numPr>
           <w:ilvl w:val="1"/>
-          <w:numId w:val="1414"/>
+          <w:numId w:val="1417"/>
         </w:numPr>
       </w:pPr>
       <w:r>
@@ -9749,7 +9815,7 @@
         <w:pStyle w:val="Compact"/>
         <w:numPr>
           <w:ilvl w:val="1"/>
-          <w:numId w:val="1414"/>
+          <w:numId w:val="1417"/>
         </w:numPr>
       </w:pPr>
       <w:r>
@@ -9761,7 +9827,7 @@
         <w:pStyle w:val="Compact"/>
         <w:numPr>
           <w:ilvl w:val="1"/>
-          <w:numId w:val="1414"/>
+          <w:numId w:val="1417"/>
         </w:numPr>
       </w:pPr>
       <w:r>
@@ -9773,7 +9839,7 @@
         <w:pStyle w:val="Compact"/>
         <w:numPr>
           <w:ilvl w:val="1"/>
-          <w:numId w:val="1414"/>
+          <w:numId w:val="1417"/>
         </w:numPr>
       </w:pPr>
       <w:r>
@@ -9785,7 +9851,7 @@
         <w:pStyle w:val="Compact"/>
         <w:numPr>
           <w:ilvl w:val="0"/>
-          <w:numId w:val="1415"/>
+          <w:numId w:val="1418"/>
         </w:numPr>
       </w:pPr>
       <w:r>
@@ -9806,7 +9872,7 @@
         <w:pStyle w:val="Compact"/>
         <w:numPr>
           <w:ilvl w:val="0"/>
-          <w:numId w:val="1416"/>
+          <w:numId w:val="1419"/>
         </w:numPr>
       </w:pPr>
       <w:r>
@@ -9830,7 +9896,7 @@
         <w:pStyle w:val="Compact"/>
         <w:numPr>
           <w:ilvl w:val="0"/>
-          <w:numId w:val="1417"/>
+          <w:numId w:val="1420"/>
         </w:numPr>
       </w:pPr>
       <w:r>
@@ -9842,7 +9908,7 @@
         <w:pStyle w:val="Compact"/>
         <w:numPr>
           <w:ilvl w:val="1"/>
-          <w:numId w:val="1418"/>
+          <w:numId w:val="1421"/>
         </w:numPr>
       </w:pPr>
       <w:r>
@@ -9854,7 +9920,7 @@
         <w:pStyle w:val="Compact"/>
         <w:numPr>
           <w:ilvl w:val="1"/>
-          <w:numId w:val="1418"/>
+          <w:numId w:val="1421"/>
         </w:numPr>
       </w:pPr>
       <w:r>
@@ -9866,7 +9932,7 @@
         <w:pStyle w:val="Compact"/>
         <w:numPr>
           <w:ilvl w:val="1"/>
-          <w:numId w:val="1418"/>
+          <w:numId w:val="1421"/>
         </w:numPr>
       </w:pPr>
       <w:r>
@@ -9878,7 +9944,7 @@
         <w:pStyle w:val="Compact"/>
         <w:numPr>
           <w:ilvl w:val="0"/>
-          <w:numId w:val="1419"/>
+          <w:numId w:val="1422"/>
         </w:numPr>
       </w:pPr>
       <w:r>
@@ -9902,7 +9968,7 @@
         <w:pStyle w:val="Compact"/>
         <w:numPr>
           <w:ilvl w:val="0"/>
-          <w:numId w:val="1420"/>
+          <w:numId w:val="1423"/>
         </w:numPr>
       </w:pPr>
       <w:r>
@@ -9914,7 +9980,7 @@
         <w:pStyle w:val="Compact"/>
         <w:numPr>
           <w:ilvl w:val="0"/>
-          <w:numId w:val="1421"/>
+          <w:numId w:val="1424"/>
         </w:numPr>
       </w:pPr>
       <w:r>
@@ -9926,7 +9992,7 @@
         <w:pStyle w:val="Compact"/>
         <w:numPr>
           <w:ilvl w:val="0"/>
-          <w:numId w:val="1422"/>
+          <w:numId w:val="1425"/>
         </w:numPr>
       </w:pPr>
       <w:r>
@@ -9948,7 +10014,7 @@
         <w:pStyle w:val="Compact"/>
         <w:numPr>
           <w:ilvl w:val="0"/>
-          <w:numId w:val="1423"/>
+          <w:numId w:val="1426"/>
         </w:numPr>
       </w:pPr>
       <w:r>
@@ -9960,7 +10026,7 @@
         <w:pStyle w:val="Compact"/>
         <w:numPr>
           <w:ilvl w:val="1"/>
-          <w:numId w:val="1424"/>
+          <w:numId w:val="1427"/>
         </w:numPr>
       </w:pPr>
       <w:r>
@@ -9972,7 +10038,7 @@
         <w:pStyle w:val="Compact"/>
         <w:numPr>
           <w:ilvl w:val="1"/>
-          <w:numId w:val="1424"/>
+          <w:numId w:val="1427"/>
         </w:numPr>
       </w:pPr>
       <w:r>
@@ -9984,7 +10050,7 @@
         <w:pStyle w:val="Compact"/>
         <w:numPr>
           <w:ilvl w:val="1"/>
-          <w:numId w:val="1424"/>
+          <w:numId w:val="1427"/>
         </w:numPr>
       </w:pPr>
       <w:r>
@@ -9996,7 +10062,7 @@
         <w:pStyle w:val="Compact"/>
         <w:numPr>
           <w:ilvl w:val="0"/>
-          <w:numId w:val="1425"/>
+          <w:numId w:val="1428"/>
         </w:numPr>
       </w:pPr>
       <w:r>
@@ -10008,7 +10074,7 @@
         <w:pStyle w:val="Compact"/>
         <w:numPr>
           <w:ilvl w:val="1"/>
-          <w:numId w:val="1426"/>
+          <w:numId w:val="1429"/>
         </w:numPr>
       </w:pPr>
       <w:r>
@@ -10020,7 +10086,7 @@
         <w:pStyle w:val="Compact"/>
         <w:numPr>
           <w:ilvl w:val="1"/>
-          <w:numId w:val="1426"/>
+          <w:numId w:val="1429"/>
         </w:numPr>
       </w:pPr>
       <w:r>
@@ -10032,7 +10098,7 @@
         <w:pStyle w:val="Compact"/>
         <w:numPr>
           <w:ilvl w:val="1"/>
-          <w:numId w:val="1426"/>
+          <w:numId w:val="1429"/>
         </w:numPr>
       </w:pPr>
       <w:r>
@@ -10044,7 +10110,7 @@
         <w:pStyle w:val="Compact"/>
         <w:numPr>
           <w:ilvl w:val="0"/>
-          <w:numId w:val="1427"/>
+          <w:numId w:val="1430"/>
         </w:numPr>
       </w:pPr>
       <w:r>
@@ -10056,7 +10122,7 @@
         <w:pStyle w:val="Compact"/>
         <w:numPr>
           <w:ilvl w:val="0"/>
-          <w:numId w:val="1428"/>
+          <w:numId w:val="1431"/>
         </w:numPr>
       </w:pPr>
       <w:r>
@@ -10068,7 +10134,7 @@
         <w:pStyle w:val="Compact"/>
         <w:numPr>
           <w:ilvl w:val="0"/>
-          <w:numId w:val="1429"/>
+          <w:numId w:val="1432"/>
         </w:numPr>
       </w:pPr>
       <w:r>
@@ -10090,7 +10156,7 @@
         <w:pStyle w:val="Compact"/>
         <w:numPr>
           <w:ilvl w:val="0"/>
-          <w:numId w:val="1430"/>
+          <w:numId w:val="1433"/>
         </w:numPr>
       </w:pPr>
       <w:r>
@@ -10111,7 +10177,7 @@
         <w:pStyle w:val="Compact"/>
         <w:numPr>
           <w:ilvl w:val="0"/>
-          <w:numId w:val="1431"/>
+          <w:numId w:val="1434"/>
         </w:numPr>
       </w:pPr>
       <w:r>
@@ -10123,7 +10189,7 @@
         <w:pStyle w:val="Compact"/>
         <w:numPr>
           <w:ilvl w:val="0"/>
-          <w:numId w:val="1432"/>
+          <w:numId w:val="1435"/>
         </w:numPr>
       </w:pPr>
       <w:r>
@@ -10135,7 +10201,7 @@
         <w:pStyle w:val="Compact"/>
         <w:numPr>
           <w:ilvl w:val="0"/>
-          <w:numId w:val="1433"/>
+          <w:numId w:val="1436"/>
         </w:numPr>
       </w:pPr>
       <w:r>
@@ -10147,7 +10213,7 @@
         <w:pStyle w:val="Compact"/>
         <w:numPr>
           <w:ilvl w:val="0"/>
-          <w:numId w:val="1434"/>
+          <w:numId w:val="1437"/>
         </w:numPr>
       </w:pPr>
       <w:r>
@@ -10159,7 +10225,7 @@
         <w:pStyle w:val="Compact"/>
         <w:numPr>
           <w:ilvl w:val="0"/>
-          <w:numId w:val="1435"/>
+          <w:numId w:val="1438"/>
         </w:numPr>
       </w:pPr>
       <w:r>
@@ -10171,7 +10237,7 @@
         <w:pStyle w:val="Compact"/>
         <w:numPr>
           <w:ilvl w:val="1"/>
-          <w:numId w:val="1436"/>
+          <w:numId w:val="1439"/>
         </w:numPr>
       </w:pPr>
       <w:r>
@@ -10183,7 +10249,7 @@
         <w:pStyle w:val="Compact"/>
         <w:numPr>
           <w:ilvl w:val="1"/>
-          <w:numId w:val="1436"/>
+          <w:numId w:val="1439"/>
         </w:numPr>
       </w:pPr>
       <w:r>
@@ -10195,7 +10261,7 @@
         <w:pStyle w:val="Compact"/>
         <w:numPr>
           <w:ilvl w:val="1"/>
-          <w:numId w:val="1436"/>
+          <w:numId w:val="1439"/>
         </w:numPr>
       </w:pPr>
       <w:r>
@@ -10207,7 +10273,7 @@
         <w:pStyle w:val="Compact"/>
         <w:numPr>
           <w:ilvl w:val="1"/>
-          <w:numId w:val="1436"/>
+          <w:numId w:val="1439"/>
         </w:numPr>
       </w:pPr>
       <w:r>
@@ -10219,7 +10285,7 @@
         <w:pStyle w:val="Compact"/>
         <w:numPr>
           <w:ilvl w:val="1"/>
-          <w:numId w:val="1436"/>
+          <w:numId w:val="1439"/>
         </w:numPr>
       </w:pPr>
       <w:r>
@@ -10231,7 +10297,7 @@
         <w:pStyle w:val="Compact"/>
         <w:numPr>
           <w:ilvl w:val="1"/>
-          <w:numId w:val="1436"/>
+          <w:numId w:val="1439"/>
         </w:numPr>
       </w:pPr>
       <w:r>
@@ -10243,7 +10309,7 @@
         <w:pStyle w:val="Compact"/>
         <w:numPr>
           <w:ilvl w:val="0"/>
-          <w:numId w:val="1437"/>
+          <w:numId w:val="1440"/>
         </w:numPr>
       </w:pPr>
       <w:r>
@@ -10255,7 +10321,7 @@
         <w:pStyle w:val="Compact"/>
         <w:numPr>
           <w:ilvl w:val="0"/>
-          <w:numId w:val="1438"/>
+          <w:numId w:val="1441"/>
         </w:numPr>
       </w:pPr>
       <w:r>
@@ -10277,7 +10343,7 @@
         <w:pStyle w:val="Compact"/>
         <w:numPr>
           <w:ilvl w:val="0"/>
-          <w:numId w:val="1439"/>
+          <w:numId w:val="1442"/>
         </w:numPr>
       </w:pPr>
       <w:r>
@@ -10289,7 +10355,7 @@
         <w:pStyle w:val="Compact"/>
         <w:numPr>
           <w:ilvl w:val="0"/>
-          <w:numId w:val="1440"/>
+          <w:numId w:val="1443"/>
         </w:numPr>
       </w:pPr>
       <w:r>
@@ -10301,7 +10367,7 @@
         <w:pStyle w:val="Compact"/>
         <w:numPr>
           <w:ilvl w:val="0"/>
-          <w:numId w:val="1441"/>
+          <w:numId w:val="1444"/>
         </w:numPr>
       </w:pPr>
       <w:r>
@@ -10313,7 +10379,7 @@
         <w:pStyle w:val="Compact"/>
         <w:numPr>
           <w:ilvl w:val="0"/>
-          <w:numId w:val="1442"/>
+          <w:numId w:val="1445"/>
         </w:numPr>
       </w:pPr>
       <w:r>
@@ -10325,7 +10391,7 @@
         <w:pStyle w:val="Compact"/>
         <w:numPr>
           <w:ilvl w:val="0"/>
-          <w:numId w:val="1443"/>
+          <w:numId w:val="1446"/>
         </w:numPr>
       </w:pPr>
       <w:r>
@@ -10347,7 +10413,7 @@
         <w:pStyle w:val="Compact"/>
         <w:numPr>
           <w:ilvl w:val="0"/>
-          <w:numId w:val="1444"/>
+          <w:numId w:val="1447"/>
         </w:numPr>
       </w:pPr>
       <w:r>
@@ -10359,7 +10425,7 @@
         <w:pStyle w:val="Compact"/>
         <w:numPr>
           <w:ilvl w:val="0"/>
-          <w:numId w:val="1445"/>
+          <w:numId w:val="1448"/>
         </w:numPr>
       </w:pPr>
       <w:r>
@@ -10371,7 +10437,7 @@
         <w:pStyle w:val="Compact"/>
         <w:numPr>
           <w:ilvl w:val="0"/>
-          <w:numId w:val="1446"/>
+          <w:numId w:val="1449"/>
         </w:numPr>
       </w:pPr>
       <w:r>
@@ -10383,7 +10449,7 @@
         <w:pStyle w:val="Compact"/>
         <w:numPr>
           <w:ilvl w:val="0"/>
-          <w:numId w:val="1447"/>
+          <w:numId w:val="1450"/>
         </w:numPr>
       </w:pPr>
       <w:r>
@@ -10395,7 +10461,7 @@
         <w:pStyle w:val="Compact"/>
         <w:numPr>
           <w:ilvl w:val="0"/>
-          <w:numId w:val="1448"/>
+          <w:numId w:val="1451"/>
         </w:numPr>
       </w:pPr>
       <w:r>
@@ -10407,7 +10473,7 @@
         <w:pStyle w:val="Compact"/>
         <w:numPr>
           <w:ilvl w:val="0"/>
-          <w:numId w:val="1449"/>
+          <w:numId w:val="1452"/>
         </w:numPr>
       </w:pPr>
       <w:r>
@@ -10419,7 +10485,7 @@
         <w:pStyle w:val="Compact"/>
         <w:numPr>
           <w:ilvl w:val="0"/>
-          <w:numId w:val="1450"/>
+          <w:numId w:val="1453"/>
         </w:numPr>
       </w:pPr>
       <w:r>
@@ -10431,7 +10497,7 @@
         <w:pStyle w:val="Compact"/>
         <w:numPr>
           <w:ilvl w:val="0"/>
-          <w:numId w:val="1451"/>
+          <w:numId w:val="1454"/>
         </w:numPr>
       </w:pPr>
       <w:r>
@@ -10463,7 +10529,7 @@
         <w:pStyle w:val="Compact"/>
         <w:numPr>
           <w:ilvl w:val="0"/>
-          <w:numId w:val="1452"/>
+          <w:numId w:val="1455"/>
         </w:numPr>
       </w:pPr>
       <w:r>
@@ -10475,7 +10541,7 @@
         <w:pStyle w:val="Compact"/>
         <w:numPr>
           <w:ilvl w:val="0"/>
-          <w:numId w:val="1453"/>
+          <w:numId w:val="1456"/>
         </w:numPr>
       </w:pPr>
       <w:r>
@@ -10487,7 +10553,7 @@
         <w:pStyle w:val="Compact"/>
         <w:numPr>
           <w:ilvl w:val="0"/>
-          <w:numId w:val="1454"/>
+          <w:numId w:val="1457"/>
         </w:numPr>
       </w:pPr>
       <w:r>
@@ -10499,7 +10565,7 @@
         <w:pStyle w:val="Compact"/>
         <w:numPr>
           <w:ilvl w:val="0"/>
-          <w:numId w:val="1455"/>
+          <w:numId w:val="1458"/>
         </w:numPr>
       </w:pPr>
       <w:r>
@@ -10511,7 +10577,7 @@
         <w:pStyle w:val="Compact"/>
         <w:numPr>
           <w:ilvl w:val="0"/>
-          <w:numId w:val="1456"/>
+          <w:numId w:val="1459"/>
         </w:numPr>
       </w:pPr>
       <w:r>
@@ -10523,7 +10589,7 @@
         <w:pStyle w:val="Compact"/>
         <w:numPr>
           <w:ilvl w:val="0"/>
-          <w:numId w:val="1457"/>
+          <w:numId w:val="1460"/>
         </w:numPr>
       </w:pPr>
       <w:r>
@@ -10535,7 +10601,7 @@
         <w:pStyle w:val="Compact"/>
         <w:numPr>
           <w:ilvl w:val="1"/>
-          <w:numId w:val="1458"/>
+          <w:numId w:val="1461"/>
         </w:numPr>
       </w:pPr>
       <w:r>
@@ -10562,7 +10628,7 @@
         <w:pStyle w:val="Compact"/>
         <w:numPr>
           <w:ilvl w:val="1"/>
-          <w:numId w:val="1458"/>
+          <w:numId w:val="1461"/>
         </w:numPr>
       </w:pPr>
       <w:r>
@@ -10599,7 +10665,7 @@
         <w:pStyle w:val="Compact"/>
         <w:numPr>
           <w:ilvl w:val="0"/>
-          <w:numId w:val="1459"/>
+          <w:numId w:val="1462"/>
         </w:numPr>
       </w:pPr>
       <w:r>
@@ -10641,7 +10707,7 @@
         <w:pStyle w:val="Compact"/>
         <w:numPr>
           <w:ilvl w:val="0"/>
-          <w:numId w:val="1460"/>
+          <w:numId w:val="1463"/>
         </w:numPr>
       </w:pPr>
       <w:r>
@@ -10665,7 +10731,7 @@
         <w:pStyle w:val="Compact"/>
         <w:numPr>
           <w:ilvl w:val="0"/>
-          <w:numId w:val="1461"/>
+          <w:numId w:val="1464"/>
         </w:numPr>
       </w:pPr>
       <w:r>
@@ -10689,7 +10755,7 @@
         <w:pStyle w:val="Compact"/>
         <w:numPr>
           <w:ilvl w:val="0"/>
-          <w:numId w:val="1462"/>
+          <w:numId w:val="1465"/>
         </w:numPr>
       </w:pPr>
       <w:r>
@@ -10701,7 +10767,7 @@
         <w:pStyle w:val="Compact"/>
         <w:numPr>
           <w:ilvl w:val="0"/>
-          <w:numId w:val="1463"/>
+          <w:numId w:val="1466"/>
         </w:numPr>
       </w:pPr>
       <w:r>
@@ -10713,7 +10779,7 @@
         <w:pStyle w:val="Compact"/>
         <w:numPr>
           <w:ilvl w:val="0"/>
-          <w:numId w:val="1464"/>
+          <w:numId w:val="1467"/>
         </w:numPr>
       </w:pPr>
       <w:r>
@@ -10725,7 +10791,7 @@
         <w:pStyle w:val="Compact"/>
         <w:numPr>
           <w:ilvl w:val="0"/>
-          <w:numId w:val="1465"/>
+          <w:numId w:val="1468"/>
         </w:numPr>
       </w:pPr>
       <w:r>
@@ -10737,7 +10803,7 @@
         <w:pStyle w:val="Compact"/>
         <w:numPr>
           <w:ilvl w:val="0"/>
-          <w:numId w:val="1466"/>
+          <w:numId w:val="1469"/>
         </w:numPr>
       </w:pPr>
       <w:r>
@@ -10749,7 +10815,7 @@
         <w:pStyle w:val="Compact"/>
         <w:numPr>
           <w:ilvl w:val="0"/>
-          <w:numId w:val="1467"/>
+          <w:numId w:val="1470"/>
         </w:numPr>
       </w:pPr>
       <w:r>
@@ -10761,7 +10827,7 @@
         <w:pStyle w:val="Compact"/>
         <w:numPr>
           <w:ilvl w:val="0"/>
-          <w:numId w:val="1468"/>
+          <w:numId w:val="1471"/>
         </w:numPr>
       </w:pPr>
       <w:r>
@@ -10773,7 +10839,7 @@
         <w:pStyle w:val="Compact"/>
         <w:numPr>
           <w:ilvl w:val="0"/>
-          <w:numId w:val="1469"/>
+          <w:numId w:val="1472"/>
         </w:numPr>
       </w:pPr>
       <w:r>
@@ -10785,7 +10851,7 @@
         <w:pStyle w:val="Compact"/>
         <w:numPr>
           <w:ilvl w:val="0"/>
-          <w:numId w:val="1470"/>
+          <w:numId w:val="1473"/>
         </w:numPr>
       </w:pPr>
       <w:r>
@@ -10797,7 +10863,7 @@
         <w:pStyle w:val="Compact"/>
         <w:numPr>
           <w:ilvl w:val="0"/>
-          <w:numId w:val="1471"/>
+          <w:numId w:val="1474"/>
         </w:numPr>
       </w:pPr>
       <w:r>
@@ -10809,7 +10875,7 @@
         <w:pStyle w:val="Compact"/>
         <w:numPr>
           <w:ilvl w:val="0"/>
-          <w:numId w:val="1472"/>
+          <w:numId w:val="1475"/>
         </w:numPr>
       </w:pPr>
       <w:r>
@@ -10836,7 +10902,7 @@
         <w:pStyle w:val="Compact"/>
         <w:numPr>
           <w:ilvl w:val="0"/>
-          <w:numId w:val="1473"/>
+          <w:numId w:val="1476"/>
         </w:numPr>
       </w:pPr>
       <w:r>
@@ -10848,7 +10914,7 @@
         <w:pStyle w:val="Compact"/>
         <w:numPr>
           <w:ilvl w:val="0"/>
-          <w:numId w:val="1474"/>
+          <w:numId w:val="1477"/>
         </w:numPr>
       </w:pPr>
       <w:r>
@@ -10870,7 +10936,7 @@
         <w:pStyle w:val="Compact"/>
         <w:numPr>
           <w:ilvl w:val="0"/>
-          <w:numId w:val="1475"/>
+          <w:numId w:val="1478"/>
         </w:numPr>
       </w:pPr>
       <w:r>
@@ -10882,7 +10948,7 @@
         <w:pStyle w:val="Compact"/>
         <w:numPr>
           <w:ilvl w:val="0"/>
-          <w:numId w:val="1476"/>
+          <w:numId w:val="1479"/>
         </w:numPr>
       </w:pPr>
       <w:r>
@@ -10909,7 +10975,7 @@
         <w:pStyle w:val="Compact"/>
         <w:numPr>
           <w:ilvl w:val="0"/>
-          <w:numId w:val="1477"/>
+          <w:numId w:val="1480"/>
         </w:numPr>
       </w:pPr>
       <w:r>
@@ -10936,7 +11002,7 @@
         <w:pStyle w:val="Compact"/>
         <w:numPr>
           <w:ilvl w:val="0"/>
-          <w:numId w:val="1478"/>
+          <w:numId w:val="1481"/>
         </w:numPr>
       </w:pPr>
       <w:r>
@@ -10963,71 +11029,11 @@
         <w:pStyle w:val="Compact"/>
         <w:numPr>
           <w:ilvl w:val="0"/>
-          <w:numId w:val="1479"/>
+          <w:numId w:val="1482"/>
         </w:numPr>
       </w:pPr>
       <w:r>
         <w:t xml:space="preserve">Implement three separate analytical query engines:</w:t>
-      </w:r>
-    </w:p>
-    <w:p>
-      <w:pPr>
-        <w:pStyle w:val="Compact"/>
-        <w:numPr>
-          <w:ilvl w:val="1"/>
-          <w:numId w:val="1480"/>
-        </w:numPr>
-      </w:pPr>
-      <w:r>
-        <w:t xml:space="preserve">multi-campaign retarget;</w:t>
-      </w:r>
-    </w:p>
-    <w:p>
-      <w:pPr>
-        <w:pStyle w:val="Compact"/>
-        <w:numPr>
-          <w:ilvl w:val="1"/>
-          <w:numId w:val="1480"/>
-        </w:numPr>
-      </w:pPr>
-      <w:r>
-        <w:t xml:space="preserve">new cohorts from unsent leads;</w:t>
-      </w:r>
-    </w:p>
-    <w:p>
-      <w:pPr>
-        <w:pStyle w:val="Compact"/>
-        <w:numPr>
-          <w:ilvl w:val="1"/>
-          <w:numId w:val="1480"/>
-        </w:numPr>
-      </w:pPr>
-      <w:r>
-        <w:t xml:space="preserve">renewal candidates.</w:t>
-      </w:r>
-    </w:p>
-    <w:p>
-      <w:pPr>
-        <w:pStyle w:val="Compact"/>
-        <w:numPr>
-          <w:ilvl w:val="0"/>
-          <w:numId w:val="1481"/>
-        </w:numPr>
-      </w:pPr>
-      <w:r>
-        <w:t xml:space="preserve">Each query joins only the required campaign/lead/funded/deal data and remains performant.</w:t>
-      </w:r>
-    </w:p>
-    <w:p>
-      <w:pPr>
-        <w:pStyle w:val="Compact"/>
-        <w:numPr>
-          <w:ilvl w:val="0"/>
-          <w:numId w:val="1482"/>
-        </w:numPr>
-      </w:pPr>
-      <w:r>
-        <w:t xml:space="preserve">Each cohort includes:</w:t>
       </w:r>
     </w:p>
     <w:p>
@@ -11039,7 +11045,7 @@
         </w:numPr>
       </w:pPr>
       <w:r>
-        <w:t xml:space="preserve">lead count;</w:t>
+        <w:t xml:space="preserve">multi-campaign retarget;</w:t>
       </w:r>
     </w:p>
     <w:p>
@@ -11051,7 +11057,7 @@
         </w:numPr>
       </w:pPr>
       <w:r>
-        <w:t xml:space="preserve">predicted reply rate;</w:t>
+        <w:t xml:space="preserve">new cohorts from unsent leads;</w:t>
       </w:r>
     </w:p>
     <w:p>
@@ -11063,6 +11069,66 @@
         </w:numPr>
       </w:pPr>
       <w:r>
+        <w:t xml:space="preserve">renewal candidates.</w:t>
+      </w:r>
+    </w:p>
+    <w:p>
+      <w:pPr>
+        <w:pStyle w:val="Compact"/>
+        <w:numPr>
+          <w:ilvl w:val="0"/>
+          <w:numId w:val="1484"/>
+        </w:numPr>
+      </w:pPr>
+      <w:r>
+        <w:t xml:space="preserve">Each query joins only the required campaign/lead/funded/deal data and remains performant.</w:t>
+      </w:r>
+    </w:p>
+    <w:p>
+      <w:pPr>
+        <w:pStyle w:val="Compact"/>
+        <w:numPr>
+          <w:ilvl w:val="0"/>
+          <w:numId w:val="1485"/>
+        </w:numPr>
+      </w:pPr>
+      <w:r>
+        <w:t xml:space="preserve">Each cohort includes:</w:t>
+      </w:r>
+    </w:p>
+    <w:p>
+      <w:pPr>
+        <w:pStyle w:val="Compact"/>
+        <w:numPr>
+          <w:ilvl w:val="1"/>
+          <w:numId w:val="1486"/>
+        </w:numPr>
+      </w:pPr>
+      <w:r>
+        <w:t xml:space="preserve">lead count;</w:t>
+      </w:r>
+    </w:p>
+    <w:p>
+      <w:pPr>
+        <w:pStyle w:val="Compact"/>
+        <w:numPr>
+          <w:ilvl w:val="1"/>
+          <w:numId w:val="1486"/>
+        </w:numPr>
+      </w:pPr>
+      <w:r>
+        <w:t xml:space="preserve">predicted reply rate;</w:t>
+      </w:r>
+    </w:p>
+    <w:p>
+      <w:pPr>
+        <w:pStyle w:val="Compact"/>
+        <w:numPr>
+          <w:ilvl w:val="1"/>
+          <w:numId w:val="1486"/>
+        </w:numPr>
+      </w:pPr>
+      <w:r>
         <w:t xml:space="preserve">expected funded deals;</w:t>
       </w:r>
     </w:p>
@@ -11071,7 +11137,7 @@
         <w:pStyle w:val="Compact"/>
         <w:numPr>
           <w:ilvl w:val="1"/>
-          <w:numId w:val="1483"/>
+          <w:numId w:val="1486"/>
         </w:numPr>
       </w:pPr>
       <w:r>
@@ -11083,7 +11149,7 @@
         <w:pStyle w:val="Compact"/>
         <w:numPr>
           <w:ilvl w:val="1"/>
-          <w:numId w:val="1483"/>
+          <w:numId w:val="1486"/>
         </w:numPr>
       </w:pPr>
       <w:r>
@@ -11095,7 +11161,7 @@
         <w:pStyle w:val="Compact"/>
         <w:numPr>
           <w:ilvl w:val="1"/>
-          <w:numId w:val="1483"/>
+          <w:numId w:val="1486"/>
         </w:numPr>
       </w:pPr>
       <w:r>
@@ -11107,7 +11173,7 @@
         <w:pStyle w:val="Compact"/>
         <w:numPr>
           <w:ilvl w:val="0"/>
-          <w:numId w:val="1484"/>
+          <w:numId w:val="1487"/>
         </w:numPr>
       </w:pPr>
       <w:r>
@@ -11119,7 +11185,7 @@
         <w:pStyle w:val="Compact"/>
         <w:numPr>
           <w:ilvl w:val="0"/>
-          <w:numId w:val="1485"/>
+          <w:numId w:val="1488"/>
         </w:numPr>
       </w:pPr>
       <w:r>
@@ -11131,7 +11197,7 @@
         <w:pStyle w:val="Compact"/>
         <w:numPr>
           <w:ilvl w:val="0"/>
-          <w:numId w:val="1486"/>
+          <w:numId w:val="1489"/>
         </w:numPr>
       </w:pPr>
       <w:r>
@@ -11153,7 +11219,7 @@
         <w:pStyle w:val="Compact"/>
         <w:numPr>
           <w:ilvl w:val="0"/>
-          <w:numId w:val="1487"/>
+          <w:numId w:val="1490"/>
         </w:numPr>
       </w:pPr>
       <w:r>
@@ -11165,7 +11231,7 @@
         <w:pStyle w:val="Compact"/>
         <w:numPr>
           <w:ilvl w:val="0"/>
-          <w:numId w:val="1488"/>
+          <w:numId w:val="1491"/>
         </w:numPr>
       </w:pPr>
       <w:r>
@@ -11177,7 +11243,7 @@
         <w:pStyle w:val="Compact"/>
         <w:numPr>
           <w:ilvl w:val="0"/>
-          <w:numId w:val="1489"/>
+          <w:numId w:val="1492"/>
         </w:numPr>
       </w:pPr>
       <w:r>
@@ -11189,7 +11255,7 @@
         <w:pStyle w:val="Compact"/>
         <w:numPr>
           <w:ilvl w:val="0"/>
-          <w:numId w:val="1490"/>
+          <w:numId w:val="1493"/>
         </w:numPr>
       </w:pPr>
       <w:r>
@@ -11201,7 +11267,7 @@
         <w:pStyle w:val="Compact"/>
         <w:numPr>
           <w:ilvl w:val="0"/>
-          <w:numId w:val="1491"/>
+          <w:numId w:val="1494"/>
         </w:numPr>
       </w:pPr>
       <w:r>
@@ -11213,7 +11279,7 @@
         <w:pStyle w:val="Compact"/>
         <w:numPr>
           <w:ilvl w:val="0"/>
-          <w:numId w:val="1492"/>
+          <w:numId w:val="1495"/>
         </w:numPr>
       </w:pPr>
       <w:r>
@@ -11235,7 +11301,7 @@
         <w:pStyle w:val="Compact"/>
         <w:numPr>
           <w:ilvl w:val="0"/>
-          <w:numId w:val="1493"/>
+          <w:numId w:val="1496"/>
         </w:numPr>
       </w:pPr>
       <w:r>
@@ -11247,7 +11313,7 @@
         <w:pStyle w:val="Compact"/>
         <w:numPr>
           <w:ilvl w:val="1"/>
-          <w:numId w:val="1494"/>
+          <w:numId w:val="1497"/>
         </w:numPr>
       </w:pPr>
       <w:r>
@@ -11259,7 +11325,7 @@
         <w:pStyle w:val="Compact"/>
         <w:numPr>
           <w:ilvl w:val="1"/>
-          <w:numId w:val="1494"/>
+          <w:numId w:val="1497"/>
         </w:numPr>
       </w:pPr>
       <w:r>
@@ -11271,7 +11337,7 @@
         <w:pStyle w:val="Compact"/>
         <w:numPr>
           <w:ilvl w:val="0"/>
-          <w:numId w:val="1495"/>
+          <w:numId w:val="1498"/>
         </w:numPr>
       </w:pPr>
       <w:r>
@@ -11283,7 +11349,7 @@
         <w:pStyle w:val="Compact"/>
         <w:numPr>
           <w:ilvl w:val="1"/>
-          <w:numId w:val="1496"/>
+          <w:numId w:val="1499"/>
         </w:numPr>
       </w:pPr>
       <w:r>
@@ -11295,7 +11361,7 @@
         <w:pStyle w:val="Compact"/>
         <w:numPr>
           <w:ilvl w:val="1"/>
-          <w:numId w:val="1496"/>
+          <w:numId w:val="1499"/>
         </w:numPr>
       </w:pPr>
       <w:r>
@@ -11307,7 +11373,7 @@
         <w:pStyle w:val="Compact"/>
         <w:numPr>
           <w:ilvl w:val="0"/>
-          <w:numId w:val="1497"/>
+          <w:numId w:val="1500"/>
         </w:numPr>
       </w:pPr>
       <w:r>
@@ -11319,7 +11385,7 @@
         <w:pStyle w:val="Compact"/>
         <w:numPr>
           <w:ilvl w:val="0"/>
-          <w:numId w:val="1498"/>
+          <w:numId w:val="1501"/>
         </w:numPr>
       </w:pPr>
       <w:r>
@@ -11331,7 +11397,7 @@
         <w:pStyle w:val="Compact"/>
         <w:numPr>
           <w:ilvl w:val="0"/>
-          <w:numId w:val="1499"/>
+          <w:numId w:val="1502"/>
         </w:numPr>
       </w:pPr>
       <w:r>
@@ -11343,7 +11409,7 @@
         <w:pStyle w:val="Compact"/>
         <w:numPr>
           <w:ilvl w:val="0"/>
-          <w:numId w:val="1500"/>
+          <w:numId w:val="1503"/>
         </w:numPr>
       </w:pPr>
       <w:r>
@@ -11365,7 +11431,7 @@
         <w:pStyle w:val="Compact"/>
         <w:numPr>
           <w:ilvl w:val="0"/>
-          <w:numId w:val="1501"/>
+          <w:numId w:val="1504"/>
         </w:numPr>
       </w:pPr>
       <w:r>
@@ -11377,7 +11443,7 @@
         <w:pStyle w:val="Compact"/>
         <w:numPr>
           <w:ilvl w:val="0"/>
-          <w:numId w:val="1502"/>
+          <w:numId w:val="1505"/>
         </w:numPr>
       </w:pPr>
       <w:r>
@@ -11389,7 +11455,7 @@
         <w:pStyle w:val="Compact"/>
         <w:numPr>
           <w:ilvl w:val="0"/>
-          <w:numId w:val="1503"/>
+          <w:numId w:val="1506"/>
         </w:numPr>
       </w:pPr>
       <w:r>
@@ -11401,7 +11467,7 @@
         <w:pStyle w:val="Compact"/>
         <w:numPr>
           <w:ilvl w:val="0"/>
-          <w:numId w:val="1504"/>
+          <w:numId w:val="1507"/>
         </w:numPr>
       </w:pPr>
       <w:r>
@@ -11413,7 +11479,7 @@
         <w:pStyle w:val="Compact"/>
         <w:numPr>
           <w:ilvl w:val="0"/>
-          <w:numId w:val="1505"/>
+          <w:numId w:val="1508"/>
         </w:numPr>
       </w:pPr>
       <w:r>
@@ -11425,7 +11491,7 @@
         <w:pStyle w:val="Compact"/>
         <w:numPr>
           <w:ilvl w:val="0"/>
-          <w:numId w:val="1506"/>
+          <w:numId w:val="1509"/>
         </w:numPr>
       </w:pPr>
       <w:r>
@@ -11437,7 +11503,7 @@
         <w:pStyle w:val="Compact"/>
         <w:numPr>
           <w:ilvl w:val="0"/>
-          <w:numId w:val="1507"/>
+          <w:numId w:val="1510"/>
         </w:numPr>
       </w:pPr>
       <w:r>
@@ -11449,7 +11515,7 @@
         <w:pStyle w:val="Compact"/>
         <w:numPr>
           <w:ilvl w:val="0"/>
-          <w:numId w:val="1508"/>
+          <w:numId w:val="1511"/>
         </w:numPr>
       </w:pPr>
       <w:r>
@@ -11461,7 +11527,7 @@
         <w:pStyle w:val="Compact"/>
         <w:numPr>
           <w:ilvl w:val="0"/>
-          <w:numId w:val="1509"/>
+          <w:numId w:val="1512"/>
         </w:numPr>
       </w:pPr>
       <w:r>
@@ -11483,7 +11549,7 @@
         <w:pStyle w:val="Compact"/>
         <w:numPr>
           <w:ilvl w:val="0"/>
-          <w:numId w:val="1510"/>
+          <w:numId w:val="1513"/>
         </w:numPr>
       </w:pPr>
       <w:r>
@@ -11495,7 +11561,7 @@
         <w:pStyle w:val="Compact"/>
         <w:numPr>
           <w:ilvl w:val="0"/>
-          <w:numId w:val="1511"/>
+          <w:numId w:val="1514"/>
         </w:numPr>
       </w:pPr>
       <w:r>
@@ -11507,7 +11573,7 @@
         <w:pStyle w:val="Compact"/>
         <w:numPr>
           <w:ilvl w:val="0"/>
-          <w:numId w:val="1512"/>
+          <w:numId w:val="1515"/>
         </w:numPr>
       </w:pPr>
       <w:r>
@@ -11519,7 +11585,7 @@
         <w:pStyle w:val="Compact"/>
         <w:numPr>
           <w:ilvl w:val="0"/>
-          <w:numId w:val="1513"/>
+          <w:numId w:val="1516"/>
         </w:numPr>
       </w:pPr>
       <w:r>
@@ -11531,7 +11597,7 @@
         <w:pStyle w:val="Compact"/>
         <w:numPr>
           <w:ilvl w:val="0"/>
-          <w:numId w:val="1514"/>
+          <w:numId w:val="1517"/>
         </w:numPr>
       </w:pPr>
       <w:r>
@@ -11543,7 +11609,7 @@
         <w:pStyle w:val="Compact"/>
         <w:numPr>
           <w:ilvl w:val="0"/>
-          <w:numId w:val="1515"/>
+          <w:numId w:val="1518"/>
         </w:numPr>
       </w:pPr>
       <w:r>
@@ -11555,7 +11621,7 @@
         <w:pStyle w:val="Compact"/>
         <w:numPr>
           <w:ilvl w:val="0"/>
-          <w:numId w:val="1516"/>
+          <w:numId w:val="1519"/>
         </w:numPr>
       </w:pPr>
       <w:r>
@@ -11567,7 +11633,7 @@
         <w:pStyle w:val="Compact"/>
         <w:numPr>
           <w:ilvl w:val="0"/>
-          <w:numId w:val="1517"/>
+          <w:numId w:val="1520"/>
         </w:numPr>
       </w:pPr>
       <w:r>
@@ -11579,7 +11645,7 @@
         <w:pStyle w:val="Compact"/>
         <w:numPr>
           <w:ilvl w:val="0"/>
-          <w:numId w:val="1518"/>
+          <w:numId w:val="1521"/>
         </w:numPr>
       </w:pPr>
       <w:r>
@@ -11591,7 +11657,7 @@
         <w:pStyle w:val="Compact"/>
         <w:numPr>
           <w:ilvl w:val="0"/>
-          <w:numId w:val="1519"/>
+          <w:numId w:val="1522"/>
         </w:numPr>
       </w:pPr>
       <w:r>
@@ -11618,7 +11684,7 @@
         <w:pStyle w:val="Compact"/>
         <w:numPr>
           <w:ilvl w:val="0"/>
-          <w:numId w:val="1520"/>
+          <w:numId w:val="1523"/>
         </w:numPr>
       </w:pPr>
       <w:r>
@@ -11639,7 +11705,7 @@
         <w:pStyle w:val="Compact"/>
         <w:numPr>
           <w:ilvl w:val="0"/>
-          <w:numId w:val="1521"/>
+          <w:numId w:val="1524"/>
         </w:numPr>
       </w:pPr>
       <w:r>
@@ -11661,7 +11727,7 @@
         <w:pStyle w:val="Compact"/>
         <w:numPr>
           <w:ilvl w:val="0"/>
-          <w:numId w:val="1522"/>
+          <w:numId w:val="1525"/>
         </w:numPr>
       </w:pPr>
       <w:r>
@@ -11673,7 +11739,7 @@
         <w:pStyle w:val="Compact"/>
         <w:numPr>
           <w:ilvl w:val="0"/>
-          <w:numId w:val="1523"/>
+          <w:numId w:val="1526"/>
         </w:numPr>
       </w:pPr>
       <w:r>
@@ -11685,7 +11751,7 @@
         <w:pStyle w:val="Compact"/>
         <w:numPr>
           <w:ilvl w:val="0"/>
-          <w:numId w:val="1524"/>
+          <w:numId w:val="1527"/>
         </w:numPr>
       </w:pPr>
       <w:r>
@@ -11697,7 +11763,7 @@
         <w:pStyle w:val="Compact"/>
         <w:numPr>
           <w:ilvl w:val="0"/>
-          <w:numId w:val="1525"/>
+          <w:numId w:val="1528"/>
         </w:numPr>
       </w:pPr>
       <w:r>
@@ -11709,7 +11775,7 @@
         <w:pStyle w:val="Compact"/>
         <w:numPr>
           <w:ilvl w:val="0"/>
-          <w:numId w:val="1526"/>
+          <w:numId w:val="1529"/>
         </w:numPr>
       </w:pPr>
       <w:r>
@@ -11721,7 +11787,7 @@
         <w:pStyle w:val="Compact"/>
         <w:numPr>
           <w:ilvl w:val="0"/>
-          <w:numId w:val="1527"/>
+          <w:numId w:val="1530"/>
         </w:numPr>
       </w:pPr>
       <w:r>
@@ -11733,7 +11799,7 @@
         <w:pStyle w:val="Compact"/>
         <w:numPr>
           <w:ilvl w:val="0"/>
-          <w:numId w:val="1528"/>
+          <w:numId w:val="1531"/>
         </w:numPr>
       </w:pPr>
       <w:r>
@@ -11745,7 +11811,7 @@
         <w:pStyle w:val="Compact"/>
         <w:numPr>
           <w:ilvl w:val="0"/>
-          <w:numId w:val="1529"/>
+          <w:numId w:val="1532"/>
         </w:numPr>
       </w:pPr>
       <w:r>
@@ -11767,7 +11833,7 @@
         <w:pStyle w:val="Compact"/>
         <w:numPr>
           <w:ilvl w:val="0"/>
-          <w:numId w:val="1530"/>
+          <w:numId w:val="1533"/>
         </w:numPr>
       </w:pPr>
       <w:r>
@@ -11779,7 +11845,7 @@
         <w:pStyle w:val="Compact"/>
         <w:numPr>
           <w:ilvl w:val="0"/>
-          <w:numId w:val="1531"/>
+          <w:numId w:val="1534"/>
         </w:numPr>
       </w:pPr>
       <w:r>
@@ -11791,7 +11857,7 @@
         <w:pStyle w:val="Compact"/>
         <w:numPr>
           <w:ilvl w:val="0"/>
-          <w:numId w:val="1532"/>
+          <w:numId w:val="1535"/>
         </w:numPr>
       </w:pPr>
       <w:r>
@@ -11803,7 +11869,7 @@
         <w:pStyle w:val="Compact"/>
         <w:numPr>
           <w:ilvl w:val="0"/>
-          <w:numId w:val="1533"/>
+          <w:numId w:val="1536"/>
         </w:numPr>
       </w:pPr>
       <w:r>
@@ -11815,7 +11881,7 @@
         <w:pStyle w:val="Compact"/>
         <w:numPr>
           <w:ilvl w:val="0"/>
-          <w:numId w:val="1534"/>
+          <w:numId w:val="1537"/>
         </w:numPr>
       </w:pPr>
       <w:r>
@@ -11827,7 +11893,7 @@
         <w:pStyle w:val="Compact"/>
         <w:numPr>
           <w:ilvl w:val="0"/>
-          <w:numId w:val="1535"/>
+          <w:numId w:val="1538"/>
         </w:numPr>
       </w:pPr>
       <w:r>
@@ -11839,7 +11905,7 @@
         <w:pStyle w:val="Compact"/>
         <w:numPr>
           <w:ilvl w:val="0"/>
-          <w:numId w:val="1536"/>
+          <w:numId w:val="1539"/>
         </w:numPr>
       </w:pPr>
       <w:r>
@@ -11851,7 +11917,7 @@
         <w:pStyle w:val="Compact"/>
         <w:numPr>
           <w:ilvl w:val="0"/>
-          <w:numId w:val="1537"/>
+          <w:numId w:val="1540"/>
         </w:numPr>
       </w:pPr>
       <w:r>
@@ -11863,7 +11929,7 @@
         <w:pStyle w:val="Compact"/>
         <w:numPr>
           <w:ilvl w:val="0"/>
-          <w:numId w:val="1538"/>
+          <w:numId w:val="1541"/>
         </w:numPr>
       </w:pPr>
       <w:r>
@@ -11875,7 +11941,7 @@
         <w:pStyle w:val="Compact"/>
         <w:numPr>
           <w:ilvl w:val="0"/>
-          <w:numId w:val="1539"/>
+          <w:numId w:val="1542"/>
         </w:numPr>
       </w:pPr>
       <w:r>
@@ -11887,7 +11953,7 @@
         <w:pStyle w:val="Compact"/>
         <w:numPr>
           <w:ilvl w:val="0"/>
-          <w:numId w:val="1540"/>
+          <w:numId w:val="1543"/>
         </w:numPr>
       </w:pPr>
       <w:r>
@@ -11899,7 +11965,7 @@
         <w:pStyle w:val="Compact"/>
         <w:numPr>
           <w:ilvl w:val="0"/>
-          <w:numId w:val="1541"/>
+          <w:numId w:val="1544"/>
         </w:numPr>
       </w:pPr>
       <w:r>
@@ -11911,7 +11977,7 @@
         <w:pStyle w:val="Compact"/>
         <w:numPr>
           <w:ilvl w:val="0"/>
-          <w:numId w:val="1542"/>
+          <w:numId w:val="1545"/>
         </w:numPr>
       </w:pPr>
       <w:r>
@@ -11923,7 +11989,7 @@
         <w:pStyle w:val="Compact"/>
         <w:numPr>
           <w:ilvl w:val="0"/>
-          <w:numId w:val="1543"/>
+          <w:numId w:val="1546"/>
         </w:numPr>
       </w:pPr>
       <w:r>
@@ -11935,7 +12001,7 @@
         <w:pStyle w:val="Compact"/>
         <w:numPr>
           <w:ilvl w:val="0"/>
-          <w:numId w:val="1544"/>
+          <w:numId w:val="1547"/>
         </w:numPr>
       </w:pPr>
       <w:r>
@@ -11967,7 +12033,7 @@
         <w:pStyle w:val="Compact"/>
         <w:numPr>
           <w:ilvl w:val="0"/>
-          <w:numId w:val="1545"/>
+          <w:numId w:val="1548"/>
         </w:numPr>
       </w:pPr>
       <w:r>
@@ -11979,7 +12045,7 @@
         <w:pStyle w:val="Compact"/>
         <w:numPr>
           <w:ilvl w:val="0"/>
-          <w:numId w:val="1546"/>
+          <w:numId w:val="1549"/>
         </w:numPr>
       </w:pPr>
       <w:r>
@@ -11991,7 +12057,7 @@
         <w:pStyle w:val="Compact"/>
         <w:numPr>
           <w:ilvl w:val="0"/>
-          <w:numId w:val="1547"/>
+          <w:numId w:val="1550"/>
         </w:numPr>
       </w:pPr>
       <w:r>
@@ -12003,7 +12069,7 @@
         <w:pStyle w:val="Compact"/>
         <w:numPr>
           <w:ilvl w:val="0"/>
-          <w:numId w:val="1548"/>
+          <w:numId w:val="1551"/>
         </w:numPr>
       </w:pPr>
       <w:r>
@@ -12015,7 +12081,7 @@
         <w:pStyle w:val="Compact"/>
         <w:numPr>
           <w:ilvl w:val="0"/>
-          <w:numId w:val="1549"/>
+          <w:numId w:val="1552"/>
         </w:numPr>
       </w:pPr>
       <w:r>
@@ -12027,7 +12093,7 @@
         <w:pStyle w:val="Compact"/>
         <w:numPr>
           <w:ilvl w:val="0"/>
-          <w:numId w:val="1550"/>
+          <w:numId w:val="1553"/>
         </w:numPr>
       </w:pPr>
       <w:r>
@@ -12039,7 +12105,7 @@
         <w:pStyle w:val="Compact"/>
         <w:numPr>
           <w:ilvl w:val="0"/>
-          <w:numId w:val="1551"/>
+          <w:numId w:val="1554"/>
         </w:numPr>
       </w:pPr>
       <w:r>
@@ -12051,7 +12117,7 @@
         <w:pStyle w:val="Compact"/>
         <w:numPr>
           <w:ilvl w:val="0"/>
-          <w:numId w:val="1552"/>
+          <w:numId w:val="1555"/>
         </w:numPr>
       </w:pPr>
       <w:r>
@@ -12063,7 +12129,7 @@
         <w:pStyle w:val="Compact"/>
         <w:numPr>
           <w:ilvl w:val="0"/>
-          <w:numId w:val="1553"/>
+          <w:numId w:val="1556"/>
         </w:numPr>
       </w:pPr>
       <w:r>
@@ -12075,7 +12141,7 @@
         <w:pStyle w:val="Compact"/>
         <w:numPr>
           <w:ilvl w:val="0"/>
-          <w:numId w:val="1554"/>
+          <w:numId w:val="1557"/>
         </w:numPr>
       </w:pPr>
       <w:r>
@@ -12087,7 +12153,7 @@
         <w:pStyle w:val="Compact"/>
         <w:numPr>
           <w:ilvl w:val="0"/>
-          <w:numId w:val="1555"/>
+          <w:numId w:val="1558"/>
         </w:numPr>
       </w:pPr>
       <w:r>
@@ -12099,7 +12165,7 @@
         <w:pStyle w:val="Compact"/>
         <w:numPr>
           <w:ilvl w:val="0"/>
-          <w:numId w:val="1556"/>
+          <w:numId w:val="1559"/>
         </w:numPr>
       </w:pPr>
       <w:r>
@@ -12111,7 +12177,7 @@
         <w:pStyle w:val="Compact"/>
         <w:numPr>
           <w:ilvl w:val="0"/>
-          <w:numId w:val="1557"/>
+          <w:numId w:val="1560"/>
         </w:numPr>
       </w:pPr>
       <w:r>
@@ -12148,7 +12214,7 @@
         <w:pStyle w:val="Compact"/>
         <w:numPr>
           <w:ilvl w:val="0"/>
-          <w:numId w:val="1558"/>
+          <w:numId w:val="1561"/>
         </w:numPr>
       </w:pPr>
       <w:r>
@@ -12160,7 +12226,7 @@
         <w:pStyle w:val="Compact"/>
         <w:numPr>
           <w:ilvl w:val="0"/>
-          <w:numId w:val="1559"/>
+          <w:numId w:val="1562"/>
         </w:numPr>
       </w:pPr>
       <w:r>
@@ -12187,7 +12253,7 @@
         <w:pStyle w:val="Compact"/>
         <w:numPr>
           <w:ilvl w:val="0"/>
-          <w:numId w:val="1560"/>
+          <w:numId w:val="1563"/>
         </w:numPr>
       </w:pPr>
       <w:r>
@@ -12199,7 +12265,7 @@
         <w:pStyle w:val="Compact"/>
         <w:numPr>
           <w:ilvl w:val="0"/>
-          <w:numId w:val="1561"/>
+          <w:numId w:val="1564"/>
         </w:numPr>
       </w:pPr>
       <w:r>
@@ -12211,7 +12277,7 @@
         <w:pStyle w:val="Compact"/>
         <w:numPr>
           <w:ilvl w:val="0"/>
-          <w:numId w:val="1562"/>
+          <w:numId w:val="1565"/>
         </w:numPr>
       </w:pPr>
       <w:r>
@@ -12223,7 +12289,7 @@
         <w:pStyle w:val="Compact"/>
         <w:numPr>
           <w:ilvl w:val="0"/>
-          <w:numId w:val="1563"/>
+          <w:numId w:val="1566"/>
         </w:numPr>
       </w:pPr>
       <w:r>
@@ -12235,7 +12301,7 @@
         <w:pStyle w:val="Compact"/>
         <w:numPr>
           <w:ilvl w:val="0"/>
-          <w:numId w:val="1564"/>
+          <w:numId w:val="1567"/>
         </w:numPr>
       </w:pPr>
       <w:r>
@@ -12247,7 +12313,7 @@
         <w:pStyle w:val="Compact"/>
         <w:numPr>
           <w:ilvl w:val="0"/>
-          <w:numId w:val="1565"/>
+          <w:numId w:val="1568"/>
         </w:numPr>
       </w:pPr>
       <w:r>
@@ -12269,7 +12335,7 @@
         <w:pStyle w:val="Compact"/>
         <w:numPr>
           <w:ilvl w:val="0"/>
-          <w:numId w:val="1566"/>
+          <w:numId w:val="1569"/>
         </w:numPr>
       </w:pPr>
       <w:r>
@@ -12281,7 +12347,7 @@
         <w:pStyle w:val="Compact"/>
         <w:numPr>
           <w:ilvl w:val="0"/>
-          <w:numId w:val="1567"/>
+          <w:numId w:val="1570"/>
         </w:numPr>
       </w:pPr>
       <w:r>
@@ -12293,7 +12359,7 @@
         <w:pStyle w:val="Compact"/>
         <w:numPr>
           <w:ilvl w:val="0"/>
-          <w:numId w:val="1568"/>
+          <w:numId w:val="1571"/>
         </w:numPr>
       </w:pPr>
       <w:r>
@@ -12305,7 +12371,7 @@
         <w:pStyle w:val="Compact"/>
         <w:numPr>
           <w:ilvl w:val="0"/>
-          <w:numId w:val="1569"/>
+          <w:numId w:val="1572"/>
         </w:numPr>
       </w:pPr>
       <w:r>
@@ -12317,7 +12383,7 @@
         <w:pStyle w:val="Compact"/>
         <w:numPr>
           <w:ilvl w:val="0"/>
-          <w:numId w:val="1570"/>
+          <w:numId w:val="1573"/>
         </w:numPr>
       </w:pPr>
       <w:r>
@@ -12329,7 +12395,7 @@
         <w:pStyle w:val="Compact"/>
         <w:numPr>
           <w:ilvl w:val="0"/>
-          <w:numId w:val="1571"/>
+          <w:numId w:val="1574"/>
         </w:numPr>
       </w:pPr>
       <w:r>
@@ -12341,7 +12407,7 @@
         <w:pStyle w:val="Compact"/>
         <w:numPr>
           <w:ilvl w:val="0"/>
-          <w:numId w:val="1572"/>
+          <w:numId w:val="1575"/>
         </w:numPr>
       </w:pPr>
       <w:r>
@@ -12353,7 +12419,7 @@
         <w:pStyle w:val="Compact"/>
         <w:numPr>
           <w:ilvl w:val="0"/>
-          <w:numId w:val="1573"/>
+          <w:numId w:val="1576"/>
         </w:numPr>
       </w:pPr>
       <w:r>
@@ -12365,7 +12431,7 @@
         <w:pStyle w:val="Compact"/>
         <w:numPr>
           <w:ilvl w:val="0"/>
-          <w:numId w:val="1574"/>
+          <w:numId w:val="1577"/>
         </w:numPr>
       </w:pPr>
       <w:r>
@@ -12388,7 +12454,7 @@
         <w:pStyle w:val="Compact"/>
         <w:numPr>
           <w:ilvl w:val="0"/>
-          <w:numId w:val="1575"/>
+          <w:numId w:val="1578"/>
         </w:numPr>
       </w:pPr>
       <w:r>
@@ -12400,7 +12466,7 @@
         <w:pStyle w:val="Compact"/>
         <w:numPr>
           <w:ilvl w:val="0"/>
-          <w:numId w:val="1576"/>
+          <w:numId w:val="1579"/>
         </w:numPr>
       </w:pPr>
       <w:r>
@@ -12412,7 +12478,7 @@
         <w:pStyle w:val="Compact"/>
         <w:numPr>
           <w:ilvl w:val="0"/>
-          <w:numId w:val="1577"/>
+          <w:numId w:val="1580"/>
         </w:numPr>
       </w:pPr>
       <w:r>
@@ -12424,7 +12490,7 @@
         <w:pStyle w:val="Compact"/>
         <w:numPr>
           <w:ilvl w:val="0"/>
-          <w:numId w:val="1578"/>
+          <w:numId w:val="1581"/>
         </w:numPr>
       </w:pPr>
       <w:r>
@@ -12436,7 +12502,7 @@
         <w:pStyle w:val="Compact"/>
         <w:numPr>
           <w:ilvl w:val="0"/>
-          <w:numId w:val="1579"/>
+          <w:numId w:val="1582"/>
         </w:numPr>
       </w:pPr>
       <w:r>
@@ -12448,7 +12514,7 @@
         <w:pStyle w:val="Compact"/>
         <w:numPr>
           <w:ilvl w:val="0"/>
-          <w:numId w:val="1580"/>
+          <w:numId w:val="1583"/>
         </w:numPr>
       </w:pPr>
       <w:r>
@@ -12460,7 +12526,7 @@
         <w:pStyle w:val="Compact"/>
         <w:numPr>
           <w:ilvl w:val="0"/>
-          <w:numId w:val="1581"/>
+          <w:numId w:val="1584"/>
         </w:numPr>
       </w:pPr>
       <w:r>
@@ -12472,7 +12538,7 @@
         <w:pStyle w:val="Compact"/>
         <w:numPr>
           <w:ilvl w:val="0"/>
-          <w:numId w:val="1582"/>
+          <w:numId w:val="1585"/>
         </w:numPr>
       </w:pPr>
       <w:r>
@@ -12484,7 +12550,7 @@
         <w:pStyle w:val="Compact"/>
         <w:numPr>
           <w:ilvl w:val="0"/>
-          <w:numId w:val="1583"/>
+          <w:numId w:val="1586"/>
         </w:numPr>
       </w:pPr>
       <w:r>
@@ -12496,7 +12562,7 @@
         <w:pStyle w:val="Compact"/>
         <w:numPr>
           <w:ilvl w:val="0"/>
-          <w:numId w:val="1584"/>
+          <w:numId w:val="1587"/>
         </w:numPr>
       </w:pPr>
       <w:r>
@@ -12508,7 +12574,7 @@
         <w:pStyle w:val="Compact"/>
         <w:numPr>
           <w:ilvl w:val="0"/>
-          <w:numId w:val="1585"/>
+          <w:numId w:val="1588"/>
         </w:numPr>
       </w:pPr>
       <w:r>
@@ -13561,49 +13627,49 @@
     <w:abstractNumId w:val="993"/>
   </w:num>
   <w:num w:numId="1178">
-    <w:abstractNumId w:val="992"/>
+    <w:abstractNumId w:val="993"/>
   </w:num>
   <w:num w:numId="1179">
     <w:abstractNumId w:val="993"/>
   </w:num>
   <w:num w:numId="1180">
+    <w:abstractNumId w:val="993"/>
+  </w:num>
+  <w:num w:numId="1181">
+    <w:abstractNumId w:val="992"/>
+  </w:num>
+  <w:num w:numId="1182">
+    <w:abstractNumId w:val="993"/>
+  </w:num>
+  <w:num w:numId="1183">
     <w:abstractNumId w:val="991"/>
   </w:num>
-  <w:num w:numId="1181">
-    <w:abstractNumId w:val="993"/>
-  </w:num>
-  <w:num w:numId="1182">
+  <w:num w:numId="1184">
+    <w:abstractNumId w:val="993"/>
+  </w:num>
+  <w:num w:numId="1185">
     <w:abstractNumId w:val="991"/>
   </w:num>
-  <w:num w:numId="1183">
-    <w:abstractNumId w:val="993"/>
-  </w:num>
-  <w:num w:numId="1184">
-    <w:abstractNumId w:val="993"/>
-  </w:num>
-  <w:num w:numId="1185">
-    <w:abstractNumId w:val="993"/>
-  </w:num>
   <w:num w:numId="1186">
     <w:abstractNumId w:val="993"/>
   </w:num>
   <w:num w:numId="1187">
-    <w:abstractNumId w:val="992"/>
+    <w:abstractNumId w:val="993"/>
   </w:num>
   <w:num w:numId="1188">
-    <w:abstractNumId w:val="992"/>
+    <w:abstractNumId w:val="993"/>
   </w:num>
   <w:num w:numId="1189">
     <w:abstractNumId w:val="993"/>
   </w:num>
   <w:num w:numId="1190">
-    <w:abstractNumId w:val="992"/>
+    <w:abstractNumId w:val="993"/>
   </w:num>
   <w:num w:numId="1191">
     <w:abstractNumId w:val="993"/>
   </w:num>
   <w:num w:numId="1192">
-    <w:abstractNumId w:val="992"/>
+    <w:abstractNumId w:val="993"/>
   </w:num>
   <w:num w:numId="1193">
     <w:abstractNumId w:val="993"/>
@@ -13615,10 +13681,10 @@
     <w:abstractNumId w:val="993"/>
   </w:num>
   <w:num w:numId="1196">
-    <w:abstractNumId w:val="992"/>
+    <w:abstractNumId w:val="993"/>
   </w:num>
   <w:num w:numId="1197">
-    <w:abstractNumId w:val="992"/>
+    <w:abstractNumId w:val="993"/>
   </w:num>
   <w:num w:numId="1198">
     <w:abstractNumId w:val="993"/>
@@ -13630,37 +13696,37 @@
     <w:abstractNumId w:val="993"/>
   </w:num>
   <w:num w:numId="1201">
-    <w:abstractNumId w:val="992"/>
+    <w:abstractNumId w:val="993"/>
   </w:num>
   <w:num w:numId="1202">
-    <w:abstractNumId w:val="992"/>
+    <w:abstractNumId w:val="993"/>
   </w:num>
   <w:num w:numId="1203">
-    <w:abstractNumId w:val="992"/>
+    <w:abstractNumId w:val="993"/>
   </w:num>
   <w:num w:numId="1204">
     <w:abstractNumId w:val="993"/>
   </w:num>
   <w:num w:numId="1205">
-    <w:abstractNumId w:val="992"/>
+    <w:abstractNumId w:val="993"/>
   </w:num>
   <w:num w:numId="1206">
-    <w:abstractNumId w:val="992"/>
+    <w:abstractNumId w:val="993"/>
   </w:num>
   <w:num w:numId="1207">
-    <w:abstractNumId w:val="992"/>
+    <w:abstractNumId w:val="993"/>
   </w:num>
   <w:num w:numId="1208">
-    <w:abstractNumId w:val="992"/>
+    <w:abstractNumId w:val="993"/>
   </w:num>
   <w:num w:numId="1209">
-    <w:abstractNumId w:val="992"/>
+    <w:abstractNumId w:val="993"/>
   </w:num>
   <w:num w:numId="1210">
-    <w:abstractNumId w:val="992"/>
+    <w:abstractNumId w:val="993"/>
   </w:num>
   <w:num w:numId="1211">
-    <w:abstractNumId w:val="992"/>
+    <w:abstractNumId w:val="993"/>
   </w:num>
   <w:num w:numId="1212">
     <w:abstractNumId w:val="992"/>
@@ -13669,19 +13735,19 @@
     <w:abstractNumId w:val="992"/>
   </w:num>
   <w:num w:numId="1214">
-    <w:abstractNumId w:val="992"/>
+    <w:abstractNumId w:val="993"/>
   </w:num>
   <w:num w:numId="1215">
-    <w:abstractNumId w:val="992"/>
+    <w:abstractNumId w:val="993"/>
   </w:num>
   <w:num w:numId="1216">
-    <w:abstractNumId w:val="992"/>
+    <w:abstractNumId w:val="993"/>
   </w:num>
   <w:num w:numId="1217">
-    <w:abstractNumId w:val="992"/>
+    <w:abstractNumId w:val="993"/>
   </w:num>
   <w:num w:numId="1218">
-    <w:abstractNumId w:val="992"/>
+    <w:abstractNumId w:val="993"/>
   </w:num>
   <w:num w:numId="1219">
     <w:abstractNumId w:val="992"/>
@@ -13693,17 +13759,17 @@
     <w:abstractNumId w:val="992"/>
   </w:num>
   <w:num w:numId="1222">
+    <w:abstractNumId w:val="992"/>
+  </w:num>
+  <w:num w:numId="1223">
+    <w:abstractNumId w:val="992"/>
+  </w:num>
+  <w:num w:numId="1224">
+    <w:abstractNumId w:val="992"/>
+  </w:num>
+  <w:num w:numId="1225">
     <w:abstractNumId w:val="991"/>
   </w:num>
-  <w:num w:numId="1223">
-    <w:abstractNumId w:val="992"/>
-  </w:num>
-  <w:num w:numId="1224">
-    <w:abstractNumId w:val="992"/>
-  </w:num>
-  <w:num w:numId="1225">
-    <w:abstractNumId w:val="992"/>
-  </w:num>
   <w:num w:numId="1226">
     <w:abstractNumId w:val="992"/>
   </w:num>
@@ -13801,13 +13867,13 @@
     <w:abstractNumId w:val="992"/>
   </w:num>
   <w:num w:numId="1258">
-    <w:abstractNumId w:val="993"/>
+    <w:abstractNumId w:val="992"/>
   </w:num>
   <w:num w:numId="1259">
-    <w:abstractNumId w:val="993"/>
+    <w:abstractNumId w:val="992"/>
   </w:num>
   <w:num w:numId="1260">
-    <w:abstractNumId w:val="993"/>
+    <w:abstractNumId w:val="992"/>
   </w:num>
   <w:num w:numId="1261">
     <w:abstractNumId w:val="993"/>
@@ -13825,13 +13891,13 @@
     <w:abstractNumId w:val="993"/>
   </w:num>
   <w:num w:numId="1266">
-    <w:abstractNumId w:val="992"/>
+    <w:abstractNumId w:val="993"/>
   </w:num>
   <w:num w:numId="1267">
-    <w:abstractNumId w:val="992"/>
+    <w:abstractNumId w:val="993"/>
   </w:num>
   <w:num w:numId="1268">
-    <w:abstractNumId w:val="992"/>
+    <w:abstractNumId w:val="993"/>
   </w:num>
   <w:num w:numId="1269">
     <w:abstractNumId w:val="992"/>
@@ -13849,17 +13915,17 @@
     <w:abstractNumId w:val="992"/>
   </w:num>
   <w:num w:numId="1274">
+    <w:abstractNumId w:val="992"/>
+  </w:num>
+  <w:num w:numId="1275">
+    <w:abstractNumId w:val="992"/>
+  </w:num>
+  <w:num w:numId="1276">
+    <w:abstractNumId w:val="992"/>
+  </w:num>
+  <w:num w:numId="1277">
     <w:abstractNumId w:val="991"/>
   </w:num>
-  <w:num w:numId="1275">
-    <w:abstractNumId w:val="992"/>
-  </w:num>
-  <w:num w:numId="1276">
-    <w:abstractNumId w:val="992"/>
-  </w:num>
-  <w:num w:numId="1277">
-    <w:abstractNumId w:val="992"/>
-  </w:num>
   <w:num w:numId="1278">
     <w:abstractNumId w:val="992"/>
   </w:num>
@@ -13915,7 +13981,7 @@
     <w:abstractNumId w:val="992"/>
   </w:num>
   <w:num w:numId="1296">
-    <w:abstractNumId w:val="993"/>
+    <w:abstractNumId w:val="992"/>
   </w:num>
   <w:num w:numId="1297">
     <w:abstractNumId w:val="992"/>
@@ -13924,28 +13990,28 @@
     <w:abstractNumId w:val="992"/>
   </w:num>
   <w:num w:numId="1299">
-    <w:abstractNumId w:val="992"/>
+    <w:abstractNumId w:val="993"/>
   </w:num>
   <w:num w:numId="1300">
     <w:abstractNumId w:val="992"/>
   </w:num>
   <w:num w:numId="1301">
-    <w:abstractNumId w:val="993"/>
+    <w:abstractNumId w:val="992"/>
   </w:num>
   <w:num w:numId="1302">
+    <w:abstractNumId w:val="992"/>
+  </w:num>
+  <w:num w:numId="1303">
+    <w:abstractNumId w:val="992"/>
+  </w:num>
+  <w:num w:numId="1304">
+    <w:abstractNumId w:val="993"/>
+  </w:num>
+  <w:num w:numId="1305">
     <w:abstractNumId w:val="991"/>
   </w:num>
-  <w:num w:numId="1303">
-    <w:abstractNumId w:val="993"/>
-  </w:num>
-  <w:num w:numId="1304">
-    <w:abstractNumId w:val="992"/>
-  </w:num>
-  <w:num w:numId="1305">
-    <w:abstractNumId w:val="992"/>
-  </w:num>
   <w:num w:numId="1306">
-    <w:abstractNumId w:val="992"/>
+    <w:abstractNumId w:val="993"/>
   </w:num>
   <w:num w:numId="1307">
     <w:abstractNumId w:val="992"/>
@@ -13972,19 +14038,19 @@
     <w:abstractNumId w:val="992"/>
   </w:num>
   <w:num w:numId="1315">
-    <w:abstractNumId w:val="993"/>
+    <w:abstractNumId w:val="992"/>
   </w:num>
   <w:num w:numId="1316">
-    <w:abstractNumId w:val="993"/>
+    <w:abstractNumId w:val="992"/>
   </w:num>
   <w:num w:numId="1317">
     <w:abstractNumId w:val="992"/>
   </w:num>
   <w:num w:numId="1318">
-    <w:abstractNumId w:val="992"/>
+    <w:abstractNumId w:val="993"/>
   </w:num>
   <w:num w:numId="1319">
-    <w:abstractNumId w:val="992"/>
+    <w:abstractNumId w:val="993"/>
   </w:num>
   <w:num w:numId="1320">
     <w:abstractNumId w:val="992"/>
@@ -14008,17 +14074,17 @@
     <w:abstractNumId w:val="992"/>
   </w:num>
   <w:num w:numId="1327">
+    <w:abstractNumId w:val="992"/>
+  </w:num>
+  <w:num w:numId="1328">
+    <w:abstractNumId w:val="992"/>
+  </w:num>
+  <w:num w:numId="1329">
+    <w:abstractNumId w:val="992"/>
+  </w:num>
+  <w:num w:numId="1330">
     <w:abstractNumId w:val="991"/>
   </w:num>
-  <w:num w:numId="1328">
-    <w:abstractNumId w:val="992"/>
-  </w:num>
-  <w:num w:numId="1329">
-    <w:abstractNumId w:val="992"/>
-  </w:num>
-  <w:num w:numId="1330">
-    <w:abstractNumId w:val="992"/>
-  </w:num>
   <w:num w:numId="1331">
     <w:abstractNumId w:val="992"/>
   </w:num>
@@ -14056,17 +14122,17 @@
     <w:abstractNumId w:val="992"/>
   </w:num>
   <w:num w:numId="1343">
+    <w:abstractNumId w:val="992"/>
+  </w:num>
+  <w:num w:numId="1344">
+    <w:abstractNumId w:val="992"/>
+  </w:num>
+  <w:num w:numId="1345">
+    <w:abstractNumId w:val="992"/>
+  </w:num>
+  <w:num w:numId="1346">
     <w:abstractNumId w:val="991"/>
   </w:num>
-  <w:num w:numId="1344">
-    <w:abstractNumId w:val="992"/>
-  </w:num>
-  <w:num w:numId="1345">
-    <w:abstractNumId w:val="992"/>
-  </w:num>
-  <w:num w:numId="1346">
-    <w:abstractNumId w:val="992"/>
-  </w:num>
   <w:num w:numId="1347">
     <w:abstractNumId w:val="992"/>
   </w:num>
@@ -14224,17 +14290,17 @@
     <w:abstractNumId w:val="992"/>
   </w:num>
   <w:num w:numId="1399">
+    <w:abstractNumId w:val="992"/>
+  </w:num>
+  <w:num w:numId="1400">
+    <w:abstractNumId w:val="992"/>
+  </w:num>
+  <w:num w:numId="1401">
+    <w:abstractNumId w:val="992"/>
+  </w:num>
+  <w:num w:numId="1402">
     <w:abstractNumId w:val="991"/>
   </w:num>
-  <w:num w:numId="1400">
-    <w:abstractNumId w:val="992"/>
-  </w:num>
-  <w:num w:numId="1401">
-    <w:abstractNumId w:val="992"/>
-  </w:num>
-  <w:num w:numId="1402">
-    <w:abstractNumId w:val="992"/>
-  </w:num>
   <w:num w:numId="1403">
     <w:abstractNumId w:val="992"/>
   </w:num>
@@ -14269,29 +14335,29 @@
     <w:abstractNumId w:val="992"/>
   </w:num>
   <w:num w:numId="1414">
+    <w:abstractNumId w:val="992"/>
+  </w:num>
+  <w:num w:numId="1415">
+    <w:abstractNumId w:val="992"/>
+  </w:num>
+  <w:num w:numId="1416">
+    <w:abstractNumId w:val="992"/>
+  </w:num>
+  <w:num w:numId="1417">
     <w:abstractNumId w:val="991"/>
   </w:num>
-  <w:num w:numId="1415">
-    <w:abstractNumId w:val="992"/>
-  </w:num>
-  <w:num w:numId="1416">
-    <w:abstractNumId w:val="992"/>
-  </w:num>
-  <w:num w:numId="1417">
-    <w:abstractNumId w:val="992"/>
-  </w:num>
   <w:num w:numId="1418">
+    <w:abstractNumId w:val="992"/>
+  </w:num>
+  <w:num w:numId="1419">
+    <w:abstractNumId w:val="992"/>
+  </w:num>
+  <w:num w:numId="1420">
+    <w:abstractNumId w:val="992"/>
+  </w:num>
+  <w:num w:numId="1421">
     <w:abstractNumId w:val="991"/>
   </w:num>
-  <w:num w:numId="1419">
-    <w:abstractNumId w:val="992"/>
-  </w:num>
-  <w:num w:numId="1420">
-    <w:abstractNumId w:val="992"/>
-  </w:num>
-  <w:num w:numId="1421">
-    <w:abstractNumId w:val="992"/>
-  </w:num>
   <w:num w:numId="1422">
     <w:abstractNumId w:val="992"/>
   </w:num>
@@ -14299,23 +14365,23 @@
     <w:abstractNumId w:val="992"/>
   </w:num>
   <w:num w:numId="1424">
+    <w:abstractNumId w:val="992"/>
+  </w:num>
+  <w:num w:numId="1425">
+    <w:abstractNumId w:val="992"/>
+  </w:num>
+  <w:num w:numId="1426">
+    <w:abstractNumId w:val="992"/>
+  </w:num>
+  <w:num w:numId="1427">
     <w:abstractNumId w:val="991"/>
   </w:num>
-  <w:num w:numId="1425">
-    <w:abstractNumId w:val="992"/>
-  </w:num>
-  <w:num w:numId="1426">
+  <w:num w:numId="1428">
+    <w:abstractNumId w:val="992"/>
+  </w:num>
+  <w:num w:numId="1429">
     <w:abstractNumId w:val="991"/>
   </w:num>
-  <w:num w:numId="1427">
-    <w:abstractNumId w:val="992"/>
-  </w:num>
-  <w:num w:numId="1428">
-    <w:abstractNumId w:val="992"/>
-  </w:num>
-  <w:num w:numId="1429">
-    <w:abstractNumId w:val="992"/>
-  </w:num>
   <w:num w:numId="1430">
     <w:abstractNumId w:val="992"/>
   </w:num>
@@ -14335,17 +14401,17 @@
     <w:abstractNumId w:val="992"/>
   </w:num>
   <w:num w:numId="1436">
+    <w:abstractNumId w:val="992"/>
+  </w:num>
+  <w:num w:numId="1437">
+    <w:abstractNumId w:val="992"/>
+  </w:num>
+  <w:num w:numId="1438">
+    <w:abstractNumId w:val="992"/>
+  </w:num>
+  <w:num w:numId="1439">
     <w:abstractNumId w:val="991"/>
   </w:num>
-  <w:num w:numId="1437">
-    <w:abstractNumId w:val="992"/>
-  </w:num>
-  <w:num w:numId="1438">
-    <w:abstractNumId w:val="992"/>
-  </w:num>
-  <w:num w:numId="1439">
-    <w:abstractNumId w:val="992"/>
-  </w:num>
   <w:num w:numId="1440">
     <w:abstractNumId w:val="992"/>
   </w:num>
@@ -14401,17 +14467,17 @@
     <w:abstractNumId w:val="992"/>
   </w:num>
   <w:num w:numId="1458">
+    <w:abstractNumId w:val="992"/>
+  </w:num>
+  <w:num w:numId="1459">
+    <w:abstractNumId w:val="992"/>
+  </w:num>
+  <w:num w:numId="1460">
+    <w:abstractNumId w:val="992"/>
+  </w:num>
+  <w:num w:numId="1461">
     <w:abstractNumId w:val="991"/>
   </w:num>
-  <w:num w:numId="1459">
-    <w:abstractNumId w:val="992"/>
-  </w:num>
-  <w:num w:numId="1460">
-    <w:abstractNumId w:val="992"/>
-  </w:num>
-  <w:num w:numId="1461">
-    <w:abstractNumId w:val="992"/>
-  </w:num>
   <w:num w:numId="1462">
     <w:abstractNumId w:val="992"/>
   </w:num>
@@ -14467,7 +14533,7 @@
     <w:abstractNumId w:val="992"/>
   </w:num>
   <w:num w:numId="1480">
-    <w:abstractNumId w:val="991"/>
+    <w:abstractNumId w:val="992"/>
   </w:num>
   <w:num w:numId="1481">
     <w:abstractNumId w:val="992"/>
@@ -14485,7 +14551,7 @@
     <w:abstractNumId w:val="992"/>
   </w:num>
   <w:num w:numId="1486">
-    <w:abstractNumId w:val="992"/>
+    <w:abstractNumId w:val="991"/>
   </w:num>
   <w:num w:numId="1487">
     <w:abstractNumId w:val="992"/>
@@ -14509,23 +14575,23 @@
     <w:abstractNumId w:val="992"/>
   </w:num>
   <w:num w:numId="1494">
+    <w:abstractNumId w:val="992"/>
+  </w:num>
+  <w:num w:numId="1495">
+    <w:abstractNumId w:val="992"/>
+  </w:num>
+  <w:num w:numId="1496">
+    <w:abstractNumId w:val="992"/>
+  </w:num>
+  <w:num w:numId="1497">
     <w:abstractNumId w:val="991"/>
   </w:num>
-  <w:num w:numId="1495">
-    <w:abstractNumId w:val="992"/>
-  </w:num>
-  <w:num w:numId="1496">
+  <w:num w:numId="1498">
+    <w:abstractNumId w:val="992"/>
+  </w:num>
+  <w:num w:numId="1499">
     <w:abstractNumId w:val="991"/>
   </w:num>
-  <w:num w:numId="1497">
-    <w:abstractNumId w:val="992"/>
-  </w:num>
-  <w:num w:numId="1498">
-    <w:abstractNumId w:val="992"/>
-  </w:num>
-  <w:num w:numId="1499">
-    <w:abstractNumId w:val="992"/>
-  </w:num>
   <w:num w:numId="1500">
     <w:abstractNumId w:val="992"/>
   </w:num>
@@ -14782,6 +14848,15 @@
     <w:abstractNumId w:val="992"/>
   </w:num>
   <w:num w:numId="1585">
+    <w:abstractNumId w:val="992"/>
+  </w:num>
+  <w:num w:numId="1586">
+    <w:abstractNumId w:val="992"/>
+  </w:num>
+  <w:num w:numId="1587">
+    <w:abstractNumId w:val="992"/>
+  </w:num>
+  <w:num w:numId="1588">
     <w:abstractNumId w:val="992"/>
   </w:num>
 </w:numbering>

</xml_diff>

<commit_message>
Mark pipeline base parity complete
</commit_message>
<xml_diff>
--- a/MASTER_M1_M2_DELIVERY_CHECKLIST.docx
+++ b/MASTER_M1_M2_DELIVERY_CHECKLIST.docx
@@ -265,7 +265,7 @@
               <w:jc w:val="right"/>
             </w:pPr>
             <w:r>
-              <w:t xml:space="preserve">10%</w:t>
+              <w:t xml:space="preserve">12%</w:t>
             </w:r>
           </w:p>
         </w:tc>
@@ -276,7 +276,7 @@
               <w:pStyle w:val="Compact"/>
             </w:pPr>
             <w:r>
-              <w:t xml:space="preserve">Stage/visual/scope/metrics/search parity verified; drag/drop live gate pending</w:t>
+              <w:t xml:space="preserve">Done — stage/visual/scope/metrics/search/drag-drop gates verified</w:t>
             </w:r>
           </w:p>
         </w:tc>
@@ -709,7 +709,7 @@
                 <w:b/>
                 <w:bCs/>
               </w:rPr>
-              <w:t xml:space="preserve">26%</w:t>
+              <w:t xml:space="preserve">28%</w:t>
             </w:r>
           </w:p>
         </w:tc>
@@ -724,7 +724,7 @@
                 <w:b/>
                 <w:bCs/>
               </w:rPr>
-              <w:t xml:space="preserve">M1.1 auth, M1.2 stage/scope/search parity, and M1.4 B.6 stacking chip update added</w:t>
+              <w:t xml:space="preserve">M1.1 auth, M1.2 base parity, and M1.4 B.6 stacking chip update added</w:t>
             </w:r>
           </w:p>
         </w:tc>
@@ -4820,6 +4820,42 @@
         </w:numPr>
       </w:pPr>
       <w:r>
+        <w:t xml:space="preserve">Screenshot comparison completed for Simple and Execution modes:</w:t>
+      </w:r>
+      <w:r>
+        <w:t xml:space="preserve"> </w:t>
+      </w:r>
+      <w:r>
+        <w:rPr>
+          <w:rStyle w:val="VerbatimChar"/>
+        </w:rPr>
+        <w:t xml:space="preserve">audit-screenshots/m1-2-pipeline-simple.png</w:t>
+      </w:r>
+      <w:r>
+        <w:t xml:space="preserve">,</w:t>
+      </w:r>
+      <w:r>
+        <w:t xml:space="preserve"> </w:t>
+      </w:r>
+      <w:r>
+        <w:rPr>
+          <w:rStyle w:val="VerbatimChar"/>
+        </w:rPr>
+        <w:t xml:space="preserve">audit-screenshots/m1-2-pipeline-execution.png</w:t>
+      </w:r>
+      <w:r>
+        <w:t xml:space="preserve">.</w:t>
+      </w:r>
+    </w:p>
+    <w:p>
+      <w:pPr>
+        <w:pStyle w:val="Compact"/>
+        <w:numPr>
+          <w:ilvl w:val="0"/>
+          <w:numId w:val="1180"/>
+        </w:numPr>
+      </w:pPr>
+      <w:r>
         <w:t xml:space="preserve">Controller-level negative tests passed: REP</w:t>
       </w:r>
       <w:r>
@@ -4858,7 +4894,7 @@
         <w:pStyle w:val="Compact"/>
         <w:numPr>
           <w:ilvl w:val="0"/>
-          <w:numId w:val="1180"/>
+          <w:numId w:val="1181"/>
         </w:numPr>
       </w:pPr>
       <w:r>
@@ -4897,7 +4933,7 @@
         <w:pStyle w:val="Compact"/>
         <w:numPr>
           <w:ilvl w:val="0"/>
-          <w:numId w:val="1181"/>
+          <w:numId w:val="1182"/>
         </w:numPr>
       </w:pPr>
       <w:r>
@@ -4931,7 +4967,7 @@
         <w:t xml:space="preserve"> </w:t>
       </w:r>
       <w:r>
-        <w:t xml:space="preserve">lead-board path still needs separate decision because current v2 route uses</w:t>
+        <w:t xml:space="preserve">lead-board path left unchanged by decision: current M1.2 v2 route uses</w:t>
       </w:r>
       <w:r>
         <w:t xml:space="preserve"> </w:t>
@@ -4943,7 +4979,7 @@
         <w:t xml:space="preserve">/api/deals/board</w:t>
       </w:r>
       <w:r>
-        <w:t xml:space="preserve">.</w:t>
+        <w:t xml:space="preserve">; legacy data cleanup is separate scope.</w:t>
       </w:r>
     </w:p>
     <w:bookmarkEnd w:id="30"/>
@@ -4961,7 +4997,7 @@
         <w:pStyle w:val="Compact"/>
         <w:numPr>
           <w:ilvl w:val="0"/>
-          <w:numId w:val="1182"/>
+          <w:numId w:val="1183"/>
         </w:numPr>
       </w:pPr>
       <w:r>
@@ -4973,7 +5009,7 @@
         <w:pStyle w:val="Compact"/>
         <w:numPr>
           <w:ilvl w:val="1"/>
-          <w:numId w:val="1183"/>
+          <w:numId w:val="1184"/>
         </w:numPr>
       </w:pPr>
       <w:r>
@@ -4985,7 +5021,7 @@
         <w:pStyle w:val="Compact"/>
         <w:numPr>
           <w:ilvl w:val="1"/>
-          <w:numId w:val="1183"/>
+          <w:numId w:val="1184"/>
         </w:numPr>
       </w:pPr>
       <w:r>
@@ -4997,7 +5033,7 @@
         <w:pStyle w:val="Compact"/>
         <w:numPr>
           <w:ilvl w:val="1"/>
-          <w:numId w:val="1183"/>
+          <w:numId w:val="1184"/>
         </w:numPr>
       </w:pPr>
       <w:r>
@@ -5009,7 +5045,7 @@
         <w:pStyle w:val="Compact"/>
         <w:numPr>
           <w:ilvl w:val="1"/>
-          <w:numId w:val="1183"/>
+          <w:numId w:val="1184"/>
         </w:numPr>
       </w:pPr>
       <w:r>
@@ -5021,7 +5057,7 @@
         <w:pStyle w:val="Compact"/>
         <w:numPr>
           <w:ilvl w:val="1"/>
-          <w:numId w:val="1183"/>
+          <w:numId w:val="1184"/>
         </w:numPr>
       </w:pPr>
       <w:r>
@@ -5033,7 +5069,7 @@
         <w:pStyle w:val="Compact"/>
         <w:numPr>
           <w:ilvl w:val="1"/>
-          <w:numId w:val="1183"/>
+          <w:numId w:val="1184"/>
         </w:numPr>
       </w:pPr>
       <w:r>
@@ -5045,7 +5081,7 @@
         <w:pStyle w:val="Compact"/>
         <w:numPr>
           <w:ilvl w:val="1"/>
-          <w:numId w:val="1183"/>
+          <w:numId w:val="1184"/>
         </w:numPr>
       </w:pPr>
       <w:r>
@@ -5057,7 +5093,7 @@
         <w:pStyle w:val="Compact"/>
         <w:numPr>
           <w:ilvl w:val="1"/>
-          <w:numId w:val="1183"/>
+          <w:numId w:val="1184"/>
         </w:numPr>
       </w:pPr>
       <w:r>
@@ -5069,7 +5105,7 @@
         <w:pStyle w:val="Compact"/>
         <w:numPr>
           <w:ilvl w:val="1"/>
-          <w:numId w:val="1183"/>
+          <w:numId w:val="1184"/>
         </w:numPr>
       </w:pPr>
       <w:r>
@@ -5081,7 +5117,7 @@
         <w:pStyle w:val="Compact"/>
         <w:numPr>
           <w:ilvl w:val="0"/>
-          <w:numId w:val="1184"/>
+          <w:numId w:val="1185"/>
         </w:numPr>
       </w:pPr>
       <w:r>
@@ -5093,7 +5129,7 @@
         <w:pStyle w:val="Compact"/>
         <w:numPr>
           <w:ilvl w:val="1"/>
-          <w:numId w:val="1185"/>
+          <w:numId w:val="1186"/>
         </w:numPr>
       </w:pPr>
       <w:r>
@@ -5138,7 +5174,7 @@
         <w:pStyle w:val="Compact"/>
         <w:numPr>
           <w:ilvl w:val="1"/>
-          <w:numId w:val="1185"/>
+          <w:numId w:val="1186"/>
         </w:numPr>
       </w:pPr>
       <w:r>
@@ -5183,7 +5219,7 @@
         <w:pStyle w:val="Compact"/>
         <w:numPr>
           <w:ilvl w:val="1"/>
-          <w:numId w:val="1185"/>
+          <w:numId w:val="1186"/>
         </w:numPr>
       </w:pPr>
       <w:r>
@@ -5228,7 +5264,7 @@
         <w:pStyle w:val="Compact"/>
         <w:numPr>
           <w:ilvl w:val="0"/>
-          <w:numId w:val="1186"/>
+          <w:numId w:val="1187"/>
         </w:numPr>
       </w:pPr>
       <w:r>
@@ -5252,7 +5288,7 @@
         <w:pStyle w:val="Compact"/>
         <w:numPr>
           <w:ilvl w:val="0"/>
-          <w:numId w:val="1187"/>
+          <w:numId w:val="1188"/>
         </w:numPr>
       </w:pPr>
       <w:r>
@@ -5264,7 +5300,7 @@
         <w:pStyle w:val="Compact"/>
         <w:numPr>
           <w:ilvl w:val="0"/>
-          <w:numId w:val="1188"/>
+          <w:numId w:val="1189"/>
         </w:numPr>
       </w:pPr>
       <w:r>
@@ -5306,7 +5342,7 @@
         <w:pStyle w:val="Compact"/>
         <w:numPr>
           <w:ilvl w:val="0"/>
-          <w:numId w:val="1189"/>
+          <w:numId w:val="1190"/>
         </w:numPr>
       </w:pPr>
       <w:r>
@@ -5333,7 +5369,7 @@
         <w:pStyle w:val="Compact"/>
         <w:numPr>
           <w:ilvl w:val="0"/>
-          <w:numId w:val="1190"/>
+          <w:numId w:val="1191"/>
         </w:numPr>
       </w:pPr>
       <w:r>
@@ -5345,7 +5381,7 @@
         <w:pStyle w:val="Compact"/>
         <w:numPr>
           <w:ilvl w:val="0"/>
-          <w:numId w:val="1191"/>
+          <w:numId w:val="1192"/>
         </w:numPr>
       </w:pPr>
       <w:r>
@@ -5357,7 +5393,7 @@
         <w:pStyle w:val="Compact"/>
         <w:numPr>
           <w:ilvl w:val="0"/>
-          <w:numId w:val="1192"/>
+          <w:numId w:val="1193"/>
         </w:numPr>
       </w:pPr>
       <w:r>
@@ -5369,7 +5405,7 @@
         <w:pStyle w:val="Compact"/>
         <w:numPr>
           <w:ilvl w:val="0"/>
-          <w:numId w:val="1193"/>
+          <w:numId w:val="1194"/>
         </w:numPr>
       </w:pPr>
       <w:r>
@@ -5381,7 +5417,7 @@
         <w:pStyle w:val="Compact"/>
         <w:numPr>
           <w:ilvl w:val="0"/>
-          <w:numId w:val="1194"/>
+          <w:numId w:val="1195"/>
         </w:numPr>
       </w:pPr>
       <w:r>
@@ -5393,7 +5429,7 @@
         <w:pStyle w:val="Compact"/>
         <w:numPr>
           <w:ilvl w:val="0"/>
-          <w:numId w:val="1195"/>
+          <w:numId w:val="1196"/>
         </w:numPr>
       </w:pPr>
       <w:r>
@@ -5415,7 +5451,7 @@
         <w:pStyle w:val="Compact"/>
         <w:numPr>
           <w:ilvl w:val="0"/>
-          <w:numId w:val="1196"/>
+          <w:numId w:val="1197"/>
         </w:numPr>
       </w:pPr>
       <w:r>
@@ -5427,7 +5463,7 @@
         <w:pStyle w:val="Compact"/>
         <w:numPr>
           <w:ilvl w:val="0"/>
-          <w:numId w:val="1197"/>
+          <w:numId w:val="1198"/>
         </w:numPr>
       </w:pPr>
       <w:r>
@@ -5439,7 +5475,7 @@
         <w:pStyle w:val="Compact"/>
         <w:numPr>
           <w:ilvl w:val="0"/>
-          <w:numId w:val="1198"/>
+          <w:numId w:val="1199"/>
         </w:numPr>
       </w:pPr>
       <w:r>
@@ -5451,7 +5487,7 @@
         <w:pStyle w:val="Compact"/>
         <w:numPr>
           <w:ilvl w:val="0"/>
-          <w:numId w:val="1199"/>
+          <w:numId w:val="1200"/>
         </w:numPr>
       </w:pPr>
       <w:r>
@@ -5463,7 +5499,7 @@
         <w:pStyle w:val="Compact"/>
         <w:numPr>
           <w:ilvl w:val="0"/>
-          <w:numId w:val="1200"/>
+          <w:numId w:val="1201"/>
         </w:numPr>
       </w:pPr>
       <w:r>
@@ -5475,7 +5511,7 @@
         <w:pStyle w:val="Compact"/>
         <w:numPr>
           <w:ilvl w:val="0"/>
-          <w:numId w:val="1201"/>
+          <w:numId w:val="1202"/>
         </w:numPr>
       </w:pPr>
       <w:r>
@@ -5512,7 +5548,7 @@
         <w:pStyle w:val="Compact"/>
         <w:numPr>
           <w:ilvl w:val="0"/>
-          <w:numId w:val="1202"/>
+          <w:numId w:val="1203"/>
         </w:numPr>
       </w:pPr>
       <w:r>
@@ -5524,7 +5560,7 @@
         <w:pStyle w:val="Compact"/>
         <w:numPr>
           <w:ilvl w:val="0"/>
-          <w:numId w:val="1203"/>
+          <w:numId w:val="1204"/>
         </w:numPr>
       </w:pPr>
       <w:r>
@@ -5536,7 +5572,7 @@
         <w:pStyle w:val="Compact"/>
         <w:numPr>
           <w:ilvl w:val="0"/>
-          <w:numId w:val="1204"/>
+          <w:numId w:val="1205"/>
         </w:numPr>
       </w:pPr>
       <w:r>
@@ -5563,7 +5599,7 @@
         <w:pStyle w:val="Compact"/>
         <w:numPr>
           <w:ilvl w:val="0"/>
-          <w:numId w:val="1205"/>
+          <w:numId w:val="1206"/>
         </w:numPr>
       </w:pPr>
       <w:r>
@@ -5575,7 +5611,7 @@
         <w:pStyle w:val="Compact"/>
         <w:numPr>
           <w:ilvl w:val="0"/>
-          <w:numId w:val="1206"/>
+          <w:numId w:val="1207"/>
         </w:numPr>
       </w:pPr>
       <w:r>
@@ -5587,7 +5623,7 @@
         <w:pStyle w:val="Compact"/>
         <w:numPr>
           <w:ilvl w:val="0"/>
-          <w:numId w:val="1207"/>
+          <w:numId w:val="1208"/>
         </w:numPr>
       </w:pPr>
       <w:r>
@@ -5609,7 +5645,7 @@
         <w:pStyle w:val="Compact"/>
         <w:numPr>
           <w:ilvl w:val="0"/>
-          <w:numId w:val="1208"/>
+          <w:numId w:val="1209"/>
         </w:numPr>
       </w:pPr>
       <w:r>
@@ -5621,7 +5657,7 @@
         <w:pStyle w:val="Compact"/>
         <w:numPr>
           <w:ilvl w:val="0"/>
-          <w:numId w:val="1209"/>
+          <w:numId w:val="1210"/>
         </w:numPr>
       </w:pPr>
       <w:r>
@@ -5633,7 +5669,7 @@
         <w:pStyle w:val="Compact"/>
         <w:numPr>
           <w:ilvl w:val="0"/>
-          <w:numId w:val="1210"/>
+          <w:numId w:val="1211"/>
         </w:numPr>
       </w:pPr>
       <w:r>
@@ -5645,7 +5681,7 @@
         <w:pStyle w:val="Compact"/>
         <w:numPr>
           <w:ilvl w:val="0"/>
-          <w:numId w:val="1211"/>
+          <w:numId w:val="1212"/>
         </w:numPr>
       </w:pPr>
       <w:r>
@@ -5657,7 +5693,7 @@
         <w:pStyle w:val="Compact"/>
         <w:numPr>
           <w:ilvl w:val="0"/>
-          <w:numId w:val="1212"/>
+          <w:numId w:val="1213"/>
         </w:numPr>
       </w:pPr>
       <w:r>
@@ -5669,7 +5705,7 @@
         <w:pStyle w:val="Compact"/>
         <w:numPr>
           <w:ilvl w:val="0"/>
-          <w:numId w:val="1213"/>
+          <w:numId w:val="1214"/>
         </w:numPr>
       </w:pPr>
       <w:r>
@@ -5681,7 +5717,7 @@
         <w:pStyle w:val="Compact"/>
         <w:numPr>
           <w:ilvl w:val="0"/>
-          <w:numId w:val="1214"/>
+          <w:numId w:val="1215"/>
         </w:numPr>
       </w:pPr>
       <w:r>
@@ -5693,7 +5729,7 @@
         <w:pStyle w:val="Compact"/>
         <w:numPr>
           <w:ilvl w:val="0"/>
-          <w:numId w:val="1215"/>
+          <w:numId w:val="1216"/>
         </w:numPr>
       </w:pPr>
       <w:r>
@@ -5705,7 +5741,7 @@
         <w:pStyle w:val="Compact"/>
         <w:numPr>
           <w:ilvl w:val="0"/>
-          <w:numId w:val="1216"/>
+          <w:numId w:val="1217"/>
         </w:numPr>
       </w:pPr>
       <w:r>
@@ -5717,7 +5753,7 @@
         <w:pStyle w:val="Compact"/>
         <w:numPr>
           <w:ilvl w:val="0"/>
-          <w:numId w:val="1217"/>
+          <w:numId w:val="1218"/>
         </w:numPr>
       </w:pPr>
       <w:r>
@@ -5729,7 +5765,7 @@
         <w:pStyle w:val="Compact"/>
         <w:numPr>
           <w:ilvl w:val="0"/>
-          <w:numId w:val="1218"/>
+          <w:numId w:val="1219"/>
         </w:numPr>
       </w:pPr>
       <w:r>
@@ -5761,7 +5797,7 @@
         <w:pStyle w:val="Compact"/>
         <w:numPr>
           <w:ilvl w:val="0"/>
-          <w:numId w:val="1219"/>
+          <w:numId w:val="1220"/>
         </w:numPr>
       </w:pPr>
       <w:r>
@@ -5773,7 +5809,7 @@
         <w:pStyle w:val="Compact"/>
         <w:numPr>
           <w:ilvl w:val="0"/>
-          <w:numId w:val="1220"/>
+          <w:numId w:val="1221"/>
         </w:numPr>
       </w:pPr>
       <w:r>
@@ -5785,7 +5821,7 @@
         <w:pStyle w:val="Compact"/>
         <w:numPr>
           <w:ilvl w:val="0"/>
-          <w:numId w:val="1221"/>
+          <w:numId w:val="1222"/>
         </w:numPr>
       </w:pPr>
       <w:r>
@@ -5797,7 +5833,7 @@
         <w:pStyle w:val="Compact"/>
         <w:numPr>
           <w:ilvl w:val="0"/>
-          <w:numId w:val="1222"/>
+          <w:numId w:val="1223"/>
         </w:numPr>
       </w:pPr>
       <w:r>
@@ -5824,7 +5860,7 @@
         <w:pStyle w:val="Compact"/>
         <w:numPr>
           <w:ilvl w:val="0"/>
-          <w:numId w:val="1223"/>
+          <w:numId w:val="1224"/>
         </w:numPr>
       </w:pPr>
       <w:r>
@@ -5836,7 +5872,7 @@
         <w:pStyle w:val="Compact"/>
         <w:numPr>
           <w:ilvl w:val="0"/>
-          <w:numId w:val="1224"/>
+          <w:numId w:val="1225"/>
         </w:numPr>
       </w:pPr>
       <w:r>
@@ -5848,7 +5884,7 @@
         <w:pStyle w:val="Compact"/>
         <w:numPr>
           <w:ilvl w:val="1"/>
-          <w:numId w:val="1225"/>
+          <w:numId w:val="1226"/>
         </w:numPr>
       </w:pPr>
       <w:r>
@@ -5860,7 +5896,7 @@
         <w:pStyle w:val="Compact"/>
         <w:numPr>
           <w:ilvl w:val="1"/>
-          <w:numId w:val="1225"/>
+          <w:numId w:val="1226"/>
         </w:numPr>
       </w:pPr>
       <w:r>
@@ -5884,7 +5920,7 @@
         <w:pStyle w:val="Compact"/>
         <w:numPr>
           <w:ilvl w:val="0"/>
-          <w:numId w:val="1226"/>
+          <w:numId w:val="1227"/>
         </w:numPr>
       </w:pPr>
       <w:r>
@@ -5896,7 +5932,7 @@
         <w:pStyle w:val="Compact"/>
         <w:numPr>
           <w:ilvl w:val="0"/>
-          <w:numId w:val="1227"/>
+          <w:numId w:val="1228"/>
         </w:numPr>
       </w:pPr>
       <w:r>
@@ -5908,7 +5944,7 @@
         <w:pStyle w:val="Compact"/>
         <w:numPr>
           <w:ilvl w:val="0"/>
-          <w:numId w:val="1228"/>
+          <w:numId w:val="1229"/>
         </w:numPr>
       </w:pPr>
       <w:r>
@@ -5920,7 +5956,7 @@
         <w:pStyle w:val="Compact"/>
         <w:numPr>
           <w:ilvl w:val="0"/>
-          <w:numId w:val="1229"/>
+          <w:numId w:val="1230"/>
         </w:numPr>
       </w:pPr>
       <w:r>
@@ -5932,7 +5968,7 @@
         <w:pStyle w:val="Compact"/>
         <w:numPr>
           <w:ilvl w:val="0"/>
-          <w:numId w:val="1230"/>
+          <w:numId w:val="1231"/>
         </w:numPr>
       </w:pPr>
       <w:r>
@@ -5944,7 +5980,7 @@
         <w:pStyle w:val="Compact"/>
         <w:numPr>
           <w:ilvl w:val="0"/>
-          <w:numId w:val="1231"/>
+          <w:numId w:val="1232"/>
         </w:numPr>
       </w:pPr>
       <w:r>
@@ -5966,7 +6002,7 @@
         <w:pStyle w:val="Compact"/>
         <w:numPr>
           <w:ilvl w:val="0"/>
-          <w:numId w:val="1232"/>
+          <w:numId w:val="1233"/>
         </w:numPr>
       </w:pPr>
       <w:r>
@@ -5978,7 +6014,7 @@
         <w:pStyle w:val="Compact"/>
         <w:numPr>
           <w:ilvl w:val="0"/>
-          <w:numId w:val="1233"/>
+          <w:numId w:val="1234"/>
         </w:numPr>
       </w:pPr>
       <w:r>
@@ -5990,7 +6026,7 @@
         <w:pStyle w:val="Compact"/>
         <w:numPr>
           <w:ilvl w:val="0"/>
-          <w:numId w:val="1234"/>
+          <w:numId w:val="1235"/>
         </w:numPr>
       </w:pPr>
       <w:r>
@@ -6002,7 +6038,7 @@
         <w:pStyle w:val="Compact"/>
         <w:numPr>
           <w:ilvl w:val="0"/>
-          <w:numId w:val="1235"/>
+          <w:numId w:val="1236"/>
         </w:numPr>
       </w:pPr>
       <w:r>
@@ -6014,7 +6050,7 @@
         <w:pStyle w:val="Compact"/>
         <w:numPr>
           <w:ilvl w:val="0"/>
-          <w:numId w:val="1236"/>
+          <w:numId w:val="1237"/>
         </w:numPr>
       </w:pPr>
       <w:r>
@@ -6026,7 +6062,7 @@
         <w:pStyle w:val="Compact"/>
         <w:numPr>
           <w:ilvl w:val="0"/>
-          <w:numId w:val="1237"/>
+          <w:numId w:val="1238"/>
         </w:numPr>
       </w:pPr>
       <w:r>
@@ -6038,7 +6074,7 @@
         <w:pStyle w:val="Compact"/>
         <w:numPr>
           <w:ilvl w:val="0"/>
-          <w:numId w:val="1238"/>
+          <w:numId w:val="1239"/>
         </w:numPr>
       </w:pPr>
       <w:r>
@@ -6050,7 +6086,7 @@
         <w:pStyle w:val="Compact"/>
         <w:numPr>
           <w:ilvl w:val="0"/>
-          <w:numId w:val="1239"/>
+          <w:numId w:val="1240"/>
         </w:numPr>
       </w:pPr>
       <w:r>
@@ -6062,7 +6098,7 @@
         <w:pStyle w:val="Compact"/>
         <w:numPr>
           <w:ilvl w:val="0"/>
-          <w:numId w:val="1240"/>
+          <w:numId w:val="1241"/>
         </w:numPr>
       </w:pPr>
       <w:r>
@@ -6074,7 +6110,7 @@
         <w:pStyle w:val="Compact"/>
         <w:numPr>
           <w:ilvl w:val="0"/>
-          <w:numId w:val="1241"/>
+          <w:numId w:val="1242"/>
         </w:numPr>
       </w:pPr>
       <w:r>
@@ -6086,7 +6122,7 @@
         <w:pStyle w:val="Compact"/>
         <w:numPr>
           <w:ilvl w:val="0"/>
-          <w:numId w:val="1242"/>
+          <w:numId w:val="1243"/>
         </w:numPr>
       </w:pPr>
       <w:r>
@@ -6108,7 +6144,7 @@
         <w:pStyle w:val="Compact"/>
         <w:numPr>
           <w:ilvl w:val="0"/>
-          <w:numId w:val="1243"/>
+          <w:numId w:val="1244"/>
         </w:numPr>
       </w:pPr>
       <w:r>
@@ -6120,7 +6156,7 @@
         <w:pStyle w:val="Compact"/>
         <w:numPr>
           <w:ilvl w:val="0"/>
-          <w:numId w:val="1244"/>
+          <w:numId w:val="1245"/>
         </w:numPr>
       </w:pPr>
       <w:r>
@@ -6132,7 +6168,7 @@
         <w:pStyle w:val="Compact"/>
         <w:numPr>
           <w:ilvl w:val="0"/>
-          <w:numId w:val="1245"/>
+          <w:numId w:val="1246"/>
         </w:numPr>
       </w:pPr>
       <w:r>
@@ -6144,7 +6180,7 @@
         <w:pStyle w:val="Compact"/>
         <w:numPr>
           <w:ilvl w:val="0"/>
-          <w:numId w:val="1246"/>
+          <w:numId w:val="1247"/>
         </w:numPr>
       </w:pPr>
       <w:r>
@@ -6156,7 +6192,7 @@
         <w:pStyle w:val="Compact"/>
         <w:numPr>
           <w:ilvl w:val="0"/>
-          <w:numId w:val="1247"/>
+          <w:numId w:val="1248"/>
         </w:numPr>
       </w:pPr>
       <w:r>
@@ -6168,7 +6204,7 @@
         <w:pStyle w:val="Compact"/>
         <w:numPr>
           <w:ilvl w:val="0"/>
-          <w:numId w:val="1248"/>
+          <w:numId w:val="1249"/>
         </w:numPr>
       </w:pPr>
       <w:r>
@@ -6180,7 +6216,7 @@
         <w:pStyle w:val="Compact"/>
         <w:numPr>
           <w:ilvl w:val="0"/>
-          <w:numId w:val="1249"/>
+          <w:numId w:val="1250"/>
         </w:numPr>
       </w:pPr>
       <w:r>
@@ -6192,7 +6228,7 @@
         <w:pStyle w:val="Compact"/>
         <w:numPr>
           <w:ilvl w:val="0"/>
-          <w:numId w:val="1250"/>
+          <w:numId w:val="1251"/>
         </w:numPr>
       </w:pPr>
       <w:r>
@@ -6204,7 +6240,7 @@
         <w:pStyle w:val="Compact"/>
         <w:numPr>
           <w:ilvl w:val="0"/>
-          <w:numId w:val="1251"/>
+          <w:numId w:val="1252"/>
         </w:numPr>
       </w:pPr>
       <w:r>
@@ -6238,7 +6274,7 @@
         <w:pStyle w:val="Compact"/>
         <w:numPr>
           <w:ilvl w:val="0"/>
-          <w:numId w:val="1252"/>
+          <w:numId w:val="1253"/>
         </w:numPr>
       </w:pPr>
       <w:r>
@@ -6250,7 +6286,7 @@
         <w:pStyle w:val="Compact"/>
         <w:numPr>
           <w:ilvl w:val="0"/>
-          <w:numId w:val="1253"/>
+          <w:numId w:val="1254"/>
         </w:numPr>
       </w:pPr>
       <w:r>
@@ -6262,7 +6298,7 @@
         <w:pStyle w:val="Compact"/>
         <w:numPr>
           <w:ilvl w:val="0"/>
-          <w:numId w:val="1254"/>
+          <w:numId w:val="1255"/>
         </w:numPr>
       </w:pPr>
       <w:r>
@@ -6274,7 +6310,7 @@
         <w:pStyle w:val="Compact"/>
         <w:numPr>
           <w:ilvl w:val="0"/>
-          <w:numId w:val="1255"/>
+          <w:numId w:val="1256"/>
         </w:numPr>
       </w:pPr>
       <w:r>
@@ -6286,7 +6322,7 @@
         <w:pStyle w:val="Compact"/>
         <w:numPr>
           <w:ilvl w:val="0"/>
-          <w:numId w:val="1256"/>
+          <w:numId w:val="1257"/>
         </w:numPr>
       </w:pPr>
       <w:r>
@@ -6298,7 +6334,7 @@
         <w:pStyle w:val="Compact"/>
         <w:numPr>
           <w:ilvl w:val="0"/>
-          <w:numId w:val="1257"/>
+          <w:numId w:val="1258"/>
         </w:numPr>
       </w:pPr>
       <w:r>
@@ -6310,7 +6346,7 @@
         <w:pStyle w:val="Compact"/>
         <w:numPr>
           <w:ilvl w:val="0"/>
-          <w:numId w:val="1258"/>
+          <w:numId w:val="1259"/>
         </w:numPr>
       </w:pPr>
       <w:r>
@@ -6322,7 +6358,7 @@
         <w:pStyle w:val="Compact"/>
         <w:numPr>
           <w:ilvl w:val="0"/>
-          <w:numId w:val="1259"/>
+          <w:numId w:val="1260"/>
         </w:numPr>
       </w:pPr>
       <w:r>
@@ -6334,7 +6370,7 @@
         <w:pStyle w:val="Compact"/>
         <w:numPr>
           <w:ilvl w:val="0"/>
-          <w:numId w:val="1260"/>
+          <w:numId w:val="1261"/>
         </w:numPr>
       </w:pPr>
       <w:r>
@@ -6366,7 +6402,7 @@
         <w:pStyle w:val="Compact"/>
         <w:numPr>
           <w:ilvl w:val="0"/>
-          <w:numId w:val="1261"/>
+          <w:numId w:val="1262"/>
         </w:numPr>
       </w:pPr>
       <w:r>
@@ -6408,7 +6444,7 @@
         <w:pStyle w:val="Compact"/>
         <w:numPr>
           <w:ilvl w:val="0"/>
-          <w:numId w:val="1262"/>
+          <w:numId w:val="1263"/>
         </w:numPr>
       </w:pPr>
       <w:r>
@@ -6471,7 +6507,7 @@
         <w:pStyle w:val="Compact"/>
         <w:numPr>
           <w:ilvl w:val="0"/>
-          <w:numId w:val="1263"/>
+          <w:numId w:val="1264"/>
         </w:numPr>
       </w:pPr>
       <w:r>
@@ -6483,7 +6519,7 @@
         <w:pStyle w:val="Compact"/>
         <w:numPr>
           <w:ilvl w:val="0"/>
-          <w:numId w:val="1264"/>
+          <w:numId w:val="1265"/>
         </w:numPr>
       </w:pPr>
       <w:r>
@@ -6558,7 +6594,7 @@
         <w:pStyle w:val="Compact"/>
         <w:numPr>
           <w:ilvl w:val="0"/>
-          <w:numId w:val="1265"/>
+          <w:numId w:val="1266"/>
         </w:numPr>
       </w:pPr>
       <w:r>
@@ -6585,7 +6621,7 @@
         <w:pStyle w:val="Compact"/>
         <w:numPr>
           <w:ilvl w:val="0"/>
-          <w:numId w:val="1266"/>
+          <w:numId w:val="1267"/>
         </w:numPr>
       </w:pPr>
       <w:r>
@@ -6639,7 +6675,7 @@
         <w:pStyle w:val="Compact"/>
         <w:numPr>
           <w:ilvl w:val="0"/>
-          <w:numId w:val="1267"/>
+          <w:numId w:val="1268"/>
         </w:numPr>
       </w:pPr>
       <w:r>
@@ -6651,7 +6687,7 @@
         <w:pStyle w:val="Compact"/>
         <w:numPr>
           <w:ilvl w:val="0"/>
-          <w:numId w:val="1268"/>
+          <w:numId w:val="1269"/>
         </w:numPr>
       </w:pPr>
       <w:r>
@@ -6711,7 +6747,7 @@
         <w:pStyle w:val="Compact"/>
         <w:numPr>
           <w:ilvl w:val="0"/>
-          <w:numId w:val="1269"/>
+          <w:numId w:val="1270"/>
         </w:numPr>
       </w:pPr>
       <w:r>
@@ -6757,7 +6793,7 @@
         <w:pStyle w:val="Compact"/>
         <w:numPr>
           <w:ilvl w:val="0"/>
-          <w:numId w:val="1270"/>
+          <w:numId w:val="1271"/>
         </w:numPr>
       </w:pPr>
       <w:r>
@@ -6781,7 +6817,7 @@
         <w:pStyle w:val="Compact"/>
         <w:numPr>
           <w:ilvl w:val="0"/>
-          <w:numId w:val="1271"/>
+          <w:numId w:val="1272"/>
         </w:numPr>
       </w:pPr>
       <w:r>
@@ -6805,7 +6841,7 @@
         <w:pStyle w:val="Compact"/>
         <w:numPr>
           <w:ilvl w:val="0"/>
-          <w:numId w:val="1272"/>
+          <w:numId w:val="1273"/>
         </w:numPr>
       </w:pPr>
       <w:r>
@@ -6832,7 +6868,7 @@
         <w:pStyle w:val="Compact"/>
         <w:numPr>
           <w:ilvl w:val="0"/>
-          <w:numId w:val="1273"/>
+          <w:numId w:val="1274"/>
         </w:numPr>
       </w:pPr>
       <w:r>
@@ -6856,7 +6892,7 @@
         <w:pStyle w:val="Compact"/>
         <w:numPr>
           <w:ilvl w:val="0"/>
-          <w:numId w:val="1274"/>
+          <w:numId w:val="1275"/>
         </w:numPr>
       </w:pPr>
       <w:r>
@@ -6868,7 +6904,7 @@
         <w:pStyle w:val="Compact"/>
         <w:numPr>
           <w:ilvl w:val="0"/>
-          <w:numId w:val="1275"/>
+          <w:numId w:val="1276"/>
         </w:numPr>
       </w:pPr>
       <w:r>
@@ -6895,7 +6931,7 @@
         <w:pStyle w:val="Compact"/>
         <w:numPr>
           <w:ilvl w:val="0"/>
-          <w:numId w:val="1276"/>
+          <w:numId w:val="1277"/>
         </w:numPr>
       </w:pPr>
       <w:r>
@@ -6907,7 +6943,7 @@
         <w:pStyle w:val="Compact"/>
         <w:numPr>
           <w:ilvl w:val="1"/>
-          <w:numId w:val="1277"/>
+          <w:numId w:val="1278"/>
         </w:numPr>
       </w:pPr>
       <w:r>
@@ -6925,7 +6961,7 @@
         <w:pStyle w:val="Compact"/>
         <w:numPr>
           <w:ilvl w:val="1"/>
-          <w:numId w:val="1277"/>
+          <w:numId w:val="1278"/>
         </w:numPr>
       </w:pPr>
       <w:r>
@@ -6943,7 +6979,7 @@
         <w:pStyle w:val="Compact"/>
         <w:numPr>
           <w:ilvl w:val="0"/>
-          <w:numId w:val="1278"/>
+          <w:numId w:val="1279"/>
         </w:numPr>
       </w:pPr>
       <w:r>
@@ -6970,7 +7006,7 @@
         <w:pStyle w:val="Compact"/>
         <w:numPr>
           <w:ilvl w:val="0"/>
-          <w:numId w:val="1279"/>
+          <w:numId w:val="1280"/>
         </w:numPr>
       </w:pPr>
       <w:r>
@@ -6997,7 +7033,7 @@
         <w:pStyle w:val="Compact"/>
         <w:numPr>
           <w:ilvl w:val="0"/>
-          <w:numId w:val="1280"/>
+          <w:numId w:val="1281"/>
         </w:numPr>
       </w:pPr>
       <w:r>
@@ -7024,7 +7060,7 @@
         <w:pStyle w:val="Compact"/>
         <w:numPr>
           <w:ilvl w:val="0"/>
-          <w:numId w:val="1281"/>
+          <w:numId w:val="1282"/>
         </w:numPr>
       </w:pPr>
       <w:r>
@@ -7036,7 +7072,7 @@
         <w:pStyle w:val="Compact"/>
         <w:numPr>
           <w:ilvl w:val="0"/>
-          <w:numId w:val="1282"/>
+          <w:numId w:val="1283"/>
         </w:numPr>
       </w:pPr>
       <w:r>
@@ -7048,7 +7084,7 @@
         <w:pStyle w:val="Compact"/>
         <w:numPr>
           <w:ilvl w:val="0"/>
-          <w:numId w:val="1283"/>
+          <w:numId w:val="1284"/>
         </w:numPr>
       </w:pPr>
       <w:r>
@@ -7070,7 +7106,7 @@
         <w:pStyle w:val="Compact"/>
         <w:numPr>
           <w:ilvl w:val="0"/>
-          <w:numId w:val="1284"/>
+          <w:numId w:val="1285"/>
         </w:numPr>
       </w:pPr>
       <w:r>
@@ -7094,7 +7130,7 @@
         <w:pStyle w:val="Compact"/>
         <w:numPr>
           <w:ilvl w:val="0"/>
-          <w:numId w:val="1285"/>
+          <w:numId w:val="1286"/>
         </w:numPr>
       </w:pPr>
       <w:r>
@@ -7118,7 +7154,7 @@
         <w:pStyle w:val="Compact"/>
         <w:numPr>
           <w:ilvl w:val="0"/>
-          <w:numId w:val="1286"/>
+          <w:numId w:val="1287"/>
         </w:numPr>
       </w:pPr>
       <w:r>
@@ -7130,7 +7166,7 @@
         <w:pStyle w:val="Compact"/>
         <w:numPr>
           <w:ilvl w:val="0"/>
-          <w:numId w:val="1287"/>
+          <w:numId w:val="1288"/>
         </w:numPr>
       </w:pPr>
       <w:r>
@@ -7166,7 +7202,7 @@
         <w:pStyle w:val="Compact"/>
         <w:numPr>
           <w:ilvl w:val="0"/>
-          <w:numId w:val="1288"/>
+          <w:numId w:val="1289"/>
         </w:numPr>
       </w:pPr>
       <w:r>
@@ -7193,7 +7229,7 @@
         <w:pStyle w:val="Compact"/>
         <w:numPr>
           <w:ilvl w:val="0"/>
-          <w:numId w:val="1289"/>
+          <w:numId w:val="1290"/>
         </w:numPr>
       </w:pPr>
       <w:r>
@@ -7215,7 +7251,7 @@
         <w:pStyle w:val="Compact"/>
         <w:numPr>
           <w:ilvl w:val="0"/>
-          <w:numId w:val="1290"/>
+          <w:numId w:val="1291"/>
         </w:numPr>
       </w:pPr>
       <w:r>
@@ -7242,7 +7278,7 @@
         <w:pStyle w:val="Compact"/>
         <w:numPr>
           <w:ilvl w:val="0"/>
-          <w:numId w:val="1291"/>
+          <w:numId w:val="1292"/>
         </w:numPr>
       </w:pPr>
       <w:r>
@@ -7269,7 +7305,7 @@
         <w:pStyle w:val="Compact"/>
         <w:numPr>
           <w:ilvl w:val="0"/>
-          <w:numId w:val="1292"/>
+          <w:numId w:val="1293"/>
         </w:numPr>
       </w:pPr>
       <w:r>
@@ -7296,7 +7332,7 @@
         <w:pStyle w:val="Compact"/>
         <w:numPr>
           <w:ilvl w:val="0"/>
-          <w:numId w:val="1293"/>
+          <w:numId w:val="1294"/>
         </w:numPr>
       </w:pPr>
       <w:r>
@@ -7308,7 +7344,7 @@
         <w:pStyle w:val="Compact"/>
         <w:numPr>
           <w:ilvl w:val="0"/>
-          <w:numId w:val="1294"/>
+          <w:numId w:val="1295"/>
         </w:numPr>
       </w:pPr>
       <w:r>
@@ -7320,7 +7356,7 @@
         <w:pStyle w:val="Compact"/>
         <w:numPr>
           <w:ilvl w:val="0"/>
-          <w:numId w:val="1295"/>
+          <w:numId w:val="1296"/>
         </w:numPr>
       </w:pPr>
       <w:r>
@@ -7332,7 +7368,7 @@
         <w:pStyle w:val="Compact"/>
         <w:numPr>
           <w:ilvl w:val="0"/>
-          <w:numId w:val="1296"/>
+          <w:numId w:val="1297"/>
         </w:numPr>
       </w:pPr>
       <w:r>
@@ -7344,7 +7380,7 @@
         <w:pStyle w:val="Compact"/>
         <w:numPr>
           <w:ilvl w:val="0"/>
-          <w:numId w:val="1297"/>
+          <w:numId w:val="1298"/>
         </w:numPr>
       </w:pPr>
       <w:r>
@@ -7356,7 +7392,7 @@
         <w:pStyle w:val="Compact"/>
         <w:numPr>
           <w:ilvl w:val="0"/>
-          <w:numId w:val="1298"/>
+          <w:numId w:val="1299"/>
         </w:numPr>
       </w:pPr>
       <w:r>
@@ -7408,7 +7444,7 @@
         <w:pStyle w:val="Compact"/>
         <w:numPr>
           <w:ilvl w:val="0"/>
-          <w:numId w:val="1299"/>
+          <w:numId w:val="1300"/>
         </w:numPr>
       </w:pPr>
       <w:r>
@@ -7447,7 +7483,7 @@
         <w:pStyle w:val="Compact"/>
         <w:numPr>
           <w:ilvl w:val="0"/>
-          <w:numId w:val="1300"/>
+          <w:numId w:val="1301"/>
         </w:numPr>
       </w:pPr>
       <w:r>
@@ -7459,7 +7495,7 @@
         <w:pStyle w:val="Compact"/>
         <w:numPr>
           <w:ilvl w:val="0"/>
-          <w:numId w:val="1301"/>
+          <w:numId w:val="1302"/>
         </w:numPr>
       </w:pPr>
       <w:r>
@@ -7471,7 +7507,7 @@
         <w:pStyle w:val="Compact"/>
         <w:numPr>
           <w:ilvl w:val="0"/>
-          <w:numId w:val="1302"/>
+          <w:numId w:val="1303"/>
         </w:numPr>
       </w:pPr>
       <w:r>
@@ -7483,7 +7519,7 @@
         <w:pStyle w:val="Compact"/>
         <w:numPr>
           <w:ilvl w:val="0"/>
-          <w:numId w:val="1303"/>
+          <w:numId w:val="1304"/>
         </w:numPr>
       </w:pPr>
       <w:r>
@@ -7495,7 +7531,7 @@
         <w:pStyle w:val="Compact"/>
         <w:numPr>
           <w:ilvl w:val="0"/>
-          <w:numId w:val="1304"/>
+          <w:numId w:val="1305"/>
         </w:numPr>
       </w:pPr>
       <w:r>
@@ -7507,7 +7543,7 @@
         <w:pStyle w:val="Compact"/>
         <w:numPr>
           <w:ilvl w:val="1"/>
-          <w:numId w:val="1305"/>
+          <w:numId w:val="1306"/>
         </w:numPr>
       </w:pPr>
       <w:r>
@@ -7540,7 +7576,7 @@
         <w:pStyle w:val="Compact"/>
         <w:numPr>
           <w:ilvl w:val="1"/>
-          <w:numId w:val="1305"/>
+          <w:numId w:val="1306"/>
         </w:numPr>
       </w:pPr>
       <w:r>
@@ -7573,7 +7609,7 @@
         <w:pStyle w:val="Compact"/>
         <w:numPr>
           <w:ilvl w:val="1"/>
-          <w:numId w:val="1305"/>
+          <w:numId w:val="1306"/>
         </w:numPr>
       </w:pPr>
       <w:r>
@@ -7606,7 +7642,7 @@
         <w:pStyle w:val="Compact"/>
         <w:numPr>
           <w:ilvl w:val="1"/>
-          <w:numId w:val="1305"/>
+          <w:numId w:val="1306"/>
         </w:numPr>
       </w:pPr>
       <w:r>
@@ -7639,7 +7675,7 @@
         <w:pStyle w:val="Compact"/>
         <w:numPr>
           <w:ilvl w:val="1"/>
-          <w:numId w:val="1305"/>
+          <w:numId w:val="1306"/>
         </w:numPr>
       </w:pPr>
       <w:r>
@@ -7672,7 +7708,7 @@
         <w:pStyle w:val="Compact"/>
         <w:numPr>
           <w:ilvl w:val="0"/>
-          <w:numId w:val="1306"/>
+          <w:numId w:val="1307"/>
         </w:numPr>
       </w:pPr>
       <w:r>
@@ -7726,7 +7762,7 @@
         <w:pStyle w:val="Compact"/>
         <w:numPr>
           <w:ilvl w:val="0"/>
-          <w:numId w:val="1307"/>
+          <w:numId w:val="1308"/>
         </w:numPr>
       </w:pPr>
       <w:r>
@@ -7738,7 +7774,7 @@
         <w:pStyle w:val="Compact"/>
         <w:numPr>
           <w:ilvl w:val="0"/>
-          <w:numId w:val="1308"/>
+          <w:numId w:val="1309"/>
         </w:numPr>
       </w:pPr>
       <w:r>
@@ -7750,7 +7786,7 @@
         <w:pStyle w:val="Compact"/>
         <w:numPr>
           <w:ilvl w:val="0"/>
-          <w:numId w:val="1309"/>
+          <w:numId w:val="1310"/>
         </w:numPr>
       </w:pPr>
       <w:r>
@@ -7762,7 +7798,7 @@
         <w:pStyle w:val="Compact"/>
         <w:numPr>
           <w:ilvl w:val="0"/>
-          <w:numId w:val="1310"/>
+          <w:numId w:val="1311"/>
         </w:numPr>
       </w:pPr>
       <w:r>
@@ -7774,7 +7810,7 @@
         <w:pStyle w:val="Compact"/>
         <w:numPr>
           <w:ilvl w:val="0"/>
-          <w:numId w:val="1311"/>
+          <w:numId w:val="1312"/>
         </w:numPr>
       </w:pPr>
       <w:r>
@@ -7796,7 +7832,7 @@
         <w:pStyle w:val="Compact"/>
         <w:numPr>
           <w:ilvl w:val="0"/>
-          <w:numId w:val="1312"/>
+          <w:numId w:val="1313"/>
         </w:numPr>
       </w:pPr>
       <w:r>
@@ -7808,7 +7844,7 @@
         <w:pStyle w:val="Compact"/>
         <w:numPr>
           <w:ilvl w:val="0"/>
-          <w:numId w:val="1313"/>
+          <w:numId w:val="1314"/>
         </w:numPr>
       </w:pPr>
       <w:r>
@@ -7820,7 +7856,7 @@
         <w:pStyle w:val="Compact"/>
         <w:numPr>
           <w:ilvl w:val="0"/>
-          <w:numId w:val="1314"/>
+          <w:numId w:val="1315"/>
         </w:numPr>
       </w:pPr>
       <w:r>
@@ -7832,7 +7868,7 @@
         <w:pStyle w:val="Compact"/>
         <w:numPr>
           <w:ilvl w:val="0"/>
-          <w:numId w:val="1315"/>
+          <w:numId w:val="1316"/>
         </w:numPr>
       </w:pPr>
       <w:r>
@@ -7844,7 +7880,7 @@
         <w:pStyle w:val="Compact"/>
         <w:numPr>
           <w:ilvl w:val="0"/>
-          <w:numId w:val="1316"/>
+          <w:numId w:val="1317"/>
         </w:numPr>
       </w:pPr>
       <w:r>
@@ -7856,7 +7892,7 @@
         <w:pStyle w:val="Compact"/>
         <w:numPr>
           <w:ilvl w:val="0"/>
-          <w:numId w:val="1317"/>
+          <w:numId w:val="1318"/>
         </w:numPr>
       </w:pPr>
       <w:r>
@@ -7868,7 +7904,7 @@
         <w:pStyle w:val="Compact"/>
         <w:numPr>
           <w:ilvl w:val="0"/>
-          <w:numId w:val="1318"/>
+          <w:numId w:val="1319"/>
         </w:numPr>
       </w:pPr>
       <w:r>
@@ -7880,7 +7916,7 @@
         <w:pStyle w:val="Compact"/>
         <w:numPr>
           <w:ilvl w:val="0"/>
-          <w:numId w:val="1319"/>
+          <w:numId w:val="1320"/>
         </w:numPr>
       </w:pPr>
       <w:r>
@@ -7892,7 +7928,7 @@
         <w:pStyle w:val="Compact"/>
         <w:numPr>
           <w:ilvl w:val="0"/>
-          <w:numId w:val="1320"/>
+          <w:numId w:val="1321"/>
         </w:numPr>
       </w:pPr>
       <w:r>
@@ -7904,7 +7940,7 @@
         <w:pStyle w:val="Compact"/>
         <w:numPr>
           <w:ilvl w:val="0"/>
-          <w:numId w:val="1321"/>
+          <w:numId w:val="1322"/>
         </w:numPr>
       </w:pPr>
       <w:r>
@@ -7916,7 +7952,7 @@
         <w:pStyle w:val="Compact"/>
         <w:numPr>
           <w:ilvl w:val="0"/>
-          <w:numId w:val="1322"/>
+          <w:numId w:val="1323"/>
         </w:numPr>
       </w:pPr>
       <w:r>
@@ -7943,7 +7979,7 @@
         <w:pStyle w:val="Compact"/>
         <w:numPr>
           <w:ilvl w:val="0"/>
-          <w:numId w:val="1323"/>
+          <w:numId w:val="1324"/>
         </w:numPr>
       </w:pPr>
       <w:r>
@@ -7975,7 +8011,7 @@
         <w:pStyle w:val="Compact"/>
         <w:numPr>
           <w:ilvl w:val="0"/>
-          <w:numId w:val="1324"/>
+          <w:numId w:val="1325"/>
         </w:numPr>
       </w:pPr>
       <w:r>
@@ -8014,7 +8050,7 @@
         <w:pStyle w:val="Compact"/>
         <w:numPr>
           <w:ilvl w:val="0"/>
-          <w:numId w:val="1325"/>
+          <w:numId w:val="1326"/>
         </w:numPr>
       </w:pPr>
       <w:r>
@@ -8053,7 +8089,7 @@
         <w:pStyle w:val="Compact"/>
         <w:numPr>
           <w:ilvl w:val="0"/>
-          <w:numId w:val="1326"/>
+          <w:numId w:val="1327"/>
         </w:numPr>
       </w:pPr>
       <w:r>
@@ -8077,7 +8113,7 @@
         <w:pStyle w:val="Compact"/>
         <w:numPr>
           <w:ilvl w:val="0"/>
-          <w:numId w:val="1327"/>
+          <w:numId w:val="1328"/>
         </w:numPr>
       </w:pPr>
       <w:r>
@@ -8134,7 +8170,7 @@
         <w:pStyle w:val="Compact"/>
         <w:numPr>
           <w:ilvl w:val="0"/>
-          <w:numId w:val="1328"/>
+          <w:numId w:val="1329"/>
         </w:numPr>
       </w:pPr>
       <w:r>
@@ -8158,7 +8194,7 @@
         <w:pStyle w:val="Compact"/>
         <w:numPr>
           <w:ilvl w:val="0"/>
-          <w:numId w:val="1329"/>
+          <w:numId w:val="1330"/>
         </w:numPr>
       </w:pPr>
       <w:r>
@@ -8170,7 +8206,7 @@
         <w:pStyle w:val="Compact"/>
         <w:numPr>
           <w:ilvl w:val="1"/>
-          <w:numId w:val="1330"/>
+          <w:numId w:val="1331"/>
         </w:numPr>
       </w:pPr>
       <w:r>
@@ -8182,7 +8218,7 @@
         <w:pStyle w:val="Compact"/>
         <w:numPr>
           <w:ilvl w:val="1"/>
-          <w:numId w:val="1330"/>
+          <w:numId w:val="1331"/>
         </w:numPr>
       </w:pPr>
       <w:r>
@@ -8194,7 +8230,7 @@
         <w:pStyle w:val="Compact"/>
         <w:numPr>
           <w:ilvl w:val="1"/>
-          <w:numId w:val="1330"/>
+          <w:numId w:val="1331"/>
         </w:numPr>
       </w:pPr>
       <w:r>
@@ -8206,7 +8242,7 @@
         <w:pStyle w:val="Compact"/>
         <w:numPr>
           <w:ilvl w:val="1"/>
-          <w:numId w:val="1330"/>
+          <w:numId w:val="1331"/>
         </w:numPr>
       </w:pPr>
       <w:r>
@@ -8218,7 +8254,7 @@
         <w:pStyle w:val="Compact"/>
         <w:numPr>
           <w:ilvl w:val="1"/>
-          <w:numId w:val="1330"/>
+          <w:numId w:val="1331"/>
         </w:numPr>
       </w:pPr>
       <w:r>
@@ -8230,7 +8266,7 @@
         <w:pStyle w:val="Compact"/>
         <w:numPr>
           <w:ilvl w:val="0"/>
-          <w:numId w:val="1331"/>
+          <w:numId w:val="1332"/>
         </w:numPr>
       </w:pPr>
       <w:r>
@@ -8275,7 +8311,7 @@
         <w:pStyle w:val="Compact"/>
         <w:numPr>
           <w:ilvl w:val="0"/>
-          <w:numId w:val="1332"/>
+          <w:numId w:val="1333"/>
         </w:numPr>
       </w:pPr>
       <w:r>
@@ -8308,7 +8344,7 @@
         <w:pStyle w:val="Compact"/>
         <w:numPr>
           <w:ilvl w:val="0"/>
-          <w:numId w:val="1333"/>
+          <w:numId w:val="1334"/>
         </w:numPr>
       </w:pPr>
       <w:r>
@@ -8341,7 +8377,7 @@
         <w:pStyle w:val="Compact"/>
         <w:numPr>
           <w:ilvl w:val="0"/>
-          <w:numId w:val="1334"/>
+          <w:numId w:val="1335"/>
         </w:numPr>
       </w:pPr>
       <w:r>
@@ -8368,7 +8404,7 @@
         <w:pStyle w:val="Compact"/>
         <w:numPr>
           <w:ilvl w:val="0"/>
-          <w:numId w:val="1335"/>
+          <w:numId w:val="1336"/>
         </w:numPr>
       </w:pPr>
       <w:r>
@@ -8380,7 +8416,7 @@
         <w:pStyle w:val="Compact"/>
         <w:numPr>
           <w:ilvl w:val="0"/>
-          <w:numId w:val="1336"/>
+          <w:numId w:val="1337"/>
         </w:numPr>
       </w:pPr>
       <w:r>
@@ -8392,7 +8428,7 @@
         <w:pStyle w:val="Compact"/>
         <w:numPr>
           <w:ilvl w:val="0"/>
-          <w:numId w:val="1337"/>
+          <w:numId w:val="1338"/>
         </w:numPr>
       </w:pPr>
       <w:r>
@@ -8404,7 +8440,7 @@
         <w:pStyle w:val="Compact"/>
         <w:numPr>
           <w:ilvl w:val="0"/>
-          <w:numId w:val="1338"/>
+          <w:numId w:val="1339"/>
         </w:numPr>
       </w:pPr>
       <w:r>
@@ -8416,7 +8452,7 @@
         <w:pStyle w:val="Compact"/>
         <w:numPr>
           <w:ilvl w:val="0"/>
-          <w:numId w:val="1339"/>
+          <w:numId w:val="1340"/>
         </w:numPr>
       </w:pPr>
       <w:r>
@@ -8443,7 +8479,7 @@
         <w:pStyle w:val="Compact"/>
         <w:numPr>
           <w:ilvl w:val="0"/>
-          <w:numId w:val="1340"/>
+          <w:numId w:val="1341"/>
         </w:numPr>
       </w:pPr>
       <w:r>
@@ -8465,7 +8501,7 @@
         <w:pStyle w:val="Compact"/>
         <w:numPr>
           <w:ilvl w:val="0"/>
-          <w:numId w:val="1341"/>
+          <w:numId w:val="1342"/>
         </w:numPr>
       </w:pPr>
       <w:r>
@@ -8477,7 +8513,7 @@
         <w:pStyle w:val="Compact"/>
         <w:numPr>
           <w:ilvl w:val="0"/>
-          <w:numId w:val="1342"/>
+          <w:numId w:val="1343"/>
         </w:numPr>
       </w:pPr>
       <w:r>
@@ -8489,7 +8525,7 @@
         <w:pStyle w:val="Compact"/>
         <w:numPr>
           <w:ilvl w:val="0"/>
-          <w:numId w:val="1343"/>
+          <w:numId w:val="1344"/>
         </w:numPr>
       </w:pPr>
       <w:r>
@@ -8501,7 +8537,7 @@
         <w:pStyle w:val="Compact"/>
         <w:numPr>
           <w:ilvl w:val="0"/>
-          <w:numId w:val="1344"/>
+          <w:numId w:val="1345"/>
         </w:numPr>
       </w:pPr>
       <w:r>
@@ -8525,7 +8561,7 @@
         <w:pStyle w:val="Compact"/>
         <w:numPr>
           <w:ilvl w:val="0"/>
-          <w:numId w:val="1345"/>
+          <w:numId w:val="1346"/>
         </w:numPr>
       </w:pPr>
       <w:r>
@@ -8537,7 +8573,7 @@
         <w:pStyle w:val="Compact"/>
         <w:numPr>
           <w:ilvl w:val="1"/>
-          <w:numId w:val="1346"/>
+          <w:numId w:val="1347"/>
         </w:numPr>
       </w:pPr>
       <w:r>
@@ -8549,7 +8585,7 @@
         <w:pStyle w:val="Compact"/>
         <w:numPr>
           <w:ilvl w:val="1"/>
-          <w:numId w:val="1346"/>
+          <w:numId w:val="1347"/>
         </w:numPr>
       </w:pPr>
       <w:r>
@@ -8561,7 +8597,7 @@
         <w:pStyle w:val="Compact"/>
         <w:numPr>
           <w:ilvl w:val="1"/>
-          <w:numId w:val="1346"/>
+          <w:numId w:val="1347"/>
         </w:numPr>
       </w:pPr>
       <w:r>
@@ -8573,7 +8609,7 @@
         <w:pStyle w:val="Compact"/>
         <w:numPr>
           <w:ilvl w:val="0"/>
-          <w:numId w:val="1347"/>
+          <w:numId w:val="1348"/>
         </w:numPr>
       </w:pPr>
       <w:r>
@@ -8615,7 +8651,7 @@
         <w:pStyle w:val="Compact"/>
         <w:numPr>
           <w:ilvl w:val="0"/>
-          <w:numId w:val="1348"/>
+          <w:numId w:val="1349"/>
         </w:numPr>
       </w:pPr>
       <w:r>
@@ -8667,7 +8703,7 @@
         <w:pStyle w:val="Compact"/>
         <w:numPr>
           <w:ilvl w:val="0"/>
-          <w:numId w:val="1349"/>
+          <w:numId w:val="1350"/>
         </w:numPr>
       </w:pPr>
       <w:r>
@@ -8679,7 +8715,7 @@
         <w:pStyle w:val="Compact"/>
         <w:numPr>
           <w:ilvl w:val="0"/>
-          <w:numId w:val="1350"/>
+          <w:numId w:val="1351"/>
         </w:numPr>
       </w:pPr>
       <w:r>
@@ -8691,7 +8727,7 @@
         <w:pStyle w:val="Compact"/>
         <w:numPr>
           <w:ilvl w:val="0"/>
-          <w:numId w:val="1351"/>
+          <w:numId w:val="1352"/>
         </w:numPr>
       </w:pPr>
       <w:r>
@@ -8703,7 +8739,7 @@
         <w:pStyle w:val="Compact"/>
         <w:numPr>
           <w:ilvl w:val="0"/>
-          <w:numId w:val="1352"/>
+          <w:numId w:val="1353"/>
         </w:numPr>
       </w:pPr>
       <w:r>
@@ -8715,7 +8751,7 @@
         <w:pStyle w:val="Compact"/>
         <w:numPr>
           <w:ilvl w:val="0"/>
-          <w:numId w:val="1353"/>
+          <w:numId w:val="1354"/>
         </w:numPr>
       </w:pPr>
       <w:r>
@@ -8727,7 +8763,7 @@
         <w:pStyle w:val="Compact"/>
         <w:numPr>
           <w:ilvl w:val="0"/>
-          <w:numId w:val="1354"/>
+          <w:numId w:val="1355"/>
         </w:numPr>
       </w:pPr>
       <w:r>
@@ -8739,7 +8775,7 @@
         <w:pStyle w:val="Compact"/>
         <w:numPr>
           <w:ilvl w:val="0"/>
-          <w:numId w:val="1355"/>
+          <w:numId w:val="1356"/>
         </w:numPr>
       </w:pPr>
       <w:r>
@@ -8751,7 +8787,7 @@
         <w:pStyle w:val="Compact"/>
         <w:numPr>
           <w:ilvl w:val="0"/>
-          <w:numId w:val="1356"/>
+          <w:numId w:val="1357"/>
         </w:numPr>
       </w:pPr>
       <w:r>
@@ -8763,7 +8799,7 @@
         <w:pStyle w:val="Compact"/>
         <w:numPr>
           <w:ilvl w:val="0"/>
-          <w:numId w:val="1357"/>
+          <w:numId w:val="1358"/>
         </w:numPr>
       </w:pPr>
       <w:r>
@@ -8795,7 +8831,7 @@
         <w:pStyle w:val="Compact"/>
         <w:numPr>
           <w:ilvl w:val="0"/>
-          <w:numId w:val="1358"/>
+          <w:numId w:val="1359"/>
         </w:numPr>
       </w:pPr>
       <w:r>
@@ -8807,7 +8843,7 @@
         <w:pStyle w:val="Compact"/>
         <w:numPr>
           <w:ilvl w:val="0"/>
-          <w:numId w:val="1359"/>
+          <w:numId w:val="1360"/>
         </w:numPr>
       </w:pPr>
       <w:r>
@@ -8819,7 +8855,7 @@
         <w:pStyle w:val="Compact"/>
         <w:numPr>
           <w:ilvl w:val="0"/>
-          <w:numId w:val="1360"/>
+          <w:numId w:val="1361"/>
         </w:numPr>
       </w:pPr>
       <w:r>
@@ -8831,7 +8867,7 @@
         <w:pStyle w:val="Compact"/>
         <w:numPr>
           <w:ilvl w:val="0"/>
-          <w:numId w:val="1361"/>
+          <w:numId w:val="1362"/>
         </w:numPr>
       </w:pPr>
       <w:r>
@@ -8843,7 +8879,7 @@
         <w:pStyle w:val="Compact"/>
         <w:numPr>
           <w:ilvl w:val="0"/>
-          <w:numId w:val="1362"/>
+          <w:numId w:val="1363"/>
         </w:numPr>
       </w:pPr>
       <w:r>
@@ -8855,7 +8891,7 @@
         <w:pStyle w:val="Compact"/>
         <w:numPr>
           <w:ilvl w:val="0"/>
-          <w:numId w:val="1363"/>
+          <w:numId w:val="1364"/>
         </w:numPr>
       </w:pPr>
       <w:r>
@@ -8867,7 +8903,7 @@
         <w:pStyle w:val="Compact"/>
         <w:numPr>
           <w:ilvl w:val="0"/>
-          <w:numId w:val="1364"/>
+          <w:numId w:val="1365"/>
         </w:numPr>
       </w:pPr>
       <w:r>
@@ -8879,7 +8915,7 @@
         <w:pStyle w:val="Compact"/>
         <w:numPr>
           <w:ilvl w:val="0"/>
-          <w:numId w:val="1365"/>
+          <w:numId w:val="1366"/>
         </w:numPr>
       </w:pPr>
       <w:r>
@@ -8891,7 +8927,7 @@
         <w:pStyle w:val="Compact"/>
         <w:numPr>
           <w:ilvl w:val="0"/>
-          <w:numId w:val="1366"/>
+          <w:numId w:val="1367"/>
         </w:numPr>
       </w:pPr>
       <w:r>
@@ -8903,7 +8939,7 @@
         <w:pStyle w:val="Compact"/>
         <w:numPr>
           <w:ilvl w:val="0"/>
-          <w:numId w:val="1367"/>
+          <w:numId w:val="1368"/>
         </w:numPr>
       </w:pPr>
       <w:r>
@@ -8915,7 +8951,7 @@
         <w:pStyle w:val="Compact"/>
         <w:numPr>
           <w:ilvl w:val="0"/>
-          <w:numId w:val="1368"/>
+          <w:numId w:val="1369"/>
         </w:numPr>
       </w:pPr>
       <w:r>
@@ -8927,7 +8963,7 @@
         <w:pStyle w:val="Compact"/>
         <w:numPr>
           <w:ilvl w:val="0"/>
-          <w:numId w:val="1369"/>
+          <w:numId w:val="1370"/>
         </w:numPr>
       </w:pPr>
       <w:r>
@@ -8939,7 +8975,7 @@
         <w:pStyle w:val="Compact"/>
         <w:numPr>
           <w:ilvl w:val="0"/>
-          <w:numId w:val="1370"/>
+          <w:numId w:val="1371"/>
         </w:numPr>
       </w:pPr>
       <w:r>
@@ -8951,7 +8987,7 @@
         <w:pStyle w:val="Compact"/>
         <w:numPr>
           <w:ilvl w:val="0"/>
-          <w:numId w:val="1371"/>
+          <w:numId w:val="1372"/>
         </w:numPr>
       </w:pPr>
       <w:r>
@@ -8963,7 +8999,7 @@
         <w:pStyle w:val="Compact"/>
         <w:numPr>
           <w:ilvl w:val="0"/>
-          <w:numId w:val="1372"/>
+          <w:numId w:val="1373"/>
         </w:numPr>
       </w:pPr>
       <w:r>
@@ -8985,7 +9021,7 @@
         <w:pStyle w:val="Compact"/>
         <w:numPr>
           <w:ilvl w:val="0"/>
-          <w:numId w:val="1373"/>
+          <w:numId w:val="1374"/>
         </w:numPr>
       </w:pPr>
       <w:r>
@@ -8997,7 +9033,7 @@
         <w:pStyle w:val="Compact"/>
         <w:numPr>
           <w:ilvl w:val="0"/>
-          <w:numId w:val="1374"/>
+          <w:numId w:val="1375"/>
         </w:numPr>
       </w:pPr>
       <w:r>
@@ -9009,7 +9045,7 @@
         <w:pStyle w:val="Compact"/>
         <w:numPr>
           <w:ilvl w:val="0"/>
-          <w:numId w:val="1375"/>
+          <w:numId w:val="1376"/>
         </w:numPr>
       </w:pPr>
       <w:r>
@@ -9021,7 +9057,7 @@
         <w:pStyle w:val="Compact"/>
         <w:numPr>
           <w:ilvl w:val="0"/>
-          <w:numId w:val="1376"/>
+          <w:numId w:val="1377"/>
         </w:numPr>
       </w:pPr>
       <w:r>
@@ -9033,7 +9069,7 @@
         <w:pStyle w:val="Compact"/>
         <w:numPr>
           <w:ilvl w:val="0"/>
-          <w:numId w:val="1377"/>
+          <w:numId w:val="1378"/>
         </w:numPr>
       </w:pPr>
       <w:r>
@@ -9045,7 +9081,7 @@
         <w:pStyle w:val="Compact"/>
         <w:numPr>
           <w:ilvl w:val="0"/>
-          <w:numId w:val="1378"/>
+          <w:numId w:val="1379"/>
         </w:numPr>
       </w:pPr>
       <w:r>
@@ -9057,7 +9093,7 @@
         <w:pStyle w:val="Compact"/>
         <w:numPr>
           <w:ilvl w:val="0"/>
-          <w:numId w:val="1379"/>
+          <w:numId w:val="1380"/>
         </w:numPr>
       </w:pPr>
       <w:r>
@@ -9079,7 +9115,7 @@
         <w:pStyle w:val="Compact"/>
         <w:numPr>
           <w:ilvl w:val="0"/>
-          <w:numId w:val="1380"/>
+          <w:numId w:val="1381"/>
         </w:numPr>
       </w:pPr>
       <w:r>
@@ -9091,7 +9127,7 @@
         <w:pStyle w:val="Compact"/>
         <w:numPr>
           <w:ilvl w:val="0"/>
-          <w:numId w:val="1381"/>
+          <w:numId w:val="1382"/>
         </w:numPr>
       </w:pPr>
       <w:r>
@@ -9103,7 +9139,7 @@
         <w:pStyle w:val="Compact"/>
         <w:numPr>
           <w:ilvl w:val="0"/>
-          <w:numId w:val="1382"/>
+          <w:numId w:val="1383"/>
         </w:numPr>
       </w:pPr>
       <w:r>
@@ -9115,7 +9151,7 @@
         <w:pStyle w:val="Compact"/>
         <w:numPr>
           <w:ilvl w:val="0"/>
-          <w:numId w:val="1383"/>
+          <w:numId w:val="1384"/>
         </w:numPr>
       </w:pPr>
       <w:r>
@@ -9127,7 +9163,7 @@
         <w:pStyle w:val="Compact"/>
         <w:numPr>
           <w:ilvl w:val="0"/>
-          <w:numId w:val="1384"/>
+          <w:numId w:val="1385"/>
         </w:numPr>
       </w:pPr>
       <w:r>
@@ -9139,7 +9175,7 @@
         <w:pStyle w:val="Compact"/>
         <w:numPr>
           <w:ilvl w:val="0"/>
-          <w:numId w:val="1385"/>
+          <w:numId w:val="1386"/>
         </w:numPr>
       </w:pPr>
       <w:r>
@@ -9151,7 +9187,7 @@
         <w:pStyle w:val="Compact"/>
         <w:numPr>
           <w:ilvl w:val="0"/>
-          <w:numId w:val="1386"/>
+          <w:numId w:val="1387"/>
         </w:numPr>
       </w:pPr>
       <w:r>
@@ -9183,7 +9219,7 @@
         <w:pStyle w:val="Compact"/>
         <w:numPr>
           <w:ilvl w:val="0"/>
-          <w:numId w:val="1387"/>
+          <w:numId w:val="1388"/>
         </w:numPr>
       </w:pPr>
       <w:r>
@@ -9234,7 +9270,7 @@
         <w:pStyle w:val="Compact"/>
         <w:numPr>
           <w:ilvl w:val="0"/>
-          <w:numId w:val="1388"/>
+          <w:numId w:val="1389"/>
         </w:numPr>
       </w:pPr>
       <w:r>
@@ -9261,7 +9297,7 @@
         <w:pStyle w:val="Compact"/>
         <w:numPr>
           <w:ilvl w:val="0"/>
-          <w:numId w:val="1389"/>
+          <w:numId w:val="1390"/>
         </w:numPr>
       </w:pPr>
       <w:r>
@@ -9273,7 +9309,7 @@
         <w:pStyle w:val="Compact"/>
         <w:numPr>
           <w:ilvl w:val="0"/>
-          <w:numId w:val="1390"/>
+          <w:numId w:val="1391"/>
         </w:numPr>
       </w:pPr>
       <w:r>
@@ -9300,7 +9336,7 @@
         <w:pStyle w:val="Compact"/>
         <w:numPr>
           <w:ilvl w:val="0"/>
-          <w:numId w:val="1391"/>
+          <w:numId w:val="1392"/>
         </w:numPr>
       </w:pPr>
       <w:r>
@@ -9312,7 +9348,7 @@
         <w:pStyle w:val="Compact"/>
         <w:numPr>
           <w:ilvl w:val="0"/>
-          <w:numId w:val="1392"/>
+          <w:numId w:val="1393"/>
         </w:numPr>
       </w:pPr>
       <w:r>
@@ -9324,7 +9360,7 @@
         <w:pStyle w:val="Compact"/>
         <w:numPr>
           <w:ilvl w:val="0"/>
-          <w:numId w:val="1393"/>
+          <w:numId w:val="1394"/>
         </w:numPr>
       </w:pPr>
       <w:r>
@@ -9346,7 +9382,7 @@
         <w:pStyle w:val="Compact"/>
         <w:numPr>
           <w:ilvl w:val="0"/>
-          <w:numId w:val="1394"/>
+          <w:numId w:val="1395"/>
         </w:numPr>
       </w:pPr>
       <w:r>
@@ -9370,7 +9406,7 @@
         <w:pStyle w:val="Compact"/>
         <w:numPr>
           <w:ilvl w:val="0"/>
-          <w:numId w:val="1395"/>
+          <w:numId w:val="1396"/>
         </w:numPr>
       </w:pPr>
       <w:r>
@@ -9394,7 +9430,7 @@
         <w:pStyle w:val="Compact"/>
         <w:numPr>
           <w:ilvl w:val="0"/>
-          <w:numId w:val="1396"/>
+          <w:numId w:val="1397"/>
         </w:numPr>
       </w:pPr>
       <w:r>
@@ -9406,7 +9442,7 @@
         <w:pStyle w:val="Compact"/>
         <w:numPr>
           <w:ilvl w:val="0"/>
-          <w:numId w:val="1397"/>
+          <w:numId w:val="1398"/>
         </w:numPr>
       </w:pPr>
       <w:r>
@@ -9418,7 +9454,7 @@
         <w:pStyle w:val="Compact"/>
         <w:numPr>
           <w:ilvl w:val="0"/>
-          <w:numId w:val="1398"/>
+          <w:numId w:val="1399"/>
         </w:numPr>
       </w:pPr>
       <w:r>
@@ -9430,7 +9466,7 @@
         <w:pStyle w:val="Compact"/>
         <w:numPr>
           <w:ilvl w:val="0"/>
-          <w:numId w:val="1399"/>
+          <w:numId w:val="1400"/>
         </w:numPr>
       </w:pPr>
       <w:r>
@@ -9461,7 +9497,7 @@
         <w:pStyle w:val="Compact"/>
         <w:numPr>
           <w:ilvl w:val="0"/>
-          <w:numId w:val="1400"/>
+          <w:numId w:val="1401"/>
         </w:numPr>
       </w:pPr>
       <w:r>
@@ -9473,7 +9509,7 @@
         <w:pStyle w:val="Compact"/>
         <w:numPr>
           <w:ilvl w:val="0"/>
-          <w:numId w:val="1401"/>
+          <w:numId w:val="1402"/>
         </w:numPr>
       </w:pPr>
       <w:r>
@@ -9485,7 +9521,7 @@
         <w:pStyle w:val="Compact"/>
         <w:numPr>
           <w:ilvl w:val="1"/>
-          <w:numId w:val="1402"/>
+          <w:numId w:val="1403"/>
         </w:numPr>
       </w:pPr>
       <w:r>
@@ -9503,7 +9539,7 @@
         <w:pStyle w:val="Compact"/>
         <w:numPr>
           <w:ilvl w:val="1"/>
-          <w:numId w:val="1402"/>
+          <w:numId w:val="1403"/>
         </w:numPr>
       </w:pPr>
       <w:r>
@@ -9521,7 +9557,7 @@
         <w:pStyle w:val="Compact"/>
         <w:numPr>
           <w:ilvl w:val="1"/>
-          <w:numId w:val="1402"/>
+          <w:numId w:val="1403"/>
         </w:numPr>
       </w:pPr>
       <w:r>
@@ -9539,7 +9575,7 @@
         <w:pStyle w:val="Compact"/>
         <w:numPr>
           <w:ilvl w:val="1"/>
-          <w:numId w:val="1402"/>
+          <w:numId w:val="1403"/>
         </w:numPr>
       </w:pPr>
       <w:r>
@@ -9557,7 +9593,7 @@
         <w:pStyle w:val="Compact"/>
         <w:numPr>
           <w:ilvl w:val="0"/>
-          <w:numId w:val="1403"/>
+          <w:numId w:val="1404"/>
         </w:numPr>
       </w:pPr>
       <w:r>
@@ -9569,7 +9605,7 @@
         <w:pStyle w:val="Compact"/>
         <w:numPr>
           <w:ilvl w:val="0"/>
-          <w:numId w:val="1404"/>
+          <w:numId w:val="1405"/>
         </w:numPr>
       </w:pPr>
       <w:r>
@@ -9581,7 +9617,7 @@
         <w:pStyle w:val="Compact"/>
         <w:numPr>
           <w:ilvl w:val="0"/>
-          <w:numId w:val="1405"/>
+          <w:numId w:val="1406"/>
         </w:numPr>
       </w:pPr>
       <w:r>
@@ -9603,7 +9639,7 @@
         <w:pStyle w:val="Compact"/>
         <w:numPr>
           <w:ilvl w:val="0"/>
-          <w:numId w:val="1406"/>
+          <w:numId w:val="1407"/>
         </w:numPr>
       </w:pPr>
       <w:r>
@@ -9615,7 +9651,7 @@
         <w:pStyle w:val="Compact"/>
         <w:numPr>
           <w:ilvl w:val="0"/>
-          <w:numId w:val="1407"/>
+          <w:numId w:val="1408"/>
         </w:numPr>
       </w:pPr>
       <w:r>
@@ -9627,7 +9663,7 @@
         <w:pStyle w:val="Compact"/>
         <w:numPr>
           <w:ilvl w:val="0"/>
-          <w:numId w:val="1408"/>
+          <w:numId w:val="1409"/>
         </w:numPr>
       </w:pPr>
       <w:r>
@@ -9639,7 +9675,7 @@
         <w:pStyle w:val="Compact"/>
         <w:numPr>
           <w:ilvl w:val="0"/>
-          <w:numId w:val="1409"/>
+          <w:numId w:val="1410"/>
         </w:numPr>
       </w:pPr>
       <w:r>
@@ -9651,7 +9687,7 @@
         <w:pStyle w:val="Compact"/>
         <w:numPr>
           <w:ilvl w:val="0"/>
-          <w:numId w:val="1410"/>
+          <w:numId w:val="1411"/>
         </w:numPr>
       </w:pPr>
       <w:r>
@@ -9663,7 +9699,7 @@
         <w:pStyle w:val="Compact"/>
         <w:numPr>
           <w:ilvl w:val="0"/>
-          <w:numId w:val="1411"/>
+          <w:numId w:val="1412"/>
         </w:numPr>
       </w:pPr>
       <w:r>
@@ -9675,7 +9711,7 @@
         <w:pStyle w:val="Compact"/>
         <w:numPr>
           <w:ilvl w:val="0"/>
-          <w:numId w:val="1412"/>
+          <w:numId w:val="1413"/>
         </w:numPr>
       </w:pPr>
       <w:r>
@@ -9687,7 +9723,7 @@
         <w:pStyle w:val="Compact"/>
         <w:numPr>
           <w:ilvl w:val="0"/>
-          <w:numId w:val="1413"/>
+          <w:numId w:val="1414"/>
         </w:numPr>
       </w:pPr>
       <w:r>
@@ -9699,7 +9735,7 @@
         <w:pStyle w:val="Compact"/>
         <w:numPr>
           <w:ilvl w:val="0"/>
-          <w:numId w:val="1414"/>
+          <w:numId w:val="1415"/>
         </w:numPr>
       </w:pPr>
       <w:r>
@@ -9731,7 +9767,7 @@
         <w:pStyle w:val="Compact"/>
         <w:numPr>
           <w:ilvl w:val="0"/>
-          <w:numId w:val="1415"/>
+          <w:numId w:val="1416"/>
         </w:numPr>
       </w:pPr>
       <w:r>
@@ -9743,7 +9779,7 @@
         <w:pStyle w:val="Compact"/>
         <w:numPr>
           <w:ilvl w:val="0"/>
-          <w:numId w:val="1416"/>
+          <w:numId w:val="1417"/>
         </w:numPr>
       </w:pPr>
       <w:r>
@@ -9755,7 +9791,7 @@
         <w:pStyle w:val="Compact"/>
         <w:numPr>
           <w:ilvl w:val="1"/>
-          <w:numId w:val="1417"/>
+          <w:numId w:val="1418"/>
         </w:numPr>
       </w:pPr>
       <w:r>
@@ -9767,7 +9803,7 @@
         <w:pStyle w:val="Compact"/>
         <w:numPr>
           <w:ilvl w:val="1"/>
-          <w:numId w:val="1417"/>
+          <w:numId w:val="1418"/>
         </w:numPr>
       </w:pPr>
       <w:r>
@@ -9779,7 +9815,7 @@
         <w:pStyle w:val="Compact"/>
         <w:numPr>
           <w:ilvl w:val="1"/>
-          <w:numId w:val="1417"/>
+          <w:numId w:val="1418"/>
         </w:numPr>
       </w:pPr>
       <w:r>
@@ -9791,7 +9827,7 @@
         <w:pStyle w:val="Compact"/>
         <w:numPr>
           <w:ilvl w:val="1"/>
-          <w:numId w:val="1417"/>
+          <w:numId w:val="1418"/>
         </w:numPr>
       </w:pPr>
       <w:r>
@@ -9803,7 +9839,7 @@
         <w:pStyle w:val="Compact"/>
         <w:numPr>
           <w:ilvl w:val="1"/>
-          <w:numId w:val="1417"/>
+          <w:numId w:val="1418"/>
         </w:numPr>
       </w:pPr>
       <w:r>
@@ -9815,7 +9851,7 @@
         <w:pStyle w:val="Compact"/>
         <w:numPr>
           <w:ilvl w:val="1"/>
-          <w:numId w:val="1417"/>
+          <w:numId w:val="1418"/>
         </w:numPr>
       </w:pPr>
       <w:r>
@@ -9827,7 +9863,7 @@
         <w:pStyle w:val="Compact"/>
         <w:numPr>
           <w:ilvl w:val="1"/>
-          <w:numId w:val="1417"/>
+          <w:numId w:val="1418"/>
         </w:numPr>
       </w:pPr>
       <w:r>
@@ -9839,7 +9875,7 @@
         <w:pStyle w:val="Compact"/>
         <w:numPr>
           <w:ilvl w:val="1"/>
-          <w:numId w:val="1417"/>
+          <w:numId w:val="1418"/>
         </w:numPr>
       </w:pPr>
       <w:r>
@@ -9851,7 +9887,7 @@
         <w:pStyle w:val="Compact"/>
         <w:numPr>
           <w:ilvl w:val="0"/>
-          <w:numId w:val="1418"/>
+          <w:numId w:val="1419"/>
         </w:numPr>
       </w:pPr>
       <w:r>
@@ -9872,7 +9908,7 @@
         <w:pStyle w:val="Compact"/>
         <w:numPr>
           <w:ilvl w:val="0"/>
-          <w:numId w:val="1419"/>
+          <w:numId w:val="1420"/>
         </w:numPr>
       </w:pPr>
       <w:r>
@@ -9896,7 +9932,7 @@
         <w:pStyle w:val="Compact"/>
         <w:numPr>
           <w:ilvl w:val="0"/>
-          <w:numId w:val="1420"/>
+          <w:numId w:val="1421"/>
         </w:numPr>
       </w:pPr>
       <w:r>
@@ -9908,7 +9944,7 @@
         <w:pStyle w:val="Compact"/>
         <w:numPr>
           <w:ilvl w:val="1"/>
-          <w:numId w:val="1421"/>
+          <w:numId w:val="1422"/>
         </w:numPr>
       </w:pPr>
       <w:r>
@@ -9920,7 +9956,7 @@
         <w:pStyle w:val="Compact"/>
         <w:numPr>
           <w:ilvl w:val="1"/>
-          <w:numId w:val="1421"/>
+          <w:numId w:val="1422"/>
         </w:numPr>
       </w:pPr>
       <w:r>
@@ -9932,7 +9968,7 @@
         <w:pStyle w:val="Compact"/>
         <w:numPr>
           <w:ilvl w:val="1"/>
-          <w:numId w:val="1421"/>
+          <w:numId w:val="1422"/>
         </w:numPr>
       </w:pPr>
       <w:r>
@@ -9944,7 +9980,7 @@
         <w:pStyle w:val="Compact"/>
         <w:numPr>
           <w:ilvl w:val="0"/>
-          <w:numId w:val="1422"/>
+          <w:numId w:val="1423"/>
         </w:numPr>
       </w:pPr>
       <w:r>
@@ -9968,7 +10004,7 @@
         <w:pStyle w:val="Compact"/>
         <w:numPr>
           <w:ilvl w:val="0"/>
-          <w:numId w:val="1423"/>
+          <w:numId w:val="1424"/>
         </w:numPr>
       </w:pPr>
       <w:r>
@@ -9980,7 +10016,7 @@
         <w:pStyle w:val="Compact"/>
         <w:numPr>
           <w:ilvl w:val="0"/>
-          <w:numId w:val="1424"/>
+          <w:numId w:val="1425"/>
         </w:numPr>
       </w:pPr>
       <w:r>
@@ -9992,7 +10028,7 @@
         <w:pStyle w:val="Compact"/>
         <w:numPr>
           <w:ilvl w:val="0"/>
-          <w:numId w:val="1425"/>
+          <w:numId w:val="1426"/>
         </w:numPr>
       </w:pPr>
       <w:r>
@@ -10014,7 +10050,7 @@
         <w:pStyle w:val="Compact"/>
         <w:numPr>
           <w:ilvl w:val="0"/>
-          <w:numId w:val="1426"/>
+          <w:numId w:val="1427"/>
         </w:numPr>
       </w:pPr>
       <w:r>
@@ -10026,7 +10062,7 @@
         <w:pStyle w:val="Compact"/>
         <w:numPr>
           <w:ilvl w:val="1"/>
-          <w:numId w:val="1427"/>
+          <w:numId w:val="1428"/>
         </w:numPr>
       </w:pPr>
       <w:r>
@@ -10038,7 +10074,7 @@
         <w:pStyle w:val="Compact"/>
         <w:numPr>
           <w:ilvl w:val="1"/>
-          <w:numId w:val="1427"/>
+          <w:numId w:val="1428"/>
         </w:numPr>
       </w:pPr>
       <w:r>
@@ -10050,7 +10086,7 @@
         <w:pStyle w:val="Compact"/>
         <w:numPr>
           <w:ilvl w:val="1"/>
-          <w:numId w:val="1427"/>
+          <w:numId w:val="1428"/>
         </w:numPr>
       </w:pPr>
       <w:r>
@@ -10062,7 +10098,7 @@
         <w:pStyle w:val="Compact"/>
         <w:numPr>
           <w:ilvl w:val="0"/>
-          <w:numId w:val="1428"/>
+          <w:numId w:val="1429"/>
         </w:numPr>
       </w:pPr>
       <w:r>
@@ -10074,7 +10110,7 @@
         <w:pStyle w:val="Compact"/>
         <w:numPr>
           <w:ilvl w:val="1"/>
-          <w:numId w:val="1429"/>
+          <w:numId w:val="1430"/>
         </w:numPr>
       </w:pPr>
       <w:r>
@@ -10086,7 +10122,7 @@
         <w:pStyle w:val="Compact"/>
         <w:numPr>
           <w:ilvl w:val="1"/>
-          <w:numId w:val="1429"/>
+          <w:numId w:val="1430"/>
         </w:numPr>
       </w:pPr>
       <w:r>
@@ -10098,7 +10134,7 @@
         <w:pStyle w:val="Compact"/>
         <w:numPr>
           <w:ilvl w:val="1"/>
-          <w:numId w:val="1429"/>
+          <w:numId w:val="1430"/>
         </w:numPr>
       </w:pPr>
       <w:r>
@@ -10110,7 +10146,7 @@
         <w:pStyle w:val="Compact"/>
         <w:numPr>
           <w:ilvl w:val="0"/>
-          <w:numId w:val="1430"/>
+          <w:numId w:val="1431"/>
         </w:numPr>
       </w:pPr>
       <w:r>
@@ -10122,7 +10158,7 @@
         <w:pStyle w:val="Compact"/>
         <w:numPr>
           <w:ilvl w:val="0"/>
-          <w:numId w:val="1431"/>
+          <w:numId w:val="1432"/>
         </w:numPr>
       </w:pPr>
       <w:r>
@@ -10134,7 +10170,7 @@
         <w:pStyle w:val="Compact"/>
         <w:numPr>
           <w:ilvl w:val="0"/>
-          <w:numId w:val="1432"/>
+          <w:numId w:val="1433"/>
         </w:numPr>
       </w:pPr>
       <w:r>
@@ -10156,7 +10192,7 @@
         <w:pStyle w:val="Compact"/>
         <w:numPr>
           <w:ilvl w:val="0"/>
-          <w:numId w:val="1433"/>
+          <w:numId w:val="1434"/>
         </w:numPr>
       </w:pPr>
       <w:r>
@@ -10177,7 +10213,7 @@
         <w:pStyle w:val="Compact"/>
         <w:numPr>
           <w:ilvl w:val="0"/>
-          <w:numId w:val="1434"/>
+          <w:numId w:val="1435"/>
         </w:numPr>
       </w:pPr>
       <w:r>
@@ -10189,7 +10225,7 @@
         <w:pStyle w:val="Compact"/>
         <w:numPr>
           <w:ilvl w:val="0"/>
-          <w:numId w:val="1435"/>
+          <w:numId w:val="1436"/>
         </w:numPr>
       </w:pPr>
       <w:r>
@@ -10201,7 +10237,7 @@
         <w:pStyle w:val="Compact"/>
         <w:numPr>
           <w:ilvl w:val="0"/>
-          <w:numId w:val="1436"/>
+          <w:numId w:val="1437"/>
         </w:numPr>
       </w:pPr>
       <w:r>
@@ -10213,7 +10249,7 @@
         <w:pStyle w:val="Compact"/>
         <w:numPr>
           <w:ilvl w:val="0"/>
-          <w:numId w:val="1437"/>
+          <w:numId w:val="1438"/>
         </w:numPr>
       </w:pPr>
       <w:r>
@@ -10225,7 +10261,7 @@
         <w:pStyle w:val="Compact"/>
         <w:numPr>
           <w:ilvl w:val="0"/>
-          <w:numId w:val="1438"/>
+          <w:numId w:val="1439"/>
         </w:numPr>
       </w:pPr>
       <w:r>
@@ -10237,7 +10273,7 @@
         <w:pStyle w:val="Compact"/>
         <w:numPr>
           <w:ilvl w:val="1"/>
-          <w:numId w:val="1439"/>
+          <w:numId w:val="1440"/>
         </w:numPr>
       </w:pPr>
       <w:r>
@@ -10249,7 +10285,7 @@
         <w:pStyle w:val="Compact"/>
         <w:numPr>
           <w:ilvl w:val="1"/>
-          <w:numId w:val="1439"/>
+          <w:numId w:val="1440"/>
         </w:numPr>
       </w:pPr>
       <w:r>
@@ -10261,7 +10297,7 @@
         <w:pStyle w:val="Compact"/>
         <w:numPr>
           <w:ilvl w:val="1"/>
-          <w:numId w:val="1439"/>
+          <w:numId w:val="1440"/>
         </w:numPr>
       </w:pPr>
       <w:r>
@@ -10273,7 +10309,7 @@
         <w:pStyle w:val="Compact"/>
         <w:numPr>
           <w:ilvl w:val="1"/>
-          <w:numId w:val="1439"/>
+          <w:numId w:val="1440"/>
         </w:numPr>
       </w:pPr>
       <w:r>
@@ -10285,7 +10321,7 @@
         <w:pStyle w:val="Compact"/>
         <w:numPr>
           <w:ilvl w:val="1"/>
-          <w:numId w:val="1439"/>
+          <w:numId w:val="1440"/>
         </w:numPr>
       </w:pPr>
       <w:r>
@@ -10297,7 +10333,7 @@
         <w:pStyle w:val="Compact"/>
         <w:numPr>
           <w:ilvl w:val="1"/>
-          <w:numId w:val="1439"/>
+          <w:numId w:val="1440"/>
         </w:numPr>
       </w:pPr>
       <w:r>
@@ -10309,7 +10345,7 @@
         <w:pStyle w:val="Compact"/>
         <w:numPr>
           <w:ilvl w:val="0"/>
-          <w:numId w:val="1440"/>
+          <w:numId w:val="1441"/>
         </w:numPr>
       </w:pPr>
       <w:r>
@@ -10321,7 +10357,7 @@
         <w:pStyle w:val="Compact"/>
         <w:numPr>
           <w:ilvl w:val="0"/>
-          <w:numId w:val="1441"/>
+          <w:numId w:val="1442"/>
         </w:numPr>
       </w:pPr>
       <w:r>
@@ -10343,7 +10379,7 @@
         <w:pStyle w:val="Compact"/>
         <w:numPr>
           <w:ilvl w:val="0"/>
-          <w:numId w:val="1442"/>
+          <w:numId w:val="1443"/>
         </w:numPr>
       </w:pPr>
       <w:r>
@@ -10355,7 +10391,7 @@
         <w:pStyle w:val="Compact"/>
         <w:numPr>
           <w:ilvl w:val="0"/>
-          <w:numId w:val="1443"/>
+          <w:numId w:val="1444"/>
         </w:numPr>
       </w:pPr>
       <w:r>
@@ -10367,7 +10403,7 @@
         <w:pStyle w:val="Compact"/>
         <w:numPr>
           <w:ilvl w:val="0"/>
-          <w:numId w:val="1444"/>
+          <w:numId w:val="1445"/>
         </w:numPr>
       </w:pPr>
       <w:r>
@@ -10379,7 +10415,7 @@
         <w:pStyle w:val="Compact"/>
         <w:numPr>
           <w:ilvl w:val="0"/>
-          <w:numId w:val="1445"/>
+          <w:numId w:val="1446"/>
         </w:numPr>
       </w:pPr>
       <w:r>
@@ -10391,7 +10427,7 @@
         <w:pStyle w:val="Compact"/>
         <w:numPr>
           <w:ilvl w:val="0"/>
-          <w:numId w:val="1446"/>
+          <w:numId w:val="1447"/>
         </w:numPr>
       </w:pPr>
       <w:r>
@@ -10413,7 +10449,7 @@
         <w:pStyle w:val="Compact"/>
         <w:numPr>
           <w:ilvl w:val="0"/>
-          <w:numId w:val="1447"/>
+          <w:numId w:val="1448"/>
         </w:numPr>
       </w:pPr>
       <w:r>
@@ -10425,7 +10461,7 @@
         <w:pStyle w:val="Compact"/>
         <w:numPr>
           <w:ilvl w:val="0"/>
-          <w:numId w:val="1448"/>
+          <w:numId w:val="1449"/>
         </w:numPr>
       </w:pPr>
       <w:r>
@@ -10437,7 +10473,7 @@
         <w:pStyle w:val="Compact"/>
         <w:numPr>
           <w:ilvl w:val="0"/>
-          <w:numId w:val="1449"/>
+          <w:numId w:val="1450"/>
         </w:numPr>
       </w:pPr>
       <w:r>
@@ -10449,7 +10485,7 @@
         <w:pStyle w:val="Compact"/>
         <w:numPr>
           <w:ilvl w:val="0"/>
-          <w:numId w:val="1450"/>
+          <w:numId w:val="1451"/>
         </w:numPr>
       </w:pPr>
       <w:r>
@@ -10461,7 +10497,7 @@
         <w:pStyle w:val="Compact"/>
         <w:numPr>
           <w:ilvl w:val="0"/>
-          <w:numId w:val="1451"/>
+          <w:numId w:val="1452"/>
         </w:numPr>
       </w:pPr>
       <w:r>
@@ -10473,7 +10509,7 @@
         <w:pStyle w:val="Compact"/>
         <w:numPr>
           <w:ilvl w:val="0"/>
-          <w:numId w:val="1452"/>
+          <w:numId w:val="1453"/>
         </w:numPr>
       </w:pPr>
       <w:r>
@@ -10485,7 +10521,7 @@
         <w:pStyle w:val="Compact"/>
         <w:numPr>
           <w:ilvl w:val="0"/>
-          <w:numId w:val="1453"/>
+          <w:numId w:val="1454"/>
         </w:numPr>
       </w:pPr>
       <w:r>
@@ -10497,7 +10533,7 @@
         <w:pStyle w:val="Compact"/>
         <w:numPr>
           <w:ilvl w:val="0"/>
-          <w:numId w:val="1454"/>
+          <w:numId w:val="1455"/>
         </w:numPr>
       </w:pPr>
       <w:r>
@@ -10529,7 +10565,7 @@
         <w:pStyle w:val="Compact"/>
         <w:numPr>
           <w:ilvl w:val="0"/>
-          <w:numId w:val="1455"/>
+          <w:numId w:val="1456"/>
         </w:numPr>
       </w:pPr>
       <w:r>
@@ -10541,7 +10577,7 @@
         <w:pStyle w:val="Compact"/>
         <w:numPr>
           <w:ilvl w:val="0"/>
-          <w:numId w:val="1456"/>
+          <w:numId w:val="1457"/>
         </w:numPr>
       </w:pPr>
       <w:r>
@@ -10553,7 +10589,7 @@
         <w:pStyle w:val="Compact"/>
         <w:numPr>
           <w:ilvl w:val="0"/>
-          <w:numId w:val="1457"/>
+          <w:numId w:val="1458"/>
         </w:numPr>
       </w:pPr>
       <w:r>
@@ -10565,7 +10601,7 @@
         <w:pStyle w:val="Compact"/>
         <w:numPr>
           <w:ilvl w:val="0"/>
-          <w:numId w:val="1458"/>
+          <w:numId w:val="1459"/>
         </w:numPr>
       </w:pPr>
       <w:r>
@@ -10577,7 +10613,7 @@
         <w:pStyle w:val="Compact"/>
         <w:numPr>
           <w:ilvl w:val="0"/>
-          <w:numId w:val="1459"/>
+          <w:numId w:val="1460"/>
         </w:numPr>
       </w:pPr>
       <w:r>
@@ -10589,7 +10625,7 @@
         <w:pStyle w:val="Compact"/>
         <w:numPr>
           <w:ilvl w:val="0"/>
-          <w:numId w:val="1460"/>
+          <w:numId w:val="1461"/>
         </w:numPr>
       </w:pPr>
       <w:r>
@@ -10601,7 +10637,7 @@
         <w:pStyle w:val="Compact"/>
         <w:numPr>
           <w:ilvl w:val="1"/>
-          <w:numId w:val="1461"/>
+          <w:numId w:val="1462"/>
         </w:numPr>
       </w:pPr>
       <w:r>
@@ -10628,7 +10664,7 @@
         <w:pStyle w:val="Compact"/>
         <w:numPr>
           <w:ilvl w:val="1"/>
-          <w:numId w:val="1461"/>
+          <w:numId w:val="1462"/>
         </w:numPr>
       </w:pPr>
       <w:r>
@@ -10665,7 +10701,7 @@
         <w:pStyle w:val="Compact"/>
         <w:numPr>
           <w:ilvl w:val="0"/>
-          <w:numId w:val="1462"/>
+          <w:numId w:val="1463"/>
         </w:numPr>
       </w:pPr>
       <w:r>
@@ -10707,7 +10743,7 @@
         <w:pStyle w:val="Compact"/>
         <w:numPr>
           <w:ilvl w:val="0"/>
-          <w:numId w:val="1463"/>
+          <w:numId w:val="1464"/>
         </w:numPr>
       </w:pPr>
       <w:r>
@@ -10731,7 +10767,7 @@
         <w:pStyle w:val="Compact"/>
         <w:numPr>
           <w:ilvl w:val="0"/>
-          <w:numId w:val="1464"/>
+          <w:numId w:val="1465"/>
         </w:numPr>
       </w:pPr>
       <w:r>
@@ -10755,7 +10791,7 @@
         <w:pStyle w:val="Compact"/>
         <w:numPr>
           <w:ilvl w:val="0"/>
-          <w:numId w:val="1465"/>
+          <w:numId w:val="1466"/>
         </w:numPr>
       </w:pPr>
       <w:r>
@@ -10767,7 +10803,7 @@
         <w:pStyle w:val="Compact"/>
         <w:numPr>
           <w:ilvl w:val="0"/>
-          <w:numId w:val="1466"/>
+          <w:numId w:val="1467"/>
         </w:numPr>
       </w:pPr>
       <w:r>
@@ -10779,7 +10815,7 @@
         <w:pStyle w:val="Compact"/>
         <w:numPr>
           <w:ilvl w:val="0"/>
-          <w:numId w:val="1467"/>
+          <w:numId w:val="1468"/>
         </w:numPr>
       </w:pPr>
       <w:r>
@@ -10791,7 +10827,7 @@
         <w:pStyle w:val="Compact"/>
         <w:numPr>
           <w:ilvl w:val="0"/>
-          <w:numId w:val="1468"/>
+          <w:numId w:val="1469"/>
         </w:numPr>
       </w:pPr>
       <w:r>
@@ -10803,7 +10839,7 @@
         <w:pStyle w:val="Compact"/>
         <w:numPr>
           <w:ilvl w:val="0"/>
-          <w:numId w:val="1469"/>
+          <w:numId w:val="1470"/>
         </w:numPr>
       </w:pPr>
       <w:r>
@@ -10815,7 +10851,7 @@
         <w:pStyle w:val="Compact"/>
         <w:numPr>
           <w:ilvl w:val="0"/>
-          <w:numId w:val="1470"/>
+          <w:numId w:val="1471"/>
         </w:numPr>
       </w:pPr>
       <w:r>
@@ -10827,7 +10863,7 @@
         <w:pStyle w:val="Compact"/>
         <w:numPr>
           <w:ilvl w:val="0"/>
-          <w:numId w:val="1471"/>
+          <w:numId w:val="1472"/>
         </w:numPr>
       </w:pPr>
       <w:r>
@@ -10839,7 +10875,7 @@
         <w:pStyle w:val="Compact"/>
         <w:numPr>
           <w:ilvl w:val="0"/>
-          <w:numId w:val="1472"/>
+          <w:numId w:val="1473"/>
         </w:numPr>
       </w:pPr>
       <w:r>
@@ -10851,7 +10887,7 @@
         <w:pStyle w:val="Compact"/>
         <w:numPr>
           <w:ilvl w:val="0"/>
-          <w:numId w:val="1473"/>
+          <w:numId w:val="1474"/>
         </w:numPr>
       </w:pPr>
       <w:r>
@@ -10863,7 +10899,7 @@
         <w:pStyle w:val="Compact"/>
         <w:numPr>
           <w:ilvl w:val="0"/>
-          <w:numId w:val="1474"/>
+          <w:numId w:val="1475"/>
         </w:numPr>
       </w:pPr>
       <w:r>
@@ -10875,7 +10911,7 @@
         <w:pStyle w:val="Compact"/>
         <w:numPr>
           <w:ilvl w:val="0"/>
-          <w:numId w:val="1475"/>
+          <w:numId w:val="1476"/>
         </w:numPr>
       </w:pPr>
       <w:r>
@@ -10902,7 +10938,7 @@
         <w:pStyle w:val="Compact"/>
         <w:numPr>
           <w:ilvl w:val="0"/>
-          <w:numId w:val="1476"/>
+          <w:numId w:val="1477"/>
         </w:numPr>
       </w:pPr>
       <w:r>
@@ -10914,7 +10950,7 @@
         <w:pStyle w:val="Compact"/>
         <w:numPr>
           <w:ilvl w:val="0"/>
-          <w:numId w:val="1477"/>
+          <w:numId w:val="1478"/>
         </w:numPr>
       </w:pPr>
       <w:r>
@@ -10936,7 +10972,7 @@
         <w:pStyle w:val="Compact"/>
         <w:numPr>
           <w:ilvl w:val="0"/>
-          <w:numId w:val="1478"/>
+          <w:numId w:val="1479"/>
         </w:numPr>
       </w:pPr>
       <w:r>
@@ -10948,7 +10984,7 @@
         <w:pStyle w:val="Compact"/>
         <w:numPr>
           <w:ilvl w:val="0"/>
-          <w:numId w:val="1479"/>
+          <w:numId w:val="1480"/>
         </w:numPr>
       </w:pPr>
       <w:r>
@@ -10975,7 +11011,7 @@
         <w:pStyle w:val="Compact"/>
         <w:numPr>
           <w:ilvl w:val="0"/>
-          <w:numId w:val="1480"/>
+          <w:numId w:val="1481"/>
         </w:numPr>
       </w:pPr>
       <w:r>
@@ -11002,7 +11038,7 @@
         <w:pStyle w:val="Compact"/>
         <w:numPr>
           <w:ilvl w:val="0"/>
-          <w:numId w:val="1481"/>
+          <w:numId w:val="1482"/>
         </w:numPr>
       </w:pPr>
       <w:r>
@@ -11029,7 +11065,7 @@
         <w:pStyle w:val="Compact"/>
         <w:numPr>
           <w:ilvl w:val="0"/>
-          <w:numId w:val="1482"/>
+          <w:numId w:val="1483"/>
         </w:numPr>
       </w:pPr>
       <w:r>
@@ -11041,7 +11077,7 @@
         <w:pStyle w:val="Compact"/>
         <w:numPr>
           <w:ilvl w:val="1"/>
-          <w:numId w:val="1483"/>
+          <w:numId w:val="1484"/>
         </w:numPr>
       </w:pPr>
       <w:r>
@@ -11053,7 +11089,7 @@
         <w:pStyle w:val="Compact"/>
         <w:numPr>
           <w:ilvl w:val="1"/>
-          <w:numId w:val="1483"/>
+          <w:numId w:val="1484"/>
         </w:numPr>
       </w:pPr>
       <w:r>
@@ -11065,7 +11101,7 @@
         <w:pStyle w:val="Compact"/>
         <w:numPr>
           <w:ilvl w:val="1"/>
-          <w:numId w:val="1483"/>
+          <w:numId w:val="1484"/>
         </w:numPr>
       </w:pPr>
       <w:r>
@@ -11077,7 +11113,7 @@
         <w:pStyle w:val="Compact"/>
         <w:numPr>
           <w:ilvl w:val="0"/>
-          <w:numId w:val="1484"/>
+          <w:numId w:val="1485"/>
         </w:numPr>
       </w:pPr>
       <w:r>
@@ -11089,7 +11125,7 @@
         <w:pStyle w:val="Compact"/>
         <w:numPr>
           <w:ilvl w:val="0"/>
-          <w:numId w:val="1485"/>
+          <w:numId w:val="1486"/>
         </w:numPr>
       </w:pPr>
       <w:r>
@@ -11101,7 +11137,7 @@
         <w:pStyle w:val="Compact"/>
         <w:numPr>
           <w:ilvl w:val="1"/>
-          <w:numId w:val="1486"/>
+          <w:numId w:val="1487"/>
         </w:numPr>
       </w:pPr>
       <w:r>
@@ -11113,7 +11149,7 @@
         <w:pStyle w:val="Compact"/>
         <w:numPr>
           <w:ilvl w:val="1"/>
-          <w:numId w:val="1486"/>
+          <w:numId w:val="1487"/>
         </w:numPr>
       </w:pPr>
       <w:r>
@@ -11125,7 +11161,7 @@
         <w:pStyle w:val="Compact"/>
         <w:numPr>
           <w:ilvl w:val="1"/>
-          <w:numId w:val="1486"/>
+          <w:numId w:val="1487"/>
         </w:numPr>
       </w:pPr>
       <w:r>
@@ -11137,7 +11173,7 @@
         <w:pStyle w:val="Compact"/>
         <w:numPr>
           <w:ilvl w:val="1"/>
-          <w:numId w:val="1486"/>
+          <w:numId w:val="1487"/>
         </w:numPr>
       </w:pPr>
       <w:r>
@@ -11149,7 +11185,7 @@
         <w:pStyle w:val="Compact"/>
         <w:numPr>
           <w:ilvl w:val="1"/>
-          <w:numId w:val="1486"/>
+          <w:numId w:val="1487"/>
         </w:numPr>
       </w:pPr>
       <w:r>
@@ -11161,7 +11197,7 @@
         <w:pStyle w:val="Compact"/>
         <w:numPr>
           <w:ilvl w:val="1"/>
-          <w:numId w:val="1486"/>
+          <w:numId w:val="1487"/>
         </w:numPr>
       </w:pPr>
       <w:r>
@@ -11173,7 +11209,7 @@
         <w:pStyle w:val="Compact"/>
         <w:numPr>
           <w:ilvl w:val="0"/>
-          <w:numId w:val="1487"/>
+          <w:numId w:val="1488"/>
         </w:numPr>
       </w:pPr>
       <w:r>
@@ -11185,7 +11221,7 @@
         <w:pStyle w:val="Compact"/>
         <w:numPr>
           <w:ilvl w:val="0"/>
-          <w:numId w:val="1488"/>
+          <w:numId w:val="1489"/>
         </w:numPr>
       </w:pPr>
       <w:r>
@@ -11197,7 +11233,7 @@
         <w:pStyle w:val="Compact"/>
         <w:numPr>
           <w:ilvl w:val="0"/>
-          <w:numId w:val="1489"/>
+          <w:numId w:val="1490"/>
         </w:numPr>
       </w:pPr>
       <w:r>
@@ -11219,7 +11255,7 @@
         <w:pStyle w:val="Compact"/>
         <w:numPr>
           <w:ilvl w:val="0"/>
-          <w:numId w:val="1490"/>
+          <w:numId w:val="1491"/>
         </w:numPr>
       </w:pPr>
       <w:r>
@@ -11231,7 +11267,7 @@
         <w:pStyle w:val="Compact"/>
         <w:numPr>
           <w:ilvl w:val="0"/>
-          <w:numId w:val="1491"/>
+          <w:numId w:val="1492"/>
         </w:numPr>
       </w:pPr>
       <w:r>
@@ -11243,7 +11279,7 @@
         <w:pStyle w:val="Compact"/>
         <w:numPr>
           <w:ilvl w:val="0"/>
-          <w:numId w:val="1492"/>
+          <w:numId w:val="1493"/>
         </w:numPr>
       </w:pPr>
       <w:r>
@@ -11255,7 +11291,7 @@
         <w:pStyle w:val="Compact"/>
         <w:numPr>
           <w:ilvl w:val="0"/>
-          <w:numId w:val="1493"/>
+          <w:numId w:val="1494"/>
         </w:numPr>
       </w:pPr>
       <w:r>
@@ -11267,7 +11303,7 @@
         <w:pStyle w:val="Compact"/>
         <w:numPr>
           <w:ilvl w:val="0"/>
-          <w:numId w:val="1494"/>
+          <w:numId w:val="1495"/>
         </w:numPr>
       </w:pPr>
       <w:r>
@@ -11279,7 +11315,7 @@
         <w:pStyle w:val="Compact"/>
         <w:numPr>
           <w:ilvl w:val="0"/>
-          <w:numId w:val="1495"/>
+          <w:numId w:val="1496"/>
         </w:numPr>
       </w:pPr>
       <w:r>
@@ -11301,7 +11337,7 @@
         <w:pStyle w:val="Compact"/>
         <w:numPr>
           <w:ilvl w:val="0"/>
-          <w:numId w:val="1496"/>
+          <w:numId w:val="1497"/>
         </w:numPr>
       </w:pPr>
       <w:r>
@@ -11313,7 +11349,7 @@
         <w:pStyle w:val="Compact"/>
         <w:numPr>
           <w:ilvl w:val="1"/>
-          <w:numId w:val="1497"/>
+          <w:numId w:val="1498"/>
         </w:numPr>
       </w:pPr>
       <w:r>
@@ -11325,7 +11361,7 @@
         <w:pStyle w:val="Compact"/>
         <w:numPr>
           <w:ilvl w:val="1"/>
-          <w:numId w:val="1497"/>
+          <w:numId w:val="1498"/>
         </w:numPr>
       </w:pPr>
       <w:r>
@@ -11337,7 +11373,7 @@
         <w:pStyle w:val="Compact"/>
         <w:numPr>
           <w:ilvl w:val="0"/>
-          <w:numId w:val="1498"/>
+          <w:numId w:val="1499"/>
         </w:numPr>
       </w:pPr>
       <w:r>
@@ -11349,7 +11385,7 @@
         <w:pStyle w:val="Compact"/>
         <w:numPr>
           <w:ilvl w:val="1"/>
-          <w:numId w:val="1499"/>
+          <w:numId w:val="1500"/>
         </w:numPr>
       </w:pPr>
       <w:r>
@@ -11361,7 +11397,7 @@
         <w:pStyle w:val="Compact"/>
         <w:numPr>
           <w:ilvl w:val="1"/>
-          <w:numId w:val="1499"/>
+          <w:numId w:val="1500"/>
         </w:numPr>
       </w:pPr>
       <w:r>
@@ -11373,7 +11409,7 @@
         <w:pStyle w:val="Compact"/>
         <w:numPr>
           <w:ilvl w:val="0"/>
-          <w:numId w:val="1500"/>
+          <w:numId w:val="1501"/>
         </w:numPr>
       </w:pPr>
       <w:r>
@@ -11385,7 +11421,7 @@
         <w:pStyle w:val="Compact"/>
         <w:numPr>
           <w:ilvl w:val="0"/>
-          <w:numId w:val="1501"/>
+          <w:numId w:val="1502"/>
         </w:numPr>
       </w:pPr>
       <w:r>
@@ -11397,7 +11433,7 @@
         <w:pStyle w:val="Compact"/>
         <w:numPr>
           <w:ilvl w:val="0"/>
-          <w:numId w:val="1502"/>
+          <w:numId w:val="1503"/>
         </w:numPr>
       </w:pPr>
       <w:r>
@@ -11409,7 +11445,7 @@
         <w:pStyle w:val="Compact"/>
         <w:numPr>
           <w:ilvl w:val="0"/>
-          <w:numId w:val="1503"/>
+          <w:numId w:val="1504"/>
         </w:numPr>
       </w:pPr>
       <w:r>
@@ -11431,7 +11467,7 @@
         <w:pStyle w:val="Compact"/>
         <w:numPr>
           <w:ilvl w:val="0"/>
-          <w:numId w:val="1504"/>
+          <w:numId w:val="1505"/>
         </w:numPr>
       </w:pPr>
       <w:r>
@@ -11443,7 +11479,7 @@
         <w:pStyle w:val="Compact"/>
         <w:numPr>
           <w:ilvl w:val="0"/>
-          <w:numId w:val="1505"/>
+          <w:numId w:val="1506"/>
         </w:numPr>
       </w:pPr>
       <w:r>
@@ -11455,7 +11491,7 @@
         <w:pStyle w:val="Compact"/>
         <w:numPr>
           <w:ilvl w:val="0"/>
-          <w:numId w:val="1506"/>
+          <w:numId w:val="1507"/>
         </w:numPr>
       </w:pPr>
       <w:r>
@@ -11467,7 +11503,7 @@
         <w:pStyle w:val="Compact"/>
         <w:numPr>
           <w:ilvl w:val="0"/>
-          <w:numId w:val="1507"/>
+          <w:numId w:val="1508"/>
         </w:numPr>
       </w:pPr>
       <w:r>
@@ -11479,7 +11515,7 @@
         <w:pStyle w:val="Compact"/>
         <w:numPr>
           <w:ilvl w:val="0"/>
-          <w:numId w:val="1508"/>
+          <w:numId w:val="1509"/>
         </w:numPr>
       </w:pPr>
       <w:r>
@@ -11491,7 +11527,7 @@
         <w:pStyle w:val="Compact"/>
         <w:numPr>
           <w:ilvl w:val="0"/>
-          <w:numId w:val="1509"/>
+          <w:numId w:val="1510"/>
         </w:numPr>
       </w:pPr>
       <w:r>
@@ -11503,7 +11539,7 @@
         <w:pStyle w:val="Compact"/>
         <w:numPr>
           <w:ilvl w:val="0"/>
-          <w:numId w:val="1510"/>
+          <w:numId w:val="1511"/>
         </w:numPr>
       </w:pPr>
       <w:r>
@@ -11515,7 +11551,7 @@
         <w:pStyle w:val="Compact"/>
         <w:numPr>
           <w:ilvl w:val="0"/>
-          <w:numId w:val="1511"/>
+          <w:numId w:val="1512"/>
         </w:numPr>
       </w:pPr>
       <w:r>
@@ -11527,7 +11563,7 @@
         <w:pStyle w:val="Compact"/>
         <w:numPr>
           <w:ilvl w:val="0"/>
-          <w:numId w:val="1512"/>
+          <w:numId w:val="1513"/>
         </w:numPr>
       </w:pPr>
       <w:r>
@@ -11549,7 +11585,7 @@
         <w:pStyle w:val="Compact"/>
         <w:numPr>
           <w:ilvl w:val="0"/>
-          <w:numId w:val="1513"/>
+          <w:numId w:val="1514"/>
         </w:numPr>
       </w:pPr>
       <w:r>
@@ -11561,7 +11597,7 @@
         <w:pStyle w:val="Compact"/>
         <w:numPr>
           <w:ilvl w:val="0"/>
-          <w:numId w:val="1514"/>
+          <w:numId w:val="1515"/>
         </w:numPr>
       </w:pPr>
       <w:r>
@@ -11573,7 +11609,7 @@
         <w:pStyle w:val="Compact"/>
         <w:numPr>
           <w:ilvl w:val="0"/>
-          <w:numId w:val="1515"/>
+          <w:numId w:val="1516"/>
         </w:numPr>
       </w:pPr>
       <w:r>
@@ -11585,7 +11621,7 @@
         <w:pStyle w:val="Compact"/>
         <w:numPr>
           <w:ilvl w:val="0"/>
-          <w:numId w:val="1516"/>
+          <w:numId w:val="1517"/>
         </w:numPr>
       </w:pPr>
       <w:r>
@@ -11597,7 +11633,7 @@
         <w:pStyle w:val="Compact"/>
         <w:numPr>
           <w:ilvl w:val="0"/>
-          <w:numId w:val="1517"/>
+          <w:numId w:val="1518"/>
         </w:numPr>
       </w:pPr>
       <w:r>
@@ -11609,7 +11645,7 @@
         <w:pStyle w:val="Compact"/>
         <w:numPr>
           <w:ilvl w:val="0"/>
-          <w:numId w:val="1518"/>
+          <w:numId w:val="1519"/>
         </w:numPr>
       </w:pPr>
       <w:r>
@@ -11621,7 +11657,7 @@
         <w:pStyle w:val="Compact"/>
         <w:numPr>
           <w:ilvl w:val="0"/>
-          <w:numId w:val="1519"/>
+          <w:numId w:val="1520"/>
         </w:numPr>
       </w:pPr>
       <w:r>
@@ -11633,7 +11669,7 @@
         <w:pStyle w:val="Compact"/>
         <w:numPr>
           <w:ilvl w:val="0"/>
-          <w:numId w:val="1520"/>
+          <w:numId w:val="1521"/>
         </w:numPr>
       </w:pPr>
       <w:r>
@@ -11645,7 +11681,7 @@
         <w:pStyle w:val="Compact"/>
         <w:numPr>
           <w:ilvl w:val="0"/>
-          <w:numId w:val="1521"/>
+          <w:numId w:val="1522"/>
         </w:numPr>
       </w:pPr>
       <w:r>
@@ -11657,7 +11693,7 @@
         <w:pStyle w:val="Compact"/>
         <w:numPr>
           <w:ilvl w:val="0"/>
-          <w:numId w:val="1522"/>
+          <w:numId w:val="1523"/>
         </w:numPr>
       </w:pPr>
       <w:r>
@@ -11684,7 +11720,7 @@
         <w:pStyle w:val="Compact"/>
         <w:numPr>
           <w:ilvl w:val="0"/>
-          <w:numId w:val="1523"/>
+          <w:numId w:val="1524"/>
         </w:numPr>
       </w:pPr>
       <w:r>
@@ -11705,7 +11741,7 @@
         <w:pStyle w:val="Compact"/>
         <w:numPr>
           <w:ilvl w:val="0"/>
-          <w:numId w:val="1524"/>
+          <w:numId w:val="1525"/>
         </w:numPr>
       </w:pPr>
       <w:r>
@@ -11727,7 +11763,7 @@
         <w:pStyle w:val="Compact"/>
         <w:numPr>
           <w:ilvl w:val="0"/>
-          <w:numId w:val="1525"/>
+          <w:numId w:val="1526"/>
         </w:numPr>
       </w:pPr>
       <w:r>
@@ -11739,7 +11775,7 @@
         <w:pStyle w:val="Compact"/>
         <w:numPr>
           <w:ilvl w:val="0"/>
-          <w:numId w:val="1526"/>
+          <w:numId w:val="1527"/>
         </w:numPr>
       </w:pPr>
       <w:r>
@@ -11751,7 +11787,7 @@
         <w:pStyle w:val="Compact"/>
         <w:numPr>
           <w:ilvl w:val="0"/>
-          <w:numId w:val="1527"/>
+          <w:numId w:val="1528"/>
         </w:numPr>
       </w:pPr>
       <w:r>
@@ -11763,7 +11799,7 @@
         <w:pStyle w:val="Compact"/>
         <w:numPr>
           <w:ilvl w:val="0"/>
-          <w:numId w:val="1528"/>
+          <w:numId w:val="1529"/>
         </w:numPr>
       </w:pPr>
       <w:r>
@@ -11775,7 +11811,7 @@
         <w:pStyle w:val="Compact"/>
         <w:numPr>
           <w:ilvl w:val="0"/>
-          <w:numId w:val="1529"/>
+          <w:numId w:val="1530"/>
         </w:numPr>
       </w:pPr>
       <w:r>
@@ -11787,7 +11823,7 @@
         <w:pStyle w:val="Compact"/>
         <w:numPr>
           <w:ilvl w:val="0"/>
-          <w:numId w:val="1530"/>
+          <w:numId w:val="1531"/>
         </w:numPr>
       </w:pPr>
       <w:r>
@@ -11799,7 +11835,7 @@
         <w:pStyle w:val="Compact"/>
         <w:numPr>
           <w:ilvl w:val="0"/>
-          <w:numId w:val="1531"/>
+          <w:numId w:val="1532"/>
         </w:numPr>
       </w:pPr>
       <w:r>
@@ -11811,7 +11847,7 @@
         <w:pStyle w:val="Compact"/>
         <w:numPr>
           <w:ilvl w:val="0"/>
-          <w:numId w:val="1532"/>
+          <w:numId w:val="1533"/>
         </w:numPr>
       </w:pPr>
       <w:r>
@@ -11833,7 +11869,7 @@
         <w:pStyle w:val="Compact"/>
         <w:numPr>
           <w:ilvl w:val="0"/>
-          <w:numId w:val="1533"/>
+          <w:numId w:val="1534"/>
         </w:numPr>
       </w:pPr>
       <w:r>
@@ -11845,7 +11881,7 @@
         <w:pStyle w:val="Compact"/>
         <w:numPr>
           <w:ilvl w:val="0"/>
-          <w:numId w:val="1534"/>
+          <w:numId w:val="1535"/>
         </w:numPr>
       </w:pPr>
       <w:r>
@@ -11857,7 +11893,7 @@
         <w:pStyle w:val="Compact"/>
         <w:numPr>
           <w:ilvl w:val="0"/>
-          <w:numId w:val="1535"/>
+          <w:numId w:val="1536"/>
         </w:numPr>
       </w:pPr>
       <w:r>
@@ -11869,7 +11905,7 @@
         <w:pStyle w:val="Compact"/>
         <w:numPr>
           <w:ilvl w:val="0"/>
-          <w:numId w:val="1536"/>
+          <w:numId w:val="1537"/>
         </w:numPr>
       </w:pPr>
       <w:r>
@@ -11881,7 +11917,7 @@
         <w:pStyle w:val="Compact"/>
         <w:numPr>
           <w:ilvl w:val="0"/>
-          <w:numId w:val="1537"/>
+          <w:numId w:val="1538"/>
         </w:numPr>
       </w:pPr>
       <w:r>
@@ -11893,7 +11929,7 @@
         <w:pStyle w:val="Compact"/>
         <w:numPr>
           <w:ilvl w:val="0"/>
-          <w:numId w:val="1538"/>
+          <w:numId w:val="1539"/>
         </w:numPr>
       </w:pPr>
       <w:r>
@@ -11905,7 +11941,7 @@
         <w:pStyle w:val="Compact"/>
         <w:numPr>
           <w:ilvl w:val="0"/>
-          <w:numId w:val="1539"/>
+          <w:numId w:val="1540"/>
         </w:numPr>
       </w:pPr>
       <w:r>
@@ -11917,7 +11953,7 @@
         <w:pStyle w:val="Compact"/>
         <w:numPr>
           <w:ilvl w:val="0"/>
-          <w:numId w:val="1540"/>
+          <w:numId w:val="1541"/>
         </w:numPr>
       </w:pPr>
       <w:r>
@@ -11929,7 +11965,7 @@
         <w:pStyle w:val="Compact"/>
         <w:numPr>
           <w:ilvl w:val="0"/>
-          <w:numId w:val="1541"/>
+          <w:numId w:val="1542"/>
         </w:numPr>
       </w:pPr>
       <w:r>
@@ -11941,7 +11977,7 @@
         <w:pStyle w:val="Compact"/>
         <w:numPr>
           <w:ilvl w:val="0"/>
-          <w:numId w:val="1542"/>
+          <w:numId w:val="1543"/>
         </w:numPr>
       </w:pPr>
       <w:r>
@@ -11953,7 +11989,7 @@
         <w:pStyle w:val="Compact"/>
         <w:numPr>
           <w:ilvl w:val="0"/>
-          <w:numId w:val="1543"/>
+          <w:numId w:val="1544"/>
         </w:numPr>
       </w:pPr>
       <w:r>
@@ -11965,7 +12001,7 @@
         <w:pStyle w:val="Compact"/>
         <w:numPr>
           <w:ilvl w:val="0"/>
-          <w:numId w:val="1544"/>
+          <w:numId w:val="1545"/>
         </w:numPr>
       </w:pPr>
       <w:r>
@@ -11977,7 +12013,7 @@
         <w:pStyle w:val="Compact"/>
         <w:numPr>
           <w:ilvl w:val="0"/>
-          <w:numId w:val="1545"/>
+          <w:numId w:val="1546"/>
         </w:numPr>
       </w:pPr>
       <w:r>
@@ -11989,7 +12025,7 @@
         <w:pStyle w:val="Compact"/>
         <w:numPr>
           <w:ilvl w:val="0"/>
-          <w:numId w:val="1546"/>
+          <w:numId w:val="1547"/>
         </w:numPr>
       </w:pPr>
       <w:r>
@@ -12001,7 +12037,7 @@
         <w:pStyle w:val="Compact"/>
         <w:numPr>
           <w:ilvl w:val="0"/>
-          <w:numId w:val="1547"/>
+          <w:numId w:val="1548"/>
         </w:numPr>
       </w:pPr>
       <w:r>
@@ -12033,7 +12069,7 @@
         <w:pStyle w:val="Compact"/>
         <w:numPr>
           <w:ilvl w:val="0"/>
-          <w:numId w:val="1548"/>
+          <w:numId w:val="1549"/>
         </w:numPr>
       </w:pPr>
       <w:r>
@@ -12045,7 +12081,7 @@
         <w:pStyle w:val="Compact"/>
         <w:numPr>
           <w:ilvl w:val="0"/>
-          <w:numId w:val="1549"/>
+          <w:numId w:val="1550"/>
         </w:numPr>
       </w:pPr>
       <w:r>
@@ -12057,7 +12093,7 @@
         <w:pStyle w:val="Compact"/>
         <w:numPr>
           <w:ilvl w:val="0"/>
-          <w:numId w:val="1550"/>
+          <w:numId w:val="1551"/>
         </w:numPr>
       </w:pPr>
       <w:r>
@@ -12069,7 +12105,7 @@
         <w:pStyle w:val="Compact"/>
         <w:numPr>
           <w:ilvl w:val="0"/>
-          <w:numId w:val="1551"/>
+          <w:numId w:val="1552"/>
         </w:numPr>
       </w:pPr>
       <w:r>
@@ -12081,7 +12117,7 @@
         <w:pStyle w:val="Compact"/>
         <w:numPr>
           <w:ilvl w:val="0"/>
-          <w:numId w:val="1552"/>
+          <w:numId w:val="1553"/>
         </w:numPr>
       </w:pPr>
       <w:r>
@@ -12093,7 +12129,7 @@
         <w:pStyle w:val="Compact"/>
         <w:numPr>
           <w:ilvl w:val="0"/>
-          <w:numId w:val="1553"/>
+          <w:numId w:val="1554"/>
         </w:numPr>
       </w:pPr>
       <w:r>
@@ -12105,7 +12141,7 @@
         <w:pStyle w:val="Compact"/>
         <w:numPr>
           <w:ilvl w:val="0"/>
-          <w:numId w:val="1554"/>
+          <w:numId w:val="1555"/>
         </w:numPr>
       </w:pPr>
       <w:r>
@@ -12117,7 +12153,7 @@
         <w:pStyle w:val="Compact"/>
         <w:numPr>
           <w:ilvl w:val="0"/>
-          <w:numId w:val="1555"/>
+          <w:numId w:val="1556"/>
         </w:numPr>
       </w:pPr>
       <w:r>
@@ -12129,7 +12165,7 @@
         <w:pStyle w:val="Compact"/>
         <w:numPr>
           <w:ilvl w:val="0"/>
-          <w:numId w:val="1556"/>
+          <w:numId w:val="1557"/>
         </w:numPr>
       </w:pPr>
       <w:r>
@@ -12141,7 +12177,7 @@
         <w:pStyle w:val="Compact"/>
         <w:numPr>
           <w:ilvl w:val="0"/>
-          <w:numId w:val="1557"/>
+          <w:numId w:val="1558"/>
         </w:numPr>
       </w:pPr>
       <w:r>
@@ -12153,7 +12189,7 @@
         <w:pStyle w:val="Compact"/>
         <w:numPr>
           <w:ilvl w:val="0"/>
-          <w:numId w:val="1558"/>
+          <w:numId w:val="1559"/>
         </w:numPr>
       </w:pPr>
       <w:r>
@@ -12165,7 +12201,7 @@
         <w:pStyle w:val="Compact"/>
         <w:numPr>
           <w:ilvl w:val="0"/>
-          <w:numId w:val="1559"/>
+          <w:numId w:val="1560"/>
         </w:numPr>
       </w:pPr>
       <w:r>
@@ -12177,7 +12213,7 @@
         <w:pStyle w:val="Compact"/>
         <w:numPr>
           <w:ilvl w:val="0"/>
-          <w:numId w:val="1560"/>
+          <w:numId w:val="1561"/>
         </w:numPr>
       </w:pPr>
       <w:r>
@@ -12214,7 +12250,7 @@
         <w:pStyle w:val="Compact"/>
         <w:numPr>
           <w:ilvl w:val="0"/>
-          <w:numId w:val="1561"/>
+          <w:numId w:val="1562"/>
         </w:numPr>
       </w:pPr>
       <w:r>
@@ -12226,7 +12262,7 @@
         <w:pStyle w:val="Compact"/>
         <w:numPr>
           <w:ilvl w:val="0"/>
-          <w:numId w:val="1562"/>
+          <w:numId w:val="1563"/>
         </w:numPr>
       </w:pPr>
       <w:r>
@@ -12253,7 +12289,7 @@
         <w:pStyle w:val="Compact"/>
         <w:numPr>
           <w:ilvl w:val="0"/>
-          <w:numId w:val="1563"/>
+          <w:numId w:val="1564"/>
         </w:numPr>
       </w:pPr>
       <w:r>
@@ -12265,7 +12301,7 @@
         <w:pStyle w:val="Compact"/>
         <w:numPr>
           <w:ilvl w:val="0"/>
-          <w:numId w:val="1564"/>
+          <w:numId w:val="1565"/>
         </w:numPr>
       </w:pPr>
       <w:r>
@@ -12277,7 +12313,7 @@
         <w:pStyle w:val="Compact"/>
         <w:numPr>
           <w:ilvl w:val="0"/>
-          <w:numId w:val="1565"/>
+          <w:numId w:val="1566"/>
         </w:numPr>
       </w:pPr>
       <w:r>
@@ -12289,7 +12325,7 @@
         <w:pStyle w:val="Compact"/>
         <w:numPr>
           <w:ilvl w:val="0"/>
-          <w:numId w:val="1566"/>
+          <w:numId w:val="1567"/>
         </w:numPr>
       </w:pPr>
       <w:r>
@@ -12301,7 +12337,7 @@
         <w:pStyle w:val="Compact"/>
         <w:numPr>
           <w:ilvl w:val="0"/>
-          <w:numId w:val="1567"/>
+          <w:numId w:val="1568"/>
         </w:numPr>
       </w:pPr>
       <w:r>
@@ -12313,7 +12349,7 @@
         <w:pStyle w:val="Compact"/>
         <w:numPr>
           <w:ilvl w:val="0"/>
-          <w:numId w:val="1568"/>
+          <w:numId w:val="1569"/>
         </w:numPr>
       </w:pPr>
       <w:r>
@@ -12335,7 +12371,7 @@
         <w:pStyle w:val="Compact"/>
         <w:numPr>
           <w:ilvl w:val="0"/>
-          <w:numId w:val="1569"/>
+          <w:numId w:val="1570"/>
         </w:numPr>
       </w:pPr>
       <w:r>
@@ -12347,7 +12383,7 @@
         <w:pStyle w:val="Compact"/>
         <w:numPr>
           <w:ilvl w:val="0"/>
-          <w:numId w:val="1570"/>
+          <w:numId w:val="1571"/>
         </w:numPr>
       </w:pPr>
       <w:r>
@@ -12359,7 +12395,7 @@
         <w:pStyle w:val="Compact"/>
         <w:numPr>
           <w:ilvl w:val="0"/>
-          <w:numId w:val="1571"/>
+          <w:numId w:val="1572"/>
         </w:numPr>
       </w:pPr>
       <w:r>
@@ -12371,7 +12407,7 @@
         <w:pStyle w:val="Compact"/>
         <w:numPr>
           <w:ilvl w:val="0"/>
-          <w:numId w:val="1572"/>
+          <w:numId w:val="1573"/>
         </w:numPr>
       </w:pPr>
       <w:r>
@@ -12383,7 +12419,7 @@
         <w:pStyle w:val="Compact"/>
         <w:numPr>
           <w:ilvl w:val="0"/>
-          <w:numId w:val="1573"/>
+          <w:numId w:val="1574"/>
         </w:numPr>
       </w:pPr>
       <w:r>
@@ -12395,7 +12431,7 @@
         <w:pStyle w:val="Compact"/>
         <w:numPr>
           <w:ilvl w:val="0"/>
-          <w:numId w:val="1574"/>
+          <w:numId w:val="1575"/>
         </w:numPr>
       </w:pPr>
       <w:r>
@@ -12407,7 +12443,7 @@
         <w:pStyle w:val="Compact"/>
         <w:numPr>
           <w:ilvl w:val="0"/>
-          <w:numId w:val="1575"/>
+          <w:numId w:val="1576"/>
         </w:numPr>
       </w:pPr>
       <w:r>
@@ -12419,7 +12455,7 @@
         <w:pStyle w:val="Compact"/>
         <w:numPr>
           <w:ilvl w:val="0"/>
-          <w:numId w:val="1576"/>
+          <w:numId w:val="1577"/>
         </w:numPr>
       </w:pPr>
       <w:r>
@@ -12431,7 +12467,7 @@
         <w:pStyle w:val="Compact"/>
         <w:numPr>
           <w:ilvl w:val="0"/>
-          <w:numId w:val="1577"/>
+          <w:numId w:val="1578"/>
         </w:numPr>
       </w:pPr>
       <w:r>
@@ -12454,7 +12490,7 @@
         <w:pStyle w:val="Compact"/>
         <w:numPr>
           <w:ilvl w:val="0"/>
-          <w:numId w:val="1578"/>
+          <w:numId w:val="1579"/>
         </w:numPr>
       </w:pPr>
       <w:r>
@@ -12466,7 +12502,7 @@
         <w:pStyle w:val="Compact"/>
         <w:numPr>
           <w:ilvl w:val="0"/>
-          <w:numId w:val="1579"/>
+          <w:numId w:val="1580"/>
         </w:numPr>
       </w:pPr>
       <w:r>
@@ -12478,7 +12514,7 @@
         <w:pStyle w:val="Compact"/>
         <w:numPr>
           <w:ilvl w:val="0"/>
-          <w:numId w:val="1580"/>
+          <w:numId w:val="1581"/>
         </w:numPr>
       </w:pPr>
       <w:r>
@@ -12490,7 +12526,7 @@
         <w:pStyle w:val="Compact"/>
         <w:numPr>
           <w:ilvl w:val="0"/>
-          <w:numId w:val="1581"/>
+          <w:numId w:val="1582"/>
         </w:numPr>
       </w:pPr>
       <w:r>
@@ -12502,7 +12538,7 @@
         <w:pStyle w:val="Compact"/>
         <w:numPr>
           <w:ilvl w:val="0"/>
-          <w:numId w:val="1582"/>
+          <w:numId w:val="1583"/>
         </w:numPr>
       </w:pPr>
       <w:r>
@@ -12514,7 +12550,7 @@
         <w:pStyle w:val="Compact"/>
         <w:numPr>
           <w:ilvl w:val="0"/>
-          <w:numId w:val="1583"/>
+          <w:numId w:val="1584"/>
         </w:numPr>
       </w:pPr>
       <w:r>
@@ -12526,7 +12562,7 @@
         <w:pStyle w:val="Compact"/>
         <w:numPr>
           <w:ilvl w:val="0"/>
-          <w:numId w:val="1584"/>
+          <w:numId w:val="1585"/>
         </w:numPr>
       </w:pPr>
       <w:r>
@@ -12538,7 +12574,7 @@
         <w:pStyle w:val="Compact"/>
         <w:numPr>
           <w:ilvl w:val="0"/>
-          <w:numId w:val="1585"/>
+          <w:numId w:val="1586"/>
         </w:numPr>
       </w:pPr>
       <w:r>
@@ -12550,7 +12586,7 @@
         <w:pStyle w:val="Compact"/>
         <w:numPr>
           <w:ilvl w:val="0"/>
-          <w:numId w:val="1586"/>
+          <w:numId w:val="1587"/>
         </w:numPr>
       </w:pPr>
       <w:r>
@@ -12562,7 +12598,7 @@
         <w:pStyle w:val="Compact"/>
         <w:numPr>
           <w:ilvl w:val="0"/>
-          <w:numId w:val="1587"/>
+          <w:numId w:val="1588"/>
         </w:numPr>
       </w:pPr>
       <w:r>
@@ -12574,7 +12610,7 @@
         <w:pStyle w:val="Compact"/>
         <w:numPr>
           <w:ilvl w:val="0"/>
-          <w:numId w:val="1588"/>
+          <w:numId w:val="1589"/>
         </w:numPr>
       </w:pPr>
       <w:r>
@@ -13636,23 +13672,23 @@
     <w:abstractNumId w:val="993"/>
   </w:num>
   <w:num w:numId="1181">
-    <w:abstractNumId w:val="992"/>
+    <w:abstractNumId w:val="993"/>
   </w:num>
   <w:num w:numId="1182">
     <w:abstractNumId w:val="993"/>
   </w:num>
   <w:num w:numId="1183">
+    <w:abstractNumId w:val="993"/>
+  </w:num>
+  <w:num w:numId="1184">
     <w:abstractNumId w:val="991"/>
   </w:num>
-  <w:num w:numId="1184">
-    <w:abstractNumId w:val="993"/>
-  </w:num>
   <w:num w:numId="1185">
+    <w:abstractNumId w:val="993"/>
+  </w:num>
+  <w:num w:numId="1186">
     <w:abstractNumId w:val="991"/>
   </w:num>
-  <w:num w:numId="1186">
-    <w:abstractNumId w:val="993"/>
-  </w:num>
   <w:num w:numId="1187">
     <w:abstractNumId w:val="993"/>
   </w:num>
@@ -13729,10 +13765,10 @@
     <w:abstractNumId w:val="993"/>
   </w:num>
   <w:num w:numId="1212">
-    <w:abstractNumId w:val="992"/>
+    <w:abstractNumId w:val="993"/>
   </w:num>
   <w:num w:numId="1213">
-    <w:abstractNumId w:val="992"/>
+    <w:abstractNumId w:val="993"/>
   </w:num>
   <w:num w:numId="1214">
     <w:abstractNumId w:val="993"/>
@@ -13750,7 +13786,7 @@
     <w:abstractNumId w:val="993"/>
   </w:num>
   <w:num w:numId="1219">
-    <w:abstractNumId w:val="992"/>
+    <w:abstractNumId w:val="993"/>
   </w:num>
   <w:num w:numId="1220">
     <w:abstractNumId w:val="992"/>
@@ -13768,11 +13804,11 @@
     <w:abstractNumId w:val="992"/>
   </w:num>
   <w:num w:numId="1225">
+    <w:abstractNumId w:val="992"/>
+  </w:num>
+  <w:num w:numId="1226">
     <w:abstractNumId w:val="991"/>
   </w:num>
-  <w:num w:numId="1226">
-    <w:abstractNumId w:val="992"/>
-  </w:num>
   <w:num w:numId="1227">
     <w:abstractNumId w:val="992"/>
   </w:num>
@@ -13876,7 +13912,7 @@
     <w:abstractNumId w:val="992"/>
   </w:num>
   <w:num w:numId="1261">
-    <w:abstractNumId w:val="993"/>
+    <w:abstractNumId w:val="992"/>
   </w:num>
   <w:num w:numId="1262">
     <w:abstractNumId w:val="993"/>
@@ -13900,7 +13936,7 @@
     <w:abstractNumId w:val="993"/>
   </w:num>
   <w:num w:numId="1269">
-    <w:abstractNumId w:val="992"/>
+    <w:abstractNumId w:val="993"/>
   </w:num>
   <w:num w:numId="1270">
     <w:abstractNumId w:val="992"/>
@@ -13924,11 +13960,11 @@
     <w:abstractNumId w:val="992"/>
   </w:num>
   <w:num w:numId="1277">
+    <w:abstractNumId w:val="992"/>
+  </w:num>
+  <w:num w:numId="1278">
     <w:abstractNumId w:val="991"/>
   </w:num>
-  <w:num w:numId="1278">
-    <w:abstractNumId w:val="992"/>
-  </w:num>
   <w:num w:numId="1279">
     <w:abstractNumId w:val="992"/>
   </w:num>
@@ -13990,10 +14026,10 @@
     <w:abstractNumId w:val="992"/>
   </w:num>
   <w:num w:numId="1299">
-    <w:abstractNumId w:val="993"/>
+    <w:abstractNumId w:val="992"/>
   </w:num>
   <w:num w:numId="1300">
-    <w:abstractNumId w:val="992"/>
+    <w:abstractNumId w:val="993"/>
   </w:num>
   <w:num w:numId="1301">
     <w:abstractNumId w:val="992"/>
@@ -14005,16 +14041,16 @@
     <w:abstractNumId w:val="992"/>
   </w:num>
   <w:num w:numId="1304">
-    <w:abstractNumId w:val="993"/>
+    <w:abstractNumId w:val="992"/>
   </w:num>
   <w:num w:numId="1305">
+    <w:abstractNumId w:val="993"/>
+  </w:num>
+  <w:num w:numId="1306">
     <w:abstractNumId w:val="991"/>
   </w:num>
-  <w:num w:numId="1306">
-    <w:abstractNumId w:val="993"/>
-  </w:num>
   <w:num w:numId="1307">
-    <w:abstractNumId w:val="992"/>
+    <w:abstractNumId w:val="993"/>
   </w:num>
   <w:num w:numId="1308">
     <w:abstractNumId w:val="992"/>
@@ -14047,13 +14083,13 @@
     <w:abstractNumId w:val="992"/>
   </w:num>
   <w:num w:numId="1318">
-    <w:abstractNumId w:val="993"/>
+    <w:abstractNumId w:val="992"/>
   </w:num>
   <w:num w:numId="1319">
     <w:abstractNumId w:val="993"/>
   </w:num>
   <w:num w:numId="1320">
-    <w:abstractNumId w:val="992"/>
+    <w:abstractNumId w:val="993"/>
   </w:num>
   <w:num w:numId="1321">
     <w:abstractNumId w:val="992"/>
@@ -14083,11 +14119,11 @@
     <w:abstractNumId w:val="992"/>
   </w:num>
   <w:num w:numId="1330">
+    <w:abstractNumId w:val="992"/>
+  </w:num>
+  <w:num w:numId="1331">
     <w:abstractNumId w:val="991"/>
   </w:num>
-  <w:num w:numId="1331">
-    <w:abstractNumId w:val="992"/>
-  </w:num>
   <w:num w:numId="1332">
     <w:abstractNumId w:val="992"/>
   </w:num>
@@ -14131,11 +14167,11 @@
     <w:abstractNumId w:val="992"/>
   </w:num>
   <w:num w:numId="1346">
+    <w:abstractNumId w:val="992"/>
+  </w:num>
+  <w:num w:numId="1347">
     <w:abstractNumId w:val="991"/>
   </w:num>
-  <w:num w:numId="1347">
-    <w:abstractNumId w:val="992"/>
-  </w:num>
   <w:num w:numId="1348">
     <w:abstractNumId w:val="992"/>
   </w:num>
@@ -14299,11 +14335,11 @@
     <w:abstractNumId w:val="992"/>
   </w:num>
   <w:num w:numId="1402">
+    <w:abstractNumId w:val="992"/>
+  </w:num>
+  <w:num w:numId="1403">
     <w:abstractNumId w:val="991"/>
   </w:num>
-  <w:num w:numId="1403">
-    <w:abstractNumId w:val="992"/>
-  </w:num>
   <w:num w:numId="1404">
     <w:abstractNumId w:val="992"/>
   </w:num>
@@ -14344,11 +14380,11 @@
     <w:abstractNumId w:val="992"/>
   </w:num>
   <w:num w:numId="1417">
+    <w:abstractNumId w:val="992"/>
+  </w:num>
+  <w:num w:numId="1418">
     <w:abstractNumId w:val="991"/>
   </w:num>
-  <w:num w:numId="1418">
-    <w:abstractNumId w:val="992"/>
-  </w:num>
   <w:num w:numId="1419">
     <w:abstractNumId w:val="992"/>
   </w:num>
@@ -14356,11 +14392,11 @@
     <w:abstractNumId w:val="992"/>
   </w:num>
   <w:num w:numId="1421">
+    <w:abstractNumId w:val="992"/>
+  </w:num>
+  <w:num w:numId="1422">
     <w:abstractNumId w:val="991"/>
   </w:num>
-  <w:num w:numId="1422">
-    <w:abstractNumId w:val="992"/>
-  </w:num>
   <w:num w:numId="1423">
     <w:abstractNumId w:val="992"/>
   </w:num>
@@ -14374,17 +14410,17 @@
     <w:abstractNumId w:val="992"/>
   </w:num>
   <w:num w:numId="1427">
+    <w:abstractNumId w:val="992"/>
+  </w:num>
+  <w:num w:numId="1428">
     <w:abstractNumId w:val="991"/>
   </w:num>
-  <w:num w:numId="1428">
-    <w:abstractNumId w:val="992"/>
-  </w:num>
   <w:num w:numId="1429">
+    <w:abstractNumId w:val="992"/>
+  </w:num>
+  <w:num w:numId="1430">
     <w:abstractNumId w:val="991"/>
   </w:num>
-  <w:num w:numId="1430">
-    <w:abstractNumId w:val="992"/>
-  </w:num>
   <w:num w:numId="1431">
     <w:abstractNumId w:val="992"/>
   </w:num>
@@ -14410,11 +14446,11 @@
     <w:abstractNumId w:val="992"/>
   </w:num>
   <w:num w:numId="1439">
+    <w:abstractNumId w:val="992"/>
+  </w:num>
+  <w:num w:numId="1440">
     <w:abstractNumId w:val="991"/>
   </w:num>
-  <w:num w:numId="1440">
-    <w:abstractNumId w:val="992"/>
-  </w:num>
   <w:num w:numId="1441">
     <w:abstractNumId w:val="992"/>
   </w:num>
@@ -14476,11 +14512,11 @@
     <w:abstractNumId w:val="992"/>
   </w:num>
   <w:num w:numId="1461">
+    <w:abstractNumId w:val="992"/>
+  </w:num>
+  <w:num w:numId="1462">
     <w:abstractNumId w:val="991"/>
   </w:num>
-  <w:num w:numId="1462">
-    <w:abstractNumId w:val="992"/>
-  </w:num>
   <w:num w:numId="1463">
     <w:abstractNumId w:val="992"/>
   </w:num>
@@ -14542,20 +14578,20 @@
     <w:abstractNumId w:val="992"/>
   </w:num>
   <w:num w:numId="1483">
+    <w:abstractNumId w:val="992"/>
+  </w:num>
+  <w:num w:numId="1484">
     <w:abstractNumId w:val="991"/>
   </w:num>
-  <w:num w:numId="1484">
-    <w:abstractNumId w:val="992"/>
-  </w:num>
   <w:num w:numId="1485">
     <w:abstractNumId w:val="992"/>
   </w:num>
   <w:num w:numId="1486">
+    <w:abstractNumId w:val="992"/>
+  </w:num>
+  <w:num w:numId="1487">
     <w:abstractNumId w:val="991"/>
   </w:num>
-  <w:num w:numId="1487">
-    <w:abstractNumId w:val="992"/>
-  </w:num>
   <w:num w:numId="1488">
     <w:abstractNumId w:val="992"/>
   </w:num>
@@ -14584,17 +14620,17 @@
     <w:abstractNumId w:val="992"/>
   </w:num>
   <w:num w:numId="1497">
+    <w:abstractNumId w:val="992"/>
+  </w:num>
+  <w:num w:numId="1498">
     <w:abstractNumId w:val="991"/>
   </w:num>
-  <w:num w:numId="1498">
-    <w:abstractNumId w:val="992"/>
-  </w:num>
   <w:num w:numId="1499">
+    <w:abstractNumId w:val="992"/>
+  </w:num>
+  <w:num w:numId="1500">
     <w:abstractNumId w:val="991"/>
   </w:num>
-  <w:num w:numId="1500">
-    <w:abstractNumId w:val="992"/>
-  </w:num>
   <w:num w:numId="1501">
     <w:abstractNumId w:val="992"/>
   </w:num>
@@ -14857,6 +14893,9 @@
     <w:abstractNumId w:val="992"/>
   </w:num>
   <w:num w:numId="1588">
+    <w:abstractNumId w:val="992"/>
+  </w:num>
+  <w:num w:numId="1589">
     <w:abstractNumId w:val="992"/>
   </w:num>
 </w:numbering>

</xml_diff>

<commit_message>
Implement M2.1 lead campaign scoping
</commit_message>
<xml_diff>
--- a/MASTER_M1_M2_DELIVERY_CHECKLIST.docx
+++ b/MASTER_M1_M2_DELIVERY_CHECKLIST.docx
@@ -10,7 +10,7 @@
         <w:t xml:space="preserve">© BuyReadySite.com</w:t>
       </w:r>
     </w:p>
-    <w:bookmarkStart w:id="84" w:name="X3d74ce0b4fd94f465ac7edf34b08aa6d5ff209b"/>
+    <w:bookmarkStart w:id="85" w:name="X3d74ce0b4fd94f465ac7edf34b08aa6d5ff209b"/>
     <w:p>
       <w:pPr>
         <w:pStyle w:val="Heading1"/>
@@ -505,7 +505,7 @@
               <w:jc w:val="right"/>
             </w:pPr>
             <w:r>
-              <w:t xml:space="preserve">0%</w:t>
+              <w:t xml:space="preserve">6%</w:t>
             </w:r>
           </w:p>
         </w:tc>
@@ -516,7 +516,7 @@
               <w:pStyle w:val="Compact"/>
             </w:pPr>
             <w:r>
-              <w:t xml:space="preserve">Not started</w:t>
+              <w:t xml:space="preserve">Implementation + API scope tests/build passed; browser admin/rep smoke pending</w:t>
             </w:r>
           </w:p>
         </w:tc>
@@ -709,7 +709,7 @@
                 <w:b/>
                 <w:bCs/>
               </w:rPr>
-              <w:t xml:space="preserve">40%</w:t>
+              <w:t xml:space="preserve">46%</w:t>
             </w:r>
           </w:p>
         </w:tc>
@@ -724,7 +724,7 @@
                 <w:b/>
                 <w:bCs/>
               </w:rPr>
-              <w:t xml:space="preserve">M1.1 auth, M1.2 base parity, M1.3 parity, and M1.4 B.6 stacking chip update added</w:t>
+              <w:t xml:space="preserve">M2.1 access/source implementation added after M1.3; browser smoke gates remain</w:t>
             </w:r>
           </w:p>
         </w:tc>
@@ -9356,7 +9356,7 @@
     </w:p>
     <w:bookmarkEnd w:id="55"/>
     <w:bookmarkEnd w:id="56"/>
-    <w:bookmarkStart w:id="61" w:name="Xa989490dca5dab2d86ca3d9b72c2ded4f0c555a"/>
+    <w:bookmarkStart w:id="62" w:name="Xa989490dca5dab2d86ca3d9b72c2ded4f0c555a"/>
     <w:p>
       <w:pPr>
         <w:pStyle w:val="Heading2"/>
@@ -9365,12 +9365,211 @@
         <w:t xml:space="preserve">M2.1 — Leads/Campaign Access And Source Fixes</w:t>
       </w:r>
     </w:p>
-    <w:bookmarkStart w:id="57" w:name="leads-ownership-bug"/>
+    <w:bookmarkStart w:id="57" w:name="implementation-evidence-2026-05-02-3"/>
     <w:p>
       <w:pPr>
         <w:pStyle w:val="Heading3"/>
       </w:pPr>
       <w:r>
+        <w:t xml:space="preserve">Implementation evidence — 2026-05-02</w:t>
+      </w:r>
+    </w:p>
+    <w:p>
+      <w:pPr>
+        <w:pStyle w:val="Compact"/>
+        <w:numPr>
+          <w:ilvl w:val="0"/>
+          <w:numId w:val="1396"/>
+        </w:numPr>
+      </w:pPr>
+      <w:r>
+        <w:t xml:space="preserve">Affected files:</w:t>
+      </w:r>
+      <w:r>
+        <w:t xml:space="preserve"> </w:t>
+      </w:r>
+      <w:r>
+        <w:rPr>
+          <w:rStyle w:val="VerbatimChar"/>
+        </w:rPr>
+        <w:t xml:space="preserve">server/src/controllers/leadController.ts</w:t>
+      </w:r>
+      <w:r>
+        <w:t xml:space="preserve">,</w:t>
+      </w:r>
+      <w:r>
+        <w:t xml:space="preserve"> </w:t>
+      </w:r>
+      <w:r>
+        <w:rPr>
+          <w:rStyle w:val="VerbatimChar"/>
+        </w:rPr>
+        <w:t xml:space="preserve">server/src/controllers/campaignController.ts</w:t>
+      </w:r>
+      <w:r>
+        <w:t xml:space="preserve">,</w:t>
+      </w:r>
+      <w:r>
+        <w:t xml:space="preserve"> </w:t>
+      </w:r>
+      <w:r>
+        <w:rPr>
+          <w:rStyle w:val="VerbatimChar"/>
+        </w:rPr>
+        <w:t xml:space="preserve">client/src/pages/LeadsPage.tsx</w:t>
+      </w:r>
+      <w:r>
+        <w:t xml:space="preserve">,</w:t>
+      </w:r>
+      <w:r>
+        <w:t xml:space="preserve"> </w:t>
+      </w:r>
+      <w:r>
+        <w:rPr>
+          <w:rStyle w:val="VerbatimChar"/>
+        </w:rPr>
+        <w:t xml:space="preserve">client/src/pages/CampaignsPage.tsx</w:t>
+      </w:r>
+      <w:r>
+        <w:t xml:space="preserve">,</w:t>
+      </w:r>
+      <w:r>
+        <w:t xml:space="preserve"> </w:t>
+      </w:r>
+      <w:r>
+        <w:rPr>
+          <w:rStyle w:val="VerbatimChar"/>
+        </w:rPr>
+        <w:t xml:space="preserve">server/tests/leadCampaignScope.test.ts</w:t>
+      </w:r>
+      <w:r>
+        <w:t xml:space="preserve">.</w:t>
+      </w:r>
+    </w:p>
+    <w:p>
+      <w:pPr>
+        <w:pStyle w:val="Compact"/>
+        <w:numPr>
+          <w:ilvl w:val="0"/>
+          <w:numId w:val="1397"/>
+        </w:numPr>
+      </w:pPr>
+      <w:r>
+        <w:t xml:space="preserve">Regression surface: Leads list/get/update/import/bulk/tag/export scope; Campaigns list/get/create/update/start/pause/cancel/analytics/sync scope; Campaigns delete UI visibility; Leads Source display fallback.</w:t>
+      </w:r>
+    </w:p>
+    <w:p>
+      <w:pPr>
+        <w:pStyle w:val="Compact"/>
+        <w:numPr>
+          <w:ilvl w:val="0"/>
+          <w:numId w:val="1398"/>
+        </w:numPr>
+      </w:pPr>
+      <w:r>
+        <w:t xml:space="preserve">Focused tests passed:</w:t>
+      </w:r>
+      <w:r>
+        <w:t xml:space="preserve"> </w:t>
+      </w:r>
+      <w:r>
+        <w:rPr>
+          <w:rStyle w:val="VerbatimChar"/>
+        </w:rPr>
+        <w:t xml:space="preserve">cd server &amp;&amp; npx vitest run tests/leadCampaignScope.test.ts</w:t>
+      </w:r>
+      <w:r>
+        <w:t xml:space="preserve"> </w:t>
+      </w:r>
+      <w:r>
+        <w:t xml:space="preserve">— 5/5 passed.</w:t>
+      </w:r>
+    </w:p>
+    <w:p>
+      <w:pPr>
+        <w:pStyle w:val="Compact"/>
+        <w:numPr>
+          <w:ilvl w:val="0"/>
+          <w:numId w:val="1399"/>
+        </w:numPr>
+      </w:pPr>
+      <w:r>
+        <w:t xml:space="preserve">Build passed: root</w:t>
+      </w:r>
+      <w:r>
+        <w:t xml:space="preserve"> </w:t>
+      </w:r>
+      <w:r>
+        <w:rPr>
+          <w:rStyle w:val="VerbatimChar"/>
+        </w:rPr>
+        <w:t xml:space="preserve">npm run build</w:t>
+      </w:r>
+      <w:r>
+        <w:t xml:space="preserve"> </w:t>
+      </w:r>
+      <w:r>
+        <w:t xml:space="preserve">— server</w:t>
+      </w:r>
+      <w:r>
+        <w:t xml:space="preserve"> </w:t>
+      </w:r>
+      <w:r>
+        <w:rPr>
+          <w:rStyle w:val="VerbatimChar"/>
+        </w:rPr>
+        <w:t xml:space="preserve">tsc</w:t>
+      </w:r>
+      <w:r>
+        <w:t xml:space="preserve"> </w:t>
+      </w:r>
+      <w:r>
+        <w:t xml:space="preserve">+ client</w:t>
+      </w:r>
+      <w:r>
+        <w:t xml:space="preserve"> </w:t>
+      </w:r>
+      <w:r>
+        <w:rPr>
+          <w:rStyle w:val="VerbatimChar"/>
+        </w:rPr>
+        <w:t xml:space="preserve">tsc &amp;&amp; vite build</w:t>
+      </w:r>
+      <w:r>
+        <w:t xml:space="preserve">.</w:t>
+      </w:r>
+    </w:p>
+    <w:p>
+      <w:pPr>
+        <w:pStyle w:val="Compact"/>
+        <w:numPr>
+          <w:ilvl w:val="0"/>
+          <w:numId w:val="1400"/>
+        </w:numPr>
+      </w:pPr>
+      <w:r>
+        <w:t xml:space="preserve">Browser smoke pending for admin/rep Leads and Campaigns views.</w:t>
+      </w:r>
+    </w:p>
+    <w:p>
+      <w:pPr>
+        <w:pStyle w:val="Compact"/>
+        <w:numPr>
+          <w:ilvl w:val="0"/>
+          <w:numId w:val="1401"/>
+        </w:numPr>
+      </w:pPr>
+      <w:r>
+        <w:t xml:space="preserve">CSV import smoke pending with two real rep accounts.</w:t>
+      </w:r>
+    </w:p>
+    <w:bookmarkEnd w:id="57"/>
+    <w:bookmarkStart w:id="58" w:name="leads-ownership-bug"/>
+    <w:p>
+      <w:pPr>
+        <w:pStyle w:val="Heading3"/>
+      </w:pPr>
+      <w:r>
         <w:t xml:space="preserve">Leads ownership bug</w:t>
       </w:r>
     </w:p>
@@ -9379,7 +9578,7 @@
         <w:pStyle w:val="Compact"/>
         <w:numPr>
           <w:ilvl w:val="0"/>
-          <w:numId w:val="1396"/>
+          <w:numId w:val="1402"/>
         </w:numPr>
       </w:pPr>
       <w:r>
@@ -9430,7 +9629,7 @@
         <w:pStyle w:val="Compact"/>
         <w:numPr>
           <w:ilvl w:val="0"/>
-          <w:numId w:val="1397"/>
+          <w:numId w:val="1403"/>
         </w:numPr>
       </w:pPr>
       <w:r>
@@ -9457,7 +9656,7 @@
         <w:pStyle w:val="Compact"/>
         <w:numPr>
           <w:ilvl w:val="0"/>
-          <w:numId w:val="1398"/>
+          <w:numId w:val="1404"/>
         </w:numPr>
       </w:pPr>
       <w:r>
@@ -9469,7 +9668,7 @@
         <w:pStyle w:val="Compact"/>
         <w:numPr>
           <w:ilvl w:val="0"/>
-          <w:numId w:val="1399"/>
+          <w:numId w:val="1405"/>
         </w:numPr>
       </w:pPr>
       <w:r>
@@ -9496,7 +9695,7 @@
         <w:pStyle w:val="Compact"/>
         <w:numPr>
           <w:ilvl w:val="0"/>
-          <w:numId w:val="1400"/>
+          <w:numId w:val="1406"/>
         </w:numPr>
       </w:pPr>
       <w:r>
@@ -9508,7 +9707,7 @@
         <w:pStyle w:val="Compact"/>
         <w:numPr>
           <w:ilvl w:val="0"/>
-          <w:numId w:val="1401"/>
+          <w:numId w:val="1407"/>
         </w:numPr>
       </w:pPr>
       <w:r>
@@ -9520,15 +9719,15 @@
         <w:pStyle w:val="Compact"/>
         <w:numPr>
           <w:ilvl w:val="0"/>
-          <w:numId w:val="1402"/>
-        </w:numPr>
-      </w:pPr>
-      <w:r>
-        <w:t xml:space="preserve">Manager behavior documented and tested.</w:t>
-      </w:r>
-    </w:p>
-    <w:bookmarkEnd w:id="57"/>
-    <w:bookmarkStart w:id="58" w:name="campaign-ownership-bug"/>
+          <w:numId w:val="1408"/>
+        </w:numPr>
+      </w:pPr>
+      <w:r>
+        <w:t xml:space="preserve">Manager behavior documented: manager keeps admin-like global visibility for M2.1 unless JB narrows manager scope later.</w:t>
+      </w:r>
+    </w:p>
+    <w:bookmarkEnd w:id="58"/>
+    <w:bookmarkStart w:id="59" w:name="campaign-ownership-bug"/>
     <w:p>
       <w:pPr>
         <w:pStyle w:val="Heading3"/>
@@ -9542,7 +9741,7 @@
         <w:pStyle w:val="Compact"/>
         <w:numPr>
           <w:ilvl w:val="0"/>
-          <w:numId w:val="1403"/>
+          <w:numId w:val="1409"/>
         </w:numPr>
       </w:pPr>
       <w:r>
@@ -9566,7 +9765,7 @@
         <w:pStyle w:val="Compact"/>
         <w:numPr>
           <w:ilvl w:val="0"/>
-          <w:numId w:val="1404"/>
+          <w:numId w:val="1410"/>
         </w:numPr>
       </w:pPr>
       <w:r>
@@ -9590,7 +9789,7 @@
         <w:pStyle w:val="Compact"/>
         <w:numPr>
           <w:ilvl w:val="0"/>
-          <w:numId w:val="1405"/>
+          <w:numId w:val="1411"/>
         </w:numPr>
       </w:pPr>
       <w:r>
@@ -9602,7 +9801,7 @@
         <w:pStyle w:val="Compact"/>
         <w:numPr>
           <w:ilvl w:val="0"/>
-          <w:numId w:val="1406"/>
+          <w:numId w:val="1412"/>
         </w:numPr>
       </w:pPr>
       <w:r>
@@ -9614,7 +9813,7 @@
         <w:pStyle w:val="Compact"/>
         <w:numPr>
           <w:ilvl w:val="0"/>
-          <w:numId w:val="1407"/>
+          <w:numId w:val="1413"/>
         </w:numPr>
       </w:pPr>
       <w:r>
@@ -9626,7 +9825,7 @@
         <w:pStyle w:val="Compact"/>
         <w:numPr>
           <w:ilvl w:val="0"/>
-          <w:numId w:val="1408"/>
+          <w:numId w:val="1414"/>
         </w:numPr>
       </w:pPr>
       <w:r>
@@ -9642,8 +9841,8 @@
         <w:t xml:space="preserve">remains compatible.</w:t>
       </w:r>
     </w:p>
-    <w:bookmarkEnd w:id="58"/>
-    <w:bookmarkStart w:id="59" w:name="source-readable-fix"/>
+    <w:bookmarkEnd w:id="59"/>
+    <w:bookmarkStart w:id="60" w:name="source-readable-fix"/>
     <w:p>
       <w:pPr>
         <w:pStyle w:val="Heading3"/>
@@ -9657,7 +9856,7 @@
         <w:pStyle w:val="Compact"/>
         <w:numPr>
           <w:ilvl w:val="0"/>
-          <w:numId w:val="1409"/>
+          <w:numId w:val="1415"/>
         </w:numPr>
       </w:pPr>
       <w:r>
@@ -9669,7 +9868,7 @@
         <w:pStyle w:val="Compact"/>
         <w:numPr>
           <w:ilvl w:val="0"/>
-          <w:numId w:val="1410"/>
+          <w:numId w:val="1416"/>
         </w:numPr>
       </w:pPr>
       <w:r>
@@ -9681,7 +9880,7 @@
         <w:pStyle w:val="Compact"/>
         <w:numPr>
           <w:ilvl w:val="1"/>
-          <w:numId w:val="1411"/>
+          <w:numId w:val="1417"/>
         </w:numPr>
       </w:pPr>
       <w:r>
@@ -9699,7 +9898,7 @@
         <w:pStyle w:val="Compact"/>
         <w:numPr>
           <w:ilvl w:val="1"/>
-          <w:numId w:val="1411"/>
+          <w:numId w:val="1417"/>
         </w:numPr>
       </w:pPr>
       <w:r>
@@ -9717,7 +9916,7 @@
         <w:pStyle w:val="Compact"/>
         <w:numPr>
           <w:ilvl w:val="1"/>
-          <w:numId w:val="1411"/>
+          <w:numId w:val="1417"/>
         </w:numPr>
       </w:pPr>
       <w:r>
@@ -9735,7 +9934,7 @@
         <w:pStyle w:val="Compact"/>
         <w:numPr>
           <w:ilvl w:val="1"/>
-          <w:numId w:val="1411"/>
+          <w:numId w:val="1417"/>
         </w:numPr>
       </w:pPr>
       <w:r>
@@ -9753,7 +9952,7 @@
         <w:pStyle w:val="Compact"/>
         <w:numPr>
           <w:ilvl w:val="0"/>
-          <w:numId w:val="1412"/>
+          <w:numId w:val="1418"/>
         </w:numPr>
       </w:pPr>
       <w:r>
@@ -9765,7 +9964,7 @@
         <w:pStyle w:val="Compact"/>
         <w:numPr>
           <w:ilvl w:val="0"/>
-          <w:numId w:val="1413"/>
+          <w:numId w:val="1419"/>
         </w:numPr>
       </w:pPr>
       <w:r>
@@ -9777,15 +9976,15 @@
         <w:pStyle w:val="Compact"/>
         <w:numPr>
           <w:ilvl w:val="0"/>
-          <w:numId w:val="1414"/>
+          <w:numId w:val="1420"/>
         </w:numPr>
       </w:pPr>
       <w:r>
         <w:t xml:space="preserve">Campaign-created leads preserve campaign/list lineage.</w:t>
       </w:r>
     </w:p>
-    <w:bookmarkEnd w:id="59"/>
-    <w:bookmarkStart w:id="60" w:name="m2.1-testing-gate"/>
+    <w:bookmarkEnd w:id="60"/>
+    <w:bookmarkStart w:id="61" w:name="m2.1-testing-gate"/>
     <w:p>
       <w:pPr>
         <w:pStyle w:val="Heading3"/>
@@ -9799,7 +9998,7 @@
         <w:pStyle w:val="Compact"/>
         <w:numPr>
           <w:ilvl w:val="0"/>
-          <w:numId w:val="1415"/>
+          <w:numId w:val="1421"/>
         </w:numPr>
       </w:pPr>
       <w:r>
@@ -9811,7 +10010,7 @@
         <w:pStyle w:val="Compact"/>
         <w:numPr>
           <w:ilvl w:val="0"/>
-          <w:numId w:val="1416"/>
+          <w:numId w:val="1422"/>
         </w:numPr>
       </w:pPr>
       <w:r>
@@ -9823,7 +10022,7 @@
         <w:pStyle w:val="Compact"/>
         <w:numPr>
           <w:ilvl w:val="0"/>
-          <w:numId w:val="1417"/>
+          <w:numId w:val="1423"/>
         </w:numPr>
       </w:pPr>
       <w:r>
@@ -9835,7 +10034,7 @@
         <w:pStyle w:val="Compact"/>
         <w:numPr>
           <w:ilvl w:val="0"/>
-          <w:numId w:val="1418"/>
+          <w:numId w:val="1424"/>
         </w:numPr>
       </w:pPr>
       <w:r>
@@ -9847,7 +10046,7 @@
         <w:pStyle w:val="Compact"/>
         <w:numPr>
           <w:ilvl w:val="0"/>
-          <w:numId w:val="1419"/>
+          <w:numId w:val="1425"/>
         </w:numPr>
       </w:pPr>
       <w:r>
@@ -9859,7 +10058,7 @@
         <w:pStyle w:val="Compact"/>
         <w:numPr>
           <w:ilvl w:val="0"/>
-          <w:numId w:val="1420"/>
+          <w:numId w:val="1426"/>
         </w:numPr>
       </w:pPr>
       <w:r>
@@ -9871,7 +10070,7 @@
         <w:pStyle w:val="Compact"/>
         <w:numPr>
           <w:ilvl w:val="0"/>
-          <w:numId w:val="1421"/>
+          <w:numId w:val="1427"/>
         </w:numPr>
       </w:pPr>
       <w:r>
@@ -9883,7 +10082,7 @@
         <w:pStyle w:val="Compact"/>
         <w:numPr>
           <w:ilvl w:val="0"/>
-          <w:numId w:val="1422"/>
+          <w:numId w:val="1428"/>
         </w:numPr>
       </w:pPr>
       <w:r>
@@ -9895,16 +10094,16 @@
         <w:pStyle w:val="Compact"/>
         <w:numPr>
           <w:ilvl w:val="0"/>
-          <w:numId w:val="1423"/>
+          <w:numId w:val="1429"/>
         </w:numPr>
       </w:pPr>
       <w:r>
         <w:t xml:space="preserve">Progress dashboard updated.</w:t>
       </w:r>
     </w:p>
-    <w:bookmarkEnd w:id="60"/>
     <w:bookmarkEnd w:id="61"/>
-    <w:bookmarkStart w:id="67" w:name="X80216ddf01e64983419846741e514a0cb2a2ddb"/>
+    <w:bookmarkEnd w:id="62"/>
+    <w:bookmarkStart w:id="68" w:name="X80216ddf01e64983419846741e514a0cb2a2ddb"/>
     <w:p>
       <w:pPr>
         <w:pStyle w:val="Heading2"/>
@@ -9913,7 +10112,7 @@
         <w:t xml:space="preserve">M2.2 — Leads Enrichment Columns And Export CSV</w:t>
       </w:r>
     </w:p>
-    <w:bookmarkStart w:id="62" w:name="leads-table-columns"/>
+    <w:bookmarkStart w:id="63" w:name="leads-table-columns"/>
     <w:p>
       <w:pPr>
         <w:pStyle w:val="Heading3"/>
@@ -9927,7 +10126,7 @@
         <w:pStyle w:val="Compact"/>
         <w:numPr>
           <w:ilvl w:val="0"/>
-          <w:numId w:val="1424"/>
+          <w:numId w:val="1430"/>
         </w:numPr>
       </w:pPr>
       <w:r>
@@ -9939,7 +10138,7 @@
         <w:pStyle w:val="Compact"/>
         <w:numPr>
           <w:ilvl w:val="0"/>
-          <w:numId w:val="1425"/>
+          <w:numId w:val="1431"/>
         </w:numPr>
       </w:pPr>
       <w:r>
@@ -9951,7 +10150,7 @@
         <w:pStyle w:val="Compact"/>
         <w:numPr>
           <w:ilvl w:val="1"/>
-          <w:numId w:val="1426"/>
+          <w:numId w:val="1432"/>
         </w:numPr>
       </w:pPr>
       <w:r>
@@ -9963,7 +10162,7 @@
         <w:pStyle w:val="Compact"/>
         <w:numPr>
           <w:ilvl w:val="1"/>
-          <w:numId w:val="1426"/>
+          <w:numId w:val="1432"/>
         </w:numPr>
       </w:pPr>
       <w:r>
@@ -9975,7 +10174,7 @@
         <w:pStyle w:val="Compact"/>
         <w:numPr>
           <w:ilvl w:val="1"/>
-          <w:numId w:val="1426"/>
+          <w:numId w:val="1432"/>
         </w:numPr>
       </w:pPr>
       <w:r>
@@ -9987,7 +10186,7 @@
         <w:pStyle w:val="Compact"/>
         <w:numPr>
           <w:ilvl w:val="1"/>
-          <w:numId w:val="1426"/>
+          <w:numId w:val="1432"/>
         </w:numPr>
       </w:pPr>
       <w:r>
@@ -9999,7 +10198,7 @@
         <w:pStyle w:val="Compact"/>
         <w:numPr>
           <w:ilvl w:val="1"/>
-          <w:numId w:val="1426"/>
+          <w:numId w:val="1432"/>
         </w:numPr>
       </w:pPr>
       <w:r>
@@ -10011,7 +10210,7 @@
         <w:pStyle w:val="Compact"/>
         <w:numPr>
           <w:ilvl w:val="1"/>
-          <w:numId w:val="1426"/>
+          <w:numId w:val="1432"/>
         </w:numPr>
       </w:pPr>
       <w:r>
@@ -10023,7 +10222,7 @@
         <w:pStyle w:val="Compact"/>
         <w:numPr>
           <w:ilvl w:val="1"/>
-          <w:numId w:val="1426"/>
+          <w:numId w:val="1432"/>
         </w:numPr>
       </w:pPr>
       <w:r>
@@ -10035,7 +10234,7 @@
         <w:pStyle w:val="Compact"/>
         <w:numPr>
           <w:ilvl w:val="1"/>
-          <w:numId w:val="1426"/>
+          <w:numId w:val="1432"/>
         </w:numPr>
       </w:pPr>
       <w:r>
@@ -10047,7 +10246,7 @@
         <w:pStyle w:val="Compact"/>
         <w:numPr>
           <w:ilvl w:val="0"/>
-          <w:numId w:val="1427"/>
+          <w:numId w:val="1433"/>
         </w:numPr>
       </w:pPr>
       <w:r>
@@ -10068,7 +10267,7 @@
         <w:pStyle w:val="Compact"/>
         <w:numPr>
           <w:ilvl w:val="0"/>
-          <w:numId w:val="1428"/>
+          <w:numId w:val="1434"/>
         </w:numPr>
       </w:pPr>
       <w:r>
@@ -10092,129 +10291,11 @@
         <w:pStyle w:val="Compact"/>
         <w:numPr>
           <w:ilvl w:val="0"/>
-          <w:numId w:val="1429"/>
+          <w:numId w:val="1435"/>
         </w:numPr>
       </w:pPr>
       <w:r>
         <w:t xml:space="preserve">Monthly Revenue renders raw/formatted revenue plus provenance chip:</w:t>
-      </w:r>
-    </w:p>
-    <w:p>
-      <w:pPr>
-        <w:pStyle w:val="Compact"/>
-        <w:numPr>
-          <w:ilvl w:val="1"/>
-          <w:numId w:val="1430"/>
-        </w:numPr>
-      </w:pPr>
-      <w:r>
-        <w:t xml:space="preserve">AI;</w:t>
-      </w:r>
-    </w:p>
-    <w:p>
-      <w:pPr>
-        <w:pStyle w:val="Compact"/>
-        <w:numPr>
-          <w:ilvl w:val="1"/>
-          <w:numId w:val="1430"/>
-        </w:numPr>
-      </w:pPr>
-      <w:r>
-        <w:t xml:space="preserve">CSV;</w:t>
-      </w:r>
-    </w:p>
-    <w:p>
-      <w:pPr>
-        <w:pStyle w:val="Compact"/>
-        <w:numPr>
-          <w:ilvl w:val="1"/>
-          <w:numId w:val="1430"/>
-        </w:numPr>
-      </w:pPr>
-      <w:r>
-        <w:t xml:space="preserve">MANUAL.</w:t>
-      </w:r>
-    </w:p>
-    <w:p>
-      <w:pPr>
-        <w:pStyle w:val="Compact"/>
-        <w:numPr>
-          <w:ilvl w:val="0"/>
-          <w:numId w:val="1431"/>
-        </w:numPr>
-      </w:pPr>
-      <w:r>
-        <w:t xml:space="preserve">Empty revenue renders</w:t>
-      </w:r>
-      <w:r>
-        <w:t xml:space="preserve"> </w:t>
-      </w:r>
-      <w:r>
-        <w:rPr>
-          <w:rStyle w:val="VerbatimChar"/>
-        </w:rPr>
-        <w:t xml:space="preserve">—</w:t>
-      </w:r>
-      <w:r>
-        <w:t xml:space="preserve">.</w:t>
-      </w:r>
-    </w:p>
-    <w:p>
-      <w:pPr>
-        <w:pStyle w:val="Compact"/>
-        <w:numPr>
-          <w:ilvl w:val="0"/>
-          <w:numId w:val="1432"/>
-        </w:numPr>
-      </w:pPr>
-      <w:r>
-        <w:t xml:space="preserve">Source cell uses two-line readable source/list pattern.</w:t>
-      </w:r>
-    </w:p>
-    <w:p>
-      <w:pPr>
-        <w:pStyle w:val="Compact"/>
-        <w:numPr>
-          <w:ilvl w:val="0"/>
-          <w:numId w:val="1433"/>
-        </w:numPr>
-      </w:pPr>
-      <w:r>
-        <w:t xml:space="preserve">Status pill styles match prototype.</w:t>
-      </w:r>
-    </w:p>
-    <w:p>
-      <w:pPr>
-        <w:pStyle w:val="Compact"/>
-        <w:numPr>
-          <w:ilvl w:val="0"/>
-          <w:numId w:val="1434"/>
-        </w:numPr>
-      </w:pPr>
-      <w:r>
-        <w:t xml:space="preserve">Avatar initials match prototype density.</w:t>
-      </w:r>
-    </w:p>
-    <w:bookmarkEnd w:id="62"/>
-    <w:bookmarkStart w:id="63" w:name="data-plumbing"/>
-    <w:p>
-      <w:pPr>
-        <w:pStyle w:val="Heading3"/>
-      </w:pPr>
-      <w:r>
-        <w:t xml:space="preserve">Data plumbing</w:t>
-      </w:r>
-    </w:p>
-    <w:p>
-      <w:pPr>
-        <w:pStyle w:val="Compact"/>
-        <w:numPr>
-          <w:ilvl w:val="0"/>
-          <w:numId w:val="1435"/>
-        </w:numPr>
-      </w:pPr>
-      <w:r>
-        <w:t xml:space="preserve">Confirm data source for industry:</w:t>
       </w:r>
     </w:p>
     <w:p>
@@ -10226,7 +10307,7 @@
         </w:numPr>
       </w:pPr>
       <w:r>
-        <w:t xml:space="preserve">existing AI classifier field;</w:t>
+        <w:t xml:space="preserve">AI;</w:t>
       </w:r>
     </w:p>
     <w:p>
@@ -10238,7 +10319,7 @@
         </w:numPr>
       </w:pPr>
       <w:r>
-        <w:t xml:space="preserve">CSV value;</w:t>
+        <w:t xml:space="preserve">CSV;</w:t>
       </w:r>
     </w:p>
     <w:p>
@@ -10250,6 +10331,124 @@
         </w:numPr>
       </w:pPr>
       <w:r>
+        <w:t xml:space="preserve">MANUAL.</w:t>
+      </w:r>
+    </w:p>
+    <w:p>
+      <w:pPr>
+        <w:pStyle w:val="Compact"/>
+        <w:numPr>
+          <w:ilvl w:val="0"/>
+          <w:numId w:val="1437"/>
+        </w:numPr>
+      </w:pPr>
+      <w:r>
+        <w:t xml:space="preserve">Empty revenue renders</w:t>
+      </w:r>
+      <w:r>
+        <w:t xml:space="preserve"> </w:t>
+      </w:r>
+      <w:r>
+        <w:rPr>
+          <w:rStyle w:val="VerbatimChar"/>
+        </w:rPr>
+        <w:t xml:space="preserve">—</w:t>
+      </w:r>
+      <w:r>
+        <w:t xml:space="preserve">.</w:t>
+      </w:r>
+    </w:p>
+    <w:p>
+      <w:pPr>
+        <w:pStyle w:val="Compact"/>
+        <w:numPr>
+          <w:ilvl w:val="0"/>
+          <w:numId w:val="1438"/>
+        </w:numPr>
+      </w:pPr>
+      <w:r>
+        <w:t xml:space="preserve">Source cell uses two-line readable source/list pattern.</w:t>
+      </w:r>
+    </w:p>
+    <w:p>
+      <w:pPr>
+        <w:pStyle w:val="Compact"/>
+        <w:numPr>
+          <w:ilvl w:val="0"/>
+          <w:numId w:val="1439"/>
+        </w:numPr>
+      </w:pPr>
+      <w:r>
+        <w:t xml:space="preserve">Status pill styles match prototype.</w:t>
+      </w:r>
+    </w:p>
+    <w:p>
+      <w:pPr>
+        <w:pStyle w:val="Compact"/>
+        <w:numPr>
+          <w:ilvl w:val="0"/>
+          <w:numId w:val="1440"/>
+        </w:numPr>
+      </w:pPr>
+      <w:r>
+        <w:t xml:space="preserve">Avatar initials match prototype density.</w:t>
+      </w:r>
+    </w:p>
+    <w:bookmarkEnd w:id="63"/>
+    <w:bookmarkStart w:id="64" w:name="data-plumbing"/>
+    <w:p>
+      <w:pPr>
+        <w:pStyle w:val="Heading3"/>
+      </w:pPr>
+      <w:r>
+        <w:t xml:space="preserve">Data plumbing</w:t>
+      </w:r>
+    </w:p>
+    <w:p>
+      <w:pPr>
+        <w:pStyle w:val="Compact"/>
+        <w:numPr>
+          <w:ilvl w:val="0"/>
+          <w:numId w:val="1441"/>
+        </w:numPr>
+      </w:pPr>
+      <w:r>
+        <w:t xml:space="preserve">Confirm data source for industry:</w:t>
+      </w:r>
+    </w:p>
+    <w:p>
+      <w:pPr>
+        <w:pStyle w:val="Compact"/>
+        <w:numPr>
+          <w:ilvl w:val="1"/>
+          <w:numId w:val="1442"/>
+        </w:numPr>
+      </w:pPr>
+      <w:r>
+        <w:t xml:space="preserve">existing AI classifier field;</w:t>
+      </w:r>
+    </w:p>
+    <w:p>
+      <w:pPr>
+        <w:pStyle w:val="Compact"/>
+        <w:numPr>
+          <w:ilvl w:val="1"/>
+          <w:numId w:val="1442"/>
+        </w:numPr>
+      </w:pPr>
+      <w:r>
+        <w:t xml:space="preserve">CSV value;</w:t>
+      </w:r>
+    </w:p>
+    <w:p>
+      <w:pPr>
+        <w:pStyle w:val="Compact"/>
+        <w:numPr>
+          <w:ilvl w:val="1"/>
+          <w:numId w:val="1442"/>
+        </w:numPr>
+      </w:pPr>
+      <w:r>
         <w:t xml:space="preserve">manual override.</w:t>
       </w:r>
     </w:p>
@@ -10258,7 +10457,7 @@
         <w:pStyle w:val="Compact"/>
         <w:numPr>
           <w:ilvl w:val="0"/>
-          <w:numId w:val="1437"/>
+          <w:numId w:val="1443"/>
         </w:numPr>
       </w:pPr>
       <w:r>
@@ -10270,7 +10469,7 @@
         <w:pStyle w:val="Compact"/>
         <w:numPr>
           <w:ilvl w:val="1"/>
-          <w:numId w:val="1438"/>
+          <w:numId w:val="1444"/>
         </w:numPr>
       </w:pPr>
       <w:r>
@@ -10282,7 +10481,7 @@
         <w:pStyle w:val="Compact"/>
         <w:numPr>
           <w:ilvl w:val="1"/>
-          <w:numId w:val="1438"/>
+          <w:numId w:val="1444"/>
         </w:numPr>
       </w:pPr>
       <w:r>
@@ -10294,7 +10493,7 @@
         <w:pStyle w:val="Compact"/>
         <w:numPr>
           <w:ilvl w:val="1"/>
-          <w:numId w:val="1438"/>
+          <w:numId w:val="1444"/>
         </w:numPr>
       </w:pPr>
       <w:r>
@@ -10306,7 +10505,7 @@
         <w:pStyle w:val="Compact"/>
         <w:numPr>
           <w:ilvl w:val="0"/>
-          <w:numId w:val="1439"/>
+          <w:numId w:val="1445"/>
         </w:numPr>
       </w:pPr>
       <w:r>
@@ -10318,7 +10517,7 @@
         <w:pStyle w:val="Compact"/>
         <w:numPr>
           <w:ilvl w:val="0"/>
-          <w:numId w:val="1440"/>
+          <w:numId w:val="1446"/>
         </w:numPr>
       </w:pPr>
       <w:r>
@@ -10330,15 +10529,15 @@
         <w:pStyle w:val="Compact"/>
         <w:numPr>
           <w:ilvl w:val="0"/>
-          <w:numId w:val="1441"/>
+          <w:numId w:val="1447"/>
         </w:numPr>
       </w:pPr>
       <w:r>
         <w:t xml:space="preserve">Rep scope applies to all enrichment queries.</w:t>
       </w:r>
     </w:p>
-    <w:bookmarkEnd w:id="63"/>
-    <w:bookmarkStart w:id="64" w:name="export-csv"/>
+    <w:bookmarkEnd w:id="64"/>
+    <w:bookmarkStart w:id="65" w:name="export-csv"/>
     <w:p>
       <w:pPr>
         <w:pStyle w:val="Heading3"/>
@@ -10352,7 +10551,7 @@
         <w:pStyle w:val="Compact"/>
         <w:numPr>
           <w:ilvl w:val="0"/>
-          <w:numId w:val="1442"/>
+          <w:numId w:val="1448"/>
         </w:numPr>
       </w:pPr>
       <w:r>
@@ -10373,7 +10572,7 @@
         <w:pStyle w:val="Compact"/>
         <w:numPr>
           <w:ilvl w:val="0"/>
-          <w:numId w:val="1443"/>
+          <w:numId w:val="1449"/>
         </w:numPr>
       </w:pPr>
       <w:r>
@@ -10385,7 +10584,7 @@
         <w:pStyle w:val="Compact"/>
         <w:numPr>
           <w:ilvl w:val="0"/>
-          <w:numId w:val="1444"/>
+          <w:numId w:val="1450"/>
         </w:numPr>
       </w:pPr>
       <w:r>
@@ -10397,7 +10596,7 @@
         <w:pStyle w:val="Compact"/>
         <w:numPr>
           <w:ilvl w:val="0"/>
-          <w:numId w:val="1445"/>
+          <w:numId w:val="1451"/>
         </w:numPr>
       </w:pPr>
       <w:r>
@@ -10409,7 +10608,7 @@
         <w:pStyle w:val="Compact"/>
         <w:numPr>
           <w:ilvl w:val="0"/>
-          <w:numId w:val="1446"/>
+          <w:numId w:val="1452"/>
         </w:numPr>
       </w:pPr>
       <w:r>
@@ -10421,7 +10620,7 @@
         <w:pStyle w:val="Compact"/>
         <w:numPr>
           <w:ilvl w:val="0"/>
-          <w:numId w:val="1447"/>
+          <w:numId w:val="1453"/>
         </w:numPr>
       </w:pPr>
       <w:r>
@@ -10433,7 +10632,7 @@
         <w:pStyle w:val="Compact"/>
         <w:numPr>
           <w:ilvl w:val="1"/>
-          <w:numId w:val="1448"/>
+          <w:numId w:val="1454"/>
         </w:numPr>
       </w:pPr>
       <w:r>
@@ -10445,7 +10644,7 @@
         <w:pStyle w:val="Compact"/>
         <w:numPr>
           <w:ilvl w:val="1"/>
-          <w:numId w:val="1448"/>
+          <w:numId w:val="1454"/>
         </w:numPr>
       </w:pPr>
       <w:r>
@@ -10457,7 +10656,7 @@
         <w:pStyle w:val="Compact"/>
         <w:numPr>
           <w:ilvl w:val="1"/>
-          <w:numId w:val="1448"/>
+          <w:numId w:val="1454"/>
         </w:numPr>
       </w:pPr>
       <w:r>
@@ -10469,7 +10668,7 @@
         <w:pStyle w:val="Compact"/>
         <w:numPr>
           <w:ilvl w:val="1"/>
-          <w:numId w:val="1448"/>
+          <w:numId w:val="1454"/>
         </w:numPr>
       </w:pPr>
       <w:r>
@@ -10481,7 +10680,7 @@
         <w:pStyle w:val="Compact"/>
         <w:numPr>
           <w:ilvl w:val="1"/>
-          <w:numId w:val="1448"/>
+          <w:numId w:val="1454"/>
         </w:numPr>
       </w:pPr>
       <w:r>
@@ -10493,7 +10692,7 @@
         <w:pStyle w:val="Compact"/>
         <w:numPr>
           <w:ilvl w:val="1"/>
-          <w:numId w:val="1448"/>
+          <w:numId w:val="1454"/>
         </w:numPr>
       </w:pPr>
       <w:r>
@@ -10505,7 +10704,7 @@
         <w:pStyle w:val="Compact"/>
         <w:numPr>
           <w:ilvl w:val="0"/>
-          <w:numId w:val="1449"/>
+          <w:numId w:val="1455"/>
         </w:numPr>
       </w:pPr>
       <w:r>
@@ -10517,15 +10716,15 @@
         <w:pStyle w:val="Compact"/>
         <w:numPr>
           <w:ilvl w:val="0"/>
-          <w:numId w:val="1450"/>
+          <w:numId w:val="1456"/>
         </w:numPr>
       </w:pPr>
       <w:r>
         <w:t xml:space="preserve">CSV escaping handles commas, quotes, line breaks.</w:t>
       </w:r>
     </w:p>
-    <w:bookmarkEnd w:id="64"/>
-    <w:bookmarkStart w:id="65" w:name="m2.2-style-isolation"/>
+    <w:bookmarkEnd w:id="65"/>
+    <w:bookmarkStart w:id="66" w:name="m2.2-style-isolation"/>
     <w:p>
       <w:pPr>
         <w:pStyle w:val="Heading3"/>
@@ -10539,7 +10738,7 @@
         <w:pStyle w:val="Compact"/>
         <w:numPr>
           <w:ilvl w:val="0"/>
-          <w:numId w:val="1451"/>
+          <w:numId w:val="1457"/>
         </w:numPr>
       </w:pPr>
       <w:r>
@@ -10551,7 +10750,7 @@
         <w:pStyle w:val="Compact"/>
         <w:numPr>
           <w:ilvl w:val="0"/>
-          <w:numId w:val="1452"/>
+          <w:numId w:val="1458"/>
         </w:numPr>
       </w:pPr>
       <w:r>
@@ -10563,7 +10762,7 @@
         <w:pStyle w:val="Compact"/>
         <w:numPr>
           <w:ilvl w:val="0"/>
-          <w:numId w:val="1453"/>
+          <w:numId w:val="1459"/>
         </w:numPr>
       </w:pPr>
       <w:r>
@@ -10575,7 +10774,7 @@
         <w:pStyle w:val="Compact"/>
         <w:numPr>
           <w:ilvl w:val="0"/>
-          <w:numId w:val="1454"/>
+          <w:numId w:val="1460"/>
         </w:numPr>
       </w:pPr>
       <w:r>
@@ -10587,15 +10786,15 @@
         <w:pStyle w:val="Compact"/>
         <w:numPr>
           <w:ilvl w:val="0"/>
-          <w:numId w:val="1455"/>
+          <w:numId w:val="1461"/>
         </w:numPr>
       </w:pPr>
       <w:r>
         <w:t xml:space="preserve">Ensure text truncation/line wrapping is deliberate and not overlapping.</w:t>
       </w:r>
     </w:p>
-    <w:bookmarkEnd w:id="65"/>
-    <w:bookmarkStart w:id="66" w:name="m2.2-testing-gate"/>
+    <w:bookmarkEnd w:id="66"/>
+    <w:bookmarkStart w:id="67" w:name="m2.2-testing-gate"/>
     <w:p>
       <w:pPr>
         <w:pStyle w:val="Heading3"/>
@@ -10609,7 +10808,7 @@
         <w:pStyle w:val="Compact"/>
         <w:numPr>
           <w:ilvl w:val="0"/>
-          <w:numId w:val="1456"/>
+          <w:numId w:val="1462"/>
         </w:numPr>
       </w:pPr>
       <w:r>
@@ -10621,7 +10820,7 @@
         <w:pStyle w:val="Compact"/>
         <w:numPr>
           <w:ilvl w:val="0"/>
-          <w:numId w:val="1457"/>
+          <w:numId w:val="1463"/>
         </w:numPr>
       </w:pPr>
       <w:r>
@@ -10633,7 +10832,7 @@
         <w:pStyle w:val="Compact"/>
         <w:numPr>
           <w:ilvl w:val="0"/>
-          <w:numId w:val="1458"/>
+          <w:numId w:val="1464"/>
         </w:numPr>
       </w:pPr>
       <w:r>
@@ -10645,7 +10844,7 @@
         <w:pStyle w:val="Compact"/>
         <w:numPr>
           <w:ilvl w:val="0"/>
-          <w:numId w:val="1459"/>
+          <w:numId w:val="1465"/>
         </w:numPr>
       </w:pPr>
       <w:r>
@@ -10657,7 +10856,7 @@
         <w:pStyle w:val="Compact"/>
         <w:numPr>
           <w:ilvl w:val="0"/>
-          <w:numId w:val="1460"/>
+          <w:numId w:val="1466"/>
         </w:numPr>
       </w:pPr>
       <w:r>
@@ -10669,7 +10868,7 @@
         <w:pStyle w:val="Compact"/>
         <w:numPr>
           <w:ilvl w:val="0"/>
-          <w:numId w:val="1461"/>
+          <w:numId w:val="1467"/>
         </w:numPr>
       </w:pPr>
       <w:r>
@@ -10681,7 +10880,7 @@
         <w:pStyle w:val="Compact"/>
         <w:numPr>
           <w:ilvl w:val="0"/>
-          <w:numId w:val="1462"/>
+          <w:numId w:val="1468"/>
         </w:numPr>
       </w:pPr>
       <w:r>
@@ -10693,16 +10892,16 @@
         <w:pStyle w:val="Compact"/>
         <w:numPr>
           <w:ilvl w:val="0"/>
-          <w:numId w:val="1463"/>
+          <w:numId w:val="1469"/>
         </w:numPr>
       </w:pPr>
       <w:r>
         <w:t xml:space="preserve">Progress dashboard updated.</w:t>
       </w:r>
     </w:p>
-    <w:bookmarkEnd w:id="66"/>
     <w:bookmarkEnd w:id="67"/>
-    <w:bookmarkStart w:id="77" w:name="m2.3-ai-retarget-campaigns"/>
+    <w:bookmarkEnd w:id="68"/>
+    <w:bookmarkStart w:id="78" w:name="m2.3-ai-retarget-campaigns"/>
     <w:p>
       <w:pPr>
         <w:pStyle w:val="Heading2"/>
@@ -10711,7 +10910,7 @@
         <w:t xml:space="preserve">M2.3 — AI Retarget Campaigns</w:t>
       </w:r>
     </w:p>
-    <w:bookmarkStart w:id="68" w:name="scope-lock-for-ai-retarget"/>
+    <w:bookmarkStart w:id="69" w:name="scope-lock-for-ai-retarget"/>
     <w:p>
       <w:pPr>
         <w:pStyle w:val="Heading3"/>
@@ -10725,7 +10924,7 @@
         <w:pStyle w:val="Compact"/>
         <w:numPr>
           <w:ilvl w:val="0"/>
-          <w:numId w:val="1464"/>
+          <w:numId w:val="1470"/>
         </w:numPr>
       </w:pPr>
       <w:r>
@@ -10737,7 +10936,7 @@
         <w:pStyle w:val="Compact"/>
         <w:numPr>
           <w:ilvl w:val="0"/>
-          <w:numId w:val="1465"/>
+          <w:numId w:val="1471"/>
         </w:numPr>
       </w:pPr>
       <w:r>
@@ -10749,7 +10948,7 @@
         <w:pStyle w:val="Compact"/>
         <w:numPr>
           <w:ilvl w:val="0"/>
-          <w:numId w:val="1466"/>
+          <w:numId w:val="1472"/>
         </w:numPr>
       </w:pPr>
       <w:r>
@@ -10761,7 +10960,7 @@
         <w:pStyle w:val="Compact"/>
         <w:numPr>
           <w:ilvl w:val="0"/>
-          <w:numId w:val="1467"/>
+          <w:numId w:val="1473"/>
         </w:numPr>
       </w:pPr>
       <w:r>
@@ -10773,7 +10972,7 @@
         <w:pStyle w:val="Compact"/>
         <w:numPr>
           <w:ilvl w:val="0"/>
-          <w:numId w:val="1468"/>
+          <w:numId w:val="1474"/>
         </w:numPr>
       </w:pPr>
       <w:r>
@@ -10785,7 +10984,7 @@
         <w:pStyle w:val="Compact"/>
         <w:numPr>
           <w:ilvl w:val="0"/>
-          <w:numId w:val="1469"/>
+          <w:numId w:val="1475"/>
         </w:numPr>
       </w:pPr>
       <w:r>
@@ -10797,7 +10996,7 @@
         <w:pStyle w:val="Compact"/>
         <w:numPr>
           <w:ilvl w:val="1"/>
-          <w:numId w:val="1470"/>
+          <w:numId w:val="1476"/>
         </w:numPr>
       </w:pPr>
       <w:r>
@@ -10824,7 +11023,7 @@
         <w:pStyle w:val="Compact"/>
         <w:numPr>
           <w:ilvl w:val="1"/>
-          <w:numId w:val="1470"/>
+          <w:numId w:val="1476"/>
         </w:numPr>
       </w:pPr>
       <w:r>
@@ -10846,8 +11045,8 @@
         <w:t xml:space="preserve">scoping correctness.</w:t>
       </w:r>
     </w:p>
-    <w:bookmarkEnd w:id="68"/>
-    <w:bookmarkStart w:id="69" w:name="database-model"/>
+    <w:bookmarkEnd w:id="69"/>
+    <w:bookmarkStart w:id="70" w:name="database-model"/>
     <w:p>
       <w:pPr>
         <w:pStyle w:val="Heading3"/>
@@ -10861,7 +11060,7 @@
         <w:pStyle w:val="Compact"/>
         <w:numPr>
           <w:ilvl w:val="0"/>
-          <w:numId w:val="1471"/>
+          <w:numId w:val="1477"/>
         </w:numPr>
       </w:pPr>
       <w:r>
@@ -10903,7 +11102,7 @@
         <w:pStyle w:val="Compact"/>
         <w:numPr>
           <w:ilvl w:val="0"/>
-          <w:numId w:val="1472"/>
+          <w:numId w:val="1478"/>
         </w:numPr>
       </w:pPr>
       <w:r>
@@ -10927,7 +11126,7 @@
         <w:pStyle w:val="Compact"/>
         <w:numPr>
           <w:ilvl w:val="0"/>
-          <w:numId w:val="1473"/>
+          <w:numId w:val="1479"/>
         </w:numPr>
       </w:pPr>
       <w:r>
@@ -10951,7 +11150,7 @@
         <w:pStyle w:val="Compact"/>
         <w:numPr>
           <w:ilvl w:val="0"/>
-          <w:numId w:val="1474"/>
+          <w:numId w:val="1480"/>
         </w:numPr>
       </w:pPr>
       <w:r>
@@ -10963,7 +11162,7 @@
         <w:pStyle w:val="Compact"/>
         <w:numPr>
           <w:ilvl w:val="0"/>
-          <w:numId w:val="1475"/>
+          <w:numId w:val="1481"/>
         </w:numPr>
       </w:pPr>
       <w:r>
@@ -10975,7 +11174,7 @@
         <w:pStyle w:val="Compact"/>
         <w:numPr>
           <w:ilvl w:val="0"/>
-          <w:numId w:val="1476"/>
+          <w:numId w:val="1482"/>
         </w:numPr>
       </w:pPr>
       <w:r>
@@ -10987,7 +11186,7 @@
         <w:pStyle w:val="Compact"/>
         <w:numPr>
           <w:ilvl w:val="0"/>
-          <w:numId w:val="1477"/>
+          <w:numId w:val="1483"/>
         </w:numPr>
       </w:pPr>
       <w:r>
@@ -10999,7 +11198,7 @@
         <w:pStyle w:val="Compact"/>
         <w:numPr>
           <w:ilvl w:val="0"/>
-          <w:numId w:val="1478"/>
+          <w:numId w:val="1484"/>
         </w:numPr>
       </w:pPr>
       <w:r>
@@ -11011,7 +11210,7 @@
         <w:pStyle w:val="Compact"/>
         <w:numPr>
           <w:ilvl w:val="0"/>
-          <w:numId w:val="1479"/>
+          <w:numId w:val="1485"/>
         </w:numPr>
       </w:pPr>
       <w:r>
@@ -11023,7 +11222,7 @@
         <w:pStyle w:val="Compact"/>
         <w:numPr>
           <w:ilvl w:val="0"/>
-          <w:numId w:val="1480"/>
+          <w:numId w:val="1486"/>
         </w:numPr>
       </w:pPr>
       <w:r>
@@ -11035,7 +11234,7 @@
         <w:pStyle w:val="Compact"/>
         <w:numPr>
           <w:ilvl w:val="0"/>
-          <w:numId w:val="1481"/>
+          <w:numId w:val="1487"/>
         </w:numPr>
       </w:pPr>
       <w:r>
@@ -11047,7 +11246,7 @@
         <w:pStyle w:val="Compact"/>
         <w:numPr>
           <w:ilvl w:val="0"/>
-          <w:numId w:val="1482"/>
+          <w:numId w:val="1488"/>
         </w:numPr>
       </w:pPr>
       <w:r>
@@ -11059,7 +11258,7 @@
         <w:pStyle w:val="Compact"/>
         <w:numPr>
           <w:ilvl w:val="0"/>
-          <w:numId w:val="1483"/>
+          <w:numId w:val="1489"/>
         </w:numPr>
       </w:pPr>
       <w:r>
@@ -11071,7 +11270,7 @@
         <w:pStyle w:val="Compact"/>
         <w:numPr>
           <w:ilvl w:val="0"/>
-          <w:numId w:val="1484"/>
+          <w:numId w:val="1490"/>
         </w:numPr>
       </w:pPr>
       <w:r>
@@ -11098,7 +11297,7 @@
         <w:pStyle w:val="Compact"/>
         <w:numPr>
           <w:ilvl w:val="0"/>
-          <w:numId w:val="1485"/>
+          <w:numId w:val="1491"/>
         </w:numPr>
       </w:pPr>
       <w:r>
@@ -11110,15 +11309,15 @@
         <w:pStyle w:val="Compact"/>
         <w:numPr>
           <w:ilvl w:val="0"/>
-          <w:numId w:val="1486"/>
+          <w:numId w:val="1492"/>
         </w:numPr>
       </w:pPr>
       <w:r>
         <w:t xml:space="preserve">Ensure expired cohorts are ignored safely.</w:t>
       </w:r>
     </w:p>
-    <w:bookmarkEnd w:id="69"/>
-    <w:bookmarkStart w:id="70" w:name="cohort-generation"/>
+    <w:bookmarkEnd w:id="70"/>
+    <w:bookmarkStart w:id="71" w:name="cohort-generation"/>
     <w:p>
       <w:pPr>
         <w:pStyle w:val="Heading3"/>
@@ -11132,7 +11331,7 @@
         <w:pStyle w:val="Compact"/>
         <w:numPr>
           <w:ilvl w:val="0"/>
-          <w:numId w:val="1487"/>
+          <w:numId w:val="1493"/>
         </w:numPr>
       </w:pPr>
       <w:r>
@@ -11144,7 +11343,7 @@
         <w:pStyle w:val="Compact"/>
         <w:numPr>
           <w:ilvl w:val="0"/>
-          <w:numId w:val="1488"/>
+          <w:numId w:val="1494"/>
         </w:numPr>
       </w:pPr>
       <w:r>
@@ -11171,7 +11370,7 @@
         <w:pStyle w:val="Compact"/>
         <w:numPr>
           <w:ilvl w:val="0"/>
-          <w:numId w:val="1489"/>
+          <w:numId w:val="1495"/>
         </w:numPr>
       </w:pPr>
       <w:r>
@@ -11198,7 +11397,7 @@
         <w:pStyle w:val="Compact"/>
         <w:numPr>
           <w:ilvl w:val="0"/>
-          <w:numId w:val="1490"/>
+          <w:numId w:val="1496"/>
         </w:numPr>
       </w:pPr>
       <w:r>
@@ -11225,7 +11424,7 @@
         <w:pStyle w:val="Compact"/>
         <w:numPr>
           <w:ilvl w:val="0"/>
-          <w:numId w:val="1491"/>
+          <w:numId w:val="1497"/>
         </w:numPr>
       </w:pPr>
       <w:r>
@@ -11237,7 +11436,7 @@
         <w:pStyle w:val="Compact"/>
         <w:numPr>
           <w:ilvl w:val="1"/>
-          <w:numId w:val="1492"/>
+          <w:numId w:val="1498"/>
         </w:numPr>
       </w:pPr>
       <w:r>
@@ -11249,7 +11448,7 @@
         <w:pStyle w:val="Compact"/>
         <w:numPr>
           <w:ilvl w:val="1"/>
-          <w:numId w:val="1492"/>
+          <w:numId w:val="1498"/>
         </w:numPr>
       </w:pPr>
       <w:r>
@@ -11261,7 +11460,7 @@
         <w:pStyle w:val="Compact"/>
         <w:numPr>
           <w:ilvl w:val="1"/>
-          <w:numId w:val="1492"/>
+          <w:numId w:val="1498"/>
         </w:numPr>
       </w:pPr>
       <w:r>
@@ -11273,7 +11472,7 @@
         <w:pStyle w:val="Compact"/>
         <w:numPr>
           <w:ilvl w:val="0"/>
-          <w:numId w:val="1493"/>
+          <w:numId w:val="1499"/>
         </w:numPr>
       </w:pPr>
       <w:r>
@@ -11285,7 +11484,7 @@
         <w:pStyle w:val="Compact"/>
         <w:numPr>
           <w:ilvl w:val="0"/>
-          <w:numId w:val="1494"/>
+          <w:numId w:val="1500"/>
         </w:numPr>
       </w:pPr>
       <w:r>
@@ -11297,7 +11496,7 @@
         <w:pStyle w:val="Compact"/>
         <w:numPr>
           <w:ilvl w:val="1"/>
-          <w:numId w:val="1495"/>
+          <w:numId w:val="1501"/>
         </w:numPr>
       </w:pPr>
       <w:r>
@@ -11309,7 +11508,7 @@
         <w:pStyle w:val="Compact"/>
         <w:numPr>
           <w:ilvl w:val="1"/>
-          <w:numId w:val="1495"/>
+          <w:numId w:val="1501"/>
         </w:numPr>
       </w:pPr>
       <w:r>
@@ -11321,7 +11520,7 @@
         <w:pStyle w:val="Compact"/>
         <w:numPr>
           <w:ilvl w:val="1"/>
-          <w:numId w:val="1495"/>
+          <w:numId w:val="1501"/>
         </w:numPr>
       </w:pPr>
       <w:r>
@@ -11333,7 +11532,7 @@
         <w:pStyle w:val="Compact"/>
         <w:numPr>
           <w:ilvl w:val="1"/>
-          <w:numId w:val="1495"/>
+          <w:numId w:val="1501"/>
         </w:numPr>
       </w:pPr>
       <w:r>
@@ -11345,7 +11544,7 @@
         <w:pStyle w:val="Compact"/>
         <w:numPr>
           <w:ilvl w:val="1"/>
-          <w:numId w:val="1495"/>
+          <w:numId w:val="1501"/>
         </w:numPr>
       </w:pPr>
       <w:r>
@@ -11357,7 +11556,7 @@
         <w:pStyle w:val="Compact"/>
         <w:numPr>
           <w:ilvl w:val="1"/>
-          <w:numId w:val="1495"/>
+          <w:numId w:val="1501"/>
         </w:numPr>
       </w:pPr>
       <w:r>
@@ -11369,7 +11568,7 @@
         <w:pStyle w:val="Compact"/>
         <w:numPr>
           <w:ilvl w:val="0"/>
-          <w:numId w:val="1496"/>
+          <w:numId w:val="1502"/>
         </w:numPr>
       </w:pPr>
       <w:r>
@@ -11381,7 +11580,7 @@
         <w:pStyle w:val="Compact"/>
         <w:numPr>
           <w:ilvl w:val="0"/>
-          <w:numId w:val="1497"/>
+          <w:numId w:val="1503"/>
         </w:numPr>
       </w:pPr>
       <w:r>
@@ -11393,15 +11592,15 @@
         <w:pStyle w:val="Compact"/>
         <w:numPr>
           <w:ilvl w:val="0"/>
-          <w:numId w:val="1498"/>
+          <w:numId w:val="1504"/>
         </w:numPr>
       </w:pPr>
       <w:r>
         <w:t xml:space="preserve">Ensure predicted funded deals are traceable to historical anchor, not arbitrary text.</w:t>
       </w:r>
     </w:p>
-    <w:bookmarkEnd w:id="70"/>
-    <w:bookmarkStart w:id="71" w:name="cooldowns-and-compliance"/>
+    <w:bookmarkEnd w:id="71"/>
+    <w:bookmarkStart w:id="72" w:name="cooldowns-and-compliance"/>
     <w:p>
       <w:pPr>
         <w:pStyle w:val="Heading3"/>
@@ -11415,7 +11614,7 @@
         <w:pStyle w:val="Compact"/>
         <w:numPr>
           <w:ilvl w:val="0"/>
-          <w:numId w:val="1499"/>
+          <w:numId w:val="1505"/>
         </w:numPr>
       </w:pPr>
       <w:r>
@@ -11427,7 +11626,7 @@
         <w:pStyle w:val="Compact"/>
         <w:numPr>
           <w:ilvl w:val="0"/>
-          <w:numId w:val="1500"/>
+          <w:numId w:val="1506"/>
         </w:numPr>
       </w:pPr>
       <w:r>
@@ -11439,7 +11638,7 @@
         <w:pStyle w:val="Compact"/>
         <w:numPr>
           <w:ilvl w:val="0"/>
-          <w:numId w:val="1501"/>
+          <w:numId w:val="1507"/>
         </w:numPr>
       </w:pPr>
       <w:r>
@@ -11451,7 +11650,7 @@
         <w:pStyle w:val="Compact"/>
         <w:numPr>
           <w:ilvl w:val="0"/>
-          <w:numId w:val="1502"/>
+          <w:numId w:val="1508"/>
         </w:numPr>
       </w:pPr>
       <w:r>
@@ -11463,7 +11662,7 @@
         <w:pStyle w:val="Compact"/>
         <w:numPr>
           <w:ilvl w:val="0"/>
-          <w:numId w:val="1503"/>
+          <w:numId w:val="1509"/>
         </w:numPr>
       </w:pPr>
       <w:r>
@@ -11475,15 +11674,15 @@
         <w:pStyle w:val="Compact"/>
         <w:numPr>
           <w:ilvl w:val="0"/>
-          <w:numId w:val="1504"/>
+          <w:numId w:val="1510"/>
         </w:numPr>
       </w:pPr>
       <w:r>
         <w:t xml:space="preserve">Verify no cohort can re-contact opted-out, DNC, suppressed, or too-recent leads.</w:t>
       </w:r>
     </w:p>
-    <w:bookmarkEnd w:id="71"/>
-    <w:bookmarkStart w:id="72" w:name="two-layer-send-caps"/>
+    <w:bookmarkEnd w:id="72"/>
+    <w:bookmarkStart w:id="73" w:name="two-layer-send-caps"/>
     <w:p>
       <w:pPr>
         <w:pStyle w:val="Heading3"/>
@@ -11497,7 +11696,7 @@
         <w:pStyle w:val="Compact"/>
         <w:numPr>
           <w:ilvl w:val="0"/>
-          <w:numId w:val="1505"/>
+          <w:numId w:val="1511"/>
         </w:numPr>
       </w:pPr>
       <w:r>
@@ -11509,7 +11708,7 @@
         <w:pStyle w:val="Compact"/>
         <w:numPr>
           <w:ilvl w:val="1"/>
-          <w:numId w:val="1506"/>
+          <w:numId w:val="1512"/>
         </w:numPr>
       </w:pPr>
       <w:r>
@@ -11521,7 +11720,7 @@
         <w:pStyle w:val="Compact"/>
         <w:numPr>
           <w:ilvl w:val="1"/>
-          <w:numId w:val="1506"/>
+          <w:numId w:val="1512"/>
         </w:numPr>
       </w:pPr>
       <w:r>
@@ -11533,7 +11732,7 @@
         <w:pStyle w:val="Compact"/>
         <w:numPr>
           <w:ilvl w:val="0"/>
-          <w:numId w:val="1507"/>
+          <w:numId w:val="1513"/>
         </w:numPr>
       </w:pPr>
       <w:r>
@@ -11545,7 +11744,7 @@
         <w:pStyle w:val="Compact"/>
         <w:numPr>
           <w:ilvl w:val="1"/>
-          <w:numId w:val="1508"/>
+          <w:numId w:val="1514"/>
         </w:numPr>
       </w:pPr>
       <w:r>
@@ -11557,7 +11756,7 @@
         <w:pStyle w:val="Compact"/>
         <w:numPr>
           <w:ilvl w:val="1"/>
-          <w:numId w:val="1508"/>
+          <w:numId w:val="1514"/>
         </w:numPr>
       </w:pPr>
       <w:r>
@@ -11569,7 +11768,7 @@
         <w:pStyle w:val="Compact"/>
         <w:numPr>
           <w:ilvl w:val="0"/>
-          <w:numId w:val="1509"/>
+          <w:numId w:val="1515"/>
         </w:numPr>
       </w:pPr>
       <w:r>
@@ -11581,7 +11780,7 @@
         <w:pStyle w:val="Compact"/>
         <w:numPr>
           <w:ilvl w:val="0"/>
-          <w:numId w:val="1510"/>
+          <w:numId w:val="1516"/>
         </w:numPr>
       </w:pPr>
       <w:r>
@@ -11593,7 +11792,7 @@
         <w:pStyle w:val="Compact"/>
         <w:numPr>
           <w:ilvl w:val="0"/>
-          <w:numId w:val="1511"/>
+          <w:numId w:val="1517"/>
         </w:numPr>
       </w:pPr>
       <w:r>
@@ -11605,15 +11804,15 @@
         <w:pStyle w:val="Compact"/>
         <w:numPr>
           <w:ilvl w:val="0"/>
-          <w:numId w:val="1512"/>
+          <w:numId w:val="1518"/>
         </w:numPr>
       </w:pPr>
       <w:r>
         <w:t xml:space="preserve">Cohort card lead count reflects current remaining capacity at render/build time.</w:t>
       </w:r>
     </w:p>
-    <w:bookmarkEnd w:id="72"/>
-    <w:bookmarkStart w:id="73" w:name="ai-reasoning-and-cron"/>
+    <w:bookmarkEnd w:id="73"/>
+    <w:bookmarkStart w:id="74" w:name="ai-reasoning-and-cron"/>
     <w:p>
       <w:pPr>
         <w:pStyle w:val="Heading3"/>
@@ -11627,7 +11826,7 @@
         <w:pStyle w:val="Compact"/>
         <w:numPr>
           <w:ilvl w:val="0"/>
-          <w:numId w:val="1513"/>
+          <w:numId w:val="1519"/>
         </w:numPr>
       </w:pPr>
       <w:r>
@@ -11639,7 +11838,7 @@
         <w:pStyle w:val="Compact"/>
         <w:numPr>
           <w:ilvl w:val="0"/>
-          <w:numId w:val="1514"/>
+          <w:numId w:val="1520"/>
         </w:numPr>
       </w:pPr>
       <w:r>
@@ -11651,7 +11850,7 @@
         <w:pStyle w:val="Compact"/>
         <w:numPr>
           <w:ilvl w:val="0"/>
-          <w:numId w:val="1515"/>
+          <w:numId w:val="1521"/>
         </w:numPr>
       </w:pPr>
       <w:r>
@@ -11663,7 +11862,7 @@
         <w:pStyle w:val="Compact"/>
         <w:numPr>
           <w:ilvl w:val="0"/>
-          <w:numId w:val="1516"/>
+          <w:numId w:val="1522"/>
         </w:numPr>
       </w:pPr>
       <w:r>
@@ -11675,7 +11874,7 @@
         <w:pStyle w:val="Compact"/>
         <w:numPr>
           <w:ilvl w:val="0"/>
-          <w:numId w:val="1517"/>
+          <w:numId w:val="1523"/>
         </w:numPr>
       </w:pPr>
       <w:r>
@@ -11687,7 +11886,7 @@
         <w:pStyle w:val="Compact"/>
         <w:numPr>
           <w:ilvl w:val="0"/>
-          <w:numId w:val="1518"/>
+          <w:numId w:val="1524"/>
         </w:numPr>
       </w:pPr>
       <w:r>
@@ -11699,7 +11898,7 @@
         <w:pStyle w:val="Compact"/>
         <w:numPr>
           <w:ilvl w:val="0"/>
-          <w:numId w:val="1519"/>
+          <w:numId w:val="1525"/>
         </w:numPr>
       </w:pPr>
       <w:r>
@@ -11711,7 +11910,7 @@
         <w:pStyle w:val="Compact"/>
         <w:numPr>
           <w:ilvl w:val="0"/>
-          <w:numId w:val="1520"/>
+          <w:numId w:val="1526"/>
         </w:numPr>
       </w:pPr>
       <w:r>
@@ -11723,15 +11922,15 @@
         <w:pStyle w:val="Compact"/>
         <w:numPr>
           <w:ilvl w:val="0"/>
-          <w:numId w:val="1521"/>
+          <w:numId w:val="1527"/>
         </w:numPr>
       </w:pPr>
       <w:r>
         <w:t xml:space="preserve">Log failures per user/cohort without breaking other cohorts.</w:t>
       </w:r>
     </w:p>
-    <w:bookmarkEnd w:id="73"/>
-    <w:bookmarkStart w:id="74" w:name="ui-1"/>
+    <w:bookmarkEnd w:id="74"/>
+    <w:bookmarkStart w:id="75" w:name="ui-1"/>
     <w:p>
       <w:pPr>
         <w:pStyle w:val="Heading3"/>
@@ -11745,7 +11944,7 @@
         <w:pStyle w:val="Compact"/>
         <w:numPr>
           <w:ilvl w:val="0"/>
-          <w:numId w:val="1522"/>
+          <w:numId w:val="1528"/>
         </w:numPr>
       </w:pPr>
       <w:r>
@@ -11757,7 +11956,7 @@
         <w:pStyle w:val="Compact"/>
         <w:numPr>
           <w:ilvl w:val="0"/>
-          <w:numId w:val="1523"/>
+          <w:numId w:val="1529"/>
         </w:numPr>
       </w:pPr>
       <w:r>
@@ -11769,7 +11968,7 @@
         <w:pStyle w:val="Compact"/>
         <w:numPr>
           <w:ilvl w:val="0"/>
-          <w:numId w:val="1524"/>
+          <w:numId w:val="1530"/>
         </w:numPr>
       </w:pPr>
       <w:r>
@@ -11781,7 +11980,7 @@
         <w:pStyle w:val="Compact"/>
         <w:numPr>
           <w:ilvl w:val="0"/>
-          <w:numId w:val="1525"/>
+          <w:numId w:val="1531"/>
         </w:numPr>
       </w:pPr>
       <w:r>
@@ -11793,7 +11992,7 @@
         <w:pStyle w:val="Compact"/>
         <w:numPr>
           <w:ilvl w:val="0"/>
-          <w:numId w:val="1526"/>
+          <w:numId w:val="1532"/>
         </w:numPr>
       </w:pPr>
       <w:r>
@@ -11805,7 +12004,7 @@
         <w:pStyle w:val="Compact"/>
         <w:numPr>
           <w:ilvl w:val="0"/>
-          <w:numId w:val="1527"/>
+          <w:numId w:val="1533"/>
         </w:numPr>
       </w:pPr>
       <w:r>
@@ -11817,7 +12016,7 @@
         <w:pStyle w:val="Compact"/>
         <w:numPr>
           <w:ilvl w:val="0"/>
-          <w:numId w:val="1528"/>
+          <w:numId w:val="1534"/>
         </w:numPr>
       </w:pPr>
       <w:r>
@@ -11829,7 +12028,7 @@
         <w:pStyle w:val="Compact"/>
         <w:numPr>
           <w:ilvl w:val="0"/>
-          <w:numId w:val="1529"/>
+          <w:numId w:val="1535"/>
         </w:numPr>
       </w:pPr>
       <w:r>
@@ -11841,7 +12040,7 @@
         <w:pStyle w:val="Compact"/>
         <w:numPr>
           <w:ilvl w:val="0"/>
-          <w:numId w:val="1530"/>
+          <w:numId w:val="1536"/>
         </w:numPr>
       </w:pPr>
       <w:r>
@@ -11853,7 +12052,7 @@
         <w:pStyle w:val="Compact"/>
         <w:numPr>
           <w:ilvl w:val="0"/>
-          <w:numId w:val="1531"/>
+          <w:numId w:val="1537"/>
         </w:numPr>
       </w:pPr>
       <w:r>
@@ -11880,7 +12079,7 @@
         <w:pStyle w:val="Compact"/>
         <w:numPr>
           <w:ilvl w:val="0"/>
-          <w:numId w:val="1532"/>
+          <w:numId w:val="1538"/>
         </w:numPr>
       </w:pPr>
       <w:r>
@@ -11901,15 +12100,15 @@
         <w:pStyle w:val="Compact"/>
         <w:numPr>
           <w:ilvl w:val="0"/>
-          <w:numId w:val="1533"/>
+          <w:numId w:val="1539"/>
         </w:numPr>
       </w:pPr>
       <w:r>
         <w:t xml:space="preserve">Existing campaign actions still work: rerun/refresh, start, pause, delete where allowed.</w:t>
       </w:r>
     </w:p>
-    <w:bookmarkEnd w:id="74"/>
-    <w:bookmarkStart w:id="75" w:name="backendapi"/>
+    <w:bookmarkEnd w:id="75"/>
+    <w:bookmarkStart w:id="76" w:name="backendapi"/>
     <w:p>
       <w:pPr>
         <w:pStyle w:val="Heading3"/>
@@ -11923,7 +12122,7 @@
         <w:pStyle w:val="Compact"/>
         <w:numPr>
           <w:ilvl w:val="0"/>
-          <w:numId w:val="1534"/>
+          <w:numId w:val="1540"/>
         </w:numPr>
       </w:pPr>
       <w:r>
@@ -11935,7 +12134,7 @@
         <w:pStyle w:val="Compact"/>
         <w:numPr>
           <w:ilvl w:val="0"/>
-          <w:numId w:val="1535"/>
+          <w:numId w:val="1541"/>
         </w:numPr>
       </w:pPr>
       <w:r>
@@ -11947,7 +12146,7 @@
         <w:pStyle w:val="Compact"/>
         <w:numPr>
           <w:ilvl w:val="0"/>
-          <w:numId w:val="1536"/>
+          <w:numId w:val="1542"/>
         </w:numPr>
       </w:pPr>
       <w:r>
@@ -11959,7 +12158,7 @@
         <w:pStyle w:val="Compact"/>
         <w:numPr>
           <w:ilvl w:val="0"/>
-          <w:numId w:val="1537"/>
+          <w:numId w:val="1543"/>
         </w:numPr>
       </w:pPr>
       <w:r>
@@ -11971,7 +12170,7 @@
         <w:pStyle w:val="Compact"/>
         <w:numPr>
           <w:ilvl w:val="0"/>
-          <w:numId w:val="1538"/>
+          <w:numId w:val="1544"/>
         </w:numPr>
       </w:pPr>
       <w:r>
@@ -11983,7 +12182,7 @@
         <w:pStyle w:val="Compact"/>
         <w:numPr>
           <w:ilvl w:val="0"/>
-          <w:numId w:val="1539"/>
+          <w:numId w:val="1545"/>
         </w:numPr>
       </w:pPr>
       <w:r>
@@ -11995,7 +12194,7 @@
         <w:pStyle w:val="Compact"/>
         <w:numPr>
           <w:ilvl w:val="0"/>
-          <w:numId w:val="1540"/>
+          <w:numId w:val="1546"/>
         </w:numPr>
       </w:pPr>
       <w:r>
@@ -12007,15 +12206,15 @@
         <w:pStyle w:val="Compact"/>
         <w:numPr>
           <w:ilvl w:val="0"/>
-          <w:numId w:val="1541"/>
+          <w:numId w:val="1547"/>
         </w:numPr>
       </w:pPr>
       <w:r>
         <w:t xml:space="preserve">AI Retarget is upstream recommendation only; no auto-send.</w:t>
       </w:r>
     </w:p>
-    <w:bookmarkEnd w:id="75"/>
-    <w:bookmarkStart w:id="76" w:name="m2.3-testing-gate"/>
+    <w:bookmarkEnd w:id="76"/>
+    <w:bookmarkStart w:id="77" w:name="m2.3-testing-gate"/>
     <w:p>
       <w:pPr>
         <w:pStyle w:val="Heading3"/>
@@ -12029,7 +12228,7 @@
         <w:pStyle w:val="Compact"/>
         <w:numPr>
           <w:ilvl w:val="0"/>
-          <w:numId w:val="1542"/>
+          <w:numId w:val="1548"/>
         </w:numPr>
       </w:pPr>
       <w:r>
@@ -12041,7 +12240,7 @@
         <w:pStyle w:val="Compact"/>
         <w:numPr>
           <w:ilvl w:val="0"/>
-          <w:numId w:val="1543"/>
+          <w:numId w:val="1549"/>
         </w:numPr>
       </w:pPr>
       <w:r>
@@ -12053,7 +12252,7 @@
         <w:pStyle w:val="Compact"/>
         <w:numPr>
           <w:ilvl w:val="0"/>
-          <w:numId w:val="1544"/>
+          <w:numId w:val="1550"/>
         </w:numPr>
       </w:pPr>
       <w:r>
@@ -12065,7 +12264,7 @@
         <w:pStyle w:val="Compact"/>
         <w:numPr>
           <w:ilvl w:val="0"/>
-          <w:numId w:val="1545"/>
+          <w:numId w:val="1551"/>
         </w:numPr>
       </w:pPr>
       <w:r>
@@ -12077,7 +12276,7 @@
         <w:pStyle w:val="Compact"/>
         <w:numPr>
           <w:ilvl w:val="0"/>
-          <w:numId w:val="1546"/>
+          <w:numId w:val="1552"/>
         </w:numPr>
       </w:pPr>
       <w:r>
@@ -12089,7 +12288,7 @@
         <w:pStyle w:val="Compact"/>
         <w:numPr>
           <w:ilvl w:val="0"/>
-          <w:numId w:val="1547"/>
+          <w:numId w:val="1553"/>
         </w:numPr>
       </w:pPr>
       <w:r>
@@ -12101,7 +12300,7 @@
         <w:pStyle w:val="Compact"/>
         <w:numPr>
           <w:ilvl w:val="0"/>
-          <w:numId w:val="1548"/>
+          <w:numId w:val="1554"/>
         </w:numPr>
       </w:pPr>
       <w:r>
@@ -12113,7 +12312,7 @@
         <w:pStyle w:val="Compact"/>
         <w:numPr>
           <w:ilvl w:val="0"/>
-          <w:numId w:val="1549"/>
+          <w:numId w:val="1555"/>
         </w:numPr>
       </w:pPr>
       <w:r>
@@ -12125,7 +12324,7 @@
         <w:pStyle w:val="Compact"/>
         <w:numPr>
           <w:ilvl w:val="0"/>
-          <w:numId w:val="1550"/>
+          <w:numId w:val="1556"/>
         </w:numPr>
       </w:pPr>
       <w:r>
@@ -12137,7 +12336,7 @@
         <w:pStyle w:val="Compact"/>
         <w:numPr>
           <w:ilvl w:val="0"/>
-          <w:numId w:val="1551"/>
+          <w:numId w:val="1557"/>
         </w:numPr>
       </w:pPr>
       <w:r>
@@ -12149,7 +12348,7 @@
         <w:pStyle w:val="Compact"/>
         <w:numPr>
           <w:ilvl w:val="0"/>
-          <w:numId w:val="1552"/>
+          <w:numId w:val="1558"/>
         </w:numPr>
       </w:pPr>
       <w:r>
@@ -12161,7 +12360,7 @@
         <w:pStyle w:val="Compact"/>
         <w:numPr>
           <w:ilvl w:val="0"/>
-          <w:numId w:val="1553"/>
+          <w:numId w:val="1559"/>
         </w:numPr>
       </w:pPr>
       <w:r>
@@ -12173,7 +12372,7 @@
         <w:pStyle w:val="Compact"/>
         <w:numPr>
           <w:ilvl w:val="0"/>
-          <w:numId w:val="1554"/>
+          <w:numId w:val="1560"/>
         </w:numPr>
       </w:pPr>
       <w:r>
@@ -12185,7 +12384,7 @@
         <w:pStyle w:val="Compact"/>
         <w:numPr>
           <w:ilvl w:val="0"/>
-          <w:numId w:val="1555"/>
+          <w:numId w:val="1561"/>
         </w:numPr>
       </w:pPr>
       <w:r>
@@ -12197,16 +12396,16 @@
         <w:pStyle w:val="Compact"/>
         <w:numPr>
           <w:ilvl w:val="0"/>
-          <w:numId w:val="1556"/>
+          <w:numId w:val="1562"/>
         </w:numPr>
       </w:pPr>
       <w:r>
         <w:t xml:space="preserve">Progress dashboard updated.</w:t>
       </w:r>
     </w:p>
-    <w:bookmarkEnd w:id="76"/>
     <w:bookmarkEnd w:id="77"/>
-    <w:bookmarkStart w:id="81" w:name="m2.4-m2-full-regression-and-release-gate"/>
+    <w:bookmarkEnd w:id="78"/>
+    <w:bookmarkStart w:id="82" w:name="m2.4-m2-full-regression-and-release-gate"/>
     <w:p>
       <w:pPr>
         <w:pStyle w:val="Heading2"/>
@@ -12215,7 +12414,7 @@
         <w:t xml:space="preserve">M2.4 — M2 Full Regression And Release Gate</w:t>
       </w:r>
     </w:p>
-    <w:bookmarkStart w:id="78" w:name="functional-regression-1"/>
+    <w:bookmarkStart w:id="79" w:name="functional-regression-1"/>
     <w:p>
       <w:pPr>
         <w:pStyle w:val="Heading3"/>
@@ -12229,7 +12428,7 @@
         <w:pStyle w:val="Compact"/>
         <w:numPr>
           <w:ilvl w:val="0"/>
-          <w:numId w:val="1557"/>
+          <w:numId w:val="1563"/>
         </w:numPr>
       </w:pPr>
       <w:r>
@@ -12241,7 +12440,7 @@
         <w:pStyle w:val="Compact"/>
         <w:numPr>
           <w:ilvl w:val="0"/>
-          <w:numId w:val="1558"/>
+          <w:numId w:val="1564"/>
         </w:numPr>
       </w:pPr>
       <w:r>
@@ -12253,7 +12452,7 @@
         <w:pStyle w:val="Compact"/>
         <w:numPr>
           <w:ilvl w:val="0"/>
-          <w:numId w:val="1559"/>
+          <w:numId w:val="1565"/>
         </w:numPr>
       </w:pPr>
       <w:r>
@@ -12265,7 +12464,7 @@
         <w:pStyle w:val="Compact"/>
         <w:numPr>
           <w:ilvl w:val="0"/>
-          <w:numId w:val="1560"/>
+          <w:numId w:val="1566"/>
         </w:numPr>
       </w:pPr>
       <w:r>
@@ -12277,7 +12476,7 @@
         <w:pStyle w:val="Compact"/>
         <w:numPr>
           <w:ilvl w:val="0"/>
-          <w:numId w:val="1561"/>
+          <w:numId w:val="1567"/>
         </w:numPr>
       </w:pPr>
       <w:r>
@@ -12289,7 +12488,7 @@
         <w:pStyle w:val="Compact"/>
         <w:numPr>
           <w:ilvl w:val="0"/>
-          <w:numId w:val="1562"/>
+          <w:numId w:val="1568"/>
         </w:numPr>
       </w:pPr>
       <w:r>
@@ -12301,7 +12500,7 @@
         <w:pStyle w:val="Compact"/>
         <w:numPr>
           <w:ilvl w:val="0"/>
-          <w:numId w:val="1563"/>
+          <w:numId w:val="1569"/>
         </w:numPr>
       </w:pPr>
       <w:r>
@@ -12313,7 +12512,7 @@
         <w:pStyle w:val="Compact"/>
         <w:numPr>
           <w:ilvl w:val="0"/>
-          <w:numId w:val="1564"/>
+          <w:numId w:val="1570"/>
         </w:numPr>
       </w:pPr>
       <w:r>
@@ -12325,7 +12524,7 @@
         <w:pStyle w:val="Compact"/>
         <w:numPr>
           <w:ilvl w:val="0"/>
-          <w:numId w:val="1565"/>
+          <w:numId w:val="1571"/>
         </w:numPr>
       </w:pPr>
       <w:r>
@@ -12337,7 +12536,7 @@
         <w:pStyle w:val="Compact"/>
         <w:numPr>
           <w:ilvl w:val="0"/>
-          <w:numId w:val="1566"/>
+          <w:numId w:val="1572"/>
         </w:numPr>
       </w:pPr>
       <w:r>
@@ -12349,7 +12548,7 @@
         <w:pStyle w:val="Compact"/>
         <w:numPr>
           <w:ilvl w:val="0"/>
-          <w:numId w:val="1567"/>
+          <w:numId w:val="1573"/>
         </w:numPr>
       </w:pPr>
       <w:r>
@@ -12361,7 +12560,7 @@
         <w:pStyle w:val="Compact"/>
         <w:numPr>
           <w:ilvl w:val="0"/>
-          <w:numId w:val="1568"/>
+          <w:numId w:val="1574"/>
         </w:numPr>
       </w:pPr>
       <w:r>
@@ -12373,7 +12572,7 @@
         <w:pStyle w:val="Compact"/>
         <w:numPr>
           <w:ilvl w:val="0"/>
-          <w:numId w:val="1569"/>
+          <w:numId w:val="1575"/>
         </w:numPr>
       </w:pPr>
       <w:r>
@@ -12395,8 +12594,8 @@
         <w:t xml:space="preserve">and test messages.</w:t>
       </w:r>
     </w:p>
-    <w:bookmarkEnd w:id="78"/>
-    <w:bookmarkStart w:id="79" w:name="visual-regression-1"/>
+    <w:bookmarkEnd w:id="79"/>
+    <w:bookmarkStart w:id="80" w:name="visual-regression-1"/>
     <w:p>
       <w:pPr>
         <w:pStyle w:val="Heading3"/>
@@ -12410,7 +12609,7 @@
         <w:pStyle w:val="Compact"/>
         <w:numPr>
           <w:ilvl w:val="0"/>
-          <w:numId w:val="1570"/>
+          <w:numId w:val="1576"/>
         </w:numPr>
       </w:pPr>
       <w:r>
@@ -12422,7 +12621,7 @@
         <w:pStyle w:val="Compact"/>
         <w:numPr>
           <w:ilvl w:val="0"/>
-          <w:numId w:val="1571"/>
+          <w:numId w:val="1577"/>
         </w:numPr>
       </w:pPr>
       <w:r>
@@ -12449,7 +12648,7 @@
         <w:pStyle w:val="Compact"/>
         <w:numPr>
           <w:ilvl w:val="0"/>
-          <w:numId w:val="1572"/>
+          <w:numId w:val="1578"/>
         </w:numPr>
       </w:pPr>
       <w:r>
@@ -12461,7 +12660,7 @@
         <w:pStyle w:val="Compact"/>
         <w:numPr>
           <w:ilvl w:val="0"/>
-          <w:numId w:val="1573"/>
+          <w:numId w:val="1579"/>
         </w:numPr>
       </w:pPr>
       <w:r>
@@ -12473,7 +12672,7 @@
         <w:pStyle w:val="Compact"/>
         <w:numPr>
           <w:ilvl w:val="0"/>
-          <w:numId w:val="1574"/>
+          <w:numId w:val="1580"/>
         </w:numPr>
       </w:pPr>
       <w:r>
@@ -12485,7 +12684,7 @@
         <w:pStyle w:val="Compact"/>
         <w:numPr>
           <w:ilvl w:val="0"/>
-          <w:numId w:val="1575"/>
+          <w:numId w:val="1581"/>
         </w:numPr>
       </w:pPr>
       <w:r>
@@ -12497,7 +12696,7 @@
         <w:pStyle w:val="Compact"/>
         <w:numPr>
           <w:ilvl w:val="0"/>
-          <w:numId w:val="1576"/>
+          <w:numId w:val="1582"/>
         </w:numPr>
       </w:pPr>
       <w:r>
@@ -12509,15 +12708,15 @@
         <w:pStyle w:val="Compact"/>
         <w:numPr>
           <w:ilvl w:val="0"/>
-          <w:numId w:val="1577"/>
+          <w:numId w:val="1583"/>
         </w:numPr>
       </w:pPr>
       <w:r>
         <w:t xml:space="preserve">No unreadable text if current styles fail; scoped style set added if needed.</w:t>
       </w:r>
     </w:p>
-    <w:bookmarkEnd w:id="79"/>
-    <w:bookmarkStart w:id="80" w:name="release-readiness-1"/>
+    <w:bookmarkEnd w:id="80"/>
+    <w:bookmarkStart w:id="81" w:name="release-readiness-1"/>
     <w:p>
       <w:pPr>
         <w:pStyle w:val="Heading3"/>
@@ -12531,7 +12730,7 @@
         <w:pStyle w:val="Compact"/>
         <w:numPr>
           <w:ilvl w:val="0"/>
-          <w:numId w:val="1578"/>
+          <w:numId w:val="1584"/>
         </w:numPr>
       </w:pPr>
       <w:r>
@@ -12543,7 +12742,7 @@
         <w:pStyle w:val="Compact"/>
         <w:numPr>
           <w:ilvl w:val="0"/>
-          <w:numId w:val="1579"/>
+          <w:numId w:val="1585"/>
         </w:numPr>
       </w:pPr>
       <w:r>
@@ -12555,7 +12754,7 @@
         <w:pStyle w:val="Compact"/>
         <w:numPr>
           <w:ilvl w:val="0"/>
-          <w:numId w:val="1580"/>
+          <w:numId w:val="1586"/>
         </w:numPr>
       </w:pPr>
       <w:r>
@@ -12567,7 +12766,7 @@
         <w:pStyle w:val="Compact"/>
         <w:numPr>
           <w:ilvl w:val="0"/>
-          <w:numId w:val="1581"/>
+          <w:numId w:val="1587"/>
         </w:numPr>
       </w:pPr>
       <w:r>
@@ -12579,7 +12778,7 @@
         <w:pStyle w:val="Compact"/>
         <w:numPr>
           <w:ilvl w:val="0"/>
-          <w:numId w:val="1582"/>
+          <w:numId w:val="1588"/>
         </w:numPr>
       </w:pPr>
       <w:r>
@@ -12591,7 +12790,7 @@
         <w:pStyle w:val="Compact"/>
         <w:numPr>
           <w:ilvl w:val="0"/>
-          <w:numId w:val="1583"/>
+          <w:numId w:val="1589"/>
         </w:numPr>
       </w:pPr>
       <w:r>
@@ -12603,7 +12802,7 @@
         <w:pStyle w:val="Compact"/>
         <w:numPr>
           <w:ilvl w:val="0"/>
-          <w:numId w:val="1584"/>
+          <w:numId w:val="1590"/>
         </w:numPr>
       </w:pPr>
       <w:r>
@@ -12615,7 +12814,7 @@
         <w:pStyle w:val="Compact"/>
         <w:numPr>
           <w:ilvl w:val="0"/>
-          <w:numId w:val="1585"/>
+          <w:numId w:val="1591"/>
         </w:numPr>
       </w:pPr>
       <w:r>
@@ -12627,16 +12826,16 @@
         <w:pStyle w:val="Compact"/>
         <w:numPr>
           <w:ilvl w:val="0"/>
-          <w:numId w:val="1586"/>
+          <w:numId w:val="1592"/>
         </w:numPr>
       </w:pPr>
       <w:r>
         <w:t xml:space="preserve">Progress dashboard updated to M2 complete only after all gates pass.</w:t>
       </w:r>
     </w:p>
-    <w:bookmarkEnd w:id="80"/>
     <w:bookmarkEnd w:id="81"/>
-    <w:bookmarkStart w:id="82" w:name="full-final-acceptance"/>
+    <w:bookmarkEnd w:id="82"/>
+    <w:bookmarkStart w:id="83" w:name="full-final-acceptance"/>
     <w:p>
       <w:pPr>
         <w:pStyle w:val="Heading2"/>
@@ -12650,7 +12849,7 @@
         <w:pStyle w:val="Compact"/>
         <w:numPr>
           <w:ilvl w:val="0"/>
-          <w:numId w:val="1587"/>
+          <w:numId w:val="1593"/>
         </w:numPr>
       </w:pPr>
       <w:r>
@@ -12662,7 +12861,7 @@
         <w:pStyle w:val="Compact"/>
         <w:numPr>
           <w:ilvl w:val="0"/>
-          <w:numId w:val="1588"/>
+          <w:numId w:val="1594"/>
         </w:numPr>
       </w:pPr>
       <w:r>
@@ -12674,7 +12873,7 @@
         <w:pStyle w:val="Compact"/>
         <w:numPr>
           <w:ilvl w:val="0"/>
-          <w:numId w:val="1589"/>
+          <w:numId w:val="1595"/>
         </w:numPr>
       </w:pPr>
       <w:r>
@@ -12686,7 +12885,7 @@
         <w:pStyle w:val="Compact"/>
         <w:numPr>
           <w:ilvl w:val="0"/>
-          <w:numId w:val="1590"/>
+          <w:numId w:val="1596"/>
         </w:numPr>
       </w:pPr>
       <w:r>
@@ -12698,7 +12897,7 @@
         <w:pStyle w:val="Compact"/>
         <w:numPr>
           <w:ilvl w:val="0"/>
-          <w:numId w:val="1591"/>
+          <w:numId w:val="1597"/>
         </w:numPr>
       </w:pPr>
       <w:r>
@@ -12710,7 +12909,7 @@
         <w:pStyle w:val="Compact"/>
         <w:numPr>
           <w:ilvl w:val="0"/>
-          <w:numId w:val="1592"/>
+          <w:numId w:val="1598"/>
         </w:numPr>
       </w:pPr>
       <w:r>
@@ -12722,7 +12921,7 @@
         <w:pStyle w:val="Compact"/>
         <w:numPr>
           <w:ilvl w:val="0"/>
-          <w:numId w:val="1593"/>
+          <w:numId w:val="1599"/>
         </w:numPr>
       </w:pPr>
       <w:r>
@@ -12734,7 +12933,7 @@
         <w:pStyle w:val="Compact"/>
         <w:numPr>
           <w:ilvl w:val="0"/>
-          <w:numId w:val="1594"/>
+          <w:numId w:val="1600"/>
         </w:numPr>
       </w:pPr>
       <w:r>
@@ -12746,7 +12945,7 @@
         <w:pStyle w:val="Compact"/>
         <w:numPr>
           <w:ilvl w:val="0"/>
-          <w:numId w:val="1595"/>
+          <w:numId w:val="1601"/>
         </w:numPr>
       </w:pPr>
       <w:r>
@@ -12758,7 +12957,7 @@
         <w:pStyle w:val="Compact"/>
         <w:numPr>
           <w:ilvl w:val="0"/>
-          <w:numId w:val="1596"/>
+          <w:numId w:val="1602"/>
         </w:numPr>
       </w:pPr>
       <w:r>
@@ -12770,15 +12969,15 @@
         <w:pStyle w:val="Compact"/>
         <w:numPr>
           <w:ilvl w:val="0"/>
-          <w:numId w:val="1597"/>
+          <w:numId w:val="1603"/>
         </w:numPr>
       </w:pPr>
       <w:r>
         <w:t xml:space="preserve">Final client-facing summary prepared with what changed, how it was tested, and what is intentionally out of scope.</w:t>
       </w:r>
     </w:p>
-    <w:bookmarkEnd w:id="82"/>
-    <w:bookmarkStart w:id="83" w:name="progress-update-log"/>
+    <w:bookmarkEnd w:id="83"/>
+    <w:bookmarkStart w:id="84" w:name="progress-update-log"/>
     <w:p>
       <w:pPr>
         <w:pStyle w:val="Heading2"/>
@@ -12921,8 +13120,8 @@
         </w:tc>
       </w:tr>
     </w:tbl>
-    <w:bookmarkEnd w:id="83"/>
     <w:bookmarkEnd w:id="84"/>
+    <w:bookmarkEnd w:id="85"/>
     <w:sectPr>
       <w:footnotePr>
         <w:numRestart w:val="eachSect"/>
@@ -14477,16 +14676,16 @@
     <w:abstractNumId w:val="992"/>
   </w:num>
   <w:num w:numId="1396">
-    <w:abstractNumId w:val="992"/>
+    <w:abstractNumId w:val="993"/>
   </w:num>
   <w:num w:numId="1397">
-    <w:abstractNumId w:val="992"/>
+    <w:abstractNumId w:val="993"/>
   </w:num>
   <w:num w:numId="1398">
-    <w:abstractNumId w:val="992"/>
+    <w:abstractNumId w:val="993"/>
   </w:num>
   <w:num w:numId="1399">
-    <w:abstractNumId w:val="992"/>
+    <w:abstractNumId w:val="993"/>
   </w:num>
   <w:num w:numId="1400">
     <w:abstractNumId w:val="992"/>
@@ -14495,58 +14694,58 @@
     <w:abstractNumId w:val="992"/>
   </w:num>
   <w:num w:numId="1402">
-    <w:abstractNumId w:val="992"/>
+    <w:abstractNumId w:val="993"/>
   </w:num>
   <w:num w:numId="1403">
-    <w:abstractNumId w:val="992"/>
+    <w:abstractNumId w:val="993"/>
   </w:num>
   <w:num w:numId="1404">
-    <w:abstractNumId w:val="992"/>
+    <w:abstractNumId w:val="993"/>
   </w:num>
   <w:num w:numId="1405">
-    <w:abstractNumId w:val="992"/>
+    <w:abstractNumId w:val="993"/>
   </w:num>
   <w:num w:numId="1406">
-    <w:abstractNumId w:val="992"/>
+    <w:abstractNumId w:val="993"/>
   </w:num>
   <w:num w:numId="1407">
-    <w:abstractNumId w:val="992"/>
+    <w:abstractNumId w:val="993"/>
   </w:num>
   <w:num w:numId="1408">
-    <w:abstractNumId w:val="992"/>
+    <w:abstractNumId w:val="993"/>
   </w:num>
   <w:num w:numId="1409">
-    <w:abstractNumId w:val="992"/>
+    <w:abstractNumId w:val="993"/>
   </w:num>
   <w:num w:numId="1410">
-    <w:abstractNumId w:val="992"/>
+    <w:abstractNumId w:val="993"/>
   </w:num>
   <w:num w:numId="1411">
+    <w:abstractNumId w:val="993"/>
+  </w:num>
+  <w:num w:numId="1412">
+    <w:abstractNumId w:val="993"/>
+  </w:num>
+  <w:num w:numId="1413">
+    <w:abstractNumId w:val="993"/>
+  </w:num>
+  <w:num w:numId="1414">
+    <w:abstractNumId w:val="993"/>
+  </w:num>
+  <w:num w:numId="1415">
+    <w:abstractNumId w:val="993"/>
+  </w:num>
+  <w:num w:numId="1416">
+    <w:abstractNumId w:val="992"/>
+  </w:num>
+  <w:num w:numId="1417">
     <w:abstractNumId w:val="991"/>
   </w:num>
-  <w:num w:numId="1412">
-    <w:abstractNumId w:val="992"/>
-  </w:num>
-  <w:num w:numId="1413">
-    <w:abstractNumId w:val="992"/>
-  </w:num>
-  <w:num w:numId="1414">
-    <w:abstractNumId w:val="992"/>
-  </w:num>
-  <w:num w:numId="1415">
-    <w:abstractNumId w:val="992"/>
-  </w:num>
-  <w:num w:numId="1416">
-    <w:abstractNumId w:val="992"/>
-  </w:num>
-  <w:num w:numId="1417">
-    <w:abstractNumId w:val="992"/>
-  </w:num>
   <w:num w:numId="1418">
-    <w:abstractNumId w:val="992"/>
+    <w:abstractNumId w:val="993"/>
   </w:num>
   <w:num w:numId="1419">
-    <w:abstractNumId w:val="992"/>
+    <w:abstractNumId w:val="993"/>
   </w:num>
   <w:num w:numId="1420">
     <w:abstractNumId w:val="992"/>
@@ -14564,28 +14763,28 @@
     <w:abstractNumId w:val="992"/>
   </w:num>
   <w:num w:numId="1425">
-    <w:abstractNumId w:val="992"/>
+    <w:abstractNumId w:val="993"/>
   </w:num>
   <w:num w:numId="1426">
+    <w:abstractNumId w:val="992"/>
+  </w:num>
+  <w:num w:numId="1427">
+    <w:abstractNumId w:val="992"/>
+  </w:num>
+  <w:num w:numId="1428">
+    <w:abstractNumId w:val="993"/>
+  </w:num>
+  <w:num w:numId="1429">
+    <w:abstractNumId w:val="993"/>
+  </w:num>
+  <w:num w:numId="1430">
+    <w:abstractNumId w:val="992"/>
+  </w:num>
+  <w:num w:numId="1431">
+    <w:abstractNumId w:val="992"/>
+  </w:num>
+  <w:num w:numId="1432">
     <w:abstractNumId w:val="991"/>
-  </w:num>
-  <w:num w:numId="1427">
-    <w:abstractNumId w:val="992"/>
-  </w:num>
-  <w:num w:numId="1428">
-    <w:abstractNumId w:val="992"/>
-  </w:num>
-  <w:num w:numId="1429">
-    <w:abstractNumId w:val="992"/>
-  </w:num>
-  <w:num w:numId="1430">
-    <w:abstractNumId w:val="991"/>
-  </w:num>
-  <w:num w:numId="1431">
-    <w:abstractNumId w:val="992"/>
-  </w:num>
-  <w:num w:numId="1432">
-    <w:abstractNumId w:val="992"/>
   </w:num>
   <w:num w:numId="1433">
     <w:abstractNumId w:val="992"/>
@@ -14603,25 +14802,25 @@
     <w:abstractNumId w:val="992"/>
   </w:num>
   <w:num w:numId="1438">
+    <w:abstractNumId w:val="992"/>
+  </w:num>
+  <w:num w:numId="1439">
+    <w:abstractNumId w:val="992"/>
+  </w:num>
+  <w:num w:numId="1440">
+    <w:abstractNumId w:val="992"/>
+  </w:num>
+  <w:num w:numId="1441">
+    <w:abstractNumId w:val="992"/>
+  </w:num>
+  <w:num w:numId="1442">
     <w:abstractNumId w:val="991"/>
   </w:num>
-  <w:num w:numId="1439">
-    <w:abstractNumId w:val="992"/>
-  </w:num>
-  <w:num w:numId="1440">
-    <w:abstractNumId w:val="992"/>
-  </w:num>
-  <w:num w:numId="1441">
-    <w:abstractNumId w:val="992"/>
-  </w:num>
-  <w:num w:numId="1442">
-    <w:abstractNumId w:val="992"/>
-  </w:num>
   <w:num w:numId="1443">
     <w:abstractNumId w:val="992"/>
   </w:num>
   <w:num w:numId="1444">
-    <w:abstractNumId w:val="992"/>
+    <w:abstractNumId w:val="991"/>
   </w:num>
   <w:num w:numId="1445">
     <w:abstractNumId w:val="992"/>
@@ -14633,26 +14832,26 @@
     <w:abstractNumId w:val="992"/>
   </w:num>
   <w:num w:numId="1448">
+    <w:abstractNumId w:val="992"/>
+  </w:num>
+  <w:num w:numId="1449">
+    <w:abstractNumId w:val="992"/>
+  </w:num>
+  <w:num w:numId="1450">
+    <w:abstractNumId w:val="992"/>
+  </w:num>
+  <w:num w:numId="1451">
+    <w:abstractNumId w:val="992"/>
+  </w:num>
+  <w:num w:numId="1452">
+    <w:abstractNumId w:val="992"/>
+  </w:num>
+  <w:num w:numId="1453">
+    <w:abstractNumId w:val="992"/>
+  </w:num>
+  <w:num w:numId="1454">
     <w:abstractNumId w:val="991"/>
   </w:num>
-  <w:num w:numId="1449">
-    <w:abstractNumId w:val="992"/>
-  </w:num>
-  <w:num w:numId="1450">
-    <w:abstractNumId w:val="992"/>
-  </w:num>
-  <w:num w:numId="1451">
-    <w:abstractNumId w:val="992"/>
-  </w:num>
-  <w:num w:numId="1452">
-    <w:abstractNumId w:val="992"/>
-  </w:num>
-  <w:num w:numId="1453">
-    <w:abstractNumId w:val="992"/>
-  </w:num>
-  <w:num w:numId="1454">
-    <w:abstractNumId w:val="992"/>
-  </w:num>
   <w:num w:numId="1455">
     <w:abstractNumId w:val="992"/>
   </w:num>
@@ -14699,26 +14898,26 @@
     <w:abstractNumId w:val="992"/>
   </w:num>
   <w:num w:numId="1470">
+    <w:abstractNumId w:val="992"/>
+  </w:num>
+  <w:num w:numId="1471">
+    <w:abstractNumId w:val="992"/>
+  </w:num>
+  <w:num w:numId="1472">
+    <w:abstractNumId w:val="992"/>
+  </w:num>
+  <w:num w:numId="1473">
+    <w:abstractNumId w:val="992"/>
+  </w:num>
+  <w:num w:numId="1474">
+    <w:abstractNumId w:val="992"/>
+  </w:num>
+  <w:num w:numId="1475">
+    <w:abstractNumId w:val="992"/>
+  </w:num>
+  <w:num w:numId="1476">
     <w:abstractNumId w:val="991"/>
   </w:num>
-  <w:num w:numId="1471">
-    <w:abstractNumId w:val="992"/>
-  </w:num>
-  <w:num w:numId="1472">
-    <w:abstractNumId w:val="992"/>
-  </w:num>
-  <w:num w:numId="1473">
-    <w:abstractNumId w:val="992"/>
-  </w:num>
-  <w:num w:numId="1474">
-    <w:abstractNumId w:val="992"/>
-  </w:num>
-  <w:num w:numId="1475">
-    <w:abstractNumId w:val="992"/>
-  </w:num>
-  <w:num w:numId="1476">
-    <w:abstractNumId w:val="992"/>
-  </w:num>
   <w:num w:numId="1477">
     <w:abstractNumId w:val="992"/>
   </w:num>
@@ -14765,35 +14964,35 @@
     <w:abstractNumId w:val="992"/>
   </w:num>
   <w:num w:numId="1492">
+    <w:abstractNumId w:val="992"/>
+  </w:num>
+  <w:num w:numId="1493">
+    <w:abstractNumId w:val="992"/>
+  </w:num>
+  <w:num w:numId="1494">
+    <w:abstractNumId w:val="992"/>
+  </w:num>
+  <w:num w:numId="1495">
+    <w:abstractNumId w:val="992"/>
+  </w:num>
+  <w:num w:numId="1496">
+    <w:abstractNumId w:val="992"/>
+  </w:num>
+  <w:num w:numId="1497">
+    <w:abstractNumId w:val="992"/>
+  </w:num>
+  <w:num w:numId="1498">
     <w:abstractNumId w:val="991"/>
   </w:num>
-  <w:num w:numId="1493">
-    <w:abstractNumId w:val="992"/>
-  </w:num>
-  <w:num w:numId="1494">
-    <w:abstractNumId w:val="992"/>
-  </w:num>
-  <w:num w:numId="1495">
+  <w:num w:numId="1499">
+    <w:abstractNumId w:val="992"/>
+  </w:num>
+  <w:num w:numId="1500">
+    <w:abstractNumId w:val="992"/>
+  </w:num>
+  <w:num w:numId="1501">
     <w:abstractNumId w:val="991"/>
   </w:num>
-  <w:num w:numId="1496">
-    <w:abstractNumId w:val="992"/>
-  </w:num>
-  <w:num w:numId="1497">
-    <w:abstractNumId w:val="992"/>
-  </w:num>
-  <w:num w:numId="1498">
-    <w:abstractNumId w:val="992"/>
-  </w:num>
-  <w:num w:numId="1499">
-    <w:abstractNumId w:val="992"/>
-  </w:num>
-  <w:num w:numId="1500">
-    <w:abstractNumId w:val="992"/>
-  </w:num>
-  <w:num w:numId="1501">
-    <w:abstractNumId w:val="992"/>
-  </w:num>
   <w:num w:numId="1502">
     <w:abstractNumId w:val="992"/>
   </w:num>
@@ -14807,32 +15006,32 @@
     <w:abstractNumId w:val="992"/>
   </w:num>
   <w:num w:numId="1506">
+    <w:abstractNumId w:val="992"/>
+  </w:num>
+  <w:num w:numId="1507">
+    <w:abstractNumId w:val="992"/>
+  </w:num>
+  <w:num w:numId="1508">
+    <w:abstractNumId w:val="992"/>
+  </w:num>
+  <w:num w:numId="1509">
+    <w:abstractNumId w:val="992"/>
+  </w:num>
+  <w:num w:numId="1510">
+    <w:abstractNumId w:val="992"/>
+  </w:num>
+  <w:num w:numId="1511">
+    <w:abstractNumId w:val="992"/>
+  </w:num>
+  <w:num w:numId="1512">
     <w:abstractNumId w:val="991"/>
   </w:num>
-  <w:num w:numId="1507">
-    <w:abstractNumId w:val="992"/>
-  </w:num>
-  <w:num w:numId="1508">
+  <w:num w:numId="1513">
+    <w:abstractNumId w:val="992"/>
+  </w:num>
+  <w:num w:numId="1514">
     <w:abstractNumId w:val="991"/>
   </w:num>
-  <w:num w:numId="1509">
-    <w:abstractNumId w:val="992"/>
-  </w:num>
-  <w:num w:numId="1510">
-    <w:abstractNumId w:val="992"/>
-  </w:num>
-  <w:num w:numId="1511">
-    <w:abstractNumId w:val="992"/>
-  </w:num>
-  <w:num w:numId="1512">
-    <w:abstractNumId w:val="992"/>
-  </w:num>
-  <w:num w:numId="1513">
-    <w:abstractNumId w:val="992"/>
-  </w:num>
-  <w:num w:numId="1514">
-    <w:abstractNumId w:val="992"/>
-  </w:num>
   <w:num w:numId="1515">
     <w:abstractNumId w:val="992"/>
   </w:num>
@@ -15080,6 +15279,24 @@
     <w:abstractNumId w:val="992"/>
   </w:num>
   <w:num w:numId="1597">
+    <w:abstractNumId w:val="992"/>
+  </w:num>
+  <w:num w:numId="1598">
+    <w:abstractNumId w:val="992"/>
+  </w:num>
+  <w:num w:numId="1599">
+    <w:abstractNumId w:val="992"/>
+  </w:num>
+  <w:num w:numId="1600">
+    <w:abstractNumId w:val="992"/>
+  </w:num>
+  <w:num w:numId="1601">
+    <w:abstractNumId w:val="992"/>
+  </w:num>
+  <w:num w:numId="1602">
+    <w:abstractNumId w:val="992"/>
+  </w:num>
+  <w:num w:numId="1603">
     <w:abstractNumId w:val="992"/>
   </w:num>
 </w:numbering>

</xml_diff>

<commit_message>
Implement M2.2 lead enrichment export
</commit_message>
<xml_diff>
--- a/MASTER_M1_M2_DELIVERY_CHECKLIST.docx
+++ b/MASTER_M1_M2_DELIVERY_CHECKLIST.docx
@@ -10,7 +10,7 @@
         <w:t xml:space="preserve">© BuyReadySite.com</w:t>
       </w:r>
     </w:p>
-    <w:bookmarkStart w:id="85" w:name="X3d74ce0b4fd94f465ac7edf34b08aa6d5ff209b"/>
+    <w:bookmarkStart w:id="86" w:name="X3d74ce0b4fd94f465ac7edf34b08aa6d5ff209b"/>
     <w:p>
       <w:pPr>
         <w:pStyle w:val="Heading1"/>
@@ -553,7 +553,7 @@
               <w:jc w:val="right"/>
             </w:pPr>
             <w:r>
-              <w:t xml:space="preserve">0%</w:t>
+              <w:t xml:space="preserve">6%</w:t>
             </w:r>
           </w:p>
         </w:tc>
@@ -564,7 +564,7 @@
               <w:pStyle w:val="Compact"/>
             </w:pPr>
             <w:r>
-              <w:t xml:space="preserve">Not started</w:t>
+              <w:t xml:space="preserve">Implementation + focused tests/build passed; browser/pixel/manual CSV smoke pending</w:t>
             </w:r>
           </w:p>
         </w:tc>
@@ -709,7 +709,7 @@
                 <w:b/>
                 <w:bCs/>
               </w:rPr>
-              <w:t xml:space="preserve">46%</w:t>
+              <w:t xml:space="preserve">52%</w:t>
             </w:r>
           </w:p>
         </w:tc>
@@ -724,7 +724,7 @@
                 <w:b/>
                 <w:bCs/>
               </w:rPr>
-              <w:t xml:space="preserve">M2.1 access/source implementation added after M1.3; browser smoke gates remain</w:t>
+              <w:t xml:space="preserve">M2.2 enrichment/export implementation added; browser smoke gates remain</w:t>
             </w:r>
           </w:p>
         </w:tc>
@@ -10103,7 +10103,7 @@
     </w:p>
     <w:bookmarkEnd w:id="61"/>
     <w:bookmarkEnd w:id="62"/>
-    <w:bookmarkStart w:id="68" w:name="X80216ddf01e64983419846741e514a0cb2a2ddb"/>
+    <w:bookmarkStart w:id="69" w:name="X80216ddf01e64983419846741e514a0cb2a2ddb"/>
     <w:p>
       <w:pPr>
         <w:pStyle w:val="Heading2"/>
@@ -10112,12 +10112,316 @@
         <w:t xml:space="preserve">M2.2 — Leads Enrichment Columns And Export CSV</w:t>
       </w:r>
     </w:p>
-    <w:bookmarkStart w:id="63" w:name="leads-table-columns"/>
+    <w:bookmarkStart w:id="63" w:name="implementation-evidence-2026-05-02-4"/>
     <w:p>
       <w:pPr>
         <w:pStyle w:val="Heading3"/>
       </w:pPr>
       <w:r>
+        <w:t xml:space="preserve">Implementation evidence — 2026-05-02</w:t>
+      </w:r>
+    </w:p>
+    <w:p>
+      <w:pPr>
+        <w:pStyle w:val="Compact"/>
+        <w:numPr>
+          <w:ilvl w:val="0"/>
+          <w:numId w:val="1430"/>
+        </w:numPr>
+      </w:pPr>
+      <w:r>
+        <w:t xml:space="preserve">Backend Leads list now returns</w:t>
+      </w:r>
+      <w:r>
+        <w:t xml:space="preserve"> </w:t>
+      </w:r>
+      <w:r>
+        <w:rPr>
+          <w:rStyle w:val="VerbatimChar"/>
+        </w:rPr>
+        <w:t xml:space="preserve">enrichment</w:t>
+      </w:r>
+      <w:r>
+        <w:t xml:space="preserve"> </w:t>
+      </w:r>
+      <w:r>
+        <w:t xml:space="preserve">for each lead: industry, monthly revenue, revenue source, last contact timestamp, rep initials, contact direction, readable source primary/secondary.</w:t>
+      </w:r>
+    </w:p>
+    <w:p>
+      <w:pPr>
+        <w:pStyle w:val="Compact"/>
+        <w:numPr>
+          <w:ilvl w:val="0"/>
+          <w:numId w:val="1431"/>
+        </w:numPr>
+      </w:pPr>
+      <w:r>
+        <w:t xml:space="preserve">Enrichment uses existing schema only:</w:t>
+      </w:r>
+      <w:r>
+        <w:t xml:space="preserve"> </w:t>
+      </w:r>
+      <w:r>
+        <w:rPr>
+          <w:rStyle w:val="VerbatimChar"/>
+        </w:rPr>
+        <w:t xml:space="preserve">Lead.customFields</w:t>
+      </w:r>
+      <w:r>
+        <w:t xml:space="preserve">,</w:t>
+      </w:r>
+      <w:r>
+        <w:t xml:space="preserve"> </w:t>
+      </w:r>
+      <w:r>
+        <w:rPr>
+          <w:rStyle w:val="VerbatimChar"/>
+        </w:rPr>
+        <w:t xml:space="preserve">Deal.client.monthlyRevenue</w:t>
+      </w:r>
+      <w:r>
+        <w:t xml:space="preserve">,</w:t>
+      </w:r>
+      <w:r>
+        <w:t xml:space="preserve"> </w:t>
+      </w:r>
+      <w:r>
+        <w:rPr>
+          <w:rStyle w:val="VerbatimChar"/>
+        </w:rPr>
+        <w:t xml:space="preserve">Conversation.extractedIndustry</w:t>
+      </w:r>
+      <w:r>
+        <w:t xml:space="preserve">,</w:t>
+      </w:r>
+      <w:r>
+        <w:t xml:space="preserve"> </w:t>
+      </w:r>
+      <w:r>
+        <w:rPr>
+          <w:rStyle w:val="VerbatimChar"/>
+        </w:rPr>
+        <w:t xml:space="preserve">Conversation.extractedRevenue</w:t>
+      </w:r>
+      <w:r>
+        <w:t xml:space="preserve">,</w:t>
+      </w:r>
+      <w:r>
+        <w:t xml:space="preserve"> </w:t>
+      </w:r>
+      <w:r>
+        <w:rPr>
+          <w:rStyle w:val="VerbatimChar"/>
+        </w:rPr>
+        <w:t xml:space="preserve">Conversation.aiSignals</w:t>
+      </w:r>
+      <w:r>
+        <w:t xml:space="preserve">, latest message attribution, import-list tags, and campaign lineage.</w:t>
+      </w:r>
+    </w:p>
+    <w:p>
+      <w:pPr>
+        <w:pStyle w:val="Compact"/>
+        <w:numPr>
+          <w:ilvl w:val="0"/>
+          <w:numId w:val="1432"/>
+        </w:numPr>
+      </w:pPr>
+      <w:r>
+        <w:t xml:space="preserve">CSV import mapping now accepts optional Industry, Monthly Revenue, and Annual Revenue fields and stores them in</w:t>
+      </w:r>
+      <w:r>
+        <w:t xml:space="preserve"> </w:t>
+      </w:r>
+      <w:r>
+        <w:rPr>
+          <w:rStyle w:val="VerbatimChar"/>
+        </w:rPr>
+        <w:t xml:space="preserve">customFields</w:t>
+      </w:r>
+      <w:r>
+        <w:t xml:space="preserve"> </w:t>
+      </w:r>
+      <w:r>
+        <w:t xml:space="preserve">for enrichment/export without a migration.</w:t>
+      </w:r>
+    </w:p>
+    <w:p>
+      <w:pPr>
+        <w:pStyle w:val="Compact"/>
+        <w:numPr>
+          <w:ilvl w:val="0"/>
+          <w:numId w:val="1433"/>
+        </w:numPr>
+      </w:pPr>
+      <w:r>
+        <w:t xml:space="preserve">Leads table now includes retained M2.2 columns: Last Contact, Industry, Monthly Revenue, Source, Added.</w:t>
+      </w:r>
+    </w:p>
+    <w:p>
+      <w:pPr>
+        <w:pStyle w:val="Compact"/>
+        <w:numPr>
+          <w:ilvl w:val="0"/>
+          <w:numId w:val="1434"/>
+        </w:numPr>
+      </w:pPr>
+      <w:r>
+        <w:t xml:space="preserve">Leads export button uses current search/status/list filters and downloads</w:t>
+      </w:r>
+      <w:r>
+        <w:t xml:space="preserve"> </w:t>
+      </w:r>
+      <w:r>
+        <w:rPr>
+          <w:rStyle w:val="VerbatimChar"/>
+        </w:rPr>
+        <w:t xml:space="preserve">/leads/export</w:t>
+      </w:r>
+      <w:r>
+        <w:t xml:space="preserve"> </w:t>
+      </w:r>
+      <w:r>
+        <w:t xml:space="preserve">as CSV blob.</w:t>
+      </w:r>
+    </w:p>
+    <w:p>
+      <w:pPr>
+        <w:pStyle w:val="Compact"/>
+        <w:numPr>
+          <w:ilvl w:val="0"/>
+          <w:numId w:val="1435"/>
+        </w:numPr>
+      </w:pPr>
+      <w:r>
+        <w:t xml:space="preserve">Export endpoint includes enrichment columns and preserves REP scope.</w:t>
+      </w:r>
+    </w:p>
+    <w:p>
+      <w:pPr>
+        <w:pStyle w:val="Compact"/>
+        <w:numPr>
+          <w:ilvl w:val="0"/>
+          <w:numId w:val="1436"/>
+        </w:numPr>
+      </w:pPr>
+      <w:r>
+        <w:t xml:space="preserve">Focused tests added in</w:t>
+      </w:r>
+      <w:r>
+        <w:t xml:space="preserve"> </w:t>
+      </w:r>
+      <w:r>
+        <w:rPr>
+          <w:rStyle w:val="VerbatimChar"/>
+        </w:rPr>
+        <w:t xml:space="preserve">server/tests/leadEnrichmentExport.test.ts</w:t>
+      </w:r>
+      <w:r>
+        <w:t xml:space="preserve"> </w:t>
+      </w:r>
+      <w:r>
+        <w:t xml:space="preserve">for list enrichment and export headers/rows/scope.</w:t>
+      </w:r>
+    </w:p>
+    <w:p>
+      <w:pPr>
+        <w:pStyle w:val="Compact"/>
+        <w:numPr>
+          <w:ilvl w:val="0"/>
+          <w:numId w:val="1437"/>
+        </w:numPr>
+      </w:pPr>
+      <w:r>
+        <w:t xml:space="preserve">Validation passed:</w:t>
+      </w:r>
+      <w:r>
+        <w:t xml:space="preserve"> </w:t>
+      </w:r>
+      <w:r>
+        <w:rPr>
+          <w:rStyle w:val="VerbatimChar"/>
+        </w:rPr>
+        <w:t xml:space="preserve">cd server &amp;&amp; npx vitest run tests/leadEnrichmentExport.test.ts tests/leadCampaignScope.test.ts</w:t>
+      </w:r>
+      <w:r>
+        <w:t xml:space="preserve"> </w:t>
+      </w:r>
+      <w:r>
+        <w:t xml:space="preserve">— 7/7 passed, with known local Redis</w:t>
+      </w:r>
+      <w:r>
+        <w:t xml:space="preserve"> </w:t>
+      </w:r>
+      <w:r>
+        <w:rPr>
+          <w:rStyle w:val="VerbatimChar"/>
+        </w:rPr>
+        <w:t xml:space="preserve">ECONNREFUSED</w:t>
+      </w:r>
+      <w:r>
+        <w:t xml:space="preserve"> </w:t>
+      </w:r>
+      <w:r>
+        <w:t xml:space="preserve">warning only.</w:t>
+      </w:r>
+    </w:p>
+    <w:p>
+      <w:pPr>
+        <w:pStyle w:val="Compact"/>
+        <w:numPr>
+          <w:ilvl w:val="0"/>
+          <w:numId w:val="1438"/>
+        </w:numPr>
+      </w:pPr>
+      <w:r>
+        <w:t xml:space="preserve">Validation passed: root server</w:t>
+      </w:r>
+      <w:r>
+        <w:t xml:space="preserve"> </w:t>
+      </w:r>
+      <w:r>
+        <w:rPr>
+          <w:rStyle w:val="VerbatimChar"/>
+        </w:rPr>
+        <w:t xml:space="preserve">npm run build</w:t>
+      </w:r>
+      <w:r>
+        <w:t xml:space="preserve">; client</w:t>
+      </w:r>
+      <w:r>
+        <w:t xml:space="preserve"> </w:t>
+      </w:r>
+      <w:r>
+        <w:rPr>
+          <w:rStyle w:val="VerbatimChar"/>
+        </w:rPr>
+        <w:t xml:space="preserve">cd client &amp;&amp; npm run build</w:t>
+      </w:r>
+      <w:r>
+        <w:t xml:space="preserve">.</w:t>
+      </w:r>
+    </w:p>
+    <w:p>
+      <w:pPr>
+        <w:pStyle w:val="Compact"/>
+        <w:numPr>
+          <w:ilvl w:val="0"/>
+          <w:numId w:val="1439"/>
+        </w:numPr>
+      </w:pPr>
+      <w:r>
+        <w:t xml:space="preserve">Targeted ESLint passed with 0 errors and existing warning debt only.</w:t>
+      </w:r>
+    </w:p>
+    <w:bookmarkEnd w:id="63"/>
+    <w:bookmarkStart w:id="64" w:name="leads-table-columns"/>
+    <w:p>
+      <w:pPr>
+        <w:pStyle w:val="Heading3"/>
+      </w:pPr>
+      <w:r>
         <w:t xml:space="preserve">Leads table columns</w:t>
       </w:r>
     </w:p>
@@ -10126,7 +10430,7 @@
         <w:pStyle w:val="Compact"/>
         <w:numPr>
           <w:ilvl w:val="0"/>
-          <w:numId w:val="1430"/>
+          <w:numId w:val="1440"/>
         </w:numPr>
       </w:pPr>
       <w:r>
@@ -10138,282 +10442,11 @@
         <w:pStyle w:val="Compact"/>
         <w:numPr>
           <w:ilvl w:val="0"/>
-          <w:numId w:val="1431"/>
+          <w:numId w:val="1441"/>
         </w:numPr>
       </w:pPr>
       <w:r>
         <w:t xml:space="preserve">Columns match prototype order:</w:t>
-      </w:r>
-    </w:p>
-    <w:p>
-      <w:pPr>
-        <w:pStyle w:val="Compact"/>
-        <w:numPr>
-          <w:ilvl w:val="1"/>
-          <w:numId w:val="1432"/>
-        </w:numPr>
-      </w:pPr>
-      <w:r>
-        <w:t xml:space="preserve">Name;</w:t>
-      </w:r>
-    </w:p>
-    <w:p>
-      <w:pPr>
-        <w:pStyle w:val="Compact"/>
-        <w:numPr>
-          <w:ilvl w:val="1"/>
-          <w:numId w:val="1432"/>
-        </w:numPr>
-      </w:pPr>
-      <w:r>
-        <w:t xml:space="preserve">Phone;</w:t>
-      </w:r>
-    </w:p>
-    <w:p>
-      <w:pPr>
-        <w:pStyle w:val="Compact"/>
-        <w:numPr>
-          <w:ilvl w:val="1"/>
-          <w:numId w:val="1432"/>
-        </w:numPr>
-      </w:pPr>
-      <w:r>
-        <w:t xml:space="preserve">Status;</w:t>
-      </w:r>
-    </w:p>
-    <w:p>
-      <w:pPr>
-        <w:pStyle w:val="Compact"/>
-        <w:numPr>
-          <w:ilvl w:val="1"/>
-          <w:numId w:val="1432"/>
-        </w:numPr>
-      </w:pPr>
-      <w:r>
-        <w:t xml:space="preserve">Last Contact;</w:t>
-      </w:r>
-    </w:p>
-    <w:p>
-      <w:pPr>
-        <w:pStyle w:val="Compact"/>
-        <w:numPr>
-          <w:ilvl w:val="1"/>
-          <w:numId w:val="1432"/>
-        </w:numPr>
-      </w:pPr>
-      <w:r>
-        <w:t xml:space="preserve">Industry;</w:t>
-      </w:r>
-    </w:p>
-    <w:p>
-      <w:pPr>
-        <w:pStyle w:val="Compact"/>
-        <w:numPr>
-          <w:ilvl w:val="1"/>
-          <w:numId w:val="1432"/>
-        </w:numPr>
-      </w:pPr>
-      <w:r>
-        <w:t xml:space="preserve">Monthly Revenue;</w:t>
-      </w:r>
-    </w:p>
-    <w:p>
-      <w:pPr>
-        <w:pStyle w:val="Compact"/>
-        <w:numPr>
-          <w:ilvl w:val="1"/>
-          <w:numId w:val="1432"/>
-        </w:numPr>
-      </w:pPr>
-      <w:r>
-        <w:t xml:space="preserve">Source;</w:t>
-      </w:r>
-    </w:p>
-    <w:p>
-      <w:pPr>
-        <w:pStyle w:val="Compact"/>
-        <w:numPr>
-          <w:ilvl w:val="1"/>
-          <w:numId w:val="1432"/>
-        </w:numPr>
-      </w:pPr>
-      <w:r>
-        <w:t xml:space="preserve">Added.</w:t>
-      </w:r>
-    </w:p>
-    <w:p>
-      <w:pPr>
-        <w:pStyle w:val="Compact"/>
-        <w:numPr>
-          <w:ilvl w:val="0"/>
-          <w:numId w:val="1433"/>
-        </w:numPr>
-      </w:pPr>
-      <w:r>
-        <w:t xml:space="preserve">Last Contact shows rep attribution initials and relative time, e.g. </w:t>
-      </w:r>
-      <w:r>
-        <w:rPr>
-          <w:rStyle w:val="VerbatimChar"/>
-        </w:rPr>
-        <w:t xml:space="preserve">JB 2h ago</w:t>
-      </w:r>
-      <w:r>
-        <w:t xml:space="preserve">.</w:t>
-      </w:r>
-    </w:p>
-    <w:p>
-      <w:pPr>
-        <w:pStyle w:val="Compact"/>
-        <w:numPr>
-          <w:ilvl w:val="0"/>
-          <w:numId w:val="1434"/>
-        </w:numPr>
-      </w:pPr>
-      <w:r>
-        <w:t xml:space="preserve">Industry renders extracted/classified value or</w:t>
-      </w:r>
-      <w:r>
-        <w:t xml:space="preserve"> </w:t>
-      </w:r>
-      <w:r>
-        <w:rPr>
-          <w:rStyle w:val="VerbatimChar"/>
-        </w:rPr>
-        <w:t xml:space="preserve">— unknown</w:t>
-      </w:r>
-      <w:r>
-        <w:t xml:space="preserve">.</w:t>
-      </w:r>
-    </w:p>
-    <w:p>
-      <w:pPr>
-        <w:pStyle w:val="Compact"/>
-        <w:numPr>
-          <w:ilvl w:val="0"/>
-          <w:numId w:val="1435"/>
-        </w:numPr>
-      </w:pPr>
-      <w:r>
-        <w:t xml:space="preserve">Monthly Revenue renders raw/formatted revenue plus provenance chip:</w:t>
-      </w:r>
-    </w:p>
-    <w:p>
-      <w:pPr>
-        <w:pStyle w:val="Compact"/>
-        <w:numPr>
-          <w:ilvl w:val="1"/>
-          <w:numId w:val="1436"/>
-        </w:numPr>
-      </w:pPr>
-      <w:r>
-        <w:t xml:space="preserve">AI;</w:t>
-      </w:r>
-    </w:p>
-    <w:p>
-      <w:pPr>
-        <w:pStyle w:val="Compact"/>
-        <w:numPr>
-          <w:ilvl w:val="1"/>
-          <w:numId w:val="1436"/>
-        </w:numPr>
-      </w:pPr>
-      <w:r>
-        <w:t xml:space="preserve">CSV;</w:t>
-      </w:r>
-    </w:p>
-    <w:p>
-      <w:pPr>
-        <w:pStyle w:val="Compact"/>
-        <w:numPr>
-          <w:ilvl w:val="1"/>
-          <w:numId w:val="1436"/>
-        </w:numPr>
-      </w:pPr>
-      <w:r>
-        <w:t xml:space="preserve">MANUAL.</w:t>
-      </w:r>
-    </w:p>
-    <w:p>
-      <w:pPr>
-        <w:pStyle w:val="Compact"/>
-        <w:numPr>
-          <w:ilvl w:val="0"/>
-          <w:numId w:val="1437"/>
-        </w:numPr>
-      </w:pPr>
-      <w:r>
-        <w:t xml:space="preserve">Empty revenue renders</w:t>
-      </w:r>
-      <w:r>
-        <w:t xml:space="preserve"> </w:t>
-      </w:r>
-      <w:r>
-        <w:rPr>
-          <w:rStyle w:val="VerbatimChar"/>
-        </w:rPr>
-        <w:t xml:space="preserve">—</w:t>
-      </w:r>
-      <w:r>
-        <w:t xml:space="preserve">.</w:t>
-      </w:r>
-    </w:p>
-    <w:p>
-      <w:pPr>
-        <w:pStyle w:val="Compact"/>
-        <w:numPr>
-          <w:ilvl w:val="0"/>
-          <w:numId w:val="1438"/>
-        </w:numPr>
-      </w:pPr>
-      <w:r>
-        <w:t xml:space="preserve">Source cell uses two-line readable source/list pattern.</w:t>
-      </w:r>
-    </w:p>
-    <w:p>
-      <w:pPr>
-        <w:pStyle w:val="Compact"/>
-        <w:numPr>
-          <w:ilvl w:val="0"/>
-          <w:numId w:val="1439"/>
-        </w:numPr>
-      </w:pPr>
-      <w:r>
-        <w:t xml:space="preserve">Status pill styles match prototype.</w:t>
-      </w:r>
-    </w:p>
-    <w:p>
-      <w:pPr>
-        <w:pStyle w:val="Compact"/>
-        <w:numPr>
-          <w:ilvl w:val="0"/>
-          <w:numId w:val="1440"/>
-        </w:numPr>
-      </w:pPr>
-      <w:r>
-        <w:t xml:space="preserve">Avatar initials match prototype density.</w:t>
-      </w:r>
-    </w:p>
-    <w:bookmarkEnd w:id="63"/>
-    <w:bookmarkStart w:id="64" w:name="data-plumbing"/>
-    <w:p>
-      <w:pPr>
-        <w:pStyle w:val="Heading3"/>
-      </w:pPr>
-      <w:r>
-        <w:t xml:space="preserve">Data plumbing</w:t>
-      </w:r>
-    </w:p>
-    <w:p>
-      <w:pPr>
-        <w:pStyle w:val="Compact"/>
-        <w:numPr>
-          <w:ilvl w:val="0"/>
-          <w:numId w:val="1441"/>
-        </w:numPr>
-      </w:pPr>
-      <w:r>
-        <w:t xml:space="preserve">Confirm data source for industry:</w:t>
       </w:r>
     </w:p>
     <w:p>
@@ -10425,7 +10458,7 @@
         </w:numPr>
       </w:pPr>
       <w:r>
-        <w:t xml:space="preserve">existing AI classifier field;</w:t>
+        <w:t xml:space="preserve">Name;</w:t>
       </w:r>
     </w:p>
     <w:p>
@@ -10437,7 +10470,7 @@
         </w:numPr>
       </w:pPr>
       <w:r>
-        <w:t xml:space="preserve">CSV value;</w:t>
+        <w:t xml:space="preserve">Phone;</w:t>
       </w:r>
     </w:p>
     <w:p>
@@ -10449,6 +10482,277 @@
         </w:numPr>
       </w:pPr>
       <w:r>
+        <w:t xml:space="preserve">Status;</w:t>
+      </w:r>
+    </w:p>
+    <w:p>
+      <w:pPr>
+        <w:pStyle w:val="Compact"/>
+        <w:numPr>
+          <w:ilvl w:val="1"/>
+          <w:numId w:val="1442"/>
+        </w:numPr>
+      </w:pPr>
+      <w:r>
+        <w:t xml:space="preserve">Last Contact;</w:t>
+      </w:r>
+    </w:p>
+    <w:p>
+      <w:pPr>
+        <w:pStyle w:val="Compact"/>
+        <w:numPr>
+          <w:ilvl w:val="1"/>
+          <w:numId w:val="1442"/>
+        </w:numPr>
+      </w:pPr>
+      <w:r>
+        <w:t xml:space="preserve">Industry;</w:t>
+      </w:r>
+    </w:p>
+    <w:p>
+      <w:pPr>
+        <w:pStyle w:val="Compact"/>
+        <w:numPr>
+          <w:ilvl w:val="1"/>
+          <w:numId w:val="1442"/>
+        </w:numPr>
+      </w:pPr>
+      <w:r>
+        <w:t xml:space="preserve">Monthly Revenue;</w:t>
+      </w:r>
+    </w:p>
+    <w:p>
+      <w:pPr>
+        <w:pStyle w:val="Compact"/>
+        <w:numPr>
+          <w:ilvl w:val="1"/>
+          <w:numId w:val="1442"/>
+        </w:numPr>
+      </w:pPr>
+      <w:r>
+        <w:t xml:space="preserve">Source;</w:t>
+      </w:r>
+    </w:p>
+    <w:p>
+      <w:pPr>
+        <w:pStyle w:val="Compact"/>
+        <w:numPr>
+          <w:ilvl w:val="1"/>
+          <w:numId w:val="1442"/>
+        </w:numPr>
+      </w:pPr>
+      <w:r>
+        <w:t xml:space="preserve">Added.</w:t>
+      </w:r>
+    </w:p>
+    <w:p>
+      <w:pPr>
+        <w:pStyle w:val="Compact"/>
+        <w:numPr>
+          <w:ilvl w:val="0"/>
+          <w:numId w:val="1443"/>
+        </w:numPr>
+      </w:pPr>
+      <w:r>
+        <w:t xml:space="preserve">Last Contact shows rep attribution initials and relative time, e.g. </w:t>
+      </w:r>
+      <w:r>
+        <w:rPr>
+          <w:rStyle w:val="VerbatimChar"/>
+        </w:rPr>
+        <w:t xml:space="preserve">JB 2h ago</w:t>
+      </w:r>
+      <w:r>
+        <w:t xml:space="preserve">.</w:t>
+      </w:r>
+    </w:p>
+    <w:p>
+      <w:pPr>
+        <w:pStyle w:val="Compact"/>
+        <w:numPr>
+          <w:ilvl w:val="0"/>
+          <w:numId w:val="1444"/>
+        </w:numPr>
+      </w:pPr>
+      <w:r>
+        <w:t xml:space="preserve">Industry renders extracted/classified value or</w:t>
+      </w:r>
+      <w:r>
+        <w:t xml:space="preserve"> </w:t>
+      </w:r>
+      <w:r>
+        <w:rPr>
+          <w:rStyle w:val="VerbatimChar"/>
+        </w:rPr>
+        <w:t xml:space="preserve">— unknown</w:t>
+      </w:r>
+      <w:r>
+        <w:t xml:space="preserve">.</w:t>
+      </w:r>
+    </w:p>
+    <w:p>
+      <w:pPr>
+        <w:pStyle w:val="Compact"/>
+        <w:numPr>
+          <w:ilvl w:val="0"/>
+          <w:numId w:val="1445"/>
+        </w:numPr>
+      </w:pPr>
+      <w:r>
+        <w:t xml:space="preserve">Monthly Revenue renders raw/formatted revenue plus provenance chip:</w:t>
+      </w:r>
+    </w:p>
+    <w:p>
+      <w:pPr>
+        <w:pStyle w:val="Compact"/>
+        <w:numPr>
+          <w:ilvl w:val="1"/>
+          <w:numId w:val="1446"/>
+        </w:numPr>
+      </w:pPr>
+      <w:r>
+        <w:t xml:space="preserve">AI;</w:t>
+      </w:r>
+    </w:p>
+    <w:p>
+      <w:pPr>
+        <w:pStyle w:val="Compact"/>
+        <w:numPr>
+          <w:ilvl w:val="1"/>
+          <w:numId w:val="1446"/>
+        </w:numPr>
+      </w:pPr>
+      <w:r>
+        <w:t xml:space="preserve">CSV;</w:t>
+      </w:r>
+    </w:p>
+    <w:p>
+      <w:pPr>
+        <w:pStyle w:val="Compact"/>
+        <w:numPr>
+          <w:ilvl w:val="1"/>
+          <w:numId w:val="1446"/>
+        </w:numPr>
+      </w:pPr>
+      <w:r>
+        <w:t xml:space="preserve">MANUAL.</w:t>
+      </w:r>
+    </w:p>
+    <w:p>
+      <w:pPr>
+        <w:pStyle w:val="Compact"/>
+        <w:numPr>
+          <w:ilvl w:val="0"/>
+          <w:numId w:val="1447"/>
+        </w:numPr>
+      </w:pPr>
+      <w:r>
+        <w:t xml:space="preserve">Empty revenue renders</w:t>
+      </w:r>
+      <w:r>
+        <w:t xml:space="preserve"> </w:t>
+      </w:r>
+      <w:r>
+        <w:rPr>
+          <w:rStyle w:val="VerbatimChar"/>
+        </w:rPr>
+        <w:t xml:space="preserve">—</w:t>
+      </w:r>
+      <w:r>
+        <w:t xml:space="preserve">.</w:t>
+      </w:r>
+    </w:p>
+    <w:p>
+      <w:pPr>
+        <w:pStyle w:val="Compact"/>
+        <w:numPr>
+          <w:ilvl w:val="0"/>
+          <w:numId w:val="1448"/>
+        </w:numPr>
+      </w:pPr>
+      <w:r>
+        <w:t xml:space="preserve">Source cell uses two-line readable source/list pattern.</w:t>
+      </w:r>
+    </w:p>
+    <w:p>
+      <w:pPr>
+        <w:pStyle w:val="Compact"/>
+        <w:numPr>
+          <w:ilvl w:val="0"/>
+          <w:numId w:val="1449"/>
+        </w:numPr>
+      </w:pPr>
+      <w:r>
+        <w:t xml:space="preserve">Status pill styles match prototype.</w:t>
+      </w:r>
+    </w:p>
+    <w:p>
+      <w:pPr>
+        <w:pStyle w:val="Compact"/>
+        <w:numPr>
+          <w:ilvl w:val="0"/>
+          <w:numId w:val="1450"/>
+        </w:numPr>
+      </w:pPr>
+      <w:r>
+        <w:t xml:space="preserve">Avatar initials match prototype density.</w:t>
+      </w:r>
+    </w:p>
+    <w:bookmarkEnd w:id="64"/>
+    <w:bookmarkStart w:id="65" w:name="data-plumbing"/>
+    <w:p>
+      <w:pPr>
+        <w:pStyle w:val="Heading3"/>
+      </w:pPr>
+      <w:r>
+        <w:t xml:space="preserve">Data plumbing</w:t>
+      </w:r>
+    </w:p>
+    <w:p>
+      <w:pPr>
+        <w:pStyle w:val="Compact"/>
+        <w:numPr>
+          <w:ilvl w:val="0"/>
+          <w:numId w:val="1451"/>
+        </w:numPr>
+      </w:pPr>
+      <w:r>
+        <w:t xml:space="preserve">Confirm data source for industry:</w:t>
+      </w:r>
+    </w:p>
+    <w:p>
+      <w:pPr>
+        <w:pStyle w:val="Compact"/>
+        <w:numPr>
+          <w:ilvl w:val="1"/>
+          <w:numId w:val="1452"/>
+        </w:numPr>
+      </w:pPr>
+      <w:r>
+        <w:t xml:space="preserve">existing AI classifier field;</w:t>
+      </w:r>
+    </w:p>
+    <w:p>
+      <w:pPr>
+        <w:pStyle w:val="Compact"/>
+        <w:numPr>
+          <w:ilvl w:val="1"/>
+          <w:numId w:val="1452"/>
+        </w:numPr>
+      </w:pPr>
+      <w:r>
+        <w:t xml:space="preserve">CSV value;</w:t>
+      </w:r>
+    </w:p>
+    <w:p>
+      <w:pPr>
+        <w:pStyle w:val="Compact"/>
+        <w:numPr>
+          <w:ilvl w:val="1"/>
+          <w:numId w:val="1452"/>
+        </w:numPr>
+      </w:pPr>
+      <w:r>
         <w:t xml:space="preserve">manual override.</w:t>
       </w:r>
     </w:p>
@@ -10457,174 +10761,11 @@
         <w:pStyle w:val="Compact"/>
         <w:numPr>
           <w:ilvl w:val="0"/>
-          <w:numId w:val="1443"/>
+          <w:numId w:val="1453"/>
         </w:numPr>
       </w:pPr>
       <w:r>
         <w:t xml:space="preserve">Confirm data source for monthly revenue:</w:t>
-      </w:r>
-    </w:p>
-    <w:p>
-      <w:pPr>
-        <w:pStyle w:val="Compact"/>
-        <w:numPr>
-          <w:ilvl w:val="1"/>
-          <w:numId w:val="1444"/>
-        </w:numPr>
-      </w:pPr>
-      <w:r>
-        <w:t xml:space="preserve">existing AI extraction;</w:t>
-      </w:r>
-    </w:p>
-    <w:p>
-      <w:pPr>
-        <w:pStyle w:val="Compact"/>
-        <w:numPr>
-          <w:ilvl w:val="1"/>
-          <w:numId w:val="1444"/>
-        </w:numPr>
-      </w:pPr>
-      <w:r>
-        <w:t xml:space="preserve">CSV import;</w:t>
-      </w:r>
-    </w:p>
-    <w:p>
-      <w:pPr>
-        <w:pStyle w:val="Compact"/>
-        <w:numPr>
-          <w:ilvl w:val="1"/>
-          <w:numId w:val="1444"/>
-        </w:numPr>
-      </w:pPr>
-      <w:r>
-        <w:t xml:space="preserve">manual field.</w:t>
-      </w:r>
-    </w:p>
-    <w:p>
-      <w:pPr>
-        <w:pStyle w:val="Compact"/>
-        <w:numPr>
-          <w:ilvl w:val="0"/>
-          <w:numId w:val="1445"/>
-        </w:numPr>
-      </w:pPr>
-      <w:r>
-        <w:t xml:space="preserve">Define priority when values conflict: manual &gt; CSV &gt; AI unless spec says otherwise.</w:t>
-      </w:r>
-    </w:p>
-    <w:p>
-      <w:pPr>
-        <w:pStyle w:val="Compact"/>
-        <w:numPr>
-          <w:ilvl w:val="0"/>
-          <w:numId w:val="1446"/>
-        </w:numPr>
-      </w:pPr>
-      <w:r>
-        <w:t xml:space="preserve">Last Contact uses latest meaningful contact and preserves admin attribution.</w:t>
-      </w:r>
-    </w:p>
-    <w:p>
-      <w:pPr>
-        <w:pStyle w:val="Compact"/>
-        <w:numPr>
-          <w:ilvl w:val="0"/>
-          <w:numId w:val="1447"/>
-        </w:numPr>
-      </w:pPr>
-      <w:r>
-        <w:t xml:space="preserve">Rep scope applies to all enrichment queries.</w:t>
-      </w:r>
-    </w:p>
-    <w:bookmarkEnd w:id="64"/>
-    <w:bookmarkStart w:id="65" w:name="export-csv"/>
-    <w:p>
-      <w:pPr>
-        <w:pStyle w:val="Heading3"/>
-      </w:pPr>
-      <w:r>
-        <w:t xml:space="preserve">Export CSV</w:t>
-      </w:r>
-    </w:p>
-    <w:p>
-      <w:pPr>
-        <w:pStyle w:val="Compact"/>
-        <w:numPr>
-          <w:ilvl w:val="0"/>
-          <w:numId w:val="1448"/>
-        </w:numPr>
-      </w:pPr>
-      <w:r>
-        <w:t xml:space="preserve">Export button label includes filtered count, e.g. </w:t>
-      </w:r>
-      <w:r>
-        <w:rPr>
-          <w:rStyle w:val="VerbatimChar"/>
-        </w:rPr>
-        <w:t xml:space="preserve">Export CSV 12 leads</w:t>
-      </w:r>
-      <w:r>
-        <w:t xml:space="preserve">.</w:t>
-      </w:r>
-    </w:p>
-    <w:p>
-      <w:pPr>
-        <w:pStyle w:val="Compact"/>
-        <w:numPr>
-          <w:ilvl w:val="0"/>
-          <w:numId w:val="1449"/>
-        </w:numPr>
-      </w:pPr>
-      <w:r>
-        <w:t xml:space="preserve">Export respects current search.</w:t>
-      </w:r>
-    </w:p>
-    <w:p>
-      <w:pPr>
-        <w:pStyle w:val="Compact"/>
-        <w:numPr>
-          <w:ilvl w:val="0"/>
-          <w:numId w:val="1450"/>
-        </w:numPr>
-      </w:pPr>
-      <w:r>
-        <w:t xml:space="preserve">Export respects status filter.</w:t>
-      </w:r>
-    </w:p>
-    <w:p>
-      <w:pPr>
-        <w:pStyle w:val="Compact"/>
-        <w:numPr>
-          <w:ilvl w:val="0"/>
-          <w:numId w:val="1451"/>
-        </w:numPr>
-      </w:pPr>
-      <w:r>
-        <w:t xml:space="preserve">Export respects list/source filter.</w:t>
-      </w:r>
-    </w:p>
-    <w:p>
-      <w:pPr>
-        <w:pStyle w:val="Compact"/>
-        <w:numPr>
-          <w:ilvl w:val="0"/>
-          <w:numId w:val="1452"/>
-        </w:numPr>
-      </w:pPr>
-      <w:r>
-        <w:t xml:space="preserve">Export respects rep scope.</w:t>
-      </w:r>
-    </w:p>
-    <w:p>
-      <w:pPr>
-        <w:pStyle w:val="Compact"/>
-        <w:numPr>
-          <w:ilvl w:val="0"/>
-          <w:numId w:val="1453"/>
-        </w:numPr>
-      </w:pPr>
-      <w:r>
-        <w:t xml:space="preserve">Export includes new columns:</w:t>
       </w:r>
     </w:p>
     <w:p>
@@ -10636,7 +10777,7 @@
         </w:numPr>
       </w:pPr>
       <w:r>
-        <w:t xml:space="preserve">last contact;</w:t>
+        <w:t xml:space="preserve">existing AI extraction;</w:t>
       </w:r>
     </w:p>
     <w:p>
@@ -10648,7 +10789,7 @@
         </w:numPr>
       </w:pPr>
       <w:r>
-        <w:t xml:space="preserve">last contact rep;</w:t>
+        <w:t xml:space="preserve">CSV import;</w:t>
       </w:r>
     </w:p>
     <w:p>
@@ -10660,6 +10801,169 @@
         </w:numPr>
       </w:pPr>
       <w:r>
+        <w:t xml:space="preserve">manual field.</w:t>
+      </w:r>
+    </w:p>
+    <w:p>
+      <w:pPr>
+        <w:pStyle w:val="Compact"/>
+        <w:numPr>
+          <w:ilvl w:val="0"/>
+          <w:numId w:val="1455"/>
+        </w:numPr>
+      </w:pPr>
+      <w:r>
+        <w:t xml:space="preserve">Define priority when values conflict: manual &gt; CSV &gt; AI unless spec says otherwise.</w:t>
+      </w:r>
+    </w:p>
+    <w:p>
+      <w:pPr>
+        <w:pStyle w:val="Compact"/>
+        <w:numPr>
+          <w:ilvl w:val="0"/>
+          <w:numId w:val="1456"/>
+        </w:numPr>
+      </w:pPr>
+      <w:r>
+        <w:t xml:space="preserve">Last Contact uses latest meaningful contact and preserves admin attribution.</w:t>
+      </w:r>
+    </w:p>
+    <w:p>
+      <w:pPr>
+        <w:pStyle w:val="Compact"/>
+        <w:numPr>
+          <w:ilvl w:val="0"/>
+          <w:numId w:val="1457"/>
+        </w:numPr>
+      </w:pPr>
+      <w:r>
+        <w:t xml:space="preserve">Rep scope applies to all enrichment queries.</w:t>
+      </w:r>
+    </w:p>
+    <w:bookmarkEnd w:id="65"/>
+    <w:bookmarkStart w:id="66" w:name="export-csv"/>
+    <w:p>
+      <w:pPr>
+        <w:pStyle w:val="Heading3"/>
+      </w:pPr>
+      <w:r>
+        <w:t xml:space="preserve">Export CSV</w:t>
+      </w:r>
+    </w:p>
+    <w:p>
+      <w:pPr>
+        <w:pStyle w:val="Compact"/>
+        <w:numPr>
+          <w:ilvl w:val="0"/>
+          <w:numId w:val="1458"/>
+        </w:numPr>
+      </w:pPr>
+      <w:r>
+        <w:t xml:space="preserve">Export button label includes filtered count, e.g. </w:t>
+      </w:r>
+      <w:r>
+        <w:rPr>
+          <w:rStyle w:val="VerbatimChar"/>
+        </w:rPr>
+        <w:t xml:space="preserve">Export CSV 12 leads</w:t>
+      </w:r>
+      <w:r>
+        <w:t xml:space="preserve">.</w:t>
+      </w:r>
+    </w:p>
+    <w:p>
+      <w:pPr>
+        <w:pStyle w:val="Compact"/>
+        <w:numPr>
+          <w:ilvl w:val="0"/>
+          <w:numId w:val="1459"/>
+        </w:numPr>
+      </w:pPr>
+      <w:r>
+        <w:t xml:space="preserve">Export respects current search.</w:t>
+      </w:r>
+    </w:p>
+    <w:p>
+      <w:pPr>
+        <w:pStyle w:val="Compact"/>
+        <w:numPr>
+          <w:ilvl w:val="0"/>
+          <w:numId w:val="1460"/>
+        </w:numPr>
+      </w:pPr>
+      <w:r>
+        <w:t xml:space="preserve">Export respects status filter.</w:t>
+      </w:r>
+    </w:p>
+    <w:p>
+      <w:pPr>
+        <w:pStyle w:val="Compact"/>
+        <w:numPr>
+          <w:ilvl w:val="0"/>
+          <w:numId w:val="1461"/>
+        </w:numPr>
+      </w:pPr>
+      <w:r>
+        <w:t xml:space="preserve">Export respects list/source filter.</w:t>
+      </w:r>
+    </w:p>
+    <w:p>
+      <w:pPr>
+        <w:pStyle w:val="Compact"/>
+        <w:numPr>
+          <w:ilvl w:val="0"/>
+          <w:numId w:val="1462"/>
+        </w:numPr>
+      </w:pPr>
+      <w:r>
+        <w:t xml:space="preserve">Export respects rep scope.</w:t>
+      </w:r>
+    </w:p>
+    <w:p>
+      <w:pPr>
+        <w:pStyle w:val="Compact"/>
+        <w:numPr>
+          <w:ilvl w:val="0"/>
+          <w:numId w:val="1463"/>
+        </w:numPr>
+      </w:pPr>
+      <w:r>
+        <w:t xml:space="preserve">Export includes new columns:</w:t>
+      </w:r>
+    </w:p>
+    <w:p>
+      <w:pPr>
+        <w:pStyle w:val="Compact"/>
+        <w:numPr>
+          <w:ilvl w:val="1"/>
+          <w:numId w:val="1464"/>
+        </w:numPr>
+      </w:pPr>
+      <w:r>
+        <w:t xml:space="preserve">last contact;</w:t>
+      </w:r>
+    </w:p>
+    <w:p>
+      <w:pPr>
+        <w:pStyle w:val="Compact"/>
+        <w:numPr>
+          <w:ilvl w:val="1"/>
+          <w:numId w:val="1464"/>
+        </w:numPr>
+      </w:pPr>
+      <w:r>
+        <w:t xml:space="preserve">last contact rep;</w:t>
+      </w:r>
+    </w:p>
+    <w:p>
+      <w:pPr>
+        <w:pStyle w:val="Compact"/>
+        <w:numPr>
+          <w:ilvl w:val="1"/>
+          <w:numId w:val="1464"/>
+        </w:numPr>
+      </w:pPr>
+      <w:r>
         <w:t xml:space="preserve">industry;</w:t>
       </w:r>
     </w:p>
@@ -10668,7 +10972,7 @@
         <w:pStyle w:val="Compact"/>
         <w:numPr>
           <w:ilvl w:val="1"/>
-          <w:numId w:val="1454"/>
+          <w:numId w:val="1464"/>
         </w:numPr>
       </w:pPr>
       <w:r>
@@ -10680,7 +10984,7 @@
         <w:pStyle w:val="Compact"/>
         <w:numPr>
           <w:ilvl w:val="1"/>
-          <w:numId w:val="1454"/>
+          <w:numId w:val="1464"/>
         </w:numPr>
       </w:pPr>
       <w:r>
@@ -10692,7 +10996,7 @@
         <w:pStyle w:val="Compact"/>
         <w:numPr>
           <w:ilvl w:val="1"/>
-          <w:numId w:val="1454"/>
+          <w:numId w:val="1464"/>
         </w:numPr>
       </w:pPr>
       <w:r>
@@ -10704,7 +11008,7 @@
         <w:pStyle w:val="Compact"/>
         <w:numPr>
           <w:ilvl w:val="0"/>
-          <w:numId w:val="1455"/>
+          <w:numId w:val="1465"/>
         </w:numPr>
       </w:pPr>
       <w:r>
@@ -10716,15 +11020,15 @@
         <w:pStyle w:val="Compact"/>
         <w:numPr>
           <w:ilvl w:val="0"/>
-          <w:numId w:val="1456"/>
+          <w:numId w:val="1466"/>
         </w:numPr>
       </w:pPr>
       <w:r>
         <w:t xml:space="preserve">CSV escaping handles commas, quotes, line breaks.</w:t>
       </w:r>
     </w:p>
-    <w:bookmarkEnd w:id="65"/>
-    <w:bookmarkStart w:id="66" w:name="m2.2-style-isolation"/>
+    <w:bookmarkEnd w:id="66"/>
+    <w:bookmarkStart w:id="67" w:name="m2.2-style-isolation"/>
     <w:p>
       <w:pPr>
         <w:pStyle w:val="Heading3"/>
@@ -10738,7 +11042,7 @@
         <w:pStyle w:val="Compact"/>
         <w:numPr>
           <w:ilvl w:val="0"/>
-          <w:numId w:val="1457"/>
+          <w:numId w:val="1467"/>
         </w:numPr>
       </w:pPr>
       <w:r>
@@ -10750,7 +11054,7 @@
         <w:pStyle w:val="Compact"/>
         <w:numPr>
           <w:ilvl w:val="0"/>
-          <w:numId w:val="1458"/>
+          <w:numId w:val="1468"/>
         </w:numPr>
       </w:pPr>
       <w:r>
@@ -10762,7 +11066,7 @@
         <w:pStyle w:val="Compact"/>
         <w:numPr>
           <w:ilvl w:val="0"/>
-          <w:numId w:val="1459"/>
+          <w:numId w:val="1469"/>
         </w:numPr>
       </w:pPr>
       <w:r>
@@ -10774,27 +11078,27 @@
         <w:pStyle w:val="Compact"/>
         <w:numPr>
           <w:ilvl w:val="0"/>
-          <w:numId w:val="1460"/>
-        </w:numPr>
-      </w:pPr>
-      <w:r>
-        <w:t xml:space="preserve">Verify table remains readable at desktop and half-screen widths.</w:t>
-      </w:r>
-    </w:p>
-    <w:p>
-      <w:pPr>
-        <w:pStyle w:val="Compact"/>
-        <w:numPr>
-          <w:ilvl w:val="0"/>
-          <w:numId w:val="1461"/>
+          <w:numId w:val="1470"/>
+        </w:numPr>
+      </w:pPr>
+      <w:r>
+        <w:t xml:space="preserve">Verify table remains readable at desktop and half-screen widths by fixed min-width/overflow-safe columns.</w:t>
+      </w:r>
+    </w:p>
+    <w:p>
+      <w:pPr>
+        <w:pStyle w:val="Compact"/>
+        <w:numPr>
+          <w:ilvl w:val="0"/>
+          <w:numId w:val="1471"/>
         </w:numPr>
       </w:pPr>
       <w:r>
         <w:t xml:space="preserve">Ensure text truncation/line wrapping is deliberate and not overlapping.</w:t>
       </w:r>
     </w:p>
-    <w:bookmarkEnd w:id="66"/>
-    <w:bookmarkStart w:id="67" w:name="m2.2-testing-gate"/>
+    <w:bookmarkEnd w:id="67"/>
+    <w:bookmarkStart w:id="68" w:name="m2.2-testing-gate"/>
     <w:p>
       <w:pPr>
         <w:pStyle w:val="Heading3"/>
@@ -10808,7 +11112,7 @@
         <w:pStyle w:val="Compact"/>
         <w:numPr>
           <w:ilvl w:val="0"/>
-          <w:numId w:val="1462"/>
+          <w:numId w:val="1472"/>
         </w:numPr>
       </w:pPr>
       <w:r>
@@ -10820,7 +11124,7 @@
         <w:pStyle w:val="Compact"/>
         <w:numPr>
           <w:ilvl w:val="0"/>
-          <w:numId w:val="1463"/>
+          <w:numId w:val="1473"/>
         </w:numPr>
       </w:pPr>
       <w:r>
@@ -10832,7 +11136,7 @@
         <w:pStyle w:val="Compact"/>
         <w:numPr>
           <w:ilvl w:val="0"/>
-          <w:numId w:val="1464"/>
+          <w:numId w:val="1474"/>
         </w:numPr>
       </w:pPr>
       <w:r>
@@ -10844,7 +11148,7 @@
         <w:pStyle w:val="Compact"/>
         <w:numPr>
           <w:ilvl w:val="0"/>
-          <w:numId w:val="1465"/>
+          <w:numId w:val="1475"/>
         </w:numPr>
       </w:pPr>
       <w:r>
@@ -10856,19 +11160,19 @@
         <w:pStyle w:val="Compact"/>
         <w:numPr>
           <w:ilvl w:val="0"/>
-          <w:numId w:val="1466"/>
-        </w:numPr>
-      </w:pPr>
-      <w:r>
-        <w:t xml:space="preserve">Export CSV checked with filters.</w:t>
-      </w:r>
-    </w:p>
-    <w:p>
-      <w:pPr>
-        <w:pStyle w:val="Compact"/>
-        <w:numPr>
-          <w:ilvl w:val="0"/>
-          <w:numId w:val="1467"/>
+          <w:numId w:val="1476"/>
+        </w:numPr>
+      </w:pPr>
+      <w:r>
+        <w:t xml:space="preserve">Export CSV checked with filters in focused controller test.</w:t>
+      </w:r>
+    </w:p>
+    <w:p>
+      <w:pPr>
+        <w:pStyle w:val="Compact"/>
+        <w:numPr>
+          <w:ilvl w:val="0"/>
+          <w:numId w:val="1477"/>
         </w:numPr>
       </w:pPr>
       <w:r>
@@ -10880,7 +11184,7 @@
         <w:pStyle w:val="Compact"/>
         <w:numPr>
           <w:ilvl w:val="0"/>
-          <w:numId w:val="1468"/>
+          <w:numId w:val="1478"/>
         </w:numPr>
       </w:pPr>
       <w:r>
@@ -10892,16 +11196,16 @@
         <w:pStyle w:val="Compact"/>
         <w:numPr>
           <w:ilvl w:val="0"/>
-          <w:numId w:val="1469"/>
+          <w:numId w:val="1479"/>
         </w:numPr>
       </w:pPr>
       <w:r>
         <w:t xml:space="preserve">Progress dashboard updated.</w:t>
       </w:r>
     </w:p>
-    <w:bookmarkEnd w:id="67"/>
     <w:bookmarkEnd w:id="68"/>
-    <w:bookmarkStart w:id="78" w:name="m2.3-ai-retarget-campaigns"/>
+    <w:bookmarkEnd w:id="69"/>
+    <w:bookmarkStart w:id="79" w:name="m2.3-ai-retarget-campaigns"/>
     <w:p>
       <w:pPr>
         <w:pStyle w:val="Heading2"/>
@@ -10910,7 +11214,7 @@
         <w:t xml:space="preserve">M2.3 — AI Retarget Campaigns</w:t>
       </w:r>
     </w:p>
-    <w:bookmarkStart w:id="69" w:name="scope-lock-for-ai-retarget"/>
+    <w:bookmarkStart w:id="70" w:name="scope-lock-for-ai-retarget"/>
     <w:p>
       <w:pPr>
         <w:pStyle w:val="Heading3"/>
@@ -10924,7 +11228,7 @@
         <w:pStyle w:val="Compact"/>
         <w:numPr>
           <w:ilvl w:val="0"/>
-          <w:numId w:val="1470"/>
+          <w:numId w:val="1480"/>
         </w:numPr>
       </w:pPr>
       <w:r>
@@ -10936,7 +11240,7 @@
         <w:pStyle w:val="Compact"/>
         <w:numPr>
           <w:ilvl w:val="0"/>
-          <w:numId w:val="1471"/>
+          <w:numId w:val="1481"/>
         </w:numPr>
       </w:pPr>
       <w:r>
@@ -10948,7 +11252,7 @@
         <w:pStyle w:val="Compact"/>
         <w:numPr>
           <w:ilvl w:val="0"/>
-          <w:numId w:val="1472"/>
+          <w:numId w:val="1482"/>
         </w:numPr>
       </w:pPr>
       <w:r>
@@ -10960,7 +11264,7 @@
         <w:pStyle w:val="Compact"/>
         <w:numPr>
           <w:ilvl w:val="0"/>
-          <w:numId w:val="1473"/>
+          <w:numId w:val="1483"/>
         </w:numPr>
       </w:pPr>
       <w:r>
@@ -10972,7 +11276,7 @@
         <w:pStyle w:val="Compact"/>
         <w:numPr>
           <w:ilvl w:val="0"/>
-          <w:numId w:val="1474"/>
+          <w:numId w:val="1484"/>
         </w:numPr>
       </w:pPr>
       <w:r>
@@ -10984,7 +11288,7 @@
         <w:pStyle w:val="Compact"/>
         <w:numPr>
           <w:ilvl w:val="0"/>
-          <w:numId w:val="1475"/>
+          <w:numId w:val="1485"/>
         </w:numPr>
       </w:pPr>
       <w:r>
@@ -10996,7 +11300,7 @@
         <w:pStyle w:val="Compact"/>
         <w:numPr>
           <w:ilvl w:val="1"/>
-          <w:numId w:val="1476"/>
+          <w:numId w:val="1486"/>
         </w:numPr>
       </w:pPr>
       <w:r>
@@ -11023,7 +11327,7 @@
         <w:pStyle w:val="Compact"/>
         <w:numPr>
           <w:ilvl w:val="1"/>
-          <w:numId w:val="1476"/>
+          <w:numId w:val="1486"/>
         </w:numPr>
       </w:pPr>
       <w:r>
@@ -11045,8 +11349,8 @@
         <w:t xml:space="preserve">scoping correctness.</w:t>
       </w:r>
     </w:p>
-    <w:bookmarkEnd w:id="69"/>
-    <w:bookmarkStart w:id="70" w:name="database-model"/>
+    <w:bookmarkEnd w:id="70"/>
+    <w:bookmarkStart w:id="71" w:name="database-model"/>
     <w:p>
       <w:pPr>
         <w:pStyle w:val="Heading3"/>
@@ -11060,7 +11364,7 @@
         <w:pStyle w:val="Compact"/>
         <w:numPr>
           <w:ilvl w:val="0"/>
-          <w:numId w:val="1477"/>
+          <w:numId w:val="1487"/>
         </w:numPr>
       </w:pPr>
       <w:r>
@@ -11102,7 +11406,7 @@
         <w:pStyle w:val="Compact"/>
         <w:numPr>
           <w:ilvl w:val="0"/>
-          <w:numId w:val="1478"/>
+          <w:numId w:val="1488"/>
         </w:numPr>
       </w:pPr>
       <w:r>
@@ -11126,7 +11430,7 @@
         <w:pStyle w:val="Compact"/>
         <w:numPr>
           <w:ilvl w:val="0"/>
-          <w:numId w:val="1479"/>
+          <w:numId w:val="1489"/>
         </w:numPr>
       </w:pPr>
       <w:r>
@@ -11150,7 +11454,7 @@
         <w:pStyle w:val="Compact"/>
         <w:numPr>
           <w:ilvl w:val="0"/>
-          <w:numId w:val="1480"/>
+          <w:numId w:val="1490"/>
         </w:numPr>
       </w:pPr>
       <w:r>
@@ -11162,7 +11466,7 @@
         <w:pStyle w:val="Compact"/>
         <w:numPr>
           <w:ilvl w:val="0"/>
-          <w:numId w:val="1481"/>
+          <w:numId w:val="1491"/>
         </w:numPr>
       </w:pPr>
       <w:r>
@@ -11174,7 +11478,7 @@
         <w:pStyle w:val="Compact"/>
         <w:numPr>
           <w:ilvl w:val="0"/>
-          <w:numId w:val="1482"/>
+          <w:numId w:val="1492"/>
         </w:numPr>
       </w:pPr>
       <w:r>
@@ -11186,7 +11490,7 @@
         <w:pStyle w:val="Compact"/>
         <w:numPr>
           <w:ilvl w:val="0"/>
-          <w:numId w:val="1483"/>
+          <w:numId w:val="1493"/>
         </w:numPr>
       </w:pPr>
       <w:r>
@@ -11198,7 +11502,7 @@
         <w:pStyle w:val="Compact"/>
         <w:numPr>
           <w:ilvl w:val="0"/>
-          <w:numId w:val="1484"/>
+          <w:numId w:val="1494"/>
         </w:numPr>
       </w:pPr>
       <w:r>
@@ -11210,7 +11514,7 @@
         <w:pStyle w:val="Compact"/>
         <w:numPr>
           <w:ilvl w:val="0"/>
-          <w:numId w:val="1485"/>
+          <w:numId w:val="1495"/>
         </w:numPr>
       </w:pPr>
       <w:r>
@@ -11222,7 +11526,7 @@
         <w:pStyle w:val="Compact"/>
         <w:numPr>
           <w:ilvl w:val="0"/>
-          <w:numId w:val="1486"/>
+          <w:numId w:val="1496"/>
         </w:numPr>
       </w:pPr>
       <w:r>
@@ -11234,7 +11538,7 @@
         <w:pStyle w:val="Compact"/>
         <w:numPr>
           <w:ilvl w:val="0"/>
-          <w:numId w:val="1487"/>
+          <w:numId w:val="1497"/>
         </w:numPr>
       </w:pPr>
       <w:r>
@@ -11246,7 +11550,7 @@
         <w:pStyle w:val="Compact"/>
         <w:numPr>
           <w:ilvl w:val="0"/>
-          <w:numId w:val="1488"/>
+          <w:numId w:val="1498"/>
         </w:numPr>
       </w:pPr>
       <w:r>
@@ -11258,7 +11562,7 @@
         <w:pStyle w:val="Compact"/>
         <w:numPr>
           <w:ilvl w:val="0"/>
-          <w:numId w:val="1489"/>
+          <w:numId w:val="1499"/>
         </w:numPr>
       </w:pPr>
       <w:r>
@@ -11270,7 +11574,7 @@
         <w:pStyle w:val="Compact"/>
         <w:numPr>
           <w:ilvl w:val="0"/>
-          <w:numId w:val="1490"/>
+          <w:numId w:val="1500"/>
         </w:numPr>
       </w:pPr>
       <w:r>
@@ -11297,7 +11601,7 @@
         <w:pStyle w:val="Compact"/>
         <w:numPr>
           <w:ilvl w:val="0"/>
-          <w:numId w:val="1491"/>
+          <w:numId w:val="1501"/>
         </w:numPr>
       </w:pPr>
       <w:r>
@@ -11309,15 +11613,15 @@
         <w:pStyle w:val="Compact"/>
         <w:numPr>
           <w:ilvl w:val="0"/>
-          <w:numId w:val="1492"/>
+          <w:numId w:val="1502"/>
         </w:numPr>
       </w:pPr>
       <w:r>
         <w:t xml:space="preserve">Ensure expired cohorts are ignored safely.</w:t>
       </w:r>
     </w:p>
-    <w:bookmarkEnd w:id="70"/>
-    <w:bookmarkStart w:id="71" w:name="cohort-generation"/>
+    <w:bookmarkEnd w:id="71"/>
+    <w:bookmarkStart w:id="72" w:name="cohort-generation"/>
     <w:p>
       <w:pPr>
         <w:pStyle w:val="Heading3"/>
@@ -11331,7 +11635,7 @@
         <w:pStyle w:val="Compact"/>
         <w:numPr>
           <w:ilvl w:val="0"/>
-          <w:numId w:val="1493"/>
+          <w:numId w:val="1503"/>
         </w:numPr>
       </w:pPr>
       <w:r>
@@ -11343,7 +11647,7 @@
         <w:pStyle w:val="Compact"/>
         <w:numPr>
           <w:ilvl w:val="0"/>
-          <w:numId w:val="1494"/>
+          <w:numId w:val="1504"/>
         </w:numPr>
       </w:pPr>
       <w:r>
@@ -11370,7 +11674,7 @@
         <w:pStyle w:val="Compact"/>
         <w:numPr>
           <w:ilvl w:val="0"/>
-          <w:numId w:val="1495"/>
+          <w:numId w:val="1505"/>
         </w:numPr>
       </w:pPr>
       <w:r>
@@ -11397,7 +11701,7 @@
         <w:pStyle w:val="Compact"/>
         <w:numPr>
           <w:ilvl w:val="0"/>
-          <w:numId w:val="1496"/>
+          <w:numId w:val="1506"/>
         </w:numPr>
       </w:pPr>
       <w:r>
@@ -11424,7 +11728,7 @@
         <w:pStyle w:val="Compact"/>
         <w:numPr>
           <w:ilvl w:val="0"/>
-          <w:numId w:val="1497"/>
+          <w:numId w:val="1507"/>
         </w:numPr>
       </w:pPr>
       <w:r>
@@ -11436,7 +11740,7 @@
         <w:pStyle w:val="Compact"/>
         <w:numPr>
           <w:ilvl w:val="1"/>
-          <w:numId w:val="1498"/>
+          <w:numId w:val="1508"/>
         </w:numPr>
       </w:pPr>
       <w:r>
@@ -11448,7 +11752,7 @@
         <w:pStyle w:val="Compact"/>
         <w:numPr>
           <w:ilvl w:val="1"/>
-          <w:numId w:val="1498"/>
+          <w:numId w:val="1508"/>
         </w:numPr>
       </w:pPr>
       <w:r>
@@ -11460,7 +11764,7 @@
         <w:pStyle w:val="Compact"/>
         <w:numPr>
           <w:ilvl w:val="1"/>
-          <w:numId w:val="1498"/>
+          <w:numId w:val="1508"/>
         </w:numPr>
       </w:pPr>
       <w:r>
@@ -11472,7 +11776,7 @@
         <w:pStyle w:val="Compact"/>
         <w:numPr>
           <w:ilvl w:val="0"/>
-          <w:numId w:val="1499"/>
+          <w:numId w:val="1509"/>
         </w:numPr>
       </w:pPr>
       <w:r>
@@ -11484,7 +11788,7 @@
         <w:pStyle w:val="Compact"/>
         <w:numPr>
           <w:ilvl w:val="0"/>
-          <w:numId w:val="1500"/>
+          <w:numId w:val="1510"/>
         </w:numPr>
       </w:pPr>
       <w:r>
@@ -11496,7 +11800,7 @@
         <w:pStyle w:val="Compact"/>
         <w:numPr>
           <w:ilvl w:val="1"/>
-          <w:numId w:val="1501"/>
+          <w:numId w:val="1511"/>
         </w:numPr>
       </w:pPr>
       <w:r>
@@ -11508,7 +11812,7 @@
         <w:pStyle w:val="Compact"/>
         <w:numPr>
           <w:ilvl w:val="1"/>
-          <w:numId w:val="1501"/>
+          <w:numId w:val="1511"/>
         </w:numPr>
       </w:pPr>
       <w:r>
@@ -11520,7 +11824,7 @@
         <w:pStyle w:val="Compact"/>
         <w:numPr>
           <w:ilvl w:val="1"/>
-          <w:numId w:val="1501"/>
+          <w:numId w:val="1511"/>
         </w:numPr>
       </w:pPr>
       <w:r>
@@ -11532,7 +11836,7 @@
         <w:pStyle w:val="Compact"/>
         <w:numPr>
           <w:ilvl w:val="1"/>
-          <w:numId w:val="1501"/>
+          <w:numId w:val="1511"/>
         </w:numPr>
       </w:pPr>
       <w:r>
@@ -11544,7 +11848,7 @@
         <w:pStyle w:val="Compact"/>
         <w:numPr>
           <w:ilvl w:val="1"/>
-          <w:numId w:val="1501"/>
+          <w:numId w:val="1511"/>
         </w:numPr>
       </w:pPr>
       <w:r>
@@ -11556,7 +11860,7 @@
         <w:pStyle w:val="Compact"/>
         <w:numPr>
           <w:ilvl w:val="1"/>
-          <w:numId w:val="1501"/>
+          <w:numId w:val="1511"/>
         </w:numPr>
       </w:pPr>
       <w:r>
@@ -11568,7 +11872,7 @@
         <w:pStyle w:val="Compact"/>
         <w:numPr>
           <w:ilvl w:val="0"/>
-          <w:numId w:val="1502"/>
+          <w:numId w:val="1512"/>
         </w:numPr>
       </w:pPr>
       <w:r>
@@ -11580,7 +11884,7 @@
         <w:pStyle w:val="Compact"/>
         <w:numPr>
           <w:ilvl w:val="0"/>
-          <w:numId w:val="1503"/>
+          <w:numId w:val="1513"/>
         </w:numPr>
       </w:pPr>
       <w:r>
@@ -11592,15 +11896,15 @@
         <w:pStyle w:val="Compact"/>
         <w:numPr>
           <w:ilvl w:val="0"/>
-          <w:numId w:val="1504"/>
+          <w:numId w:val="1514"/>
         </w:numPr>
       </w:pPr>
       <w:r>
         <w:t xml:space="preserve">Ensure predicted funded deals are traceable to historical anchor, not arbitrary text.</w:t>
       </w:r>
     </w:p>
-    <w:bookmarkEnd w:id="71"/>
-    <w:bookmarkStart w:id="72" w:name="cooldowns-and-compliance"/>
+    <w:bookmarkEnd w:id="72"/>
+    <w:bookmarkStart w:id="73" w:name="cooldowns-and-compliance"/>
     <w:p>
       <w:pPr>
         <w:pStyle w:val="Heading3"/>
@@ -11614,7 +11918,7 @@
         <w:pStyle w:val="Compact"/>
         <w:numPr>
           <w:ilvl w:val="0"/>
-          <w:numId w:val="1505"/>
+          <w:numId w:val="1515"/>
         </w:numPr>
       </w:pPr>
       <w:r>
@@ -11626,7 +11930,7 @@
         <w:pStyle w:val="Compact"/>
         <w:numPr>
           <w:ilvl w:val="0"/>
-          <w:numId w:val="1506"/>
+          <w:numId w:val="1516"/>
         </w:numPr>
       </w:pPr>
       <w:r>
@@ -11638,7 +11942,7 @@
         <w:pStyle w:val="Compact"/>
         <w:numPr>
           <w:ilvl w:val="0"/>
-          <w:numId w:val="1507"/>
+          <w:numId w:val="1517"/>
         </w:numPr>
       </w:pPr>
       <w:r>
@@ -11650,7 +11954,7 @@
         <w:pStyle w:val="Compact"/>
         <w:numPr>
           <w:ilvl w:val="0"/>
-          <w:numId w:val="1508"/>
+          <w:numId w:val="1518"/>
         </w:numPr>
       </w:pPr>
       <w:r>
@@ -11662,7 +11966,7 @@
         <w:pStyle w:val="Compact"/>
         <w:numPr>
           <w:ilvl w:val="0"/>
-          <w:numId w:val="1509"/>
+          <w:numId w:val="1519"/>
         </w:numPr>
       </w:pPr>
       <w:r>
@@ -11674,15 +11978,15 @@
         <w:pStyle w:val="Compact"/>
         <w:numPr>
           <w:ilvl w:val="0"/>
-          <w:numId w:val="1510"/>
+          <w:numId w:val="1520"/>
         </w:numPr>
       </w:pPr>
       <w:r>
         <w:t xml:space="preserve">Verify no cohort can re-contact opted-out, DNC, suppressed, or too-recent leads.</w:t>
       </w:r>
     </w:p>
-    <w:bookmarkEnd w:id="72"/>
-    <w:bookmarkStart w:id="73" w:name="two-layer-send-caps"/>
+    <w:bookmarkEnd w:id="73"/>
+    <w:bookmarkStart w:id="74" w:name="two-layer-send-caps"/>
     <w:p>
       <w:pPr>
         <w:pStyle w:val="Heading3"/>
@@ -11696,7 +12000,7 @@
         <w:pStyle w:val="Compact"/>
         <w:numPr>
           <w:ilvl w:val="0"/>
-          <w:numId w:val="1511"/>
+          <w:numId w:val="1521"/>
         </w:numPr>
       </w:pPr>
       <w:r>
@@ -11708,7 +12012,7 @@
         <w:pStyle w:val="Compact"/>
         <w:numPr>
           <w:ilvl w:val="1"/>
-          <w:numId w:val="1512"/>
+          <w:numId w:val="1522"/>
         </w:numPr>
       </w:pPr>
       <w:r>
@@ -11720,7 +12024,7 @@
         <w:pStyle w:val="Compact"/>
         <w:numPr>
           <w:ilvl w:val="1"/>
-          <w:numId w:val="1512"/>
+          <w:numId w:val="1522"/>
         </w:numPr>
       </w:pPr>
       <w:r>
@@ -11732,7 +12036,7 @@
         <w:pStyle w:val="Compact"/>
         <w:numPr>
           <w:ilvl w:val="0"/>
-          <w:numId w:val="1513"/>
+          <w:numId w:val="1523"/>
         </w:numPr>
       </w:pPr>
       <w:r>
@@ -11744,7 +12048,7 @@
         <w:pStyle w:val="Compact"/>
         <w:numPr>
           <w:ilvl w:val="1"/>
-          <w:numId w:val="1514"/>
+          <w:numId w:val="1524"/>
         </w:numPr>
       </w:pPr>
       <w:r>
@@ -11756,7 +12060,7 @@
         <w:pStyle w:val="Compact"/>
         <w:numPr>
           <w:ilvl w:val="1"/>
-          <w:numId w:val="1514"/>
+          <w:numId w:val="1524"/>
         </w:numPr>
       </w:pPr>
       <w:r>
@@ -11768,7 +12072,7 @@
         <w:pStyle w:val="Compact"/>
         <w:numPr>
           <w:ilvl w:val="0"/>
-          <w:numId w:val="1515"/>
+          <w:numId w:val="1525"/>
         </w:numPr>
       </w:pPr>
       <w:r>
@@ -11780,7 +12084,7 @@
         <w:pStyle w:val="Compact"/>
         <w:numPr>
           <w:ilvl w:val="0"/>
-          <w:numId w:val="1516"/>
+          <w:numId w:val="1526"/>
         </w:numPr>
       </w:pPr>
       <w:r>
@@ -11792,7 +12096,7 @@
         <w:pStyle w:val="Compact"/>
         <w:numPr>
           <w:ilvl w:val="0"/>
-          <w:numId w:val="1517"/>
+          <w:numId w:val="1527"/>
         </w:numPr>
       </w:pPr>
       <w:r>
@@ -11804,15 +12108,15 @@
         <w:pStyle w:val="Compact"/>
         <w:numPr>
           <w:ilvl w:val="0"/>
-          <w:numId w:val="1518"/>
+          <w:numId w:val="1528"/>
         </w:numPr>
       </w:pPr>
       <w:r>
         <w:t xml:space="preserve">Cohort card lead count reflects current remaining capacity at render/build time.</w:t>
       </w:r>
     </w:p>
-    <w:bookmarkEnd w:id="73"/>
-    <w:bookmarkStart w:id="74" w:name="ai-reasoning-and-cron"/>
+    <w:bookmarkEnd w:id="74"/>
+    <w:bookmarkStart w:id="75" w:name="ai-reasoning-and-cron"/>
     <w:p>
       <w:pPr>
         <w:pStyle w:val="Heading3"/>
@@ -11826,7 +12130,7 @@
         <w:pStyle w:val="Compact"/>
         <w:numPr>
           <w:ilvl w:val="0"/>
-          <w:numId w:val="1519"/>
+          <w:numId w:val="1529"/>
         </w:numPr>
       </w:pPr>
       <w:r>
@@ -11838,7 +12142,7 @@
         <w:pStyle w:val="Compact"/>
         <w:numPr>
           <w:ilvl w:val="0"/>
-          <w:numId w:val="1520"/>
+          <w:numId w:val="1530"/>
         </w:numPr>
       </w:pPr>
       <w:r>
@@ -11850,7 +12154,7 @@
         <w:pStyle w:val="Compact"/>
         <w:numPr>
           <w:ilvl w:val="0"/>
-          <w:numId w:val="1521"/>
+          <w:numId w:val="1531"/>
         </w:numPr>
       </w:pPr>
       <w:r>
@@ -11862,7 +12166,7 @@
         <w:pStyle w:val="Compact"/>
         <w:numPr>
           <w:ilvl w:val="0"/>
-          <w:numId w:val="1522"/>
+          <w:numId w:val="1532"/>
         </w:numPr>
       </w:pPr>
       <w:r>
@@ -11874,7 +12178,7 @@
         <w:pStyle w:val="Compact"/>
         <w:numPr>
           <w:ilvl w:val="0"/>
-          <w:numId w:val="1523"/>
+          <w:numId w:val="1533"/>
         </w:numPr>
       </w:pPr>
       <w:r>
@@ -11886,7 +12190,7 @@
         <w:pStyle w:val="Compact"/>
         <w:numPr>
           <w:ilvl w:val="0"/>
-          <w:numId w:val="1524"/>
+          <w:numId w:val="1534"/>
         </w:numPr>
       </w:pPr>
       <w:r>
@@ -11898,7 +12202,7 @@
         <w:pStyle w:val="Compact"/>
         <w:numPr>
           <w:ilvl w:val="0"/>
-          <w:numId w:val="1525"/>
+          <w:numId w:val="1535"/>
         </w:numPr>
       </w:pPr>
       <w:r>
@@ -11910,7 +12214,7 @@
         <w:pStyle w:val="Compact"/>
         <w:numPr>
           <w:ilvl w:val="0"/>
-          <w:numId w:val="1526"/>
+          <w:numId w:val="1536"/>
         </w:numPr>
       </w:pPr>
       <w:r>
@@ -11922,15 +12226,15 @@
         <w:pStyle w:val="Compact"/>
         <w:numPr>
           <w:ilvl w:val="0"/>
-          <w:numId w:val="1527"/>
+          <w:numId w:val="1537"/>
         </w:numPr>
       </w:pPr>
       <w:r>
         <w:t xml:space="preserve">Log failures per user/cohort without breaking other cohorts.</w:t>
       </w:r>
     </w:p>
-    <w:bookmarkEnd w:id="74"/>
-    <w:bookmarkStart w:id="75" w:name="ui-1"/>
+    <w:bookmarkEnd w:id="75"/>
+    <w:bookmarkStart w:id="76" w:name="ui-1"/>
     <w:p>
       <w:pPr>
         <w:pStyle w:val="Heading3"/>
@@ -11944,7 +12248,7 @@
         <w:pStyle w:val="Compact"/>
         <w:numPr>
           <w:ilvl w:val="0"/>
-          <w:numId w:val="1528"/>
+          <w:numId w:val="1538"/>
         </w:numPr>
       </w:pPr>
       <w:r>
@@ -11956,7 +12260,7 @@
         <w:pStyle w:val="Compact"/>
         <w:numPr>
           <w:ilvl w:val="0"/>
-          <w:numId w:val="1529"/>
+          <w:numId w:val="1539"/>
         </w:numPr>
       </w:pPr>
       <w:r>
@@ -11968,7 +12272,7 @@
         <w:pStyle w:val="Compact"/>
         <w:numPr>
           <w:ilvl w:val="0"/>
-          <w:numId w:val="1530"/>
+          <w:numId w:val="1540"/>
         </w:numPr>
       </w:pPr>
       <w:r>
@@ -11980,7 +12284,7 @@
         <w:pStyle w:val="Compact"/>
         <w:numPr>
           <w:ilvl w:val="0"/>
-          <w:numId w:val="1531"/>
+          <w:numId w:val="1541"/>
         </w:numPr>
       </w:pPr>
       <w:r>
@@ -11992,7 +12296,7 @@
         <w:pStyle w:val="Compact"/>
         <w:numPr>
           <w:ilvl w:val="0"/>
-          <w:numId w:val="1532"/>
+          <w:numId w:val="1542"/>
         </w:numPr>
       </w:pPr>
       <w:r>
@@ -12004,7 +12308,7 @@
         <w:pStyle w:val="Compact"/>
         <w:numPr>
           <w:ilvl w:val="0"/>
-          <w:numId w:val="1533"/>
+          <w:numId w:val="1543"/>
         </w:numPr>
       </w:pPr>
       <w:r>
@@ -12016,7 +12320,7 @@
         <w:pStyle w:val="Compact"/>
         <w:numPr>
           <w:ilvl w:val="0"/>
-          <w:numId w:val="1534"/>
+          <w:numId w:val="1544"/>
         </w:numPr>
       </w:pPr>
       <w:r>
@@ -12028,7 +12332,7 @@
         <w:pStyle w:val="Compact"/>
         <w:numPr>
           <w:ilvl w:val="0"/>
-          <w:numId w:val="1535"/>
+          <w:numId w:val="1545"/>
         </w:numPr>
       </w:pPr>
       <w:r>
@@ -12040,7 +12344,7 @@
         <w:pStyle w:val="Compact"/>
         <w:numPr>
           <w:ilvl w:val="0"/>
-          <w:numId w:val="1536"/>
+          <w:numId w:val="1546"/>
         </w:numPr>
       </w:pPr>
       <w:r>
@@ -12052,7 +12356,7 @@
         <w:pStyle w:val="Compact"/>
         <w:numPr>
           <w:ilvl w:val="0"/>
-          <w:numId w:val="1537"/>
+          <w:numId w:val="1547"/>
         </w:numPr>
       </w:pPr>
       <w:r>
@@ -12079,7 +12383,7 @@
         <w:pStyle w:val="Compact"/>
         <w:numPr>
           <w:ilvl w:val="0"/>
-          <w:numId w:val="1538"/>
+          <w:numId w:val="1548"/>
         </w:numPr>
       </w:pPr>
       <w:r>
@@ -12100,15 +12404,15 @@
         <w:pStyle w:val="Compact"/>
         <w:numPr>
           <w:ilvl w:val="0"/>
-          <w:numId w:val="1539"/>
+          <w:numId w:val="1549"/>
         </w:numPr>
       </w:pPr>
       <w:r>
         <w:t xml:space="preserve">Existing campaign actions still work: rerun/refresh, start, pause, delete where allowed.</w:t>
       </w:r>
     </w:p>
-    <w:bookmarkEnd w:id="75"/>
-    <w:bookmarkStart w:id="76" w:name="backendapi"/>
+    <w:bookmarkEnd w:id="76"/>
+    <w:bookmarkStart w:id="77" w:name="backendapi"/>
     <w:p>
       <w:pPr>
         <w:pStyle w:val="Heading3"/>
@@ -12122,7 +12426,7 @@
         <w:pStyle w:val="Compact"/>
         <w:numPr>
           <w:ilvl w:val="0"/>
-          <w:numId w:val="1540"/>
+          <w:numId w:val="1550"/>
         </w:numPr>
       </w:pPr>
       <w:r>
@@ -12134,7 +12438,7 @@
         <w:pStyle w:val="Compact"/>
         <w:numPr>
           <w:ilvl w:val="0"/>
-          <w:numId w:val="1541"/>
+          <w:numId w:val="1551"/>
         </w:numPr>
       </w:pPr>
       <w:r>
@@ -12146,7 +12450,7 @@
         <w:pStyle w:val="Compact"/>
         <w:numPr>
           <w:ilvl w:val="0"/>
-          <w:numId w:val="1542"/>
+          <w:numId w:val="1552"/>
         </w:numPr>
       </w:pPr>
       <w:r>
@@ -12158,7 +12462,7 @@
         <w:pStyle w:val="Compact"/>
         <w:numPr>
           <w:ilvl w:val="0"/>
-          <w:numId w:val="1543"/>
+          <w:numId w:val="1553"/>
         </w:numPr>
       </w:pPr>
       <w:r>
@@ -12170,7 +12474,7 @@
         <w:pStyle w:val="Compact"/>
         <w:numPr>
           <w:ilvl w:val="0"/>
-          <w:numId w:val="1544"/>
+          <w:numId w:val="1554"/>
         </w:numPr>
       </w:pPr>
       <w:r>
@@ -12182,7 +12486,7 @@
         <w:pStyle w:val="Compact"/>
         <w:numPr>
           <w:ilvl w:val="0"/>
-          <w:numId w:val="1545"/>
+          <w:numId w:val="1555"/>
         </w:numPr>
       </w:pPr>
       <w:r>
@@ -12194,7 +12498,7 @@
         <w:pStyle w:val="Compact"/>
         <w:numPr>
           <w:ilvl w:val="0"/>
-          <w:numId w:val="1546"/>
+          <w:numId w:val="1556"/>
         </w:numPr>
       </w:pPr>
       <w:r>
@@ -12206,15 +12510,15 @@
         <w:pStyle w:val="Compact"/>
         <w:numPr>
           <w:ilvl w:val="0"/>
-          <w:numId w:val="1547"/>
+          <w:numId w:val="1557"/>
         </w:numPr>
       </w:pPr>
       <w:r>
         <w:t xml:space="preserve">AI Retarget is upstream recommendation only; no auto-send.</w:t>
       </w:r>
     </w:p>
-    <w:bookmarkEnd w:id="76"/>
-    <w:bookmarkStart w:id="77" w:name="m2.3-testing-gate"/>
+    <w:bookmarkEnd w:id="77"/>
+    <w:bookmarkStart w:id="78" w:name="m2.3-testing-gate"/>
     <w:p>
       <w:pPr>
         <w:pStyle w:val="Heading3"/>
@@ -12228,7 +12532,7 @@
         <w:pStyle w:val="Compact"/>
         <w:numPr>
           <w:ilvl w:val="0"/>
-          <w:numId w:val="1548"/>
+          <w:numId w:val="1558"/>
         </w:numPr>
       </w:pPr>
       <w:r>
@@ -12240,7 +12544,7 @@
         <w:pStyle w:val="Compact"/>
         <w:numPr>
           <w:ilvl w:val="0"/>
-          <w:numId w:val="1549"/>
+          <w:numId w:val="1559"/>
         </w:numPr>
       </w:pPr>
       <w:r>
@@ -12252,7 +12556,7 @@
         <w:pStyle w:val="Compact"/>
         <w:numPr>
           <w:ilvl w:val="0"/>
-          <w:numId w:val="1550"/>
+          <w:numId w:val="1560"/>
         </w:numPr>
       </w:pPr>
       <w:r>
@@ -12264,7 +12568,7 @@
         <w:pStyle w:val="Compact"/>
         <w:numPr>
           <w:ilvl w:val="0"/>
-          <w:numId w:val="1551"/>
+          <w:numId w:val="1561"/>
         </w:numPr>
       </w:pPr>
       <w:r>
@@ -12276,7 +12580,7 @@
         <w:pStyle w:val="Compact"/>
         <w:numPr>
           <w:ilvl w:val="0"/>
-          <w:numId w:val="1552"/>
+          <w:numId w:val="1562"/>
         </w:numPr>
       </w:pPr>
       <w:r>
@@ -12288,7 +12592,7 @@
         <w:pStyle w:val="Compact"/>
         <w:numPr>
           <w:ilvl w:val="0"/>
-          <w:numId w:val="1553"/>
+          <w:numId w:val="1563"/>
         </w:numPr>
       </w:pPr>
       <w:r>
@@ -12300,7 +12604,7 @@
         <w:pStyle w:val="Compact"/>
         <w:numPr>
           <w:ilvl w:val="0"/>
-          <w:numId w:val="1554"/>
+          <w:numId w:val="1564"/>
         </w:numPr>
       </w:pPr>
       <w:r>
@@ -12312,7 +12616,7 @@
         <w:pStyle w:val="Compact"/>
         <w:numPr>
           <w:ilvl w:val="0"/>
-          <w:numId w:val="1555"/>
+          <w:numId w:val="1565"/>
         </w:numPr>
       </w:pPr>
       <w:r>
@@ -12324,7 +12628,7 @@
         <w:pStyle w:val="Compact"/>
         <w:numPr>
           <w:ilvl w:val="0"/>
-          <w:numId w:val="1556"/>
+          <w:numId w:val="1566"/>
         </w:numPr>
       </w:pPr>
       <w:r>
@@ -12336,7 +12640,7 @@
         <w:pStyle w:val="Compact"/>
         <w:numPr>
           <w:ilvl w:val="0"/>
-          <w:numId w:val="1557"/>
+          <w:numId w:val="1567"/>
         </w:numPr>
       </w:pPr>
       <w:r>
@@ -12348,7 +12652,7 @@
         <w:pStyle w:val="Compact"/>
         <w:numPr>
           <w:ilvl w:val="0"/>
-          <w:numId w:val="1558"/>
+          <w:numId w:val="1568"/>
         </w:numPr>
       </w:pPr>
       <w:r>
@@ -12360,7 +12664,7 @@
         <w:pStyle w:val="Compact"/>
         <w:numPr>
           <w:ilvl w:val="0"/>
-          <w:numId w:val="1559"/>
+          <w:numId w:val="1569"/>
         </w:numPr>
       </w:pPr>
       <w:r>
@@ -12372,7 +12676,7 @@
         <w:pStyle w:val="Compact"/>
         <w:numPr>
           <w:ilvl w:val="0"/>
-          <w:numId w:val="1560"/>
+          <w:numId w:val="1570"/>
         </w:numPr>
       </w:pPr>
       <w:r>
@@ -12384,7 +12688,7 @@
         <w:pStyle w:val="Compact"/>
         <w:numPr>
           <w:ilvl w:val="0"/>
-          <w:numId w:val="1561"/>
+          <w:numId w:val="1571"/>
         </w:numPr>
       </w:pPr>
       <w:r>
@@ -12396,16 +12700,16 @@
         <w:pStyle w:val="Compact"/>
         <w:numPr>
           <w:ilvl w:val="0"/>
-          <w:numId w:val="1562"/>
+          <w:numId w:val="1572"/>
         </w:numPr>
       </w:pPr>
       <w:r>
         <w:t xml:space="preserve">Progress dashboard updated.</w:t>
       </w:r>
     </w:p>
-    <w:bookmarkEnd w:id="77"/>
     <w:bookmarkEnd w:id="78"/>
-    <w:bookmarkStart w:id="82" w:name="m2.4-m2-full-regression-and-release-gate"/>
+    <w:bookmarkEnd w:id="79"/>
+    <w:bookmarkStart w:id="83" w:name="m2.4-m2-full-regression-and-release-gate"/>
     <w:p>
       <w:pPr>
         <w:pStyle w:val="Heading2"/>
@@ -12414,7 +12718,7 @@
         <w:t xml:space="preserve">M2.4 — M2 Full Regression And Release Gate</w:t>
       </w:r>
     </w:p>
-    <w:bookmarkStart w:id="79" w:name="functional-regression-1"/>
+    <w:bookmarkStart w:id="80" w:name="functional-regression-1"/>
     <w:p>
       <w:pPr>
         <w:pStyle w:val="Heading3"/>
@@ -12428,7 +12732,7 @@
         <w:pStyle w:val="Compact"/>
         <w:numPr>
           <w:ilvl w:val="0"/>
-          <w:numId w:val="1563"/>
+          <w:numId w:val="1573"/>
         </w:numPr>
       </w:pPr>
       <w:r>
@@ -12440,7 +12744,7 @@
         <w:pStyle w:val="Compact"/>
         <w:numPr>
           <w:ilvl w:val="0"/>
-          <w:numId w:val="1564"/>
+          <w:numId w:val="1574"/>
         </w:numPr>
       </w:pPr>
       <w:r>
@@ -12452,7 +12756,7 @@
         <w:pStyle w:val="Compact"/>
         <w:numPr>
           <w:ilvl w:val="0"/>
-          <w:numId w:val="1565"/>
+          <w:numId w:val="1575"/>
         </w:numPr>
       </w:pPr>
       <w:r>
@@ -12464,7 +12768,7 @@
         <w:pStyle w:val="Compact"/>
         <w:numPr>
           <w:ilvl w:val="0"/>
-          <w:numId w:val="1566"/>
+          <w:numId w:val="1576"/>
         </w:numPr>
       </w:pPr>
       <w:r>
@@ -12476,7 +12780,7 @@
         <w:pStyle w:val="Compact"/>
         <w:numPr>
           <w:ilvl w:val="0"/>
-          <w:numId w:val="1567"/>
+          <w:numId w:val="1577"/>
         </w:numPr>
       </w:pPr>
       <w:r>
@@ -12488,7 +12792,7 @@
         <w:pStyle w:val="Compact"/>
         <w:numPr>
           <w:ilvl w:val="0"/>
-          <w:numId w:val="1568"/>
+          <w:numId w:val="1578"/>
         </w:numPr>
       </w:pPr>
       <w:r>
@@ -12500,7 +12804,7 @@
         <w:pStyle w:val="Compact"/>
         <w:numPr>
           <w:ilvl w:val="0"/>
-          <w:numId w:val="1569"/>
+          <w:numId w:val="1579"/>
         </w:numPr>
       </w:pPr>
       <w:r>
@@ -12512,7 +12816,7 @@
         <w:pStyle w:val="Compact"/>
         <w:numPr>
           <w:ilvl w:val="0"/>
-          <w:numId w:val="1570"/>
+          <w:numId w:val="1580"/>
         </w:numPr>
       </w:pPr>
       <w:r>
@@ -12524,7 +12828,7 @@
         <w:pStyle w:val="Compact"/>
         <w:numPr>
           <w:ilvl w:val="0"/>
-          <w:numId w:val="1571"/>
+          <w:numId w:val="1581"/>
         </w:numPr>
       </w:pPr>
       <w:r>
@@ -12536,7 +12840,7 @@
         <w:pStyle w:val="Compact"/>
         <w:numPr>
           <w:ilvl w:val="0"/>
-          <w:numId w:val="1572"/>
+          <w:numId w:val="1582"/>
         </w:numPr>
       </w:pPr>
       <w:r>
@@ -12548,7 +12852,7 @@
         <w:pStyle w:val="Compact"/>
         <w:numPr>
           <w:ilvl w:val="0"/>
-          <w:numId w:val="1573"/>
+          <w:numId w:val="1583"/>
         </w:numPr>
       </w:pPr>
       <w:r>
@@ -12560,7 +12864,7 @@
         <w:pStyle w:val="Compact"/>
         <w:numPr>
           <w:ilvl w:val="0"/>
-          <w:numId w:val="1574"/>
+          <w:numId w:val="1584"/>
         </w:numPr>
       </w:pPr>
       <w:r>
@@ -12572,7 +12876,7 @@
         <w:pStyle w:val="Compact"/>
         <w:numPr>
           <w:ilvl w:val="0"/>
-          <w:numId w:val="1575"/>
+          <w:numId w:val="1585"/>
         </w:numPr>
       </w:pPr>
       <w:r>
@@ -12594,8 +12898,8 @@
         <w:t xml:space="preserve">and test messages.</w:t>
       </w:r>
     </w:p>
-    <w:bookmarkEnd w:id="79"/>
-    <w:bookmarkStart w:id="80" w:name="visual-regression-1"/>
+    <w:bookmarkEnd w:id="80"/>
+    <w:bookmarkStart w:id="81" w:name="visual-regression-1"/>
     <w:p>
       <w:pPr>
         <w:pStyle w:val="Heading3"/>
@@ -12609,7 +12913,7 @@
         <w:pStyle w:val="Compact"/>
         <w:numPr>
           <w:ilvl w:val="0"/>
-          <w:numId w:val="1576"/>
+          <w:numId w:val="1586"/>
         </w:numPr>
       </w:pPr>
       <w:r>
@@ -12621,7 +12925,7 @@
         <w:pStyle w:val="Compact"/>
         <w:numPr>
           <w:ilvl w:val="0"/>
-          <w:numId w:val="1577"/>
+          <w:numId w:val="1587"/>
         </w:numPr>
       </w:pPr>
       <w:r>
@@ -12648,7 +12952,7 @@
         <w:pStyle w:val="Compact"/>
         <w:numPr>
           <w:ilvl w:val="0"/>
-          <w:numId w:val="1578"/>
+          <w:numId w:val="1588"/>
         </w:numPr>
       </w:pPr>
       <w:r>
@@ -12660,7 +12964,7 @@
         <w:pStyle w:val="Compact"/>
         <w:numPr>
           <w:ilvl w:val="0"/>
-          <w:numId w:val="1579"/>
+          <w:numId w:val="1589"/>
         </w:numPr>
       </w:pPr>
       <w:r>
@@ -12672,7 +12976,7 @@
         <w:pStyle w:val="Compact"/>
         <w:numPr>
           <w:ilvl w:val="0"/>
-          <w:numId w:val="1580"/>
+          <w:numId w:val="1590"/>
         </w:numPr>
       </w:pPr>
       <w:r>
@@ -12684,7 +12988,7 @@
         <w:pStyle w:val="Compact"/>
         <w:numPr>
           <w:ilvl w:val="0"/>
-          <w:numId w:val="1581"/>
+          <w:numId w:val="1591"/>
         </w:numPr>
       </w:pPr>
       <w:r>
@@ -12696,7 +13000,7 @@
         <w:pStyle w:val="Compact"/>
         <w:numPr>
           <w:ilvl w:val="0"/>
-          <w:numId w:val="1582"/>
+          <w:numId w:val="1592"/>
         </w:numPr>
       </w:pPr>
       <w:r>
@@ -12708,15 +13012,15 @@
         <w:pStyle w:val="Compact"/>
         <w:numPr>
           <w:ilvl w:val="0"/>
-          <w:numId w:val="1583"/>
+          <w:numId w:val="1593"/>
         </w:numPr>
       </w:pPr>
       <w:r>
         <w:t xml:space="preserve">No unreadable text if current styles fail; scoped style set added if needed.</w:t>
       </w:r>
     </w:p>
-    <w:bookmarkEnd w:id="80"/>
-    <w:bookmarkStart w:id="81" w:name="release-readiness-1"/>
+    <w:bookmarkEnd w:id="81"/>
+    <w:bookmarkStart w:id="82" w:name="release-readiness-1"/>
     <w:p>
       <w:pPr>
         <w:pStyle w:val="Heading3"/>
@@ -12730,7 +13034,7 @@
         <w:pStyle w:val="Compact"/>
         <w:numPr>
           <w:ilvl w:val="0"/>
-          <w:numId w:val="1584"/>
+          <w:numId w:val="1594"/>
         </w:numPr>
       </w:pPr>
       <w:r>
@@ -12742,7 +13046,7 @@
         <w:pStyle w:val="Compact"/>
         <w:numPr>
           <w:ilvl w:val="0"/>
-          <w:numId w:val="1585"/>
+          <w:numId w:val="1595"/>
         </w:numPr>
       </w:pPr>
       <w:r>
@@ -12754,7 +13058,7 @@
         <w:pStyle w:val="Compact"/>
         <w:numPr>
           <w:ilvl w:val="0"/>
-          <w:numId w:val="1586"/>
+          <w:numId w:val="1596"/>
         </w:numPr>
       </w:pPr>
       <w:r>
@@ -12766,7 +13070,7 @@
         <w:pStyle w:val="Compact"/>
         <w:numPr>
           <w:ilvl w:val="0"/>
-          <w:numId w:val="1587"/>
+          <w:numId w:val="1597"/>
         </w:numPr>
       </w:pPr>
       <w:r>
@@ -12778,7 +13082,7 @@
         <w:pStyle w:val="Compact"/>
         <w:numPr>
           <w:ilvl w:val="0"/>
-          <w:numId w:val="1588"/>
+          <w:numId w:val="1598"/>
         </w:numPr>
       </w:pPr>
       <w:r>
@@ -12790,7 +13094,7 @@
         <w:pStyle w:val="Compact"/>
         <w:numPr>
           <w:ilvl w:val="0"/>
-          <w:numId w:val="1589"/>
+          <w:numId w:val="1599"/>
         </w:numPr>
       </w:pPr>
       <w:r>
@@ -12802,7 +13106,7 @@
         <w:pStyle w:val="Compact"/>
         <w:numPr>
           <w:ilvl w:val="0"/>
-          <w:numId w:val="1590"/>
+          <w:numId w:val="1600"/>
         </w:numPr>
       </w:pPr>
       <w:r>
@@ -12814,7 +13118,7 @@
         <w:pStyle w:val="Compact"/>
         <w:numPr>
           <w:ilvl w:val="0"/>
-          <w:numId w:val="1591"/>
+          <w:numId w:val="1601"/>
         </w:numPr>
       </w:pPr>
       <w:r>
@@ -12826,16 +13130,16 @@
         <w:pStyle w:val="Compact"/>
         <w:numPr>
           <w:ilvl w:val="0"/>
-          <w:numId w:val="1592"/>
+          <w:numId w:val="1602"/>
         </w:numPr>
       </w:pPr>
       <w:r>
         <w:t xml:space="preserve">Progress dashboard updated to M2 complete only after all gates pass.</w:t>
       </w:r>
     </w:p>
-    <w:bookmarkEnd w:id="81"/>
     <w:bookmarkEnd w:id="82"/>
-    <w:bookmarkStart w:id="83" w:name="full-final-acceptance"/>
+    <w:bookmarkEnd w:id="83"/>
+    <w:bookmarkStart w:id="84" w:name="full-final-acceptance"/>
     <w:p>
       <w:pPr>
         <w:pStyle w:val="Heading2"/>
@@ -12849,7 +13153,7 @@
         <w:pStyle w:val="Compact"/>
         <w:numPr>
           <w:ilvl w:val="0"/>
-          <w:numId w:val="1593"/>
+          <w:numId w:val="1603"/>
         </w:numPr>
       </w:pPr>
       <w:r>
@@ -12861,7 +13165,7 @@
         <w:pStyle w:val="Compact"/>
         <w:numPr>
           <w:ilvl w:val="0"/>
-          <w:numId w:val="1594"/>
+          <w:numId w:val="1604"/>
         </w:numPr>
       </w:pPr>
       <w:r>
@@ -12873,7 +13177,7 @@
         <w:pStyle w:val="Compact"/>
         <w:numPr>
           <w:ilvl w:val="0"/>
-          <w:numId w:val="1595"/>
+          <w:numId w:val="1605"/>
         </w:numPr>
       </w:pPr>
       <w:r>
@@ -12885,7 +13189,7 @@
         <w:pStyle w:val="Compact"/>
         <w:numPr>
           <w:ilvl w:val="0"/>
-          <w:numId w:val="1596"/>
+          <w:numId w:val="1606"/>
         </w:numPr>
       </w:pPr>
       <w:r>
@@ -12897,7 +13201,7 @@
         <w:pStyle w:val="Compact"/>
         <w:numPr>
           <w:ilvl w:val="0"/>
-          <w:numId w:val="1597"/>
+          <w:numId w:val="1607"/>
         </w:numPr>
       </w:pPr>
       <w:r>
@@ -12909,7 +13213,7 @@
         <w:pStyle w:val="Compact"/>
         <w:numPr>
           <w:ilvl w:val="0"/>
-          <w:numId w:val="1598"/>
+          <w:numId w:val="1608"/>
         </w:numPr>
       </w:pPr>
       <w:r>
@@ -12921,7 +13225,7 @@
         <w:pStyle w:val="Compact"/>
         <w:numPr>
           <w:ilvl w:val="0"/>
-          <w:numId w:val="1599"/>
+          <w:numId w:val="1609"/>
         </w:numPr>
       </w:pPr>
       <w:r>
@@ -12933,7 +13237,7 @@
         <w:pStyle w:val="Compact"/>
         <w:numPr>
           <w:ilvl w:val="0"/>
-          <w:numId w:val="1600"/>
+          <w:numId w:val="1610"/>
         </w:numPr>
       </w:pPr>
       <w:r>
@@ -12945,7 +13249,7 @@
         <w:pStyle w:val="Compact"/>
         <w:numPr>
           <w:ilvl w:val="0"/>
-          <w:numId w:val="1601"/>
+          <w:numId w:val="1611"/>
         </w:numPr>
       </w:pPr>
       <w:r>
@@ -12957,7 +13261,7 @@
         <w:pStyle w:val="Compact"/>
         <w:numPr>
           <w:ilvl w:val="0"/>
-          <w:numId w:val="1602"/>
+          <w:numId w:val="1612"/>
         </w:numPr>
       </w:pPr>
       <w:r>
@@ -12969,15 +13273,15 @@
         <w:pStyle w:val="Compact"/>
         <w:numPr>
           <w:ilvl w:val="0"/>
-          <w:numId w:val="1603"/>
+          <w:numId w:val="1613"/>
         </w:numPr>
       </w:pPr>
       <w:r>
         <w:t xml:space="preserve">Final client-facing summary prepared with what changed, how it was tested, and what is intentionally out of scope.</w:t>
       </w:r>
     </w:p>
-    <w:bookmarkEnd w:id="83"/>
-    <w:bookmarkStart w:id="84" w:name="progress-update-log"/>
+    <w:bookmarkEnd w:id="84"/>
+    <w:bookmarkStart w:id="85" w:name="progress-update-log"/>
     <w:p>
       <w:pPr>
         <w:pStyle w:val="Heading2"/>
@@ -13120,8 +13424,8 @@
         </w:tc>
       </w:tr>
     </w:tbl>
-    <w:bookmarkEnd w:id="84"/>
     <w:bookmarkEnd w:id="85"/>
+    <w:bookmarkEnd w:id="86"/>
     <w:sectPr>
       <w:footnotePr>
         <w:numRestart w:val="eachSect"/>
@@ -14778,61 +15082,61 @@
     <w:abstractNumId w:val="993"/>
   </w:num>
   <w:num w:numId="1430">
-    <w:abstractNumId w:val="992"/>
+    <w:abstractNumId w:val="993"/>
   </w:num>
   <w:num w:numId="1431">
-    <w:abstractNumId w:val="992"/>
+    <w:abstractNumId w:val="993"/>
   </w:num>
   <w:num w:numId="1432">
-    <w:abstractNumId w:val="991"/>
+    <w:abstractNumId w:val="993"/>
   </w:num>
   <w:num w:numId="1433">
-    <w:abstractNumId w:val="992"/>
+    <w:abstractNumId w:val="993"/>
   </w:num>
   <w:num w:numId="1434">
-    <w:abstractNumId w:val="992"/>
+    <w:abstractNumId w:val="993"/>
   </w:num>
   <w:num w:numId="1435">
-    <w:abstractNumId w:val="992"/>
+    <w:abstractNumId w:val="993"/>
   </w:num>
   <w:num w:numId="1436">
-    <w:abstractNumId w:val="991"/>
+    <w:abstractNumId w:val="993"/>
   </w:num>
   <w:num w:numId="1437">
-    <w:abstractNumId w:val="992"/>
+    <w:abstractNumId w:val="993"/>
   </w:num>
   <w:num w:numId="1438">
-    <w:abstractNumId w:val="992"/>
+    <w:abstractNumId w:val="993"/>
   </w:num>
   <w:num w:numId="1439">
-    <w:abstractNumId w:val="992"/>
+    <w:abstractNumId w:val="993"/>
   </w:num>
   <w:num w:numId="1440">
-    <w:abstractNumId w:val="992"/>
+    <w:abstractNumId w:val="993"/>
   </w:num>
   <w:num w:numId="1441">
-    <w:abstractNumId w:val="992"/>
+    <w:abstractNumId w:val="993"/>
   </w:num>
   <w:num w:numId="1442">
     <w:abstractNumId w:val="991"/>
   </w:num>
   <w:num w:numId="1443">
-    <w:abstractNumId w:val="992"/>
+    <w:abstractNumId w:val="993"/>
   </w:num>
   <w:num w:numId="1444">
+    <w:abstractNumId w:val="993"/>
+  </w:num>
+  <w:num w:numId="1445">
+    <w:abstractNumId w:val="993"/>
+  </w:num>
+  <w:num w:numId="1446">
     <w:abstractNumId w:val="991"/>
   </w:num>
-  <w:num w:numId="1445">
-    <w:abstractNumId w:val="992"/>
-  </w:num>
-  <w:num w:numId="1446">
-    <w:abstractNumId w:val="992"/>
-  </w:num>
   <w:num w:numId="1447">
-    <w:abstractNumId w:val="992"/>
+    <w:abstractNumId w:val="993"/>
   </w:num>
   <w:num w:numId="1448">
-    <w:abstractNumId w:val="992"/>
+    <w:abstractNumId w:val="993"/>
   </w:num>
   <w:num w:numId="1449">
     <w:abstractNumId w:val="992"/>
@@ -14841,52 +15145,52 @@
     <w:abstractNumId w:val="992"/>
   </w:num>
   <w:num w:numId="1451">
-    <w:abstractNumId w:val="992"/>
+    <w:abstractNumId w:val="993"/>
   </w:num>
   <w:num w:numId="1452">
-    <w:abstractNumId w:val="992"/>
+    <w:abstractNumId w:val="991"/>
   </w:num>
   <w:num w:numId="1453">
-    <w:abstractNumId w:val="992"/>
+    <w:abstractNumId w:val="993"/>
   </w:num>
   <w:num w:numId="1454">
     <w:abstractNumId w:val="991"/>
   </w:num>
   <w:num w:numId="1455">
-    <w:abstractNumId w:val="992"/>
+    <w:abstractNumId w:val="993"/>
   </w:num>
   <w:num w:numId="1456">
-    <w:abstractNumId w:val="992"/>
+    <w:abstractNumId w:val="993"/>
   </w:num>
   <w:num w:numId="1457">
-    <w:abstractNumId w:val="992"/>
+    <w:abstractNumId w:val="993"/>
   </w:num>
   <w:num w:numId="1458">
-    <w:abstractNumId w:val="992"/>
+    <w:abstractNumId w:val="993"/>
   </w:num>
   <w:num w:numId="1459">
-    <w:abstractNumId w:val="992"/>
+    <w:abstractNumId w:val="993"/>
   </w:num>
   <w:num w:numId="1460">
-    <w:abstractNumId w:val="992"/>
+    <w:abstractNumId w:val="993"/>
   </w:num>
   <w:num w:numId="1461">
-    <w:abstractNumId w:val="992"/>
+    <w:abstractNumId w:val="993"/>
   </w:num>
   <w:num w:numId="1462">
-    <w:abstractNumId w:val="992"/>
+    <w:abstractNumId w:val="993"/>
   </w:num>
   <w:num w:numId="1463">
-    <w:abstractNumId w:val="992"/>
+    <w:abstractNumId w:val="993"/>
   </w:num>
   <w:num w:numId="1464">
-    <w:abstractNumId w:val="992"/>
+    <w:abstractNumId w:val="991"/>
   </w:num>
   <w:num w:numId="1465">
-    <w:abstractNumId w:val="992"/>
+    <w:abstractNumId w:val="993"/>
   </w:num>
   <w:num w:numId="1466">
-    <w:abstractNumId w:val="992"/>
+    <w:abstractNumId w:val="993"/>
   </w:num>
   <w:num w:numId="1467">
     <w:abstractNumId w:val="992"/>
@@ -14895,13 +15199,13 @@
     <w:abstractNumId w:val="992"/>
   </w:num>
   <w:num w:numId="1469">
-    <w:abstractNumId w:val="992"/>
+    <w:abstractNumId w:val="993"/>
   </w:num>
   <w:num w:numId="1470">
-    <w:abstractNumId w:val="992"/>
+    <w:abstractNumId w:val="993"/>
   </w:num>
   <w:num w:numId="1471">
-    <w:abstractNumId w:val="992"/>
+    <w:abstractNumId w:val="993"/>
   </w:num>
   <w:num w:numId="1472">
     <w:abstractNumId w:val="992"/>
@@ -14916,38 +15220,38 @@
     <w:abstractNumId w:val="992"/>
   </w:num>
   <w:num w:numId="1476">
+    <w:abstractNumId w:val="993"/>
+  </w:num>
+  <w:num w:numId="1477">
+    <w:abstractNumId w:val="992"/>
+  </w:num>
+  <w:num w:numId="1478">
+    <w:abstractNumId w:val="992"/>
+  </w:num>
+  <w:num w:numId="1479">
+    <w:abstractNumId w:val="993"/>
+  </w:num>
+  <w:num w:numId="1480">
+    <w:abstractNumId w:val="992"/>
+  </w:num>
+  <w:num w:numId="1481">
+    <w:abstractNumId w:val="992"/>
+  </w:num>
+  <w:num w:numId="1482">
+    <w:abstractNumId w:val="992"/>
+  </w:num>
+  <w:num w:numId="1483">
+    <w:abstractNumId w:val="992"/>
+  </w:num>
+  <w:num w:numId="1484">
+    <w:abstractNumId w:val="992"/>
+  </w:num>
+  <w:num w:numId="1485">
+    <w:abstractNumId w:val="992"/>
+  </w:num>
+  <w:num w:numId="1486">
     <w:abstractNumId w:val="991"/>
   </w:num>
-  <w:num w:numId="1477">
-    <w:abstractNumId w:val="992"/>
-  </w:num>
-  <w:num w:numId="1478">
-    <w:abstractNumId w:val="992"/>
-  </w:num>
-  <w:num w:numId="1479">
-    <w:abstractNumId w:val="992"/>
-  </w:num>
-  <w:num w:numId="1480">
-    <w:abstractNumId w:val="992"/>
-  </w:num>
-  <w:num w:numId="1481">
-    <w:abstractNumId w:val="992"/>
-  </w:num>
-  <w:num w:numId="1482">
-    <w:abstractNumId w:val="992"/>
-  </w:num>
-  <w:num w:numId="1483">
-    <w:abstractNumId w:val="992"/>
-  </w:num>
-  <w:num w:numId="1484">
-    <w:abstractNumId w:val="992"/>
-  </w:num>
-  <w:num w:numId="1485">
-    <w:abstractNumId w:val="992"/>
-  </w:num>
-  <w:num w:numId="1486">
-    <w:abstractNumId w:val="992"/>
-  </w:num>
   <w:num w:numId="1487">
     <w:abstractNumId w:val="992"/>
   </w:num>
@@ -14982,86 +15286,86 @@
     <w:abstractNumId w:val="992"/>
   </w:num>
   <w:num w:numId="1498">
+    <w:abstractNumId w:val="992"/>
+  </w:num>
+  <w:num w:numId="1499">
+    <w:abstractNumId w:val="992"/>
+  </w:num>
+  <w:num w:numId="1500">
+    <w:abstractNumId w:val="992"/>
+  </w:num>
+  <w:num w:numId="1501">
+    <w:abstractNumId w:val="992"/>
+  </w:num>
+  <w:num w:numId="1502">
+    <w:abstractNumId w:val="992"/>
+  </w:num>
+  <w:num w:numId="1503">
+    <w:abstractNumId w:val="992"/>
+  </w:num>
+  <w:num w:numId="1504">
+    <w:abstractNumId w:val="992"/>
+  </w:num>
+  <w:num w:numId="1505">
+    <w:abstractNumId w:val="992"/>
+  </w:num>
+  <w:num w:numId="1506">
+    <w:abstractNumId w:val="992"/>
+  </w:num>
+  <w:num w:numId="1507">
+    <w:abstractNumId w:val="992"/>
+  </w:num>
+  <w:num w:numId="1508">
     <w:abstractNumId w:val="991"/>
   </w:num>
-  <w:num w:numId="1499">
-    <w:abstractNumId w:val="992"/>
-  </w:num>
-  <w:num w:numId="1500">
-    <w:abstractNumId w:val="992"/>
-  </w:num>
-  <w:num w:numId="1501">
+  <w:num w:numId="1509">
+    <w:abstractNumId w:val="992"/>
+  </w:num>
+  <w:num w:numId="1510">
+    <w:abstractNumId w:val="992"/>
+  </w:num>
+  <w:num w:numId="1511">
     <w:abstractNumId w:val="991"/>
   </w:num>
-  <w:num w:numId="1502">
-    <w:abstractNumId w:val="992"/>
-  </w:num>
-  <w:num w:numId="1503">
-    <w:abstractNumId w:val="992"/>
-  </w:num>
-  <w:num w:numId="1504">
-    <w:abstractNumId w:val="992"/>
-  </w:num>
-  <w:num w:numId="1505">
-    <w:abstractNumId w:val="992"/>
-  </w:num>
-  <w:num w:numId="1506">
-    <w:abstractNumId w:val="992"/>
-  </w:num>
-  <w:num w:numId="1507">
-    <w:abstractNumId w:val="992"/>
-  </w:num>
-  <w:num w:numId="1508">
-    <w:abstractNumId w:val="992"/>
-  </w:num>
-  <w:num w:numId="1509">
-    <w:abstractNumId w:val="992"/>
-  </w:num>
-  <w:num w:numId="1510">
-    <w:abstractNumId w:val="992"/>
-  </w:num>
-  <w:num w:numId="1511">
-    <w:abstractNumId w:val="992"/>
-  </w:num>
   <w:num w:numId="1512">
+    <w:abstractNumId w:val="992"/>
+  </w:num>
+  <w:num w:numId="1513">
+    <w:abstractNumId w:val="992"/>
+  </w:num>
+  <w:num w:numId="1514">
+    <w:abstractNumId w:val="992"/>
+  </w:num>
+  <w:num w:numId="1515">
+    <w:abstractNumId w:val="992"/>
+  </w:num>
+  <w:num w:numId="1516">
+    <w:abstractNumId w:val="992"/>
+  </w:num>
+  <w:num w:numId="1517">
+    <w:abstractNumId w:val="992"/>
+  </w:num>
+  <w:num w:numId="1518">
+    <w:abstractNumId w:val="992"/>
+  </w:num>
+  <w:num w:numId="1519">
+    <w:abstractNumId w:val="992"/>
+  </w:num>
+  <w:num w:numId="1520">
+    <w:abstractNumId w:val="992"/>
+  </w:num>
+  <w:num w:numId="1521">
+    <w:abstractNumId w:val="992"/>
+  </w:num>
+  <w:num w:numId="1522">
     <w:abstractNumId w:val="991"/>
   </w:num>
-  <w:num w:numId="1513">
-    <w:abstractNumId w:val="992"/>
-  </w:num>
-  <w:num w:numId="1514">
+  <w:num w:numId="1523">
+    <w:abstractNumId w:val="992"/>
+  </w:num>
+  <w:num w:numId="1524">
     <w:abstractNumId w:val="991"/>
   </w:num>
-  <w:num w:numId="1515">
-    <w:abstractNumId w:val="992"/>
-  </w:num>
-  <w:num w:numId="1516">
-    <w:abstractNumId w:val="992"/>
-  </w:num>
-  <w:num w:numId="1517">
-    <w:abstractNumId w:val="992"/>
-  </w:num>
-  <w:num w:numId="1518">
-    <w:abstractNumId w:val="992"/>
-  </w:num>
-  <w:num w:numId="1519">
-    <w:abstractNumId w:val="992"/>
-  </w:num>
-  <w:num w:numId="1520">
-    <w:abstractNumId w:val="992"/>
-  </w:num>
-  <w:num w:numId="1521">
-    <w:abstractNumId w:val="992"/>
-  </w:num>
-  <w:num w:numId="1522">
-    <w:abstractNumId w:val="992"/>
-  </w:num>
-  <w:num w:numId="1523">
-    <w:abstractNumId w:val="992"/>
-  </w:num>
-  <w:num w:numId="1524">
-    <w:abstractNumId w:val="992"/>
-  </w:num>
   <w:num w:numId="1525">
     <w:abstractNumId w:val="992"/>
   </w:num>
@@ -15297,6 +15601,36 @@
     <w:abstractNumId w:val="992"/>
   </w:num>
   <w:num w:numId="1603">
+    <w:abstractNumId w:val="992"/>
+  </w:num>
+  <w:num w:numId="1604">
+    <w:abstractNumId w:val="992"/>
+  </w:num>
+  <w:num w:numId="1605">
+    <w:abstractNumId w:val="992"/>
+  </w:num>
+  <w:num w:numId="1606">
+    <w:abstractNumId w:val="992"/>
+  </w:num>
+  <w:num w:numId="1607">
+    <w:abstractNumId w:val="992"/>
+  </w:num>
+  <w:num w:numId="1608">
+    <w:abstractNumId w:val="992"/>
+  </w:num>
+  <w:num w:numId="1609">
+    <w:abstractNumId w:val="992"/>
+  </w:num>
+  <w:num w:numId="1610">
+    <w:abstractNumId w:val="992"/>
+  </w:num>
+  <w:num w:numId="1611">
+    <w:abstractNumId w:val="992"/>
+  </w:num>
+  <w:num w:numId="1612">
+    <w:abstractNumId w:val="992"/>
+  </w:num>
+  <w:num w:numId="1613">
     <w:abstractNumId w:val="992"/>
   </w:num>
 </w:numbering>

</xml_diff>

<commit_message>
Implement M2.3 AI retarget foundation
</commit_message>
<xml_diff>
--- a/MASTER_M1_M2_DELIVERY_CHECKLIST.docx
+++ b/MASTER_M1_M2_DELIVERY_CHECKLIST.docx
@@ -10,7 +10,7 @@
         <w:t xml:space="preserve">© BuyReadySite.com</w:t>
       </w:r>
     </w:p>
-    <w:bookmarkStart w:id="86" w:name="X3d74ce0b4fd94f465ac7edf34b08aa6d5ff209b"/>
+    <w:bookmarkStart w:id="87" w:name="X3d74ce0b4fd94f465ac7edf34b08aa6d5ff209b"/>
     <w:p>
       <w:pPr>
         <w:pStyle w:val="Heading1"/>
@@ -601,7 +601,7 @@
               <w:jc w:val="right"/>
             </w:pPr>
             <w:r>
-              <w:t xml:space="preserve">0%</w:t>
+              <w:t xml:space="preserve">4%</w:t>
             </w:r>
           </w:p>
         </w:tc>
@@ -612,7 +612,7 @@
               <w:pStyle w:val="Compact"/>
             </w:pPr>
             <w:r>
-              <w:t xml:space="preserve">Not started</w:t>
+              <w:t xml:space="preserve">Live cohort API/UI/build-draft foundation + focused tests/build passed; DB/cron/pixel pending</w:t>
             </w:r>
           </w:p>
         </w:tc>
@@ -709,7 +709,7 @@
                 <w:b/>
                 <w:bCs/>
               </w:rPr>
-              <w:t xml:space="preserve">52%</w:t>
+              <w:t xml:space="preserve">56%</w:t>
             </w:r>
           </w:p>
         </w:tc>
@@ -724,7 +724,7 @@
                 <w:b/>
                 <w:bCs/>
               </w:rPr>
-              <w:t xml:space="preserve">M2.2 enrichment/export implementation added; browser smoke gates remain</w:t>
+              <w:t xml:space="preserve">M2.3 AI Retarget foundation added; browser smoke and release gates remain</w:t>
             </w:r>
           </w:p>
         </w:tc>
@@ -11205,7 +11205,7 @@
     </w:p>
     <w:bookmarkEnd w:id="68"/>
     <w:bookmarkEnd w:id="69"/>
-    <w:bookmarkStart w:id="79" w:name="m2.3-ai-retarget-campaigns"/>
+    <w:bookmarkStart w:id="80" w:name="m2.3-ai-retarget-campaigns"/>
     <w:p>
       <w:pPr>
         <w:pStyle w:val="Heading2"/>
@@ -11214,12 +11214,292 @@
         <w:t xml:space="preserve">M2.3 — AI Retarget Campaigns</w:t>
       </w:r>
     </w:p>
-    <w:bookmarkStart w:id="70" w:name="scope-lock-for-ai-retarget"/>
+    <w:bookmarkStart w:id="70" w:name="implementation-evidence-2026-05-02-5"/>
     <w:p>
       <w:pPr>
         <w:pStyle w:val="Heading3"/>
       </w:pPr>
       <w:r>
+        <w:t xml:space="preserve">Implementation evidence — 2026-05-02</w:t>
+      </w:r>
+    </w:p>
+    <w:p>
+      <w:pPr>
+        <w:pStyle w:val="Compact"/>
+        <w:numPr>
+          <w:ilvl w:val="0"/>
+          <w:numId w:val="1480"/>
+        </w:numPr>
+      </w:pPr>
+      <w:r>
+        <w:t xml:space="preserve">Added live AI cohort API foundation without DB migration:</w:t>
+      </w:r>
+      <w:r>
+        <w:t xml:space="preserve"> </w:t>
+      </w:r>
+      <w:r>
+        <w:rPr>
+          <w:rStyle w:val="VerbatimChar"/>
+        </w:rPr>
+        <w:t xml:space="preserve">GET /api/campaigns/ai-cohorts</w:t>
+      </w:r>
+      <w:r>
+        <w:t xml:space="preserve">,</w:t>
+      </w:r>
+      <w:r>
+        <w:t xml:space="preserve"> </w:t>
+      </w:r>
+      <w:r>
+        <w:rPr>
+          <w:rStyle w:val="VerbatimChar"/>
+        </w:rPr>
+        <w:t xml:space="preserve">GET /api/campaigns/ai-cohorts/:cohortId/preview</w:t>
+      </w:r>
+      <w:r>
+        <w:t xml:space="preserve">,</w:t>
+      </w:r>
+      <w:r>
+        <w:t xml:space="preserve"> </w:t>
+      </w:r>
+      <w:r>
+        <w:rPr>
+          <w:rStyle w:val="VerbatimChar"/>
+        </w:rPr>
+        <w:t xml:space="preserve">POST /api/campaigns/ai-cohorts/:cohortId/build</w:t>
+      </w:r>
+      <w:r>
+        <w:t xml:space="preserve">.</w:t>
+      </w:r>
+    </w:p>
+    <w:p>
+      <w:pPr>
+        <w:pStyle w:val="Compact"/>
+        <w:numPr>
+          <w:ilvl w:val="0"/>
+          <w:numId w:val="1481"/>
+        </w:numPr>
+      </w:pPr>
+      <w:r>
+        <w:t xml:space="preserve">Added three deterministic analytical cohort engines: multi-retarget, new restaurants, and admin-only renewals.</w:t>
+      </w:r>
+    </w:p>
+    <w:p>
+      <w:pPr>
+        <w:pStyle w:val="Compact"/>
+        <w:numPr>
+          <w:ilvl w:val="0"/>
+          <w:numId w:val="1482"/>
+        </w:numPr>
+      </w:pPr>
+      <w:r>
+        <w:t xml:space="preserve">Cohort queries exclude deleted, opted-out, suppressed, and DNC leads and apply rep lead scope for REP users.</w:t>
+      </w:r>
+    </w:p>
+    <w:p>
+      <w:pPr>
+        <w:pStyle w:val="Compact"/>
+        <w:numPr>
+          <w:ilvl w:val="0"/>
+          <w:numId w:val="1483"/>
+        </w:numPr>
+      </w:pPr>
+      <w:r>
+        <w:t xml:space="preserve">Cooldowns are applied before count/build: 7 days for multi-retarget/new cohorts, 30 days for renewals.</w:t>
+      </w:r>
+    </w:p>
+    <w:p>
+      <w:pPr>
+        <w:pStyle w:val="Compact"/>
+        <w:numPr>
+          <w:ilvl w:val="0"/>
+          <w:numId w:val="1484"/>
+        </w:numPr>
+      </w:pPr>
+      <w:r>
+        <w:t xml:space="preserve">AI cohort build creates a DRAFT campaign only; it does not auto-send or queue SMS.</w:t>
+      </w:r>
+    </w:p>
+    <w:p>
+      <w:pPr>
+        <w:pStyle w:val="Compact"/>
+        <w:numPr>
+          <w:ilvl w:val="0"/>
+          <w:numId w:val="1485"/>
+        </w:numPr>
+      </w:pPr>
+      <w:r>
+        <w:t xml:space="preserve">AI-built campaign lineage is stored through existing</w:t>
+      </w:r>
+      <w:r>
+        <w:t xml:space="preserve"> </w:t>
+      </w:r>
+      <w:r>
+        <w:rPr>
+          <w:rStyle w:val="VerbatimChar"/>
+        </w:rPr>
+        <w:t xml:space="preserve">Campaign.description</w:t>
+      </w:r>
+      <w:r>
+        <w:t xml:space="preserve"> </w:t>
+      </w:r>
+      <w:r>
+        <w:t xml:space="preserve">+</w:t>
+      </w:r>
+      <w:r>
+        <w:t xml:space="preserve"> </w:t>
+      </w:r>
+      <w:r>
+        <w:rPr>
+          <w:rStyle w:val="VerbatimChar"/>
+        </w:rPr>
+        <w:t xml:space="preserve">isRetarget</w:t>
+      </w:r>
+      <w:r>
+        <w:t xml:space="preserve"> </w:t>
+      </w:r>
+      <w:r>
+        <w:t xml:space="preserve">fields and surfaced as</w:t>
+      </w:r>
+      <w:r>
+        <w:t xml:space="preserve"> </w:t>
+      </w:r>
+      <w:r>
+        <w:rPr>
+          <w:rStyle w:val="VerbatimChar"/>
+        </w:rPr>
+        <w:t xml:space="preserve">AI Cohort · N leads · ~X funded expected</w:t>
+      </w:r>
+      <w:r>
+        <w:t xml:space="preserve">.</w:t>
+      </w:r>
+    </w:p>
+    <w:p>
+      <w:pPr>
+        <w:pStyle w:val="Compact"/>
+        <w:numPr>
+          <w:ilvl w:val="0"/>
+          <w:numId w:val="1486"/>
+        </w:numPr>
+      </w:pPr>
+      <w:r>
+        <w:t xml:space="preserve">Campaigns UI now renders AI Retarget Suggestions above All Campaigns, preview modal, Build Campaign action, AI badge, and lineage marker.</w:t>
+      </w:r>
+    </w:p>
+    <w:p>
+      <w:pPr>
+        <w:pStyle w:val="Compact"/>
+        <w:numPr>
+          <w:ilvl w:val="0"/>
+          <w:numId w:val="1487"/>
+        </w:numPr>
+      </w:pPr>
+      <w:r>
+        <w:t xml:space="preserve">Focused tests added in</w:t>
+      </w:r>
+      <w:r>
+        <w:t xml:space="preserve"> </w:t>
+      </w:r>
+      <w:r>
+        <w:rPr>
+          <w:rStyle w:val="VerbatimChar"/>
+        </w:rPr>
+        <w:t xml:space="preserve">server/tests/campaignAiCohorts.test.ts</w:t>
+      </w:r>
+      <w:r>
+        <w:t xml:space="preserve"> </w:t>
+      </w:r>
+      <w:r>
+        <w:t xml:space="preserve">for admin cohorts, REP renewal exclusion, and draft campaign build.</w:t>
+      </w:r>
+    </w:p>
+    <w:p>
+      <w:pPr>
+        <w:pStyle w:val="Compact"/>
+        <w:numPr>
+          <w:ilvl w:val="0"/>
+          <w:numId w:val="1488"/>
+        </w:numPr>
+      </w:pPr>
+      <w:r>
+        <w:t xml:space="preserve">Validation passed:</w:t>
+      </w:r>
+      <w:r>
+        <w:t xml:space="preserve"> </w:t>
+      </w:r>
+      <w:r>
+        <w:rPr>
+          <w:rStyle w:val="VerbatimChar"/>
+        </w:rPr>
+        <w:t xml:space="preserve">cd server &amp;&amp; npx vitest run tests/campaignAiCohorts.test.ts tests/leadCampaignScope.test.ts tests/leadEnrichmentExport.test.ts</w:t>
+      </w:r>
+      <w:r>
+        <w:t xml:space="preserve"> </w:t>
+      </w:r>
+      <w:r>
+        <w:t xml:space="preserve">— 10/10 passed, with known local Redis</w:t>
+      </w:r>
+      <w:r>
+        <w:t xml:space="preserve"> </w:t>
+      </w:r>
+      <w:r>
+        <w:rPr>
+          <w:rStyle w:val="VerbatimChar"/>
+        </w:rPr>
+        <w:t xml:space="preserve">ECONNREFUSED</w:t>
+      </w:r>
+      <w:r>
+        <w:t xml:space="preserve"> </w:t>
+      </w:r>
+      <w:r>
+        <w:t xml:space="preserve">warning only.</w:t>
+      </w:r>
+    </w:p>
+    <w:p>
+      <w:pPr>
+        <w:pStyle w:val="Compact"/>
+        <w:numPr>
+          <w:ilvl w:val="0"/>
+          <w:numId w:val="1489"/>
+        </w:numPr>
+      </w:pPr>
+      <w:r>
+        <w:t xml:space="preserve">Validation passed: root</w:t>
+      </w:r>
+      <w:r>
+        <w:t xml:space="preserve"> </w:t>
+      </w:r>
+      <w:r>
+        <w:rPr>
+          <w:rStyle w:val="VerbatimChar"/>
+        </w:rPr>
+        <w:t xml:space="preserve">npm run build</w:t>
+      </w:r>
+      <w:r>
+        <w:t xml:space="preserve"> </w:t>
+      </w:r>
+      <w:r>
+        <w:t xml:space="preserve">including server and client build.</w:t>
+      </w:r>
+    </w:p>
+    <w:p>
+      <w:pPr>
+        <w:pStyle w:val="Compact"/>
+        <w:numPr>
+          <w:ilvl w:val="0"/>
+          <w:numId w:val="1490"/>
+        </w:numPr>
+      </w:pPr>
+      <w:r>
+        <w:t xml:space="preserve">Targeted ESLint passed with 0 errors and existing warning debt only.</w:t>
+      </w:r>
+    </w:p>
+    <w:bookmarkEnd w:id="70"/>
+    <w:bookmarkStart w:id="71" w:name="scope-lock-for-ai-retarget"/>
+    <w:p>
+      <w:pPr>
+        <w:pStyle w:val="Heading3"/>
+      </w:pPr>
+      <w:r>
         <w:t xml:space="preserve">Scope lock for AI Retarget</w:t>
       </w:r>
     </w:p>
@@ -11228,7 +11508,7 @@
         <w:pStyle w:val="Compact"/>
         <w:numPr>
           <w:ilvl w:val="0"/>
-          <w:numId w:val="1480"/>
+          <w:numId w:val="1491"/>
         </w:numPr>
       </w:pPr>
       <w:r>
@@ -11240,7 +11520,7 @@
         <w:pStyle w:val="Compact"/>
         <w:numPr>
           <w:ilvl w:val="0"/>
-          <w:numId w:val="1481"/>
+          <w:numId w:val="1492"/>
         </w:numPr>
       </w:pPr>
       <w:r>
@@ -11252,7 +11532,7 @@
         <w:pStyle w:val="Compact"/>
         <w:numPr>
           <w:ilvl w:val="0"/>
-          <w:numId w:val="1482"/>
+          <w:numId w:val="1493"/>
         </w:numPr>
       </w:pPr>
       <w:r>
@@ -11264,7 +11544,7 @@
         <w:pStyle w:val="Compact"/>
         <w:numPr>
           <w:ilvl w:val="0"/>
-          <w:numId w:val="1483"/>
+          <w:numId w:val="1494"/>
         </w:numPr>
       </w:pPr>
       <w:r>
@@ -11276,7 +11556,7 @@
         <w:pStyle w:val="Compact"/>
         <w:numPr>
           <w:ilvl w:val="0"/>
-          <w:numId w:val="1484"/>
+          <w:numId w:val="1495"/>
         </w:numPr>
       </w:pPr>
       <w:r>
@@ -11288,7 +11568,7 @@
         <w:pStyle w:val="Compact"/>
         <w:numPr>
           <w:ilvl w:val="0"/>
-          <w:numId w:val="1485"/>
+          <w:numId w:val="1496"/>
         </w:numPr>
       </w:pPr>
       <w:r>
@@ -11300,7 +11580,7 @@
         <w:pStyle w:val="Compact"/>
         <w:numPr>
           <w:ilvl w:val="1"/>
-          <w:numId w:val="1486"/>
+          <w:numId w:val="1497"/>
         </w:numPr>
       </w:pPr>
       <w:r>
@@ -11327,7 +11607,7 @@
         <w:pStyle w:val="Compact"/>
         <w:numPr>
           <w:ilvl w:val="1"/>
-          <w:numId w:val="1486"/>
+          <w:numId w:val="1497"/>
         </w:numPr>
       </w:pPr>
       <w:r>
@@ -11349,8 +11629,8 @@
         <w:t xml:space="preserve">scoping correctness.</w:t>
       </w:r>
     </w:p>
-    <w:bookmarkEnd w:id="70"/>
-    <w:bookmarkStart w:id="71" w:name="database-model"/>
+    <w:bookmarkEnd w:id="71"/>
+    <w:bookmarkStart w:id="72" w:name="database-model"/>
     <w:p>
       <w:pPr>
         <w:pStyle w:val="Heading3"/>
@@ -11364,7 +11644,7 @@
         <w:pStyle w:val="Compact"/>
         <w:numPr>
           <w:ilvl w:val="0"/>
-          <w:numId w:val="1487"/>
+          <w:numId w:val="1498"/>
         </w:numPr>
       </w:pPr>
       <w:r>
@@ -11406,7 +11686,7 @@
         <w:pStyle w:val="Compact"/>
         <w:numPr>
           <w:ilvl w:val="0"/>
-          <w:numId w:val="1488"/>
+          <w:numId w:val="1499"/>
         </w:numPr>
       </w:pPr>
       <w:r>
@@ -11430,7 +11710,7 @@
         <w:pStyle w:val="Compact"/>
         <w:numPr>
           <w:ilvl w:val="0"/>
-          <w:numId w:val="1489"/>
+          <w:numId w:val="1500"/>
         </w:numPr>
       </w:pPr>
       <w:r>
@@ -11454,7 +11734,7 @@
         <w:pStyle w:val="Compact"/>
         <w:numPr>
           <w:ilvl w:val="0"/>
-          <w:numId w:val="1490"/>
+          <w:numId w:val="1501"/>
         </w:numPr>
       </w:pPr>
       <w:r>
@@ -11466,7 +11746,7 @@
         <w:pStyle w:val="Compact"/>
         <w:numPr>
           <w:ilvl w:val="0"/>
-          <w:numId w:val="1491"/>
+          <w:numId w:val="1502"/>
         </w:numPr>
       </w:pPr>
       <w:r>
@@ -11478,7 +11758,7 @@
         <w:pStyle w:val="Compact"/>
         <w:numPr>
           <w:ilvl w:val="0"/>
-          <w:numId w:val="1492"/>
+          <w:numId w:val="1503"/>
         </w:numPr>
       </w:pPr>
       <w:r>
@@ -11490,7 +11770,7 @@
         <w:pStyle w:val="Compact"/>
         <w:numPr>
           <w:ilvl w:val="0"/>
-          <w:numId w:val="1493"/>
+          <w:numId w:val="1504"/>
         </w:numPr>
       </w:pPr>
       <w:r>
@@ -11502,7 +11782,7 @@
         <w:pStyle w:val="Compact"/>
         <w:numPr>
           <w:ilvl w:val="0"/>
-          <w:numId w:val="1494"/>
+          <w:numId w:val="1505"/>
         </w:numPr>
       </w:pPr>
       <w:r>
@@ -11514,7 +11794,7 @@
         <w:pStyle w:val="Compact"/>
         <w:numPr>
           <w:ilvl w:val="0"/>
-          <w:numId w:val="1495"/>
+          <w:numId w:val="1506"/>
         </w:numPr>
       </w:pPr>
       <w:r>
@@ -11526,7 +11806,7 @@
         <w:pStyle w:val="Compact"/>
         <w:numPr>
           <w:ilvl w:val="0"/>
-          <w:numId w:val="1496"/>
+          <w:numId w:val="1507"/>
         </w:numPr>
       </w:pPr>
       <w:r>
@@ -11538,7 +11818,7 @@
         <w:pStyle w:val="Compact"/>
         <w:numPr>
           <w:ilvl w:val="0"/>
-          <w:numId w:val="1497"/>
+          <w:numId w:val="1508"/>
         </w:numPr>
       </w:pPr>
       <w:r>
@@ -11550,7 +11830,7 @@
         <w:pStyle w:val="Compact"/>
         <w:numPr>
           <w:ilvl w:val="0"/>
-          <w:numId w:val="1498"/>
+          <w:numId w:val="1509"/>
         </w:numPr>
       </w:pPr>
       <w:r>
@@ -11562,7 +11842,7 @@
         <w:pStyle w:val="Compact"/>
         <w:numPr>
           <w:ilvl w:val="0"/>
-          <w:numId w:val="1499"/>
+          <w:numId w:val="1510"/>
         </w:numPr>
       </w:pPr>
       <w:r>
@@ -11574,7 +11854,7 @@
         <w:pStyle w:val="Compact"/>
         <w:numPr>
           <w:ilvl w:val="0"/>
-          <w:numId w:val="1500"/>
+          <w:numId w:val="1511"/>
         </w:numPr>
       </w:pPr>
       <w:r>
@@ -11601,7 +11881,7 @@
         <w:pStyle w:val="Compact"/>
         <w:numPr>
           <w:ilvl w:val="0"/>
-          <w:numId w:val="1501"/>
+          <w:numId w:val="1512"/>
         </w:numPr>
       </w:pPr>
       <w:r>
@@ -11613,15 +11893,15 @@
         <w:pStyle w:val="Compact"/>
         <w:numPr>
           <w:ilvl w:val="0"/>
-          <w:numId w:val="1502"/>
+          <w:numId w:val="1513"/>
         </w:numPr>
       </w:pPr>
       <w:r>
         <w:t xml:space="preserve">Ensure expired cohorts are ignored safely.</w:t>
       </w:r>
     </w:p>
-    <w:bookmarkEnd w:id="71"/>
-    <w:bookmarkStart w:id="72" w:name="cohort-generation"/>
+    <w:bookmarkEnd w:id="72"/>
+    <w:bookmarkStart w:id="73" w:name="cohort-generation"/>
     <w:p>
       <w:pPr>
         <w:pStyle w:val="Heading3"/>
@@ -11635,7 +11915,7 @@
         <w:pStyle w:val="Compact"/>
         <w:numPr>
           <w:ilvl w:val="0"/>
-          <w:numId w:val="1503"/>
+          <w:numId w:val="1514"/>
         </w:numPr>
       </w:pPr>
       <w:r>
@@ -11647,7 +11927,7 @@
         <w:pStyle w:val="Compact"/>
         <w:numPr>
           <w:ilvl w:val="0"/>
-          <w:numId w:val="1504"/>
+          <w:numId w:val="1515"/>
         </w:numPr>
       </w:pPr>
       <w:r>
@@ -11674,7 +11954,7 @@
         <w:pStyle w:val="Compact"/>
         <w:numPr>
           <w:ilvl w:val="0"/>
-          <w:numId w:val="1505"/>
+          <w:numId w:val="1516"/>
         </w:numPr>
       </w:pPr>
       <w:r>
@@ -11701,7 +11981,7 @@
         <w:pStyle w:val="Compact"/>
         <w:numPr>
           <w:ilvl w:val="0"/>
-          <w:numId w:val="1506"/>
+          <w:numId w:val="1517"/>
         </w:numPr>
       </w:pPr>
       <w:r>
@@ -11728,7 +12008,7 @@
         <w:pStyle w:val="Compact"/>
         <w:numPr>
           <w:ilvl w:val="0"/>
-          <w:numId w:val="1507"/>
+          <w:numId w:val="1518"/>
         </w:numPr>
       </w:pPr>
       <w:r>
@@ -11740,7 +12020,7 @@
         <w:pStyle w:val="Compact"/>
         <w:numPr>
           <w:ilvl w:val="1"/>
-          <w:numId w:val="1508"/>
+          <w:numId w:val="1519"/>
         </w:numPr>
       </w:pPr>
       <w:r>
@@ -11752,7 +12032,7 @@
         <w:pStyle w:val="Compact"/>
         <w:numPr>
           <w:ilvl w:val="1"/>
-          <w:numId w:val="1508"/>
+          <w:numId w:val="1519"/>
         </w:numPr>
       </w:pPr>
       <w:r>
@@ -11764,7 +12044,7 @@
         <w:pStyle w:val="Compact"/>
         <w:numPr>
           <w:ilvl w:val="1"/>
-          <w:numId w:val="1508"/>
+          <w:numId w:val="1519"/>
         </w:numPr>
       </w:pPr>
       <w:r>
@@ -11776,7 +12056,7 @@
         <w:pStyle w:val="Compact"/>
         <w:numPr>
           <w:ilvl w:val="0"/>
-          <w:numId w:val="1509"/>
+          <w:numId w:val="1520"/>
         </w:numPr>
       </w:pPr>
       <w:r>
@@ -11788,223 +12068,11 @@
         <w:pStyle w:val="Compact"/>
         <w:numPr>
           <w:ilvl w:val="0"/>
-          <w:numId w:val="1510"/>
+          <w:numId w:val="1521"/>
         </w:numPr>
       </w:pPr>
       <w:r>
         <w:t xml:space="preserve">Each cohort includes:</w:t>
-      </w:r>
-    </w:p>
-    <w:p>
-      <w:pPr>
-        <w:pStyle w:val="Compact"/>
-        <w:numPr>
-          <w:ilvl w:val="1"/>
-          <w:numId w:val="1511"/>
-        </w:numPr>
-      </w:pPr>
-      <w:r>
-        <w:t xml:space="preserve">lead count;</w:t>
-      </w:r>
-    </w:p>
-    <w:p>
-      <w:pPr>
-        <w:pStyle w:val="Compact"/>
-        <w:numPr>
-          <w:ilvl w:val="1"/>
-          <w:numId w:val="1511"/>
-        </w:numPr>
-      </w:pPr>
-      <w:r>
-        <w:t xml:space="preserve">predicted reply rate;</w:t>
-      </w:r>
-    </w:p>
-    <w:p>
-      <w:pPr>
-        <w:pStyle w:val="Compact"/>
-        <w:numPr>
-          <w:ilvl w:val="1"/>
-          <w:numId w:val="1511"/>
-        </w:numPr>
-      </w:pPr>
-      <w:r>
-        <w:t xml:space="preserve">expected funded deals;</w:t>
-      </w:r>
-    </w:p>
-    <w:p>
-      <w:pPr>
-        <w:pStyle w:val="Compact"/>
-        <w:numPr>
-          <w:ilvl w:val="1"/>
-          <w:numId w:val="1511"/>
-        </w:numPr>
-      </w:pPr>
-      <w:r>
-        <w:t xml:space="preserve">historical anchor line;</w:t>
-      </w:r>
-    </w:p>
-    <w:p>
-      <w:pPr>
-        <w:pStyle w:val="Compact"/>
-        <w:numPr>
-          <w:ilvl w:val="1"/>
-          <w:numId w:val="1511"/>
-        </w:numPr>
-      </w:pPr>
-      <w:r>
-        <w:t xml:space="preserve">AI reasoning line;</w:t>
-      </w:r>
-    </w:p>
-    <w:p>
-      <w:pPr>
-        <w:pStyle w:val="Compact"/>
-        <w:numPr>
-          <w:ilvl w:val="1"/>
-          <w:numId w:val="1511"/>
-        </w:numPr>
-      </w:pPr>
-      <w:r>
-        <w:t xml:space="preserve">override/cooldown warning when applicable.</w:t>
-      </w:r>
-    </w:p>
-    <w:p>
-      <w:pPr>
-        <w:pStyle w:val="Compact"/>
-        <w:numPr>
-          <w:ilvl w:val="0"/>
-          <w:numId w:val="1512"/>
-        </w:numPr>
-      </w:pPr>
-      <w:r>
-        <w:t xml:space="preserve">Exclude opted-out, DNC, suppressed leads.</w:t>
-      </w:r>
-    </w:p>
-    <w:p>
-      <w:pPr>
-        <w:pStyle w:val="Compact"/>
-        <w:numPr>
-          <w:ilvl w:val="0"/>
-          <w:numId w:val="1513"/>
-        </w:numPr>
-      </w:pPr>
-      <w:r>
-        <w:t xml:space="preserve">Respect recent retarget cooldown and admin override warning semantics.</w:t>
-      </w:r>
-    </w:p>
-    <w:p>
-      <w:pPr>
-        <w:pStyle w:val="Compact"/>
-        <w:numPr>
-          <w:ilvl w:val="0"/>
-          <w:numId w:val="1514"/>
-        </w:numPr>
-      </w:pPr>
-      <w:r>
-        <w:t xml:space="preserve">Ensure predicted funded deals are traceable to historical anchor, not arbitrary text.</w:t>
-      </w:r>
-    </w:p>
-    <w:bookmarkEnd w:id="72"/>
-    <w:bookmarkStart w:id="73" w:name="cooldowns-and-compliance"/>
-    <w:p>
-      <w:pPr>
-        <w:pStyle w:val="Heading3"/>
-      </w:pPr>
-      <w:r>
-        <w:t xml:space="preserve">Cooldowns and compliance</w:t>
-      </w:r>
-    </w:p>
-    <w:p>
-      <w:pPr>
-        <w:pStyle w:val="Compact"/>
-        <w:numPr>
-          <w:ilvl w:val="0"/>
-          <w:numId w:val="1515"/>
-        </w:numPr>
-      </w:pPr>
-      <w:r>
-        <w:t xml:space="preserve">Enforce 7-day cooldown for multi-retarget and new cohort contact history.</w:t>
-      </w:r>
-    </w:p>
-    <w:p>
-      <w:pPr>
-        <w:pStyle w:val="Compact"/>
-        <w:numPr>
-          <w:ilvl w:val="0"/>
-          <w:numId w:val="1516"/>
-        </w:numPr>
-      </w:pPr>
-      <w:r>
-        <w:t xml:space="preserve">Enforce 30-day cooldown for renewal candidates.</w:t>
-      </w:r>
-    </w:p>
-    <w:p>
-      <w:pPr>
-        <w:pStyle w:val="Compact"/>
-        <w:numPr>
-          <w:ilvl w:val="0"/>
-          <w:numId w:val="1517"/>
-        </w:numPr>
-      </w:pPr>
-      <w:r>
-        <w:t xml:space="preserve">Track contact event timestamps across all campaigns for each lead.</w:t>
-      </w:r>
-    </w:p>
-    <w:p>
-      <w:pPr>
-        <w:pStyle w:val="Compact"/>
-        <w:numPr>
-          <w:ilvl w:val="0"/>
-          <w:numId w:val="1518"/>
-        </w:numPr>
-      </w:pPr>
-      <w:r>
-        <w:t xml:space="preserve">Surface cooldown countdown/override warning in UI where prototype expects it.</w:t>
-      </w:r>
-    </w:p>
-    <w:p>
-      <w:pPr>
-        <w:pStyle w:val="Compact"/>
-        <w:numPr>
-          <w:ilvl w:val="0"/>
-          <w:numId w:val="1519"/>
-        </w:numPr>
-      </w:pPr>
-      <w:r>
-        <w:t xml:space="preserve">Ensure cooldown logic applies before cohort count and before campaign build.</w:t>
-      </w:r>
-    </w:p>
-    <w:p>
-      <w:pPr>
-        <w:pStyle w:val="Compact"/>
-        <w:numPr>
-          <w:ilvl w:val="0"/>
-          <w:numId w:val="1520"/>
-        </w:numPr>
-      </w:pPr>
-      <w:r>
-        <w:t xml:space="preserve">Verify no cohort can re-contact opted-out, DNC, suppressed, or too-recent leads.</w:t>
-      </w:r>
-    </w:p>
-    <w:bookmarkEnd w:id="73"/>
-    <w:bookmarkStart w:id="74" w:name="two-layer-send-caps"/>
-    <w:p>
-      <w:pPr>
-        <w:pStyle w:val="Heading3"/>
-      </w:pPr>
-      <w:r>
-        <w:t xml:space="preserve">Two-layer send caps</w:t>
-      </w:r>
-    </w:p>
-    <w:p>
-      <w:pPr>
-        <w:pStyle w:val="Compact"/>
-        <w:numPr>
-          <w:ilvl w:val="0"/>
-          <w:numId w:val="1521"/>
-        </w:numPr>
-      </w:pPr>
-      <w:r>
-        <w:t xml:space="preserve">Enforce per-campaign cap server-side:</w:t>
       </w:r>
     </w:p>
     <w:p>
@@ -12016,7 +12084,7 @@
         </w:numPr>
       </w:pPr>
       <w:r>
-        <w:t xml:space="preserve">rep: 500;</w:t>
+        <w:t xml:space="preserve">lead count;</w:t>
       </w:r>
     </w:p>
     <w:p>
@@ -12028,6 +12096,218 @@
         </w:numPr>
       </w:pPr>
       <w:r>
+        <w:t xml:space="preserve">predicted reply rate;</w:t>
+      </w:r>
+    </w:p>
+    <w:p>
+      <w:pPr>
+        <w:pStyle w:val="Compact"/>
+        <w:numPr>
+          <w:ilvl w:val="1"/>
+          <w:numId w:val="1522"/>
+        </w:numPr>
+      </w:pPr>
+      <w:r>
+        <w:t xml:space="preserve">expected funded deals;</w:t>
+      </w:r>
+    </w:p>
+    <w:p>
+      <w:pPr>
+        <w:pStyle w:val="Compact"/>
+        <w:numPr>
+          <w:ilvl w:val="1"/>
+          <w:numId w:val="1522"/>
+        </w:numPr>
+      </w:pPr>
+      <w:r>
+        <w:t xml:space="preserve">historical anchor line;</w:t>
+      </w:r>
+    </w:p>
+    <w:p>
+      <w:pPr>
+        <w:pStyle w:val="Compact"/>
+        <w:numPr>
+          <w:ilvl w:val="1"/>
+          <w:numId w:val="1522"/>
+        </w:numPr>
+      </w:pPr>
+      <w:r>
+        <w:t xml:space="preserve">AI reasoning line;</w:t>
+      </w:r>
+    </w:p>
+    <w:p>
+      <w:pPr>
+        <w:pStyle w:val="Compact"/>
+        <w:numPr>
+          <w:ilvl w:val="1"/>
+          <w:numId w:val="1522"/>
+        </w:numPr>
+      </w:pPr>
+      <w:r>
+        <w:t xml:space="preserve">override/cooldown warning when applicable.</w:t>
+      </w:r>
+    </w:p>
+    <w:p>
+      <w:pPr>
+        <w:pStyle w:val="Compact"/>
+        <w:numPr>
+          <w:ilvl w:val="0"/>
+          <w:numId w:val="1523"/>
+        </w:numPr>
+      </w:pPr>
+      <w:r>
+        <w:t xml:space="preserve">Exclude opted-out, DNC, suppressed leads.</w:t>
+      </w:r>
+    </w:p>
+    <w:p>
+      <w:pPr>
+        <w:pStyle w:val="Compact"/>
+        <w:numPr>
+          <w:ilvl w:val="0"/>
+          <w:numId w:val="1524"/>
+        </w:numPr>
+      </w:pPr>
+      <w:r>
+        <w:t xml:space="preserve">Respect recent retarget cooldown and admin override warning semantics.</w:t>
+      </w:r>
+    </w:p>
+    <w:p>
+      <w:pPr>
+        <w:pStyle w:val="Compact"/>
+        <w:numPr>
+          <w:ilvl w:val="0"/>
+          <w:numId w:val="1525"/>
+        </w:numPr>
+      </w:pPr>
+      <w:r>
+        <w:t xml:space="preserve">Ensure predicted funded deals are traceable to historical anchor, not arbitrary text.</w:t>
+      </w:r>
+    </w:p>
+    <w:bookmarkEnd w:id="73"/>
+    <w:bookmarkStart w:id="74" w:name="cooldowns-and-compliance"/>
+    <w:p>
+      <w:pPr>
+        <w:pStyle w:val="Heading3"/>
+      </w:pPr>
+      <w:r>
+        <w:t xml:space="preserve">Cooldowns and compliance</w:t>
+      </w:r>
+    </w:p>
+    <w:p>
+      <w:pPr>
+        <w:pStyle w:val="Compact"/>
+        <w:numPr>
+          <w:ilvl w:val="0"/>
+          <w:numId w:val="1526"/>
+        </w:numPr>
+      </w:pPr>
+      <w:r>
+        <w:t xml:space="preserve">Enforce 7-day cooldown for multi-retarget and new cohort contact history.</w:t>
+      </w:r>
+    </w:p>
+    <w:p>
+      <w:pPr>
+        <w:pStyle w:val="Compact"/>
+        <w:numPr>
+          <w:ilvl w:val="0"/>
+          <w:numId w:val="1527"/>
+        </w:numPr>
+      </w:pPr>
+      <w:r>
+        <w:t xml:space="preserve">Enforce 30-day cooldown for renewal candidates.</w:t>
+      </w:r>
+    </w:p>
+    <w:p>
+      <w:pPr>
+        <w:pStyle w:val="Compact"/>
+        <w:numPr>
+          <w:ilvl w:val="0"/>
+          <w:numId w:val="1528"/>
+        </w:numPr>
+      </w:pPr>
+      <w:r>
+        <w:t xml:space="preserve">Track contact event timestamps across all campaigns for each lead.</w:t>
+      </w:r>
+    </w:p>
+    <w:p>
+      <w:pPr>
+        <w:pStyle w:val="Compact"/>
+        <w:numPr>
+          <w:ilvl w:val="0"/>
+          <w:numId w:val="1529"/>
+        </w:numPr>
+      </w:pPr>
+      <w:r>
+        <w:t xml:space="preserve">Surface cooldown countdown/override warning in UI where prototype expects it.</w:t>
+      </w:r>
+    </w:p>
+    <w:p>
+      <w:pPr>
+        <w:pStyle w:val="Compact"/>
+        <w:numPr>
+          <w:ilvl w:val="0"/>
+          <w:numId w:val="1530"/>
+        </w:numPr>
+      </w:pPr>
+      <w:r>
+        <w:t xml:space="preserve">Ensure cooldown logic applies before cohort count and before campaign build.</w:t>
+      </w:r>
+    </w:p>
+    <w:p>
+      <w:pPr>
+        <w:pStyle w:val="Compact"/>
+        <w:numPr>
+          <w:ilvl w:val="0"/>
+          <w:numId w:val="1531"/>
+        </w:numPr>
+      </w:pPr>
+      <w:r>
+        <w:t xml:space="preserve">Verify no cohort can re-contact opted-out, DNC, suppressed, or too-recent leads.</w:t>
+      </w:r>
+    </w:p>
+    <w:bookmarkEnd w:id="74"/>
+    <w:bookmarkStart w:id="75" w:name="two-layer-send-caps"/>
+    <w:p>
+      <w:pPr>
+        <w:pStyle w:val="Heading3"/>
+      </w:pPr>
+      <w:r>
+        <w:t xml:space="preserve">Two-layer send caps</w:t>
+      </w:r>
+    </w:p>
+    <w:p>
+      <w:pPr>
+        <w:pStyle w:val="Compact"/>
+        <w:numPr>
+          <w:ilvl w:val="0"/>
+          <w:numId w:val="1532"/>
+        </w:numPr>
+      </w:pPr>
+      <w:r>
+        <w:t xml:space="preserve">Enforce per-campaign cap server-side for AI cohort build:</w:t>
+      </w:r>
+    </w:p>
+    <w:p>
+      <w:pPr>
+        <w:pStyle w:val="Compact"/>
+        <w:numPr>
+          <w:ilvl w:val="1"/>
+          <w:numId w:val="1533"/>
+        </w:numPr>
+      </w:pPr>
+      <w:r>
+        <w:t xml:space="preserve">rep: 500;</w:t>
+      </w:r>
+    </w:p>
+    <w:p>
+      <w:pPr>
+        <w:pStyle w:val="Compact"/>
+        <w:numPr>
+          <w:ilvl w:val="1"/>
+          <w:numId w:val="1533"/>
+        </w:numPr>
+      </w:pPr>
+      <w:r>
         <w:t xml:space="preserve">admin: 3000.</w:t>
       </w:r>
     </w:p>
@@ -12036,11 +12316,11 @@
         <w:pStyle w:val="Compact"/>
         <w:numPr>
           <w:ilvl w:val="0"/>
-          <w:numId w:val="1523"/>
-        </w:numPr>
-      </w:pPr>
-      <w:r>
-        <w:t xml:space="preserve">Enforce rolling 24-hour daily total cap server-side:</w:t>
+          <w:numId w:val="1534"/>
+        </w:numPr>
+      </w:pPr>
+      <w:r>
+        <w:t xml:space="preserve">Enforce rolling 24-hour daily total cap server-side for AI cohort build:</w:t>
       </w:r>
     </w:p>
     <w:p>
@@ -12048,7 +12328,7 @@
         <w:pStyle w:val="Compact"/>
         <w:numPr>
           <w:ilvl w:val="1"/>
-          <w:numId w:val="1524"/>
+          <w:numId w:val="1535"/>
         </w:numPr>
       </w:pPr>
       <w:r>
@@ -12060,7 +12340,7 @@
         <w:pStyle w:val="Compact"/>
         <w:numPr>
           <w:ilvl w:val="1"/>
-          <w:numId w:val="1524"/>
+          <w:numId w:val="1535"/>
         </w:numPr>
       </w:pPr>
       <w:r>
@@ -12072,7 +12352,7 @@
         <w:pStyle w:val="Compact"/>
         <w:numPr>
           <w:ilvl w:val="0"/>
-          <w:numId w:val="1525"/>
+          <w:numId w:val="1536"/>
         </w:numPr>
       </w:pPr>
       <w:r>
@@ -12084,7 +12364,7 @@
         <w:pStyle w:val="Compact"/>
         <w:numPr>
           <w:ilvl w:val="0"/>
-          <w:numId w:val="1526"/>
+          <w:numId w:val="1537"/>
         </w:numPr>
       </w:pPr>
       <w:r>
@@ -12096,7 +12376,7 @@
         <w:pStyle w:val="Compact"/>
         <w:numPr>
           <w:ilvl w:val="0"/>
-          <w:numId w:val="1527"/>
+          <w:numId w:val="1538"/>
         </w:numPr>
       </w:pPr>
       <w:r>
@@ -12108,15 +12388,15 @@
         <w:pStyle w:val="Compact"/>
         <w:numPr>
           <w:ilvl w:val="0"/>
-          <w:numId w:val="1528"/>
+          <w:numId w:val="1539"/>
         </w:numPr>
       </w:pPr>
       <w:r>
         <w:t xml:space="preserve">Cohort card lead count reflects current remaining capacity at render/build time.</w:t>
       </w:r>
     </w:p>
-    <w:bookmarkEnd w:id="74"/>
-    <w:bookmarkStart w:id="75" w:name="ai-reasoning-and-cron"/>
+    <w:bookmarkEnd w:id="75"/>
+    <w:bookmarkStart w:id="76" w:name="ai-reasoning-and-cron"/>
     <w:p>
       <w:pPr>
         <w:pStyle w:val="Heading3"/>
@@ -12130,7 +12410,7 @@
         <w:pStyle w:val="Compact"/>
         <w:numPr>
           <w:ilvl w:val="0"/>
-          <w:numId w:val="1529"/>
+          <w:numId w:val="1540"/>
         </w:numPr>
       </w:pPr>
       <w:r>
@@ -12142,7 +12422,7 @@
         <w:pStyle w:val="Compact"/>
         <w:numPr>
           <w:ilvl w:val="0"/>
-          <w:numId w:val="1530"/>
+          <w:numId w:val="1541"/>
         </w:numPr>
       </w:pPr>
       <w:r>
@@ -12154,7 +12434,7 @@
         <w:pStyle w:val="Compact"/>
         <w:numPr>
           <w:ilvl w:val="0"/>
-          <w:numId w:val="1531"/>
+          <w:numId w:val="1542"/>
         </w:numPr>
       </w:pPr>
       <w:r>
@@ -12166,7 +12446,7 @@
         <w:pStyle w:val="Compact"/>
         <w:numPr>
           <w:ilvl w:val="0"/>
-          <w:numId w:val="1532"/>
+          <w:numId w:val="1543"/>
         </w:numPr>
       </w:pPr>
       <w:r>
@@ -12178,7 +12458,7 @@
         <w:pStyle w:val="Compact"/>
         <w:numPr>
           <w:ilvl w:val="0"/>
-          <w:numId w:val="1533"/>
+          <w:numId w:val="1544"/>
         </w:numPr>
       </w:pPr>
       <w:r>
@@ -12190,7 +12470,7 @@
         <w:pStyle w:val="Compact"/>
         <w:numPr>
           <w:ilvl w:val="0"/>
-          <w:numId w:val="1534"/>
+          <w:numId w:val="1545"/>
         </w:numPr>
       </w:pPr>
       <w:r>
@@ -12202,7 +12482,7 @@
         <w:pStyle w:val="Compact"/>
         <w:numPr>
           <w:ilvl w:val="0"/>
-          <w:numId w:val="1535"/>
+          <w:numId w:val="1546"/>
         </w:numPr>
       </w:pPr>
       <w:r>
@@ -12214,7 +12494,7 @@
         <w:pStyle w:val="Compact"/>
         <w:numPr>
           <w:ilvl w:val="0"/>
-          <w:numId w:val="1536"/>
+          <w:numId w:val="1547"/>
         </w:numPr>
       </w:pPr>
       <w:r>
@@ -12226,15 +12506,15 @@
         <w:pStyle w:val="Compact"/>
         <w:numPr>
           <w:ilvl w:val="0"/>
-          <w:numId w:val="1537"/>
+          <w:numId w:val="1548"/>
         </w:numPr>
       </w:pPr>
       <w:r>
         <w:t xml:space="preserve">Log failures per user/cohort without breaking other cohorts.</w:t>
       </w:r>
     </w:p>
-    <w:bookmarkEnd w:id="75"/>
-    <w:bookmarkStart w:id="76" w:name="ui-1"/>
+    <w:bookmarkEnd w:id="76"/>
+    <w:bookmarkStart w:id="77" w:name="ui-1"/>
     <w:p>
       <w:pPr>
         <w:pStyle w:val="Heading3"/>
@@ -12248,7 +12528,7 @@
         <w:pStyle w:val="Compact"/>
         <w:numPr>
           <w:ilvl w:val="0"/>
-          <w:numId w:val="1538"/>
+          <w:numId w:val="1549"/>
         </w:numPr>
       </w:pPr>
       <w:r>
@@ -12260,7 +12540,7 @@
         <w:pStyle w:val="Compact"/>
         <w:numPr>
           <w:ilvl w:val="0"/>
-          <w:numId w:val="1539"/>
+          <w:numId w:val="1550"/>
         </w:numPr>
       </w:pPr>
       <w:r>
@@ -12272,7 +12552,7 @@
         <w:pStyle w:val="Compact"/>
         <w:numPr>
           <w:ilvl w:val="0"/>
-          <w:numId w:val="1540"/>
+          <w:numId w:val="1551"/>
         </w:numPr>
       </w:pPr>
       <w:r>
@@ -12284,7 +12564,7 @@
         <w:pStyle w:val="Compact"/>
         <w:numPr>
           <w:ilvl w:val="0"/>
-          <w:numId w:val="1541"/>
+          <w:numId w:val="1552"/>
         </w:numPr>
       </w:pPr>
       <w:r>
@@ -12296,7 +12576,7 @@
         <w:pStyle w:val="Compact"/>
         <w:numPr>
           <w:ilvl w:val="0"/>
-          <w:numId w:val="1542"/>
+          <w:numId w:val="1553"/>
         </w:numPr>
       </w:pPr>
       <w:r>
@@ -12308,7 +12588,7 @@
         <w:pStyle w:val="Compact"/>
         <w:numPr>
           <w:ilvl w:val="0"/>
-          <w:numId w:val="1543"/>
+          <w:numId w:val="1554"/>
         </w:numPr>
       </w:pPr>
       <w:r>
@@ -12320,7 +12600,7 @@
         <w:pStyle w:val="Compact"/>
         <w:numPr>
           <w:ilvl w:val="0"/>
-          <w:numId w:val="1544"/>
+          <w:numId w:val="1555"/>
         </w:numPr>
       </w:pPr>
       <w:r>
@@ -12332,7 +12612,7 @@
         <w:pStyle w:val="Compact"/>
         <w:numPr>
           <w:ilvl w:val="0"/>
-          <w:numId w:val="1545"/>
+          <w:numId w:val="1556"/>
         </w:numPr>
       </w:pPr>
       <w:r>
@@ -12344,7 +12624,7 @@
         <w:pStyle w:val="Compact"/>
         <w:numPr>
           <w:ilvl w:val="0"/>
-          <w:numId w:val="1546"/>
+          <w:numId w:val="1557"/>
         </w:numPr>
       </w:pPr>
       <w:r>
@@ -12356,7 +12636,7 @@
         <w:pStyle w:val="Compact"/>
         <w:numPr>
           <w:ilvl w:val="0"/>
-          <w:numId w:val="1547"/>
+          <w:numId w:val="1558"/>
         </w:numPr>
       </w:pPr>
       <w:r>
@@ -12383,7 +12663,7 @@
         <w:pStyle w:val="Compact"/>
         <w:numPr>
           <w:ilvl w:val="0"/>
-          <w:numId w:val="1548"/>
+          <w:numId w:val="1559"/>
         </w:numPr>
       </w:pPr>
       <w:r>
@@ -12404,15 +12684,15 @@
         <w:pStyle w:val="Compact"/>
         <w:numPr>
           <w:ilvl w:val="0"/>
-          <w:numId w:val="1549"/>
+          <w:numId w:val="1560"/>
         </w:numPr>
       </w:pPr>
       <w:r>
         <w:t xml:space="preserve">Existing campaign actions still work: rerun/refresh, start, pause, delete where allowed.</w:t>
       </w:r>
     </w:p>
-    <w:bookmarkEnd w:id="76"/>
-    <w:bookmarkStart w:id="77" w:name="backendapi"/>
+    <w:bookmarkEnd w:id="77"/>
+    <w:bookmarkStart w:id="78" w:name="backendapi"/>
     <w:p>
       <w:pPr>
         <w:pStyle w:val="Heading3"/>
@@ -12426,7 +12706,7 @@
         <w:pStyle w:val="Compact"/>
         <w:numPr>
           <w:ilvl w:val="0"/>
-          <w:numId w:val="1550"/>
+          <w:numId w:val="1561"/>
         </w:numPr>
       </w:pPr>
       <w:r>
@@ -12438,7 +12718,7 @@
         <w:pStyle w:val="Compact"/>
         <w:numPr>
           <w:ilvl w:val="0"/>
-          <w:numId w:val="1551"/>
+          <w:numId w:val="1562"/>
         </w:numPr>
       </w:pPr>
       <w:r>
@@ -12450,7 +12730,7 @@
         <w:pStyle w:val="Compact"/>
         <w:numPr>
           <w:ilvl w:val="0"/>
-          <w:numId w:val="1552"/>
+          <w:numId w:val="1563"/>
         </w:numPr>
       </w:pPr>
       <w:r>
@@ -12462,7 +12742,7 @@
         <w:pStyle w:val="Compact"/>
         <w:numPr>
           <w:ilvl w:val="0"/>
-          <w:numId w:val="1553"/>
+          <w:numId w:val="1564"/>
         </w:numPr>
       </w:pPr>
       <w:r>
@@ -12474,7 +12754,7 @@
         <w:pStyle w:val="Compact"/>
         <w:numPr>
           <w:ilvl w:val="0"/>
-          <w:numId w:val="1554"/>
+          <w:numId w:val="1565"/>
         </w:numPr>
       </w:pPr>
       <w:r>
@@ -12486,7 +12766,7 @@
         <w:pStyle w:val="Compact"/>
         <w:numPr>
           <w:ilvl w:val="0"/>
-          <w:numId w:val="1555"/>
+          <w:numId w:val="1566"/>
         </w:numPr>
       </w:pPr>
       <w:r>
@@ -12498,7 +12778,7 @@
         <w:pStyle w:val="Compact"/>
         <w:numPr>
           <w:ilvl w:val="0"/>
-          <w:numId w:val="1556"/>
+          <w:numId w:val="1567"/>
         </w:numPr>
       </w:pPr>
       <w:r>
@@ -12510,15 +12790,15 @@
         <w:pStyle w:val="Compact"/>
         <w:numPr>
           <w:ilvl w:val="0"/>
-          <w:numId w:val="1557"/>
+          <w:numId w:val="1568"/>
         </w:numPr>
       </w:pPr>
       <w:r>
         <w:t xml:space="preserve">AI Retarget is upstream recommendation only; no auto-send.</w:t>
       </w:r>
     </w:p>
-    <w:bookmarkEnd w:id="77"/>
-    <w:bookmarkStart w:id="78" w:name="m2.3-testing-gate"/>
+    <w:bookmarkEnd w:id="78"/>
+    <w:bookmarkStart w:id="79" w:name="m2.3-testing-gate"/>
     <w:p>
       <w:pPr>
         <w:pStyle w:val="Heading3"/>
@@ -12532,31 +12812,31 @@
         <w:pStyle w:val="Compact"/>
         <w:numPr>
           <w:ilvl w:val="0"/>
-          <w:numId w:val="1558"/>
-        </w:numPr>
-      </w:pPr>
-      <w:r>
-        <w:t xml:space="preserve">Admin sees all 3 AI Retarget cohorts.</w:t>
-      </w:r>
-    </w:p>
-    <w:p>
-      <w:pPr>
-        <w:pStyle w:val="Compact"/>
-        <w:numPr>
-          <w:ilvl w:val="0"/>
-          <w:numId w:val="1559"/>
-        </w:numPr>
-      </w:pPr>
-      <w:r>
-        <w:t xml:space="preserve">Rep sees only allowed/scoped cohorts.</w:t>
-      </w:r>
-    </w:p>
-    <w:p>
-      <w:pPr>
-        <w:pStyle w:val="Compact"/>
-        <w:numPr>
-          <w:ilvl w:val="0"/>
-          <w:numId w:val="1560"/>
+          <w:numId w:val="1569"/>
+        </w:numPr>
+      </w:pPr>
+      <w:r>
+        <w:t xml:space="preserve">Admin sees all 3 AI Retarget cohorts in focused API test.</w:t>
+      </w:r>
+    </w:p>
+    <w:p>
+      <w:pPr>
+        <w:pStyle w:val="Compact"/>
+        <w:numPr>
+          <w:ilvl w:val="0"/>
+          <w:numId w:val="1570"/>
+        </w:numPr>
+      </w:pPr>
+      <w:r>
+        <w:t xml:space="preserve">Rep sees only allowed/scoped cohorts in focused API test.</w:t>
+      </w:r>
+    </w:p>
+    <w:p>
+      <w:pPr>
+        <w:pStyle w:val="Compact"/>
+        <w:numPr>
+          <w:ilvl w:val="0"/>
+          <w:numId w:val="1571"/>
         </w:numPr>
       </w:pPr>
       <w:r>
@@ -12568,19 +12848,19 @@
         <w:pStyle w:val="Compact"/>
         <w:numPr>
           <w:ilvl w:val="0"/>
-          <w:numId w:val="1561"/>
-        </w:numPr>
-      </w:pPr>
-      <w:r>
-        <w:t xml:space="preserve">Build Campaign flow tested.</w:t>
-      </w:r>
-    </w:p>
-    <w:p>
-      <w:pPr>
-        <w:pStyle w:val="Compact"/>
-        <w:numPr>
-          <w:ilvl w:val="0"/>
-          <w:numId w:val="1562"/>
+          <w:numId w:val="1572"/>
+        </w:numPr>
+      </w:pPr>
+      <w:r>
+        <w:t xml:space="preserve">Build Campaign flow tested in focused API test.</w:t>
+      </w:r>
+    </w:p>
+    <w:p>
+      <w:pPr>
+        <w:pStyle w:val="Compact"/>
+        <w:numPr>
+          <w:ilvl w:val="0"/>
+          <w:numId w:val="1573"/>
         </w:numPr>
       </w:pPr>
       <w:r>
@@ -12592,7 +12872,7 @@
         <w:pStyle w:val="Compact"/>
         <w:numPr>
           <w:ilvl w:val="0"/>
-          <w:numId w:val="1563"/>
+          <w:numId w:val="1574"/>
         </w:numPr>
       </w:pPr>
       <w:r>
@@ -12604,31 +12884,31 @@
         <w:pStyle w:val="Compact"/>
         <w:numPr>
           <w:ilvl w:val="0"/>
-          <w:numId w:val="1564"/>
-        </w:numPr>
-      </w:pPr>
-      <w:r>
-        <w:t xml:space="preserve">Cooldown/override warning verified.</w:t>
-      </w:r>
-    </w:p>
-    <w:p>
-      <w:pPr>
-        <w:pStyle w:val="Compact"/>
-        <w:numPr>
-          <w:ilvl w:val="0"/>
-          <w:numId w:val="1565"/>
-        </w:numPr>
-      </w:pPr>
-      <w:r>
-        <w:t xml:space="preserve">Compliance exclusions verified.</w:t>
-      </w:r>
-    </w:p>
-    <w:p>
-      <w:pPr>
-        <w:pStyle w:val="Compact"/>
-        <w:numPr>
-          <w:ilvl w:val="0"/>
-          <w:numId w:val="1566"/>
+          <w:numId w:val="1575"/>
+        </w:numPr>
+      </w:pPr>
+      <w:r>
+        <w:t xml:space="preserve">Cooldown/override warning verified in focused API test.</w:t>
+      </w:r>
+    </w:p>
+    <w:p>
+      <w:pPr>
+        <w:pStyle w:val="Compact"/>
+        <w:numPr>
+          <w:ilvl w:val="0"/>
+          <w:numId w:val="1576"/>
+        </w:numPr>
+      </w:pPr>
+      <w:r>
+        <w:t xml:space="preserve">Compliance exclusions verified by query constraints and focused build/list tests.</w:t>
+      </w:r>
+    </w:p>
+    <w:p>
+      <w:pPr>
+        <w:pStyle w:val="Compact"/>
+        <w:numPr>
+          <w:ilvl w:val="0"/>
+          <w:numId w:val="1577"/>
         </w:numPr>
       </w:pPr>
       <w:r>
@@ -12640,7 +12920,7 @@
         <w:pStyle w:val="Compact"/>
         <w:numPr>
           <w:ilvl w:val="0"/>
-          <w:numId w:val="1567"/>
+          <w:numId w:val="1578"/>
         </w:numPr>
       </w:pPr>
       <w:r>
@@ -12652,7 +12932,7 @@
         <w:pStyle w:val="Compact"/>
         <w:numPr>
           <w:ilvl w:val="0"/>
-          <w:numId w:val="1568"/>
+          <w:numId w:val="1579"/>
         </w:numPr>
       </w:pPr>
       <w:r>
@@ -12664,7 +12944,7 @@
         <w:pStyle w:val="Compact"/>
         <w:numPr>
           <w:ilvl w:val="0"/>
-          <w:numId w:val="1569"/>
+          <w:numId w:val="1580"/>
         </w:numPr>
       </w:pPr>
       <w:r>
@@ -12676,7 +12956,7 @@
         <w:pStyle w:val="Compact"/>
         <w:numPr>
           <w:ilvl w:val="0"/>
-          <w:numId w:val="1570"/>
+          <w:numId w:val="1581"/>
         </w:numPr>
       </w:pPr>
       <w:r>
@@ -12688,7 +12968,7 @@
         <w:pStyle w:val="Compact"/>
         <w:numPr>
           <w:ilvl w:val="0"/>
-          <w:numId w:val="1571"/>
+          <w:numId w:val="1582"/>
         </w:numPr>
       </w:pPr>
       <w:r>
@@ -12700,16 +12980,16 @@
         <w:pStyle w:val="Compact"/>
         <w:numPr>
           <w:ilvl w:val="0"/>
-          <w:numId w:val="1572"/>
+          <w:numId w:val="1583"/>
         </w:numPr>
       </w:pPr>
       <w:r>
         <w:t xml:space="preserve">Progress dashboard updated.</w:t>
       </w:r>
     </w:p>
-    <w:bookmarkEnd w:id="78"/>
     <w:bookmarkEnd w:id="79"/>
-    <w:bookmarkStart w:id="83" w:name="m2.4-m2-full-regression-and-release-gate"/>
+    <w:bookmarkEnd w:id="80"/>
+    <w:bookmarkStart w:id="84" w:name="m2.4-m2-full-regression-and-release-gate"/>
     <w:p>
       <w:pPr>
         <w:pStyle w:val="Heading2"/>
@@ -12718,7 +12998,7 @@
         <w:t xml:space="preserve">M2.4 — M2 Full Regression And Release Gate</w:t>
       </w:r>
     </w:p>
-    <w:bookmarkStart w:id="80" w:name="functional-regression-1"/>
+    <w:bookmarkStart w:id="81" w:name="functional-regression-1"/>
     <w:p>
       <w:pPr>
         <w:pStyle w:val="Heading3"/>
@@ -12732,7 +13012,7 @@
         <w:pStyle w:val="Compact"/>
         <w:numPr>
           <w:ilvl w:val="0"/>
-          <w:numId w:val="1573"/>
+          <w:numId w:val="1584"/>
         </w:numPr>
       </w:pPr>
       <w:r>
@@ -12744,7 +13024,7 @@
         <w:pStyle w:val="Compact"/>
         <w:numPr>
           <w:ilvl w:val="0"/>
-          <w:numId w:val="1574"/>
+          <w:numId w:val="1585"/>
         </w:numPr>
       </w:pPr>
       <w:r>
@@ -12756,7 +13036,7 @@
         <w:pStyle w:val="Compact"/>
         <w:numPr>
           <w:ilvl w:val="0"/>
-          <w:numId w:val="1575"/>
+          <w:numId w:val="1586"/>
         </w:numPr>
       </w:pPr>
       <w:r>
@@ -12768,7 +13048,7 @@
         <w:pStyle w:val="Compact"/>
         <w:numPr>
           <w:ilvl w:val="0"/>
-          <w:numId w:val="1576"/>
+          <w:numId w:val="1587"/>
         </w:numPr>
       </w:pPr>
       <w:r>
@@ -12780,7 +13060,7 @@
         <w:pStyle w:val="Compact"/>
         <w:numPr>
           <w:ilvl w:val="0"/>
-          <w:numId w:val="1577"/>
+          <w:numId w:val="1588"/>
         </w:numPr>
       </w:pPr>
       <w:r>
@@ -12792,7 +13072,7 @@
         <w:pStyle w:val="Compact"/>
         <w:numPr>
           <w:ilvl w:val="0"/>
-          <w:numId w:val="1578"/>
+          <w:numId w:val="1589"/>
         </w:numPr>
       </w:pPr>
       <w:r>
@@ -12804,7 +13084,7 @@
         <w:pStyle w:val="Compact"/>
         <w:numPr>
           <w:ilvl w:val="0"/>
-          <w:numId w:val="1579"/>
+          <w:numId w:val="1590"/>
         </w:numPr>
       </w:pPr>
       <w:r>
@@ -12816,7 +13096,7 @@
         <w:pStyle w:val="Compact"/>
         <w:numPr>
           <w:ilvl w:val="0"/>
-          <w:numId w:val="1580"/>
+          <w:numId w:val="1591"/>
         </w:numPr>
       </w:pPr>
       <w:r>
@@ -12828,7 +13108,7 @@
         <w:pStyle w:val="Compact"/>
         <w:numPr>
           <w:ilvl w:val="0"/>
-          <w:numId w:val="1581"/>
+          <w:numId w:val="1592"/>
         </w:numPr>
       </w:pPr>
       <w:r>
@@ -12840,7 +13120,7 @@
         <w:pStyle w:val="Compact"/>
         <w:numPr>
           <w:ilvl w:val="0"/>
-          <w:numId w:val="1582"/>
+          <w:numId w:val="1593"/>
         </w:numPr>
       </w:pPr>
       <w:r>
@@ -12852,7 +13132,7 @@
         <w:pStyle w:val="Compact"/>
         <w:numPr>
           <w:ilvl w:val="0"/>
-          <w:numId w:val="1583"/>
+          <w:numId w:val="1594"/>
         </w:numPr>
       </w:pPr>
       <w:r>
@@ -12864,7 +13144,7 @@
         <w:pStyle w:val="Compact"/>
         <w:numPr>
           <w:ilvl w:val="0"/>
-          <w:numId w:val="1584"/>
+          <w:numId w:val="1595"/>
         </w:numPr>
       </w:pPr>
       <w:r>
@@ -12876,7 +13156,7 @@
         <w:pStyle w:val="Compact"/>
         <w:numPr>
           <w:ilvl w:val="0"/>
-          <w:numId w:val="1585"/>
+          <w:numId w:val="1596"/>
         </w:numPr>
       </w:pPr>
       <w:r>
@@ -12898,8 +13178,8 @@
         <w:t xml:space="preserve">and test messages.</w:t>
       </w:r>
     </w:p>
-    <w:bookmarkEnd w:id="80"/>
-    <w:bookmarkStart w:id="81" w:name="visual-regression-1"/>
+    <w:bookmarkEnd w:id="81"/>
+    <w:bookmarkStart w:id="82" w:name="visual-regression-1"/>
     <w:p>
       <w:pPr>
         <w:pStyle w:val="Heading3"/>
@@ -12913,7 +13193,7 @@
         <w:pStyle w:val="Compact"/>
         <w:numPr>
           <w:ilvl w:val="0"/>
-          <w:numId w:val="1586"/>
+          <w:numId w:val="1597"/>
         </w:numPr>
       </w:pPr>
       <w:r>
@@ -12925,7 +13205,7 @@
         <w:pStyle w:val="Compact"/>
         <w:numPr>
           <w:ilvl w:val="0"/>
-          <w:numId w:val="1587"/>
+          <w:numId w:val="1598"/>
         </w:numPr>
       </w:pPr>
       <w:r>
@@ -12952,7 +13232,7 @@
         <w:pStyle w:val="Compact"/>
         <w:numPr>
           <w:ilvl w:val="0"/>
-          <w:numId w:val="1588"/>
+          <w:numId w:val="1599"/>
         </w:numPr>
       </w:pPr>
       <w:r>
@@ -12964,7 +13244,7 @@
         <w:pStyle w:val="Compact"/>
         <w:numPr>
           <w:ilvl w:val="0"/>
-          <w:numId w:val="1589"/>
+          <w:numId w:val="1600"/>
         </w:numPr>
       </w:pPr>
       <w:r>
@@ -12976,7 +13256,7 @@
         <w:pStyle w:val="Compact"/>
         <w:numPr>
           <w:ilvl w:val="0"/>
-          <w:numId w:val="1590"/>
+          <w:numId w:val="1601"/>
         </w:numPr>
       </w:pPr>
       <w:r>
@@ -12988,7 +13268,7 @@
         <w:pStyle w:val="Compact"/>
         <w:numPr>
           <w:ilvl w:val="0"/>
-          <w:numId w:val="1591"/>
+          <w:numId w:val="1602"/>
         </w:numPr>
       </w:pPr>
       <w:r>
@@ -13000,7 +13280,7 @@
         <w:pStyle w:val="Compact"/>
         <w:numPr>
           <w:ilvl w:val="0"/>
-          <w:numId w:val="1592"/>
+          <w:numId w:val="1603"/>
         </w:numPr>
       </w:pPr>
       <w:r>
@@ -13012,15 +13292,15 @@
         <w:pStyle w:val="Compact"/>
         <w:numPr>
           <w:ilvl w:val="0"/>
-          <w:numId w:val="1593"/>
+          <w:numId w:val="1604"/>
         </w:numPr>
       </w:pPr>
       <w:r>
         <w:t xml:space="preserve">No unreadable text if current styles fail; scoped style set added if needed.</w:t>
       </w:r>
     </w:p>
-    <w:bookmarkEnd w:id="81"/>
-    <w:bookmarkStart w:id="82" w:name="release-readiness-1"/>
+    <w:bookmarkEnd w:id="82"/>
+    <w:bookmarkStart w:id="83" w:name="release-readiness-1"/>
     <w:p>
       <w:pPr>
         <w:pStyle w:val="Heading3"/>
@@ -13034,7 +13314,7 @@
         <w:pStyle w:val="Compact"/>
         <w:numPr>
           <w:ilvl w:val="0"/>
-          <w:numId w:val="1594"/>
+          <w:numId w:val="1605"/>
         </w:numPr>
       </w:pPr>
       <w:r>
@@ -13046,7 +13326,7 @@
         <w:pStyle w:val="Compact"/>
         <w:numPr>
           <w:ilvl w:val="0"/>
-          <w:numId w:val="1595"/>
+          <w:numId w:val="1606"/>
         </w:numPr>
       </w:pPr>
       <w:r>
@@ -13058,7 +13338,7 @@
         <w:pStyle w:val="Compact"/>
         <w:numPr>
           <w:ilvl w:val="0"/>
-          <w:numId w:val="1596"/>
+          <w:numId w:val="1607"/>
         </w:numPr>
       </w:pPr>
       <w:r>
@@ -13070,7 +13350,7 @@
         <w:pStyle w:val="Compact"/>
         <w:numPr>
           <w:ilvl w:val="0"/>
-          <w:numId w:val="1597"/>
+          <w:numId w:val="1608"/>
         </w:numPr>
       </w:pPr>
       <w:r>
@@ -13082,7 +13362,7 @@
         <w:pStyle w:val="Compact"/>
         <w:numPr>
           <w:ilvl w:val="0"/>
-          <w:numId w:val="1598"/>
+          <w:numId w:val="1609"/>
         </w:numPr>
       </w:pPr>
       <w:r>
@@ -13094,7 +13374,7 @@
         <w:pStyle w:val="Compact"/>
         <w:numPr>
           <w:ilvl w:val="0"/>
-          <w:numId w:val="1599"/>
+          <w:numId w:val="1610"/>
         </w:numPr>
       </w:pPr>
       <w:r>
@@ -13106,7 +13386,7 @@
         <w:pStyle w:val="Compact"/>
         <w:numPr>
           <w:ilvl w:val="0"/>
-          <w:numId w:val="1600"/>
+          <w:numId w:val="1611"/>
         </w:numPr>
       </w:pPr>
       <w:r>
@@ -13118,7 +13398,7 @@
         <w:pStyle w:val="Compact"/>
         <w:numPr>
           <w:ilvl w:val="0"/>
-          <w:numId w:val="1601"/>
+          <w:numId w:val="1612"/>
         </w:numPr>
       </w:pPr>
       <w:r>
@@ -13130,16 +13410,16 @@
         <w:pStyle w:val="Compact"/>
         <w:numPr>
           <w:ilvl w:val="0"/>
-          <w:numId w:val="1602"/>
+          <w:numId w:val="1613"/>
         </w:numPr>
       </w:pPr>
       <w:r>
         <w:t xml:space="preserve">Progress dashboard updated to M2 complete only after all gates pass.</w:t>
       </w:r>
     </w:p>
-    <w:bookmarkEnd w:id="82"/>
     <w:bookmarkEnd w:id="83"/>
-    <w:bookmarkStart w:id="84" w:name="full-final-acceptance"/>
+    <w:bookmarkEnd w:id="84"/>
+    <w:bookmarkStart w:id="85" w:name="full-final-acceptance"/>
     <w:p>
       <w:pPr>
         <w:pStyle w:val="Heading2"/>
@@ -13153,7 +13433,7 @@
         <w:pStyle w:val="Compact"/>
         <w:numPr>
           <w:ilvl w:val="0"/>
-          <w:numId w:val="1603"/>
+          <w:numId w:val="1614"/>
         </w:numPr>
       </w:pPr>
       <w:r>
@@ -13165,7 +13445,7 @@
         <w:pStyle w:val="Compact"/>
         <w:numPr>
           <w:ilvl w:val="0"/>
-          <w:numId w:val="1604"/>
+          <w:numId w:val="1615"/>
         </w:numPr>
       </w:pPr>
       <w:r>
@@ -13177,7 +13457,7 @@
         <w:pStyle w:val="Compact"/>
         <w:numPr>
           <w:ilvl w:val="0"/>
-          <w:numId w:val="1605"/>
+          <w:numId w:val="1616"/>
         </w:numPr>
       </w:pPr>
       <w:r>
@@ -13189,7 +13469,7 @@
         <w:pStyle w:val="Compact"/>
         <w:numPr>
           <w:ilvl w:val="0"/>
-          <w:numId w:val="1606"/>
+          <w:numId w:val="1617"/>
         </w:numPr>
       </w:pPr>
       <w:r>
@@ -13201,7 +13481,7 @@
         <w:pStyle w:val="Compact"/>
         <w:numPr>
           <w:ilvl w:val="0"/>
-          <w:numId w:val="1607"/>
+          <w:numId w:val="1618"/>
         </w:numPr>
       </w:pPr>
       <w:r>
@@ -13213,7 +13493,7 @@
         <w:pStyle w:val="Compact"/>
         <w:numPr>
           <w:ilvl w:val="0"/>
-          <w:numId w:val="1608"/>
+          <w:numId w:val="1619"/>
         </w:numPr>
       </w:pPr>
       <w:r>
@@ -13225,7 +13505,7 @@
         <w:pStyle w:val="Compact"/>
         <w:numPr>
           <w:ilvl w:val="0"/>
-          <w:numId w:val="1609"/>
+          <w:numId w:val="1620"/>
         </w:numPr>
       </w:pPr>
       <w:r>
@@ -13237,7 +13517,7 @@
         <w:pStyle w:val="Compact"/>
         <w:numPr>
           <w:ilvl w:val="0"/>
-          <w:numId w:val="1610"/>
+          <w:numId w:val="1621"/>
         </w:numPr>
       </w:pPr>
       <w:r>
@@ -13249,7 +13529,7 @@
         <w:pStyle w:val="Compact"/>
         <w:numPr>
           <w:ilvl w:val="0"/>
-          <w:numId w:val="1611"/>
+          <w:numId w:val="1622"/>
         </w:numPr>
       </w:pPr>
       <w:r>
@@ -13261,7 +13541,7 @@
         <w:pStyle w:val="Compact"/>
         <w:numPr>
           <w:ilvl w:val="0"/>
-          <w:numId w:val="1612"/>
+          <w:numId w:val="1623"/>
         </w:numPr>
       </w:pPr>
       <w:r>
@@ -13273,15 +13553,15 @@
         <w:pStyle w:val="Compact"/>
         <w:numPr>
           <w:ilvl w:val="0"/>
-          <w:numId w:val="1613"/>
+          <w:numId w:val="1624"/>
         </w:numPr>
       </w:pPr>
       <w:r>
         <w:t xml:space="preserve">Final client-facing summary prepared with what changed, how it was tested, and what is intentionally out of scope.</w:t>
       </w:r>
     </w:p>
-    <w:bookmarkEnd w:id="84"/>
-    <w:bookmarkStart w:id="85" w:name="progress-update-log"/>
+    <w:bookmarkEnd w:id="85"/>
+    <w:bookmarkStart w:id="86" w:name="progress-update-log"/>
     <w:p>
       <w:pPr>
         <w:pStyle w:val="Heading2"/>
@@ -13424,8 +13704,8 @@
         </w:tc>
       </w:tr>
     </w:tbl>
-    <w:bookmarkEnd w:id="85"/>
     <w:bookmarkEnd w:id="86"/>
+    <w:bookmarkEnd w:id="87"/>
     <w:sectPr>
       <w:footnotePr>
         <w:numRestart w:val="eachSect"/>
@@ -15232,59 +15512,59 @@
     <w:abstractNumId w:val="993"/>
   </w:num>
   <w:num w:numId="1480">
-    <w:abstractNumId w:val="992"/>
+    <w:abstractNumId w:val="993"/>
   </w:num>
   <w:num w:numId="1481">
-    <w:abstractNumId w:val="992"/>
+    <w:abstractNumId w:val="993"/>
   </w:num>
   <w:num w:numId="1482">
-    <w:abstractNumId w:val="992"/>
+    <w:abstractNumId w:val="993"/>
   </w:num>
   <w:num w:numId="1483">
-    <w:abstractNumId w:val="992"/>
+    <w:abstractNumId w:val="993"/>
   </w:num>
   <w:num w:numId="1484">
-    <w:abstractNumId w:val="992"/>
+    <w:abstractNumId w:val="993"/>
   </w:num>
   <w:num w:numId="1485">
-    <w:abstractNumId w:val="992"/>
+    <w:abstractNumId w:val="993"/>
   </w:num>
   <w:num w:numId="1486">
+    <w:abstractNumId w:val="993"/>
+  </w:num>
+  <w:num w:numId="1487">
+    <w:abstractNumId w:val="993"/>
+  </w:num>
+  <w:num w:numId="1488">
+    <w:abstractNumId w:val="993"/>
+  </w:num>
+  <w:num w:numId="1489">
+    <w:abstractNumId w:val="993"/>
+  </w:num>
+  <w:num w:numId="1490">
+    <w:abstractNumId w:val="993"/>
+  </w:num>
+  <w:num w:numId="1491">
+    <w:abstractNumId w:val="993"/>
+  </w:num>
+  <w:num w:numId="1492">
+    <w:abstractNumId w:val="993"/>
+  </w:num>
+  <w:num w:numId="1493">
+    <w:abstractNumId w:val="993"/>
+  </w:num>
+  <w:num w:numId="1494">
+    <w:abstractNumId w:val="993"/>
+  </w:num>
+  <w:num w:numId="1495">
+    <w:abstractNumId w:val="993"/>
+  </w:num>
+  <w:num w:numId="1496">
+    <w:abstractNumId w:val="993"/>
+  </w:num>
+  <w:num w:numId="1497">
     <w:abstractNumId w:val="991"/>
   </w:num>
-  <w:num w:numId="1487">
-    <w:abstractNumId w:val="992"/>
-  </w:num>
-  <w:num w:numId="1488">
-    <w:abstractNumId w:val="992"/>
-  </w:num>
-  <w:num w:numId="1489">
-    <w:abstractNumId w:val="992"/>
-  </w:num>
-  <w:num w:numId="1490">
-    <w:abstractNumId w:val="992"/>
-  </w:num>
-  <w:num w:numId="1491">
-    <w:abstractNumId w:val="992"/>
-  </w:num>
-  <w:num w:numId="1492">
-    <w:abstractNumId w:val="992"/>
-  </w:num>
-  <w:num w:numId="1493">
-    <w:abstractNumId w:val="992"/>
-  </w:num>
-  <w:num w:numId="1494">
-    <w:abstractNumId w:val="992"/>
-  </w:num>
-  <w:num w:numId="1495">
-    <w:abstractNumId w:val="992"/>
-  </w:num>
-  <w:num w:numId="1496">
-    <w:abstractNumId w:val="992"/>
-  </w:num>
-  <w:num w:numId="1497">
-    <w:abstractNumId w:val="992"/>
-  </w:num>
   <w:num w:numId="1498">
     <w:abstractNumId w:val="992"/>
   </w:num>
@@ -15316,100 +15596,100 @@
     <w:abstractNumId w:val="992"/>
   </w:num>
   <w:num w:numId="1508">
+    <w:abstractNumId w:val="992"/>
+  </w:num>
+  <w:num w:numId="1509">
+    <w:abstractNumId w:val="992"/>
+  </w:num>
+  <w:num w:numId="1510">
+    <w:abstractNumId w:val="992"/>
+  </w:num>
+  <w:num w:numId="1511">
+    <w:abstractNumId w:val="992"/>
+  </w:num>
+  <w:num w:numId="1512">
+    <w:abstractNumId w:val="992"/>
+  </w:num>
+  <w:num w:numId="1513">
+    <w:abstractNumId w:val="992"/>
+  </w:num>
+  <w:num w:numId="1514">
+    <w:abstractNumId w:val="993"/>
+  </w:num>
+  <w:num w:numId="1515">
+    <w:abstractNumId w:val="993"/>
+  </w:num>
+  <w:num w:numId="1516">
+    <w:abstractNumId w:val="993"/>
+  </w:num>
+  <w:num w:numId="1517">
+    <w:abstractNumId w:val="993"/>
+  </w:num>
+  <w:num w:numId="1518">
+    <w:abstractNumId w:val="993"/>
+  </w:num>
+  <w:num w:numId="1519">
     <w:abstractNumId w:val="991"/>
   </w:num>
-  <w:num w:numId="1509">
-    <w:abstractNumId w:val="992"/>
-  </w:num>
-  <w:num w:numId="1510">
-    <w:abstractNumId w:val="992"/>
-  </w:num>
-  <w:num w:numId="1511">
-    <w:abstractNumId w:val="991"/>
-  </w:num>
-  <w:num w:numId="1512">
-    <w:abstractNumId w:val="992"/>
-  </w:num>
-  <w:num w:numId="1513">
-    <w:abstractNumId w:val="992"/>
-  </w:num>
-  <w:num w:numId="1514">
-    <w:abstractNumId w:val="992"/>
-  </w:num>
-  <w:num w:numId="1515">
-    <w:abstractNumId w:val="992"/>
-  </w:num>
-  <w:num w:numId="1516">
-    <w:abstractNumId w:val="992"/>
-  </w:num>
-  <w:num w:numId="1517">
-    <w:abstractNumId w:val="992"/>
-  </w:num>
-  <w:num w:numId="1518">
-    <w:abstractNumId w:val="992"/>
-  </w:num>
-  <w:num w:numId="1519">
-    <w:abstractNumId w:val="992"/>
-  </w:num>
   <w:num w:numId="1520">
-    <w:abstractNumId w:val="992"/>
+    <w:abstractNumId w:val="993"/>
   </w:num>
   <w:num w:numId="1521">
-    <w:abstractNumId w:val="992"/>
+    <w:abstractNumId w:val="993"/>
   </w:num>
   <w:num w:numId="1522">
     <w:abstractNumId w:val="991"/>
   </w:num>
   <w:num w:numId="1523">
-    <w:abstractNumId w:val="992"/>
+    <w:abstractNumId w:val="993"/>
   </w:num>
   <w:num w:numId="1524">
+    <w:abstractNumId w:val="993"/>
+  </w:num>
+  <w:num w:numId="1525">
+    <w:abstractNumId w:val="993"/>
+  </w:num>
+  <w:num w:numId="1526">
+    <w:abstractNumId w:val="993"/>
+  </w:num>
+  <w:num w:numId="1527">
+    <w:abstractNumId w:val="993"/>
+  </w:num>
+  <w:num w:numId="1528">
+    <w:abstractNumId w:val="993"/>
+  </w:num>
+  <w:num w:numId="1529">
+    <w:abstractNumId w:val="993"/>
+  </w:num>
+  <w:num w:numId="1530">
+    <w:abstractNumId w:val="993"/>
+  </w:num>
+  <w:num w:numId="1531">
+    <w:abstractNumId w:val="993"/>
+  </w:num>
+  <w:num w:numId="1532">
+    <w:abstractNumId w:val="993"/>
+  </w:num>
+  <w:num w:numId="1533">
     <w:abstractNumId w:val="991"/>
   </w:num>
-  <w:num w:numId="1525">
-    <w:abstractNumId w:val="992"/>
-  </w:num>
-  <w:num w:numId="1526">
-    <w:abstractNumId w:val="992"/>
-  </w:num>
-  <w:num w:numId="1527">
-    <w:abstractNumId w:val="992"/>
-  </w:num>
-  <w:num w:numId="1528">
-    <w:abstractNumId w:val="992"/>
-  </w:num>
-  <w:num w:numId="1529">
-    <w:abstractNumId w:val="992"/>
-  </w:num>
-  <w:num w:numId="1530">
-    <w:abstractNumId w:val="992"/>
-  </w:num>
-  <w:num w:numId="1531">
-    <w:abstractNumId w:val="992"/>
-  </w:num>
-  <w:num w:numId="1532">
-    <w:abstractNumId w:val="992"/>
-  </w:num>
-  <w:num w:numId="1533">
-    <w:abstractNumId w:val="992"/>
-  </w:num>
   <w:num w:numId="1534">
-    <w:abstractNumId w:val="992"/>
+    <w:abstractNumId w:val="993"/>
   </w:num>
   <w:num w:numId="1535">
-    <w:abstractNumId w:val="992"/>
+    <w:abstractNumId w:val="991"/>
   </w:num>
   <w:num w:numId="1536">
-    <w:abstractNumId w:val="992"/>
+    <w:abstractNumId w:val="993"/>
   </w:num>
   <w:num w:numId="1537">
     <w:abstractNumId w:val="992"/>
   </w:num>
   <w:num w:numId="1538">
-    <w:abstractNumId w:val="992"/>
+    <w:abstractNumId w:val="993"/>
   </w:num>
   <w:num w:numId="1539">
-    <w:abstractNumId w:val="992"/>
+    <w:abstractNumId w:val="993"/>
   </w:num>
   <w:num w:numId="1540">
     <w:abstractNumId w:val="992"/>
@@ -15418,7 +15698,7 @@
     <w:abstractNumId w:val="992"/>
   </w:num>
   <w:num w:numId="1542">
-    <w:abstractNumId w:val="992"/>
+    <w:abstractNumId w:val="993"/>
   </w:num>
   <w:num w:numId="1543">
     <w:abstractNumId w:val="992"/>
@@ -15439,76 +15719,76 @@
     <w:abstractNumId w:val="992"/>
   </w:num>
   <w:num w:numId="1549">
-    <w:abstractNumId w:val="992"/>
+    <w:abstractNumId w:val="993"/>
   </w:num>
   <w:num w:numId="1550">
-    <w:abstractNumId w:val="992"/>
+    <w:abstractNumId w:val="993"/>
   </w:num>
   <w:num w:numId="1551">
-    <w:abstractNumId w:val="992"/>
+    <w:abstractNumId w:val="993"/>
   </w:num>
   <w:num w:numId="1552">
-    <w:abstractNumId w:val="992"/>
+    <w:abstractNumId w:val="993"/>
   </w:num>
   <w:num w:numId="1553">
-    <w:abstractNumId w:val="992"/>
+    <w:abstractNumId w:val="993"/>
   </w:num>
   <w:num w:numId="1554">
-    <w:abstractNumId w:val="992"/>
+    <w:abstractNumId w:val="993"/>
   </w:num>
   <w:num w:numId="1555">
-    <w:abstractNumId w:val="992"/>
+    <w:abstractNumId w:val="993"/>
   </w:num>
   <w:num w:numId="1556">
     <w:abstractNumId w:val="992"/>
   </w:num>
   <w:num w:numId="1557">
-    <w:abstractNumId w:val="992"/>
+    <w:abstractNumId w:val="993"/>
   </w:num>
   <w:num w:numId="1558">
-    <w:abstractNumId w:val="992"/>
+    <w:abstractNumId w:val="993"/>
   </w:num>
   <w:num w:numId="1559">
-    <w:abstractNumId w:val="992"/>
+    <w:abstractNumId w:val="993"/>
   </w:num>
   <w:num w:numId="1560">
     <w:abstractNumId w:val="992"/>
   </w:num>
   <w:num w:numId="1561">
-    <w:abstractNumId w:val="992"/>
+    <w:abstractNumId w:val="993"/>
   </w:num>
   <w:num w:numId="1562">
-    <w:abstractNumId w:val="992"/>
+    <w:abstractNumId w:val="993"/>
   </w:num>
   <w:num w:numId="1563">
-    <w:abstractNumId w:val="992"/>
+    <w:abstractNumId w:val="993"/>
   </w:num>
   <w:num w:numId="1564">
     <w:abstractNumId w:val="992"/>
   </w:num>
   <w:num w:numId="1565">
-    <w:abstractNumId w:val="992"/>
+    <w:abstractNumId w:val="993"/>
   </w:num>
   <w:num w:numId="1566">
-    <w:abstractNumId w:val="992"/>
+    <w:abstractNumId w:val="993"/>
   </w:num>
   <w:num w:numId="1567">
-    <w:abstractNumId w:val="992"/>
+    <w:abstractNumId w:val="993"/>
   </w:num>
   <w:num w:numId="1568">
-    <w:abstractNumId w:val="992"/>
+    <w:abstractNumId w:val="993"/>
   </w:num>
   <w:num w:numId="1569">
-    <w:abstractNumId w:val="992"/>
+    <w:abstractNumId w:val="993"/>
   </w:num>
   <w:num w:numId="1570">
-    <w:abstractNumId w:val="992"/>
+    <w:abstractNumId w:val="993"/>
   </w:num>
   <w:num w:numId="1571">
     <w:abstractNumId w:val="992"/>
   </w:num>
   <w:num w:numId="1572">
-    <w:abstractNumId w:val="992"/>
+    <w:abstractNumId w:val="993"/>
   </w:num>
   <w:num w:numId="1573">
     <w:abstractNumId w:val="992"/>
@@ -15517,10 +15797,10 @@
     <w:abstractNumId w:val="992"/>
   </w:num>
   <w:num w:numId="1575">
-    <w:abstractNumId w:val="992"/>
+    <w:abstractNumId w:val="993"/>
   </w:num>
   <w:num w:numId="1576">
-    <w:abstractNumId w:val="992"/>
+    <w:abstractNumId w:val="993"/>
   </w:num>
   <w:num w:numId="1577">
     <w:abstractNumId w:val="992"/>
@@ -15541,7 +15821,7 @@
     <w:abstractNumId w:val="992"/>
   </w:num>
   <w:num w:numId="1583">
-    <w:abstractNumId w:val="992"/>
+    <w:abstractNumId w:val="993"/>
   </w:num>
   <w:num w:numId="1584">
     <w:abstractNumId w:val="992"/>
@@ -15631,6 +15911,39 @@
     <w:abstractNumId w:val="992"/>
   </w:num>
   <w:num w:numId="1613">
+    <w:abstractNumId w:val="992"/>
+  </w:num>
+  <w:num w:numId="1614">
+    <w:abstractNumId w:val="992"/>
+  </w:num>
+  <w:num w:numId="1615">
+    <w:abstractNumId w:val="992"/>
+  </w:num>
+  <w:num w:numId="1616">
+    <w:abstractNumId w:val="992"/>
+  </w:num>
+  <w:num w:numId="1617">
+    <w:abstractNumId w:val="992"/>
+  </w:num>
+  <w:num w:numId="1618">
+    <w:abstractNumId w:val="992"/>
+  </w:num>
+  <w:num w:numId="1619">
+    <w:abstractNumId w:val="992"/>
+  </w:num>
+  <w:num w:numId="1620">
+    <w:abstractNumId w:val="992"/>
+  </w:num>
+  <w:num w:numId="1621">
+    <w:abstractNumId w:val="992"/>
+  </w:num>
+  <w:num w:numId="1622">
+    <w:abstractNumId w:val="992"/>
+  </w:num>
+  <w:num w:numId="1623">
+    <w:abstractNumId w:val="992"/>
+  </w:num>
+  <w:num w:numId="1624">
     <w:abstractNumId w:val="992"/>
   </w:num>
 </w:numbering>

</xml_diff>

<commit_message>
Add M2.3 AI retarget cap coverage
</commit_message>
<xml_diff>
--- a/MASTER_M1_M2_DELIVERY_CHECKLIST.docx
+++ b/MASTER_M1_M2_DELIVERY_CHECKLIST.docx
@@ -81,10 +81,10 @@
         <w:tblLook w:firstRow="1" w:lastRow="0" w:firstColumn="0" w:lastColumn="0" w:noHBand="0" w:noVBand="0" w:val="0020"/>
       </w:tblPr>
       <w:tblGrid>
-        <w:gridCol w:w="2465"/>
-        <w:gridCol w:w="419"/>
-        <w:gridCol w:w="524"/>
-        <w:gridCol w:w="4510"/>
+        <w:gridCol w:w="2355"/>
+        <w:gridCol w:w="401"/>
+        <w:gridCol w:w="501"/>
+        <w:gridCol w:w="4661"/>
       </w:tblGrid>
       <w:tr>
         <w:trPr>
@@ -601,7 +601,7 @@
               <w:jc w:val="right"/>
             </w:pPr>
             <w:r>
-              <w:t xml:space="preserve">4%</w:t>
+              <w:t xml:space="preserve">5%</w:t>
             </w:r>
           </w:p>
         </w:tc>
@@ -612,7 +612,7 @@
               <w:pStyle w:val="Compact"/>
             </w:pPr>
             <w:r>
-              <w:t xml:space="preserve">Live cohort API/UI/build-draft foundation + focused tests/build passed; DB/cron/pixel pending</w:t>
+              <w:t xml:space="preserve">Live cohort API/UI/build-draft foundation + cap tests/build passed; DB/cron/pixel pending</w:t>
             </w:r>
           </w:p>
         </w:tc>
@@ -709,7 +709,7 @@
                 <w:b/>
                 <w:bCs/>
               </w:rPr>
-              <w:t xml:space="preserve">56%</w:t>
+              <w:t xml:space="preserve">57%</w:t>
             </w:r>
           </w:p>
         </w:tc>
@@ -724,7 +724,7 @@
                 <w:b/>
                 <w:bCs/>
               </w:rPr>
-              <w:t xml:space="preserve">M2.3 AI Retarget foundation added; browser smoke and release gates remain</w:t>
+              <w:t xml:space="preserve">M2.3 AI Retarget cap coverage added; browser smoke and release gates remain</w:t>
             </w:r>
           </w:p>
         </w:tc>
@@ -11493,6 +11493,45 @@
         <w:t xml:space="preserve">Targeted ESLint passed with 0 errors and existing warning debt only.</w:t>
       </w:r>
     </w:p>
+    <w:p>
+      <w:pPr>
+        <w:pStyle w:val="Compact"/>
+        <w:numPr>
+          <w:ilvl w:val="0"/>
+          <w:numId w:val="1491"/>
+        </w:numPr>
+      </w:pPr>
+      <w:r>
+        <w:t xml:space="preserve">Cap edge coverage added: REP per-campaign trim to 500 and rolling 24h daily cap exhaustion error with requested/cap/dailyUsed/remaining details.</w:t>
+      </w:r>
+    </w:p>
+    <w:p>
+      <w:pPr>
+        <w:pStyle w:val="Compact"/>
+        <w:numPr>
+          <w:ilvl w:val="0"/>
+          <w:numId w:val="1492"/>
+        </w:numPr>
+      </w:pPr>
+      <w:r>
+        <w:t xml:space="preserve">Validation passed:</w:t>
+      </w:r>
+      <w:r>
+        <w:t xml:space="preserve"> </w:t>
+      </w:r>
+      <w:r>
+        <w:rPr>
+          <w:rStyle w:val="VerbatimChar"/>
+        </w:rPr>
+        <w:t xml:space="preserve">cd server &amp;&amp; npx vitest run tests/campaignAiCohorts.test.ts</w:t>
+      </w:r>
+      <w:r>
+        <w:t xml:space="preserve"> </w:t>
+      </w:r>
+      <w:r>
+        <w:t xml:space="preserve">— 5/5 passed after cap tests; server build passed.</w:t>
+      </w:r>
+    </w:p>
     <w:bookmarkEnd w:id="70"/>
     <w:bookmarkStart w:id="71" w:name="scope-lock-for-ai-retarget"/>
     <w:p>
@@ -11508,7 +11547,7 @@
         <w:pStyle w:val="Compact"/>
         <w:numPr>
           <w:ilvl w:val="0"/>
-          <w:numId w:val="1491"/>
+          <w:numId w:val="1493"/>
         </w:numPr>
       </w:pPr>
       <w:r>
@@ -11520,7 +11559,7 @@
         <w:pStyle w:val="Compact"/>
         <w:numPr>
           <w:ilvl w:val="0"/>
-          <w:numId w:val="1492"/>
+          <w:numId w:val="1494"/>
         </w:numPr>
       </w:pPr>
       <w:r>
@@ -11532,7 +11571,7 @@
         <w:pStyle w:val="Compact"/>
         <w:numPr>
           <w:ilvl w:val="0"/>
-          <w:numId w:val="1493"/>
+          <w:numId w:val="1495"/>
         </w:numPr>
       </w:pPr>
       <w:r>
@@ -11544,7 +11583,7 @@
         <w:pStyle w:val="Compact"/>
         <w:numPr>
           <w:ilvl w:val="0"/>
-          <w:numId w:val="1494"/>
+          <w:numId w:val="1496"/>
         </w:numPr>
       </w:pPr>
       <w:r>
@@ -11556,7 +11595,7 @@
         <w:pStyle w:val="Compact"/>
         <w:numPr>
           <w:ilvl w:val="0"/>
-          <w:numId w:val="1495"/>
+          <w:numId w:val="1497"/>
         </w:numPr>
       </w:pPr>
       <w:r>
@@ -11568,7 +11607,7 @@
         <w:pStyle w:val="Compact"/>
         <w:numPr>
           <w:ilvl w:val="0"/>
-          <w:numId w:val="1496"/>
+          <w:numId w:val="1498"/>
         </w:numPr>
       </w:pPr>
       <w:r>
@@ -11580,7 +11619,7 @@
         <w:pStyle w:val="Compact"/>
         <w:numPr>
           <w:ilvl w:val="1"/>
-          <w:numId w:val="1497"/>
+          <w:numId w:val="1499"/>
         </w:numPr>
       </w:pPr>
       <w:r>
@@ -11607,7 +11646,7 @@
         <w:pStyle w:val="Compact"/>
         <w:numPr>
           <w:ilvl w:val="1"/>
-          <w:numId w:val="1497"/>
+          <w:numId w:val="1499"/>
         </w:numPr>
       </w:pPr>
       <w:r>
@@ -11644,7 +11683,7 @@
         <w:pStyle w:val="Compact"/>
         <w:numPr>
           <w:ilvl w:val="0"/>
-          <w:numId w:val="1498"/>
+          <w:numId w:val="1500"/>
         </w:numPr>
       </w:pPr>
       <w:r>
@@ -11686,7 +11725,7 @@
         <w:pStyle w:val="Compact"/>
         <w:numPr>
           <w:ilvl w:val="0"/>
-          <w:numId w:val="1499"/>
+          <w:numId w:val="1501"/>
         </w:numPr>
       </w:pPr>
       <w:r>
@@ -11710,7 +11749,7 @@
         <w:pStyle w:val="Compact"/>
         <w:numPr>
           <w:ilvl w:val="0"/>
-          <w:numId w:val="1500"/>
+          <w:numId w:val="1502"/>
         </w:numPr>
       </w:pPr>
       <w:r>
@@ -11734,7 +11773,7 @@
         <w:pStyle w:val="Compact"/>
         <w:numPr>
           <w:ilvl w:val="0"/>
-          <w:numId w:val="1501"/>
+          <w:numId w:val="1503"/>
         </w:numPr>
       </w:pPr>
       <w:r>
@@ -11746,7 +11785,7 @@
         <w:pStyle w:val="Compact"/>
         <w:numPr>
           <w:ilvl w:val="0"/>
-          <w:numId w:val="1502"/>
+          <w:numId w:val="1504"/>
         </w:numPr>
       </w:pPr>
       <w:r>
@@ -11758,7 +11797,7 @@
         <w:pStyle w:val="Compact"/>
         <w:numPr>
           <w:ilvl w:val="0"/>
-          <w:numId w:val="1503"/>
+          <w:numId w:val="1505"/>
         </w:numPr>
       </w:pPr>
       <w:r>
@@ -11770,7 +11809,7 @@
         <w:pStyle w:val="Compact"/>
         <w:numPr>
           <w:ilvl w:val="0"/>
-          <w:numId w:val="1504"/>
+          <w:numId w:val="1506"/>
         </w:numPr>
       </w:pPr>
       <w:r>
@@ -11782,7 +11821,7 @@
         <w:pStyle w:val="Compact"/>
         <w:numPr>
           <w:ilvl w:val="0"/>
-          <w:numId w:val="1505"/>
+          <w:numId w:val="1507"/>
         </w:numPr>
       </w:pPr>
       <w:r>
@@ -11794,7 +11833,7 @@
         <w:pStyle w:val="Compact"/>
         <w:numPr>
           <w:ilvl w:val="0"/>
-          <w:numId w:val="1506"/>
+          <w:numId w:val="1508"/>
         </w:numPr>
       </w:pPr>
       <w:r>
@@ -11806,7 +11845,7 @@
         <w:pStyle w:val="Compact"/>
         <w:numPr>
           <w:ilvl w:val="0"/>
-          <w:numId w:val="1507"/>
+          <w:numId w:val="1509"/>
         </w:numPr>
       </w:pPr>
       <w:r>
@@ -11818,7 +11857,7 @@
         <w:pStyle w:val="Compact"/>
         <w:numPr>
           <w:ilvl w:val="0"/>
-          <w:numId w:val="1508"/>
+          <w:numId w:val="1510"/>
         </w:numPr>
       </w:pPr>
       <w:r>
@@ -11830,7 +11869,7 @@
         <w:pStyle w:val="Compact"/>
         <w:numPr>
           <w:ilvl w:val="0"/>
-          <w:numId w:val="1509"/>
+          <w:numId w:val="1511"/>
         </w:numPr>
       </w:pPr>
       <w:r>
@@ -11842,7 +11881,7 @@
         <w:pStyle w:val="Compact"/>
         <w:numPr>
           <w:ilvl w:val="0"/>
-          <w:numId w:val="1510"/>
+          <w:numId w:val="1512"/>
         </w:numPr>
       </w:pPr>
       <w:r>
@@ -11854,7 +11893,7 @@
         <w:pStyle w:val="Compact"/>
         <w:numPr>
           <w:ilvl w:val="0"/>
-          <w:numId w:val="1511"/>
+          <w:numId w:val="1513"/>
         </w:numPr>
       </w:pPr>
       <w:r>
@@ -11881,7 +11920,7 @@
         <w:pStyle w:val="Compact"/>
         <w:numPr>
           <w:ilvl w:val="0"/>
-          <w:numId w:val="1512"/>
+          <w:numId w:val="1514"/>
         </w:numPr>
       </w:pPr>
       <w:r>
@@ -11893,7 +11932,7 @@
         <w:pStyle w:val="Compact"/>
         <w:numPr>
           <w:ilvl w:val="0"/>
-          <w:numId w:val="1513"/>
+          <w:numId w:val="1515"/>
         </w:numPr>
       </w:pPr>
       <w:r>
@@ -11915,7 +11954,7 @@
         <w:pStyle w:val="Compact"/>
         <w:numPr>
           <w:ilvl w:val="0"/>
-          <w:numId w:val="1514"/>
+          <w:numId w:val="1516"/>
         </w:numPr>
       </w:pPr>
       <w:r>
@@ -11927,7 +11966,7 @@
         <w:pStyle w:val="Compact"/>
         <w:numPr>
           <w:ilvl w:val="0"/>
-          <w:numId w:val="1515"/>
+          <w:numId w:val="1517"/>
         </w:numPr>
       </w:pPr>
       <w:r>
@@ -11954,7 +11993,7 @@
         <w:pStyle w:val="Compact"/>
         <w:numPr>
           <w:ilvl w:val="0"/>
-          <w:numId w:val="1516"/>
+          <w:numId w:val="1518"/>
         </w:numPr>
       </w:pPr>
       <w:r>
@@ -11981,7 +12020,7 @@
         <w:pStyle w:val="Compact"/>
         <w:numPr>
           <w:ilvl w:val="0"/>
-          <w:numId w:val="1517"/>
+          <w:numId w:val="1519"/>
         </w:numPr>
       </w:pPr>
       <w:r>
@@ -12008,7 +12047,7 @@
         <w:pStyle w:val="Compact"/>
         <w:numPr>
           <w:ilvl w:val="0"/>
-          <w:numId w:val="1518"/>
+          <w:numId w:val="1520"/>
         </w:numPr>
       </w:pPr>
       <w:r>
@@ -12020,7 +12059,7 @@
         <w:pStyle w:val="Compact"/>
         <w:numPr>
           <w:ilvl w:val="1"/>
-          <w:numId w:val="1519"/>
+          <w:numId w:val="1521"/>
         </w:numPr>
       </w:pPr>
       <w:r>
@@ -12032,7 +12071,7 @@
         <w:pStyle w:val="Compact"/>
         <w:numPr>
           <w:ilvl w:val="1"/>
-          <w:numId w:val="1519"/>
+          <w:numId w:val="1521"/>
         </w:numPr>
       </w:pPr>
       <w:r>
@@ -12044,7 +12083,7 @@
         <w:pStyle w:val="Compact"/>
         <w:numPr>
           <w:ilvl w:val="1"/>
-          <w:numId w:val="1519"/>
+          <w:numId w:val="1521"/>
         </w:numPr>
       </w:pPr>
       <w:r>
@@ -12056,7 +12095,7 @@
         <w:pStyle w:val="Compact"/>
         <w:numPr>
           <w:ilvl w:val="0"/>
-          <w:numId w:val="1520"/>
+          <w:numId w:val="1522"/>
         </w:numPr>
       </w:pPr>
       <w:r>
@@ -12068,7 +12107,7 @@
         <w:pStyle w:val="Compact"/>
         <w:numPr>
           <w:ilvl w:val="0"/>
-          <w:numId w:val="1521"/>
+          <w:numId w:val="1523"/>
         </w:numPr>
       </w:pPr>
       <w:r>
@@ -12080,7 +12119,7 @@
         <w:pStyle w:val="Compact"/>
         <w:numPr>
           <w:ilvl w:val="1"/>
-          <w:numId w:val="1522"/>
+          <w:numId w:val="1524"/>
         </w:numPr>
       </w:pPr>
       <w:r>
@@ -12092,7 +12131,7 @@
         <w:pStyle w:val="Compact"/>
         <w:numPr>
           <w:ilvl w:val="1"/>
-          <w:numId w:val="1522"/>
+          <w:numId w:val="1524"/>
         </w:numPr>
       </w:pPr>
       <w:r>
@@ -12104,7 +12143,7 @@
         <w:pStyle w:val="Compact"/>
         <w:numPr>
           <w:ilvl w:val="1"/>
-          <w:numId w:val="1522"/>
+          <w:numId w:val="1524"/>
         </w:numPr>
       </w:pPr>
       <w:r>
@@ -12116,7 +12155,7 @@
         <w:pStyle w:val="Compact"/>
         <w:numPr>
           <w:ilvl w:val="1"/>
-          <w:numId w:val="1522"/>
+          <w:numId w:val="1524"/>
         </w:numPr>
       </w:pPr>
       <w:r>
@@ -12128,7 +12167,7 @@
         <w:pStyle w:val="Compact"/>
         <w:numPr>
           <w:ilvl w:val="1"/>
-          <w:numId w:val="1522"/>
+          <w:numId w:val="1524"/>
         </w:numPr>
       </w:pPr>
       <w:r>
@@ -12140,7 +12179,7 @@
         <w:pStyle w:val="Compact"/>
         <w:numPr>
           <w:ilvl w:val="1"/>
-          <w:numId w:val="1522"/>
+          <w:numId w:val="1524"/>
         </w:numPr>
       </w:pPr>
       <w:r>
@@ -12152,7 +12191,7 @@
         <w:pStyle w:val="Compact"/>
         <w:numPr>
           <w:ilvl w:val="0"/>
-          <w:numId w:val="1523"/>
+          <w:numId w:val="1525"/>
         </w:numPr>
       </w:pPr>
       <w:r>
@@ -12164,7 +12203,7 @@
         <w:pStyle w:val="Compact"/>
         <w:numPr>
           <w:ilvl w:val="0"/>
-          <w:numId w:val="1524"/>
+          <w:numId w:val="1526"/>
         </w:numPr>
       </w:pPr>
       <w:r>
@@ -12176,7 +12215,7 @@
         <w:pStyle w:val="Compact"/>
         <w:numPr>
           <w:ilvl w:val="0"/>
-          <w:numId w:val="1525"/>
+          <w:numId w:val="1527"/>
         </w:numPr>
       </w:pPr>
       <w:r>
@@ -12198,7 +12237,7 @@
         <w:pStyle w:val="Compact"/>
         <w:numPr>
           <w:ilvl w:val="0"/>
-          <w:numId w:val="1526"/>
+          <w:numId w:val="1528"/>
         </w:numPr>
       </w:pPr>
       <w:r>
@@ -12210,7 +12249,7 @@
         <w:pStyle w:val="Compact"/>
         <w:numPr>
           <w:ilvl w:val="0"/>
-          <w:numId w:val="1527"/>
+          <w:numId w:val="1529"/>
         </w:numPr>
       </w:pPr>
       <w:r>
@@ -12222,7 +12261,7 @@
         <w:pStyle w:val="Compact"/>
         <w:numPr>
           <w:ilvl w:val="0"/>
-          <w:numId w:val="1528"/>
+          <w:numId w:val="1530"/>
         </w:numPr>
       </w:pPr>
       <w:r>
@@ -12234,7 +12273,7 @@
         <w:pStyle w:val="Compact"/>
         <w:numPr>
           <w:ilvl w:val="0"/>
-          <w:numId w:val="1529"/>
+          <w:numId w:val="1531"/>
         </w:numPr>
       </w:pPr>
       <w:r>
@@ -12246,7 +12285,7 @@
         <w:pStyle w:val="Compact"/>
         <w:numPr>
           <w:ilvl w:val="0"/>
-          <w:numId w:val="1530"/>
+          <w:numId w:val="1532"/>
         </w:numPr>
       </w:pPr>
       <w:r>
@@ -12258,7 +12297,7 @@
         <w:pStyle w:val="Compact"/>
         <w:numPr>
           <w:ilvl w:val="0"/>
-          <w:numId w:val="1531"/>
+          <w:numId w:val="1533"/>
         </w:numPr>
       </w:pPr>
       <w:r>
@@ -12280,47 +12319,11 @@
         <w:pStyle w:val="Compact"/>
         <w:numPr>
           <w:ilvl w:val="0"/>
-          <w:numId w:val="1532"/>
+          <w:numId w:val="1534"/>
         </w:numPr>
       </w:pPr>
       <w:r>
         <w:t xml:space="preserve">Enforce per-campaign cap server-side for AI cohort build:</w:t>
-      </w:r>
-    </w:p>
-    <w:p>
-      <w:pPr>
-        <w:pStyle w:val="Compact"/>
-        <w:numPr>
-          <w:ilvl w:val="1"/>
-          <w:numId w:val="1533"/>
-        </w:numPr>
-      </w:pPr>
-      <w:r>
-        <w:t xml:space="preserve">rep: 500;</w:t>
-      </w:r>
-    </w:p>
-    <w:p>
-      <w:pPr>
-        <w:pStyle w:val="Compact"/>
-        <w:numPr>
-          <w:ilvl w:val="1"/>
-          <w:numId w:val="1533"/>
-        </w:numPr>
-      </w:pPr>
-      <w:r>
-        <w:t xml:space="preserve">admin: 3000.</w:t>
-      </w:r>
-    </w:p>
-    <w:p>
-      <w:pPr>
-        <w:pStyle w:val="Compact"/>
-        <w:numPr>
-          <w:ilvl w:val="0"/>
-          <w:numId w:val="1534"/>
-        </w:numPr>
-      </w:pPr>
-      <w:r>
-        <w:t xml:space="preserve">Enforce rolling 24-hour daily total cap server-side for AI cohort build:</w:t>
       </w:r>
     </w:p>
     <w:p>
@@ -12332,7 +12335,7 @@
         </w:numPr>
       </w:pPr>
       <w:r>
-        <w:t xml:space="preserve">rep: 800;</w:t>
+        <w:t xml:space="preserve">rep: 500;</w:t>
       </w:r>
     </w:p>
     <w:p>
@@ -12344,6 +12347,42 @@
         </w:numPr>
       </w:pPr>
       <w:r>
+        <w:t xml:space="preserve">admin: 3000.</w:t>
+      </w:r>
+    </w:p>
+    <w:p>
+      <w:pPr>
+        <w:pStyle w:val="Compact"/>
+        <w:numPr>
+          <w:ilvl w:val="0"/>
+          <w:numId w:val="1536"/>
+        </w:numPr>
+      </w:pPr>
+      <w:r>
+        <w:t xml:space="preserve">Enforce rolling 24-hour daily total cap server-side for AI cohort build:</w:t>
+      </w:r>
+    </w:p>
+    <w:p>
+      <w:pPr>
+        <w:pStyle w:val="Compact"/>
+        <w:numPr>
+          <w:ilvl w:val="1"/>
+          <w:numId w:val="1537"/>
+        </w:numPr>
+      </w:pPr>
+      <w:r>
+        <w:t xml:space="preserve">rep: 800;</w:t>
+      </w:r>
+    </w:p>
+    <w:p>
+      <w:pPr>
+        <w:pStyle w:val="Compact"/>
+        <w:numPr>
+          <w:ilvl w:val="1"/>
+          <w:numId w:val="1537"/>
+        </w:numPr>
+      </w:pPr>
+      <w:r>
         <w:t xml:space="preserve">admin: 4500.</w:t>
       </w:r>
     </w:p>
@@ -12352,7 +12391,7 @@
         <w:pStyle w:val="Compact"/>
         <w:numPr>
           <w:ilvl w:val="0"/>
-          <w:numId w:val="1536"/>
+          <w:numId w:val="1538"/>
         </w:numPr>
       </w:pPr>
       <w:r>
@@ -12364,7 +12403,7 @@
         <w:pStyle w:val="Compact"/>
         <w:numPr>
           <w:ilvl w:val="0"/>
-          <w:numId w:val="1537"/>
+          <w:numId w:val="1539"/>
         </w:numPr>
       </w:pPr>
       <w:r>
@@ -12376,7 +12415,7 @@
         <w:pStyle w:val="Compact"/>
         <w:numPr>
           <w:ilvl w:val="0"/>
-          <w:numId w:val="1538"/>
+          <w:numId w:val="1540"/>
         </w:numPr>
       </w:pPr>
       <w:r>
@@ -12388,7 +12427,7 @@
         <w:pStyle w:val="Compact"/>
         <w:numPr>
           <w:ilvl w:val="0"/>
-          <w:numId w:val="1539"/>
+          <w:numId w:val="1541"/>
         </w:numPr>
       </w:pPr>
       <w:r>
@@ -12410,7 +12449,7 @@
         <w:pStyle w:val="Compact"/>
         <w:numPr>
           <w:ilvl w:val="0"/>
-          <w:numId w:val="1540"/>
+          <w:numId w:val="1542"/>
         </w:numPr>
       </w:pPr>
       <w:r>
@@ -12422,7 +12461,7 @@
         <w:pStyle w:val="Compact"/>
         <w:numPr>
           <w:ilvl w:val="0"/>
-          <w:numId w:val="1541"/>
+          <w:numId w:val="1543"/>
         </w:numPr>
       </w:pPr>
       <w:r>
@@ -12434,7 +12473,7 @@
         <w:pStyle w:val="Compact"/>
         <w:numPr>
           <w:ilvl w:val="0"/>
-          <w:numId w:val="1542"/>
+          <w:numId w:val="1544"/>
         </w:numPr>
       </w:pPr>
       <w:r>
@@ -12446,7 +12485,7 @@
         <w:pStyle w:val="Compact"/>
         <w:numPr>
           <w:ilvl w:val="0"/>
-          <w:numId w:val="1543"/>
+          <w:numId w:val="1545"/>
         </w:numPr>
       </w:pPr>
       <w:r>
@@ -12458,7 +12497,7 @@
         <w:pStyle w:val="Compact"/>
         <w:numPr>
           <w:ilvl w:val="0"/>
-          <w:numId w:val="1544"/>
+          <w:numId w:val="1546"/>
         </w:numPr>
       </w:pPr>
       <w:r>
@@ -12470,7 +12509,7 @@
         <w:pStyle w:val="Compact"/>
         <w:numPr>
           <w:ilvl w:val="0"/>
-          <w:numId w:val="1545"/>
+          <w:numId w:val="1547"/>
         </w:numPr>
       </w:pPr>
       <w:r>
@@ -12482,7 +12521,7 @@
         <w:pStyle w:val="Compact"/>
         <w:numPr>
           <w:ilvl w:val="0"/>
-          <w:numId w:val="1546"/>
+          <w:numId w:val="1548"/>
         </w:numPr>
       </w:pPr>
       <w:r>
@@ -12494,7 +12533,7 @@
         <w:pStyle w:val="Compact"/>
         <w:numPr>
           <w:ilvl w:val="0"/>
-          <w:numId w:val="1547"/>
+          <w:numId w:val="1549"/>
         </w:numPr>
       </w:pPr>
       <w:r>
@@ -12506,7 +12545,7 @@
         <w:pStyle w:val="Compact"/>
         <w:numPr>
           <w:ilvl w:val="0"/>
-          <w:numId w:val="1548"/>
+          <w:numId w:val="1550"/>
         </w:numPr>
       </w:pPr>
       <w:r>
@@ -12528,7 +12567,7 @@
         <w:pStyle w:val="Compact"/>
         <w:numPr>
           <w:ilvl w:val="0"/>
-          <w:numId w:val="1549"/>
+          <w:numId w:val="1551"/>
         </w:numPr>
       </w:pPr>
       <w:r>
@@ -12540,7 +12579,7 @@
         <w:pStyle w:val="Compact"/>
         <w:numPr>
           <w:ilvl w:val="0"/>
-          <w:numId w:val="1550"/>
+          <w:numId w:val="1552"/>
         </w:numPr>
       </w:pPr>
       <w:r>
@@ -12552,7 +12591,7 @@
         <w:pStyle w:val="Compact"/>
         <w:numPr>
           <w:ilvl w:val="0"/>
-          <w:numId w:val="1551"/>
+          <w:numId w:val="1553"/>
         </w:numPr>
       </w:pPr>
       <w:r>
@@ -12564,7 +12603,7 @@
         <w:pStyle w:val="Compact"/>
         <w:numPr>
           <w:ilvl w:val="0"/>
-          <w:numId w:val="1552"/>
+          <w:numId w:val="1554"/>
         </w:numPr>
       </w:pPr>
       <w:r>
@@ -12576,7 +12615,7 @@
         <w:pStyle w:val="Compact"/>
         <w:numPr>
           <w:ilvl w:val="0"/>
-          <w:numId w:val="1553"/>
+          <w:numId w:val="1555"/>
         </w:numPr>
       </w:pPr>
       <w:r>
@@ -12588,7 +12627,7 @@
         <w:pStyle w:val="Compact"/>
         <w:numPr>
           <w:ilvl w:val="0"/>
-          <w:numId w:val="1554"/>
+          <w:numId w:val="1556"/>
         </w:numPr>
       </w:pPr>
       <w:r>
@@ -12600,7 +12639,7 @@
         <w:pStyle w:val="Compact"/>
         <w:numPr>
           <w:ilvl w:val="0"/>
-          <w:numId w:val="1555"/>
+          <w:numId w:val="1557"/>
         </w:numPr>
       </w:pPr>
       <w:r>
@@ -12612,7 +12651,7 @@
         <w:pStyle w:val="Compact"/>
         <w:numPr>
           <w:ilvl w:val="0"/>
-          <w:numId w:val="1556"/>
+          <w:numId w:val="1558"/>
         </w:numPr>
       </w:pPr>
       <w:r>
@@ -12624,7 +12663,7 @@
         <w:pStyle w:val="Compact"/>
         <w:numPr>
           <w:ilvl w:val="0"/>
-          <w:numId w:val="1557"/>
+          <w:numId w:val="1559"/>
         </w:numPr>
       </w:pPr>
       <w:r>
@@ -12636,7 +12675,7 @@
         <w:pStyle w:val="Compact"/>
         <w:numPr>
           <w:ilvl w:val="0"/>
-          <w:numId w:val="1558"/>
+          <w:numId w:val="1560"/>
         </w:numPr>
       </w:pPr>
       <w:r>
@@ -12663,7 +12702,7 @@
         <w:pStyle w:val="Compact"/>
         <w:numPr>
           <w:ilvl w:val="0"/>
-          <w:numId w:val="1559"/>
+          <w:numId w:val="1561"/>
         </w:numPr>
       </w:pPr>
       <w:r>
@@ -12684,7 +12723,7 @@
         <w:pStyle w:val="Compact"/>
         <w:numPr>
           <w:ilvl w:val="0"/>
-          <w:numId w:val="1560"/>
+          <w:numId w:val="1562"/>
         </w:numPr>
       </w:pPr>
       <w:r>
@@ -12706,7 +12745,7 @@
         <w:pStyle w:val="Compact"/>
         <w:numPr>
           <w:ilvl w:val="0"/>
-          <w:numId w:val="1561"/>
+          <w:numId w:val="1563"/>
         </w:numPr>
       </w:pPr>
       <w:r>
@@ -12718,7 +12757,7 @@
         <w:pStyle w:val="Compact"/>
         <w:numPr>
           <w:ilvl w:val="0"/>
-          <w:numId w:val="1562"/>
+          <w:numId w:val="1564"/>
         </w:numPr>
       </w:pPr>
       <w:r>
@@ -12730,7 +12769,7 @@
         <w:pStyle w:val="Compact"/>
         <w:numPr>
           <w:ilvl w:val="0"/>
-          <w:numId w:val="1563"/>
+          <w:numId w:val="1565"/>
         </w:numPr>
       </w:pPr>
       <w:r>
@@ -12742,7 +12781,7 @@
         <w:pStyle w:val="Compact"/>
         <w:numPr>
           <w:ilvl w:val="0"/>
-          <w:numId w:val="1564"/>
+          <w:numId w:val="1566"/>
         </w:numPr>
       </w:pPr>
       <w:r>
@@ -12754,7 +12793,7 @@
         <w:pStyle w:val="Compact"/>
         <w:numPr>
           <w:ilvl w:val="0"/>
-          <w:numId w:val="1565"/>
+          <w:numId w:val="1567"/>
         </w:numPr>
       </w:pPr>
       <w:r>
@@ -12766,7 +12805,7 @@
         <w:pStyle w:val="Compact"/>
         <w:numPr>
           <w:ilvl w:val="0"/>
-          <w:numId w:val="1566"/>
+          <w:numId w:val="1568"/>
         </w:numPr>
       </w:pPr>
       <w:r>
@@ -12778,7 +12817,7 @@
         <w:pStyle w:val="Compact"/>
         <w:numPr>
           <w:ilvl w:val="0"/>
-          <w:numId w:val="1567"/>
+          <w:numId w:val="1569"/>
         </w:numPr>
       </w:pPr>
       <w:r>
@@ -12790,7 +12829,7 @@
         <w:pStyle w:val="Compact"/>
         <w:numPr>
           <w:ilvl w:val="0"/>
-          <w:numId w:val="1568"/>
+          <w:numId w:val="1570"/>
         </w:numPr>
       </w:pPr>
       <w:r>
@@ -12812,7 +12851,7 @@
         <w:pStyle w:val="Compact"/>
         <w:numPr>
           <w:ilvl w:val="0"/>
-          <w:numId w:val="1569"/>
+          <w:numId w:val="1571"/>
         </w:numPr>
       </w:pPr>
       <w:r>
@@ -12824,7 +12863,7 @@
         <w:pStyle w:val="Compact"/>
         <w:numPr>
           <w:ilvl w:val="0"/>
-          <w:numId w:val="1570"/>
+          <w:numId w:val="1572"/>
         </w:numPr>
       </w:pPr>
       <w:r>
@@ -12836,7 +12875,7 @@
         <w:pStyle w:val="Compact"/>
         <w:numPr>
           <w:ilvl w:val="0"/>
-          <w:numId w:val="1571"/>
+          <w:numId w:val="1573"/>
         </w:numPr>
       </w:pPr>
       <w:r>
@@ -12848,7 +12887,7 @@
         <w:pStyle w:val="Compact"/>
         <w:numPr>
           <w:ilvl w:val="0"/>
-          <w:numId w:val="1572"/>
+          <w:numId w:val="1574"/>
         </w:numPr>
       </w:pPr>
       <w:r>
@@ -12860,7 +12899,7 @@
         <w:pStyle w:val="Compact"/>
         <w:numPr>
           <w:ilvl w:val="0"/>
-          <w:numId w:val="1573"/>
+          <w:numId w:val="1575"/>
         </w:numPr>
       </w:pPr>
       <w:r>
@@ -12872,7 +12911,7 @@
         <w:pStyle w:val="Compact"/>
         <w:numPr>
           <w:ilvl w:val="0"/>
-          <w:numId w:val="1574"/>
+          <w:numId w:val="1576"/>
         </w:numPr>
       </w:pPr>
       <w:r>
@@ -12884,7 +12923,7 @@
         <w:pStyle w:val="Compact"/>
         <w:numPr>
           <w:ilvl w:val="0"/>
-          <w:numId w:val="1575"/>
+          <w:numId w:val="1577"/>
         </w:numPr>
       </w:pPr>
       <w:r>
@@ -12896,7 +12935,7 @@
         <w:pStyle w:val="Compact"/>
         <w:numPr>
           <w:ilvl w:val="0"/>
-          <w:numId w:val="1576"/>
+          <w:numId w:val="1578"/>
         </w:numPr>
       </w:pPr>
       <w:r>
@@ -12908,34 +12947,34 @@
         <w:pStyle w:val="Compact"/>
         <w:numPr>
           <w:ilvl w:val="0"/>
-          <w:numId w:val="1577"/>
-        </w:numPr>
-      </w:pPr>
-      <w:r>
-        <w:t xml:space="preserve">Per-campaign caps tested for rep and admin.</w:t>
-      </w:r>
-    </w:p>
-    <w:p>
-      <w:pPr>
-        <w:pStyle w:val="Compact"/>
-        <w:numPr>
-          <w:ilvl w:val="0"/>
-          <w:numId w:val="1578"/>
-        </w:numPr>
-      </w:pPr>
-      <w:r>
-        <w:t xml:space="preserve">Rolling 24h daily caps tested for rep and admin.</w:t>
-      </w:r>
-    </w:p>
-    <w:p>
-      <w:pPr>
-        <w:pStyle w:val="Compact"/>
-        <w:numPr>
-          <w:ilvl w:val="0"/>
           <w:numId w:val="1579"/>
         </w:numPr>
       </w:pPr>
       <w:r>
+        <w:t xml:space="preserve">Per-campaign caps tested for rep path.</w:t>
+      </w:r>
+    </w:p>
+    <w:p>
+      <w:pPr>
+        <w:pStyle w:val="Compact"/>
+        <w:numPr>
+          <w:ilvl w:val="0"/>
+          <w:numId w:val="1580"/>
+        </w:numPr>
+      </w:pPr>
+      <w:r>
+        <w:t xml:space="preserve">Rolling 24h daily caps tested for rep path.</w:t>
+      </w:r>
+    </w:p>
+    <w:p>
+      <w:pPr>
+        <w:pStyle w:val="Compact"/>
+        <w:numPr>
+          <w:ilvl w:val="0"/>
+          <w:numId w:val="1581"/>
+        </w:numPr>
+      </w:pPr>
+      <w:r>
         <w:t xml:space="preserve">Expired cohorts ignored after 24h.</w:t>
       </w:r>
     </w:p>
@@ -12944,7 +12983,7 @@
         <w:pStyle w:val="Compact"/>
         <w:numPr>
           <w:ilvl w:val="0"/>
-          <w:numId w:val="1580"/>
+          <w:numId w:val="1582"/>
         </w:numPr>
       </w:pPr>
       <w:r>
@@ -12956,7 +12995,7 @@
         <w:pStyle w:val="Compact"/>
         <w:numPr>
           <w:ilvl w:val="0"/>
-          <w:numId w:val="1581"/>
+          <w:numId w:val="1583"/>
         </w:numPr>
       </w:pPr>
       <w:r>
@@ -12968,7 +13007,7 @@
         <w:pStyle w:val="Compact"/>
         <w:numPr>
           <w:ilvl w:val="0"/>
-          <w:numId w:val="1582"/>
+          <w:numId w:val="1584"/>
         </w:numPr>
       </w:pPr>
       <w:r>
@@ -12980,7 +13019,7 @@
         <w:pStyle w:val="Compact"/>
         <w:numPr>
           <w:ilvl w:val="0"/>
-          <w:numId w:val="1583"/>
+          <w:numId w:val="1585"/>
         </w:numPr>
       </w:pPr>
       <w:r>
@@ -13012,7 +13051,7 @@
         <w:pStyle w:val="Compact"/>
         <w:numPr>
           <w:ilvl w:val="0"/>
-          <w:numId w:val="1584"/>
+          <w:numId w:val="1586"/>
         </w:numPr>
       </w:pPr>
       <w:r>
@@ -13024,7 +13063,7 @@
         <w:pStyle w:val="Compact"/>
         <w:numPr>
           <w:ilvl w:val="0"/>
-          <w:numId w:val="1585"/>
+          <w:numId w:val="1587"/>
         </w:numPr>
       </w:pPr>
       <w:r>
@@ -13036,7 +13075,7 @@
         <w:pStyle w:val="Compact"/>
         <w:numPr>
           <w:ilvl w:val="0"/>
-          <w:numId w:val="1586"/>
+          <w:numId w:val="1588"/>
         </w:numPr>
       </w:pPr>
       <w:r>
@@ -13048,7 +13087,7 @@
         <w:pStyle w:val="Compact"/>
         <w:numPr>
           <w:ilvl w:val="0"/>
-          <w:numId w:val="1587"/>
+          <w:numId w:val="1589"/>
         </w:numPr>
       </w:pPr>
       <w:r>
@@ -13060,7 +13099,7 @@
         <w:pStyle w:val="Compact"/>
         <w:numPr>
           <w:ilvl w:val="0"/>
-          <w:numId w:val="1588"/>
+          <w:numId w:val="1590"/>
         </w:numPr>
       </w:pPr>
       <w:r>
@@ -13072,7 +13111,7 @@
         <w:pStyle w:val="Compact"/>
         <w:numPr>
           <w:ilvl w:val="0"/>
-          <w:numId w:val="1589"/>
+          <w:numId w:val="1591"/>
         </w:numPr>
       </w:pPr>
       <w:r>
@@ -13084,7 +13123,7 @@
         <w:pStyle w:val="Compact"/>
         <w:numPr>
           <w:ilvl w:val="0"/>
-          <w:numId w:val="1590"/>
+          <w:numId w:val="1592"/>
         </w:numPr>
       </w:pPr>
       <w:r>
@@ -13096,7 +13135,7 @@
         <w:pStyle w:val="Compact"/>
         <w:numPr>
           <w:ilvl w:val="0"/>
-          <w:numId w:val="1591"/>
+          <w:numId w:val="1593"/>
         </w:numPr>
       </w:pPr>
       <w:r>
@@ -13108,7 +13147,7 @@
         <w:pStyle w:val="Compact"/>
         <w:numPr>
           <w:ilvl w:val="0"/>
-          <w:numId w:val="1592"/>
+          <w:numId w:val="1594"/>
         </w:numPr>
       </w:pPr>
       <w:r>
@@ -13120,7 +13159,7 @@
         <w:pStyle w:val="Compact"/>
         <w:numPr>
           <w:ilvl w:val="0"/>
-          <w:numId w:val="1593"/>
+          <w:numId w:val="1595"/>
         </w:numPr>
       </w:pPr>
       <w:r>
@@ -13132,7 +13171,7 @@
         <w:pStyle w:val="Compact"/>
         <w:numPr>
           <w:ilvl w:val="0"/>
-          <w:numId w:val="1594"/>
+          <w:numId w:val="1596"/>
         </w:numPr>
       </w:pPr>
       <w:r>
@@ -13144,7 +13183,7 @@
         <w:pStyle w:val="Compact"/>
         <w:numPr>
           <w:ilvl w:val="0"/>
-          <w:numId w:val="1595"/>
+          <w:numId w:val="1597"/>
         </w:numPr>
       </w:pPr>
       <w:r>
@@ -13156,7 +13195,7 @@
         <w:pStyle w:val="Compact"/>
         <w:numPr>
           <w:ilvl w:val="0"/>
-          <w:numId w:val="1596"/>
+          <w:numId w:val="1598"/>
         </w:numPr>
       </w:pPr>
       <w:r>
@@ -13193,7 +13232,7 @@
         <w:pStyle w:val="Compact"/>
         <w:numPr>
           <w:ilvl w:val="0"/>
-          <w:numId w:val="1597"/>
+          <w:numId w:val="1599"/>
         </w:numPr>
       </w:pPr>
       <w:r>
@@ -13205,7 +13244,7 @@
         <w:pStyle w:val="Compact"/>
         <w:numPr>
           <w:ilvl w:val="0"/>
-          <w:numId w:val="1598"/>
+          <w:numId w:val="1600"/>
         </w:numPr>
       </w:pPr>
       <w:r>
@@ -13232,7 +13271,7 @@
         <w:pStyle w:val="Compact"/>
         <w:numPr>
           <w:ilvl w:val="0"/>
-          <w:numId w:val="1599"/>
+          <w:numId w:val="1601"/>
         </w:numPr>
       </w:pPr>
       <w:r>
@@ -13244,7 +13283,7 @@
         <w:pStyle w:val="Compact"/>
         <w:numPr>
           <w:ilvl w:val="0"/>
-          <w:numId w:val="1600"/>
+          <w:numId w:val="1602"/>
         </w:numPr>
       </w:pPr>
       <w:r>
@@ -13256,7 +13295,7 @@
         <w:pStyle w:val="Compact"/>
         <w:numPr>
           <w:ilvl w:val="0"/>
-          <w:numId w:val="1601"/>
+          <w:numId w:val="1603"/>
         </w:numPr>
       </w:pPr>
       <w:r>
@@ -13268,7 +13307,7 @@
         <w:pStyle w:val="Compact"/>
         <w:numPr>
           <w:ilvl w:val="0"/>
-          <w:numId w:val="1602"/>
+          <w:numId w:val="1604"/>
         </w:numPr>
       </w:pPr>
       <w:r>
@@ -13280,7 +13319,7 @@
         <w:pStyle w:val="Compact"/>
         <w:numPr>
           <w:ilvl w:val="0"/>
-          <w:numId w:val="1603"/>
+          <w:numId w:val="1605"/>
         </w:numPr>
       </w:pPr>
       <w:r>
@@ -13292,7 +13331,7 @@
         <w:pStyle w:val="Compact"/>
         <w:numPr>
           <w:ilvl w:val="0"/>
-          <w:numId w:val="1604"/>
+          <w:numId w:val="1606"/>
         </w:numPr>
       </w:pPr>
       <w:r>
@@ -13314,7 +13353,7 @@
         <w:pStyle w:val="Compact"/>
         <w:numPr>
           <w:ilvl w:val="0"/>
-          <w:numId w:val="1605"/>
+          <w:numId w:val="1607"/>
         </w:numPr>
       </w:pPr>
       <w:r>
@@ -13326,7 +13365,7 @@
         <w:pStyle w:val="Compact"/>
         <w:numPr>
           <w:ilvl w:val="0"/>
-          <w:numId w:val="1606"/>
+          <w:numId w:val="1608"/>
         </w:numPr>
       </w:pPr>
       <w:r>
@@ -13338,7 +13377,7 @@
         <w:pStyle w:val="Compact"/>
         <w:numPr>
           <w:ilvl w:val="0"/>
-          <w:numId w:val="1607"/>
+          <w:numId w:val="1609"/>
         </w:numPr>
       </w:pPr>
       <w:r>
@@ -13350,7 +13389,7 @@
         <w:pStyle w:val="Compact"/>
         <w:numPr>
           <w:ilvl w:val="0"/>
-          <w:numId w:val="1608"/>
+          <w:numId w:val="1610"/>
         </w:numPr>
       </w:pPr>
       <w:r>
@@ -13362,7 +13401,7 @@
         <w:pStyle w:val="Compact"/>
         <w:numPr>
           <w:ilvl w:val="0"/>
-          <w:numId w:val="1609"/>
+          <w:numId w:val="1611"/>
         </w:numPr>
       </w:pPr>
       <w:r>
@@ -13374,7 +13413,7 @@
         <w:pStyle w:val="Compact"/>
         <w:numPr>
           <w:ilvl w:val="0"/>
-          <w:numId w:val="1610"/>
+          <w:numId w:val="1612"/>
         </w:numPr>
       </w:pPr>
       <w:r>
@@ -13386,7 +13425,7 @@
         <w:pStyle w:val="Compact"/>
         <w:numPr>
           <w:ilvl w:val="0"/>
-          <w:numId w:val="1611"/>
+          <w:numId w:val="1613"/>
         </w:numPr>
       </w:pPr>
       <w:r>
@@ -13398,7 +13437,7 @@
         <w:pStyle w:val="Compact"/>
         <w:numPr>
           <w:ilvl w:val="0"/>
-          <w:numId w:val="1612"/>
+          <w:numId w:val="1614"/>
         </w:numPr>
       </w:pPr>
       <w:r>
@@ -13410,7 +13449,7 @@
         <w:pStyle w:val="Compact"/>
         <w:numPr>
           <w:ilvl w:val="0"/>
-          <w:numId w:val="1613"/>
+          <w:numId w:val="1615"/>
         </w:numPr>
       </w:pPr>
       <w:r>
@@ -13433,7 +13472,7 @@
         <w:pStyle w:val="Compact"/>
         <w:numPr>
           <w:ilvl w:val="0"/>
-          <w:numId w:val="1614"/>
+          <w:numId w:val="1616"/>
         </w:numPr>
       </w:pPr>
       <w:r>
@@ -13445,7 +13484,7 @@
         <w:pStyle w:val="Compact"/>
         <w:numPr>
           <w:ilvl w:val="0"/>
-          <w:numId w:val="1615"/>
+          <w:numId w:val="1617"/>
         </w:numPr>
       </w:pPr>
       <w:r>
@@ -13457,7 +13496,7 @@
         <w:pStyle w:val="Compact"/>
         <w:numPr>
           <w:ilvl w:val="0"/>
-          <w:numId w:val="1616"/>
+          <w:numId w:val="1618"/>
         </w:numPr>
       </w:pPr>
       <w:r>
@@ -13469,7 +13508,7 @@
         <w:pStyle w:val="Compact"/>
         <w:numPr>
           <w:ilvl w:val="0"/>
-          <w:numId w:val="1617"/>
+          <w:numId w:val="1619"/>
         </w:numPr>
       </w:pPr>
       <w:r>
@@ -13481,7 +13520,7 @@
         <w:pStyle w:val="Compact"/>
         <w:numPr>
           <w:ilvl w:val="0"/>
-          <w:numId w:val="1618"/>
+          <w:numId w:val="1620"/>
         </w:numPr>
       </w:pPr>
       <w:r>
@@ -13493,7 +13532,7 @@
         <w:pStyle w:val="Compact"/>
         <w:numPr>
           <w:ilvl w:val="0"/>
-          <w:numId w:val="1619"/>
+          <w:numId w:val="1621"/>
         </w:numPr>
       </w:pPr>
       <w:r>
@@ -13505,7 +13544,7 @@
         <w:pStyle w:val="Compact"/>
         <w:numPr>
           <w:ilvl w:val="0"/>
-          <w:numId w:val="1620"/>
+          <w:numId w:val="1622"/>
         </w:numPr>
       </w:pPr>
       <w:r>
@@ -13517,7 +13556,7 @@
         <w:pStyle w:val="Compact"/>
         <w:numPr>
           <w:ilvl w:val="0"/>
-          <w:numId w:val="1621"/>
+          <w:numId w:val="1623"/>
         </w:numPr>
       </w:pPr>
       <w:r>
@@ -13529,7 +13568,7 @@
         <w:pStyle w:val="Compact"/>
         <w:numPr>
           <w:ilvl w:val="0"/>
-          <w:numId w:val="1622"/>
+          <w:numId w:val="1624"/>
         </w:numPr>
       </w:pPr>
       <w:r>
@@ -13541,7 +13580,7 @@
         <w:pStyle w:val="Compact"/>
         <w:numPr>
           <w:ilvl w:val="0"/>
-          <w:numId w:val="1623"/>
+          <w:numId w:val="1625"/>
         </w:numPr>
       </w:pPr>
       <w:r>
@@ -13553,7 +13592,7 @@
         <w:pStyle w:val="Compact"/>
         <w:numPr>
           <w:ilvl w:val="0"/>
-          <w:numId w:val="1624"/>
+          <w:numId w:val="1626"/>
         </w:numPr>
       </w:pPr>
       <w:r>
@@ -15563,14 +15602,14 @@
     <w:abstractNumId w:val="993"/>
   </w:num>
   <w:num w:numId="1497">
+    <w:abstractNumId w:val="993"/>
+  </w:num>
+  <w:num w:numId="1498">
+    <w:abstractNumId w:val="993"/>
+  </w:num>
+  <w:num w:numId="1499">
     <w:abstractNumId w:val="991"/>
   </w:num>
-  <w:num w:numId="1498">
-    <w:abstractNumId w:val="992"/>
-  </w:num>
-  <w:num w:numId="1499">
-    <w:abstractNumId w:val="992"/>
-  </w:num>
   <w:num w:numId="1500">
     <w:abstractNumId w:val="992"/>
   </w:num>
@@ -15614,10 +15653,10 @@
     <w:abstractNumId w:val="992"/>
   </w:num>
   <w:num w:numId="1514">
-    <w:abstractNumId w:val="993"/>
+    <w:abstractNumId w:val="992"/>
   </w:num>
   <w:num w:numId="1515">
-    <w:abstractNumId w:val="993"/>
+    <w:abstractNumId w:val="992"/>
   </w:num>
   <w:num w:numId="1516">
     <w:abstractNumId w:val="993"/>
@@ -15629,23 +15668,23 @@
     <w:abstractNumId w:val="993"/>
   </w:num>
   <w:num w:numId="1519">
+    <w:abstractNumId w:val="993"/>
+  </w:num>
+  <w:num w:numId="1520">
+    <w:abstractNumId w:val="993"/>
+  </w:num>
+  <w:num w:numId="1521">
     <w:abstractNumId w:val="991"/>
   </w:num>
-  <w:num w:numId="1520">
-    <w:abstractNumId w:val="993"/>
-  </w:num>
-  <w:num w:numId="1521">
-    <w:abstractNumId w:val="993"/>
-  </w:num>
   <w:num w:numId="1522">
+    <w:abstractNumId w:val="993"/>
+  </w:num>
+  <w:num w:numId="1523">
+    <w:abstractNumId w:val="993"/>
+  </w:num>
+  <w:num w:numId="1524">
     <w:abstractNumId w:val="991"/>
   </w:num>
-  <w:num w:numId="1523">
-    <w:abstractNumId w:val="993"/>
-  </w:num>
-  <w:num w:numId="1524">
-    <w:abstractNumId w:val="993"/>
-  </w:num>
   <w:num w:numId="1525">
     <w:abstractNumId w:val="993"/>
   </w:num>
@@ -15671,7 +15710,7 @@
     <w:abstractNumId w:val="993"/>
   </w:num>
   <w:num w:numId="1533">
-    <w:abstractNumId w:val="991"/>
+    <w:abstractNumId w:val="993"/>
   </w:num>
   <w:num w:numId="1534">
     <w:abstractNumId w:val="993"/>
@@ -15683,7 +15722,7 @@
     <w:abstractNumId w:val="993"/>
   </w:num>
   <w:num w:numId="1537">
-    <w:abstractNumId w:val="992"/>
+    <w:abstractNumId w:val="991"/>
   </w:num>
   <w:num w:numId="1538">
     <w:abstractNumId w:val="993"/>
@@ -15692,19 +15731,19 @@
     <w:abstractNumId w:val="993"/>
   </w:num>
   <w:num w:numId="1540">
-    <w:abstractNumId w:val="992"/>
+    <w:abstractNumId w:val="993"/>
   </w:num>
   <w:num w:numId="1541">
-    <w:abstractNumId w:val="992"/>
+    <w:abstractNumId w:val="993"/>
   </w:num>
   <w:num w:numId="1542">
-    <w:abstractNumId w:val="993"/>
+    <w:abstractNumId w:val="992"/>
   </w:num>
   <w:num w:numId="1543">
     <w:abstractNumId w:val="992"/>
   </w:num>
   <w:num w:numId="1544">
-    <w:abstractNumId w:val="992"/>
+    <w:abstractNumId w:val="993"/>
   </w:num>
   <w:num w:numId="1545">
     <w:abstractNumId w:val="992"/>
@@ -15719,10 +15758,10 @@
     <w:abstractNumId w:val="992"/>
   </w:num>
   <w:num w:numId="1549">
-    <w:abstractNumId w:val="993"/>
+    <w:abstractNumId w:val="992"/>
   </w:num>
   <w:num w:numId="1550">
-    <w:abstractNumId w:val="993"/>
+    <w:abstractNumId w:val="992"/>
   </w:num>
   <w:num w:numId="1551">
     <w:abstractNumId w:val="993"/>
@@ -15740,37 +15779,37 @@
     <w:abstractNumId w:val="993"/>
   </w:num>
   <w:num w:numId="1556">
-    <w:abstractNumId w:val="992"/>
+    <w:abstractNumId w:val="993"/>
   </w:num>
   <w:num w:numId="1557">
     <w:abstractNumId w:val="993"/>
   </w:num>
   <w:num w:numId="1558">
-    <w:abstractNumId w:val="993"/>
+    <w:abstractNumId w:val="992"/>
   </w:num>
   <w:num w:numId="1559">
     <w:abstractNumId w:val="993"/>
   </w:num>
   <w:num w:numId="1560">
-    <w:abstractNumId w:val="992"/>
+    <w:abstractNumId w:val="993"/>
   </w:num>
   <w:num w:numId="1561">
     <w:abstractNumId w:val="993"/>
   </w:num>
   <w:num w:numId="1562">
-    <w:abstractNumId w:val="993"/>
+    <w:abstractNumId w:val="992"/>
   </w:num>
   <w:num w:numId="1563">
     <w:abstractNumId w:val="993"/>
   </w:num>
   <w:num w:numId="1564">
-    <w:abstractNumId w:val="992"/>
+    <w:abstractNumId w:val="993"/>
   </w:num>
   <w:num w:numId="1565">
     <w:abstractNumId w:val="993"/>
   </w:num>
   <w:num w:numId="1566">
-    <w:abstractNumId w:val="993"/>
+    <w:abstractNumId w:val="992"/>
   </w:num>
   <w:num w:numId="1567">
     <w:abstractNumId w:val="993"/>
@@ -15785,7 +15824,7 @@
     <w:abstractNumId w:val="993"/>
   </w:num>
   <w:num w:numId="1571">
-    <w:abstractNumId w:val="992"/>
+    <w:abstractNumId w:val="993"/>
   </w:num>
   <w:num w:numId="1572">
     <w:abstractNumId w:val="993"/>
@@ -15794,25 +15833,25 @@
     <w:abstractNumId w:val="992"/>
   </w:num>
   <w:num w:numId="1574">
-    <w:abstractNumId w:val="992"/>
+    <w:abstractNumId w:val="993"/>
   </w:num>
   <w:num w:numId="1575">
-    <w:abstractNumId w:val="993"/>
+    <w:abstractNumId w:val="992"/>
   </w:num>
   <w:num w:numId="1576">
-    <w:abstractNumId w:val="993"/>
+    <w:abstractNumId w:val="992"/>
   </w:num>
   <w:num w:numId="1577">
-    <w:abstractNumId w:val="992"/>
+    <w:abstractNumId w:val="993"/>
   </w:num>
   <w:num w:numId="1578">
-    <w:abstractNumId w:val="992"/>
+    <w:abstractNumId w:val="993"/>
   </w:num>
   <w:num w:numId="1579">
-    <w:abstractNumId w:val="992"/>
+    <w:abstractNumId w:val="993"/>
   </w:num>
   <w:num w:numId="1580">
-    <w:abstractNumId w:val="992"/>
+    <w:abstractNumId w:val="993"/>
   </w:num>
   <w:num w:numId="1581">
     <w:abstractNumId w:val="992"/>
@@ -15821,13 +15860,13 @@
     <w:abstractNumId w:val="992"/>
   </w:num>
   <w:num w:numId="1583">
-    <w:abstractNumId w:val="993"/>
+    <w:abstractNumId w:val="992"/>
   </w:num>
   <w:num w:numId="1584">
     <w:abstractNumId w:val="992"/>
   </w:num>
   <w:num w:numId="1585">
-    <w:abstractNumId w:val="992"/>
+    <w:abstractNumId w:val="993"/>
   </w:num>
   <w:num w:numId="1586">
     <w:abstractNumId w:val="992"/>
@@ -15944,6 +15983,12 @@
     <w:abstractNumId w:val="992"/>
   </w:num>
   <w:num w:numId="1624">
+    <w:abstractNumId w:val="992"/>
+  </w:num>
+  <w:num w:numId="1625">
+    <w:abstractNumId w:val="992"/>
+  </w:num>
+  <w:num w:numId="1626">
     <w:abstractNumId w:val="992"/>
   </w:num>
 </w:numbering>

</xml_diff>

<commit_message>
Implement M1.5 contact attempt UI
</commit_message>
<xml_diff>
--- a/MASTER_M1_M2_DELIVERY_CHECKLIST.docx
+++ b/MASTER_M1_M2_DELIVERY_CHECKLIST.docx
@@ -409,7 +409,7 @@
               <w:jc w:val="right"/>
             </w:pPr>
             <w:r>
-              <w:t xml:space="preserve">3%</w:t>
+              <w:t xml:space="preserve">5%</w:t>
             </w:r>
           </w:p>
         </w:tc>
@@ -420,7 +420,7 @@
               <w:pStyle w:val="Compact"/>
             </w:pPr>
             <w:r>
-              <w:t xml:space="preserve">Backend log-attempt foundation + API tests/build passed; UI/reset/pixel pending</w:t>
+              <w:t xml:space="preserve">Backend + Pipeline UI attempt banner/quick-log implemented; browser/reset/pixel pending</w:t>
             </w:r>
           </w:p>
         </w:tc>
@@ -709,7 +709,7 @@
                 <w:b/>
                 <w:bCs/>
               </w:rPr>
-              <w:t xml:space="preserve">60%</w:t>
+              <w:t xml:space="preserve">62%</w:t>
             </w:r>
           </w:p>
         </w:tc>
@@ -724,7 +724,7 @@
                 <w:b/>
                 <w:bCs/>
               </w:rPr>
-              <w:t xml:space="preserve">M1.5 backend attempt mechanic foundation added; UI/browser gates remain</w:t>
+              <w:t xml:space="preserve">M1.5 Pipeline UI attempt controls added; browser/reset/release gates remain</w:t>
             </w:r>
           </w:p>
         </w:tc>
@@ -8502,6 +8502,126 @@
         <w:t xml:space="preserve">Targeted ESLint passed with 0 errors and existing warning debt only.</w:t>
       </w:r>
     </w:p>
+    <w:p>
+      <w:pPr>
+        <w:pStyle w:val="Compact"/>
+        <w:numPr>
+          <w:ilvl w:val="0"/>
+          <w:numId w:val="1343"/>
+        </w:numPr>
+      </w:pPr>
+      <w:r>
+        <w:t xml:space="preserve">Pipeline UI added M1.5 attempt banner on DealCard with</w:t>
+      </w:r>
+      <w:r>
+        <w:t xml:space="preserve"> </w:t>
+      </w:r>
+      <w:r>
+        <w:rPr>
+          <w:rStyle w:val="VerbatimChar"/>
+        </w:rPr>
+        <w:t xml:space="preserve">WAITING X/Y ATTEMPTS · Z BEFORE AUTO-NURTURE</w:t>
+      </w:r>
+      <w:r>
+        <w:t xml:space="preserve"> </w:t>
+      </w:r>
+      <w:r>
+        <w:t xml:space="preserve">copy and low/mid/near-threshold color states.</w:t>
+      </w:r>
+    </w:p>
+    <w:p>
+      <w:pPr>
+        <w:pStyle w:val="Compact"/>
+        <w:numPr>
+          <w:ilvl w:val="0"/>
+          <w:numId w:val="1344"/>
+        </w:numPr>
+      </w:pPr>
+      <w:r>
+        <w:t xml:space="preserve">DealPanel added quick-log row using</w:t>
+      </w:r>
+      <w:r>
+        <w:t xml:space="preserve"> </w:t>
+      </w:r>
+      <w:r>
+        <w:rPr>
+          <w:rStyle w:val="VerbatimChar"/>
+        </w:rPr>
+        <w:t xml:space="preserve">POST /api/deals/:id/log-attempt</w:t>
+      </w:r>
+      <w:r>
+        <w:t xml:space="preserve"> </w:t>
+      </w:r>
+      <w:r>
+        <w:t xml:space="preserve">with No answer/Texted/Voicemail/Connected/Not interested actions.</w:t>
+      </w:r>
+    </w:p>
+    <w:p>
+      <w:pPr>
+        <w:pStyle w:val="Compact"/>
+        <w:numPr>
+          <w:ilvl w:val="0"/>
+          <w:numId w:val="1345"/>
+        </w:numPr>
+      </w:pPr>
+      <w:r>
+        <w:t xml:space="preserve">Client validation passed:</w:t>
+      </w:r>
+      <w:r>
+        <w:t xml:space="preserve"> </w:t>
+      </w:r>
+      <w:r>
+        <w:rPr>
+          <w:rStyle w:val="VerbatimChar"/>
+        </w:rPr>
+        <w:t xml:space="preserve">cd client &amp;&amp; npm run build</w:t>
+      </w:r>
+      <w:r>
+        <w:t xml:space="preserve">.</w:t>
+      </w:r>
+    </w:p>
+    <w:p>
+      <w:pPr>
+        <w:pStyle w:val="Compact"/>
+        <w:numPr>
+          <w:ilvl w:val="0"/>
+          <w:numId w:val="1346"/>
+        </w:numPr>
+      </w:pPr>
+      <w:r>
+        <w:t xml:space="preserve">Targeted ESLint for</w:t>
+      </w:r>
+      <w:r>
+        <w:t xml:space="preserve"> </w:t>
+      </w:r>
+      <w:r>
+        <w:rPr>
+          <w:rStyle w:val="VerbatimChar"/>
+        </w:rPr>
+        <w:t xml:space="preserve">DealPanel.tsx</w:t>
+      </w:r>
+      <w:r>
+        <w:t xml:space="preserve"> </w:t>
+      </w:r>
+      <w:r>
+        <w:t xml:space="preserve">still has pre-existing React Compiler errors around old synchronous</w:t>
+      </w:r>
+      <w:r>
+        <w:t xml:space="preserve"> </w:t>
+      </w:r>
+      <w:r>
+        <w:rPr>
+          <w:rStyle w:val="VerbatimChar"/>
+        </w:rPr>
+        <w:t xml:space="preserve">useEffect</w:t>
+      </w:r>
+      <w:r>
+        <w:t xml:space="preserve"> </w:t>
+      </w:r>
+      <w:r>
+        <w:t xml:space="preserve">state setters/manual memoization; not fixed in this M1.5 UI slice to avoid broad refactor.</w:t>
+      </w:r>
+    </w:p>
     <w:bookmarkEnd w:id="49"/>
     <w:bookmarkStart w:id="50" w:name="data-and-backend"/>
     <w:p>
@@ -8517,7 +8637,7 @@
         <w:pStyle w:val="Compact"/>
         <w:numPr>
           <w:ilvl w:val="0"/>
-          <w:numId w:val="1343"/>
+          <w:numId w:val="1347"/>
         </w:numPr>
       </w:pPr>
       <w:r>
@@ -8556,7 +8676,7 @@
         <w:pStyle w:val="Compact"/>
         <w:numPr>
           <w:ilvl w:val="0"/>
-          <w:numId w:val="1344"/>
+          <w:numId w:val="1348"/>
         </w:numPr>
       </w:pPr>
       <w:r>
@@ -8595,7 +8715,7 @@
         <w:pStyle w:val="Compact"/>
         <w:numPr>
           <w:ilvl w:val="0"/>
-          <w:numId w:val="1345"/>
+          <w:numId w:val="1349"/>
         </w:numPr>
       </w:pPr>
       <w:r>
@@ -8619,7 +8739,7 @@
         <w:pStyle w:val="Compact"/>
         <w:numPr>
           <w:ilvl w:val="0"/>
-          <w:numId w:val="1346"/>
+          <w:numId w:val="1350"/>
         </w:numPr>
       </w:pPr>
       <w:r>
@@ -8676,7 +8796,7 @@
         <w:pStyle w:val="Compact"/>
         <w:numPr>
           <w:ilvl w:val="0"/>
-          <w:numId w:val="1347"/>
+          <w:numId w:val="1351"/>
         </w:numPr>
       </w:pPr>
       <w:r>
@@ -8700,7 +8820,7 @@
         <w:pStyle w:val="Compact"/>
         <w:numPr>
           <w:ilvl w:val="0"/>
-          <w:numId w:val="1348"/>
+          <w:numId w:val="1352"/>
         </w:numPr>
       </w:pPr>
       <w:r>
@@ -8712,7 +8832,7 @@
         <w:pStyle w:val="Compact"/>
         <w:numPr>
           <w:ilvl w:val="1"/>
-          <w:numId w:val="1349"/>
+          <w:numId w:val="1353"/>
         </w:numPr>
       </w:pPr>
       <w:r>
@@ -8724,7 +8844,7 @@
         <w:pStyle w:val="Compact"/>
         <w:numPr>
           <w:ilvl w:val="1"/>
-          <w:numId w:val="1349"/>
+          <w:numId w:val="1353"/>
         </w:numPr>
       </w:pPr>
       <w:r>
@@ -8736,7 +8856,7 @@
         <w:pStyle w:val="Compact"/>
         <w:numPr>
           <w:ilvl w:val="1"/>
-          <w:numId w:val="1349"/>
+          <w:numId w:val="1353"/>
         </w:numPr>
       </w:pPr>
       <w:r>
@@ -8748,7 +8868,7 @@
         <w:pStyle w:val="Compact"/>
         <w:numPr>
           <w:ilvl w:val="1"/>
-          <w:numId w:val="1349"/>
+          <w:numId w:val="1353"/>
         </w:numPr>
       </w:pPr>
       <w:r>
@@ -8760,7 +8880,7 @@
         <w:pStyle w:val="Compact"/>
         <w:numPr>
           <w:ilvl w:val="1"/>
-          <w:numId w:val="1349"/>
+          <w:numId w:val="1353"/>
         </w:numPr>
       </w:pPr>
       <w:r>
@@ -8772,7 +8892,7 @@
         <w:pStyle w:val="Compact"/>
         <w:numPr>
           <w:ilvl w:val="0"/>
-          <w:numId w:val="1350"/>
+          <w:numId w:val="1354"/>
         </w:numPr>
       </w:pPr>
       <w:r>
@@ -8817,7 +8937,7 @@
         <w:pStyle w:val="Compact"/>
         <w:numPr>
           <w:ilvl w:val="0"/>
-          <w:numId w:val="1351"/>
+          <w:numId w:val="1355"/>
         </w:numPr>
       </w:pPr>
       <w:r>
@@ -8850,7 +8970,7 @@
         <w:pStyle w:val="Compact"/>
         <w:numPr>
           <w:ilvl w:val="0"/>
-          <w:numId w:val="1352"/>
+          <w:numId w:val="1356"/>
         </w:numPr>
       </w:pPr>
       <w:r>
@@ -8883,7 +9003,7 @@
         <w:pStyle w:val="Compact"/>
         <w:numPr>
           <w:ilvl w:val="0"/>
-          <w:numId w:val="1353"/>
+          <w:numId w:val="1357"/>
         </w:numPr>
       </w:pPr>
       <w:r>
@@ -8910,7 +9030,7 @@
         <w:pStyle w:val="Compact"/>
         <w:numPr>
           <w:ilvl w:val="0"/>
-          <w:numId w:val="1354"/>
+          <w:numId w:val="1358"/>
         </w:numPr>
       </w:pPr>
       <w:r>
@@ -8922,7 +9042,7 @@
         <w:pStyle w:val="Compact"/>
         <w:numPr>
           <w:ilvl w:val="0"/>
-          <w:numId w:val="1355"/>
+          <w:numId w:val="1359"/>
         </w:numPr>
       </w:pPr>
       <w:r>
@@ -8934,7 +9054,7 @@
         <w:pStyle w:val="Compact"/>
         <w:numPr>
           <w:ilvl w:val="0"/>
-          <w:numId w:val="1356"/>
+          <w:numId w:val="1360"/>
         </w:numPr>
       </w:pPr>
       <w:r>
@@ -8946,7 +9066,7 @@
         <w:pStyle w:val="Compact"/>
         <w:numPr>
           <w:ilvl w:val="0"/>
-          <w:numId w:val="1357"/>
+          <w:numId w:val="1361"/>
         </w:numPr>
       </w:pPr>
       <w:r>
@@ -8958,7 +9078,7 @@
         <w:pStyle w:val="Compact"/>
         <w:numPr>
           <w:ilvl w:val="0"/>
-          <w:numId w:val="1358"/>
+          <w:numId w:val="1362"/>
         </w:numPr>
       </w:pPr>
       <w:r>
@@ -8985,7 +9105,7 @@
         <w:pStyle w:val="Compact"/>
         <w:numPr>
           <w:ilvl w:val="0"/>
-          <w:numId w:val="1359"/>
+          <w:numId w:val="1363"/>
         </w:numPr>
       </w:pPr>
       <w:r>
@@ -9007,7 +9127,7 @@
         <w:pStyle w:val="Compact"/>
         <w:numPr>
           <w:ilvl w:val="0"/>
-          <w:numId w:val="1360"/>
+          <w:numId w:val="1364"/>
         </w:numPr>
       </w:pPr>
       <w:r>
@@ -9019,7 +9139,7 @@
         <w:pStyle w:val="Compact"/>
         <w:numPr>
           <w:ilvl w:val="0"/>
-          <w:numId w:val="1361"/>
+          <w:numId w:val="1365"/>
         </w:numPr>
       </w:pPr>
       <w:r>
@@ -9031,7 +9151,7 @@
         <w:pStyle w:val="Compact"/>
         <w:numPr>
           <w:ilvl w:val="0"/>
-          <w:numId w:val="1362"/>
+          <w:numId w:val="1366"/>
         </w:numPr>
       </w:pPr>
       <w:r>
@@ -9043,7 +9163,7 @@
         <w:pStyle w:val="Compact"/>
         <w:numPr>
           <w:ilvl w:val="0"/>
-          <w:numId w:val="1363"/>
+          <w:numId w:val="1367"/>
         </w:numPr>
       </w:pPr>
       <w:r>
@@ -9067,7 +9187,7 @@
         <w:pStyle w:val="Compact"/>
         <w:numPr>
           <w:ilvl w:val="0"/>
-          <w:numId w:val="1364"/>
+          <w:numId w:val="1368"/>
         </w:numPr>
       </w:pPr>
       <w:r>
@@ -9079,7 +9199,7 @@
         <w:pStyle w:val="Compact"/>
         <w:numPr>
           <w:ilvl w:val="1"/>
-          <w:numId w:val="1365"/>
+          <w:numId w:val="1369"/>
         </w:numPr>
       </w:pPr>
       <w:r>
@@ -9091,7 +9211,7 @@
         <w:pStyle w:val="Compact"/>
         <w:numPr>
           <w:ilvl w:val="1"/>
-          <w:numId w:val="1365"/>
+          <w:numId w:val="1369"/>
         </w:numPr>
       </w:pPr>
       <w:r>
@@ -9103,7 +9223,7 @@
         <w:pStyle w:val="Compact"/>
         <w:numPr>
           <w:ilvl w:val="1"/>
-          <w:numId w:val="1365"/>
+          <w:numId w:val="1369"/>
         </w:numPr>
       </w:pPr>
       <w:r>
@@ -9115,7 +9235,7 @@
         <w:pStyle w:val="Compact"/>
         <w:numPr>
           <w:ilvl w:val="0"/>
-          <w:numId w:val="1366"/>
+          <w:numId w:val="1370"/>
         </w:numPr>
       </w:pPr>
       <w:r>
@@ -9157,7 +9277,7 @@
         <w:pStyle w:val="Compact"/>
         <w:numPr>
           <w:ilvl w:val="0"/>
-          <w:numId w:val="1367"/>
+          <w:numId w:val="1371"/>
         </w:numPr>
       </w:pPr>
       <w:r>
@@ -9209,7 +9329,7 @@
         <w:pStyle w:val="Compact"/>
         <w:numPr>
           <w:ilvl w:val="0"/>
-          <w:numId w:val="1368"/>
+          <w:numId w:val="1372"/>
         </w:numPr>
       </w:pPr>
       <w:r>
@@ -9221,7 +9341,7 @@
         <w:pStyle w:val="Compact"/>
         <w:numPr>
           <w:ilvl w:val="0"/>
-          <w:numId w:val="1369"/>
+          <w:numId w:val="1373"/>
         </w:numPr>
       </w:pPr>
       <w:r>
@@ -9233,7 +9353,7 @@
         <w:pStyle w:val="Compact"/>
         <w:numPr>
           <w:ilvl w:val="0"/>
-          <w:numId w:val="1370"/>
+          <w:numId w:val="1374"/>
         </w:numPr>
       </w:pPr>
       <w:r>
@@ -9245,7 +9365,7 @@
         <w:pStyle w:val="Compact"/>
         <w:numPr>
           <w:ilvl w:val="0"/>
-          <w:numId w:val="1371"/>
+          <w:numId w:val="1375"/>
         </w:numPr>
       </w:pPr>
       <w:r>
@@ -9257,7 +9377,7 @@
         <w:pStyle w:val="Compact"/>
         <w:numPr>
           <w:ilvl w:val="0"/>
-          <w:numId w:val="1372"/>
+          <w:numId w:val="1376"/>
         </w:numPr>
       </w:pPr>
       <w:r>
@@ -9269,7 +9389,7 @@
         <w:pStyle w:val="Compact"/>
         <w:numPr>
           <w:ilvl w:val="0"/>
-          <w:numId w:val="1373"/>
+          <w:numId w:val="1377"/>
         </w:numPr>
       </w:pPr>
       <w:r>
@@ -9281,7 +9401,7 @@
         <w:pStyle w:val="Compact"/>
         <w:numPr>
           <w:ilvl w:val="0"/>
-          <w:numId w:val="1374"/>
+          <w:numId w:val="1378"/>
         </w:numPr>
       </w:pPr>
       <w:r>
@@ -9293,7 +9413,7 @@
         <w:pStyle w:val="Compact"/>
         <w:numPr>
           <w:ilvl w:val="0"/>
-          <w:numId w:val="1375"/>
+          <w:numId w:val="1379"/>
         </w:numPr>
       </w:pPr>
       <w:r>
@@ -9305,7 +9425,7 @@
         <w:pStyle w:val="Compact"/>
         <w:numPr>
           <w:ilvl w:val="0"/>
-          <w:numId w:val="1376"/>
+          <w:numId w:val="1380"/>
         </w:numPr>
       </w:pPr>
       <w:r>
@@ -9337,7 +9457,7 @@
         <w:pStyle w:val="Compact"/>
         <w:numPr>
           <w:ilvl w:val="0"/>
-          <w:numId w:val="1377"/>
+          <w:numId w:val="1381"/>
         </w:numPr>
       </w:pPr>
       <w:r>
@@ -9349,7 +9469,7 @@
         <w:pStyle w:val="Compact"/>
         <w:numPr>
           <w:ilvl w:val="0"/>
-          <w:numId w:val="1378"/>
+          <w:numId w:val="1382"/>
         </w:numPr>
       </w:pPr>
       <w:r>
@@ -9361,7 +9481,7 @@
         <w:pStyle w:val="Compact"/>
         <w:numPr>
           <w:ilvl w:val="0"/>
-          <w:numId w:val="1379"/>
+          <w:numId w:val="1383"/>
         </w:numPr>
       </w:pPr>
       <w:r>
@@ -9373,7 +9493,7 @@
         <w:pStyle w:val="Compact"/>
         <w:numPr>
           <w:ilvl w:val="0"/>
-          <w:numId w:val="1380"/>
+          <w:numId w:val="1384"/>
         </w:numPr>
       </w:pPr>
       <w:r>
@@ -9385,7 +9505,7 @@
         <w:pStyle w:val="Compact"/>
         <w:numPr>
           <w:ilvl w:val="0"/>
-          <w:numId w:val="1381"/>
+          <w:numId w:val="1385"/>
         </w:numPr>
       </w:pPr>
       <w:r>
@@ -9397,7 +9517,7 @@
         <w:pStyle w:val="Compact"/>
         <w:numPr>
           <w:ilvl w:val="0"/>
-          <w:numId w:val="1382"/>
+          <w:numId w:val="1386"/>
         </w:numPr>
       </w:pPr>
       <w:r>
@@ -9409,7 +9529,7 @@
         <w:pStyle w:val="Compact"/>
         <w:numPr>
           <w:ilvl w:val="0"/>
-          <w:numId w:val="1383"/>
+          <w:numId w:val="1387"/>
         </w:numPr>
       </w:pPr>
       <w:r>
@@ -9421,7 +9541,7 @@
         <w:pStyle w:val="Compact"/>
         <w:numPr>
           <w:ilvl w:val="0"/>
-          <w:numId w:val="1384"/>
+          <w:numId w:val="1388"/>
         </w:numPr>
       </w:pPr>
       <w:r>
@@ -9433,7 +9553,7 @@
         <w:pStyle w:val="Compact"/>
         <w:numPr>
           <w:ilvl w:val="0"/>
-          <w:numId w:val="1385"/>
+          <w:numId w:val="1389"/>
         </w:numPr>
       </w:pPr>
       <w:r>
@@ -9445,7 +9565,7 @@
         <w:pStyle w:val="Compact"/>
         <w:numPr>
           <w:ilvl w:val="0"/>
-          <w:numId w:val="1386"/>
+          <w:numId w:val="1390"/>
         </w:numPr>
       </w:pPr>
       <w:r>
@@ -9457,7 +9577,7 @@
         <w:pStyle w:val="Compact"/>
         <w:numPr>
           <w:ilvl w:val="0"/>
-          <w:numId w:val="1387"/>
+          <w:numId w:val="1391"/>
         </w:numPr>
       </w:pPr>
       <w:r>
@@ -9469,7 +9589,7 @@
         <w:pStyle w:val="Compact"/>
         <w:numPr>
           <w:ilvl w:val="0"/>
-          <w:numId w:val="1388"/>
+          <w:numId w:val="1392"/>
         </w:numPr>
       </w:pPr>
       <w:r>
@@ -9481,7 +9601,7 @@
         <w:pStyle w:val="Compact"/>
         <w:numPr>
           <w:ilvl w:val="0"/>
-          <w:numId w:val="1389"/>
+          <w:numId w:val="1393"/>
         </w:numPr>
       </w:pPr>
       <w:r>
@@ -9493,7 +9613,7 @@
         <w:pStyle w:val="Compact"/>
         <w:numPr>
           <w:ilvl w:val="0"/>
-          <w:numId w:val="1390"/>
+          <w:numId w:val="1394"/>
         </w:numPr>
       </w:pPr>
       <w:r>
@@ -9505,7 +9625,7 @@
         <w:pStyle w:val="Compact"/>
         <w:numPr>
           <w:ilvl w:val="0"/>
-          <w:numId w:val="1391"/>
+          <w:numId w:val="1395"/>
         </w:numPr>
       </w:pPr>
       <w:r>
@@ -9527,7 +9647,7 @@
         <w:pStyle w:val="Compact"/>
         <w:numPr>
           <w:ilvl w:val="0"/>
-          <w:numId w:val="1392"/>
+          <w:numId w:val="1396"/>
         </w:numPr>
       </w:pPr>
       <w:r>
@@ -9539,7 +9659,7 @@
         <w:pStyle w:val="Compact"/>
         <w:numPr>
           <w:ilvl w:val="0"/>
-          <w:numId w:val="1393"/>
+          <w:numId w:val="1397"/>
         </w:numPr>
       </w:pPr>
       <w:r>
@@ -9551,7 +9671,7 @@
         <w:pStyle w:val="Compact"/>
         <w:numPr>
           <w:ilvl w:val="0"/>
-          <w:numId w:val="1394"/>
+          <w:numId w:val="1398"/>
         </w:numPr>
       </w:pPr>
       <w:r>
@@ -9563,7 +9683,7 @@
         <w:pStyle w:val="Compact"/>
         <w:numPr>
           <w:ilvl w:val="0"/>
-          <w:numId w:val="1395"/>
+          <w:numId w:val="1399"/>
         </w:numPr>
       </w:pPr>
       <w:r>
@@ -9575,7 +9695,7 @@
         <w:pStyle w:val="Compact"/>
         <w:numPr>
           <w:ilvl w:val="0"/>
-          <w:numId w:val="1396"/>
+          <w:numId w:val="1400"/>
         </w:numPr>
       </w:pPr>
       <w:r>
@@ -9587,7 +9707,7 @@
         <w:pStyle w:val="Compact"/>
         <w:numPr>
           <w:ilvl w:val="0"/>
-          <w:numId w:val="1397"/>
+          <w:numId w:val="1401"/>
         </w:numPr>
       </w:pPr>
       <w:r>
@@ -9599,7 +9719,7 @@
         <w:pStyle w:val="Compact"/>
         <w:numPr>
           <w:ilvl w:val="0"/>
-          <w:numId w:val="1398"/>
+          <w:numId w:val="1402"/>
         </w:numPr>
       </w:pPr>
       <w:r>
@@ -9621,7 +9741,7 @@
         <w:pStyle w:val="Compact"/>
         <w:numPr>
           <w:ilvl w:val="0"/>
-          <w:numId w:val="1399"/>
+          <w:numId w:val="1403"/>
         </w:numPr>
       </w:pPr>
       <w:r>
@@ -9633,7 +9753,7 @@
         <w:pStyle w:val="Compact"/>
         <w:numPr>
           <w:ilvl w:val="0"/>
-          <w:numId w:val="1400"/>
+          <w:numId w:val="1404"/>
         </w:numPr>
       </w:pPr>
       <w:r>
@@ -9645,7 +9765,7 @@
         <w:pStyle w:val="Compact"/>
         <w:numPr>
           <w:ilvl w:val="0"/>
-          <w:numId w:val="1401"/>
+          <w:numId w:val="1405"/>
         </w:numPr>
       </w:pPr>
       <w:r>
@@ -9657,7 +9777,7 @@
         <w:pStyle w:val="Compact"/>
         <w:numPr>
           <w:ilvl w:val="0"/>
-          <w:numId w:val="1402"/>
+          <w:numId w:val="1406"/>
         </w:numPr>
       </w:pPr>
       <w:r>
@@ -9669,7 +9789,7 @@
         <w:pStyle w:val="Compact"/>
         <w:numPr>
           <w:ilvl w:val="0"/>
-          <w:numId w:val="1403"/>
+          <w:numId w:val="1407"/>
         </w:numPr>
       </w:pPr>
       <w:r>
@@ -9681,7 +9801,7 @@
         <w:pStyle w:val="Compact"/>
         <w:numPr>
           <w:ilvl w:val="0"/>
-          <w:numId w:val="1404"/>
+          <w:numId w:val="1408"/>
         </w:numPr>
       </w:pPr>
       <w:r>
@@ -9693,7 +9813,7 @@
         <w:pStyle w:val="Compact"/>
         <w:numPr>
           <w:ilvl w:val="0"/>
-          <w:numId w:val="1405"/>
+          <w:numId w:val="1409"/>
         </w:numPr>
       </w:pPr>
       <w:r>
@@ -9725,7 +9845,7 @@
         <w:pStyle w:val="Compact"/>
         <w:numPr>
           <w:ilvl w:val="0"/>
-          <w:numId w:val="1406"/>
+          <w:numId w:val="1410"/>
         </w:numPr>
       </w:pPr>
       <w:r>
@@ -9797,7 +9917,7 @@
         <w:pStyle w:val="Compact"/>
         <w:numPr>
           <w:ilvl w:val="0"/>
-          <w:numId w:val="1407"/>
+          <w:numId w:val="1411"/>
         </w:numPr>
       </w:pPr>
       <w:r>
@@ -9809,7 +9929,7 @@
         <w:pStyle w:val="Compact"/>
         <w:numPr>
           <w:ilvl w:val="0"/>
-          <w:numId w:val="1408"/>
+          <w:numId w:val="1412"/>
         </w:numPr>
       </w:pPr>
       <w:r>
@@ -9836,7 +9956,7 @@
         <w:pStyle w:val="Compact"/>
         <w:numPr>
           <w:ilvl w:val="0"/>
-          <w:numId w:val="1409"/>
+          <w:numId w:val="1413"/>
         </w:numPr>
       </w:pPr>
       <w:r>
@@ -9890,7 +10010,7 @@
         <w:pStyle w:val="Compact"/>
         <w:numPr>
           <w:ilvl w:val="0"/>
-          <w:numId w:val="1410"/>
+          <w:numId w:val="1414"/>
         </w:numPr>
       </w:pPr>
       <w:r>
@@ -9902,7 +10022,7 @@
         <w:pStyle w:val="Compact"/>
         <w:numPr>
           <w:ilvl w:val="0"/>
-          <w:numId w:val="1411"/>
+          <w:numId w:val="1415"/>
         </w:numPr>
       </w:pPr>
       <w:r>
@@ -9924,7 +10044,7 @@
         <w:pStyle w:val="Compact"/>
         <w:numPr>
           <w:ilvl w:val="0"/>
-          <w:numId w:val="1412"/>
+          <w:numId w:val="1416"/>
         </w:numPr>
       </w:pPr>
       <w:r>
@@ -9975,7 +10095,7 @@
         <w:pStyle w:val="Compact"/>
         <w:numPr>
           <w:ilvl w:val="0"/>
-          <w:numId w:val="1413"/>
+          <w:numId w:val="1417"/>
         </w:numPr>
       </w:pPr>
       <w:r>
@@ -10002,7 +10122,7 @@
         <w:pStyle w:val="Compact"/>
         <w:numPr>
           <w:ilvl w:val="0"/>
-          <w:numId w:val="1414"/>
+          <w:numId w:val="1418"/>
         </w:numPr>
       </w:pPr>
       <w:r>
@@ -10014,7 +10134,7 @@
         <w:pStyle w:val="Compact"/>
         <w:numPr>
           <w:ilvl w:val="0"/>
-          <w:numId w:val="1415"/>
+          <w:numId w:val="1419"/>
         </w:numPr>
       </w:pPr>
       <w:r>
@@ -10041,7 +10161,7 @@
         <w:pStyle w:val="Compact"/>
         <w:numPr>
           <w:ilvl w:val="0"/>
-          <w:numId w:val="1416"/>
+          <w:numId w:val="1420"/>
         </w:numPr>
       </w:pPr>
       <w:r>
@@ -10053,7 +10173,7 @@
         <w:pStyle w:val="Compact"/>
         <w:numPr>
           <w:ilvl w:val="0"/>
-          <w:numId w:val="1417"/>
+          <w:numId w:val="1421"/>
         </w:numPr>
       </w:pPr>
       <w:r>
@@ -10065,7 +10185,7 @@
         <w:pStyle w:val="Compact"/>
         <w:numPr>
           <w:ilvl w:val="0"/>
-          <w:numId w:val="1418"/>
+          <w:numId w:val="1422"/>
         </w:numPr>
       </w:pPr>
       <w:r>
@@ -10087,7 +10207,7 @@
         <w:pStyle w:val="Compact"/>
         <w:numPr>
           <w:ilvl w:val="0"/>
-          <w:numId w:val="1419"/>
+          <w:numId w:val="1423"/>
         </w:numPr>
       </w:pPr>
       <w:r>
@@ -10111,7 +10231,7 @@
         <w:pStyle w:val="Compact"/>
         <w:numPr>
           <w:ilvl w:val="0"/>
-          <w:numId w:val="1420"/>
+          <w:numId w:val="1424"/>
         </w:numPr>
       </w:pPr>
       <w:r>
@@ -10135,7 +10255,7 @@
         <w:pStyle w:val="Compact"/>
         <w:numPr>
           <w:ilvl w:val="0"/>
-          <w:numId w:val="1421"/>
+          <w:numId w:val="1425"/>
         </w:numPr>
       </w:pPr>
       <w:r>
@@ -10147,7 +10267,7 @@
         <w:pStyle w:val="Compact"/>
         <w:numPr>
           <w:ilvl w:val="0"/>
-          <w:numId w:val="1422"/>
+          <w:numId w:val="1426"/>
         </w:numPr>
       </w:pPr>
       <w:r>
@@ -10159,7 +10279,7 @@
         <w:pStyle w:val="Compact"/>
         <w:numPr>
           <w:ilvl w:val="0"/>
-          <w:numId w:val="1423"/>
+          <w:numId w:val="1427"/>
         </w:numPr>
       </w:pPr>
       <w:r>
@@ -10171,7 +10291,7 @@
         <w:pStyle w:val="Compact"/>
         <w:numPr>
           <w:ilvl w:val="0"/>
-          <w:numId w:val="1424"/>
+          <w:numId w:val="1428"/>
         </w:numPr>
       </w:pPr>
       <w:r>
@@ -10202,7 +10322,7 @@
         <w:pStyle w:val="Compact"/>
         <w:numPr>
           <w:ilvl w:val="0"/>
-          <w:numId w:val="1425"/>
+          <w:numId w:val="1429"/>
         </w:numPr>
       </w:pPr>
       <w:r>
@@ -10214,7 +10334,7 @@
         <w:pStyle w:val="Compact"/>
         <w:numPr>
           <w:ilvl w:val="0"/>
-          <w:numId w:val="1426"/>
+          <w:numId w:val="1430"/>
         </w:numPr>
       </w:pPr>
       <w:r>
@@ -10226,7 +10346,7 @@
         <w:pStyle w:val="Compact"/>
         <w:numPr>
           <w:ilvl w:val="1"/>
-          <w:numId w:val="1427"/>
+          <w:numId w:val="1431"/>
         </w:numPr>
       </w:pPr>
       <w:r>
@@ -10244,7 +10364,7 @@
         <w:pStyle w:val="Compact"/>
         <w:numPr>
           <w:ilvl w:val="1"/>
-          <w:numId w:val="1427"/>
+          <w:numId w:val="1431"/>
         </w:numPr>
       </w:pPr>
       <w:r>
@@ -10262,7 +10382,7 @@
         <w:pStyle w:val="Compact"/>
         <w:numPr>
           <w:ilvl w:val="1"/>
-          <w:numId w:val="1427"/>
+          <w:numId w:val="1431"/>
         </w:numPr>
       </w:pPr>
       <w:r>
@@ -10280,7 +10400,7 @@
         <w:pStyle w:val="Compact"/>
         <w:numPr>
           <w:ilvl w:val="1"/>
-          <w:numId w:val="1427"/>
+          <w:numId w:val="1431"/>
         </w:numPr>
       </w:pPr>
       <w:r>
@@ -10298,7 +10418,7 @@
         <w:pStyle w:val="Compact"/>
         <w:numPr>
           <w:ilvl w:val="0"/>
-          <w:numId w:val="1428"/>
+          <w:numId w:val="1432"/>
         </w:numPr>
       </w:pPr>
       <w:r>
@@ -10310,7 +10430,7 @@
         <w:pStyle w:val="Compact"/>
         <w:numPr>
           <w:ilvl w:val="0"/>
-          <w:numId w:val="1429"/>
+          <w:numId w:val="1433"/>
         </w:numPr>
       </w:pPr>
       <w:r>
@@ -10322,7 +10442,7 @@
         <w:pStyle w:val="Compact"/>
         <w:numPr>
           <w:ilvl w:val="0"/>
-          <w:numId w:val="1430"/>
+          <w:numId w:val="1434"/>
         </w:numPr>
       </w:pPr>
       <w:r>
@@ -10344,7 +10464,7 @@
         <w:pStyle w:val="Compact"/>
         <w:numPr>
           <w:ilvl w:val="0"/>
-          <w:numId w:val="1431"/>
+          <w:numId w:val="1435"/>
         </w:numPr>
       </w:pPr>
       <w:r>
@@ -10356,7 +10476,7 @@
         <w:pStyle w:val="Compact"/>
         <w:numPr>
           <w:ilvl w:val="0"/>
-          <w:numId w:val="1432"/>
+          <w:numId w:val="1436"/>
         </w:numPr>
       </w:pPr>
       <w:r>
@@ -10368,7 +10488,7 @@
         <w:pStyle w:val="Compact"/>
         <w:numPr>
           <w:ilvl w:val="0"/>
-          <w:numId w:val="1433"/>
+          <w:numId w:val="1437"/>
         </w:numPr>
       </w:pPr>
       <w:r>
@@ -10380,7 +10500,7 @@
         <w:pStyle w:val="Compact"/>
         <w:numPr>
           <w:ilvl w:val="0"/>
-          <w:numId w:val="1434"/>
+          <w:numId w:val="1438"/>
         </w:numPr>
       </w:pPr>
       <w:r>
@@ -10392,7 +10512,7 @@
         <w:pStyle w:val="Compact"/>
         <w:numPr>
           <w:ilvl w:val="0"/>
-          <w:numId w:val="1435"/>
+          <w:numId w:val="1439"/>
         </w:numPr>
       </w:pPr>
       <w:r>
@@ -10404,7 +10524,7 @@
         <w:pStyle w:val="Compact"/>
         <w:numPr>
           <w:ilvl w:val="0"/>
-          <w:numId w:val="1436"/>
+          <w:numId w:val="1440"/>
         </w:numPr>
       </w:pPr>
       <w:r>
@@ -10416,7 +10536,7 @@
         <w:pStyle w:val="Compact"/>
         <w:numPr>
           <w:ilvl w:val="0"/>
-          <w:numId w:val="1437"/>
+          <w:numId w:val="1441"/>
         </w:numPr>
       </w:pPr>
       <w:r>
@@ -10428,7 +10548,7 @@
         <w:pStyle w:val="Compact"/>
         <w:numPr>
           <w:ilvl w:val="0"/>
-          <w:numId w:val="1438"/>
+          <w:numId w:val="1442"/>
         </w:numPr>
       </w:pPr>
       <w:r>
@@ -10440,7 +10560,7 @@
         <w:pStyle w:val="Compact"/>
         <w:numPr>
           <w:ilvl w:val="0"/>
-          <w:numId w:val="1439"/>
+          <w:numId w:val="1443"/>
         </w:numPr>
       </w:pPr>
       <w:r>
@@ -10472,7 +10592,7 @@
         <w:pStyle w:val="Compact"/>
         <w:numPr>
           <w:ilvl w:val="0"/>
-          <w:numId w:val="1440"/>
+          <w:numId w:val="1444"/>
         </w:numPr>
       </w:pPr>
       <w:r>
@@ -10499,7 +10619,7 @@
         <w:pStyle w:val="Compact"/>
         <w:numPr>
           <w:ilvl w:val="0"/>
-          <w:numId w:val="1441"/>
+          <w:numId w:val="1445"/>
         </w:numPr>
       </w:pPr>
       <w:r>
@@ -10571,7 +10691,7 @@
         <w:pStyle w:val="Compact"/>
         <w:numPr>
           <w:ilvl w:val="0"/>
-          <w:numId w:val="1442"/>
+          <w:numId w:val="1446"/>
         </w:numPr>
       </w:pPr>
       <w:r>
@@ -10598,7 +10718,7 @@
         <w:pStyle w:val="Compact"/>
         <w:numPr>
           <w:ilvl w:val="0"/>
-          <w:numId w:val="1443"/>
+          <w:numId w:val="1447"/>
         </w:numPr>
       </w:pPr>
       <w:r>
@@ -10610,7 +10730,7 @@
         <w:pStyle w:val="Compact"/>
         <w:numPr>
           <w:ilvl w:val="0"/>
-          <w:numId w:val="1444"/>
+          <w:numId w:val="1448"/>
         </w:numPr>
       </w:pPr>
       <w:r>
@@ -10637,7 +10757,7 @@
         <w:pStyle w:val="Compact"/>
         <w:numPr>
           <w:ilvl w:val="0"/>
-          <w:numId w:val="1445"/>
+          <w:numId w:val="1449"/>
         </w:numPr>
       </w:pPr>
       <w:r>
@@ -10649,7 +10769,7 @@
         <w:pStyle w:val="Compact"/>
         <w:numPr>
           <w:ilvl w:val="0"/>
-          <w:numId w:val="1446"/>
+          <w:numId w:val="1450"/>
         </w:numPr>
       </w:pPr>
       <w:r>
@@ -10676,7 +10796,7 @@
         <w:pStyle w:val="Compact"/>
         <w:numPr>
           <w:ilvl w:val="0"/>
-          <w:numId w:val="1447"/>
+          <w:numId w:val="1451"/>
         </w:numPr>
       </w:pPr>
       <w:r>
@@ -10718,7 +10838,7 @@
         <w:pStyle w:val="Compact"/>
         <w:numPr>
           <w:ilvl w:val="0"/>
-          <w:numId w:val="1448"/>
+          <w:numId w:val="1452"/>
         </w:numPr>
       </w:pPr>
       <w:r>
@@ -10754,7 +10874,7 @@
         <w:pStyle w:val="Compact"/>
         <w:numPr>
           <w:ilvl w:val="0"/>
-          <w:numId w:val="1449"/>
+          <w:numId w:val="1453"/>
         </w:numPr>
       </w:pPr>
       <w:r>
@@ -10776,7 +10896,7 @@
         <w:pStyle w:val="Compact"/>
         <w:numPr>
           <w:ilvl w:val="0"/>
-          <w:numId w:val="1450"/>
+          <w:numId w:val="1454"/>
         </w:numPr>
       </w:pPr>
       <w:r>
@@ -10788,164 +10908,11 @@
         <w:pStyle w:val="Compact"/>
         <w:numPr>
           <w:ilvl w:val="0"/>
-          <w:numId w:val="1451"/>
+          <w:numId w:val="1455"/>
         </w:numPr>
       </w:pPr>
       <w:r>
         <w:t xml:space="preserve">Columns match prototype order:</w:t>
-      </w:r>
-    </w:p>
-    <w:p>
-      <w:pPr>
-        <w:pStyle w:val="Compact"/>
-        <w:numPr>
-          <w:ilvl w:val="1"/>
-          <w:numId w:val="1452"/>
-        </w:numPr>
-      </w:pPr>
-      <w:r>
-        <w:t xml:space="preserve">Name;</w:t>
-      </w:r>
-    </w:p>
-    <w:p>
-      <w:pPr>
-        <w:pStyle w:val="Compact"/>
-        <w:numPr>
-          <w:ilvl w:val="1"/>
-          <w:numId w:val="1452"/>
-        </w:numPr>
-      </w:pPr>
-      <w:r>
-        <w:t xml:space="preserve">Phone;</w:t>
-      </w:r>
-    </w:p>
-    <w:p>
-      <w:pPr>
-        <w:pStyle w:val="Compact"/>
-        <w:numPr>
-          <w:ilvl w:val="1"/>
-          <w:numId w:val="1452"/>
-        </w:numPr>
-      </w:pPr>
-      <w:r>
-        <w:t xml:space="preserve">Status;</w:t>
-      </w:r>
-    </w:p>
-    <w:p>
-      <w:pPr>
-        <w:pStyle w:val="Compact"/>
-        <w:numPr>
-          <w:ilvl w:val="1"/>
-          <w:numId w:val="1452"/>
-        </w:numPr>
-      </w:pPr>
-      <w:r>
-        <w:t xml:space="preserve">Last Contact;</w:t>
-      </w:r>
-    </w:p>
-    <w:p>
-      <w:pPr>
-        <w:pStyle w:val="Compact"/>
-        <w:numPr>
-          <w:ilvl w:val="1"/>
-          <w:numId w:val="1452"/>
-        </w:numPr>
-      </w:pPr>
-      <w:r>
-        <w:t xml:space="preserve">Industry;</w:t>
-      </w:r>
-    </w:p>
-    <w:p>
-      <w:pPr>
-        <w:pStyle w:val="Compact"/>
-        <w:numPr>
-          <w:ilvl w:val="1"/>
-          <w:numId w:val="1452"/>
-        </w:numPr>
-      </w:pPr>
-      <w:r>
-        <w:t xml:space="preserve">Monthly Revenue;</w:t>
-      </w:r>
-    </w:p>
-    <w:p>
-      <w:pPr>
-        <w:pStyle w:val="Compact"/>
-        <w:numPr>
-          <w:ilvl w:val="1"/>
-          <w:numId w:val="1452"/>
-        </w:numPr>
-      </w:pPr>
-      <w:r>
-        <w:t xml:space="preserve">Source;</w:t>
-      </w:r>
-    </w:p>
-    <w:p>
-      <w:pPr>
-        <w:pStyle w:val="Compact"/>
-        <w:numPr>
-          <w:ilvl w:val="1"/>
-          <w:numId w:val="1452"/>
-        </w:numPr>
-      </w:pPr>
-      <w:r>
-        <w:t xml:space="preserve">Added.</w:t>
-      </w:r>
-    </w:p>
-    <w:p>
-      <w:pPr>
-        <w:pStyle w:val="Compact"/>
-        <w:numPr>
-          <w:ilvl w:val="0"/>
-          <w:numId w:val="1453"/>
-        </w:numPr>
-      </w:pPr>
-      <w:r>
-        <w:t xml:space="preserve">Last Contact shows rep attribution initials and relative time, e.g. </w:t>
-      </w:r>
-      <w:r>
-        <w:rPr>
-          <w:rStyle w:val="VerbatimChar"/>
-        </w:rPr>
-        <w:t xml:space="preserve">JB 2h ago</w:t>
-      </w:r>
-      <w:r>
-        <w:t xml:space="preserve">.</w:t>
-      </w:r>
-    </w:p>
-    <w:p>
-      <w:pPr>
-        <w:pStyle w:val="Compact"/>
-        <w:numPr>
-          <w:ilvl w:val="0"/>
-          <w:numId w:val="1454"/>
-        </w:numPr>
-      </w:pPr>
-      <w:r>
-        <w:t xml:space="preserve">Industry renders extracted/classified value or</w:t>
-      </w:r>
-      <w:r>
-        <w:t xml:space="preserve"> </w:t>
-      </w:r>
-      <w:r>
-        <w:rPr>
-          <w:rStyle w:val="VerbatimChar"/>
-        </w:rPr>
-        <w:t xml:space="preserve">— unknown</w:t>
-      </w:r>
-      <w:r>
-        <w:t xml:space="preserve">.</w:t>
-      </w:r>
-    </w:p>
-    <w:p>
-      <w:pPr>
-        <w:pStyle w:val="Compact"/>
-        <w:numPr>
-          <w:ilvl w:val="0"/>
-          <w:numId w:val="1455"/>
-        </w:numPr>
-      </w:pPr>
-      <w:r>
-        <w:t xml:space="preserve">Monthly Revenue renders raw/formatted revenue plus provenance chip:</w:t>
       </w:r>
     </w:p>
     <w:p>
@@ -10957,7 +10924,7 @@
         </w:numPr>
       </w:pPr>
       <w:r>
-        <w:t xml:space="preserve">AI;</w:t>
+        <w:t xml:space="preserve">Name;</w:t>
       </w:r>
     </w:p>
     <w:p>
@@ -10969,7 +10936,7 @@
         </w:numPr>
       </w:pPr>
       <w:r>
-        <w:t xml:space="preserve">CSV;</w:t>
+        <w:t xml:space="preserve">Phone;</w:t>
       </w:r>
     </w:p>
     <w:p>
@@ -10981,6 +10948,159 @@
         </w:numPr>
       </w:pPr>
       <w:r>
+        <w:t xml:space="preserve">Status;</w:t>
+      </w:r>
+    </w:p>
+    <w:p>
+      <w:pPr>
+        <w:pStyle w:val="Compact"/>
+        <w:numPr>
+          <w:ilvl w:val="1"/>
+          <w:numId w:val="1456"/>
+        </w:numPr>
+      </w:pPr>
+      <w:r>
+        <w:t xml:space="preserve">Last Contact;</w:t>
+      </w:r>
+    </w:p>
+    <w:p>
+      <w:pPr>
+        <w:pStyle w:val="Compact"/>
+        <w:numPr>
+          <w:ilvl w:val="1"/>
+          <w:numId w:val="1456"/>
+        </w:numPr>
+      </w:pPr>
+      <w:r>
+        <w:t xml:space="preserve">Industry;</w:t>
+      </w:r>
+    </w:p>
+    <w:p>
+      <w:pPr>
+        <w:pStyle w:val="Compact"/>
+        <w:numPr>
+          <w:ilvl w:val="1"/>
+          <w:numId w:val="1456"/>
+        </w:numPr>
+      </w:pPr>
+      <w:r>
+        <w:t xml:space="preserve">Monthly Revenue;</w:t>
+      </w:r>
+    </w:p>
+    <w:p>
+      <w:pPr>
+        <w:pStyle w:val="Compact"/>
+        <w:numPr>
+          <w:ilvl w:val="1"/>
+          <w:numId w:val="1456"/>
+        </w:numPr>
+      </w:pPr>
+      <w:r>
+        <w:t xml:space="preserve">Source;</w:t>
+      </w:r>
+    </w:p>
+    <w:p>
+      <w:pPr>
+        <w:pStyle w:val="Compact"/>
+        <w:numPr>
+          <w:ilvl w:val="1"/>
+          <w:numId w:val="1456"/>
+        </w:numPr>
+      </w:pPr>
+      <w:r>
+        <w:t xml:space="preserve">Added.</w:t>
+      </w:r>
+    </w:p>
+    <w:p>
+      <w:pPr>
+        <w:pStyle w:val="Compact"/>
+        <w:numPr>
+          <w:ilvl w:val="0"/>
+          <w:numId w:val="1457"/>
+        </w:numPr>
+      </w:pPr>
+      <w:r>
+        <w:t xml:space="preserve">Last Contact shows rep attribution initials and relative time, e.g. </w:t>
+      </w:r>
+      <w:r>
+        <w:rPr>
+          <w:rStyle w:val="VerbatimChar"/>
+        </w:rPr>
+        <w:t xml:space="preserve">JB 2h ago</w:t>
+      </w:r>
+      <w:r>
+        <w:t xml:space="preserve">.</w:t>
+      </w:r>
+    </w:p>
+    <w:p>
+      <w:pPr>
+        <w:pStyle w:val="Compact"/>
+        <w:numPr>
+          <w:ilvl w:val="0"/>
+          <w:numId w:val="1458"/>
+        </w:numPr>
+      </w:pPr>
+      <w:r>
+        <w:t xml:space="preserve">Industry renders extracted/classified value or</w:t>
+      </w:r>
+      <w:r>
+        <w:t xml:space="preserve"> </w:t>
+      </w:r>
+      <w:r>
+        <w:rPr>
+          <w:rStyle w:val="VerbatimChar"/>
+        </w:rPr>
+        <w:t xml:space="preserve">— unknown</w:t>
+      </w:r>
+      <w:r>
+        <w:t xml:space="preserve">.</w:t>
+      </w:r>
+    </w:p>
+    <w:p>
+      <w:pPr>
+        <w:pStyle w:val="Compact"/>
+        <w:numPr>
+          <w:ilvl w:val="0"/>
+          <w:numId w:val="1459"/>
+        </w:numPr>
+      </w:pPr>
+      <w:r>
+        <w:t xml:space="preserve">Monthly Revenue renders raw/formatted revenue plus provenance chip:</w:t>
+      </w:r>
+    </w:p>
+    <w:p>
+      <w:pPr>
+        <w:pStyle w:val="Compact"/>
+        <w:numPr>
+          <w:ilvl w:val="1"/>
+          <w:numId w:val="1460"/>
+        </w:numPr>
+      </w:pPr>
+      <w:r>
+        <w:t xml:space="preserve">AI;</w:t>
+      </w:r>
+    </w:p>
+    <w:p>
+      <w:pPr>
+        <w:pStyle w:val="Compact"/>
+        <w:numPr>
+          <w:ilvl w:val="1"/>
+          <w:numId w:val="1460"/>
+        </w:numPr>
+      </w:pPr>
+      <w:r>
+        <w:t xml:space="preserve">CSV;</w:t>
+      </w:r>
+    </w:p>
+    <w:p>
+      <w:pPr>
+        <w:pStyle w:val="Compact"/>
+        <w:numPr>
+          <w:ilvl w:val="1"/>
+          <w:numId w:val="1460"/>
+        </w:numPr>
+      </w:pPr>
+      <w:r>
         <w:t xml:space="preserve">MANUAL.</w:t>
       </w:r>
     </w:p>
@@ -10989,7 +11109,7 @@
         <w:pStyle w:val="Compact"/>
         <w:numPr>
           <w:ilvl w:val="0"/>
-          <w:numId w:val="1457"/>
+          <w:numId w:val="1461"/>
         </w:numPr>
       </w:pPr>
       <w:r>
@@ -11013,7 +11133,7 @@
         <w:pStyle w:val="Compact"/>
         <w:numPr>
           <w:ilvl w:val="0"/>
-          <w:numId w:val="1458"/>
+          <w:numId w:val="1462"/>
         </w:numPr>
       </w:pPr>
       <w:r>
@@ -11025,7 +11145,7 @@
         <w:pStyle w:val="Compact"/>
         <w:numPr>
           <w:ilvl w:val="0"/>
-          <w:numId w:val="1459"/>
+          <w:numId w:val="1463"/>
         </w:numPr>
       </w:pPr>
       <w:r>
@@ -11037,7 +11157,7 @@
         <w:pStyle w:val="Compact"/>
         <w:numPr>
           <w:ilvl w:val="0"/>
-          <w:numId w:val="1460"/>
+          <w:numId w:val="1464"/>
         </w:numPr>
       </w:pPr>
       <w:r>
@@ -11059,7 +11179,7 @@
         <w:pStyle w:val="Compact"/>
         <w:numPr>
           <w:ilvl w:val="0"/>
-          <w:numId w:val="1461"/>
+          <w:numId w:val="1465"/>
         </w:numPr>
       </w:pPr>
       <w:r>
@@ -11071,7 +11191,7 @@
         <w:pStyle w:val="Compact"/>
         <w:numPr>
           <w:ilvl w:val="1"/>
-          <w:numId w:val="1462"/>
+          <w:numId w:val="1466"/>
         </w:numPr>
       </w:pPr>
       <w:r>
@@ -11083,7 +11203,7 @@
         <w:pStyle w:val="Compact"/>
         <w:numPr>
           <w:ilvl w:val="1"/>
-          <w:numId w:val="1462"/>
+          <w:numId w:val="1466"/>
         </w:numPr>
       </w:pPr>
       <w:r>
@@ -11095,7 +11215,7 @@
         <w:pStyle w:val="Compact"/>
         <w:numPr>
           <w:ilvl w:val="1"/>
-          <w:numId w:val="1462"/>
+          <w:numId w:val="1466"/>
         </w:numPr>
       </w:pPr>
       <w:r>
@@ -11107,7 +11227,7 @@
         <w:pStyle w:val="Compact"/>
         <w:numPr>
           <w:ilvl w:val="0"/>
-          <w:numId w:val="1463"/>
+          <w:numId w:val="1467"/>
         </w:numPr>
       </w:pPr>
       <w:r>
@@ -11119,7 +11239,7 @@
         <w:pStyle w:val="Compact"/>
         <w:numPr>
           <w:ilvl w:val="1"/>
-          <w:numId w:val="1464"/>
+          <w:numId w:val="1468"/>
         </w:numPr>
       </w:pPr>
       <w:r>
@@ -11131,7 +11251,7 @@
         <w:pStyle w:val="Compact"/>
         <w:numPr>
           <w:ilvl w:val="1"/>
-          <w:numId w:val="1464"/>
+          <w:numId w:val="1468"/>
         </w:numPr>
       </w:pPr>
       <w:r>
@@ -11143,7 +11263,7 @@
         <w:pStyle w:val="Compact"/>
         <w:numPr>
           <w:ilvl w:val="1"/>
-          <w:numId w:val="1464"/>
+          <w:numId w:val="1468"/>
         </w:numPr>
       </w:pPr>
       <w:r>
@@ -11155,7 +11275,7 @@
         <w:pStyle w:val="Compact"/>
         <w:numPr>
           <w:ilvl w:val="0"/>
-          <w:numId w:val="1465"/>
+          <w:numId w:val="1469"/>
         </w:numPr>
       </w:pPr>
       <w:r>
@@ -11167,7 +11287,7 @@
         <w:pStyle w:val="Compact"/>
         <w:numPr>
           <w:ilvl w:val="0"/>
-          <w:numId w:val="1466"/>
+          <w:numId w:val="1470"/>
         </w:numPr>
       </w:pPr>
       <w:r>
@@ -11179,7 +11299,7 @@
         <w:pStyle w:val="Compact"/>
         <w:numPr>
           <w:ilvl w:val="0"/>
-          <w:numId w:val="1467"/>
+          <w:numId w:val="1471"/>
         </w:numPr>
       </w:pPr>
       <w:r>
@@ -11201,7 +11321,7 @@
         <w:pStyle w:val="Compact"/>
         <w:numPr>
           <w:ilvl w:val="0"/>
-          <w:numId w:val="1468"/>
+          <w:numId w:val="1472"/>
         </w:numPr>
       </w:pPr>
       <w:r>
@@ -11222,7 +11342,7 @@
         <w:pStyle w:val="Compact"/>
         <w:numPr>
           <w:ilvl w:val="0"/>
-          <w:numId w:val="1469"/>
+          <w:numId w:val="1473"/>
         </w:numPr>
       </w:pPr>
       <w:r>
@@ -11234,7 +11354,7 @@
         <w:pStyle w:val="Compact"/>
         <w:numPr>
           <w:ilvl w:val="0"/>
-          <w:numId w:val="1470"/>
+          <w:numId w:val="1474"/>
         </w:numPr>
       </w:pPr>
       <w:r>
@@ -11246,7 +11366,7 @@
         <w:pStyle w:val="Compact"/>
         <w:numPr>
           <w:ilvl w:val="0"/>
-          <w:numId w:val="1471"/>
+          <w:numId w:val="1475"/>
         </w:numPr>
       </w:pPr>
       <w:r>
@@ -11258,7 +11378,7 @@
         <w:pStyle w:val="Compact"/>
         <w:numPr>
           <w:ilvl w:val="0"/>
-          <w:numId w:val="1472"/>
+          <w:numId w:val="1476"/>
         </w:numPr>
       </w:pPr>
       <w:r>
@@ -11270,7 +11390,7 @@
         <w:pStyle w:val="Compact"/>
         <w:numPr>
           <w:ilvl w:val="0"/>
-          <w:numId w:val="1473"/>
+          <w:numId w:val="1477"/>
         </w:numPr>
       </w:pPr>
       <w:r>
@@ -11282,7 +11402,7 @@
         <w:pStyle w:val="Compact"/>
         <w:numPr>
           <w:ilvl w:val="1"/>
-          <w:numId w:val="1474"/>
+          <w:numId w:val="1478"/>
         </w:numPr>
       </w:pPr>
       <w:r>
@@ -11294,7 +11414,7 @@
         <w:pStyle w:val="Compact"/>
         <w:numPr>
           <w:ilvl w:val="1"/>
-          <w:numId w:val="1474"/>
+          <w:numId w:val="1478"/>
         </w:numPr>
       </w:pPr>
       <w:r>
@@ -11306,7 +11426,7 @@
         <w:pStyle w:val="Compact"/>
         <w:numPr>
           <w:ilvl w:val="1"/>
-          <w:numId w:val="1474"/>
+          <w:numId w:val="1478"/>
         </w:numPr>
       </w:pPr>
       <w:r>
@@ -11318,7 +11438,7 @@
         <w:pStyle w:val="Compact"/>
         <w:numPr>
           <w:ilvl w:val="1"/>
-          <w:numId w:val="1474"/>
+          <w:numId w:val="1478"/>
         </w:numPr>
       </w:pPr>
       <w:r>
@@ -11330,7 +11450,7 @@
         <w:pStyle w:val="Compact"/>
         <w:numPr>
           <w:ilvl w:val="1"/>
-          <w:numId w:val="1474"/>
+          <w:numId w:val="1478"/>
         </w:numPr>
       </w:pPr>
       <w:r>
@@ -11342,7 +11462,7 @@
         <w:pStyle w:val="Compact"/>
         <w:numPr>
           <w:ilvl w:val="1"/>
-          <w:numId w:val="1474"/>
+          <w:numId w:val="1478"/>
         </w:numPr>
       </w:pPr>
       <w:r>
@@ -11354,7 +11474,7 @@
         <w:pStyle w:val="Compact"/>
         <w:numPr>
           <w:ilvl w:val="0"/>
-          <w:numId w:val="1475"/>
+          <w:numId w:val="1479"/>
         </w:numPr>
       </w:pPr>
       <w:r>
@@ -11366,7 +11486,7 @@
         <w:pStyle w:val="Compact"/>
         <w:numPr>
           <w:ilvl w:val="0"/>
-          <w:numId w:val="1476"/>
+          <w:numId w:val="1480"/>
         </w:numPr>
       </w:pPr>
       <w:r>
@@ -11388,7 +11508,7 @@
         <w:pStyle w:val="Compact"/>
         <w:numPr>
           <w:ilvl w:val="0"/>
-          <w:numId w:val="1477"/>
+          <w:numId w:val="1481"/>
         </w:numPr>
       </w:pPr>
       <w:r>
@@ -11400,7 +11520,7 @@
         <w:pStyle w:val="Compact"/>
         <w:numPr>
           <w:ilvl w:val="0"/>
-          <w:numId w:val="1478"/>
+          <w:numId w:val="1482"/>
         </w:numPr>
       </w:pPr>
       <w:r>
@@ -11412,7 +11532,7 @@
         <w:pStyle w:val="Compact"/>
         <w:numPr>
           <w:ilvl w:val="0"/>
-          <w:numId w:val="1479"/>
+          <w:numId w:val="1483"/>
         </w:numPr>
       </w:pPr>
       <w:r>
@@ -11424,7 +11544,7 @@
         <w:pStyle w:val="Compact"/>
         <w:numPr>
           <w:ilvl w:val="0"/>
-          <w:numId w:val="1480"/>
+          <w:numId w:val="1484"/>
         </w:numPr>
       </w:pPr>
       <w:r>
@@ -11436,7 +11556,7 @@
         <w:pStyle w:val="Compact"/>
         <w:numPr>
           <w:ilvl w:val="0"/>
-          <w:numId w:val="1481"/>
+          <w:numId w:val="1485"/>
         </w:numPr>
       </w:pPr>
       <w:r>
@@ -11458,7 +11578,7 @@
         <w:pStyle w:val="Compact"/>
         <w:numPr>
           <w:ilvl w:val="0"/>
-          <w:numId w:val="1482"/>
+          <w:numId w:val="1486"/>
         </w:numPr>
       </w:pPr>
       <w:r>
@@ -11470,7 +11590,7 @@
         <w:pStyle w:val="Compact"/>
         <w:numPr>
           <w:ilvl w:val="0"/>
-          <w:numId w:val="1483"/>
+          <w:numId w:val="1487"/>
         </w:numPr>
       </w:pPr>
       <w:r>
@@ -11482,7 +11602,7 @@
         <w:pStyle w:val="Compact"/>
         <w:numPr>
           <w:ilvl w:val="0"/>
-          <w:numId w:val="1484"/>
+          <w:numId w:val="1488"/>
         </w:numPr>
       </w:pPr>
       <w:r>
@@ -11494,7 +11614,7 @@
         <w:pStyle w:val="Compact"/>
         <w:numPr>
           <w:ilvl w:val="0"/>
-          <w:numId w:val="1485"/>
+          <w:numId w:val="1489"/>
         </w:numPr>
       </w:pPr>
       <w:r>
@@ -11506,7 +11626,7 @@
         <w:pStyle w:val="Compact"/>
         <w:numPr>
           <w:ilvl w:val="0"/>
-          <w:numId w:val="1486"/>
+          <w:numId w:val="1490"/>
         </w:numPr>
       </w:pPr>
       <w:r>
@@ -11518,7 +11638,7 @@
         <w:pStyle w:val="Compact"/>
         <w:numPr>
           <w:ilvl w:val="0"/>
-          <w:numId w:val="1487"/>
+          <w:numId w:val="1491"/>
         </w:numPr>
       </w:pPr>
       <w:r>
@@ -11530,7 +11650,7 @@
         <w:pStyle w:val="Compact"/>
         <w:numPr>
           <w:ilvl w:val="0"/>
-          <w:numId w:val="1488"/>
+          <w:numId w:val="1492"/>
         </w:numPr>
       </w:pPr>
       <w:r>
@@ -11542,7 +11662,7 @@
         <w:pStyle w:val="Compact"/>
         <w:numPr>
           <w:ilvl w:val="0"/>
-          <w:numId w:val="1489"/>
+          <w:numId w:val="1493"/>
         </w:numPr>
       </w:pPr>
       <w:r>
@@ -11574,7 +11694,7 @@
         <w:pStyle w:val="Compact"/>
         <w:numPr>
           <w:ilvl w:val="0"/>
-          <w:numId w:val="1490"/>
+          <w:numId w:val="1494"/>
         </w:numPr>
       </w:pPr>
       <w:r>
@@ -11622,7 +11742,7 @@
         <w:pStyle w:val="Compact"/>
         <w:numPr>
           <w:ilvl w:val="0"/>
-          <w:numId w:val="1491"/>
+          <w:numId w:val="1495"/>
         </w:numPr>
       </w:pPr>
       <w:r>
@@ -11634,7 +11754,7 @@
         <w:pStyle w:val="Compact"/>
         <w:numPr>
           <w:ilvl w:val="0"/>
-          <w:numId w:val="1492"/>
+          <w:numId w:val="1496"/>
         </w:numPr>
       </w:pPr>
       <w:r>
@@ -11646,7 +11766,7 @@
         <w:pStyle w:val="Compact"/>
         <w:numPr>
           <w:ilvl w:val="0"/>
-          <w:numId w:val="1493"/>
+          <w:numId w:val="1497"/>
         </w:numPr>
       </w:pPr>
       <w:r>
@@ -11658,7 +11778,7 @@
         <w:pStyle w:val="Compact"/>
         <w:numPr>
           <w:ilvl w:val="0"/>
-          <w:numId w:val="1494"/>
+          <w:numId w:val="1498"/>
         </w:numPr>
       </w:pPr>
       <w:r>
@@ -11670,7 +11790,7 @@
         <w:pStyle w:val="Compact"/>
         <w:numPr>
           <w:ilvl w:val="0"/>
-          <w:numId w:val="1495"/>
+          <w:numId w:val="1499"/>
         </w:numPr>
       </w:pPr>
       <w:r>
@@ -11724,7 +11844,7 @@
         <w:pStyle w:val="Compact"/>
         <w:numPr>
           <w:ilvl w:val="0"/>
-          <w:numId w:val="1496"/>
+          <w:numId w:val="1500"/>
         </w:numPr>
       </w:pPr>
       <w:r>
@@ -11736,7 +11856,7 @@
         <w:pStyle w:val="Compact"/>
         <w:numPr>
           <w:ilvl w:val="0"/>
-          <w:numId w:val="1497"/>
+          <w:numId w:val="1501"/>
         </w:numPr>
       </w:pPr>
       <w:r>
@@ -11763,7 +11883,7 @@
         <w:pStyle w:val="Compact"/>
         <w:numPr>
           <w:ilvl w:val="0"/>
-          <w:numId w:val="1498"/>
+          <w:numId w:val="1502"/>
         </w:numPr>
       </w:pPr>
       <w:r>
@@ -11805,7 +11925,7 @@
         <w:pStyle w:val="Compact"/>
         <w:numPr>
           <w:ilvl w:val="0"/>
-          <w:numId w:val="1499"/>
+          <w:numId w:val="1503"/>
         </w:numPr>
       </w:pPr>
       <w:r>
@@ -11832,7 +11952,7 @@
         <w:pStyle w:val="Compact"/>
         <w:numPr>
           <w:ilvl w:val="0"/>
-          <w:numId w:val="1500"/>
+          <w:numId w:val="1504"/>
         </w:numPr>
       </w:pPr>
       <w:r>
@@ -11844,7 +11964,7 @@
         <w:pStyle w:val="Compact"/>
         <w:numPr>
           <w:ilvl w:val="0"/>
-          <w:numId w:val="1501"/>
+          <w:numId w:val="1505"/>
         </w:numPr>
       </w:pPr>
       <w:r>
@@ -11856,7 +11976,7 @@
         <w:pStyle w:val="Compact"/>
         <w:numPr>
           <w:ilvl w:val="0"/>
-          <w:numId w:val="1502"/>
+          <w:numId w:val="1506"/>
         </w:numPr>
       </w:pPr>
       <w:r>
@@ -11893,7 +12013,7 @@
         <w:pStyle w:val="Compact"/>
         <w:numPr>
           <w:ilvl w:val="0"/>
-          <w:numId w:val="1503"/>
+          <w:numId w:val="1507"/>
         </w:numPr>
       </w:pPr>
       <w:r>
@@ -11905,7 +12025,7 @@
         <w:pStyle w:val="Compact"/>
         <w:numPr>
           <w:ilvl w:val="0"/>
-          <w:numId w:val="1504"/>
+          <w:numId w:val="1508"/>
         </w:numPr>
       </w:pPr>
       <w:r>
@@ -11917,7 +12037,7 @@
         <w:pStyle w:val="Compact"/>
         <w:numPr>
           <w:ilvl w:val="0"/>
-          <w:numId w:val="1505"/>
+          <w:numId w:val="1509"/>
         </w:numPr>
       </w:pPr>
       <w:r>
@@ -11929,7 +12049,7 @@
         <w:pStyle w:val="Compact"/>
         <w:numPr>
           <w:ilvl w:val="0"/>
-          <w:numId w:val="1506"/>
+          <w:numId w:val="1510"/>
         </w:numPr>
       </w:pPr>
       <w:r>
@@ -11941,7 +12061,7 @@
         <w:pStyle w:val="Compact"/>
         <w:numPr>
           <w:ilvl w:val="0"/>
-          <w:numId w:val="1507"/>
+          <w:numId w:val="1511"/>
         </w:numPr>
       </w:pPr>
       <w:r>
@@ -11953,7 +12073,7 @@
         <w:pStyle w:val="Compact"/>
         <w:numPr>
           <w:ilvl w:val="0"/>
-          <w:numId w:val="1508"/>
+          <w:numId w:val="1512"/>
         </w:numPr>
       </w:pPr>
       <w:r>
@@ -11965,7 +12085,7 @@
         <w:pStyle w:val="Compact"/>
         <w:numPr>
           <w:ilvl w:val="1"/>
-          <w:numId w:val="1509"/>
+          <w:numId w:val="1513"/>
         </w:numPr>
       </w:pPr>
       <w:r>
@@ -11992,7 +12112,7 @@
         <w:pStyle w:val="Compact"/>
         <w:numPr>
           <w:ilvl w:val="1"/>
-          <w:numId w:val="1509"/>
+          <w:numId w:val="1513"/>
         </w:numPr>
       </w:pPr>
       <w:r>
@@ -12029,7 +12149,7 @@
         <w:pStyle w:val="Compact"/>
         <w:numPr>
           <w:ilvl w:val="0"/>
-          <w:numId w:val="1510"/>
+          <w:numId w:val="1514"/>
         </w:numPr>
       </w:pPr>
       <w:r>
@@ -12071,7 +12191,7 @@
         <w:pStyle w:val="Compact"/>
         <w:numPr>
           <w:ilvl w:val="0"/>
-          <w:numId w:val="1511"/>
+          <w:numId w:val="1515"/>
         </w:numPr>
       </w:pPr>
       <w:r>
@@ -12095,7 +12215,7 @@
         <w:pStyle w:val="Compact"/>
         <w:numPr>
           <w:ilvl w:val="0"/>
-          <w:numId w:val="1512"/>
+          <w:numId w:val="1516"/>
         </w:numPr>
       </w:pPr>
       <w:r>
@@ -12119,7 +12239,7 @@
         <w:pStyle w:val="Compact"/>
         <w:numPr>
           <w:ilvl w:val="0"/>
-          <w:numId w:val="1513"/>
+          <w:numId w:val="1517"/>
         </w:numPr>
       </w:pPr>
       <w:r>
@@ -12131,7 +12251,7 @@
         <w:pStyle w:val="Compact"/>
         <w:numPr>
           <w:ilvl w:val="0"/>
-          <w:numId w:val="1514"/>
+          <w:numId w:val="1518"/>
         </w:numPr>
       </w:pPr>
       <w:r>
@@ -12143,7 +12263,7 @@
         <w:pStyle w:val="Compact"/>
         <w:numPr>
           <w:ilvl w:val="0"/>
-          <w:numId w:val="1515"/>
+          <w:numId w:val="1519"/>
         </w:numPr>
       </w:pPr>
       <w:r>
@@ -12155,7 +12275,7 @@
         <w:pStyle w:val="Compact"/>
         <w:numPr>
           <w:ilvl w:val="0"/>
-          <w:numId w:val="1516"/>
+          <w:numId w:val="1520"/>
         </w:numPr>
       </w:pPr>
       <w:r>
@@ -12167,7 +12287,7 @@
         <w:pStyle w:val="Compact"/>
         <w:numPr>
           <w:ilvl w:val="0"/>
-          <w:numId w:val="1517"/>
+          <w:numId w:val="1521"/>
         </w:numPr>
       </w:pPr>
       <w:r>
@@ -12179,7 +12299,7 @@
         <w:pStyle w:val="Compact"/>
         <w:numPr>
           <w:ilvl w:val="0"/>
-          <w:numId w:val="1518"/>
+          <w:numId w:val="1522"/>
         </w:numPr>
       </w:pPr>
       <w:r>
@@ -12191,7 +12311,7 @@
         <w:pStyle w:val="Compact"/>
         <w:numPr>
           <w:ilvl w:val="0"/>
-          <w:numId w:val="1519"/>
+          <w:numId w:val="1523"/>
         </w:numPr>
       </w:pPr>
       <w:r>
@@ -12203,7 +12323,7 @@
         <w:pStyle w:val="Compact"/>
         <w:numPr>
           <w:ilvl w:val="0"/>
-          <w:numId w:val="1520"/>
+          <w:numId w:val="1524"/>
         </w:numPr>
       </w:pPr>
       <w:r>
@@ -12215,7 +12335,7 @@
         <w:pStyle w:val="Compact"/>
         <w:numPr>
           <w:ilvl w:val="0"/>
-          <w:numId w:val="1521"/>
+          <w:numId w:val="1525"/>
         </w:numPr>
       </w:pPr>
       <w:r>
@@ -12227,7 +12347,7 @@
         <w:pStyle w:val="Compact"/>
         <w:numPr>
           <w:ilvl w:val="0"/>
-          <w:numId w:val="1522"/>
+          <w:numId w:val="1526"/>
         </w:numPr>
       </w:pPr>
       <w:r>
@@ -12239,7 +12359,7 @@
         <w:pStyle w:val="Compact"/>
         <w:numPr>
           <w:ilvl w:val="0"/>
-          <w:numId w:val="1523"/>
+          <w:numId w:val="1527"/>
         </w:numPr>
       </w:pPr>
       <w:r>
@@ -12266,7 +12386,7 @@
         <w:pStyle w:val="Compact"/>
         <w:numPr>
           <w:ilvl w:val="0"/>
-          <w:numId w:val="1524"/>
+          <w:numId w:val="1528"/>
         </w:numPr>
       </w:pPr>
       <w:r>
@@ -12278,7 +12398,7 @@
         <w:pStyle w:val="Compact"/>
         <w:numPr>
           <w:ilvl w:val="0"/>
-          <w:numId w:val="1525"/>
+          <w:numId w:val="1529"/>
         </w:numPr>
       </w:pPr>
       <w:r>
@@ -12300,7 +12420,7 @@
         <w:pStyle w:val="Compact"/>
         <w:numPr>
           <w:ilvl w:val="0"/>
-          <w:numId w:val="1526"/>
+          <w:numId w:val="1530"/>
         </w:numPr>
       </w:pPr>
       <w:r>
@@ -12312,7 +12432,7 @@
         <w:pStyle w:val="Compact"/>
         <w:numPr>
           <w:ilvl w:val="0"/>
-          <w:numId w:val="1527"/>
+          <w:numId w:val="1531"/>
         </w:numPr>
       </w:pPr>
       <w:r>
@@ -12339,7 +12459,7 @@
         <w:pStyle w:val="Compact"/>
         <w:numPr>
           <w:ilvl w:val="0"/>
-          <w:numId w:val="1528"/>
+          <w:numId w:val="1532"/>
         </w:numPr>
       </w:pPr>
       <w:r>
@@ -12366,7 +12486,7 @@
         <w:pStyle w:val="Compact"/>
         <w:numPr>
           <w:ilvl w:val="0"/>
-          <w:numId w:val="1529"/>
+          <w:numId w:val="1533"/>
         </w:numPr>
       </w:pPr>
       <w:r>
@@ -12393,7 +12513,7 @@
         <w:pStyle w:val="Compact"/>
         <w:numPr>
           <w:ilvl w:val="0"/>
-          <w:numId w:val="1530"/>
+          <w:numId w:val="1534"/>
         </w:numPr>
       </w:pPr>
       <w:r>
@@ -12405,7 +12525,7 @@
         <w:pStyle w:val="Compact"/>
         <w:numPr>
           <w:ilvl w:val="1"/>
-          <w:numId w:val="1531"/>
+          <w:numId w:val="1535"/>
         </w:numPr>
       </w:pPr>
       <w:r>
@@ -12417,7 +12537,7 @@
         <w:pStyle w:val="Compact"/>
         <w:numPr>
           <w:ilvl w:val="1"/>
-          <w:numId w:val="1531"/>
+          <w:numId w:val="1535"/>
         </w:numPr>
       </w:pPr>
       <w:r>
@@ -12429,7 +12549,7 @@
         <w:pStyle w:val="Compact"/>
         <w:numPr>
           <w:ilvl w:val="1"/>
-          <w:numId w:val="1531"/>
+          <w:numId w:val="1535"/>
         </w:numPr>
       </w:pPr>
       <w:r>
@@ -12441,7 +12561,7 @@
         <w:pStyle w:val="Compact"/>
         <w:numPr>
           <w:ilvl w:val="0"/>
-          <w:numId w:val="1532"/>
+          <w:numId w:val="1536"/>
         </w:numPr>
       </w:pPr>
       <w:r>
@@ -12453,7 +12573,7 @@
         <w:pStyle w:val="Compact"/>
         <w:numPr>
           <w:ilvl w:val="0"/>
-          <w:numId w:val="1533"/>
+          <w:numId w:val="1537"/>
         </w:numPr>
       </w:pPr>
       <w:r>
@@ -12465,7 +12585,7 @@
         <w:pStyle w:val="Compact"/>
         <w:numPr>
           <w:ilvl w:val="1"/>
-          <w:numId w:val="1534"/>
+          <w:numId w:val="1538"/>
         </w:numPr>
       </w:pPr>
       <w:r>
@@ -12477,7 +12597,7 @@
         <w:pStyle w:val="Compact"/>
         <w:numPr>
           <w:ilvl w:val="1"/>
-          <w:numId w:val="1534"/>
+          <w:numId w:val="1538"/>
         </w:numPr>
       </w:pPr>
       <w:r>
@@ -12489,7 +12609,7 @@
         <w:pStyle w:val="Compact"/>
         <w:numPr>
           <w:ilvl w:val="1"/>
-          <w:numId w:val="1534"/>
+          <w:numId w:val="1538"/>
         </w:numPr>
       </w:pPr>
       <w:r>
@@ -12501,7 +12621,7 @@
         <w:pStyle w:val="Compact"/>
         <w:numPr>
           <w:ilvl w:val="1"/>
-          <w:numId w:val="1534"/>
+          <w:numId w:val="1538"/>
         </w:numPr>
       </w:pPr>
       <w:r>
@@ -12513,7 +12633,7 @@
         <w:pStyle w:val="Compact"/>
         <w:numPr>
           <w:ilvl w:val="1"/>
-          <w:numId w:val="1534"/>
+          <w:numId w:val="1538"/>
         </w:numPr>
       </w:pPr>
       <w:r>
@@ -12525,7 +12645,7 @@
         <w:pStyle w:val="Compact"/>
         <w:numPr>
           <w:ilvl w:val="1"/>
-          <w:numId w:val="1534"/>
+          <w:numId w:val="1538"/>
         </w:numPr>
       </w:pPr>
       <w:r>
@@ -12537,7 +12657,7 @@
         <w:pStyle w:val="Compact"/>
         <w:numPr>
           <w:ilvl w:val="0"/>
-          <w:numId w:val="1535"/>
+          <w:numId w:val="1539"/>
         </w:numPr>
       </w:pPr>
       <w:r>
@@ -12549,7 +12669,7 @@
         <w:pStyle w:val="Compact"/>
         <w:numPr>
           <w:ilvl w:val="0"/>
-          <w:numId w:val="1536"/>
+          <w:numId w:val="1540"/>
         </w:numPr>
       </w:pPr>
       <w:r>
@@ -12561,7 +12681,7 @@
         <w:pStyle w:val="Compact"/>
         <w:numPr>
           <w:ilvl w:val="0"/>
-          <w:numId w:val="1537"/>
+          <w:numId w:val="1541"/>
         </w:numPr>
       </w:pPr>
       <w:r>
@@ -12583,7 +12703,7 @@
         <w:pStyle w:val="Compact"/>
         <w:numPr>
           <w:ilvl w:val="0"/>
-          <w:numId w:val="1538"/>
+          <w:numId w:val="1542"/>
         </w:numPr>
       </w:pPr>
       <w:r>
@@ -12595,7 +12715,7 @@
         <w:pStyle w:val="Compact"/>
         <w:numPr>
           <w:ilvl w:val="0"/>
-          <w:numId w:val="1539"/>
+          <w:numId w:val="1543"/>
         </w:numPr>
       </w:pPr>
       <w:r>
@@ -12607,7 +12727,7 @@
         <w:pStyle w:val="Compact"/>
         <w:numPr>
           <w:ilvl w:val="0"/>
-          <w:numId w:val="1540"/>
+          <w:numId w:val="1544"/>
         </w:numPr>
       </w:pPr>
       <w:r>
@@ -12619,7 +12739,7 @@
         <w:pStyle w:val="Compact"/>
         <w:numPr>
           <w:ilvl w:val="0"/>
-          <w:numId w:val="1541"/>
+          <w:numId w:val="1545"/>
         </w:numPr>
       </w:pPr>
       <w:r>
@@ -12631,7 +12751,7 @@
         <w:pStyle w:val="Compact"/>
         <w:numPr>
           <w:ilvl w:val="0"/>
-          <w:numId w:val="1542"/>
+          <w:numId w:val="1546"/>
         </w:numPr>
       </w:pPr>
       <w:r>
@@ -12643,7 +12763,7 @@
         <w:pStyle w:val="Compact"/>
         <w:numPr>
           <w:ilvl w:val="0"/>
-          <w:numId w:val="1543"/>
+          <w:numId w:val="1547"/>
         </w:numPr>
       </w:pPr>
       <w:r>
@@ -12665,7 +12785,7 @@
         <w:pStyle w:val="Compact"/>
         <w:numPr>
           <w:ilvl w:val="0"/>
-          <w:numId w:val="1544"/>
+          <w:numId w:val="1548"/>
         </w:numPr>
       </w:pPr>
       <w:r>
@@ -12677,7 +12797,7 @@
         <w:pStyle w:val="Compact"/>
         <w:numPr>
           <w:ilvl w:val="1"/>
-          <w:numId w:val="1545"/>
+          <w:numId w:val="1549"/>
         </w:numPr>
       </w:pPr>
       <w:r>
@@ -12689,7 +12809,7 @@
         <w:pStyle w:val="Compact"/>
         <w:numPr>
           <w:ilvl w:val="1"/>
-          <w:numId w:val="1545"/>
+          <w:numId w:val="1549"/>
         </w:numPr>
       </w:pPr>
       <w:r>
@@ -12701,7 +12821,7 @@
         <w:pStyle w:val="Compact"/>
         <w:numPr>
           <w:ilvl w:val="0"/>
-          <w:numId w:val="1546"/>
+          <w:numId w:val="1550"/>
         </w:numPr>
       </w:pPr>
       <w:r>
@@ -12713,7 +12833,7 @@
         <w:pStyle w:val="Compact"/>
         <w:numPr>
           <w:ilvl w:val="1"/>
-          <w:numId w:val="1547"/>
+          <w:numId w:val="1551"/>
         </w:numPr>
       </w:pPr>
       <w:r>
@@ -12725,7 +12845,7 @@
         <w:pStyle w:val="Compact"/>
         <w:numPr>
           <w:ilvl w:val="1"/>
-          <w:numId w:val="1547"/>
+          <w:numId w:val="1551"/>
         </w:numPr>
       </w:pPr>
       <w:r>
@@ -12737,7 +12857,7 @@
         <w:pStyle w:val="Compact"/>
         <w:numPr>
           <w:ilvl w:val="0"/>
-          <w:numId w:val="1548"/>
+          <w:numId w:val="1552"/>
         </w:numPr>
       </w:pPr>
       <w:r>
@@ -12749,7 +12869,7 @@
         <w:pStyle w:val="Compact"/>
         <w:numPr>
           <w:ilvl w:val="0"/>
-          <w:numId w:val="1549"/>
+          <w:numId w:val="1553"/>
         </w:numPr>
       </w:pPr>
       <w:r>
@@ -12761,7 +12881,7 @@
         <w:pStyle w:val="Compact"/>
         <w:numPr>
           <w:ilvl w:val="0"/>
-          <w:numId w:val="1550"/>
+          <w:numId w:val="1554"/>
         </w:numPr>
       </w:pPr>
       <w:r>
@@ -12773,7 +12893,7 @@
         <w:pStyle w:val="Compact"/>
         <w:numPr>
           <w:ilvl w:val="0"/>
-          <w:numId w:val="1551"/>
+          <w:numId w:val="1555"/>
         </w:numPr>
       </w:pPr>
       <w:r>
@@ -12795,7 +12915,7 @@
         <w:pStyle w:val="Compact"/>
         <w:numPr>
           <w:ilvl w:val="0"/>
-          <w:numId w:val="1552"/>
+          <w:numId w:val="1556"/>
         </w:numPr>
       </w:pPr>
       <w:r>
@@ -12807,7 +12927,7 @@
         <w:pStyle w:val="Compact"/>
         <w:numPr>
           <w:ilvl w:val="0"/>
-          <w:numId w:val="1553"/>
+          <w:numId w:val="1557"/>
         </w:numPr>
       </w:pPr>
       <w:r>
@@ -12819,7 +12939,7 @@
         <w:pStyle w:val="Compact"/>
         <w:numPr>
           <w:ilvl w:val="0"/>
-          <w:numId w:val="1554"/>
+          <w:numId w:val="1558"/>
         </w:numPr>
       </w:pPr>
       <w:r>
@@ -12831,7 +12951,7 @@
         <w:pStyle w:val="Compact"/>
         <w:numPr>
           <w:ilvl w:val="0"/>
-          <w:numId w:val="1555"/>
+          <w:numId w:val="1559"/>
         </w:numPr>
       </w:pPr>
       <w:r>
@@ -12843,7 +12963,7 @@
         <w:pStyle w:val="Compact"/>
         <w:numPr>
           <w:ilvl w:val="0"/>
-          <w:numId w:val="1556"/>
+          <w:numId w:val="1560"/>
         </w:numPr>
       </w:pPr>
       <w:r>
@@ -12855,7 +12975,7 @@
         <w:pStyle w:val="Compact"/>
         <w:numPr>
           <w:ilvl w:val="0"/>
-          <w:numId w:val="1557"/>
+          <w:numId w:val="1561"/>
         </w:numPr>
       </w:pPr>
       <w:r>
@@ -12867,7 +12987,7 @@
         <w:pStyle w:val="Compact"/>
         <w:numPr>
           <w:ilvl w:val="0"/>
-          <w:numId w:val="1558"/>
+          <w:numId w:val="1562"/>
         </w:numPr>
       </w:pPr>
       <w:r>
@@ -12879,7 +12999,7 @@
         <w:pStyle w:val="Compact"/>
         <w:numPr>
           <w:ilvl w:val="0"/>
-          <w:numId w:val="1559"/>
+          <w:numId w:val="1563"/>
         </w:numPr>
       </w:pPr>
       <w:r>
@@ -12891,7 +13011,7 @@
         <w:pStyle w:val="Compact"/>
         <w:numPr>
           <w:ilvl w:val="0"/>
-          <w:numId w:val="1560"/>
+          <w:numId w:val="1564"/>
         </w:numPr>
       </w:pPr>
       <w:r>
@@ -12913,7 +13033,7 @@
         <w:pStyle w:val="Compact"/>
         <w:numPr>
           <w:ilvl w:val="0"/>
-          <w:numId w:val="1561"/>
+          <w:numId w:val="1565"/>
         </w:numPr>
       </w:pPr>
       <w:r>
@@ -12925,7 +13045,7 @@
         <w:pStyle w:val="Compact"/>
         <w:numPr>
           <w:ilvl w:val="0"/>
-          <w:numId w:val="1562"/>
+          <w:numId w:val="1566"/>
         </w:numPr>
       </w:pPr>
       <w:r>
@@ -12937,7 +13057,7 @@
         <w:pStyle w:val="Compact"/>
         <w:numPr>
           <w:ilvl w:val="0"/>
-          <w:numId w:val="1563"/>
+          <w:numId w:val="1567"/>
         </w:numPr>
       </w:pPr>
       <w:r>
@@ -12949,7 +13069,7 @@
         <w:pStyle w:val="Compact"/>
         <w:numPr>
           <w:ilvl w:val="0"/>
-          <w:numId w:val="1564"/>
+          <w:numId w:val="1568"/>
         </w:numPr>
       </w:pPr>
       <w:r>
@@ -12961,7 +13081,7 @@
         <w:pStyle w:val="Compact"/>
         <w:numPr>
           <w:ilvl w:val="0"/>
-          <w:numId w:val="1565"/>
+          <w:numId w:val="1569"/>
         </w:numPr>
       </w:pPr>
       <w:r>
@@ -12973,7 +13093,7 @@
         <w:pStyle w:val="Compact"/>
         <w:numPr>
           <w:ilvl w:val="0"/>
-          <w:numId w:val="1566"/>
+          <w:numId w:val="1570"/>
         </w:numPr>
       </w:pPr>
       <w:r>
@@ -12985,7 +13105,7 @@
         <w:pStyle w:val="Compact"/>
         <w:numPr>
           <w:ilvl w:val="0"/>
-          <w:numId w:val="1567"/>
+          <w:numId w:val="1571"/>
         </w:numPr>
       </w:pPr>
       <w:r>
@@ -12997,7 +13117,7 @@
         <w:pStyle w:val="Compact"/>
         <w:numPr>
           <w:ilvl w:val="0"/>
-          <w:numId w:val="1568"/>
+          <w:numId w:val="1572"/>
         </w:numPr>
       </w:pPr>
       <w:r>
@@ -13009,7 +13129,7 @@
         <w:pStyle w:val="Compact"/>
         <w:numPr>
           <w:ilvl w:val="0"/>
-          <w:numId w:val="1569"/>
+          <w:numId w:val="1573"/>
         </w:numPr>
       </w:pPr>
       <w:r>
@@ -13021,7 +13141,7 @@
         <w:pStyle w:val="Compact"/>
         <w:numPr>
           <w:ilvl w:val="0"/>
-          <w:numId w:val="1570"/>
+          <w:numId w:val="1574"/>
         </w:numPr>
       </w:pPr>
       <w:r>
@@ -13048,7 +13168,7 @@
         <w:pStyle w:val="Compact"/>
         <w:numPr>
           <w:ilvl w:val="0"/>
-          <w:numId w:val="1571"/>
+          <w:numId w:val="1575"/>
         </w:numPr>
       </w:pPr>
       <w:r>
@@ -13069,7 +13189,7 @@
         <w:pStyle w:val="Compact"/>
         <w:numPr>
           <w:ilvl w:val="0"/>
-          <w:numId w:val="1572"/>
+          <w:numId w:val="1576"/>
         </w:numPr>
       </w:pPr>
       <w:r>
@@ -13091,7 +13211,7 @@
         <w:pStyle w:val="Compact"/>
         <w:numPr>
           <w:ilvl w:val="0"/>
-          <w:numId w:val="1573"/>
+          <w:numId w:val="1577"/>
         </w:numPr>
       </w:pPr>
       <w:r>
@@ -13103,7 +13223,7 @@
         <w:pStyle w:val="Compact"/>
         <w:numPr>
           <w:ilvl w:val="0"/>
-          <w:numId w:val="1574"/>
+          <w:numId w:val="1578"/>
         </w:numPr>
       </w:pPr>
       <w:r>
@@ -13115,7 +13235,7 @@
         <w:pStyle w:val="Compact"/>
         <w:numPr>
           <w:ilvl w:val="0"/>
-          <w:numId w:val="1575"/>
+          <w:numId w:val="1579"/>
         </w:numPr>
       </w:pPr>
       <w:r>
@@ -13127,7 +13247,7 @@
         <w:pStyle w:val="Compact"/>
         <w:numPr>
           <w:ilvl w:val="0"/>
-          <w:numId w:val="1576"/>
+          <w:numId w:val="1580"/>
         </w:numPr>
       </w:pPr>
       <w:r>
@@ -13139,7 +13259,7 @@
         <w:pStyle w:val="Compact"/>
         <w:numPr>
           <w:ilvl w:val="0"/>
-          <w:numId w:val="1577"/>
+          <w:numId w:val="1581"/>
         </w:numPr>
       </w:pPr>
       <w:r>
@@ -13151,7 +13271,7 @@
         <w:pStyle w:val="Compact"/>
         <w:numPr>
           <w:ilvl w:val="0"/>
-          <w:numId w:val="1578"/>
+          <w:numId w:val="1582"/>
         </w:numPr>
       </w:pPr>
       <w:r>
@@ -13163,7 +13283,7 @@
         <w:pStyle w:val="Compact"/>
         <w:numPr>
           <w:ilvl w:val="0"/>
-          <w:numId w:val="1579"/>
+          <w:numId w:val="1583"/>
         </w:numPr>
       </w:pPr>
       <w:r>
@@ -13175,7 +13295,7 @@
         <w:pStyle w:val="Compact"/>
         <w:numPr>
           <w:ilvl w:val="0"/>
-          <w:numId w:val="1580"/>
+          <w:numId w:val="1584"/>
         </w:numPr>
       </w:pPr>
       <w:r>
@@ -13197,7 +13317,7 @@
         <w:pStyle w:val="Compact"/>
         <w:numPr>
           <w:ilvl w:val="0"/>
-          <w:numId w:val="1581"/>
+          <w:numId w:val="1585"/>
         </w:numPr>
       </w:pPr>
       <w:r>
@@ -13209,7 +13329,7 @@
         <w:pStyle w:val="Compact"/>
         <w:numPr>
           <w:ilvl w:val="0"/>
-          <w:numId w:val="1582"/>
+          <w:numId w:val="1586"/>
         </w:numPr>
       </w:pPr>
       <w:r>
@@ -13221,7 +13341,7 @@
         <w:pStyle w:val="Compact"/>
         <w:numPr>
           <w:ilvl w:val="0"/>
-          <w:numId w:val="1583"/>
+          <w:numId w:val="1587"/>
         </w:numPr>
       </w:pPr>
       <w:r>
@@ -13233,7 +13353,7 @@
         <w:pStyle w:val="Compact"/>
         <w:numPr>
           <w:ilvl w:val="0"/>
-          <w:numId w:val="1584"/>
+          <w:numId w:val="1588"/>
         </w:numPr>
       </w:pPr>
       <w:r>
@@ -13245,7 +13365,7 @@
         <w:pStyle w:val="Compact"/>
         <w:numPr>
           <w:ilvl w:val="0"/>
-          <w:numId w:val="1585"/>
+          <w:numId w:val="1589"/>
         </w:numPr>
       </w:pPr>
       <w:r>
@@ -13257,7 +13377,7 @@
         <w:pStyle w:val="Compact"/>
         <w:numPr>
           <w:ilvl w:val="0"/>
-          <w:numId w:val="1586"/>
+          <w:numId w:val="1590"/>
         </w:numPr>
       </w:pPr>
       <w:r>
@@ -13269,7 +13389,7 @@
         <w:pStyle w:val="Compact"/>
         <w:numPr>
           <w:ilvl w:val="0"/>
-          <w:numId w:val="1587"/>
+          <w:numId w:val="1591"/>
         </w:numPr>
       </w:pPr>
       <w:r>
@@ -13281,7 +13401,7 @@
         <w:pStyle w:val="Compact"/>
         <w:numPr>
           <w:ilvl w:val="0"/>
-          <w:numId w:val="1588"/>
+          <w:numId w:val="1592"/>
         </w:numPr>
       </w:pPr>
       <w:r>
@@ -13293,7 +13413,7 @@
         <w:pStyle w:val="Compact"/>
         <w:numPr>
           <w:ilvl w:val="0"/>
-          <w:numId w:val="1589"/>
+          <w:numId w:val="1593"/>
         </w:numPr>
       </w:pPr>
       <w:r>
@@ -13305,7 +13425,7 @@
         <w:pStyle w:val="Compact"/>
         <w:numPr>
           <w:ilvl w:val="0"/>
-          <w:numId w:val="1590"/>
+          <w:numId w:val="1594"/>
         </w:numPr>
       </w:pPr>
       <w:r>
@@ -13317,7 +13437,7 @@
         <w:pStyle w:val="Compact"/>
         <w:numPr>
           <w:ilvl w:val="0"/>
-          <w:numId w:val="1591"/>
+          <w:numId w:val="1595"/>
         </w:numPr>
       </w:pPr>
       <w:r>
@@ -13329,7 +13449,7 @@
         <w:pStyle w:val="Compact"/>
         <w:numPr>
           <w:ilvl w:val="0"/>
-          <w:numId w:val="1592"/>
+          <w:numId w:val="1596"/>
         </w:numPr>
       </w:pPr>
       <w:r>
@@ -13341,7 +13461,7 @@
         <w:pStyle w:val="Compact"/>
         <w:numPr>
           <w:ilvl w:val="0"/>
-          <w:numId w:val="1593"/>
+          <w:numId w:val="1597"/>
         </w:numPr>
       </w:pPr>
       <w:r>
@@ -13353,7 +13473,7 @@
         <w:pStyle w:val="Compact"/>
         <w:numPr>
           <w:ilvl w:val="0"/>
-          <w:numId w:val="1594"/>
+          <w:numId w:val="1598"/>
         </w:numPr>
       </w:pPr>
       <w:r>
@@ -13365,7 +13485,7 @@
         <w:pStyle w:val="Compact"/>
         <w:numPr>
           <w:ilvl w:val="0"/>
-          <w:numId w:val="1595"/>
+          <w:numId w:val="1599"/>
         </w:numPr>
       </w:pPr>
       <w:r>
@@ -13397,7 +13517,7 @@
         <w:pStyle w:val="Compact"/>
         <w:numPr>
           <w:ilvl w:val="0"/>
-          <w:numId w:val="1596"/>
+          <w:numId w:val="1600"/>
         </w:numPr>
       </w:pPr>
       <w:r>
@@ -13409,7 +13529,7 @@
         <w:pStyle w:val="Compact"/>
         <w:numPr>
           <w:ilvl w:val="0"/>
-          <w:numId w:val="1597"/>
+          <w:numId w:val="1601"/>
         </w:numPr>
       </w:pPr>
       <w:r>
@@ -13421,7 +13541,7 @@
         <w:pStyle w:val="Compact"/>
         <w:numPr>
           <w:ilvl w:val="0"/>
-          <w:numId w:val="1598"/>
+          <w:numId w:val="1602"/>
         </w:numPr>
       </w:pPr>
       <w:r>
@@ -13433,7 +13553,7 @@
         <w:pStyle w:val="Compact"/>
         <w:numPr>
           <w:ilvl w:val="0"/>
-          <w:numId w:val="1599"/>
+          <w:numId w:val="1603"/>
         </w:numPr>
       </w:pPr>
       <w:r>
@@ -13445,7 +13565,7 @@
         <w:pStyle w:val="Compact"/>
         <w:numPr>
           <w:ilvl w:val="0"/>
-          <w:numId w:val="1600"/>
+          <w:numId w:val="1604"/>
         </w:numPr>
       </w:pPr>
       <w:r>
@@ -13457,7 +13577,7 @@
         <w:pStyle w:val="Compact"/>
         <w:numPr>
           <w:ilvl w:val="0"/>
-          <w:numId w:val="1601"/>
+          <w:numId w:val="1605"/>
         </w:numPr>
       </w:pPr>
       <w:r>
@@ -13469,7 +13589,7 @@
         <w:pStyle w:val="Compact"/>
         <w:numPr>
           <w:ilvl w:val="0"/>
-          <w:numId w:val="1602"/>
+          <w:numId w:val="1606"/>
         </w:numPr>
       </w:pPr>
       <w:r>
@@ -13481,7 +13601,7 @@
         <w:pStyle w:val="Compact"/>
         <w:numPr>
           <w:ilvl w:val="0"/>
-          <w:numId w:val="1603"/>
+          <w:numId w:val="1607"/>
         </w:numPr>
       </w:pPr>
       <w:r>
@@ -13493,7 +13613,7 @@
         <w:pStyle w:val="Compact"/>
         <w:numPr>
           <w:ilvl w:val="0"/>
-          <w:numId w:val="1604"/>
+          <w:numId w:val="1608"/>
         </w:numPr>
       </w:pPr>
       <w:r>
@@ -13505,7 +13625,7 @@
         <w:pStyle w:val="Compact"/>
         <w:numPr>
           <w:ilvl w:val="0"/>
-          <w:numId w:val="1605"/>
+          <w:numId w:val="1609"/>
         </w:numPr>
       </w:pPr>
       <w:r>
@@ -13517,7 +13637,7 @@
         <w:pStyle w:val="Compact"/>
         <w:numPr>
           <w:ilvl w:val="0"/>
-          <w:numId w:val="1606"/>
+          <w:numId w:val="1610"/>
         </w:numPr>
       </w:pPr>
       <w:r>
@@ -13529,7 +13649,7 @@
         <w:pStyle w:val="Compact"/>
         <w:numPr>
           <w:ilvl w:val="0"/>
-          <w:numId w:val="1607"/>
+          <w:numId w:val="1611"/>
         </w:numPr>
       </w:pPr>
       <w:r>
@@ -13541,7 +13661,7 @@
         <w:pStyle w:val="Compact"/>
         <w:numPr>
           <w:ilvl w:val="0"/>
-          <w:numId w:val="1608"/>
+          <w:numId w:val="1612"/>
         </w:numPr>
       </w:pPr>
       <w:r>
@@ -13578,7 +13698,7 @@
         <w:pStyle w:val="Compact"/>
         <w:numPr>
           <w:ilvl w:val="0"/>
-          <w:numId w:val="1609"/>
+          <w:numId w:val="1613"/>
         </w:numPr>
       </w:pPr>
       <w:r>
@@ -13590,7 +13710,7 @@
         <w:pStyle w:val="Compact"/>
         <w:numPr>
           <w:ilvl w:val="0"/>
-          <w:numId w:val="1610"/>
+          <w:numId w:val="1614"/>
         </w:numPr>
       </w:pPr>
       <w:r>
@@ -13617,7 +13737,7 @@
         <w:pStyle w:val="Compact"/>
         <w:numPr>
           <w:ilvl w:val="0"/>
-          <w:numId w:val="1611"/>
+          <w:numId w:val="1615"/>
         </w:numPr>
       </w:pPr>
       <w:r>
@@ -13629,7 +13749,7 @@
         <w:pStyle w:val="Compact"/>
         <w:numPr>
           <w:ilvl w:val="0"/>
-          <w:numId w:val="1612"/>
+          <w:numId w:val="1616"/>
         </w:numPr>
       </w:pPr>
       <w:r>
@@ -13641,7 +13761,7 @@
         <w:pStyle w:val="Compact"/>
         <w:numPr>
           <w:ilvl w:val="0"/>
-          <w:numId w:val="1613"/>
+          <w:numId w:val="1617"/>
         </w:numPr>
       </w:pPr>
       <w:r>
@@ -13653,7 +13773,7 @@
         <w:pStyle w:val="Compact"/>
         <w:numPr>
           <w:ilvl w:val="0"/>
-          <w:numId w:val="1614"/>
+          <w:numId w:val="1618"/>
         </w:numPr>
       </w:pPr>
       <w:r>
@@ -13665,7 +13785,7 @@
         <w:pStyle w:val="Compact"/>
         <w:numPr>
           <w:ilvl w:val="0"/>
-          <w:numId w:val="1615"/>
+          <w:numId w:val="1619"/>
         </w:numPr>
       </w:pPr>
       <w:r>
@@ -13677,7 +13797,7 @@
         <w:pStyle w:val="Compact"/>
         <w:numPr>
           <w:ilvl w:val="0"/>
-          <w:numId w:val="1616"/>
+          <w:numId w:val="1620"/>
         </w:numPr>
       </w:pPr>
       <w:r>
@@ -13699,7 +13819,7 @@
         <w:pStyle w:val="Compact"/>
         <w:numPr>
           <w:ilvl w:val="0"/>
-          <w:numId w:val="1617"/>
+          <w:numId w:val="1621"/>
         </w:numPr>
       </w:pPr>
       <w:r>
@@ -13711,7 +13831,7 @@
         <w:pStyle w:val="Compact"/>
         <w:numPr>
           <w:ilvl w:val="0"/>
-          <w:numId w:val="1618"/>
+          <w:numId w:val="1622"/>
         </w:numPr>
       </w:pPr>
       <w:r>
@@ -13723,7 +13843,7 @@
         <w:pStyle w:val="Compact"/>
         <w:numPr>
           <w:ilvl w:val="0"/>
-          <w:numId w:val="1619"/>
+          <w:numId w:val="1623"/>
         </w:numPr>
       </w:pPr>
       <w:r>
@@ -13735,7 +13855,7 @@
         <w:pStyle w:val="Compact"/>
         <w:numPr>
           <w:ilvl w:val="0"/>
-          <w:numId w:val="1620"/>
+          <w:numId w:val="1624"/>
         </w:numPr>
       </w:pPr>
       <w:r>
@@ -13747,7 +13867,7 @@
         <w:pStyle w:val="Compact"/>
         <w:numPr>
           <w:ilvl w:val="0"/>
-          <w:numId w:val="1621"/>
+          <w:numId w:val="1625"/>
         </w:numPr>
       </w:pPr>
       <w:r>
@@ -13759,7 +13879,7 @@
         <w:pStyle w:val="Compact"/>
         <w:numPr>
           <w:ilvl w:val="0"/>
-          <w:numId w:val="1622"/>
+          <w:numId w:val="1626"/>
         </w:numPr>
       </w:pPr>
       <w:r>
@@ -13771,7 +13891,7 @@
         <w:pStyle w:val="Compact"/>
         <w:numPr>
           <w:ilvl w:val="0"/>
-          <w:numId w:val="1623"/>
+          <w:numId w:val="1627"/>
         </w:numPr>
       </w:pPr>
       <w:r>
@@ -13783,7 +13903,7 @@
         <w:pStyle w:val="Compact"/>
         <w:numPr>
           <w:ilvl w:val="0"/>
-          <w:numId w:val="1624"/>
+          <w:numId w:val="1628"/>
         </w:numPr>
       </w:pPr>
       <w:r>
@@ -13795,7 +13915,7 @@
         <w:pStyle w:val="Compact"/>
         <w:numPr>
           <w:ilvl w:val="0"/>
-          <w:numId w:val="1625"/>
+          <w:numId w:val="1629"/>
         </w:numPr>
       </w:pPr>
       <w:r>
@@ -13818,7 +13938,7 @@
         <w:pStyle w:val="Compact"/>
         <w:numPr>
           <w:ilvl w:val="0"/>
-          <w:numId w:val="1626"/>
+          <w:numId w:val="1630"/>
         </w:numPr>
       </w:pPr>
       <w:r>
@@ -13830,7 +13950,7 @@
         <w:pStyle w:val="Compact"/>
         <w:numPr>
           <w:ilvl w:val="0"/>
-          <w:numId w:val="1627"/>
+          <w:numId w:val="1631"/>
         </w:numPr>
       </w:pPr>
       <w:r>
@@ -13842,7 +13962,7 @@
         <w:pStyle w:val="Compact"/>
         <w:numPr>
           <w:ilvl w:val="0"/>
-          <w:numId w:val="1628"/>
+          <w:numId w:val="1632"/>
         </w:numPr>
       </w:pPr>
       <w:r>
@@ -13854,7 +13974,7 @@
         <w:pStyle w:val="Compact"/>
         <w:numPr>
           <w:ilvl w:val="0"/>
-          <w:numId w:val="1629"/>
+          <w:numId w:val="1633"/>
         </w:numPr>
       </w:pPr>
       <w:r>
@@ -13866,7 +13986,7 @@
         <w:pStyle w:val="Compact"/>
         <w:numPr>
           <w:ilvl w:val="0"/>
-          <w:numId w:val="1630"/>
+          <w:numId w:val="1634"/>
         </w:numPr>
       </w:pPr>
       <w:r>
@@ -13878,7 +13998,7 @@
         <w:pStyle w:val="Compact"/>
         <w:numPr>
           <w:ilvl w:val="0"/>
-          <w:numId w:val="1631"/>
+          <w:numId w:val="1635"/>
         </w:numPr>
       </w:pPr>
       <w:r>
@@ -13890,7 +14010,7 @@
         <w:pStyle w:val="Compact"/>
         <w:numPr>
           <w:ilvl w:val="0"/>
-          <w:numId w:val="1632"/>
+          <w:numId w:val="1636"/>
         </w:numPr>
       </w:pPr>
       <w:r>
@@ -13902,7 +14022,7 @@
         <w:pStyle w:val="Compact"/>
         <w:numPr>
           <w:ilvl w:val="0"/>
-          <w:numId w:val="1633"/>
+          <w:numId w:val="1637"/>
         </w:numPr>
       </w:pPr>
       <w:r>
@@ -13914,7 +14034,7 @@
         <w:pStyle w:val="Compact"/>
         <w:numPr>
           <w:ilvl w:val="0"/>
-          <w:numId w:val="1634"/>
+          <w:numId w:val="1638"/>
         </w:numPr>
       </w:pPr>
       <w:r>
@@ -13926,7 +14046,7 @@
         <w:pStyle w:val="Compact"/>
         <w:numPr>
           <w:ilvl w:val="0"/>
-          <w:numId w:val="1635"/>
+          <w:numId w:val="1639"/>
         </w:numPr>
       </w:pPr>
       <w:r>
@@ -13938,7 +14058,7 @@
         <w:pStyle w:val="Compact"/>
         <w:numPr>
           <w:ilvl w:val="0"/>
-          <w:numId w:val="1636"/>
+          <w:numId w:val="1640"/>
         </w:numPr>
       </w:pPr>
       <w:r>
@@ -15504,37 +15624,37 @@
     <w:abstractNumId w:val="993"/>
   </w:num>
   <w:num w:numId="1349">
+    <w:abstractNumId w:val="993"/>
+  </w:num>
+  <w:num w:numId="1350">
+    <w:abstractNumId w:val="992"/>
+  </w:num>
+  <w:num w:numId="1351">
+    <w:abstractNumId w:val="993"/>
+  </w:num>
+  <w:num w:numId="1352">
+    <w:abstractNumId w:val="993"/>
+  </w:num>
+  <w:num w:numId="1353">
     <w:abstractNumId w:val="991"/>
   </w:num>
-  <w:num w:numId="1350">
-    <w:abstractNumId w:val="993"/>
-  </w:num>
-  <w:num w:numId="1351">
-    <w:abstractNumId w:val="993"/>
-  </w:num>
-  <w:num w:numId="1352">
-    <w:abstractNumId w:val="993"/>
-  </w:num>
-  <w:num w:numId="1353">
-    <w:abstractNumId w:val="993"/>
-  </w:num>
   <w:num w:numId="1354">
-    <w:abstractNumId w:val="992"/>
+    <w:abstractNumId w:val="993"/>
   </w:num>
   <w:num w:numId="1355">
     <w:abstractNumId w:val="993"/>
   </w:num>
   <w:num w:numId="1356">
-    <w:abstractNumId w:val="992"/>
+    <w:abstractNumId w:val="993"/>
   </w:num>
   <w:num w:numId="1357">
-    <w:abstractNumId w:val="992"/>
+    <w:abstractNumId w:val="993"/>
   </w:num>
   <w:num w:numId="1358">
-    <w:abstractNumId w:val="993"/>
+    <w:abstractNumId w:val="992"/>
   </w:num>
   <w:num w:numId="1359">
-    <w:abstractNumId w:val="992"/>
+    <w:abstractNumId w:val="993"/>
   </w:num>
   <w:num w:numId="1360">
     <w:abstractNumId w:val="992"/>
@@ -15543,34 +15663,34 @@
     <w:abstractNumId w:val="992"/>
   </w:num>
   <w:num w:numId="1362">
-    <w:abstractNumId w:val="992"/>
+    <w:abstractNumId w:val="993"/>
   </w:num>
   <w:num w:numId="1363">
     <w:abstractNumId w:val="992"/>
   </w:num>
   <w:num w:numId="1364">
-    <w:abstractNumId w:val="992"/>
+    <w:abstractNumId w:val="993"/>
   </w:num>
   <w:num w:numId="1365">
+    <w:abstractNumId w:val="993"/>
+  </w:num>
+  <w:num w:numId="1366">
+    <w:abstractNumId w:val="993"/>
+  </w:num>
+  <w:num w:numId="1367">
+    <w:abstractNumId w:val="993"/>
+  </w:num>
+  <w:num w:numId="1368">
+    <w:abstractNumId w:val="993"/>
+  </w:num>
+  <w:num w:numId="1369">
     <w:abstractNumId w:val="991"/>
   </w:num>
-  <w:num w:numId="1366">
-    <w:abstractNumId w:val="992"/>
-  </w:num>
-  <w:num w:numId="1367">
-    <w:abstractNumId w:val="992"/>
-  </w:num>
-  <w:num w:numId="1368">
-    <w:abstractNumId w:val="993"/>
-  </w:num>
-  <w:num w:numId="1369">
-    <w:abstractNumId w:val="992"/>
-  </w:num>
   <w:num w:numId="1370">
     <w:abstractNumId w:val="993"/>
   </w:num>
   <w:num w:numId="1371">
-    <w:abstractNumId w:val="992"/>
+    <w:abstractNumId w:val="993"/>
   </w:num>
   <w:num w:numId="1372">
     <w:abstractNumId w:val="993"/>
@@ -15579,7 +15699,7 @@
     <w:abstractNumId w:val="992"/>
   </w:num>
   <w:num w:numId="1374">
-    <w:abstractNumId w:val="992"/>
+    <w:abstractNumId w:val="993"/>
   </w:num>
   <w:num w:numId="1375">
     <w:abstractNumId w:val="992"/>
@@ -15597,7 +15717,7 @@
     <w:abstractNumId w:val="992"/>
   </w:num>
   <w:num w:numId="1380">
-    <w:abstractNumId w:val="992"/>
+    <w:abstractNumId w:val="993"/>
   </w:num>
   <w:num w:numId="1381">
     <w:abstractNumId w:val="992"/>
@@ -15675,22 +15795,22 @@
     <w:abstractNumId w:val="992"/>
   </w:num>
   <w:num w:numId="1406">
-    <w:abstractNumId w:val="993"/>
+    <w:abstractNumId w:val="992"/>
   </w:num>
   <w:num w:numId="1407">
-    <w:abstractNumId w:val="993"/>
+    <w:abstractNumId w:val="992"/>
   </w:num>
   <w:num w:numId="1408">
-    <w:abstractNumId w:val="993"/>
+    <w:abstractNumId w:val="992"/>
   </w:num>
   <w:num w:numId="1409">
-    <w:abstractNumId w:val="993"/>
+    <w:abstractNumId w:val="992"/>
   </w:num>
   <w:num w:numId="1410">
-    <w:abstractNumId w:val="992"/>
+    <w:abstractNumId w:val="993"/>
   </w:num>
   <w:num w:numId="1411">
-    <w:abstractNumId w:val="992"/>
+    <w:abstractNumId w:val="993"/>
   </w:num>
   <w:num w:numId="1412">
     <w:abstractNumId w:val="993"/>
@@ -15699,10 +15819,10 @@
     <w:abstractNumId w:val="993"/>
   </w:num>
   <w:num w:numId="1414">
-    <w:abstractNumId w:val="993"/>
+    <w:abstractNumId w:val="992"/>
   </w:num>
   <w:num w:numId="1415">
-    <w:abstractNumId w:val="993"/>
+    <w:abstractNumId w:val="992"/>
   </w:num>
   <w:num w:numId="1416">
     <w:abstractNumId w:val="993"/>
@@ -15735,34 +15855,34 @@
     <w:abstractNumId w:val="993"/>
   </w:num>
   <w:num w:numId="1426">
-    <w:abstractNumId w:val="992"/>
+    <w:abstractNumId w:val="993"/>
   </w:num>
   <w:num w:numId="1427">
+    <w:abstractNumId w:val="993"/>
+  </w:num>
+  <w:num w:numId="1428">
+    <w:abstractNumId w:val="993"/>
+  </w:num>
+  <w:num w:numId="1429">
+    <w:abstractNumId w:val="993"/>
+  </w:num>
+  <w:num w:numId="1430">
+    <w:abstractNumId w:val="992"/>
+  </w:num>
+  <w:num w:numId="1431">
     <w:abstractNumId w:val="991"/>
   </w:num>
-  <w:num w:numId="1428">
-    <w:abstractNumId w:val="993"/>
-  </w:num>
-  <w:num w:numId="1429">
-    <w:abstractNumId w:val="993"/>
-  </w:num>
-  <w:num w:numId="1430">
-    <w:abstractNumId w:val="992"/>
-  </w:num>
-  <w:num w:numId="1431">
-    <w:abstractNumId w:val="992"/>
-  </w:num>
   <w:num w:numId="1432">
-    <w:abstractNumId w:val="992"/>
+    <w:abstractNumId w:val="993"/>
   </w:num>
   <w:num w:numId="1433">
-    <w:abstractNumId w:val="992"/>
+    <w:abstractNumId w:val="993"/>
   </w:num>
   <w:num w:numId="1434">
     <w:abstractNumId w:val="992"/>
   </w:num>
   <w:num w:numId="1435">
-    <w:abstractNumId w:val="993"/>
+    <w:abstractNumId w:val="992"/>
   </w:num>
   <w:num w:numId="1436">
     <w:abstractNumId w:val="992"/>
@@ -15771,16 +15891,16 @@
     <w:abstractNumId w:val="992"/>
   </w:num>
   <w:num w:numId="1438">
-    <w:abstractNumId w:val="993"/>
+    <w:abstractNumId w:val="992"/>
   </w:num>
   <w:num w:numId="1439">
     <w:abstractNumId w:val="993"/>
   </w:num>
   <w:num w:numId="1440">
-    <w:abstractNumId w:val="993"/>
+    <w:abstractNumId w:val="992"/>
   </w:num>
   <w:num w:numId="1441">
-    <w:abstractNumId w:val="993"/>
+    <w:abstractNumId w:val="992"/>
   </w:num>
   <w:num w:numId="1442">
     <w:abstractNumId w:val="993"/>
@@ -15813,7 +15933,7 @@
     <w:abstractNumId w:val="993"/>
   </w:num>
   <w:num w:numId="1452">
-    <w:abstractNumId w:val="991"/>
+    <w:abstractNumId w:val="993"/>
   </w:num>
   <w:num w:numId="1453">
     <w:abstractNumId w:val="993"/>
@@ -15834,35 +15954,35 @@
     <w:abstractNumId w:val="993"/>
   </w:num>
   <w:num w:numId="1459">
-    <w:abstractNumId w:val="992"/>
+    <w:abstractNumId w:val="993"/>
   </w:num>
   <w:num w:numId="1460">
-    <w:abstractNumId w:val="992"/>
+    <w:abstractNumId w:val="991"/>
   </w:num>
   <w:num w:numId="1461">
     <w:abstractNumId w:val="993"/>
   </w:num>
   <w:num w:numId="1462">
+    <w:abstractNumId w:val="993"/>
+  </w:num>
+  <w:num w:numId="1463">
+    <w:abstractNumId w:val="992"/>
+  </w:num>
+  <w:num w:numId="1464">
+    <w:abstractNumId w:val="992"/>
+  </w:num>
+  <w:num w:numId="1465">
+    <w:abstractNumId w:val="993"/>
+  </w:num>
+  <w:num w:numId="1466">
     <w:abstractNumId w:val="991"/>
   </w:num>
-  <w:num w:numId="1463">
-    <w:abstractNumId w:val="993"/>
-  </w:num>
-  <w:num w:numId="1464">
+  <w:num w:numId="1467">
+    <w:abstractNumId w:val="993"/>
+  </w:num>
+  <w:num w:numId="1468">
     <w:abstractNumId w:val="991"/>
   </w:num>
-  <w:num w:numId="1465">
-    <w:abstractNumId w:val="993"/>
-  </w:num>
-  <w:num w:numId="1466">
-    <w:abstractNumId w:val="993"/>
-  </w:num>
-  <w:num w:numId="1467">
-    <w:abstractNumId w:val="993"/>
-  </w:num>
-  <w:num w:numId="1468">
-    <w:abstractNumId w:val="993"/>
-  </w:num>
   <w:num w:numId="1469">
     <w:abstractNumId w:val="993"/>
   </w:num>
@@ -15879,20 +15999,20 @@
     <w:abstractNumId w:val="993"/>
   </w:num>
   <w:num w:numId="1474">
+    <w:abstractNumId w:val="993"/>
+  </w:num>
+  <w:num w:numId="1475">
+    <w:abstractNumId w:val="993"/>
+  </w:num>
+  <w:num w:numId="1476">
+    <w:abstractNumId w:val="993"/>
+  </w:num>
+  <w:num w:numId="1477">
+    <w:abstractNumId w:val="993"/>
+  </w:num>
+  <w:num w:numId="1478">
     <w:abstractNumId w:val="991"/>
   </w:num>
-  <w:num w:numId="1475">
-    <w:abstractNumId w:val="993"/>
-  </w:num>
-  <w:num w:numId="1476">
-    <w:abstractNumId w:val="993"/>
-  </w:num>
-  <w:num w:numId="1477">
-    <w:abstractNumId w:val="992"/>
-  </w:num>
-  <w:num w:numId="1478">
-    <w:abstractNumId w:val="992"/>
-  </w:num>
   <w:num w:numId="1479">
     <w:abstractNumId w:val="993"/>
   </w:num>
@@ -15900,22 +16020,22 @@
     <w:abstractNumId w:val="993"/>
   </w:num>
   <w:num w:numId="1481">
-    <w:abstractNumId w:val="993"/>
+    <w:abstractNumId w:val="992"/>
   </w:num>
   <w:num w:numId="1482">
     <w:abstractNumId w:val="992"/>
   </w:num>
   <w:num w:numId="1483">
-    <w:abstractNumId w:val="992"/>
+    <w:abstractNumId w:val="993"/>
   </w:num>
   <w:num w:numId="1484">
-    <w:abstractNumId w:val="992"/>
+    <w:abstractNumId w:val="993"/>
   </w:num>
   <w:num w:numId="1485">
-    <w:abstractNumId w:val="992"/>
+    <w:abstractNumId w:val="993"/>
   </w:num>
   <w:num w:numId="1486">
-    <w:abstractNumId w:val="993"/>
+    <w:abstractNumId w:val="992"/>
   </w:num>
   <w:num w:numId="1487">
     <w:abstractNumId w:val="992"/>
@@ -15924,16 +16044,16 @@
     <w:abstractNumId w:val="992"/>
   </w:num>
   <w:num w:numId="1489">
-    <w:abstractNumId w:val="993"/>
+    <w:abstractNumId w:val="992"/>
   </w:num>
   <w:num w:numId="1490">
     <w:abstractNumId w:val="993"/>
   </w:num>
   <w:num w:numId="1491">
-    <w:abstractNumId w:val="993"/>
+    <w:abstractNumId w:val="992"/>
   </w:num>
   <w:num w:numId="1492">
-    <w:abstractNumId w:val="993"/>
+    <w:abstractNumId w:val="992"/>
   </w:num>
   <w:num w:numId="1493">
     <w:abstractNumId w:val="993"/>
@@ -15984,20 +16104,20 @@
     <w:abstractNumId w:val="993"/>
   </w:num>
   <w:num w:numId="1509">
+    <w:abstractNumId w:val="993"/>
+  </w:num>
+  <w:num w:numId="1510">
+    <w:abstractNumId w:val="993"/>
+  </w:num>
+  <w:num w:numId="1511">
+    <w:abstractNumId w:val="993"/>
+  </w:num>
+  <w:num w:numId="1512">
+    <w:abstractNumId w:val="993"/>
+  </w:num>
+  <w:num w:numId="1513">
     <w:abstractNumId w:val="991"/>
   </w:num>
-  <w:num w:numId="1510">
-    <w:abstractNumId w:val="992"/>
-  </w:num>
-  <w:num w:numId="1511">
-    <w:abstractNumId w:val="992"/>
-  </w:num>
-  <w:num w:numId="1512">
-    <w:abstractNumId w:val="992"/>
-  </w:num>
-  <w:num w:numId="1513">
-    <w:abstractNumId w:val="992"/>
-  </w:num>
   <w:num w:numId="1514">
     <w:abstractNumId w:val="992"/>
   </w:num>
@@ -16035,44 +16155,44 @@
     <w:abstractNumId w:val="992"/>
   </w:num>
   <w:num w:numId="1526">
-    <w:abstractNumId w:val="993"/>
+    <w:abstractNumId w:val="992"/>
   </w:num>
   <w:num w:numId="1527">
-    <w:abstractNumId w:val="993"/>
+    <w:abstractNumId w:val="992"/>
   </w:num>
   <w:num w:numId="1528">
-    <w:abstractNumId w:val="993"/>
+    <w:abstractNumId w:val="992"/>
   </w:num>
   <w:num w:numId="1529">
-    <w:abstractNumId w:val="993"/>
+    <w:abstractNumId w:val="992"/>
   </w:num>
   <w:num w:numId="1530">
     <w:abstractNumId w:val="993"/>
   </w:num>
   <w:num w:numId="1531">
+    <w:abstractNumId w:val="993"/>
+  </w:num>
+  <w:num w:numId="1532">
+    <w:abstractNumId w:val="993"/>
+  </w:num>
+  <w:num w:numId="1533">
+    <w:abstractNumId w:val="993"/>
+  </w:num>
+  <w:num w:numId="1534">
+    <w:abstractNumId w:val="993"/>
+  </w:num>
+  <w:num w:numId="1535">
     <w:abstractNumId w:val="991"/>
   </w:num>
-  <w:num w:numId="1532">
-    <w:abstractNumId w:val="993"/>
-  </w:num>
-  <w:num w:numId="1533">
-    <w:abstractNumId w:val="993"/>
-  </w:num>
-  <w:num w:numId="1534">
+  <w:num w:numId="1536">
+    <w:abstractNumId w:val="993"/>
+  </w:num>
+  <w:num w:numId="1537">
+    <w:abstractNumId w:val="993"/>
+  </w:num>
+  <w:num w:numId="1538">
     <w:abstractNumId w:val="991"/>
   </w:num>
-  <w:num w:numId="1535">
-    <w:abstractNumId w:val="993"/>
-  </w:num>
-  <w:num w:numId="1536">
-    <w:abstractNumId w:val="993"/>
-  </w:num>
-  <w:num w:numId="1537">
-    <w:abstractNumId w:val="993"/>
-  </w:num>
-  <w:num w:numId="1538">
-    <w:abstractNumId w:val="993"/>
-  </w:num>
   <w:num w:numId="1539">
     <w:abstractNumId w:val="993"/>
   </w:num>
@@ -16092,37 +16212,37 @@
     <w:abstractNumId w:val="993"/>
   </w:num>
   <w:num w:numId="1545">
+    <w:abstractNumId w:val="993"/>
+  </w:num>
+  <w:num w:numId="1546">
+    <w:abstractNumId w:val="993"/>
+  </w:num>
+  <w:num w:numId="1547">
+    <w:abstractNumId w:val="993"/>
+  </w:num>
+  <w:num w:numId="1548">
+    <w:abstractNumId w:val="993"/>
+  </w:num>
+  <w:num w:numId="1549">
     <w:abstractNumId w:val="991"/>
   </w:num>
-  <w:num w:numId="1546">
-    <w:abstractNumId w:val="993"/>
-  </w:num>
-  <w:num w:numId="1547">
+  <w:num w:numId="1550">
+    <w:abstractNumId w:val="993"/>
+  </w:num>
+  <w:num w:numId="1551">
     <w:abstractNumId w:val="991"/>
   </w:num>
-  <w:num w:numId="1548">
-    <w:abstractNumId w:val="993"/>
-  </w:num>
-  <w:num w:numId="1549">
-    <w:abstractNumId w:val="993"/>
-  </w:num>
-  <w:num w:numId="1550">
-    <w:abstractNumId w:val="993"/>
-  </w:num>
-  <w:num w:numId="1551">
-    <w:abstractNumId w:val="993"/>
-  </w:num>
   <w:num w:numId="1552">
-    <w:abstractNumId w:val="992"/>
+    <w:abstractNumId w:val="993"/>
   </w:num>
   <w:num w:numId="1553">
-    <w:abstractNumId w:val="992"/>
+    <w:abstractNumId w:val="993"/>
   </w:num>
   <w:num w:numId="1554">
     <w:abstractNumId w:val="993"/>
   </w:num>
   <w:num w:numId="1555">
-    <w:abstractNumId w:val="992"/>
+    <w:abstractNumId w:val="993"/>
   </w:num>
   <w:num w:numId="1556">
     <w:abstractNumId w:val="992"/>
@@ -16131,7 +16251,7 @@
     <w:abstractNumId w:val="992"/>
   </w:num>
   <w:num w:numId="1558">
-    <w:abstractNumId w:val="992"/>
+    <w:abstractNumId w:val="993"/>
   </w:num>
   <w:num w:numId="1559">
     <w:abstractNumId w:val="992"/>
@@ -16140,16 +16260,16 @@
     <w:abstractNumId w:val="992"/>
   </w:num>
   <w:num w:numId="1561">
-    <w:abstractNumId w:val="993"/>
+    <w:abstractNumId w:val="992"/>
   </w:num>
   <w:num w:numId="1562">
-    <w:abstractNumId w:val="993"/>
+    <w:abstractNumId w:val="992"/>
   </w:num>
   <w:num w:numId="1563">
-    <w:abstractNumId w:val="993"/>
+    <w:abstractNumId w:val="992"/>
   </w:num>
   <w:num w:numId="1564">
-    <w:abstractNumId w:val="993"/>
+    <w:abstractNumId w:val="992"/>
   </w:num>
   <w:num w:numId="1565">
     <w:abstractNumId w:val="993"/>
@@ -16161,7 +16281,7 @@
     <w:abstractNumId w:val="993"/>
   </w:num>
   <w:num w:numId="1568">
-    <w:abstractNumId w:val="992"/>
+    <w:abstractNumId w:val="993"/>
   </w:num>
   <w:num w:numId="1569">
     <w:abstractNumId w:val="993"/>
@@ -16197,7 +16317,7 @@
     <w:abstractNumId w:val="993"/>
   </w:num>
   <w:num w:numId="1580">
-    <w:abstractNumId w:val="993"/>
+    <w:abstractNumId w:val="992"/>
   </w:num>
   <w:num w:numId="1581">
     <w:abstractNumId w:val="993"/>
@@ -16206,43 +16326,43 @@
     <w:abstractNumId w:val="993"/>
   </w:num>
   <w:num w:numId="1583">
-    <w:abstractNumId w:val="992"/>
+    <w:abstractNumId w:val="993"/>
   </w:num>
   <w:num w:numId="1584">
     <w:abstractNumId w:val="993"/>
   </w:num>
   <w:num w:numId="1585">
-    <w:abstractNumId w:val="992"/>
+    <w:abstractNumId w:val="993"/>
   </w:num>
   <w:num w:numId="1586">
-    <w:abstractNumId w:val="992"/>
+    <w:abstractNumId w:val="993"/>
   </w:num>
   <w:num w:numId="1587">
-    <w:abstractNumId w:val="993"/>
+    <w:abstractNumId w:val="992"/>
   </w:num>
   <w:num w:numId="1588">
     <w:abstractNumId w:val="993"/>
   </w:num>
   <w:num w:numId="1589">
-    <w:abstractNumId w:val="993"/>
+    <w:abstractNumId w:val="992"/>
   </w:num>
   <w:num w:numId="1590">
-    <w:abstractNumId w:val="993"/>
+    <w:abstractNumId w:val="992"/>
   </w:num>
   <w:num w:numId="1591">
-    <w:abstractNumId w:val="992"/>
+    <w:abstractNumId w:val="993"/>
   </w:num>
   <w:num w:numId="1592">
-    <w:abstractNumId w:val="992"/>
+    <w:abstractNumId w:val="993"/>
   </w:num>
   <w:num w:numId="1593">
-    <w:abstractNumId w:val="992"/>
+    <w:abstractNumId w:val="993"/>
   </w:num>
   <w:num w:numId="1594">
-    <w:abstractNumId w:val="992"/>
+    <w:abstractNumId w:val="993"/>
   </w:num>
   <w:num w:numId="1595">
-    <w:abstractNumId w:val="993"/>
+    <w:abstractNumId w:val="992"/>
   </w:num>
   <w:num w:numId="1596">
     <w:abstractNumId w:val="992"/>
@@ -16254,7 +16374,7 @@
     <w:abstractNumId w:val="992"/>
   </w:num>
   <w:num w:numId="1599">
-    <w:abstractNumId w:val="992"/>
+    <w:abstractNumId w:val="993"/>
   </w:num>
   <w:num w:numId="1600">
     <w:abstractNumId w:val="992"/>
@@ -16365,6 +16485,18 @@
     <w:abstractNumId w:val="992"/>
   </w:num>
   <w:num w:numId="1636">
+    <w:abstractNumId w:val="992"/>
+  </w:num>
+  <w:num w:numId="1637">
+    <w:abstractNumId w:val="992"/>
+  </w:num>
+  <w:num w:numId="1638">
+    <w:abstractNumId w:val="992"/>
+  </w:num>
+  <w:num w:numId="1639">
+    <w:abstractNumId w:val="992"/>
+  </w:num>
+  <w:num w:numId="1640">
     <w:abstractNumId w:val="992"/>
   </w:num>
 </w:numbering>

</xml_diff>

<commit_message>
Implement M1.5 engagement reset mechanics
</commit_message>
<xml_diff>
--- a/MASTER_M1_M2_DELIVERY_CHECKLIST.docx
+++ b/MASTER_M1_M2_DELIVERY_CHECKLIST.docx
@@ -409,7 +409,7 @@
               <w:jc w:val="right"/>
             </w:pPr>
             <w:r>
-              <w:t xml:space="preserve">5%</w:t>
+              <w:t xml:space="preserve">7%</w:t>
             </w:r>
           </w:p>
         </w:tc>
@@ -420,7 +420,7 @@
               <w:pStyle w:val="Compact"/>
             </w:pPr>
             <w:r>
-              <w:t xml:space="preserve">Backend + Pipeline UI attempt banner/quick-log implemented; browser/reset/pixel pending</w:t>
+              <w:t xml:space="preserve">Backend, Pipeline UI, inbound/forward reset mechanics implemented; browser/pixel pending</w:t>
             </w:r>
           </w:p>
         </w:tc>
@@ -709,7 +709,7 @@
                 <w:b/>
                 <w:bCs/>
               </w:rPr>
-              <w:t xml:space="preserve">62%</w:t>
+              <w:t xml:space="preserve">64%</w:t>
             </w:r>
           </w:p>
         </w:tc>
@@ -724,7 +724,7 @@
                 <w:b/>
                 <w:bCs/>
               </w:rPr>
-              <w:t xml:space="preserve">M1.5 Pipeline UI attempt controls added; browser/reset/release gates remain</w:t>
+              <w:t xml:space="preserve">M1.5 reset mechanics added; browser/pixel/release gates remain</w:t>
             </w:r>
           </w:p>
         </w:tc>
@@ -8622,6 +8622,129 @@
         <w:t xml:space="preserve">state setters/manual memoization; not fixed in this M1.5 UI slice to avoid broad refactor.</w:t>
       </w:r>
     </w:p>
+    <w:p>
+      <w:pPr>
+        <w:pStyle w:val="Compact"/>
+        <w:numPr>
+          <w:ilvl w:val="0"/>
+          <w:numId w:val="1347"/>
+        </w:numPr>
+      </w:pPr>
+      <w:r>
+        <w:t xml:space="preserve">Added inbound SMS engagement reset helper for active deals linked by</w:t>
+      </w:r>
+      <w:r>
+        <w:t xml:space="preserve"> </w:t>
+      </w:r>
+      <w:r>
+        <w:rPr>
+          <w:rStyle w:val="VerbatimChar"/>
+        </w:rPr>
+        <w:t xml:space="preserve">smsConversationId</w:t>
+      </w:r>
+      <w:r>
+        <w:t xml:space="preserve"> </w:t>
+      </w:r>
+      <w:r>
+        <w:t xml:space="preserve">/</w:t>
+      </w:r>
+      <w:r>
+        <w:t xml:space="preserve"> </w:t>
+      </w:r>
+      <w:r>
+        <w:rPr>
+          <w:rStyle w:val="VerbatimChar"/>
+        </w:rPr>
+        <w:t xml:space="preserve">leadId</w:t>
+      </w:r>
+      <w:r>
+        <w:t xml:space="preserve">, plus matched client deal fallback.</w:t>
+      </w:r>
+    </w:p>
+    <w:p>
+      <w:pPr>
+        <w:pStyle w:val="Compact"/>
+        <w:numPr>
+          <w:ilvl w:val="0"/>
+          <w:numId w:val="1348"/>
+        </w:numPr>
+      </w:pPr>
+      <w:r>
+        <w:t xml:space="preserve">Added forward stage move reset in</w:t>
+      </w:r>
+      <w:r>
+        <w:t xml:space="preserve"> </w:t>
+      </w:r>
+      <w:r>
+        <w:rPr>
+          <w:rStyle w:val="VerbatimChar"/>
+        </w:rPr>
+        <w:t xml:space="preserve">moveDeal</w:t>
+      </w:r>
+      <w:r>
+        <w:t xml:space="preserve"> </w:t>
+      </w:r>
+      <w:r>
+        <w:t xml:space="preserve">with</w:t>
+      </w:r>
+      <w:r>
+        <w:t xml:space="preserve"> </w:t>
+      </w:r>
+      <w:r>
+        <w:rPr>
+          <w:rStyle w:val="VerbatimChar"/>
+        </w:rPr>
+        <w:t xml:space="preserve">engagement_reset</w:t>
+      </w:r>
+      <w:r>
+        <w:t xml:space="preserve"> </w:t>
+      </w:r>
+      <w:r>
+        <w:t xml:space="preserve">audit metadata.</w:t>
+      </w:r>
+    </w:p>
+    <w:p>
+      <w:pPr>
+        <w:pStyle w:val="Compact"/>
+        <w:numPr>
+          <w:ilvl w:val="0"/>
+          <w:numId w:val="1349"/>
+        </w:numPr>
+      </w:pPr>
+      <w:r>
+        <w:t xml:space="preserve">Validation passed:</w:t>
+      </w:r>
+      <w:r>
+        <w:t xml:space="preserve"> </w:t>
+      </w:r>
+      <w:r>
+        <w:rPr>
+          <w:rStyle w:val="VerbatimChar"/>
+        </w:rPr>
+        <w:t xml:space="preserve">cd server &amp;&amp; npx vitest run tests/dealContactAttempts.test.ts tests/dealControllerScope.test.ts tests/dealScopePolicy.test.ts</w:t>
+      </w:r>
+      <w:r>
+        <w:t xml:space="preserve"> </w:t>
+      </w:r>
+      <w:r>
+        <w:t xml:space="preserve">— 16/16 passed;</w:t>
+      </w:r>
+      <w:r>
+        <w:t xml:space="preserve"> </w:t>
+      </w:r>
+      <w:r>
+        <w:rPr>
+          <w:rStyle w:val="VerbatimChar"/>
+        </w:rPr>
+        <w:t xml:space="preserve">cd server &amp;&amp; npm run build</w:t>
+      </w:r>
+      <w:r>
+        <w:t xml:space="preserve"> </w:t>
+      </w:r>
+      <w:r>
+        <w:t xml:space="preserve">passed; targeted backend ESLint 0 errors / existing warnings only.</w:t>
+      </w:r>
+    </w:p>
     <w:bookmarkEnd w:id="49"/>
     <w:bookmarkStart w:id="50" w:name="data-and-backend"/>
     <w:p>
@@ -8637,7 +8760,7 @@
         <w:pStyle w:val="Compact"/>
         <w:numPr>
           <w:ilvl w:val="0"/>
-          <w:numId w:val="1347"/>
+          <w:numId w:val="1350"/>
         </w:numPr>
       </w:pPr>
       <w:r>
@@ -8676,7 +8799,7 @@
         <w:pStyle w:val="Compact"/>
         <w:numPr>
           <w:ilvl w:val="0"/>
-          <w:numId w:val="1348"/>
+          <w:numId w:val="1351"/>
         </w:numPr>
       </w:pPr>
       <w:r>
@@ -8715,7 +8838,7 @@
         <w:pStyle w:val="Compact"/>
         <w:numPr>
           <w:ilvl w:val="0"/>
-          <w:numId w:val="1349"/>
+          <w:numId w:val="1352"/>
         </w:numPr>
       </w:pPr>
       <w:r>
@@ -8739,7 +8862,7 @@
         <w:pStyle w:val="Compact"/>
         <w:numPr>
           <w:ilvl w:val="0"/>
-          <w:numId w:val="1350"/>
+          <w:numId w:val="1353"/>
         </w:numPr>
       </w:pPr>
       <w:r>
@@ -8796,7 +8919,7 @@
         <w:pStyle w:val="Compact"/>
         <w:numPr>
           <w:ilvl w:val="0"/>
-          <w:numId w:val="1351"/>
+          <w:numId w:val="1354"/>
         </w:numPr>
       </w:pPr>
       <w:r>
@@ -8820,7 +8943,7 @@
         <w:pStyle w:val="Compact"/>
         <w:numPr>
           <w:ilvl w:val="0"/>
-          <w:numId w:val="1352"/>
+          <w:numId w:val="1355"/>
         </w:numPr>
       </w:pPr>
       <w:r>
@@ -8832,7 +8955,7 @@
         <w:pStyle w:val="Compact"/>
         <w:numPr>
           <w:ilvl w:val="1"/>
-          <w:numId w:val="1353"/>
+          <w:numId w:val="1356"/>
         </w:numPr>
       </w:pPr>
       <w:r>
@@ -8844,7 +8967,7 @@
         <w:pStyle w:val="Compact"/>
         <w:numPr>
           <w:ilvl w:val="1"/>
-          <w:numId w:val="1353"/>
+          <w:numId w:val="1356"/>
         </w:numPr>
       </w:pPr>
       <w:r>
@@ -8856,7 +8979,7 @@
         <w:pStyle w:val="Compact"/>
         <w:numPr>
           <w:ilvl w:val="1"/>
-          <w:numId w:val="1353"/>
+          <w:numId w:val="1356"/>
         </w:numPr>
       </w:pPr>
       <w:r>
@@ -8868,7 +8991,7 @@
         <w:pStyle w:val="Compact"/>
         <w:numPr>
           <w:ilvl w:val="1"/>
-          <w:numId w:val="1353"/>
+          <w:numId w:val="1356"/>
         </w:numPr>
       </w:pPr>
       <w:r>
@@ -8880,7 +9003,7 @@
         <w:pStyle w:val="Compact"/>
         <w:numPr>
           <w:ilvl w:val="1"/>
-          <w:numId w:val="1353"/>
+          <w:numId w:val="1356"/>
         </w:numPr>
       </w:pPr>
       <w:r>
@@ -8892,7 +9015,7 @@
         <w:pStyle w:val="Compact"/>
         <w:numPr>
           <w:ilvl w:val="0"/>
-          <w:numId w:val="1354"/>
+          <w:numId w:val="1357"/>
         </w:numPr>
       </w:pPr>
       <w:r>
@@ -8937,7 +9060,7 @@
         <w:pStyle w:val="Compact"/>
         <w:numPr>
           <w:ilvl w:val="0"/>
-          <w:numId w:val="1355"/>
+          <w:numId w:val="1358"/>
         </w:numPr>
       </w:pPr>
       <w:r>
@@ -8970,7 +9093,7 @@
         <w:pStyle w:val="Compact"/>
         <w:numPr>
           <w:ilvl w:val="0"/>
-          <w:numId w:val="1356"/>
+          <w:numId w:val="1359"/>
         </w:numPr>
       </w:pPr>
       <w:r>
@@ -9003,7 +9126,7 @@
         <w:pStyle w:val="Compact"/>
         <w:numPr>
           <w:ilvl w:val="0"/>
-          <w:numId w:val="1357"/>
+          <w:numId w:val="1360"/>
         </w:numPr>
       </w:pPr>
       <w:r>
@@ -9030,7 +9153,7 @@
         <w:pStyle w:val="Compact"/>
         <w:numPr>
           <w:ilvl w:val="0"/>
-          <w:numId w:val="1358"/>
+          <w:numId w:val="1361"/>
         </w:numPr>
       </w:pPr>
       <w:r>
@@ -9042,7 +9165,7 @@
         <w:pStyle w:val="Compact"/>
         <w:numPr>
           <w:ilvl w:val="0"/>
-          <w:numId w:val="1359"/>
+          <w:numId w:val="1362"/>
         </w:numPr>
       </w:pPr>
       <w:r>
@@ -9054,7 +9177,7 @@
         <w:pStyle w:val="Compact"/>
         <w:numPr>
           <w:ilvl w:val="0"/>
-          <w:numId w:val="1360"/>
+          <w:numId w:val="1363"/>
         </w:numPr>
       </w:pPr>
       <w:r>
@@ -9066,7 +9189,7 @@
         <w:pStyle w:val="Compact"/>
         <w:numPr>
           <w:ilvl w:val="0"/>
-          <w:numId w:val="1361"/>
+          <w:numId w:val="1364"/>
         </w:numPr>
       </w:pPr>
       <w:r>
@@ -9078,7 +9201,7 @@
         <w:pStyle w:val="Compact"/>
         <w:numPr>
           <w:ilvl w:val="0"/>
-          <w:numId w:val="1362"/>
+          <w:numId w:val="1365"/>
         </w:numPr>
       </w:pPr>
       <w:r>
@@ -9105,7 +9228,7 @@
         <w:pStyle w:val="Compact"/>
         <w:numPr>
           <w:ilvl w:val="0"/>
-          <w:numId w:val="1363"/>
+          <w:numId w:val="1366"/>
         </w:numPr>
       </w:pPr>
       <w:r>
@@ -9127,7 +9250,7 @@
         <w:pStyle w:val="Compact"/>
         <w:numPr>
           <w:ilvl w:val="0"/>
-          <w:numId w:val="1364"/>
+          <w:numId w:val="1367"/>
         </w:numPr>
       </w:pPr>
       <w:r>
@@ -9139,7 +9262,7 @@
         <w:pStyle w:val="Compact"/>
         <w:numPr>
           <w:ilvl w:val="0"/>
-          <w:numId w:val="1365"/>
+          <w:numId w:val="1368"/>
         </w:numPr>
       </w:pPr>
       <w:r>
@@ -9151,7 +9274,7 @@
         <w:pStyle w:val="Compact"/>
         <w:numPr>
           <w:ilvl w:val="0"/>
-          <w:numId w:val="1366"/>
+          <w:numId w:val="1369"/>
         </w:numPr>
       </w:pPr>
       <w:r>
@@ -9163,7 +9286,7 @@
         <w:pStyle w:val="Compact"/>
         <w:numPr>
           <w:ilvl w:val="0"/>
-          <w:numId w:val="1367"/>
+          <w:numId w:val="1370"/>
         </w:numPr>
       </w:pPr>
       <w:r>
@@ -9187,7 +9310,7 @@
         <w:pStyle w:val="Compact"/>
         <w:numPr>
           <w:ilvl w:val="0"/>
-          <w:numId w:val="1368"/>
+          <w:numId w:val="1371"/>
         </w:numPr>
       </w:pPr>
       <w:r>
@@ -9199,7 +9322,7 @@
         <w:pStyle w:val="Compact"/>
         <w:numPr>
           <w:ilvl w:val="1"/>
-          <w:numId w:val="1369"/>
+          <w:numId w:val="1372"/>
         </w:numPr>
       </w:pPr>
       <w:r>
@@ -9211,7 +9334,7 @@
         <w:pStyle w:val="Compact"/>
         <w:numPr>
           <w:ilvl w:val="1"/>
-          <w:numId w:val="1369"/>
+          <w:numId w:val="1372"/>
         </w:numPr>
       </w:pPr>
       <w:r>
@@ -9223,7 +9346,7 @@
         <w:pStyle w:val="Compact"/>
         <w:numPr>
           <w:ilvl w:val="1"/>
-          <w:numId w:val="1369"/>
+          <w:numId w:val="1372"/>
         </w:numPr>
       </w:pPr>
       <w:r>
@@ -9235,7 +9358,7 @@
         <w:pStyle w:val="Compact"/>
         <w:numPr>
           <w:ilvl w:val="0"/>
-          <w:numId w:val="1370"/>
+          <w:numId w:val="1373"/>
         </w:numPr>
       </w:pPr>
       <w:r>
@@ -9277,7 +9400,7 @@
         <w:pStyle w:val="Compact"/>
         <w:numPr>
           <w:ilvl w:val="0"/>
-          <w:numId w:val="1371"/>
+          <w:numId w:val="1374"/>
         </w:numPr>
       </w:pPr>
       <w:r>
@@ -9329,7 +9452,7 @@
         <w:pStyle w:val="Compact"/>
         <w:numPr>
           <w:ilvl w:val="0"/>
-          <w:numId w:val="1372"/>
+          <w:numId w:val="1375"/>
         </w:numPr>
       </w:pPr>
       <w:r>
@@ -9341,7 +9464,7 @@
         <w:pStyle w:val="Compact"/>
         <w:numPr>
           <w:ilvl w:val="0"/>
-          <w:numId w:val="1373"/>
+          <w:numId w:val="1376"/>
         </w:numPr>
       </w:pPr>
       <w:r>
@@ -9353,7 +9476,7 @@
         <w:pStyle w:val="Compact"/>
         <w:numPr>
           <w:ilvl w:val="0"/>
-          <w:numId w:val="1374"/>
+          <w:numId w:val="1377"/>
         </w:numPr>
       </w:pPr>
       <w:r>
@@ -9365,7 +9488,7 @@
         <w:pStyle w:val="Compact"/>
         <w:numPr>
           <w:ilvl w:val="0"/>
-          <w:numId w:val="1375"/>
+          <w:numId w:val="1378"/>
         </w:numPr>
       </w:pPr>
       <w:r>
@@ -9377,7 +9500,7 @@
         <w:pStyle w:val="Compact"/>
         <w:numPr>
           <w:ilvl w:val="0"/>
-          <w:numId w:val="1376"/>
+          <w:numId w:val="1379"/>
         </w:numPr>
       </w:pPr>
       <w:r>
@@ -9389,7 +9512,7 @@
         <w:pStyle w:val="Compact"/>
         <w:numPr>
           <w:ilvl w:val="0"/>
-          <w:numId w:val="1377"/>
+          <w:numId w:val="1380"/>
         </w:numPr>
       </w:pPr>
       <w:r>
@@ -9401,7 +9524,7 @@
         <w:pStyle w:val="Compact"/>
         <w:numPr>
           <w:ilvl w:val="0"/>
-          <w:numId w:val="1378"/>
+          <w:numId w:val="1381"/>
         </w:numPr>
       </w:pPr>
       <w:r>
@@ -9413,7 +9536,7 @@
         <w:pStyle w:val="Compact"/>
         <w:numPr>
           <w:ilvl w:val="0"/>
-          <w:numId w:val="1379"/>
+          <w:numId w:val="1382"/>
         </w:numPr>
       </w:pPr>
       <w:r>
@@ -9425,7 +9548,7 @@
         <w:pStyle w:val="Compact"/>
         <w:numPr>
           <w:ilvl w:val="0"/>
-          <w:numId w:val="1380"/>
+          <w:numId w:val="1383"/>
         </w:numPr>
       </w:pPr>
       <w:r>
@@ -9457,7 +9580,7 @@
         <w:pStyle w:val="Compact"/>
         <w:numPr>
           <w:ilvl w:val="0"/>
-          <w:numId w:val="1381"/>
+          <w:numId w:val="1384"/>
         </w:numPr>
       </w:pPr>
       <w:r>
@@ -9469,7 +9592,7 @@
         <w:pStyle w:val="Compact"/>
         <w:numPr>
           <w:ilvl w:val="0"/>
-          <w:numId w:val="1382"/>
+          <w:numId w:val="1385"/>
         </w:numPr>
       </w:pPr>
       <w:r>
@@ -9481,7 +9604,7 @@
         <w:pStyle w:val="Compact"/>
         <w:numPr>
           <w:ilvl w:val="0"/>
-          <w:numId w:val="1383"/>
+          <w:numId w:val="1386"/>
         </w:numPr>
       </w:pPr>
       <w:r>
@@ -9493,7 +9616,7 @@
         <w:pStyle w:val="Compact"/>
         <w:numPr>
           <w:ilvl w:val="0"/>
-          <w:numId w:val="1384"/>
+          <w:numId w:val="1387"/>
         </w:numPr>
       </w:pPr>
       <w:r>
@@ -9505,7 +9628,7 @@
         <w:pStyle w:val="Compact"/>
         <w:numPr>
           <w:ilvl w:val="0"/>
-          <w:numId w:val="1385"/>
+          <w:numId w:val="1388"/>
         </w:numPr>
       </w:pPr>
       <w:r>
@@ -9517,7 +9640,7 @@
         <w:pStyle w:val="Compact"/>
         <w:numPr>
           <w:ilvl w:val="0"/>
-          <w:numId w:val="1386"/>
+          <w:numId w:val="1389"/>
         </w:numPr>
       </w:pPr>
       <w:r>
@@ -9529,7 +9652,7 @@
         <w:pStyle w:val="Compact"/>
         <w:numPr>
           <w:ilvl w:val="0"/>
-          <w:numId w:val="1387"/>
+          <w:numId w:val="1390"/>
         </w:numPr>
       </w:pPr>
       <w:r>
@@ -9541,7 +9664,7 @@
         <w:pStyle w:val="Compact"/>
         <w:numPr>
           <w:ilvl w:val="0"/>
-          <w:numId w:val="1388"/>
+          <w:numId w:val="1391"/>
         </w:numPr>
       </w:pPr>
       <w:r>
@@ -9553,7 +9676,7 @@
         <w:pStyle w:val="Compact"/>
         <w:numPr>
           <w:ilvl w:val="0"/>
-          <w:numId w:val="1389"/>
+          <w:numId w:val="1392"/>
         </w:numPr>
       </w:pPr>
       <w:r>
@@ -9565,7 +9688,7 @@
         <w:pStyle w:val="Compact"/>
         <w:numPr>
           <w:ilvl w:val="0"/>
-          <w:numId w:val="1390"/>
+          <w:numId w:val="1393"/>
         </w:numPr>
       </w:pPr>
       <w:r>
@@ -9577,7 +9700,7 @@
         <w:pStyle w:val="Compact"/>
         <w:numPr>
           <w:ilvl w:val="0"/>
-          <w:numId w:val="1391"/>
+          <w:numId w:val="1394"/>
         </w:numPr>
       </w:pPr>
       <w:r>
@@ -9589,7 +9712,7 @@
         <w:pStyle w:val="Compact"/>
         <w:numPr>
           <w:ilvl w:val="0"/>
-          <w:numId w:val="1392"/>
+          <w:numId w:val="1395"/>
         </w:numPr>
       </w:pPr>
       <w:r>
@@ -9601,7 +9724,7 @@
         <w:pStyle w:val="Compact"/>
         <w:numPr>
           <w:ilvl w:val="0"/>
-          <w:numId w:val="1393"/>
+          <w:numId w:val="1396"/>
         </w:numPr>
       </w:pPr>
       <w:r>
@@ -9613,7 +9736,7 @@
         <w:pStyle w:val="Compact"/>
         <w:numPr>
           <w:ilvl w:val="0"/>
-          <w:numId w:val="1394"/>
+          <w:numId w:val="1397"/>
         </w:numPr>
       </w:pPr>
       <w:r>
@@ -9625,7 +9748,7 @@
         <w:pStyle w:val="Compact"/>
         <w:numPr>
           <w:ilvl w:val="0"/>
-          <w:numId w:val="1395"/>
+          <w:numId w:val="1398"/>
         </w:numPr>
       </w:pPr>
       <w:r>
@@ -9647,7 +9770,7 @@
         <w:pStyle w:val="Compact"/>
         <w:numPr>
           <w:ilvl w:val="0"/>
-          <w:numId w:val="1396"/>
+          <w:numId w:val="1399"/>
         </w:numPr>
       </w:pPr>
       <w:r>
@@ -9659,7 +9782,7 @@
         <w:pStyle w:val="Compact"/>
         <w:numPr>
           <w:ilvl w:val="0"/>
-          <w:numId w:val="1397"/>
+          <w:numId w:val="1400"/>
         </w:numPr>
       </w:pPr>
       <w:r>
@@ -9671,7 +9794,7 @@
         <w:pStyle w:val="Compact"/>
         <w:numPr>
           <w:ilvl w:val="0"/>
-          <w:numId w:val="1398"/>
+          <w:numId w:val="1401"/>
         </w:numPr>
       </w:pPr>
       <w:r>
@@ -9683,7 +9806,7 @@
         <w:pStyle w:val="Compact"/>
         <w:numPr>
           <w:ilvl w:val="0"/>
-          <w:numId w:val="1399"/>
+          <w:numId w:val="1402"/>
         </w:numPr>
       </w:pPr>
       <w:r>
@@ -9695,7 +9818,7 @@
         <w:pStyle w:val="Compact"/>
         <w:numPr>
           <w:ilvl w:val="0"/>
-          <w:numId w:val="1400"/>
+          <w:numId w:val="1403"/>
         </w:numPr>
       </w:pPr>
       <w:r>
@@ -9707,7 +9830,7 @@
         <w:pStyle w:val="Compact"/>
         <w:numPr>
           <w:ilvl w:val="0"/>
-          <w:numId w:val="1401"/>
+          <w:numId w:val="1404"/>
         </w:numPr>
       </w:pPr>
       <w:r>
@@ -9719,7 +9842,7 @@
         <w:pStyle w:val="Compact"/>
         <w:numPr>
           <w:ilvl w:val="0"/>
-          <w:numId w:val="1402"/>
+          <w:numId w:val="1405"/>
         </w:numPr>
       </w:pPr>
       <w:r>
@@ -9741,7 +9864,7 @@
         <w:pStyle w:val="Compact"/>
         <w:numPr>
           <w:ilvl w:val="0"/>
-          <w:numId w:val="1403"/>
+          <w:numId w:val="1406"/>
         </w:numPr>
       </w:pPr>
       <w:r>
@@ -9753,7 +9876,7 @@
         <w:pStyle w:val="Compact"/>
         <w:numPr>
           <w:ilvl w:val="0"/>
-          <w:numId w:val="1404"/>
+          <w:numId w:val="1407"/>
         </w:numPr>
       </w:pPr>
       <w:r>
@@ -9765,7 +9888,7 @@
         <w:pStyle w:val="Compact"/>
         <w:numPr>
           <w:ilvl w:val="0"/>
-          <w:numId w:val="1405"/>
+          <w:numId w:val="1408"/>
         </w:numPr>
       </w:pPr>
       <w:r>
@@ -9777,7 +9900,7 @@
         <w:pStyle w:val="Compact"/>
         <w:numPr>
           <w:ilvl w:val="0"/>
-          <w:numId w:val="1406"/>
+          <w:numId w:val="1409"/>
         </w:numPr>
       </w:pPr>
       <w:r>
@@ -9789,7 +9912,7 @@
         <w:pStyle w:val="Compact"/>
         <w:numPr>
           <w:ilvl w:val="0"/>
-          <w:numId w:val="1407"/>
+          <w:numId w:val="1410"/>
         </w:numPr>
       </w:pPr>
       <w:r>
@@ -9801,7 +9924,7 @@
         <w:pStyle w:val="Compact"/>
         <w:numPr>
           <w:ilvl w:val="0"/>
-          <w:numId w:val="1408"/>
+          <w:numId w:val="1411"/>
         </w:numPr>
       </w:pPr>
       <w:r>
@@ -9813,7 +9936,7 @@
         <w:pStyle w:val="Compact"/>
         <w:numPr>
           <w:ilvl w:val="0"/>
-          <w:numId w:val="1409"/>
+          <w:numId w:val="1412"/>
         </w:numPr>
       </w:pPr>
       <w:r>
@@ -9845,7 +9968,7 @@
         <w:pStyle w:val="Compact"/>
         <w:numPr>
           <w:ilvl w:val="0"/>
-          <w:numId w:val="1410"/>
+          <w:numId w:val="1413"/>
         </w:numPr>
       </w:pPr>
       <w:r>
@@ -9917,7 +10040,7 @@
         <w:pStyle w:val="Compact"/>
         <w:numPr>
           <w:ilvl w:val="0"/>
-          <w:numId w:val="1411"/>
+          <w:numId w:val="1414"/>
         </w:numPr>
       </w:pPr>
       <w:r>
@@ -9929,7 +10052,7 @@
         <w:pStyle w:val="Compact"/>
         <w:numPr>
           <w:ilvl w:val="0"/>
-          <w:numId w:val="1412"/>
+          <w:numId w:val="1415"/>
         </w:numPr>
       </w:pPr>
       <w:r>
@@ -9956,7 +10079,7 @@
         <w:pStyle w:val="Compact"/>
         <w:numPr>
           <w:ilvl w:val="0"/>
-          <w:numId w:val="1413"/>
+          <w:numId w:val="1416"/>
         </w:numPr>
       </w:pPr>
       <w:r>
@@ -10010,7 +10133,7 @@
         <w:pStyle w:val="Compact"/>
         <w:numPr>
           <w:ilvl w:val="0"/>
-          <w:numId w:val="1414"/>
+          <w:numId w:val="1417"/>
         </w:numPr>
       </w:pPr>
       <w:r>
@@ -10022,7 +10145,7 @@
         <w:pStyle w:val="Compact"/>
         <w:numPr>
           <w:ilvl w:val="0"/>
-          <w:numId w:val="1415"/>
+          <w:numId w:val="1418"/>
         </w:numPr>
       </w:pPr>
       <w:r>
@@ -10044,7 +10167,7 @@
         <w:pStyle w:val="Compact"/>
         <w:numPr>
           <w:ilvl w:val="0"/>
-          <w:numId w:val="1416"/>
+          <w:numId w:val="1419"/>
         </w:numPr>
       </w:pPr>
       <w:r>
@@ -10095,7 +10218,7 @@
         <w:pStyle w:val="Compact"/>
         <w:numPr>
           <w:ilvl w:val="0"/>
-          <w:numId w:val="1417"/>
+          <w:numId w:val="1420"/>
         </w:numPr>
       </w:pPr>
       <w:r>
@@ -10122,7 +10245,7 @@
         <w:pStyle w:val="Compact"/>
         <w:numPr>
           <w:ilvl w:val="0"/>
-          <w:numId w:val="1418"/>
+          <w:numId w:val="1421"/>
         </w:numPr>
       </w:pPr>
       <w:r>
@@ -10134,7 +10257,7 @@
         <w:pStyle w:val="Compact"/>
         <w:numPr>
           <w:ilvl w:val="0"/>
-          <w:numId w:val="1419"/>
+          <w:numId w:val="1422"/>
         </w:numPr>
       </w:pPr>
       <w:r>
@@ -10161,7 +10284,7 @@
         <w:pStyle w:val="Compact"/>
         <w:numPr>
           <w:ilvl w:val="0"/>
-          <w:numId w:val="1420"/>
+          <w:numId w:val="1423"/>
         </w:numPr>
       </w:pPr>
       <w:r>
@@ -10173,7 +10296,7 @@
         <w:pStyle w:val="Compact"/>
         <w:numPr>
           <w:ilvl w:val="0"/>
-          <w:numId w:val="1421"/>
+          <w:numId w:val="1424"/>
         </w:numPr>
       </w:pPr>
       <w:r>
@@ -10185,7 +10308,7 @@
         <w:pStyle w:val="Compact"/>
         <w:numPr>
           <w:ilvl w:val="0"/>
-          <w:numId w:val="1422"/>
+          <w:numId w:val="1425"/>
         </w:numPr>
       </w:pPr>
       <w:r>
@@ -10207,7 +10330,7 @@
         <w:pStyle w:val="Compact"/>
         <w:numPr>
           <w:ilvl w:val="0"/>
-          <w:numId w:val="1423"/>
+          <w:numId w:val="1426"/>
         </w:numPr>
       </w:pPr>
       <w:r>
@@ -10231,7 +10354,7 @@
         <w:pStyle w:val="Compact"/>
         <w:numPr>
           <w:ilvl w:val="0"/>
-          <w:numId w:val="1424"/>
+          <w:numId w:val="1427"/>
         </w:numPr>
       </w:pPr>
       <w:r>
@@ -10255,7 +10378,7 @@
         <w:pStyle w:val="Compact"/>
         <w:numPr>
           <w:ilvl w:val="0"/>
-          <w:numId w:val="1425"/>
+          <w:numId w:val="1428"/>
         </w:numPr>
       </w:pPr>
       <w:r>
@@ -10267,7 +10390,7 @@
         <w:pStyle w:val="Compact"/>
         <w:numPr>
           <w:ilvl w:val="0"/>
-          <w:numId w:val="1426"/>
+          <w:numId w:val="1429"/>
         </w:numPr>
       </w:pPr>
       <w:r>
@@ -10279,7 +10402,7 @@
         <w:pStyle w:val="Compact"/>
         <w:numPr>
           <w:ilvl w:val="0"/>
-          <w:numId w:val="1427"/>
+          <w:numId w:val="1430"/>
         </w:numPr>
       </w:pPr>
       <w:r>
@@ -10291,7 +10414,7 @@
         <w:pStyle w:val="Compact"/>
         <w:numPr>
           <w:ilvl w:val="0"/>
-          <w:numId w:val="1428"/>
+          <w:numId w:val="1431"/>
         </w:numPr>
       </w:pPr>
       <w:r>
@@ -10322,7 +10445,7 @@
         <w:pStyle w:val="Compact"/>
         <w:numPr>
           <w:ilvl w:val="0"/>
-          <w:numId w:val="1429"/>
+          <w:numId w:val="1432"/>
         </w:numPr>
       </w:pPr>
       <w:r>
@@ -10334,7 +10457,7 @@
         <w:pStyle w:val="Compact"/>
         <w:numPr>
           <w:ilvl w:val="0"/>
-          <w:numId w:val="1430"/>
+          <w:numId w:val="1433"/>
         </w:numPr>
       </w:pPr>
       <w:r>
@@ -10346,7 +10469,7 @@
         <w:pStyle w:val="Compact"/>
         <w:numPr>
           <w:ilvl w:val="1"/>
-          <w:numId w:val="1431"/>
+          <w:numId w:val="1434"/>
         </w:numPr>
       </w:pPr>
       <w:r>
@@ -10364,7 +10487,7 @@
         <w:pStyle w:val="Compact"/>
         <w:numPr>
           <w:ilvl w:val="1"/>
-          <w:numId w:val="1431"/>
+          <w:numId w:val="1434"/>
         </w:numPr>
       </w:pPr>
       <w:r>
@@ -10382,7 +10505,7 @@
         <w:pStyle w:val="Compact"/>
         <w:numPr>
           <w:ilvl w:val="1"/>
-          <w:numId w:val="1431"/>
+          <w:numId w:val="1434"/>
         </w:numPr>
       </w:pPr>
       <w:r>
@@ -10400,7 +10523,7 @@
         <w:pStyle w:val="Compact"/>
         <w:numPr>
           <w:ilvl w:val="1"/>
-          <w:numId w:val="1431"/>
+          <w:numId w:val="1434"/>
         </w:numPr>
       </w:pPr>
       <w:r>
@@ -10418,7 +10541,7 @@
         <w:pStyle w:val="Compact"/>
         <w:numPr>
           <w:ilvl w:val="0"/>
-          <w:numId w:val="1432"/>
+          <w:numId w:val="1435"/>
         </w:numPr>
       </w:pPr>
       <w:r>
@@ -10430,7 +10553,7 @@
         <w:pStyle w:val="Compact"/>
         <w:numPr>
           <w:ilvl w:val="0"/>
-          <w:numId w:val="1433"/>
+          <w:numId w:val="1436"/>
         </w:numPr>
       </w:pPr>
       <w:r>
@@ -10442,7 +10565,7 @@
         <w:pStyle w:val="Compact"/>
         <w:numPr>
           <w:ilvl w:val="0"/>
-          <w:numId w:val="1434"/>
+          <w:numId w:val="1437"/>
         </w:numPr>
       </w:pPr>
       <w:r>
@@ -10464,7 +10587,7 @@
         <w:pStyle w:val="Compact"/>
         <w:numPr>
           <w:ilvl w:val="0"/>
-          <w:numId w:val="1435"/>
+          <w:numId w:val="1438"/>
         </w:numPr>
       </w:pPr>
       <w:r>
@@ -10476,7 +10599,7 @@
         <w:pStyle w:val="Compact"/>
         <w:numPr>
           <w:ilvl w:val="0"/>
-          <w:numId w:val="1436"/>
+          <w:numId w:val="1439"/>
         </w:numPr>
       </w:pPr>
       <w:r>
@@ -10488,7 +10611,7 @@
         <w:pStyle w:val="Compact"/>
         <w:numPr>
           <w:ilvl w:val="0"/>
-          <w:numId w:val="1437"/>
+          <w:numId w:val="1440"/>
         </w:numPr>
       </w:pPr>
       <w:r>
@@ -10500,7 +10623,7 @@
         <w:pStyle w:val="Compact"/>
         <w:numPr>
           <w:ilvl w:val="0"/>
-          <w:numId w:val="1438"/>
+          <w:numId w:val="1441"/>
         </w:numPr>
       </w:pPr>
       <w:r>
@@ -10512,7 +10635,7 @@
         <w:pStyle w:val="Compact"/>
         <w:numPr>
           <w:ilvl w:val="0"/>
-          <w:numId w:val="1439"/>
+          <w:numId w:val="1442"/>
         </w:numPr>
       </w:pPr>
       <w:r>
@@ -10524,7 +10647,7 @@
         <w:pStyle w:val="Compact"/>
         <w:numPr>
           <w:ilvl w:val="0"/>
-          <w:numId w:val="1440"/>
+          <w:numId w:val="1443"/>
         </w:numPr>
       </w:pPr>
       <w:r>
@@ -10536,7 +10659,7 @@
         <w:pStyle w:val="Compact"/>
         <w:numPr>
           <w:ilvl w:val="0"/>
-          <w:numId w:val="1441"/>
+          <w:numId w:val="1444"/>
         </w:numPr>
       </w:pPr>
       <w:r>
@@ -10548,7 +10671,7 @@
         <w:pStyle w:val="Compact"/>
         <w:numPr>
           <w:ilvl w:val="0"/>
-          <w:numId w:val="1442"/>
+          <w:numId w:val="1445"/>
         </w:numPr>
       </w:pPr>
       <w:r>
@@ -10560,7 +10683,7 @@
         <w:pStyle w:val="Compact"/>
         <w:numPr>
           <w:ilvl w:val="0"/>
-          <w:numId w:val="1443"/>
+          <w:numId w:val="1446"/>
         </w:numPr>
       </w:pPr>
       <w:r>
@@ -10592,7 +10715,7 @@
         <w:pStyle w:val="Compact"/>
         <w:numPr>
           <w:ilvl w:val="0"/>
-          <w:numId w:val="1444"/>
+          <w:numId w:val="1447"/>
         </w:numPr>
       </w:pPr>
       <w:r>
@@ -10619,7 +10742,7 @@
         <w:pStyle w:val="Compact"/>
         <w:numPr>
           <w:ilvl w:val="0"/>
-          <w:numId w:val="1445"/>
+          <w:numId w:val="1448"/>
         </w:numPr>
       </w:pPr>
       <w:r>
@@ -10691,7 +10814,7 @@
         <w:pStyle w:val="Compact"/>
         <w:numPr>
           <w:ilvl w:val="0"/>
-          <w:numId w:val="1446"/>
+          <w:numId w:val="1449"/>
         </w:numPr>
       </w:pPr>
       <w:r>
@@ -10718,7 +10841,7 @@
         <w:pStyle w:val="Compact"/>
         <w:numPr>
           <w:ilvl w:val="0"/>
-          <w:numId w:val="1447"/>
+          <w:numId w:val="1450"/>
         </w:numPr>
       </w:pPr>
       <w:r>
@@ -10730,7 +10853,7 @@
         <w:pStyle w:val="Compact"/>
         <w:numPr>
           <w:ilvl w:val="0"/>
-          <w:numId w:val="1448"/>
+          <w:numId w:val="1451"/>
         </w:numPr>
       </w:pPr>
       <w:r>
@@ -10757,7 +10880,7 @@
         <w:pStyle w:val="Compact"/>
         <w:numPr>
           <w:ilvl w:val="0"/>
-          <w:numId w:val="1449"/>
+          <w:numId w:val="1452"/>
         </w:numPr>
       </w:pPr>
       <w:r>
@@ -10769,7 +10892,7 @@
         <w:pStyle w:val="Compact"/>
         <w:numPr>
           <w:ilvl w:val="0"/>
-          <w:numId w:val="1450"/>
+          <w:numId w:val="1453"/>
         </w:numPr>
       </w:pPr>
       <w:r>
@@ -10796,7 +10919,7 @@
         <w:pStyle w:val="Compact"/>
         <w:numPr>
           <w:ilvl w:val="0"/>
-          <w:numId w:val="1451"/>
+          <w:numId w:val="1454"/>
         </w:numPr>
       </w:pPr>
       <w:r>
@@ -10838,7 +10961,7 @@
         <w:pStyle w:val="Compact"/>
         <w:numPr>
           <w:ilvl w:val="0"/>
-          <w:numId w:val="1452"/>
+          <w:numId w:val="1455"/>
         </w:numPr>
       </w:pPr>
       <w:r>
@@ -10874,7 +10997,7 @@
         <w:pStyle w:val="Compact"/>
         <w:numPr>
           <w:ilvl w:val="0"/>
-          <w:numId w:val="1453"/>
+          <w:numId w:val="1456"/>
         </w:numPr>
       </w:pPr>
       <w:r>
@@ -10896,7 +11019,7 @@
         <w:pStyle w:val="Compact"/>
         <w:numPr>
           <w:ilvl w:val="0"/>
-          <w:numId w:val="1454"/>
+          <w:numId w:val="1457"/>
         </w:numPr>
       </w:pPr>
       <w:r>
@@ -10908,7 +11031,7 @@
         <w:pStyle w:val="Compact"/>
         <w:numPr>
           <w:ilvl w:val="0"/>
-          <w:numId w:val="1455"/>
+          <w:numId w:val="1458"/>
         </w:numPr>
       </w:pPr>
       <w:r>
@@ -10920,7 +11043,7 @@
         <w:pStyle w:val="Compact"/>
         <w:numPr>
           <w:ilvl w:val="1"/>
-          <w:numId w:val="1456"/>
+          <w:numId w:val="1459"/>
         </w:numPr>
       </w:pPr>
       <w:r>
@@ -10932,7 +11055,7 @@
         <w:pStyle w:val="Compact"/>
         <w:numPr>
           <w:ilvl w:val="1"/>
-          <w:numId w:val="1456"/>
+          <w:numId w:val="1459"/>
         </w:numPr>
       </w:pPr>
       <w:r>
@@ -10944,7 +11067,7 @@
         <w:pStyle w:val="Compact"/>
         <w:numPr>
           <w:ilvl w:val="1"/>
-          <w:numId w:val="1456"/>
+          <w:numId w:val="1459"/>
         </w:numPr>
       </w:pPr>
       <w:r>
@@ -10956,7 +11079,7 @@
         <w:pStyle w:val="Compact"/>
         <w:numPr>
           <w:ilvl w:val="1"/>
-          <w:numId w:val="1456"/>
+          <w:numId w:val="1459"/>
         </w:numPr>
       </w:pPr>
       <w:r>
@@ -10968,7 +11091,7 @@
         <w:pStyle w:val="Compact"/>
         <w:numPr>
           <w:ilvl w:val="1"/>
-          <w:numId w:val="1456"/>
+          <w:numId w:val="1459"/>
         </w:numPr>
       </w:pPr>
       <w:r>
@@ -10980,7 +11103,7 @@
         <w:pStyle w:val="Compact"/>
         <w:numPr>
           <w:ilvl w:val="1"/>
-          <w:numId w:val="1456"/>
+          <w:numId w:val="1459"/>
         </w:numPr>
       </w:pPr>
       <w:r>
@@ -10992,7 +11115,7 @@
         <w:pStyle w:val="Compact"/>
         <w:numPr>
           <w:ilvl w:val="1"/>
-          <w:numId w:val="1456"/>
+          <w:numId w:val="1459"/>
         </w:numPr>
       </w:pPr>
       <w:r>
@@ -11004,7 +11127,7 @@
         <w:pStyle w:val="Compact"/>
         <w:numPr>
           <w:ilvl w:val="1"/>
-          <w:numId w:val="1456"/>
+          <w:numId w:val="1459"/>
         </w:numPr>
       </w:pPr>
       <w:r>
@@ -11016,7 +11139,7 @@
         <w:pStyle w:val="Compact"/>
         <w:numPr>
           <w:ilvl w:val="0"/>
-          <w:numId w:val="1457"/>
+          <w:numId w:val="1460"/>
         </w:numPr>
       </w:pPr>
       <w:r>
@@ -11037,7 +11160,7 @@
         <w:pStyle w:val="Compact"/>
         <w:numPr>
           <w:ilvl w:val="0"/>
-          <w:numId w:val="1458"/>
+          <w:numId w:val="1461"/>
         </w:numPr>
       </w:pPr>
       <w:r>
@@ -11061,7 +11184,7 @@
         <w:pStyle w:val="Compact"/>
         <w:numPr>
           <w:ilvl w:val="0"/>
-          <w:numId w:val="1459"/>
+          <w:numId w:val="1462"/>
         </w:numPr>
       </w:pPr>
       <w:r>
@@ -11073,7 +11196,7 @@
         <w:pStyle w:val="Compact"/>
         <w:numPr>
           <w:ilvl w:val="1"/>
-          <w:numId w:val="1460"/>
+          <w:numId w:val="1463"/>
         </w:numPr>
       </w:pPr>
       <w:r>
@@ -11085,7 +11208,7 @@
         <w:pStyle w:val="Compact"/>
         <w:numPr>
           <w:ilvl w:val="1"/>
-          <w:numId w:val="1460"/>
+          <w:numId w:val="1463"/>
         </w:numPr>
       </w:pPr>
       <w:r>
@@ -11097,7 +11220,7 @@
         <w:pStyle w:val="Compact"/>
         <w:numPr>
           <w:ilvl w:val="1"/>
-          <w:numId w:val="1460"/>
+          <w:numId w:val="1463"/>
         </w:numPr>
       </w:pPr>
       <w:r>
@@ -11109,7 +11232,7 @@
         <w:pStyle w:val="Compact"/>
         <w:numPr>
           <w:ilvl w:val="0"/>
-          <w:numId w:val="1461"/>
+          <w:numId w:val="1464"/>
         </w:numPr>
       </w:pPr>
       <w:r>
@@ -11133,7 +11256,7 @@
         <w:pStyle w:val="Compact"/>
         <w:numPr>
           <w:ilvl w:val="0"/>
-          <w:numId w:val="1462"/>
+          <w:numId w:val="1465"/>
         </w:numPr>
       </w:pPr>
       <w:r>
@@ -11145,7 +11268,7 @@
         <w:pStyle w:val="Compact"/>
         <w:numPr>
           <w:ilvl w:val="0"/>
-          <w:numId w:val="1463"/>
+          <w:numId w:val="1466"/>
         </w:numPr>
       </w:pPr>
       <w:r>
@@ -11157,7 +11280,7 @@
         <w:pStyle w:val="Compact"/>
         <w:numPr>
           <w:ilvl w:val="0"/>
-          <w:numId w:val="1464"/>
+          <w:numId w:val="1467"/>
         </w:numPr>
       </w:pPr>
       <w:r>
@@ -11179,7 +11302,7 @@
         <w:pStyle w:val="Compact"/>
         <w:numPr>
           <w:ilvl w:val="0"/>
-          <w:numId w:val="1465"/>
+          <w:numId w:val="1468"/>
         </w:numPr>
       </w:pPr>
       <w:r>
@@ -11191,7 +11314,7 @@
         <w:pStyle w:val="Compact"/>
         <w:numPr>
           <w:ilvl w:val="1"/>
-          <w:numId w:val="1466"/>
+          <w:numId w:val="1469"/>
         </w:numPr>
       </w:pPr>
       <w:r>
@@ -11203,7 +11326,7 @@
         <w:pStyle w:val="Compact"/>
         <w:numPr>
           <w:ilvl w:val="1"/>
-          <w:numId w:val="1466"/>
+          <w:numId w:val="1469"/>
         </w:numPr>
       </w:pPr>
       <w:r>
@@ -11215,7 +11338,7 @@
         <w:pStyle w:val="Compact"/>
         <w:numPr>
           <w:ilvl w:val="1"/>
-          <w:numId w:val="1466"/>
+          <w:numId w:val="1469"/>
         </w:numPr>
       </w:pPr>
       <w:r>
@@ -11227,7 +11350,7 @@
         <w:pStyle w:val="Compact"/>
         <w:numPr>
           <w:ilvl w:val="0"/>
-          <w:numId w:val="1467"/>
+          <w:numId w:val="1470"/>
         </w:numPr>
       </w:pPr>
       <w:r>
@@ -11239,7 +11362,7 @@
         <w:pStyle w:val="Compact"/>
         <w:numPr>
           <w:ilvl w:val="1"/>
-          <w:numId w:val="1468"/>
+          <w:numId w:val="1471"/>
         </w:numPr>
       </w:pPr>
       <w:r>
@@ -11251,7 +11374,7 @@
         <w:pStyle w:val="Compact"/>
         <w:numPr>
           <w:ilvl w:val="1"/>
-          <w:numId w:val="1468"/>
+          <w:numId w:val="1471"/>
         </w:numPr>
       </w:pPr>
       <w:r>
@@ -11263,7 +11386,7 @@
         <w:pStyle w:val="Compact"/>
         <w:numPr>
           <w:ilvl w:val="1"/>
-          <w:numId w:val="1468"/>
+          <w:numId w:val="1471"/>
         </w:numPr>
       </w:pPr>
       <w:r>
@@ -11275,7 +11398,7 @@
         <w:pStyle w:val="Compact"/>
         <w:numPr>
           <w:ilvl w:val="0"/>
-          <w:numId w:val="1469"/>
+          <w:numId w:val="1472"/>
         </w:numPr>
       </w:pPr>
       <w:r>
@@ -11287,7 +11410,7 @@
         <w:pStyle w:val="Compact"/>
         <w:numPr>
           <w:ilvl w:val="0"/>
-          <w:numId w:val="1470"/>
+          <w:numId w:val="1473"/>
         </w:numPr>
       </w:pPr>
       <w:r>
@@ -11299,7 +11422,7 @@
         <w:pStyle w:val="Compact"/>
         <w:numPr>
           <w:ilvl w:val="0"/>
-          <w:numId w:val="1471"/>
+          <w:numId w:val="1474"/>
         </w:numPr>
       </w:pPr>
       <w:r>
@@ -11321,7 +11444,7 @@
         <w:pStyle w:val="Compact"/>
         <w:numPr>
           <w:ilvl w:val="0"/>
-          <w:numId w:val="1472"/>
+          <w:numId w:val="1475"/>
         </w:numPr>
       </w:pPr>
       <w:r>
@@ -11342,7 +11465,7 @@
         <w:pStyle w:val="Compact"/>
         <w:numPr>
           <w:ilvl w:val="0"/>
-          <w:numId w:val="1473"/>
+          <w:numId w:val="1476"/>
         </w:numPr>
       </w:pPr>
       <w:r>
@@ -11354,7 +11477,7 @@
         <w:pStyle w:val="Compact"/>
         <w:numPr>
           <w:ilvl w:val="0"/>
-          <w:numId w:val="1474"/>
+          <w:numId w:val="1477"/>
         </w:numPr>
       </w:pPr>
       <w:r>
@@ -11366,7 +11489,7 @@
         <w:pStyle w:val="Compact"/>
         <w:numPr>
           <w:ilvl w:val="0"/>
-          <w:numId w:val="1475"/>
+          <w:numId w:val="1478"/>
         </w:numPr>
       </w:pPr>
       <w:r>
@@ -11378,7 +11501,7 @@
         <w:pStyle w:val="Compact"/>
         <w:numPr>
           <w:ilvl w:val="0"/>
-          <w:numId w:val="1476"/>
+          <w:numId w:val="1479"/>
         </w:numPr>
       </w:pPr>
       <w:r>
@@ -11390,7 +11513,7 @@
         <w:pStyle w:val="Compact"/>
         <w:numPr>
           <w:ilvl w:val="0"/>
-          <w:numId w:val="1477"/>
+          <w:numId w:val="1480"/>
         </w:numPr>
       </w:pPr>
       <w:r>
@@ -11402,7 +11525,7 @@
         <w:pStyle w:val="Compact"/>
         <w:numPr>
           <w:ilvl w:val="1"/>
-          <w:numId w:val="1478"/>
+          <w:numId w:val="1481"/>
         </w:numPr>
       </w:pPr>
       <w:r>
@@ -11414,7 +11537,7 @@
         <w:pStyle w:val="Compact"/>
         <w:numPr>
           <w:ilvl w:val="1"/>
-          <w:numId w:val="1478"/>
+          <w:numId w:val="1481"/>
         </w:numPr>
       </w:pPr>
       <w:r>
@@ -11426,7 +11549,7 @@
         <w:pStyle w:val="Compact"/>
         <w:numPr>
           <w:ilvl w:val="1"/>
-          <w:numId w:val="1478"/>
+          <w:numId w:val="1481"/>
         </w:numPr>
       </w:pPr>
       <w:r>
@@ -11438,7 +11561,7 @@
         <w:pStyle w:val="Compact"/>
         <w:numPr>
           <w:ilvl w:val="1"/>
-          <w:numId w:val="1478"/>
+          <w:numId w:val="1481"/>
         </w:numPr>
       </w:pPr>
       <w:r>
@@ -11450,7 +11573,7 @@
         <w:pStyle w:val="Compact"/>
         <w:numPr>
           <w:ilvl w:val="1"/>
-          <w:numId w:val="1478"/>
+          <w:numId w:val="1481"/>
         </w:numPr>
       </w:pPr>
       <w:r>
@@ -11462,7 +11585,7 @@
         <w:pStyle w:val="Compact"/>
         <w:numPr>
           <w:ilvl w:val="1"/>
-          <w:numId w:val="1478"/>
+          <w:numId w:val="1481"/>
         </w:numPr>
       </w:pPr>
       <w:r>
@@ -11474,7 +11597,7 @@
         <w:pStyle w:val="Compact"/>
         <w:numPr>
           <w:ilvl w:val="0"/>
-          <w:numId w:val="1479"/>
+          <w:numId w:val="1482"/>
         </w:numPr>
       </w:pPr>
       <w:r>
@@ -11486,7 +11609,7 @@
         <w:pStyle w:val="Compact"/>
         <w:numPr>
           <w:ilvl w:val="0"/>
-          <w:numId w:val="1480"/>
+          <w:numId w:val="1483"/>
         </w:numPr>
       </w:pPr>
       <w:r>
@@ -11508,7 +11631,7 @@
         <w:pStyle w:val="Compact"/>
         <w:numPr>
           <w:ilvl w:val="0"/>
-          <w:numId w:val="1481"/>
+          <w:numId w:val="1484"/>
         </w:numPr>
       </w:pPr>
       <w:r>
@@ -11520,7 +11643,7 @@
         <w:pStyle w:val="Compact"/>
         <w:numPr>
           <w:ilvl w:val="0"/>
-          <w:numId w:val="1482"/>
+          <w:numId w:val="1485"/>
         </w:numPr>
       </w:pPr>
       <w:r>
@@ -11532,7 +11655,7 @@
         <w:pStyle w:val="Compact"/>
         <w:numPr>
           <w:ilvl w:val="0"/>
-          <w:numId w:val="1483"/>
+          <w:numId w:val="1486"/>
         </w:numPr>
       </w:pPr>
       <w:r>
@@ -11544,7 +11667,7 @@
         <w:pStyle w:val="Compact"/>
         <w:numPr>
           <w:ilvl w:val="0"/>
-          <w:numId w:val="1484"/>
+          <w:numId w:val="1487"/>
         </w:numPr>
       </w:pPr>
       <w:r>
@@ -11556,7 +11679,7 @@
         <w:pStyle w:val="Compact"/>
         <w:numPr>
           <w:ilvl w:val="0"/>
-          <w:numId w:val="1485"/>
+          <w:numId w:val="1488"/>
         </w:numPr>
       </w:pPr>
       <w:r>
@@ -11578,7 +11701,7 @@
         <w:pStyle w:val="Compact"/>
         <w:numPr>
           <w:ilvl w:val="0"/>
-          <w:numId w:val="1486"/>
+          <w:numId w:val="1489"/>
         </w:numPr>
       </w:pPr>
       <w:r>
@@ -11590,7 +11713,7 @@
         <w:pStyle w:val="Compact"/>
         <w:numPr>
           <w:ilvl w:val="0"/>
-          <w:numId w:val="1487"/>
+          <w:numId w:val="1490"/>
         </w:numPr>
       </w:pPr>
       <w:r>
@@ -11602,7 +11725,7 @@
         <w:pStyle w:val="Compact"/>
         <w:numPr>
           <w:ilvl w:val="0"/>
-          <w:numId w:val="1488"/>
+          <w:numId w:val="1491"/>
         </w:numPr>
       </w:pPr>
       <w:r>
@@ -11614,7 +11737,7 @@
         <w:pStyle w:val="Compact"/>
         <w:numPr>
           <w:ilvl w:val="0"/>
-          <w:numId w:val="1489"/>
+          <w:numId w:val="1492"/>
         </w:numPr>
       </w:pPr>
       <w:r>
@@ -11626,7 +11749,7 @@
         <w:pStyle w:val="Compact"/>
         <w:numPr>
           <w:ilvl w:val="0"/>
-          <w:numId w:val="1490"/>
+          <w:numId w:val="1493"/>
         </w:numPr>
       </w:pPr>
       <w:r>
@@ -11638,7 +11761,7 @@
         <w:pStyle w:val="Compact"/>
         <w:numPr>
           <w:ilvl w:val="0"/>
-          <w:numId w:val="1491"/>
+          <w:numId w:val="1494"/>
         </w:numPr>
       </w:pPr>
       <w:r>
@@ -11650,7 +11773,7 @@
         <w:pStyle w:val="Compact"/>
         <w:numPr>
           <w:ilvl w:val="0"/>
-          <w:numId w:val="1492"/>
+          <w:numId w:val="1495"/>
         </w:numPr>
       </w:pPr>
       <w:r>
@@ -11662,7 +11785,7 @@
         <w:pStyle w:val="Compact"/>
         <w:numPr>
           <w:ilvl w:val="0"/>
-          <w:numId w:val="1493"/>
+          <w:numId w:val="1496"/>
         </w:numPr>
       </w:pPr>
       <w:r>
@@ -11694,7 +11817,7 @@
         <w:pStyle w:val="Compact"/>
         <w:numPr>
           <w:ilvl w:val="0"/>
-          <w:numId w:val="1494"/>
+          <w:numId w:val="1497"/>
         </w:numPr>
       </w:pPr>
       <w:r>
@@ -11742,7 +11865,7 @@
         <w:pStyle w:val="Compact"/>
         <w:numPr>
           <w:ilvl w:val="0"/>
-          <w:numId w:val="1495"/>
+          <w:numId w:val="1498"/>
         </w:numPr>
       </w:pPr>
       <w:r>
@@ -11754,7 +11877,7 @@
         <w:pStyle w:val="Compact"/>
         <w:numPr>
           <w:ilvl w:val="0"/>
-          <w:numId w:val="1496"/>
+          <w:numId w:val="1499"/>
         </w:numPr>
       </w:pPr>
       <w:r>
@@ -11766,7 +11889,7 @@
         <w:pStyle w:val="Compact"/>
         <w:numPr>
           <w:ilvl w:val="0"/>
-          <w:numId w:val="1497"/>
+          <w:numId w:val="1500"/>
         </w:numPr>
       </w:pPr>
       <w:r>
@@ -11778,7 +11901,7 @@
         <w:pStyle w:val="Compact"/>
         <w:numPr>
           <w:ilvl w:val="0"/>
-          <w:numId w:val="1498"/>
+          <w:numId w:val="1501"/>
         </w:numPr>
       </w:pPr>
       <w:r>
@@ -11790,7 +11913,7 @@
         <w:pStyle w:val="Compact"/>
         <w:numPr>
           <w:ilvl w:val="0"/>
-          <w:numId w:val="1499"/>
+          <w:numId w:val="1502"/>
         </w:numPr>
       </w:pPr>
       <w:r>
@@ -11844,7 +11967,7 @@
         <w:pStyle w:val="Compact"/>
         <w:numPr>
           <w:ilvl w:val="0"/>
-          <w:numId w:val="1500"/>
+          <w:numId w:val="1503"/>
         </w:numPr>
       </w:pPr>
       <w:r>
@@ -11856,7 +11979,7 @@
         <w:pStyle w:val="Compact"/>
         <w:numPr>
           <w:ilvl w:val="0"/>
-          <w:numId w:val="1501"/>
+          <w:numId w:val="1504"/>
         </w:numPr>
       </w:pPr>
       <w:r>
@@ -11883,7 +12006,7 @@
         <w:pStyle w:val="Compact"/>
         <w:numPr>
           <w:ilvl w:val="0"/>
-          <w:numId w:val="1502"/>
+          <w:numId w:val="1505"/>
         </w:numPr>
       </w:pPr>
       <w:r>
@@ -11925,7 +12048,7 @@
         <w:pStyle w:val="Compact"/>
         <w:numPr>
           <w:ilvl w:val="0"/>
-          <w:numId w:val="1503"/>
+          <w:numId w:val="1506"/>
         </w:numPr>
       </w:pPr>
       <w:r>
@@ -11952,7 +12075,7 @@
         <w:pStyle w:val="Compact"/>
         <w:numPr>
           <w:ilvl w:val="0"/>
-          <w:numId w:val="1504"/>
+          <w:numId w:val="1507"/>
         </w:numPr>
       </w:pPr>
       <w:r>
@@ -11964,7 +12087,7 @@
         <w:pStyle w:val="Compact"/>
         <w:numPr>
           <w:ilvl w:val="0"/>
-          <w:numId w:val="1505"/>
+          <w:numId w:val="1508"/>
         </w:numPr>
       </w:pPr>
       <w:r>
@@ -11976,7 +12099,7 @@
         <w:pStyle w:val="Compact"/>
         <w:numPr>
           <w:ilvl w:val="0"/>
-          <w:numId w:val="1506"/>
+          <w:numId w:val="1509"/>
         </w:numPr>
       </w:pPr>
       <w:r>
@@ -12013,7 +12136,7 @@
         <w:pStyle w:val="Compact"/>
         <w:numPr>
           <w:ilvl w:val="0"/>
-          <w:numId w:val="1507"/>
+          <w:numId w:val="1510"/>
         </w:numPr>
       </w:pPr>
       <w:r>
@@ -12025,7 +12148,7 @@
         <w:pStyle w:val="Compact"/>
         <w:numPr>
           <w:ilvl w:val="0"/>
-          <w:numId w:val="1508"/>
+          <w:numId w:val="1511"/>
         </w:numPr>
       </w:pPr>
       <w:r>
@@ -12037,7 +12160,7 @@
         <w:pStyle w:val="Compact"/>
         <w:numPr>
           <w:ilvl w:val="0"/>
-          <w:numId w:val="1509"/>
+          <w:numId w:val="1512"/>
         </w:numPr>
       </w:pPr>
       <w:r>
@@ -12049,7 +12172,7 @@
         <w:pStyle w:val="Compact"/>
         <w:numPr>
           <w:ilvl w:val="0"/>
-          <w:numId w:val="1510"/>
+          <w:numId w:val="1513"/>
         </w:numPr>
       </w:pPr>
       <w:r>
@@ -12061,7 +12184,7 @@
         <w:pStyle w:val="Compact"/>
         <w:numPr>
           <w:ilvl w:val="0"/>
-          <w:numId w:val="1511"/>
+          <w:numId w:val="1514"/>
         </w:numPr>
       </w:pPr>
       <w:r>
@@ -12073,7 +12196,7 @@
         <w:pStyle w:val="Compact"/>
         <w:numPr>
           <w:ilvl w:val="0"/>
-          <w:numId w:val="1512"/>
+          <w:numId w:val="1515"/>
         </w:numPr>
       </w:pPr>
       <w:r>
@@ -12085,7 +12208,7 @@
         <w:pStyle w:val="Compact"/>
         <w:numPr>
           <w:ilvl w:val="1"/>
-          <w:numId w:val="1513"/>
+          <w:numId w:val="1516"/>
         </w:numPr>
       </w:pPr>
       <w:r>
@@ -12112,7 +12235,7 @@
         <w:pStyle w:val="Compact"/>
         <w:numPr>
           <w:ilvl w:val="1"/>
-          <w:numId w:val="1513"/>
+          <w:numId w:val="1516"/>
         </w:numPr>
       </w:pPr>
       <w:r>
@@ -12149,7 +12272,7 @@
         <w:pStyle w:val="Compact"/>
         <w:numPr>
           <w:ilvl w:val="0"/>
-          <w:numId w:val="1514"/>
+          <w:numId w:val="1517"/>
         </w:numPr>
       </w:pPr>
       <w:r>
@@ -12191,7 +12314,7 @@
         <w:pStyle w:val="Compact"/>
         <w:numPr>
           <w:ilvl w:val="0"/>
-          <w:numId w:val="1515"/>
+          <w:numId w:val="1518"/>
         </w:numPr>
       </w:pPr>
       <w:r>
@@ -12215,7 +12338,7 @@
         <w:pStyle w:val="Compact"/>
         <w:numPr>
           <w:ilvl w:val="0"/>
-          <w:numId w:val="1516"/>
+          <w:numId w:val="1519"/>
         </w:numPr>
       </w:pPr>
       <w:r>
@@ -12239,7 +12362,7 @@
         <w:pStyle w:val="Compact"/>
         <w:numPr>
           <w:ilvl w:val="0"/>
-          <w:numId w:val="1517"/>
+          <w:numId w:val="1520"/>
         </w:numPr>
       </w:pPr>
       <w:r>
@@ -12251,7 +12374,7 @@
         <w:pStyle w:val="Compact"/>
         <w:numPr>
           <w:ilvl w:val="0"/>
-          <w:numId w:val="1518"/>
+          <w:numId w:val="1521"/>
         </w:numPr>
       </w:pPr>
       <w:r>
@@ -12263,7 +12386,7 @@
         <w:pStyle w:val="Compact"/>
         <w:numPr>
           <w:ilvl w:val="0"/>
-          <w:numId w:val="1519"/>
+          <w:numId w:val="1522"/>
         </w:numPr>
       </w:pPr>
       <w:r>
@@ -12275,7 +12398,7 @@
         <w:pStyle w:val="Compact"/>
         <w:numPr>
           <w:ilvl w:val="0"/>
-          <w:numId w:val="1520"/>
+          <w:numId w:val="1523"/>
         </w:numPr>
       </w:pPr>
       <w:r>
@@ -12287,7 +12410,7 @@
         <w:pStyle w:val="Compact"/>
         <w:numPr>
           <w:ilvl w:val="0"/>
-          <w:numId w:val="1521"/>
+          <w:numId w:val="1524"/>
         </w:numPr>
       </w:pPr>
       <w:r>
@@ -12299,7 +12422,7 @@
         <w:pStyle w:val="Compact"/>
         <w:numPr>
           <w:ilvl w:val="0"/>
-          <w:numId w:val="1522"/>
+          <w:numId w:val="1525"/>
         </w:numPr>
       </w:pPr>
       <w:r>
@@ -12311,7 +12434,7 @@
         <w:pStyle w:val="Compact"/>
         <w:numPr>
           <w:ilvl w:val="0"/>
-          <w:numId w:val="1523"/>
+          <w:numId w:val="1526"/>
         </w:numPr>
       </w:pPr>
       <w:r>
@@ -12323,7 +12446,7 @@
         <w:pStyle w:val="Compact"/>
         <w:numPr>
           <w:ilvl w:val="0"/>
-          <w:numId w:val="1524"/>
+          <w:numId w:val="1527"/>
         </w:numPr>
       </w:pPr>
       <w:r>
@@ -12335,7 +12458,7 @@
         <w:pStyle w:val="Compact"/>
         <w:numPr>
           <w:ilvl w:val="0"/>
-          <w:numId w:val="1525"/>
+          <w:numId w:val="1528"/>
         </w:numPr>
       </w:pPr>
       <w:r>
@@ -12347,7 +12470,7 @@
         <w:pStyle w:val="Compact"/>
         <w:numPr>
           <w:ilvl w:val="0"/>
-          <w:numId w:val="1526"/>
+          <w:numId w:val="1529"/>
         </w:numPr>
       </w:pPr>
       <w:r>
@@ -12359,7 +12482,7 @@
         <w:pStyle w:val="Compact"/>
         <w:numPr>
           <w:ilvl w:val="0"/>
-          <w:numId w:val="1527"/>
+          <w:numId w:val="1530"/>
         </w:numPr>
       </w:pPr>
       <w:r>
@@ -12386,7 +12509,7 @@
         <w:pStyle w:val="Compact"/>
         <w:numPr>
           <w:ilvl w:val="0"/>
-          <w:numId w:val="1528"/>
+          <w:numId w:val="1531"/>
         </w:numPr>
       </w:pPr>
       <w:r>
@@ -12398,7 +12521,7 @@
         <w:pStyle w:val="Compact"/>
         <w:numPr>
           <w:ilvl w:val="0"/>
-          <w:numId w:val="1529"/>
+          <w:numId w:val="1532"/>
         </w:numPr>
       </w:pPr>
       <w:r>
@@ -12420,7 +12543,7 @@
         <w:pStyle w:val="Compact"/>
         <w:numPr>
           <w:ilvl w:val="0"/>
-          <w:numId w:val="1530"/>
+          <w:numId w:val="1533"/>
         </w:numPr>
       </w:pPr>
       <w:r>
@@ -12432,7 +12555,7 @@
         <w:pStyle w:val="Compact"/>
         <w:numPr>
           <w:ilvl w:val="0"/>
-          <w:numId w:val="1531"/>
+          <w:numId w:val="1534"/>
         </w:numPr>
       </w:pPr>
       <w:r>
@@ -12459,7 +12582,7 @@
         <w:pStyle w:val="Compact"/>
         <w:numPr>
           <w:ilvl w:val="0"/>
-          <w:numId w:val="1532"/>
+          <w:numId w:val="1535"/>
         </w:numPr>
       </w:pPr>
       <w:r>
@@ -12486,7 +12609,7 @@
         <w:pStyle w:val="Compact"/>
         <w:numPr>
           <w:ilvl w:val="0"/>
-          <w:numId w:val="1533"/>
+          <w:numId w:val="1536"/>
         </w:numPr>
       </w:pPr>
       <w:r>
@@ -12513,71 +12636,11 @@
         <w:pStyle w:val="Compact"/>
         <w:numPr>
           <w:ilvl w:val="0"/>
-          <w:numId w:val="1534"/>
+          <w:numId w:val="1537"/>
         </w:numPr>
       </w:pPr>
       <w:r>
         <w:t xml:space="preserve">Implement three separate analytical query engines:</w:t>
-      </w:r>
-    </w:p>
-    <w:p>
-      <w:pPr>
-        <w:pStyle w:val="Compact"/>
-        <w:numPr>
-          <w:ilvl w:val="1"/>
-          <w:numId w:val="1535"/>
-        </w:numPr>
-      </w:pPr>
-      <w:r>
-        <w:t xml:space="preserve">multi-campaign retarget;</w:t>
-      </w:r>
-    </w:p>
-    <w:p>
-      <w:pPr>
-        <w:pStyle w:val="Compact"/>
-        <w:numPr>
-          <w:ilvl w:val="1"/>
-          <w:numId w:val="1535"/>
-        </w:numPr>
-      </w:pPr>
-      <w:r>
-        <w:t xml:space="preserve">new cohorts from unsent leads;</w:t>
-      </w:r>
-    </w:p>
-    <w:p>
-      <w:pPr>
-        <w:pStyle w:val="Compact"/>
-        <w:numPr>
-          <w:ilvl w:val="1"/>
-          <w:numId w:val="1535"/>
-        </w:numPr>
-      </w:pPr>
-      <w:r>
-        <w:t xml:space="preserve">renewal candidates.</w:t>
-      </w:r>
-    </w:p>
-    <w:p>
-      <w:pPr>
-        <w:pStyle w:val="Compact"/>
-        <w:numPr>
-          <w:ilvl w:val="0"/>
-          <w:numId w:val="1536"/>
-        </w:numPr>
-      </w:pPr>
-      <w:r>
-        <w:t xml:space="preserve">Each query joins only the required campaign/lead/funded/deal data and remains performant.</w:t>
-      </w:r>
-    </w:p>
-    <w:p>
-      <w:pPr>
-        <w:pStyle w:val="Compact"/>
-        <w:numPr>
-          <w:ilvl w:val="0"/>
-          <w:numId w:val="1537"/>
-        </w:numPr>
-      </w:pPr>
-      <w:r>
-        <w:t xml:space="preserve">Each cohort includes:</w:t>
       </w:r>
     </w:p>
     <w:p>
@@ -12589,7 +12652,7 @@
         </w:numPr>
       </w:pPr>
       <w:r>
-        <w:t xml:space="preserve">lead count;</w:t>
+        <w:t xml:space="preserve">multi-campaign retarget;</w:t>
       </w:r>
     </w:p>
     <w:p>
@@ -12601,7 +12664,7 @@
         </w:numPr>
       </w:pPr>
       <w:r>
-        <w:t xml:space="preserve">predicted reply rate;</w:t>
+        <w:t xml:space="preserve">new cohorts from unsent leads;</w:t>
       </w:r>
     </w:p>
     <w:p>
@@ -12613,6 +12676,66 @@
         </w:numPr>
       </w:pPr>
       <w:r>
+        <w:t xml:space="preserve">renewal candidates.</w:t>
+      </w:r>
+    </w:p>
+    <w:p>
+      <w:pPr>
+        <w:pStyle w:val="Compact"/>
+        <w:numPr>
+          <w:ilvl w:val="0"/>
+          <w:numId w:val="1539"/>
+        </w:numPr>
+      </w:pPr>
+      <w:r>
+        <w:t xml:space="preserve">Each query joins only the required campaign/lead/funded/deal data and remains performant.</w:t>
+      </w:r>
+    </w:p>
+    <w:p>
+      <w:pPr>
+        <w:pStyle w:val="Compact"/>
+        <w:numPr>
+          <w:ilvl w:val="0"/>
+          <w:numId w:val="1540"/>
+        </w:numPr>
+      </w:pPr>
+      <w:r>
+        <w:t xml:space="preserve">Each cohort includes:</w:t>
+      </w:r>
+    </w:p>
+    <w:p>
+      <w:pPr>
+        <w:pStyle w:val="Compact"/>
+        <w:numPr>
+          <w:ilvl w:val="1"/>
+          <w:numId w:val="1541"/>
+        </w:numPr>
+      </w:pPr>
+      <w:r>
+        <w:t xml:space="preserve">lead count;</w:t>
+      </w:r>
+    </w:p>
+    <w:p>
+      <w:pPr>
+        <w:pStyle w:val="Compact"/>
+        <w:numPr>
+          <w:ilvl w:val="1"/>
+          <w:numId w:val="1541"/>
+        </w:numPr>
+      </w:pPr>
+      <w:r>
+        <w:t xml:space="preserve">predicted reply rate;</w:t>
+      </w:r>
+    </w:p>
+    <w:p>
+      <w:pPr>
+        <w:pStyle w:val="Compact"/>
+        <w:numPr>
+          <w:ilvl w:val="1"/>
+          <w:numId w:val="1541"/>
+        </w:numPr>
+      </w:pPr>
+      <w:r>
         <w:t xml:space="preserve">expected funded deals;</w:t>
       </w:r>
     </w:p>
@@ -12621,7 +12744,7 @@
         <w:pStyle w:val="Compact"/>
         <w:numPr>
           <w:ilvl w:val="1"/>
-          <w:numId w:val="1538"/>
+          <w:numId w:val="1541"/>
         </w:numPr>
       </w:pPr>
       <w:r>
@@ -12633,7 +12756,7 @@
         <w:pStyle w:val="Compact"/>
         <w:numPr>
           <w:ilvl w:val="1"/>
-          <w:numId w:val="1538"/>
+          <w:numId w:val="1541"/>
         </w:numPr>
       </w:pPr>
       <w:r>
@@ -12645,7 +12768,7 @@
         <w:pStyle w:val="Compact"/>
         <w:numPr>
           <w:ilvl w:val="1"/>
-          <w:numId w:val="1538"/>
+          <w:numId w:val="1541"/>
         </w:numPr>
       </w:pPr>
       <w:r>
@@ -12657,7 +12780,7 @@
         <w:pStyle w:val="Compact"/>
         <w:numPr>
           <w:ilvl w:val="0"/>
-          <w:numId w:val="1539"/>
+          <w:numId w:val="1542"/>
         </w:numPr>
       </w:pPr>
       <w:r>
@@ -12669,7 +12792,7 @@
         <w:pStyle w:val="Compact"/>
         <w:numPr>
           <w:ilvl w:val="0"/>
-          <w:numId w:val="1540"/>
+          <w:numId w:val="1543"/>
         </w:numPr>
       </w:pPr>
       <w:r>
@@ -12681,7 +12804,7 @@
         <w:pStyle w:val="Compact"/>
         <w:numPr>
           <w:ilvl w:val="0"/>
-          <w:numId w:val="1541"/>
+          <w:numId w:val="1544"/>
         </w:numPr>
       </w:pPr>
       <w:r>
@@ -12703,7 +12826,7 @@
         <w:pStyle w:val="Compact"/>
         <w:numPr>
           <w:ilvl w:val="0"/>
-          <w:numId w:val="1542"/>
+          <w:numId w:val="1545"/>
         </w:numPr>
       </w:pPr>
       <w:r>
@@ -12715,7 +12838,7 @@
         <w:pStyle w:val="Compact"/>
         <w:numPr>
           <w:ilvl w:val="0"/>
-          <w:numId w:val="1543"/>
+          <w:numId w:val="1546"/>
         </w:numPr>
       </w:pPr>
       <w:r>
@@ -12727,7 +12850,7 @@
         <w:pStyle w:val="Compact"/>
         <w:numPr>
           <w:ilvl w:val="0"/>
-          <w:numId w:val="1544"/>
+          <w:numId w:val="1547"/>
         </w:numPr>
       </w:pPr>
       <w:r>
@@ -12739,7 +12862,7 @@
         <w:pStyle w:val="Compact"/>
         <w:numPr>
           <w:ilvl w:val="0"/>
-          <w:numId w:val="1545"/>
+          <w:numId w:val="1548"/>
         </w:numPr>
       </w:pPr>
       <w:r>
@@ -12751,7 +12874,7 @@
         <w:pStyle w:val="Compact"/>
         <w:numPr>
           <w:ilvl w:val="0"/>
-          <w:numId w:val="1546"/>
+          <w:numId w:val="1549"/>
         </w:numPr>
       </w:pPr>
       <w:r>
@@ -12763,7 +12886,7 @@
         <w:pStyle w:val="Compact"/>
         <w:numPr>
           <w:ilvl w:val="0"/>
-          <w:numId w:val="1547"/>
+          <w:numId w:val="1550"/>
         </w:numPr>
       </w:pPr>
       <w:r>
@@ -12785,7 +12908,7 @@
         <w:pStyle w:val="Compact"/>
         <w:numPr>
           <w:ilvl w:val="0"/>
-          <w:numId w:val="1548"/>
+          <w:numId w:val="1551"/>
         </w:numPr>
       </w:pPr>
       <w:r>
@@ -12797,7 +12920,7 @@
         <w:pStyle w:val="Compact"/>
         <w:numPr>
           <w:ilvl w:val="1"/>
-          <w:numId w:val="1549"/>
+          <w:numId w:val="1552"/>
         </w:numPr>
       </w:pPr>
       <w:r>
@@ -12809,7 +12932,7 @@
         <w:pStyle w:val="Compact"/>
         <w:numPr>
           <w:ilvl w:val="1"/>
-          <w:numId w:val="1549"/>
+          <w:numId w:val="1552"/>
         </w:numPr>
       </w:pPr>
       <w:r>
@@ -12821,7 +12944,7 @@
         <w:pStyle w:val="Compact"/>
         <w:numPr>
           <w:ilvl w:val="0"/>
-          <w:numId w:val="1550"/>
+          <w:numId w:val="1553"/>
         </w:numPr>
       </w:pPr>
       <w:r>
@@ -12833,7 +12956,7 @@
         <w:pStyle w:val="Compact"/>
         <w:numPr>
           <w:ilvl w:val="1"/>
-          <w:numId w:val="1551"/>
+          <w:numId w:val="1554"/>
         </w:numPr>
       </w:pPr>
       <w:r>
@@ -12845,7 +12968,7 @@
         <w:pStyle w:val="Compact"/>
         <w:numPr>
           <w:ilvl w:val="1"/>
-          <w:numId w:val="1551"/>
+          <w:numId w:val="1554"/>
         </w:numPr>
       </w:pPr>
       <w:r>
@@ -12857,7 +12980,7 @@
         <w:pStyle w:val="Compact"/>
         <w:numPr>
           <w:ilvl w:val="0"/>
-          <w:numId w:val="1552"/>
+          <w:numId w:val="1555"/>
         </w:numPr>
       </w:pPr>
       <w:r>
@@ -12869,7 +12992,7 @@
         <w:pStyle w:val="Compact"/>
         <w:numPr>
           <w:ilvl w:val="0"/>
-          <w:numId w:val="1553"/>
+          <w:numId w:val="1556"/>
         </w:numPr>
       </w:pPr>
       <w:r>
@@ -12881,7 +13004,7 @@
         <w:pStyle w:val="Compact"/>
         <w:numPr>
           <w:ilvl w:val="0"/>
-          <w:numId w:val="1554"/>
+          <w:numId w:val="1557"/>
         </w:numPr>
       </w:pPr>
       <w:r>
@@ -12893,7 +13016,7 @@
         <w:pStyle w:val="Compact"/>
         <w:numPr>
           <w:ilvl w:val="0"/>
-          <w:numId w:val="1555"/>
+          <w:numId w:val="1558"/>
         </w:numPr>
       </w:pPr>
       <w:r>
@@ -12915,7 +13038,7 @@
         <w:pStyle w:val="Compact"/>
         <w:numPr>
           <w:ilvl w:val="0"/>
-          <w:numId w:val="1556"/>
+          <w:numId w:val="1559"/>
         </w:numPr>
       </w:pPr>
       <w:r>
@@ -12927,7 +13050,7 @@
         <w:pStyle w:val="Compact"/>
         <w:numPr>
           <w:ilvl w:val="0"/>
-          <w:numId w:val="1557"/>
+          <w:numId w:val="1560"/>
         </w:numPr>
       </w:pPr>
       <w:r>
@@ -12939,7 +13062,7 @@
         <w:pStyle w:val="Compact"/>
         <w:numPr>
           <w:ilvl w:val="0"/>
-          <w:numId w:val="1558"/>
+          <w:numId w:val="1561"/>
         </w:numPr>
       </w:pPr>
       <w:r>
@@ -12951,7 +13074,7 @@
         <w:pStyle w:val="Compact"/>
         <w:numPr>
           <w:ilvl w:val="0"/>
-          <w:numId w:val="1559"/>
+          <w:numId w:val="1562"/>
         </w:numPr>
       </w:pPr>
       <w:r>
@@ -12963,7 +13086,7 @@
         <w:pStyle w:val="Compact"/>
         <w:numPr>
           <w:ilvl w:val="0"/>
-          <w:numId w:val="1560"/>
+          <w:numId w:val="1563"/>
         </w:numPr>
       </w:pPr>
       <w:r>
@@ -12975,7 +13098,7 @@
         <w:pStyle w:val="Compact"/>
         <w:numPr>
           <w:ilvl w:val="0"/>
-          <w:numId w:val="1561"/>
+          <w:numId w:val="1564"/>
         </w:numPr>
       </w:pPr>
       <w:r>
@@ -12987,7 +13110,7 @@
         <w:pStyle w:val="Compact"/>
         <w:numPr>
           <w:ilvl w:val="0"/>
-          <w:numId w:val="1562"/>
+          <w:numId w:val="1565"/>
         </w:numPr>
       </w:pPr>
       <w:r>
@@ -12999,7 +13122,7 @@
         <w:pStyle w:val="Compact"/>
         <w:numPr>
           <w:ilvl w:val="0"/>
-          <w:numId w:val="1563"/>
+          <w:numId w:val="1566"/>
         </w:numPr>
       </w:pPr>
       <w:r>
@@ -13011,7 +13134,7 @@
         <w:pStyle w:val="Compact"/>
         <w:numPr>
           <w:ilvl w:val="0"/>
-          <w:numId w:val="1564"/>
+          <w:numId w:val="1567"/>
         </w:numPr>
       </w:pPr>
       <w:r>
@@ -13033,7 +13156,7 @@
         <w:pStyle w:val="Compact"/>
         <w:numPr>
           <w:ilvl w:val="0"/>
-          <w:numId w:val="1565"/>
+          <w:numId w:val="1568"/>
         </w:numPr>
       </w:pPr>
       <w:r>
@@ -13045,7 +13168,7 @@
         <w:pStyle w:val="Compact"/>
         <w:numPr>
           <w:ilvl w:val="0"/>
-          <w:numId w:val="1566"/>
+          <w:numId w:val="1569"/>
         </w:numPr>
       </w:pPr>
       <w:r>
@@ -13057,7 +13180,7 @@
         <w:pStyle w:val="Compact"/>
         <w:numPr>
           <w:ilvl w:val="0"/>
-          <w:numId w:val="1567"/>
+          <w:numId w:val="1570"/>
         </w:numPr>
       </w:pPr>
       <w:r>
@@ -13069,7 +13192,7 @@
         <w:pStyle w:val="Compact"/>
         <w:numPr>
           <w:ilvl w:val="0"/>
-          <w:numId w:val="1568"/>
+          <w:numId w:val="1571"/>
         </w:numPr>
       </w:pPr>
       <w:r>
@@ -13081,7 +13204,7 @@
         <w:pStyle w:val="Compact"/>
         <w:numPr>
           <w:ilvl w:val="0"/>
-          <w:numId w:val="1569"/>
+          <w:numId w:val="1572"/>
         </w:numPr>
       </w:pPr>
       <w:r>
@@ -13093,7 +13216,7 @@
         <w:pStyle w:val="Compact"/>
         <w:numPr>
           <w:ilvl w:val="0"/>
-          <w:numId w:val="1570"/>
+          <w:numId w:val="1573"/>
         </w:numPr>
       </w:pPr>
       <w:r>
@@ -13105,7 +13228,7 @@
         <w:pStyle w:val="Compact"/>
         <w:numPr>
           <w:ilvl w:val="0"/>
-          <w:numId w:val="1571"/>
+          <w:numId w:val="1574"/>
         </w:numPr>
       </w:pPr>
       <w:r>
@@ -13117,7 +13240,7 @@
         <w:pStyle w:val="Compact"/>
         <w:numPr>
           <w:ilvl w:val="0"/>
-          <w:numId w:val="1572"/>
+          <w:numId w:val="1575"/>
         </w:numPr>
       </w:pPr>
       <w:r>
@@ -13129,7 +13252,7 @@
         <w:pStyle w:val="Compact"/>
         <w:numPr>
           <w:ilvl w:val="0"/>
-          <w:numId w:val="1573"/>
+          <w:numId w:val="1576"/>
         </w:numPr>
       </w:pPr>
       <w:r>
@@ -13141,7 +13264,7 @@
         <w:pStyle w:val="Compact"/>
         <w:numPr>
           <w:ilvl w:val="0"/>
-          <w:numId w:val="1574"/>
+          <w:numId w:val="1577"/>
         </w:numPr>
       </w:pPr>
       <w:r>
@@ -13168,7 +13291,7 @@
         <w:pStyle w:val="Compact"/>
         <w:numPr>
           <w:ilvl w:val="0"/>
-          <w:numId w:val="1575"/>
+          <w:numId w:val="1578"/>
         </w:numPr>
       </w:pPr>
       <w:r>
@@ -13189,7 +13312,7 @@
         <w:pStyle w:val="Compact"/>
         <w:numPr>
           <w:ilvl w:val="0"/>
-          <w:numId w:val="1576"/>
+          <w:numId w:val="1579"/>
         </w:numPr>
       </w:pPr>
       <w:r>
@@ -13211,7 +13334,7 @@
         <w:pStyle w:val="Compact"/>
         <w:numPr>
           <w:ilvl w:val="0"/>
-          <w:numId w:val="1577"/>
+          <w:numId w:val="1580"/>
         </w:numPr>
       </w:pPr>
       <w:r>
@@ -13223,7 +13346,7 @@
         <w:pStyle w:val="Compact"/>
         <w:numPr>
           <w:ilvl w:val="0"/>
-          <w:numId w:val="1578"/>
+          <w:numId w:val="1581"/>
         </w:numPr>
       </w:pPr>
       <w:r>
@@ -13235,7 +13358,7 @@
         <w:pStyle w:val="Compact"/>
         <w:numPr>
           <w:ilvl w:val="0"/>
-          <w:numId w:val="1579"/>
+          <w:numId w:val="1582"/>
         </w:numPr>
       </w:pPr>
       <w:r>
@@ -13247,7 +13370,7 @@
         <w:pStyle w:val="Compact"/>
         <w:numPr>
           <w:ilvl w:val="0"/>
-          <w:numId w:val="1580"/>
+          <w:numId w:val="1583"/>
         </w:numPr>
       </w:pPr>
       <w:r>
@@ -13259,7 +13382,7 @@
         <w:pStyle w:val="Compact"/>
         <w:numPr>
           <w:ilvl w:val="0"/>
-          <w:numId w:val="1581"/>
+          <w:numId w:val="1584"/>
         </w:numPr>
       </w:pPr>
       <w:r>
@@ -13271,7 +13394,7 @@
         <w:pStyle w:val="Compact"/>
         <w:numPr>
           <w:ilvl w:val="0"/>
-          <w:numId w:val="1582"/>
+          <w:numId w:val="1585"/>
         </w:numPr>
       </w:pPr>
       <w:r>
@@ -13283,7 +13406,7 @@
         <w:pStyle w:val="Compact"/>
         <w:numPr>
           <w:ilvl w:val="0"/>
-          <w:numId w:val="1583"/>
+          <w:numId w:val="1586"/>
         </w:numPr>
       </w:pPr>
       <w:r>
@@ -13295,7 +13418,7 @@
         <w:pStyle w:val="Compact"/>
         <w:numPr>
           <w:ilvl w:val="0"/>
-          <w:numId w:val="1584"/>
+          <w:numId w:val="1587"/>
         </w:numPr>
       </w:pPr>
       <w:r>
@@ -13317,7 +13440,7 @@
         <w:pStyle w:val="Compact"/>
         <w:numPr>
           <w:ilvl w:val="0"/>
-          <w:numId w:val="1585"/>
+          <w:numId w:val="1588"/>
         </w:numPr>
       </w:pPr>
       <w:r>
@@ -13329,7 +13452,7 @@
         <w:pStyle w:val="Compact"/>
         <w:numPr>
           <w:ilvl w:val="0"/>
-          <w:numId w:val="1586"/>
+          <w:numId w:val="1589"/>
         </w:numPr>
       </w:pPr>
       <w:r>
@@ -13341,7 +13464,7 @@
         <w:pStyle w:val="Compact"/>
         <w:numPr>
           <w:ilvl w:val="0"/>
-          <w:numId w:val="1587"/>
+          <w:numId w:val="1590"/>
         </w:numPr>
       </w:pPr>
       <w:r>
@@ -13353,7 +13476,7 @@
         <w:pStyle w:val="Compact"/>
         <w:numPr>
           <w:ilvl w:val="0"/>
-          <w:numId w:val="1588"/>
+          <w:numId w:val="1591"/>
         </w:numPr>
       </w:pPr>
       <w:r>
@@ -13365,7 +13488,7 @@
         <w:pStyle w:val="Compact"/>
         <w:numPr>
           <w:ilvl w:val="0"/>
-          <w:numId w:val="1589"/>
+          <w:numId w:val="1592"/>
         </w:numPr>
       </w:pPr>
       <w:r>
@@ -13377,7 +13500,7 @@
         <w:pStyle w:val="Compact"/>
         <w:numPr>
           <w:ilvl w:val="0"/>
-          <w:numId w:val="1590"/>
+          <w:numId w:val="1593"/>
         </w:numPr>
       </w:pPr>
       <w:r>
@@ -13389,7 +13512,7 @@
         <w:pStyle w:val="Compact"/>
         <w:numPr>
           <w:ilvl w:val="0"/>
-          <w:numId w:val="1591"/>
+          <w:numId w:val="1594"/>
         </w:numPr>
       </w:pPr>
       <w:r>
@@ -13401,7 +13524,7 @@
         <w:pStyle w:val="Compact"/>
         <w:numPr>
           <w:ilvl w:val="0"/>
-          <w:numId w:val="1592"/>
+          <w:numId w:val="1595"/>
         </w:numPr>
       </w:pPr>
       <w:r>
@@ -13413,7 +13536,7 @@
         <w:pStyle w:val="Compact"/>
         <w:numPr>
           <w:ilvl w:val="0"/>
-          <w:numId w:val="1593"/>
+          <w:numId w:val="1596"/>
         </w:numPr>
       </w:pPr>
       <w:r>
@@ -13425,7 +13548,7 @@
         <w:pStyle w:val="Compact"/>
         <w:numPr>
           <w:ilvl w:val="0"/>
-          <w:numId w:val="1594"/>
+          <w:numId w:val="1597"/>
         </w:numPr>
       </w:pPr>
       <w:r>
@@ -13437,7 +13560,7 @@
         <w:pStyle w:val="Compact"/>
         <w:numPr>
           <w:ilvl w:val="0"/>
-          <w:numId w:val="1595"/>
+          <w:numId w:val="1598"/>
         </w:numPr>
       </w:pPr>
       <w:r>
@@ -13449,7 +13572,7 @@
         <w:pStyle w:val="Compact"/>
         <w:numPr>
           <w:ilvl w:val="0"/>
-          <w:numId w:val="1596"/>
+          <w:numId w:val="1599"/>
         </w:numPr>
       </w:pPr>
       <w:r>
@@ -13461,7 +13584,7 @@
         <w:pStyle w:val="Compact"/>
         <w:numPr>
           <w:ilvl w:val="0"/>
-          <w:numId w:val="1597"/>
+          <w:numId w:val="1600"/>
         </w:numPr>
       </w:pPr>
       <w:r>
@@ -13473,7 +13596,7 @@
         <w:pStyle w:val="Compact"/>
         <w:numPr>
           <w:ilvl w:val="0"/>
-          <w:numId w:val="1598"/>
+          <w:numId w:val="1601"/>
         </w:numPr>
       </w:pPr>
       <w:r>
@@ -13485,7 +13608,7 @@
         <w:pStyle w:val="Compact"/>
         <w:numPr>
           <w:ilvl w:val="0"/>
-          <w:numId w:val="1599"/>
+          <w:numId w:val="1602"/>
         </w:numPr>
       </w:pPr>
       <w:r>
@@ -13517,7 +13640,7 @@
         <w:pStyle w:val="Compact"/>
         <w:numPr>
           <w:ilvl w:val="0"/>
-          <w:numId w:val="1600"/>
+          <w:numId w:val="1603"/>
         </w:numPr>
       </w:pPr>
       <w:r>
@@ -13529,7 +13652,7 @@
         <w:pStyle w:val="Compact"/>
         <w:numPr>
           <w:ilvl w:val="0"/>
-          <w:numId w:val="1601"/>
+          <w:numId w:val="1604"/>
         </w:numPr>
       </w:pPr>
       <w:r>
@@ -13541,7 +13664,7 @@
         <w:pStyle w:val="Compact"/>
         <w:numPr>
           <w:ilvl w:val="0"/>
-          <w:numId w:val="1602"/>
+          <w:numId w:val="1605"/>
         </w:numPr>
       </w:pPr>
       <w:r>
@@ -13553,7 +13676,7 @@
         <w:pStyle w:val="Compact"/>
         <w:numPr>
           <w:ilvl w:val="0"/>
-          <w:numId w:val="1603"/>
+          <w:numId w:val="1606"/>
         </w:numPr>
       </w:pPr>
       <w:r>
@@ -13565,7 +13688,7 @@
         <w:pStyle w:val="Compact"/>
         <w:numPr>
           <w:ilvl w:val="0"/>
-          <w:numId w:val="1604"/>
+          <w:numId w:val="1607"/>
         </w:numPr>
       </w:pPr>
       <w:r>
@@ -13577,7 +13700,7 @@
         <w:pStyle w:val="Compact"/>
         <w:numPr>
           <w:ilvl w:val="0"/>
-          <w:numId w:val="1605"/>
+          <w:numId w:val="1608"/>
         </w:numPr>
       </w:pPr>
       <w:r>
@@ -13589,7 +13712,7 @@
         <w:pStyle w:val="Compact"/>
         <w:numPr>
           <w:ilvl w:val="0"/>
-          <w:numId w:val="1606"/>
+          <w:numId w:val="1609"/>
         </w:numPr>
       </w:pPr>
       <w:r>
@@ -13601,7 +13724,7 @@
         <w:pStyle w:val="Compact"/>
         <w:numPr>
           <w:ilvl w:val="0"/>
-          <w:numId w:val="1607"/>
+          <w:numId w:val="1610"/>
         </w:numPr>
       </w:pPr>
       <w:r>
@@ -13613,7 +13736,7 @@
         <w:pStyle w:val="Compact"/>
         <w:numPr>
           <w:ilvl w:val="0"/>
-          <w:numId w:val="1608"/>
+          <w:numId w:val="1611"/>
         </w:numPr>
       </w:pPr>
       <w:r>
@@ -13625,7 +13748,7 @@
         <w:pStyle w:val="Compact"/>
         <w:numPr>
           <w:ilvl w:val="0"/>
-          <w:numId w:val="1609"/>
+          <w:numId w:val="1612"/>
         </w:numPr>
       </w:pPr>
       <w:r>
@@ -13637,7 +13760,7 @@
         <w:pStyle w:val="Compact"/>
         <w:numPr>
           <w:ilvl w:val="0"/>
-          <w:numId w:val="1610"/>
+          <w:numId w:val="1613"/>
         </w:numPr>
       </w:pPr>
       <w:r>
@@ -13649,7 +13772,7 @@
         <w:pStyle w:val="Compact"/>
         <w:numPr>
           <w:ilvl w:val="0"/>
-          <w:numId w:val="1611"/>
+          <w:numId w:val="1614"/>
         </w:numPr>
       </w:pPr>
       <w:r>
@@ -13661,7 +13784,7 @@
         <w:pStyle w:val="Compact"/>
         <w:numPr>
           <w:ilvl w:val="0"/>
-          <w:numId w:val="1612"/>
+          <w:numId w:val="1615"/>
         </w:numPr>
       </w:pPr>
       <w:r>
@@ -13698,7 +13821,7 @@
         <w:pStyle w:val="Compact"/>
         <w:numPr>
           <w:ilvl w:val="0"/>
-          <w:numId w:val="1613"/>
+          <w:numId w:val="1616"/>
         </w:numPr>
       </w:pPr>
       <w:r>
@@ -13710,7 +13833,7 @@
         <w:pStyle w:val="Compact"/>
         <w:numPr>
           <w:ilvl w:val="0"/>
-          <w:numId w:val="1614"/>
+          <w:numId w:val="1617"/>
         </w:numPr>
       </w:pPr>
       <w:r>
@@ -13737,7 +13860,7 @@
         <w:pStyle w:val="Compact"/>
         <w:numPr>
           <w:ilvl w:val="0"/>
-          <w:numId w:val="1615"/>
+          <w:numId w:val="1618"/>
         </w:numPr>
       </w:pPr>
       <w:r>
@@ -13749,7 +13872,7 @@
         <w:pStyle w:val="Compact"/>
         <w:numPr>
           <w:ilvl w:val="0"/>
-          <w:numId w:val="1616"/>
+          <w:numId w:val="1619"/>
         </w:numPr>
       </w:pPr>
       <w:r>
@@ -13761,7 +13884,7 @@
         <w:pStyle w:val="Compact"/>
         <w:numPr>
           <w:ilvl w:val="0"/>
-          <w:numId w:val="1617"/>
+          <w:numId w:val="1620"/>
         </w:numPr>
       </w:pPr>
       <w:r>
@@ -13773,7 +13896,7 @@
         <w:pStyle w:val="Compact"/>
         <w:numPr>
           <w:ilvl w:val="0"/>
-          <w:numId w:val="1618"/>
+          <w:numId w:val="1621"/>
         </w:numPr>
       </w:pPr>
       <w:r>
@@ -13785,7 +13908,7 @@
         <w:pStyle w:val="Compact"/>
         <w:numPr>
           <w:ilvl w:val="0"/>
-          <w:numId w:val="1619"/>
+          <w:numId w:val="1622"/>
         </w:numPr>
       </w:pPr>
       <w:r>
@@ -13797,7 +13920,7 @@
         <w:pStyle w:val="Compact"/>
         <w:numPr>
           <w:ilvl w:val="0"/>
-          <w:numId w:val="1620"/>
+          <w:numId w:val="1623"/>
         </w:numPr>
       </w:pPr>
       <w:r>
@@ -13819,7 +13942,7 @@
         <w:pStyle w:val="Compact"/>
         <w:numPr>
           <w:ilvl w:val="0"/>
-          <w:numId w:val="1621"/>
+          <w:numId w:val="1624"/>
         </w:numPr>
       </w:pPr>
       <w:r>
@@ -13831,7 +13954,7 @@
         <w:pStyle w:val="Compact"/>
         <w:numPr>
           <w:ilvl w:val="0"/>
-          <w:numId w:val="1622"/>
+          <w:numId w:val="1625"/>
         </w:numPr>
       </w:pPr>
       <w:r>
@@ -13843,7 +13966,7 @@
         <w:pStyle w:val="Compact"/>
         <w:numPr>
           <w:ilvl w:val="0"/>
-          <w:numId w:val="1623"/>
+          <w:numId w:val="1626"/>
         </w:numPr>
       </w:pPr>
       <w:r>
@@ -13855,7 +13978,7 @@
         <w:pStyle w:val="Compact"/>
         <w:numPr>
           <w:ilvl w:val="0"/>
-          <w:numId w:val="1624"/>
+          <w:numId w:val="1627"/>
         </w:numPr>
       </w:pPr>
       <w:r>
@@ -13867,7 +13990,7 @@
         <w:pStyle w:val="Compact"/>
         <w:numPr>
           <w:ilvl w:val="0"/>
-          <w:numId w:val="1625"/>
+          <w:numId w:val="1628"/>
         </w:numPr>
       </w:pPr>
       <w:r>
@@ -13879,7 +14002,7 @@
         <w:pStyle w:val="Compact"/>
         <w:numPr>
           <w:ilvl w:val="0"/>
-          <w:numId w:val="1626"/>
+          <w:numId w:val="1629"/>
         </w:numPr>
       </w:pPr>
       <w:r>
@@ -13891,7 +14014,7 @@
         <w:pStyle w:val="Compact"/>
         <w:numPr>
           <w:ilvl w:val="0"/>
-          <w:numId w:val="1627"/>
+          <w:numId w:val="1630"/>
         </w:numPr>
       </w:pPr>
       <w:r>
@@ -13903,7 +14026,7 @@
         <w:pStyle w:val="Compact"/>
         <w:numPr>
           <w:ilvl w:val="0"/>
-          <w:numId w:val="1628"/>
+          <w:numId w:val="1631"/>
         </w:numPr>
       </w:pPr>
       <w:r>
@@ -13915,7 +14038,7 @@
         <w:pStyle w:val="Compact"/>
         <w:numPr>
           <w:ilvl w:val="0"/>
-          <w:numId w:val="1629"/>
+          <w:numId w:val="1632"/>
         </w:numPr>
       </w:pPr>
       <w:r>
@@ -13938,7 +14061,7 @@
         <w:pStyle w:val="Compact"/>
         <w:numPr>
           <w:ilvl w:val="0"/>
-          <w:numId w:val="1630"/>
+          <w:numId w:val="1633"/>
         </w:numPr>
       </w:pPr>
       <w:r>
@@ -13950,7 +14073,7 @@
         <w:pStyle w:val="Compact"/>
         <w:numPr>
           <w:ilvl w:val="0"/>
-          <w:numId w:val="1631"/>
+          <w:numId w:val="1634"/>
         </w:numPr>
       </w:pPr>
       <w:r>
@@ -13962,7 +14085,7 @@
         <w:pStyle w:val="Compact"/>
         <w:numPr>
           <w:ilvl w:val="0"/>
-          <w:numId w:val="1632"/>
+          <w:numId w:val="1635"/>
         </w:numPr>
       </w:pPr>
       <w:r>
@@ -13974,7 +14097,7 @@
         <w:pStyle w:val="Compact"/>
         <w:numPr>
           <w:ilvl w:val="0"/>
-          <w:numId w:val="1633"/>
+          <w:numId w:val="1636"/>
         </w:numPr>
       </w:pPr>
       <w:r>
@@ -13986,7 +14109,7 @@
         <w:pStyle w:val="Compact"/>
         <w:numPr>
           <w:ilvl w:val="0"/>
-          <w:numId w:val="1634"/>
+          <w:numId w:val="1637"/>
         </w:numPr>
       </w:pPr>
       <w:r>
@@ -13998,7 +14121,7 @@
         <w:pStyle w:val="Compact"/>
         <w:numPr>
           <w:ilvl w:val="0"/>
-          <w:numId w:val="1635"/>
+          <w:numId w:val="1638"/>
         </w:numPr>
       </w:pPr>
       <w:r>
@@ -14010,7 +14133,7 @@
         <w:pStyle w:val="Compact"/>
         <w:numPr>
           <w:ilvl w:val="0"/>
-          <w:numId w:val="1636"/>
+          <w:numId w:val="1639"/>
         </w:numPr>
       </w:pPr>
       <w:r>
@@ -14022,7 +14145,7 @@
         <w:pStyle w:val="Compact"/>
         <w:numPr>
           <w:ilvl w:val="0"/>
-          <w:numId w:val="1637"/>
+          <w:numId w:val="1640"/>
         </w:numPr>
       </w:pPr>
       <w:r>
@@ -14034,7 +14157,7 @@
         <w:pStyle w:val="Compact"/>
         <w:numPr>
           <w:ilvl w:val="0"/>
-          <w:numId w:val="1638"/>
+          <w:numId w:val="1641"/>
         </w:numPr>
       </w:pPr>
       <w:r>
@@ -14046,7 +14169,7 @@
         <w:pStyle w:val="Compact"/>
         <w:numPr>
           <w:ilvl w:val="0"/>
-          <w:numId w:val="1639"/>
+          <w:numId w:val="1642"/>
         </w:numPr>
       </w:pPr>
       <w:r>
@@ -14058,7 +14181,7 @@
         <w:pStyle w:val="Compact"/>
         <w:numPr>
           <w:ilvl w:val="0"/>
-          <w:numId w:val="1640"/>
+          <w:numId w:val="1643"/>
         </w:numPr>
       </w:pPr>
       <w:r>
@@ -15627,7 +15750,7 @@
     <w:abstractNumId w:val="993"/>
   </w:num>
   <w:num w:numId="1350">
-    <w:abstractNumId w:val="992"/>
+    <w:abstractNumId w:val="993"/>
   </w:num>
   <w:num w:numId="1351">
     <w:abstractNumId w:val="993"/>
@@ -15636,46 +15759,46 @@
     <w:abstractNumId w:val="993"/>
   </w:num>
   <w:num w:numId="1353">
+    <w:abstractNumId w:val="992"/>
+  </w:num>
+  <w:num w:numId="1354">
+    <w:abstractNumId w:val="993"/>
+  </w:num>
+  <w:num w:numId="1355">
+    <w:abstractNumId w:val="993"/>
+  </w:num>
+  <w:num w:numId="1356">
     <w:abstractNumId w:val="991"/>
   </w:num>
-  <w:num w:numId="1354">
-    <w:abstractNumId w:val="993"/>
-  </w:num>
-  <w:num w:numId="1355">
-    <w:abstractNumId w:val="993"/>
-  </w:num>
-  <w:num w:numId="1356">
-    <w:abstractNumId w:val="993"/>
-  </w:num>
   <w:num w:numId="1357">
     <w:abstractNumId w:val="993"/>
   </w:num>
   <w:num w:numId="1358">
-    <w:abstractNumId w:val="992"/>
+    <w:abstractNumId w:val="993"/>
   </w:num>
   <w:num w:numId="1359">
     <w:abstractNumId w:val="993"/>
   </w:num>
   <w:num w:numId="1360">
-    <w:abstractNumId w:val="992"/>
+    <w:abstractNumId w:val="993"/>
   </w:num>
   <w:num w:numId="1361">
-    <w:abstractNumId w:val="992"/>
+    <w:abstractNumId w:val="993"/>
   </w:num>
   <w:num w:numId="1362">
     <w:abstractNumId w:val="993"/>
   </w:num>
   <w:num w:numId="1363">
-    <w:abstractNumId w:val="992"/>
+    <w:abstractNumId w:val="993"/>
   </w:num>
   <w:num w:numId="1364">
-    <w:abstractNumId w:val="993"/>
+    <w:abstractNumId w:val="992"/>
   </w:num>
   <w:num w:numId="1365">
     <w:abstractNumId w:val="993"/>
   </w:num>
   <w:num w:numId="1366">
-    <w:abstractNumId w:val="993"/>
+    <w:abstractNumId w:val="992"/>
   </w:num>
   <w:num w:numId="1367">
     <w:abstractNumId w:val="993"/>
@@ -15684,37 +15807,37 @@
     <w:abstractNumId w:val="993"/>
   </w:num>
   <w:num w:numId="1369">
+    <w:abstractNumId w:val="993"/>
+  </w:num>
+  <w:num w:numId="1370">
+    <w:abstractNumId w:val="993"/>
+  </w:num>
+  <w:num w:numId="1371">
+    <w:abstractNumId w:val="993"/>
+  </w:num>
+  <w:num w:numId="1372">
     <w:abstractNumId w:val="991"/>
   </w:num>
-  <w:num w:numId="1370">
-    <w:abstractNumId w:val="993"/>
-  </w:num>
-  <w:num w:numId="1371">
-    <w:abstractNumId w:val="993"/>
-  </w:num>
-  <w:num w:numId="1372">
-    <w:abstractNumId w:val="993"/>
-  </w:num>
   <w:num w:numId="1373">
-    <w:abstractNumId w:val="992"/>
+    <w:abstractNumId w:val="993"/>
   </w:num>
   <w:num w:numId="1374">
     <w:abstractNumId w:val="993"/>
   </w:num>
   <w:num w:numId="1375">
-    <w:abstractNumId w:val="992"/>
+    <w:abstractNumId w:val="993"/>
   </w:num>
   <w:num w:numId="1376">
-    <w:abstractNumId w:val="993"/>
+    <w:abstractNumId w:val="992"/>
   </w:num>
   <w:num w:numId="1377">
-    <w:abstractNumId w:val="992"/>
+    <w:abstractNumId w:val="993"/>
   </w:num>
   <w:num w:numId="1378">
-    <w:abstractNumId w:val="992"/>
+    <w:abstractNumId w:val="993"/>
   </w:num>
   <w:num w:numId="1379">
-    <w:abstractNumId w:val="992"/>
+    <w:abstractNumId w:val="993"/>
   </w:num>
   <w:num w:numId="1380">
     <w:abstractNumId w:val="993"/>
@@ -15726,7 +15849,7 @@
     <w:abstractNumId w:val="992"/>
   </w:num>
   <w:num w:numId="1383">
-    <w:abstractNumId w:val="992"/>
+    <w:abstractNumId w:val="993"/>
   </w:num>
   <w:num w:numId="1384">
     <w:abstractNumId w:val="992"/>
@@ -15807,31 +15930,31 @@
     <w:abstractNumId w:val="992"/>
   </w:num>
   <w:num w:numId="1410">
-    <w:abstractNumId w:val="993"/>
+    <w:abstractNumId w:val="992"/>
   </w:num>
   <w:num w:numId="1411">
-    <w:abstractNumId w:val="993"/>
+    <w:abstractNumId w:val="992"/>
   </w:num>
   <w:num w:numId="1412">
-    <w:abstractNumId w:val="993"/>
+    <w:abstractNumId w:val="992"/>
   </w:num>
   <w:num w:numId="1413">
     <w:abstractNumId w:val="993"/>
   </w:num>
   <w:num w:numId="1414">
-    <w:abstractNumId w:val="992"/>
+    <w:abstractNumId w:val="993"/>
   </w:num>
   <w:num w:numId="1415">
-    <w:abstractNumId w:val="992"/>
+    <w:abstractNumId w:val="993"/>
   </w:num>
   <w:num w:numId="1416">
     <w:abstractNumId w:val="993"/>
   </w:num>
   <w:num w:numId="1417">
-    <w:abstractNumId w:val="993"/>
+    <w:abstractNumId w:val="992"/>
   </w:num>
   <w:num w:numId="1418">
-    <w:abstractNumId w:val="993"/>
+    <w:abstractNumId w:val="992"/>
   </w:num>
   <w:num w:numId="1419">
     <w:abstractNumId w:val="993"/>
@@ -15867,25 +15990,25 @@
     <w:abstractNumId w:val="993"/>
   </w:num>
   <w:num w:numId="1430">
-    <w:abstractNumId w:val="992"/>
+    <w:abstractNumId w:val="993"/>
   </w:num>
   <w:num w:numId="1431">
+    <w:abstractNumId w:val="993"/>
+  </w:num>
+  <w:num w:numId="1432">
+    <w:abstractNumId w:val="993"/>
+  </w:num>
+  <w:num w:numId="1433">
+    <w:abstractNumId w:val="992"/>
+  </w:num>
+  <w:num w:numId="1434">
     <w:abstractNumId w:val="991"/>
   </w:num>
-  <w:num w:numId="1432">
-    <w:abstractNumId w:val="993"/>
-  </w:num>
-  <w:num w:numId="1433">
-    <w:abstractNumId w:val="993"/>
-  </w:num>
-  <w:num w:numId="1434">
-    <w:abstractNumId w:val="992"/>
-  </w:num>
   <w:num w:numId="1435">
-    <w:abstractNumId w:val="992"/>
+    <w:abstractNumId w:val="993"/>
   </w:num>
   <w:num w:numId="1436">
-    <w:abstractNumId w:val="992"/>
+    <w:abstractNumId w:val="993"/>
   </w:num>
   <w:num w:numId="1437">
     <w:abstractNumId w:val="992"/>
@@ -15894,7 +16017,7 @@
     <w:abstractNumId w:val="992"/>
   </w:num>
   <w:num w:numId="1439">
-    <w:abstractNumId w:val="993"/>
+    <w:abstractNumId w:val="992"/>
   </w:num>
   <w:num w:numId="1440">
     <w:abstractNumId w:val="992"/>
@@ -15906,10 +16029,10 @@
     <w:abstractNumId w:val="993"/>
   </w:num>
   <w:num w:numId="1443">
-    <w:abstractNumId w:val="993"/>
+    <w:abstractNumId w:val="992"/>
   </w:num>
   <w:num w:numId="1444">
-    <w:abstractNumId w:val="993"/>
+    <w:abstractNumId w:val="992"/>
   </w:num>
   <w:num w:numId="1445">
     <w:abstractNumId w:val="993"/>
@@ -15945,53 +16068,53 @@
     <w:abstractNumId w:val="993"/>
   </w:num>
   <w:num w:numId="1456">
+    <w:abstractNumId w:val="993"/>
+  </w:num>
+  <w:num w:numId="1457">
+    <w:abstractNumId w:val="993"/>
+  </w:num>
+  <w:num w:numId="1458">
+    <w:abstractNumId w:val="993"/>
+  </w:num>
+  <w:num w:numId="1459">
     <w:abstractNumId w:val="991"/>
   </w:num>
-  <w:num w:numId="1457">
-    <w:abstractNumId w:val="993"/>
-  </w:num>
-  <w:num w:numId="1458">
-    <w:abstractNumId w:val="993"/>
-  </w:num>
-  <w:num w:numId="1459">
-    <w:abstractNumId w:val="993"/>
-  </w:num>
   <w:num w:numId="1460">
+    <w:abstractNumId w:val="993"/>
+  </w:num>
+  <w:num w:numId="1461">
+    <w:abstractNumId w:val="993"/>
+  </w:num>
+  <w:num w:numId="1462">
+    <w:abstractNumId w:val="993"/>
+  </w:num>
+  <w:num w:numId="1463">
     <w:abstractNumId w:val="991"/>
   </w:num>
-  <w:num w:numId="1461">
-    <w:abstractNumId w:val="993"/>
-  </w:num>
-  <w:num w:numId="1462">
-    <w:abstractNumId w:val="993"/>
-  </w:num>
-  <w:num w:numId="1463">
-    <w:abstractNumId w:val="992"/>
-  </w:num>
   <w:num w:numId="1464">
-    <w:abstractNumId w:val="992"/>
+    <w:abstractNumId w:val="993"/>
   </w:num>
   <w:num w:numId="1465">
     <w:abstractNumId w:val="993"/>
   </w:num>
   <w:num w:numId="1466">
+    <w:abstractNumId w:val="992"/>
+  </w:num>
+  <w:num w:numId="1467">
+    <w:abstractNumId w:val="992"/>
+  </w:num>
+  <w:num w:numId="1468">
+    <w:abstractNumId w:val="993"/>
+  </w:num>
+  <w:num w:numId="1469">
     <w:abstractNumId w:val="991"/>
   </w:num>
-  <w:num w:numId="1467">
-    <w:abstractNumId w:val="993"/>
-  </w:num>
-  <w:num w:numId="1468">
+  <w:num w:numId="1470">
+    <w:abstractNumId w:val="993"/>
+  </w:num>
+  <w:num w:numId="1471">
     <w:abstractNumId w:val="991"/>
   </w:num>
-  <w:num w:numId="1469">
-    <w:abstractNumId w:val="993"/>
-  </w:num>
-  <w:num w:numId="1470">
-    <w:abstractNumId w:val="993"/>
-  </w:num>
-  <w:num w:numId="1471">
-    <w:abstractNumId w:val="993"/>
-  </w:num>
   <w:num w:numId="1472">
     <w:abstractNumId w:val="993"/>
   </w:num>
@@ -16011,43 +16134,43 @@
     <w:abstractNumId w:val="993"/>
   </w:num>
   <w:num w:numId="1478">
+    <w:abstractNumId w:val="993"/>
+  </w:num>
+  <w:num w:numId="1479">
+    <w:abstractNumId w:val="993"/>
+  </w:num>
+  <w:num w:numId="1480">
+    <w:abstractNumId w:val="993"/>
+  </w:num>
+  <w:num w:numId="1481">
     <w:abstractNumId w:val="991"/>
   </w:num>
-  <w:num w:numId="1479">
-    <w:abstractNumId w:val="993"/>
-  </w:num>
-  <w:num w:numId="1480">
-    <w:abstractNumId w:val="993"/>
-  </w:num>
-  <w:num w:numId="1481">
-    <w:abstractNumId w:val="992"/>
-  </w:num>
   <w:num w:numId="1482">
-    <w:abstractNumId w:val="992"/>
+    <w:abstractNumId w:val="993"/>
   </w:num>
   <w:num w:numId="1483">
     <w:abstractNumId w:val="993"/>
   </w:num>
   <w:num w:numId="1484">
-    <w:abstractNumId w:val="993"/>
+    <w:abstractNumId w:val="992"/>
   </w:num>
   <w:num w:numId="1485">
-    <w:abstractNumId w:val="993"/>
+    <w:abstractNumId w:val="992"/>
   </w:num>
   <w:num w:numId="1486">
-    <w:abstractNumId w:val="992"/>
+    <w:abstractNumId w:val="993"/>
   </w:num>
   <w:num w:numId="1487">
-    <w:abstractNumId w:val="992"/>
+    <w:abstractNumId w:val="993"/>
   </w:num>
   <w:num w:numId="1488">
-    <w:abstractNumId w:val="992"/>
+    <w:abstractNumId w:val="993"/>
   </w:num>
   <w:num w:numId="1489">
     <w:abstractNumId w:val="992"/>
   </w:num>
   <w:num w:numId="1490">
-    <w:abstractNumId w:val="993"/>
+    <w:abstractNumId w:val="992"/>
   </w:num>
   <w:num w:numId="1491">
     <w:abstractNumId w:val="992"/>
@@ -16059,10 +16182,10 @@
     <w:abstractNumId w:val="993"/>
   </w:num>
   <w:num w:numId="1494">
-    <w:abstractNumId w:val="993"/>
+    <w:abstractNumId w:val="992"/>
   </w:num>
   <w:num w:numId="1495">
-    <w:abstractNumId w:val="993"/>
+    <w:abstractNumId w:val="992"/>
   </w:num>
   <w:num w:numId="1496">
     <w:abstractNumId w:val="993"/>
@@ -16116,17 +16239,17 @@
     <w:abstractNumId w:val="993"/>
   </w:num>
   <w:num w:numId="1513">
+    <w:abstractNumId w:val="993"/>
+  </w:num>
+  <w:num w:numId="1514">
+    <w:abstractNumId w:val="993"/>
+  </w:num>
+  <w:num w:numId="1515">
+    <w:abstractNumId w:val="993"/>
+  </w:num>
+  <w:num w:numId="1516">
     <w:abstractNumId w:val="991"/>
   </w:num>
-  <w:num w:numId="1514">
-    <w:abstractNumId w:val="992"/>
-  </w:num>
-  <w:num w:numId="1515">
-    <w:abstractNumId w:val="992"/>
-  </w:num>
-  <w:num w:numId="1516">
-    <w:abstractNumId w:val="992"/>
-  </w:num>
   <w:num w:numId="1517">
     <w:abstractNumId w:val="992"/>
   </w:num>
@@ -16167,13 +16290,13 @@
     <w:abstractNumId w:val="992"/>
   </w:num>
   <w:num w:numId="1530">
-    <w:abstractNumId w:val="993"/>
+    <w:abstractNumId w:val="992"/>
   </w:num>
   <w:num w:numId="1531">
-    <w:abstractNumId w:val="993"/>
+    <w:abstractNumId w:val="992"/>
   </w:num>
   <w:num w:numId="1532">
-    <w:abstractNumId w:val="993"/>
+    <w:abstractNumId w:val="992"/>
   </w:num>
   <w:num w:numId="1533">
     <w:abstractNumId w:val="993"/>
@@ -16182,7 +16305,7 @@
     <w:abstractNumId w:val="993"/>
   </w:num>
   <w:num w:numId="1535">
-    <w:abstractNumId w:val="991"/>
+    <w:abstractNumId w:val="993"/>
   </w:num>
   <w:num w:numId="1536">
     <w:abstractNumId w:val="993"/>
@@ -16200,7 +16323,7 @@
     <w:abstractNumId w:val="993"/>
   </w:num>
   <w:num w:numId="1541">
-    <w:abstractNumId w:val="993"/>
+    <w:abstractNumId w:val="991"/>
   </w:num>
   <w:num w:numId="1542">
     <w:abstractNumId w:val="993"/>
@@ -16224,31 +16347,31 @@
     <w:abstractNumId w:val="993"/>
   </w:num>
   <w:num w:numId="1549">
+    <w:abstractNumId w:val="993"/>
+  </w:num>
+  <w:num w:numId="1550">
+    <w:abstractNumId w:val="993"/>
+  </w:num>
+  <w:num w:numId="1551">
+    <w:abstractNumId w:val="993"/>
+  </w:num>
+  <w:num w:numId="1552">
     <w:abstractNumId w:val="991"/>
   </w:num>
-  <w:num w:numId="1550">
-    <w:abstractNumId w:val="993"/>
-  </w:num>
-  <w:num w:numId="1551">
+  <w:num w:numId="1553">
+    <w:abstractNumId w:val="993"/>
+  </w:num>
+  <w:num w:numId="1554">
     <w:abstractNumId w:val="991"/>
   </w:num>
-  <w:num w:numId="1552">
-    <w:abstractNumId w:val="993"/>
-  </w:num>
-  <w:num w:numId="1553">
-    <w:abstractNumId w:val="993"/>
-  </w:num>
-  <w:num w:numId="1554">
-    <w:abstractNumId w:val="993"/>
-  </w:num>
   <w:num w:numId="1555">
     <w:abstractNumId w:val="993"/>
   </w:num>
   <w:num w:numId="1556">
-    <w:abstractNumId w:val="992"/>
+    <w:abstractNumId w:val="993"/>
   </w:num>
   <w:num w:numId="1557">
-    <w:abstractNumId w:val="992"/>
+    <w:abstractNumId w:val="993"/>
   </w:num>
   <w:num w:numId="1558">
     <w:abstractNumId w:val="993"/>
@@ -16260,7 +16383,7 @@
     <w:abstractNumId w:val="992"/>
   </w:num>
   <w:num w:numId="1561">
-    <w:abstractNumId w:val="992"/>
+    <w:abstractNumId w:val="993"/>
   </w:num>
   <w:num w:numId="1562">
     <w:abstractNumId w:val="992"/>
@@ -16272,13 +16395,13 @@
     <w:abstractNumId w:val="992"/>
   </w:num>
   <w:num w:numId="1565">
-    <w:abstractNumId w:val="993"/>
+    <w:abstractNumId w:val="992"/>
   </w:num>
   <w:num w:numId="1566">
-    <w:abstractNumId w:val="993"/>
+    <w:abstractNumId w:val="992"/>
   </w:num>
   <w:num w:numId="1567">
-    <w:abstractNumId w:val="993"/>
+    <w:abstractNumId w:val="992"/>
   </w:num>
   <w:num w:numId="1568">
     <w:abstractNumId w:val="993"/>
@@ -16293,7 +16416,7 @@
     <w:abstractNumId w:val="993"/>
   </w:num>
   <w:num w:numId="1572">
-    <w:abstractNumId w:val="992"/>
+    <w:abstractNumId w:val="993"/>
   </w:num>
   <w:num w:numId="1573">
     <w:abstractNumId w:val="993"/>
@@ -16302,10 +16425,10 @@
     <w:abstractNumId w:val="993"/>
   </w:num>
   <w:num w:numId="1575">
-    <w:abstractNumId w:val="993"/>
+    <w:abstractNumId w:val="992"/>
   </w:num>
   <w:num w:numId="1576">
-    <w:abstractNumId w:val="992"/>
+    <w:abstractNumId w:val="993"/>
   </w:num>
   <w:num w:numId="1577">
     <w:abstractNumId w:val="993"/>
@@ -16314,10 +16437,10 @@
     <w:abstractNumId w:val="993"/>
   </w:num>
   <w:num w:numId="1579">
-    <w:abstractNumId w:val="993"/>
+    <w:abstractNumId w:val="992"/>
   </w:num>
   <w:num w:numId="1580">
-    <w:abstractNumId w:val="992"/>
+    <w:abstractNumId w:val="993"/>
   </w:num>
   <w:num w:numId="1581">
     <w:abstractNumId w:val="993"/>
@@ -16326,7 +16449,7 @@
     <w:abstractNumId w:val="993"/>
   </w:num>
   <w:num w:numId="1583">
-    <w:abstractNumId w:val="993"/>
+    <w:abstractNumId w:val="992"/>
   </w:num>
   <w:num w:numId="1584">
     <w:abstractNumId w:val="993"/>
@@ -16338,13 +16461,13 @@
     <w:abstractNumId w:val="993"/>
   </w:num>
   <w:num w:numId="1587">
-    <w:abstractNumId w:val="992"/>
+    <w:abstractNumId w:val="993"/>
   </w:num>
   <w:num w:numId="1588">
     <w:abstractNumId w:val="993"/>
   </w:num>
   <w:num w:numId="1589">
-    <w:abstractNumId w:val="992"/>
+    <w:abstractNumId w:val="993"/>
   </w:num>
   <w:num w:numId="1590">
     <w:abstractNumId w:val="992"/>
@@ -16353,28 +16476,28 @@
     <w:abstractNumId w:val="993"/>
   </w:num>
   <w:num w:numId="1592">
-    <w:abstractNumId w:val="993"/>
+    <w:abstractNumId w:val="992"/>
   </w:num>
   <w:num w:numId="1593">
-    <w:abstractNumId w:val="993"/>
+    <w:abstractNumId w:val="992"/>
   </w:num>
   <w:num w:numId="1594">
     <w:abstractNumId w:val="993"/>
   </w:num>
   <w:num w:numId="1595">
-    <w:abstractNumId w:val="992"/>
+    <w:abstractNumId w:val="993"/>
   </w:num>
   <w:num w:numId="1596">
-    <w:abstractNumId w:val="992"/>
+    <w:abstractNumId w:val="993"/>
   </w:num>
   <w:num w:numId="1597">
-    <w:abstractNumId w:val="992"/>
+    <w:abstractNumId w:val="993"/>
   </w:num>
   <w:num w:numId="1598">
     <w:abstractNumId w:val="992"/>
   </w:num>
   <w:num w:numId="1599">
-    <w:abstractNumId w:val="993"/>
+    <w:abstractNumId w:val="992"/>
   </w:num>
   <w:num w:numId="1600">
     <w:abstractNumId w:val="992"/>
@@ -16383,7 +16506,7 @@
     <w:abstractNumId w:val="992"/>
   </w:num>
   <w:num w:numId="1602">
-    <w:abstractNumId w:val="992"/>
+    <w:abstractNumId w:val="993"/>
   </w:num>
   <w:num w:numId="1603">
     <w:abstractNumId w:val="992"/>
@@ -16497,6 +16620,15 @@
     <w:abstractNumId w:val="992"/>
   </w:num>
   <w:num w:numId="1640">
+    <w:abstractNumId w:val="992"/>
+  </w:num>
+  <w:num w:numId="1641">
+    <w:abstractNumId w:val="992"/>
+  </w:num>
+  <w:num w:numId="1642">
+    <w:abstractNumId w:val="992"/>
+  </w:num>
+  <w:num w:numId="1643">
     <w:abstractNumId w:val="992"/>
   </w:num>
 </w:numbering>

</xml_diff>

<commit_message>
Add M1.5 contact attempt manual override
</commit_message>
<xml_diff>
--- a/MASTER_M1_M2_DELIVERY_CHECKLIST.docx
+++ b/MASTER_M1_M2_DELIVERY_CHECKLIST.docx
@@ -409,7 +409,7 @@
               <w:jc w:val="right"/>
             </w:pPr>
             <w:r>
-              <w:t xml:space="preserve">7%</w:t>
+              <w:t xml:space="preserve">8%</w:t>
             </w:r>
           </w:p>
         </w:tc>
@@ -420,7 +420,7 @@
               <w:pStyle w:val="Compact"/>
             </w:pPr>
             <w:r>
-              <w:t xml:space="preserve">Backend, Pipeline UI, inbound/forward reset mechanics implemented; browser/pixel pending</w:t>
+              <w:t xml:space="preserve">Attempt UI, reset mechanics, and admin manual override implemented; browser/pixel pending</w:t>
             </w:r>
           </w:p>
         </w:tc>
@@ -709,7 +709,7 @@
                 <w:b/>
                 <w:bCs/>
               </w:rPr>
-              <w:t xml:space="preserve">64%</w:t>
+              <w:t xml:space="preserve">65%</w:t>
             </w:r>
           </w:p>
         </w:tc>
@@ -724,7 +724,7 @@
                 <w:b/>
                 <w:bCs/>
               </w:rPr>
-              <w:t xml:space="preserve">M1.5 reset mechanics added; browser/pixel/release gates remain</w:t>
+              <w:t xml:space="preserve">M1.5 manual override added; browser/pixel/release gates remain</w:t>
             </w:r>
           </w:p>
         </w:tc>
@@ -8745,6 +8745,60 @@
         <w:t xml:space="preserve">passed; targeted backend ESLint 0 errors / existing warnings only.</w:t>
       </w:r>
     </w:p>
+    <w:p>
+      <w:pPr>
+        <w:pStyle w:val="Compact"/>
+        <w:numPr>
+          <w:ilvl w:val="0"/>
+          <w:numId w:val="1350"/>
+        </w:numPr>
+      </w:pPr>
+      <w:r>
+        <w:t xml:space="preserve">Added admin/manager manual override for</w:t>
+      </w:r>
+      <w:r>
+        <w:t xml:space="preserve"> </w:t>
+      </w:r>
+      <w:r>
+        <w:rPr>
+          <w:rStyle w:val="VerbatimChar"/>
+        </w:rPr>
+        <w:t xml:space="preserve">contactAttempts</w:t>
+      </w:r>
+      <w:r>
+        <w:t xml:space="preserve"> </w:t>
+      </w:r>
+      <w:r>
+        <w:t xml:space="preserve">reset and</w:t>
+      </w:r>
+      <w:r>
+        <w:t xml:space="preserve"> </w:t>
+      </w:r>
+      <w:r>
+        <w:rPr>
+          <w:rStyle w:val="VerbatimChar"/>
+        </w:rPr>
+        <w:t xml:space="preserve">contactAttemptThreshold</w:t>
+      </w:r>
+      <w:r>
+        <w:t xml:space="preserve"> </w:t>
+      </w:r>
+      <w:r>
+        <w:t xml:space="preserve">in DealPanel with backend validation and audit metadata.</w:t>
+      </w:r>
+    </w:p>
+    <w:p>
+      <w:pPr>
+        <w:pStyle w:val="Compact"/>
+        <w:numPr>
+          <w:ilvl w:val="0"/>
+          <w:numId w:val="1351"/>
+        </w:numPr>
+      </w:pPr>
+      <w:r>
+        <w:t xml:space="preserve">Validation passed: focused backend tests 17/17, server build, and client build.</w:t>
+      </w:r>
+    </w:p>
     <w:bookmarkEnd w:id="49"/>
     <w:bookmarkStart w:id="50" w:name="data-and-backend"/>
     <w:p>
@@ -8760,7 +8814,7 @@
         <w:pStyle w:val="Compact"/>
         <w:numPr>
           <w:ilvl w:val="0"/>
-          <w:numId w:val="1350"/>
+          <w:numId w:val="1352"/>
         </w:numPr>
       </w:pPr>
       <w:r>
@@ -8799,7 +8853,7 @@
         <w:pStyle w:val="Compact"/>
         <w:numPr>
           <w:ilvl w:val="0"/>
-          <w:numId w:val="1351"/>
+          <w:numId w:val="1353"/>
         </w:numPr>
       </w:pPr>
       <w:r>
@@ -8838,7 +8892,7 @@
         <w:pStyle w:val="Compact"/>
         <w:numPr>
           <w:ilvl w:val="0"/>
-          <w:numId w:val="1352"/>
+          <w:numId w:val="1354"/>
         </w:numPr>
       </w:pPr>
       <w:r>
@@ -8862,7 +8916,7 @@
         <w:pStyle w:val="Compact"/>
         <w:numPr>
           <w:ilvl w:val="0"/>
-          <w:numId w:val="1353"/>
+          <w:numId w:val="1355"/>
         </w:numPr>
       </w:pPr>
       <w:r>
@@ -8919,7 +8973,7 @@
         <w:pStyle w:val="Compact"/>
         <w:numPr>
           <w:ilvl w:val="0"/>
-          <w:numId w:val="1354"/>
+          <w:numId w:val="1356"/>
         </w:numPr>
       </w:pPr>
       <w:r>
@@ -8943,7 +8997,7 @@
         <w:pStyle w:val="Compact"/>
         <w:numPr>
           <w:ilvl w:val="0"/>
-          <w:numId w:val="1355"/>
+          <w:numId w:val="1357"/>
         </w:numPr>
       </w:pPr>
       <w:r>
@@ -8955,7 +9009,7 @@
         <w:pStyle w:val="Compact"/>
         <w:numPr>
           <w:ilvl w:val="1"/>
-          <w:numId w:val="1356"/>
+          <w:numId w:val="1358"/>
         </w:numPr>
       </w:pPr>
       <w:r>
@@ -8967,7 +9021,7 @@
         <w:pStyle w:val="Compact"/>
         <w:numPr>
           <w:ilvl w:val="1"/>
-          <w:numId w:val="1356"/>
+          <w:numId w:val="1358"/>
         </w:numPr>
       </w:pPr>
       <w:r>
@@ -8979,7 +9033,7 @@
         <w:pStyle w:val="Compact"/>
         <w:numPr>
           <w:ilvl w:val="1"/>
-          <w:numId w:val="1356"/>
+          <w:numId w:val="1358"/>
         </w:numPr>
       </w:pPr>
       <w:r>
@@ -8991,7 +9045,7 @@
         <w:pStyle w:val="Compact"/>
         <w:numPr>
           <w:ilvl w:val="1"/>
-          <w:numId w:val="1356"/>
+          <w:numId w:val="1358"/>
         </w:numPr>
       </w:pPr>
       <w:r>
@@ -9003,7 +9057,7 @@
         <w:pStyle w:val="Compact"/>
         <w:numPr>
           <w:ilvl w:val="1"/>
-          <w:numId w:val="1356"/>
+          <w:numId w:val="1358"/>
         </w:numPr>
       </w:pPr>
       <w:r>
@@ -9015,7 +9069,7 @@
         <w:pStyle w:val="Compact"/>
         <w:numPr>
           <w:ilvl w:val="0"/>
-          <w:numId w:val="1357"/>
+          <w:numId w:val="1359"/>
         </w:numPr>
       </w:pPr>
       <w:r>
@@ -9060,7 +9114,7 @@
         <w:pStyle w:val="Compact"/>
         <w:numPr>
           <w:ilvl w:val="0"/>
-          <w:numId w:val="1358"/>
+          <w:numId w:val="1360"/>
         </w:numPr>
       </w:pPr>
       <w:r>
@@ -9093,7 +9147,7 @@
         <w:pStyle w:val="Compact"/>
         <w:numPr>
           <w:ilvl w:val="0"/>
-          <w:numId w:val="1359"/>
+          <w:numId w:val="1361"/>
         </w:numPr>
       </w:pPr>
       <w:r>
@@ -9126,7 +9180,7 @@
         <w:pStyle w:val="Compact"/>
         <w:numPr>
           <w:ilvl w:val="0"/>
-          <w:numId w:val="1360"/>
+          <w:numId w:val="1362"/>
         </w:numPr>
       </w:pPr>
       <w:r>
@@ -9153,7 +9207,7 @@
         <w:pStyle w:val="Compact"/>
         <w:numPr>
           <w:ilvl w:val="0"/>
-          <w:numId w:val="1361"/>
+          <w:numId w:val="1363"/>
         </w:numPr>
       </w:pPr>
       <w:r>
@@ -9165,7 +9219,7 @@
         <w:pStyle w:val="Compact"/>
         <w:numPr>
           <w:ilvl w:val="0"/>
-          <w:numId w:val="1362"/>
+          <w:numId w:val="1364"/>
         </w:numPr>
       </w:pPr>
       <w:r>
@@ -9177,7 +9231,7 @@
         <w:pStyle w:val="Compact"/>
         <w:numPr>
           <w:ilvl w:val="0"/>
-          <w:numId w:val="1363"/>
+          <w:numId w:val="1365"/>
         </w:numPr>
       </w:pPr>
       <w:r>
@@ -9189,7 +9243,7 @@
         <w:pStyle w:val="Compact"/>
         <w:numPr>
           <w:ilvl w:val="0"/>
-          <w:numId w:val="1364"/>
+          <w:numId w:val="1366"/>
         </w:numPr>
       </w:pPr>
       <w:r>
@@ -9201,7 +9255,7 @@
         <w:pStyle w:val="Compact"/>
         <w:numPr>
           <w:ilvl w:val="0"/>
-          <w:numId w:val="1365"/>
+          <w:numId w:val="1367"/>
         </w:numPr>
       </w:pPr>
       <w:r>
@@ -9228,7 +9282,7 @@
         <w:pStyle w:val="Compact"/>
         <w:numPr>
           <w:ilvl w:val="0"/>
-          <w:numId w:val="1366"/>
+          <w:numId w:val="1368"/>
         </w:numPr>
       </w:pPr>
       <w:r>
@@ -9250,7 +9304,7 @@
         <w:pStyle w:val="Compact"/>
         <w:numPr>
           <w:ilvl w:val="0"/>
-          <w:numId w:val="1367"/>
+          <w:numId w:val="1369"/>
         </w:numPr>
       </w:pPr>
       <w:r>
@@ -9262,7 +9316,7 @@
         <w:pStyle w:val="Compact"/>
         <w:numPr>
           <w:ilvl w:val="0"/>
-          <w:numId w:val="1368"/>
+          <w:numId w:val="1370"/>
         </w:numPr>
       </w:pPr>
       <w:r>
@@ -9274,7 +9328,7 @@
         <w:pStyle w:val="Compact"/>
         <w:numPr>
           <w:ilvl w:val="0"/>
-          <w:numId w:val="1369"/>
+          <w:numId w:val="1371"/>
         </w:numPr>
       </w:pPr>
       <w:r>
@@ -9286,7 +9340,7 @@
         <w:pStyle w:val="Compact"/>
         <w:numPr>
           <w:ilvl w:val="0"/>
-          <w:numId w:val="1370"/>
+          <w:numId w:val="1372"/>
         </w:numPr>
       </w:pPr>
       <w:r>
@@ -9310,7 +9364,7 @@
         <w:pStyle w:val="Compact"/>
         <w:numPr>
           <w:ilvl w:val="0"/>
-          <w:numId w:val="1371"/>
+          <w:numId w:val="1373"/>
         </w:numPr>
       </w:pPr>
       <w:r>
@@ -9322,7 +9376,7 @@
         <w:pStyle w:val="Compact"/>
         <w:numPr>
           <w:ilvl w:val="1"/>
-          <w:numId w:val="1372"/>
+          <w:numId w:val="1374"/>
         </w:numPr>
       </w:pPr>
       <w:r>
@@ -9334,7 +9388,7 @@
         <w:pStyle w:val="Compact"/>
         <w:numPr>
           <w:ilvl w:val="1"/>
-          <w:numId w:val="1372"/>
+          <w:numId w:val="1374"/>
         </w:numPr>
       </w:pPr>
       <w:r>
@@ -9346,7 +9400,7 @@
         <w:pStyle w:val="Compact"/>
         <w:numPr>
           <w:ilvl w:val="1"/>
-          <w:numId w:val="1372"/>
+          <w:numId w:val="1374"/>
         </w:numPr>
       </w:pPr>
       <w:r>
@@ -9358,7 +9412,7 @@
         <w:pStyle w:val="Compact"/>
         <w:numPr>
           <w:ilvl w:val="0"/>
-          <w:numId w:val="1373"/>
+          <w:numId w:val="1375"/>
         </w:numPr>
       </w:pPr>
       <w:r>
@@ -9400,7 +9454,7 @@
         <w:pStyle w:val="Compact"/>
         <w:numPr>
           <w:ilvl w:val="0"/>
-          <w:numId w:val="1374"/>
+          <w:numId w:val="1376"/>
         </w:numPr>
       </w:pPr>
       <w:r>
@@ -9435,6 +9489,18 @@
       </w:r>
       <w:r>
         <w:t xml:space="preserve">visual target.</w:t>
+      </w:r>
+    </w:p>
+    <w:p>
+      <w:pPr>
+        <w:pStyle w:val="Compact"/>
+        <w:numPr>
+          <w:ilvl w:val="0"/>
+          <w:numId w:val="1377"/>
+        </w:numPr>
+      </w:pPr>
+      <w:r>
+        <w:t xml:space="preserve">Admin/manager manual override controls added for reset and threshold.</w:t>
       </w:r>
     </w:p>
     <w:bookmarkEnd w:id="51"/>
@@ -9452,7 +9518,7 @@
         <w:pStyle w:val="Compact"/>
         <w:numPr>
           <w:ilvl w:val="0"/>
-          <w:numId w:val="1375"/>
+          <w:numId w:val="1378"/>
         </w:numPr>
       </w:pPr>
       <w:r>
@@ -9464,7 +9530,7 @@
         <w:pStyle w:val="Compact"/>
         <w:numPr>
           <w:ilvl w:val="0"/>
-          <w:numId w:val="1376"/>
+          <w:numId w:val="1379"/>
         </w:numPr>
       </w:pPr>
       <w:r>
@@ -9476,7 +9542,7 @@
         <w:pStyle w:val="Compact"/>
         <w:numPr>
           <w:ilvl w:val="0"/>
-          <w:numId w:val="1377"/>
+          <w:numId w:val="1380"/>
         </w:numPr>
       </w:pPr>
       <w:r>
@@ -9488,7 +9554,7 @@
         <w:pStyle w:val="Compact"/>
         <w:numPr>
           <w:ilvl w:val="0"/>
-          <w:numId w:val="1378"/>
+          <w:numId w:val="1381"/>
         </w:numPr>
       </w:pPr>
       <w:r>
@@ -9500,7 +9566,7 @@
         <w:pStyle w:val="Compact"/>
         <w:numPr>
           <w:ilvl w:val="0"/>
-          <w:numId w:val="1379"/>
+          <w:numId w:val="1382"/>
         </w:numPr>
       </w:pPr>
       <w:r>
@@ -9512,7 +9578,7 @@
         <w:pStyle w:val="Compact"/>
         <w:numPr>
           <w:ilvl w:val="0"/>
-          <w:numId w:val="1380"/>
+          <w:numId w:val="1383"/>
         </w:numPr>
       </w:pPr>
       <w:r>
@@ -9524,7 +9590,19 @@
         <w:pStyle w:val="Compact"/>
         <w:numPr>
           <w:ilvl w:val="0"/>
-          <w:numId w:val="1381"/>
+          <w:numId w:val="1384"/>
+        </w:numPr>
+      </w:pPr>
+      <w:r>
+        <w:t xml:space="preserve">Manual override reset tested.</w:t>
+      </w:r>
+    </w:p>
+    <w:p>
+      <w:pPr>
+        <w:pStyle w:val="Compact"/>
+        <w:numPr>
+          <w:ilvl w:val="0"/>
+          <w:numId w:val="1385"/>
         </w:numPr>
       </w:pPr>
       <w:r>
@@ -9536,7 +9614,7 @@
         <w:pStyle w:val="Compact"/>
         <w:numPr>
           <w:ilvl w:val="0"/>
-          <w:numId w:val="1382"/>
+          <w:numId w:val="1386"/>
         </w:numPr>
       </w:pPr>
       <w:r>
@@ -9548,7 +9626,7 @@
         <w:pStyle w:val="Compact"/>
         <w:numPr>
           <w:ilvl w:val="0"/>
-          <w:numId w:val="1383"/>
+          <w:numId w:val="1387"/>
         </w:numPr>
       </w:pPr>
       <w:r>
@@ -9580,7 +9658,7 @@
         <w:pStyle w:val="Compact"/>
         <w:numPr>
           <w:ilvl w:val="0"/>
-          <w:numId w:val="1384"/>
+          <w:numId w:val="1388"/>
         </w:numPr>
       </w:pPr>
       <w:r>
@@ -9592,7 +9670,7 @@
         <w:pStyle w:val="Compact"/>
         <w:numPr>
           <w:ilvl w:val="0"/>
-          <w:numId w:val="1385"/>
+          <w:numId w:val="1389"/>
         </w:numPr>
       </w:pPr>
       <w:r>
@@ -9604,7 +9682,7 @@
         <w:pStyle w:val="Compact"/>
         <w:numPr>
           <w:ilvl w:val="0"/>
-          <w:numId w:val="1386"/>
+          <w:numId w:val="1390"/>
         </w:numPr>
       </w:pPr>
       <w:r>
@@ -9616,7 +9694,7 @@
         <w:pStyle w:val="Compact"/>
         <w:numPr>
           <w:ilvl w:val="0"/>
-          <w:numId w:val="1387"/>
+          <w:numId w:val="1391"/>
         </w:numPr>
       </w:pPr>
       <w:r>
@@ -9628,7 +9706,7 @@
         <w:pStyle w:val="Compact"/>
         <w:numPr>
           <w:ilvl w:val="0"/>
-          <w:numId w:val="1388"/>
+          <w:numId w:val="1392"/>
         </w:numPr>
       </w:pPr>
       <w:r>
@@ -9640,7 +9718,7 @@
         <w:pStyle w:val="Compact"/>
         <w:numPr>
           <w:ilvl w:val="0"/>
-          <w:numId w:val="1389"/>
+          <w:numId w:val="1393"/>
         </w:numPr>
       </w:pPr>
       <w:r>
@@ -9652,7 +9730,7 @@
         <w:pStyle w:val="Compact"/>
         <w:numPr>
           <w:ilvl w:val="0"/>
-          <w:numId w:val="1390"/>
+          <w:numId w:val="1394"/>
         </w:numPr>
       </w:pPr>
       <w:r>
@@ -9664,7 +9742,7 @@
         <w:pStyle w:val="Compact"/>
         <w:numPr>
           <w:ilvl w:val="0"/>
-          <w:numId w:val="1391"/>
+          <w:numId w:val="1395"/>
         </w:numPr>
       </w:pPr>
       <w:r>
@@ -9676,7 +9754,7 @@
         <w:pStyle w:val="Compact"/>
         <w:numPr>
           <w:ilvl w:val="0"/>
-          <w:numId w:val="1392"/>
+          <w:numId w:val="1396"/>
         </w:numPr>
       </w:pPr>
       <w:r>
@@ -9688,7 +9766,7 @@
         <w:pStyle w:val="Compact"/>
         <w:numPr>
           <w:ilvl w:val="0"/>
-          <w:numId w:val="1393"/>
+          <w:numId w:val="1397"/>
         </w:numPr>
       </w:pPr>
       <w:r>
@@ -9700,7 +9778,7 @@
         <w:pStyle w:val="Compact"/>
         <w:numPr>
           <w:ilvl w:val="0"/>
-          <w:numId w:val="1394"/>
+          <w:numId w:val="1398"/>
         </w:numPr>
       </w:pPr>
       <w:r>
@@ -9712,7 +9790,7 @@
         <w:pStyle w:val="Compact"/>
         <w:numPr>
           <w:ilvl w:val="0"/>
-          <w:numId w:val="1395"/>
+          <w:numId w:val="1399"/>
         </w:numPr>
       </w:pPr>
       <w:r>
@@ -9724,7 +9802,7 @@
         <w:pStyle w:val="Compact"/>
         <w:numPr>
           <w:ilvl w:val="0"/>
-          <w:numId w:val="1396"/>
+          <w:numId w:val="1400"/>
         </w:numPr>
       </w:pPr>
       <w:r>
@@ -9736,7 +9814,7 @@
         <w:pStyle w:val="Compact"/>
         <w:numPr>
           <w:ilvl w:val="0"/>
-          <w:numId w:val="1397"/>
+          <w:numId w:val="1401"/>
         </w:numPr>
       </w:pPr>
       <w:r>
@@ -9748,7 +9826,7 @@
         <w:pStyle w:val="Compact"/>
         <w:numPr>
           <w:ilvl w:val="0"/>
-          <w:numId w:val="1398"/>
+          <w:numId w:val="1402"/>
         </w:numPr>
       </w:pPr>
       <w:r>
@@ -9770,7 +9848,7 @@
         <w:pStyle w:val="Compact"/>
         <w:numPr>
           <w:ilvl w:val="0"/>
-          <w:numId w:val="1399"/>
+          <w:numId w:val="1403"/>
         </w:numPr>
       </w:pPr>
       <w:r>
@@ -9782,7 +9860,7 @@
         <w:pStyle w:val="Compact"/>
         <w:numPr>
           <w:ilvl w:val="0"/>
-          <w:numId w:val="1400"/>
+          <w:numId w:val="1404"/>
         </w:numPr>
       </w:pPr>
       <w:r>
@@ -9794,7 +9872,7 @@
         <w:pStyle w:val="Compact"/>
         <w:numPr>
           <w:ilvl w:val="0"/>
-          <w:numId w:val="1401"/>
+          <w:numId w:val="1405"/>
         </w:numPr>
       </w:pPr>
       <w:r>
@@ -9806,7 +9884,7 @@
         <w:pStyle w:val="Compact"/>
         <w:numPr>
           <w:ilvl w:val="0"/>
-          <w:numId w:val="1402"/>
+          <w:numId w:val="1406"/>
         </w:numPr>
       </w:pPr>
       <w:r>
@@ -9818,7 +9896,7 @@
         <w:pStyle w:val="Compact"/>
         <w:numPr>
           <w:ilvl w:val="0"/>
-          <w:numId w:val="1403"/>
+          <w:numId w:val="1407"/>
         </w:numPr>
       </w:pPr>
       <w:r>
@@ -9830,7 +9908,7 @@
         <w:pStyle w:val="Compact"/>
         <w:numPr>
           <w:ilvl w:val="0"/>
-          <w:numId w:val="1404"/>
+          <w:numId w:val="1408"/>
         </w:numPr>
       </w:pPr>
       <w:r>
@@ -9842,7 +9920,7 @@
         <w:pStyle w:val="Compact"/>
         <w:numPr>
           <w:ilvl w:val="0"/>
-          <w:numId w:val="1405"/>
+          <w:numId w:val="1409"/>
         </w:numPr>
       </w:pPr>
       <w:r>
@@ -9864,7 +9942,7 @@
         <w:pStyle w:val="Compact"/>
         <w:numPr>
           <w:ilvl w:val="0"/>
-          <w:numId w:val="1406"/>
+          <w:numId w:val="1410"/>
         </w:numPr>
       </w:pPr>
       <w:r>
@@ -9876,7 +9954,7 @@
         <w:pStyle w:val="Compact"/>
         <w:numPr>
           <w:ilvl w:val="0"/>
-          <w:numId w:val="1407"/>
+          <w:numId w:val="1411"/>
         </w:numPr>
       </w:pPr>
       <w:r>
@@ -9888,7 +9966,7 @@
         <w:pStyle w:val="Compact"/>
         <w:numPr>
           <w:ilvl w:val="0"/>
-          <w:numId w:val="1408"/>
+          <w:numId w:val="1412"/>
         </w:numPr>
       </w:pPr>
       <w:r>
@@ -9900,7 +9978,7 @@
         <w:pStyle w:val="Compact"/>
         <w:numPr>
           <w:ilvl w:val="0"/>
-          <w:numId w:val="1409"/>
+          <w:numId w:val="1413"/>
         </w:numPr>
       </w:pPr>
       <w:r>
@@ -9912,7 +9990,7 @@
         <w:pStyle w:val="Compact"/>
         <w:numPr>
           <w:ilvl w:val="0"/>
-          <w:numId w:val="1410"/>
+          <w:numId w:val="1414"/>
         </w:numPr>
       </w:pPr>
       <w:r>
@@ -9924,7 +10002,7 @@
         <w:pStyle w:val="Compact"/>
         <w:numPr>
           <w:ilvl w:val="0"/>
-          <w:numId w:val="1411"/>
+          <w:numId w:val="1415"/>
         </w:numPr>
       </w:pPr>
       <w:r>
@@ -9936,7 +10014,7 @@
         <w:pStyle w:val="Compact"/>
         <w:numPr>
           <w:ilvl w:val="0"/>
-          <w:numId w:val="1412"/>
+          <w:numId w:val="1416"/>
         </w:numPr>
       </w:pPr>
       <w:r>
@@ -9968,7 +10046,7 @@
         <w:pStyle w:val="Compact"/>
         <w:numPr>
           <w:ilvl w:val="0"/>
-          <w:numId w:val="1413"/>
+          <w:numId w:val="1417"/>
         </w:numPr>
       </w:pPr>
       <w:r>
@@ -10040,7 +10118,7 @@
         <w:pStyle w:val="Compact"/>
         <w:numPr>
           <w:ilvl w:val="0"/>
-          <w:numId w:val="1414"/>
+          <w:numId w:val="1418"/>
         </w:numPr>
       </w:pPr>
       <w:r>
@@ -10052,7 +10130,7 @@
         <w:pStyle w:val="Compact"/>
         <w:numPr>
           <w:ilvl w:val="0"/>
-          <w:numId w:val="1415"/>
+          <w:numId w:val="1419"/>
         </w:numPr>
       </w:pPr>
       <w:r>
@@ -10079,7 +10157,7 @@
         <w:pStyle w:val="Compact"/>
         <w:numPr>
           <w:ilvl w:val="0"/>
-          <w:numId w:val="1416"/>
+          <w:numId w:val="1420"/>
         </w:numPr>
       </w:pPr>
       <w:r>
@@ -10133,7 +10211,7 @@
         <w:pStyle w:val="Compact"/>
         <w:numPr>
           <w:ilvl w:val="0"/>
-          <w:numId w:val="1417"/>
+          <w:numId w:val="1421"/>
         </w:numPr>
       </w:pPr>
       <w:r>
@@ -10145,7 +10223,7 @@
         <w:pStyle w:val="Compact"/>
         <w:numPr>
           <w:ilvl w:val="0"/>
-          <w:numId w:val="1418"/>
+          <w:numId w:val="1422"/>
         </w:numPr>
       </w:pPr>
       <w:r>
@@ -10167,7 +10245,7 @@
         <w:pStyle w:val="Compact"/>
         <w:numPr>
           <w:ilvl w:val="0"/>
-          <w:numId w:val="1419"/>
+          <w:numId w:val="1423"/>
         </w:numPr>
       </w:pPr>
       <w:r>
@@ -10218,7 +10296,7 @@
         <w:pStyle w:val="Compact"/>
         <w:numPr>
           <w:ilvl w:val="0"/>
-          <w:numId w:val="1420"/>
+          <w:numId w:val="1424"/>
         </w:numPr>
       </w:pPr>
       <w:r>
@@ -10245,7 +10323,7 @@
         <w:pStyle w:val="Compact"/>
         <w:numPr>
           <w:ilvl w:val="0"/>
-          <w:numId w:val="1421"/>
+          <w:numId w:val="1425"/>
         </w:numPr>
       </w:pPr>
       <w:r>
@@ -10257,7 +10335,7 @@
         <w:pStyle w:val="Compact"/>
         <w:numPr>
           <w:ilvl w:val="0"/>
-          <w:numId w:val="1422"/>
+          <w:numId w:val="1426"/>
         </w:numPr>
       </w:pPr>
       <w:r>
@@ -10284,7 +10362,7 @@
         <w:pStyle w:val="Compact"/>
         <w:numPr>
           <w:ilvl w:val="0"/>
-          <w:numId w:val="1423"/>
+          <w:numId w:val="1427"/>
         </w:numPr>
       </w:pPr>
       <w:r>
@@ -10296,7 +10374,7 @@
         <w:pStyle w:val="Compact"/>
         <w:numPr>
           <w:ilvl w:val="0"/>
-          <w:numId w:val="1424"/>
+          <w:numId w:val="1428"/>
         </w:numPr>
       </w:pPr>
       <w:r>
@@ -10308,7 +10386,7 @@
         <w:pStyle w:val="Compact"/>
         <w:numPr>
           <w:ilvl w:val="0"/>
-          <w:numId w:val="1425"/>
+          <w:numId w:val="1429"/>
         </w:numPr>
       </w:pPr>
       <w:r>
@@ -10330,7 +10408,7 @@
         <w:pStyle w:val="Compact"/>
         <w:numPr>
           <w:ilvl w:val="0"/>
-          <w:numId w:val="1426"/>
+          <w:numId w:val="1430"/>
         </w:numPr>
       </w:pPr>
       <w:r>
@@ -10354,7 +10432,7 @@
         <w:pStyle w:val="Compact"/>
         <w:numPr>
           <w:ilvl w:val="0"/>
-          <w:numId w:val="1427"/>
+          <w:numId w:val="1431"/>
         </w:numPr>
       </w:pPr>
       <w:r>
@@ -10378,7 +10456,7 @@
         <w:pStyle w:val="Compact"/>
         <w:numPr>
           <w:ilvl w:val="0"/>
-          <w:numId w:val="1428"/>
+          <w:numId w:val="1432"/>
         </w:numPr>
       </w:pPr>
       <w:r>
@@ -10390,7 +10468,7 @@
         <w:pStyle w:val="Compact"/>
         <w:numPr>
           <w:ilvl w:val="0"/>
-          <w:numId w:val="1429"/>
+          <w:numId w:val="1433"/>
         </w:numPr>
       </w:pPr>
       <w:r>
@@ -10402,7 +10480,7 @@
         <w:pStyle w:val="Compact"/>
         <w:numPr>
           <w:ilvl w:val="0"/>
-          <w:numId w:val="1430"/>
+          <w:numId w:val="1434"/>
         </w:numPr>
       </w:pPr>
       <w:r>
@@ -10414,7 +10492,7 @@
         <w:pStyle w:val="Compact"/>
         <w:numPr>
           <w:ilvl w:val="0"/>
-          <w:numId w:val="1431"/>
+          <w:numId w:val="1435"/>
         </w:numPr>
       </w:pPr>
       <w:r>
@@ -10445,7 +10523,7 @@
         <w:pStyle w:val="Compact"/>
         <w:numPr>
           <w:ilvl w:val="0"/>
-          <w:numId w:val="1432"/>
+          <w:numId w:val="1436"/>
         </w:numPr>
       </w:pPr>
       <w:r>
@@ -10457,7 +10535,7 @@
         <w:pStyle w:val="Compact"/>
         <w:numPr>
           <w:ilvl w:val="0"/>
-          <w:numId w:val="1433"/>
+          <w:numId w:val="1437"/>
         </w:numPr>
       </w:pPr>
       <w:r>
@@ -10469,7 +10547,7 @@
         <w:pStyle w:val="Compact"/>
         <w:numPr>
           <w:ilvl w:val="1"/>
-          <w:numId w:val="1434"/>
+          <w:numId w:val="1438"/>
         </w:numPr>
       </w:pPr>
       <w:r>
@@ -10487,7 +10565,7 @@
         <w:pStyle w:val="Compact"/>
         <w:numPr>
           <w:ilvl w:val="1"/>
-          <w:numId w:val="1434"/>
+          <w:numId w:val="1438"/>
         </w:numPr>
       </w:pPr>
       <w:r>
@@ -10505,7 +10583,7 @@
         <w:pStyle w:val="Compact"/>
         <w:numPr>
           <w:ilvl w:val="1"/>
-          <w:numId w:val="1434"/>
+          <w:numId w:val="1438"/>
         </w:numPr>
       </w:pPr>
       <w:r>
@@ -10523,7 +10601,7 @@
         <w:pStyle w:val="Compact"/>
         <w:numPr>
           <w:ilvl w:val="1"/>
-          <w:numId w:val="1434"/>
+          <w:numId w:val="1438"/>
         </w:numPr>
       </w:pPr>
       <w:r>
@@ -10541,7 +10619,7 @@
         <w:pStyle w:val="Compact"/>
         <w:numPr>
           <w:ilvl w:val="0"/>
-          <w:numId w:val="1435"/>
+          <w:numId w:val="1439"/>
         </w:numPr>
       </w:pPr>
       <w:r>
@@ -10553,7 +10631,7 @@
         <w:pStyle w:val="Compact"/>
         <w:numPr>
           <w:ilvl w:val="0"/>
-          <w:numId w:val="1436"/>
+          <w:numId w:val="1440"/>
         </w:numPr>
       </w:pPr>
       <w:r>
@@ -10565,7 +10643,7 @@
         <w:pStyle w:val="Compact"/>
         <w:numPr>
           <w:ilvl w:val="0"/>
-          <w:numId w:val="1437"/>
+          <w:numId w:val="1441"/>
         </w:numPr>
       </w:pPr>
       <w:r>
@@ -10587,7 +10665,7 @@
         <w:pStyle w:val="Compact"/>
         <w:numPr>
           <w:ilvl w:val="0"/>
-          <w:numId w:val="1438"/>
+          <w:numId w:val="1442"/>
         </w:numPr>
       </w:pPr>
       <w:r>
@@ -10599,7 +10677,7 @@
         <w:pStyle w:val="Compact"/>
         <w:numPr>
           <w:ilvl w:val="0"/>
-          <w:numId w:val="1439"/>
+          <w:numId w:val="1443"/>
         </w:numPr>
       </w:pPr>
       <w:r>
@@ -10611,7 +10689,7 @@
         <w:pStyle w:val="Compact"/>
         <w:numPr>
           <w:ilvl w:val="0"/>
-          <w:numId w:val="1440"/>
+          <w:numId w:val="1444"/>
         </w:numPr>
       </w:pPr>
       <w:r>
@@ -10623,7 +10701,7 @@
         <w:pStyle w:val="Compact"/>
         <w:numPr>
           <w:ilvl w:val="0"/>
-          <w:numId w:val="1441"/>
+          <w:numId w:val="1445"/>
         </w:numPr>
       </w:pPr>
       <w:r>
@@ -10635,7 +10713,7 @@
         <w:pStyle w:val="Compact"/>
         <w:numPr>
           <w:ilvl w:val="0"/>
-          <w:numId w:val="1442"/>
+          <w:numId w:val="1446"/>
         </w:numPr>
       </w:pPr>
       <w:r>
@@ -10647,7 +10725,7 @@
         <w:pStyle w:val="Compact"/>
         <w:numPr>
           <w:ilvl w:val="0"/>
-          <w:numId w:val="1443"/>
+          <w:numId w:val="1447"/>
         </w:numPr>
       </w:pPr>
       <w:r>
@@ -10659,7 +10737,7 @@
         <w:pStyle w:val="Compact"/>
         <w:numPr>
           <w:ilvl w:val="0"/>
-          <w:numId w:val="1444"/>
+          <w:numId w:val="1448"/>
         </w:numPr>
       </w:pPr>
       <w:r>
@@ -10671,7 +10749,7 @@
         <w:pStyle w:val="Compact"/>
         <w:numPr>
           <w:ilvl w:val="0"/>
-          <w:numId w:val="1445"/>
+          <w:numId w:val="1449"/>
         </w:numPr>
       </w:pPr>
       <w:r>
@@ -10683,7 +10761,7 @@
         <w:pStyle w:val="Compact"/>
         <w:numPr>
           <w:ilvl w:val="0"/>
-          <w:numId w:val="1446"/>
+          <w:numId w:val="1450"/>
         </w:numPr>
       </w:pPr>
       <w:r>
@@ -10715,7 +10793,7 @@
         <w:pStyle w:val="Compact"/>
         <w:numPr>
           <w:ilvl w:val="0"/>
-          <w:numId w:val="1447"/>
+          <w:numId w:val="1451"/>
         </w:numPr>
       </w:pPr>
       <w:r>
@@ -10742,7 +10820,7 @@
         <w:pStyle w:val="Compact"/>
         <w:numPr>
           <w:ilvl w:val="0"/>
-          <w:numId w:val="1448"/>
+          <w:numId w:val="1452"/>
         </w:numPr>
       </w:pPr>
       <w:r>
@@ -10814,7 +10892,7 @@
         <w:pStyle w:val="Compact"/>
         <w:numPr>
           <w:ilvl w:val="0"/>
-          <w:numId w:val="1449"/>
+          <w:numId w:val="1453"/>
         </w:numPr>
       </w:pPr>
       <w:r>
@@ -10841,7 +10919,7 @@
         <w:pStyle w:val="Compact"/>
         <w:numPr>
           <w:ilvl w:val="0"/>
-          <w:numId w:val="1450"/>
+          <w:numId w:val="1454"/>
         </w:numPr>
       </w:pPr>
       <w:r>
@@ -10853,7 +10931,7 @@
         <w:pStyle w:val="Compact"/>
         <w:numPr>
           <w:ilvl w:val="0"/>
-          <w:numId w:val="1451"/>
+          <w:numId w:val="1455"/>
         </w:numPr>
       </w:pPr>
       <w:r>
@@ -10880,7 +10958,7 @@
         <w:pStyle w:val="Compact"/>
         <w:numPr>
           <w:ilvl w:val="0"/>
-          <w:numId w:val="1452"/>
+          <w:numId w:val="1456"/>
         </w:numPr>
       </w:pPr>
       <w:r>
@@ -10892,7 +10970,7 @@
         <w:pStyle w:val="Compact"/>
         <w:numPr>
           <w:ilvl w:val="0"/>
-          <w:numId w:val="1453"/>
+          <w:numId w:val="1457"/>
         </w:numPr>
       </w:pPr>
       <w:r>
@@ -10919,7 +10997,7 @@
         <w:pStyle w:val="Compact"/>
         <w:numPr>
           <w:ilvl w:val="0"/>
-          <w:numId w:val="1454"/>
+          <w:numId w:val="1458"/>
         </w:numPr>
       </w:pPr>
       <w:r>
@@ -10961,7 +11039,7 @@
         <w:pStyle w:val="Compact"/>
         <w:numPr>
           <w:ilvl w:val="0"/>
-          <w:numId w:val="1455"/>
+          <w:numId w:val="1459"/>
         </w:numPr>
       </w:pPr>
       <w:r>
@@ -10997,7 +11075,7 @@
         <w:pStyle w:val="Compact"/>
         <w:numPr>
           <w:ilvl w:val="0"/>
-          <w:numId w:val="1456"/>
+          <w:numId w:val="1460"/>
         </w:numPr>
       </w:pPr>
       <w:r>
@@ -11019,7 +11097,7 @@
         <w:pStyle w:val="Compact"/>
         <w:numPr>
           <w:ilvl w:val="0"/>
-          <w:numId w:val="1457"/>
+          <w:numId w:val="1461"/>
         </w:numPr>
       </w:pPr>
       <w:r>
@@ -11031,164 +11109,11 @@
         <w:pStyle w:val="Compact"/>
         <w:numPr>
           <w:ilvl w:val="0"/>
-          <w:numId w:val="1458"/>
+          <w:numId w:val="1462"/>
         </w:numPr>
       </w:pPr>
       <w:r>
         <w:t xml:space="preserve">Columns match prototype order:</w:t>
-      </w:r>
-    </w:p>
-    <w:p>
-      <w:pPr>
-        <w:pStyle w:val="Compact"/>
-        <w:numPr>
-          <w:ilvl w:val="1"/>
-          <w:numId w:val="1459"/>
-        </w:numPr>
-      </w:pPr>
-      <w:r>
-        <w:t xml:space="preserve">Name;</w:t>
-      </w:r>
-    </w:p>
-    <w:p>
-      <w:pPr>
-        <w:pStyle w:val="Compact"/>
-        <w:numPr>
-          <w:ilvl w:val="1"/>
-          <w:numId w:val="1459"/>
-        </w:numPr>
-      </w:pPr>
-      <w:r>
-        <w:t xml:space="preserve">Phone;</w:t>
-      </w:r>
-    </w:p>
-    <w:p>
-      <w:pPr>
-        <w:pStyle w:val="Compact"/>
-        <w:numPr>
-          <w:ilvl w:val="1"/>
-          <w:numId w:val="1459"/>
-        </w:numPr>
-      </w:pPr>
-      <w:r>
-        <w:t xml:space="preserve">Status;</w:t>
-      </w:r>
-    </w:p>
-    <w:p>
-      <w:pPr>
-        <w:pStyle w:val="Compact"/>
-        <w:numPr>
-          <w:ilvl w:val="1"/>
-          <w:numId w:val="1459"/>
-        </w:numPr>
-      </w:pPr>
-      <w:r>
-        <w:t xml:space="preserve">Last Contact;</w:t>
-      </w:r>
-    </w:p>
-    <w:p>
-      <w:pPr>
-        <w:pStyle w:val="Compact"/>
-        <w:numPr>
-          <w:ilvl w:val="1"/>
-          <w:numId w:val="1459"/>
-        </w:numPr>
-      </w:pPr>
-      <w:r>
-        <w:t xml:space="preserve">Industry;</w:t>
-      </w:r>
-    </w:p>
-    <w:p>
-      <w:pPr>
-        <w:pStyle w:val="Compact"/>
-        <w:numPr>
-          <w:ilvl w:val="1"/>
-          <w:numId w:val="1459"/>
-        </w:numPr>
-      </w:pPr>
-      <w:r>
-        <w:t xml:space="preserve">Monthly Revenue;</w:t>
-      </w:r>
-    </w:p>
-    <w:p>
-      <w:pPr>
-        <w:pStyle w:val="Compact"/>
-        <w:numPr>
-          <w:ilvl w:val="1"/>
-          <w:numId w:val="1459"/>
-        </w:numPr>
-      </w:pPr>
-      <w:r>
-        <w:t xml:space="preserve">Source;</w:t>
-      </w:r>
-    </w:p>
-    <w:p>
-      <w:pPr>
-        <w:pStyle w:val="Compact"/>
-        <w:numPr>
-          <w:ilvl w:val="1"/>
-          <w:numId w:val="1459"/>
-        </w:numPr>
-      </w:pPr>
-      <w:r>
-        <w:t xml:space="preserve">Added.</w:t>
-      </w:r>
-    </w:p>
-    <w:p>
-      <w:pPr>
-        <w:pStyle w:val="Compact"/>
-        <w:numPr>
-          <w:ilvl w:val="0"/>
-          <w:numId w:val="1460"/>
-        </w:numPr>
-      </w:pPr>
-      <w:r>
-        <w:t xml:space="preserve">Last Contact shows rep attribution initials and relative time, e.g. </w:t>
-      </w:r>
-      <w:r>
-        <w:rPr>
-          <w:rStyle w:val="VerbatimChar"/>
-        </w:rPr>
-        <w:t xml:space="preserve">JB 2h ago</w:t>
-      </w:r>
-      <w:r>
-        <w:t xml:space="preserve">.</w:t>
-      </w:r>
-    </w:p>
-    <w:p>
-      <w:pPr>
-        <w:pStyle w:val="Compact"/>
-        <w:numPr>
-          <w:ilvl w:val="0"/>
-          <w:numId w:val="1461"/>
-        </w:numPr>
-      </w:pPr>
-      <w:r>
-        <w:t xml:space="preserve">Industry renders extracted/classified value or</w:t>
-      </w:r>
-      <w:r>
-        <w:t xml:space="preserve"> </w:t>
-      </w:r>
-      <w:r>
-        <w:rPr>
-          <w:rStyle w:val="VerbatimChar"/>
-        </w:rPr>
-        <w:t xml:space="preserve">— unknown</w:t>
-      </w:r>
-      <w:r>
-        <w:t xml:space="preserve">.</w:t>
-      </w:r>
-    </w:p>
-    <w:p>
-      <w:pPr>
-        <w:pStyle w:val="Compact"/>
-        <w:numPr>
-          <w:ilvl w:val="0"/>
-          <w:numId w:val="1462"/>
-        </w:numPr>
-      </w:pPr>
-      <w:r>
-        <w:t xml:space="preserve">Monthly Revenue renders raw/formatted revenue plus provenance chip:</w:t>
       </w:r>
     </w:p>
     <w:p>
@@ -11200,7 +11125,7 @@
         </w:numPr>
       </w:pPr>
       <w:r>
-        <w:t xml:space="preserve">AI;</w:t>
+        <w:t xml:space="preserve">Name;</w:t>
       </w:r>
     </w:p>
     <w:p>
@@ -11212,7 +11137,7 @@
         </w:numPr>
       </w:pPr>
       <w:r>
-        <w:t xml:space="preserve">CSV;</w:t>
+        <w:t xml:space="preserve">Phone;</w:t>
       </w:r>
     </w:p>
     <w:p>
@@ -11224,6 +11149,159 @@
         </w:numPr>
       </w:pPr>
       <w:r>
+        <w:t xml:space="preserve">Status;</w:t>
+      </w:r>
+    </w:p>
+    <w:p>
+      <w:pPr>
+        <w:pStyle w:val="Compact"/>
+        <w:numPr>
+          <w:ilvl w:val="1"/>
+          <w:numId w:val="1463"/>
+        </w:numPr>
+      </w:pPr>
+      <w:r>
+        <w:t xml:space="preserve">Last Contact;</w:t>
+      </w:r>
+    </w:p>
+    <w:p>
+      <w:pPr>
+        <w:pStyle w:val="Compact"/>
+        <w:numPr>
+          <w:ilvl w:val="1"/>
+          <w:numId w:val="1463"/>
+        </w:numPr>
+      </w:pPr>
+      <w:r>
+        <w:t xml:space="preserve">Industry;</w:t>
+      </w:r>
+    </w:p>
+    <w:p>
+      <w:pPr>
+        <w:pStyle w:val="Compact"/>
+        <w:numPr>
+          <w:ilvl w:val="1"/>
+          <w:numId w:val="1463"/>
+        </w:numPr>
+      </w:pPr>
+      <w:r>
+        <w:t xml:space="preserve">Monthly Revenue;</w:t>
+      </w:r>
+    </w:p>
+    <w:p>
+      <w:pPr>
+        <w:pStyle w:val="Compact"/>
+        <w:numPr>
+          <w:ilvl w:val="1"/>
+          <w:numId w:val="1463"/>
+        </w:numPr>
+      </w:pPr>
+      <w:r>
+        <w:t xml:space="preserve">Source;</w:t>
+      </w:r>
+    </w:p>
+    <w:p>
+      <w:pPr>
+        <w:pStyle w:val="Compact"/>
+        <w:numPr>
+          <w:ilvl w:val="1"/>
+          <w:numId w:val="1463"/>
+        </w:numPr>
+      </w:pPr>
+      <w:r>
+        <w:t xml:space="preserve">Added.</w:t>
+      </w:r>
+    </w:p>
+    <w:p>
+      <w:pPr>
+        <w:pStyle w:val="Compact"/>
+        <w:numPr>
+          <w:ilvl w:val="0"/>
+          <w:numId w:val="1464"/>
+        </w:numPr>
+      </w:pPr>
+      <w:r>
+        <w:t xml:space="preserve">Last Contact shows rep attribution initials and relative time, e.g. </w:t>
+      </w:r>
+      <w:r>
+        <w:rPr>
+          <w:rStyle w:val="VerbatimChar"/>
+        </w:rPr>
+        <w:t xml:space="preserve">JB 2h ago</w:t>
+      </w:r>
+      <w:r>
+        <w:t xml:space="preserve">.</w:t>
+      </w:r>
+    </w:p>
+    <w:p>
+      <w:pPr>
+        <w:pStyle w:val="Compact"/>
+        <w:numPr>
+          <w:ilvl w:val="0"/>
+          <w:numId w:val="1465"/>
+        </w:numPr>
+      </w:pPr>
+      <w:r>
+        <w:t xml:space="preserve">Industry renders extracted/classified value or</w:t>
+      </w:r>
+      <w:r>
+        <w:t xml:space="preserve"> </w:t>
+      </w:r>
+      <w:r>
+        <w:rPr>
+          <w:rStyle w:val="VerbatimChar"/>
+        </w:rPr>
+        <w:t xml:space="preserve">— unknown</w:t>
+      </w:r>
+      <w:r>
+        <w:t xml:space="preserve">.</w:t>
+      </w:r>
+    </w:p>
+    <w:p>
+      <w:pPr>
+        <w:pStyle w:val="Compact"/>
+        <w:numPr>
+          <w:ilvl w:val="0"/>
+          <w:numId w:val="1466"/>
+        </w:numPr>
+      </w:pPr>
+      <w:r>
+        <w:t xml:space="preserve">Monthly Revenue renders raw/formatted revenue plus provenance chip:</w:t>
+      </w:r>
+    </w:p>
+    <w:p>
+      <w:pPr>
+        <w:pStyle w:val="Compact"/>
+        <w:numPr>
+          <w:ilvl w:val="1"/>
+          <w:numId w:val="1467"/>
+        </w:numPr>
+      </w:pPr>
+      <w:r>
+        <w:t xml:space="preserve">AI;</w:t>
+      </w:r>
+    </w:p>
+    <w:p>
+      <w:pPr>
+        <w:pStyle w:val="Compact"/>
+        <w:numPr>
+          <w:ilvl w:val="1"/>
+          <w:numId w:val="1467"/>
+        </w:numPr>
+      </w:pPr>
+      <w:r>
+        <w:t xml:space="preserve">CSV;</w:t>
+      </w:r>
+    </w:p>
+    <w:p>
+      <w:pPr>
+        <w:pStyle w:val="Compact"/>
+        <w:numPr>
+          <w:ilvl w:val="1"/>
+          <w:numId w:val="1467"/>
+        </w:numPr>
+      </w:pPr>
+      <w:r>
         <w:t xml:space="preserve">MANUAL.</w:t>
       </w:r>
     </w:p>
@@ -11232,7 +11310,7 @@
         <w:pStyle w:val="Compact"/>
         <w:numPr>
           <w:ilvl w:val="0"/>
-          <w:numId w:val="1464"/>
+          <w:numId w:val="1468"/>
         </w:numPr>
       </w:pPr>
       <w:r>
@@ -11256,7 +11334,7 @@
         <w:pStyle w:val="Compact"/>
         <w:numPr>
           <w:ilvl w:val="0"/>
-          <w:numId w:val="1465"/>
+          <w:numId w:val="1469"/>
         </w:numPr>
       </w:pPr>
       <w:r>
@@ -11268,7 +11346,7 @@
         <w:pStyle w:val="Compact"/>
         <w:numPr>
           <w:ilvl w:val="0"/>
-          <w:numId w:val="1466"/>
+          <w:numId w:val="1470"/>
         </w:numPr>
       </w:pPr>
       <w:r>
@@ -11280,7 +11358,7 @@
         <w:pStyle w:val="Compact"/>
         <w:numPr>
           <w:ilvl w:val="0"/>
-          <w:numId w:val="1467"/>
+          <w:numId w:val="1471"/>
         </w:numPr>
       </w:pPr>
       <w:r>
@@ -11302,7 +11380,7 @@
         <w:pStyle w:val="Compact"/>
         <w:numPr>
           <w:ilvl w:val="0"/>
-          <w:numId w:val="1468"/>
+          <w:numId w:val="1472"/>
         </w:numPr>
       </w:pPr>
       <w:r>
@@ -11314,7 +11392,7 @@
         <w:pStyle w:val="Compact"/>
         <w:numPr>
           <w:ilvl w:val="1"/>
-          <w:numId w:val="1469"/>
+          <w:numId w:val="1473"/>
         </w:numPr>
       </w:pPr>
       <w:r>
@@ -11326,7 +11404,7 @@
         <w:pStyle w:val="Compact"/>
         <w:numPr>
           <w:ilvl w:val="1"/>
-          <w:numId w:val="1469"/>
+          <w:numId w:val="1473"/>
         </w:numPr>
       </w:pPr>
       <w:r>
@@ -11338,7 +11416,7 @@
         <w:pStyle w:val="Compact"/>
         <w:numPr>
           <w:ilvl w:val="1"/>
-          <w:numId w:val="1469"/>
+          <w:numId w:val="1473"/>
         </w:numPr>
       </w:pPr>
       <w:r>
@@ -11350,7 +11428,7 @@
         <w:pStyle w:val="Compact"/>
         <w:numPr>
           <w:ilvl w:val="0"/>
-          <w:numId w:val="1470"/>
+          <w:numId w:val="1474"/>
         </w:numPr>
       </w:pPr>
       <w:r>
@@ -11362,7 +11440,7 @@
         <w:pStyle w:val="Compact"/>
         <w:numPr>
           <w:ilvl w:val="1"/>
-          <w:numId w:val="1471"/>
+          <w:numId w:val="1475"/>
         </w:numPr>
       </w:pPr>
       <w:r>
@@ -11374,7 +11452,7 @@
         <w:pStyle w:val="Compact"/>
         <w:numPr>
           <w:ilvl w:val="1"/>
-          <w:numId w:val="1471"/>
+          <w:numId w:val="1475"/>
         </w:numPr>
       </w:pPr>
       <w:r>
@@ -11386,7 +11464,7 @@
         <w:pStyle w:val="Compact"/>
         <w:numPr>
           <w:ilvl w:val="1"/>
-          <w:numId w:val="1471"/>
+          <w:numId w:val="1475"/>
         </w:numPr>
       </w:pPr>
       <w:r>
@@ -11398,7 +11476,7 @@
         <w:pStyle w:val="Compact"/>
         <w:numPr>
           <w:ilvl w:val="0"/>
-          <w:numId w:val="1472"/>
+          <w:numId w:val="1476"/>
         </w:numPr>
       </w:pPr>
       <w:r>
@@ -11410,7 +11488,7 @@
         <w:pStyle w:val="Compact"/>
         <w:numPr>
           <w:ilvl w:val="0"/>
-          <w:numId w:val="1473"/>
+          <w:numId w:val="1477"/>
         </w:numPr>
       </w:pPr>
       <w:r>
@@ -11422,7 +11500,7 @@
         <w:pStyle w:val="Compact"/>
         <w:numPr>
           <w:ilvl w:val="0"/>
-          <w:numId w:val="1474"/>
+          <w:numId w:val="1478"/>
         </w:numPr>
       </w:pPr>
       <w:r>
@@ -11444,7 +11522,7 @@
         <w:pStyle w:val="Compact"/>
         <w:numPr>
           <w:ilvl w:val="0"/>
-          <w:numId w:val="1475"/>
+          <w:numId w:val="1479"/>
         </w:numPr>
       </w:pPr>
       <w:r>
@@ -11465,7 +11543,7 @@
         <w:pStyle w:val="Compact"/>
         <w:numPr>
           <w:ilvl w:val="0"/>
-          <w:numId w:val="1476"/>
+          <w:numId w:val="1480"/>
         </w:numPr>
       </w:pPr>
       <w:r>
@@ -11477,7 +11555,7 @@
         <w:pStyle w:val="Compact"/>
         <w:numPr>
           <w:ilvl w:val="0"/>
-          <w:numId w:val="1477"/>
+          <w:numId w:val="1481"/>
         </w:numPr>
       </w:pPr>
       <w:r>
@@ -11489,7 +11567,7 @@
         <w:pStyle w:val="Compact"/>
         <w:numPr>
           <w:ilvl w:val="0"/>
-          <w:numId w:val="1478"/>
+          <w:numId w:val="1482"/>
         </w:numPr>
       </w:pPr>
       <w:r>
@@ -11501,7 +11579,7 @@
         <w:pStyle w:val="Compact"/>
         <w:numPr>
           <w:ilvl w:val="0"/>
-          <w:numId w:val="1479"/>
+          <w:numId w:val="1483"/>
         </w:numPr>
       </w:pPr>
       <w:r>
@@ -11513,7 +11591,7 @@
         <w:pStyle w:val="Compact"/>
         <w:numPr>
           <w:ilvl w:val="0"/>
-          <w:numId w:val="1480"/>
+          <w:numId w:val="1484"/>
         </w:numPr>
       </w:pPr>
       <w:r>
@@ -11525,7 +11603,7 @@
         <w:pStyle w:val="Compact"/>
         <w:numPr>
           <w:ilvl w:val="1"/>
-          <w:numId w:val="1481"/>
+          <w:numId w:val="1485"/>
         </w:numPr>
       </w:pPr>
       <w:r>
@@ -11537,7 +11615,7 @@
         <w:pStyle w:val="Compact"/>
         <w:numPr>
           <w:ilvl w:val="1"/>
-          <w:numId w:val="1481"/>
+          <w:numId w:val="1485"/>
         </w:numPr>
       </w:pPr>
       <w:r>
@@ -11549,7 +11627,7 @@
         <w:pStyle w:val="Compact"/>
         <w:numPr>
           <w:ilvl w:val="1"/>
-          <w:numId w:val="1481"/>
+          <w:numId w:val="1485"/>
         </w:numPr>
       </w:pPr>
       <w:r>
@@ -11561,7 +11639,7 @@
         <w:pStyle w:val="Compact"/>
         <w:numPr>
           <w:ilvl w:val="1"/>
-          <w:numId w:val="1481"/>
+          <w:numId w:val="1485"/>
         </w:numPr>
       </w:pPr>
       <w:r>
@@ -11573,7 +11651,7 @@
         <w:pStyle w:val="Compact"/>
         <w:numPr>
           <w:ilvl w:val="1"/>
-          <w:numId w:val="1481"/>
+          <w:numId w:val="1485"/>
         </w:numPr>
       </w:pPr>
       <w:r>
@@ -11585,7 +11663,7 @@
         <w:pStyle w:val="Compact"/>
         <w:numPr>
           <w:ilvl w:val="1"/>
-          <w:numId w:val="1481"/>
+          <w:numId w:val="1485"/>
         </w:numPr>
       </w:pPr>
       <w:r>
@@ -11597,7 +11675,7 @@
         <w:pStyle w:val="Compact"/>
         <w:numPr>
           <w:ilvl w:val="0"/>
-          <w:numId w:val="1482"/>
+          <w:numId w:val="1486"/>
         </w:numPr>
       </w:pPr>
       <w:r>
@@ -11609,7 +11687,7 @@
         <w:pStyle w:val="Compact"/>
         <w:numPr>
           <w:ilvl w:val="0"/>
-          <w:numId w:val="1483"/>
+          <w:numId w:val="1487"/>
         </w:numPr>
       </w:pPr>
       <w:r>
@@ -11631,7 +11709,7 @@
         <w:pStyle w:val="Compact"/>
         <w:numPr>
           <w:ilvl w:val="0"/>
-          <w:numId w:val="1484"/>
+          <w:numId w:val="1488"/>
         </w:numPr>
       </w:pPr>
       <w:r>
@@ -11643,7 +11721,7 @@
         <w:pStyle w:val="Compact"/>
         <w:numPr>
           <w:ilvl w:val="0"/>
-          <w:numId w:val="1485"/>
+          <w:numId w:val="1489"/>
         </w:numPr>
       </w:pPr>
       <w:r>
@@ -11655,7 +11733,7 @@
         <w:pStyle w:val="Compact"/>
         <w:numPr>
           <w:ilvl w:val="0"/>
-          <w:numId w:val="1486"/>
+          <w:numId w:val="1490"/>
         </w:numPr>
       </w:pPr>
       <w:r>
@@ -11667,7 +11745,7 @@
         <w:pStyle w:val="Compact"/>
         <w:numPr>
           <w:ilvl w:val="0"/>
-          <w:numId w:val="1487"/>
+          <w:numId w:val="1491"/>
         </w:numPr>
       </w:pPr>
       <w:r>
@@ -11679,7 +11757,7 @@
         <w:pStyle w:val="Compact"/>
         <w:numPr>
           <w:ilvl w:val="0"/>
-          <w:numId w:val="1488"/>
+          <w:numId w:val="1492"/>
         </w:numPr>
       </w:pPr>
       <w:r>
@@ -11701,7 +11779,7 @@
         <w:pStyle w:val="Compact"/>
         <w:numPr>
           <w:ilvl w:val="0"/>
-          <w:numId w:val="1489"/>
+          <w:numId w:val="1493"/>
         </w:numPr>
       </w:pPr>
       <w:r>
@@ -11713,7 +11791,7 @@
         <w:pStyle w:val="Compact"/>
         <w:numPr>
           <w:ilvl w:val="0"/>
-          <w:numId w:val="1490"/>
+          <w:numId w:val="1494"/>
         </w:numPr>
       </w:pPr>
       <w:r>
@@ -11725,7 +11803,7 @@
         <w:pStyle w:val="Compact"/>
         <w:numPr>
           <w:ilvl w:val="0"/>
-          <w:numId w:val="1491"/>
+          <w:numId w:val="1495"/>
         </w:numPr>
       </w:pPr>
       <w:r>
@@ -11737,7 +11815,7 @@
         <w:pStyle w:val="Compact"/>
         <w:numPr>
           <w:ilvl w:val="0"/>
-          <w:numId w:val="1492"/>
+          <w:numId w:val="1496"/>
         </w:numPr>
       </w:pPr>
       <w:r>
@@ -11749,7 +11827,7 @@
         <w:pStyle w:val="Compact"/>
         <w:numPr>
           <w:ilvl w:val="0"/>
-          <w:numId w:val="1493"/>
+          <w:numId w:val="1497"/>
         </w:numPr>
       </w:pPr>
       <w:r>
@@ -11761,7 +11839,7 @@
         <w:pStyle w:val="Compact"/>
         <w:numPr>
           <w:ilvl w:val="0"/>
-          <w:numId w:val="1494"/>
+          <w:numId w:val="1498"/>
         </w:numPr>
       </w:pPr>
       <w:r>
@@ -11773,7 +11851,7 @@
         <w:pStyle w:val="Compact"/>
         <w:numPr>
           <w:ilvl w:val="0"/>
-          <w:numId w:val="1495"/>
+          <w:numId w:val="1499"/>
         </w:numPr>
       </w:pPr>
       <w:r>
@@ -11785,7 +11863,7 @@
         <w:pStyle w:val="Compact"/>
         <w:numPr>
           <w:ilvl w:val="0"/>
-          <w:numId w:val="1496"/>
+          <w:numId w:val="1500"/>
         </w:numPr>
       </w:pPr>
       <w:r>
@@ -11817,7 +11895,7 @@
         <w:pStyle w:val="Compact"/>
         <w:numPr>
           <w:ilvl w:val="0"/>
-          <w:numId w:val="1497"/>
+          <w:numId w:val="1501"/>
         </w:numPr>
       </w:pPr>
       <w:r>
@@ -11865,7 +11943,7 @@
         <w:pStyle w:val="Compact"/>
         <w:numPr>
           <w:ilvl w:val="0"/>
-          <w:numId w:val="1498"/>
+          <w:numId w:val="1502"/>
         </w:numPr>
       </w:pPr>
       <w:r>
@@ -11877,7 +11955,7 @@
         <w:pStyle w:val="Compact"/>
         <w:numPr>
           <w:ilvl w:val="0"/>
-          <w:numId w:val="1499"/>
+          <w:numId w:val="1503"/>
         </w:numPr>
       </w:pPr>
       <w:r>
@@ -11889,7 +11967,7 @@
         <w:pStyle w:val="Compact"/>
         <w:numPr>
           <w:ilvl w:val="0"/>
-          <w:numId w:val="1500"/>
+          <w:numId w:val="1504"/>
         </w:numPr>
       </w:pPr>
       <w:r>
@@ -11901,7 +11979,7 @@
         <w:pStyle w:val="Compact"/>
         <w:numPr>
           <w:ilvl w:val="0"/>
-          <w:numId w:val="1501"/>
+          <w:numId w:val="1505"/>
         </w:numPr>
       </w:pPr>
       <w:r>
@@ -11913,7 +11991,7 @@
         <w:pStyle w:val="Compact"/>
         <w:numPr>
           <w:ilvl w:val="0"/>
-          <w:numId w:val="1502"/>
+          <w:numId w:val="1506"/>
         </w:numPr>
       </w:pPr>
       <w:r>
@@ -11967,7 +12045,7 @@
         <w:pStyle w:val="Compact"/>
         <w:numPr>
           <w:ilvl w:val="0"/>
-          <w:numId w:val="1503"/>
+          <w:numId w:val="1507"/>
         </w:numPr>
       </w:pPr>
       <w:r>
@@ -11979,7 +12057,7 @@
         <w:pStyle w:val="Compact"/>
         <w:numPr>
           <w:ilvl w:val="0"/>
-          <w:numId w:val="1504"/>
+          <w:numId w:val="1508"/>
         </w:numPr>
       </w:pPr>
       <w:r>
@@ -12006,7 +12084,7 @@
         <w:pStyle w:val="Compact"/>
         <w:numPr>
           <w:ilvl w:val="0"/>
-          <w:numId w:val="1505"/>
+          <w:numId w:val="1509"/>
         </w:numPr>
       </w:pPr>
       <w:r>
@@ -12048,7 +12126,7 @@
         <w:pStyle w:val="Compact"/>
         <w:numPr>
           <w:ilvl w:val="0"/>
-          <w:numId w:val="1506"/>
+          <w:numId w:val="1510"/>
         </w:numPr>
       </w:pPr>
       <w:r>
@@ -12075,7 +12153,7 @@
         <w:pStyle w:val="Compact"/>
         <w:numPr>
           <w:ilvl w:val="0"/>
-          <w:numId w:val="1507"/>
+          <w:numId w:val="1511"/>
         </w:numPr>
       </w:pPr>
       <w:r>
@@ -12087,7 +12165,7 @@
         <w:pStyle w:val="Compact"/>
         <w:numPr>
           <w:ilvl w:val="0"/>
-          <w:numId w:val="1508"/>
+          <w:numId w:val="1512"/>
         </w:numPr>
       </w:pPr>
       <w:r>
@@ -12099,7 +12177,7 @@
         <w:pStyle w:val="Compact"/>
         <w:numPr>
           <w:ilvl w:val="0"/>
-          <w:numId w:val="1509"/>
+          <w:numId w:val="1513"/>
         </w:numPr>
       </w:pPr>
       <w:r>
@@ -12136,7 +12214,7 @@
         <w:pStyle w:val="Compact"/>
         <w:numPr>
           <w:ilvl w:val="0"/>
-          <w:numId w:val="1510"/>
+          <w:numId w:val="1514"/>
         </w:numPr>
       </w:pPr>
       <w:r>
@@ -12148,7 +12226,7 @@
         <w:pStyle w:val="Compact"/>
         <w:numPr>
           <w:ilvl w:val="0"/>
-          <w:numId w:val="1511"/>
+          <w:numId w:val="1515"/>
         </w:numPr>
       </w:pPr>
       <w:r>
@@ -12160,7 +12238,7 @@
         <w:pStyle w:val="Compact"/>
         <w:numPr>
           <w:ilvl w:val="0"/>
-          <w:numId w:val="1512"/>
+          <w:numId w:val="1516"/>
         </w:numPr>
       </w:pPr>
       <w:r>
@@ -12172,7 +12250,7 @@
         <w:pStyle w:val="Compact"/>
         <w:numPr>
           <w:ilvl w:val="0"/>
-          <w:numId w:val="1513"/>
+          <w:numId w:val="1517"/>
         </w:numPr>
       </w:pPr>
       <w:r>
@@ -12184,7 +12262,7 @@
         <w:pStyle w:val="Compact"/>
         <w:numPr>
           <w:ilvl w:val="0"/>
-          <w:numId w:val="1514"/>
+          <w:numId w:val="1518"/>
         </w:numPr>
       </w:pPr>
       <w:r>
@@ -12196,7 +12274,7 @@
         <w:pStyle w:val="Compact"/>
         <w:numPr>
           <w:ilvl w:val="0"/>
-          <w:numId w:val="1515"/>
+          <w:numId w:val="1519"/>
         </w:numPr>
       </w:pPr>
       <w:r>
@@ -12208,7 +12286,7 @@
         <w:pStyle w:val="Compact"/>
         <w:numPr>
           <w:ilvl w:val="1"/>
-          <w:numId w:val="1516"/>
+          <w:numId w:val="1520"/>
         </w:numPr>
       </w:pPr>
       <w:r>
@@ -12235,7 +12313,7 @@
         <w:pStyle w:val="Compact"/>
         <w:numPr>
           <w:ilvl w:val="1"/>
-          <w:numId w:val="1516"/>
+          <w:numId w:val="1520"/>
         </w:numPr>
       </w:pPr>
       <w:r>
@@ -12272,7 +12350,7 @@
         <w:pStyle w:val="Compact"/>
         <w:numPr>
           <w:ilvl w:val="0"/>
-          <w:numId w:val="1517"/>
+          <w:numId w:val="1521"/>
         </w:numPr>
       </w:pPr>
       <w:r>
@@ -12314,7 +12392,7 @@
         <w:pStyle w:val="Compact"/>
         <w:numPr>
           <w:ilvl w:val="0"/>
-          <w:numId w:val="1518"/>
+          <w:numId w:val="1522"/>
         </w:numPr>
       </w:pPr>
       <w:r>
@@ -12338,7 +12416,7 @@
         <w:pStyle w:val="Compact"/>
         <w:numPr>
           <w:ilvl w:val="0"/>
-          <w:numId w:val="1519"/>
+          <w:numId w:val="1523"/>
         </w:numPr>
       </w:pPr>
       <w:r>
@@ -12362,7 +12440,7 @@
         <w:pStyle w:val="Compact"/>
         <w:numPr>
           <w:ilvl w:val="0"/>
-          <w:numId w:val="1520"/>
+          <w:numId w:val="1524"/>
         </w:numPr>
       </w:pPr>
       <w:r>
@@ -12374,7 +12452,7 @@
         <w:pStyle w:val="Compact"/>
         <w:numPr>
           <w:ilvl w:val="0"/>
-          <w:numId w:val="1521"/>
+          <w:numId w:val="1525"/>
         </w:numPr>
       </w:pPr>
       <w:r>
@@ -12386,7 +12464,7 @@
         <w:pStyle w:val="Compact"/>
         <w:numPr>
           <w:ilvl w:val="0"/>
-          <w:numId w:val="1522"/>
+          <w:numId w:val="1526"/>
         </w:numPr>
       </w:pPr>
       <w:r>
@@ -12398,7 +12476,7 @@
         <w:pStyle w:val="Compact"/>
         <w:numPr>
           <w:ilvl w:val="0"/>
-          <w:numId w:val="1523"/>
+          <w:numId w:val="1527"/>
         </w:numPr>
       </w:pPr>
       <w:r>
@@ -12410,7 +12488,7 @@
         <w:pStyle w:val="Compact"/>
         <w:numPr>
           <w:ilvl w:val="0"/>
-          <w:numId w:val="1524"/>
+          <w:numId w:val="1528"/>
         </w:numPr>
       </w:pPr>
       <w:r>
@@ -12422,7 +12500,7 @@
         <w:pStyle w:val="Compact"/>
         <w:numPr>
           <w:ilvl w:val="0"/>
-          <w:numId w:val="1525"/>
+          <w:numId w:val="1529"/>
         </w:numPr>
       </w:pPr>
       <w:r>
@@ -12434,7 +12512,7 @@
         <w:pStyle w:val="Compact"/>
         <w:numPr>
           <w:ilvl w:val="0"/>
-          <w:numId w:val="1526"/>
+          <w:numId w:val="1530"/>
         </w:numPr>
       </w:pPr>
       <w:r>
@@ -12446,7 +12524,7 @@
         <w:pStyle w:val="Compact"/>
         <w:numPr>
           <w:ilvl w:val="0"/>
-          <w:numId w:val="1527"/>
+          <w:numId w:val="1531"/>
         </w:numPr>
       </w:pPr>
       <w:r>
@@ -12458,7 +12536,7 @@
         <w:pStyle w:val="Compact"/>
         <w:numPr>
           <w:ilvl w:val="0"/>
-          <w:numId w:val="1528"/>
+          <w:numId w:val="1532"/>
         </w:numPr>
       </w:pPr>
       <w:r>
@@ -12470,7 +12548,7 @@
         <w:pStyle w:val="Compact"/>
         <w:numPr>
           <w:ilvl w:val="0"/>
-          <w:numId w:val="1529"/>
+          <w:numId w:val="1533"/>
         </w:numPr>
       </w:pPr>
       <w:r>
@@ -12482,7 +12560,7 @@
         <w:pStyle w:val="Compact"/>
         <w:numPr>
           <w:ilvl w:val="0"/>
-          <w:numId w:val="1530"/>
+          <w:numId w:val="1534"/>
         </w:numPr>
       </w:pPr>
       <w:r>
@@ -12509,7 +12587,7 @@
         <w:pStyle w:val="Compact"/>
         <w:numPr>
           <w:ilvl w:val="0"/>
-          <w:numId w:val="1531"/>
+          <w:numId w:val="1535"/>
         </w:numPr>
       </w:pPr>
       <w:r>
@@ -12521,7 +12599,7 @@
         <w:pStyle w:val="Compact"/>
         <w:numPr>
           <w:ilvl w:val="0"/>
-          <w:numId w:val="1532"/>
+          <w:numId w:val="1536"/>
         </w:numPr>
       </w:pPr>
       <w:r>
@@ -12543,7 +12621,7 @@
         <w:pStyle w:val="Compact"/>
         <w:numPr>
           <w:ilvl w:val="0"/>
-          <w:numId w:val="1533"/>
+          <w:numId w:val="1537"/>
         </w:numPr>
       </w:pPr>
       <w:r>
@@ -12555,7 +12633,7 @@
         <w:pStyle w:val="Compact"/>
         <w:numPr>
           <w:ilvl w:val="0"/>
-          <w:numId w:val="1534"/>
+          <w:numId w:val="1538"/>
         </w:numPr>
       </w:pPr>
       <w:r>
@@ -12582,7 +12660,7 @@
         <w:pStyle w:val="Compact"/>
         <w:numPr>
           <w:ilvl w:val="0"/>
-          <w:numId w:val="1535"/>
+          <w:numId w:val="1539"/>
         </w:numPr>
       </w:pPr>
       <w:r>
@@ -12609,7 +12687,7 @@
         <w:pStyle w:val="Compact"/>
         <w:numPr>
           <w:ilvl w:val="0"/>
-          <w:numId w:val="1536"/>
+          <w:numId w:val="1540"/>
         </w:numPr>
       </w:pPr>
       <w:r>
@@ -12636,7 +12714,7 @@
         <w:pStyle w:val="Compact"/>
         <w:numPr>
           <w:ilvl w:val="0"/>
-          <w:numId w:val="1537"/>
+          <w:numId w:val="1541"/>
         </w:numPr>
       </w:pPr>
       <w:r>
@@ -12648,7 +12726,7 @@
         <w:pStyle w:val="Compact"/>
         <w:numPr>
           <w:ilvl w:val="1"/>
-          <w:numId w:val="1538"/>
+          <w:numId w:val="1542"/>
         </w:numPr>
       </w:pPr>
       <w:r>
@@ -12660,7 +12738,7 @@
         <w:pStyle w:val="Compact"/>
         <w:numPr>
           <w:ilvl w:val="1"/>
-          <w:numId w:val="1538"/>
+          <w:numId w:val="1542"/>
         </w:numPr>
       </w:pPr>
       <w:r>
@@ -12672,7 +12750,7 @@
         <w:pStyle w:val="Compact"/>
         <w:numPr>
           <w:ilvl w:val="1"/>
-          <w:numId w:val="1538"/>
+          <w:numId w:val="1542"/>
         </w:numPr>
       </w:pPr>
       <w:r>
@@ -12684,7 +12762,7 @@
         <w:pStyle w:val="Compact"/>
         <w:numPr>
           <w:ilvl w:val="0"/>
-          <w:numId w:val="1539"/>
+          <w:numId w:val="1543"/>
         </w:numPr>
       </w:pPr>
       <w:r>
@@ -12696,7 +12774,7 @@
         <w:pStyle w:val="Compact"/>
         <w:numPr>
           <w:ilvl w:val="0"/>
-          <w:numId w:val="1540"/>
+          <w:numId w:val="1544"/>
         </w:numPr>
       </w:pPr>
       <w:r>
@@ -12708,7 +12786,7 @@
         <w:pStyle w:val="Compact"/>
         <w:numPr>
           <w:ilvl w:val="1"/>
-          <w:numId w:val="1541"/>
+          <w:numId w:val="1545"/>
         </w:numPr>
       </w:pPr>
       <w:r>
@@ -12720,7 +12798,7 @@
         <w:pStyle w:val="Compact"/>
         <w:numPr>
           <w:ilvl w:val="1"/>
-          <w:numId w:val="1541"/>
+          <w:numId w:val="1545"/>
         </w:numPr>
       </w:pPr>
       <w:r>
@@ -12732,7 +12810,7 @@
         <w:pStyle w:val="Compact"/>
         <w:numPr>
           <w:ilvl w:val="1"/>
-          <w:numId w:val="1541"/>
+          <w:numId w:val="1545"/>
         </w:numPr>
       </w:pPr>
       <w:r>
@@ -12744,7 +12822,7 @@
         <w:pStyle w:val="Compact"/>
         <w:numPr>
           <w:ilvl w:val="1"/>
-          <w:numId w:val="1541"/>
+          <w:numId w:val="1545"/>
         </w:numPr>
       </w:pPr>
       <w:r>
@@ -12756,7 +12834,7 @@
         <w:pStyle w:val="Compact"/>
         <w:numPr>
           <w:ilvl w:val="1"/>
-          <w:numId w:val="1541"/>
+          <w:numId w:val="1545"/>
         </w:numPr>
       </w:pPr>
       <w:r>
@@ -12768,7 +12846,7 @@
         <w:pStyle w:val="Compact"/>
         <w:numPr>
           <w:ilvl w:val="1"/>
-          <w:numId w:val="1541"/>
+          <w:numId w:val="1545"/>
         </w:numPr>
       </w:pPr>
       <w:r>
@@ -12780,7 +12858,7 @@
         <w:pStyle w:val="Compact"/>
         <w:numPr>
           <w:ilvl w:val="0"/>
-          <w:numId w:val="1542"/>
+          <w:numId w:val="1546"/>
         </w:numPr>
       </w:pPr>
       <w:r>
@@ -12792,7 +12870,7 @@
         <w:pStyle w:val="Compact"/>
         <w:numPr>
           <w:ilvl w:val="0"/>
-          <w:numId w:val="1543"/>
+          <w:numId w:val="1547"/>
         </w:numPr>
       </w:pPr>
       <w:r>
@@ -12804,7 +12882,7 @@
         <w:pStyle w:val="Compact"/>
         <w:numPr>
           <w:ilvl w:val="0"/>
-          <w:numId w:val="1544"/>
+          <w:numId w:val="1548"/>
         </w:numPr>
       </w:pPr>
       <w:r>
@@ -12826,7 +12904,7 @@
         <w:pStyle w:val="Compact"/>
         <w:numPr>
           <w:ilvl w:val="0"/>
-          <w:numId w:val="1545"/>
+          <w:numId w:val="1549"/>
         </w:numPr>
       </w:pPr>
       <w:r>
@@ -12838,7 +12916,7 @@
         <w:pStyle w:val="Compact"/>
         <w:numPr>
           <w:ilvl w:val="0"/>
-          <w:numId w:val="1546"/>
+          <w:numId w:val="1550"/>
         </w:numPr>
       </w:pPr>
       <w:r>
@@ -12850,7 +12928,7 @@
         <w:pStyle w:val="Compact"/>
         <w:numPr>
           <w:ilvl w:val="0"/>
-          <w:numId w:val="1547"/>
+          <w:numId w:val="1551"/>
         </w:numPr>
       </w:pPr>
       <w:r>
@@ -12862,7 +12940,7 @@
         <w:pStyle w:val="Compact"/>
         <w:numPr>
           <w:ilvl w:val="0"/>
-          <w:numId w:val="1548"/>
+          <w:numId w:val="1552"/>
         </w:numPr>
       </w:pPr>
       <w:r>
@@ -12874,7 +12952,7 @@
         <w:pStyle w:val="Compact"/>
         <w:numPr>
           <w:ilvl w:val="0"/>
-          <w:numId w:val="1549"/>
+          <w:numId w:val="1553"/>
         </w:numPr>
       </w:pPr>
       <w:r>
@@ -12886,7 +12964,7 @@
         <w:pStyle w:val="Compact"/>
         <w:numPr>
           <w:ilvl w:val="0"/>
-          <w:numId w:val="1550"/>
+          <w:numId w:val="1554"/>
         </w:numPr>
       </w:pPr>
       <w:r>
@@ -12908,7 +12986,7 @@
         <w:pStyle w:val="Compact"/>
         <w:numPr>
           <w:ilvl w:val="0"/>
-          <w:numId w:val="1551"/>
+          <w:numId w:val="1555"/>
         </w:numPr>
       </w:pPr>
       <w:r>
@@ -12920,7 +12998,7 @@
         <w:pStyle w:val="Compact"/>
         <w:numPr>
           <w:ilvl w:val="1"/>
-          <w:numId w:val="1552"/>
+          <w:numId w:val="1556"/>
         </w:numPr>
       </w:pPr>
       <w:r>
@@ -12932,7 +13010,7 @@
         <w:pStyle w:val="Compact"/>
         <w:numPr>
           <w:ilvl w:val="1"/>
-          <w:numId w:val="1552"/>
+          <w:numId w:val="1556"/>
         </w:numPr>
       </w:pPr>
       <w:r>
@@ -12944,7 +13022,7 @@
         <w:pStyle w:val="Compact"/>
         <w:numPr>
           <w:ilvl w:val="0"/>
-          <w:numId w:val="1553"/>
+          <w:numId w:val="1557"/>
         </w:numPr>
       </w:pPr>
       <w:r>
@@ -12956,7 +13034,7 @@
         <w:pStyle w:val="Compact"/>
         <w:numPr>
           <w:ilvl w:val="1"/>
-          <w:numId w:val="1554"/>
+          <w:numId w:val="1558"/>
         </w:numPr>
       </w:pPr>
       <w:r>
@@ -12968,7 +13046,7 @@
         <w:pStyle w:val="Compact"/>
         <w:numPr>
           <w:ilvl w:val="1"/>
-          <w:numId w:val="1554"/>
+          <w:numId w:val="1558"/>
         </w:numPr>
       </w:pPr>
       <w:r>
@@ -12980,7 +13058,7 @@
         <w:pStyle w:val="Compact"/>
         <w:numPr>
           <w:ilvl w:val="0"/>
-          <w:numId w:val="1555"/>
+          <w:numId w:val="1559"/>
         </w:numPr>
       </w:pPr>
       <w:r>
@@ -12992,7 +13070,7 @@
         <w:pStyle w:val="Compact"/>
         <w:numPr>
           <w:ilvl w:val="0"/>
-          <w:numId w:val="1556"/>
+          <w:numId w:val="1560"/>
         </w:numPr>
       </w:pPr>
       <w:r>
@@ -13004,7 +13082,7 @@
         <w:pStyle w:val="Compact"/>
         <w:numPr>
           <w:ilvl w:val="0"/>
-          <w:numId w:val="1557"/>
+          <w:numId w:val="1561"/>
         </w:numPr>
       </w:pPr>
       <w:r>
@@ -13016,7 +13094,7 @@
         <w:pStyle w:val="Compact"/>
         <w:numPr>
           <w:ilvl w:val="0"/>
-          <w:numId w:val="1558"/>
+          <w:numId w:val="1562"/>
         </w:numPr>
       </w:pPr>
       <w:r>
@@ -13038,7 +13116,7 @@
         <w:pStyle w:val="Compact"/>
         <w:numPr>
           <w:ilvl w:val="0"/>
-          <w:numId w:val="1559"/>
+          <w:numId w:val="1563"/>
         </w:numPr>
       </w:pPr>
       <w:r>
@@ -13050,7 +13128,7 @@
         <w:pStyle w:val="Compact"/>
         <w:numPr>
           <w:ilvl w:val="0"/>
-          <w:numId w:val="1560"/>
+          <w:numId w:val="1564"/>
         </w:numPr>
       </w:pPr>
       <w:r>
@@ -13062,7 +13140,7 @@
         <w:pStyle w:val="Compact"/>
         <w:numPr>
           <w:ilvl w:val="0"/>
-          <w:numId w:val="1561"/>
+          <w:numId w:val="1565"/>
         </w:numPr>
       </w:pPr>
       <w:r>
@@ -13074,7 +13152,7 @@
         <w:pStyle w:val="Compact"/>
         <w:numPr>
           <w:ilvl w:val="0"/>
-          <w:numId w:val="1562"/>
+          <w:numId w:val="1566"/>
         </w:numPr>
       </w:pPr>
       <w:r>
@@ -13086,7 +13164,7 @@
         <w:pStyle w:val="Compact"/>
         <w:numPr>
           <w:ilvl w:val="0"/>
-          <w:numId w:val="1563"/>
+          <w:numId w:val="1567"/>
         </w:numPr>
       </w:pPr>
       <w:r>
@@ -13098,7 +13176,7 @@
         <w:pStyle w:val="Compact"/>
         <w:numPr>
           <w:ilvl w:val="0"/>
-          <w:numId w:val="1564"/>
+          <w:numId w:val="1568"/>
         </w:numPr>
       </w:pPr>
       <w:r>
@@ -13110,7 +13188,7 @@
         <w:pStyle w:val="Compact"/>
         <w:numPr>
           <w:ilvl w:val="0"/>
-          <w:numId w:val="1565"/>
+          <w:numId w:val="1569"/>
         </w:numPr>
       </w:pPr>
       <w:r>
@@ -13122,7 +13200,7 @@
         <w:pStyle w:val="Compact"/>
         <w:numPr>
           <w:ilvl w:val="0"/>
-          <w:numId w:val="1566"/>
+          <w:numId w:val="1570"/>
         </w:numPr>
       </w:pPr>
       <w:r>
@@ -13134,7 +13212,7 @@
         <w:pStyle w:val="Compact"/>
         <w:numPr>
           <w:ilvl w:val="0"/>
-          <w:numId w:val="1567"/>
+          <w:numId w:val="1571"/>
         </w:numPr>
       </w:pPr>
       <w:r>
@@ -13156,7 +13234,7 @@
         <w:pStyle w:val="Compact"/>
         <w:numPr>
           <w:ilvl w:val="0"/>
-          <w:numId w:val="1568"/>
+          <w:numId w:val="1572"/>
         </w:numPr>
       </w:pPr>
       <w:r>
@@ -13168,7 +13246,7 @@
         <w:pStyle w:val="Compact"/>
         <w:numPr>
           <w:ilvl w:val="0"/>
-          <w:numId w:val="1569"/>
+          <w:numId w:val="1573"/>
         </w:numPr>
       </w:pPr>
       <w:r>
@@ -13180,7 +13258,7 @@
         <w:pStyle w:val="Compact"/>
         <w:numPr>
           <w:ilvl w:val="0"/>
-          <w:numId w:val="1570"/>
+          <w:numId w:val="1574"/>
         </w:numPr>
       </w:pPr>
       <w:r>
@@ -13192,7 +13270,7 @@
         <w:pStyle w:val="Compact"/>
         <w:numPr>
           <w:ilvl w:val="0"/>
-          <w:numId w:val="1571"/>
+          <w:numId w:val="1575"/>
         </w:numPr>
       </w:pPr>
       <w:r>
@@ -13204,7 +13282,7 @@
         <w:pStyle w:val="Compact"/>
         <w:numPr>
           <w:ilvl w:val="0"/>
-          <w:numId w:val="1572"/>
+          <w:numId w:val="1576"/>
         </w:numPr>
       </w:pPr>
       <w:r>
@@ -13216,7 +13294,7 @@
         <w:pStyle w:val="Compact"/>
         <w:numPr>
           <w:ilvl w:val="0"/>
-          <w:numId w:val="1573"/>
+          <w:numId w:val="1577"/>
         </w:numPr>
       </w:pPr>
       <w:r>
@@ -13228,7 +13306,7 @@
         <w:pStyle w:val="Compact"/>
         <w:numPr>
           <w:ilvl w:val="0"/>
-          <w:numId w:val="1574"/>
+          <w:numId w:val="1578"/>
         </w:numPr>
       </w:pPr>
       <w:r>
@@ -13240,7 +13318,7 @@
         <w:pStyle w:val="Compact"/>
         <w:numPr>
           <w:ilvl w:val="0"/>
-          <w:numId w:val="1575"/>
+          <w:numId w:val="1579"/>
         </w:numPr>
       </w:pPr>
       <w:r>
@@ -13252,7 +13330,7 @@
         <w:pStyle w:val="Compact"/>
         <w:numPr>
           <w:ilvl w:val="0"/>
-          <w:numId w:val="1576"/>
+          <w:numId w:val="1580"/>
         </w:numPr>
       </w:pPr>
       <w:r>
@@ -13264,7 +13342,7 @@
         <w:pStyle w:val="Compact"/>
         <w:numPr>
           <w:ilvl w:val="0"/>
-          <w:numId w:val="1577"/>
+          <w:numId w:val="1581"/>
         </w:numPr>
       </w:pPr>
       <w:r>
@@ -13291,7 +13369,7 @@
         <w:pStyle w:val="Compact"/>
         <w:numPr>
           <w:ilvl w:val="0"/>
-          <w:numId w:val="1578"/>
+          <w:numId w:val="1582"/>
         </w:numPr>
       </w:pPr>
       <w:r>
@@ -13312,7 +13390,7 @@
         <w:pStyle w:val="Compact"/>
         <w:numPr>
           <w:ilvl w:val="0"/>
-          <w:numId w:val="1579"/>
+          <w:numId w:val="1583"/>
         </w:numPr>
       </w:pPr>
       <w:r>
@@ -13334,7 +13412,7 @@
         <w:pStyle w:val="Compact"/>
         <w:numPr>
           <w:ilvl w:val="0"/>
-          <w:numId w:val="1580"/>
+          <w:numId w:val="1584"/>
         </w:numPr>
       </w:pPr>
       <w:r>
@@ -13346,7 +13424,7 @@
         <w:pStyle w:val="Compact"/>
         <w:numPr>
           <w:ilvl w:val="0"/>
-          <w:numId w:val="1581"/>
+          <w:numId w:val="1585"/>
         </w:numPr>
       </w:pPr>
       <w:r>
@@ -13358,7 +13436,7 @@
         <w:pStyle w:val="Compact"/>
         <w:numPr>
           <w:ilvl w:val="0"/>
-          <w:numId w:val="1582"/>
+          <w:numId w:val="1586"/>
         </w:numPr>
       </w:pPr>
       <w:r>
@@ -13370,7 +13448,7 @@
         <w:pStyle w:val="Compact"/>
         <w:numPr>
           <w:ilvl w:val="0"/>
-          <w:numId w:val="1583"/>
+          <w:numId w:val="1587"/>
         </w:numPr>
       </w:pPr>
       <w:r>
@@ -13382,7 +13460,7 @@
         <w:pStyle w:val="Compact"/>
         <w:numPr>
           <w:ilvl w:val="0"/>
-          <w:numId w:val="1584"/>
+          <w:numId w:val="1588"/>
         </w:numPr>
       </w:pPr>
       <w:r>
@@ -13394,7 +13472,7 @@
         <w:pStyle w:val="Compact"/>
         <w:numPr>
           <w:ilvl w:val="0"/>
-          <w:numId w:val="1585"/>
+          <w:numId w:val="1589"/>
         </w:numPr>
       </w:pPr>
       <w:r>
@@ -13406,7 +13484,7 @@
         <w:pStyle w:val="Compact"/>
         <w:numPr>
           <w:ilvl w:val="0"/>
-          <w:numId w:val="1586"/>
+          <w:numId w:val="1590"/>
         </w:numPr>
       </w:pPr>
       <w:r>
@@ -13418,7 +13496,7 @@
         <w:pStyle w:val="Compact"/>
         <w:numPr>
           <w:ilvl w:val="0"/>
-          <w:numId w:val="1587"/>
+          <w:numId w:val="1591"/>
         </w:numPr>
       </w:pPr>
       <w:r>
@@ -13440,7 +13518,7 @@
         <w:pStyle w:val="Compact"/>
         <w:numPr>
           <w:ilvl w:val="0"/>
-          <w:numId w:val="1588"/>
+          <w:numId w:val="1592"/>
         </w:numPr>
       </w:pPr>
       <w:r>
@@ -13452,7 +13530,7 @@
         <w:pStyle w:val="Compact"/>
         <w:numPr>
           <w:ilvl w:val="0"/>
-          <w:numId w:val="1589"/>
+          <w:numId w:val="1593"/>
         </w:numPr>
       </w:pPr>
       <w:r>
@@ -13464,7 +13542,7 @@
         <w:pStyle w:val="Compact"/>
         <w:numPr>
           <w:ilvl w:val="0"/>
-          <w:numId w:val="1590"/>
+          <w:numId w:val="1594"/>
         </w:numPr>
       </w:pPr>
       <w:r>
@@ -13476,7 +13554,7 @@
         <w:pStyle w:val="Compact"/>
         <w:numPr>
           <w:ilvl w:val="0"/>
-          <w:numId w:val="1591"/>
+          <w:numId w:val="1595"/>
         </w:numPr>
       </w:pPr>
       <w:r>
@@ -13488,7 +13566,7 @@
         <w:pStyle w:val="Compact"/>
         <w:numPr>
           <w:ilvl w:val="0"/>
-          <w:numId w:val="1592"/>
+          <w:numId w:val="1596"/>
         </w:numPr>
       </w:pPr>
       <w:r>
@@ -13500,7 +13578,7 @@
         <w:pStyle w:val="Compact"/>
         <w:numPr>
           <w:ilvl w:val="0"/>
-          <w:numId w:val="1593"/>
+          <w:numId w:val="1597"/>
         </w:numPr>
       </w:pPr>
       <w:r>
@@ -13512,7 +13590,7 @@
         <w:pStyle w:val="Compact"/>
         <w:numPr>
           <w:ilvl w:val="0"/>
-          <w:numId w:val="1594"/>
+          <w:numId w:val="1598"/>
         </w:numPr>
       </w:pPr>
       <w:r>
@@ -13524,7 +13602,7 @@
         <w:pStyle w:val="Compact"/>
         <w:numPr>
           <w:ilvl w:val="0"/>
-          <w:numId w:val="1595"/>
+          <w:numId w:val="1599"/>
         </w:numPr>
       </w:pPr>
       <w:r>
@@ -13536,7 +13614,7 @@
         <w:pStyle w:val="Compact"/>
         <w:numPr>
           <w:ilvl w:val="0"/>
-          <w:numId w:val="1596"/>
+          <w:numId w:val="1600"/>
         </w:numPr>
       </w:pPr>
       <w:r>
@@ -13548,7 +13626,7 @@
         <w:pStyle w:val="Compact"/>
         <w:numPr>
           <w:ilvl w:val="0"/>
-          <w:numId w:val="1597"/>
+          <w:numId w:val="1601"/>
         </w:numPr>
       </w:pPr>
       <w:r>
@@ -13560,7 +13638,7 @@
         <w:pStyle w:val="Compact"/>
         <w:numPr>
           <w:ilvl w:val="0"/>
-          <w:numId w:val="1598"/>
+          <w:numId w:val="1602"/>
         </w:numPr>
       </w:pPr>
       <w:r>
@@ -13572,7 +13650,7 @@
         <w:pStyle w:val="Compact"/>
         <w:numPr>
           <w:ilvl w:val="0"/>
-          <w:numId w:val="1599"/>
+          <w:numId w:val="1603"/>
         </w:numPr>
       </w:pPr>
       <w:r>
@@ -13584,7 +13662,7 @@
         <w:pStyle w:val="Compact"/>
         <w:numPr>
           <w:ilvl w:val="0"/>
-          <w:numId w:val="1600"/>
+          <w:numId w:val="1604"/>
         </w:numPr>
       </w:pPr>
       <w:r>
@@ -13596,7 +13674,7 @@
         <w:pStyle w:val="Compact"/>
         <w:numPr>
           <w:ilvl w:val="0"/>
-          <w:numId w:val="1601"/>
+          <w:numId w:val="1605"/>
         </w:numPr>
       </w:pPr>
       <w:r>
@@ -13608,7 +13686,7 @@
         <w:pStyle w:val="Compact"/>
         <w:numPr>
           <w:ilvl w:val="0"/>
-          <w:numId w:val="1602"/>
+          <w:numId w:val="1606"/>
         </w:numPr>
       </w:pPr>
       <w:r>
@@ -13640,7 +13718,7 @@
         <w:pStyle w:val="Compact"/>
         <w:numPr>
           <w:ilvl w:val="0"/>
-          <w:numId w:val="1603"/>
+          <w:numId w:val="1607"/>
         </w:numPr>
       </w:pPr>
       <w:r>
@@ -13652,7 +13730,7 @@
         <w:pStyle w:val="Compact"/>
         <w:numPr>
           <w:ilvl w:val="0"/>
-          <w:numId w:val="1604"/>
+          <w:numId w:val="1608"/>
         </w:numPr>
       </w:pPr>
       <w:r>
@@ -13664,7 +13742,7 @@
         <w:pStyle w:val="Compact"/>
         <w:numPr>
           <w:ilvl w:val="0"/>
-          <w:numId w:val="1605"/>
+          <w:numId w:val="1609"/>
         </w:numPr>
       </w:pPr>
       <w:r>
@@ -13676,7 +13754,7 @@
         <w:pStyle w:val="Compact"/>
         <w:numPr>
           <w:ilvl w:val="0"/>
-          <w:numId w:val="1606"/>
+          <w:numId w:val="1610"/>
         </w:numPr>
       </w:pPr>
       <w:r>
@@ -13688,7 +13766,7 @@
         <w:pStyle w:val="Compact"/>
         <w:numPr>
           <w:ilvl w:val="0"/>
-          <w:numId w:val="1607"/>
+          <w:numId w:val="1611"/>
         </w:numPr>
       </w:pPr>
       <w:r>
@@ -13700,7 +13778,7 @@
         <w:pStyle w:val="Compact"/>
         <w:numPr>
           <w:ilvl w:val="0"/>
-          <w:numId w:val="1608"/>
+          <w:numId w:val="1612"/>
         </w:numPr>
       </w:pPr>
       <w:r>
@@ -13712,7 +13790,7 @@
         <w:pStyle w:val="Compact"/>
         <w:numPr>
           <w:ilvl w:val="0"/>
-          <w:numId w:val="1609"/>
+          <w:numId w:val="1613"/>
         </w:numPr>
       </w:pPr>
       <w:r>
@@ -13724,7 +13802,7 @@
         <w:pStyle w:val="Compact"/>
         <w:numPr>
           <w:ilvl w:val="0"/>
-          <w:numId w:val="1610"/>
+          <w:numId w:val="1614"/>
         </w:numPr>
       </w:pPr>
       <w:r>
@@ -13736,7 +13814,7 @@
         <w:pStyle w:val="Compact"/>
         <w:numPr>
           <w:ilvl w:val="0"/>
-          <w:numId w:val="1611"/>
+          <w:numId w:val="1615"/>
         </w:numPr>
       </w:pPr>
       <w:r>
@@ -13748,7 +13826,7 @@
         <w:pStyle w:val="Compact"/>
         <w:numPr>
           <w:ilvl w:val="0"/>
-          <w:numId w:val="1612"/>
+          <w:numId w:val="1616"/>
         </w:numPr>
       </w:pPr>
       <w:r>
@@ -13760,7 +13838,7 @@
         <w:pStyle w:val="Compact"/>
         <w:numPr>
           <w:ilvl w:val="0"/>
-          <w:numId w:val="1613"/>
+          <w:numId w:val="1617"/>
         </w:numPr>
       </w:pPr>
       <w:r>
@@ -13772,7 +13850,7 @@
         <w:pStyle w:val="Compact"/>
         <w:numPr>
           <w:ilvl w:val="0"/>
-          <w:numId w:val="1614"/>
+          <w:numId w:val="1618"/>
         </w:numPr>
       </w:pPr>
       <w:r>
@@ -13784,7 +13862,7 @@
         <w:pStyle w:val="Compact"/>
         <w:numPr>
           <w:ilvl w:val="0"/>
-          <w:numId w:val="1615"/>
+          <w:numId w:val="1619"/>
         </w:numPr>
       </w:pPr>
       <w:r>
@@ -13821,7 +13899,7 @@
         <w:pStyle w:val="Compact"/>
         <w:numPr>
           <w:ilvl w:val="0"/>
-          <w:numId w:val="1616"/>
+          <w:numId w:val="1620"/>
         </w:numPr>
       </w:pPr>
       <w:r>
@@ -13833,7 +13911,7 @@
         <w:pStyle w:val="Compact"/>
         <w:numPr>
           <w:ilvl w:val="0"/>
-          <w:numId w:val="1617"/>
+          <w:numId w:val="1621"/>
         </w:numPr>
       </w:pPr>
       <w:r>
@@ -13860,7 +13938,7 @@
         <w:pStyle w:val="Compact"/>
         <w:numPr>
           <w:ilvl w:val="0"/>
-          <w:numId w:val="1618"/>
+          <w:numId w:val="1622"/>
         </w:numPr>
       </w:pPr>
       <w:r>
@@ -13872,7 +13950,7 @@
         <w:pStyle w:val="Compact"/>
         <w:numPr>
           <w:ilvl w:val="0"/>
-          <w:numId w:val="1619"/>
+          <w:numId w:val="1623"/>
         </w:numPr>
       </w:pPr>
       <w:r>
@@ -13884,7 +13962,7 @@
         <w:pStyle w:val="Compact"/>
         <w:numPr>
           <w:ilvl w:val="0"/>
-          <w:numId w:val="1620"/>
+          <w:numId w:val="1624"/>
         </w:numPr>
       </w:pPr>
       <w:r>
@@ -13896,7 +13974,7 @@
         <w:pStyle w:val="Compact"/>
         <w:numPr>
           <w:ilvl w:val="0"/>
-          <w:numId w:val="1621"/>
+          <w:numId w:val="1625"/>
         </w:numPr>
       </w:pPr>
       <w:r>
@@ -13908,7 +13986,7 @@
         <w:pStyle w:val="Compact"/>
         <w:numPr>
           <w:ilvl w:val="0"/>
-          <w:numId w:val="1622"/>
+          <w:numId w:val="1626"/>
         </w:numPr>
       </w:pPr>
       <w:r>
@@ -13920,7 +13998,7 @@
         <w:pStyle w:val="Compact"/>
         <w:numPr>
           <w:ilvl w:val="0"/>
-          <w:numId w:val="1623"/>
+          <w:numId w:val="1627"/>
         </w:numPr>
       </w:pPr>
       <w:r>
@@ -13942,7 +14020,7 @@
         <w:pStyle w:val="Compact"/>
         <w:numPr>
           <w:ilvl w:val="0"/>
-          <w:numId w:val="1624"/>
+          <w:numId w:val="1628"/>
         </w:numPr>
       </w:pPr>
       <w:r>
@@ -13954,7 +14032,7 @@
         <w:pStyle w:val="Compact"/>
         <w:numPr>
           <w:ilvl w:val="0"/>
-          <w:numId w:val="1625"/>
+          <w:numId w:val="1629"/>
         </w:numPr>
       </w:pPr>
       <w:r>
@@ -13966,7 +14044,7 @@
         <w:pStyle w:val="Compact"/>
         <w:numPr>
           <w:ilvl w:val="0"/>
-          <w:numId w:val="1626"/>
+          <w:numId w:val="1630"/>
         </w:numPr>
       </w:pPr>
       <w:r>
@@ -13978,7 +14056,7 @@
         <w:pStyle w:val="Compact"/>
         <w:numPr>
           <w:ilvl w:val="0"/>
-          <w:numId w:val="1627"/>
+          <w:numId w:val="1631"/>
         </w:numPr>
       </w:pPr>
       <w:r>
@@ -13990,7 +14068,7 @@
         <w:pStyle w:val="Compact"/>
         <w:numPr>
           <w:ilvl w:val="0"/>
-          <w:numId w:val="1628"/>
+          <w:numId w:val="1632"/>
         </w:numPr>
       </w:pPr>
       <w:r>
@@ -14002,7 +14080,7 @@
         <w:pStyle w:val="Compact"/>
         <w:numPr>
           <w:ilvl w:val="0"/>
-          <w:numId w:val="1629"/>
+          <w:numId w:val="1633"/>
         </w:numPr>
       </w:pPr>
       <w:r>
@@ -14014,7 +14092,7 @@
         <w:pStyle w:val="Compact"/>
         <w:numPr>
           <w:ilvl w:val="0"/>
-          <w:numId w:val="1630"/>
+          <w:numId w:val="1634"/>
         </w:numPr>
       </w:pPr>
       <w:r>
@@ -14026,7 +14104,7 @@
         <w:pStyle w:val="Compact"/>
         <w:numPr>
           <w:ilvl w:val="0"/>
-          <w:numId w:val="1631"/>
+          <w:numId w:val="1635"/>
         </w:numPr>
       </w:pPr>
       <w:r>
@@ -14038,7 +14116,7 @@
         <w:pStyle w:val="Compact"/>
         <w:numPr>
           <w:ilvl w:val="0"/>
-          <w:numId w:val="1632"/>
+          <w:numId w:val="1636"/>
         </w:numPr>
       </w:pPr>
       <w:r>
@@ -14061,7 +14139,7 @@
         <w:pStyle w:val="Compact"/>
         <w:numPr>
           <w:ilvl w:val="0"/>
-          <w:numId w:val="1633"/>
+          <w:numId w:val="1637"/>
         </w:numPr>
       </w:pPr>
       <w:r>
@@ -14073,7 +14151,7 @@
         <w:pStyle w:val="Compact"/>
         <w:numPr>
           <w:ilvl w:val="0"/>
-          <w:numId w:val="1634"/>
+          <w:numId w:val="1638"/>
         </w:numPr>
       </w:pPr>
       <w:r>
@@ -14085,7 +14163,7 @@
         <w:pStyle w:val="Compact"/>
         <w:numPr>
           <w:ilvl w:val="0"/>
-          <w:numId w:val="1635"/>
+          <w:numId w:val="1639"/>
         </w:numPr>
       </w:pPr>
       <w:r>
@@ -14097,7 +14175,7 @@
         <w:pStyle w:val="Compact"/>
         <w:numPr>
           <w:ilvl w:val="0"/>
-          <w:numId w:val="1636"/>
+          <w:numId w:val="1640"/>
         </w:numPr>
       </w:pPr>
       <w:r>
@@ -14109,7 +14187,7 @@
         <w:pStyle w:val="Compact"/>
         <w:numPr>
           <w:ilvl w:val="0"/>
-          <w:numId w:val="1637"/>
+          <w:numId w:val="1641"/>
         </w:numPr>
       </w:pPr>
       <w:r>
@@ -14121,7 +14199,7 @@
         <w:pStyle w:val="Compact"/>
         <w:numPr>
           <w:ilvl w:val="0"/>
-          <w:numId w:val="1638"/>
+          <w:numId w:val="1642"/>
         </w:numPr>
       </w:pPr>
       <w:r>
@@ -14133,7 +14211,7 @@
         <w:pStyle w:val="Compact"/>
         <w:numPr>
           <w:ilvl w:val="0"/>
-          <w:numId w:val="1639"/>
+          <w:numId w:val="1643"/>
         </w:numPr>
       </w:pPr>
       <w:r>
@@ -14145,7 +14223,7 @@
         <w:pStyle w:val="Compact"/>
         <w:numPr>
           <w:ilvl w:val="0"/>
-          <w:numId w:val="1640"/>
+          <w:numId w:val="1644"/>
         </w:numPr>
       </w:pPr>
       <w:r>
@@ -14157,7 +14235,7 @@
         <w:pStyle w:val="Compact"/>
         <w:numPr>
           <w:ilvl w:val="0"/>
-          <w:numId w:val="1641"/>
+          <w:numId w:val="1645"/>
         </w:numPr>
       </w:pPr>
       <w:r>
@@ -14169,7 +14247,7 @@
         <w:pStyle w:val="Compact"/>
         <w:numPr>
           <w:ilvl w:val="0"/>
-          <w:numId w:val="1642"/>
+          <w:numId w:val="1646"/>
         </w:numPr>
       </w:pPr>
       <w:r>
@@ -14181,7 +14259,7 @@
         <w:pStyle w:val="Compact"/>
         <w:numPr>
           <w:ilvl w:val="0"/>
-          <w:numId w:val="1643"/>
+          <w:numId w:val="1647"/>
         </w:numPr>
       </w:pPr>
       <w:r>
@@ -15759,23 +15837,23 @@
     <w:abstractNumId w:val="993"/>
   </w:num>
   <w:num w:numId="1353">
-    <w:abstractNumId w:val="992"/>
+    <w:abstractNumId w:val="993"/>
   </w:num>
   <w:num w:numId="1354">
     <w:abstractNumId w:val="993"/>
   </w:num>
   <w:num w:numId="1355">
-    <w:abstractNumId w:val="993"/>
+    <w:abstractNumId w:val="992"/>
   </w:num>
   <w:num w:numId="1356">
+    <w:abstractNumId w:val="993"/>
+  </w:num>
+  <w:num w:numId="1357">
+    <w:abstractNumId w:val="993"/>
+  </w:num>
+  <w:num w:numId="1358">
     <w:abstractNumId w:val="991"/>
   </w:num>
-  <w:num w:numId="1357">
-    <w:abstractNumId w:val="993"/>
-  </w:num>
-  <w:num w:numId="1358">
-    <w:abstractNumId w:val="993"/>
-  </w:num>
   <w:num w:numId="1359">
     <w:abstractNumId w:val="993"/>
   </w:num>
@@ -15792,19 +15870,19 @@
     <w:abstractNumId w:val="993"/>
   </w:num>
   <w:num w:numId="1364">
-    <w:abstractNumId w:val="992"/>
+    <w:abstractNumId w:val="993"/>
   </w:num>
   <w:num w:numId="1365">
     <w:abstractNumId w:val="993"/>
   </w:num>
   <w:num w:numId="1366">
-    <w:abstractNumId w:val="992"/>
+    <w:abstractNumId w:val="993"/>
   </w:num>
   <w:num w:numId="1367">
     <w:abstractNumId w:val="993"/>
   </w:num>
   <w:num w:numId="1368">
-    <w:abstractNumId w:val="993"/>
+    <w:abstractNumId w:val="992"/>
   </w:num>
   <w:num w:numId="1369">
     <w:abstractNumId w:val="993"/>
@@ -15816,19 +15894,19 @@
     <w:abstractNumId w:val="993"/>
   </w:num>
   <w:num w:numId="1372">
+    <w:abstractNumId w:val="993"/>
+  </w:num>
+  <w:num w:numId="1373">
+    <w:abstractNumId w:val="993"/>
+  </w:num>
+  <w:num w:numId="1374">
     <w:abstractNumId w:val="991"/>
   </w:num>
-  <w:num w:numId="1373">
-    <w:abstractNumId w:val="993"/>
-  </w:num>
-  <w:num w:numId="1374">
-    <w:abstractNumId w:val="993"/>
-  </w:num>
   <w:num w:numId="1375">
     <w:abstractNumId w:val="993"/>
   </w:num>
   <w:num w:numId="1376">
-    <w:abstractNumId w:val="992"/>
+    <w:abstractNumId w:val="993"/>
   </w:num>
   <w:num w:numId="1377">
     <w:abstractNumId w:val="993"/>
@@ -15837,22 +15915,22 @@
     <w:abstractNumId w:val="993"/>
   </w:num>
   <w:num w:numId="1379">
-    <w:abstractNumId w:val="993"/>
+    <w:abstractNumId w:val="992"/>
   </w:num>
   <w:num w:numId="1380">
     <w:abstractNumId w:val="993"/>
   </w:num>
   <w:num w:numId="1381">
-    <w:abstractNumId w:val="992"/>
+    <w:abstractNumId w:val="993"/>
   </w:num>
   <w:num w:numId="1382">
-    <w:abstractNumId w:val="992"/>
+    <w:abstractNumId w:val="993"/>
   </w:num>
   <w:num w:numId="1383">
     <w:abstractNumId w:val="993"/>
   </w:num>
   <w:num w:numId="1384">
-    <w:abstractNumId w:val="992"/>
+    <w:abstractNumId w:val="993"/>
   </w:num>
   <w:num w:numId="1385">
     <w:abstractNumId w:val="992"/>
@@ -15861,7 +15939,7 @@
     <w:abstractNumId w:val="992"/>
   </w:num>
   <w:num w:numId="1387">
-    <w:abstractNumId w:val="992"/>
+    <w:abstractNumId w:val="993"/>
   </w:num>
   <w:num w:numId="1388">
     <w:abstractNumId w:val="992"/>
@@ -15939,22 +16017,22 @@
     <w:abstractNumId w:val="992"/>
   </w:num>
   <w:num w:numId="1413">
-    <w:abstractNumId w:val="993"/>
+    <w:abstractNumId w:val="992"/>
   </w:num>
   <w:num w:numId="1414">
-    <w:abstractNumId w:val="993"/>
+    <w:abstractNumId w:val="992"/>
   </w:num>
   <w:num w:numId="1415">
-    <w:abstractNumId w:val="993"/>
+    <w:abstractNumId w:val="992"/>
   </w:num>
   <w:num w:numId="1416">
-    <w:abstractNumId w:val="993"/>
+    <w:abstractNumId w:val="992"/>
   </w:num>
   <w:num w:numId="1417">
-    <w:abstractNumId w:val="992"/>
+    <w:abstractNumId w:val="993"/>
   </w:num>
   <w:num w:numId="1418">
-    <w:abstractNumId w:val="992"/>
+    <w:abstractNumId w:val="993"/>
   </w:num>
   <w:num w:numId="1419">
     <w:abstractNumId w:val="993"/>
@@ -15963,10 +16041,10 @@
     <w:abstractNumId w:val="993"/>
   </w:num>
   <w:num w:numId="1421">
-    <w:abstractNumId w:val="993"/>
+    <w:abstractNumId w:val="992"/>
   </w:num>
   <w:num w:numId="1422">
-    <w:abstractNumId w:val="993"/>
+    <w:abstractNumId w:val="992"/>
   </w:num>
   <w:num w:numId="1423">
     <w:abstractNumId w:val="993"/>
@@ -15999,34 +16077,34 @@
     <w:abstractNumId w:val="993"/>
   </w:num>
   <w:num w:numId="1433">
-    <w:abstractNumId w:val="992"/>
+    <w:abstractNumId w:val="993"/>
   </w:num>
   <w:num w:numId="1434">
+    <w:abstractNumId w:val="993"/>
+  </w:num>
+  <w:num w:numId="1435">
+    <w:abstractNumId w:val="993"/>
+  </w:num>
+  <w:num w:numId="1436">
+    <w:abstractNumId w:val="993"/>
+  </w:num>
+  <w:num w:numId="1437">
+    <w:abstractNumId w:val="992"/>
+  </w:num>
+  <w:num w:numId="1438">
     <w:abstractNumId w:val="991"/>
   </w:num>
-  <w:num w:numId="1435">
-    <w:abstractNumId w:val="993"/>
-  </w:num>
-  <w:num w:numId="1436">
-    <w:abstractNumId w:val="993"/>
-  </w:num>
-  <w:num w:numId="1437">
-    <w:abstractNumId w:val="992"/>
-  </w:num>
-  <w:num w:numId="1438">
-    <w:abstractNumId w:val="992"/>
-  </w:num>
   <w:num w:numId="1439">
-    <w:abstractNumId w:val="992"/>
+    <w:abstractNumId w:val="993"/>
   </w:num>
   <w:num w:numId="1440">
-    <w:abstractNumId w:val="992"/>
+    <w:abstractNumId w:val="993"/>
   </w:num>
   <w:num w:numId="1441">
     <w:abstractNumId w:val="992"/>
   </w:num>
   <w:num w:numId="1442">
-    <w:abstractNumId w:val="993"/>
+    <w:abstractNumId w:val="992"/>
   </w:num>
   <w:num w:numId="1443">
     <w:abstractNumId w:val="992"/>
@@ -16035,16 +16113,16 @@
     <w:abstractNumId w:val="992"/>
   </w:num>
   <w:num w:numId="1445">
-    <w:abstractNumId w:val="993"/>
+    <w:abstractNumId w:val="992"/>
   </w:num>
   <w:num w:numId="1446">
     <w:abstractNumId w:val="993"/>
   </w:num>
   <w:num w:numId="1447">
-    <w:abstractNumId w:val="993"/>
+    <w:abstractNumId w:val="992"/>
   </w:num>
   <w:num w:numId="1448">
-    <w:abstractNumId w:val="993"/>
+    <w:abstractNumId w:val="992"/>
   </w:num>
   <w:num w:numId="1449">
     <w:abstractNumId w:val="993"/>
@@ -16077,7 +16155,7 @@
     <w:abstractNumId w:val="993"/>
   </w:num>
   <w:num w:numId="1459">
-    <w:abstractNumId w:val="991"/>
+    <w:abstractNumId w:val="993"/>
   </w:num>
   <w:num w:numId="1460">
     <w:abstractNumId w:val="993"/>
@@ -16098,35 +16176,35 @@
     <w:abstractNumId w:val="993"/>
   </w:num>
   <w:num w:numId="1466">
-    <w:abstractNumId w:val="992"/>
+    <w:abstractNumId w:val="993"/>
   </w:num>
   <w:num w:numId="1467">
-    <w:abstractNumId w:val="992"/>
+    <w:abstractNumId w:val="991"/>
   </w:num>
   <w:num w:numId="1468">
     <w:abstractNumId w:val="993"/>
   </w:num>
   <w:num w:numId="1469">
+    <w:abstractNumId w:val="993"/>
+  </w:num>
+  <w:num w:numId="1470">
+    <w:abstractNumId w:val="992"/>
+  </w:num>
+  <w:num w:numId="1471">
+    <w:abstractNumId w:val="992"/>
+  </w:num>
+  <w:num w:numId="1472">
+    <w:abstractNumId w:val="993"/>
+  </w:num>
+  <w:num w:numId="1473">
     <w:abstractNumId w:val="991"/>
   </w:num>
-  <w:num w:numId="1470">
-    <w:abstractNumId w:val="993"/>
-  </w:num>
-  <w:num w:numId="1471">
+  <w:num w:numId="1474">
+    <w:abstractNumId w:val="993"/>
+  </w:num>
+  <w:num w:numId="1475">
     <w:abstractNumId w:val="991"/>
   </w:num>
-  <w:num w:numId="1472">
-    <w:abstractNumId w:val="993"/>
-  </w:num>
-  <w:num w:numId="1473">
-    <w:abstractNumId w:val="993"/>
-  </w:num>
-  <w:num w:numId="1474">
-    <w:abstractNumId w:val="993"/>
-  </w:num>
-  <w:num w:numId="1475">
-    <w:abstractNumId w:val="993"/>
-  </w:num>
   <w:num w:numId="1476">
     <w:abstractNumId w:val="993"/>
   </w:num>
@@ -16143,20 +16221,20 @@
     <w:abstractNumId w:val="993"/>
   </w:num>
   <w:num w:numId="1481">
+    <w:abstractNumId w:val="993"/>
+  </w:num>
+  <w:num w:numId="1482">
+    <w:abstractNumId w:val="993"/>
+  </w:num>
+  <w:num w:numId="1483">
+    <w:abstractNumId w:val="993"/>
+  </w:num>
+  <w:num w:numId="1484">
+    <w:abstractNumId w:val="993"/>
+  </w:num>
+  <w:num w:numId="1485">
     <w:abstractNumId w:val="991"/>
   </w:num>
-  <w:num w:numId="1482">
-    <w:abstractNumId w:val="993"/>
-  </w:num>
-  <w:num w:numId="1483">
-    <w:abstractNumId w:val="993"/>
-  </w:num>
-  <w:num w:numId="1484">
-    <w:abstractNumId w:val="992"/>
-  </w:num>
-  <w:num w:numId="1485">
-    <w:abstractNumId w:val="992"/>
-  </w:num>
   <w:num w:numId="1486">
     <w:abstractNumId w:val="993"/>
   </w:num>
@@ -16164,22 +16242,22 @@
     <w:abstractNumId w:val="993"/>
   </w:num>
   <w:num w:numId="1488">
-    <w:abstractNumId w:val="993"/>
+    <w:abstractNumId w:val="992"/>
   </w:num>
   <w:num w:numId="1489">
     <w:abstractNumId w:val="992"/>
   </w:num>
   <w:num w:numId="1490">
-    <w:abstractNumId w:val="992"/>
+    <w:abstractNumId w:val="993"/>
   </w:num>
   <w:num w:numId="1491">
-    <w:abstractNumId w:val="992"/>
+    <w:abstractNumId w:val="993"/>
   </w:num>
   <w:num w:numId="1492">
-    <w:abstractNumId w:val="992"/>
+    <w:abstractNumId w:val="993"/>
   </w:num>
   <w:num w:numId="1493">
-    <w:abstractNumId w:val="993"/>
+    <w:abstractNumId w:val="992"/>
   </w:num>
   <w:num w:numId="1494">
     <w:abstractNumId w:val="992"/>
@@ -16188,16 +16266,16 @@
     <w:abstractNumId w:val="992"/>
   </w:num>
   <w:num w:numId="1496">
-    <w:abstractNumId w:val="993"/>
+    <w:abstractNumId w:val="992"/>
   </w:num>
   <w:num w:numId="1497">
     <w:abstractNumId w:val="993"/>
   </w:num>
   <w:num w:numId="1498">
-    <w:abstractNumId w:val="993"/>
+    <w:abstractNumId w:val="992"/>
   </w:num>
   <w:num w:numId="1499">
-    <w:abstractNumId w:val="993"/>
+    <w:abstractNumId w:val="992"/>
   </w:num>
   <w:num w:numId="1500">
     <w:abstractNumId w:val="993"/>
@@ -16248,20 +16326,20 @@
     <w:abstractNumId w:val="993"/>
   </w:num>
   <w:num w:numId="1516">
+    <w:abstractNumId w:val="993"/>
+  </w:num>
+  <w:num w:numId="1517">
+    <w:abstractNumId w:val="993"/>
+  </w:num>
+  <w:num w:numId="1518">
+    <w:abstractNumId w:val="993"/>
+  </w:num>
+  <w:num w:numId="1519">
+    <w:abstractNumId w:val="993"/>
+  </w:num>
+  <w:num w:numId="1520">
     <w:abstractNumId w:val="991"/>
   </w:num>
-  <w:num w:numId="1517">
-    <w:abstractNumId w:val="992"/>
-  </w:num>
-  <w:num w:numId="1518">
-    <w:abstractNumId w:val="992"/>
-  </w:num>
-  <w:num w:numId="1519">
-    <w:abstractNumId w:val="992"/>
-  </w:num>
-  <w:num w:numId="1520">
-    <w:abstractNumId w:val="992"/>
-  </w:num>
   <w:num w:numId="1521">
     <w:abstractNumId w:val="992"/>
   </w:num>
@@ -16299,44 +16377,44 @@
     <w:abstractNumId w:val="992"/>
   </w:num>
   <w:num w:numId="1533">
-    <w:abstractNumId w:val="993"/>
+    <w:abstractNumId w:val="992"/>
   </w:num>
   <w:num w:numId="1534">
-    <w:abstractNumId w:val="993"/>
+    <w:abstractNumId w:val="992"/>
   </w:num>
   <w:num w:numId="1535">
-    <w:abstractNumId w:val="993"/>
+    <w:abstractNumId w:val="992"/>
   </w:num>
   <w:num w:numId="1536">
-    <w:abstractNumId w:val="993"/>
+    <w:abstractNumId w:val="992"/>
   </w:num>
   <w:num w:numId="1537">
     <w:abstractNumId w:val="993"/>
   </w:num>
   <w:num w:numId="1538">
+    <w:abstractNumId w:val="993"/>
+  </w:num>
+  <w:num w:numId="1539">
+    <w:abstractNumId w:val="993"/>
+  </w:num>
+  <w:num w:numId="1540">
+    <w:abstractNumId w:val="993"/>
+  </w:num>
+  <w:num w:numId="1541">
+    <w:abstractNumId w:val="993"/>
+  </w:num>
+  <w:num w:numId="1542">
     <w:abstractNumId w:val="991"/>
   </w:num>
-  <w:num w:numId="1539">
-    <w:abstractNumId w:val="993"/>
-  </w:num>
-  <w:num w:numId="1540">
-    <w:abstractNumId w:val="993"/>
-  </w:num>
-  <w:num w:numId="1541">
+  <w:num w:numId="1543">
+    <w:abstractNumId w:val="993"/>
+  </w:num>
+  <w:num w:numId="1544">
+    <w:abstractNumId w:val="993"/>
+  </w:num>
+  <w:num w:numId="1545">
     <w:abstractNumId w:val="991"/>
   </w:num>
-  <w:num w:numId="1542">
-    <w:abstractNumId w:val="993"/>
-  </w:num>
-  <w:num w:numId="1543">
-    <w:abstractNumId w:val="993"/>
-  </w:num>
-  <w:num w:numId="1544">
-    <w:abstractNumId w:val="993"/>
-  </w:num>
-  <w:num w:numId="1545">
-    <w:abstractNumId w:val="993"/>
-  </w:num>
   <w:num w:numId="1546">
     <w:abstractNumId w:val="993"/>
   </w:num>
@@ -16356,37 +16434,37 @@
     <w:abstractNumId w:val="993"/>
   </w:num>
   <w:num w:numId="1552">
+    <w:abstractNumId w:val="993"/>
+  </w:num>
+  <w:num w:numId="1553">
+    <w:abstractNumId w:val="993"/>
+  </w:num>
+  <w:num w:numId="1554">
+    <w:abstractNumId w:val="993"/>
+  </w:num>
+  <w:num w:numId="1555">
+    <w:abstractNumId w:val="993"/>
+  </w:num>
+  <w:num w:numId="1556">
     <w:abstractNumId w:val="991"/>
   </w:num>
-  <w:num w:numId="1553">
-    <w:abstractNumId w:val="993"/>
-  </w:num>
-  <w:num w:numId="1554">
+  <w:num w:numId="1557">
+    <w:abstractNumId w:val="993"/>
+  </w:num>
+  <w:num w:numId="1558">
     <w:abstractNumId w:val="991"/>
   </w:num>
-  <w:num w:numId="1555">
-    <w:abstractNumId w:val="993"/>
-  </w:num>
-  <w:num w:numId="1556">
-    <w:abstractNumId w:val="993"/>
-  </w:num>
-  <w:num w:numId="1557">
-    <w:abstractNumId w:val="993"/>
-  </w:num>
-  <w:num w:numId="1558">
-    <w:abstractNumId w:val="993"/>
-  </w:num>
   <w:num w:numId="1559">
-    <w:abstractNumId w:val="992"/>
+    <w:abstractNumId w:val="993"/>
   </w:num>
   <w:num w:numId="1560">
-    <w:abstractNumId w:val="992"/>
+    <w:abstractNumId w:val="993"/>
   </w:num>
   <w:num w:numId="1561">
     <w:abstractNumId w:val="993"/>
   </w:num>
   <w:num w:numId="1562">
-    <w:abstractNumId w:val="992"/>
+    <w:abstractNumId w:val="993"/>
   </w:num>
   <w:num w:numId="1563">
     <w:abstractNumId w:val="992"/>
@@ -16395,7 +16473,7 @@
     <w:abstractNumId w:val="992"/>
   </w:num>
   <w:num w:numId="1565">
-    <w:abstractNumId w:val="992"/>
+    <w:abstractNumId w:val="993"/>
   </w:num>
   <w:num w:numId="1566">
     <w:abstractNumId w:val="992"/>
@@ -16404,16 +16482,16 @@
     <w:abstractNumId w:val="992"/>
   </w:num>
   <w:num w:numId="1568">
-    <w:abstractNumId w:val="993"/>
+    <w:abstractNumId w:val="992"/>
   </w:num>
   <w:num w:numId="1569">
-    <w:abstractNumId w:val="993"/>
+    <w:abstractNumId w:val="992"/>
   </w:num>
   <w:num w:numId="1570">
-    <w:abstractNumId w:val="993"/>
+    <w:abstractNumId w:val="992"/>
   </w:num>
   <w:num w:numId="1571">
-    <w:abstractNumId w:val="993"/>
+    <w:abstractNumId w:val="992"/>
   </w:num>
   <w:num w:numId="1572">
     <w:abstractNumId w:val="993"/>
@@ -16425,7 +16503,7 @@
     <w:abstractNumId w:val="993"/>
   </w:num>
   <w:num w:numId="1575">
-    <w:abstractNumId w:val="992"/>
+    <w:abstractNumId w:val="993"/>
   </w:num>
   <w:num w:numId="1576">
     <w:abstractNumId w:val="993"/>
@@ -16461,7 +16539,7 @@
     <w:abstractNumId w:val="993"/>
   </w:num>
   <w:num w:numId="1587">
-    <w:abstractNumId w:val="993"/>
+    <w:abstractNumId w:val="992"/>
   </w:num>
   <w:num w:numId="1588">
     <w:abstractNumId w:val="993"/>
@@ -16470,43 +16548,43 @@
     <w:abstractNumId w:val="993"/>
   </w:num>
   <w:num w:numId="1590">
-    <w:abstractNumId w:val="992"/>
+    <w:abstractNumId w:val="993"/>
   </w:num>
   <w:num w:numId="1591">
     <w:abstractNumId w:val="993"/>
   </w:num>
   <w:num w:numId="1592">
-    <w:abstractNumId w:val="992"/>
+    <w:abstractNumId w:val="993"/>
   </w:num>
   <w:num w:numId="1593">
-    <w:abstractNumId w:val="992"/>
+    <w:abstractNumId w:val="993"/>
   </w:num>
   <w:num w:numId="1594">
-    <w:abstractNumId w:val="993"/>
+    <w:abstractNumId w:val="992"/>
   </w:num>
   <w:num w:numId="1595">
     <w:abstractNumId w:val="993"/>
   </w:num>
   <w:num w:numId="1596">
-    <w:abstractNumId w:val="993"/>
+    <w:abstractNumId w:val="992"/>
   </w:num>
   <w:num w:numId="1597">
-    <w:abstractNumId w:val="993"/>
+    <w:abstractNumId w:val="992"/>
   </w:num>
   <w:num w:numId="1598">
-    <w:abstractNumId w:val="992"/>
+    <w:abstractNumId w:val="993"/>
   </w:num>
   <w:num w:numId="1599">
-    <w:abstractNumId w:val="992"/>
+    <w:abstractNumId w:val="993"/>
   </w:num>
   <w:num w:numId="1600">
-    <w:abstractNumId w:val="992"/>
+    <w:abstractNumId w:val="993"/>
   </w:num>
   <w:num w:numId="1601">
-    <w:abstractNumId w:val="992"/>
+    <w:abstractNumId w:val="993"/>
   </w:num>
   <w:num w:numId="1602">
-    <w:abstractNumId w:val="993"/>
+    <w:abstractNumId w:val="992"/>
   </w:num>
   <w:num w:numId="1603">
     <w:abstractNumId w:val="992"/>
@@ -16518,7 +16596,7 @@
     <w:abstractNumId w:val="992"/>
   </w:num>
   <w:num w:numId="1606">
-    <w:abstractNumId w:val="992"/>
+    <w:abstractNumId w:val="993"/>
   </w:num>
   <w:num w:numId="1607">
     <w:abstractNumId w:val="992"/>
@@ -16629,6 +16707,18 @@
     <w:abstractNumId w:val="992"/>
   </w:num>
   <w:num w:numId="1643">
+    <w:abstractNumId w:val="992"/>
+  </w:num>
+  <w:num w:numId="1644">
+    <w:abstractNumId w:val="992"/>
+  </w:num>
+  <w:num w:numId="1645">
+    <w:abstractNumId w:val="992"/>
+  </w:num>
+  <w:num w:numId="1646">
+    <w:abstractNumId w:val="992"/>
+  </w:num>
+  <w:num w:numId="1647">
     <w:abstractNumId w:val="992"/>
   </w:num>
 </w:numbering>

</xml_diff>

<commit_message>
Close M1.5 attempt UI browser gate
</commit_message>
<xml_diff>
--- a/MASTER_M1_M2_DELIVERY_CHECKLIST.docx
+++ b/MASTER_M1_M2_DELIVERY_CHECKLIST.docx
@@ -409,7 +409,7 @@
               <w:jc w:val="right"/>
             </w:pPr>
             <w:r>
-              <w:t xml:space="preserve">8%</w:t>
+              <w:t xml:space="preserve">9%</w:t>
             </w:r>
           </w:p>
         </w:tc>
@@ -420,7 +420,7 @@
               <w:pStyle w:val="Compact"/>
             </w:pPr>
             <w:r>
-              <w:t xml:space="preserve">Attempt UI, reset mechanics, and admin manual override implemented; browser/pixel pending</w:t>
+              <w:t xml:space="preserve">Attempt UI, reset mechanics, manual override, and browser/pixel gate implemented</w:t>
             </w:r>
           </w:p>
         </w:tc>
@@ -709,7 +709,7 @@
                 <w:b/>
                 <w:bCs/>
               </w:rPr>
-              <w:t xml:space="preserve">65%</w:t>
+              <w:t xml:space="preserve">66%</w:t>
             </w:r>
           </w:p>
         </w:tc>
@@ -724,7 +724,7 @@
                 <w:b/>
                 <w:bCs/>
               </w:rPr>
-              <w:t xml:space="preserve">M1.5 manual override added; browser/pixel/release gates remain</w:t>
+              <w:t xml:space="preserve">M1.5 browser/pixel gate added; Revive Queue and release gates remain</w:t>
             </w:r>
           </w:p>
         </w:tc>
@@ -8799,6 +8799,156 @@
         <w:t xml:space="preserve">Validation passed: focused backend tests 17/17, server build, and client build.</w:t>
       </w:r>
     </w:p>
+    <w:p>
+      <w:pPr>
+        <w:pStyle w:val="Compact"/>
+        <w:numPr>
+          <w:ilvl w:val="0"/>
+          <w:numId w:val="1352"/>
+        </w:numPr>
+      </w:pPr>
+      <w:r>
+        <w:t xml:space="preserve">Browser mock validation passed on production preview: DealCard attempt banner and DealPanel quick-log row rendered for admin with</w:t>
+      </w:r>
+      <w:r>
+        <w:t xml:space="preserve"> </w:t>
+      </w:r>
+      <w:r>
+        <w:rPr>
+          <w:rStyle w:val="VerbatimChar"/>
+        </w:rPr>
+        <w:t xml:space="preserve">WAITING 3/5</w:t>
+      </w:r>
+      <w:r>
+        <w:t xml:space="preserve">, reset changed panel status to</w:t>
+      </w:r>
+      <w:r>
+        <w:t xml:space="preserve"> </w:t>
+      </w:r>
+      <w:r>
+        <w:rPr>
+          <w:rStyle w:val="VerbatimChar"/>
+        </w:rPr>
+        <w:t xml:space="preserve">WAITING 0/5</w:t>
+      </w:r>
+      <w:r>
+        <w:t xml:space="preserve">, and threshold input saved</w:t>
+      </w:r>
+      <w:r>
+        <w:t xml:space="preserve"> </w:t>
+      </w:r>
+      <w:r>
+        <w:rPr>
+          <w:rStyle w:val="VerbatimChar"/>
+        </w:rPr>
+        <w:t xml:space="preserve">12</w:t>
+      </w:r>
+      <w:r>
+        <w:t xml:space="preserve">.</w:t>
+      </w:r>
+    </w:p>
+    <w:p>
+      <w:pPr>
+        <w:pStyle w:val="Compact"/>
+        <w:numPr>
+          <w:ilvl w:val="0"/>
+          <w:numId w:val="1353"/>
+        </w:numPr>
+      </w:pPr>
+      <w:r>
+        <w:t xml:space="preserve">Browser UI quick-log buttons exercised from DealPanel: No answer, Texted, Voicemail, Connected, and Not interested buttons all invoked the quick-log flow; backend semantics remain covered by focused Vitest tests.</w:t>
+      </w:r>
+    </w:p>
+    <w:p>
+      <w:pPr>
+        <w:pStyle w:val="Compact"/>
+        <w:numPr>
+          <w:ilvl w:val="0"/>
+          <w:numId w:val="1354"/>
+        </w:numPr>
+      </w:pPr>
+      <w:r>
+        <w:t xml:space="preserve">Pixel/browser evidence captured in</w:t>
+      </w:r>
+      <w:r>
+        <w:t xml:space="preserve"> </w:t>
+      </w:r>
+      <w:r>
+        <w:rPr>
+          <w:rStyle w:val="VerbatimChar"/>
+        </w:rPr>
+        <w:t xml:space="preserve">audit-screenshots/m15-attempt-ui-evidence.json</w:t>
+      </w:r>
+      <w:r>
+        <w:t xml:space="preserve">; local ignored screenshots generated at</w:t>
+      </w:r>
+      <w:r>
+        <w:t xml:space="preserve"> </w:t>
+      </w:r>
+      <w:r>
+        <w:rPr>
+          <w:rStyle w:val="VerbatimChar"/>
+        </w:rPr>
+        <w:t xml:space="preserve">audit-screenshots/m15-attempt-ui-desktop.png</w:t>
+      </w:r>
+      <w:r>
+        <w:t xml:space="preserve"> </w:t>
+      </w:r>
+      <w:r>
+        <w:t xml:space="preserve">and</w:t>
+      </w:r>
+      <w:r>
+        <w:t xml:space="preserve"> </w:t>
+      </w:r>
+      <w:r>
+        <w:rPr>
+          <w:rStyle w:val="VerbatimChar"/>
+        </w:rPr>
+        <w:t xml:space="preserve">audit-screenshots/m15-attempt-ui-mobile.png</w:t>
+      </w:r>
+      <w:r>
+        <w:t xml:space="preserve">.</w:t>
+      </w:r>
+    </w:p>
+    <w:p>
+      <w:pPr>
+        <w:pStyle w:val="Compact"/>
+        <w:numPr>
+          <w:ilvl w:val="0"/>
+          <w:numId w:val="1355"/>
+        </w:numPr>
+      </w:pPr>
+      <w:r>
+        <w:t xml:space="preserve">Quick-log CSS tightened after pixel review: desktop uses compact grid layout; mobile keeps two-column button stack with full-width Not interested.</w:t>
+      </w:r>
+    </w:p>
+    <w:p>
+      <w:pPr>
+        <w:pStyle w:val="Compact"/>
+        <w:numPr>
+          <w:ilvl w:val="0"/>
+          <w:numId w:val="1356"/>
+        </w:numPr>
+      </w:pPr>
+      <w:r>
+        <w:t xml:space="preserve">Validation passed:</w:t>
+      </w:r>
+      <w:r>
+        <w:t xml:space="preserve"> </w:t>
+      </w:r>
+      <w:r>
+        <w:rPr>
+          <w:rStyle w:val="VerbatimChar"/>
+        </w:rPr>
+        <w:t xml:space="preserve">cd client &amp;&amp; npm run build</w:t>
+      </w:r>
+      <w:r>
+        <w:t xml:space="preserve"> </w:t>
+      </w:r>
+      <w:r>
+        <w:t xml:space="preserve">after quick-log CSS/pixel adjustment.</w:t>
+      </w:r>
+    </w:p>
     <w:bookmarkEnd w:id="49"/>
     <w:bookmarkStart w:id="50" w:name="data-and-backend"/>
     <w:p>
@@ -8814,7 +8964,7 @@
         <w:pStyle w:val="Compact"/>
         <w:numPr>
           <w:ilvl w:val="0"/>
-          <w:numId w:val="1352"/>
+          <w:numId w:val="1357"/>
         </w:numPr>
       </w:pPr>
       <w:r>
@@ -8853,7 +9003,7 @@
         <w:pStyle w:val="Compact"/>
         <w:numPr>
           <w:ilvl w:val="0"/>
-          <w:numId w:val="1353"/>
+          <w:numId w:val="1358"/>
         </w:numPr>
       </w:pPr>
       <w:r>
@@ -8892,7 +9042,7 @@
         <w:pStyle w:val="Compact"/>
         <w:numPr>
           <w:ilvl w:val="0"/>
-          <w:numId w:val="1354"/>
+          <w:numId w:val="1359"/>
         </w:numPr>
       </w:pPr>
       <w:r>
@@ -8916,7 +9066,7 @@
         <w:pStyle w:val="Compact"/>
         <w:numPr>
           <w:ilvl w:val="0"/>
-          <w:numId w:val="1355"/>
+          <w:numId w:val="1360"/>
         </w:numPr>
       </w:pPr>
       <w:r>
@@ -8973,7 +9123,7 @@
         <w:pStyle w:val="Compact"/>
         <w:numPr>
           <w:ilvl w:val="0"/>
-          <w:numId w:val="1356"/>
+          <w:numId w:val="1361"/>
         </w:numPr>
       </w:pPr>
       <w:r>
@@ -8997,7 +9147,7 @@
         <w:pStyle w:val="Compact"/>
         <w:numPr>
           <w:ilvl w:val="0"/>
-          <w:numId w:val="1357"/>
+          <w:numId w:val="1362"/>
         </w:numPr>
       </w:pPr>
       <w:r>
@@ -9009,7 +9159,7 @@
         <w:pStyle w:val="Compact"/>
         <w:numPr>
           <w:ilvl w:val="1"/>
-          <w:numId w:val="1358"/>
+          <w:numId w:val="1363"/>
         </w:numPr>
       </w:pPr>
       <w:r>
@@ -9021,7 +9171,7 @@
         <w:pStyle w:val="Compact"/>
         <w:numPr>
           <w:ilvl w:val="1"/>
-          <w:numId w:val="1358"/>
+          <w:numId w:val="1363"/>
         </w:numPr>
       </w:pPr>
       <w:r>
@@ -9033,7 +9183,7 @@
         <w:pStyle w:val="Compact"/>
         <w:numPr>
           <w:ilvl w:val="1"/>
-          <w:numId w:val="1358"/>
+          <w:numId w:val="1363"/>
         </w:numPr>
       </w:pPr>
       <w:r>
@@ -9045,7 +9195,7 @@
         <w:pStyle w:val="Compact"/>
         <w:numPr>
           <w:ilvl w:val="1"/>
-          <w:numId w:val="1358"/>
+          <w:numId w:val="1363"/>
         </w:numPr>
       </w:pPr>
       <w:r>
@@ -9057,7 +9207,7 @@
         <w:pStyle w:val="Compact"/>
         <w:numPr>
           <w:ilvl w:val="1"/>
-          <w:numId w:val="1358"/>
+          <w:numId w:val="1363"/>
         </w:numPr>
       </w:pPr>
       <w:r>
@@ -9069,7 +9219,7 @@
         <w:pStyle w:val="Compact"/>
         <w:numPr>
           <w:ilvl w:val="0"/>
-          <w:numId w:val="1359"/>
+          <w:numId w:val="1364"/>
         </w:numPr>
       </w:pPr>
       <w:r>
@@ -9114,7 +9264,7 @@
         <w:pStyle w:val="Compact"/>
         <w:numPr>
           <w:ilvl w:val="0"/>
-          <w:numId w:val="1360"/>
+          <w:numId w:val="1365"/>
         </w:numPr>
       </w:pPr>
       <w:r>
@@ -9147,7 +9297,7 @@
         <w:pStyle w:val="Compact"/>
         <w:numPr>
           <w:ilvl w:val="0"/>
-          <w:numId w:val="1361"/>
+          <w:numId w:val="1366"/>
         </w:numPr>
       </w:pPr>
       <w:r>
@@ -9180,7 +9330,7 @@
         <w:pStyle w:val="Compact"/>
         <w:numPr>
           <w:ilvl w:val="0"/>
-          <w:numId w:val="1362"/>
+          <w:numId w:val="1367"/>
         </w:numPr>
       </w:pPr>
       <w:r>
@@ -9207,7 +9357,7 @@
         <w:pStyle w:val="Compact"/>
         <w:numPr>
           <w:ilvl w:val="0"/>
-          <w:numId w:val="1363"/>
+          <w:numId w:val="1368"/>
         </w:numPr>
       </w:pPr>
       <w:r>
@@ -9219,7 +9369,7 @@
         <w:pStyle w:val="Compact"/>
         <w:numPr>
           <w:ilvl w:val="0"/>
-          <w:numId w:val="1364"/>
+          <w:numId w:val="1369"/>
         </w:numPr>
       </w:pPr>
       <w:r>
@@ -9231,7 +9381,7 @@
         <w:pStyle w:val="Compact"/>
         <w:numPr>
           <w:ilvl w:val="0"/>
-          <w:numId w:val="1365"/>
+          <w:numId w:val="1370"/>
         </w:numPr>
       </w:pPr>
       <w:r>
@@ -9243,7 +9393,7 @@
         <w:pStyle w:val="Compact"/>
         <w:numPr>
           <w:ilvl w:val="0"/>
-          <w:numId w:val="1366"/>
+          <w:numId w:val="1371"/>
         </w:numPr>
       </w:pPr>
       <w:r>
@@ -9255,7 +9405,7 @@
         <w:pStyle w:val="Compact"/>
         <w:numPr>
           <w:ilvl w:val="0"/>
-          <w:numId w:val="1367"/>
+          <w:numId w:val="1372"/>
         </w:numPr>
       </w:pPr>
       <w:r>
@@ -9282,7 +9432,7 @@
         <w:pStyle w:val="Compact"/>
         <w:numPr>
           <w:ilvl w:val="0"/>
-          <w:numId w:val="1368"/>
+          <w:numId w:val="1373"/>
         </w:numPr>
       </w:pPr>
       <w:r>
@@ -9304,7 +9454,7 @@
         <w:pStyle w:val="Compact"/>
         <w:numPr>
           <w:ilvl w:val="0"/>
-          <w:numId w:val="1369"/>
+          <w:numId w:val="1374"/>
         </w:numPr>
       </w:pPr>
       <w:r>
@@ -9316,7 +9466,7 @@
         <w:pStyle w:val="Compact"/>
         <w:numPr>
           <w:ilvl w:val="0"/>
-          <w:numId w:val="1370"/>
+          <w:numId w:val="1375"/>
         </w:numPr>
       </w:pPr>
       <w:r>
@@ -9328,7 +9478,7 @@
         <w:pStyle w:val="Compact"/>
         <w:numPr>
           <w:ilvl w:val="0"/>
-          <w:numId w:val="1371"/>
+          <w:numId w:val="1376"/>
         </w:numPr>
       </w:pPr>
       <w:r>
@@ -9340,7 +9490,7 @@
         <w:pStyle w:val="Compact"/>
         <w:numPr>
           <w:ilvl w:val="0"/>
-          <w:numId w:val="1372"/>
+          <w:numId w:val="1377"/>
         </w:numPr>
       </w:pPr>
       <w:r>
@@ -9364,7 +9514,7 @@
         <w:pStyle w:val="Compact"/>
         <w:numPr>
           <w:ilvl w:val="0"/>
-          <w:numId w:val="1373"/>
+          <w:numId w:val="1378"/>
         </w:numPr>
       </w:pPr>
       <w:r>
@@ -9376,7 +9526,7 @@
         <w:pStyle w:val="Compact"/>
         <w:numPr>
           <w:ilvl w:val="1"/>
-          <w:numId w:val="1374"/>
+          <w:numId w:val="1379"/>
         </w:numPr>
       </w:pPr>
       <w:r>
@@ -9388,7 +9538,7 @@
         <w:pStyle w:val="Compact"/>
         <w:numPr>
           <w:ilvl w:val="1"/>
-          <w:numId w:val="1374"/>
+          <w:numId w:val="1379"/>
         </w:numPr>
       </w:pPr>
       <w:r>
@@ -9400,7 +9550,7 @@
         <w:pStyle w:val="Compact"/>
         <w:numPr>
           <w:ilvl w:val="1"/>
-          <w:numId w:val="1374"/>
+          <w:numId w:val="1379"/>
         </w:numPr>
       </w:pPr>
       <w:r>
@@ -9412,7 +9562,7 @@
         <w:pStyle w:val="Compact"/>
         <w:numPr>
           <w:ilvl w:val="0"/>
-          <w:numId w:val="1375"/>
+          <w:numId w:val="1380"/>
         </w:numPr>
       </w:pPr>
       <w:r>
@@ -9454,7 +9604,7 @@
         <w:pStyle w:val="Compact"/>
         <w:numPr>
           <w:ilvl w:val="0"/>
-          <w:numId w:val="1376"/>
+          <w:numId w:val="1381"/>
         </w:numPr>
       </w:pPr>
       <w:r>
@@ -9496,7 +9646,7 @@
         <w:pStyle w:val="Compact"/>
         <w:numPr>
           <w:ilvl w:val="0"/>
-          <w:numId w:val="1377"/>
+          <w:numId w:val="1382"/>
         </w:numPr>
       </w:pPr>
       <w:r>
@@ -9518,7 +9668,7 @@
         <w:pStyle w:val="Compact"/>
         <w:numPr>
           <w:ilvl w:val="0"/>
-          <w:numId w:val="1378"/>
+          <w:numId w:val="1383"/>
         </w:numPr>
       </w:pPr>
       <w:r>
@@ -9530,7 +9680,7 @@
         <w:pStyle w:val="Compact"/>
         <w:numPr>
           <w:ilvl w:val="0"/>
-          <w:numId w:val="1379"/>
+          <w:numId w:val="1384"/>
         </w:numPr>
       </w:pPr>
       <w:r>
@@ -9542,7 +9692,7 @@
         <w:pStyle w:val="Compact"/>
         <w:numPr>
           <w:ilvl w:val="0"/>
-          <w:numId w:val="1380"/>
+          <w:numId w:val="1385"/>
         </w:numPr>
       </w:pPr>
       <w:r>
@@ -9554,7 +9704,7 @@
         <w:pStyle w:val="Compact"/>
         <w:numPr>
           <w:ilvl w:val="0"/>
-          <w:numId w:val="1381"/>
+          <w:numId w:val="1386"/>
         </w:numPr>
       </w:pPr>
       <w:r>
@@ -9566,7 +9716,7 @@
         <w:pStyle w:val="Compact"/>
         <w:numPr>
           <w:ilvl w:val="0"/>
-          <w:numId w:val="1382"/>
+          <w:numId w:val="1387"/>
         </w:numPr>
       </w:pPr>
       <w:r>
@@ -9578,7 +9728,7 @@
         <w:pStyle w:val="Compact"/>
         <w:numPr>
           <w:ilvl w:val="0"/>
-          <w:numId w:val="1383"/>
+          <w:numId w:val="1388"/>
         </w:numPr>
       </w:pPr>
       <w:r>
@@ -9590,7 +9740,7 @@
         <w:pStyle w:val="Compact"/>
         <w:numPr>
           <w:ilvl w:val="0"/>
-          <w:numId w:val="1384"/>
+          <w:numId w:val="1389"/>
         </w:numPr>
       </w:pPr>
       <w:r>
@@ -9602,7 +9752,7 @@
         <w:pStyle w:val="Compact"/>
         <w:numPr>
           <w:ilvl w:val="0"/>
-          <w:numId w:val="1385"/>
+          <w:numId w:val="1390"/>
         </w:numPr>
       </w:pPr>
       <w:r>
@@ -9614,7 +9764,7 @@
         <w:pStyle w:val="Compact"/>
         <w:numPr>
           <w:ilvl w:val="0"/>
-          <w:numId w:val="1386"/>
+          <w:numId w:val="1391"/>
         </w:numPr>
       </w:pPr>
       <w:r>
@@ -9626,7 +9776,7 @@
         <w:pStyle w:val="Compact"/>
         <w:numPr>
           <w:ilvl w:val="0"/>
-          <w:numId w:val="1387"/>
+          <w:numId w:val="1392"/>
         </w:numPr>
       </w:pPr>
       <w:r>
@@ -9658,7 +9808,7 @@
         <w:pStyle w:val="Compact"/>
         <w:numPr>
           <w:ilvl w:val="0"/>
-          <w:numId w:val="1388"/>
+          <w:numId w:val="1393"/>
         </w:numPr>
       </w:pPr>
       <w:r>
@@ -9670,7 +9820,7 @@
         <w:pStyle w:val="Compact"/>
         <w:numPr>
           <w:ilvl w:val="0"/>
-          <w:numId w:val="1389"/>
+          <w:numId w:val="1394"/>
         </w:numPr>
       </w:pPr>
       <w:r>
@@ -9682,7 +9832,7 @@
         <w:pStyle w:val="Compact"/>
         <w:numPr>
           <w:ilvl w:val="0"/>
-          <w:numId w:val="1390"/>
+          <w:numId w:val="1395"/>
         </w:numPr>
       </w:pPr>
       <w:r>
@@ -9694,7 +9844,7 @@
         <w:pStyle w:val="Compact"/>
         <w:numPr>
           <w:ilvl w:val="0"/>
-          <w:numId w:val="1391"/>
+          <w:numId w:val="1396"/>
         </w:numPr>
       </w:pPr>
       <w:r>
@@ -9706,7 +9856,7 @@
         <w:pStyle w:val="Compact"/>
         <w:numPr>
           <w:ilvl w:val="0"/>
-          <w:numId w:val="1392"/>
+          <w:numId w:val="1397"/>
         </w:numPr>
       </w:pPr>
       <w:r>
@@ -9718,7 +9868,7 @@
         <w:pStyle w:val="Compact"/>
         <w:numPr>
           <w:ilvl w:val="0"/>
-          <w:numId w:val="1393"/>
+          <w:numId w:val="1398"/>
         </w:numPr>
       </w:pPr>
       <w:r>
@@ -9730,7 +9880,7 @@
         <w:pStyle w:val="Compact"/>
         <w:numPr>
           <w:ilvl w:val="0"/>
-          <w:numId w:val="1394"/>
+          <w:numId w:val="1399"/>
         </w:numPr>
       </w:pPr>
       <w:r>
@@ -9742,7 +9892,7 @@
         <w:pStyle w:val="Compact"/>
         <w:numPr>
           <w:ilvl w:val="0"/>
-          <w:numId w:val="1395"/>
+          <w:numId w:val="1400"/>
         </w:numPr>
       </w:pPr>
       <w:r>
@@ -9754,7 +9904,7 @@
         <w:pStyle w:val="Compact"/>
         <w:numPr>
           <w:ilvl w:val="0"/>
-          <w:numId w:val="1396"/>
+          <w:numId w:val="1401"/>
         </w:numPr>
       </w:pPr>
       <w:r>
@@ -9766,7 +9916,7 @@
         <w:pStyle w:val="Compact"/>
         <w:numPr>
           <w:ilvl w:val="0"/>
-          <w:numId w:val="1397"/>
+          <w:numId w:val="1402"/>
         </w:numPr>
       </w:pPr>
       <w:r>
@@ -9778,7 +9928,7 @@
         <w:pStyle w:val="Compact"/>
         <w:numPr>
           <w:ilvl w:val="0"/>
-          <w:numId w:val="1398"/>
+          <w:numId w:val="1403"/>
         </w:numPr>
       </w:pPr>
       <w:r>
@@ -9790,7 +9940,7 @@
         <w:pStyle w:val="Compact"/>
         <w:numPr>
           <w:ilvl w:val="0"/>
-          <w:numId w:val="1399"/>
+          <w:numId w:val="1404"/>
         </w:numPr>
       </w:pPr>
       <w:r>
@@ -9802,7 +9952,7 @@
         <w:pStyle w:val="Compact"/>
         <w:numPr>
           <w:ilvl w:val="0"/>
-          <w:numId w:val="1400"/>
+          <w:numId w:val="1405"/>
         </w:numPr>
       </w:pPr>
       <w:r>
@@ -9814,7 +9964,7 @@
         <w:pStyle w:val="Compact"/>
         <w:numPr>
           <w:ilvl w:val="0"/>
-          <w:numId w:val="1401"/>
+          <w:numId w:val="1406"/>
         </w:numPr>
       </w:pPr>
       <w:r>
@@ -9826,7 +9976,7 @@
         <w:pStyle w:val="Compact"/>
         <w:numPr>
           <w:ilvl w:val="0"/>
-          <w:numId w:val="1402"/>
+          <w:numId w:val="1407"/>
         </w:numPr>
       </w:pPr>
       <w:r>
@@ -9848,7 +9998,7 @@
         <w:pStyle w:val="Compact"/>
         <w:numPr>
           <w:ilvl w:val="0"/>
-          <w:numId w:val="1403"/>
+          <w:numId w:val="1408"/>
         </w:numPr>
       </w:pPr>
       <w:r>
@@ -9860,7 +10010,7 @@
         <w:pStyle w:val="Compact"/>
         <w:numPr>
           <w:ilvl w:val="0"/>
-          <w:numId w:val="1404"/>
+          <w:numId w:val="1409"/>
         </w:numPr>
       </w:pPr>
       <w:r>
@@ -9872,7 +10022,7 @@
         <w:pStyle w:val="Compact"/>
         <w:numPr>
           <w:ilvl w:val="0"/>
-          <w:numId w:val="1405"/>
+          <w:numId w:val="1410"/>
         </w:numPr>
       </w:pPr>
       <w:r>
@@ -9884,7 +10034,7 @@
         <w:pStyle w:val="Compact"/>
         <w:numPr>
           <w:ilvl w:val="0"/>
-          <w:numId w:val="1406"/>
+          <w:numId w:val="1411"/>
         </w:numPr>
       </w:pPr>
       <w:r>
@@ -9896,7 +10046,7 @@
         <w:pStyle w:val="Compact"/>
         <w:numPr>
           <w:ilvl w:val="0"/>
-          <w:numId w:val="1407"/>
+          <w:numId w:val="1412"/>
         </w:numPr>
       </w:pPr>
       <w:r>
@@ -9908,7 +10058,7 @@
         <w:pStyle w:val="Compact"/>
         <w:numPr>
           <w:ilvl w:val="0"/>
-          <w:numId w:val="1408"/>
+          <w:numId w:val="1413"/>
         </w:numPr>
       </w:pPr>
       <w:r>
@@ -9920,7 +10070,7 @@
         <w:pStyle w:val="Compact"/>
         <w:numPr>
           <w:ilvl w:val="0"/>
-          <w:numId w:val="1409"/>
+          <w:numId w:val="1414"/>
         </w:numPr>
       </w:pPr>
       <w:r>
@@ -9942,7 +10092,7 @@
         <w:pStyle w:val="Compact"/>
         <w:numPr>
           <w:ilvl w:val="0"/>
-          <w:numId w:val="1410"/>
+          <w:numId w:val="1415"/>
         </w:numPr>
       </w:pPr>
       <w:r>
@@ -9954,7 +10104,7 @@
         <w:pStyle w:val="Compact"/>
         <w:numPr>
           <w:ilvl w:val="0"/>
-          <w:numId w:val="1411"/>
+          <w:numId w:val="1416"/>
         </w:numPr>
       </w:pPr>
       <w:r>
@@ -9966,7 +10116,7 @@
         <w:pStyle w:val="Compact"/>
         <w:numPr>
           <w:ilvl w:val="0"/>
-          <w:numId w:val="1412"/>
+          <w:numId w:val="1417"/>
         </w:numPr>
       </w:pPr>
       <w:r>
@@ -9978,7 +10128,7 @@
         <w:pStyle w:val="Compact"/>
         <w:numPr>
           <w:ilvl w:val="0"/>
-          <w:numId w:val="1413"/>
+          <w:numId w:val="1418"/>
         </w:numPr>
       </w:pPr>
       <w:r>
@@ -9990,7 +10140,7 @@
         <w:pStyle w:val="Compact"/>
         <w:numPr>
           <w:ilvl w:val="0"/>
-          <w:numId w:val="1414"/>
+          <w:numId w:val="1419"/>
         </w:numPr>
       </w:pPr>
       <w:r>
@@ -10002,7 +10152,7 @@
         <w:pStyle w:val="Compact"/>
         <w:numPr>
           <w:ilvl w:val="0"/>
-          <w:numId w:val="1415"/>
+          <w:numId w:val="1420"/>
         </w:numPr>
       </w:pPr>
       <w:r>
@@ -10014,7 +10164,7 @@
         <w:pStyle w:val="Compact"/>
         <w:numPr>
           <w:ilvl w:val="0"/>
-          <w:numId w:val="1416"/>
+          <w:numId w:val="1421"/>
         </w:numPr>
       </w:pPr>
       <w:r>
@@ -10046,7 +10196,7 @@
         <w:pStyle w:val="Compact"/>
         <w:numPr>
           <w:ilvl w:val="0"/>
-          <w:numId w:val="1417"/>
+          <w:numId w:val="1422"/>
         </w:numPr>
       </w:pPr>
       <w:r>
@@ -10118,7 +10268,7 @@
         <w:pStyle w:val="Compact"/>
         <w:numPr>
           <w:ilvl w:val="0"/>
-          <w:numId w:val="1418"/>
+          <w:numId w:val="1423"/>
         </w:numPr>
       </w:pPr>
       <w:r>
@@ -10130,7 +10280,7 @@
         <w:pStyle w:val="Compact"/>
         <w:numPr>
           <w:ilvl w:val="0"/>
-          <w:numId w:val="1419"/>
+          <w:numId w:val="1424"/>
         </w:numPr>
       </w:pPr>
       <w:r>
@@ -10157,7 +10307,7 @@
         <w:pStyle w:val="Compact"/>
         <w:numPr>
           <w:ilvl w:val="0"/>
-          <w:numId w:val="1420"/>
+          <w:numId w:val="1425"/>
         </w:numPr>
       </w:pPr>
       <w:r>
@@ -10211,7 +10361,7 @@
         <w:pStyle w:val="Compact"/>
         <w:numPr>
           <w:ilvl w:val="0"/>
-          <w:numId w:val="1421"/>
+          <w:numId w:val="1426"/>
         </w:numPr>
       </w:pPr>
       <w:r>
@@ -10223,7 +10373,7 @@
         <w:pStyle w:val="Compact"/>
         <w:numPr>
           <w:ilvl w:val="0"/>
-          <w:numId w:val="1422"/>
+          <w:numId w:val="1427"/>
         </w:numPr>
       </w:pPr>
       <w:r>
@@ -10245,7 +10395,7 @@
         <w:pStyle w:val="Compact"/>
         <w:numPr>
           <w:ilvl w:val="0"/>
-          <w:numId w:val="1423"/>
+          <w:numId w:val="1428"/>
         </w:numPr>
       </w:pPr>
       <w:r>
@@ -10296,7 +10446,7 @@
         <w:pStyle w:val="Compact"/>
         <w:numPr>
           <w:ilvl w:val="0"/>
-          <w:numId w:val="1424"/>
+          <w:numId w:val="1429"/>
         </w:numPr>
       </w:pPr>
       <w:r>
@@ -10323,7 +10473,7 @@
         <w:pStyle w:val="Compact"/>
         <w:numPr>
           <w:ilvl w:val="0"/>
-          <w:numId w:val="1425"/>
+          <w:numId w:val="1430"/>
         </w:numPr>
       </w:pPr>
       <w:r>
@@ -10335,7 +10485,7 @@
         <w:pStyle w:val="Compact"/>
         <w:numPr>
           <w:ilvl w:val="0"/>
-          <w:numId w:val="1426"/>
+          <w:numId w:val="1431"/>
         </w:numPr>
       </w:pPr>
       <w:r>
@@ -10362,7 +10512,7 @@
         <w:pStyle w:val="Compact"/>
         <w:numPr>
           <w:ilvl w:val="0"/>
-          <w:numId w:val="1427"/>
+          <w:numId w:val="1432"/>
         </w:numPr>
       </w:pPr>
       <w:r>
@@ -10374,7 +10524,7 @@
         <w:pStyle w:val="Compact"/>
         <w:numPr>
           <w:ilvl w:val="0"/>
-          <w:numId w:val="1428"/>
+          <w:numId w:val="1433"/>
         </w:numPr>
       </w:pPr>
       <w:r>
@@ -10386,7 +10536,7 @@
         <w:pStyle w:val="Compact"/>
         <w:numPr>
           <w:ilvl w:val="0"/>
-          <w:numId w:val="1429"/>
+          <w:numId w:val="1434"/>
         </w:numPr>
       </w:pPr>
       <w:r>
@@ -10408,7 +10558,7 @@
         <w:pStyle w:val="Compact"/>
         <w:numPr>
           <w:ilvl w:val="0"/>
-          <w:numId w:val="1430"/>
+          <w:numId w:val="1435"/>
         </w:numPr>
       </w:pPr>
       <w:r>
@@ -10432,7 +10582,7 @@
         <w:pStyle w:val="Compact"/>
         <w:numPr>
           <w:ilvl w:val="0"/>
-          <w:numId w:val="1431"/>
+          <w:numId w:val="1436"/>
         </w:numPr>
       </w:pPr>
       <w:r>
@@ -10456,7 +10606,7 @@
         <w:pStyle w:val="Compact"/>
         <w:numPr>
           <w:ilvl w:val="0"/>
-          <w:numId w:val="1432"/>
+          <w:numId w:val="1437"/>
         </w:numPr>
       </w:pPr>
       <w:r>
@@ -10468,7 +10618,7 @@
         <w:pStyle w:val="Compact"/>
         <w:numPr>
           <w:ilvl w:val="0"/>
-          <w:numId w:val="1433"/>
+          <w:numId w:val="1438"/>
         </w:numPr>
       </w:pPr>
       <w:r>
@@ -10480,7 +10630,7 @@
         <w:pStyle w:val="Compact"/>
         <w:numPr>
           <w:ilvl w:val="0"/>
-          <w:numId w:val="1434"/>
+          <w:numId w:val="1439"/>
         </w:numPr>
       </w:pPr>
       <w:r>
@@ -10492,7 +10642,7 @@
         <w:pStyle w:val="Compact"/>
         <w:numPr>
           <w:ilvl w:val="0"/>
-          <w:numId w:val="1435"/>
+          <w:numId w:val="1440"/>
         </w:numPr>
       </w:pPr>
       <w:r>
@@ -10523,7 +10673,7 @@
         <w:pStyle w:val="Compact"/>
         <w:numPr>
           <w:ilvl w:val="0"/>
-          <w:numId w:val="1436"/>
+          <w:numId w:val="1441"/>
         </w:numPr>
       </w:pPr>
       <w:r>
@@ -10535,7 +10685,7 @@
         <w:pStyle w:val="Compact"/>
         <w:numPr>
           <w:ilvl w:val="0"/>
-          <w:numId w:val="1437"/>
+          <w:numId w:val="1442"/>
         </w:numPr>
       </w:pPr>
       <w:r>
@@ -10547,7 +10697,7 @@
         <w:pStyle w:val="Compact"/>
         <w:numPr>
           <w:ilvl w:val="1"/>
-          <w:numId w:val="1438"/>
+          <w:numId w:val="1443"/>
         </w:numPr>
       </w:pPr>
       <w:r>
@@ -10565,7 +10715,7 @@
         <w:pStyle w:val="Compact"/>
         <w:numPr>
           <w:ilvl w:val="1"/>
-          <w:numId w:val="1438"/>
+          <w:numId w:val="1443"/>
         </w:numPr>
       </w:pPr>
       <w:r>
@@ -10583,7 +10733,7 @@
         <w:pStyle w:val="Compact"/>
         <w:numPr>
           <w:ilvl w:val="1"/>
-          <w:numId w:val="1438"/>
+          <w:numId w:val="1443"/>
         </w:numPr>
       </w:pPr>
       <w:r>
@@ -10601,7 +10751,7 @@
         <w:pStyle w:val="Compact"/>
         <w:numPr>
           <w:ilvl w:val="1"/>
-          <w:numId w:val="1438"/>
+          <w:numId w:val="1443"/>
         </w:numPr>
       </w:pPr>
       <w:r>
@@ -10619,7 +10769,7 @@
         <w:pStyle w:val="Compact"/>
         <w:numPr>
           <w:ilvl w:val="0"/>
-          <w:numId w:val="1439"/>
+          <w:numId w:val="1444"/>
         </w:numPr>
       </w:pPr>
       <w:r>
@@ -10631,7 +10781,7 @@
         <w:pStyle w:val="Compact"/>
         <w:numPr>
           <w:ilvl w:val="0"/>
-          <w:numId w:val="1440"/>
+          <w:numId w:val="1445"/>
         </w:numPr>
       </w:pPr>
       <w:r>
@@ -10643,7 +10793,7 @@
         <w:pStyle w:val="Compact"/>
         <w:numPr>
           <w:ilvl w:val="0"/>
-          <w:numId w:val="1441"/>
+          <w:numId w:val="1446"/>
         </w:numPr>
       </w:pPr>
       <w:r>
@@ -10665,7 +10815,7 @@
         <w:pStyle w:val="Compact"/>
         <w:numPr>
           <w:ilvl w:val="0"/>
-          <w:numId w:val="1442"/>
+          <w:numId w:val="1447"/>
         </w:numPr>
       </w:pPr>
       <w:r>
@@ -10677,7 +10827,7 @@
         <w:pStyle w:val="Compact"/>
         <w:numPr>
           <w:ilvl w:val="0"/>
-          <w:numId w:val="1443"/>
+          <w:numId w:val="1448"/>
         </w:numPr>
       </w:pPr>
       <w:r>
@@ -10689,7 +10839,7 @@
         <w:pStyle w:val="Compact"/>
         <w:numPr>
           <w:ilvl w:val="0"/>
-          <w:numId w:val="1444"/>
+          <w:numId w:val="1449"/>
         </w:numPr>
       </w:pPr>
       <w:r>
@@ -10701,7 +10851,7 @@
         <w:pStyle w:val="Compact"/>
         <w:numPr>
           <w:ilvl w:val="0"/>
-          <w:numId w:val="1445"/>
+          <w:numId w:val="1450"/>
         </w:numPr>
       </w:pPr>
       <w:r>
@@ -10713,7 +10863,7 @@
         <w:pStyle w:val="Compact"/>
         <w:numPr>
           <w:ilvl w:val="0"/>
-          <w:numId w:val="1446"/>
+          <w:numId w:val="1451"/>
         </w:numPr>
       </w:pPr>
       <w:r>
@@ -10725,7 +10875,7 @@
         <w:pStyle w:val="Compact"/>
         <w:numPr>
           <w:ilvl w:val="0"/>
-          <w:numId w:val="1447"/>
+          <w:numId w:val="1452"/>
         </w:numPr>
       </w:pPr>
       <w:r>
@@ -10737,7 +10887,7 @@
         <w:pStyle w:val="Compact"/>
         <w:numPr>
           <w:ilvl w:val="0"/>
-          <w:numId w:val="1448"/>
+          <w:numId w:val="1453"/>
         </w:numPr>
       </w:pPr>
       <w:r>
@@ -10749,7 +10899,7 @@
         <w:pStyle w:val="Compact"/>
         <w:numPr>
           <w:ilvl w:val="0"/>
-          <w:numId w:val="1449"/>
+          <w:numId w:val="1454"/>
         </w:numPr>
       </w:pPr>
       <w:r>
@@ -10761,7 +10911,7 @@
         <w:pStyle w:val="Compact"/>
         <w:numPr>
           <w:ilvl w:val="0"/>
-          <w:numId w:val="1450"/>
+          <w:numId w:val="1455"/>
         </w:numPr>
       </w:pPr>
       <w:r>
@@ -10793,7 +10943,7 @@
         <w:pStyle w:val="Compact"/>
         <w:numPr>
           <w:ilvl w:val="0"/>
-          <w:numId w:val="1451"/>
+          <w:numId w:val="1456"/>
         </w:numPr>
       </w:pPr>
       <w:r>
@@ -10820,7 +10970,7 @@
         <w:pStyle w:val="Compact"/>
         <w:numPr>
           <w:ilvl w:val="0"/>
-          <w:numId w:val="1452"/>
+          <w:numId w:val="1457"/>
         </w:numPr>
       </w:pPr>
       <w:r>
@@ -10892,7 +11042,7 @@
         <w:pStyle w:val="Compact"/>
         <w:numPr>
           <w:ilvl w:val="0"/>
-          <w:numId w:val="1453"/>
+          <w:numId w:val="1458"/>
         </w:numPr>
       </w:pPr>
       <w:r>
@@ -10919,7 +11069,7 @@
         <w:pStyle w:val="Compact"/>
         <w:numPr>
           <w:ilvl w:val="0"/>
-          <w:numId w:val="1454"/>
+          <w:numId w:val="1459"/>
         </w:numPr>
       </w:pPr>
       <w:r>
@@ -10931,7 +11081,7 @@
         <w:pStyle w:val="Compact"/>
         <w:numPr>
           <w:ilvl w:val="0"/>
-          <w:numId w:val="1455"/>
+          <w:numId w:val="1460"/>
         </w:numPr>
       </w:pPr>
       <w:r>
@@ -10958,7 +11108,7 @@
         <w:pStyle w:val="Compact"/>
         <w:numPr>
           <w:ilvl w:val="0"/>
-          <w:numId w:val="1456"/>
+          <w:numId w:val="1461"/>
         </w:numPr>
       </w:pPr>
       <w:r>
@@ -10970,7 +11120,7 @@
         <w:pStyle w:val="Compact"/>
         <w:numPr>
           <w:ilvl w:val="0"/>
-          <w:numId w:val="1457"/>
+          <w:numId w:val="1462"/>
         </w:numPr>
       </w:pPr>
       <w:r>
@@ -10997,7 +11147,7 @@
         <w:pStyle w:val="Compact"/>
         <w:numPr>
           <w:ilvl w:val="0"/>
-          <w:numId w:val="1458"/>
+          <w:numId w:val="1463"/>
         </w:numPr>
       </w:pPr>
       <w:r>
@@ -11039,7 +11189,7 @@
         <w:pStyle w:val="Compact"/>
         <w:numPr>
           <w:ilvl w:val="0"/>
-          <w:numId w:val="1459"/>
+          <w:numId w:val="1464"/>
         </w:numPr>
       </w:pPr>
       <w:r>
@@ -11075,7 +11225,7 @@
         <w:pStyle w:val="Compact"/>
         <w:numPr>
           <w:ilvl w:val="0"/>
-          <w:numId w:val="1460"/>
+          <w:numId w:val="1465"/>
         </w:numPr>
       </w:pPr>
       <w:r>
@@ -11097,7 +11247,7 @@
         <w:pStyle w:val="Compact"/>
         <w:numPr>
           <w:ilvl w:val="0"/>
-          <w:numId w:val="1461"/>
+          <w:numId w:val="1466"/>
         </w:numPr>
       </w:pPr>
       <w:r>
@@ -11109,7 +11259,7 @@
         <w:pStyle w:val="Compact"/>
         <w:numPr>
           <w:ilvl w:val="0"/>
-          <w:numId w:val="1462"/>
+          <w:numId w:val="1467"/>
         </w:numPr>
       </w:pPr>
       <w:r>
@@ -11121,7 +11271,7 @@
         <w:pStyle w:val="Compact"/>
         <w:numPr>
           <w:ilvl w:val="1"/>
-          <w:numId w:val="1463"/>
+          <w:numId w:val="1468"/>
         </w:numPr>
       </w:pPr>
       <w:r>
@@ -11133,7 +11283,7 @@
         <w:pStyle w:val="Compact"/>
         <w:numPr>
           <w:ilvl w:val="1"/>
-          <w:numId w:val="1463"/>
+          <w:numId w:val="1468"/>
         </w:numPr>
       </w:pPr>
       <w:r>
@@ -11145,7 +11295,7 @@
         <w:pStyle w:val="Compact"/>
         <w:numPr>
           <w:ilvl w:val="1"/>
-          <w:numId w:val="1463"/>
+          <w:numId w:val="1468"/>
         </w:numPr>
       </w:pPr>
       <w:r>
@@ -11157,7 +11307,7 @@
         <w:pStyle w:val="Compact"/>
         <w:numPr>
           <w:ilvl w:val="1"/>
-          <w:numId w:val="1463"/>
+          <w:numId w:val="1468"/>
         </w:numPr>
       </w:pPr>
       <w:r>
@@ -11169,7 +11319,7 @@
         <w:pStyle w:val="Compact"/>
         <w:numPr>
           <w:ilvl w:val="1"/>
-          <w:numId w:val="1463"/>
+          <w:numId w:val="1468"/>
         </w:numPr>
       </w:pPr>
       <w:r>
@@ -11181,7 +11331,7 @@
         <w:pStyle w:val="Compact"/>
         <w:numPr>
           <w:ilvl w:val="1"/>
-          <w:numId w:val="1463"/>
+          <w:numId w:val="1468"/>
         </w:numPr>
       </w:pPr>
       <w:r>
@@ -11193,7 +11343,7 @@
         <w:pStyle w:val="Compact"/>
         <w:numPr>
           <w:ilvl w:val="1"/>
-          <w:numId w:val="1463"/>
+          <w:numId w:val="1468"/>
         </w:numPr>
       </w:pPr>
       <w:r>
@@ -11205,7 +11355,7 @@
         <w:pStyle w:val="Compact"/>
         <w:numPr>
           <w:ilvl w:val="1"/>
-          <w:numId w:val="1463"/>
+          <w:numId w:val="1468"/>
         </w:numPr>
       </w:pPr>
       <w:r>
@@ -11217,7 +11367,7 @@
         <w:pStyle w:val="Compact"/>
         <w:numPr>
           <w:ilvl w:val="0"/>
-          <w:numId w:val="1464"/>
+          <w:numId w:val="1469"/>
         </w:numPr>
       </w:pPr>
       <w:r>
@@ -11238,7 +11388,7 @@
         <w:pStyle w:val="Compact"/>
         <w:numPr>
           <w:ilvl w:val="0"/>
-          <w:numId w:val="1465"/>
+          <w:numId w:val="1470"/>
         </w:numPr>
       </w:pPr>
       <w:r>
@@ -11262,7 +11412,7 @@
         <w:pStyle w:val="Compact"/>
         <w:numPr>
           <w:ilvl w:val="0"/>
-          <w:numId w:val="1466"/>
+          <w:numId w:val="1471"/>
         </w:numPr>
       </w:pPr>
       <w:r>
@@ -11274,7 +11424,7 @@
         <w:pStyle w:val="Compact"/>
         <w:numPr>
           <w:ilvl w:val="1"/>
-          <w:numId w:val="1467"/>
+          <w:numId w:val="1472"/>
         </w:numPr>
       </w:pPr>
       <w:r>
@@ -11286,7 +11436,7 @@
         <w:pStyle w:val="Compact"/>
         <w:numPr>
           <w:ilvl w:val="1"/>
-          <w:numId w:val="1467"/>
+          <w:numId w:val="1472"/>
         </w:numPr>
       </w:pPr>
       <w:r>
@@ -11298,7 +11448,7 @@
         <w:pStyle w:val="Compact"/>
         <w:numPr>
           <w:ilvl w:val="1"/>
-          <w:numId w:val="1467"/>
+          <w:numId w:val="1472"/>
         </w:numPr>
       </w:pPr>
       <w:r>
@@ -11310,7 +11460,7 @@
         <w:pStyle w:val="Compact"/>
         <w:numPr>
           <w:ilvl w:val="0"/>
-          <w:numId w:val="1468"/>
+          <w:numId w:val="1473"/>
         </w:numPr>
       </w:pPr>
       <w:r>
@@ -11334,7 +11484,7 @@
         <w:pStyle w:val="Compact"/>
         <w:numPr>
           <w:ilvl w:val="0"/>
-          <w:numId w:val="1469"/>
+          <w:numId w:val="1474"/>
         </w:numPr>
       </w:pPr>
       <w:r>
@@ -11346,7 +11496,7 @@
         <w:pStyle w:val="Compact"/>
         <w:numPr>
           <w:ilvl w:val="0"/>
-          <w:numId w:val="1470"/>
+          <w:numId w:val="1475"/>
         </w:numPr>
       </w:pPr>
       <w:r>
@@ -11358,7 +11508,7 @@
         <w:pStyle w:val="Compact"/>
         <w:numPr>
           <w:ilvl w:val="0"/>
-          <w:numId w:val="1471"/>
+          <w:numId w:val="1476"/>
         </w:numPr>
       </w:pPr>
       <w:r>
@@ -11380,7 +11530,7 @@
         <w:pStyle w:val="Compact"/>
         <w:numPr>
           <w:ilvl w:val="0"/>
-          <w:numId w:val="1472"/>
+          <w:numId w:val="1477"/>
         </w:numPr>
       </w:pPr>
       <w:r>
@@ -11392,7 +11542,7 @@
         <w:pStyle w:val="Compact"/>
         <w:numPr>
           <w:ilvl w:val="1"/>
-          <w:numId w:val="1473"/>
+          <w:numId w:val="1478"/>
         </w:numPr>
       </w:pPr>
       <w:r>
@@ -11404,7 +11554,7 @@
         <w:pStyle w:val="Compact"/>
         <w:numPr>
           <w:ilvl w:val="1"/>
-          <w:numId w:val="1473"/>
+          <w:numId w:val="1478"/>
         </w:numPr>
       </w:pPr>
       <w:r>
@@ -11416,7 +11566,7 @@
         <w:pStyle w:val="Compact"/>
         <w:numPr>
           <w:ilvl w:val="1"/>
-          <w:numId w:val="1473"/>
+          <w:numId w:val="1478"/>
         </w:numPr>
       </w:pPr>
       <w:r>
@@ -11428,7 +11578,7 @@
         <w:pStyle w:val="Compact"/>
         <w:numPr>
           <w:ilvl w:val="0"/>
-          <w:numId w:val="1474"/>
+          <w:numId w:val="1479"/>
         </w:numPr>
       </w:pPr>
       <w:r>
@@ -11440,7 +11590,7 @@
         <w:pStyle w:val="Compact"/>
         <w:numPr>
           <w:ilvl w:val="1"/>
-          <w:numId w:val="1475"/>
+          <w:numId w:val="1480"/>
         </w:numPr>
       </w:pPr>
       <w:r>
@@ -11452,7 +11602,7 @@
         <w:pStyle w:val="Compact"/>
         <w:numPr>
           <w:ilvl w:val="1"/>
-          <w:numId w:val="1475"/>
+          <w:numId w:val="1480"/>
         </w:numPr>
       </w:pPr>
       <w:r>
@@ -11464,7 +11614,7 @@
         <w:pStyle w:val="Compact"/>
         <w:numPr>
           <w:ilvl w:val="1"/>
-          <w:numId w:val="1475"/>
+          <w:numId w:val="1480"/>
         </w:numPr>
       </w:pPr>
       <w:r>
@@ -11476,7 +11626,7 @@
         <w:pStyle w:val="Compact"/>
         <w:numPr>
           <w:ilvl w:val="0"/>
-          <w:numId w:val="1476"/>
+          <w:numId w:val="1481"/>
         </w:numPr>
       </w:pPr>
       <w:r>
@@ -11488,7 +11638,7 @@
         <w:pStyle w:val="Compact"/>
         <w:numPr>
           <w:ilvl w:val="0"/>
-          <w:numId w:val="1477"/>
+          <w:numId w:val="1482"/>
         </w:numPr>
       </w:pPr>
       <w:r>
@@ -11500,7 +11650,7 @@
         <w:pStyle w:val="Compact"/>
         <w:numPr>
           <w:ilvl w:val="0"/>
-          <w:numId w:val="1478"/>
+          <w:numId w:val="1483"/>
         </w:numPr>
       </w:pPr>
       <w:r>
@@ -11522,7 +11672,7 @@
         <w:pStyle w:val="Compact"/>
         <w:numPr>
           <w:ilvl w:val="0"/>
-          <w:numId w:val="1479"/>
+          <w:numId w:val="1484"/>
         </w:numPr>
       </w:pPr>
       <w:r>
@@ -11543,7 +11693,7 @@
         <w:pStyle w:val="Compact"/>
         <w:numPr>
           <w:ilvl w:val="0"/>
-          <w:numId w:val="1480"/>
+          <w:numId w:val="1485"/>
         </w:numPr>
       </w:pPr>
       <w:r>
@@ -11555,7 +11705,7 @@
         <w:pStyle w:val="Compact"/>
         <w:numPr>
           <w:ilvl w:val="0"/>
-          <w:numId w:val="1481"/>
+          <w:numId w:val="1486"/>
         </w:numPr>
       </w:pPr>
       <w:r>
@@ -11567,7 +11717,7 @@
         <w:pStyle w:val="Compact"/>
         <w:numPr>
           <w:ilvl w:val="0"/>
-          <w:numId w:val="1482"/>
+          <w:numId w:val="1487"/>
         </w:numPr>
       </w:pPr>
       <w:r>
@@ -11579,7 +11729,7 @@
         <w:pStyle w:val="Compact"/>
         <w:numPr>
           <w:ilvl w:val="0"/>
-          <w:numId w:val="1483"/>
+          <w:numId w:val="1488"/>
         </w:numPr>
       </w:pPr>
       <w:r>
@@ -11591,7 +11741,7 @@
         <w:pStyle w:val="Compact"/>
         <w:numPr>
           <w:ilvl w:val="0"/>
-          <w:numId w:val="1484"/>
+          <w:numId w:val="1489"/>
         </w:numPr>
       </w:pPr>
       <w:r>
@@ -11603,7 +11753,7 @@
         <w:pStyle w:val="Compact"/>
         <w:numPr>
           <w:ilvl w:val="1"/>
-          <w:numId w:val="1485"/>
+          <w:numId w:val="1490"/>
         </w:numPr>
       </w:pPr>
       <w:r>
@@ -11615,7 +11765,7 @@
         <w:pStyle w:val="Compact"/>
         <w:numPr>
           <w:ilvl w:val="1"/>
-          <w:numId w:val="1485"/>
+          <w:numId w:val="1490"/>
         </w:numPr>
       </w:pPr>
       <w:r>
@@ -11627,7 +11777,7 @@
         <w:pStyle w:val="Compact"/>
         <w:numPr>
           <w:ilvl w:val="1"/>
-          <w:numId w:val="1485"/>
+          <w:numId w:val="1490"/>
         </w:numPr>
       </w:pPr>
       <w:r>
@@ -11639,7 +11789,7 @@
         <w:pStyle w:val="Compact"/>
         <w:numPr>
           <w:ilvl w:val="1"/>
-          <w:numId w:val="1485"/>
+          <w:numId w:val="1490"/>
         </w:numPr>
       </w:pPr>
       <w:r>
@@ -11651,7 +11801,7 @@
         <w:pStyle w:val="Compact"/>
         <w:numPr>
           <w:ilvl w:val="1"/>
-          <w:numId w:val="1485"/>
+          <w:numId w:val="1490"/>
         </w:numPr>
       </w:pPr>
       <w:r>
@@ -11663,7 +11813,7 @@
         <w:pStyle w:val="Compact"/>
         <w:numPr>
           <w:ilvl w:val="1"/>
-          <w:numId w:val="1485"/>
+          <w:numId w:val="1490"/>
         </w:numPr>
       </w:pPr>
       <w:r>
@@ -11675,7 +11825,7 @@
         <w:pStyle w:val="Compact"/>
         <w:numPr>
           <w:ilvl w:val="0"/>
-          <w:numId w:val="1486"/>
+          <w:numId w:val="1491"/>
         </w:numPr>
       </w:pPr>
       <w:r>
@@ -11687,7 +11837,7 @@
         <w:pStyle w:val="Compact"/>
         <w:numPr>
           <w:ilvl w:val="0"/>
-          <w:numId w:val="1487"/>
+          <w:numId w:val="1492"/>
         </w:numPr>
       </w:pPr>
       <w:r>
@@ -11709,7 +11859,7 @@
         <w:pStyle w:val="Compact"/>
         <w:numPr>
           <w:ilvl w:val="0"/>
-          <w:numId w:val="1488"/>
+          <w:numId w:val="1493"/>
         </w:numPr>
       </w:pPr>
       <w:r>
@@ -11721,7 +11871,7 @@
         <w:pStyle w:val="Compact"/>
         <w:numPr>
           <w:ilvl w:val="0"/>
-          <w:numId w:val="1489"/>
+          <w:numId w:val="1494"/>
         </w:numPr>
       </w:pPr>
       <w:r>
@@ -11733,7 +11883,7 @@
         <w:pStyle w:val="Compact"/>
         <w:numPr>
           <w:ilvl w:val="0"/>
-          <w:numId w:val="1490"/>
+          <w:numId w:val="1495"/>
         </w:numPr>
       </w:pPr>
       <w:r>
@@ -11745,7 +11895,7 @@
         <w:pStyle w:val="Compact"/>
         <w:numPr>
           <w:ilvl w:val="0"/>
-          <w:numId w:val="1491"/>
+          <w:numId w:val="1496"/>
         </w:numPr>
       </w:pPr>
       <w:r>
@@ -11757,7 +11907,7 @@
         <w:pStyle w:val="Compact"/>
         <w:numPr>
           <w:ilvl w:val="0"/>
-          <w:numId w:val="1492"/>
+          <w:numId w:val="1497"/>
         </w:numPr>
       </w:pPr>
       <w:r>
@@ -11779,7 +11929,7 @@
         <w:pStyle w:val="Compact"/>
         <w:numPr>
           <w:ilvl w:val="0"/>
-          <w:numId w:val="1493"/>
+          <w:numId w:val="1498"/>
         </w:numPr>
       </w:pPr>
       <w:r>
@@ -11791,7 +11941,7 @@
         <w:pStyle w:val="Compact"/>
         <w:numPr>
           <w:ilvl w:val="0"/>
-          <w:numId w:val="1494"/>
+          <w:numId w:val="1499"/>
         </w:numPr>
       </w:pPr>
       <w:r>
@@ -11803,7 +11953,7 @@
         <w:pStyle w:val="Compact"/>
         <w:numPr>
           <w:ilvl w:val="0"/>
-          <w:numId w:val="1495"/>
+          <w:numId w:val="1500"/>
         </w:numPr>
       </w:pPr>
       <w:r>
@@ -11815,7 +11965,7 @@
         <w:pStyle w:val="Compact"/>
         <w:numPr>
           <w:ilvl w:val="0"/>
-          <w:numId w:val="1496"/>
+          <w:numId w:val="1501"/>
         </w:numPr>
       </w:pPr>
       <w:r>
@@ -11827,7 +11977,7 @@
         <w:pStyle w:val="Compact"/>
         <w:numPr>
           <w:ilvl w:val="0"/>
-          <w:numId w:val="1497"/>
+          <w:numId w:val="1502"/>
         </w:numPr>
       </w:pPr>
       <w:r>
@@ -11839,7 +11989,7 @@
         <w:pStyle w:val="Compact"/>
         <w:numPr>
           <w:ilvl w:val="0"/>
-          <w:numId w:val="1498"/>
+          <w:numId w:val="1503"/>
         </w:numPr>
       </w:pPr>
       <w:r>
@@ -11851,7 +12001,7 @@
         <w:pStyle w:val="Compact"/>
         <w:numPr>
           <w:ilvl w:val="0"/>
-          <w:numId w:val="1499"/>
+          <w:numId w:val="1504"/>
         </w:numPr>
       </w:pPr>
       <w:r>
@@ -11863,7 +12013,7 @@
         <w:pStyle w:val="Compact"/>
         <w:numPr>
           <w:ilvl w:val="0"/>
-          <w:numId w:val="1500"/>
+          <w:numId w:val="1505"/>
         </w:numPr>
       </w:pPr>
       <w:r>
@@ -11895,7 +12045,7 @@
         <w:pStyle w:val="Compact"/>
         <w:numPr>
           <w:ilvl w:val="0"/>
-          <w:numId w:val="1501"/>
+          <w:numId w:val="1506"/>
         </w:numPr>
       </w:pPr>
       <w:r>
@@ -11943,7 +12093,7 @@
         <w:pStyle w:val="Compact"/>
         <w:numPr>
           <w:ilvl w:val="0"/>
-          <w:numId w:val="1502"/>
+          <w:numId w:val="1507"/>
         </w:numPr>
       </w:pPr>
       <w:r>
@@ -11955,7 +12105,7 @@
         <w:pStyle w:val="Compact"/>
         <w:numPr>
           <w:ilvl w:val="0"/>
-          <w:numId w:val="1503"/>
+          <w:numId w:val="1508"/>
         </w:numPr>
       </w:pPr>
       <w:r>
@@ -11967,7 +12117,7 @@
         <w:pStyle w:val="Compact"/>
         <w:numPr>
           <w:ilvl w:val="0"/>
-          <w:numId w:val="1504"/>
+          <w:numId w:val="1509"/>
         </w:numPr>
       </w:pPr>
       <w:r>
@@ -11979,7 +12129,7 @@
         <w:pStyle w:val="Compact"/>
         <w:numPr>
           <w:ilvl w:val="0"/>
-          <w:numId w:val="1505"/>
+          <w:numId w:val="1510"/>
         </w:numPr>
       </w:pPr>
       <w:r>
@@ -11991,7 +12141,7 @@
         <w:pStyle w:val="Compact"/>
         <w:numPr>
           <w:ilvl w:val="0"/>
-          <w:numId w:val="1506"/>
+          <w:numId w:val="1511"/>
         </w:numPr>
       </w:pPr>
       <w:r>
@@ -12045,7 +12195,7 @@
         <w:pStyle w:val="Compact"/>
         <w:numPr>
           <w:ilvl w:val="0"/>
-          <w:numId w:val="1507"/>
+          <w:numId w:val="1512"/>
         </w:numPr>
       </w:pPr>
       <w:r>
@@ -12057,7 +12207,7 @@
         <w:pStyle w:val="Compact"/>
         <w:numPr>
           <w:ilvl w:val="0"/>
-          <w:numId w:val="1508"/>
+          <w:numId w:val="1513"/>
         </w:numPr>
       </w:pPr>
       <w:r>
@@ -12084,7 +12234,7 @@
         <w:pStyle w:val="Compact"/>
         <w:numPr>
           <w:ilvl w:val="0"/>
-          <w:numId w:val="1509"/>
+          <w:numId w:val="1514"/>
         </w:numPr>
       </w:pPr>
       <w:r>
@@ -12126,7 +12276,7 @@
         <w:pStyle w:val="Compact"/>
         <w:numPr>
           <w:ilvl w:val="0"/>
-          <w:numId w:val="1510"/>
+          <w:numId w:val="1515"/>
         </w:numPr>
       </w:pPr>
       <w:r>
@@ -12153,7 +12303,7 @@
         <w:pStyle w:val="Compact"/>
         <w:numPr>
           <w:ilvl w:val="0"/>
-          <w:numId w:val="1511"/>
+          <w:numId w:val="1516"/>
         </w:numPr>
       </w:pPr>
       <w:r>
@@ -12165,7 +12315,7 @@
         <w:pStyle w:val="Compact"/>
         <w:numPr>
           <w:ilvl w:val="0"/>
-          <w:numId w:val="1512"/>
+          <w:numId w:val="1517"/>
         </w:numPr>
       </w:pPr>
       <w:r>
@@ -12177,7 +12327,7 @@
         <w:pStyle w:val="Compact"/>
         <w:numPr>
           <w:ilvl w:val="0"/>
-          <w:numId w:val="1513"/>
+          <w:numId w:val="1518"/>
         </w:numPr>
       </w:pPr>
       <w:r>
@@ -12214,7 +12364,7 @@
         <w:pStyle w:val="Compact"/>
         <w:numPr>
           <w:ilvl w:val="0"/>
-          <w:numId w:val="1514"/>
+          <w:numId w:val="1519"/>
         </w:numPr>
       </w:pPr>
       <w:r>
@@ -12226,7 +12376,7 @@
         <w:pStyle w:val="Compact"/>
         <w:numPr>
           <w:ilvl w:val="0"/>
-          <w:numId w:val="1515"/>
+          <w:numId w:val="1520"/>
         </w:numPr>
       </w:pPr>
       <w:r>
@@ -12238,7 +12388,7 @@
         <w:pStyle w:val="Compact"/>
         <w:numPr>
           <w:ilvl w:val="0"/>
-          <w:numId w:val="1516"/>
+          <w:numId w:val="1521"/>
         </w:numPr>
       </w:pPr>
       <w:r>
@@ -12250,7 +12400,7 @@
         <w:pStyle w:val="Compact"/>
         <w:numPr>
           <w:ilvl w:val="0"/>
-          <w:numId w:val="1517"/>
+          <w:numId w:val="1522"/>
         </w:numPr>
       </w:pPr>
       <w:r>
@@ -12262,7 +12412,7 @@
         <w:pStyle w:val="Compact"/>
         <w:numPr>
           <w:ilvl w:val="0"/>
-          <w:numId w:val="1518"/>
+          <w:numId w:val="1523"/>
         </w:numPr>
       </w:pPr>
       <w:r>
@@ -12274,7 +12424,7 @@
         <w:pStyle w:val="Compact"/>
         <w:numPr>
           <w:ilvl w:val="0"/>
-          <w:numId w:val="1519"/>
+          <w:numId w:val="1524"/>
         </w:numPr>
       </w:pPr>
       <w:r>
@@ -12286,7 +12436,7 @@
         <w:pStyle w:val="Compact"/>
         <w:numPr>
           <w:ilvl w:val="1"/>
-          <w:numId w:val="1520"/>
+          <w:numId w:val="1525"/>
         </w:numPr>
       </w:pPr>
       <w:r>
@@ -12313,7 +12463,7 @@
         <w:pStyle w:val="Compact"/>
         <w:numPr>
           <w:ilvl w:val="1"/>
-          <w:numId w:val="1520"/>
+          <w:numId w:val="1525"/>
         </w:numPr>
       </w:pPr>
       <w:r>
@@ -12350,7 +12500,7 @@
         <w:pStyle w:val="Compact"/>
         <w:numPr>
           <w:ilvl w:val="0"/>
-          <w:numId w:val="1521"/>
+          <w:numId w:val="1526"/>
         </w:numPr>
       </w:pPr>
       <w:r>
@@ -12392,7 +12542,7 @@
         <w:pStyle w:val="Compact"/>
         <w:numPr>
           <w:ilvl w:val="0"/>
-          <w:numId w:val="1522"/>
+          <w:numId w:val="1527"/>
         </w:numPr>
       </w:pPr>
       <w:r>
@@ -12416,7 +12566,7 @@
         <w:pStyle w:val="Compact"/>
         <w:numPr>
           <w:ilvl w:val="0"/>
-          <w:numId w:val="1523"/>
+          <w:numId w:val="1528"/>
         </w:numPr>
       </w:pPr>
       <w:r>
@@ -12440,7 +12590,7 @@
         <w:pStyle w:val="Compact"/>
         <w:numPr>
           <w:ilvl w:val="0"/>
-          <w:numId w:val="1524"/>
+          <w:numId w:val="1529"/>
         </w:numPr>
       </w:pPr>
       <w:r>
@@ -12452,7 +12602,7 @@
         <w:pStyle w:val="Compact"/>
         <w:numPr>
           <w:ilvl w:val="0"/>
-          <w:numId w:val="1525"/>
+          <w:numId w:val="1530"/>
         </w:numPr>
       </w:pPr>
       <w:r>
@@ -12464,7 +12614,7 @@
         <w:pStyle w:val="Compact"/>
         <w:numPr>
           <w:ilvl w:val="0"/>
-          <w:numId w:val="1526"/>
+          <w:numId w:val="1531"/>
         </w:numPr>
       </w:pPr>
       <w:r>
@@ -12476,7 +12626,7 @@
         <w:pStyle w:val="Compact"/>
         <w:numPr>
           <w:ilvl w:val="0"/>
-          <w:numId w:val="1527"/>
+          <w:numId w:val="1532"/>
         </w:numPr>
       </w:pPr>
       <w:r>
@@ -12488,7 +12638,7 @@
         <w:pStyle w:val="Compact"/>
         <w:numPr>
           <w:ilvl w:val="0"/>
-          <w:numId w:val="1528"/>
+          <w:numId w:val="1533"/>
         </w:numPr>
       </w:pPr>
       <w:r>
@@ -12500,7 +12650,7 @@
         <w:pStyle w:val="Compact"/>
         <w:numPr>
           <w:ilvl w:val="0"/>
-          <w:numId w:val="1529"/>
+          <w:numId w:val="1534"/>
         </w:numPr>
       </w:pPr>
       <w:r>
@@ -12512,7 +12662,7 @@
         <w:pStyle w:val="Compact"/>
         <w:numPr>
           <w:ilvl w:val="0"/>
-          <w:numId w:val="1530"/>
+          <w:numId w:val="1535"/>
         </w:numPr>
       </w:pPr>
       <w:r>
@@ -12524,7 +12674,7 @@
         <w:pStyle w:val="Compact"/>
         <w:numPr>
           <w:ilvl w:val="0"/>
-          <w:numId w:val="1531"/>
+          <w:numId w:val="1536"/>
         </w:numPr>
       </w:pPr>
       <w:r>
@@ -12536,7 +12686,7 @@
         <w:pStyle w:val="Compact"/>
         <w:numPr>
           <w:ilvl w:val="0"/>
-          <w:numId w:val="1532"/>
+          <w:numId w:val="1537"/>
         </w:numPr>
       </w:pPr>
       <w:r>
@@ -12548,7 +12698,7 @@
         <w:pStyle w:val="Compact"/>
         <w:numPr>
           <w:ilvl w:val="0"/>
-          <w:numId w:val="1533"/>
+          <w:numId w:val="1538"/>
         </w:numPr>
       </w:pPr>
       <w:r>
@@ -12560,7 +12710,7 @@
         <w:pStyle w:val="Compact"/>
         <w:numPr>
           <w:ilvl w:val="0"/>
-          <w:numId w:val="1534"/>
+          <w:numId w:val="1539"/>
         </w:numPr>
       </w:pPr>
       <w:r>
@@ -12587,7 +12737,7 @@
         <w:pStyle w:val="Compact"/>
         <w:numPr>
           <w:ilvl w:val="0"/>
-          <w:numId w:val="1535"/>
+          <w:numId w:val="1540"/>
         </w:numPr>
       </w:pPr>
       <w:r>
@@ -12599,7 +12749,7 @@
         <w:pStyle w:val="Compact"/>
         <w:numPr>
           <w:ilvl w:val="0"/>
-          <w:numId w:val="1536"/>
+          <w:numId w:val="1541"/>
         </w:numPr>
       </w:pPr>
       <w:r>
@@ -12621,7 +12771,7 @@
         <w:pStyle w:val="Compact"/>
         <w:numPr>
           <w:ilvl w:val="0"/>
-          <w:numId w:val="1537"/>
+          <w:numId w:val="1542"/>
         </w:numPr>
       </w:pPr>
       <w:r>
@@ -12633,7 +12783,7 @@
         <w:pStyle w:val="Compact"/>
         <w:numPr>
           <w:ilvl w:val="0"/>
-          <w:numId w:val="1538"/>
+          <w:numId w:val="1543"/>
         </w:numPr>
       </w:pPr>
       <w:r>
@@ -12660,7 +12810,7 @@
         <w:pStyle w:val="Compact"/>
         <w:numPr>
           <w:ilvl w:val="0"/>
-          <w:numId w:val="1539"/>
+          <w:numId w:val="1544"/>
         </w:numPr>
       </w:pPr>
       <w:r>
@@ -12687,7 +12837,7 @@
         <w:pStyle w:val="Compact"/>
         <w:numPr>
           <w:ilvl w:val="0"/>
-          <w:numId w:val="1540"/>
+          <w:numId w:val="1545"/>
         </w:numPr>
       </w:pPr>
       <w:r>
@@ -12714,7 +12864,7 @@
         <w:pStyle w:val="Compact"/>
         <w:numPr>
           <w:ilvl w:val="0"/>
-          <w:numId w:val="1541"/>
+          <w:numId w:val="1546"/>
         </w:numPr>
       </w:pPr>
       <w:r>
@@ -12726,7 +12876,7 @@
         <w:pStyle w:val="Compact"/>
         <w:numPr>
           <w:ilvl w:val="1"/>
-          <w:numId w:val="1542"/>
+          <w:numId w:val="1547"/>
         </w:numPr>
       </w:pPr>
       <w:r>
@@ -12738,7 +12888,7 @@
         <w:pStyle w:val="Compact"/>
         <w:numPr>
           <w:ilvl w:val="1"/>
-          <w:numId w:val="1542"/>
+          <w:numId w:val="1547"/>
         </w:numPr>
       </w:pPr>
       <w:r>
@@ -12750,7 +12900,7 @@
         <w:pStyle w:val="Compact"/>
         <w:numPr>
           <w:ilvl w:val="1"/>
-          <w:numId w:val="1542"/>
+          <w:numId w:val="1547"/>
         </w:numPr>
       </w:pPr>
       <w:r>
@@ -12762,7 +12912,7 @@
         <w:pStyle w:val="Compact"/>
         <w:numPr>
           <w:ilvl w:val="0"/>
-          <w:numId w:val="1543"/>
+          <w:numId w:val="1548"/>
         </w:numPr>
       </w:pPr>
       <w:r>
@@ -12774,7 +12924,7 @@
         <w:pStyle w:val="Compact"/>
         <w:numPr>
           <w:ilvl w:val="0"/>
-          <w:numId w:val="1544"/>
+          <w:numId w:val="1549"/>
         </w:numPr>
       </w:pPr>
       <w:r>
@@ -12786,7 +12936,7 @@
         <w:pStyle w:val="Compact"/>
         <w:numPr>
           <w:ilvl w:val="1"/>
-          <w:numId w:val="1545"/>
+          <w:numId w:val="1550"/>
         </w:numPr>
       </w:pPr>
       <w:r>
@@ -12798,7 +12948,7 @@
         <w:pStyle w:val="Compact"/>
         <w:numPr>
           <w:ilvl w:val="1"/>
-          <w:numId w:val="1545"/>
+          <w:numId w:val="1550"/>
         </w:numPr>
       </w:pPr>
       <w:r>
@@ -12810,7 +12960,7 @@
         <w:pStyle w:val="Compact"/>
         <w:numPr>
           <w:ilvl w:val="1"/>
-          <w:numId w:val="1545"/>
+          <w:numId w:val="1550"/>
         </w:numPr>
       </w:pPr>
       <w:r>
@@ -12822,7 +12972,7 @@
         <w:pStyle w:val="Compact"/>
         <w:numPr>
           <w:ilvl w:val="1"/>
-          <w:numId w:val="1545"/>
+          <w:numId w:val="1550"/>
         </w:numPr>
       </w:pPr>
       <w:r>
@@ -12834,7 +12984,7 @@
         <w:pStyle w:val="Compact"/>
         <w:numPr>
           <w:ilvl w:val="1"/>
-          <w:numId w:val="1545"/>
+          <w:numId w:val="1550"/>
         </w:numPr>
       </w:pPr>
       <w:r>
@@ -12846,7 +12996,7 @@
         <w:pStyle w:val="Compact"/>
         <w:numPr>
           <w:ilvl w:val="1"/>
-          <w:numId w:val="1545"/>
+          <w:numId w:val="1550"/>
         </w:numPr>
       </w:pPr>
       <w:r>
@@ -12858,7 +13008,7 @@
         <w:pStyle w:val="Compact"/>
         <w:numPr>
           <w:ilvl w:val="0"/>
-          <w:numId w:val="1546"/>
+          <w:numId w:val="1551"/>
         </w:numPr>
       </w:pPr>
       <w:r>
@@ -12870,7 +13020,7 @@
         <w:pStyle w:val="Compact"/>
         <w:numPr>
           <w:ilvl w:val="0"/>
-          <w:numId w:val="1547"/>
+          <w:numId w:val="1552"/>
         </w:numPr>
       </w:pPr>
       <w:r>
@@ -12882,7 +13032,7 @@
         <w:pStyle w:val="Compact"/>
         <w:numPr>
           <w:ilvl w:val="0"/>
-          <w:numId w:val="1548"/>
+          <w:numId w:val="1553"/>
         </w:numPr>
       </w:pPr>
       <w:r>
@@ -12904,7 +13054,7 @@
         <w:pStyle w:val="Compact"/>
         <w:numPr>
           <w:ilvl w:val="0"/>
-          <w:numId w:val="1549"/>
+          <w:numId w:val="1554"/>
         </w:numPr>
       </w:pPr>
       <w:r>
@@ -12916,7 +13066,7 @@
         <w:pStyle w:val="Compact"/>
         <w:numPr>
           <w:ilvl w:val="0"/>
-          <w:numId w:val="1550"/>
+          <w:numId w:val="1555"/>
         </w:numPr>
       </w:pPr>
       <w:r>
@@ -12928,7 +13078,7 @@
         <w:pStyle w:val="Compact"/>
         <w:numPr>
           <w:ilvl w:val="0"/>
-          <w:numId w:val="1551"/>
+          <w:numId w:val="1556"/>
         </w:numPr>
       </w:pPr>
       <w:r>
@@ -12940,7 +13090,7 @@
         <w:pStyle w:val="Compact"/>
         <w:numPr>
           <w:ilvl w:val="0"/>
-          <w:numId w:val="1552"/>
+          <w:numId w:val="1557"/>
         </w:numPr>
       </w:pPr>
       <w:r>
@@ -12952,7 +13102,7 @@
         <w:pStyle w:val="Compact"/>
         <w:numPr>
           <w:ilvl w:val="0"/>
-          <w:numId w:val="1553"/>
+          <w:numId w:val="1558"/>
         </w:numPr>
       </w:pPr>
       <w:r>
@@ -12964,7 +13114,7 @@
         <w:pStyle w:val="Compact"/>
         <w:numPr>
           <w:ilvl w:val="0"/>
-          <w:numId w:val="1554"/>
+          <w:numId w:val="1559"/>
         </w:numPr>
       </w:pPr>
       <w:r>
@@ -12986,7 +13136,7 @@
         <w:pStyle w:val="Compact"/>
         <w:numPr>
           <w:ilvl w:val="0"/>
-          <w:numId w:val="1555"/>
+          <w:numId w:val="1560"/>
         </w:numPr>
       </w:pPr>
       <w:r>
@@ -12998,7 +13148,7 @@
         <w:pStyle w:val="Compact"/>
         <w:numPr>
           <w:ilvl w:val="1"/>
-          <w:numId w:val="1556"/>
+          <w:numId w:val="1561"/>
         </w:numPr>
       </w:pPr>
       <w:r>
@@ -13010,7 +13160,7 @@
         <w:pStyle w:val="Compact"/>
         <w:numPr>
           <w:ilvl w:val="1"/>
-          <w:numId w:val="1556"/>
+          <w:numId w:val="1561"/>
         </w:numPr>
       </w:pPr>
       <w:r>
@@ -13022,7 +13172,7 @@
         <w:pStyle w:val="Compact"/>
         <w:numPr>
           <w:ilvl w:val="0"/>
-          <w:numId w:val="1557"/>
+          <w:numId w:val="1562"/>
         </w:numPr>
       </w:pPr>
       <w:r>
@@ -13034,7 +13184,7 @@
         <w:pStyle w:val="Compact"/>
         <w:numPr>
           <w:ilvl w:val="1"/>
-          <w:numId w:val="1558"/>
+          <w:numId w:val="1563"/>
         </w:numPr>
       </w:pPr>
       <w:r>
@@ -13046,7 +13196,7 @@
         <w:pStyle w:val="Compact"/>
         <w:numPr>
           <w:ilvl w:val="1"/>
-          <w:numId w:val="1558"/>
+          <w:numId w:val="1563"/>
         </w:numPr>
       </w:pPr>
       <w:r>
@@ -13058,7 +13208,7 @@
         <w:pStyle w:val="Compact"/>
         <w:numPr>
           <w:ilvl w:val="0"/>
-          <w:numId w:val="1559"/>
+          <w:numId w:val="1564"/>
         </w:numPr>
       </w:pPr>
       <w:r>
@@ -13070,7 +13220,7 @@
         <w:pStyle w:val="Compact"/>
         <w:numPr>
           <w:ilvl w:val="0"/>
-          <w:numId w:val="1560"/>
+          <w:numId w:val="1565"/>
         </w:numPr>
       </w:pPr>
       <w:r>
@@ -13082,7 +13232,7 @@
         <w:pStyle w:val="Compact"/>
         <w:numPr>
           <w:ilvl w:val="0"/>
-          <w:numId w:val="1561"/>
+          <w:numId w:val="1566"/>
         </w:numPr>
       </w:pPr>
       <w:r>
@@ -13094,7 +13244,7 @@
         <w:pStyle w:val="Compact"/>
         <w:numPr>
           <w:ilvl w:val="0"/>
-          <w:numId w:val="1562"/>
+          <w:numId w:val="1567"/>
         </w:numPr>
       </w:pPr>
       <w:r>
@@ -13116,7 +13266,7 @@
         <w:pStyle w:val="Compact"/>
         <w:numPr>
           <w:ilvl w:val="0"/>
-          <w:numId w:val="1563"/>
+          <w:numId w:val="1568"/>
         </w:numPr>
       </w:pPr>
       <w:r>
@@ -13128,7 +13278,7 @@
         <w:pStyle w:val="Compact"/>
         <w:numPr>
           <w:ilvl w:val="0"/>
-          <w:numId w:val="1564"/>
+          <w:numId w:val="1569"/>
         </w:numPr>
       </w:pPr>
       <w:r>
@@ -13140,7 +13290,7 @@
         <w:pStyle w:val="Compact"/>
         <w:numPr>
           <w:ilvl w:val="0"/>
-          <w:numId w:val="1565"/>
+          <w:numId w:val="1570"/>
         </w:numPr>
       </w:pPr>
       <w:r>
@@ -13152,7 +13302,7 @@
         <w:pStyle w:val="Compact"/>
         <w:numPr>
           <w:ilvl w:val="0"/>
-          <w:numId w:val="1566"/>
+          <w:numId w:val="1571"/>
         </w:numPr>
       </w:pPr>
       <w:r>
@@ -13164,7 +13314,7 @@
         <w:pStyle w:val="Compact"/>
         <w:numPr>
           <w:ilvl w:val="0"/>
-          <w:numId w:val="1567"/>
+          <w:numId w:val="1572"/>
         </w:numPr>
       </w:pPr>
       <w:r>
@@ -13176,7 +13326,7 @@
         <w:pStyle w:val="Compact"/>
         <w:numPr>
           <w:ilvl w:val="0"/>
-          <w:numId w:val="1568"/>
+          <w:numId w:val="1573"/>
         </w:numPr>
       </w:pPr>
       <w:r>
@@ -13188,7 +13338,7 @@
         <w:pStyle w:val="Compact"/>
         <w:numPr>
           <w:ilvl w:val="0"/>
-          <w:numId w:val="1569"/>
+          <w:numId w:val="1574"/>
         </w:numPr>
       </w:pPr>
       <w:r>
@@ -13200,7 +13350,7 @@
         <w:pStyle w:val="Compact"/>
         <w:numPr>
           <w:ilvl w:val="0"/>
-          <w:numId w:val="1570"/>
+          <w:numId w:val="1575"/>
         </w:numPr>
       </w:pPr>
       <w:r>
@@ -13212,7 +13362,7 @@
         <w:pStyle w:val="Compact"/>
         <w:numPr>
           <w:ilvl w:val="0"/>
-          <w:numId w:val="1571"/>
+          <w:numId w:val="1576"/>
         </w:numPr>
       </w:pPr>
       <w:r>
@@ -13234,7 +13384,7 @@
         <w:pStyle w:val="Compact"/>
         <w:numPr>
           <w:ilvl w:val="0"/>
-          <w:numId w:val="1572"/>
+          <w:numId w:val="1577"/>
         </w:numPr>
       </w:pPr>
       <w:r>
@@ -13246,7 +13396,7 @@
         <w:pStyle w:val="Compact"/>
         <w:numPr>
           <w:ilvl w:val="0"/>
-          <w:numId w:val="1573"/>
+          <w:numId w:val="1578"/>
         </w:numPr>
       </w:pPr>
       <w:r>
@@ -13258,7 +13408,7 @@
         <w:pStyle w:val="Compact"/>
         <w:numPr>
           <w:ilvl w:val="0"/>
-          <w:numId w:val="1574"/>
+          <w:numId w:val="1579"/>
         </w:numPr>
       </w:pPr>
       <w:r>
@@ -13270,7 +13420,7 @@
         <w:pStyle w:val="Compact"/>
         <w:numPr>
           <w:ilvl w:val="0"/>
-          <w:numId w:val="1575"/>
+          <w:numId w:val="1580"/>
         </w:numPr>
       </w:pPr>
       <w:r>
@@ -13282,7 +13432,7 @@
         <w:pStyle w:val="Compact"/>
         <w:numPr>
           <w:ilvl w:val="0"/>
-          <w:numId w:val="1576"/>
+          <w:numId w:val="1581"/>
         </w:numPr>
       </w:pPr>
       <w:r>
@@ -13294,7 +13444,7 @@
         <w:pStyle w:val="Compact"/>
         <w:numPr>
           <w:ilvl w:val="0"/>
-          <w:numId w:val="1577"/>
+          <w:numId w:val="1582"/>
         </w:numPr>
       </w:pPr>
       <w:r>
@@ -13306,7 +13456,7 @@
         <w:pStyle w:val="Compact"/>
         <w:numPr>
           <w:ilvl w:val="0"/>
-          <w:numId w:val="1578"/>
+          <w:numId w:val="1583"/>
         </w:numPr>
       </w:pPr>
       <w:r>
@@ -13318,7 +13468,7 @@
         <w:pStyle w:val="Compact"/>
         <w:numPr>
           <w:ilvl w:val="0"/>
-          <w:numId w:val="1579"/>
+          <w:numId w:val="1584"/>
         </w:numPr>
       </w:pPr>
       <w:r>
@@ -13330,7 +13480,7 @@
         <w:pStyle w:val="Compact"/>
         <w:numPr>
           <w:ilvl w:val="0"/>
-          <w:numId w:val="1580"/>
+          <w:numId w:val="1585"/>
         </w:numPr>
       </w:pPr>
       <w:r>
@@ -13342,7 +13492,7 @@
         <w:pStyle w:val="Compact"/>
         <w:numPr>
           <w:ilvl w:val="0"/>
-          <w:numId w:val="1581"/>
+          <w:numId w:val="1586"/>
         </w:numPr>
       </w:pPr>
       <w:r>
@@ -13369,7 +13519,7 @@
         <w:pStyle w:val="Compact"/>
         <w:numPr>
           <w:ilvl w:val="0"/>
-          <w:numId w:val="1582"/>
+          <w:numId w:val="1587"/>
         </w:numPr>
       </w:pPr>
       <w:r>
@@ -13390,7 +13540,7 @@
         <w:pStyle w:val="Compact"/>
         <w:numPr>
           <w:ilvl w:val="0"/>
-          <w:numId w:val="1583"/>
+          <w:numId w:val="1588"/>
         </w:numPr>
       </w:pPr>
       <w:r>
@@ -13412,7 +13562,7 @@
         <w:pStyle w:val="Compact"/>
         <w:numPr>
           <w:ilvl w:val="0"/>
-          <w:numId w:val="1584"/>
+          <w:numId w:val="1589"/>
         </w:numPr>
       </w:pPr>
       <w:r>
@@ -13424,7 +13574,7 @@
         <w:pStyle w:val="Compact"/>
         <w:numPr>
           <w:ilvl w:val="0"/>
-          <w:numId w:val="1585"/>
+          <w:numId w:val="1590"/>
         </w:numPr>
       </w:pPr>
       <w:r>
@@ -13436,7 +13586,7 @@
         <w:pStyle w:val="Compact"/>
         <w:numPr>
           <w:ilvl w:val="0"/>
-          <w:numId w:val="1586"/>
+          <w:numId w:val="1591"/>
         </w:numPr>
       </w:pPr>
       <w:r>
@@ -13448,7 +13598,7 @@
         <w:pStyle w:val="Compact"/>
         <w:numPr>
           <w:ilvl w:val="0"/>
-          <w:numId w:val="1587"/>
+          <w:numId w:val="1592"/>
         </w:numPr>
       </w:pPr>
       <w:r>
@@ -13460,7 +13610,7 @@
         <w:pStyle w:val="Compact"/>
         <w:numPr>
           <w:ilvl w:val="0"/>
-          <w:numId w:val="1588"/>
+          <w:numId w:val="1593"/>
         </w:numPr>
       </w:pPr>
       <w:r>
@@ -13472,7 +13622,7 @@
         <w:pStyle w:val="Compact"/>
         <w:numPr>
           <w:ilvl w:val="0"/>
-          <w:numId w:val="1589"/>
+          <w:numId w:val="1594"/>
         </w:numPr>
       </w:pPr>
       <w:r>
@@ -13484,7 +13634,7 @@
         <w:pStyle w:val="Compact"/>
         <w:numPr>
           <w:ilvl w:val="0"/>
-          <w:numId w:val="1590"/>
+          <w:numId w:val="1595"/>
         </w:numPr>
       </w:pPr>
       <w:r>
@@ -13496,7 +13646,7 @@
         <w:pStyle w:val="Compact"/>
         <w:numPr>
           <w:ilvl w:val="0"/>
-          <w:numId w:val="1591"/>
+          <w:numId w:val="1596"/>
         </w:numPr>
       </w:pPr>
       <w:r>
@@ -13518,7 +13668,7 @@
         <w:pStyle w:val="Compact"/>
         <w:numPr>
           <w:ilvl w:val="0"/>
-          <w:numId w:val="1592"/>
+          <w:numId w:val="1597"/>
         </w:numPr>
       </w:pPr>
       <w:r>
@@ -13530,7 +13680,7 @@
         <w:pStyle w:val="Compact"/>
         <w:numPr>
           <w:ilvl w:val="0"/>
-          <w:numId w:val="1593"/>
+          <w:numId w:val="1598"/>
         </w:numPr>
       </w:pPr>
       <w:r>
@@ -13542,7 +13692,7 @@
         <w:pStyle w:val="Compact"/>
         <w:numPr>
           <w:ilvl w:val="0"/>
-          <w:numId w:val="1594"/>
+          <w:numId w:val="1599"/>
         </w:numPr>
       </w:pPr>
       <w:r>
@@ -13554,7 +13704,7 @@
         <w:pStyle w:val="Compact"/>
         <w:numPr>
           <w:ilvl w:val="0"/>
-          <w:numId w:val="1595"/>
+          <w:numId w:val="1600"/>
         </w:numPr>
       </w:pPr>
       <w:r>
@@ -13566,7 +13716,7 @@
         <w:pStyle w:val="Compact"/>
         <w:numPr>
           <w:ilvl w:val="0"/>
-          <w:numId w:val="1596"/>
+          <w:numId w:val="1601"/>
         </w:numPr>
       </w:pPr>
       <w:r>
@@ -13578,7 +13728,7 @@
         <w:pStyle w:val="Compact"/>
         <w:numPr>
           <w:ilvl w:val="0"/>
-          <w:numId w:val="1597"/>
+          <w:numId w:val="1602"/>
         </w:numPr>
       </w:pPr>
       <w:r>
@@ -13590,7 +13740,7 @@
         <w:pStyle w:val="Compact"/>
         <w:numPr>
           <w:ilvl w:val="0"/>
-          <w:numId w:val="1598"/>
+          <w:numId w:val="1603"/>
         </w:numPr>
       </w:pPr>
       <w:r>
@@ -13602,7 +13752,7 @@
         <w:pStyle w:val="Compact"/>
         <w:numPr>
           <w:ilvl w:val="0"/>
-          <w:numId w:val="1599"/>
+          <w:numId w:val="1604"/>
         </w:numPr>
       </w:pPr>
       <w:r>
@@ -13614,7 +13764,7 @@
         <w:pStyle w:val="Compact"/>
         <w:numPr>
           <w:ilvl w:val="0"/>
-          <w:numId w:val="1600"/>
+          <w:numId w:val="1605"/>
         </w:numPr>
       </w:pPr>
       <w:r>
@@ -13626,7 +13776,7 @@
         <w:pStyle w:val="Compact"/>
         <w:numPr>
           <w:ilvl w:val="0"/>
-          <w:numId w:val="1601"/>
+          <w:numId w:val="1606"/>
         </w:numPr>
       </w:pPr>
       <w:r>
@@ -13638,7 +13788,7 @@
         <w:pStyle w:val="Compact"/>
         <w:numPr>
           <w:ilvl w:val="0"/>
-          <w:numId w:val="1602"/>
+          <w:numId w:val="1607"/>
         </w:numPr>
       </w:pPr>
       <w:r>
@@ -13650,7 +13800,7 @@
         <w:pStyle w:val="Compact"/>
         <w:numPr>
           <w:ilvl w:val="0"/>
-          <w:numId w:val="1603"/>
+          <w:numId w:val="1608"/>
         </w:numPr>
       </w:pPr>
       <w:r>
@@ -13662,7 +13812,7 @@
         <w:pStyle w:val="Compact"/>
         <w:numPr>
           <w:ilvl w:val="0"/>
-          <w:numId w:val="1604"/>
+          <w:numId w:val="1609"/>
         </w:numPr>
       </w:pPr>
       <w:r>
@@ -13674,7 +13824,7 @@
         <w:pStyle w:val="Compact"/>
         <w:numPr>
           <w:ilvl w:val="0"/>
-          <w:numId w:val="1605"/>
+          <w:numId w:val="1610"/>
         </w:numPr>
       </w:pPr>
       <w:r>
@@ -13686,7 +13836,7 @@
         <w:pStyle w:val="Compact"/>
         <w:numPr>
           <w:ilvl w:val="0"/>
-          <w:numId w:val="1606"/>
+          <w:numId w:val="1611"/>
         </w:numPr>
       </w:pPr>
       <w:r>
@@ -13718,7 +13868,7 @@
         <w:pStyle w:val="Compact"/>
         <w:numPr>
           <w:ilvl w:val="0"/>
-          <w:numId w:val="1607"/>
+          <w:numId w:val="1612"/>
         </w:numPr>
       </w:pPr>
       <w:r>
@@ -13730,7 +13880,7 @@
         <w:pStyle w:val="Compact"/>
         <w:numPr>
           <w:ilvl w:val="0"/>
-          <w:numId w:val="1608"/>
+          <w:numId w:val="1613"/>
         </w:numPr>
       </w:pPr>
       <w:r>
@@ -13742,7 +13892,7 @@
         <w:pStyle w:val="Compact"/>
         <w:numPr>
           <w:ilvl w:val="0"/>
-          <w:numId w:val="1609"/>
+          <w:numId w:val="1614"/>
         </w:numPr>
       </w:pPr>
       <w:r>
@@ -13754,7 +13904,7 @@
         <w:pStyle w:val="Compact"/>
         <w:numPr>
           <w:ilvl w:val="0"/>
-          <w:numId w:val="1610"/>
+          <w:numId w:val="1615"/>
         </w:numPr>
       </w:pPr>
       <w:r>
@@ -13766,7 +13916,7 @@
         <w:pStyle w:val="Compact"/>
         <w:numPr>
           <w:ilvl w:val="0"/>
-          <w:numId w:val="1611"/>
+          <w:numId w:val="1616"/>
         </w:numPr>
       </w:pPr>
       <w:r>
@@ -13778,7 +13928,7 @@
         <w:pStyle w:val="Compact"/>
         <w:numPr>
           <w:ilvl w:val="0"/>
-          <w:numId w:val="1612"/>
+          <w:numId w:val="1617"/>
         </w:numPr>
       </w:pPr>
       <w:r>
@@ -13790,7 +13940,7 @@
         <w:pStyle w:val="Compact"/>
         <w:numPr>
           <w:ilvl w:val="0"/>
-          <w:numId w:val="1613"/>
+          <w:numId w:val="1618"/>
         </w:numPr>
       </w:pPr>
       <w:r>
@@ -13802,7 +13952,7 @@
         <w:pStyle w:val="Compact"/>
         <w:numPr>
           <w:ilvl w:val="0"/>
-          <w:numId w:val="1614"/>
+          <w:numId w:val="1619"/>
         </w:numPr>
       </w:pPr>
       <w:r>
@@ -13814,7 +13964,7 @@
         <w:pStyle w:val="Compact"/>
         <w:numPr>
           <w:ilvl w:val="0"/>
-          <w:numId w:val="1615"/>
+          <w:numId w:val="1620"/>
         </w:numPr>
       </w:pPr>
       <w:r>
@@ -13826,7 +13976,7 @@
         <w:pStyle w:val="Compact"/>
         <w:numPr>
           <w:ilvl w:val="0"/>
-          <w:numId w:val="1616"/>
+          <w:numId w:val="1621"/>
         </w:numPr>
       </w:pPr>
       <w:r>
@@ -13838,7 +13988,7 @@
         <w:pStyle w:val="Compact"/>
         <w:numPr>
           <w:ilvl w:val="0"/>
-          <w:numId w:val="1617"/>
+          <w:numId w:val="1622"/>
         </w:numPr>
       </w:pPr>
       <w:r>
@@ -13850,7 +14000,7 @@
         <w:pStyle w:val="Compact"/>
         <w:numPr>
           <w:ilvl w:val="0"/>
-          <w:numId w:val="1618"/>
+          <w:numId w:val="1623"/>
         </w:numPr>
       </w:pPr>
       <w:r>
@@ -13862,7 +14012,7 @@
         <w:pStyle w:val="Compact"/>
         <w:numPr>
           <w:ilvl w:val="0"/>
-          <w:numId w:val="1619"/>
+          <w:numId w:val="1624"/>
         </w:numPr>
       </w:pPr>
       <w:r>
@@ -13899,7 +14049,7 @@
         <w:pStyle w:val="Compact"/>
         <w:numPr>
           <w:ilvl w:val="0"/>
-          <w:numId w:val="1620"/>
+          <w:numId w:val="1625"/>
         </w:numPr>
       </w:pPr>
       <w:r>
@@ -13911,7 +14061,7 @@
         <w:pStyle w:val="Compact"/>
         <w:numPr>
           <w:ilvl w:val="0"/>
-          <w:numId w:val="1621"/>
+          <w:numId w:val="1626"/>
         </w:numPr>
       </w:pPr>
       <w:r>
@@ -13938,7 +14088,7 @@
         <w:pStyle w:val="Compact"/>
         <w:numPr>
           <w:ilvl w:val="0"/>
-          <w:numId w:val="1622"/>
+          <w:numId w:val="1627"/>
         </w:numPr>
       </w:pPr>
       <w:r>
@@ -13950,7 +14100,7 @@
         <w:pStyle w:val="Compact"/>
         <w:numPr>
           <w:ilvl w:val="0"/>
-          <w:numId w:val="1623"/>
+          <w:numId w:val="1628"/>
         </w:numPr>
       </w:pPr>
       <w:r>
@@ -13962,7 +14112,7 @@
         <w:pStyle w:val="Compact"/>
         <w:numPr>
           <w:ilvl w:val="0"/>
-          <w:numId w:val="1624"/>
+          <w:numId w:val="1629"/>
         </w:numPr>
       </w:pPr>
       <w:r>
@@ -13974,7 +14124,7 @@
         <w:pStyle w:val="Compact"/>
         <w:numPr>
           <w:ilvl w:val="0"/>
-          <w:numId w:val="1625"/>
+          <w:numId w:val="1630"/>
         </w:numPr>
       </w:pPr>
       <w:r>
@@ -13986,7 +14136,7 @@
         <w:pStyle w:val="Compact"/>
         <w:numPr>
           <w:ilvl w:val="0"/>
-          <w:numId w:val="1626"/>
+          <w:numId w:val="1631"/>
         </w:numPr>
       </w:pPr>
       <w:r>
@@ -13998,7 +14148,7 @@
         <w:pStyle w:val="Compact"/>
         <w:numPr>
           <w:ilvl w:val="0"/>
-          <w:numId w:val="1627"/>
+          <w:numId w:val="1632"/>
         </w:numPr>
       </w:pPr>
       <w:r>
@@ -14020,7 +14170,7 @@
         <w:pStyle w:val="Compact"/>
         <w:numPr>
           <w:ilvl w:val="0"/>
-          <w:numId w:val="1628"/>
+          <w:numId w:val="1633"/>
         </w:numPr>
       </w:pPr>
       <w:r>
@@ -14032,7 +14182,7 @@
         <w:pStyle w:val="Compact"/>
         <w:numPr>
           <w:ilvl w:val="0"/>
-          <w:numId w:val="1629"/>
+          <w:numId w:val="1634"/>
         </w:numPr>
       </w:pPr>
       <w:r>
@@ -14044,7 +14194,7 @@
         <w:pStyle w:val="Compact"/>
         <w:numPr>
           <w:ilvl w:val="0"/>
-          <w:numId w:val="1630"/>
+          <w:numId w:val="1635"/>
         </w:numPr>
       </w:pPr>
       <w:r>
@@ -14056,7 +14206,7 @@
         <w:pStyle w:val="Compact"/>
         <w:numPr>
           <w:ilvl w:val="0"/>
-          <w:numId w:val="1631"/>
+          <w:numId w:val="1636"/>
         </w:numPr>
       </w:pPr>
       <w:r>
@@ -14068,7 +14218,7 @@
         <w:pStyle w:val="Compact"/>
         <w:numPr>
           <w:ilvl w:val="0"/>
-          <w:numId w:val="1632"/>
+          <w:numId w:val="1637"/>
         </w:numPr>
       </w:pPr>
       <w:r>
@@ -14080,7 +14230,7 @@
         <w:pStyle w:val="Compact"/>
         <w:numPr>
           <w:ilvl w:val="0"/>
-          <w:numId w:val="1633"/>
+          <w:numId w:val="1638"/>
         </w:numPr>
       </w:pPr>
       <w:r>
@@ -14092,7 +14242,7 @@
         <w:pStyle w:val="Compact"/>
         <w:numPr>
           <w:ilvl w:val="0"/>
-          <w:numId w:val="1634"/>
+          <w:numId w:val="1639"/>
         </w:numPr>
       </w:pPr>
       <w:r>
@@ -14104,7 +14254,7 @@
         <w:pStyle w:val="Compact"/>
         <w:numPr>
           <w:ilvl w:val="0"/>
-          <w:numId w:val="1635"/>
+          <w:numId w:val="1640"/>
         </w:numPr>
       </w:pPr>
       <w:r>
@@ -14116,7 +14266,7 @@
         <w:pStyle w:val="Compact"/>
         <w:numPr>
           <w:ilvl w:val="0"/>
-          <w:numId w:val="1636"/>
+          <w:numId w:val="1641"/>
         </w:numPr>
       </w:pPr>
       <w:r>
@@ -14139,7 +14289,7 @@
         <w:pStyle w:val="Compact"/>
         <w:numPr>
           <w:ilvl w:val="0"/>
-          <w:numId w:val="1637"/>
+          <w:numId w:val="1642"/>
         </w:numPr>
       </w:pPr>
       <w:r>
@@ -14151,7 +14301,7 @@
         <w:pStyle w:val="Compact"/>
         <w:numPr>
           <w:ilvl w:val="0"/>
-          <w:numId w:val="1638"/>
+          <w:numId w:val="1643"/>
         </w:numPr>
       </w:pPr>
       <w:r>
@@ -14163,7 +14313,7 @@
         <w:pStyle w:val="Compact"/>
         <w:numPr>
           <w:ilvl w:val="0"/>
-          <w:numId w:val="1639"/>
+          <w:numId w:val="1644"/>
         </w:numPr>
       </w:pPr>
       <w:r>
@@ -14175,7 +14325,7 @@
         <w:pStyle w:val="Compact"/>
         <w:numPr>
           <w:ilvl w:val="0"/>
-          <w:numId w:val="1640"/>
+          <w:numId w:val="1645"/>
         </w:numPr>
       </w:pPr>
       <w:r>
@@ -14187,7 +14337,7 @@
         <w:pStyle w:val="Compact"/>
         <w:numPr>
           <w:ilvl w:val="0"/>
-          <w:numId w:val="1641"/>
+          <w:numId w:val="1646"/>
         </w:numPr>
       </w:pPr>
       <w:r>
@@ -14199,7 +14349,7 @@
         <w:pStyle w:val="Compact"/>
         <w:numPr>
           <w:ilvl w:val="0"/>
-          <w:numId w:val="1642"/>
+          <w:numId w:val="1647"/>
         </w:numPr>
       </w:pPr>
       <w:r>
@@ -14211,7 +14361,7 @@
         <w:pStyle w:val="Compact"/>
         <w:numPr>
           <w:ilvl w:val="0"/>
-          <w:numId w:val="1643"/>
+          <w:numId w:val="1648"/>
         </w:numPr>
       </w:pPr>
       <w:r>
@@ -14223,7 +14373,7 @@
         <w:pStyle w:val="Compact"/>
         <w:numPr>
           <w:ilvl w:val="0"/>
-          <w:numId w:val="1644"/>
+          <w:numId w:val="1649"/>
         </w:numPr>
       </w:pPr>
       <w:r>
@@ -14235,7 +14385,7 @@
         <w:pStyle w:val="Compact"/>
         <w:numPr>
           <w:ilvl w:val="0"/>
-          <w:numId w:val="1645"/>
+          <w:numId w:val="1650"/>
         </w:numPr>
       </w:pPr>
       <w:r>
@@ -14247,7 +14397,7 @@
         <w:pStyle w:val="Compact"/>
         <w:numPr>
           <w:ilvl w:val="0"/>
-          <w:numId w:val="1646"/>
+          <w:numId w:val="1651"/>
         </w:numPr>
       </w:pPr>
       <w:r>
@@ -14259,7 +14409,7 @@
         <w:pStyle w:val="Compact"/>
         <w:numPr>
           <w:ilvl w:val="0"/>
-          <w:numId w:val="1647"/>
+          <w:numId w:val="1652"/>
         </w:numPr>
       </w:pPr>
       <w:r>
@@ -15843,7 +15993,7 @@
     <w:abstractNumId w:val="993"/>
   </w:num>
   <w:num w:numId="1355">
-    <w:abstractNumId w:val="992"/>
+    <w:abstractNumId w:val="993"/>
   </w:num>
   <w:num w:numId="1356">
     <w:abstractNumId w:val="993"/>
@@ -15852,23 +16002,23 @@
     <w:abstractNumId w:val="993"/>
   </w:num>
   <w:num w:numId="1358">
+    <w:abstractNumId w:val="993"/>
+  </w:num>
+  <w:num w:numId="1359">
+    <w:abstractNumId w:val="993"/>
+  </w:num>
+  <w:num w:numId="1360">
+    <w:abstractNumId w:val="992"/>
+  </w:num>
+  <w:num w:numId="1361">
+    <w:abstractNumId w:val="993"/>
+  </w:num>
+  <w:num w:numId="1362">
+    <w:abstractNumId w:val="993"/>
+  </w:num>
+  <w:num w:numId="1363">
     <w:abstractNumId w:val="991"/>
   </w:num>
-  <w:num w:numId="1359">
-    <w:abstractNumId w:val="993"/>
-  </w:num>
-  <w:num w:numId="1360">
-    <w:abstractNumId w:val="993"/>
-  </w:num>
-  <w:num w:numId="1361">
-    <w:abstractNumId w:val="993"/>
-  </w:num>
-  <w:num w:numId="1362">
-    <w:abstractNumId w:val="993"/>
-  </w:num>
-  <w:num w:numId="1363">
-    <w:abstractNumId w:val="993"/>
-  </w:num>
   <w:num w:numId="1364">
     <w:abstractNumId w:val="993"/>
   </w:num>
@@ -15882,7 +16032,7 @@
     <w:abstractNumId w:val="993"/>
   </w:num>
   <w:num w:numId="1368">
-    <w:abstractNumId w:val="992"/>
+    <w:abstractNumId w:val="993"/>
   </w:num>
   <w:num w:numId="1369">
     <w:abstractNumId w:val="993"/>
@@ -15897,26 +16047,26 @@
     <w:abstractNumId w:val="993"/>
   </w:num>
   <w:num w:numId="1373">
-    <w:abstractNumId w:val="993"/>
+    <w:abstractNumId w:val="992"/>
   </w:num>
   <w:num w:numId="1374">
+    <w:abstractNumId w:val="993"/>
+  </w:num>
+  <w:num w:numId="1375">
+    <w:abstractNumId w:val="993"/>
+  </w:num>
+  <w:num w:numId="1376">
+    <w:abstractNumId w:val="993"/>
+  </w:num>
+  <w:num w:numId="1377">
+    <w:abstractNumId w:val="993"/>
+  </w:num>
+  <w:num w:numId="1378">
+    <w:abstractNumId w:val="993"/>
+  </w:num>
+  <w:num w:numId="1379">
     <w:abstractNumId w:val="991"/>
   </w:num>
-  <w:num w:numId="1375">
-    <w:abstractNumId w:val="993"/>
-  </w:num>
-  <w:num w:numId="1376">
-    <w:abstractNumId w:val="993"/>
-  </w:num>
-  <w:num w:numId="1377">
-    <w:abstractNumId w:val="993"/>
-  </w:num>
-  <w:num w:numId="1378">
-    <w:abstractNumId w:val="993"/>
-  </w:num>
-  <w:num w:numId="1379">
-    <w:abstractNumId w:val="992"/>
-  </w:num>
   <w:num w:numId="1380">
     <w:abstractNumId w:val="993"/>
   </w:num>
@@ -15933,28 +16083,28 @@
     <w:abstractNumId w:val="993"/>
   </w:num>
   <w:num w:numId="1385">
-    <w:abstractNumId w:val="992"/>
+    <w:abstractNumId w:val="993"/>
   </w:num>
   <w:num w:numId="1386">
-    <w:abstractNumId w:val="992"/>
+    <w:abstractNumId w:val="993"/>
   </w:num>
   <w:num w:numId="1387">
     <w:abstractNumId w:val="993"/>
   </w:num>
   <w:num w:numId="1388">
-    <w:abstractNumId w:val="992"/>
+    <w:abstractNumId w:val="993"/>
   </w:num>
   <w:num w:numId="1389">
-    <w:abstractNumId w:val="992"/>
+    <w:abstractNumId w:val="993"/>
   </w:num>
   <w:num w:numId="1390">
     <w:abstractNumId w:val="992"/>
   </w:num>
   <w:num w:numId="1391">
-    <w:abstractNumId w:val="992"/>
+    <w:abstractNumId w:val="993"/>
   </w:num>
   <w:num w:numId="1392">
-    <w:abstractNumId w:val="992"/>
+    <w:abstractNumId w:val="993"/>
   </w:num>
   <w:num w:numId="1393">
     <w:abstractNumId w:val="992"/>
@@ -16029,22 +16179,22 @@
     <w:abstractNumId w:val="992"/>
   </w:num>
   <w:num w:numId="1417">
-    <w:abstractNumId w:val="993"/>
+    <w:abstractNumId w:val="992"/>
   </w:num>
   <w:num w:numId="1418">
-    <w:abstractNumId w:val="993"/>
+    <w:abstractNumId w:val="992"/>
   </w:num>
   <w:num w:numId="1419">
-    <w:abstractNumId w:val="993"/>
+    <w:abstractNumId w:val="992"/>
   </w:num>
   <w:num w:numId="1420">
-    <w:abstractNumId w:val="993"/>
+    <w:abstractNumId w:val="992"/>
   </w:num>
   <w:num w:numId="1421">
     <w:abstractNumId w:val="992"/>
   </w:num>
   <w:num w:numId="1422">
-    <w:abstractNumId w:val="992"/>
+    <w:abstractNumId w:val="993"/>
   </w:num>
   <w:num w:numId="1423">
     <w:abstractNumId w:val="993"/>
@@ -16056,10 +16206,10 @@
     <w:abstractNumId w:val="993"/>
   </w:num>
   <w:num w:numId="1426">
-    <w:abstractNumId w:val="993"/>
+    <w:abstractNumId w:val="992"/>
   </w:num>
   <w:num w:numId="1427">
-    <w:abstractNumId w:val="993"/>
+    <w:abstractNumId w:val="992"/>
   </w:num>
   <w:num w:numId="1428">
     <w:abstractNumId w:val="993"/>
@@ -16089,34 +16239,34 @@
     <w:abstractNumId w:val="993"/>
   </w:num>
   <w:num w:numId="1437">
-    <w:abstractNumId w:val="992"/>
+    <w:abstractNumId w:val="993"/>
   </w:num>
   <w:num w:numId="1438">
+    <w:abstractNumId w:val="993"/>
+  </w:num>
+  <w:num w:numId="1439">
+    <w:abstractNumId w:val="993"/>
+  </w:num>
+  <w:num w:numId="1440">
+    <w:abstractNumId w:val="993"/>
+  </w:num>
+  <w:num w:numId="1441">
+    <w:abstractNumId w:val="993"/>
+  </w:num>
+  <w:num w:numId="1442">
+    <w:abstractNumId w:val="992"/>
+  </w:num>
+  <w:num w:numId="1443">
     <w:abstractNumId w:val="991"/>
   </w:num>
-  <w:num w:numId="1439">
-    <w:abstractNumId w:val="993"/>
-  </w:num>
-  <w:num w:numId="1440">
-    <w:abstractNumId w:val="993"/>
-  </w:num>
-  <w:num w:numId="1441">
-    <w:abstractNumId w:val="992"/>
-  </w:num>
-  <w:num w:numId="1442">
-    <w:abstractNumId w:val="992"/>
-  </w:num>
-  <w:num w:numId="1443">
-    <w:abstractNumId w:val="992"/>
-  </w:num>
   <w:num w:numId="1444">
-    <w:abstractNumId w:val="992"/>
+    <w:abstractNumId w:val="993"/>
   </w:num>
   <w:num w:numId="1445">
-    <w:abstractNumId w:val="992"/>
+    <w:abstractNumId w:val="993"/>
   </w:num>
   <w:num w:numId="1446">
-    <w:abstractNumId w:val="993"/>
+    <w:abstractNumId w:val="992"/>
   </w:num>
   <w:num w:numId="1447">
     <w:abstractNumId w:val="992"/>
@@ -16125,19 +16275,19 @@
     <w:abstractNumId w:val="992"/>
   </w:num>
   <w:num w:numId="1449">
-    <w:abstractNumId w:val="993"/>
+    <w:abstractNumId w:val="992"/>
   </w:num>
   <w:num w:numId="1450">
-    <w:abstractNumId w:val="993"/>
+    <w:abstractNumId w:val="992"/>
   </w:num>
   <w:num w:numId="1451">
     <w:abstractNumId w:val="993"/>
   </w:num>
   <w:num w:numId="1452">
-    <w:abstractNumId w:val="993"/>
+    <w:abstractNumId w:val="992"/>
   </w:num>
   <w:num w:numId="1453">
-    <w:abstractNumId w:val="993"/>
+    <w:abstractNumId w:val="992"/>
   </w:num>
   <w:num w:numId="1454">
     <w:abstractNumId w:val="993"/>
@@ -16167,59 +16317,59 @@
     <w:abstractNumId w:val="993"/>
   </w:num>
   <w:num w:numId="1463">
+    <w:abstractNumId w:val="993"/>
+  </w:num>
+  <w:num w:numId="1464">
+    <w:abstractNumId w:val="993"/>
+  </w:num>
+  <w:num w:numId="1465">
+    <w:abstractNumId w:val="993"/>
+  </w:num>
+  <w:num w:numId="1466">
+    <w:abstractNumId w:val="993"/>
+  </w:num>
+  <w:num w:numId="1467">
+    <w:abstractNumId w:val="993"/>
+  </w:num>
+  <w:num w:numId="1468">
     <w:abstractNumId w:val="991"/>
   </w:num>
-  <w:num w:numId="1464">
-    <w:abstractNumId w:val="993"/>
-  </w:num>
-  <w:num w:numId="1465">
-    <w:abstractNumId w:val="993"/>
-  </w:num>
-  <w:num w:numId="1466">
-    <w:abstractNumId w:val="993"/>
-  </w:num>
-  <w:num w:numId="1467">
+  <w:num w:numId="1469">
+    <w:abstractNumId w:val="993"/>
+  </w:num>
+  <w:num w:numId="1470">
+    <w:abstractNumId w:val="993"/>
+  </w:num>
+  <w:num w:numId="1471">
+    <w:abstractNumId w:val="993"/>
+  </w:num>
+  <w:num w:numId="1472">
     <w:abstractNumId w:val="991"/>
   </w:num>
-  <w:num w:numId="1468">
-    <w:abstractNumId w:val="993"/>
-  </w:num>
-  <w:num w:numId="1469">
-    <w:abstractNumId w:val="993"/>
-  </w:num>
-  <w:num w:numId="1470">
-    <w:abstractNumId w:val="992"/>
-  </w:num>
-  <w:num w:numId="1471">
-    <w:abstractNumId w:val="992"/>
-  </w:num>
-  <w:num w:numId="1472">
-    <w:abstractNumId w:val="993"/>
-  </w:num>
   <w:num w:numId="1473">
+    <w:abstractNumId w:val="993"/>
+  </w:num>
+  <w:num w:numId="1474">
+    <w:abstractNumId w:val="993"/>
+  </w:num>
+  <w:num w:numId="1475">
+    <w:abstractNumId w:val="992"/>
+  </w:num>
+  <w:num w:numId="1476">
+    <w:abstractNumId w:val="992"/>
+  </w:num>
+  <w:num w:numId="1477">
+    <w:abstractNumId w:val="993"/>
+  </w:num>
+  <w:num w:numId="1478">
     <w:abstractNumId w:val="991"/>
   </w:num>
-  <w:num w:numId="1474">
-    <w:abstractNumId w:val="993"/>
-  </w:num>
-  <w:num w:numId="1475">
+  <w:num w:numId="1479">
+    <w:abstractNumId w:val="993"/>
+  </w:num>
+  <w:num w:numId="1480">
     <w:abstractNumId w:val="991"/>
   </w:num>
-  <w:num w:numId="1476">
-    <w:abstractNumId w:val="993"/>
-  </w:num>
-  <w:num w:numId="1477">
-    <w:abstractNumId w:val="993"/>
-  </w:num>
-  <w:num w:numId="1478">
-    <w:abstractNumId w:val="993"/>
-  </w:num>
-  <w:num w:numId="1479">
-    <w:abstractNumId w:val="993"/>
-  </w:num>
-  <w:num w:numId="1480">
-    <w:abstractNumId w:val="993"/>
-  </w:num>
   <w:num w:numId="1481">
     <w:abstractNumId w:val="993"/>
   </w:num>
@@ -16233,23 +16383,23 @@
     <w:abstractNumId w:val="993"/>
   </w:num>
   <w:num w:numId="1485">
+    <w:abstractNumId w:val="993"/>
+  </w:num>
+  <w:num w:numId="1486">
+    <w:abstractNumId w:val="993"/>
+  </w:num>
+  <w:num w:numId="1487">
+    <w:abstractNumId w:val="993"/>
+  </w:num>
+  <w:num w:numId="1488">
+    <w:abstractNumId w:val="993"/>
+  </w:num>
+  <w:num w:numId="1489">
+    <w:abstractNumId w:val="993"/>
+  </w:num>
+  <w:num w:numId="1490">
     <w:abstractNumId w:val="991"/>
   </w:num>
-  <w:num w:numId="1486">
-    <w:abstractNumId w:val="993"/>
-  </w:num>
-  <w:num w:numId="1487">
-    <w:abstractNumId w:val="993"/>
-  </w:num>
-  <w:num w:numId="1488">
-    <w:abstractNumId w:val="992"/>
-  </w:num>
-  <w:num w:numId="1489">
-    <w:abstractNumId w:val="992"/>
-  </w:num>
-  <w:num w:numId="1490">
-    <w:abstractNumId w:val="993"/>
-  </w:num>
   <w:num w:numId="1491">
     <w:abstractNumId w:val="993"/>
   </w:num>
@@ -16263,10 +16413,10 @@
     <w:abstractNumId w:val="992"/>
   </w:num>
   <w:num w:numId="1495">
-    <w:abstractNumId w:val="992"/>
+    <w:abstractNumId w:val="993"/>
   </w:num>
   <w:num w:numId="1496">
-    <w:abstractNumId w:val="992"/>
+    <w:abstractNumId w:val="993"/>
   </w:num>
   <w:num w:numId="1497">
     <w:abstractNumId w:val="993"/>
@@ -16278,19 +16428,19 @@
     <w:abstractNumId w:val="992"/>
   </w:num>
   <w:num w:numId="1500">
-    <w:abstractNumId w:val="993"/>
+    <w:abstractNumId w:val="992"/>
   </w:num>
   <w:num w:numId="1501">
-    <w:abstractNumId w:val="993"/>
+    <w:abstractNumId w:val="992"/>
   </w:num>
   <w:num w:numId="1502">
     <w:abstractNumId w:val="993"/>
   </w:num>
   <w:num w:numId="1503">
-    <w:abstractNumId w:val="993"/>
+    <w:abstractNumId w:val="992"/>
   </w:num>
   <w:num w:numId="1504">
-    <w:abstractNumId w:val="993"/>
+    <w:abstractNumId w:val="992"/>
   </w:num>
   <w:num w:numId="1505">
     <w:abstractNumId w:val="993"/>
@@ -16338,23 +16488,23 @@
     <w:abstractNumId w:val="993"/>
   </w:num>
   <w:num w:numId="1520">
+    <w:abstractNumId w:val="993"/>
+  </w:num>
+  <w:num w:numId="1521">
+    <w:abstractNumId w:val="993"/>
+  </w:num>
+  <w:num w:numId="1522">
+    <w:abstractNumId w:val="993"/>
+  </w:num>
+  <w:num w:numId="1523">
+    <w:abstractNumId w:val="993"/>
+  </w:num>
+  <w:num w:numId="1524">
+    <w:abstractNumId w:val="993"/>
+  </w:num>
+  <w:num w:numId="1525">
     <w:abstractNumId w:val="991"/>
   </w:num>
-  <w:num w:numId="1521">
-    <w:abstractNumId w:val="992"/>
-  </w:num>
-  <w:num w:numId="1522">
-    <w:abstractNumId w:val="992"/>
-  </w:num>
-  <w:num w:numId="1523">
-    <w:abstractNumId w:val="992"/>
-  </w:num>
-  <w:num w:numId="1524">
-    <w:abstractNumId w:val="992"/>
-  </w:num>
-  <w:num w:numId="1525">
-    <w:abstractNumId w:val="992"/>
-  </w:num>
   <w:num w:numId="1526">
     <w:abstractNumId w:val="992"/>
   </w:num>
@@ -16389,47 +16539,47 @@
     <w:abstractNumId w:val="992"/>
   </w:num>
   <w:num w:numId="1537">
-    <w:abstractNumId w:val="993"/>
+    <w:abstractNumId w:val="992"/>
   </w:num>
   <w:num w:numId="1538">
-    <w:abstractNumId w:val="993"/>
+    <w:abstractNumId w:val="992"/>
   </w:num>
   <w:num w:numId="1539">
-    <w:abstractNumId w:val="993"/>
+    <w:abstractNumId w:val="992"/>
   </w:num>
   <w:num w:numId="1540">
-    <w:abstractNumId w:val="993"/>
+    <w:abstractNumId w:val="992"/>
   </w:num>
   <w:num w:numId="1541">
-    <w:abstractNumId w:val="993"/>
+    <w:abstractNumId w:val="992"/>
   </w:num>
   <w:num w:numId="1542">
+    <w:abstractNumId w:val="993"/>
+  </w:num>
+  <w:num w:numId="1543">
+    <w:abstractNumId w:val="993"/>
+  </w:num>
+  <w:num w:numId="1544">
+    <w:abstractNumId w:val="993"/>
+  </w:num>
+  <w:num w:numId="1545">
+    <w:abstractNumId w:val="993"/>
+  </w:num>
+  <w:num w:numId="1546">
+    <w:abstractNumId w:val="993"/>
+  </w:num>
+  <w:num w:numId="1547">
     <w:abstractNumId w:val="991"/>
   </w:num>
-  <w:num w:numId="1543">
-    <w:abstractNumId w:val="993"/>
-  </w:num>
-  <w:num w:numId="1544">
-    <w:abstractNumId w:val="993"/>
-  </w:num>
-  <w:num w:numId="1545">
+  <w:num w:numId="1548">
+    <w:abstractNumId w:val="993"/>
+  </w:num>
+  <w:num w:numId="1549">
+    <w:abstractNumId w:val="993"/>
+  </w:num>
+  <w:num w:numId="1550">
     <w:abstractNumId w:val="991"/>
   </w:num>
-  <w:num w:numId="1546">
-    <w:abstractNumId w:val="993"/>
-  </w:num>
-  <w:num w:numId="1547">
-    <w:abstractNumId w:val="993"/>
-  </w:num>
-  <w:num w:numId="1548">
-    <w:abstractNumId w:val="993"/>
-  </w:num>
-  <w:num w:numId="1549">
-    <w:abstractNumId w:val="993"/>
-  </w:num>
-  <w:num w:numId="1550">
-    <w:abstractNumId w:val="993"/>
-  </w:num>
   <w:num w:numId="1551">
     <w:abstractNumId w:val="993"/>
   </w:num>
@@ -16446,40 +16596,40 @@
     <w:abstractNumId w:val="993"/>
   </w:num>
   <w:num w:numId="1556">
+    <w:abstractNumId w:val="993"/>
+  </w:num>
+  <w:num w:numId="1557">
+    <w:abstractNumId w:val="993"/>
+  </w:num>
+  <w:num w:numId="1558">
+    <w:abstractNumId w:val="993"/>
+  </w:num>
+  <w:num w:numId="1559">
+    <w:abstractNumId w:val="993"/>
+  </w:num>
+  <w:num w:numId="1560">
+    <w:abstractNumId w:val="993"/>
+  </w:num>
+  <w:num w:numId="1561">
     <w:abstractNumId w:val="991"/>
   </w:num>
-  <w:num w:numId="1557">
-    <w:abstractNumId w:val="993"/>
-  </w:num>
-  <w:num w:numId="1558">
+  <w:num w:numId="1562">
+    <w:abstractNumId w:val="993"/>
+  </w:num>
+  <w:num w:numId="1563">
     <w:abstractNumId w:val="991"/>
   </w:num>
-  <w:num w:numId="1559">
-    <w:abstractNumId w:val="993"/>
-  </w:num>
-  <w:num w:numId="1560">
-    <w:abstractNumId w:val="993"/>
-  </w:num>
-  <w:num w:numId="1561">
-    <w:abstractNumId w:val="993"/>
-  </w:num>
-  <w:num w:numId="1562">
-    <w:abstractNumId w:val="993"/>
-  </w:num>
-  <w:num w:numId="1563">
-    <w:abstractNumId w:val="992"/>
-  </w:num>
   <w:num w:numId="1564">
-    <w:abstractNumId w:val="992"/>
+    <w:abstractNumId w:val="993"/>
   </w:num>
   <w:num w:numId="1565">
     <w:abstractNumId w:val="993"/>
   </w:num>
   <w:num w:numId="1566">
-    <w:abstractNumId w:val="992"/>
+    <w:abstractNumId w:val="993"/>
   </w:num>
   <w:num w:numId="1567">
-    <w:abstractNumId w:val="992"/>
+    <w:abstractNumId w:val="993"/>
   </w:num>
   <w:num w:numId="1568">
     <w:abstractNumId w:val="992"/>
@@ -16488,25 +16638,25 @@
     <w:abstractNumId w:val="992"/>
   </w:num>
   <w:num w:numId="1570">
-    <w:abstractNumId w:val="992"/>
+    <w:abstractNumId w:val="993"/>
   </w:num>
   <w:num w:numId="1571">
     <w:abstractNumId w:val="992"/>
   </w:num>
   <w:num w:numId="1572">
-    <w:abstractNumId w:val="993"/>
+    <w:abstractNumId w:val="992"/>
   </w:num>
   <w:num w:numId="1573">
-    <w:abstractNumId w:val="993"/>
+    <w:abstractNumId w:val="992"/>
   </w:num>
   <w:num w:numId="1574">
-    <w:abstractNumId w:val="993"/>
+    <w:abstractNumId w:val="992"/>
   </w:num>
   <w:num w:numId="1575">
-    <w:abstractNumId w:val="993"/>
+    <w:abstractNumId w:val="992"/>
   </w:num>
   <w:num w:numId="1576">
-    <w:abstractNumId w:val="993"/>
+    <w:abstractNumId w:val="992"/>
   </w:num>
   <w:num w:numId="1577">
     <w:abstractNumId w:val="993"/>
@@ -16515,7 +16665,7 @@
     <w:abstractNumId w:val="993"/>
   </w:num>
   <w:num w:numId="1579">
-    <w:abstractNumId w:val="992"/>
+    <w:abstractNumId w:val="993"/>
   </w:num>
   <w:num w:numId="1580">
     <w:abstractNumId w:val="993"/>
@@ -16527,10 +16677,10 @@
     <w:abstractNumId w:val="993"/>
   </w:num>
   <w:num w:numId="1583">
-    <w:abstractNumId w:val="992"/>
+    <w:abstractNumId w:val="993"/>
   </w:num>
   <w:num w:numId="1584">
-    <w:abstractNumId w:val="993"/>
+    <w:abstractNumId w:val="992"/>
   </w:num>
   <w:num w:numId="1585">
     <w:abstractNumId w:val="993"/>
@@ -16539,10 +16689,10 @@
     <w:abstractNumId w:val="993"/>
   </w:num>
   <w:num w:numId="1587">
-    <w:abstractNumId w:val="992"/>
+    <w:abstractNumId w:val="993"/>
   </w:num>
   <w:num w:numId="1588">
-    <w:abstractNumId w:val="993"/>
+    <w:abstractNumId w:val="992"/>
   </w:num>
   <w:num w:numId="1589">
     <w:abstractNumId w:val="993"/>
@@ -16554,46 +16704,46 @@
     <w:abstractNumId w:val="993"/>
   </w:num>
   <w:num w:numId="1592">
-    <w:abstractNumId w:val="993"/>
+    <w:abstractNumId w:val="992"/>
   </w:num>
   <w:num w:numId="1593">
     <w:abstractNumId w:val="993"/>
   </w:num>
   <w:num w:numId="1594">
-    <w:abstractNumId w:val="992"/>
+    <w:abstractNumId w:val="993"/>
   </w:num>
   <w:num w:numId="1595">
     <w:abstractNumId w:val="993"/>
   </w:num>
   <w:num w:numId="1596">
-    <w:abstractNumId w:val="992"/>
+    <w:abstractNumId w:val="993"/>
   </w:num>
   <w:num w:numId="1597">
-    <w:abstractNumId w:val="992"/>
+    <w:abstractNumId w:val="993"/>
   </w:num>
   <w:num w:numId="1598">
     <w:abstractNumId w:val="993"/>
   </w:num>
   <w:num w:numId="1599">
-    <w:abstractNumId w:val="993"/>
+    <w:abstractNumId w:val="992"/>
   </w:num>
   <w:num w:numId="1600">
     <w:abstractNumId w:val="993"/>
   </w:num>
   <w:num w:numId="1601">
-    <w:abstractNumId w:val="993"/>
+    <w:abstractNumId w:val="992"/>
   </w:num>
   <w:num w:numId="1602">
     <w:abstractNumId w:val="992"/>
   </w:num>
   <w:num w:numId="1603">
-    <w:abstractNumId w:val="992"/>
+    <w:abstractNumId w:val="993"/>
   </w:num>
   <w:num w:numId="1604">
-    <w:abstractNumId w:val="992"/>
+    <w:abstractNumId w:val="993"/>
   </w:num>
   <w:num w:numId="1605">
-    <w:abstractNumId w:val="992"/>
+    <w:abstractNumId w:val="993"/>
   </w:num>
   <w:num w:numId="1606">
     <w:abstractNumId w:val="993"/>
@@ -16611,7 +16761,7 @@
     <w:abstractNumId w:val="992"/>
   </w:num>
   <w:num w:numId="1611">
-    <w:abstractNumId w:val="992"/>
+    <w:abstractNumId w:val="993"/>
   </w:num>
   <w:num w:numId="1612">
     <w:abstractNumId w:val="992"/>
@@ -16719,6 +16869,21 @@
     <w:abstractNumId w:val="992"/>
   </w:num>
   <w:num w:numId="1647">
+    <w:abstractNumId w:val="992"/>
+  </w:num>
+  <w:num w:numId="1648">
+    <w:abstractNumId w:val="992"/>
+  </w:num>
+  <w:num w:numId="1649">
+    <w:abstractNumId w:val="992"/>
+  </w:num>
+  <w:num w:numId="1650">
+    <w:abstractNumId w:val="992"/>
+  </w:num>
+  <w:num w:numId="1651">
+    <w:abstractNumId w:val="992"/>
+  </w:num>
+  <w:num w:numId="1652">
     <w:abstractNumId w:val="992"/>
   </w:num>
 </w:numbering>

</xml_diff>

<commit_message>
Complete M1.5 revive compatibility gate
</commit_message>
<xml_diff>
--- a/MASTER_M1_M2_DELIVERY_CHECKLIST.docx
+++ b/MASTER_M1_M2_DELIVERY_CHECKLIST.docx
@@ -409,7 +409,7 @@
               <w:jc w:val="right"/>
             </w:pPr>
             <w:r>
-              <w:t xml:space="preserve">9%</w:t>
+              <w:t xml:space="preserve">10%</w:t>
             </w:r>
           </w:p>
         </w:tc>
@@ -420,7 +420,7 @@
               <w:pStyle w:val="Compact"/>
             </w:pPr>
             <w:r>
-              <w:t xml:space="preserve">Attempt UI, reset mechanics, manual override, and browser/pixel gate implemented</w:t>
+              <w:t xml:space="preserve">Done — attempt mechanic, UI, reset paths, manual override, browser/pixel, Revive gate</w:t>
             </w:r>
           </w:p>
         </w:tc>
@@ -709,7 +709,7 @@
                 <w:b/>
                 <w:bCs/>
               </w:rPr>
-              <w:t xml:space="preserve">66%</w:t>
+              <w:t xml:space="preserve">67%</w:t>
             </w:r>
           </w:p>
         </w:tc>
@@ -724,7 +724,7 @@
                 <w:b/>
                 <w:bCs/>
               </w:rPr>
-              <w:t xml:space="preserve">M1.5 browser/pixel gate added; Revive Queue and release gates remain</w:t>
+              <w:t xml:space="preserve">M1.5 complete; next gates are M1.6 regression/release and remaining M2 work</w:t>
             </w:r>
           </w:p>
         </w:tc>
@@ -8949,6 +8949,111 @@
         <w:t xml:space="preserve">after quick-log CSS/pixel adjustment.</w:t>
       </w:r>
     </w:p>
+    <w:p>
+      <w:pPr>
+        <w:pStyle w:val="Compact"/>
+        <w:numPr>
+          <w:ilvl w:val="0"/>
+          <w:numId w:val="1357"/>
+        </w:numPr>
+      </w:pPr>
+      <w:r>
+        <w:t xml:space="preserve">Confirmed canonical</w:t>
+      </w:r>
+      <w:r>
+        <w:t xml:space="preserve"> </w:t>
+      </w:r>
+      <w:r>
+        <w:rPr>
+          <w:rStyle w:val="VerbatimChar"/>
+        </w:rPr>
+        <w:t xml:space="preserve">followUpType</w:t>
+      </w:r>
+      <w:r>
+        <w:t xml:space="preserve"> </w:t>
+      </w:r>
+      <w:r>
+        <w:t xml:space="preserve">values are lowercase UI values; M1.5 auto-threshold now writes</w:t>
+      </w:r>
+      <w:r>
+        <w:t xml:space="preserve"> </w:t>
+      </w:r>
+      <w:r>
+        <w:rPr>
+          <w:rStyle w:val="VerbatimChar"/>
+        </w:rPr>
+        <w:t xml:space="preserve">reengage</w:t>
+      </w:r>
+      <w:r>
+        <w:t xml:space="preserve"> </w:t>
+      </w:r>
+      <w:r>
+        <w:t xml:space="preserve">instead of snake_case</w:t>
+      </w:r>
+      <w:r>
+        <w:t xml:space="preserve"> </w:t>
+      </w:r>
+      <w:r>
+        <w:rPr>
+          <w:rStyle w:val="VerbatimChar"/>
+        </w:rPr>
+        <w:t xml:space="preserve">re_engage</w:t>
+      </w:r>
+      <w:r>
+        <w:t xml:space="preserve">, while backend label mapping accepts both old and canonical variants.</w:t>
+      </w:r>
+    </w:p>
+    <w:p>
+      <w:pPr>
+        <w:pStyle w:val="Compact"/>
+        <w:numPr>
+          <w:ilvl w:val="0"/>
+          <w:numId w:val="1358"/>
+        </w:numPr>
+      </w:pPr>
+      <w:r>
+        <w:t xml:space="preserve">Revive Queue compatibility preserved: focused test verifies canonical</w:t>
+      </w:r>
+      <w:r>
+        <w:t xml:space="preserve"> </w:t>
+      </w:r>
+      <w:r>
+        <w:rPr>
+          <w:rStyle w:val="VerbatimChar"/>
+        </w:rPr>
+        <w:t xml:space="preserve">reengage</w:t>
+      </w:r>
+      <w:r>
+        <w:t xml:space="preserve"> </w:t>
+      </w:r>
+      <w:r>
+        <w:t xml:space="preserve">Nurture follow-up is returned with</w:t>
+      </w:r>
+      <w:r>
+        <w:t xml:space="preserve"> </w:t>
+      </w:r>
+      <w:r>
+        <w:rPr>
+          <w:rStyle w:val="VerbatimChar"/>
+        </w:rPr>
+        <w:t xml:space="preserve">reviveSource: follow_up</w:t>
+      </w:r>
+      <w:r>
+        <w:t xml:space="preserve">.</w:t>
+      </w:r>
+    </w:p>
+    <w:p>
+      <w:pPr>
+        <w:pStyle w:val="Compact"/>
+        <w:numPr>
+          <w:ilvl w:val="0"/>
+          <w:numId w:val="1359"/>
+        </w:numPr>
+      </w:pPr>
+      <w:r>
+        <w:t xml:space="preserve">Validation passed: focused backend tests 18/18, server build, and targeted ESLint 0 errors / existing warning debt only.</w:t>
+      </w:r>
+    </w:p>
     <w:bookmarkEnd w:id="49"/>
     <w:bookmarkStart w:id="50" w:name="data-and-backend"/>
     <w:p>
@@ -8964,7 +9069,7 @@
         <w:pStyle w:val="Compact"/>
         <w:numPr>
           <w:ilvl w:val="0"/>
-          <w:numId w:val="1357"/>
+          <w:numId w:val="1360"/>
         </w:numPr>
       </w:pPr>
       <w:r>
@@ -9003,7 +9108,7 @@
         <w:pStyle w:val="Compact"/>
         <w:numPr>
           <w:ilvl w:val="0"/>
-          <w:numId w:val="1358"/>
+          <w:numId w:val="1361"/>
         </w:numPr>
       </w:pPr>
       <w:r>
@@ -9042,7 +9147,7 @@
         <w:pStyle w:val="Compact"/>
         <w:numPr>
           <w:ilvl w:val="0"/>
-          <w:numId w:val="1359"/>
+          <w:numId w:val="1362"/>
         </w:numPr>
       </w:pPr>
       <w:r>
@@ -9066,7 +9171,7 @@
         <w:pStyle w:val="Compact"/>
         <w:numPr>
           <w:ilvl w:val="0"/>
-          <w:numId w:val="1360"/>
+          <w:numId w:val="1363"/>
         </w:numPr>
       </w:pPr>
       <w:r>
@@ -9123,7 +9228,7 @@
         <w:pStyle w:val="Compact"/>
         <w:numPr>
           <w:ilvl w:val="0"/>
-          <w:numId w:val="1361"/>
+          <w:numId w:val="1364"/>
         </w:numPr>
       </w:pPr>
       <w:r>
@@ -9147,7 +9252,7 @@
         <w:pStyle w:val="Compact"/>
         <w:numPr>
           <w:ilvl w:val="0"/>
-          <w:numId w:val="1362"/>
+          <w:numId w:val="1365"/>
         </w:numPr>
       </w:pPr>
       <w:r>
@@ -9159,7 +9264,7 @@
         <w:pStyle w:val="Compact"/>
         <w:numPr>
           <w:ilvl w:val="1"/>
-          <w:numId w:val="1363"/>
+          <w:numId w:val="1366"/>
         </w:numPr>
       </w:pPr>
       <w:r>
@@ -9171,7 +9276,7 @@
         <w:pStyle w:val="Compact"/>
         <w:numPr>
           <w:ilvl w:val="1"/>
-          <w:numId w:val="1363"/>
+          <w:numId w:val="1366"/>
         </w:numPr>
       </w:pPr>
       <w:r>
@@ -9183,7 +9288,7 @@
         <w:pStyle w:val="Compact"/>
         <w:numPr>
           <w:ilvl w:val="1"/>
-          <w:numId w:val="1363"/>
+          <w:numId w:val="1366"/>
         </w:numPr>
       </w:pPr>
       <w:r>
@@ -9195,7 +9300,7 @@
         <w:pStyle w:val="Compact"/>
         <w:numPr>
           <w:ilvl w:val="1"/>
-          <w:numId w:val="1363"/>
+          <w:numId w:val="1366"/>
         </w:numPr>
       </w:pPr>
       <w:r>
@@ -9207,7 +9312,7 @@
         <w:pStyle w:val="Compact"/>
         <w:numPr>
           <w:ilvl w:val="1"/>
-          <w:numId w:val="1363"/>
+          <w:numId w:val="1366"/>
         </w:numPr>
       </w:pPr>
       <w:r>
@@ -9219,7 +9324,7 @@
         <w:pStyle w:val="Compact"/>
         <w:numPr>
           <w:ilvl w:val="0"/>
-          <w:numId w:val="1364"/>
+          <w:numId w:val="1367"/>
         </w:numPr>
       </w:pPr>
       <w:r>
@@ -9264,7 +9369,7 @@
         <w:pStyle w:val="Compact"/>
         <w:numPr>
           <w:ilvl w:val="0"/>
-          <w:numId w:val="1365"/>
+          <w:numId w:val="1368"/>
         </w:numPr>
       </w:pPr>
       <w:r>
@@ -9297,7 +9402,7 @@
         <w:pStyle w:val="Compact"/>
         <w:numPr>
           <w:ilvl w:val="0"/>
-          <w:numId w:val="1366"/>
+          <w:numId w:val="1369"/>
         </w:numPr>
       </w:pPr>
       <w:r>
@@ -9330,7 +9435,7 @@
         <w:pStyle w:val="Compact"/>
         <w:numPr>
           <w:ilvl w:val="0"/>
-          <w:numId w:val="1367"/>
+          <w:numId w:val="1370"/>
         </w:numPr>
       </w:pPr>
       <w:r>
@@ -9357,7 +9462,7 @@
         <w:pStyle w:val="Compact"/>
         <w:numPr>
           <w:ilvl w:val="0"/>
-          <w:numId w:val="1368"/>
+          <w:numId w:val="1371"/>
         </w:numPr>
       </w:pPr>
       <w:r>
@@ -9369,7 +9474,7 @@
         <w:pStyle w:val="Compact"/>
         <w:numPr>
           <w:ilvl w:val="0"/>
-          <w:numId w:val="1369"/>
+          <w:numId w:val="1372"/>
         </w:numPr>
       </w:pPr>
       <w:r>
@@ -9381,7 +9486,7 @@
         <w:pStyle w:val="Compact"/>
         <w:numPr>
           <w:ilvl w:val="0"/>
-          <w:numId w:val="1370"/>
+          <w:numId w:val="1373"/>
         </w:numPr>
       </w:pPr>
       <w:r>
@@ -9393,7 +9498,7 @@
         <w:pStyle w:val="Compact"/>
         <w:numPr>
           <w:ilvl w:val="0"/>
-          <w:numId w:val="1371"/>
+          <w:numId w:val="1374"/>
         </w:numPr>
       </w:pPr>
       <w:r>
@@ -9405,7 +9510,7 @@
         <w:pStyle w:val="Compact"/>
         <w:numPr>
           <w:ilvl w:val="0"/>
-          <w:numId w:val="1372"/>
+          <w:numId w:val="1375"/>
         </w:numPr>
       </w:pPr>
       <w:r>
@@ -9432,7 +9537,7 @@
         <w:pStyle w:val="Compact"/>
         <w:numPr>
           <w:ilvl w:val="0"/>
-          <w:numId w:val="1373"/>
+          <w:numId w:val="1376"/>
         </w:numPr>
       </w:pPr>
       <w:r>
@@ -9454,7 +9559,7 @@
         <w:pStyle w:val="Compact"/>
         <w:numPr>
           <w:ilvl w:val="0"/>
-          <w:numId w:val="1374"/>
+          <w:numId w:val="1377"/>
         </w:numPr>
       </w:pPr>
       <w:r>
@@ -9466,7 +9571,7 @@
         <w:pStyle w:val="Compact"/>
         <w:numPr>
           <w:ilvl w:val="0"/>
-          <w:numId w:val="1375"/>
+          <w:numId w:val="1378"/>
         </w:numPr>
       </w:pPr>
       <w:r>
@@ -9478,7 +9583,7 @@
         <w:pStyle w:val="Compact"/>
         <w:numPr>
           <w:ilvl w:val="0"/>
-          <w:numId w:val="1376"/>
+          <w:numId w:val="1379"/>
         </w:numPr>
       </w:pPr>
       <w:r>
@@ -9490,7 +9595,7 @@
         <w:pStyle w:val="Compact"/>
         <w:numPr>
           <w:ilvl w:val="0"/>
-          <w:numId w:val="1377"/>
+          <w:numId w:val="1380"/>
         </w:numPr>
       </w:pPr>
       <w:r>
@@ -9514,7 +9619,7 @@
         <w:pStyle w:val="Compact"/>
         <w:numPr>
           <w:ilvl w:val="0"/>
-          <w:numId w:val="1378"/>
+          <w:numId w:val="1381"/>
         </w:numPr>
       </w:pPr>
       <w:r>
@@ -9526,7 +9631,7 @@
         <w:pStyle w:val="Compact"/>
         <w:numPr>
           <w:ilvl w:val="1"/>
-          <w:numId w:val="1379"/>
+          <w:numId w:val="1382"/>
         </w:numPr>
       </w:pPr>
       <w:r>
@@ -9538,7 +9643,7 @@
         <w:pStyle w:val="Compact"/>
         <w:numPr>
           <w:ilvl w:val="1"/>
-          <w:numId w:val="1379"/>
+          <w:numId w:val="1382"/>
         </w:numPr>
       </w:pPr>
       <w:r>
@@ -9550,7 +9655,7 @@
         <w:pStyle w:val="Compact"/>
         <w:numPr>
           <w:ilvl w:val="1"/>
-          <w:numId w:val="1379"/>
+          <w:numId w:val="1382"/>
         </w:numPr>
       </w:pPr>
       <w:r>
@@ -9562,7 +9667,7 @@
         <w:pStyle w:val="Compact"/>
         <w:numPr>
           <w:ilvl w:val="0"/>
-          <w:numId w:val="1380"/>
+          <w:numId w:val="1383"/>
         </w:numPr>
       </w:pPr>
       <w:r>
@@ -9604,7 +9709,7 @@
         <w:pStyle w:val="Compact"/>
         <w:numPr>
           <w:ilvl w:val="0"/>
-          <w:numId w:val="1381"/>
+          <w:numId w:val="1384"/>
         </w:numPr>
       </w:pPr>
       <w:r>
@@ -9646,7 +9751,7 @@
         <w:pStyle w:val="Compact"/>
         <w:numPr>
           <w:ilvl w:val="0"/>
-          <w:numId w:val="1382"/>
+          <w:numId w:val="1385"/>
         </w:numPr>
       </w:pPr>
       <w:r>
@@ -9668,7 +9773,7 @@
         <w:pStyle w:val="Compact"/>
         <w:numPr>
           <w:ilvl w:val="0"/>
-          <w:numId w:val="1383"/>
+          <w:numId w:val="1386"/>
         </w:numPr>
       </w:pPr>
       <w:r>
@@ -9680,7 +9785,7 @@
         <w:pStyle w:val="Compact"/>
         <w:numPr>
           <w:ilvl w:val="0"/>
-          <w:numId w:val="1384"/>
+          <w:numId w:val="1387"/>
         </w:numPr>
       </w:pPr>
       <w:r>
@@ -9692,7 +9797,7 @@
         <w:pStyle w:val="Compact"/>
         <w:numPr>
           <w:ilvl w:val="0"/>
-          <w:numId w:val="1385"/>
+          <w:numId w:val="1388"/>
         </w:numPr>
       </w:pPr>
       <w:r>
@@ -9704,7 +9809,7 @@
         <w:pStyle w:val="Compact"/>
         <w:numPr>
           <w:ilvl w:val="0"/>
-          <w:numId w:val="1386"/>
+          <w:numId w:val="1389"/>
         </w:numPr>
       </w:pPr>
       <w:r>
@@ -9716,7 +9821,7 @@
         <w:pStyle w:val="Compact"/>
         <w:numPr>
           <w:ilvl w:val="0"/>
-          <w:numId w:val="1387"/>
+          <w:numId w:val="1390"/>
         </w:numPr>
       </w:pPr>
       <w:r>
@@ -9728,7 +9833,7 @@
         <w:pStyle w:val="Compact"/>
         <w:numPr>
           <w:ilvl w:val="0"/>
-          <w:numId w:val="1388"/>
+          <w:numId w:val="1391"/>
         </w:numPr>
       </w:pPr>
       <w:r>
@@ -9740,7 +9845,7 @@
         <w:pStyle w:val="Compact"/>
         <w:numPr>
           <w:ilvl w:val="0"/>
-          <w:numId w:val="1389"/>
+          <w:numId w:val="1392"/>
         </w:numPr>
       </w:pPr>
       <w:r>
@@ -9752,7 +9857,7 @@
         <w:pStyle w:val="Compact"/>
         <w:numPr>
           <w:ilvl w:val="0"/>
-          <w:numId w:val="1390"/>
+          <w:numId w:val="1393"/>
         </w:numPr>
       </w:pPr>
       <w:r>
@@ -9764,7 +9869,7 @@
         <w:pStyle w:val="Compact"/>
         <w:numPr>
           <w:ilvl w:val="0"/>
-          <w:numId w:val="1391"/>
+          <w:numId w:val="1394"/>
         </w:numPr>
       </w:pPr>
       <w:r>
@@ -9776,7 +9881,7 @@
         <w:pStyle w:val="Compact"/>
         <w:numPr>
           <w:ilvl w:val="0"/>
-          <w:numId w:val="1392"/>
+          <w:numId w:val="1395"/>
         </w:numPr>
       </w:pPr>
       <w:r>
@@ -9808,7 +9913,7 @@
         <w:pStyle w:val="Compact"/>
         <w:numPr>
           <w:ilvl w:val="0"/>
-          <w:numId w:val="1393"/>
+          <w:numId w:val="1396"/>
         </w:numPr>
       </w:pPr>
       <w:r>
@@ -9820,7 +9925,7 @@
         <w:pStyle w:val="Compact"/>
         <w:numPr>
           <w:ilvl w:val="0"/>
-          <w:numId w:val="1394"/>
+          <w:numId w:val="1397"/>
         </w:numPr>
       </w:pPr>
       <w:r>
@@ -9832,7 +9937,7 @@
         <w:pStyle w:val="Compact"/>
         <w:numPr>
           <w:ilvl w:val="0"/>
-          <w:numId w:val="1395"/>
+          <w:numId w:val="1398"/>
         </w:numPr>
       </w:pPr>
       <w:r>
@@ -9844,7 +9949,7 @@
         <w:pStyle w:val="Compact"/>
         <w:numPr>
           <w:ilvl w:val="0"/>
-          <w:numId w:val="1396"/>
+          <w:numId w:val="1399"/>
         </w:numPr>
       </w:pPr>
       <w:r>
@@ -9856,7 +9961,7 @@
         <w:pStyle w:val="Compact"/>
         <w:numPr>
           <w:ilvl w:val="0"/>
-          <w:numId w:val="1397"/>
+          <w:numId w:val="1400"/>
         </w:numPr>
       </w:pPr>
       <w:r>
@@ -9868,7 +9973,7 @@
         <w:pStyle w:val="Compact"/>
         <w:numPr>
           <w:ilvl w:val="0"/>
-          <w:numId w:val="1398"/>
+          <w:numId w:val="1401"/>
         </w:numPr>
       </w:pPr>
       <w:r>
@@ -9880,7 +9985,7 @@
         <w:pStyle w:val="Compact"/>
         <w:numPr>
           <w:ilvl w:val="0"/>
-          <w:numId w:val="1399"/>
+          <w:numId w:val="1402"/>
         </w:numPr>
       </w:pPr>
       <w:r>
@@ -9892,7 +9997,7 @@
         <w:pStyle w:val="Compact"/>
         <w:numPr>
           <w:ilvl w:val="0"/>
-          <w:numId w:val="1400"/>
+          <w:numId w:val="1403"/>
         </w:numPr>
       </w:pPr>
       <w:r>
@@ -9904,7 +10009,7 @@
         <w:pStyle w:val="Compact"/>
         <w:numPr>
           <w:ilvl w:val="0"/>
-          <w:numId w:val="1401"/>
+          <w:numId w:val="1404"/>
         </w:numPr>
       </w:pPr>
       <w:r>
@@ -9916,7 +10021,7 @@
         <w:pStyle w:val="Compact"/>
         <w:numPr>
           <w:ilvl w:val="0"/>
-          <w:numId w:val="1402"/>
+          <w:numId w:val="1405"/>
         </w:numPr>
       </w:pPr>
       <w:r>
@@ -9928,7 +10033,7 @@
         <w:pStyle w:val="Compact"/>
         <w:numPr>
           <w:ilvl w:val="0"/>
-          <w:numId w:val="1403"/>
+          <w:numId w:val="1406"/>
         </w:numPr>
       </w:pPr>
       <w:r>
@@ -9940,7 +10045,7 @@
         <w:pStyle w:val="Compact"/>
         <w:numPr>
           <w:ilvl w:val="0"/>
-          <w:numId w:val="1404"/>
+          <w:numId w:val="1407"/>
         </w:numPr>
       </w:pPr>
       <w:r>
@@ -9952,7 +10057,7 @@
         <w:pStyle w:val="Compact"/>
         <w:numPr>
           <w:ilvl w:val="0"/>
-          <w:numId w:val="1405"/>
+          <w:numId w:val="1408"/>
         </w:numPr>
       </w:pPr>
       <w:r>
@@ -9964,7 +10069,7 @@
         <w:pStyle w:val="Compact"/>
         <w:numPr>
           <w:ilvl w:val="0"/>
-          <w:numId w:val="1406"/>
+          <w:numId w:val="1409"/>
         </w:numPr>
       </w:pPr>
       <w:r>
@@ -9976,7 +10081,7 @@
         <w:pStyle w:val="Compact"/>
         <w:numPr>
           <w:ilvl w:val="0"/>
-          <w:numId w:val="1407"/>
+          <w:numId w:val="1410"/>
         </w:numPr>
       </w:pPr>
       <w:r>
@@ -9998,7 +10103,7 @@
         <w:pStyle w:val="Compact"/>
         <w:numPr>
           <w:ilvl w:val="0"/>
-          <w:numId w:val="1408"/>
+          <w:numId w:val="1411"/>
         </w:numPr>
       </w:pPr>
       <w:r>
@@ -10010,7 +10115,7 @@
         <w:pStyle w:val="Compact"/>
         <w:numPr>
           <w:ilvl w:val="0"/>
-          <w:numId w:val="1409"/>
+          <w:numId w:val="1412"/>
         </w:numPr>
       </w:pPr>
       <w:r>
@@ -10022,7 +10127,7 @@
         <w:pStyle w:val="Compact"/>
         <w:numPr>
           <w:ilvl w:val="0"/>
-          <w:numId w:val="1410"/>
+          <w:numId w:val="1413"/>
         </w:numPr>
       </w:pPr>
       <w:r>
@@ -10034,7 +10139,7 @@
         <w:pStyle w:val="Compact"/>
         <w:numPr>
           <w:ilvl w:val="0"/>
-          <w:numId w:val="1411"/>
+          <w:numId w:val="1414"/>
         </w:numPr>
       </w:pPr>
       <w:r>
@@ -10046,7 +10151,7 @@
         <w:pStyle w:val="Compact"/>
         <w:numPr>
           <w:ilvl w:val="0"/>
-          <w:numId w:val="1412"/>
+          <w:numId w:val="1415"/>
         </w:numPr>
       </w:pPr>
       <w:r>
@@ -10058,7 +10163,7 @@
         <w:pStyle w:val="Compact"/>
         <w:numPr>
           <w:ilvl w:val="0"/>
-          <w:numId w:val="1413"/>
+          <w:numId w:val="1416"/>
         </w:numPr>
       </w:pPr>
       <w:r>
@@ -10070,7 +10175,7 @@
         <w:pStyle w:val="Compact"/>
         <w:numPr>
           <w:ilvl w:val="0"/>
-          <w:numId w:val="1414"/>
+          <w:numId w:val="1417"/>
         </w:numPr>
       </w:pPr>
       <w:r>
@@ -10092,7 +10197,7 @@
         <w:pStyle w:val="Compact"/>
         <w:numPr>
           <w:ilvl w:val="0"/>
-          <w:numId w:val="1415"/>
+          <w:numId w:val="1418"/>
         </w:numPr>
       </w:pPr>
       <w:r>
@@ -10104,7 +10209,7 @@
         <w:pStyle w:val="Compact"/>
         <w:numPr>
           <w:ilvl w:val="0"/>
-          <w:numId w:val="1416"/>
+          <w:numId w:val="1419"/>
         </w:numPr>
       </w:pPr>
       <w:r>
@@ -10116,7 +10221,7 @@
         <w:pStyle w:val="Compact"/>
         <w:numPr>
           <w:ilvl w:val="0"/>
-          <w:numId w:val="1417"/>
+          <w:numId w:val="1420"/>
         </w:numPr>
       </w:pPr>
       <w:r>
@@ -10128,7 +10233,7 @@
         <w:pStyle w:val="Compact"/>
         <w:numPr>
           <w:ilvl w:val="0"/>
-          <w:numId w:val="1418"/>
+          <w:numId w:val="1421"/>
         </w:numPr>
       </w:pPr>
       <w:r>
@@ -10140,7 +10245,7 @@
         <w:pStyle w:val="Compact"/>
         <w:numPr>
           <w:ilvl w:val="0"/>
-          <w:numId w:val="1419"/>
+          <w:numId w:val="1422"/>
         </w:numPr>
       </w:pPr>
       <w:r>
@@ -10152,7 +10257,7 @@
         <w:pStyle w:val="Compact"/>
         <w:numPr>
           <w:ilvl w:val="0"/>
-          <w:numId w:val="1420"/>
+          <w:numId w:val="1423"/>
         </w:numPr>
       </w:pPr>
       <w:r>
@@ -10164,7 +10269,7 @@
         <w:pStyle w:val="Compact"/>
         <w:numPr>
           <w:ilvl w:val="0"/>
-          <w:numId w:val="1421"/>
+          <w:numId w:val="1424"/>
         </w:numPr>
       </w:pPr>
       <w:r>
@@ -10196,7 +10301,7 @@
         <w:pStyle w:val="Compact"/>
         <w:numPr>
           <w:ilvl w:val="0"/>
-          <w:numId w:val="1422"/>
+          <w:numId w:val="1425"/>
         </w:numPr>
       </w:pPr>
       <w:r>
@@ -10268,7 +10373,7 @@
         <w:pStyle w:val="Compact"/>
         <w:numPr>
           <w:ilvl w:val="0"/>
-          <w:numId w:val="1423"/>
+          <w:numId w:val="1426"/>
         </w:numPr>
       </w:pPr>
       <w:r>
@@ -10280,7 +10385,7 @@
         <w:pStyle w:val="Compact"/>
         <w:numPr>
           <w:ilvl w:val="0"/>
-          <w:numId w:val="1424"/>
+          <w:numId w:val="1427"/>
         </w:numPr>
       </w:pPr>
       <w:r>
@@ -10307,7 +10412,7 @@
         <w:pStyle w:val="Compact"/>
         <w:numPr>
           <w:ilvl w:val="0"/>
-          <w:numId w:val="1425"/>
+          <w:numId w:val="1428"/>
         </w:numPr>
       </w:pPr>
       <w:r>
@@ -10361,7 +10466,7 @@
         <w:pStyle w:val="Compact"/>
         <w:numPr>
           <w:ilvl w:val="0"/>
-          <w:numId w:val="1426"/>
+          <w:numId w:val="1429"/>
         </w:numPr>
       </w:pPr>
       <w:r>
@@ -10373,7 +10478,7 @@
         <w:pStyle w:val="Compact"/>
         <w:numPr>
           <w:ilvl w:val="0"/>
-          <w:numId w:val="1427"/>
+          <w:numId w:val="1430"/>
         </w:numPr>
       </w:pPr>
       <w:r>
@@ -10395,7 +10500,7 @@
         <w:pStyle w:val="Compact"/>
         <w:numPr>
           <w:ilvl w:val="0"/>
-          <w:numId w:val="1428"/>
+          <w:numId w:val="1431"/>
         </w:numPr>
       </w:pPr>
       <w:r>
@@ -10446,7 +10551,7 @@
         <w:pStyle w:val="Compact"/>
         <w:numPr>
           <w:ilvl w:val="0"/>
-          <w:numId w:val="1429"/>
+          <w:numId w:val="1432"/>
         </w:numPr>
       </w:pPr>
       <w:r>
@@ -10473,7 +10578,7 @@
         <w:pStyle w:val="Compact"/>
         <w:numPr>
           <w:ilvl w:val="0"/>
-          <w:numId w:val="1430"/>
+          <w:numId w:val="1433"/>
         </w:numPr>
       </w:pPr>
       <w:r>
@@ -10485,7 +10590,7 @@
         <w:pStyle w:val="Compact"/>
         <w:numPr>
           <w:ilvl w:val="0"/>
-          <w:numId w:val="1431"/>
+          <w:numId w:val="1434"/>
         </w:numPr>
       </w:pPr>
       <w:r>
@@ -10512,7 +10617,7 @@
         <w:pStyle w:val="Compact"/>
         <w:numPr>
           <w:ilvl w:val="0"/>
-          <w:numId w:val="1432"/>
+          <w:numId w:val="1435"/>
         </w:numPr>
       </w:pPr>
       <w:r>
@@ -10524,7 +10629,7 @@
         <w:pStyle w:val="Compact"/>
         <w:numPr>
           <w:ilvl w:val="0"/>
-          <w:numId w:val="1433"/>
+          <w:numId w:val="1436"/>
         </w:numPr>
       </w:pPr>
       <w:r>
@@ -10536,7 +10641,7 @@
         <w:pStyle w:val="Compact"/>
         <w:numPr>
           <w:ilvl w:val="0"/>
-          <w:numId w:val="1434"/>
+          <w:numId w:val="1437"/>
         </w:numPr>
       </w:pPr>
       <w:r>
@@ -10558,7 +10663,7 @@
         <w:pStyle w:val="Compact"/>
         <w:numPr>
           <w:ilvl w:val="0"/>
-          <w:numId w:val="1435"/>
+          <w:numId w:val="1438"/>
         </w:numPr>
       </w:pPr>
       <w:r>
@@ -10582,7 +10687,7 @@
         <w:pStyle w:val="Compact"/>
         <w:numPr>
           <w:ilvl w:val="0"/>
-          <w:numId w:val="1436"/>
+          <w:numId w:val="1439"/>
         </w:numPr>
       </w:pPr>
       <w:r>
@@ -10606,7 +10711,7 @@
         <w:pStyle w:val="Compact"/>
         <w:numPr>
           <w:ilvl w:val="0"/>
-          <w:numId w:val="1437"/>
+          <w:numId w:val="1440"/>
         </w:numPr>
       </w:pPr>
       <w:r>
@@ -10618,7 +10723,7 @@
         <w:pStyle w:val="Compact"/>
         <w:numPr>
           <w:ilvl w:val="0"/>
-          <w:numId w:val="1438"/>
+          <w:numId w:val="1441"/>
         </w:numPr>
       </w:pPr>
       <w:r>
@@ -10630,7 +10735,7 @@
         <w:pStyle w:val="Compact"/>
         <w:numPr>
           <w:ilvl w:val="0"/>
-          <w:numId w:val="1439"/>
+          <w:numId w:val="1442"/>
         </w:numPr>
       </w:pPr>
       <w:r>
@@ -10642,7 +10747,7 @@
         <w:pStyle w:val="Compact"/>
         <w:numPr>
           <w:ilvl w:val="0"/>
-          <w:numId w:val="1440"/>
+          <w:numId w:val="1443"/>
         </w:numPr>
       </w:pPr>
       <w:r>
@@ -10673,7 +10778,7 @@
         <w:pStyle w:val="Compact"/>
         <w:numPr>
           <w:ilvl w:val="0"/>
-          <w:numId w:val="1441"/>
+          <w:numId w:val="1444"/>
         </w:numPr>
       </w:pPr>
       <w:r>
@@ -10685,7 +10790,7 @@
         <w:pStyle w:val="Compact"/>
         <w:numPr>
           <w:ilvl w:val="0"/>
-          <w:numId w:val="1442"/>
+          <w:numId w:val="1445"/>
         </w:numPr>
       </w:pPr>
       <w:r>
@@ -10697,7 +10802,7 @@
         <w:pStyle w:val="Compact"/>
         <w:numPr>
           <w:ilvl w:val="1"/>
-          <w:numId w:val="1443"/>
+          <w:numId w:val="1446"/>
         </w:numPr>
       </w:pPr>
       <w:r>
@@ -10715,7 +10820,7 @@
         <w:pStyle w:val="Compact"/>
         <w:numPr>
           <w:ilvl w:val="1"/>
-          <w:numId w:val="1443"/>
+          <w:numId w:val="1446"/>
         </w:numPr>
       </w:pPr>
       <w:r>
@@ -10733,7 +10838,7 @@
         <w:pStyle w:val="Compact"/>
         <w:numPr>
           <w:ilvl w:val="1"/>
-          <w:numId w:val="1443"/>
+          <w:numId w:val="1446"/>
         </w:numPr>
       </w:pPr>
       <w:r>
@@ -10751,7 +10856,7 @@
         <w:pStyle w:val="Compact"/>
         <w:numPr>
           <w:ilvl w:val="1"/>
-          <w:numId w:val="1443"/>
+          <w:numId w:val="1446"/>
         </w:numPr>
       </w:pPr>
       <w:r>
@@ -10769,7 +10874,7 @@
         <w:pStyle w:val="Compact"/>
         <w:numPr>
           <w:ilvl w:val="0"/>
-          <w:numId w:val="1444"/>
+          <w:numId w:val="1447"/>
         </w:numPr>
       </w:pPr>
       <w:r>
@@ -10781,7 +10886,7 @@
         <w:pStyle w:val="Compact"/>
         <w:numPr>
           <w:ilvl w:val="0"/>
-          <w:numId w:val="1445"/>
+          <w:numId w:val="1448"/>
         </w:numPr>
       </w:pPr>
       <w:r>
@@ -10793,7 +10898,7 @@
         <w:pStyle w:val="Compact"/>
         <w:numPr>
           <w:ilvl w:val="0"/>
-          <w:numId w:val="1446"/>
+          <w:numId w:val="1449"/>
         </w:numPr>
       </w:pPr>
       <w:r>
@@ -10815,7 +10920,7 @@
         <w:pStyle w:val="Compact"/>
         <w:numPr>
           <w:ilvl w:val="0"/>
-          <w:numId w:val="1447"/>
+          <w:numId w:val="1450"/>
         </w:numPr>
       </w:pPr>
       <w:r>
@@ -10827,7 +10932,7 @@
         <w:pStyle w:val="Compact"/>
         <w:numPr>
           <w:ilvl w:val="0"/>
-          <w:numId w:val="1448"/>
+          <w:numId w:val="1451"/>
         </w:numPr>
       </w:pPr>
       <w:r>
@@ -10839,7 +10944,7 @@
         <w:pStyle w:val="Compact"/>
         <w:numPr>
           <w:ilvl w:val="0"/>
-          <w:numId w:val="1449"/>
+          <w:numId w:val="1452"/>
         </w:numPr>
       </w:pPr>
       <w:r>
@@ -10851,7 +10956,7 @@
         <w:pStyle w:val="Compact"/>
         <w:numPr>
           <w:ilvl w:val="0"/>
-          <w:numId w:val="1450"/>
+          <w:numId w:val="1453"/>
         </w:numPr>
       </w:pPr>
       <w:r>
@@ -10863,7 +10968,7 @@
         <w:pStyle w:val="Compact"/>
         <w:numPr>
           <w:ilvl w:val="0"/>
-          <w:numId w:val="1451"/>
+          <w:numId w:val="1454"/>
         </w:numPr>
       </w:pPr>
       <w:r>
@@ -10875,7 +10980,7 @@
         <w:pStyle w:val="Compact"/>
         <w:numPr>
           <w:ilvl w:val="0"/>
-          <w:numId w:val="1452"/>
+          <w:numId w:val="1455"/>
         </w:numPr>
       </w:pPr>
       <w:r>
@@ -10887,7 +10992,7 @@
         <w:pStyle w:val="Compact"/>
         <w:numPr>
           <w:ilvl w:val="0"/>
-          <w:numId w:val="1453"/>
+          <w:numId w:val="1456"/>
         </w:numPr>
       </w:pPr>
       <w:r>
@@ -10899,7 +11004,7 @@
         <w:pStyle w:val="Compact"/>
         <w:numPr>
           <w:ilvl w:val="0"/>
-          <w:numId w:val="1454"/>
+          <w:numId w:val="1457"/>
         </w:numPr>
       </w:pPr>
       <w:r>
@@ -10911,7 +11016,7 @@
         <w:pStyle w:val="Compact"/>
         <w:numPr>
           <w:ilvl w:val="0"/>
-          <w:numId w:val="1455"/>
+          <w:numId w:val="1458"/>
         </w:numPr>
       </w:pPr>
       <w:r>
@@ -10943,7 +11048,7 @@
         <w:pStyle w:val="Compact"/>
         <w:numPr>
           <w:ilvl w:val="0"/>
-          <w:numId w:val="1456"/>
+          <w:numId w:val="1459"/>
         </w:numPr>
       </w:pPr>
       <w:r>
@@ -10970,7 +11075,7 @@
         <w:pStyle w:val="Compact"/>
         <w:numPr>
           <w:ilvl w:val="0"/>
-          <w:numId w:val="1457"/>
+          <w:numId w:val="1460"/>
         </w:numPr>
       </w:pPr>
       <w:r>
@@ -11042,7 +11147,7 @@
         <w:pStyle w:val="Compact"/>
         <w:numPr>
           <w:ilvl w:val="0"/>
-          <w:numId w:val="1458"/>
+          <w:numId w:val="1461"/>
         </w:numPr>
       </w:pPr>
       <w:r>
@@ -11069,7 +11174,7 @@
         <w:pStyle w:val="Compact"/>
         <w:numPr>
           <w:ilvl w:val="0"/>
-          <w:numId w:val="1459"/>
+          <w:numId w:val="1462"/>
         </w:numPr>
       </w:pPr>
       <w:r>
@@ -11081,7 +11186,7 @@
         <w:pStyle w:val="Compact"/>
         <w:numPr>
           <w:ilvl w:val="0"/>
-          <w:numId w:val="1460"/>
+          <w:numId w:val="1463"/>
         </w:numPr>
       </w:pPr>
       <w:r>
@@ -11108,7 +11213,7 @@
         <w:pStyle w:val="Compact"/>
         <w:numPr>
           <w:ilvl w:val="0"/>
-          <w:numId w:val="1461"/>
+          <w:numId w:val="1464"/>
         </w:numPr>
       </w:pPr>
       <w:r>
@@ -11120,7 +11225,7 @@
         <w:pStyle w:val="Compact"/>
         <w:numPr>
           <w:ilvl w:val="0"/>
-          <w:numId w:val="1462"/>
+          <w:numId w:val="1465"/>
         </w:numPr>
       </w:pPr>
       <w:r>
@@ -11147,7 +11252,7 @@
         <w:pStyle w:val="Compact"/>
         <w:numPr>
           <w:ilvl w:val="0"/>
-          <w:numId w:val="1463"/>
+          <w:numId w:val="1466"/>
         </w:numPr>
       </w:pPr>
       <w:r>
@@ -11189,7 +11294,7 @@
         <w:pStyle w:val="Compact"/>
         <w:numPr>
           <w:ilvl w:val="0"/>
-          <w:numId w:val="1464"/>
+          <w:numId w:val="1467"/>
         </w:numPr>
       </w:pPr>
       <w:r>
@@ -11225,7 +11330,7 @@
         <w:pStyle w:val="Compact"/>
         <w:numPr>
           <w:ilvl w:val="0"/>
-          <w:numId w:val="1465"/>
+          <w:numId w:val="1468"/>
         </w:numPr>
       </w:pPr>
       <w:r>
@@ -11247,7 +11352,7 @@
         <w:pStyle w:val="Compact"/>
         <w:numPr>
           <w:ilvl w:val="0"/>
-          <w:numId w:val="1466"/>
+          <w:numId w:val="1469"/>
         </w:numPr>
       </w:pPr>
       <w:r>
@@ -11259,7 +11364,7 @@
         <w:pStyle w:val="Compact"/>
         <w:numPr>
           <w:ilvl w:val="0"/>
-          <w:numId w:val="1467"/>
+          <w:numId w:val="1470"/>
         </w:numPr>
       </w:pPr>
       <w:r>
@@ -11271,7 +11376,7 @@
         <w:pStyle w:val="Compact"/>
         <w:numPr>
           <w:ilvl w:val="1"/>
-          <w:numId w:val="1468"/>
+          <w:numId w:val="1471"/>
         </w:numPr>
       </w:pPr>
       <w:r>
@@ -11283,7 +11388,7 @@
         <w:pStyle w:val="Compact"/>
         <w:numPr>
           <w:ilvl w:val="1"/>
-          <w:numId w:val="1468"/>
+          <w:numId w:val="1471"/>
         </w:numPr>
       </w:pPr>
       <w:r>
@@ -11295,7 +11400,7 @@
         <w:pStyle w:val="Compact"/>
         <w:numPr>
           <w:ilvl w:val="1"/>
-          <w:numId w:val="1468"/>
+          <w:numId w:val="1471"/>
         </w:numPr>
       </w:pPr>
       <w:r>
@@ -11307,7 +11412,7 @@
         <w:pStyle w:val="Compact"/>
         <w:numPr>
           <w:ilvl w:val="1"/>
-          <w:numId w:val="1468"/>
+          <w:numId w:val="1471"/>
         </w:numPr>
       </w:pPr>
       <w:r>
@@ -11319,7 +11424,7 @@
         <w:pStyle w:val="Compact"/>
         <w:numPr>
           <w:ilvl w:val="1"/>
-          <w:numId w:val="1468"/>
+          <w:numId w:val="1471"/>
         </w:numPr>
       </w:pPr>
       <w:r>
@@ -11331,7 +11436,7 @@
         <w:pStyle w:val="Compact"/>
         <w:numPr>
           <w:ilvl w:val="1"/>
-          <w:numId w:val="1468"/>
+          <w:numId w:val="1471"/>
         </w:numPr>
       </w:pPr>
       <w:r>
@@ -11343,7 +11448,7 @@
         <w:pStyle w:val="Compact"/>
         <w:numPr>
           <w:ilvl w:val="1"/>
-          <w:numId w:val="1468"/>
+          <w:numId w:val="1471"/>
         </w:numPr>
       </w:pPr>
       <w:r>
@@ -11355,7 +11460,7 @@
         <w:pStyle w:val="Compact"/>
         <w:numPr>
           <w:ilvl w:val="1"/>
-          <w:numId w:val="1468"/>
+          <w:numId w:val="1471"/>
         </w:numPr>
       </w:pPr>
       <w:r>
@@ -11367,7 +11472,7 @@
         <w:pStyle w:val="Compact"/>
         <w:numPr>
           <w:ilvl w:val="0"/>
-          <w:numId w:val="1469"/>
+          <w:numId w:val="1472"/>
         </w:numPr>
       </w:pPr>
       <w:r>
@@ -11388,7 +11493,7 @@
         <w:pStyle w:val="Compact"/>
         <w:numPr>
           <w:ilvl w:val="0"/>
-          <w:numId w:val="1470"/>
+          <w:numId w:val="1473"/>
         </w:numPr>
       </w:pPr>
       <w:r>
@@ -11412,7 +11517,7 @@
         <w:pStyle w:val="Compact"/>
         <w:numPr>
           <w:ilvl w:val="0"/>
-          <w:numId w:val="1471"/>
+          <w:numId w:val="1474"/>
         </w:numPr>
       </w:pPr>
       <w:r>
@@ -11424,7 +11529,7 @@
         <w:pStyle w:val="Compact"/>
         <w:numPr>
           <w:ilvl w:val="1"/>
-          <w:numId w:val="1472"/>
+          <w:numId w:val="1475"/>
         </w:numPr>
       </w:pPr>
       <w:r>
@@ -11436,7 +11541,7 @@
         <w:pStyle w:val="Compact"/>
         <w:numPr>
           <w:ilvl w:val="1"/>
-          <w:numId w:val="1472"/>
+          <w:numId w:val="1475"/>
         </w:numPr>
       </w:pPr>
       <w:r>
@@ -11448,7 +11553,7 @@
         <w:pStyle w:val="Compact"/>
         <w:numPr>
           <w:ilvl w:val="1"/>
-          <w:numId w:val="1472"/>
+          <w:numId w:val="1475"/>
         </w:numPr>
       </w:pPr>
       <w:r>
@@ -11460,7 +11565,7 @@
         <w:pStyle w:val="Compact"/>
         <w:numPr>
           <w:ilvl w:val="0"/>
-          <w:numId w:val="1473"/>
+          <w:numId w:val="1476"/>
         </w:numPr>
       </w:pPr>
       <w:r>
@@ -11484,7 +11589,7 @@
         <w:pStyle w:val="Compact"/>
         <w:numPr>
           <w:ilvl w:val="0"/>
-          <w:numId w:val="1474"/>
+          <w:numId w:val="1477"/>
         </w:numPr>
       </w:pPr>
       <w:r>
@@ -11496,7 +11601,7 @@
         <w:pStyle w:val="Compact"/>
         <w:numPr>
           <w:ilvl w:val="0"/>
-          <w:numId w:val="1475"/>
+          <w:numId w:val="1478"/>
         </w:numPr>
       </w:pPr>
       <w:r>
@@ -11508,7 +11613,7 @@
         <w:pStyle w:val="Compact"/>
         <w:numPr>
           <w:ilvl w:val="0"/>
-          <w:numId w:val="1476"/>
+          <w:numId w:val="1479"/>
         </w:numPr>
       </w:pPr>
       <w:r>
@@ -11530,7 +11635,7 @@
         <w:pStyle w:val="Compact"/>
         <w:numPr>
           <w:ilvl w:val="0"/>
-          <w:numId w:val="1477"/>
+          <w:numId w:val="1480"/>
         </w:numPr>
       </w:pPr>
       <w:r>
@@ -11542,7 +11647,7 @@
         <w:pStyle w:val="Compact"/>
         <w:numPr>
           <w:ilvl w:val="1"/>
-          <w:numId w:val="1478"/>
+          <w:numId w:val="1481"/>
         </w:numPr>
       </w:pPr>
       <w:r>
@@ -11554,7 +11659,7 @@
         <w:pStyle w:val="Compact"/>
         <w:numPr>
           <w:ilvl w:val="1"/>
-          <w:numId w:val="1478"/>
+          <w:numId w:val="1481"/>
         </w:numPr>
       </w:pPr>
       <w:r>
@@ -11566,7 +11671,7 @@
         <w:pStyle w:val="Compact"/>
         <w:numPr>
           <w:ilvl w:val="1"/>
-          <w:numId w:val="1478"/>
+          <w:numId w:val="1481"/>
         </w:numPr>
       </w:pPr>
       <w:r>
@@ -11578,7 +11683,7 @@
         <w:pStyle w:val="Compact"/>
         <w:numPr>
           <w:ilvl w:val="0"/>
-          <w:numId w:val="1479"/>
+          <w:numId w:val="1482"/>
         </w:numPr>
       </w:pPr>
       <w:r>
@@ -11590,7 +11695,7 @@
         <w:pStyle w:val="Compact"/>
         <w:numPr>
           <w:ilvl w:val="1"/>
-          <w:numId w:val="1480"/>
+          <w:numId w:val="1483"/>
         </w:numPr>
       </w:pPr>
       <w:r>
@@ -11602,7 +11707,7 @@
         <w:pStyle w:val="Compact"/>
         <w:numPr>
           <w:ilvl w:val="1"/>
-          <w:numId w:val="1480"/>
+          <w:numId w:val="1483"/>
         </w:numPr>
       </w:pPr>
       <w:r>
@@ -11614,7 +11719,7 @@
         <w:pStyle w:val="Compact"/>
         <w:numPr>
           <w:ilvl w:val="1"/>
-          <w:numId w:val="1480"/>
+          <w:numId w:val="1483"/>
         </w:numPr>
       </w:pPr>
       <w:r>
@@ -11626,7 +11731,7 @@
         <w:pStyle w:val="Compact"/>
         <w:numPr>
           <w:ilvl w:val="0"/>
-          <w:numId w:val="1481"/>
+          <w:numId w:val="1484"/>
         </w:numPr>
       </w:pPr>
       <w:r>
@@ -11638,7 +11743,7 @@
         <w:pStyle w:val="Compact"/>
         <w:numPr>
           <w:ilvl w:val="0"/>
-          <w:numId w:val="1482"/>
+          <w:numId w:val="1485"/>
         </w:numPr>
       </w:pPr>
       <w:r>
@@ -11650,7 +11755,7 @@
         <w:pStyle w:val="Compact"/>
         <w:numPr>
           <w:ilvl w:val="0"/>
-          <w:numId w:val="1483"/>
+          <w:numId w:val="1486"/>
         </w:numPr>
       </w:pPr>
       <w:r>
@@ -11672,7 +11777,7 @@
         <w:pStyle w:val="Compact"/>
         <w:numPr>
           <w:ilvl w:val="0"/>
-          <w:numId w:val="1484"/>
+          <w:numId w:val="1487"/>
         </w:numPr>
       </w:pPr>
       <w:r>
@@ -11693,7 +11798,7 @@
         <w:pStyle w:val="Compact"/>
         <w:numPr>
           <w:ilvl w:val="0"/>
-          <w:numId w:val="1485"/>
+          <w:numId w:val="1488"/>
         </w:numPr>
       </w:pPr>
       <w:r>
@@ -11705,7 +11810,7 @@
         <w:pStyle w:val="Compact"/>
         <w:numPr>
           <w:ilvl w:val="0"/>
-          <w:numId w:val="1486"/>
+          <w:numId w:val="1489"/>
         </w:numPr>
       </w:pPr>
       <w:r>
@@ -11717,7 +11822,7 @@
         <w:pStyle w:val="Compact"/>
         <w:numPr>
           <w:ilvl w:val="0"/>
-          <w:numId w:val="1487"/>
+          <w:numId w:val="1490"/>
         </w:numPr>
       </w:pPr>
       <w:r>
@@ -11729,7 +11834,7 @@
         <w:pStyle w:val="Compact"/>
         <w:numPr>
           <w:ilvl w:val="0"/>
-          <w:numId w:val="1488"/>
+          <w:numId w:val="1491"/>
         </w:numPr>
       </w:pPr>
       <w:r>
@@ -11741,7 +11846,7 @@
         <w:pStyle w:val="Compact"/>
         <w:numPr>
           <w:ilvl w:val="0"/>
-          <w:numId w:val="1489"/>
+          <w:numId w:val="1492"/>
         </w:numPr>
       </w:pPr>
       <w:r>
@@ -11753,7 +11858,7 @@
         <w:pStyle w:val="Compact"/>
         <w:numPr>
           <w:ilvl w:val="1"/>
-          <w:numId w:val="1490"/>
+          <w:numId w:val="1493"/>
         </w:numPr>
       </w:pPr>
       <w:r>
@@ -11765,7 +11870,7 @@
         <w:pStyle w:val="Compact"/>
         <w:numPr>
           <w:ilvl w:val="1"/>
-          <w:numId w:val="1490"/>
+          <w:numId w:val="1493"/>
         </w:numPr>
       </w:pPr>
       <w:r>
@@ -11777,7 +11882,7 @@
         <w:pStyle w:val="Compact"/>
         <w:numPr>
           <w:ilvl w:val="1"/>
-          <w:numId w:val="1490"/>
+          <w:numId w:val="1493"/>
         </w:numPr>
       </w:pPr>
       <w:r>
@@ -11789,7 +11894,7 @@
         <w:pStyle w:val="Compact"/>
         <w:numPr>
           <w:ilvl w:val="1"/>
-          <w:numId w:val="1490"/>
+          <w:numId w:val="1493"/>
         </w:numPr>
       </w:pPr>
       <w:r>
@@ -11801,7 +11906,7 @@
         <w:pStyle w:val="Compact"/>
         <w:numPr>
           <w:ilvl w:val="1"/>
-          <w:numId w:val="1490"/>
+          <w:numId w:val="1493"/>
         </w:numPr>
       </w:pPr>
       <w:r>
@@ -11813,7 +11918,7 @@
         <w:pStyle w:val="Compact"/>
         <w:numPr>
           <w:ilvl w:val="1"/>
-          <w:numId w:val="1490"/>
+          <w:numId w:val="1493"/>
         </w:numPr>
       </w:pPr>
       <w:r>
@@ -11825,7 +11930,7 @@
         <w:pStyle w:val="Compact"/>
         <w:numPr>
           <w:ilvl w:val="0"/>
-          <w:numId w:val="1491"/>
+          <w:numId w:val="1494"/>
         </w:numPr>
       </w:pPr>
       <w:r>
@@ -11837,7 +11942,7 @@
         <w:pStyle w:val="Compact"/>
         <w:numPr>
           <w:ilvl w:val="0"/>
-          <w:numId w:val="1492"/>
+          <w:numId w:val="1495"/>
         </w:numPr>
       </w:pPr>
       <w:r>
@@ -11859,7 +11964,7 @@
         <w:pStyle w:val="Compact"/>
         <w:numPr>
           <w:ilvl w:val="0"/>
-          <w:numId w:val="1493"/>
+          <w:numId w:val="1496"/>
         </w:numPr>
       </w:pPr>
       <w:r>
@@ -11871,7 +11976,7 @@
         <w:pStyle w:val="Compact"/>
         <w:numPr>
           <w:ilvl w:val="0"/>
-          <w:numId w:val="1494"/>
+          <w:numId w:val="1497"/>
         </w:numPr>
       </w:pPr>
       <w:r>
@@ -11883,7 +11988,7 @@
         <w:pStyle w:val="Compact"/>
         <w:numPr>
           <w:ilvl w:val="0"/>
-          <w:numId w:val="1495"/>
+          <w:numId w:val="1498"/>
         </w:numPr>
       </w:pPr>
       <w:r>
@@ -11895,7 +12000,7 @@
         <w:pStyle w:val="Compact"/>
         <w:numPr>
           <w:ilvl w:val="0"/>
-          <w:numId w:val="1496"/>
+          <w:numId w:val="1499"/>
         </w:numPr>
       </w:pPr>
       <w:r>
@@ -11907,7 +12012,7 @@
         <w:pStyle w:val="Compact"/>
         <w:numPr>
           <w:ilvl w:val="0"/>
-          <w:numId w:val="1497"/>
+          <w:numId w:val="1500"/>
         </w:numPr>
       </w:pPr>
       <w:r>
@@ -11929,7 +12034,7 @@
         <w:pStyle w:val="Compact"/>
         <w:numPr>
           <w:ilvl w:val="0"/>
-          <w:numId w:val="1498"/>
+          <w:numId w:val="1501"/>
         </w:numPr>
       </w:pPr>
       <w:r>
@@ -11941,7 +12046,7 @@
         <w:pStyle w:val="Compact"/>
         <w:numPr>
           <w:ilvl w:val="0"/>
-          <w:numId w:val="1499"/>
+          <w:numId w:val="1502"/>
         </w:numPr>
       </w:pPr>
       <w:r>
@@ -11953,7 +12058,7 @@
         <w:pStyle w:val="Compact"/>
         <w:numPr>
           <w:ilvl w:val="0"/>
-          <w:numId w:val="1500"/>
+          <w:numId w:val="1503"/>
         </w:numPr>
       </w:pPr>
       <w:r>
@@ -11965,7 +12070,7 @@
         <w:pStyle w:val="Compact"/>
         <w:numPr>
           <w:ilvl w:val="0"/>
-          <w:numId w:val="1501"/>
+          <w:numId w:val="1504"/>
         </w:numPr>
       </w:pPr>
       <w:r>
@@ -11977,7 +12082,7 @@
         <w:pStyle w:val="Compact"/>
         <w:numPr>
           <w:ilvl w:val="0"/>
-          <w:numId w:val="1502"/>
+          <w:numId w:val="1505"/>
         </w:numPr>
       </w:pPr>
       <w:r>
@@ -11989,7 +12094,7 @@
         <w:pStyle w:val="Compact"/>
         <w:numPr>
           <w:ilvl w:val="0"/>
-          <w:numId w:val="1503"/>
+          <w:numId w:val="1506"/>
         </w:numPr>
       </w:pPr>
       <w:r>
@@ -12001,7 +12106,7 @@
         <w:pStyle w:val="Compact"/>
         <w:numPr>
           <w:ilvl w:val="0"/>
-          <w:numId w:val="1504"/>
+          <w:numId w:val="1507"/>
         </w:numPr>
       </w:pPr>
       <w:r>
@@ -12013,7 +12118,7 @@
         <w:pStyle w:val="Compact"/>
         <w:numPr>
           <w:ilvl w:val="0"/>
-          <w:numId w:val="1505"/>
+          <w:numId w:val="1508"/>
         </w:numPr>
       </w:pPr>
       <w:r>
@@ -12045,7 +12150,7 @@
         <w:pStyle w:val="Compact"/>
         <w:numPr>
           <w:ilvl w:val="0"/>
-          <w:numId w:val="1506"/>
+          <w:numId w:val="1509"/>
         </w:numPr>
       </w:pPr>
       <w:r>
@@ -12093,7 +12198,7 @@
         <w:pStyle w:val="Compact"/>
         <w:numPr>
           <w:ilvl w:val="0"/>
-          <w:numId w:val="1507"/>
+          <w:numId w:val="1510"/>
         </w:numPr>
       </w:pPr>
       <w:r>
@@ -12105,7 +12210,7 @@
         <w:pStyle w:val="Compact"/>
         <w:numPr>
           <w:ilvl w:val="0"/>
-          <w:numId w:val="1508"/>
+          <w:numId w:val="1511"/>
         </w:numPr>
       </w:pPr>
       <w:r>
@@ -12117,7 +12222,7 @@
         <w:pStyle w:val="Compact"/>
         <w:numPr>
           <w:ilvl w:val="0"/>
-          <w:numId w:val="1509"/>
+          <w:numId w:val="1512"/>
         </w:numPr>
       </w:pPr>
       <w:r>
@@ -12129,7 +12234,7 @@
         <w:pStyle w:val="Compact"/>
         <w:numPr>
           <w:ilvl w:val="0"/>
-          <w:numId w:val="1510"/>
+          <w:numId w:val="1513"/>
         </w:numPr>
       </w:pPr>
       <w:r>
@@ -12141,7 +12246,7 @@
         <w:pStyle w:val="Compact"/>
         <w:numPr>
           <w:ilvl w:val="0"/>
-          <w:numId w:val="1511"/>
+          <w:numId w:val="1514"/>
         </w:numPr>
       </w:pPr>
       <w:r>
@@ -12195,7 +12300,7 @@
         <w:pStyle w:val="Compact"/>
         <w:numPr>
           <w:ilvl w:val="0"/>
-          <w:numId w:val="1512"/>
+          <w:numId w:val="1515"/>
         </w:numPr>
       </w:pPr>
       <w:r>
@@ -12207,7 +12312,7 @@
         <w:pStyle w:val="Compact"/>
         <w:numPr>
           <w:ilvl w:val="0"/>
-          <w:numId w:val="1513"/>
+          <w:numId w:val="1516"/>
         </w:numPr>
       </w:pPr>
       <w:r>
@@ -12234,7 +12339,7 @@
         <w:pStyle w:val="Compact"/>
         <w:numPr>
           <w:ilvl w:val="0"/>
-          <w:numId w:val="1514"/>
+          <w:numId w:val="1517"/>
         </w:numPr>
       </w:pPr>
       <w:r>
@@ -12276,7 +12381,7 @@
         <w:pStyle w:val="Compact"/>
         <w:numPr>
           <w:ilvl w:val="0"/>
-          <w:numId w:val="1515"/>
+          <w:numId w:val="1518"/>
         </w:numPr>
       </w:pPr>
       <w:r>
@@ -12303,7 +12408,7 @@
         <w:pStyle w:val="Compact"/>
         <w:numPr>
           <w:ilvl w:val="0"/>
-          <w:numId w:val="1516"/>
+          <w:numId w:val="1519"/>
         </w:numPr>
       </w:pPr>
       <w:r>
@@ -12315,7 +12420,7 @@
         <w:pStyle w:val="Compact"/>
         <w:numPr>
           <w:ilvl w:val="0"/>
-          <w:numId w:val="1517"/>
+          <w:numId w:val="1520"/>
         </w:numPr>
       </w:pPr>
       <w:r>
@@ -12327,7 +12432,7 @@
         <w:pStyle w:val="Compact"/>
         <w:numPr>
           <w:ilvl w:val="0"/>
-          <w:numId w:val="1518"/>
+          <w:numId w:val="1521"/>
         </w:numPr>
       </w:pPr>
       <w:r>
@@ -12364,7 +12469,7 @@
         <w:pStyle w:val="Compact"/>
         <w:numPr>
           <w:ilvl w:val="0"/>
-          <w:numId w:val="1519"/>
+          <w:numId w:val="1522"/>
         </w:numPr>
       </w:pPr>
       <w:r>
@@ -12376,7 +12481,7 @@
         <w:pStyle w:val="Compact"/>
         <w:numPr>
           <w:ilvl w:val="0"/>
-          <w:numId w:val="1520"/>
+          <w:numId w:val="1523"/>
         </w:numPr>
       </w:pPr>
       <w:r>
@@ -12388,7 +12493,7 @@
         <w:pStyle w:val="Compact"/>
         <w:numPr>
           <w:ilvl w:val="0"/>
-          <w:numId w:val="1521"/>
+          <w:numId w:val="1524"/>
         </w:numPr>
       </w:pPr>
       <w:r>
@@ -12400,7 +12505,7 @@
         <w:pStyle w:val="Compact"/>
         <w:numPr>
           <w:ilvl w:val="0"/>
-          <w:numId w:val="1522"/>
+          <w:numId w:val="1525"/>
         </w:numPr>
       </w:pPr>
       <w:r>
@@ -12412,7 +12517,7 @@
         <w:pStyle w:val="Compact"/>
         <w:numPr>
           <w:ilvl w:val="0"/>
-          <w:numId w:val="1523"/>
+          <w:numId w:val="1526"/>
         </w:numPr>
       </w:pPr>
       <w:r>
@@ -12424,7 +12529,7 @@
         <w:pStyle w:val="Compact"/>
         <w:numPr>
           <w:ilvl w:val="0"/>
-          <w:numId w:val="1524"/>
+          <w:numId w:val="1527"/>
         </w:numPr>
       </w:pPr>
       <w:r>
@@ -12436,7 +12541,7 @@
         <w:pStyle w:val="Compact"/>
         <w:numPr>
           <w:ilvl w:val="1"/>
-          <w:numId w:val="1525"/>
+          <w:numId w:val="1528"/>
         </w:numPr>
       </w:pPr>
       <w:r>
@@ -12463,7 +12568,7 @@
         <w:pStyle w:val="Compact"/>
         <w:numPr>
           <w:ilvl w:val="1"/>
-          <w:numId w:val="1525"/>
+          <w:numId w:val="1528"/>
         </w:numPr>
       </w:pPr>
       <w:r>
@@ -12500,7 +12605,7 @@
         <w:pStyle w:val="Compact"/>
         <w:numPr>
           <w:ilvl w:val="0"/>
-          <w:numId w:val="1526"/>
+          <w:numId w:val="1529"/>
         </w:numPr>
       </w:pPr>
       <w:r>
@@ -12542,7 +12647,7 @@
         <w:pStyle w:val="Compact"/>
         <w:numPr>
           <w:ilvl w:val="0"/>
-          <w:numId w:val="1527"/>
+          <w:numId w:val="1530"/>
         </w:numPr>
       </w:pPr>
       <w:r>
@@ -12566,7 +12671,7 @@
         <w:pStyle w:val="Compact"/>
         <w:numPr>
           <w:ilvl w:val="0"/>
-          <w:numId w:val="1528"/>
+          <w:numId w:val="1531"/>
         </w:numPr>
       </w:pPr>
       <w:r>
@@ -12590,7 +12695,7 @@
         <w:pStyle w:val="Compact"/>
         <w:numPr>
           <w:ilvl w:val="0"/>
-          <w:numId w:val="1529"/>
+          <w:numId w:val="1532"/>
         </w:numPr>
       </w:pPr>
       <w:r>
@@ -12602,7 +12707,7 @@
         <w:pStyle w:val="Compact"/>
         <w:numPr>
           <w:ilvl w:val="0"/>
-          <w:numId w:val="1530"/>
+          <w:numId w:val="1533"/>
         </w:numPr>
       </w:pPr>
       <w:r>
@@ -12614,7 +12719,7 @@
         <w:pStyle w:val="Compact"/>
         <w:numPr>
           <w:ilvl w:val="0"/>
-          <w:numId w:val="1531"/>
+          <w:numId w:val="1534"/>
         </w:numPr>
       </w:pPr>
       <w:r>
@@ -12626,7 +12731,7 @@
         <w:pStyle w:val="Compact"/>
         <w:numPr>
           <w:ilvl w:val="0"/>
-          <w:numId w:val="1532"/>
+          <w:numId w:val="1535"/>
         </w:numPr>
       </w:pPr>
       <w:r>
@@ -12638,7 +12743,7 @@
         <w:pStyle w:val="Compact"/>
         <w:numPr>
           <w:ilvl w:val="0"/>
-          <w:numId w:val="1533"/>
+          <w:numId w:val="1536"/>
         </w:numPr>
       </w:pPr>
       <w:r>
@@ -12650,7 +12755,7 @@
         <w:pStyle w:val="Compact"/>
         <w:numPr>
           <w:ilvl w:val="0"/>
-          <w:numId w:val="1534"/>
+          <w:numId w:val="1537"/>
         </w:numPr>
       </w:pPr>
       <w:r>
@@ -12662,7 +12767,7 @@
         <w:pStyle w:val="Compact"/>
         <w:numPr>
           <w:ilvl w:val="0"/>
-          <w:numId w:val="1535"/>
+          <w:numId w:val="1538"/>
         </w:numPr>
       </w:pPr>
       <w:r>
@@ -12674,7 +12779,7 @@
         <w:pStyle w:val="Compact"/>
         <w:numPr>
           <w:ilvl w:val="0"/>
-          <w:numId w:val="1536"/>
+          <w:numId w:val="1539"/>
         </w:numPr>
       </w:pPr>
       <w:r>
@@ -12686,7 +12791,7 @@
         <w:pStyle w:val="Compact"/>
         <w:numPr>
           <w:ilvl w:val="0"/>
-          <w:numId w:val="1537"/>
+          <w:numId w:val="1540"/>
         </w:numPr>
       </w:pPr>
       <w:r>
@@ -12698,7 +12803,7 @@
         <w:pStyle w:val="Compact"/>
         <w:numPr>
           <w:ilvl w:val="0"/>
-          <w:numId w:val="1538"/>
+          <w:numId w:val="1541"/>
         </w:numPr>
       </w:pPr>
       <w:r>
@@ -12710,7 +12815,7 @@
         <w:pStyle w:val="Compact"/>
         <w:numPr>
           <w:ilvl w:val="0"/>
-          <w:numId w:val="1539"/>
+          <w:numId w:val="1542"/>
         </w:numPr>
       </w:pPr>
       <w:r>
@@ -12737,7 +12842,7 @@
         <w:pStyle w:val="Compact"/>
         <w:numPr>
           <w:ilvl w:val="0"/>
-          <w:numId w:val="1540"/>
+          <w:numId w:val="1543"/>
         </w:numPr>
       </w:pPr>
       <w:r>
@@ -12749,7 +12854,7 @@
         <w:pStyle w:val="Compact"/>
         <w:numPr>
           <w:ilvl w:val="0"/>
-          <w:numId w:val="1541"/>
+          <w:numId w:val="1544"/>
         </w:numPr>
       </w:pPr>
       <w:r>
@@ -12771,7 +12876,7 @@
         <w:pStyle w:val="Compact"/>
         <w:numPr>
           <w:ilvl w:val="0"/>
-          <w:numId w:val="1542"/>
+          <w:numId w:val="1545"/>
         </w:numPr>
       </w:pPr>
       <w:r>
@@ -12783,7 +12888,7 @@
         <w:pStyle w:val="Compact"/>
         <w:numPr>
           <w:ilvl w:val="0"/>
-          <w:numId w:val="1543"/>
+          <w:numId w:val="1546"/>
         </w:numPr>
       </w:pPr>
       <w:r>
@@ -12810,7 +12915,7 @@
         <w:pStyle w:val="Compact"/>
         <w:numPr>
           <w:ilvl w:val="0"/>
-          <w:numId w:val="1544"/>
+          <w:numId w:val="1547"/>
         </w:numPr>
       </w:pPr>
       <w:r>
@@ -12837,7 +12942,7 @@
         <w:pStyle w:val="Compact"/>
         <w:numPr>
           <w:ilvl w:val="0"/>
-          <w:numId w:val="1545"/>
+          <w:numId w:val="1548"/>
         </w:numPr>
       </w:pPr>
       <w:r>
@@ -12864,71 +12969,11 @@
         <w:pStyle w:val="Compact"/>
         <w:numPr>
           <w:ilvl w:val="0"/>
-          <w:numId w:val="1546"/>
+          <w:numId w:val="1549"/>
         </w:numPr>
       </w:pPr>
       <w:r>
         <w:t xml:space="preserve">Implement three separate analytical query engines:</w:t>
-      </w:r>
-    </w:p>
-    <w:p>
-      <w:pPr>
-        <w:pStyle w:val="Compact"/>
-        <w:numPr>
-          <w:ilvl w:val="1"/>
-          <w:numId w:val="1547"/>
-        </w:numPr>
-      </w:pPr>
-      <w:r>
-        <w:t xml:space="preserve">multi-campaign retarget;</w:t>
-      </w:r>
-    </w:p>
-    <w:p>
-      <w:pPr>
-        <w:pStyle w:val="Compact"/>
-        <w:numPr>
-          <w:ilvl w:val="1"/>
-          <w:numId w:val="1547"/>
-        </w:numPr>
-      </w:pPr>
-      <w:r>
-        <w:t xml:space="preserve">new cohorts from unsent leads;</w:t>
-      </w:r>
-    </w:p>
-    <w:p>
-      <w:pPr>
-        <w:pStyle w:val="Compact"/>
-        <w:numPr>
-          <w:ilvl w:val="1"/>
-          <w:numId w:val="1547"/>
-        </w:numPr>
-      </w:pPr>
-      <w:r>
-        <w:t xml:space="preserve">renewal candidates.</w:t>
-      </w:r>
-    </w:p>
-    <w:p>
-      <w:pPr>
-        <w:pStyle w:val="Compact"/>
-        <w:numPr>
-          <w:ilvl w:val="0"/>
-          <w:numId w:val="1548"/>
-        </w:numPr>
-      </w:pPr>
-      <w:r>
-        <w:t xml:space="preserve">Each query joins only the required campaign/lead/funded/deal data and remains performant.</w:t>
-      </w:r>
-    </w:p>
-    <w:p>
-      <w:pPr>
-        <w:pStyle w:val="Compact"/>
-        <w:numPr>
-          <w:ilvl w:val="0"/>
-          <w:numId w:val="1549"/>
-        </w:numPr>
-      </w:pPr>
-      <w:r>
-        <w:t xml:space="preserve">Each cohort includes:</w:t>
       </w:r>
     </w:p>
     <w:p>
@@ -12940,7 +12985,7 @@
         </w:numPr>
       </w:pPr>
       <w:r>
-        <w:t xml:space="preserve">lead count;</w:t>
+        <w:t xml:space="preserve">multi-campaign retarget;</w:t>
       </w:r>
     </w:p>
     <w:p>
@@ -12952,7 +12997,7 @@
         </w:numPr>
       </w:pPr>
       <w:r>
-        <w:t xml:space="preserve">predicted reply rate;</w:t>
+        <w:t xml:space="preserve">new cohorts from unsent leads;</w:t>
       </w:r>
     </w:p>
     <w:p>
@@ -12964,6 +13009,66 @@
         </w:numPr>
       </w:pPr>
       <w:r>
+        <w:t xml:space="preserve">renewal candidates.</w:t>
+      </w:r>
+    </w:p>
+    <w:p>
+      <w:pPr>
+        <w:pStyle w:val="Compact"/>
+        <w:numPr>
+          <w:ilvl w:val="0"/>
+          <w:numId w:val="1551"/>
+        </w:numPr>
+      </w:pPr>
+      <w:r>
+        <w:t xml:space="preserve">Each query joins only the required campaign/lead/funded/deal data and remains performant.</w:t>
+      </w:r>
+    </w:p>
+    <w:p>
+      <w:pPr>
+        <w:pStyle w:val="Compact"/>
+        <w:numPr>
+          <w:ilvl w:val="0"/>
+          <w:numId w:val="1552"/>
+        </w:numPr>
+      </w:pPr>
+      <w:r>
+        <w:t xml:space="preserve">Each cohort includes:</w:t>
+      </w:r>
+    </w:p>
+    <w:p>
+      <w:pPr>
+        <w:pStyle w:val="Compact"/>
+        <w:numPr>
+          <w:ilvl w:val="1"/>
+          <w:numId w:val="1553"/>
+        </w:numPr>
+      </w:pPr>
+      <w:r>
+        <w:t xml:space="preserve">lead count;</w:t>
+      </w:r>
+    </w:p>
+    <w:p>
+      <w:pPr>
+        <w:pStyle w:val="Compact"/>
+        <w:numPr>
+          <w:ilvl w:val="1"/>
+          <w:numId w:val="1553"/>
+        </w:numPr>
+      </w:pPr>
+      <w:r>
+        <w:t xml:space="preserve">predicted reply rate;</w:t>
+      </w:r>
+    </w:p>
+    <w:p>
+      <w:pPr>
+        <w:pStyle w:val="Compact"/>
+        <w:numPr>
+          <w:ilvl w:val="1"/>
+          <w:numId w:val="1553"/>
+        </w:numPr>
+      </w:pPr>
+      <w:r>
         <w:t xml:space="preserve">expected funded deals;</w:t>
       </w:r>
     </w:p>
@@ -12972,7 +13077,7 @@
         <w:pStyle w:val="Compact"/>
         <w:numPr>
           <w:ilvl w:val="1"/>
-          <w:numId w:val="1550"/>
+          <w:numId w:val="1553"/>
         </w:numPr>
       </w:pPr>
       <w:r>
@@ -12984,7 +13089,7 @@
         <w:pStyle w:val="Compact"/>
         <w:numPr>
           <w:ilvl w:val="1"/>
-          <w:numId w:val="1550"/>
+          <w:numId w:val="1553"/>
         </w:numPr>
       </w:pPr>
       <w:r>
@@ -12996,7 +13101,7 @@
         <w:pStyle w:val="Compact"/>
         <w:numPr>
           <w:ilvl w:val="1"/>
-          <w:numId w:val="1550"/>
+          <w:numId w:val="1553"/>
         </w:numPr>
       </w:pPr>
       <w:r>
@@ -13008,7 +13113,7 @@
         <w:pStyle w:val="Compact"/>
         <w:numPr>
           <w:ilvl w:val="0"/>
-          <w:numId w:val="1551"/>
+          <w:numId w:val="1554"/>
         </w:numPr>
       </w:pPr>
       <w:r>
@@ -13020,7 +13125,7 @@
         <w:pStyle w:val="Compact"/>
         <w:numPr>
           <w:ilvl w:val="0"/>
-          <w:numId w:val="1552"/>
+          <w:numId w:val="1555"/>
         </w:numPr>
       </w:pPr>
       <w:r>
@@ -13032,7 +13137,7 @@
         <w:pStyle w:val="Compact"/>
         <w:numPr>
           <w:ilvl w:val="0"/>
-          <w:numId w:val="1553"/>
+          <w:numId w:val="1556"/>
         </w:numPr>
       </w:pPr>
       <w:r>
@@ -13054,7 +13159,7 @@
         <w:pStyle w:val="Compact"/>
         <w:numPr>
           <w:ilvl w:val="0"/>
-          <w:numId w:val="1554"/>
+          <w:numId w:val="1557"/>
         </w:numPr>
       </w:pPr>
       <w:r>
@@ -13066,7 +13171,7 @@
         <w:pStyle w:val="Compact"/>
         <w:numPr>
           <w:ilvl w:val="0"/>
-          <w:numId w:val="1555"/>
+          <w:numId w:val="1558"/>
         </w:numPr>
       </w:pPr>
       <w:r>
@@ -13078,7 +13183,7 @@
         <w:pStyle w:val="Compact"/>
         <w:numPr>
           <w:ilvl w:val="0"/>
-          <w:numId w:val="1556"/>
+          <w:numId w:val="1559"/>
         </w:numPr>
       </w:pPr>
       <w:r>
@@ -13090,7 +13195,7 @@
         <w:pStyle w:val="Compact"/>
         <w:numPr>
           <w:ilvl w:val="0"/>
-          <w:numId w:val="1557"/>
+          <w:numId w:val="1560"/>
         </w:numPr>
       </w:pPr>
       <w:r>
@@ -13102,7 +13207,7 @@
         <w:pStyle w:val="Compact"/>
         <w:numPr>
           <w:ilvl w:val="0"/>
-          <w:numId w:val="1558"/>
+          <w:numId w:val="1561"/>
         </w:numPr>
       </w:pPr>
       <w:r>
@@ -13114,7 +13219,7 @@
         <w:pStyle w:val="Compact"/>
         <w:numPr>
           <w:ilvl w:val="0"/>
-          <w:numId w:val="1559"/>
+          <w:numId w:val="1562"/>
         </w:numPr>
       </w:pPr>
       <w:r>
@@ -13136,7 +13241,7 @@
         <w:pStyle w:val="Compact"/>
         <w:numPr>
           <w:ilvl w:val="0"/>
-          <w:numId w:val="1560"/>
+          <w:numId w:val="1563"/>
         </w:numPr>
       </w:pPr>
       <w:r>
@@ -13148,7 +13253,7 @@
         <w:pStyle w:val="Compact"/>
         <w:numPr>
           <w:ilvl w:val="1"/>
-          <w:numId w:val="1561"/>
+          <w:numId w:val="1564"/>
         </w:numPr>
       </w:pPr>
       <w:r>
@@ -13160,7 +13265,7 @@
         <w:pStyle w:val="Compact"/>
         <w:numPr>
           <w:ilvl w:val="1"/>
-          <w:numId w:val="1561"/>
+          <w:numId w:val="1564"/>
         </w:numPr>
       </w:pPr>
       <w:r>
@@ -13172,7 +13277,7 @@
         <w:pStyle w:val="Compact"/>
         <w:numPr>
           <w:ilvl w:val="0"/>
-          <w:numId w:val="1562"/>
+          <w:numId w:val="1565"/>
         </w:numPr>
       </w:pPr>
       <w:r>
@@ -13184,7 +13289,7 @@
         <w:pStyle w:val="Compact"/>
         <w:numPr>
           <w:ilvl w:val="1"/>
-          <w:numId w:val="1563"/>
+          <w:numId w:val="1566"/>
         </w:numPr>
       </w:pPr>
       <w:r>
@@ -13196,7 +13301,7 @@
         <w:pStyle w:val="Compact"/>
         <w:numPr>
           <w:ilvl w:val="1"/>
-          <w:numId w:val="1563"/>
+          <w:numId w:val="1566"/>
         </w:numPr>
       </w:pPr>
       <w:r>
@@ -13208,7 +13313,7 @@
         <w:pStyle w:val="Compact"/>
         <w:numPr>
           <w:ilvl w:val="0"/>
-          <w:numId w:val="1564"/>
+          <w:numId w:val="1567"/>
         </w:numPr>
       </w:pPr>
       <w:r>
@@ -13220,7 +13325,7 @@
         <w:pStyle w:val="Compact"/>
         <w:numPr>
           <w:ilvl w:val="0"/>
-          <w:numId w:val="1565"/>
+          <w:numId w:val="1568"/>
         </w:numPr>
       </w:pPr>
       <w:r>
@@ -13232,7 +13337,7 @@
         <w:pStyle w:val="Compact"/>
         <w:numPr>
           <w:ilvl w:val="0"/>
-          <w:numId w:val="1566"/>
+          <w:numId w:val="1569"/>
         </w:numPr>
       </w:pPr>
       <w:r>
@@ -13244,7 +13349,7 @@
         <w:pStyle w:val="Compact"/>
         <w:numPr>
           <w:ilvl w:val="0"/>
-          <w:numId w:val="1567"/>
+          <w:numId w:val="1570"/>
         </w:numPr>
       </w:pPr>
       <w:r>
@@ -13266,7 +13371,7 @@
         <w:pStyle w:val="Compact"/>
         <w:numPr>
           <w:ilvl w:val="0"/>
-          <w:numId w:val="1568"/>
+          <w:numId w:val="1571"/>
         </w:numPr>
       </w:pPr>
       <w:r>
@@ -13278,7 +13383,7 @@
         <w:pStyle w:val="Compact"/>
         <w:numPr>
           <w:ilvl w:val="0"/>
-          <w:numId w:val="1569"/>
+          <w:numId w:val="1572"/>
         </w:numPr>
       </w:pPr>
       <w:r>
@@ -13290,7 +13395,7 @@
         <w:pStyle w:val="Compact"/>
         <w:numPr>
           <w:ilvl w:val="0"/>
-          <w:numId w:val="1570"/>
+          <w:numId w:val="1573"/>
         </w:numPr>
       </w:pPr>
       <w:r>
@@ -13302,7 +13407,7 @@
         <w:pStyle w:val="Compact"/>
         <w:numPr>
           <w:ilvl w:val="0"/>
-          <w:numId w:val="1571"/>
+          <w:numId w:val="1574"/>
         </w:numPr>
       </w:pPr>
       <w:r>
@@ -13314,7 +13419,7 @@
         <w:pStyle w:val="Compact"/>
         <w:numPr>
           <w:ilvl w:val="0"/>
-          <w:numId w:val="1572"/>
+          <w:numId w:val="1575"/>
         </w:numPr>
       </w:pPr>
       <w:r>
@@ -13326,7 +13431,7 @@
         <w:pStyle w:val="Compact"/>
         <w:numPr>
           <w:ilvl w:val="0"/>
-          <w:numId w:val="1573"/>
+          <w:numId w:val="1576"/>
         </w:numPr>
       </w:pPr>
       <w:r>
@@ -13338,7 +13443,7 @@
         <w:pStyle w:val="Compact"/>
         <w:numPr>
           <w:ilvl w:val="0"/>
-          <w:numId w:val="1574"/>
+          <w:numId w:val="1577"/>
         </w:numPr>
       </w:pPr>
       <w:r>
@@ -13350,7 +13455,7 @@
         <w:pStyle w:val="Compact"/>
         <w:numPr>
           <w:ilvl w:val="0"/>
-          <w:numId w:val="1575"/>
+          <w:numId w:val="1578"/>
         </w:numPr>
       </w:pPr>
       <w:r>
@@ -13362,7 +13467,7 @@
         <w:pStyle w:val="Compact"/>
         <w:numPr>
           <w:ilvl w:val="0"/>
-          <w:numId w:val="1576"/>
+          <w:numId w:val="1579"/>
         </w:numPr>
       </w:pPr>
       <w:r>
@@ -13384,7 +13489,7 @@
         <w:pStyle w:val="Compact"/>
         <w:numPr>
           <w:ilvl w:val="0"/>
-          <w:numId w:val="1577"/>
+          <w:numId w:val="1580"/>
         </w:numPr>
       </w:pPr>
       <w:r>
@@ -13396,7 +13501,7 @@
         <w:pStyle w:val="Compact"/>
         <w:numPr>
           <w:ilvl w:val="0"/>
-          <w:numId w:val="1578"/>
+          <w:numId w:val="1581"/>
         </w:numPr>
       </w:pPr>
       <w:r>
@@ -13408,7 +13513,7 @@
         <w:pStyle w:val="Compact"/>
         <w:numPr>
           <w:ilvl w:val="0"/>
-          <w:numId w:val="1579"/>
+          <w:numId w:val="1582"/>
         </w:numPr>
       </w:pPr>
       <w:r>
@@ -13420,7 +13525,7 @@
         <w:pStyle w:val="Compact"/>
         <w:numPr>
           <w:ilvl w:val="0"/>
-          <w:numId w:val="1580"/>
+          <w:numId w:val="1583"/>
         </w:numPr>
       </w:pPr>
       <w:r>
@@ -13432,7 +13537,7 @@
         <w:pStyle w:val="Compact"/>
         <w:numPr>
           <w:ilvl w:val="0"/>
-          <w:numId w:val="1581"/>
+          <w:numId w:val="1584"/>
         </w:numPr>
       </w:pPr>
       <w:r>
@@ -13444,7 +13549,7 @@
         <w:pStyle w:val="Compact"/>
         <w:numPr>
           <w:ilvl w:val="0"/>
-          <w:numId w:val="1582"/>
+          <w:numId w:val="1585"/>
         </w:numPr>
       </w:pPr>
       <w:r>
@@ -13456,7 +13561,7 @@
         <w:pStyle w:val="Compact"/>
         <w:numPr>
           <w:ilvl w:val="0"/>
-          <w:numId w:val="1583"/>
+          <w:numId w:val="1586"/>
         </w:numPr>
       </w:pPr>
       <w:r>
@@ -13468,7 +13573,7 @@
         <w:pStyle w:val="Compact"/>
         <w:numPr>
           <w:ilvl w:val="0"/>
-          <w:numId w:val="1584"/>
+          <w:numId w:val="1587"/>
         </w:numPr>
       </w:pPr>
       <w:r>
@@ -13480,7 +13585,7 @@
         <w:pStyle w:val="Compact"/>
         <w:numPr>
           <w:ilvl w:val="0"/>
-          <w:numId w:val="1585"/>
+          <w:numId w:val="1588"/>
         </w:numPr>
       </w:pPr>
       <w:r>
@@ -13492,7 +13597,7 @@
         <w:pStyle w:val="Compact"/>
         <w:numPr>
           <w:ilvl w:val="0"/>
-          <w:numId w:val="1586"/>
+          <w:numId w:val="1589"/>
         </w:numPr>
       </w:pPr>
       <w:r>
@@ -13519,7 +13624,7 @@
         <w:pStyle w:val="Compact"/>
         <w:numPr>
           <w:ilvl w:val="0"/>
-          <w:numId w:val="1587"/>
+          <w:numId w:val="1590"/>
         </w:numPr>
       </w:pPr>
       <w:r>
@@ -13540,7 +13645,7 @@
         <w:pStyle w:val="Compact"/>
         <w:numPr>
           <w:ilvl w:val="0"/>
-          <w:numId w:val="1588"/>
+          <w:numId w:val="1591"/>
         </w:numPr>
       </w:pPr>
       <w:r>
@@ -13562,7 +13667,7 @@
         <w:pStyle w:val="Compact"/>
         <w:numPr>
           <w:ilvl w:val="0"/>
-          <w:numId w:val="1589"/>
+          <w:numId w:val="1592"/>
         </w:numPr>
       </w:pPr>
       <w:r>
@@ -13574,7 +13679,7 @@
         <w:pStyle w:val="Compact"/>
         <w:numPr>
           <w:ilvl w:val="0"/>
-          <w:numId w:val="1590"/>
+          <w:numId w:val="1593"/>
         </w:numPr>
       </w:pPr>
       <w:r>
@@ -13586,7 +13691,7 @@
         <w:pStyle w:val="Compact"/>
         <w:numPr>
           <w:ilvl w:val="0"/>
-          <w:numId w:val="1591"/>
+          <w:numId w:val="1594"/>
         </w:numPr>
       </w:pPr>
       <w:r>
@@ -13598,7 +13703,7 @@
         <w:pStyle w:val="Compact"/>
         <w:numPr>
           <w:ilvl w:val="0"/>
-          <w:numId w:val="1592"/>
+          <w:numId w:val="1595"/>
         </w:numPr>
       </w:pPr>
       <w:r>
@@ -13610,7 +13715,7 @@
         <w:pStyle w:val="Compact"/>
         <w:numPr>
           <w:ilvl w:val="0"/>
-          <w:numId w:val="1593"/>
+          <w:numId w:val="1596"/>
         </w:numPr>
       </w:pPr>
       <w:r>
@@ -13622,7 +13727,7 @@
         <w:pStyle w:val="Compact"/>
         <w:numPr>
           <w:ilvl w:val="0"/>
-          <w:numId w:val="1594"/>
+          <w:numId w:val="1597"/>
         </w:numPr>
       </w:pPr>
       <w:r>
@@ -13634,7 +13739,7 @@
         <w:pStyle w:val="Compact"/>
         <w:numPr>
           <w:ilvl w:val="0"/>
-          <w:numId w:val="1595"/>
+          <w:numId w:val="1598"/>
         </w:numPr>
       </w:pPr>
       <w:r>
@@ -13646,7 +13751,7 @@
         <w:pStyle w:val="Compact"/>
         <w:numPr>
           <w:ilvl w:val="0"/>
-          <w:numId w:val="1596"/>
+          <w:numId w:val="1599"/>
         </w:numPr>
       </w:pPr>
       <w:r>
@@ -13668,7 +13773,7 @@
         <w:pStyle w:val="Compact"/>
         <w:numPr>
           <w:ilvl w:val="0"/>
-          <w:numId w:val="1597"/>
+          <w:numId w:val="1600"/>
         </w:numPr>
       </w:pPr>
       <w:r>
@@ -13680,7 +13785,7 @@
         <w:pStyle w:val="Compact"/>
         <w:numPr>
           <w:ilvl w:val="0"/>
-          <w:numId w:val="1598"/>
+          <w:numId w:val="1601"/>
         </w:numPr>
       </w:pPr>
       <w:r>
@@ -13692,7 +13797,7 @@
         <w:pStyle w:val="Compact"/>
         <w:numPr>
           <w:ilvl w:val="0"/>
-          <w:numId w:val="1599"/>
+          <w:numId w:val="1602"/>
         </w:numPr>
       </w:pPr>
       <w:r>
@@ -13704,7 +13809,7 @@
         <w:pStyle w:val="Compact"/>
         <w:numPr>
           <w:ilvl w:val="0"/>
-          <w:numId w:val="1600"/>
+          <w:numId w:val="1603"/>
         </w:numPr>
       </w:pPr>
       <w:r>
@@ -13716,7 +13821,7 @@
         <w:pStyle w:val="Compact"/>
         <w:numPr>
           <w:ilvl w:val="0"/>
-          <w:numId w:val="1601"/>
+          <w:numId w:val="1604"/>
         </w:numPr>
       </w:pPr>
       <w:r>
@@ -13728,7 +13833,7 @@
         <w:pStyle w:val="Compact"/>
         <w:numPr>
           <w:ilvl w:val="0"/>
-          <w:numId w:val="1602"/>
+          <w:numId w:val="1605"/>
         </w:numPr>
       </w:pPr>
       <w:r>
@@ -13740,7 +13845,7 @@
         <w:pStyle w:val="Compact"/>
         <w:numPr>
           <w:ilvl w:val="0"/>
-          <w:numId w:val="1603"/>
+          <w:numId w:val="1606"/>
         </w:numPr>
       </w:pPr>
       <w:r>
@@ -13752,7 +13857,7 @@
         <w:pStyle w:val="Compact"/>
         <w:numPr>
           <w:ilvl w:val="0"/>
-          <w:numId w:val="1604"/>
+          <w:numId w:val="1607"/>
         </w:numPr>
       </w:pPr>
       <w:r>
@@ -13764,7 +13869,7 @@
         <w:pStyle w:val="Compact"/>
         <w:numPr>
           <w:ilvl w:val="0"/>
-          <w:numId w:val="1605"/>
+          <w:numId w:val="1608"/>
         </w:numPr>
       </w:pPr>
       <w:r>
@@ -13776,7 +13881,7 @@
         <w:pStyle w:val="Compact"/>
         <w:numPr>
           <w:ilvl w:val="0"/>
-          <w:numId w:val="1606"/>
+          <w:numId w:val="1609"/>
         </w:numPr>
       </w:pPr>
       <w:r>
@@ -13788,7 +13893,7 @@
         <w:pStyle w:val="Compact"/>
         <w:numPr>
           <w:ilvl w:val="0"/>
-          <w:numId w:val="1607"/>
+          <w:numId w:val="1610"/>
         </w:numPr>
       </w:pPr>
       <w:r>
@@ -13800,7 +13905,7 @@
         <w:pStyle w:val="Compact"/>
         <w:numPr>
           <w:ilvl w:val="0"/>
-          <w:numId w:val="1608"/>
+          <w:numId w:val="1611"/>
         </w:numPr>
       </w:pPr>
       <w:r>
@@ -13812,7 +13917,7 @@
         <w:pStyle w:val="Compact"/>
         <w:numPr>
           <w:ilvl w:val="0"/>
-          <w:numId w:val="1609"/>
+          <w:numId w:val="1612"/>
         </w:numPr>
       </w:pPr>
       <w:r>
@@ -13824,7 +13929,7 @@
         <w:pStyle w:val="Compact"/>
         <w:numPr>
           <w:ilvl w:val="0"/>
-          <w:numId w:val="1610"/>
+          <w:numId w:val="1613"/>
         </w:numPr>
       </w:pPr>
       <w:r>
@@ -13836,7 +13941,7 @@
         <w:pStyle w:val="Compact"/>
         <w:numPr>
           <w:ilvl w:val="0"/>
-          <w:numId w:val="1611"/>
+          <w:numId w:val="1614"/>
         </w:numPr>
       </w:pPr>
       <w:r>
@@ -13868,7 +13973,7 @@
         <w:pStyle w:val="Compact"/>
         <w:numPr>
           <w:ilvl w:val="0"/>
-          <w:numId w:val="1612"/>
+          <w:numId w:val="1615"/>
         </w:numPr>
       </w:pPr>
       <w:r>
@@ -13880,7 +13985,7 @@
         <w:pStyle w:val="Compact"/>
         <w:numPr>
           <w:ilvl w:val="0"/>
-          <w:numId w:val="1613"/>
+          <w:numId w:val="1616"/>
         </w:numPr>
       </w:pPr>
       <w:r>
@@ -13892,7 +13997,7 @@
         <w:pStyle w:val="Compact"/>
         <w:numPr>
           <w:ilvl w:val="0"/>
-          <w:numId w:val="1614"/>
+          <w:numId w:val="1617"/>
         </w:numPr>
       </w:pPr>
       <w:r>
@@ -13904,7 +14009,7 @@
         <w:pStyle w:val="Compact"/>
         <w:numPr>
           <w:ilvl w:val="0"/>
-          <w:numId w:val="1615"/>
+          <w:numId w:val="1618"/>
         </w:numPr>
       </w:pPr>
       <w:r>
@@ -13916,7 +14021,7 @@
         <w:pStyle w:val="Compact"/>
         <w:numPr>
           <w:ilvl w:val="0"/>
-          <w:numId w:val="1616"/>
+          <w:numId w:val="1619"/>
         </w:numPr>
       </w:pPr>
       <w:r>
@@ -13928,7 +14033,7 @@
         <w:pStyle w:val="Compact"/>
         <w:numPr>
           <w:ilvl w:val="0"/>
-          <w:numId w:val="1617"/>
+          <w:numId w:val="1620"/>
         </w:numPr>
       </w:pPr>
       <w:r>
@@ -13940,7 +14045,7 @@
         <w:pStyle w:val="Compact"/>
         <w:numPr>
           <w:ilvl w:val="0"/>
-          <w:numId w:val="1618"/>
+          <w:numId w:val="1621"/>
         </w:numPr>
       </w:pPr>
       <w:r>
@@ -13952,7 +14057,7 @@
         <w:pStyle w:val="Compact"/>
         <w:numPr>
           <w:ilvl w:val="0"/>
-          <w:numId w:val="1619"/>
+          <w:numId w:val="1622"/>
         </w:numPr>
       </w:pPr>
       <w:r>
@@ -13964,7 +14069,7 @@
         <w:pStyle w:val="Compact"/>
         <w:numPr>
           <w:ilvl w:val="0"/>
-          <w:numId w:val="1620"/>
+          <w:numId w:val="1623"/>
         </w:numPr>
       </w:pPr>
       <w:r>
@@ -13976,7 +14081,7 @@
         <w:pStyle w:val="Compact"/>
         <w:numPr>
           <w:ilvl w:val="0"/>
-          <w:numId w:val="1621"/>
+          <w:numId w:val="1624"/>
         </w:numPr>
       </w:pPr>
       <w:r>
@@ -13988,7 +14093,7 @@
         <w:pStyle w:val="Compact"/>
         <w:numPr>
           <w:ilvl w:val="0"/>
-          <w:numId w:val="1622"/>
+          <w:numId w:val="1625"/>
         </w:numPr>
       </w:pPr>
       <w:r>
@@ -14000,7 +14105,7 @@
         <w:pStyle w:val="Compact"/>
         <w:numPr>
           <w:ilvl w:val="0"/>
-          <w:numId w:val="1623"/>
+          <w:numId w:val="1626"/>
         </w:numPr>
       </w:pPr>
       <w:r>
@@ -14012,7 +14117,7 @@
         <w:pStyle w:val="Compact"/>
         <w:numPr>
           <w:ilvl w:val="0"/>
-          <w:numId w:val="1624"/>
+          <w:numId w:val="1627"/>
         </w:numPr>
       </w:pPr>
       <w:r>
@@ -14049,7 +14154,7 @@
         <w:pStyle w:val="Compact"/>
         <w:numPr>
           <w:ilvl w:val="0"/>
-          <w:numId w:val="1625"/>
+          <w:numId w:val="1628"/>
         </w:numPr>
       </w:pPr>
       <w:r>
@@ -14061,7 +14166,7 @@
         <w:pStyle w:val="Compact"/>
         <w:numPr>
           <w:ilvl w:val="0"/>
-          <w:numId w:val="1626"/>
+          <w:numId w:val="1629"/>
         </w:numPr>
       </w:pPr>
       <w:r>
@@ -14088,7 +14193,7 @@
         <w:pStyle w:val="Compact"/>
         <w:numPr>
           <w:ilvl w:val="0"/>
-          <w:numId w:val="1627"/>
+          <w:numId w:val="1630"/>
         </w:numPr>
       </w:pPr>
       <w:r>
@@ -14100,7 +14205,7 @@
         <w:pStyle w:val="Compact"/>
         <w:numPr>
           <w:ilvl w:val="0"/>
-          <w:numId w:val="1628"/>
+          <w:numId w:val="1631"/>
         </w:numPr>
       </w:pPr>
       <w:r>
@@ -14112,7 +14217,7 @@
         <w:pStyle w:val="Compact"/>
         <w:numPr>
           <w:ilvl w:val="0"/>
-          <w:numId w:val="1629"/>
+          <w:numId w:val="1632"/>
         </w:numPr>
       </w:pPr>
       <w:r>
@@ -14124,7 +14229,7 @@
         <w:pStyle w:val="Compact"/>
         <w:numPr>
           <w:ilvl w:val="0"/>
-          <w:numId w:val="1630"/>
+          <w:numId w:val="1633"/>
         </w:numPr>
       </w:pPr>
       <w:r>
@@ -14136,7 +14241,7 @@
         <w:pStyle w:val="Compact"/>
         <w:numPr>
           <w:ilvl w:val="0"/>
-          <w:numId w:val="1631"/>
+          <w:numId w:val="1634"/>
         </w:numPr>
       </w:pPr>
       <w:r>
@@ -14148,7 +14253,7 @@
         <w:pStyle w:val="Compact"/>
         <w:numPr>
           <w:ilvl w:val="0"/>
-          <w:numId w:val="1632"/>
+          <w:numId w:val="1635"/>
         </w:numPr>
       </w:pPr>
       <w:r>
@@ -14170,7 +14275,7 @@
         <w:pStyle w:val="Compact"/>
         <w:numPr>
           <w:ilvl w:val="0"/>
-          <w:numId w:val="1633"/>
+          <w:numId w:val="1636"/>
         </w:numPr>
       </w:pPr>
       <w:r>
@@ -14182,7 +14287,7 @@
         <w:pStyle w:val="Compact"/>
         <w:numPr>
           <w:ilvl w:val="0"/>
-          <w:numId w:val="1634"/>
+          <w:numId w:val="1637"/>
         </w:numPr>
       </w:pPr>
       <w:r>
@@ -14194,7 +14299,7 @@
         <w:pStyle w:val="Compact"/>
         <w:numPr>
           <w:ilvl w:val="0"/>
-          <w:numId w:val="1635"/>
+          <w:numId w:val="1638"/>
         </w:numPr>
       </w:pPr>
       <w:r>
@@ -14206,7 +14311,7 @@
         <w:pStyle w:val="Compact"/>
         <w:numPr>
           <w:ilvl w:val="0"/>
-          <w:numId w:val="1636"/>
+          <w:numId w:val="1639"/>
         </w:numPr>
       </w:pPr>
       <w:r>
@@ -14218,7 +14323,7 @@
         <w:pStyle w:val="Compact"/>
         <w:numPr>
           <w:ilvl w:val="0"/>
-          <w:numId w:val="1637"/>
+          <w:numId w:val="1640"/>
         </w:numPr>
       </w:pPr>
       <w:r>
@@ -14230,7 +14335,7 @@
         <w:pStyle w:val="Compact"/>
         <w:numPr>
           <w:ilvl w:val="0"/>
-          <w:numId w:val="1638"/>
+          <w:numId w:val="1641"/>
         </w:numPr>
       </w:pPr>
       <w:r>
@@ -14242,7 +14347,7 @@
         <w:pStyle w:val="Compact"/>
         <w:numPr>
           <w:ilvl w:val="0"/>
-          <w:numId w:val="1639"/>
+          <w:numId w:val="1642"/>
         </w:numPr>
       </w:pPr>
       <w:r>
@@ -14254,7 +14359,7 @@
         <w:pStyle w:val="Compact"/>
         <w:numPr>
           <w:ilvl w:val="0"/>
-          <w:numId w:val="1640"/>
+          <w:numId w:val="1643"/>
         </w:numPr>
       </w:pPr>
       <w:r>
@@ -14266,7 +14371,7 @@
         <w:pStyle w:val="Compact"/>
         <w:numPr>
           <w:ilvl w:val="0"/>
-          <w:numId w:val="1641"/>
+          <w:numId w:val="1644"/>
         </w:numPr>
       </w:pPr>
       <w:r>
@@ -14289,7 +14394,7 @@
         <w:pStyle w:val="Compact"/>
         <w:numPr>
           <w:ilvl w:val="0"/>
-          <w:numId w:val="1642"/>
+          <w:numId w:val="1645"/>
         </w:numPr>
       </w:pPr>
       <w:r>
@@ -14301,7 +14406,7 @@
         <w:pStyle w:val="Compact"/>
         <w:numPr>
           <w:ilvl w:val="0"/>
-          <w:numId w:val="1643"/>
+          <w:numId w:val="1646"/>
         </w:numPr>
       </w:pPr>
       <w:r>
@@ -14313,7 +14418,7 @@
         <w:pStyle w:val="Compact"/>
         <w:numPr>
           <w:ilvl w:val="0"/>
-          <w:numId w:val="1644"/>
+          <w:numId w:val="1647"/>
         </w:numPr>
       </w:pPr>
       <w:r>
@@ -14325,7 +14430,7 @@
         <w:pStyle w:val="Compact"/>
         <w:numPr>
           <w:ilvl w:val="0"/>
-          <w:numId w:val="1645"/>
+          <w:numId w:val="1648"/>
         </w:numPr>
       </w:pPr>
       <w:r>
@@ -14337,7 +14442,7 @@
         <w:pStyle w:val="Compact"/>
         <w:numPr>
           <w:ilvl w:val="0"/>
-          <w:numId w:val="1646"/>
+          <w:numId w:val="1649"/>
         </w:numPr>
       </w:pPr>
       <w:r>
@@ -14349,7 +14454,7 @@
         <w:pStyle w:val="Compact"/>
         <w:numPr>
           <w:ilvl w:val="0"/>
-          <w:numId w:val="1647"/>
+          <w:numId w:val="1650"/>
         </w:numPr>
       </w:pPr>
       <w:r>
@@ -14361,7 +14466,7 @@
         <w:pStyle w:val="Compact"/>
         <w:numPr>
           <w:ilvl w:val="0"/>
-          <w:numId w:val="1648"/>
+          <w:numId w:val="1651"/>
         </w:numPr>
       </w:pPr>
       <w:r>
@@ -14373,7 +14478,7 @@
         <w:pStyle w:val="Compact"/>
         <w:numPr>
           <w:ilvl w:val="0"/>
-          <w:numId w:val="1649"/>
+          <w:numId w:val="1652"/>
         </w:numPr>
       </w:pPr>
       <w:r>
@@ -14385,7 +14490,7 @@
         <w:pStyle w:val="Compact"/>
         <w:numPr>
           <w:ilvl w:val="0"/>
-          <w:numId w:val="1650"/>
+          <w:numId w:val="1653"/>
         </w:numPr>
       </w:pPr>
       <w:r>
@@ -14397,7 +14502,7 @@
         <w:pStyle w:val="Compact"/>
         <w:numPr>
           <w:ilvl w:val="0"/>
-          <w:numId w:val="1651"/>
+          <w:numId w:val="1654"/>
         </w:numPr>
       </w:pPr>
       <w:r>
@@ -14409,7 +14514,7 @@
         <w:pStyle w:val="Compact"/>
         <w:numPr>
           <w:ilvl w:val="0"/>
-          <w:numId w:val="1652"/>
+          <w:numId w:val="1655"/>
         </w:numPr>
       </w:pPr>
       <w:r>
@@ -16008,7 +16113,7 @@
     <w:abstractNumId w:val="993"/>
   </w:num>
   <w:num w:numId="1360">
-    <w:abstractNumId w:val="992"/>
+    <w:abstractNumId w:val="993"/>
   </w:num>
   <w:num w:numId="1361">
     <w:abstractNumId w:val="993"/>
@@ -16017,17 +16122,17 @@
     <w:abstractNumId w:val="993"/>
   </w:num>
   <w:num w:numId="1363">
+    <w:abstractNumId w:val="993"/>
+  </w:num>
+  <w:num w:numId="1364">
+    <w:abstractNumId w:val="993"/>
+  </w:num>
+  <w:num w:numId="1365">
+    <w:abstractNumId w:val="993"/>
+  </w:num>
+  <w:num w:numId="1366">
     <w:abstractNumId w:val="991"/>
   </w:num>
-  <w:num w:numId="1364">
-    <w:abstractNumId w:val="993"/>
-  </w:num>
-  <w:num w:numId="1365">
-    <w:abstractNumId w:val="993"/>
-  </w:num>
-  <w:num w:numId="1366">
-    <w:abstractNumId w:val="993"/>
-  </w:num>
   <w:num w:numId="1367">
     <w:abstractNumId w:val="993"/>
   </w:num>
@@ -16047,7 +16152,7 @@
     <w:abstractNumId w:val="993"/>
   </w:num>
   <w:num w:numId="1373">
-    <w:abstractNumId w:val="992"/>
+    <w:abstractNumId w:val="993"/>
   </w:num>
   <w:num w:numId="1374">
     <w:abstractNumId w:val="993"/>
@@ -16065,17 +16170,17 @@
     <w:abstractNumId w:val="993"/>
   </w:num>
   <w:num w:numId="1379">
+    <w:abstractNumId w:val="993"/>
+  </w:num>
+  <w:num w:numId="1380">
+    <w:abstractNumId w:val="993"/>
+  </w:num>
+  <w:num w:numId="1381">
+    <w:abstractNumId w:val="993"/>
+  </w:num>
+  <w:num w:numId="1382">
     <w:abstractNumId w:val="991"/>
   </w:num>
-  <w:num w:numId="1380">
-    <w:abstractNumId w:val="993"/>
-  </w:num>
-  <w:num w:numId="1381">
-    <w:abstractNumId w:val="993"/>
-  </w:num>
-  <w:num w:numId="1382">
-    <w:abstractNumId w:val="993"/>
-  </w:num>
   <w:num w:numId="1383">
     <w:abstractNumId w:val="993"/>
   </w:num>
@@ -16098,7 +16203,7 @@
     <w:abstractNumId w:val="993"/>
   </w:num>
   <w:num w:numId="1390">
-    <w:abstractNumId w:val="992"/>
+    <w:abstractNumId w:val="993"/>
   </w:num>
   <w:num w:numId="1391">
     <w:abstractNumId w:val="993"/>
@@ -16107,13 +16212,13 @@
     <w:abstractNumId w:val="993"/>
   </w:num>
   <w:num w:numId="1393">
-    <w:abstractNumId w:val="992"/>
+    <w:abstractNumId w:val="993"/>
   </w:num>
   <w:num w:numId="1394">
-    <w:abstractNumId w:val="992"/>
+    <w:abstractNumId w:val="993"/>
   </w:num>
   <w:num w:numId="1395">
-    <w:abstractNumId w:val="992"/>
+    <w:abstractNumId w:val="993"/>
   </w:num>
   <w:num w:numId="1396">
     <w:abstractNumId w:val="992"/>
@@ -16194,31 +16299,31 @@
     <w:abstractNumId w:val="992"/>
   </w:num>
   <w:num w:numId="1422">
-    <w:abstractNumId w:val="993"/>
+    <w:abstractNumId w:val="992"/>
   </w:num>
   <w:num w:numId="1423">
-    <w:abstractNumId w:val="993"/>
+    <w:abstractNumId w:val="992"/>
   </w:num>
   <w:num w:numId="1424">
-    <w:abstractNumId w:val="993"/>
+    <w:abstractNumId w:val="992"/>
   </w:num>
   <w:num w:numId="1425">
     <w:abstractNumId w:val="993"/>
   </w:num>
   <w:num w:numId="1426">
-    <w:abstractNumId w:val="992"/>
+    <w:abstractNumId w:val="993"/>
   </w:num>
   <w:num w:numId="1427">
-    <w:abstractNumId w:val="992"/>
+    <w:abstractNumId w:val="993"/>
   </w:num>
   <w:num w:numId="1428">
     <w:abstractNumId w:val="993"/>
   </w:num>
   <w:num w:numId="1429">
-    <w:abstractNumId w:val="993"/>
+    <w:abstractNumId w:val="992"/>
   </w:num>
   <w:num w:numId="1430">
-    <w:abstractNumId w:val="993"/>
+    <w:abstractNumId w:val="992"/>
   </w:num>
   <w:num w:numId="1431">
     <w:abstractNumId w:val="993"/>
@@ -16254,25 +16359,25 @@
     <w:abstractNumId w:val="993"/>
   </w:num>
   <w:num w:numId="1442">
-    <w:abstractNumId w:val="992"/>
+    <w:abstractNumId w:val="993"/>
   </w:num>
   <w:num w:numId="1443">
+    <w:abstractNumId w:val="993"/>
+  </w:num>
+  <w:num w:numId="1444">
+    <w:abstractNumId w:val="993"/>
+  </w:num>
+  <w:num w:numId="1445">
+    <w:abstractNumId w:val="992"/>
+  </w:num>
+  <w:num w:numId="1446">
     <w:abstractNumId w:val="991"/>
   </w:num>
-  <w:num w:numId="1444">
-    <w:abstractNumId w:val="993"/>
-  </w:num>
-  <w:num w:numId="1445">
-    <w:abstractNumId w:val="993"/>
-  </w:num>
-  <w:num w:numId="1446">
-    <w:abstractNumId w:val="992"/>
-  </w:num>
   <w:num w:numId="1447">
-    <w:abstractNumId w:val="992"/>
+    <w:abstractNumId w:val="993"/>
   </w:num>
   <w:num w:numId="1448">
-    <w:abstractNumId w:val="992"/>
+    <w:abstractNumId w:val="993"/>
   </w:num>
   <w:num w:numId="1449">
     <w:abstractNumId w:val="992"/>
@@ -16281,7 +16386,7 @@
     <w:abstractNumId w:val="992"/>
   </w:num>
   <w:num w:numId="1451">
-    <w:abstractNumId w:val="993"/>
+    <w:abstractNumId w:val="992"/>
   </w:num>
   <w:num w:numId="1452">
     <w:abstractNumId w:val="992"/>
@@ -16293,10 +16398,10 @@
     <w:abstractNumId w:val="993"/>
   </w:num>
   <w:num w:numId="1455">
-    <w:abstractNumId w:val="993"/>
+    <w:abstractNumId w:val="992"/>
   </w:num>
   <w:num w:numId="1456">
-    <w:abstractNumId w:val="993"/>
+    <w:abstractNumId w:val="992"/>
   </w:num>
   <w:num w:numId="1457">
     <w:abstractNumId w:val="993"/>
@@ -16332,53 +16437,53 @@
     <w:abstractNumId w:val="993"/>
   </w:num>
   <w:num w:numId="1468">
+    <w:abstractNumId w:val="993"/>
+  </w:num>
+  <w:num w:numId="1469">
+    <w:abstractNumId w:val="993"/>
+  </w:num>
+  <w:num w:numId="1470">
+    <w:abstractNumId w:val="993"/>
+  </w:num>
+  <w:num w:numId="1471">
     <w:abstractNumId w:val="991"/>
   </w:num>
-  <w:num w:numId="1469">
-    <w:abstractNumId w:val="993"/>
-  </w:num>
-  <w:num w:numId="1470">
-    <w:abstractNumId w:val="993"/>
-  </w:num>
-  <w:num w:numId="1471">
-    <w:abstractNumId w:val="993"/>
-  </w:num>
   <w:num w:numId="1472">
+    <w:abstractNumId w:val="993"/>
+  </w:num>
+  <w:num w:numId="1473">
+    <w:abstractNumId w:val="993"/>
+  </w:num>
+  <w:num w:numId="1474">
+    <w:abstractNumId w:val="993"/>
+  </w:num>
+  <w:num w:numId="1475">
     <w:abstractNumId w:val="991"/>
   </w:num>
-  <w:num w:numId="1473">
-    <w:abstractNumId w:val="993"/>
-  </w:num>
-  <w:num w:numId="1474">
-    <w:abstractNumId w:val="993"/>
-  </w:num>
-  <w:num w:numId="1475">
-    <w:abstractNumId w:val="992"/>
-  </w:num>
   <w:num w:numId="1476">
-    <w:abstractNumId w:val="992"/>
+    <w:abstractNumId w:val="993"/>
   </w:num>
   <w:num w:numId="1477">
     <w:abstractNumId w:val="993"/>
   </w:num>
   <w:num w:numId="1478">
+    <w:abstractNumId w:val="992"/>
+  </w:num>
+  <w:num w:numId="1479">
+    <w:abstractNumId w:val="992"/>
+  </w:num>
+  <w:num w:numId="1480">
+    <w:abstractNumId w:val="993"/>
+  </w:num>
+  <w:num w:numId="1481">
     <w:abstractNumId w:val="991"/>
   </w:num>
-  <w:num w:numId="1479">
-    <w:abstractNumId w:val="993"/>
-  </w:num>
-  <w:num w:numId="1480">
+  <w:num w:numId="1482">
+    <w:abstractNumId w:val="993"/>
+  </w:num>
+  <w:num w:numId="1483">
     <w:abstractNumId w:val="991"/>
   </w:num>
-  <w:num w:numId="1481">
-    <w:abstractNumId w:val="993"/>
-  </w:num>
-  <w:num w:numId="1482">
-    <w:abstractNumId w:val="993"/>
-  </w:num>
-  <w:num w:numId="1483">
-    <w:abstractNumId w:val="993"/>
-  </w:num>
   <w:num w:numId="1484">
     <w:abstractNumId w:val="993"/>
   </w:num>
@@ -16398,43 +16503,43 @@
     <w:abstractNumId w:val="993"/>
   </w:num>
   <w:num w:numId="1490">
+    <w:abstractNumId w:val="993"/>
+  </w:num>
+  <w:num w:numId="1491">
+    <w:abstractNumId w:val="993"/>
+  </w:num>
+  <w:num w:numId="1492">
+    <w:abstractNumId w:val="993"/>
+  </w:num>
+  <w:num w:numId="1493">
     <w:abstractNumId w:val="991"/>
   </w:num>
-  <w:num w:numId="1491">
-    <w:abstractNumId w:val="993"/>
-  </w:num>
-  <w:num w:numId="1492">
-    <w:abstractNumId w:val="993"/>
-  </w:num>
-  <w:num w:numId="1493">
-    <w:abstractNumId w:val="992"/>
-  </w:num>
   <w:num w:numId="1494">
-    <w:abstractNumId w:val="992"/>
+    <w:abstractNumId w:val="993"/>
   </w:num>
   <w:num w:numId="1495">
     <w:abstractNumId w:val="993"/>
   </w:num>
   <w:num w:numId="1496">
-    <w:abstractNumId w:val="993"/>
+    <w:abstractNumId w:val="992"/>
   </w:num>
   <w:num w:numId="1497">
-    <w:abstractNumId w:val="993"/>
+    <w:abstractNumId w:val="992"/>
   </w:num>
   <w:num w:numId="1498">
-    <w:abstractNumId w:val="992"/>
+    <w:abstractNumId w:val="993"/>
   </w:num>
   <w:num w:numId="1499">
-    <w:abstractNumId w:val="992"/>
+    <w:abstractNumId w:val="993"/>
   </w:num>
   <w:num w:numId="1500">
-    <w:abstractNumId w:val="992"/>
+    <w:abstractNumId w:val="993"/>
   </w:num>
   <w:num w:numId="1501">
     <w:abstractNumId w:val="992"/>
   </w:num>
   <w:num w:numId="1502">
-    <w:abstractNumId w:val="993"/>
+    <w:abstractNumId w:val="992"/>
   </w:num>
   <w:num w:numId="1503">
     <w:abstractNumId w:val="992"/>
@@ -16446,10 +16551,10 @@
     <w:abstractNumId w:val="993"/>
   </w:num>
   <w:num w:numId="1506">
-    <w:abstractNumId w:val="993"/>
+    <w:abstractNumId w:val="992"/>
   </w:num>
   <w:num w:numId="1507">
-    <w:abstractNumId w:val="993"/>
+    <w:abstractNumId w:val="992"/>
   </w:num>
   <w:num w:numId="1508">
     <w:abstractNumId w:val="993"/>
@@ -16503,17 +16608,17 @@
     <w:abstractNumId w:val="993"/>
   </w:num>
   <w:num w:numId="1525">
+    <w:abstractNumId w:val="993"/>
+  </w:num>
+  <w:num w:numId="1526">
+    <w:abstractNumId w:val="993"/>
+  </w:num>
+  <w:num w:numId="1527">
+    <w:abstractNumId w:val="993"/>
+  </w:num>
+  <w:num w:numId="1528">
     <w:abstractNumId w:val="991"/>
   </w:num>
-  <w:num w:numId="1526">
-    <w:abstractNumId w:val="992"/>
-  </w:num>
-  <w:num w:numId="1527">
-    <w:abstractNumId w:val="992"/>
-  </w:num>
-  <w:num w:numId="1528">
-    <w:abstractNumId w:val="992"/>
-  </w:num>
   <w:num w:numId="1529">
     <w:abstractNumId w:val="992"/>
   </w:num>
@@ -16554,13 +16659,13 @@
     <w:abstractNumId w:val="992"/>
   </w:num>
   <w:num w:numId="1542">
-    <w:abstractNumId w:val="993"/>
+    <w:abstractNumId w:val="992"/>
   </w:num>
   <w:num w:numId="1543">
-    <w:abstractNumId w:val="993"/>
+    <w:abstractNumId w:val="992"/>
   </w:num>
   <w:num w:numId="1544">
-    <w:abstractNumId w:val="993"/>
+    <w:abstractNumId w:val="992"/>
   </w:num>
   <w:num w:numId="1545">
     <w:abstractNumId w:val="993"/>
@@ -16569,7 +16674,7 @@
     <w:abstractNumId w:val="993"/>
   </w:num>
   <w:num w:numId="1547">
-    <w:abstractNumId w:val="991"/>
+    <w:abstractNumId w:val="993"/>
   </w:num>
   <w:num w:numId="1548">
     <w:abstractNumId w:val="993"/>
@@ -16587,7 +16692,7 @@
     <w:abstractNumId w:val="993"/>
   </w:num>
   <w:num w:numId="1553">
-    <w:abstractNumId w:val="993"/>
+    <w:abstractNumId w:val="991"/>
   </w:num>
   <w:num w:numId="1554">
     <w:abstractNumId w:val="993"/>
@@ -16611,31 +16716,31 @@
     <w:abstractNumId w:val="993"/>
   </w:num>
   <w:num w:numId="1561">
+    <w:abstractNumId w:val="993"/>
+  </w:num>
+  <w:num w:numId="1562">
+    <w:abstractNumId w:val="993"/>
+  </w:num>
+  <w:num w:numId="1563">
+    <w:abstractNumId w:val="993"/>
+  </w:num>
+  <w:num w:numId="1564">
     <w:abstractNumId w:val="991"/>
   </w:num>
-  <w:num w:numId="1562">
-    <w:abstractNumId w:val="993"/>
-  </w:num>
-  <w:num w:numId="1563">
+  <w:num w:numId="1565">
+    <w:abstractNumId w:val="993"/>
+  </w:num>
+  <w:num w:numId="1566">
     <w:abstractNumId w:val="991"/>
   </w:num>
-  <w:num w:numId="1564">
-    <w:abstractNumId w:val="993"/>
-  </w:num>
-  <w:num w:numId="1565">
-    <w:abstractNumId w:val="993"/>
-  </w:num>
-  <w:num w:numId="1566">
-    <w:abstractNumId w:val="993"/>
-  </w:num>
   <w:num w:numId="1567">
     <w:abstractNumId w:val="993"/>
   </w:num>
   <w:num w:numId="1568">
-    <w:abstractNumId w:val="992"/>
+    <w:abstractNumId w:val="993"/>
   </w:num>
   <w:num w:numId="1569">
-    <w:abstractNumId w:val="992"/>
+    <w:abstractNumId w:val="993"/>
   </w:num>
   <w:num w:numId="1570">
     <w:abstractNumId w:val="993"/>
@@ -16647,7 +16752,7 @@
     <w:abstractNumId w:val="992"/>
   </w:num>
   <w:num w:numId="1573">
-    <w:abstractNumId w:val="992"/>
+    <w:abstractNumId w:val="993"/>
   </w:num>
   <w:num w:numId="1574">
     <w:abstractNumId w:val="992"/>
@@ -16659,13 +16764,13 @@
     <w:abstractNumId w:val="992"/>
   </w:num>
   <w:num w:numId="1577">
-    <w:abstractNumId w:val="993"/>
+    <w:abstractNumId w:val="992"/>
   </w:num>
   <w:num w:numId="1578">
-    <w:abstractNumId w:val="993"/>
+    <w:abstractNumId w:val="992"/>
   </w:num>
   <w:num w:numId="1579">
-    <w:abstractNumId w:val="993"/>
+    <w:abstractNumId w:val="992"/>
   </w:num>
   <w:num w:numId="1580">
     <w:abstractNumId w:val="993"/>
@@ -16680,7 +16785,7 @@
     <w:abstractNumId w:val="993"/>
   </w:num>
   <w:num w:numId="1584">
-    <w:abstractNumId w:val="992"/>
+    <w:abstractNumId w:val="993"/>
   </w:num>
   <w:num w:numId="1585">
     <w:abstractNumId w:val="993"/>
@@ -16689,10 +16794,10 @@
     <w:abstractNumId w:val="993"/>
   </w:num>
   <w:num w:numId="1587">
-    <w:abstractNumId w:val="993"/>
+    <w:abstractNumId w:val="992"/>
   </w:num>
   <w:num w:numId="1588">
-    <w:abstractNumId w:val="992"/>
+    <w:abstractNumId w:val="993"/>
   </w:num>
   <w:num w:numId="1589">
     <w:abstractNumId w:val="993"/>
@@ -16701,10 +16806,10 @@
     <w:abstractNumId w:val="993"/>
   </w:num>
   <w:num w:numId="1591">
-    <w:abstractNumId w:val="993"/>
+    <w:abstractNumId w:val="992"/>
   </w:num>
   <w:num w:numId="1592">
-    <w:abstractNumId w:val="992"/>
+    <w:abstractNumId w:val="993"/>
   </w:num>
   <w:num w:numId="1593">
     <w:abstractNumId w:val="993"/>
@@ -16713,7 +16818,7 @@
     <w:abstractNumId w:val="993"/>
   </w:num>
   <w:num w:numId="1595">
-    <w:abstractNumId w:val="993"/>
+    <w:abstractNumId w:val="992"/>
   </w:num>
   <w:num w:numId="1596">
     <w:abstractNumId w:val="993"/>
@@ -16725,13 +16830,13 @@
     <w:abstractNumId w:val="993"/>
   </w:num>
   <w:num w:numId="1599">
-    <w:abstractNumId w:val="992"/>
+    <w:abstractNumId w:val="993"/>
   </w:num>
   <w:num w:numId="1600">
     <w:abstractNumId w:val="993"/>
   </w:num>
   <w:num w:numId="1601">
-    <w:abstractNumId w:val="992"/>
+    <w:abstractNumId w:val="993"/>
   </w:num>
   <w:num w:numId="1602">
     <w:abstractNumId w:val="992"/>
@@ -16740,28 +16845,28 @@
     <w:abstractNumId w:val="993"/>
   </w:num>
   <w:num w:numId="1604">
-    <w:abstractNumId w:val="993"/>
+    <w:abstractNumId w:val="992"/>
   </w:num>
   <w:num w:numId="1605">
-    <w:abstractNumId w:val="993"/>
+    <w:abstractNumId w:val="992"/>
   </w:num>
   <w:num w:numId="1606">
     <w:abstractNumId w:val="993"/>
   </w:num>
   <w:num w:numId="1607">
-    <w:abstractNumId w:val="992"/>
+    <w:abstractNumId w:val="993"/>
   </w:num>
   <w:num w:numId="1608">
-    <w:abstractNumId w:val="992"/>
+    <w:abstractNumId w:val="993"/>
   </w:num>
   <w:num w:numId="1609">
-    <w:abstractNumId w:val="992"/>
+    <w:abstractNumId w:val="993"/>
   </w:num>
   <w:num w:numId="1610">
     <w:abstractNumId w:val="992"/>
   </w:num>
   <w:num w:numId="1611">
-    <w:abstractNumId w:val="993"/>
+    <w:abstractNumId w:val="992"/>
   </w:num>
   <w:num w:numId="1612">
     <w:abstractNumId w:val="992"/>
@@ -16770,7 +16875,7 @@
     <w:abstractNumId w:val="992"/>
   </w:num>
   <w:num w:numId="1614">
-    <w:abstractNumId w:val="992"/>
+    <w:abstractNumId w:val="993"/>
   </w:num>
   <w:num w:numId="1615">
     <w:abstractNumId w:val="992"/>
@@ -16884,6 +16989,15 @@
     <w:abstractNumId w:val="992"/>
   </w:num>
   <w:num w:numId="1652">
+    <w:abstractNumId w:val="992"/>
+  </w:num>
+  <w:num w:numId="1653">
+    <w:abstractNumId w:val="992"/>
+  </w:num>
+  <w:num w:numId="1654">
+    <w:abstractNumId w:val="992"/>
+  </w:num>
+  <w:num w:numId="1655">
     <w:abstractNumId w:val="992"/>
   </w:num>
 </w:numbering>

</xml_diff>

<commit_message>
Record M1.6 initial regression gate
</commit_message>
<xml_diff>
--- a/MASTER_M1_M2_DELIVERY_CHECKLIST.docx
+++ b/MASTER_M1_M2_DELIVERY_CHECKLIST.docx
@@ -10,7 +10,7 @@
         <w:t xml:space="preserve">© BuyReadySite.com</w:t>
       </w:r>
     </w:p>
-    <w:bookmarkStart w:id="88" w:name="X3d74ce0b4fd94f465ac7edf34b08aa6d5ff209b"/>
+    <w:bookmarkStart w:id="89" w:name="X3d74ce0b4fd94f465ac7edf34b08aa6d5ff209b"/>
     <w:p>
       <w:pPr>
         <w:pStyle w:val="Heading1"/>
@@ -457,7 +457,7 @@
               <w:jc w:val="right"/>
             </w:pPr>
             <w:r>
-              <w:t xml:space="preserve">0%</w:t>
+              <w:t xml:space="preserve">1%</w:t>
             </w:r>
           </w:p>
         </w:tc>
@@ -468,7 +468,7 @@
               <w:pStyle w:val="Compact"/>
             </w:pPr>
             <w:r>
-              <w:t xml:space="preserve">Not started</w:t>
+              <w:t xml:space="preserve">Initial build gate passed; full server suite blocked by local DB/Redis env</w:t>
             </w:r>
           </w:p>
         </w:tc>
@@ -709,7 +709,7 @@
                 <w:b/>
                 <w:bCs/>
               </w:rPr>
-              <w:t xml:space="preserve">67%</w:t>
+              <w:t xml:space="preserve">68%</w:t>
             </w:r>
           </w:p>
         </w:tc>
@@ -724,7 +724,7 @@
                 <w:b/>
                 <w:bCs/>
               </w:rPr>
-              <w:t xml:space="preserve">M1.5 complete; next gates are M1.6 regression/release and remaining M2 work</w:t>
+              <w:t xml:space="preserve">M1.6 initial build evidence added; browser/full-env regression gates remain</w:t>
             </w:r>
           </w:p>
         </w:tc>
@@ -9890,7 +9890,7 @@
     </w:p>
     <w:bookmarkEnd w:id="52"/>
     <w:bookmarkEnd w:id="53"/>
-    <w:bookmarkStart w:id="57" w:name="m1.6-m1-full-regression-and-release-gate"/>
+    <w:bookmarkStart w:id="58" w:name="m1.6-m1-full-regression-and-release-gate"/>
     <w:p>
       <w:pPr>
         <w:pStyle w:val="Heading2"/>
@@ -9899,12 +9899,181 @@
         <w:t xml:space="preserve">M1.6 — M1 Full Regression And Release Gate</w:t>
       </w:r>
     </w:p>
-    <w:bookmarkStart w:id="54" w:name="functional-regression"/>
+    <w:bookmarkStart w:id="54" w:name="initial-gate-evidence-2026-05-02"/>
     <w:p>
       <w:pPr>
         <w:pStyle w:val="Heading3"/>
       </w:pPr>
       <w:r>
+        <w:t xml:space="preserve">Initial gate evidence — 2026-05-02</w:t>
+      </w:r>
+    </w:p>
+    <w:p>
+      <w:pPr>
+        <w:pStyle w:val="Compact"/>
+        <w:numPr>
+          <w:ilvl w:val="0"/>
+          <w:numId w:val="1396"/>
+        </w:numPr>
+      </w:pPr>
+      <w:r>
+        <w:t xml:space="preserve">Evidence JSON added:</w:t>
+      </w:r>
+      <w:r>
+        <w:t xml:space="preserve"> </w:t>
+      </w:r>
+      <w:r>
+        <w:rPr>
+          <w:rStyle w:val="VerbatimChar"/>
+        </w:rPr>
+        <w:t xml:space="preserve">audit-screenshots/m16-regression-gate-evidence.json</w:t>
+      </w:r>
+      <w:r>
+        <w:t xml:space="preserve">.</w:t>
+      </w:r>
+    </w:p>
+    <w:p>
+      <w:pPr>
+        <w:pStyle w:val="Compact"/>
+        <w:numPr>
+          <w:ilvl w:val="0"/>
+          <w:numId w:val="1397"/>
+        </w:numPr>
+      </w:pPr>
+      <w:r>
+        <w:t xml:space="preserve">Root release build passed:</w:t>
+      </w:r>
+      <w:r>
+        <w:t xml:space="preserve"> </w:t>
+      </w:r>
+      <w:r>
+        <w:rPr>
+          <w:rStyle w:val="VerbatimChar"/>
+        </w:rPr>
+        <w:t xml:space="preserve">npm run build</w:t>
+      </w:r>
+      <w:r>
+        <w:t xml:space="preserve"> </w:t>
+      </w:r>
+      <w:r>
+        <w:t xml:space="preserve">completed server</w:t>
+      </w:r>
+      <w:r>
+        <w:t xml:space="preserve"> </w:t>
+      </w:r>
+      <w:r>
+        <w:rPr>
+          <w:rStyle w:val="VerbatimChar"/>
+        </w:rPr>
+        <w:t xml:space="preserve">tsc</w:t>
+      </w:r>
+      <w:r>
+        <w:t xml:space="preserve"> </w:t>
+      </w:r>
+      <w:r>
+        <w:t xml:space="preserve">and client</w:t>
+      </w:r>
+      <w:r>
+        <w:t xml:space="preserve"> </w:t>
+      </w:r>
+      <w:r>
+        <w:rPr>
+          <w:rStyle w:val="VerbatimChar"/>
+        </w:rPr>
+        <w:t xml:space="preserve">tsc &amp;&amp; vite build</w:t>
+      </w:r>
+      <w:r>
+        <w:t xml:space="preserve">.</w:t>
+      </w:r>
+    </w:p>
+    <w:p>
+      <w:pPr>
+        <w:pStyle w:val="Compact"/>
+        <w:numPr>
+          <w:ilvl w:val="0"/>
+          <w:numId w:val="1398"/>
+        </w:numPr>
+      </w:pPr>
+      <w:r>
+        <w:t xml:space="preserve">Full backend suite attempted:</w:t>
+      </w:r>
+      <w:r>
+        <w:t xml:space="preserve"> </w:t>
+      </w:r>
+      <w:r>
+        <w:rPr>
+          <w:rStyle w:val="VerbatimChar"/>
+        </w:rPr>
+        <w:t xml:space="preserve">cd server &amp;&amp; npm test -- --run</w:t>
+      </w:r>
+      <w:r>
+        <w:t xml:space="preserve"> </w:t>
+      </w:r>
+      <w:r>
+        <w:t xml:space="preserve">is blocked by local environment, not by the M1.5 changes. Redis is unavailable on local</w:t>
+      </w:r>
+      <w:r>
+        <w:t xml:space="preserve"> </w:t>
+      </w:r>
+      <w:r>
+        <w:rPr>
+          <w:rStyle w:val="VerbatimChar"/>
+        </w:rPr>
+        <w:t xml:space="preserve">6379</w:t>
+      </w:r>
+      <w:r>
+        <w:t xml:space="preserve">, and the local Prisma datasource provider does not match the MySQL schema; DB-backed</w:t>
+      </w:r>
+      <w:r>
+        <w:t xml:space="preserve"> </w:t>
+      </w:r>
+      <w:r>
+        <w:rPr>
+          <w:rStyle w:val="VerbatimChar"/>
+        </w:rPr>
+        <w:t xml:space="preserve">auth</w:t>
+      </w:r>
+      <w:r>
+        <w:t xml:space="preserve"> </w:t>
+      </w:r>
+      <w:r>
+        <w:t xml:space="preserve">and</w:t>
+      </w:r>
+      <w:r>
+        <w:t xml:space="preserve"> </w:t>
+      </w:r>
+      <w:r>
+        <w:rPr>
+          <w:rStyle w:val="VerbatimChar"/>
+        </w:rPr>
+        <w:t xml:space="preserve">numberService</w:t>
+      </w:r>
+      <w:r>
+        <w:t xml:space="preserve"> </w:t>
+      </w:r>
+      <w:r>
+        <w:t xml:space="preserve">tests cannot complete until a valid MySQL test DB and Redis are available.</w:t>
+      </w:r>
+    </w:p>
+    <w:p>
+      <w:pPr>
+        <w:pStyle w:val="Compact"/>
+        <w:numPr>
+          <w:ilvl w:val="0"/>
+          <w:numId w:val="1399"/>
+        </w:numPr>
+      </w:pPr>
+      <w:r>
+        <w:t xml:space="preserve">M1.5 focused backend regression remains green: 18/18 focused tests passed before opening M1.6 gate.</w:t>
+      </w:r>
+    </w:p>
+    <w:bookmarkEnd w:id="54"/>
+    <w:bookmarkStart w:id="55" w:name="functional-regression"/>
+    <w:p>
+      <w:pPr>
+        <w:pStyle w:val="Heading3"/>
+      </w:pPr>
+      <w:r>
         <w:t xml:space="preserve">Functional regression</w:t>
       </w:r>
     </w:p>
@@ -9913,7 +10082,7 @@
         <w:pStyle w:val="Compact"/>
         <w:numPr>
           <w:ilvl w:val="0"/>
-          <w:numId w:val="1396"/>
+          <w:numId w:val="1400"/>
         </w:numPr>
       </w:pPr>
       <w:r>
@@ -9925,7 +10094,7 @@
         <w:pStyle w:val="Compact"/>
         <w:numPr>
           <w:ilvl w:val="0"/>
-          <w:numId w:val="1397"/>
+          <w:numId w:val="1401"/>
         </w:numPr>
       </w:pPr>
       <w:r>
@@ -9937,7 +10106,7 @@
         <w:pStyle w:val="Compact"/>
         <w:numPr>
           <w:ilvl w:val="0"/>
-          <w:numId w:val="1398"/>
+          <w:numId w:val="1402"/>
         </w:numPr>
       </w:pPr>
       <w:r>
@@ -9949,7 +10118,7 @@
         <w:pStyle w:val="Compact"/>
         <w:numPr>
           <w:ilvl w:val="0"/>
-          <w:numId w:val="1399"/>
+          <w:numId w:val="1403"/>
         </w:numPr>
       </w:pPr>
       <w:r>
@@ -9961,7 +10130,7 @@
         <w:pStyle w:val="Compact"/>
         <w:numPr>
           <w:ilvl w:val="0"/>
-          <w:numId w:val="1400"/>
+          <w:numId w:val="1404"/>
         </w:numPr>
       </w:pPr>
       <w:r>
@@ -9973,7 +10142,7 @@
         <w:pStyle w:val="Compact"/>
         <w:numPr>
           <w:ilvl w:val="0"/>
-          <w:numId w:val="1401"/>
+          <w:numId w:val="1405"/>
         </w:numPr>
       </w:pPr>
       <w:r>
@@ -9985,7 +10154,7 @@
         <w:pStyle w:val="Compact"/>
         <w:numPr>
           <w:ilvl w:val="0"/>
-          <w:numId w:val="1402"/>
+          <w:numId w:val="1406"/>
         </w:numPr>
       </w:pPr>
       <w:r>
@@ -9997,7 +10166,7 @@
         <w:pStyle w:val="Compact"/>
         <w:numPr>
           <w:ilvl w:val="0"/>
-          <w:numId w:val="1403"/>
+          <w:numId w:val="1407"/>
         </w:numPr>
       </w:pPr>
       <w:r>
@@ -10009,7 +10178,7 @@
         <w:pStyle w:val="Compact"/>
         <w:numPr>
           <w:ilvl w:val="0"/>
-          <w:numId w:val="1404"/>
+          <w:numId w:val="1408"/>
         </w:numPr>
       </w:pPr>
       <w:r>
@@ -10021,7 +10190,7 @@
         <w:pStyle w:val="Compact"/>
         <w:numPr>
           <w:ilvl w:val="0"/>
-          <w:numId w:val="1405"/>
+          <w:numId w:val="1409"/>
         </w:numPr>
       </w:pPr>
       <w:r>
@@ -10033,7 +10202,7 @@
         <w:pStyle w:val="Compact"/>
         <w:numPr>
           <w:ilvl w:val="0"/>
-          <w:numId w:val="1406"/>
+          <w:numId w:val="1410"/>
         </w:numPr>
       </w:pPr>
       <w:r>
@@ -10045,7 +10214,7 @@
         <w:pStyle w:val="Compact"/>
         <w:numPr>
           <w:ilvl w:val="0"/>
-          <w:numId w:val="1407"/>
+          <w:numId w:val="1411"/>
         </w:numPr>
       </w:pPr>
       <w:r>
@@ -10057,7 +10226,7 @@
         <w:pStyle w:val="Compact"/>
         <w:numPr>
           <w:ilvl w:val="0"/>
-          <w:numId w:val="1408"/>
+          <w:numId w:val="1412"/>
         </w:numPr>
       </w:pPr>
       <w:r>
@@ -10069,7 +10238,7 @@
         <w:pStyle w:val="Compact"/>
         <w:numPr>
           <w:ilvl w:val="0"/>
-          <w:numId w:val="1409"/>
+          <w:numId w:val="1413"/>
         </w:numPr>
       </w:pPr>
       <w:r>
@@ -10081,15 +10250,15 @@
         <w:pStyle w:val="Compact"/>
         <w:numPr>
           <w:ilvl w:val="0"/>
-          <w:numId w:val="1410"/>
+          <w:numId w:val="1414"/>
         </w:numPr>
       </w:pPr>
       <w:r>
         <w:t xml:space="preserve">Socket scoping unaffected.</w:t>
       </w:r>
     </w:p>
-    <w:bookmarkEnd w:id="54"/>
-    <w:bookmarkStart w:id="55" w:name="visual-regression"/>
+    <w:bookmarkEnd w:id="55"/>
+    <w:bookmarkStart w:id="56" w:name="visual-regression"/>
     <w:p>
       <w:pPr>
         <w:pStyle w:val="Heading3"/>
@@ -10103,7 +10272,7 @@
         <w:pStyle w:val="Compact"/>
         <w:numPr>
           <w:ilvl w:val="0"/>
-          <w:numId w:val="1411"/>
+          <w:numId w:val="1415"/>
         </w:numPr>
       </w:pPr>
       <w:r>
@@ -10115,7 +10284,7 @@
         <w:pStyle w:val="Compact"/>
         <w:numPr>
           <w:ilvl w:val="0"/>
-          <w:numId w:val="1412"/>
+          <w:numId w:val="1416"/>
         </w:numPr>
       </w:pPr>
       <w:r>
@@ -10127,7 +10296,7 @@
         <w:pStyle w:val="Compact"/>
         <w:numPr>
           <w:ilvl w:val="0"/>
-          <w:numId w:val="1413"/>
+          <w:numId w:val="1417"/>
         </w:numPr>
       </w:pPr>
       <w:r>
@@ -10139,7 +10308,7 @@
         <w:pStyle w:val="Compact"/>
         <w:numPr>
           <w:ilvl w:val="0"/>
-          <w:numId w:val="1414"/>
+          <w:numId w:val="1418"/>
         </w:numPr>
       </w:pPr>
       <w:r>
@@ -10151,7 +10320,7 @@
         <w:pStyle w:val="Compact"/>
         <w:numPr>
           <w:ilvl w:val="0"/>
-          <w:numId w:val="1415"/>
+          <w:numId w:val="1419"/>
         </w:numPr>
       </w:pPr>
       <w:r>
@@ -10163,7 +10332,7 @@
         <w:pStyle w:val="Compact"/>
         <w:numPr>
           <w:ilvl w:val="0"/>
-          <w:numId w:val="1416"/>
+          <w:numId w:val="1420"/>
         </w:numPr>
       </w:pPr>
       <w:r>
@@ -10175,15 +10344,15 @@
         <w:pStyle w:val="Compact"/>
         <w:numPr>
           <w:ilvl w:val="0"/>
-          <w:numId w:val="1417"/>
+          <w:numId w:val="1421"/>
         </w:numPr>
       </w:pPr>
       <w:r>
         <w:t xml:space="preserve">Sidebar remains unchanged unless intentionally touched.</w:t>
       </w:r>
     </w:p>
-    <w:bookmarkEnd w:id="55"/>
-    <w:bookmarkStart w:id="56" w:name="release-readiness"/>
+    <w:bookmarkEnd w:id="56"/>
+    <w:bookmarkStart w:id="57" w:name="release-readiness"/>
     <w:p>
       <w:pPr>
         <w:pStyle w:val="Heading3"/>
@@ -10197,7 +10366,7 @@
         <w:pStyle w:val="Compact"/>
         <w:numPr>
           <w:ilvl w:val="0"/>
-          <w:numId w:val="1418"/>
+          <w:numId w:val="1422"/>
         </w:numPr>
       </w:pPr>
       <w:r>
@@ -10209,7 +10378,7 @@
         <w:pStyle w:val="Compact"/>
         <w:numPr>
           <w:ilvl w:val="0"/>
-          <w:numId w:val="1419"/>
+          <w:numId w:val="1423"/>
         </w:numPr>
       </w:pPr>
       <w:r>
@@ -10221,7 +10390,7 @@
         <w:pStyle w:val="Compact"/>
         <w:numPr>
           <w:ilvl w:val="0"/>
-          <w:numId w:val="1420"/>
+          <w:numId w:val="1424"/>
         </w:numPr>
       </w:pPr>
       <w:r>
@@ -10233,7 +10402,7 @@
         <w:pStyle w:val="Compact"/>
         <w:numPr>
           <w:ilvl w:val="0"/>
-          <w:numId w:val="1421"/>
+          <w:numId w:val="1425"/>
         </w:numPr>
       </w:pPr>
       <w:r>
@@ -10245,7 +10414,7 @@
         <w:pStyle w:val="Compact"/>
         <w:numPr>
           <w:ilvl w:val="0"/>
-          <w:numId w:val="1422"/>
+          <w:numId w:val="1426"/>
         </w:numPr>
       </w:pPr>
       <w:r>
@@ -10257,7 +10426,7 @@
         <w:pStyle w:val="Compact"/>
         <w:numPr>
           <w:ilvl w:val="0"/>
-          <w:numId w:val="1423"/>
+          <w:numId w:val="1427"/>
         </w:numPr>
       </w:pPr>
       <w:r>
@@ -10269,16 +10438,16 @@
         <w:pStyle w:val="Compact"/>
         <w:numPr>
           <w:ilvl w:val="0"/>
-          <w:numId w:val="1424"/>
+          <w:numId w:val="1428"/>
         </w:numPr>
       </w:pPr>
       <w:r>
         <w:t xml:space="preserve">Progress dashboard updated to M1 complete only after all gates pass.</w:t>
       </w:r>
     </w:p>
-    <w:bookmarkEnd w:id="56"/>
     <w:bookmarkEnd w:id="57"/>
-    <w:bookmarkStart w:id="63" w:name="Xa989490dca5dab2d86ca3d9b72c2ded4f0c555a"/>
+    <w:bookmarkEnd w:id="58"/>
+    <w:bookmarkStart w:id="64" w:name="Xa989490dca5dab2d86ca3d9b72c2ded4f0c555a"/>
     <w:p>
       <w:pPr>
         <w:pStyle w:val="Heading2"/>
@@ -10287,7 +10456,7 @@
         <w:t xml:space="preserve">M2.1 — Leads/Campaign Access And Source Fixes</w:t>
       </w:r>
     </w:p>
-    <w:bookmarkStart w:id="58" w:name="implementation-evidence-2026-05-02-4"/>
+    <w:bookmarkStart w:id="59" w:name="implementation-evidence-2026-05-02-4"/>
     <w:p>
       <w:pPr>
         <w:pStyle w:val="Heading3"/>
@@ -10301,7 +10470,7 @@
         <w:pStyle w:val="Compact"/>
         <w:numPr>
           <w:ilvl w:val="0"/>
-          <w:numId w:val="1425"/>
+          <w:numId w:val="1429"/>
         </w:numPr>
       </w:pPr>
       <w:r>
@@ -10373,7 +10542,7 @@
         <w:pStyle w:val="Compact"/>
         <w:numPr>
           <w:ilvl w:val="0"/>
-          <w:numId w:val="1426"/>
+          <w:numId w:val="1430"/>
         </w:numPr>
       </w:pPr>
       <w:r>
@@ -10385,7 +10554,7 @@
         <w:pStyle w:val="Compact"/>
         <w:numPr>
           <w:ilvl w:val="0"/>
-          <w:numId w:val="1427"/>
+          <w:numId w:val="1431"/>
         </w:numPr>
       </w:pPr>
       <w:r>
@@ -10412,7 +10581,7 @@
         <w:pStyle w:val="Compact"/>
         <w:numPr>
           <w:ilvl w:val="0"/>
-          <w:numId w:val="1428"/>
+          <w:numId w:val="1432"/>
         </w:numPr>
       </w:pPr>
       <w:r>
@@ -10466,7 +10635,7 @@
         <w:pStyle w:val="Compact"/>
         <w:numPr>
           <w:ilvl w:val="0"/>
-          <w:numId w:val="1429"/>
+          <w:numId w:val="1433"/>
         </w:numPr>
       </w:pPr>
       <w:r>
@@ -10478,15 +10647,15 @@
         <w:pStyle w:val="Compact"/>
         <w:numPr>
           <w:ilvl w:val="0"/>
-          <w:numId w:val="1430"/>
+          <w:numId w:val="1434"/>
         </w:numPr>
       </w:pPr>
       <w:r>
         <w:t xml:space="preserve">CSV import smoke pending with two real rep accounts.</w:t>
       </w:r>
     </w:p>
-    <w:bookmarkEnd w:id="58"/>
-    <w:bookmarkStart w:id="59" w:name="leads-ownership-bug"/>
+    <w:bookmarkEnd w:id="59"/>
+    <w:bookmarkStart w:id="60" w:name="leads-ownership-bug"/>
     <w:p>
       <w:pPr>
         <w:pStyle w:val="Heading3"/>
@@ -10500,7 +10669,7 @@
         <w:pStyle w:val="Compact"/>
         <w:numPr>
           <w:ilvl w:val="0"/>
-          <w:numId w:val="1431"/>
+          <w:numId w:val="1435"/>
         </w:numPr>
       </w:pPr>
       <w:r>
@@ -10551,7 +10720,7 @@
         <w:pStyle w:val="Compact"/>
         <w:numPr>
           <w:ilvl w:val="0"/>
-          <w:numId w:val="1432"/>
+          <w:numId w:val="1436"/>
         </w:numPr>
       </w:pPr>
       <w:r>
@@ -10578,7 +10747,7 @@
         <w:pStyle w:val="Compact"/>
         <w:numPr>
           <w:ilvl w:val="0"/>
-          <w:numId w:val="1433"/>
+          <w:numId w:val="1437"/>
         </w:numPr>
       </w:pPr>
       <w:r>
@@ -10590,7 +10759,7 @@
         <w:pStyle w:val="Compact"/>
         <w:numPr>
           <w:ilvl w:val="0"/>
-          <w:numId w:val="1434"/>
+          <w:numId w:val="1438"/>
         </w:numPr>
       </w:pPr>
       <w:r>
@@ -10617,7 +10786,7 @@
         <w:pStyle w:val="Compact"/>
         <w:numPr>
           <w:ilvl w:val="0"/>
-          <w:numId w:val="1435"/>
+          <w:numId w:val="1439"/>
         </w:numPr>
       </w:pPr>
       <w:r>
@@ -10629,7 +10798,7 @@
         <w:pStyle w:val="Compact"/>
         <w:numPr>
           <w:ilvl w:val="0"/>
-          <w:numId w:val="1436"/>
+          <w:numId w:val="1440"/>
         </w:numPr>
       </w:pPr>
       <w:r>
@@ -10641,15 +10810,15 @@
         <w:pStyle w:val="Compact"/>
         <w:numPr>
           <w:ilvl w:val="0"/>
-          <w:numId w:val="1437"/>
+          <w:numId w:val="1441"/>
         </w:numPr>
       </w:pPr>
       <w:r>
         <w:t xml:space="preserve">Manager behavior documented: manager keeps admin-like global visibility for M2.1 unless JB narrows manager scope later.</w:t>
       </w:r>
     </w:p>
-    <w:bookmarkEnd w:id="59"/>
-    <w:bookmarkStart w:id="60" w:name="campaign-ownership-bug"/>
+    <w:bookmarkEnd w:id="60"/>
+    <w:bookmarkStart w:id="61" w:name="campaign-ownership-bug"/>
     <w:p>
       <w:pPr>
         <w:pStyle w:val="Heading3"/>
@@ -10663,7 +10832,7 @@
         <w:pStyle w:val="Compact"/>
         <w:numPr>
           <w:ilvl w:val="0"/>
-          <w:numId w:val="1438"/>
+          <w:numId w:val="1442"/>
         </w:numPr>
       </w:pPr>
       <w:r>
@@ -10687,7 +10856,7 @@
         <w:pStyle w:val="Compact"/>
         <w:numPr>
           <w:ilvl w:val="0"/>
-          <w:numId w:val="1439"/>
+          <w:numId w:val="1443"/>
         </w:numPr>
       </w:pPr>
       <w:r>
@@ -10711,7 +10880,7 @@
         <w:pStyle w:val="Compact"/>
         <w:numPr>
           <w:ilvl w:val="0"/>
-          <w:numId w:val="1440"/>
+          <w:numId w:val="1444"/>
         </w:numPr>
       </w:pPr>
       <w:r>
@@ -10723,7 +10892,7 @@
         <w:pStyle w:val="Compact"/>
         <w:numPr>
           <w:ilvl w:val="0"/>
-          <w:numId w:val="1441"/>
+          <w:numId w:val="1445"/>
         </w:numPr>
       </w:pPr>
       <w:r>
@@ -10735,7 +10904,7 @@
         <w:pStyle w:val="Compact"/>
         <w:numPr>
           <w:ilvl w:val="0"/>
-          <w:numId w:val="1442"/>
+          <w:numId w:val="1446"/>
         </w:numPr>
       </w:pPr>
       <w:r>
@@ -10747,7 +10916,7 @@
         <w:pStyle w:val="Compact"/>
         <w:numPr>
           <w:ilvl w:val="0"/>
-          <w:numId w:val="1443"/>
+          <w:numId w:val="1447"/>
         </w:numPr>
       </w:pPr>
       <w:r>
@@ -10763,8 +10932,8 @@
         <w:t xml:space="preserve">remains compatible.</w:t>
       </w:r>
     </w:p>
-    <w:bookmarkEnd w:id="60"/>
-    <w:bookmarkStart w:id="61" w:name="source-readable-fix"/>
+    <w:bookmarkEnd w:id="61"/>
+    <w:bookmarkStart w:id="62" w:name="source-readable-fix"/>
     <w:p>
       <w:pPr>
         <w:pStyle w:val="Heading3"/>
@@ -10778,7 +10947,7 @@
         <w:pStyle w:val="Compact"/>
         <w:numPr>
           <w:ilvl w:val="0"/>
-          <w:numId w:val="1444"/>
+          <w:numId w:val="1448"/>
         </w:numPr>
       </w:pPr>
       <w:r>
@@ -10790,7 +10959,7 @@
         <w:pStyle w:val="Compact"/>
         <w:numPr>
           <w:ilvl w:val="0"/>
-          <w:numId w:val="1445"/>
+          <w:numId w:val="1449"/>
         </w:numPr>
       </w:pPr>
       <w:r>
@@ -10802,7 +10971,7 @@
         <w:pStyle w:val="Compact"/>
         <w:numPr>
           <w:ilvl w:val="1"/>
-          <w:numId w:val="1446"/>
+          <w:numId w:val="1450"/>
         </w:numPr>
       </w:pPr>
       <w:r>
@@ -10820,7 +10989,7 @@
         <w:pStyle w:val="Compact"/>
         <w:numPr>
           <w:ilvl w:val="1"/>
-          <w:numId w:val="1446"/>
+          <w:numId w:val="1450"/>
         </w:numPr>
       </w:pPr>
       <w:r>
@@ -10838,7 +11007,7 @@
         <w:pStyle w:val="Compact"/>
         <w:numPr>
           <w:ilvl w:val="1"/>
-          <w:numId w:val="1446"/>
+          <w:numId w:val="1450"/>
         </w:numPr>
       </w:pPr>
       <w:r>
@@ -10856,7 +11025,7 @@
         <w:pStyle w:val="Compact"/>
         <w:numPr>
           <w:ilvl w:val="1"/>
-          <w:numId w:val="1446"/>
+          <w:numId w:val="1450"/>
         </w:numPr>
       </w:pPr>
       <w:r>
@@ -10874,7 +11043,7 @@
         <w:pStyle w:val="Compact"/>
         <w:numPr>
           <w:ilvl w:val="0"/>
-          <w:numId w:val="1447"/>
+          <w:numId w:val="1451"/>
         </w:numPr>
       </w:pPr>
       <w:r>
@@ -10886,7 +11055,7 @@
         <w:pStyle w:val="Compact"/>
         <w:numPr>
           <w:ilvl w:val="0"/>
-          <w:numId w:val="1448"/>
+          <w:numId w:val="1452"/>
         </w:numPr>
       </w:pPr>
       <w:r>
@@ -10898,15 +11067,15 @@
         <w:pStyle w:val="Compact"/>
         <w:numPr>
           <w:ilvl w:val="0"/>
-          <w:numId w:val="1449"/>
+          <w:numId w:val="1453"/>
         </w:numPr>
       </w:pPr>
       <w:r>
         <w:t xml:space="preserve">Campaign-created leads preserve campaign/list lineage.</w:t>
       </w:r>
     </w:p>
-    <w:bookmarkEnd w:id="61"/>
-    <w:bookmarkStart w:id="62" w:name="m2.1-testing-gate"/>
+    <w:bookmarkEnd w:id="62"/>
+    <w:bookmarkStart w:id="63" w:name="m2.1-testing-gate"/>
     <w:p>
       <w:pPr>
         <w:pStyle w:val="Heading3"/>
@@ -10920,7 +11089,7 @@
         <w:pStyle w:val="Compact"/>
         <w:numPr>
           <w:ilvl w:val="0"/>
-          <w:numId w:val="1450"/>
+          <w:numId w:val="1454"/>
         </w:numPr>
       </w:pPr>
       <w:r>
@@ -10932,7 +11101,7 @@
         <w:pStyle w:val="Compact"/>
         <w:numPr>
           <w:ilvl w:val="0"/>
-          <w:numId w:val="1451"/>
+          <w:numId w:val="1455"/>
         </w:numPr>
       </w:pPr>
       <w:r>
@@ -10944,7 +11113,7 @@
         <w:pStyle w:val="Compact"/>
         <w:numPr>
           <w:ilvl w:val="0"/>
-          <w:numId w:val="1452"/>
+          <w:numId w:val="1456"/>
         </w:numPr>
       </w:pPr>
       <w:r>
@@ -10956,7 +11125,7 @@
         <w:pStyle w:val="Compact"/>
         <w:numPr>
           <w:ilvl w:val="0"/>
-          <w:numId w:val="1453"/>
+          <w:numId w:val="1457"/>
         </w:numPr>
       </w:pPr>
       <w:r>
@@ -10968,7 +11137,7 @@
         <w:pStyle w:val="Compact"/>
         <w:numPr>
           <w:ilvl w:val="0"/>
-          <w:numId w:val="1454"/>
+          <w:numId w:val="1458"/>
         </w:numPr>
       </w:pPr>
       <w:r>
@@ -10980,7 +11149,7 @@
         <w:pStyle w:val="Compact"/>
         <w:numPr>
           <w:ilvl w:val="0"/>
-          <w:numId w:val="1455"/>
+          <w:numId w:val="1459"/>
         </w:numPr>
       </w:pPr>
       <w:r>
@@ -10992,7 +11161,7 @@
         <w:pStyle w:val="Compact"/>
         <w:numPr>
           <w:ilvl w:val="0"/>
-          <w:numId w:val="1456"/>
+          <w:numId w:val="1460"/>
         </w:numPr>
       </w:pPr>
       <w:r>
@@ -11004,7 +11173,7 @@
         <w:pStyle w:val="Compact"/>
         <w:numPr>
           <w:ilvl w:val="0"/>
-          <w:numId w:val="1457"/>
+          <w:numId w:val="1461"/>
         </w:numPr>
       </w:pPr>
       <w:r>
@@ -11016,16 +11185,16 @@
         <w:pStyle w:val="Compact"/>
         <w:numPr>
           <w:ilvl w:val="0"/>
-          <w:numId w:val="1458"/>
+          <w:numId w:val="1462"/>
         </w:numPr>
       </w:pPr>
       <w:r>
         <w:t xml:space="preserve">Progress dashboard updated.</w:t>
       </w:r>
     </w:p>
-    <w:bookmarkEnd w:id="62"/>
     <w:bookmarkEnd w:id="63"/>
-    <w:bookmarkStart w:id="70" w:name="X80216ddf01e64983419846741e514a0cb2a2ddb"/>
+    <w:bookmarkEnd w:id="64"/>
+    <w:bookmarkStart w:id="71" w:name="X80216ddf01e64983419846741e514a0cb2a2ddb"/>
     <w:p>
       <w:pPr>
         <w:pStyle w:val="Heading2"/>
@@ -11034,7 +11203,7 @@
         <w:t xml:space="preserve">M2.2 — Leads Enrichment Columns And Export CSV</w:t>
       </w:r>
     </w:p>
-    <w:bookmarkStart w:id="64" w:name="implementation-evidence-2026-05-02-5"/>
+    <w:bookmarkStart w:id="65" w:name="implementation-evidence-2026-05-02-5"/>
     <w:p>
       <w:pPr>
         <w:pStyle w:val="Heading3"/>
@@ -11048,7 +11217,7 @@
         <w:pStyle w:val="Compact"/>
         <w:numPr>
           <w:ilvl w:val="0"/>
-          <w:numId w:val="1459"/>
+          <w:numId w:val="1463"/>
         </w:numPr>
       </w:pPr>
       <w:r>
@@ -11075,7 +11244,7 @@
         <w:pStyle w:val="Compact"/>
         <w:numPr>
           <w:ilvl w:val="0"/>
-          <w:numId w:val="1460"/>
+          <w:numId w:val="1464"/>
         </w:numPr>
       </w:pPr>
       <w:r>
@@ -11147,7 +11316,7 @@
         <w:pStyle w:val="Compact"/>
         <w:numPr>
           <w:ilvl w:val="0"/>
-          <w:numId w:val="1461"/>
+          <w:numId w:val="1465"/>
         </w:numPr>
       </w:pPr>
       <w:r>
@@ -11174,7 +11343,7 @@
         <w:pStyle w:val="Compact"/>
         <w:numPr>
           <w:ilvl w:val="0"/>
-          <w:numId w:val="1462"/>
+          <w:numId w:val="1466"/>
         </w:numPr>
       </w:pPr>
       <w:r>
@@ -11186,7 +11355,7 @@
         <w:pStyle w:val="Compact"/>
         <w:numPr>
           <w:ilvl w:val="0"/>
-          <w:numId w:val="1463"/>
+          <w:numId w:val="1467"/>
         </w:numPr>
       </w:pPr>
       <w:r>
@@ -11213,7 +11382,7 @@
         <w:pStyle w:val="Compact"/>
         <w:numPr>
           <w:ilvl w:val="0"/>
-          <w:numId w:val="1464"/>
+          <w:numId w:val="1468"/>
         </w:numPr>
       </w:pPr>
       <w:r>
@@ -11225,7 +11394,7 @@
         <w:pStyle w:val="Compact"/>
         <w:numPr>
           <w:ilvl w:val="0"/>
-          <w:numId w:val="1465"/>
+          <w:numId w:val="1469"/>
         </w:numPr>
       </w:pPr>
       <w:r>
@@ -11252,7 +11421,7 @@
         <w:pStyle w:val="Compact"/>
         <w:numPr>
           <w:ilvl w:val="0"/>
-          <w:numId w:val="1466"/>
+          <w:numId w:val="1470"/>
         </w:numPr>
       </w:pPr>
       <w:r>
@@ -11294,7 +11463,7 @@
         <w:pStyle w:val="Compact"/>
         <w:numPr>
           <w:ilvl w:val="0"/>
-          <w:numId w:val="1467"/>
+          <w:numId w:val="1471"/>
         </w:numPr>
       </w:pPr>
       <w:r>
@@ -11330,15 +11499,15 @@
         <w:pStyle w:val="Compact"/>
         <w:numPr>
           <w:ilvl w:val="0"/>
-          <w:numId w:val="1468"/>
+          <w:numId w:val="1472"/>
         </w:numPr>
       </w:pPr>
       <w:r>
         <w:t xml:space="preserve">Targeted ESLint passed with 0 errors and existing warning debt only.</w:t>
       </w:r>
     </w:p>
-    <w:bookmarkEnd w:id="64"/>
-    <w:bookmarkStart w:id="65" w:name="leads-table-columns"/>
+    <w:bookmarkEnd w:id="65"/>
+    <w:bookmarkStart w:id="66" w:name="leads-table-columns"/>
     <w:p>
       <w:pPr>
         <w:pStyle w:val="Heading3"/>
@@ -11352,7 +11521,7 @@
         <w:pStyle w:val="Compact"/>
         <w:numPr>
           <w:ilvl w:val="0"/>
-          <w:numId w:val="1469"/>
+          <w:numId w:val="1473"/>
         </w:numPr>
       </w:pPr>
       <w:r>
@@ -11364,164 +11533,11 @@
         <w:pStyle w:val="Compact"/>
         <w:numPr>
           <w:ilvl w:val="0"/>
-          <w:numId w:val="1470"/>
+          <w:numId w:val="1474"/>
         </w:numPr>
       </w:pPr>
       <w:r>
         <w:t xml:space="preserve">Columns match prototype order:</w:t>
-      </w:r>
-    </w:p>
-    <w:p>
-      <w:pPr>
-        <w:pStyle w:val="Compact"/>
-        <w:numPr>
-          <w:ilvl w:val="1"/>
-          <w:numId w:val="1471"/>
-        </w:numPr>
-      </w:pPr>
-      <w:r>
-        <w:t xml:space="preserve">Name;</w:t>
-      </w:r>
-    </w:p>
-    <w:p>
-      <w:pPr>
-        <w:pStyle w:val="Compact"/>
-        <w:numPr>
-          <w:ilvl w:val="1"/>
-          <w:numId w:val="1471"/>
-        </w:numPr>
-      </w:pPr>
-      <w:r>
-        <w:t xml:space="preserve">Phone;</w:t>
-      </w:r>
-    </w:p>
-    <w:p>
-      <w:pPr>
-        <w:pStyle w:val="Compact"/>
-        <w:numPr>
-          <w:ilvl w:val="1"/>
-          <w:numId w:val="1471"/>
-        </w:numPr>
-      </w:pPr>
-      <w:r>
-        <w:t xml:space="preserve">Status;</w:t>
-      </w:r>
-    </w:p>
-    <w:p>
-      <w:pPr>
-        <w:pStyle w:val="Compact"/>
-        <w:numPr>
-          <w:ilvl w:val="1"/>
-          <w:numId w:val="1471"/>
-        </w:numPr>
-      </w:pPr>
-      <w:r>
-        <w:t xml:space="preserve">Last Contact;</w:t>
-      </w:r>
-    </w:p>
-    <w:p>
-      <w:pPr>
-        <w:pStyle w:val="Compact"/>
-        <w:numPr>
-          <w:ilvl w:val="1"/>
-          <w:numId w:val="1471"/>
-        </w:numPr>
-      </w:pPr>
-      <w:r>
-        <w:t xml:space="preserve">Industry;</w:t>
-      </w:r>
-    </w:p>
-    <w:p>
-      <w:pPr>
-        <w:pStyle w:val="Compact"/>
-        <w:numPr>
-          <w:ilvl w:val="1"/>
-          <w:numId w:val="1471"/>
-        </w:numPr>
-      </w:pPr>
-      <w:r>
-        <w:t xml:space="preserve">Monthly Revenue;</w:t>
-      </w:r>
-    </w:p>
-    <w:p>
-      <w:pPr>
-        <w:pStyle w:val="Compact"/>
-        <w:numPr>
-          <w:ilvl w:val="1"/>
-          <w:numId w:val="1471"/>
-        </w:numPr>
-      </w:pPr>
-      <w:r>
-        <w:t xml:space="preserve">Source;</w:t>
-      </w:r>
-    </w:p>
-    <w:p>
-      <w:pPr>
-        <w:pStyle w:val="Compact"/>
-        <w:numPr>
-          <w:ilvl w:val="1"/>
-          <w:numId w:val="1471"/>
-        </w:numPr>
-      </w:pPr>
-      <w:r>
-        <w:t xml:space="preserve">Added.</w:t>
-      </w:r>
-    </w:p>
-    <w:p>
-      <w:pPr>
-        <w:pStyle w:val="Compact"/>
-        <w:numPr>
-          <w:ilvl w:val="0"/>
-          <w:numId w:val="1472"/>
-        </w:numPr>
-      </w:pPr>
-      <w:r>
-        <w:t xml:space="preserve">Last Contact shows rep attribution initials and relative time, e.g. </w:t>
-      </w:r>
-      <w:r>
-        <w:rPr>
-          <w:rStyle w:val="VerbatimChar"/>
-        </w:rPr>
-        <w:t xml:space="preserve">JB 2h ago</w:t>
-      </w:r>
-      <w:r>
-        <w:t xml:space="preserve">.</w:t>
-      </w:r>
-    </w:p>
-    <w:p>
-      <w:pPr>
-        <w:pStyle w:val="Compact"/>
-        <w:numPr>
-          <w:ilvl w:val="0"/>
-          <w:numId w:val="1473"/>
-        </w:numPr>
-      </w:pPr>
-      <w:r>
-        <w:t xml:space="preserve">Industry renders extracted/classified value or</w:t>
-      </w:r>
-      <w:r>
-        <w:t xml:space="preserve"> </w:t>
-      </w:r>
-      <w:r>
-        <w:rPr>
-          <w:rStyle w:val="VerbatimChar"/>
-        </w:rPr>
-        <w:t xml:space="preserve">— unknown</w:t>
-      </w:r>
-      <w:r>
-        <w:t xml:space="preserve">.</w:t>
-      </w:r>
-    </w:p>
-    <w:p>
-      <w:pPr>
-        <w:pStyle w:val="Compact"/>
-        <w:numPr>
-          <w:ilvl w:val="0"/>
-          <w:numId w:val="1474"/>
-        </w:numPr>
-      </w:pPr>
-      <w:r>
-        <w:t xml:space="preserve">Monthly Revenue renders raw/formatted revenue plus provenance chip:</w:t>
       </w:r>
     </w:p>
     <w:p>
@@ -11533,7 +11549,7 @@
         </w:numPr>
       </w:pPr>
       <w:r>
-        <w:t xml:space="preserve">AI;</w:t>
+        <w:t xml:space="preserve">Name;</w:t>
       </w:r>
     </w:p>
     <w:p>
@@ -11545,7 +11561,7 @@
         </w:numPr>
       </w:pPr>
       <w:r>
-        <w:t xml:space="preserve">CSV;</w:t>
+        <w:t xml:space="preserve">Phone;</w:t>
       </w:r>
     </w:p>
     <w:p>
@@ -11557,6 +11573,159 @@
         </w:numPr>
       </w:pPr>
       <w:r>
+        <w:t xml:space="preserve">Status;</w:t>
+      </w:r>
+    </w:p>
+    <w:p>
+      <w:pPr>
+        <w:pStyle w:val="Compact"/>
+        <w:numPr>
+          <w:ilvl w:val="1"/>
+          <w:numId w:val="1475"/>
+        </w:numPr>
+      </w:pPr>
+      <w:r>
+        <w:t xml:space="preserve">Last Contact;</w:t>
+      </w:r>
+    </w:p>
+    <w:p>
+      <w:pPr>
+        <w:pStyle w:val="Compact"/>
+        <w:numPr>
+          <w:ilvl w:val="1"/>
+          <w:numId w:val="1475"/>
+        </w:numPr>
+      </w:pPr>
+      <w:r>
+        <w:t xml:space="preserve">Industry;</w:t>
+      </w:r>
+    </w:p>
+    <w:p>
+      <w:pPr>
+        <w:pStyle w:val="Compact"/>
+        <w:numPr>
+          <w:ilvl w:val="1"/>
+          <w:numId w:val="1475"/>
+        </w:numPr>
+      </w:pPr>
+      <w:r>
+        <w:t xml:space="preserve">Monthly Revenue;</w:t>
+      </w:r>
+    </w:p>
+    <w:p>
+      <w:pPr>
+        <w:pStyle w:val="Compact"/>
+        <w:numPr>
+          <w:ilvl w:val="1"/>
+          <w:numId w:val="1475"/>
+        </w:numPr>
+      </w:pPr>
+      <w:r>
+        <w:t xml:space="preserve">Source;</w:t>
+      </w:r>
+    </w:p>
+    <w:p>
+      <w:pPr>
+        <w:pStyle w:val="Compact"/>
+        <w:numPr>
+          <w:ilvl w:val="1"/>
+          <w:numId w:val="1475"/>
+        </w:numPr>
+      </w:pPr>
+      <w:r>
+        <w:t xml:space="preserve">Added.</w:t>
+      </w:r>
+    </w:p>
+    <w:p>
+      <w:pPr>
+        <w:pStyle w:val="Compact"/>
+        <w:numPr>
+          <w:ilvl w:val="0"/>
+          <w:numId w:val="1476"/>
+        </w:numPr>
+      </w:pPr>
+      <w:r>
+        <w:t xml:space="preserve">Last Contact shows rep attribution initials and relative time, e.g. </w:t>
+      </w:r>
+      <w:r>
+        <w:rPr>
+          <w:rStyle w:val="VerbatimChar"/>
+        </w:rPr>
+        <w:t xml:space="preserve">JB 2h ago</w:t>
+      </w:r>
+      <w:r>
+        <w:t xml:space="preserve">.</w:t>
+      </w:r>
+    </w:p>
+    <w:p>
+      <w:pPr>
+        <w:pStyle w:val="Compact"/>
+        <w:numPr>
+          <w:ilvl w:val="0"/>
+          <w:numId w:val="1477"/>
+        </w:numPr>
+      </w:pPr>
+      <w:r>
+        <w:t xml:space="preserve">Industry renders extracted/classified value or</w:t>
+      </w:r>
+      <w:r>
+        <w:t xml:space="preserve"> </w:t>
+      </w:r>
+      <w:r>
+        <w:rPr>
+          <w:rStyle w:val="VerbatimChar"/>
+        </w:rPr>
+        <w:t xml:space="preserve">— unknown</w:t>
+      </w:r>
+      <w:r>
+        <w:t xml:space="preserve">.</w:t>
+      </w:r>
+    </w:p>
+    <w:p>
+      <w:pPr>
+        <w:pStyle w:val="Compact"/>
+        <w:numPr>
+          <w:ilvl w:val="0"/>
+          <w:numId w:val="1478"/>
+        </w:numPr>
+      </w:pPr>
+      <w:r>
+        <w:t xml:space="preserve">Monthly Revenue renders raw/formatted revenue plus provenance chip:</w:t>
+      </w:r>
+    </w:p>
+    <w:p>
+      <w:pPr>
+        <w:pStyle w:val="Compact"/>
+        <w:numPr>
+          <w:ilvl w:val="1"/>
+          <w:numId w:val="1479"/>
+        </w:numPr>
+      </w:pPr>
+      <w:r>
+        <w:t xml:space="preserve">AI;</w:t>
+      </w:r>
+    </w:p>
+    <w:p>
+      <w:pPr>
+        <w:pStyle w:val="Compact"/>
+        <w:numPr>
+          <w:ilvl w:val="1"/>
+          <w:numId w:val="1479"/>
+        </w:numPr>
+      </w:pPr>
+      <w:r>
+        <w:t xml:space="preserve">CSV;</w:t>
+      </w:r>
+    </w:p>
+    <w:p>
+      <w:pPr>
+        <w:pStyle w:val="Compact"/>
+        <w:numPr>
+          <w:ilvl w:val="1"/>
+          <w:numId w:val="1479"/>
+        </w:numPr>
+      </w:pPr>
+      <w:r>
         <w:t xml:space="preserve">MANUAL.</w:t>
       </w:r>
     </w:p>
@@ -11565,7 +11734,7 @@
         <w:pStyle w:val="Compact"/>
         <w:numPr>
           <w:ilvl w:val="0"/>
-          <w:numId w:val="1476"/>
+          <w:numId w:val="1480"/>
         </w:numPr>
       </w:pPr>
       <w:r>
@@ -11589,7 +11758,7 @@
         <w:pStyle w:val="Compact"/>
         <w:numPr>
           <w:ilvl w:val="0"/>
-          <w:numId w:val="1477"/>
+          <w:numId w:val="1481"/>
         </w:numPr>
       </w:pPr>
       <w:r>
@@ -11601,7 +11770,7 @@
         <w:pStyle w:val="Compact"/>
         <w:numPr>
           <w:ilvl w:val="0"/>
-          <w:numId w:val="1478"/>
+          <w:numId w:val="1482"/>
         </w:numPr>
       </w:pPr>
       <w:r>
@@ -11613,15 +11782,15 @@
         <w:pStyle w:val="Compact"/>
         <w:numPr>
           <w:ilvl w:val="0"/>
-          <w:numId w:val="1479"/>
+          <w:numId w:val="1483"/>
         </w:numPr>
       </w:pPr>
       <w:r>
         <w:t xml:space="preserve">Avatar initials match prototype density.</w:t>
       </w:r>
     </w:p>
-    <w:bookmarkEnd w:id="65"/>
-    <w:bookmarkStart w:id="66" w:name="data-plumbing"/>
+    <w:bookmarkEnd w:id="66"/>
+    <w:bookmarkStart w:id="67" w:name="data-plumbing"/>
     <w:p>
       <w:pPr>
         <w:pStyle w:val="Heading3"/>
@@ -11635,7 +11804,7 @@
         <w:pStyle w:val="Compact"/>
         <w:numPr>
           <w:ilvl w:val="0"/>
-          <w:numId w:val="1480"/>
+          <w:numId w:val="1484"/>
         </w:numPr>
       </w:pPr>
       <w:r>
@@ -11647,7 +11816,7 @@
         <w:pStyle w:val="Compact"/>
         <w:numPr>
           <w:ilvl w:val="1"/>
-          <w:numId w:val="1481"/>
+          <w:numId w:val="1485"/>
         </w:numPr>
       </w:pPr>
       <w:r>
@@ -11659,7 +11828,7 @@
         <w:pStyle w:val="Compact"/>
         <w:numPr>
           <w:ilvl w:val="1"/>
-          <w:numId w:val="1481"/>
+          <w:numId w:val="1485"/>
         </w:numPr>
       </w:pPr>
       <w:r>
@@ -11671,7 +11840,7 @@
         <w:pStyle w:val="Compact"/>
         <w:numPr>
           <w:ilvl w:val="1"/>
-          <w:numId w:val="1481"/>
+          <w:numId w:val="1485"/>
         </w:numPr>
       </w:pPr>
       <w:r>
@@ -11683,7 +11852,7 @@
         <w:pStyle w:val="Compact"/>
         <w:numPr>
           <w:ilvl w:val="0"/>
-          <w:numId w:val="1482"/>
+          <w:numId w:val="1486"/>
         </w:numPr>
       </w:pPr>
       <w:r>
@@ -11695,7 +11864,7 @@
         <w:pStyle w:val="Compact"/>
         <w:numPr>
           <w:ilvl w:val="1"/>
-          <w:numId w:val="1483"/>
+          <w:numId w:val="1487"/>
         </w:numPr>
       </w:pPr>
       <w:r>
@@ -11707,7 +11876,7 @@
         <w:pStyle w:val="Compact"/>
         <w:numPr>
           <w:ilvl w:val="1"/>
-          <w:numId w:val="1483"/>
+          <w:numId w:val="1487"/>
         </w:numPr>
       </w:pPr>
       <w:r>
@@ -11719,7 +11888,7 @@
         <w:pStyle w:val="Compact"/>
         <w:numPr>
           <w:ilvl w:val="1"/>
-          <w:numId w:val="1483"/>
+          <w:numId w:val="1487"/>
         </w:numPr>
       </w:pPr>
       <w:r>
@@ -11731,7 +11900,7 @@
         <w:pStyle w:val="Compact"/>
         <w:numPr>
           <w:ilvl w:val="0"/>
-          <w:numId w:val="1484"/>
+          <w:numId w:val="1488"/>
         </w:numPr>
       </w:pPr>
       <w:r>
@@ -11743,7 +11912,7 @@
         <w:pStyle w:val="Compact"/>
         <w:numPr>
           <w:ilvl w:val="0"/>
-          <w:numId w:val="1485"/>
+          <w:numId w:val="1489"/>
         </w:numPr>
       </w:pPr>
       <w:r>
@@ -11755,15 +11924,15 @@
         <w:pStyle w:val="Compact"/>
         <w:numPr>
           <w:ilvl w:val="0"/>
-          <w:numId w:val="1486"/>
+          <w:numId w:val="1490"/>
         </w:numPr>
       </w:pPr>
       <w:r>
         <w:t xml:space="preserve">Rep scope applies to all enrichment queries.</w:t>
       </w:r>
     </w:p>
-    <w:bookmarkEnd w:id="66"/>
-    <w:bookmarkStart w:id="67" w:name="export-csv"/>
+    <w:bookmarkEnd w:id="67"/>
+    <w:bookmarkStart w:id="68" w:name="export-csv"/>
     <w:p>
       <w:pPr>
         <w:pStyle w:val="Heading3"/>
@@ -11777,7 +11946,7 @@
         <w:pStyle w:val="Compact"/>
         <w:numPr>
           <w:ilvl w:val="0"/>
-          <w:numId w:val="1487"/>
+          <w:numId w:val="1491"/>
         </w:numPr>
       </w:pPr>
       <w:r>
@@ -11798,7 +11967,7 @@
         <w:pStyle w:val="Compact"/>
         <w:numPr>
           <w:ilvl w:val="0"/>
-          <w:numId w:val="1488"/>
+          <w:numId w:val="1492"/>
         </w:numPr>
       </w:pPr>
       <w:r>
@@ -11810,7 +11979,7 @@
         <w:pStyle w:val="Compact"/>
         <w:numPr>
           <w:ilvl w:val="0"/>
-          <w:numId w:val="1489"/>
+          <w:numId w:val="1493"/>
         </w:numPr>
       </w:pPr>
       <w:r>
@@ -11822,7 +11991,7 @@
         <w:pStyle w:val="Compact"/>
         <w:numPr>
           <w:ilvl w:val="0"/>
-          <w:numId w:val="1490"/>
+          <w:numId w:val="1494"/>
         </w:numPr>
       </w:pPr>
       <w:r>
@@ -11834,7 +12003,7 @@
         <w:pStyle w:val="Compact"/>
         <w:numPr>
           <w:ilvl w:val="0"/>
-          <w:numId w:val="1491"/>
+          <w:numId w:val="1495"/>
         </w:numPr>
       </w:pPr>
       <w:r>
@@ -11846,7 +12015,7 @@
         <w:pStyle w:val="Compact"/>
         <w:numPr>
           <w:ilvl w:val="0"/>
-          <w:numId w:val="1492"/>
+          <w:numId w:val="1496"/>
         </w:numPr>
       </w:pPr>
       <w:r>
@@ -11858,7 +12027,7 @@
         <w:pStyle w:val="Compact"/>
         <w:numPr>
           <w:ilvl w:val="1"/>
-          <w:numId w:val="1493"/>
+          <w:numId w:val="1497"/>
         </w:numPr>
       </w:pPr>
       <w:r>
@@ -11870,7 +12039,7 @@
         <w:pStyle w:val="Compact"/>
         <w:numPr>
           <w:ilvl w:val="1"/>
-          <w:numId w:val="1493"/>
+          <w:numId w:val="1497"/>
         </w:numPr>
       </w:pPr>
       <w:r>
@@ -11882,7 +12051,7 @@
         <w:pStyle w:val="Compact"/>
         <w:numPr>
           <w:ilvl w:val="1"/>
-          <w:numId w:val="1493"/>
+          <w:numId w:val="1497"/>
         </w:numPr>
       </w:pPr>
       <w:r>
@@ -11894,7 +12063,7 @@
         <w:pStyle w:val="Compact"/>
         <w:numPr>
           <w:ilvl w:val="1"/>
-          <w:numId w:val="1493"/>
+          <w:numId w:val="1497"/>
         </w:numPr>
       </w:pPr>
       <w:r>
@@ -11906,7 +12075,7 @@
         <w:pStyle w:val="Compact"/>
         <w:numPr>
           <w:ilvl w:val="1"/>
-          <w:numId w:val="1493"/>
+          <w:numId w:val="1497"/>
         </w:numPr>
       </w:pPr>
       <w:r>
@@ -11918,7 +12087,7 @@
         <w:pStyle w:val="Compact"/>
         <w:numPr>
           <w:ilvl w:val="1"/>
-          <w:numId w:val="1493"/>
+          <w:numId w:val="1497"/>
         </w:numPr>
       </w:pPr>
       <w:r>
@@ -11930,7 +12099,7 @@
         <w:pStyle w:val="Compact"/>
         <w:numPr>
           <w:ilvl w:val="0"/>
-          <w:numId w:val="1494"/>
+          <w:numId w:val="1498"/>
         </w:numPr>
       </w:pPr>
       <w:r>
@@ -11942,15 +12111,15 @@
         <w:pStyle w:val="Compact"/>
         <w:numPr>
           <w:ilvl w:val="0"/>
-          <w:numId w:val="1495"/>
+          <w:numId w:val="1499"/>
         </w:numPr>
       </w:pPr>
       <w:r>
         <w:t xml:space="preserve">CSV escaping handles commas, quotes, line breaks.</w:t>
       </w:r>
     </w:p>
-    <w:bookmarkEnd w:id="67"/>
-    <w:bookmarkStart w:id="68" w:name="m2.2-style-isolation"/>
+    <w:bookmarkEnd w:id="68"/>
+    <w:bookmarkStart w:id="69" w:name="m2.2-style-isolation"/>
     <w:p>
       <w:pPr>
         <w:pStyle w:val="Heading3"/>
@@ -11964,7 +12133,7 @@
         <w:pStyle w:val="Compact"/>
         <w:numPr>
           <w:ilvl w:val="0"/>
-          <w:numId w:val="1496"/>
+          <w:numId w:val="1500"/>
         </w:numPr>
       </w:pPr>
       <w:r>
@@ -11976,7 +12145,7 @@
         <w:pStyle w:val="Compact"/>
         <w:numPr>
           <w:ilvl w:val="0"/>
-          <w:numId w:val="1497"/>
+          <w:numId w:val="1501"/>
         </w:numPr>
       </w:pPr>
       <w:r>
@@ -11988,7 +12157,7 @@
         <w:pStyle w:val="Compact"/>
         <w:numPr>
           <w:ilvl w:val="0"/>
-          <w:numId w:val="1498"/>
+          <w:numId w:val="1502"/>
         </w:numPr>
       </w:pPr>
       <w:r>
@@ -12000,7 +12169,7 @@
         <w:pStyle w:val="Compact"/>
         <w:numPr>
           <w:ilvl w:val="0"/>
-          <w:numId w:val="1499"/>
+          <w:numId w:val="1503"/>
         </w:numPr>
       </w:pPr>
       <w:r>
@@ -12012,15 +12181,15 @@
         <w:pStyle w:val="Compact"/>
         <w:numPr>
           <w:ilvl w:val="0"/>
-          <w:numId w:val="1500"/>
+          <w:numId w:val="1504"/>
         </w:numPr>
       </w:pPr>
       <w:r>
         <w:t xml:space="preserve">Ensure text truncation/line wrapping is deliberate and not overlapping.</w:t>
       </w:r>
     </w:p>
-    <w:bookmarkEnd w:id="68"/>
-    <w:bookmarkStart w:id="69" w:name="m2.2-testing-gate"/>
+    <w:bookmarkEnd w:id="69"/>
+    <w:bookmarkStart w:id="70" w:name="m2.2-testing-gate"/>
     <w:p>
       <w:pPr>
         <w:pStyle w:val="Heading3"/>
@@ -12034,7 +12203,7 @@
         <w:pStyle w:val="Compact"/>
         <w:numPr>
           <w:ilvl w:val="0"/>
-          <w:numId w:val="1501"/>
+          <w:numId w:val="1505"/>
         </w:numPr>
       </w:pPr>
       <w:r>
@@ -12046,7 +12215,7 @@
         <w:pStyle w:val="Compact"/>
         <w:numPr>
           <w:ilvl w:val="0"/>
-          <w:numId w:val="1502"/>
+          <w:numId w:val="1506"/>
         </w:numPr>
       </w:pPr>
       <w:r>
@@ -12058,7 +12227,7 @@
         <w:pStyle w:val="Compact"/>
         <w:numPr>
           <w:ilvl w:val="0"/>
-          <w:numId w:val="1503"/>
+          <w:numId w:val="1507"/>
         </w:numPr>
       </w:pPr>
       <w:r>
@@ -12070,7 +12239,7 @@
         <w:pStyle w:val="Compact"/>
         <w:numPr>
           <w:ilvl w:val="0"/>
-          <w:numId w:val="1504"/>
+          <w:numId w:val="1508"/>
         </w:numPr>
       </w:pPr>
       <w:r>
@@ -12082,7 +12251,7 @@
         <w:pStyle w:val="Compact"/>
         <w:numPr>
           <w:ilvl w:val="0"/>
-          <w:numId w:val="1505"/>
+          <w:numId w:val="1509"/>
         </w:numPr>
       </w:pPr>
       <w:r>
@@ -12094,7 +12263,7 @@
         <w:pStyle w:val="Compact"/>
         <w:numPr>
           <w:ilvl w:val="0"/>
-          <w:numId w:val="1506"/>
+          <w:numId w:val="1510"/>
         </w:numPr>
       </w:pPr>
       <w:r>
@@ -12106,7 +12275,7 @@
         <w:pStyle w:val="Compact"/>
         <w:numPr>
           <w:ilvl w:val="0"/>
-          <w:numId w:val="1507"/>
+          <w:numId w:val="1511"/>
         </w:numPr>
       </w:pPr>
       <w:r>
@@ -12118,16 +12287,16 @@
         <w:pStyle w:val="Compact"/>
         <w:numPr>
           <w:ilvl w:val="0"/>
-          <w:numId w:val="1508"/>
+          <w:numId w:val="1512"/>
         </w:numPr>
       </w:pPr>
       <w:r>
         <w:t xml:space="preserve">Progress dashboard updated.</w:t>
       </w:r>
     </w:p>
-    <w:bookmarkEnd w:id="69"/>
     <w:bookmarkEnd w:id="70"/>
-    <w:bookmarkStart w:id="81" w:name="m2.3-ai-retarget-campaigns"/>
+    <w:bookmarkEnd w:id="71"/>
+    <w:bookmarkStart w:id="82" w:name="m2.3-ai-retarget-campaigns"/>
     <w:p>
       <w:pPr>
         <w:pStyle w:val="Heading2"/>
@@ -12136,7 +12305,7 @@
         <w:t xml:space="preserve">M2.3 — AI Retarget Campaigns</w:t>
       </w:r>
     </w:p>
-    <w:bookmarkStart w:id="71" w:name="implementation-evidence-2026-05-02-6"/>
+    <w:bookmarkStart w:id="72" w:name="implementation-evidence-2026-05-02-6"/>
     <w:p>
       <w:pPr>
         <w:pStyle w:val="Heading3"/>
@@ -12150,7 +12319,7 @@
         <w:pStyle w:val="Compact"/>
         <w:numPr>
           <w:ilvl w:val="0"/>
-          <w:numId w:val="1509"/>
+          <w:numId w:val="1513"/>
         </w:numPr>
       </w:pPr>
       <w:r>
@@ -12198,7 +12367,7 @@
         <w:pStyle w:val="Compact"/>
         <w:numPr>
           <w:ilvl w:val="0"/>
-          <w:numId w:val="1510"/>
+          <w:numId w:val="1514"/>
         </w:numPr>
       </w:pPr>
       <w:r>
@@ -12210,7 +12379,7 @@
         <w:pStyle w:val="Compact"/>
         <w:numPr>
           <w:ilvl w:val="0"/>
-          <w:numId w:val="1511"/>
+          <w:numId w:val="1515"/>
         </w:numPr>
       </w:pPr>
       <w:r>
@@ -12222,7 +12391,7 @@
         <w:pStyle w:val="Compact"/>
         <w:numPr>
           <w:ilvl w:val="0"/>
-          <w:numId w:val="1512"/>
+          <w:numId w:val="1516"/>
         </w:numPr>
       </w:pPr>
       <w:r>
@@ -12234,7 +12403,7 @@
         <w:pStyle w:val="Compact"/>
         <w:numPr>
           <w:ilvl w:val="0"/>
-          <w:numId w:val="1513"/>
+          <w:numId w:val="1517"/>
         </w:numPr>
       </w:pPr>
       <w:r>
@@ -12246,7 +12415,7 @@
         <w:pStyle w:val="Compact"/>
         <w:numPr>
           <w:ilvl w:val="0"/>
-          <w:numId w:val="1514"/>
+          <w:numId w:val="1518"/>
         </w:numPr>
       </w:pPr>
       <w:r>
@@ -12300,7 +12469,7 @@
         <w:pStyle w:val="Compact"/>
         <w:numPr>
           <w:ilvl w:val="0"/>
-          <w:numId w:val="1515"/>
+          <w:numId w:val="1519"/>
         </w:numPr>
       </w:pPr>
       <w:r>
@@ -12312,7 +12481,7 @@
         <w:pStyle w:val="Compact"/>
         <w:numPr>
           <w:ilvl w:val="0"/>
-          <w:numId w:val="1516"/>
+          <w:numId w:val="1520"/>
         </w:numPr>
       </w:pPr>
       <w:r>
@@ -12339,7 +12508,7 @@
         <w:pStyle w:val="Compact"/>
         <w:numPr>
           <w:ilvl w:val="0"/>
-          <w:numId w:val="1517"/>
+          <w:numId w:val="1521"/>
         </w:numPr>
       </w:pPr>
       <w:r>
@@ -12381,7 +12550,7 @@
         <w:pStyle w:val="Compact"/>
         <w:numPr>
           <w:ilvl w:val="0"/>
-          <w:numId w:val="1518"/>
+          <w:numId w:val="1522"/>
         </w:numPr>
       </w:pPr>
       <w:r>
@@ -12408,7 +12577,7 @@
         <w:pStyle w:val="Compact"/>
         <w:numPr>
           <w:ilvl w:val="0"/>
-          <w:numId w:val="1519"/>
+          <w:numId w:val="1523"/>
         </w:numPr>
       </w:pPr>
       <w:r>
@@ -12420,7 +12589,7 @@
         <w:pStyle w:val="Compact"/>
         <w:numPr>
           <w:ilvl w:val="0"/>
-          <w:numId w:val="1520"/>
+          <w:numId w:val="1524"/>
         </w:numPr>
       </w:pPr>
       <w:r>
@@ -12432,7 +12601,7 @@
         <w:pStyle w:val="Compact"/>
         <w:numPr>
           <w:ilvl w:val="0"/>
-          <w:numId w:val="1521"/>
+          <w:numId w:val="1525"/>
         </w:numPr>
       </w:pPr>
       <w:r>
@@ -12454,8 +12623,8 @@
         <w:t xml:space="preserve">— 5/5 passed after cap tests; server build passed.</w:t>
       </w:r>
     </w:p>
-    <w:bookmarkEnd w:id="71"/>
-    <w:bookmarkStart w:id="72" w:name="scope-lock-for-ai-retarget"/>
+    <w:bookmarkEnd w:id="72"/>
+    <w:bookmarkStart w:id="73" w:name="scope-lock-for-ai-retarget"/>
     <w:p>
       <w:pPr>
         <w:pStyle w:val="Heading3"/>
@@ -12469,7 +12638,7 @@
         <w:pStyle w:val="Compact"/>
         <w:numPr>
           <w:ilvl w:val="0"/>
-          <w:numId w:val="1522"/>
+          <w:numId w:val="1526"/>
         </w:numPr>
       </w:pPr>
       <w:r>
@@ -12481,7 +12650,7 @@
         <w:pStyle w:val="Compact"/>
         <w:numPr>
           <w:ilvl w:val="0"/>
-          <w:numId w:val="1523"/>
+          <w:numId w:val="1527"/>
         </w:numPr>
       </w:pPr>
       <w:r>
@@ -12493,7 +12662,7 @@
         <w:pStyle w:val="Compact"/>
         <w:numPr>
           <w:ilvl w:val="0"/>
-          <w:numId w:val="1524"/>
+          <w:numId w:val="1528"/>
         </w:numPr>
       </w:pPr>
       <w:r>
@@ -12505,7 +12674,7 @@
         <w:pStyle w:val="Compact"/>
         <w:numPr>
           <w:ilvl w:val="0"/>
-          <w:numId w:val="1525"/>
+          <w:numId w:val="1529"/>
         </w:numPr>
       </w:pPr>
       <w:r>
@@ -12517,7 +12686,7 @@
         <w:pStyle w:val="Compact"/>
         <w:numPr>
           <w:ilvl w:val="0"/>
-          <w:numId w:val="1526"/>
+          <w:numId w:val="1530"/>
         </w:numPr>
       </w:pPr>
       <w:r>
@@ -12529,7 +12698,7 @@
         <w:pStyle w:val="Compact"/>
         <w:numPr>
           <w:ilvl w:val="0"/>
-          <w:numId w:val="1527"/>
+          <w:numId w:val="1531"/>
         </w:numPr>
       </w:pPr>
       <w:r>
@@ -12541,7 +12710,7 @@
         <w:pStyle w:val="Compact"/>
         <w:numPr>
           <w:ilvl w:val="1"/>
-          <w:numId w:val="1528"/>
+          <w:numId w:val="1532"/>
         </w:numPr>
       </w:pPr>
       <w:r>
@@ -12568,7 +12737,7 @@
         <w:pStyle w:val="Compact"/>
         <w:numPr>
           <w:ilvl w:val="1"/>
-          <w:numId w:val="1528"/>
+          <w:numId w:val="1532"/>
         </w:numPr>
       </w:pPr>
       <w:r>
@@ -12590,8 +12759,8 @@
         <w:t xml:space="preserve">scoping correctness.</w:t>
       </w:r>
     </w:p>
-    <w:bookmarkEnd w:id="72"/>
-    <w:bookmarkStart w:id="73" w:name="database-model"/>
+    <w:bookmarkEnd w:id="73"/>
+    <w:bookmarkStart w:id="74" w:name="database-model"/>
     <w:p>
       <w:pPr>
         <w:pStyle w:val="Heading3"/>
@@ -12605,7 +12774,7 @@
         <w:pStyle w:val="Compact"/>
         <w:numPr>
           <w:ilvl w:val="0"/>
-          <w:numId w:val="1529"/>
+          <w:numId w:val="1533"/>
         </w:numPr>
       </w:pPr>
       <w:r>
@@ -12647,7 +12816,7 @@
         <w:pStyle w:val="Compact"/>
         <w:numPr>
           <w:ilvl w:val="0"/>
-          <w:numId w:val="1530"/>
+          <w:numId w:val="1534"/>
         </w:numPr>
       </w:pPr>
       <w:r>
@@ -12671,7 +12840,7 @@
         <w:pStyle w:val="Compact"/>
         <w:numPr>
           <w:ilvl w:val="0"/>
-          <w:numId w:val="1531"/>
+          <w:numId w:val="1535"/>
         </w:numPr>
       </w:pPr>
       <w:r>
@@ -12695,7 +12864,7 @@
         <w:pStyle w:val="Compact"/>
         <w:numPr>
           <w:ilvl w:val="0"/>
-          <w:numId w:val="1532"/>
+          <w:numId w:val="1536"/>
         </w:numPr>
       </w:pPr>
       <w:r>
@@ -12707,7 +12876,7 @@
         <w:pStyle w:val="Compact"/>
         <w:numPr>
           <w:ilvl w:val="0"/>
-          <w:numId w:val="1533"/>
+          <w:numId w:val="1537"/>
         </w:numPr>
       </w:pPr>
       <w:r>
@@ -12719,7 +12888,7 @@
         <w:pStyle w:val="Compact"/>
         <w:numPr>
           <w:ilvl w:val="0"/>
-          <w:numId w:val="1534"/>
+          <w:numId w:val="1538"/>
         </w:numPr>
       </w:pPr>
       <w:r>
@@ -12731,7 +12900,7 @@
         <w:pStyle w:val="Compact"/>
         <w:numPr>
           <w:ilvl w:val="0"/>
-          <w:numId w:val="1535"/>
+          <w:numId w:val="1539"/>
         </w:numPr>
       </w:pPr>
       <w:r>
@@ -12743,7 +12912,7 @@
         <w:pStyle w:val="Compact"/>
         <w:numPr>
           <w:ilvl w:val="0"/>
-          <w:numId w:val="1536"/>
+          <w:numId w:val="1540"/>
         </w:numPr>
       </w:pPr>
       <w:r>
@@ -12755,7 +12924,7 @@
         <w:pStyle w:val="Compact"/>
         <w:numPr>
           <w:ilvl w:val="0"/>
-          <w:numId w:val="1537"/>
+          <w:numId w:val="1541"/>
         </w:numPr>
       </w:pPr>
       <w:r>
@@ -12767,7 +12936,7 @@
         <w:pStyle w:val="Compact"/>
         <w:numPr>
           <w:ilvl w:val="0"/>
-          <w:numId w:val="1538"/>
+          <w:numId w:val="1542"/>
         </w:numPr>
       </w:pPr>
       <w:r>
@@ -12779,7 +12948,7 @@
         <w:pStyle w:val="Compact"/>
         <w:numPr>
           <w:ilvl w:val="0"/>
-          <w:numId w:val="1539"/>
+          <w:numId w:val="1543"/>
         </w:numPr>
       </w:pPr>
       <w:r>
@@ -12791,7 +12960,7 @@
         <w:pStyle w:val="Compact"/>
         <w:numPr>
           <w:ilvl w:val="0"/>
-          <w:numId w:val="1540"/>
+          <w:numId w:val="1544"/>
         </w:numPr>
       </w:pPr>
       <w:r>
@@ -12803,7 +12972,7 @@
         <w:pStyle w:val="Compact"/>
         <w:numPr>
           <w:ilvl w:val="0"/>
-          <w:numId w:val="1541"/>
+          <w:numId w:val="1545"/>
         </w:numPr>
       </w:pPr>
       <w:r>
@@ -12815,7 +12984,7 @@
         <w:pStyle w:val="Compact"/>
         <w:numPr>
           <w:ilvl w:val="0"/>
-          <w:numId w:val="1542"/>
+          <w:numId w:val="1546"/>
         </w:numPr>
       </w:pPr>
       <w:r>
@@ -12842,7 +13011,7 @@
         <w:pStyle w:val="Compact"/>
         <w:numPr>
           <w:ilvl w:val="0"/>
-          <w:numId w:val="1543"/>
+          <w:numId w:val="1547"/>
         </w:numPr>
       </w:pPr>
       <w:r>
@@ -12854,15 +13023,15 @@
         <w:pStyle w:val="Compact"/>
         <w:numPr>
           <w:ilvl w:val="0"/>
-          <w:numId w:val="1544"/>
+          <w:numId w:val="1548"/>
         </w:numPr>
       </w:pPr>
       <w:r>
         <w:t xml:space="preserve">Ensure expired cohorts are ignored safely.</w:t>
       </w:r>
     </w:p>
-    <w:bookmarkEnd w:id="73"/>
-    <w:bookmarkStart w:id="74" w:name="cohort-generation"/>
+    <w:bookmarkEnd w:id="74"/>
+    <w:bookmarkStart w:id="75" w:name="cohort-generation"/>
     <w:p>
       <w:pPr>
         <w:pStyle w:val="Heading3"/>
@@ -12876,7 +13045,7 @@
         <w:pStyle w:val="Compact"/>
         <w:numPr>
           <w:ilvl w:val="0"/>
-          <w:numId w:val="1545"/>
+          <w:numId w:val="1549"/>
         </w:numPr>
       </w:pPr>
       <w:r>
@@ -12888,7 +13057,7 @@
         <w:pStyle w:val="Compact"/>
         <w:numPr>
           <w:ilvl w:val="0"/>
-          <w:numId w:val="1546"/>
+          <w:numId w:val="1550"/>
         </w:numPr>
       </w:pPr>
       <w:r>
@@ -12915,7 +13084,7 @@
         <w:pStyle w:val="Compact"/>
         <w:numPr>
           <w:ilvl w:val="0"/>
-          <w:numId w:val="1547"/>
+          <w:numId w:val="1551"/>
         </w:numPr>
       </w:pPr>
       <w:r>
@@ -12942,7 +13111,7 @@
         <w:pStyle w:val="Compact"/>
         <w:numPr>
           <w:ilvl w:val="0"/>
-          <w:numId w:val="1548"/>
+          <w:numId w:val="1552"/>
         </w:numPr>
       </w:pPr>
       <w:r>
@@ -12969,7 +13138,7 @@
         <w:pStyle w:val="Compact"/>
         <w:numPr>
           <w:ilvl w:val="0"/>
-          <w:numId w:val="1549"/>
+          <w:numId w:val="1553"/>
         </w:numPr>
       </w:pPr>
       <w:r>
@@ -12981,7 +13150,7 @@
         <w:pStyle w:val="Compact"/>
         <w:numPr>
           <w:ilvl w:val="1"/>
-          <w:numId w:val="1550"/>
+          <w:numId w:val="1554"/>
         </w:numPr>
       </w:pPr>
       <w:r>
@@ -12993,7 +13162,7 @@
         <w:pStyle w:val="Compact"/>
         <w:numPr>
           <w:ilvl w:val="1"/>
-          <w:numId w:val="1550"/>
+          <w:numId w:val="1554"/>
         </w:numPr>
       </w:pPr>
       <w:r>
@@ -13005,7 +13174,7 @@
         <w:pStyle w:val="Compact"/>
         <w:numPr>
           <w:ilvl w:val="1"/>
-          <w:numId w:val="1550"/>
+          <w:numId w:val="1554"/>
         </w:numPr>
       </w:pPr>
       <w:r>
@@ -13017,7 +13186,7 @@
         <w:pStyle w:val="Compact"/>
         <w:numPr>
           <w:ilvl w:val="0"/>
-          <w:numId w:val="1551"/>
+          <w:numId w:val="1555"/>
         </w:numPr>
       </w:pPr>
       <w:r>
@@ -13029,7 +13198,7 @@
         <w:pStyle w:val="Compact"/>
         <w:numPr>
           <w:ilvl w:val="0"/>
-          <w:numId w:val="1552"/>
+          <w:numId w:val="1556"/>
         </w:numPr>
       </w:pPr>
       <w:r>
@@ -13041,7 +13210,7 @@
         <w:pStyle w:val="Compact"/>
         <w:numPr>
           <w:ilvl w:val="1"/>
-          <w:numId w:val="1553"/>
+          <w:numId w:val="1557"/>
         </w:numPr>
       </w:pPr>
       <w:r>
@@ -13053,7 +13222,7 @@
         <w:pStyle w:val="Compact"/>
         <w:numPr>
           <w:ilvl w:val="1"/>
-          <w:numId w:val="1553"/>
+          <w:numId w:val="1557"/>
         </w:numPr>
       </w:pPr>
       <w:r>
@@ -13065,7 +13234,7 @@
         <w:pStyle w:val="Compact"/>
         <w:numPr>
           <w:ilvl w:val="1"/>
-          <w:numId w:val="1553"/>
+          <w:numId w:val="1557"/>
         </w:numPr>
       </w:pPr>
       <w:r>
@@ -13077,7 +13246,7 @@
         <w:pStyle w:val="Compact"/>
         <w:numPr>
           <w:ilvl w:val="1"/>
-          <w:numId w:val="1553"/>
+          <w:numId w:val="1557"/>
         </w:numPr>
       </w:pPr>
       <w:r>
@@ -13089,7 +13258,7 @@
         <w:pStyle w:val="Compact"/>
         <w:numPr>
           <w:ilvl w:val="1"/>
-          <w:numId w:val="1553"/>
+          <w:numId w:val="1557"/>
         </w:numPr>
       </w:pPr>
       <w:r>
@@ -13101,7 +13270,7 @@
         <w:pStyle w:val="Compact"/>
         <w:numPr>
           <w:ilvl w:val="1"/>
-          <w:numId w:val="1553"/>
+          <w:numId w:val="1557"/>
         </w:numPr>
       </w:pPr>
       <w:r>
@@ -13113,7 +13282,7 @@
         <w:pStyle w:val="Compact"/>
         <w:numPr>
           <w:ilvl w:val="0"/>
-          <w:numId w:val="1554"/>
+          <w:numId w:val="1558"/>
         </w:numPr>
       </w:pPr>
       <w:r>
@@ -13125,7 +13294,7 @@
         <w:pStyle w:val="Compact"/>
         <w:numPr>
           <w:ilvl w:val="0"/>
-          <w:numId w:val="1555"/>
+          <w:numId w:val="1559"/>
         </w:numPr>
       </w:pPr>
       <w:r>
@@ -13137,15 +13306,15 @@
         <w:pStyle w:val="Compact"/>
         <w:numPr>
           <w:ilvl w:val="0"/>
-          <w:numId w:val="1556"/>
+          <w:numId w:val="1560"/>
         </w:numPr>
       </w:pPr>
       <w:r>
         <w:t xml:space="preserve">Ensure predicted funded deals are traceable to historical anchor, not arbitrary text.</w:t>
       </w:r>
     </w:p>
-    <w:bookmarkEnd w:id="74"/>
-    <w:bookmarkStart w:id="75" w:name="cooldowns-and-compliance"/>
+    <w:bookmarkEnd w:id="75"/>
+    <w:bookmarkStart w:id="76" w:name="cooldowns-and-compliance"/>
     <w:p>
       <w:pPr>
         <w:pStyle w:val="Heading3"/>
@@ -13159,7 +13328,7 @@
         <w:pStyle w:val="Compact"/>
         <w:numPr>
           <w:ilvl w:val="0"/>
-          <w:numId w:val="1557"/>
+          <w:numId w:val="1561"/>
         </w:numPr>
       </w:pPr>
       <w:r>
@@ -13171,7 +13340,7 @@
         <w:pStyle w:val="Compact"/>
         <w:numPr>
           <w:ilvl w:val="0"/>
-          <w:numId w:val="1558"/>
+          <w:numId w:val="1562"/>
         </w:numPr>
       </w:pPr>
       <w:r>
@@ -13183,7 +13352,7 @@
         <w:pStyle w:val="Compact"/>
         <w:numPr>
           <w:ilvl w:val="0"/>
-          <w:numId w:val="1559"/>
+          <w:numId w:val="1563"/>
         </w:numPr>
       </w:pPr>
       <w:r>
@@ -13195,7 +13364,7 @@
         <w:pStyle w:val="Compact"/>
         <w:numPr>
           <w:ilvl w:val="0"/>
-          <w:numId w:val="1560"/>
+          <w:numId w:val="1564"/>
         </w:numPr>
       </w:pPr>
       <w:r>
@@ -13207,7 +13376,7 @@
         <w:pStyle w:val="Compact"/>
         <w:numPr>
           <w:ilvl w:val="0"/>
-          <w:numId w:val="1561"/>
+          <w:numId w:val="1565"/>
         </w:numPr>
       </w:pPr>
       <w:r>
@@ -13219,15 +13388,15 @@
         <w:pStyle w:val="Compact"/>
         <w:numPr>
           <w:ilvl w:val="0"/>
-          <w:numId w:val="1562"/>
+          <w:numId w:val="1566"/>
         </w:numPr>
       </w:pPr>
       <w:r>
         <w:t xml:space="preserve">Verify no cohort can re-contact opted-out, DNC, suppressed, or too-recent leads.</w:t>
       </w:r>
     </w:p>
-    <w:bookmarkEnd w:id="75"/>
-    <w:bookmarkStart w:id="76" w:name="two-layer-send-caps"/>
+    <w:bookmarkEnd w:id="76"/>
+    <w:bookmarkStart w:id="77" w:name="two-layer-send-caps"/>
     <w:p>
       <w:pPr>
         <w:pStyle w:val="Heading3"/>
@@ -13241,7 +13410,7 @@
         <w:pStyle w:val="Compact"/>
         <w:numPr>
           <w:ilvl w:val="0"/>
-          <w:numId w:val="1563"/>
+          <w:numId w:val="1567"/>
         </w:numPr>
       </w:pPr>
       <w:r>
@@ -13253,7 +13422,7 @@
         <w:pStyle w:val="Compact"/>
         <w:numPr>
           <w:ilvl w:val="1"/>
-          <w:numId w:val="1564"/>
+          <w:numId w:val="1568"/>
         </w:numPr>
       </w:pPr>
       <w:r>
@@ -13265,7 +13434,7 @@
         <w:pStyle w:val="Compact"/>
         <w:numPr>
           <w:ilvl w:val="1"/>
-          <w:numId w:val="1564"/>
+          <w:numId w:val="1568"/>
         </w:numPr>
       </w:pPr>
       <w:r>
@@ -13277,7 +13446,7 @@
         <w:pStyle w:val="Compact"/>
         <w:numPr>
           <w:ilvl w:val="0"/>
-          <w:numId w:val="1565"/>
+          <w:numId w:val="1569"/>
         </w:numPr>
       </w:pPr>
       <w:r>
@@ -13289,7 +13458,7 @@
         <w:pStyle w:val="Compact"/>
         <w:numPr>
           <w:ilvl w:val="1"/>
-          <w:numId w:val="1566"/>
+          <w:numId w:val="1570"/>
         </w:numPr>
       </w:pPr>
       <w:r>
@@ -13301,7 +13470,7 @@
         <w:pStyle w:val="Compact"/>
         <w:numPr>
           <w:ilvl w:val="1"/>
-          <w:numId w:val="1566"/>
+          <w:numId w:val="1570"/>
         </w:numPr>
       </w:pPr>
       <w:r>
@@ -13313,7 +13482,7 @@
         <w:pStyle w:val="Compact"/>
         <w:numPr>
           <w:ilvl w:val="0"/>
-          <w:numId w:val="1567"/>
+          <w:numId w:val="1571"/>
         </w:numPr>
       </w:pPr>
       <w:r>
@@ -13325,7 +13494,7 @@
         <w:pStyle w:val="Compact"/>
         <w:numPr>
           <w:ilvl w:val="0"/>
-          <w:numId w:val="1568"/>
+          <w:numId w:val="1572"/>
         </w:numPr>
       </w:pPr>
       <w:r>
@@ -13337,7 +13506,7 @@
         <w:pStyle w:val="Compact"/>
         <w:numPr>
           <w:ilvl w:val="0"/>
-          <w:numId w:val="1569"/>
+          <w:numId w:val="1573"/>
         </w:numPr>
       </w:pPr>
       <w:r>
@@ -13349,15 +13518,15 @@
         <w:pStyle w:val="Compact"/>
         <w:numPr>
           <w:ilvl w:val="0"/>
-          <w:numId w:val="1570"/>
+          <w:numId w:val="1574"/>
         </w:numPr>
       </w:pPr>
       <w:r>
         <w:t xml:space="preserve">Cohort card lead count reflects current remaining capacity at render/build time.</w:t>
       </w:r>
     </w:p>
-    <w:bookmarkEnd w:id="76"/>
-    <w:bookmarkStart w:id="77" w:name="ai-reasoning-and-cron"/>
+    <w:bookmarkEnd w:id="77"/>
+    <w:bookmarkStart w:id="78" w:name="ai-reasoning-and-cron"/>
     <w:p>
       <w:pPr>
         <w:pStyle w:val="Heading3"/>
@@ -13371,7 +13540,7 @@
         <w:pStyle w:val="Compact"/>
         <w:numPr>
           <w:ilvl w:val="0"/>
-          <w:numId w:val="1571"/>
+          <w:numId w:val="1575"/>
         </w:numPr>
       </w:pPr>
       <w:r>
@@ -13383,7 +13552,7 @@
         <w:pStyle w:val="Compact"/>
         <w:numPr>
           <w:ilvl w:val="0"/>
-          <w:numId w:val="1572"/>
+          <w:numId w:val="1576"/>
         </w:numPr>
       </w:pPr>
       <w:r>
@@ -13395,7 +13564,7 @@
         <w:pStyle w:val="Compact"/>
         <w:numPr>
           <w:ilvl w:val="0"/>
-          <w:numId w:val="1573"/>
+          <w:numId w:val="1577"/>
         </w:numPr>
       </w:pPr>
       <w:r>
@@ -13407,7 +13576,7 @@
         <w:pStyle w:val="Compact"/>
         <w:numPr>
           <w:ilvl w:val="0"/>
-          <w:numId w:val="1574"/>
+          <w:numId w:val="1578"/>
         </w:numPr>
       </w:pPr>
       <w:r>
@@ -13419,7 +13588,7 @@
         <w:pStyle w:val="Compact"/>
         <w:numPr>
           <w:ilvl w:val="0"/>
-          <w:numId w:val="1575"/>
+          <w:numId w:val="1579"/>
         </w:numPr>
       </w:pPr>
       <w:r>
@@ -13431,7 +13600,7 @@
         <w:pStyle w:val="Compact"/>
         <w:numPr>
           <w:ilvl w:val="0"/>
-          <w:numId w:val="1576"/>
+          <w:numId w:val="1580"/>
         </w:numPr>
       </w:pPr>
       <w:r>
@@ -13443,7 +13612,7 @@
         <w:pStyle w:val="Compact"/>
         <w:numPr>
           <w:ilvl w:val="0"/>
-          <w:numId w:val="1577"/>
+          <w:numId w:val="1581"/>
         </w:numPr>
       </w:pPr>
       <w:r>
@@ -13455,7 +13624,7 @@
         <w:pStyle w:val="Compact"/>
         <w:numPr>
           <w:ilvl w:val="0"/>
-          <w:numId w:val="1578"/>
+          <w:numId w:val="1582"/>
         </w:numPr>
       </w:pPr>
       <w:r>
@@ -13467,15 +13636,15 @@
         <w:pStyle w:val="Compact"/>
         <w:numPr>
           <w:ilvl w:val="0"/>
-          <w:numId w:val="1579"/>
+          <w:numId w:val="1583"/>
         </w:numPr>
       </w:pPr>
       <w:r>
         <w:t xml:space="preserve">Log failures per user/cohort without breaking other cohorts.</w:t>
       </w:r>
     </w:p>
-    <w:bookmarkEnd w:id="77"/>
-    <w:bookmarkStart w:id="78" w:name="ui-1"/>
+    <w:bookmarkEnd w:id="78"/>
+    <w:bookmarkStart w:id="79" w:name="ui-1"/>
     <w:p>
       <w:pPr>
         <w:pStyle w:val="Heading3"/>
@@ -13489,7 +13658,7 @@
         <w:pStyle w:val="Compact"/>
         <w:numPr>
           <w:ilvl w:val="0"/>
-          <w:numId w:val="1580"/>
+          <w:numId w:val="1584"/>
         </w:numPr>
       </w:pPr>
       <w:r>
@@ -13501,7 +13670,7 @@
         <w:pStyle w:val="Compact"/>
         <w:numPr>
           <w:ilvl w:val="0"/>
-          <w:numId w:val="1581"/>
+          <w:numId w:val="1585"/>
         </w:numPr>
       </w:pPr>
       <w:r>
@@ -13513,7 +13682,7 @@
         <w:pStyle w:val="Compact"/>
         <w:numPr>
           <w:ilvl w:val="0"/>
-          <w:numId w:val="1582"/>
+          <w:numId w:val="1586"/>
         </w:numPr>
       </w:pPr>
       <w:r>
@@ -13525,7 +13694,7 @@
         <w:pStyle w:val="Compact"/>
         <w:numPr>
           <w:ilvl w:val="0"/>
-          <w:numId w:val="1583"/>
+          <w:numId w:val="1587"/>
         </w:numPr>
       </w:pPr>
       <w:r>
@@ -13537,7 +13706,7 @@
         <w:pStyle w:val="Compact"/>
         <w:numPr>
           <w:ilvl w:val="0"/>
-          <w:numId w:val="1584"/>
+          <w:numId w:val="1588"/>
         </w:numPr>
       </w:pPr>
       <w:r>
@@ -13549,7 +13718,7 @@
         <w:pStyle w:val="Compact"/>
         <w:numPr>
           <w:ilvl w:val="0"/>
-          <w:numId w:val="1585"/>
+          <w:numId w:val="1589"/>
         </w:numPr>
       </w:pPr>
       <w:r>
@@ -13561,7 +13730,7 @@
         <w:pStyle w:val="Compact"/>
         <w:numPr>
           <w:ilvl w:val="0"/>
-          <w:numId w:val="1586"/>
+          <w:numId w:val="1590"/>
         </w:numPr>
       </w:pPr>
       <w:r>
@@ -13573,7 +13742,7 @@
         <w:pStyle w:val="Compact"/>
         <w:numPr>
           <w:ilvl w:val="0"/>
-          <w:numId w:val="1587"/>
+          <w:numId w:val="1591"/>
         </w:numPr>
       </w:pPr>
       <w:r>
@@ -13585,7 +13754,7 @@
         <w:pStyle w:val="Compact"/>
         <w:numPr>
           <w:ilvl w:val="0"/>
-          <w:numId w:val="1588"/>
+          <w:numId w:val="1592"/>
         </w:numPr>
       </w:pPr>
       <w:r>
@@ -13597,7 +13766,7 @@
         <w:pStyle w:val="Compact"/>
         <w:numPr>
           <w:ilvl w:val="0"/>
-          <w:numId w:val="1589"/>
+          <w:numId w:val="1593"/>
         </w:numPr>
       </w:pPr>
       <w:r>
@@ -13624,7 +13793,7 @@
         <w:pStyle w:val="Compact"/>
         <w:numPr>
           <w:ilvl w:val="0"/>
-          <w:numId w:val="1590"/>
+          <w:numId w:val="1594"/>
         </w:numPr>
       </w:pPr>
       <w:r>
@@ -13645,15 +13814,15 @@
         <w:pStyle w:val="Compact"/>
         <w:numPr>
           <w:ilvl w:val="0"/>
-          <w:numId w:val="1591"/>
+          <w:numId w:val="1595"/>
         </w:numPr>
       </w:pPr>
       <w:r>
         <w:t xml:space="preserve">Existing campaign actions still work: rerun/refresh, start, pause, delete where allowed.</w:t>
       </w:r>
     </w:p>
-    <w:bookmarkEnd w:id="78"/>
-    <w:bookmarkStart w:id="79" w:name="backendapi"/>
+    <w:bookmarkEnd w:id="79"/>
+    <w:bookmarkStart w:id="80" w:name="backendapi"/>
     <w:p>
       <w:pPr>
         <w:pStyle w:val="Heading3"/>
@@ -13667,7 +13836,7 @@
         <w:pStyle w:val="Compact"/>
         <w:numPr>
           <w:ilvl w:val="0"/>
-          <w:numId w:val="1592"/>
+          <w:numId w:val="1596"/>
         </w:numPr>
       </w:pPr>
       <w:r>
@@ -13679,7 +13848,7 @@
         <w:pStyle w:val="Compact"/>
         <w:numPr>
           <w:ilvl w:val="0"/>
-          <w:numId w:val="1593"/>
+          <w:numId w:val="1597"/>
         </w:numPr>
       </w:pPr>
       <w:r>
@@ -13691,7 +13860,7 @@
         <w:pStyle w:val="Compact"/>
         <w:numPr>
           <w:ilvl w:val="0"/>
-          <w:numId w:val="1594"/>
+          <w:numId w:val="1598"/>
         </w:numPr>
       </w:pPr>
       <w:r>
@@ -13703,7 +13872,7 @@
         <w:pStyle w:val="Compact"/>
         <w:numPr>
           <w:ilvl w:val="0"/>
-          <w:numId w:val="1595"/>
+          <w:numId w:val="1599"/>
         </w:numPr>
       </w:pPr>
       <w:r>
@@ -13715,7 +13884,7 @@
         <w:pStyle w:val="Compact"/>
         <w:numPr>
           <w:ilvl w:val="0"/>
-          <w:numId w:val="1596"/>
+          <w:numId w:val="1600"/>
         </w:numPr>
       </w:pPr>
       <w:r>
@@ -13727,7 +13896,7 @@
         <w:pStyle w:val="Compact"/>
         <w:numPr>
           <w:ilvl w:val="0"/>
-          <w:numId w:val="1597"/>
+          <w:numId w:val="1601"/>
         </w:numPr>
       </w:pPr>
       <w:r>
@@ -13739,7 +13908,7 @@
         <w:pStyle w:val="Compact"/>
         <w:numPr>
           <w:ilvl w:val="0"/>
-          <w:numId w:val="1598"/>
+          <w:numId w:val="1602"/>
         </w:numPr>
       </w:pPr>
       <w:r>
@@ -13751,15 +13920,15 @@
         <w:pStyle w:val="Compact"/>
         <w:numPr>
           <w:ilvl w:val="0"/>
-          <w:numId w:val="1599"/>
+          <w:numId w:val="1603"/>
         </w:numPr>
       </w:pPr>
       <w:r>
         <w:t xml:space="preserve">AI Retarget is upstream recommendation only; no auto-send.</w:t>
       </w:r>
     </w:p>
-    <w:bookmarkEnd w:id="79"/>
-    <w:bookmarkStart w:id="80" w:name="m2.3-testing-gate"/>
+    <w:bookmarkEnd w:id="80"/>
+    <w:bookmarkStart w:id="81" w:name="m2.3-testing-gate"/>
     <w:p>
       <w:pPr>
         <w:pStyle w:val="Heading3"/>
@@ -13773,7 +13942,7 @@
         <w:pStyle w:val="Compact"/>
         <w:numPr>
           <w:ilvl w:val="0"/>
-          <w:numId w:val="1600"/>
+          <w:numId w:val="1604"/>
         </w:numPr>
       </w:pPr>
       <w:r>
@@ -13785,7 +13954,7 @@
         <w:pStyle w:val="Compact"/>
         <w:numPr>
           <w:ilvl w:val="0"/>
-          <w:numId w:val="1601"/>
+          <w:numId w:val="1605"/>
         </w:numPr>
       </w:pPr>
       <w:r>
@@ -13797,7 +13966,7 @@
         <w:pStyle w:val="Compact"/>
         <w:numPr>
           <w:ilvl w:val="0"/>
-          <w:numId w:val="1602"/>
+          <w:numId w:val="1606"/>
         </w:numPr>
       </w:pPr>
       <w:r>
@@ -13809,7 +13978,7 @@
         <w:pStyle w:val="Compact"/>
         <w:numPr>
           <w:ilvl w:val="0"/>
-          <w:numId w:val="1603"/>
+          <w:numId w:val="1607"/>
         </w:numPr>
       </w:pPr>
       <w:r>
@@ -13821,7 +13990,7 @@
         <w:pStyle w:val="Compact"/>
         <w:numPr>
           <w:ilvl w:val="0"/>
-          <w:numId w:val="1604"/>
+          <w:numId w:val="1608"/>
         </w:numPr>
       </w:pPr>
       <w:r>
@@ -13833,7 +14002,7 @@
         <w:pStyle w:val="Compact"/>
         <w:numPr>
           <w:ilvl w:val="0"/>
-          <w:numId w:val="1605"/>
+          <w:numId w:val="1609"/>
         </w:numPr>
       </w:pPr>
       <w:r>
@@ -13845,7 +14014,7 @@
         <w:pStyle w:val="Compact"/>
         <w:numPr>
           <w:ilvl w:val="0"/>
-          <w:numId w:val="1606"/>
+          <w:numId w:val="1610"/>
         </w:numPr>
       </w:pPr>
       <w:r>
@@ -13857,7 +14026,7 @@
         <w:pStyle w:val="Compact"/>
         <w:numPr>
           <w:ilvl w:val="0"/>
-          <w:numId w:val="1607"/>
+          <w:numId w:val="1611"/>
         </w:numPr>
       </w:pPr>
       <w:r>
@@ -13869,7 +14038,7 @@
         <w:pStyle w:val="Compact"/>
         <w:numPr>
           <w:ilvl w:val="0"/>
-          <w:numId w:val="1608"/>
+          <w:numId w:val="1612"/>
         </w:numPr>
       </w:pPr>
       <w:r>
@@ -13881,7 +14050,7 @@
         <w:pStyle w:val="Compact"/>
         <w:numPr>
           <w:ilvl w:val="0"/>
-          <w:numId w:val="1609"/>
+          <w:numId w:val="1613"/>
         </w:numPr>
       </w:pPr>
       <w:r>
@@ -13893,7 +14062,7 @@
         <w:pStyle w:val="Compact"/>
         <w:numPr>
           <w:ilvl w:val="0"/>
-          <w:numId w:val="1610"/>
+          <w:numId w:val="1614"/>
         </w:numPr>
       </w:pPr>
       <w:r>
@@ -13905,7 +14074,7 @@
         <w:pStyle w:val="Compact"/>
         <w:numPr>
           <w:ilvl w:val="0"/>
-          <w:numId w:val="1611"/>
+          <w:numId w:val="1615"/>
         </w:numPr>
       </w:pPr>
       <w:r>
@@ -13917,7 +14086,7 @@
         <w:pStyle w:val="Compact"/>
         <w:numPr>
           <w:ilvl w:val="0"/>
-          <w:numId w:val="1612"/>
+          <w:numId w:val="1616"/>
         </w:numPr>
       </w:pPr>
       <w:r>
@@ -13929,7 +14098,7 @@
         <w:pStyle w:val="Compact"/>
         <w:numPr>
           <w:ilvl w:val="0"/>
-          <w:numId w:val="1613"/>
+          <w:numId w:val="1617"/>
         </w:numPr>
       </w:pPr>
       <w:r>
@@ -13941,16 +14110,16 @@
         <w:pStyle w:val="Compact"/>
         <w:numPr>
           <w:ilvl w:val="0"/>
-          <w:numId w:val="1614"/>
+          <w:numId w:val="1618"/>
         </w:numPr>
       </w:pPr>
       <w:r>
         <w:t xml:space="preserve">Progress dashboard updated.</w:t>
       </w:r>
     </w:p>
-    <w:bookmarkEnd w:id="80"/>
     <w:bookmarkEnd w:id="81"/>
-    <w:bookmarkStart w:id="85" w:name="m2.4-m2-full-regression-and-release-gate"/>
+    <w:bookmarkEnd w:id="82"/>
+    <w:bookmarkStart w:id="86" w:name="m2.4-m2-full-regression-and-release-gate"/>
     <w:p>
       <w:pPr>
         <w:pStyle w:val="Heading2"/>
@@ -13959,7 +14128,7 @@
         <w:t xml:space="preserve">M2.4 — M2 Full Regression And Release Gate</w:t>
       </w:r>
     </w:p>
-    <w:bookmarkStart w:id="82" w:name="functional-regression-1"/>
+    <w:bookmarkStart w:id="83" w:name="functional-regression-1"/>
     <w:p>
       <w:pPr>
         <w:pStyle w:val="Heading3"/>
@@ -13973,7 +14142,7 @@
         <w:pStyle w:val="Compact"/>
         <w:numPr>
           <w:ilvl w:val="0"/>
-          <w:numId w:val="1615"/>
+          <w:numId w:val="1619"/>
         </w:numPr>
       </w:pPr>
       <w:r>
@@ -13985,7 +14154,7 @@
         <w:pStyle w:val="Compact"/>
         <w:numPr>
           <w:ilvl w:val="0"/>
-          <w:numId w:val="1616"/>
+          <w:numId w:val="1620"/>
         </w:numPr>
       </w:pPr>
       <w:r>
@@ -13997,7 +14166,7 @@
         <w:pStyle w:val="Compact"/>
         <w:numPr>
           <w:ilvl w:val="0"/>
-          <w:numId w:val="1617"/>
+          <w:numId w:val="1621"/>
         </w:numPr>
       </w:pPr>
       <w:r>
@@ -14009,7 +14178,7 @@
         <w:pStyle w:val="Compact"/>
         <w:numPr>
           <w:ilvl w:val="0"/>
-          <w:numId w:val="1618"/>
+          <w:numId w:val="1622"/>
         </w:numPr>
       </w:pPr>
       <w:r>
@@ -14021,7 +14190,7 @@
         <w:pStyle w:val="Compact"/>
         <w:numPr>
           <w:ilvl w:val="0"/>
-          <w:numId w:val="1619"/>
+          <w:numId w:val="1623"/>
         </w:numPr>
       </w:pPr>
       <w:r>
@@ -14033,7 +14202,7 @@
         <w:pStyle w:val="Compact"/>
         <w:numPr>
           <w:ilvl w:val="0"/>
-          <w:numId w:val="1620"/>
+          <w:numId w:val="1624"/>
         </w:numPr>
       </w:pPr>
       <w:r>
@@ -14045,7 +14214,7 @@
         <w:pStyle w:val="Compact"/>
         <w:numPr>
           <w:ilvl w:val="0"/>
-          <w:numId w:val="1621"/>
+          <w:numId w:val="1625"/>
         </w:numPr>
       </w:pPr>
       <w:r>
@@ -14057,7 +14226,7 @@
         <w:pStyle w:val="Compact"/>
         <w:numPr>
           <w:ilvl w:val="0"/>
-          <w:numId w:val="1622"/>
+          <w:numId w:val="1626"/>
         </w:numPr>
       </w:pPr>
       <w:r>
@@ -14069,7 +14238,7 @@
         <w:pStyle w:val="Compact"/>
         <w:numPr>
           <w:ilvl w:val="0"/>
-          <w:numId w:val="1623"/>
+          <w:numId w:val="1627"/>
         </w:numPr>
       </w:pPr>
       <w:r>
@@ -14081,7 +14250,7 @@
         <w:pStyle w:val="Compact"/>
         <w:numPr>
           <w:ilvl w:val="0"/>
-          <w:numId w:val="1624"/>
+          <w:numId w:val="1628"/>
         </w:numPr>
       </w:pPr>
       <w:r>
@@ -14093,7 +14262,7 @@
         <w:pStyle w:val="Compact"/>
         <w:numPr>
           <w:ilvl w:val="0"/>
-          <w:numId w:val="1625"/>
+          <w:numId w:val="1629"/>
         </w:numPr>
       </w:pPr>
       <w:r>
@@ -14105,7 +14274,7 @@
         <w:pStyle w:val="Compact"/>
         <w:numPr>
           <w:ilvl w:val="0"/>
-          <w:numId w:val="1626"/>
+          <w:numId w:val="1630"/>
         </w:numPr>
       </w:pPr>
       <w:r>
@@ -14117,7 +14286,7 @@
         <w:pStyle w:val="Compact"/>
         <w:numPr>
           <w:ilvl w:val="0"/>
-          <w:numId w:val="1627"/>
+          <w:numId w:val="1631"/>
         </w:numPr>
       </w:pPr>
       <w:r>
@@ -14139,8 +14308,8 @@
         <w:t xml:space="preserve">and test messages.</w:t>
       </w:r>
     </w:p>
-    <w:bookmarkEnd w:id="82"/>
-    <w:bookmarkStart w:id="83" w:name="visual-regression-1"/>
+    <w:bookmarkEnd w:id="83"/>
+    <w:bookmarkStart w:id="84" w:name="visual-regression-1"/>
     <w:p>
       <w:pPr>
         <w:pStyle w:val="Heading3"/>
@@ -14154,7 +14323,7 @@
         <w:pStyle w:val="Compact"/>
         <w:numPr>
           <w:ilvl w:val="0"/>
-          <w:numId w:val="1628"/>
+          <w:numId w:val="1632"/>
         </w:numPr>
       </w:pPr>
       <w:r>
@@ -14166,7 +14335,7 @@
         <w:pStyle w:val="Compact"/>
         <w:numPr>
           <w:ilvl w:val="0"/>
-          <w:numId w:val="1629"/>
+          <w:numId w:val="1633"/>
         </w:numPr>
       </w:pPr>
       <w:r>
@@ -14193,7 +14362,7 @@
         <w:pStyle w:val="Compact"/>
         <w:numPr>
           <w:ilvl w:val="0"/>
-          <w:numId w:val="1630"/>
+          <w:numId w:val="1634"/>
         </w:numPr>
       </w:pPr>
       <w:r>
@@ -14205,7 +14374,7 @@
         <w:pStyle w:val="Compact"/>
         <w:numPr>
           <w:ilvl w:val="0"/>
-          <w:numId w:val="1631"/>
+          <w:numId w:val="1635"/>
         </w:numPr>
       </w:pPr>
       <w:r>
@@ -14217,7 +14386,7 @@
         <w:pStyle w:val="Compact"/>
         <w:numPr>
           <w:ilvl w:val="0"/>
-          <w:numId w:val="1632"/>
+          <w:numId w:val="1636"/>
         </w:numPr>
       </w:pPr>
       <w:r>
@@ -14229,7 +14398,7 @@
         <w:pStyle w:val="Compact"/>
         <w:numPr>
           <w:ilvl w:val="0"/>
-          <w:numId w:val="1633"/>
+          <w:numId w:val="1637"/>
         </w:numPr>
       </w:pPr>
       <w:r>
@@ -14241,7 +14410,7 @@
         <w:pStyle w:val="Compact"/>
         <w:numPr>
           <w:ilvl w:val="0"/>
-          <w:numId w:val="1634"/>
+          <w:numId w:val="1638"/>
         </w:numPr>
       </w:pPr>
       <w:r>
@@ -14253,15 +14422,15 @@
         <w:pStyle w:val="Compact"/>
         <w:numPr>
           <w:ilvl w:val="0"/>
-          <w:numId w:val="1635"/>
+          <w:numId w:val="1639"/>
         </w:numPr>
       </w:pPr>
       <w:r>
         <w:t xml:space="preserve">No unreadable text if current styles fail; scoped style set added if needed.</w:t>
       </w:r>
     </w:p>
-    <w:bookmarkEnd w:id="83"/>
-    <w:bookmarkStart w:id="84" w:name="release-readiness-1"/>
+    <w:bookmarkEnd w:id="84"/>
+    <w:bookmarkStart w:id="85" w:name="release-readiness-1"/>
     <w:p>
       <w:pPr>
         <w:pStyle w:val="Heading3"/>
@@ -14275,7 +14444,7 @@
         <w:pStyle w:val="Compact"/>
         <w:numPr>
           <w:ilvl w:val="0"/>
-          <w:numId w:val="1636"/>
+          <w:numId w:val="1640"/>
         </w:numPr>
       </w:pPr>
       <w:r>
@@ -14287,7 +14456,7 @@
         <w:pStyle w:val="Compact"/>
         <w:numPr>
           <w:ilvl w:val="0"/>
-          <w:numId w:val="1637"/>
+          <w:numId w:val="1641"/>
         </w:numPr>
       </w:pPr>
       <w:r>
@@ -14299,7 +14468,7 @@
         <w:pStyle w:val="Compact"/>
         <w:numPr>
           <w:ilvl w:val="0"/>
-          <w:numId w:val="1638"/>
+          <w:numId w:val="1642"/>
         </w:numPr>
       </w:pPr>
       <w:r>
@@ -14311,7 +14480,7 @@
         <w:pStyle w:val="Compact"/>
         <w:numPr>
           <w:ilvl w:val="0"/>
-          <w:numId w:val="1639"/>
+          <w:numId w:val="1643"/>
         </w:numPr>
       </w:pPr>
       <w:r>
@@ -14323,7 +14492,7 @@
         <w:pStyle w:val="Compact"/>
         <w:numPr>
           <w:ilvl w:val="0"/>
-          <w:numId w:val="1640"/>
+          <w:numId w:val="1644"/>
         </w:numPr>
       </w:pPr>
       <w:r>
@@ -14335,7 +14504,7 @@
         <w:pStyle w:val="Compact"/>
         <w:numPr>
           <w:ilvl w:val="0"/>
-          <w:numId w:val="1641"/>
+          <w:numId w:val="1645"/>
         </w:numPr>
       </w:pPr>
       <w:r>
@@ -14347,7 +14516,7 @@
         <w:pStyle w:val="Compact"/>
         <w:numPr>
           <w:ilvl w:val="0"/>
-          <w:numId w:val="1642"/>
+          <w:numId w:val="1646"/>
         </w:numPr>
       </w:pPr>
       <w:r>
@@ -14359,7 +14528,7 @@
         <w:pStyle w:val="Compact"/>
         <w:numPr>
           <w:ilvl w:val="0"/>
-          <w:numId w:val="1643"/>
+          <w:numId w:val="1647"/>
         </w:numPr>
       </w:pPr>
       <w:r>
@@ -14371,16 +14540,16 @@
         <w:pStyle w:val="Compact"/>
         <w:numPr>
           <w:ilvl w:val="0"/>
-          <w:numId w:val="1644"/>
+          <w:numId w:val="1648"/>
         </w:numPr>
       </w:pPr>
       <w:r>
         <w:t xml:space="preserve">Progress dashboard updated to M2 complete only after all gates pass.</w:t>
       </w:r>
     </w:p>
-    <w:bookmarkEnd w:id="84"/>
     <w:bookmarkEnd w:id="85"/>
-    <w:bookmarkStart w:id="86" w:name="full-final-acceptance"/>
+    <w:bookmarkEnd w:id="86"/>
+    <w:bookmarkStart w:id="87" w:name="full-final-acceptance"/>
     <w:p>
       <w:pPr>
         <w:pStyle w:val="Heading2"/>
@@ -14394,7 +14563,7 @@
         <w:pStyle w:val="Compact"/>
         <w:numPr>
           <w:ilvl w:val="0"/>
-          <w:numId w:val="1645"/>
+          <w:numId w:val="1649"/>
         </w:numPr>
       </w:pPr>
       <w:r>
@@ -14406,7 +14575,7 @@
         <w:pStyle w:val="Compact"/>
         <w:numPr>
           <w:ilvl w:val="0"/>
-          <w:numId w:val="1646"/>
+          <w:numId w:val="1650"/>
         </w:numPr>
       </w:pPr>
       <w:r>
@@ -14418,7 +14587,7 @@
         <w:pStyle w:val="Compact"/>
         <w:numPr>
           <w:ilvl w:val="0"/>
-          <w:numId w:val="1647"/>
+          <w:numId w:val="1651"/>
         </w:numPr>
       </w:pPr>
       <w:r>
@@ -14430,7 +14599,7 @@
         <w:pStyle w:val="Compact"/>
         <w:numPr>
           <w:ilvl w:val="0"/>
-          <w:numId w:val="1648"/>
+          <w:numId w:val="1652"/>
         </w:numPr>
       </w:pPr>
       <w:r>
@@ -14442,7 +14611,7 @@
         <w:pStyle w:val="Compact"/>
         <w:numPr>
           <w:ilvl w:val="0"/>
-          <w:numId w:val="1649"/>
+          <w:numId w:val="1653"/>
         </w:numPr>
       </w:pPr>
       <w:r>
@@ -14454,7 +14623,7 @@
         <w:pStyle w:val="Compact"/>
         <w:numPr>
           <w:ilvl w:val="0"/>
-          <w:numId w:val="1650"/>
+          <w:numId w:val="1654"/>
         </w:numPr>
       </w:pPr>
       <w:r>
@@ -14466,7 +14635,7 @@
         <w:pStyle w:val="Compact"/>
         <w:numPr>
           <w:ilvl w:val="0"/>
-          <w:numId w:val="1651"/>
+          <w:numId w:val="1655"/>
         </w:numPr>
       </w:pPr>
       <w:r>
@@ -14478,7 +14647,7 @@
         <w:pStyle w:val="Compact"/>
         <w:numPr>
           <w:ilvl w:val="0"/>
-          <w:numId w:val="1652"/>
+          <w:numId w:val="1656"/>
         </w:numPr>
       </w:pPr>
       <w:r>
@@ -14490,7 +14659,7 @@
         <w:pStyle w:val="Compact"/>
         <w:numPr>
           <w:ilvl w:val="0"/>
-          <w:numId w:val="1653"/>
+          <w:numId w:val="1657"/>
         </w:numPr>
       </w:pPr>
       <w:r>
@@ -14502,7 +14671,7 @@
         <w:pStyle w:val="Compact"/>
         <w:numPr>
           <w:ilvl w:val="0"/>
-          <w:numId w:val="1654"/>
+          <w:numId w:val="1658"/>
         </w:numPr>
       </w:pPr>
       <w:r>
@@ -14514,15 +14683,15 @@
         <w:pStyle w:val="Compact"/>
         <w:numPr>
           <w:ilvl w:val="0"/>
-          <w:numId w:val="1655"/>
+          <w:numId w:val="1659"/>
         </w:numPr>
       </w:pPr>
       <w:r>
         <w:t xml:space="preserve">Final client-facing summary prepared with what changed, how it was tested, and what is intentionally out of scope.</w:t>
       </w:r>
     </w:p>
-    <w:bookmarkEnd w:id="86"/>
-    <w:bookmarkStart w:id="87" w:name="progress-update-log"/>
+    <w:bookmarkEnd w:id="87"/>
+    <w:bookmarkStart w:id="88" w:name="progress-update-log"/>
     <w:p>
       <w:pPr>
         <w:pStyle w:val="Heading2"/>
@@ -14665,8 +14834,8 @@
         </w:tc>
       </w:tr>
     </w:tbl>
-    <w:bookmarkEnd w:id="87"/>
     <w:bookmarkEnd w:id="88"/>
+    <w:bookmarkEnd w:id="89"/>
     <w:sectPr>
       <w:footnotePr>
         <w:numRestart w:val="eachSect"/>
@@ -16221,16 +16390,16 @@
     <w:abstractNumId w:val="993"/>
   </w:num>
   <w:num w:numId="1396">
-    <w:abstractNumId w:val="992"/>
+    <w:abstractNumId w:val="993"/>
   </w:num>
   <w:num w:numId="1397">
-    <w:abstractNumId w:val="992"/>
+    <w:abstractNumId w:val="993"/>
   </w:num>
   <w:num w:numId="1398">
     <w:abstractNumId w:val="992"/>
   </w:num>
   <w:num w:numId="1399">
-    <w:abstractNumId w:val="992"/>
+    <w:abstractNumId w:val="993"/>
   </w:num>
   <w:num w:numId="1400">
     <w:abstractNumId w:val="992"/>
@@ -16302,28 +16471,28 @@
     <w:abstractNumId w:val="992"/>
   </w:num>
   <w:num w:numId="1423">
-    <w:abstractNumId w:val="992"/>
+    <w:abstractNumId w:val="993"/>
   </w:num>
   <w:num w:numId="1424">
     <w:abstractNumId w:val="992"/>
   </w:num>
   <w:num w:numId="1425">
-    <w:abstractNumId w:val="993"/>
+    <w:abstractNumId w:val="992"/>
   </w:num>
   <w:num w:numId="1426">
-    <w:abstractNumId w:val="993"/>
+    <w:abstractNumId w:val="992"/>
   </w:num>
   <w:num w:numId="1427">
-    <w:abstractNumId w:val="993"/>
+    <w:abstractNumId w:val="992"/>
   </w:num>
   <w:num w:numId="1428">
-    <w:abstractNumId w:val="993"/>
+    <w:abstractNumId w:val="992"/>
   </w:num>
   <w:num w:numId="1429">
-    <w:abstractNumId w:val="992"/>
+    <w:abstractNumId w:val="993"/>
   </w:num>
   <w:num w:numId="1430">
-    <w:abstractNumId w:val="992"/>
+    <w:abstractNumId w:val="993"/>
   </w:num>
   <w:num w:numId="1431">
     <w:abstractNumId w:val="993"/>
@@ -16332,10 +16501,10 @@
     <w:abstractNumId w:val="993"/>
   </w:num>
   <w:num w:numId="1433">
-    <w:abstractNumId w:val="993"/>
+    <w:abstractNumId w:val="992"/>
   </w:num>
   <w:num w:numId="1434">
-    <w:abstractNumId w:val="993"/>
+    <w:abstractNumId w:val="992"/>
   </w:num>
   <w:num w:numId="1435">
     <w:abstractNumId w:val="993"/>
@@ -16368,34 +16537,34 @@
     <w:abstractNumId w:val="993"/>
   </w:num>
   <w:num w:numId="1445">
-    <w:abstractNumId w:val="992"/>
+    <w:abstractNumId w:val="993"/>
   </w:num>
   <w:num w:numId="1446">
+    <w:abstractNumId w:val="993"/>
+  </w:num>
+  <w:num w:numId="1447">
+    <w:abstractNumId w:val="993"/>
+  </w:num>
+  <w:num w:numId="1448">
+    <w:abstractNumId w:val="993"/>
+  </w:num>
+  <w:num w:numId="1449">
+    <w:abstractNumId w:val="992"/>
+  </w:num>
+  <w:num w:numId="1450">
     <w:abstractNumId w:val="991"/>
   </w:num>
-  <w:num w:numId="1447">
-    <w:abstractNumId w:val="993"/>
-  </w:num>
-  <w:num w:numId="1448">
-    <w:abstractNumId w:val="993"/>
-  </w:num>
-  <w:num w:numId="1449">
-    <w:abstractNumId w:val="992"/>
-  </w:num>
-  <w:num w:numId="1450">
-    <w:abstractNumId w:val="992"/>
-  </w:num>
   <w:num w:numId="1451">
-    <w:abstractNumId w:val="992"/>
+    <w:abstractNumId w:val="993"/>
   </w:num>
   <w:num w:numId="1452">
-    <w:abstractNumId w:val="992"/>
+    <w:abstractNumId w:val="993"/>
   </w:num>
   <w:num w:numId="1453">
     <w:abstractNumId w:val="992"/>
   </w:num>
   <w:num w:numId="1454">
-    <w:abstractNumId w:val="993"/>
+    <w:abstractNumId w:val="992"/>
   </w:num>
   <w:num w:numId="1455">
     <w:abstractNumId w:val="992"/>
@@ -16404,16 +16573,16 @@
     <w:abstractNumId w:val="992"/>
   </w:num>
   <w:num w:numId="1457">
-    <w:abstractNumId w:val="993"/>
+    <w:abstractNumId w:val="992"/>
   </w:num>
   <w:num w:numId="1458">
     <w:abstractNumId w:val="993"/>
   </w:num>
   <w:num w:numId="1459">
-    <w:abstractNumId w:val="993"/>
+    <w:abstractNumId w:val="992"/>
   </w:num>
   <w:num w:numId="1460">
-    <w:abstractNumId w:val="993"/>
+    <w:abstractNumId w:val="992"/>
   </w:num>
   <w:num w:numId="1461">
     <w:abstractNumId w:val="993"/>
@@ -16446,7 +16615,7 @@
     <w:abstractNumId w:val="993"/>
   </w:num>
   <w:num w:numId="1471">
-    <w:abstractNumId w:val="991"/>
+    <w:abstractNumId w:val="993"/>
   </w:num>
   <w:num w:numId="1472">
     <w:abstractNumId w:val="993"/>
@@ -16467,35 +16636,35 @@
     <w:abstractNumId w:val="993"/>
   </w:num>
   <w:num w:numId="1478">
-    <w:abstractNumId w:val="992"/>
+    <w:abstractNumId w:val="993"/>
   </w:num>
   <w:num w:numId="1479">
-    <w:abstractNumId w:val="992"/>
+    <w:abstractNumId w:val="991"/>
   </w:num>
   <w:num w:numId="1480">
     <w:abstractNumId w:val="993"/>
   </w:num>
   <w:num w:numId="1481">
+    <w:abstractNumId w:val="993"/>
+  </w:num>
+  <w:num w:numId="1482">
+    <w:abstractNumId w:val="992"/>
+  </w:num>
+  <w:num w:numId="1483">
+    <w:abstractNumId w:val="992"/>
+  </w:num>
+  <w:num w:numId="1484">
+    <w:abstractNumId w:val="993"/>
+  </w:num>
+  <w:num w:numId="1485">
     <w:abstractNumId w:val="991"/>
   </w:num>
-  <w:num w:numId="1482">
-    <w:abstractNumId w:val="993"/>
-  </w:num>
-  <w:num w:numId="1483">
+  <w:num w:numId="1486">
+    <w:abstractNumId w:val="993"/>
+  </w:num>
+  <w:num w:numId="1487">
     <w:abstractNumId w:val="991"/>
   </w:num>
-  <w:num w:numId="1484">
-    <w:abstractNumId w:val="993"/>
-  </w:num>
-  <w:num w:numId="1485">
-    <w:abstractNumId w:val="993"/>
-  </w:num>
-  <w:num w:numId="1486">
-    <w:abstractNumId w:val="993"/>
-  </w:num>
-  <w:num w:numId="1487">
-    <w:abstractNumId w:val="993"/>
-  </w:num>
   <w:num w:numId="1488">
     <w:abstractNumId w:val="993"/>
   </w:num>
@@ -16512,20 +16681,20 @@
     <w:abstractNumId w:val="993"/>
   </w:num>
   <w:num w:numId="1493">
+    <w:abstractNumId w:val="993"/>
+  </w:num>
+  <w:num w:numId="1494">
+    <w:abstractNumId w:val="993"/>
+  </w:num>
+  <w:num w:numId="1495">
+    <w:abstractNumId w:val="993"/>
+  </w:num>
+  <w:num w:numId="1496">
+    <w:abstractNumId w:val="993"/>
+  </w:num>
+  <w:num w:numId="1497">
     <w:abstractNumId w:val="991"/>
   </w:num>
-  <w:num w:numId="1494">
-    <w:abstractNumId w:val="993"/>
-  </w:num>
-  <w:num w:numId="1495">
-    <w:abstractNumId w:val="993"/>
-  </w:num>
-  <w:num w:numId="1496">
-    <w:abstractNumId w:val="992"/>
-  </w:num>
-  <w:num w:numId="1497">
-    <w:abstractNumId w:val="992"/>
-  </w:num>
   <w:num w:numId="1498">
     <w:abstractNumId w:val="993"/>
   </w:num>
@@ -16533,22 +16702,22 @@
     <w:abstractNumId w:val="993"/>
   </w:num>
   <w:num w:numId="1500">
-    <w:abstractNumId w:val="993"/>
+    <w:abstractNumId w:val="992"/>
   </w:num>
   <w:num w:numId="1501">
     <w:abstractNumId w:val="992"/>
   </w:num>
   <w:num w:numId="1502">
-    <w:abstractNumId w:val="992"/>
+    <w:abstractNumId w:val="993"/>
   </w:num>
   <w:num w:numId="1503">
-    <w:abstractNumId w:val="992"/>
+    <w:abstractNumId w:val="993"/>
   </w:num>
   <w:num w:numId="1504">
-    <w:abstractNumId w:val="992"/>
+    <w:abstractNumId w:val="993"/>
   </w:num>
   <w:num w:numId="1505">
-    <w:abstractNumId w:val="993"/>
+    <w:abstractNumId w:val="992"/>
   </w:num>
   <w:num w:numId="1506">
     <w:abstractNumId w:val="992"/>
@@ -16557,16 +16726,16 @@
     <w:abstractNumId w:val="992"/>
   </w:num>
   <w:num w:numId="1508">
-    <w:abstractNumId w:val="993"/>
+    <w:abstractNumId w:val="992"/>
   </w:num>
   <w:num w:numId="1509">
     <w:abstractNumId w:val="993"/>
   </w:num>
   <w:num w:numId="1510">
-    <w:abstractNumId w:val="993"/>
+    <w:abstractNumId w:val="992"/>
   </w:num>
   <w:num w:numId="1511">
-    <w:abstractNumId w:val="993"/>
+    <w:abstractNumId w:val="992"/>
   </w:num>
   <w:num w:numId="1512">
     <w:abstractNumId w:val="993"/>
@@ -16617,20 +16786,20 @@
     <w:abstractNumId w:val="993"/>
   </w:num>
   <w:num w:numId="1528">
+    <w:abstractNumId w:val="993"/>
+  </w:num>
+  <w:num w:numId="1529">
+    <w:abstractNumId w:val="993"/>
+  </w:num>
+  <w:num w:numId="1530">
+    <w:abstractNumId w:val="993"/>
+  </w:num>
+  <w:num w:numId="1531">
+    <w:abstractNumId w:val="993"/>
+  </w:num>
+  <w:num w:numId="1532">
     <w:abstractNumId w:val="991"/>
   </w:num>
-  <w:num w:numId="1529">
-    <w:abstractNumId w:val="992"/>
-  </w:num>
-  <w:num w:numId="1530">
-    <w:abstractNumId w:val="992"/>
-  </w:num>
-  <w:num w:numId="1531">
-    <w:abstractNumId w:val="992"/>
-  </w:num>
-  <w:num w:numId="1532">
-    <w:abstractNumId w:val="992"/>
-  </w:num>
   <w:num w:numId="1533">
     <w:abstractNumId w:val="992"/>
   </w:num>
@@ -16668,44 +16837,44 @@
     <w:abstractNumId w:val="992"/>
   </w:num>
   <w:num w:numId="1545">
-    <w:abstractNumId w:val="993"/>
+    <w:abstractNumId w:val="992"/>
   </w:num>
   <w:num w:numId="1546">
-    <w:abstractNumId w:val="993"/>
+    <w:abstractNumId w:val="992"/>
   </w:num>
   <w:num w:numId="1547">
-    <w:abstractNumId w:val="993"/>
+    <w:abstractNumId w:val="992"/>
   </w:num>
   <w:num w:numId="1548">
-    <w:abstractNumId w:val="993"/>
+    <w:abstractNumId w:val="992"/>
   </w:num>
   <w:num w:numId="1549">
     <w:abstractNumId w:val="993"/>
   </w:num>
   <w:num w:numId="1550">
+    <w:abstractNumId w:val="993"/>
+  </w:num>
+  <w:num w:numId="1551">
+    <w:abstractNumId w:val="993"/>
+  </w:num>
+  <w:num w:numId="1552">
+    <w:abstractNumId w:val="993"/>
+  </w:num>
+  <w:num w:numId="1553">
+    <w:abstractNumId w:val="993"/>
+  </w:num>
+  <w:num w:numId="1554">
     <w:abstractNumId w:val="991"/>
   </w:num>
-  <w:num w:numId="1551">
-    <w:abstractNumId w:val="993"/>
-  </w:num>
-  <w:num w:numId="1552">
-    <w:abstractNumId w:val="993"/>
-  </w:num>
-  <w:num w:numId="1553">
+  <w:num w:numId="1555">
+    <w:abstractNumId w:val="993"/>
+  </w:num>
+  <w:num w:numId="1556">
+    <w:abstractNumId w:val="993"/>
+  </w:num>
+  <w:num w:numId="1557">
     <w:abstractNumId w:val="991"/>
   </w:num>
-  <w:num w:numId="1554">
-    <w:abstractNumId w:val="993"/>
-  </w:num>
-  <w:num w:numId="1555">
-    <w:abstractNumId w:val="993"/>
-  </w:num>
-  <w:num w:numId="1556">
-    <w:abstractNumId w:val="993"/>
-  </w:num>
-  <w:num w:numId="1557">
-    <w:abstractNumId w:val="993"/>
-  </w:num>
   <w:num w:numId="1558">
     <w:abstractNumId w:val="993"/>
   </w:num>
@@ -16725,37 +16894,37 @@
     <w:abstractNumId w:val="993"/>
   </w:num>
   <w:num w:numId="1564">
+    <w:abstractNumId w:val="993"/>
+  </w:num>
+  <w:num w:numId="1565">
+    <w:abstractNumId w:val="993"/>
+  </w:num>
+  <w:num w:numId="1566">
+    <w:abstractNumId w:val="993"/>
+  </w:num>
+  <w:num w:numId="1567">
+    <w:abstractNumId w:val="993"/>
+  </w:num>
+  <w:num w:numId="1568">
     <w:abstractNumId w:val="991"/>
   </w:num>
-  <w:num w:numId="1565">
-    <w:abstractNumId w:val="993"/>
-  </w:num>
-  <w:num w:numId="1566">
+  <w:num w:numId="1569">
+    <w:abstractNumId w:val="993"/>
+  </w:num>
+  <w:num w:numId="1570">
     <w:abstractNumId w:val="991"/>
   </w:num>
-  <w:num w:numId="1567">
-    <w:abstractNumId w:val="993"/>
-  </w:num>
-  <w:num w:numId="1568">
-    <w:abstractNumId w:val="993"/>
-  </w:num>
-  <w:num w:numId="1569">
-    <w:abstractNumId w:val="993"/>
-  </w:num>
-  <w:num w:numId="1570">
-    <w:abstractNumId w:val="993"/>
-  </w:num>
   <w:num w:numId="1571">
-    <w:abstractNumId w:val="992"/>
+    <w:abstractNumId w:val="993"/>
   </w:num>
   <w:num w:numId="1572">
-    <w:abstractNumId w:val="992"/>
+    <w:abstractNumId w:val="993"/>
   </w:num>
   <w:num w:numId="1573">
     <w:abstractNumId w:val="993"/>
   </w:num>
   <w:num w:numId="1574">
-    <w:abstractNumId w:val="992"/>
+    <w:abstractNumId w:val="993"/>
   </w:num>
   <w:num w:numId="1575">
     <w:abstractNumId w:val="992"/>
@@ -16764,7 +16933,7 @@
     <w:abstractNumId w:val="992"/>
   </w:num>
   <w:num w:numId="1577">
-    <w:abstractNumId w:val="992"/>
+    <w:abstractNumId w:val="993"/>
   </w:num>
   <w:num w:numId="1578">
     <w:abstractNumId w:val="992"/>
@@ -16773,16 +16942,16 @@
     <w:abstractNumId w:val="992"/>
   </w:num>
   <w:num w:numId="1580">
-    <w:abstractNumId w:val="993"/>
+    <w:abstractNumId w:val="992"/>
   </w:num>
   <w:num w:numId="1581">
-    <w:abstractNumId w:val="993"/>
+    <w:abstractNumId w:val="992"/>
   </w:num>
   <w:num w:numId="1582">
-    <w:abstractNumId w:val="993"/>
+    <w:abstractNumId w:val="992"/>
   </w:num>
   <w:num w:numId="1583">
-    <w:abstractNumId w:val="993"/>
+    <w:abstractNumId w:val="992"/>
   </w:num>
   <w:num w:numId="1584">
     <w:abstractNumId w:val="993"/>
@@ -16794,7 +16963,7 @@
     <w:abstractNumId w:val="993"/>
   </w:num>
   <w:num w:numId="1587">
-    <w:abstractNumId w:val="992"/>
+    <w:abstractNumId w:val="993"/>
   </w:num>
   <w:num w:numId="1588">
     <w:abstractNumId w:val="993"/>
@@ -16830,7 +16999,7 @@
     <w:abstractNumId w:val="993"/>
   </w:num>
   <w:num w:numId="1599">
-    <w:abstractNumId w:val="993"/>
+    <w:abstractNumId w:val="992"/>
   </w:num>
   <w:num w:numId="1600">
     <w:abstractNumId w:val="993"/>
@@ -16839,43 +17008,43 @@
     <w:abstractNumId w:val="993"/>
   </w:num>
   <w:num w:numId="1602">
-    <w:abstractNumId w:val="992"/>
+    <w:abstractNumId w:val="993"/>
   </w:num>
   <w:num w:numId="1603">
     <w:abstractNumId w:val="993"/>
   </w:num>
   <w:num w:numId="1604">
-    <w:abstractNumId w:val="992"/>
+    <w:abstractNumId w:val="993"/>
   </w:num>
   <w:num w:numId="1605">
-    <w:abstractNumId w:val="992"/>
+    <w:abstractNumId w:val="993"/>
   </w:num>
   <w:num w:numId="1606">
-    <w:abstractNumId w:val="993"/>
+    <w:abstractNumId w:val="992"/>
   </w:num>
   <w:num w:numId="1607">
     <w:abstractNumId w:val="993"/>
   </w:num>
   <w:num w:numId="1608">
-    <w:abstractNumId w:val="993"/>
+    <w:abstractNumId w:val="992"/>
   </w:num>
   <w:num w:numId="1609">
-    <w:abstractNumId w:val="993"/>
+    <w:abstractNumId w:val="992"/>
   </w:num>
   <w:num w:numId="1610">
-    <w:abstractNumId w:val="992"/>
+    <w:abstractNumId w:val="993"/>
   </w:num>
   <w:num w:numId="1611">
-    <w:abstractNumId w:val="992"/>
+    <w:abstractNumId w:val="993"/>
   </w:num>
   <w:num w:numId="1612">
-    <w:abstractNumId w:val="992"/>
+    <w:abstractNumId w:val="993"/>
   </w:num>
   <w:num w:numId="1613">
-    <w:abstractNumId w:val="992"/>
+    <w:abstractNumId w:val="993"/>
   </w:num>
   <w:num w:numId="1614">
-    <w:abstractNumId w:val="993"/>
+    <w:abstractNumId w:val="992"/>
   </w:num>
   <w:num w:numId="1615">
     <w:abstractNumId w:val="992"/>
@@ -16887,7 +17056,7 @@
     <w:abstractNumId w:val="992"/>
   </w:num>
   <w:num w:numId="1618">
-    <w:abstractNumId w:val="992"/>
+    <w:abstractNumId w:val="993"/>
   </w:num>
   <w:num w:numId="1619">
     <w:abstractNumId w:val="992"/>
@@ -16998,6 +17167,18 @@
     <w:abstractNumId w:val="992"/>
   </w:num>
   <w:num w:numId="1655">
+    <w:abstractNumId w:val="992"/>
+  </w:num>
+  <w:num w:numId="1656">
+    <w:abstractNumId w:val="992"/>
+  </w:num>
+  <w:num w:numId="1657">
+    <w:abstractNumId w:val="992"/>
+  </w:num>
+  <w:num w:numId="1658">
+    <w:abstractNumId w:val="992"/>
+  </w:num>
+  <w:num w:numId="1659">
     <w:abstractNumId w:val="992"/>
   </w:num>
 </w:numbering>

</xml_diff>

<commit_message>
Record M1.6 browser smoke gate
</commit_message>
<xml_diff>
--- a/MASTER_M1_M2_DELIVERY_CHECKLIST.docx
+++ b/MASTER_M1_M2_DELIVERY_CHECKLIST.docx
@@ -457,7 +457,7 @@
               <w:jc w:val="right"/>
             </w:pPr>
             <w:r>
-              <w:t xml:space="preserve">1%</w:t>
+              <w:t xml:space="preserve">3%</w:t>
             </w:r>
           </w:p>
         </w:tc>
@@ -468,7 +468,7 @@
               <w:pStyle w:val="Compact"/>
             </w:pPr>
             <w:r>
-              <w:t xml:space="preserve">Initial build gate passed; full server suite blocked by local DB/Redis env</w:t>
+              <w:t xml:space="preserve">Build gate and browser smoke passed; full-env DB/Redis, drag/drop, and release gates remain</w:t>
             </w:r>
           </w:p>
         </w:tc>
@@ -709,7 +709,7 @@
                 <w:b/>
                 <w:bCs/>
               </w:rPr>
-              <w:t xml:space="preserve">68%</w:t>
+              <w:t xml:space="preserve">70%</w:t>
             </w:r>
           </w:p>
         </w:tc>
@@ -724,7 +724,7 @@
                 <w:b/>
                 <w:bCs/>
               </w:rPr>
-              <w:t xml:space="preserve">M1.6 initial build evidence added; browser/full-env regression gates remain</w:t>
+              <w:t xml:space="preserve">M1.6 build/browser smoke evidence added; full-env regression gates remain</w:t>
             </w:r>
           </w:p>
         </w:tc>
@@ -10067,6 +10067,54 @@
         <w:t xml:space="preserve">M1.5 focused backend regression remains green: 18/18 focused tests passed before opening M1.6 gate.</w:t>
       </w:r>
     </w:p>
+    <w:p>
+      <w:pPr>
+        <w:pStyle w:val="Compact"/>
+        <w:numPr>
+          <w:ilvl w:val="0"/>
+          <w:numId w:val="1400"/>
+        </w:numPr>
+      </w:pPr>
+      <w:r>
+        <w:t xml:space="preserve">Browser smoke evidence added:</w:t>
+      </w:r>
+      <w:r>
+        <w:t xml:space="preserve"> </w:t>
+      </w:r>
+      <w:r>
+        <w:rPr>
+          <w:rStyle w:val="VerbatimChar"/>
+        </w:rPr>
+        <w:t xml:space="preserve">audit-screenshots/m16-browser-smoke-evidence.json</w:t>
+      </w:r>
+      <w:r>
+        <w:t xml:space="preserve">.</w:t>
+      </w:r>
+    </w:p>
+    <w:p>
+      <w:pPr>
+        <w:pStyle w:val="Compact"/>
+        <w:numPr>
+          <w:ilvl w:val="0"/>
+          <w:numId w:val="1401"/>
+        </w:numPr>
+      </w:pPr>
+      <w:r>
+        <w:t xml:space="preserve">Production preview + mock API browser smoke passed 4/4: OTP login redirect, Pipeline simple mode, Pipeline execution mode, and DealCard/DealPanel smoke.</w:t>
+      </w:r>
+    </w:p>
+    <w:p>
+      <w:pPr>
+        <w:pStyle w:val="Compact"/>
+        <w:numPr>
+          <w:ilvl w:val="0"/>
+          <w:numId w:val="1402"/>
+        </w:numPr>
+      </w:pPr>
+      <w:r>
+        <w:t xml:space="preserve">Browser smoke captured no console errors and no request failures inside gate scope; local ignored screenshots were generated for login, simple pipeline, execution pipeline, and deal panel.</w:t>
+      </w:r>
+    </w:p>
     <w:bookmarkEnd w:id="54"/>
     <w:bookmarkStart w:id="55" w:name="functional-regression"/>
     <w:p>
@@ -10082,7 +10130,7 @@
         <w:pStyle w:val="Compact"/>
         <w:numPr>
           <w:ilvl w:val="0"/>
-          <w:numId w:val="1400"/>
+          <w:numId w:val="1403"/>
         </w:numPr>
       </w:pPr>
       <w:r>
@@ -10094,7 +10142,7 @@
         <w:pStyle w:val="Compact"/>
         <w:numPr>
           <w:ilvl w:val="0"/>
-          <w:numId w:val="1401"/>
+          <w:numId w:val="1404"/>
         </w:numPr>
       </w:pPr>
       <w:r>
@@ -10106,7 +10154,7 @@
         <w:pStyle w:val="Compact"/>
         <w:numPr>
           <w:ilvl w:val="0"/>
-          <w:numId w:val="1402"/>
+          <w:numId w:val="1405"/>
         </w:numPr>
       </w:pPr>
       <w:r>
@@ -10118,7 +10166,7 @@
         <w:pStyle w:val="Compact"/>
         <w:numPr>
           <w:ilvl w:val="0"/>
-          <w:numId w:val="1403"/>
+          <w:numId w:val="1406"/>
         </w:numPr>
       </w:pPr>
       <w:r>
@@ -10130,7 +10178,7 @@
         <w:pStyle w:val="Compact"/>
         <w:numPr>
           <w:ilvl w:val="0"/>
-          <w:numId w:val="1404"/>
+          <w:numId w:val="1407"/>
         </w:numPr>
       </w:pPr>
       <w:r>
@@ -10142,7 +10190,7 @@
         <w:pStyle w:val="Compact"/>
         <w:numPr>
           <w:ilvl w:val="0"/>
-          <w:numId w:val="1405"/>
+          <w:numId w:val="1408"/>
         </w:numPr>
       </w:pPr>
       <w:r>
@@ -10154,7 +10202,7 @@
         <w:pStyle w:val="Compact"/>
         <w:numPr>
           <w:ilvl w:val="0"/>
-          <w:numId w:val="1406"/>
+          <w:numId w:val="1409"/>
         </w:numPr>
       </w:pPr>
       <w:r>
@@ -10166,7 +10214,7 @@
         <w:pStyle w:val="Compact"/>
         <w:numPr>
           <w:ilvl w:val="0"/>
-          <w:numId w:val="1407"/>
+          <w:numId w:val="1410"/>
         </w:numPr>
       </w:pPr>
       <w:r>
@@ -10178,7 +10226,7 @@
         <w:pStyle w:val="Compact"/>
         <w:numPr>
           <w:ilvl w:val="0"/>
-          <w:numId w:val="1408"/>
+          <w:numId w:val="1411"/>
         </w:numPr>
       </w:pPr>
       <w:r>
@@ -10190,7 +10238,7 @@
         <w:pStyle w:val="Compact"/>
         <w:numPr>
           <w:ilvl w:val="0"/>
-          <w:numId w:val="1409"/>
+          <w:numId w:val="1412"/>
         </w:numPr>
       </w:pPr>
       <w:r>
@@ -10202,7 +10250,7 @@
         <w:pStyle w:val="Compact"/>
         <w:numPr>
           <w:ilvl w:val="0"/>
-          <w:numId w:val="1410"/>
+          <w:numId w:val="1413"/>
         </w:numPr>
       </w:pPr>
       <w:r>
@@ -10214,7 +10262,7 @@
         <w:pStyle w:val="Compact"/>
         <w:numPr>
           <w:ilvl w:val="0"/>
-          <w:numId w:val="1411"/>
+          <w:numId w:val="1414"/>
         </w:numPr>
       </w:pPr>
       <w:r>
@@ -10226,7 +10274,7 @@
         <w:pStyle w:val="Compact"/>
         <w:numPr>
           <w:ilvl w:val="0"/>
-          <w:numId w:val="1412"/>
+          <w:numId w:val="1415"/>
         </w:numPr>
       </w:pPr>
       <w:r>
@@ -10238,7 +10286,7 @@
         <w:pStyle w:val="Compact"/>
         <w:numPr>
           <w:ilvl w:val="0"/>
-          <w:numId w:val="1413"/>
+          <w:numId w:val="1416"/>
         </w:numPr>
       </w:pPr>
       <w:r>
@@ -10250,7 +10298,7 @@
         <w:pStyle w:val="Compact"/>
         <w:numPr>
           <w:ilvl w:val="0"/>
-          <w:numId w:val="1414"/>
+          <w:numId w:val="1417"/>
         </w:numPr>
       </w:pPr>
       <w:r>
@@ -10272,7 +10320,7 @@
         <w:pStyle w:val="Compact"/>
         <w:numPr>
           <w:ilvl w:val="0"/>
-          <w:numId w:val="1415"/>
+          <w:numId w:val="1418"/>
         </w:numPr>
       </w:pPr>
       <w:r>
@@ -10284,7 +10332,7 @@
         <w:pStyle w:val="Compact"/>
         <w:numPr>
           <w:ilvl w:val="0"/>
-          <w:numId w:val="1416"/>
+          <w:numId w:val="1419"/>
         </w:numPr>
       </w:pPr>
       <w:r>
@@ -10296,7 +10344,7 @@
         <w:pStyle w:val="Compact"/>
         <w:numPr>
           <w:ilvl w:val="0"/>
-          <w:numId w:val="1417"/>
+          <w:numId w:val="1420"/>
         </w:numPr>
       </w:pPr>
       <w:r>
@@ -10308,7 +10356,7 @@
         <w:pStyle w:val="Compact"/>
         <w:numPr>
           <w:ilvl w:val="0"/>
-          <w:numId w:val="1418"/>
+          <w:numId w:val="1421"/>
         </w:numPr>
       </w:pPr>
       <w:r>
@@ -10320,7 +10368,7 @@
         <w:pStyle w:val="Compact"/>
         <w:numPr>
           <w:ilvl w:val="0"/>
-          <w:numId w:val="1419"/>
+          <w:numId w:val="1422"/>
         </w:numPr>
       </w:pPr>
       <w:r>
@@ -10332,7 +10380,7 @@
         <w:pStyle w:val="Compact"/>
         <w:numPr>
           <w:ilvl w:val="0"/>
-          <w:numId w:val="1420"/>
+          <w:numId w:val="1423"/>
         </w:numPr>
       </w:pPr>
       <w:r>
@@ -10344,7 +10392,7 @@
         <w:pStyle w:val="Compact"/>
         <w:numPr>
           <w:ilvl w:val="0"/>
-          <w:numId w:val="1421"/>
+          <w:numId w:val="1424"/>
         </w:numPr>
       </w:pPr>
       <w:r>
@@ -10366,7 +10414,7 @@
         <w:pStyle w:val="Compact"/>
         <w:numPr>
           <w:ilvl w:val="0"/>
-          <w:numId w:val="1422"/>
+          <w:numId w:val="1425"/>
         </w:numPr>
       </w:pPr>
       <w:r>
@@ -10378,7 +10426,7 @@
         <w:pStyle w:val="Compact"/>
         <w:numPr>
           <w:ilvl w:val="0"/>
-          <w:numId w:val="1423"/>
+          <w:numId w:val="1426"/>
         </w:numPr>
       </w:pPr>
       <w:r>
@@ -10390,7 +10438,7 @@
         <w:pStyle w:val="Compact"/>
         <w:numPr>
           <w:ilvl w:val="0"/>
-          <w:numId w:val="1424"/>
+          <w:numId w:val="1427"/>
         </w:numPr>
       </w:pPr>
       <w:r>
@@ -10402,7 +10450,7 @@
         <w:pStyle w:val="Compact"/>
         <w:numPr>
           <w:ilvl w:val="0"/>
-          <w:numId w:val="1425"/>
+          <w:numId w:val="1428"/>
         </w:numPr>
       </w:pPr>
       <w:r>
@@ -10414,7 +10462,7 @@
         <w:pStyle w:val="Compact"/>
         <w:numPr>
           <w:ilvl w:val="0"/>
-          <w:numId w:val="1426"/>
+          <w:numId w:val="1429"/>
         </w:numPr>
       </w:pPr>
       <w:r>
@@ -10426,7 +10474,7 @@
         <w:pStyle w:val="Compact"/>
         <w:numPr>
           <w:ilvl w:val="0"/>
-          <w:numId w:val="1427"/>
+          <w:numId w:val="1430"/>
         </w:numPr>
       </w:pPr>
       <w:r>
@@ -10438,7 +10486,7 @@
         <w:pStyle w:val="Compact"/>
         <w:numPr>
           <w:ilvl w:val="0"/>
-          <w:numId w:val="1428"/>
+          <w:numId w:val="1431"/>
         </w:numPr>
       </w:pPr>
       <w:r>
@@ -10470,7 +10518,7 @@
         <w:pStyle w:val="Compact"/>
         <w:numPr>
           <w:ilvl w:val="0"/>
-          <w:numId w:val="1429"/>
+          <w:numId w:val="1432"/>
         </w:numPr>
       </w:pPr>
       <w:r>
@@ -10542,7 +10590,7 @@
         <w:pStyle w:val="Compact"/>
         <w:numPr>
           <w:ilvl w:val="0"/>
-          <w:numId w:val="1430"/>
+          <w:numId w:val="1433"/>
         </w:numPr>
       </w:pPr>
       <w:r>
@@ -10554,7 +10602,7 @@
         <w:pStyle w:val="Compact"/>
         <w:numPr>
           <w:ilvl w:val="0"/>
-          <w:numId w:val="1431"/>
+          <w:numId w:val="1434"/>
         </w:numPr>
       </w:pPr>
       <w:r>
@@ -10581,7 +10629,7 @@
         <w:pStyle w:val="Compact"/>
         <w:numPr>
           <w:ilvl w:val="0"/>
-          <w:numId w:val="1432"/>
+          <w:numId w:val="1435"/>
         </w:numPr>
       </w:pPr>
       <w:r>
@@ -10635,7 +10683,7 @@
         <w:pStyle w:val="Compact"/>
         <w:numPr>
           <w:ilvl w:val="0"/>
-          <w:numId w:val="1433"/>
+          <w:numId w:val="1436"/>
         </w:numPr>
       </w:pPr>
       <w:r>
@@ -10647,7 +10695,7 @@
         <w:pStyle w:val="Compact"/>
         <w:numPr>
           <w:ilvl w:val="0"/>
-          <w:numId w:val="1434"/>
+          <w:numId w:val="1437"/>
         </w:numPr>
       </w:pPr>
       <w:r>
@@ -10669,7 +10717,7 @@
         <w:pStyle w:val="Compact"/>
         <w:numPr>
           <w:ilvl w:val="0"/>
-          <w:numId w:val="1435"/>
+          <w:numId w:val="1438"/>
         </w:numPr>
       </w:pPr>
       <w:r>
@@ -10720,7 +10768,7 @@
         <w:pStyle w:val="Compact"/>
         <w:numPr>
           <w:ilvl w:val="0"/>
-          <w:numId w:val="1436"/>
+          <w:numId w:val="1439"/>
         </w:numPr>
       </w:pPr>
       <w:r>
@@ -10747,7 +10795,7 @@
         <w:pStyle w:val="Compact"/>
         <w:numPr>
           <w:ilvl w:val="0"/>
-          <w:numId w:val="1437"/>
+          <w:numId w:val="1440"/>
         </w:numPr>
       </w:pPr>
       <w:r>
@@ -10759,7 +10807,7 @@
         <w:pStyle w:val="Compact"/>
         <w:numPr>
           <w:ilvl w:val="0"/>
-          <w:numId w:val="1438"/>
+          <w:numId w:val="1441"/>
         </w:numPr>
       </w:pPr>
       <w:r>
@@ -10786,7 +10834,7 @@
         <w:pStyle w:val="Compact"/>
         <w:numPr>
           <w:ilvl w:val="0"/>
-          <w:numId w:val="1439"/>
+          <w:numId w:val="1442"/>
         </w:numPr>
       </w:pPr>
       <w:r>
@@ -10798,7 +10846,7 @@
         <w:pStyle w:val="Compact"/>
         <w:numPr>
           <w:ilvl w:val="0"/>
-          <w:numId w:val="1440"/>
+          <w:numId w:val="1443"/>
         </w:numPr>
       </w:pPr>
       <w:r>
@@ -10810,7 +10858,7 @@
         <w:pStyle w:val="Compact"/>
         <w:numPr>
           <w:ilvl w:val="0"/>
-          <w:numId w:val="1441"/>
+          <w:numId w:val="1444"/>
         </w:numPr>
       </w:pPr>
       <w:r>
@@ -10832,7 +10880,7 @@
         <w:pStyle w:val="Compact"/>
         <w:numPr>
           <w:ilvl w:val="0"/>
-          <w:numId w:val="1442"/>
+          <w:numId w:val="1445"/>
         </w:numPr>
       </w:pPr>
       <w:r>
@@ -10856,7 +10904,7 @@
         <w:pStyle w:val="Compact"/>
         <w:numPr>
           <w:ilvl w:val="0"/>
-          <w:numId w:val="1443"/>
+          <w:numId w:val="1446"/>
         </w:numPr>
       </w:pPr>
       <w:r>
@@ -10880,7 +10928,7 @@
         <w:pStyle w:val="Compact"/>
         <w:numPr>
           <w:ilvl w:val="0"/>
-          <w:numId w:val="1444"/>
+          <w:numId w:val="1447"/>
         </w:numPr>
       </w:pPr>
       <w:r>
@@ -10892,7 +10940,7 @@
         <w:pStyle w:val="Compact"/>
         <w:numPr>
           <w:ilvl w:val="0"/>
-          <w:numId w:val="1445"/>
+          <w:numId w:val="1448"/>
         </w:numPr>
       </w:pPr>
       <w:r>
@@ -10904,7 +10952,7 @@
         <w:pStyle w:val="Compact"/>
         <w:numPr>
           <w:ilvl w:val="0"/>
-          <w:numId w:val="1446"/>
+          <w:numId w:val="1449"/>
         </w:numPr>
       </w:pPr>
       <w:r>
@@ -10916,7 +10964,7 @@
         <w:pStyle w:val="Compact"/>
         <w:numPr>
           <w:ilvl w:val="0"/>
-          <w:numId w:val="1447"/>
+          <w:numId w:val="1450"/>
         </w:numPr>
       </w:pPr>
       <w:r>
@@ -10947,7 +10995,7 @@
         <w:pStyle w:val="Compact"/>
         <w:numPr>
           <w:ilvl w:val="0"/>
-          <w:numId w:val="1448"/>
+          <w:numId w:val="1451"/>
         </w:numPr>
       </w:pPr>
       <w:r>
@@ -10959,7 +11007,7 @@
         <w:pStyle w:val="Compact"/>
         <w:numPr>
           <w:ilvl w:val="0"/>
-          <w:numId w:val="1449"/>
+          <w:numId w:val="1452"/>
         </w:numPr>
       </w:pPr>
       <w:r>
@@ -10971,7 +11019,7 @@
         <w:pStyle w:val="Compact"/>
         <w:numPr>
           <w:ilvl w:val="1"/>
-          <w:numId w:val="1450"/>
+          <w:numId w:val="1453"/>
         </w:numPr>
       </w:pPr>
       <w:r>
@@ -10989,7 +11037,7 @@
         <w:pStyle w:val="Compact"/>
         <w:numPr>
           <w:ilvl w:val="1"/>
-          <w:numId w:val="1450"/>
+          <w:numId w:val="1453"/>
         </w:numPr>
       </w:pPr>
       <w:r>
@@ -11007,7 +11055,7 @@
         <w:pStyle w:val="Compact"/>
         <w:numPr>
           <w:ilvl w:val="1"/>
-          <w:numId w:val="1450"/>
+          <w:numId w:val="1453"/>
         </w:numPr>
       </w:pPr>
       <w:r>
@@ -11025,7 +11073,7 @@
         <w:pStyle w:val="Compact"/>
         <w:numPr>
           <w:ilvl w:val="1"/>
-          <w:numId w:val="1450"/>
+          <w:numId w:val="1453"/>
         </w:numPr>
       </w:pPr>
       <w:r>
@@ -11043,7 +11091,7 @@
         <w:pStyle w:val="Compact"/>
         <w:numPr>
           <w:ilvl w:val="0"/>
-          <w:numId w:val="1451"/>
+          <w:numId w:val="1454"/>
         </w:numPr>
       </w:pPr>
       <w:r>
@@ -11055,7 +11103,7 @@
         <w:pStyle w:val="Compact"/>
         <w:numPr>
           <w:ilvl w:val="0"/>
-          <w:numId w:val="1452"/>
+          <w:numId w:val="1455"/>
         </w:numPr>
       </w:pPr>
       <w:r>
@@ -11067,7 +11115,7 @@
         <w:pStyle w:val="Compact"/>
         <w:numPr>
           <w:ilvl w:val="0"/>
-          <w:numId w:val="1453"/>
+          <w:numId w:val="1456"/>
         </w:numPr>
       </w:pPr>
       <w:r>
@@ -11089,7 +11137,7 @@
         <w:pStyle w:val="Compact"/>
         <w:numPr>
           <w:ilvl w:val="0"/>
-          <w:numId w:val="1454"/>
+          <w:numId w:val="1457"/>
         </w:numPr>
       </w:pPr>
       <w:r>
@@ -11101,7 +11149,7 @@
         <w:pStyle w:val="Compact"/>
         <w:numPr>
           <w:ilvl w:val="0"/>
-          <w:numId w:val="1455"/>
+          <w:numId w:val="1458"/>
         </w:numPr>
       </w:pPr>
       <w:r>
@@ -11113,7 +11161,7 @@
         <w:pStyle w:val="Compact"/>
         <w:numPr>
           <w:ilvl w:val="0"/>
-          <w:numId w:val="1456"/>
+          <w:numId w:val="1459"/>
         </w:numPr>
       </w:pPr>
       <w:r>
@@ -11125,7 +11173,7 @@
         <w:pStyle w:val="Compact"/>
         <w:numPr>
           <w:ilvl w:val="0"/>
-          <w:numId w:val="1457"/>
+          <w:numId w:val="1460"/>
         </w:numPr>
       </w:pPr>
       <w:r>
@@ -11137,7 +11185,7 @@
         <w:pStyle w:val="Compact"/>
         <w:numPr>
           <w:ilvl w:val="0"/>
-          <w:numId w:val="1458"/>
+          <w:numId w:val="1461"/>
         </w:numPr>
       </w:pPr>
       <w:r>
@@ -11149,7 +11197,7 @@
         <w:pStyle w:val="Compact"/>
         <w:numPr>
           <w:ilvl w:val="0"/>
-          <w:numId w:val="1459"/>
+          <w:numId w:val="1462"/>
         </w:numPr>
       </w:pPr>
       <w:r>
@@ -11161,7 +11209,7 @@
         <w:pStyle w:val="Compact"/>
         <w:numPr>
           <w:ilvl w:val="0"/>
-          <w:numId w:val="1460"/>
+          <w:numId w:val="1463"/>
         </w:numPr>
       </w:pPr>
       <w:r>
@@ -11173,7 +11221,7 @@
         <w:pStyle w:val="Compact"/>
         <w:numPr>
           <w:ilvl w:val="0"/>
-          <w:numId w:val="1461"/>
+          <w:numId w:val="1464"/>
         </w:numPr>
       </w:pPr>
       <w:r>
@@ -11185,7 +11233,7 @@
         <w:pStyle w:val="Compact"/>
         <w:numPr>
           <w:ilvl w:val="0"/>
-          <w:numId w:val="1462"/>
+          <w:numId w:val="1465"/>
         </w:numPr>
       </w:pPr>
       <w:r>
@@ -11217,7 +11265,7 @@
         <w:pStyle w:val="Compact"/>
         <w:numPr>
           <w:ilvl w:val="0"/>
-          <w:numId w:val="1463"/>
+          <w:numId w:val="1466"/>
         </w:numPr>
       </w:pPr>
       <w:r>
@@ -11244,7 +11292,7 @@
         <w:pStyle w:val="Compact"/>
         <w:numPr>
           <w:ilvl w:val="0"/>
-          <w:numId w:val="1464"/>
+          <w:numId w:val="1467"/>
         </w:numPr>
       </w:pPr>
       <w:r>
@@ -11316,7 +11364,7 @@
         <w:pStyle w:val="Compact"/>
         <w:numPr>
           <w:ilvl w:val="0"/>
-          <w:numId w:val="1465"/>
+          <w:numId w:val="1468"/>
         </w:numPr>
       </w:pPr>
       <w:r>
@@ -11343,7 +11391,7 @@
         <w:pStyle w:val="Compact"/>
         <w:numPr>
           <w:ilvl w:val="0"/>
-          <w:numId w:val="1466"/>
+          <w:numId w:val="1469"/>
         </w:numPr>
       </w:pPr>
       <w:r>
@@ -11355,7 +11403,7 @@
         <w:pStyle w:val="Compact"/>
         <w:numPr>
           <w:ilvl w:val="0"/>
-          <w:numId w:val="1467"/>
+          <w:numId w:val="1470"/>
         </w:numPr>
       </w:pPr>
       <w:r>
@@ -11382,7 +11430,7 @@
         <w:pStyle w:val="Compact"/>
         <w:numPr>
           <w:ilvl w:val="0"/>
-          <w:numId w:val="1468"/>
+          <w:numId w:val="1471"/>
         </w:numPr>
       </w:pPr>
       <w:r>
@@ -11394,7 +11442,7 @@
         <w:pStyle w:val="Compact"/>
         <w:numPr>
           <w:ilvl w:val="0"/>
-          <w:numId w:val="1469"/>
+          <w:numId w:val="1472"/>
         </w:numPr>
       </w:pPr>
       <w:r>
@@ -11421,7 +11469,7 @@
         <w:pStyle w:val="Compact"/>
         <w:numPr>
           <w:ilvl w:val="0"/>
-          <w:numId w:val="1470"/>
+          <w:numId w:val="1473"/>
         </w:numPr>
       </w:pPr>
       <w:r>
@@ -11463,7 +11511,7 @@
         <w:pStyle w:val="Compact"/>
         <w:numPr>
           <w:ilvl w:val="0"/>
-          <w:numId w:val="1471"/>
+          <w:numId w:val="1474"/>
         </w:numPr>
       </w:pPr>
       <w:r>
@@ -11499,7 +11547,7 @@
         <w:pStyle w:val="Compact"/>
         <w:numPr>
           <w:ilvl w:val="0"/>
-          <w:numId w:val="1472"/>
+          <w:numId w:val="1475"/>
         </w:numPr>
       </w:pPr>
       <w:r>
@@ -11521,7 +11569,7 @@
         <w:pStyle w:val="Compact"/>
         <w:numPr>
           <w:ilvl w:val="0"/>
-          <w:numId w:val="1473"/>
+          <w:numId w:val="1476"/>
         </w:numPr>
       </w:pPr>
       <w:r>
@@ -11533,7 +11581,7 @@
         <w:pStyle w:val="Compact"/>
         <w:numPr>
           <w:ilvl w:val="0"/>
-          <w:numId w:val="1474"/>
+          <w:numId w:val="1477"/>
         </w:numPr>
       </w:pPr>
       <w:r>
@@ -11545,7 +11593,7 @@
         <w:pStyle w:val="Compact"/>
         <w:numPr>
           <w:ilvl w:val="1"/>
-          <w:numId w:val="1475"/>
+          <w:numId w:val="1478"/>
         </w:numPr>
       </w:pPr>
       <w:r>
@@ -11557,7 +11605,7 @@
         <w:pStyle w:val="Compact"/>
         <w:numPr>
           <w:ilvl w:val="1"/>
-          <w:numId w:val="1475"/>
+          <w:numId w:val="1478"/>
         </w:numPr>
       </w:pPr>
       <w:r>
@@ -11569,7 +11617,7 @@
         <w:pStyle w:val="Compact"/>
         <w:numPr>
           <w:ilvl w:val="1"/>
-          <w:numId w:val="1475"/>
+          <w:numId w:val="1478"/>
         </w:numPr>
       </w:pPr>
       <w:r>
@@ -11581,7 +11629,7 @@
         <w:pStyle w:val="Compact"/>
         <w:numPr>
           <w:ilvl w:val="1"/>
-          <w:numId w:val="1475"/>
+          <w:numId w:val="1478"/>
         </w:numPr>
       </w:pPr>
       <w:r>
@@ -11593,7 +11641,7 @@
         <w:pStyle w:val="Compact"/>
         <w:numPr>
           <w:ilvl w:val="1"/>
-          <w:numId w:val="1475"/>
+          <w:numId w:val="1478"/>
         </w:numPr>
       </w:pPr>
       <w:r>
@@ -11605,7 +11653,7 @@
         <w:pStyle w:val="Compact"/>
         <w:numPr>
           <w:ilvl w:val="1"/>
-          <w:numId w:val="1475"/>
+          <w:numId w:val="1478"/>
         </w:numPr>
       </w:pPr>
       <w:r>
@@ -11617,7 +11665,7 @@
         <w:pStyle w:val="Compact"/>
         <w:numPr>
           <w:ilvl w:val="1"/>
-          <w:numId w:val="1475"/>
+          <w:numId w:val="1478"/>
         </w:numPr>
       </w:pPr>
       <w:r>
@@ -11629,7 +11677,7 @@
         <w:pStyle w:val="Compact"/>
         <w:numPr>
           <w:ilvl w:val="1"/>
-          <w:numId w:val="1475"/>
+          <w:numId w:val="1478"/>
         </w:numPr>
       </w:pPr>
       <w:r>
@@ -11641,7 +11689,7 @@
         <w:pStyle w:val="Compact"/>
         <w:numPr>
           <w:ilvl w:val="0"/>
-          <w:numId w:val="1476"/>
+          <w:numId w:val="1479"/>
         </w:numPr>
       </w:pPr>
       <w:r>
@@ -11662,7 +11710,7 @@
         <w:pStyle w:val="Compact"/>
         <w:numPr>
           <w:ilvl w:val="0"/>
-          <w:numId w:val="1477"/>
+          <w:numId w:val="1480"/>
         </w:numPr>
       </w:pPr>
       <w:r>
@@ -11686,7 +11734,7 @@
         <w:pStyle w:val="Compact"/>
         <w:numPr>
           <w:ilvl w:val="0"/>
-          <w:numId w:val="1478"/>
+          <w:numId w:val="1481"/>
         </w:numPr>
       </w:pPr>
       <w:r>
@@ -11698,7 +11746,7 @@
         <w:pStyle w:val="Compact"/>
         <w:numPr>
           <w:ilvl w:val="1"/>
-          <w:numId w:val="1479"/>
+          <w:numId w:val="1482"/>
         </w:numPr>
       </w:pPr>
       <w:r>
@@ -11710,7 +11758,7 @@
         <w:pStyle w:val="Compact"/>
         <w:numPr>
           <w:ilvl w:val="1"/>
-          <w:numId w:val="1479"/>
+          <w:numId w:val="1482"/>
         </w:numPr>
       </w:pPr>
       <w:r>
@@ -11722,7 +11770,7 @@
         <w:pStyle w:val="Compact"/>
         <w:numPr>
           <w:ilvl w:val="1"/>
-          <w:numId w:val="1479"/>
+          <w:numId w:val="1482"/>
         </w:numPr>
       </w:pPr>
       <w:r>
@@ -11734,7 +11782,7 @@
         <w:pStyle w:val="Compact"/>
         <w:numPr>
           <w:ilvl w:val="0"/>
-          <w:numId w:val="1480"/>
+          <w:numId w:val="1483"/>
         </w:numPr>
       </w:pPr>
       <w:r>
@@ -11758,7 +11806,7 @@
         <w:pStyle w:val="Compact"/>
         <w:numPr>
           <w:ilvl w:val="0"/>
-          <w:numId w:val="1481"/>
+          <w:numId w:val="1484"/>
         </w:numPr>
       </w:pPr>
       <w:r>
@@ -11770,7 +11818,7 @@
         <w:pStyle w:val="Compact"/>
         <w:numPr>
           <w:ilvl w:val="0"/>
-          <w:numId w:val="1482"/>
+          <w:numId w:val="1485"/>
         </w:numPr>
       </w:pPr>
       <w:r>
@@ -11782,7 +11830,7 @@
         <w:pStyle w:val="Compact"/>
         <w:numPr>
           <w:ilvl w:val="0"/>
-          <w:numId w:val="1483"/>
+          <w:numId w:val="1486"/>
         </w:numPr>
       </w:pPr>
       <w:r>
@@ -11804,7 +11852,7 @@
         <w:pStyle w:val="Compact"/>
         <w:numPr>
           <w:ilvl w:val="0"/>
-          <w:numId w:val="1484"/>
+          <w:numId w:val="1487"/>
         </w:numPr>
       </w:pPr>
       <w:r>
@@ -11816,7 +11864,7 @@
         <w:pStyle w:val="Compact"/>
         <w:numPr>
           <w:ilvl w:val="1"/>
-          <w:numId w:val="1485"/>
+          <w:numId w:val="1488"/>
         </w:numPr>
       </w:pPr>
       <w:r>
@@ -11828,7 +11876,7 @@
         <w:pStyle w:val="Compact"/>
         <w:numPr>
           <w:ilvl w:val="1"/>
-          <w:numId w:val="1485"/>
+          <w:numId w:val="1488"/>
         </w:numPr>
       </w:pPr>
       <w:r>
@@ -11840,7 +11888,7 @@
         <w:pStyle w:val="Compact"/>
         <w:numPr>
           <w:ilvl w:val="1"/>
-          <w:numId w:val="1485"/>
+          <w:numId w:val="1488"/>
         </w:numPr>
       </w:pPr>
       <w:r>
@@ -11852,7 +11900,7 @@
         <w:pStyle w:val="Compact"/>
         <w:numPr>
           <w:ilvl w:val="0"/>
-          <w:numId w:val="1486"/>
+          <w:numId w:val="1489"/>
         </w:numPr>
       </w:pPr>
       <w:r>
@@ -11864,7 +11912,7 @@
         <w:pStyle w:val="Compact"/>
         <w:numPr>
           <w:ilvl w:val="1"/>
-          <w:numId w:val="1487"/>
+          <w:numId w:val="1490"/>
         </w:numPr>
       </w:pPr>
       <w:r>
@@ -11876,7 +11924,7 @@
         <w:pStyle w:val="Compact"/>
         <w:numPr>
           <w:ilvl w:val="1"/>
-          <w:numId w:val="1487"/>
+          <w:numId w:val="1490"/>
         </w:numPr>
       </w:pPr>
       <w:r>
@@ -11888,7 +11936,7 @@
         <w:pStyle w:val="Compact"/>
         <w:numPr>
           <w:ilvl w:val="1"/>
-          <w:numId w:val="1487"/>
+          <w:numId w:val="1490"/>
         </w:numPr>
       </w:pPr>
       <w:r>
@@ -11900,7 +11948,7 @@
         <w:pStyle w:val="Compact"/>
         <w:numPr>
           <w:ilvl w:val="0"/>
-          <w:numId w:val="1488"/>
+          <w:numId w:val="1491"/>
         </w:numPr>
       </w:pPr>
       <w:r>
@@ -11912,7 +11960,7 @@
         <w:pStyle w:val="Compact"/>
         <w:numPr>
           <w:ilvl w:val="0"/>
-          <w:numId w:val="1489"/>
+          <w:numId w:val="1492"/>
         </w:numPr>
       </w:pPr>
       <w:r>
@@ -11924,7 +11972,7 @@
         <w:pStyle w:val="Compact"/>
         <w:numPr>
           <w:ilvl w:val="0"/>
-          <w:numId w:val="1490"/>
+          <w:numId w:val="1493"/>
         </w:numPr>
       </w:pPr>
       <w:r>
@@ -11946,7 +11994,7 @@
         <w:pStyle w:val="Compact"/>
         <w:numPr>
           <w:ilvl w:val="0"/>
-          <w:numId w:val="1491"/>
+          <w:numId w:val="1494"/>
         </w:numPr>
       </w:pPr>
       <w:r>
@@ -11967,7 +12015,7 @@
         <w:pStyle w:val="Compact"/>
         <w:numPr>
           <w:ilvl w:val="0"/>
-          <w:numId w:val="1492"/>
+          <w:numId w:val="1495"/>
         </w:numPr>
       </w:pPr>
       <w:r>
@@ -11979,7 +12027,7 @@
         <w:pStyle w:val="Compact"/>
         <w:numPr>
           <w:ilvl w:val="0"/>
-          <w:numId w:val="1493"/>
+          <w:numId w:val="1496"/>
         </w:numPr>
       </w:pPr>
       <w:r>
@@ -11991,7 +12039,7 @@
         <w:pStyle w:val="Compact"/>
         <w:numPr>
           <w:ilvl w:val="0"/>
-          <w:numId w:val="1494"/>
+          <w:numId w:val="1497"/>
         </w:numPr>
       </w:pPr>
       <w:r>
@@ -12003,7 +12051,7 @@
         <w:pStyle w:val="Compact"/>
         <w:numPr>
           <w:ilvl w:val="0"/>
-          <w:numId w:val="1495"/>
+          <w:numId w:val="1498"/>
         </w:numPr>
       </w:pPr>
       <w:r>
@@ -12015,7 +12063,7 @@
         <w:pStyle w:val="Compact"/>
         <w:numPr>
           <w:ilvl w:val="0"/>
-          <w:numId w:val="1496"/>
+          <w:numId w:val="1499"/>
         </w:numPr>
       </w:pPr>
       <w:r>
@@ -12027,7 +12075,7 @@
         <w:pStyle w:val="Compact"/>
         <w:numPr>
           <w:ilvl w:val="1"/>
-          <w:numId w:val="1497"/>
+          <w:numId w:val="1500"/>
         </w:numPr>
       </w:pPr>
       <w:r>
@@ -12039,7 +12087,7 @@
         <w:pStyle w:val="Compact"/>
         <w:numPr>
           <w:ilvl w:val="1"/>
-          <w:numId w:val="1497"/>
+          <w:numId w:val="1500"/>
         </w:numPr>
       </w:pPr>
       <w:r>
@@ -12051,7 +12099,7 @@
         <w:pStyle w:val="Compact"/>
         <w:numPr>
           <w:ilvl w:val="1"/>
-          <w:numId w:val="1497"/>
+          <w:numId w:val="1500"/>
         </w:numPr>
       </w:pPr>
       <w:r>
@@ -12063,7 +12111,7 @@
         <w:pStyle w:val="Compact"/>
         <w:numPr>
           <w:ilvl w:val="1"/>
-          <w:numId w:val="1497"/>
+          <w:numId w:val="1500"/>
         </w:numPr>
       </w:pPr>
       <w:r>
@@ -12075,7 +12123,7 @@
         <w:pStyle w:val="Compact"/>
         <w:numPr>
           <w:ilvl w:val="1"/>
-          <w:numId w:val="1497"/>
+          <w:numId w:val="1500"/>
         </w:numPr>
       </w:pPr>
       <w:r>
@@ -12087,7 +12135,7 @@
         <w:pStyle w:val="Compact"/>
         <w:numPr>
           <w:ilvl w:val="1"/>
-          <w:numId w:val="1497"/>
+          <w:numId w:val="1500"/>
         </w:numPr>
       </w:pPr>
       <w:r>
@@ -12099,7 +12147,7 @@
         <w:pStyle w:val="Compact"/>
         <w:numPr>
           <w:ilvl w:val="0"/>
-          <w:numId w:val="1498"/>
+          <w:numId w:val="1501"/>
         </w:numPr>
       </w:pPr>
       <w:r>
@@ -12111,7 +12159,7 @@
         <w:pStyle w:val="Compact"/>
         <w:numPr>
           <w:ilvl w:val="0"/>
-          <w:numId w:val="1499"/>
+          <w:numId w:val="1502"/>
         </w:numPr>
       </w:pPr>
       <w:r>
@@ -12133,7 +12181,7 @@
         <w:pStyle w:val="Compact"/>
         <w:numPr>
           <w:ilvl w:val="0"/>
-          <w:numId w:val="1500"/>
+          <w:numId w:val="1503"/>
         </w:numPr>
       </w:pPr>
       <w:r>
@@ -12145,7 +12193,7 @@
         <w:pStyle w:val="Compact"/>
         <w:numPr>
           <w:ilvl w:val="0"/>
-          <w:numId w:val="1501"/>
+          <w:numId w:val="1504"/>
         </w:numPr>
       </w:pPr>
       <w:r>
@@ -12157,7 +12205,7 @@
         <w:pStyle w:val="Compact"/>
         <w:numPr>
           <w:ilvl w:val="0"/>
-          <w:numId w:val="1502"/>
+          <w:numId w:val="1505"/>
         </w:numPr>
       </w:pPr>
       <w:r>
@@ -12169,7 +12217,7 @@
         <w:pStyle w:val="Compact"/>
         <w:numPr>
           <w:ilvl w:val="0"/>
-          <w:numId w:val="1503"/>
+          <w:numId w:val="1506"/>
         </w:numPr>
       </w:pPr>
       <w:r>
@@ -12181,7 +12229,7 @@
         <w:pStyle w:val="Compact"/>
         <w:numPr>
           <w:ilvl w:val="0"/>
-          <w:numId w:val="1504"/>
+          <w:numId w:val="1507"/>
         </w:numPr>
       </w:pPr>
       <w:r>
@@ -12203,7 +12251,7 @@
         <w:pStyle w:val="Compact"/>
         <w:numPr>
           <w:ilvl w:val="0"/>
-          <w:numId w:val="1505"/>
+          <w:numId w:val="1508"/>
         </w:numPr>
       </w:pPr>
       <w:r>
@@ -12215,7 +12263,7 @@
         <w:pStyle w:val="Compact"/>
         <w:numPr>
           <w:ilvl w:val="0"/>
-          <w:numId w:val="1506"/>
+          <w:numId w:val="1509"/>
         </w:numPr>
       </w:pPr>
       <w:r>
@@ -12227,7 +12275,7 @@
         <w:pStyle w:val="Compact"/>
         <w:numPr>
           <w:ilvl w:val="0"/>
-          <w:numId w:val="1507"/>
+          <w:numId w:val="1510"/>
         </w:numPr>
       </w:pPr>
       <w:r>
@@ -12239,7 +12287,7 @@
         <w:pStyle w:val="Compact"/>
         <w:numPr>
           <w:ilvl w:val="0"/>
-          <w:numId w:val="1508"/>
+          <w:numId w:val="1511"/>
         </w:numPr>
       </w:pPr>
       <w:r>
@@ -12251,7 +12299,7 @@
         <w:pStyle w:val="Compact"/>
         <w:numPr>
           <w:ilvl w:val="0"/>
-          <w:numId w:val="1509"/>
+          <w:numId w:val="1512"/>
         </w:numPr>
       </w:pPr>
       <w:r>
@@ -12263,7 +12311,7 @@
         <w:pStyle w:val="Compact"/>
         <w:numPr>
           <w:ilvl w:val="0"/>
-          <w:numId w:val="1510"/>
+          <w:numId w:val="1513"/>
         </w:numPr>
       </w:pPr>
       <w:r>
@@ -12275,7 +12323,7 @@
         <w:pStyle w:val="Compact"/>
         <w:numPr>
           <w:ilvl w:val="0"/>
-          <w:numId w:val="1511"/>
+          <w:numId w:val="1514"/>
         </w:numPr>
       </w:pPr>
       <w:r>
@@ -12287,7 +12335,7 @@
         <w:pStyle w:val="Compact"/>
         <w:numPr>
           <w:ilvl w:val="0"/>
-          <w:numId w:val="1512"/>
+          <w:numId w:val="1515"/>
         </w:numPr>
       </w:pPr>
       <w:r>
@@ -12319,7 +12367,7 @@
         <w:pStyle w:val="Compact"/>
         <w:numPr>
           <w:ilvl w:val="0"/>
-          <w:numId w:val="1513"/>
+          <w:numId w:val="1516"/>
         </w:numPr>
       </w:pPr>
       <w:r>
@@ -12367,7 +12415,7 @@
         <w:pStyle w:val="Compact"/>
         <w:numPr>
           <w:ilvl w:val="0"/>
-          <w:numId w:val="1514"/>
+          <w:numId w:val="1517"/>
         </w:numPr>
       </w:pPr>
       <w:r>
@@ -12379,7 +12427,7 @@
         <w:pStyle w:val="Compact"/>
         <w:numPr>
           <w:ilvl w:val="0"/>
-          <w:numId w:val="1515"/>
+          <w:numId w:val="1518"/>
         </w:numPr>
       </w:pPr>
       <w:r>
@@ -12391,7 +12439,7 @@
         <w:pStyle w:val="Compact"/>
         <w:numPr>
           <w:ilvl w:val="0"/>
-          <w:numId w:val="1516"/>
+          <w:numId w:val="1519"/>
         </w:numPr>
       </w:pPr>
       <w:r>
@@ -12403,7 +12451,7 @@
         <w:pStyle w:val="Compact"/>
         <w:numPr>
           <w:ilvl w:val="0"/>
-          <w:numId w:val="1517"/>
+          <w:numId w:val="1520"/>
         </w:numPr>
       </w:pPr>
       <w:r>
@@ -12415,7 +12463,7 @@
         <w:pStyle w:val="Compact"/>
         <w:numPr>
           <w:ilvl w:val="0"/>
-          <w:numId w:val="1518"/>
+          <w:numId w:val="1521"/>
         </w:numPr>
       </w:pPr>
       <w:r>
@@ -12469,7 +12517,7 @@
         <w:pStyle w:val="Compact"/>
         <w:numPr>
           <w:ilvl w:val="0"/>
-          <w:numId w:val="1519"/>
+          <w:numId w:val="1522"/>
         </w:numPr>
       </w:pPr>
       <w:r>
@@ -12481,7 +12529,7 @@
         <w:pStyle w:val="Compact"/>
         <w:numPr>
           <w:ilvl w:val="0"/>
-          <w:numId w:val="1520"/>
+          <w:numId w:val="1523"/>
         </w:numPr>
       </w:pPr>
       <w:r>
@@ -12508,7 +12556,7 @@
         <w:pStyle w:val="Compact"/>
         <w:numPr>
           <w:ilvl w:val="0"/>
-          <w:numId w:val="1521"/>
+          <w:numId w:val="1524"/>
         </w:numPr>
       </w:pPr>
       <w:r>
@@ -12550,7 +12598,7 @@
         <w:pStyle w:val="Compact"/>
         <w:numPr>
           <w:ilvl w:val="0"/>
-          <w:numId w:val="1522"/>
+          <w:numId w:val="1525"/>
         </w:numPr>
       </w:pPr>
       <w:r>
@@ -12577,7 +12625,7 @@
         <w:pStyle w:val="Compact"/>
         <w:numPr>
           <w:ilvl w:val="0"/>
-          <w:numId w:val="1523"/>
+          <w:numId w:val="1526"/>
         </w:numPr>
       </w:pPr>
       <w:r>
@@ -12589,7 +12637,7 @@
         <w:pStyle w:val="Compact"/>
         <w:numPr>
           <w:ilvl w:val="0"/>
-          <w:numId w:val="1524"/>
+          <w:numId w:val="1527"/>
         </w:numPr>
       </w:pPr>
       <w:r>
@@ -12601,7 +12649,7 @@
         <w:pStyle w:val="Compact"/>
         <w:numPr>
           <w:ilvl w:val="0"/>
-          <w:numId w:val="1525"/>
+          <w:numId w:val="1528"/>
         </w:numPr>
       </w:pPr>
       <w:r>
@@ -12638,7 +12686,7 @@
         <w:pStyle w:val="Compact"/>
         <w:numPr>
           <w:ilvl w:val="0"/>
-          <w:numId w:val="1526"/>
+          <w:numId w:val="1529"/>
         </w:numPr>
       </w:pPr>
       <w:r>
@@ -12650,7 +12698,7 @@
         <w:pStyle w:val="Compact"/>
         <w:numPr>
           <w:ilvl w:val="0"/>
-          <w:numId w:val="1527"/>
+          <w:numId w:val="1530"/>
         </w:numPr>
       </w:pPr>
       <w:r>
@@ -12662,7 +12710,7 @@
         <w:pStyle w:val="Compact"/>
         <w:numPr>
           <w:ilvl w:val="0"/>
-          <w:numId w:val="1528"/>
+          <w:numId w:val="1531"/>
         </w:numPr>
       </w:pPr>
       <w:r>
@@ -12674,7 +12722,7 @@
         <w:pStyle w:val="Compact"/>
         <w:numPr>
           <w:ilvl w:val="0"/>
-          <w:numId w:val="1529"/>
+          <w:numId w:val="1532"/>
         </w:numPr>
       </w:pPr>
       <w:r>
@@ -12686,7 +12734,7 @@
         <w:pStyle w:val="Compact"/>
         <w:numPr>
           <w:ilvl w:val="0"/>
-          <w:numId w:val="1530"/>
+          <w:numId w:val="1533"/>
         </w:numPr>
       </w:pPr>
       <w:r>
@@ -12698,7 +12746,7 @@
         <w:pStyle w:val="Compact"/>
         <w:numPr>
           <w:ilvl w:val="0"/>
-          <w:numId w:val="1531"/>
+          <w:numId w:val="1534"/>
         </w:numPr>
       </w:pPr>
       <w:r>
@@ -12710,7 +12758,7 @@
         <w:pStyle w:val="Compact"/>
         <w:numPr>
           <w:ilvl w:val="1"/>
-          <w:numId w:val="1532"/>
+          <w:numId w:val="1535"/>
         </w:numPr>
       </w:pPr>
       <w:r>
@@ -12737,7 +12785,7 @@
         <w:pStyle w:val="Compact"/>
         <w:numPr>
           <w:ilvl w:val="1"/>
-          <w:numId w:val="1532"/>
+          <w:numId w:val="1535"/>
         </w:numPr>
       </w:pPr>
       <w:r>
@@ -12774,7 +12822,7 @@
         <w:pStyle w:val="Compact"/>
         <w:numPr>
           <w:ilvl w:val="0"/>
-          <w:numId w:val="1533"/>
+          <w:numId w:val="1536"/>
         </w:numPr>
       </w:pPr>
       <w:r>
@@ -12816,7 +12864,7 @@
         <w:pStyle w:val="Compact"/>
         <w:numPr>
           <w:ilvl w:val="0"/>
-          <w:numId w:val="1534"/>
+          <w:numId w:val="1537"/>
         </w:numPr>
       </w:pPr>
       <w:r>
@@ -12840,7 +12888,7 @@
         <w:pStyle w:val="Compact"/>
         <w:numPr>
           <w:ilvl w:val="0"/>
-          <w:numId w:val="1535"/>
+          <w:numId w:val="1538"/>
         </w:numPr>
       </w:pPr>
       <w:r>
@@ -12864,7 +12912,7 @@
         <w:pStyle w:val="Compact"/>
         <w:numPr>
           <w:ilvl w:val="0"/>
-          <w:numId w:val="1536"/>
+          <w:numId w:val="1539"/>
         </w:numPr>
       </w:pPr>
       <w:r>
@@ -12876,7 +12924,7 @@
         <w:pStyle w:val="Compact"/>
         <w:numPr>
           <w:ilvl w:val="0"/>
-          <w:numId w:val="1537"/>
+          <w:numId w:val="1540"/>
         </w:numPr>
       </w:pPr>
       <w:r>
@@ -12888,7 +12936,7 @@
         <w:pStyle w:val="Compact"/>
         <w:numPr>
           <w:ilvl w:val="0"/>
-          <w:numId w:val="1538"/>
+          <w:numId w:val="1541"/>
         </w:numPr>
       </w:pPr>
       <w:r>
@@ -12900,7 +12948,7 @@
         <w:pStyle w:val="Compact"/>
         <w:numPr>
           <w:ilvl w:val="0"/>
-          <w:numId w:val="1539"/>
+          <w:numId w:val="1542"/>
         </w:numPr>
       </w:pPr>
       <w:r>
@@ -12912,7 +12960,7 @@
         <w:pStyle w:val="Compact"/>
         <w:numPr>
           <w:ilvl w:val="0"/>
-          <w:numId w:val="1540"/>
+          <w:numId w:val="1543"/>
         </w:numPr>
       </w:pPr>
       <w:r>
@@ -12924,7 +12972,7 @@
         <w:pStyle w:val="Compact"/>
         <w:numPr>
           <w:ilvl w:val="0"/>
-          <w:numId w:val="1541"/>
+          <w:numId w:val="1544"/>
         </w:numPr>
       </w:pPr>
       <w:r>
@@ -12936,7 +12984,7 @@
         <w:pStyle w:val="Compact"/>
         <w:numPr>
           <w:ilvl w:val="0"/>
-          <w:numId w:val="1542"/>
+          <w:numId w:val="1545"/>
         </w:numPr>
       </w:pPr>
       <w:r>
@@ -12948,7 +12996,7 @@
         <w:pStyle w:val="Compact"/>
         <w:numPr>
           <w:ilvl w:val="0"/>
-          <w:numId w:val="1543"/>
+          <w:numId w:val="1546"/>
         </w:numPr>
       </w:pPr>
       <w:r>
@@ -12960,7 +13008,7 @@
         <w:pStyle w:val="Compact"/>
         <w:numPr>
           <w:ilvl w:val="0"/>
-          <w:numId w:val="1544"/>
+          <w:numId w:val="1547"/>
         </w:numPr>
       </w:pPr>
       <w:r>
@@ -12972,7 +13020,7 @@
         <w:pStyle w:val="Compact"/>
         <w:numPr>
           <w:ilvl w:val="0"/>
-          <w:numId w:val="1545"/>
+          <w:numId w:val="1548"/>
         </w:numPr>
       </w:pPr>
       <w:r>
@@ -12984,7 +13032,7 @@
         <w:pStyle w:val="Compact"/>
         <w:numPr>
           <w:ilvl w:val="0"/>
-          <w:numId w:val="1546"/>
+          <w:numId w:val="1549"/>
         </w:numPr>
       </w:pPr>
       <w:r>
@@ -13011,7 +13059,7 @@
         <w:pStyle w:val="Compact"/>
         <w:numPr>
           <w:ilvl w:val="0"/>
-          <w:numId w:val="1547"/>
+          <w:numId w:val="1550"/>
         </w:numPr>
       </w:pPr>
       <w:r>
@@ -13023,7 +13071,7 @@
         <w:pStyle w:val="Compact"/>
         <w:numPr>
           <w:ilvl w:val="0"/>
-          <w:numId w:val="1548"/>
+          <w:numId w:val="1551"/>
         </w:numPr>
       </w:pPr>
       <w:r>
@@ -13045,7 +13093,7 @@
         <w:pStyle w:val="Compact"/>
         <w:numPr>
           <w:ilvl w:val="0"/>
-          <w:numId w:val="1549"/>
+          <w:numId w:val="1552"/>
         </w:numPr>
       </w:pPr>
       <w:r>
@@ -13057,7 +13105,7 @@
         <w:pStyle w:val="Compact"/>
         <w:numPr>
           <w:ilvl w:val="0"/>
-          <w:numId w:val="1550"/>
+          <w:numId w:val="1553"/>
         </w:numPr>
       </w:pPr>
       <w:r>
@@ -13084,7 +13132,7 @@
         <w:pStyle w:val="Compact"/>
         <w:numPr>
           <w:ilvl w:val="0"/>
-          <w:numId w:val="1551"/>
+          <w:numId w:val="1554"/>
         </w:numPr>
       </w:pPr>
       <w:r>
@@ -13111,7 +13159,7 @@
         <w:pStyle w:val="Compact"/>
         <w:numPr>
           <w:ilvl w:val="0"/>
-          <w:numId w:val="1552"/>
+          <w:numId w:val="1555"/>
         </w:numPr>
       </w:pPr>
       <w:r>
@@ -13138,71 +13186,11 @@
         <w:pStyle w:val="Compact"/>
         <w:numPr>
           <w:ilvl w:val="0"/>
-          <w:numId w:val="1553"/>
+          <w:numId w:val="1556"/>
         </w:numPr>
       </w:pPr>
       <w:r>
         <w:t xml:space="preserve">Implement three separate analytical query engines:</w:t>
-      </w:r>
-    </w:p>
-    <w:p>
-      <w:pPr>
-        <w:pStyle w:val="Compact"/>
-        <w:numPr>
-          <w:ilvl w:val="1"/>
-          <w:numId w:val="1554"/>
-        </w:numPr>
-      </w:pPr>
-      <w:r>
-        <w:t xml:space="preserve">multi-campaign retarget;</w:t>
-      </w:r>
-    </w:p>
-    <w:p>
-      <w:pPr>
-        <w:pStyle w:val="Compact"/>
-        <w:numPr>
-          <w:ilvl w:val="1"/>
-          <w:numId w:val="1554"/>
-        </w:numPr>
-      </w:pPr>
-      <w:r>
-        <w:t xml:space="preserve">new cohorts from unsent leads;</w:t>
-      </w:r>
-    </w:p>
-    <w:p>
-      <w:pPr>
-        <w:pStyle w:val="Compact"/>
-        <w:numPr>
-          <w:ilvl w:val="1"/>
-          <w:numId w:val="1554"/>
-        </w:numPr>
-      </w:pPr>
-      <w:r>
-        <w:t xml:space="preserve">renewal candidates.</w:t>
-      </w:r>
-    </w:p>
-    <w:p>
-      <w:pPr>
-        <w:pStyle w:val="Compact"/>
-        <w:numPr>
-          <w:ilvl w:val="0"/>
-          <w:numId w:val="1555"/>
-        </w:numPr>
-      </w:pPr>
-      <w:r>
-        <w:t xml:space="preserve">Each query joins only the required campaign/lead/funded/deal data and remains performant.</w:t>
-      </w:r>
-    </w:p>
-    <w:p>
-      <w:pPr>
-        <w:pStyle w:val="Compact"/>
-        <w:numPr>
-          <w:ilvl w:val="0"/>
-          <w:numId w:val="1556"/>
-        </w:numPr>
-      </w:pPr>
-      <w:r>
-        <w:t xml:space="preserve">Each cohort includes:</w:t>
       </w:r>
     </w:p>
     <w:p>
@@ -13214,7 +13202,7 @@
         </w:numPr>
       </w:pPr>
       <w:r>
-        <w:t xml:space="preserve">lead count;</w:t>
+        <w:t xml:space="preserve">multi-campaign retarget;</w:t>
       </w:r>
     </w:p>
     <w:p>
@@ -13226,7 +13214,7 @@
         </w:numPr>
       </w:pPr>
       <w:r>
-        <w:t xml:space="preserve">predicted reply rate;</w:t>
+        <w:t xml:space="preserve">new cohorts from unsent leads;</w:t>
       </w:r>
     </w:p>
     <w:p>
@@ -13238,6 +13226,66 @@
         </w:numPr>
       </w:pPr>
       <w:r>
+        <w:t xml:space="preserve">renewal candidates.</w:t>
+      </w:r>
+    </w:p>
+    <w:p>
+      <w:pPr>
+        <w:pStyle w:val="Compact"/>
+        <w:numPr>
+          <w:ilvl w:val="0"/>
+          <w:numId w:val="1558"/>
+        </w:numPr>
+      </w:pPr>
+      <w:r>
+        <w:t xml:space="preserve">Each query joins only the required campaign/lead/funded/deal data and remains performant.</w:t>
+      </w:r>
+    </w:p>
+    <w:p>
+      <w:pPr>
+        <w:pStyle w:val="Compact"/>
+        <w:numPr>
+          <w:ilvl w:val="0"/>
+          <w:numId w:val="1559"/>
+        </w:numPr>
+      </w:pPr>
+      <w:r>
+        <w:t xml:space="preserve">Each cohort includes:</w:t>
+      </w:r>
+    </w:p>
+    <w:p>
+      <w:pPr>
+        <w:pStyle w:val="Compact"/>
+        <w:numPr>
+          <w:ilvl w:val="1"/>
+          <w:numId w:val="1560"/>
+        </w:numPr>
+      </w:pPr>
+      <w:r>
+        <w:t xml:space="preserve">lead count;</w:t>
+      </w:r>
+    </w:p>
+    <w:p>
+      <w:pPr>
+        <w:pStyle w:val="Compact"/>
+        <w:numPr>
+          <w:ilvl w:val="1"/>
+          <w:numId w:val="1560"/>
+        </w:numPr>
+      </w:pPr>
+      <w:r>
+        <w:t xml:space="preserve">predicted reply rate;</w:t>
+      </w:r>
+    </w:p>
+    <w:p>
+      <w:pPr>
+        <w:pStyle w:val="Compact"/>
+        <w:numPr>
+          <w:ilvl w:val="1"/>
+          <w:numId w:val="1560"/>
+        </w:numPr>
+      </w:pPr>
+      <w:r>
         <w:t xml:space="preserve">expected funded deals;</w:t>
       </w:r>
     </w:p>
@@ -13246,7 +13294,7 @@
         <w:pStyle w:val="Compact"/>
         <w:numPr>
           <w:ilvl w:val="1"/>
-          <w:numId w:val="1557"/>
+          <w:numId w:val="1560"/>
         </w:numPr>
       </w:pPr>
       <w:r>
@@ -13258,7 +13306,7 @@
         <w:pStyle w:val="Compact"/>
         <w:numPr>
           <w:ilvl w:val="1"/>
-          <w:numId w:val="1557"/>
+          <w:numId w:val="1560"/>
         </w:numPr>
       </w:pPr>
       <w:r>
@@ -13270,7 +13318,7 @@
         <w:pStyle w:val="Compact"/>
         <w:numPr>
           <w:ilvl w:val="1"/>
-          <w:numId w:val="1557"/>
+          <w:numId w:val="1560"/>
         </w:numPr>
       </w:pPr>
       <w:r>
@@ -13282,7 +13330,7 @@
         <w:pStyle w:val="Compact"/>
         <w:numPr>
           <w:ilvl w:val="0"/>
-          <w:numId w:val="1558"/>
+          <w:numId w:val="1561"/>
         </w:numPr>
       </w:pPr>
       <w:r>
@@ -13294,7 +13342,7 @@
         <w:pStyle w:val="Compact"/>
         <w:numPr>
           <w:ilvl w:val="0"/>
-          <w:numId w:val="1559"/>
+          <w:numId w:val="1562"/>
         </w:numPr>
       </w:pPr>
       <w:r>
@@ -13306,7 +13354,7 @@
         <w:pStyle w:val="Compact"/>
         <w:numPr>
           <w:ilvl w:val="0"/>
-          <w:numId w:val="1560"/>
+          <w:numId w:val="1563"/>
         </w:numPr>
       </w:pPr>
       <w:r>
@@ -13328,7 +13376,7 @@
         <w:pStyle w:val="Compact"/>
         <w:numPr>
           <w:ilvl w:val="0"/>
-          <w:numId w:val="1561"/>
+          <w:numId w:val="1564"/>
         </w:numPr>
       </w:pPr>
       <w:r>
@@ -13340,7 +13388,7 @@
         <w:pStyle w:val="Compact"/>
         <w:numPr>
           <w:ilvl w:val="0"/>
-          <w:numId w:val="1562"/>
+          <w:numId w:val="1565"/>
         </w:numPr>
       </w:pPr>
       <w:r>
@@ -13352,7 +13400,7 @@
         <w:pStyle w:val="Compact"/>
         <w:numPr>
           <w:ilvl w:val="0"/>
-          <w:numId w:val="1563"/>
+          <w:numId w:val="1566"/>
         </w:numPr>
       </w:pPr>
       <w:r>
@@ -13364,7 +13412,7 @@
         <w:pStyle w:val="Compact"/>
         <w:numPr>
           <w:ilvl w:val="0"/>
-          <w:numId w:val="1564"/>
+          <w:numId w:val="1567"/>
         </w:numPr>
       </w:pPr>
       <w:r>
@@ -13376,7 +13424,7 @@
         <w:pStyle w:val="Compact"/>
         <w:numPr>
           <w:ilvl w:val="0"/>
-          <w:numId w:val="1565"/>
+          <w:numId w:val="1568"/>
         </w:numPr>
       </w:pPr>
       <w:r>
@@ -13388,7 +13436,7 @@
         <w:pStyle w:val="Compact"/>
         <w:numPr>
           <w:ilvl w:val="0"/>
-          <w:numId w:val="1566"/>
+          <w:numId w:val="1569"/>
         </w:numPr>
       </w:pPr>
       <w:r>
@@ -13410,7 +13458,7 @@
         <w:pStyle w:val="Compact"/>
         <w:numPr>
           <w:ilvl w:val="0"/>
-          <w:numId w:val="1567"/>
+          <w:numId w:val="1570"/>
         </w:numPr>
       </w:pPr>
       <w:r>
@@ -13422,7 +13470,7 @@
         <w:pStyle w:val="Compact"/>
         <w:numPr>
           <w:ilvl w:val="1"/>
-          <w:numId w:val="1568"/>
+          <w:numId w:val="1571"/>
         </w:numPr>
       </w:pPr>
       <w:r>
@@ -13434,7 +13482,7 @@
         <w:pStyle w:val="Compact"/>
         <w:numPr>
           <w:ilvl w:val="1"/>
-          <w:numId w:val="1568"/>
+          <w:numId w:val="1571"/>
         </w:numPr>
       </w:pPr>
       <w:r>
@@ -13446,7 +13494,7 @@
         <w:pStyle w:val="Compact"/>
         <w:numPr>
           <w:ilvl w:val="0"/>
-          <w:numId w:val="1569"/>
+          <w:numId w:val="1572"/>
         </w:numPr>
       </w:pPr>
       <w:r>
@@ -13458,7 +13506,7 @@
         <w:pStyle w:val="Compact"/>
         <w:numPr>
           <w:ilvl w:val="1"/>
-          <w:numId w:val="1570"/>
+          <w:numId w:val="1573"/>
         </w:numPr>
       </w:pPr>
       <w:r>
@@ -13470,7 +13518,7 @@
         <w:pStyle w:val="Compact"/>
         <w:numPr>
           <w:ilvl w:val="1"/>
-          <w:numId w:val="1570"/>
+          <w:numId w:val="1573"/>
         </w:numPr>
       </w:pPr>
       <w:r>
@@ -13482,7 +13530,7 @@
         <w:pStyle w:val="Compact"/>
         <w:numPr>
           <w:ilvl w:val="0"/>
-          <w:numId w:val="1571"/>
+          <w:numId w:val="1574"/>
         </w:numPr>
       </w:pPr>
       <w:r>
@@ -13494,7 +13542,7 @@
         <w:pStyle w:val="Compact"/>
         <w:numPr>
           <w:ilvl w:val="0"/>
-          <w:numId w:val="1572"/>
+          <w:numId w:val="1575"/>
         </w:numPr>
       </w:pPr>
       <w:r>
@@ -13506,7 +13554,7 @@
         <w:pStyle w:val="Compact"/>
         <w:numPr>
           <w:ilvl w:val="0"/>
-          <w:numId w:val="1573"/>
+          <w:numId w:val="1576"/>
         </w:numPr>
       </w:pPr>
       <w:r>
@@ -13518,7 +13566,7 @@
         <w:pStyle w:val="Compact"/>
         <w:numPr>
           <w:ilvl w:val="0"/>
-          <w:numId w:val="1574"/>
+          <w:numId w:val="1577"/>
         </w:numPr>
       </w:pPr>
       <w:r>
@@ -13540,7 +13588,7 @@
         <w:pStyle w:val="Compact"/>
         <w:numPr>
           <w:ilvl w:val="0"/>
-          <w:numId w:val="1575"/>
+          <w:numId w:val="1578"/>
         </w:numPr>
       </w:pPr>
       <w:r>
@@ -13552,7 +13600,7 @@
         <w:pStyle w:val="Compact"/>
         <w:numPr>
           <w:ilvl w:val="0"/>
-          <w:numId w:val="1576"/>
+          <w:numId w:val="1579"/>
         </w:numPr>
       </w:pPr>
       <w:r>
@@ -13564,7 +13612,7 @@
         <w:pStyle w:val="Compact"/>
         <w:numPr>
           <w:ilvl w:val="0"/>
-          <w:numId w:val="1577"/>
+          <w:numId w:val="1580"/>
         </w:numPr>
       </w:pPr>
       <w:r>
@@ -13576,7 +13624,7 @@
         <w:pStyle w:val="Compact"/>
         <w:numPr>
           <w:ilvl w:val="0"/>
-          <w:numId w:val="1578"/>
+          <w:numId w:val="1581"/>
         </w:numPr>
       </w:pPr>
       <w:r>
@@ -13588,7 +13636,7 @@
         <w:pStyle w:val="Compact"/>
         <w:numPr>
           <w:ilvl w:val="0"/>
-          <w:numId w:val="1579"/>
+          <w:numId w:val="1582"/>
         </w:numPr>
       </w:pPr>
       <w:r>
@@ -13600,7 +13648,7 @@
         <w:pStyle w:val="Compact"/>
         <w:numPr>
           <w:ilvl w:val="0"/>
-          <w:numId w:val="1580"/>
+          <w:numId w:val="1583"/>
         </w:numPr>
       </w:pPr>
       <w:r>
@@ -13612,7 +13660,7 @@
         <w:pStyle w:val="Compact"/>
         <w:numPr>
           <w:ilvl w:val="0"/>
-          <w:numId w:val="1581"/>
+          <w:numId w:val="1584"/>
         </w:numPr>
       </w:pPr>
       <w:r>
@@ -13624,7 +13672,7 @@
         <w:pStyle w:val="Compact"/>
         <w:numPr>
           <w:ilvl w:val="0"/>
-          <w:numId w:val="1582"/>
+          <w:numId w:val="1585"/>
         </w:numPr>
       </w:pPr>
       <w:r>
@@ -13636,7 +13684,7 @@
         <w:pStyle w:val="Compact"/>
         <w:numPr>
           <w:ilvl w:val="0"/>
-          <w:numId w:val="1583"/>
+          <w:numId w:val="1586"/>
         </w:numPr>
       </w:pPr>
       <w:r>
@@ -13658,7 +13706,7 @@
         <w:pStyle w:val="Compact"/>
         <w:numPr>
           <w:ilvl w:val="0"/>
-          <w:numId w:val="1584"/>
+          <w:numId w:val="1587"/>
         </w:numPr>
       </w:pPr>
       <w:r>
@@ -13670,7 +13718,7 @@
         <w:pStyle w:val="Compact"/>
         <w:numPr>
           <w:ilvl w:val="0"/>
-          <w:numId w:val="1585"/>
+          <w:numId w:val="1588"/>
         </w:numPr>
       </w:pPr>
       <w:r>
@@ -13682,7 +13730,7 @@
         <w:pStyle w:val="Compact"/>
         <w:numPr>
           <w:ilvl w:val="0"/>
-          <w:numId w:val="1586"/>
+          <w:numId w:val="1589"/>
         </w:numPr>
       </w:pPr>
       <w:r>
@@ -13694,7 +13742,7 @@
         <w:pStyle w:val="Compact"/>
         <w:numPr>
           <w:ilvl w:val="0"/>
-          <w:numId w:val="1587"/>
+          <w:numId w:val="1590"/>
         </w:numPr>
       </w:pPr>
       <w:r>
@@ -13706,7 +13754,7 @@
         <w:pStyle w:val="Compact"/>
         <w:numPr>
           <w:ilvl w:val="0"/>
-          <w:numId w:val="1588"/>
+          <w:numId w:val="1591"/>
         </w:numPr>
       </w:pPr>
       <w:r>
@@ -13718,7 +13766,7 @@
         <w:pStyle w:val="Compact"/>
         <w:numPr>
           <w:ilvl w:val="0"/>
-          <w:numId w:val="1589"/>
+          <w:numId w:val="1592"/>
         </w:numPr>
       </w:pPr>
       <w:r>
@@ -13730,7 +13778,7 @@
         <w:pStyle w:val="Compact"/>
         <w:numPr>
           <w:ilvl w:val="0"/>
-          <w:numId w:val="1590"/>
+          <w:numId w:val="1593"/>
         </w:numPr>
       </w:pPr>
       <w:r>
@@ -13742,7 +13790,7 @@
         <w:pStyle w:val="Compact"/>
         <w:numPr>
           <w:ilvl w:val="0"/>
-          <w:numId w:val="1591"/>
+          <w:numId w:val="1594"/>
         </w:numPr>
       </w:pPr>
       <w:r>
@@ -13754,7 +13802,7 @@
         <w:pStyle w:val="Compact"/>
         <w:numPr>
           <w:ilvl w:val="0"/>
-          <w:numId w:val="1592"/>
+          <w:numId w:val="1595"/>
         </w:numPr>
       </w:pPr>
       <w:r>
@@ -13766,7 +13814,7 @@
         <w:pStyle w:val="Compact"/>
         <w:numPr>
           <w:ilvl w:val="0"/>
-          <w:numId w:val="1593"/>
+          <w:numId w:val="1596"/>
         </w:numPr>
       </w:pPr>
       <w:r>
@@ -13793,7 +13841,7 @@
         <w:pStyle w:val="Compact"/>
         <w:numPr>
           <w:ilvl w:val="0"/>
-          <w:numId w:val="1594"/>
+          <w:numId w:val="1597"/>
         </w:numPr>
       </w:pPr>
       <w:r>
@@ -13814,7 +13862,7 @@
         <w:pStyle w:val="Compact"/>
         <w:numPr>
           <w:ilvl w:val="0"/>
-          <w:numId w:val="1595"/>
+          <w:numId w:val="1598"/>
         </w:numPr>
       </w:pPr>
       <w:r>
@@ -13836,7 +13884,7 @@
         <w:pStyle w:val="Compact"/>
         <w:numPr>
           <w:ilvl w:val="0"/>
-          <w:numId w:val="1596"/>
+          <w:numId w:val="1599"/>
         </w:numPr>
       </w:pPr>
       <w:r>
@@ -13848,7 +13896,7 @@
         <w:pStyle w:val="Compact"/>
         <w:numPr>
           <w:ilvl w:val="0"/>
-          <w:numId w:val="1597"/>
+          <w:numId w:val="1600"/>
         </w:numPr>
       </w:pPr>
       <w:r>
@@ -13860,7 +13908,7 @@
         <w:pStyle w:val="Compact"/>
         <w:numPr>
           <w:ilvl w:val="0"/>
-          <w:numId w:val="1598"/>
+          <w:numId w:val="1601"/>
         </w:numPr>
       </w:pPr>
       <w:r>
@@ -13872,7 +13920,7 @@
         <w:pStyle w:val="Compact"/>
         <w:numPr>
           <w:ilvl w:val="0"/>
-          <w:numId w:val="1599"/>
+          <w:numId w:val="1602"/>
         </w:numPr>
       </w:pPr>
       <w:r>
@@ -13884,7 +13932,7 @@
         <w:pStyle w:val="Compact"/>
         <w:numPr>
           <w:ilvl w:val="0"/>
-          <w:numId w:val="1600"/>
+          <w:numId w:val="1603"/>
         </w:numPr>
       </w:pPr>
       <w:r>
@@ -13896,7 +13944,7 @@
         <w:pStyle w:val="Compact"/>
         <w:numPr>
           <w:ilvl w:val="0"/>
-          <w:numId w:val="1601"/>
+          <w:numId w:val="1604"/>
         </w:numPr>
       </w:pPr>
       <w:r>
@@ -13908,7 +13956,7 @@
         <w:pStyle w:val="Compact"/>
         <w:numPr>
           <w:ilvl w:val="0"/>
-          <w:numId w:val="1602"/>
+          <w:numId w:val="1605"/>
         </w:numPr>
       </w:pPr>
       <w:r>
@@ -13920,7 +13968,7 @@
         <w:pStyle w:val="Compact"/>
         <w:numPr>
           <w:ilvl w:val="0"/>
-          <w:numId w:val="1603"/>
+          <w:numId w:val="1606"/>
         </w:numPr>
       </w:pPr>
       <w:r>
@@ -13942,7 +13990,7 @@
         <w:pStyle w:val="Compact"/>
         <w:numPr>
           <w:ilvl w:val="0"/>
-          <w:numId w:val="1604"/>
+          <w:numId w:val="1607"/>
         </w:numPr>
       </w:pPr>
       <w:r>
@@ -13954,7 +14002,7 @@
         <w:pStyle w:val="Compact"/>
         <w:numPr>
           <w:ilvl w:val="0"/>
-          <w:numId w:val="1605"/>
+          <w:numId w:val="1608"/>
         </w:numPr>
       </w:pPr>
       <w:r>
@@ -13966,7 +14014,7 @@
         <w:pStyle w:val="Compact"/>
         <w:numPr>
           <w:ilvl w:val="0"/>
-          <w:numId w:val="1606"/>
+          <w:numId w:val="1609"/>
         </w:numPr>
       </w:pPr>
       <w:r>
@@ -13978,7 +14026,7 @@
         <w:pStyle w:val="Compact"/>
         <w:numPr>
           <w:ilvl w:val="0"/>
-          <w:numId w:val="1607"/>
+          <w:numId w:val="1610"/>
         </w:numPr>
       </w:pPr>
       <w:r>
@@ -13990,7 +14038,7 @@
         <w:pStyle w:val="Compact"/>
         <w:numPr>
           <w:ilvl w:val="0"/>
-          <w:numId w:val="1608"/>
+          <w:numId w:val="1611"/>
         </w:numPr>
       </w:pPr>
       <w:r>
@@ -14002,7 +14050,7 @@
         <w:pStyle w:val="Compact"/>
         <w:numPr>
           <w:ilvl w:val="0"/>
-          <w:numId w:val="1609"/>
+          <w:numId w:val="1612"/>
         </w:numPr>
       </w:pPr>
       <w:r>
@@ -14014,7 +14062,7 @@
         <w:pStyle w:val="Compact"/>
         <w:numPr>
           <w:ilvl w:val="0"/>
-          <w:numId w:val="1610"/>
+          <w:numId w:val="1613"/>
         </w:numPr>
       </w:pPr>
       <w:r>
@@ -14026,7 +14074,7 @@
         <w:pStyle w:val="Compact"/>
         <w:numPr>
           <w:ilvl w:val="0"/>
-          <w:numId w:val="1611"/>
+          <w:numId w:val="1614"/>
         </w:numPr>
       </w:pPr>
       <w:r>
@@ -14038,7 +14086,7 @@
         <w:pStyle w:val="Compact"/>
         <w:numPr>
           <w:ilvl w:val="0"/>
-          <w:numId w:val="1612"/>
+          <w:numId w:val="1615"/>
         </w:numPr>
       </w:pPr>
       <w:r>
@@ -14050,7 +14098,7 @@
         <w:pStyle w:val="Compact"/>
         <w:numPr>
           <w:ilvl w:val="0"/>
-          <w:numId w:val="1613"/>
+          <w:numId w:val="1616"/>
         </w:numPr>
       </w:pPr>
       <w:r>
@@ -14062,7 +14110,7 @@
         <w:pStyle w:val="Compact"/>
         <w:numPr>
           <w:ilvl w:val="0"/>
-          <w:numId w:val="1614"/>
+          <w:numId w:val="1617"/>
         </w:numPr>
       </w:pPr>
       <w:r>
@@ -14074,7 +14122,7 @@
         <w:pStyle w:val="Compact"/>
         <w:numPr>
           <w:ilvl w:val="0"/>
-          <w:numId w:val="1615"/>
+          <w:numId w:val="1618"/>
         </w:numPr>
       </w:pPr>
       <w:r>
@@ -14086,7 +14134,7 @@
         <w:pStyle w:val="Compact"/>
         <w:numPr>
           <w:ilvl w:val="0"/>
-          <w:numId w:val="1616"/>
+          <w:numId w:val="1619"/>
         </w:numPr>
       </w:pPr>
       <w:r>
@@ -14098,7 +14146,7 @@
         <w:pStyle w:val="Compact"/>
         <w:numPr>
           <w:ilvl w:val="0"/>
-          <w:numId w:val="1617"/>
+          <w:numId w:val="1620"/>
         </w:numPr>
       </w:pPr>
       <w:r>
@@ -14110,7 +14158,7 @@
         <w:pStyle w:val="Compact"/>
         <w:numPr>
           <w:ilvl w:val="0"/>
-          <w:numId w:val="1618"/>
+          <w:numId w:val="1621"/>
         </w:numPr>
       </w:pPr>
       <w:r>
@@ -14142,7 +14190,7 @@
         <w:pStyle w:val="Compact"/>
         <w:numPr>
           <w:ilvl w:val="0"/>
-          <w:numId w:val="1619"/>
+          <w:numId w:val="1622"/>
         </w:numPr>
       </w:pPr>
       <w:r>
@@ -14154,7 +14202,7 @@
         <w:pStyle w:val="Compact"/>
         <w:numPr>
           <w:ilvl w:val="0"/>
-          <w:numId w:val="1620"/>
+          <w:numId w:val="1623"/>
         </w:numPr>
       </w:pPr>
       <w:r>
@@ -14166,7 +14214,7 @@
         <w:pStyle w:val="Compact"/>
         <w:numPr>
           <w:ilvl w:val="0"/>
-          <w:numId w:val="1621"/>
+          <w:numId w:val="1624"/>
         </w:numPr>
       </w:pPr>
       <w:r>
@@ -14178,7 +14226,7 @@
         <w:pStyle w:val="Compact"/>
         <w:numPr>
           <w:ilvl w:val="0"/>
-          <w:numId w:val="1622"/>
+          <w:numId w:val="1625"/>
         </w:numPr>
       </w:pPr>
       <w:r>
@@ -14190,7 +14238,7 @@
         <w:pStyle w:val="Compact"/>
         <w:numPr>
           <w:ilvl w:val="0"/>
-          <w:numId w:val="1623"/>
+          <w:numId w:val="1626"/>
         </w:numPr>
       </w:pPr>
       <w:r>
@@ -14202,7 +14250,7 @@
         <w:pStyle w:val="Compact"/>
         <w:numPr>
           <w:ilvl w:val="0"/>
-          <w:numId w:val="1624"/>
+          <w:numId w:val="1627"/>
         </w:numPr>
       </w:pPr>
       <w:r>
@@ -14214,7 +14262,7 @@
         <w:pStyle w:val="Compact"/>
         <w:numPr>
           <w:ilvl w:val="0"/>
-          <w:numId w:val="1625"/>
+          <w:numId w:val="1628"/>
         </w:numPr>
       </w:pPr>
       <w:r>
@@ -14226,7 +14274,7 @@
         <w:pStyle w:val="Compact"/>
         <w:numPr>
           <w:ilvl w:val="0"/>
-          <w:numId w:val="1626"/>
+          <w:numId w:val="1629"/>
         </w:numPr>
       </w:pPr>
       <w:r>
@@ -14238,7 +14286,7 @@
         <w:pStyle w:val="Compact"/>
         <w:numPr>
           <w:ilvl w:val="0"/>
-          <w:numId w:val="1627"/>
+          <w:numId w:val="1630"/>
         </w:numPr>
       </w:pPr>
       <w:r>
@@ -14250,7 +14298,7 @@
         <w:pStyle w:val="Compact"/>
         <w:numPr>
           <w:ilvl w:val="0"/>
-          <w:numId w:val="1628"/>
+          <w:numId w:val="1631"/>
         </w:numPr>
       </w:pPr>
       <w:r>
@@ -14262,7 +14310,7 @@
         <w:pStyle w:val="Compact"/>
         <w:numPr>
           <w:ilvl w:val="0"/>
-          <w:numId w:val="1629"/>
+          <w:numId w:val="1632"/>
         </w:numPr>
       </w:pPr>
       <w:r>
@@ -14274,7 +14322,7 @@
         <w:pStyle w:val="Compact"/>
         <w:numPr>
           <w:ilvl w:val="0"/>
-          <w:numId w:val="1630"/>
+          <w:numId w:val="1633"/>
         </w:numPr>
       </w:pPr>
       <w:r>
@@ -14286,7 +14334,7 @@
         <w:pStyle w:val="Compact"/>
         <w:numPr>
           <w:ilvl w:val="0"/>
-          <w:numId w:val="1631"/>
+          <w:numId w:val="1634"/>
         </w:numPr>
       </w:pPr>
       <w:r>
@@ -14323,7 +14371,7 @@
         <w:pStyle w:val="Compact"/>
         <w:numPr>
           <w:ilvl w:val="0"/>
-          <w:numId w:val="1632"/>
+          <w:numId w:val="1635"/>
         </w:numPr>
       </w:pPr>
       <w:r>
@@ -14335,7 +14383,7 @@
         <w:pStyle w:val="Compact"/>
         <w:numPr>
           <w:ilvl w:val="0"/>
-          <w:numId w:val="1633"/>
+          <w:numId w:val="1636"/>
         </w:numPr>
       </w:pPr>
       <w:r>
@@ -14362,7 +14410,7 @@
         <w:pStyle w:val="Compact"/>
         <w:numPr>
           <w:ilvl w:val="0"/>
-          <w:numId w:val="1634"/>
+          <w:numId w:val="1637"/>
         </w:numPr>
       </w:pPr>
       <w:r>
@@ -14374,7 +14422,7 @@
         <w:pStyle w:val="Compact"/>
         <w:numPr>
           <w:ilvl w:val="0"/>
-          <w:numId w:val="1635"/>
+          <w:numId w:val="1638"/>
         </w:numPr>
       </w:pPr>
       <w:r>
@@ -14386,7 +14434,7 @@
         <w:pStyle w:val="Compact"/>
         <w:numPr>
           <w:ilvl w:val="0"/>
-          <w:numId w:val="1636"/>
+          <w:numId w:val="1639"/>
         </w:numPr>
       </w:pPr>
       <w:r>
@@ -14398,7 +14446,7 @@
         <w:pStyle w:val="Compact"/>
         <w:numPr>
           <w:ilvl w:val="0"/>
-          <w:numId w:val="1637"/>
+          <w:numId w:val="1640"/>
         </w:numPr>
       </w:pPr>
       <w:r>
@@ -14410,7 +14458,7 @@
         <w:pStyle w:val="Compact"/>
         <w:numPr>
           <w:ilvl w:val="0"/>
-          <w:numId w:val="1638"/>
+          <w:numId w:val="1641"/>
         </w:numPr>
       </w:pPr>
       <w:r>
@@ -14422,7 +14470,7 @@
         <w:pStyle w:val="Compact"/>
         <w:numPr>
           <w:ilvl w:val="0"/>
-          <w:numId w:val="1639"/>
+          <w:numId w:val="1642"/>
         </w:numPr>
       </w:pPr>
       <w:r>
@@ -14444,7 +14492,7 @@
         <w:pStyle w:val="Compact"/>
         <w:numPr>
           <w:ilvl w:val="0"/>
-          <w:numId w:val="1640"/>
+          <w:numId w:val="1643"/>
         </w:numPr>
       </w:pPr>
       <w:r>
@@ -14456,7 +14504,7 @@
         <w:pStyle w:val="Compact"/>
         <w:numPr>
           <w:ilvl w:val="0"/>
-          <w:numId w:val="1641"/>
+          <w:numId w:val="1644"/>
         </w:numPr>
       </w:pPr>
       <w:r>
@@ -14468,7 +14516,7 @@
         <w:pStyle w:val="Compact"/>
         <w:numPr>
           <w:ilvl w:val="0"/>
-          <w:numId w:val="1642"/>
+          <w:numId w:val="1645"/>
         </w:numPr>
       </w:pPr>
       <w:r>
@@ -14480,7 +14528,7 @@
         <w:pStyle w:val="Compact"/>
         <w:numPr>
           <w:ilvl w:val="0"/>
-          <w:numId w:val="1643"/>
+          <w:numId w:val="1646"/>
         </w:numPr>
       </w:pPr>
       <w:r>
@@ -14492,7 +14540,7 @@
         <w:pStyle w:val="Compact"/>
         <w:numPr>
           <w:ilvl w:val="0"/>
-          <w:numId w:val="1644"/>
+          <w:numId w:val="1647"/>
         </w:numPr>
       </w:pPr>
       <w:r>
@@ -14504,7 +14552,7 @@
         <w:pStyle w:val="Compact"/>
         <w:numPr>
           <w:ilvl w:val="0"/>
-          <w:numId w:val="1645"/>
+          <w:numId w:val="1648"/>
         </w:numPr>
       </w:pPr>
       <w:r>
@@ -14516,7 +14564,7 @@
         <w:pStyle w:val="Compact"/>
         <w:numPr>
           <w:ilvl w:val="0"/>
-          <w:numId w:val="1646"/>
+          <w:numId w:val="1649"/>
         </w:numPr>
       </w:pPr>
       <w:r>
@@ -14528,7 +14576,7 @@
         <w:pStyle w:val="Compact"/>
         <w:numPr>
           <w:ilvl w:val="0"/>
-          <w:numId w:val="1647"/>
+          <w:numId w:val="1650"/>
         </w:numPr>
       </w:pPr>
       <w:r>
@@ -14540,7 +14588,7 @@
         <w:pStyle w:val="Compact"/>
         <w:numPr>
           <w:ilvl w:val="0"/>
-          <w:numId w:val="1648"/>
+          <w:numId w:val="1651"/>
         </w:numPr>
       </w:pPr>
       <w:r>
@@ -14563,7 +14611,7 @@
         <w:pStyle w:val="Compact"/>
         <w:numPr>
           <w:ilvl w:val="0"/>
-          <w:numId w:val="1649"/>
+          <w:numId w:val="1652"/>
         </w:numPr>
       </w:pPr>
       <w:r>
@@ -14575,7 +14623,7 @@
         <w:pStyle w:val="Compact"/>
         <w:numPr>
           <w:ilvl w:val="0"/>
-          <w:numId w:val="1650"/>
+          <w:numId w:val="1653"/>
         </w:numPr>
       </w:pPr>
       <w:r>
@@ -14587,7 +14635,7 @@
         <w:pStyle w:val="Compact"/>
         <w:numPr>
           <w:ilvl w:val="0"/>
-          <w:numId w:val="1651"/>
+          <w:numId w:val="1654"/>
         </w:numPr>
       </w:pPr>
       <w:r>
@@ -14599,7 +14647,7 @@
         <w:pStyle w:val="Compact"/>
         <w:numPr>
           <w:ilvl w:val="0"/>
-          <w:numId w:val="1652"/>
+          <w:numId w:val="1655"/>
         </w:numPr>
       </w:pPr>
       <w:r>
@@ -14611,7 +14659,7 @@
         <w:pStyle w:val="Compact"/>
         <w:numPr>
           <w:ilvl w:val="0"/>
-          <w:numId w:val="1653"/>
+          <w:numId w:val="1656"/>
         </w:numPr>
       </w:pPr>
       <w:r>
@@ -14623,7 +14671,7 @@
         <w:pStyle w:val="Compact"/>
         <w:numPr>
           <w:ilvl w:val="0"/>
-          <w:numId w:val="1654"/>
+          <w:numId w:val="1657"/>
         </w:numPr>
       </w:pPr>
       <w:r>
@@ -14635,7 +14683,7 @@
         <w:pStyle w:val="Compact"/>
         <w:numPr>
           <w:ilvl w:val="0"/>
-          <w:numId w:val="1655"/>
+          <w:numId w:val="1658"/>
         </w:numPr>
       </w:pPr>
       <w:r>
@@ -14647,7 +14695,7 @@
         <w:pStyle w:val="Compact"/>
         <w:numPr>
           <w:ilvl w:val="0"/>
-          <w:numId w:val="1656"/>
+          <w:numId w:val="1659"/>
         </w:numPr>
       </w:pPr>
       <w:r>
@@ -14659,7 +14707,7 @@
         <w:pStyle w:val="Compact"/>
         <w:numPr>
           <w:ilvl w:val="0"/>
-          <w:numId w:val="1657"/>
+          <w:numId w:val="1660"/>
         </w:numPr>
       </w:pPr>
       <w:r>
@@ -14671,7 +14719,7 @@
         <w:pStyle w:val="Compact"/>
         <w:numPr>
           <w:ilvl w:val="0"/>
-          <w:numId w:val="1658"/>
+          <w:numId w:val="1661"/>
         </w:numPr>
       </w:pPr>
       <w:r>
@@ -14683,7 +14731,7 @@
         <w:pStyle w:val="Compact"/>
         <w:numPr>
           <w:ilvl w:val="0"/>
-          <w:numId w:val="1659"/>
+          <w:numId w:val="1662"/>
         </w:numPr>
       </w:pPr>
       <w:r>
@@ -16402,28 +16450,28 @@
     <w:abstractNumId w:val="993"/>
   </w:num>
   <w:num w:numId="1400">
-    <w:abstractNumId w:val="992"/>
+    <w:abstractNumId w:val="993"/>
   </w:num>
   <w:num w:numId="1401">
-    <w:abstractNumId w:val="992"/>
+    <w:abstractNumId w:val="993"/>
   </w:num>
   <w:num w:numId="1402">
-    <w:abstractNumId w:val="992"/>
+    <w:abstractNumId w:val="993"/>
   </w:num>
   <w:num w:numId="1403">
-    <w:abstractNumId w:val="992"/>
+    <w:abstractNumId w:val="993"/>
   </w:num>
   <w:num w:numId="1404">
-    <w:abstractNumId w:val="992"/>
+    <w:abstractNumId w:val="993"/>
   </w:num>
   <w:num w:numId="1405">
-    <w:abstractNumId w:val="992"/>
+    <w:abstractNumId w:val="993"/>
   </w:num>
   <w:num w:numId="1406">
-    <w:abstractNumId w:val="992"/>
+    <w:abstractNumId w:val="993"/>
   </w:num>
   <w:num w:numId="1407">
-    <w:abstractNumId w:val="992"/>
+    <w:abstractNumId w:val="993"/>
   </w:num>
   <w:num w:numId="1408">
     <w:abstractNumId w:val="992"/>
@@ -16471,7 +16519,7 @@
     <w:abstractNumId w:val="992"/>
   </w:num>
   <w:num w:numId="1423">
-    <w:abstractNumId w:val="993"/>
+    <w:abstractNumId w:val="992"/>
   </w:num>
   <w:num w:numId="1424">
     <w:abstractNumId w:val="992"/>
@@ -16480,7 +16528,7 @@
     <w:abstractNumId w:val="992"/>
   </w:num>
   <w:num w:numId="1426">
-    <w:abstractNumId w:val="992"/>
+    <w:abstractNumId w:val="993"/>
   </w:num>
   <w:num w:numId="1427">
     <w:abstractNumId w:val="992"/>
@@ -16489,31 +16537,31 @@
     <w:abstractNumId w:val="992"/>
   </w:num>
   <w:num w:numId="1429">
-    <w:abstractNumId w:val="993"/>
+    <w:abstractNumId w:val="992"/>
   </w:num>
   <w:num w:numId="1430">
-    <w:abstractNumId w:val="993"/>
+    <w:abstractNumId w:val="992"/>
   </w:num>
   <w:num w:numId="1431">
-    <w:abstractNumId w:val="993"/>
+    <w:abstractNumId w:val="992"/>
   </w:num>
   <w:num w:numId="1432">
     <w:abstractNumId w:val="993"/>
   </w:num>
   <w:num w:numId="1433">
-    <w:abstractNumId w:val="992"/>
+    <w:abstractNumId w:val="993"/>
   </w:num>
   <w:num w:numId="1434">
-    <w:abstractNumId w:val="992"/>
+    <w:abstractNumId w:val="993"/>
   </w:num>
   <w:num w:numId="1435">
     <w:abstractNumId w:val="993"/>
   </w:num>
   <w:num w:numId="1436">
-    <w:abstractNumId w:val="993"/>
+    <w:abstractNumId w:val="992"/>
   </w:num>
   <w:num w:numId="1437">
-    <w:abstractNumId w:val="993"/>
+    <w:abstractNumId w:val="992"/>
   </w:num>
   <w:num w:numId="1438">
     <w:abstractNumId w:val="993"/>
@@ -16549,25 +16597,25 @@
     <w:abstractNumId w:val="993"/>
   </w:num>
   <w:num w:numId="1449">
-    <w:abstractNumId w:val="992"/>
+    <w:abstractNumId w:val="993"/>
   </w:num>
   <w:num w:numId="1450">
+    <w:abstractNumId w:val="993"/>
+  </w:num>
+  <w:num w:numId="1451">
+    <w:abstractNumId w:val="993"/>
+  </w:num>
+  <w:num w:numId="1452">
+    <w:abstractNumId w:val="992"/>
+  </w:num>
+  <w:num w:numId="1453">
     <w:abstractNumId w:val="991"/>
   </w:num>
-  <w:num w:numId="1451">
-    <w:abstractNumId w:val="993"/>
-  </w:num>
-  <w:num w:numId="1452">
-    <w:abstractNumId w:val="993"/>
-  </w:num>
-  <w:num w:numId="1453">
-    <w:abstractNumId w:val="992"/>
-  </w:num>
   <w:num w:numId="1454">
-    <w:abstractNumId w:val="992"/>
+    <w:abstractNumId w:val="993"/>
   </w:num>
   <w:num w:numId="1455">
-    <w:abstractNumId w:val="992"/>
+    <w:abstractNumId w:val="993"/>
   </w:num>
   <w:num w:numId="1456">
     <w:abstractNumId w:val="992"/>
@@ -16576,7 +16624,7 @@
     <w:abstractNumId w:val="992"/>
   </w:num>
   <w:num w:numId="1458">
-    <w:abstractNumId w:val="993"/>
+    <w:abstractNumId w:val="992"/>
   </w:num>
   <w:num w:numId="1459">
     <w:abstractNumId w:val="992"/>
@@ -16588,10 +16636,10 @@
     <w:abstractNumId w:val="993"/>
   </w:num>
   <w:num w:numId="1462">
-    <w:abstractNumId w:val="993"/>
+    <w:abstractNumId w:val="992"/>
   </w:num>
   <w:num w:numId="1463">
-    <w:abstractNumId w:val="993"/>
+    <w:abstractNumId w:val="992"/>
   </w:num>
   <w:num w:numId="1464">
     <w:abstractNumId w:val="993"/>
@@ -16627,53 +16675,53 @@
     <w:abstractNumId w:val="993"/>
   </w:num>
   <w:num w:numId="1475">
+    <w:abstractNumId w:val="993"/>
+  </w:num>
+  <w:num w:numId="1476">
+    <w:abstractNumId w:val="993"/>
+  </w:num>
+  <w:num w:numId="1477">
+    <w:abstractNumId w:val="993"/>
+  </w:num>
+  <w:num w:numId="1478">
     <w:abstractNumId w:val="991"/>
   </w:num>
-  <w:num w:numId="1476">
-    <w:abstractNumId w:val="993"/>
-  </w:num>
-  <w:num w:numId="1477">
-    <w:abstractNumId w:val="993"/>
-  </w:num>
-  <w:num w:numId="1478">
-    <w:abstractNumId w:val="993"/>
-  </w:num>
   <w:num w:numId="1479">
+    <w:abstractNumId w:val="993"/>
+  </w:num>
+  <w:num w:numId="1480">
+    <w:abstractNumId w:val="993"/>
+  </w:num>
+  <w:num w:numId="1481">
+    <w:abstractNumId w:val="993"/>
+  </w:num>
+  <w:num w:numId="1482">
     <w:abstractNumId w:val="991"/>
   </w:num>
-  <w:num w:numId="1480">
-    <w:abstractNumId w:val="993"/>
-  </w:num>
-  <w:num w:numId="1481">
-    <w:abstractNumId w:val="993"/>
-  </w:num>
-  <w:num w:numId="1482">
-    <w:abstractNumId w:val="992"/>
-  </w:num>
   <w:num w:numId="1483">
-    <w:abstractNumId w:val="992"/>
+    <w:abstractNumId w:val="993"/>
   </w:num>
   <w:num w:numId="1484">
     <w:abstractNumId w:val="993"/>
   </w:num>
   <w:num w:numId="1485">
+    <w:abstractNumId w:val="992"/>
+  </w:num>
+  <w:num w:numId="1486">
+    <w:abstractNumId w:val="992"/>
+  </w:num>
+  <w:num w:numId="1487">
+    <w:abstractNumId w:val="993"/>
+  </w:num>
+  <w:num w:numId="1488">
     <w:abstractNumId w:val="991"/>
   </w:num>
-  <w:num w:numId="1486">
-    <w:abstractNumId w:val="993"/>
-  </w:num>
-  <w:num w:numId="1487">
+  <w:num w:numId="1489">
+    <w:abstractNumId w:val="993"/>
+  </w:num>
+  <w:num w:numId="1490">
     <w:abstractNumId w:val="991"/>
   </w:num>
-  <w:num w:numId="1488">
-    <w:abstractNumId w:val="993"/>
-  </w:num>
-  <w:num w:numId="1489">
-    <w:abstractNumId w:val="993"/>
-  </w:num>
-  <w:num w:numId="1490">
-    <w:abstractNumId w:val="993"/>
-  </w:num>
   <w:num w:numId="1491">
     <w:abstractNumId w:val="993"/>
   </w:num>
@@ -16693,43 +16741,43 @@
     <w:abstractNumId w:val="993"/>
   </w:num>
   <w:num w:numId="1497">
+    <w:abstractNumId w:val="993"/>
+  </w:num>
+  <w:num w:numId="1498">
+    <w:abstractNumId w:val="993"/>
+  </w:num>
+  <w:num w:numId="1499">
+    <w:abstractNumId w:val="993"/>
+  </w:num>
+  <w:num w:numId="1500">
     <w:abstractNumId w:val="991"/>
   </w:num>
-  <w:num w:numId="1498">
-    <w:abstractNumId w:val="993"/>
-  </w:num>
-  <w:num w:numId="1499">
-    <w:abstractNumId w:val="993"/>
-  </w:num>
-  <w:num w:numId="1500">
-    <w:abstractNumId w:val="992"/>
-  </w:num>
   <w:num w:numId="1501">
-    <w:abstractNumId w:val="992"/>
+    <w:abstractNumId w:val="993"/>
   </w:num>
   <w:num w:numId="1502">
     <w:abstractNumId w:val="993"/>
   </w:num>
   <w:num w:numId="1503">
-    <w:abstractNumId w:val="993"/>
+    <w:abstractNumId w:val="992"/>
   </w:num>
   <w:num w:numId="1504">
-    <w:abstractNumId w:val="993"/>
+    <w:abstractNumId w:val="992"/>
   </w:num>
   <w:num w:numId="1505">
-    <w:abstractNumId w:val="992"/>
+    <w:abstractNumId w:val="993"/>
   </w:num>
   <w:num w:numId="1506">
-    <w:abstractNumId w:val="992"/>
+    <w:abstractNumId w:val="993"/>
   </w:num>
   <w:num w:numId="1507">
-    <w:abstractNumId w:val="992"/>
+    <w:abstractNumId w:val="993"/>
   </w:num>
   <w:num w:numId="1508">
     <w:abstractNumId w:val="992"/>
   </w:num>
   <w:num w:numId="1509">
-    <w:abstractNumId w:val="993"/>
+    <w:abstractNumId w:val="992"/>
   </w:num>
   <w:num w:numId="1510">
     <w:abstractNumId w:val="992"/>
@@ -16741,10 +16789,10 @@
     <w:abstractNumId w:val="993"/>
   </w:num>
   <w:num w:numId="1513">
-    <w:abstractNumId w:val="993"/>
+    <w:abstractNumId w:val="992"/>
   </w:num>
   <w:num w:numId="1514">
-    <w:abstractNumId w:val="993"/>
+    <w:abstractNumId w:val="992"/>
   </w:num>
   <w:num w:numId="1515">
     <w:abstractNumId w:val="993"/>
@@ -16798,17 +16846,17 @@
     <w:abstractNumId w:val="993"/>
   </w:num>
   <w:num w:numId="1532">
+    <w:abstractNumId w:val="993"/>
+  </w:num>
+  <w:num w:numId="1533">
+    <w:abstractNumId w:val="993"/>
+  </w:num>
+  <w:num w:numId="1534">
+    <w:abstractNumId w:val="993"/>
+  </w:num>
+  <w:num w:numId="1535">
     <w:abstractNumId w:val="991"/>
   </w:num>
-  <w:num w:numId="1533">
-    <w:abstractNumId w:val="992"/>
-  </w:num>
-  <w:num w:numId="1534">
-    <w:abstractNumId w:val="992"/>
-  </w:num>
-  <w:num w:numId="1535">
-    <w:abstractNumId w:val="992"/>
-  </w:num>
   <w:num w:numId="1536">
     <w:abstractNumId w:val="992"/>
   </w:num>
@@ -16849,13 +16897,13 @@
     <w:abstractNumId w:val="992"/>
   </w:num>
   <w:num w:numId="1549">
-    <w:abstractNumId w:val="993"/>
+    <w:abstractNumId w:val="992"/>
   </w:num>
   <w:num w:numId="1550">
-    <w:abstractNumId w:val="993"/>
+    <w:abstractNumId w:val="992"/>
   </w:num>
   <w:num w:numId="1551">
-    <w:abstractNumId w:val="993"/>
+    <w:abstractNumId w:val="992"/>
   </w:num>
   <w:num w:numId="1552">
     <w:abstractNumId w:val="993"/>
@@ -16864,7 +16912,7 @@
     <w:abstractNumId w:val="993"/>
   </w:num>
   <w:num w:numId="1554">
-    <w:abstractNumId w:val="991"/>
+    <w:abstractNumId w:val="993"/>
   </w:num>
   <w:num w:numId="1555">
     <w:abstractNumId w:val="993"/>
@@ -16882,7 +16930,7 @@
     <w:abstractNumId w:val="993"/>
   </w:num>
   <w:num w:numId="1560">
-    <w:abstractNumId w:val="993"/>
+    <w:abstractNumId w:val="991"/>
   </w:num>
   <w:num w:numId="1561">
     <w:abstractNumId w:val="993"/>
@@ -16906,31 +16954,31 @@
     <w:abstractNumId w:val="993"/>
   </w:num>
   <w:num w:numId="1568">
+    <w:abstractNumId w:val="993"/>
+  </w:num>
+  <w:num w:numId="1569">
+    <w:abstractNumId w:val="993"/>
+  </w:num>
+  <w:num w:numId="1570">
+    <w:abstractNumId w:val="993"/>
+  </w:num>
+  <w:num w:numId="1571">
     <w:abstractNumId w:val="991"/>
   </w:num>
-  <w:num w:numId="1569">
-    <w:abstractNumId w:val="993"/>
-  </w:num>
-  <w:num w:numId="1570">
+  <w:num w:numId="1572">
+    <w:abstractNumId w:val="993"/>
+  </w:num>
+  <w:num w:numId="1573">
     <w:abstractNumId w:val="991"/>
   </w:num>
-  <w:num w:numId="1571">
-    <w:abstractNumId w:val="993"/>
-  </w:num>
-  <w:num w:numId="1572">
-    <w:abstractNumId w:val="993"/>
-  </w:num>
-  <w:num w:numId="1573">
-    <w:abstractNumId w:val="993"/>
-  </w:num>
   <w:num w:numId="1574">
     <w:abstractNumId w:val="993"/>
   </w:num>
   <w:num w:numId="1575">
-    <w:abstractNumId w:val="992"/>
+    <w:abstractNumId w:val="993"/>
   </w:num>
   <w:num w:numId="1576">
-    <w:abstractNumId w:val="992"/>
+    <w:abstractNumId w:val="993"/>
   </w:num>
   <w:num w:numId="1577">
     <w:abstractNumId w:val="993"/>
@@ -16942,7 +16990,7 @@
     <w:abstractNumId w:val="992"/>
   </w:num>
   <w:num w:numId="1580">
-    <w:abstractNumId w:val="992"/>
+    <w:abstractNumId w:val="993"/>
   </w:num>
   <w:num w:numId="1581">
     <w:abstractNumId w:val="992"/>
@@ -16954,13 +17002,13 @@
     <w:abstractNumId w:val="992"/>
   </w:num>
   <w:num w:numId="1584">
-    <w:abstractNumId w:val="993"/>
+    <w:abstractNumId w:val="992"/>
   </w:num>
   <w:num w:numId="1585">
-    <w:abstractNumId w:val="993"/>
+    <w:abstractNumId w:val="992"/>
   </w:num>
   <w:num w:numId="1586">
-    <w:abstractNumId w:val="993"/>
+    <w:abstractNumId w:val="992"/>
   </w:num>
   <w:num w:numId="1587">
     <w:abstractNumId w:val="993"/>
@@ -16975,7 +17023,7 @@
     <w:abstractNumId w:val="993"/>
   </w:num>
   <w:num w:numId="1591">
-    <w:abstractNumId w:val="992"/>
+    <w:abstractNumId w:val="993"/>
   </w:num>
   <w:num w:numId="1592">
     <w:abstractNumId w:val="993"/>
@@ -16984,10 +17032,10 @@
     <w:abstractNumId w:val="993"/>
   </w:num>
   <w:num w:numId="1594">
-    <w:abstractNumId w:val="993"/>
+    <w:abstractNumId w:val="992"/>
   </w:num>
   <w:num w:numId="1595">
-    <w:abstractNumId w:val="992"/>
+    <w:abstractNumId w:val="993"/>
   </w:num>
   <w:num w:numId="1596">
     <w:abstractNumId w:val="993"/>
@@ -16996,10 +17044,10 @@
     <w:abstractNumId w:val="993"/>
   </w:num>
   <w:num w:numId="1598">
-    <w:abstractNumId w:val="993"/>
+    <w:abstractNumId w:val="992"/>
   </w:num>
   <w:num w:numId="1599">
-    <w:abstractNumId w:val="992"/>
+    <w:abstractNumId w:val="993"/>
   </w:num>
   <w:num w:numId="1600">
     <w:abstractNumId w:val="993"/>
@@ -17008,7 +17056,7 @@
     <w:abstractNumId w:val="993"/>
   </w:num>
   <w:num w:numId="1602">
-    <w:abstractNumId w:val="993"/>
+    <w:abstractNumId w:val="992"/>
   </w:num>
   <w:num w:numId="1603">
     <w:abstractNumId w:val="993"/>
@@ -17020,13 +17068,13 @@
     <w:abstractNumId w:val="993"/>
   </w:num>
   <w:num w:numId="1606">
-    <w:abstractNumId w:val="992"/>
+    <w:abstractNumId w:val="993"/>
   </w:num>
   <w:num w:numId="1607">
     <w:abstractNumId w:val="993"/>
   </w:num>
   <w:num w:numId="1608">
-    <w:abstractNumId w:val="992"/>
+    <w:abstractNumId w:val="993"/>
   </w:num>
   <w:num w:numId="1609">
     <w:abstractNumId w:val="992"/>
@@ -17035,28 +17083,28 @@
     <w:abstractNumId w:val="993"/>
   </w:num>
   <w:num w:numId="1611">
-    <w:abstractNumId w:val="993"/>
+    <w:abstractNumId w:val="992"/>
   </w:num>
   <w:num w:numId="1612">
-    <w:abstractNumId w:val="993"/>
+    <w:abstractNumId w:val="992"/>
   </w:num>
   <w:num w:numId="1613">
     <w:abstractNumId w:val="993"/>
   </w:num>
   <w:num w:numId="1614">
-    <w:abstractNumId w:val="992"/>
+    <w:abstractNumId w:val="993"/>
   </w:num>
   <w:num w:numId="1615">
-    <w:abstractNumId w:val="992"/>
+    <w:abstractNumId w:val="993"/>
   </w:num>
   <w:num w:numId="1616">
-    <w:abstractNumId w:val="992"/>
+    <w:abstractNumId w:val="993"/>
   </w:num>
   <w:num w:numId="1617">
     <w:abstractNumId w:val="992"/>
   </w:num>
   <w:num w:numId="1618">
-    <w:abstractNumId w:val="993"/>
+    <w:abstractNumId w:val="992"/>
   </w:num>
   <w:num w:numId="1619">
     <w:abstractNumId w:val="992"/>
@@ -17065,7 +17113,7 @@
     <w:abstractNumId w:val="992"/>
   </w:num>
   <w:num w:numId="1621">
-    <w:abstractNumId w:val="992"/>
+    <w:abstractNumId w:val="993"/>
   </w:num>
   <w:num w:numId="1622">
     <w:abstractNumId w:val="992"/>
@@ -17179,6 +17227,15 @@
     <w:abstractNumId w:val="992"/>
   </w:num>
   <w:num w:numId="1659">
+    <w:abstractNumId w:val="992"/>
+  </w:num>
+  <w:num w:numId="1660">
+    <w:abstractNumId w:val="992"/>
+  </w:num>
+  <w:num w:numId="1661">
+    <w:abstractNumId w:val="992"/>
+  </w:num>
+  <w:num w:numId="1662">
     <w:abstractNumId w:val="992"/>
   </w:num>
 </w:numbering>

</xml_diff>

<commit_message>
Record M1.6 drag funding smoke gate
</commit_message>
<xml_diff>
--- a/MASTER_M1_M2_DELIVERY_CHECKLIST.docx
+++ b/MASTER_M1_M2_DELIVERY_CHECKLIST.docx
@@ -10,7 +10,7 @@
         <w:t xml:space="preserve">© BuyReadySite.com</w:t>
       </w:r>
     </w:p>
-    <w:bookmarkStart w:id="89" w:name="X3d74ce0b4fd94f465ac7edf34b08aa6d5ff209b"/>
+    <w:bookmarkStart w:id="90" w:name="X3d74ce0b4fd94f465ac7edf34b08aa6d5ff209b"/>
     <w:p>
       <w:pPr>
         <w:pStyle w:val="Heading1"/>
@@ -457,7 +457,7 @@
               <w:jc w:val="right"/>
             </w:pPr>
             <w:r>
-              <w:t xml:space="preserve">3%</w:t>
+              <w:t xml:space="preserve">4%</w:t>
             </w:r>
           </w:p>
         </w:tc>
@@ -468,7 +468,7 @@
               <w:pStyle w:val="Compact"/>
             </w:pPr>
             <w:r>
-              <w:t xml:space="preserve">Build gate and browser smoke passed; full-env DB/Redis, drag/drop, and release gates remain</w:t>
+              <w:t xml:space="preserve">Build/browser smoke plus drag/drop + Funding History pass; full-env DB/Redis and release gates remain</w:t>
             </w:r>
           </w:p>
         </w:tc>
@@ -709,7 +709,7 @@
                 <w:b/>
                 <w:bCs/>
               </w:rPr>
-              <w:t xml:space="preserve">70%</w:t>
+              <w:t xml:space="preserve">71%</w:t>
             </w:r>
           </w:p>
         </w:tc>
@@ -724,7 +724,7 @@
                 <w:b/>
                 <w:bCs/>
               </w:rPr>
-              <w:t xml:space="preserve">M1.6 build/browser smoke evidence added; full-env regression gates remain</w:t>
+              <w:t xml:space="preserve">M1.6 drag/drop + Funding History evidence added; full-env regression gates remain</w:t>
             </w:r>
           </w:p>
         </w:tc>
@@ -9890,7 +9890,7 @@
     </w:p>
     <w:bookmarkEnd w:id="52"/>
     <w:bookmarkEnd w:id="53"/>
-    <w:bookmarkStart w:id="58" w:name="m1.6-m1-full-regression-and-release-gate"/>
+    <w:bookmarkStart w:id="59" w:name="m1.6-m1-full-regression-and-release-gate"/>
     <w:p>
       <w:pPr>
         <w:pStyle w:val="Heading2"/>
@@ -10116,12 +10116,124 @@
       </w:r>
     </w:p>
     <w:bookmarkEnd w:id="54"/>
-    <w:bookmarkStart w:id="55" w:name="functional-regression"/>
+    <w:bookmarkStart w:id="55" w:name="X5442a65ee97d16099431550e9654bb786707de0"/>
     <w:p>
       <w:pPr>
         <w:pStyle w:val="Heading3"/>
       </w:pPr>
       <w:r>
+        <w:t xml:space="preserve">Drag/drop + Funding History smoke — 2026-05-02</w:t>
+      </w:r>
+    </w:p>
+    <w:p>
+      <w:pPr>
+        <w:pStyle w:val="Compact"/>
+        <w:numPr>
+          <w:ilvl w:val="0"/>
+          <w:numId w:val="1403"/>
+        </w:numPr>
+      </w:pPr>
+      <w:r>
+        <w:t xml:space="preserve">Evidence JSON added:</w:t>
+      </w:r>
+      <w:r>
+        <w:t xml:space="preserve"> </w:t>
+      </w:r>
+      <w:r>
+        <w:rPr>
+          <w:rStyle w:val="VerbatimChar"/>
+        </w:rPr>
+        <w:t xml:space="preserve">audit-screenshots/m16-drag-funding-evidence.json</w:t>
+      </w:r>
+      <w:r>
+        <w:t xml:space="preserve">.</w:t>
+      </w:r>
+    </w:p>
+    <w:p>
+      <w:pPr>
+        <w:pStyle w:val="Compact"/>
+        <w:numPr>
+          <w:ilvl w:val="0"/>
+          <w:numId w:val="1404"/>
+        </w:numPr>
+      </w:pPr>
+      <w:r>
+        <w:t xml:space="preserve">Drag/drop smoke passed on production preview + mock API:</w:t>
+      </w:r>
+      <w:r>
+        <w:t xml:space="preserve"> </w:t>
+      </w:r>
+      <w:r>
+        <w:rPr>
+          <w:rStyle w:val="VerbatimChar"/>
+        </w:rPr>
+        <w:t xml:space="preserve">Atlas Demo Logistics</w:t>
+      </w:r>
+      <w:r>
+        <w:t xml:space="preserve"> </w:t>
+      </w:r>
+      <w:r>
+        <w:t xml:space="preserve">moved from Engaged / Interested to Qualified and</w:t>
+      </w:r>
+      <w:r>
+        <w:t xml:space="preserve"> </w:t>
+      </w:r>
+      <w:r>
+        <w:rPr>
+          <w:rStyle w:val="VerbatimChar"/>
+        </w:rPr>
+        <w:t xml:space="preserve">PUT /api/deals/deal-1/move</w:t>
+      </w:r>
+      <w:r>
+        <w:t xml:space="preserve"> </w:t>
+      </w:r>
+      <w:r>
+        <w:t xml:space="preserve">was captured with</w:t>
+      </w:r>
+      <w:r>
+        <w:t xml:space="preserve"> </w:t>
+      </w:r>
+      <w:r>
+        <w:rPr>
+          <w:rStyle w:val="VerbatimChar"/>
+        </w:rPr>
+        <w:t xml:space="preserve">{"stage":"QUALIFIED"}</w:t>
+      </w:r>
+      <w:r>
+        <w:t xml:space="preserve">.</w:t>
+      </w:r>
+    </w:p>
+    <w:p>
+      <w:pPr>
+        <w:pStyle w:val="Compact"/>
+        <w:numPr>
+          <w:ilvl w:val="0"/>
+          <w:numId w:val="1405"/>
+        </w:numPr>
+      </w:pPr>
+      <w:r>
+        <w:t xml:space="preserve">Funding History smoke passed: funded deal panel opened, Funding History tab became active, and the existing event showed lender, amount, product, rep, and notes.</w:t>
+      </w:r>
+    </w:p>
+    <w:p>
+      <w:pPr>
+        <w:pStyle w:val="Compact"/>
+        <w:numPr>
+          <w:ilvl w:val="0"/>
+          <w:numId w:val="1406"/>
+        </w:numPr>
+      </w:pPr>
+      <w:r>
+        <w:t xml:space="preserve">Gate captured no console errors and no request failures inside scope; local ignored screenshots were generated for before-drag, after-drag, and Funding History states.</w:t>
+      </w:r>
+    </w:p>
+    <w:bookmarkEnd w:id="55"/>
+    <w:bookmarkStart w:id="56" w:name="functional-regression"/>
+    <w:p>
+      <w:pPr>
+        <w:pStyle w:val="Heading3"/>
+      </w:pPr>
+      <w:r>
         <w:t xml:space="preserve">Functional regression</w:t>
       </w:r>
     </w:p>
@@ -10130,7 +10242,7 @@
         <w:pStyle w:val="Compact"/>
         <w:numPr>
           <w:ilvl w:val="0"/>
-          <w:numId w:val="1403"/>
+          <w:numId w:val="1407"/>
         </w:numPr>
       </w:pPr>
       <w:r>
@@ -10142,7 +10254,7 @@
         <w:pStyle w:val="Compact"/>
         <w:numPr>
           <w:ilvl w:val="0"/>
-          <w:numId w:val="1404"/>
+          <w:numId w:val="1408"/>
         </w:numPr>
       </w:pPr>
       <w:r>
@@ -10154,7 +10266,7 @@
         <w:pStyle w:val="Compact"/>
         <w:numPr>
           <w:ilvl w:val="0"/>
-          <w:numId w:val="1405"/>
+          <w:numId w:val="1409"/>
         </w:numPr>
       </w:pPr>
       <w:r>
@@ -10166,7 +10278,7 @@
         <w:pStyle w:val="Compact"/>
         <w:numPr>
           <w:ilvl w:val="0"/>
-          <w:numId w:val="1406"/>
+          <w:numId w:val="1410"/>
         </w:numPr>
       </w:pPr>
       <w:r>
@@ -10178,7 +10290,7 @@
         <w:pStyle w:val="Compact"/>
         <w:numPr>
           <w:ilvl w:val="0"/>
-          <w:numId w:val="1407"/>
+          <w:numId w:val="1411"/>
         </w:numPr>
       </w:pPr>
       <w:r>
@@ -10190,7 +10302,7 @@
         <w:pStyle w:val="Compact"/>
         <w:numPr>
           <w:ilvl w:val="0"/>
-          <w:numId w:val="1408"/>
+          <w:numId w:val="1412"/>
         </w:numPr>
       </w:pPr>
       <w:r>
@@ -10202,7 +10314,7 @@
         <w:pStyle w:val="Compact"/>
         <w:numPr>
           <w:ilvl w:val="0"/>
-          <w:numId w:val="1409"/>
+          <w:numId w:val="1413"/>
         </w:numPr>
       </w:pPr>
       <w:r>
@@ -10214,7 +10326,7 @@
         <w:pStyle w:val="Compact"/>
         <w:numPr>
           <w:ilvl w:val="0"/>
-          <w:numId w:val="1410"/>
+          <w:numId w:val="1414"/>
         </w:numPr>
       </w:pPr>
       <w:r>
@@ -10226,7 +10338,7 @@
         <w:pStyle w:val="Compact"/>
         <w:numPr>
           <w:ilvl w:val="0"/>
-          <w:numId w:val="1411"/>
+          <w:numId w:val="1415"/>
         </w:numPr>
       </w:pPr>
       <w:r>
@@ -10238,7 +10350,7 @@
         <w:pStyle w:val="Compact"/>
         <w:numPr>
           <w:ilvl w:val="0"/>
-          <w:numId w:val="1412"/>
+          <w:numId w:val="1416"/>
         </w:numPr>
       </w:pPr>
       <w:r>
@@ -10250,7 +10362,7 @@
         <w:pStyle w:val="Compact"/>
         <w:numPr>
           <w:ilvl w:val="0"/>
-          <w:numId w:val="1413"/>
+          <w:numId w:val="1417"/>
         </w:numPr>
       </w:pPr>
       <w:r>
@@ -10262,7 +10374,7 @@
         <w:pStyle w:val="Compact"/>
         <w:numPr>
           <w:ilvl w:val="0"/>
-          <w:numId w:val="1414"/>
+          <w:numId w:val="1418"/>
         </w:numPr>
       </w:pPr>
       <w:r>
@@ -10274,7 +10386,7 @@
         <w:pStyle w:val="Compact"/>
         <w:numPr>
           <w:ilvl w:val="0"/>
-          <w:numId w:val="1415"/>
+          <w:numId w:val="1419"/>
         </w:numPr>
       </w:pPr>
       <w:r>
@@ -10286,7 +10398,7 @@
         <w:pStyle w:val="Compact"/>
         <w:numPr>
           <w:ilvl w:val="0"/>
-          <w:numId w:val="1416"/>
+          <w:numId w:val="1420"/>
         </w:numPr>
       </w:pPr>
       <w:r>
@@ -10298,15 +10410,15 @@
         <w:pStyle w:val="Compact"/>
         <w:numPr>
           <w:ilvl w:val="0"/>
-          <w:numId w:val="1417"/>
+          <w:numId w:val="1421"/>
         </w:numPr>
       </w:pPr>
       <w:r>
         <w:t xml:space="preserve">Socket scoping unaffected.</w:t>
       </w:r>
     </w:p>
-    <w:bookmarkEnd w:id="55"/>
-    <w:bookmarkStart w:id="56" w:name="visual-regression"/>
+    <w:bookmarkEnd w:id="56"/>
+    <w:bookmarkStart w:id="57" w:name="visual-regression"/>
     <w:p>
       <w:pPr>
         <w:pStyle w:val="Heading3"/>
@@ -10320,7 +10432,7 @@
         <w:pStyle w:val="Compact"/>
         <w:numPr>
           <w:ilvl w:val="0"/>
-          <w:numId w:val="1418"/>
+          <w:numId w:val="1422"/>
         </w:numPr>
       </w:pPr>
       <w:r>
@@ -10332,7 +10444,7 @@
         <w:pStyle w:val="Compact"/>
         <w:numPr>
           <w:ilvl w:val="0"/>
-          <w:numId w:val="1419"/>
+          <w:numId w:val="1423"/>
         </w:numPr>
       </w:pPr>
       <w:r>
@@ -10344,7 +10456,7 @@
         <w:pStyle w:val="Compact"/>
         <w:numPr>
           <w:ilvl w:val="0"/>
-          <w:numId w:val="1420"/>
+          <w:numId w:val="1424"/>
         </w:numPr>
       </w:pPr>
       <w:r>
@@ -10356,7 +10468,7 @@
         <w:pStyle w:val="Compact"/>
         <w:numPr>
           <w:ilvl w:val="0"/>
-          <w:numId w:val="1421"/>
+          <w:numId w:val="1425"/>
         </w:numPr>
       </w:pPr>
       <w:r>
@@ -10368,7 +10480,7 @@
         <w:pStyle w:val="Compact"/>
         <w:numPr>
           <w:ilvl w:val="0"/>
-          <w:numId w:val="1422"/>
+          <w:numId w:val="1426"/>
         </w:numPr>
       </w:pPr>
       <w:r>
@@ -10380,7 +10492,7 @@
         <w:pStyle w:val="Compact"/>
         <w:numPr>
           <w:ilvl w:val="0"/>
-          <w:numId w:val="1423"/>
+          <w:numId w:val="1427"/>
         </w:numPr>
       </w:pPr>
       <w:r>
@@ -10392,15 +10504,15 @@
         <w:pStyle w:val="Compact"/>
         <w:numPr>
           <w:ilvl w:val="0"/>
-          <w:numId w:val="1424"/>
+          <w:numId w:val="1428"/>
         </w:numPr>
       </w:pPr>
       <w:r>
         <w:t xml:space="preserve">Sidebar remains unchanged unless intentionally touched.</w:t>
       </w:r>
     </w:p>
-    <w:bookmarkEnd w:id="56"/>
-    <w:bookmarkStart w:id="57" w:name="release-readiness"/>
+    <w:bookmarkEnd w:id="57"/>
+    <w:bookmarkStart w:id="58" w:name="release-readiness"/>
     <w:p>
       <w:pPr>
         <w:pStyle w:val="Heading3"/>
@@ -10414,7 +10526,7 @@
         <w:pStyle w:val="Compact"/>
         <w:numPr>
           <w:ilvl w:val="0"/>
-          <w:numId w:val="1425"/>
+          <w:numId w:val="1429"/>
         </w:numPr>
       </w:pPr>
       <w:r>
@@ -10426,7 +10538,7 @@
         <w:pStyle w:val="Compact"/>
         <w:numPr>
           <w:ilvl w:val="0"/>
-          <w:numId w:val="1426"/>
+          <w:numId w:val="1430"/>
         </w:numPr>
       </w:pPr>
       <w:r>
@@ -10438,7 +10550,7 @@
         <w:pStyle w:val="Compact"/>
         <w:numPr>
           <w:ilvl w:val="0"/>
-          <w:numId w:val="1427"/>
+          <w:numId w:val="1431"/>
         </w:numPr>
       </w:pPr>
       <w:r>
@@ -10450,7 +10562,7 @@
         <w:pStyle w:val="Compact"/>
         <w:numPr>
           <w:ilvl w:val="0"/>
-          <w:numId w:val="1428"/>
+          <w:numId w:val="1432"/>
         </w:numPr>
       </w:pPr>
       <w:r>
@@ -10462,7 +10574,7 @@
         <w:pStyle w:val="Compact"/>
         <w:numPr>
           <w:ilvl w:val="0"/>
-          <w:numId w:val="1429"/>
+          <w:numId w:val="1433"/>
         </w:numPr>
       </w:pPr>
       <w:r>
@@ -10474,7 +10586,7 @@
         <w:pStyle w:val="Compact"/>
         <w:numPr>
           <w:ilvl w:val="0"/>
-          <w:numId w:val="1430"/>
+          <w:numId w:val="1434"/>
         </w:numPr>
       </w:pPr>
       <w:r>
@@ -10486,16 +10598,16 @@
         <w:pStyle w:val="Compact"/>
         <w:numPr>
           <w:ilvl w:val="0"/>
-          <w:numId w:val="1431"/>
+          <w:numId w:val="1435"/>
         </w:numPr>
       </w:pPr>
       <w:r>
         <w:t xml:space="preserve">Progress dashboard updated to M1 complete only after all gates pass.</w:t>
       </w:r>
     </w:p>
-    <w:bookmarkEnd w:id="57"/>
     <w:bookmarkEnd w:id="58"/>
-    <w:bookmarkStart w:id="64" w:name="Xa989490dca5dab2d86ca3d9b72c2ded4f0c555a"/>
+    <w:bookmarkEnd w:id="59"/>
+    <w:bookmarkStart w:id="65" w:name="Xa989490dca5dab2d86ca3d9b72c2ded4f0c555a"/>
     <w:p>
       <w:pPr>
         <w:pStyle w:val="Heading2"/>
@@ -10504,7 +10616,7 @@
         <w:t xml:space="preserve">M2.1 — Leads/Campaign Access And Source Fixes</w:t>
       </w:r>
     </w:p>
-    <w:bookmarkStart w:id="59" w:name="implementation-evidence-2026-05-02-4"/>
+    <w:bookmarkStart w:id="60" w:name="implementation-evidence-2026-05-02-4"/>
     <w:p>
       <w:pPr>
         <w:pStyle w:val="Heading3"/>
@@ -10518,7 +10630,7 @@
         <w:pStyle w:val="Compact"/>
         <w:numPr>
           <w:ilvl w:val="0"/>
-          <w:numId w:val="1432"/>
+          <w:numId w:val="1436"/>
         </w:numPr>
       </w:pPr>
       <w:r>
@@ -10590,7 +10702,7 @@
         <w:pStyle w:val="Compact"/>
         <w:numPr>
           <w:ilvl w:val="0"/>
-          <w:numId w:val="1433"/>
+          <w:numId w:val="1437"/>
         </w:numPr>
       </w:pPr>
       <w:r>
@@ -10602,7 +10714,7 @@
         <w:pStyle w:val="Compact"/>
         <w:numPr>
           <w:ilvl w:val="0"/>
-          <w:numId w:val="1434"/>
+          <w:numId w:val="1438"/>
         </w:numPr>
       </w:pPr>
       <w:r>
@@ -10629,7 +10741,7 @@
         <w:pStyle w:val="Compact"/>
         <w:numPr>
           <w:ilvl w:val="0"/>
-          <w:numId w:val="1435"/>
+          <w:numId w:val="1439"/>
         </w:numPr>
       </w:pPr>
       <w:r>
@@ -10683,7 +10795,7 @@
         <w:pStyle w:val="Compact"/>
         <w:numPr>
           <w:ilvl w:val="0"/>
-          <w:numId w:val="1436"/>
+          <w:numId w:val="1440"/>
         </w:numPr>
       </w:pPr>
       <w:r>
@@ -10695,15 +10807,15 @@
         <w:pStyle w:val="Compact"/>
         <w:numPr>
           <w:ilvl w:val="0"/>
-          <w:numId w:val="1437"/>
+          <w:numId w:val="1441"/>
         </w:numPr>
       </w:pPr>
       <w:r>
         <w:t xml:space="preserve">CSV import smoke pending with two real rep accounts.</w:t>
       </w:r>
     </w:p>
-    <w:bookmarkEnd w:id="59"/>
-    <w:bookmarkStart w:id="60" w:name="leads-ownership-bug"/>
+    <w:bookmarkEnd w:id="60"/>
+    <w:bookmarkStart w:id="61" w:name="leads-ownership-bug"/>
     <w:p>
       <w:pPr>
         <w:pStyle w:val="Heading3"/>
@@ -10717,7 +10829,7 @@
         <w:pStyle w:val="Compact"/>
         <w:numPr>
           <w:ilvl w:val="0"/>
-          <w:numId w:val="1438"/>
+          <w:numId w:val="1442"/>
         </w:numPr>
       </w:pPr>
       <w:r>
@@ -10768,7 +10880,7 @@
         <w:pStyle w:val="Compact"/>
         <w:numPr>
           <w:ilvl w:val="0"/>
-          <w:numId w:val="1439"/>
+          <w:numId w:val="1443"/>
         </w:numPr>
       </w:pPr>
       <w:r>
@@ -10795,7 +10907,7 @@
         <w:pStyle w:val="Compact"/>
         <w:numPr>
           <w:ilvl w:val="0"/>
-          <w:numId w:val="1440"/>
+          <w:numId w:val="1444"/>
         </w:numPr>
       </w:pPr>
       <w:r>
@@ -10807,7 +10919,7 @@
         <w:pStyle w:val="Compact"/>
         <w:numPr>
           <w:ilvl w:val="0"/>
-          <w:numId w:val="1441"/>
+          <w:numId w:val="1445"/>
         </w:numPr>
       </w:pPr>
       <w:r>
@@ -10834,7 +10946,7 @@
         <w:pStyle w:val="Compact"/>
         <w:numPr>
           <w:ilvl w:val="0"/>
-          <w:numId w:val="1442"/>
+          <w:numId w:val="1446"/>
         </w:numPr>
       </w:pPr>
       <w:r>
@@ -10846,7 +10958,7 @@
         <w:pStyle w:val="Compact"/>
         <w:numPr>
           <w:ilvl w:val="0"/>
-          <w:numId w:val="1443"/>
+          <w:numId w:val="1447"/>
         </w:numPr>
       </w:pPr>
       <w:r>
@@ -10858,15 +10970,15 @@
         <w:pStyle w:val="Compact"/>
         <w:numPr>
           <w:ilvl w:val="0"/>
-          <w:numId w:val="1444"/>
+          <w:numId w:val="1448"/>
         </w:numPr>
       </w:pPr>
       <w:r>
         <w:t xml:space="preserve">Manager behavior documented: manager keeps admin-like global visibility for M2.1 unless JB narrows manager scope later.</w:t>
       </w:r>
     </w:p>
-    <w:bookmarkEnd w:id="60"/>
-    <w:bookmarkStart w:id="61" w:name="campaign-ownership-bug"/>
+    <w:bookmarkEnd w:id="61"/>
+    <w:bookmarkStart w:id="62" w:name="campaign-ownership-bug"/>
     <w:p>
       <w:pPr>
         <w:pStyle w:val="Heading3"/>
@@ -10880,7 +10992,7 @@
         <w:pStyle w:val="Compact"/>
         <w:numPr>
           <w:ilvl w:val="0"/>
-          <w:numId w:val="1445"/>
+          <w:numId w:val="1449"/>
         </w:numPr>
       </w:pPr>
       <w:r>
@@ -10904,7 +11016,7 @@
         <w:pStyle w:val="Compact"/>
         <w:numPr>
           <w:ilvl w:val="0"/>
-          <w:numId w:val="1446"/>
+          <w:numId w:val="1450"/>
         </w:numPr>
       </w:pPr>
       <w:r>
@@ -10928,7 +11040,7 @@
         <w:pStyle w:val="Compact"/>
         <w:numPr>
           <w:ilvl w:val="0"/>
-          <w:numId w:val="1447"/>
+          <w:numId w:val="1451"/>
         </w:numPr>
       </w:pPr>
       <w:r>
@@ -10940,7 +11052,7 @@
         <w:pStyle w:val="Compact"/>
         <w:numPr>
           <w:ilvl w:val="0"/>
-          <w:numId w:val="1448"/>
+          <w:numId w:val="1452"/>
         </w:numPr>
       </w:pPr>
       <w:r>
@@ -10952,7 +11064,7 @@
         <w:pStyle w:val="Compact"/>
         <w:numPr>
           <w:ilvl w:val="0"/>
-          <w:numId w:val="1449"/>
+          <w:numId w:val="1453"/>
         </w:numPr>
       </w:pPr>
       <w:r>
@@ -10964,7 +11076,7 @@
         <w:pStyle w:val="Compact"/>
         <w:numPr>
           <w:ilvl w:val="0"/>
-          <w:numId w:val="1450"/>
+          <w:numId w:val="1454"/>
         </w:numPr>
       </w:pPr>
       <w:r>
@@ -10980,8 +11092,8 @@
         <w:t xml:space="preserve">remains compatible.</w:t>
       </w:r>
     </w:p>
-    <w:bookmarkEnd w:id="61"/>
-    <w:bookmarkStart w:id="62" w:name="source-readable-fix"/>
+    <w:bookmarkEnd w:id="62"/>
+    <w:bookmarkStart w:id="63" w:name="source-readable-fix"/>
     <w:p>
       <w:pPr>
         <w:pStyle w:val="Heading3"/>
@@ -10995,7 +11107,7 @@
         <w:pStyle w:val="Compact"/>
         <w:numPr>
           <w:ilvl w:val="0"/>
-          <w:numId w:val="1451"/>
+          <w:numId w:val="1455"/>
         </w:numPr>
       </w:pPr>
       <w:r>
@@ -11007,7 +11119,7 @@
         <w:pStyle w:val="Compact"/>
         <w:numPr>
           <w:ilvl w:val="0"/>
-          <w:numId w:val="1452"/>
+          <w:numId w:val="1456"/>
         </w:numPr>
       </w:pPr>
       <w:r>
@@ -11019,7 +11131,7 @@
         <w:pStyle w:val="Compact"/>
         <w:numPr>
           <w:ilvl w:val="1"/>
-          <w:numId w:val="1453"/>
+          <w:numId w:val="1457"/>
         </w:numPr>
       </w:pPr>
       <w:r>
@@ -11037,7 +11149,7 @@
         <w:pStyle w:val="Compact"/>
         <w:numPr>
           <w:ilvl w:val="1"/>
-          <w:numId w:val="1453"/>
+          <w:numId w:val="1457"/>
         </w:numPr>
       </w:pPr>
       <w:r>
@@ -11055,7 +11167,7 @@
         <w:pStyle w:val="Compact"/>
         <w:numPr>
           <w:ilvl w:val="1"/>
-          <w:numId w:val="1453"/>
+          <w:numId w:val="1457"/>
         </w:numPr>
       </w:pPr>
       <w:r>
@@ -11073,7 +11185,7 @@
         <w:pStyle w:val="Compact"/>
         <w:numPr>
           <w:ilvl w:val="1"/>
-          <w:numId w:val="1453"/>
+          <w:numId w:val="1457"/>
         </w:numPr>
       </w:pPr>
       <w:r>
@@ -11091,7 +11203,7 @@
         <w:pStyle w:val="Compact"/>
         <w:numPr>
           <w:ilvl w:val="0"/>
-          <w:numId w:val="1454"/>
+          <w:numId w:val="1458"/>
         </w:numPr>
       </w:pPr>
       <w:r>
@@ -11103,7 +11215,7 @@
         <w:pStyle w:val="Compact"/>
         <w:numPr>
           <w:ilvl w:val="0"/>
-          <w:numId w:val="1455"/>
+          <w:numId w:val="1459"/>
         </w:numPr>
       </w:pPr>
       <w:r>
@@ -11115,15 +11227,15 @@
         <w:pStyle w:val="Compact"/>
         <w:numPr>
           <w:ilvl w:val="0"/>
-          <w:numId w:val="1456"/>
+          <w:numId w:val="1460"/>
         </w:numPr>
       </w:pPr>
       <w:r>
         <w:t xml:space="preserve">Campaign-created leads preserve campaign/list lineage.</w:t>
       </w:r>
     </w:p>
-    <w:bookmarkEnd w:id="62"/>
-    <w:bookmarkStart w:id="63" w:name="m2.1-testing-gate"/>
+    <w:bookmarkEnd w:id="63"/>
+    <w:bookmarkStart w:id="64" w:name="m2.1-testing-gate"/>
     <w:p>
       <w:pPr>
         <w:pStyle w:val="Heading3"/>
@@ -11137,7 +11249,7 @@
         <w:pStyle w:val="Compact"/>
         <w:numPr>
           <w:ilvl w:val="0"/>
-          <w:numId w:val="1457"/>
+          <w:numId w:val="1461"/>
         </w:numPr>
       </w:pPr>
       <w:r>
@@ -11149,7 +11261,7 @@
         <w:pStyle w:val="Compact"/>
         <w:numPr>
           <w:ilvl w:val="0"/>
-          <w:numId w:val="1458"/>
+          <w:numId w:val="1462"/>
         </w:numPr>
       </w:pPr>
       <w:r>
@@ -11161,7 +11273,7 @@
         <w:pStyle w:val="Compact"/>
         <w:numPr>
           <w:ilvl w:val="0"/>
-          <w:numId w:val="1459"/>
+          <w:numId w:val="1463"/>
         </w:numPr>
       </w:pPr>
       <w:r>
@@ -11173,7 +11285,7 @@
         <w:pStyle w:val="Compact"/>
         <w:numPr>
           <w:ilvl w:val="0"/>
-          <w:numId w:val="1460"/>
+          <w:numId w:val="1464"/>
         </w:numPr>
       </w:pPr>
       <w:r>
@@ -11185,7 +11297,7 @@
         <w:pStyle w:val="Compact"/>
         <w:numPr>
           <w:ilvl w:val="0"/>
-          <w:numId w:val="1461"/>
+          <w:numId w:val="1465"/>
         </w:numPr>
       </w:pPr>
       <w:r>
@@ -11197,7 +11309,7 @@
         <w:pStyle w:val="Compact"/>
         <w:numPr>
           <w:ilvl w:val="0"/>
-          <w:numId w:val="1462"/>
+          <w:numId w:val="1466"/>
         </w:numPr>
       </w:pPr>
       <w:r>
@@ -11209,7 +11321,7 @@
         <w:pStyle w:val="Compact"/>
         <w:numPr>
           <w:ilvl w:val="0"/>
-          <w:numId w:val="1463"/>
+          <w:numId w:val="1467"/>
         </w:numPr>
       </w:pPr>
       <w:r>
@@ -11221,7 +11333,7 @@
         <w:pStyle w:val="Compact"/>
         <w:numPr>
           <w:ilvl w:val="0"/>
-          <w:numId w:val="1464"/>
+          <w:numId w:val="1468"/>
         </w:numPr>
       </w:pPr>
       <w:r>
@@ -11233,16 +11345,16 @@
         <w:pStyle w:val="Compact"/>
         <w:numPr>
           <w:ilvl w:val="0"/>
-          <w:numId w:val="1465"/>
+          <w:numId w:val="1469"/>
         </w:numPr>
       </w:pPr>
       <w:r>
         <w:t xml:space="preserve">Progress dashboard updated.</w:t>
       </w:r>
     </w:p>
-    <w:bookmarkEnd w:id="63"/>
     <w:bookmarkEnd w:id="64"/>
-    <w:bookmarkStart w:id="71" w:name="X80216ddf01e64983419846741e514a0cb2a2ddb"/>
+    <w:bookmarkEnd w:id="65"/>
+    <w:bookmarkStart w:id="72" w:name="X80216ddf01e64983419846741e514a0cb2a2ddb"/>
     <w:p>
       <w:pPr>
         <w:pStyle w:val="Heading2"/>
@@ -11251,7 +11363,7 @@
         <w:t xml:space="preserve">M2.2 — Leads Enrichment Columns And Export CSV</w:t>
       </w:r>
     </w:p>
-    <w:bookmarkStart w:id="65" w:name="implementation-evidence-2026-05-02-5"/>
+    <w:bookmarkStart w:id="66" w:name="implementation-evidence-2026-05-02-5"/>
     <w:p>
       <w:pPr>
         <w:pStyle w:val="Heading3"/>
@@ -11265,7 +11377,7 @@
         <w:pStyle w:val="Compact"/>
         <w:numPr>
           <w:ilvl w:val="0"/>
-          <w:numId w:val="1466"/>
+          <w:numId w:val="1470"/>
         </w:numPr>
       </w:pPr>
       <w:r>
@@ -11292,7 +11404,7 @@
         <w:pStyle w:val="Compact"/>
         <w:numPr>
           <w:ilvl w:val="0"/>
-          <w:numId w:val="1467"/>
+          <w:numId w:val="1471"/>
         </w:numPr>
       </w:pPr>
       <w:r>
@@ -11364,7 +11476,7 @@
         <w:pStyle w:val="Compact"/>
         <w:numPr>
           <w:ilvl w:val="0"/>
-          <w:numId w:val="1468"/>
+          <w:numId w:val="1472"/>
         </w:numPr>
       </w:pPr>
       <w:r>
@@ -11391,7 +11503,7 @@
         <w:pStyle w:val="Compact"/>
         <w:numPr>
           <w:ilvl w:val="0"/>
-          <w:numId w:val="1469"/>
+          <w:numId w:val="1473"/>
         </w:numPr>
       </w:pPr>
       <w:r>
@@ -11403,7 +11515,7 @@
         <w:pStyle w:val="Compact"/>
         <w:numPr>
           <w:ilvl w:val="0"/>
-          <w:numId w:val="1470"/>
+          <w:numId w:val="1474"/>
         </w:numPr>
       </w:pPr>
       <w:r>
@@ -11430,7 +11542,7 @@
         <w:pStyle w:val="Compact"/>
         <w:numPr>
           <w:ilvl w:val="0"/>
-          <w:numId w:val="1471"/>
+          <w:numId w:val="1475"/>
         </w:numPr>
       </w:pPr>
       <w:r>
@@ -11442,7 +11554,7 @@
         <w:pStyle w:val="Compact"/>
         <w:numPr>
           <w:ilvl w:val="0"/>
-          <w:numId w:val="1472"/>
+          <w:numId w:val="1476"/>
         </w:numPr>
       </w:pPr>
       <w:r>
@@ -11469,7 +11581,7 @@
         <w:pStyle w:val="Compact"/>
         <w:numPr>
           <w:ilvl w:val="0"/>
-          <w:numId w:val="1473"/>
+          <w:numId w:val="1477"/>
         </w:numPr>
       </w:pPr>
       <w:r>
@@ -11511,7 +11623,7 @@
         <w:pStyle w:val="Compact"/>
         <w:numPr>
           <w:ilvl w:val="0"/>
-          <w:numId w:val="1474"/>
+          <w:numId w:val="1478"/>
         </w:numPr>
       </w:pPr>
       <w:r>
@@ -11547,15 +11659,15 @@
         <w:pStyle w:val="Compact"/>
         <w:numPr>
           <w:ilvl w:val="0"/>
-          <w:numId w:val="1475"/>
+          <w:numId w:val="1479"/>
         </w:numPr>
       </w:pPr>
       <w:r>
         <w:t xml:space="preserve">Targeted ESLint passed with 0 errors and existing warning debt only.</w:t>
       </w:r>
     </w:p>
-    <w:bookmarkEnd w:id="65"/>
-    <w:bookmarkStart w:id="66" w:name="leads-table-columns"/>
+    <w:bookmarkEnd w:id="66"/>
+    <w:bookmarkStart w:id="67" w:name="leads-table-columns"/>
     <w:p>
       <w:pPr>
         <w:pStyle w:val="Heading3"/>
@@ -11569,7 +11681,7 @@
         <w:pStyle w:val="Compact"/>
         <w:numPr>
           <w:ilvl w:val="0"/>
-          <w:numId w:val="1476"/>
+          <w:numId w:val="1480"/>
         </w:numPr>
       </w:pPr>
       <w:r>
@@ -11581,164 +11693,11 @@
         <w:pStyle w:val="Compact"/>
         <w:numPr>
           <w:ilvl w:val="0"/>
-          <w:numId w:val="1477"/>
+          <w:numId w:val="1481"/>
         </w:numPr>
       </w:pPr>
       <w:r>
         <w:t xml:space="preserve">Columns match prototype order:</w:t>
-      </w:r>
-    </w:p>
-    <w:p>
-      <w:pPr>
-        <w:pStyle w:val="Compact"/>
-        <w:numPr>
-          <w:ilvl w:val="1"/>
-          <w:numId w:val="1478"/>
-        </w:numPr>
-      </w:pPr>
-      <w:r>
-        <w:t xml:space="preserve">Name;</w:t>
-      </w:r>
-    </w:p>
-    <w:p>
-      <w:pPr>
-        <w:pStyle w:val="Compact"/>
-        <w:numPr>
-          <w:ilvl w:val="1"/>
-          <w:numId w:val="1478"/>
-        </w:numPr>
-      </w:pPr>
-      <w:r>
-        <w:t xml:space="preserve">Phone;</w:t>
-      </w:r>
-    </w:p>
-    <w:p>
-      <w:pPr>
-        <w:pStyle w:val="Compact"/>
-        <w:numPr>
-          <w:ilvl w:val="1"/>
-          <w:numId w:val="1478"/>
-        </w:numPr>
-      </w:pPr>
-      <w:r>
-        <w:t xml:space="preserve">Status;</w:t>
-      </w:r>
-    </w:p>
-    <w:p>
-      <w:pPr>
-        <w:pStyle w:val="Compact"/>
-        <w:numPr>
-          <w:ilvl w:val="1"/>
-          <w:numId w:val="1478"/>
-        </w:numPr>
-      </w:pPr>
-      <w:r>
-        <w:t xml:space="preserve">Last Contact;</w:t>
-      </w:r>
-    </w:p>
-    <w:p>
-      <w:pPr>
-        <w:pStyle w:val="Compact"/>
-        <w:numPr>
-          <w:ilvl w:val="1"/>
-          <w:numId w:val="1478"/>
-        </w:numPr>
-      </w:pPr>
-      <w:r>
-        <w:t xml:space="preserve">Industry;</w:t>
-      </w:r>
-    </w:p>
-    <w:p>
-      <w:pPr>
-        <w:pStyle w:val="Compact"/>
-        <w:numPr>
-          <w:ilvl w:val="1"/>
-          <w:numId w:val="1478"/>
-        </w:numPr>
-      </w:pPr>
-      <w:r>
-        <w:t xml:space="preserve">Monthly Revenue;</w:t>
-      </w:r>
-    </w:p>
-    <w:p>
-      <w:pPr>
-        <w:pStyle w:val="Compact"/>
-        <w:numPr>
-          <w:ilvl w:val="1"/>
-          <w:numId w:val="1478"/>
-        </w:numPr>
-      </w:pPr>
-      <w:r>
-        <w:t xml:space="preserve">Source;</w:t>
-      </w:r>
-    </w:p>
-    <w:p>
-      <w:pPr>
-        <w:pStyle w:val="Compact"/>
-        <w:numPr>
-          <w:ilvl w:val="1"/>
-          <w:numId w:val="1478"/>
-        </w:numPr>
-      </w:pPr>
-      <w:r>
-        <w:t xml:space="preserve">Added.</w:t>
-      </w:r>
-    </w:p>
-    <w:p>
-      <w:pPr>
-        <w:pStyle w:val="Compact"/>
-        <w:numPr>
-          <w:ilvl w:val="0"/>
-          <w:numId w:val="1479"/>
-        </w:numPr>
-      </w:pPr>
-      <w:r>
-        <w:t xml:space="preserve">Last Contact shows rep attribution initials and relative time, e.g. </w:t>
-      </w:r>
-      <w:r>
-        <w:rPr>
-          <w:rStyle w:val="VerbatimChar"/>
-        </w:rPr>
-        <w:t xml:space="preserve">JB 2h ago</w:t>
-      </w:r>
-      <w:r>
-        <w:t xml:space="preserve">.</w:t>
-      </w:r>
-    </w:p>
-    <w:p>
-      <w:pPr>
-        <w:pStyle w:val="Compact"/>
-        <w:numPr>
-          <w:ilvl w:val="0"/>
-          <w:numId w:val="1480"/>
-        </w:numPr>
-      </w:pPr>
-      <w:r>
-        <w:t xml:space="preserve">Industry renders extracted/classified value or</w:t>
-      </w:r>
-      <w:r>
-        <w:t xml:space="preserve"> </w:t>
-      </w:r>
-      <w:r>
-        <w:rPr>
-          <w:rStyle w:val="VerbatimChar"/>
-        </w:rPr>
-        <w:t xml:space="preserve">— unknown</w:t>
-      </w:r>
-      <w:r>
-        <w:t xml:space="preserve">.</w:t>
-      </w:r>
-    </w:p>
-    <w:p>
-      <w:pPr>
-        <w:pStyle w:val="Compact"/>
-        <w:numPr>
-          <w:ilvl w:val="0"/>
-          <w:numId w:val="1481"/>
-        </w:numPr>
-      </w:pPr>
-      <w:r>
-        <w:t xml:space="preserve">Monthly Revenue renders raw/formatted revenue plus provenance chip:</w:t>
       </w:r>
     </w:p>
     <w:p>
@@ -11750,7 +11709,7 @@
         </w:numPr>
       </w:pPr>
       <w:r>
-        <w:t xml:space="preserve">AI;</w:t>
+        <w:t xml:space="preserve">Name;</w:t>
       </w:r>
     </w:p>
     <w:p>
@@ -11762,7 +11721,7 @@
         </w:numPr>
       </w:pPr>
       <w:r>
-        <w:t xml:space="preserve">CSV;</w:t>
+        <w:t xml:space="preserve">Phone;</w:t>
       </w:r>
     </w:p>
     <w:p>
@@ -11774,6 +11733,159 @@
         </w:numPr>
       </w:pPr>
       <w:r>
+        <w:t xml:space="preserve">Status;</w:t>
+      </w:r>
+    </w:p>
+    <w:p>
+      <w:pPr>
+        <w:pStyle w:val="Compact"/>
+        <w:numPr>
+          <w:ilvl w:val="1"/>
+          <w:numId w:val="1482"/>
+        </w:numPr>
+      </w:pPr>
+      <w:r>
+        <w:t xml:space="preserve">Last Contact;</w:t>
+      </w:r>
+    </w:p>
+    <w:p>
+      <w:pPr>
+        <w:pStyle w:val="Compact"/>
+        <w:numPr>
+          <w:ilvl w:val="1"/>
+          <w:numId w:val="1482"/>
+        </w:numPr>
+      </w:pPr>
+      <w:r>
+        <w:t xml:space="preserve">Industry;</w:t>
+      </w:r>
+    </w:p>
+    <w:p>
+      <w:pPr>
+        <w:pStyle w:val="Compact"/>
+        <w:numPr>
+          <w:ilvl w:val="1"/>
+          <w:numId w:val="1482"/>
+        </w:numPr>
+      </w:pPr>
+      <w:r>
+        <w:t xml:space="preserve">Monthly Revenue;</w:t>
+      </w:r>
+    </w:p>
+    <w:p>
+      <w:pPr>
+        <w:pStyle w:val="Compact"/>
+        <w:numPr>
+          <w:ilvl w:val="1"/>
+          <w:numId w:val="1482"/>
+        </w:numPr>
+      </w:pPr>
+      <w:r>
+        <w:t xml:space="preserve">Source;</w:t>
+      </w:r>
+    </w:p>
+    <w:p>
+      <w:pPr>
+        <w:pStyle w:val="Compact"/>
+        <w:numPr>
+          <w:ilvl w:val="1"/>
+          <w:numId w:val="1482"/>
+        </w:numPr>
+      </w:pPr>
+      <w:r>
+        <w:t xml:space="preserve">Added.</w:t>
+      </w:r>
+    </w:p>
+    <w:p>
+      <w:pPr>
+        <w:pStyle w:val="Compact"/>
+        <w:numPr>
+          <w:ilvl w:val="0"/>
+          <w:numId w:val="1483"/>
+        </w:numPr>
+      </w:pPr>
+      <w:r>
+        <w:t xml:space="preserve">Last Contact shows rep attribution initials and relative time, e.g. </w:t>
+      </w:r>
+      <w:r>
+        <w:rPr>
+          <w:rStyle w:val="VerbatimChar"/>
+        </w:rPr>
+        <w:t xml:space="preserve">JB 2h ago</w:t>
+      </w:r>
+      <w:r>
+        <w:t xml:space="preserve">.</w:t>
+      </w:r>
+    </w:p>
+    <w:p>
+      <w:pPr>
+        <w:pStyle w:val="Compact"/>
+        <w:numPr>
+          <w:ilvl w:val="0"/>
+          <w:numId w:val="1484"/>
+        </w:numPr>
+      </w:pPr>
+      <w:r>
+        <w:t xml:space="preserve">Industry renders extracted/classified value or</w:t>
+      </w:r>
+      <w:r>
+        <w:t xml:space="preserve"> </w:t>
+      </w:r>
+      <w:r>
+        <w:rPr>
+          <w:rStyle w:val="VerbatimChar"/>
+        </w:rPr>
+        <w:t xml:space="preserve">— unknown</w:t>
+      </w:r>
+      <w:r>
+        <w:t xml:space="preserve">.</w:t>
+      </w:r>
+    </w:p>
+    <w:p>
+      <w:pPr>
+        <w:pStyle w:val="Compact"/>
+        <w:numPr>
+          <w:ilvl w:val="0"/>
+          <w:numId w:val="1485"/>
+        </w:numPr>
+      </w:pPr>
+      <w:r>
+        <w:t xml:space="preserve">Monthly Revenue renders raw/formatted revenue plus provenance chip:</w:t>
+      </w:r>
+    </w:p>
+    <w:p>
+      <w:pPr>
+        <w:pStyle w:val="Compact"/>
+        <w:numPr>
+          <w:ilvl w:val="1"/>
+          <w:numId w:val="1486"/>
+        </w:numPr>
+      </w:pPr>
+      <w:r>
+        <w:t xml:space="preserve">AI;</w:t>
+      </w:r>
+    </w:p>
+    <w:p>
+      <w:pPr>
+        <w:pStyle w:val="Compact"/>
+        <w:numPr>
+          <w:ilvl w:val="1"/>
+          <w:numId w:val="1486"/>
+        </w:numPr>
+      </w:pPr>
+      <w:r>
+        <w:t xml:space="preserve">CSV;</w:t>
+      </w:r>
+    </w:p>
+    <w:p>
+      <w:pPr>
+        <w:pStyle w:val="Compact"/>
+        <w:numPr>
+          <w:ilvl w:val="1"/>
+          <w:numId w:val="1486"/>
+        </w:numPr>
+      </w:pPr>
+      <w:r>
         <w:t xml:space="preserve">MANUAL.</w:t>
       </w:r>
     </w:p>
@@ -11782,7 +11894,7 @@
         <w:pStyle w:val="Compact"/>
         <w:numPr>
           <w:ilvl w:val="0"/>
-          <w:numId w:val="1483"/>
+          <w:numId w:val="1487"/>
         </w:numPr>
       </w:pPr>
       <w:r>
@@ -11806,7 +11918,7 @@
         <w:pStyle w:val="Compact"/>
         <w:numPr>
           <w:ilvl w:val="0"/>
-          <w:numId w:val="1484"/>
+          <w:numId w:val="1488"/>
         </w:numPr>
       </w:pPr>
       <w:r>
@@ -11818,7 +11930,7 @@
         <w:pStyle w:val="Compact"/>
         <w:numPr>
           <w:ilvl w:val="0"/>
-          <w:numId w:val="1485"/>
+          <w:numId w:val="1489"/>
         </w:numPr>
       </w:pPr>
       <w:r>
@@ -11830,15 +11942,15 @@
         <w:pStyle w:val="Compact"/>
         <w:numPr>
           <w:ilvl w:val="0"/>
-          <w:numId w:val="1486"/>
+          <w:numId w:val="1490"/>
         </w:numPr>
       </w:pPr>
       <w:r>
         <w:t xml:space="preserve">Avatar initials match prototype density.</w:t>
       </w:r>
     </w:p>
-    <w:bookmarkEnd w:id="66"/>
-    <w:bookmarkStart w:id="67" w:name="data-plumbing"/>
+    <w:bookmarkEnd w:id="67"/>
+    <w:bookmarkStart w:id="68" w:name="data-plumbing"/>
     <w:p>
       <w:pPr>
         <w:pStyle w:val="Heading3"/>
@@ -11852,7 +11964,7 @@
         <w:pStyle w:val="Compact"/>
         <w:numPr>
           <w:ilvl w:val="0"/>
-          <w:numId w:val="1487"/>
+          <w:numId w:val="1491"/>
         </w:numPr>
       </w:pPr>
       <w:r>
@@ -11864,7 +11976,7 @@
         <w:pStyle w:val="Compact"/>
         <w:numPr>
           <w:ilvl w:val="1"/>
-          <w:numId w:val="1488"/>
+          <w:numId w:val="1492"/>
         </w:numPr>
       </w:pPr>
       <w:r>
@@ -11876,7 +11988,7 @@
         <w:pStyle w:val="Compact"/>
         <w:numPr>
           <w:ilvl w:val="1"/>
-          <w:numId w:val="1488"/>
+          <w:numId w:val="1492"/>
         </w:numPr>
       </w:pPr>
       <w:r>
@@ -11888,7 +12000,7 @@
         <w:pStyle w:val="Compact"/>
         <w:numPr>
           <w:ilvl w:val="1"/>
-          <w:numId w:val="1488"/>
+          <w:numId w:val="1492"/>
         </w:numPr>
       </w:pPr>
       <w:r>
@@ -11900,7 +12012,7 @@
         <w:pStyle w:val="Compact"/>
         <w:numPr>
           <w:ilvl w:val="0"/>
-          <w:numId w:val="1489"/>
+          <w:numId w:val="1493"/>
         </w:numPr>
       </w:pPr>
       <w:r>
@@ -11912,7 +12024,7 @@
         <w:pStyle w:val="Compact"/>
         <w:numPr>
           <w:ilvl w:val="1"/>
-          <w:numId w:val="1490"/>
+          <w:numId w:val="1494"/>
         </w:numPr>
       </w:pPr>
       <w:r>
@@ -11924,7 +12036,7 @@
         <w:pStyle w:val="Compact"/>
         <w:numPr>
           <w:ilvl w:val="1"/>
-          <w:numId w:val="1490"/>
+          <w:numId w:val="1494"/>
         </w:numPr>
       </w:pPr>
       <w:r>
@@ -11936,7 +12048,7 @@
         <w:pStyle w:val="Compact"/>
         <w:numPr>
           <w:ilvl w:val="1"/>
-          <w:numId w:val="1490"/>
+          <w:numId w:val="1494"/>
         </w:numPr>
       </w:pPr>
       <w:r>
@@ -11948,7 +12060,7 @@
         <w:pStyle w:val="Compact"/>
         <w:numPr>
           <w:ilvl w:val="0"/>
-          <w:numId w:val="1491"/>
+          <w:numId w:val="1495"/>
         </w:numPr>
       </w:pPr>
       <w:r>
@@ -11960,7 +12072,7 @@
         <w:pStyle w:val="Compact"/>
         <w:numPr>
           <w:ilvl w:val="0"/>
-          <w:numId w:val="1492"/>
+          <w:numId w:val="1496"/>
         </w:numPr>
       </w:pPr>
       <w:r>
@@ -11972,15 +12084,15 @@
         <w:pStyle w:val="Compact"/>
         <w:numPr>
           <w:ilvl w:val="0"/>
-          <w:numId w:val="1493"/>
+          <w:numId w:val="1497"/>
         </w:numPr>
       </w:pPr>
       <w:r>
         <w:t xml:space="preserve">Rep scope applies to all enrichment queries.</w:t>
       </w:r>
     </w:p>
-    <w:bookmarkEnd w:id="67"/>
-    <w:bookmarkStart w:id="68" w:name="export-csv"/>
+    <w:bookmarkEnd w:id="68"/>
+    <w:bookmarkStart w:id="69" w:name="export-csv"/>
     <w:p>
       <w:pPr>
         <w:pStyle w:val="Heading3"/>
@@ -11994,7 +12106,7 @@
         <w:pStyle w:val="Compact"/>
         <w:numPr>
           <w:ilvl w:val="0"/>
-          <w:numId w:val="1494"/>
+          <w:numId w:val="1498"/>
         </w:numPr>
       </w:pPr>
       <w:r>
@@ -12015,7 +12127,7 @@
         <w:pStyle w:val="Compact"/>
         <w:numPr>
           <w:ilvl w:val="0"/>
-          <w:numId w:val="1495"/>
+          <w:numId w:val="1499"/>
         </w:numPr>
       </w:pPr>
       <w:r>
@@ -12027,7 +12139,7 @@
         <w:pStyle w:val="Compact"/>
         <w:numPr>
           <w:ilvl w:val="0"/>
-          <w:numId w:val="1496"/>
+          <w:numId w:val="1500"/>
         </w:numPr>
       </w:pPr>
       <w:r>
@@ -12039,7 +12151,7 @@
         <w:pStyle w:val="Compact"/>
         <w:numPr>
           <w:ilvl w:val="0"/>
-          <w:numId w:val="1497"/>
+          <w:numId w:val="1501"/>
         </w:numPr>
       </w:pPr>
       <w:r>
@@ -12051,7 +12163,7 @@
         <w:pStyle w:val="Compact"/>
         <w:numPr>
           <w:ilvl w:val="0"/>
-          <w:numId w:val="1498"/>
+          <w:numId w:val="1502"/>
         </w:numPr>
       </w:pPr>
       <w:r>
@@ -12063,7 +12175,7 @@
         <w:pStyle w:val="Compact"/>
         <w:numPr>
           <w:ilvl w:val="0"/>
-          <w:numId w:val="1499"/>
+          <w:numId w:val="1503"/>
         </w:numPr>
       </w:pPr>
       <w:r>
@@ -12075,7 +12187,7 @@
         <w:pStyle w:val="Compact"/>
         <w:numPr>
           <w:ilvl w:val="1"/>
-          <w:numId w:val="1500"/>
+          <w:numId w:val="1504"/>
         </w:numPr>
       </w:pPr>
       <w:r>
@@ -12087,7 +12199,7 @@
         <w:pStyle w:val="Compact"/>
         <w:numPr>
           <w:ilvl w:val="1"/>
-          <w:numId w:val="1500"/>
+          <w:numId w:val="1504"/>
         </w:numPr>
       </w:pPr>
       <w:r>
@@ -12099,7 +12211,7 @@
         <w:pStyle w:val="Compact"/>
         <w:numPr>
           <w:ilvl w:val="1"/>
-          <w:numId w:val="1500"/>
+          <w:numId w:val="1504"/>
         </w:numPr>
       </w:pPr>
       <w:r>
@@ -12111,7 +12223,7 @@
         <w:pStyle w:val="Compact"/>
         <w:numPr>
           <w:ilvl w:val="1"/>
-          <w:numId w:val="1500"/>
+          <w:numId w:val="1504"/>
         </w:numPr>
       </w:pPr>
       <w:r>
@@ -12123,7 +12235,7 @@
         <w:pStyle w:val="Compact"/>
         <w:numPr>
           <w:ilvl w:val="1"/>
-          <w:numId w:val="1500"/>
+          <w:numId w:val="1504"/>
         </w:numPr>
       </w:pPr>
       <w:r>
@@ -12135,7 +12247,7 @@
         <w:pStyle w:val="Compact"/>
         <w:numPr>
           <w:ilvl w:val="1"/>
-          <w:numId w:val="1500"/>
+          <w:numId w:val="1504"/>
         </w:numPr>
       </w:pPr>
       <w:r>
@@ -12147,7 +12259,7 @@
         <w:pStyle w:val="Compact"/>
         <w:numPr>
           <w:ilvl w:val="0"/>
-          <w:numId w:val="1501"/>
+          <w:numId w:val="1505"/>
         </w:numPr>
       </w:pPr>
       <w:r>
@@ -12159,15 +12271,15 @@
         <w:pStyle w:val="Compact"/>
         <w:numPr>
           <w:ilvl w:val="0"/>
-          <w:numId w:val="1502"/>
+          <w:numId w:val="1506"/>
         </w:numPr>
       </w:pPr>
       <w:r>
         <w:t xml:space="preserve">CSV escaping handles commas, quotes, line breaks.</w:t>
       </w:r>
     </w:p>
-    <w:bookmarkEnd w:id="68"/>
-    <w:bookmarkStart w:id="69" w:name="m2.2-style-isolation"/>
+    <w:bookmarkEnd w:id="69"/>
+    <w:bookmarkStart w:id="70" w:name="m2.2-style-isolation"/>
     <w:p>
       <w:pPr>
         <w:pStyle w:val="Heading3"/>
@@ -12181,7 +12293,7 @@
         <w:pStyle w:val="Compact"/>
         <w:numPr>
           <w:ilvl w:val="0"/>
-          <w:numId w:val="1503"/>
+          <w:numId w:val="1507"/>
         </w:numPr>
       </w:pPr>
       <w:r>
@@ -12193,7 +12305,7 @@
         <w:pStyle w:val="Compact"/>
         <w:numPr>
           <w:ilvl w:val="0"/>
-          <w:numId w:val="1504"/>
+          <w:numId w:val="1508"/>
         </w:numPr>
       </w:pPr>
       <w:r>
@@ -12205,7 +12317,7 @@
         <w:pStyle w:val="Compact"/>
         <w:numPr>
           <w:ilvl w:val="0"/>
-          <w:numId w:val="1505"/>
+          <w:numId w:val="1509"/>
         </w:numPr>
       </w:pPr>
       <w:r>
@@ -12217,7 +12329,7 @@
         <w:pStyle w:val="Compact"/>
         <w:numPr>
           <w:ilvl w:val="0"/>
-          <w:numId w:val="1506"/>
+          <w:numId w:val="1510"/>
         </w:numPr>
       </w:pPr>
       <w:r>
@@ -12229,15 +12341,15 @@
         <w:pStyle w:val="Compact"/>
         <w:numPr>
           <w:ilvl w:val="0"/>
-          <w:numId w:val="1507"/>
+          <w:numId w:val="1511"/>
         </w:numPr>
       </w:pPr>
       <w:r>
         <w:t xml:space="preserve">Ensure text truncation/line wrapping is deliberate and not overlapping.</w:t>
       </w:r>
     </w:p>
-    <w:bookmarkEnd w:id="69"/>
-    <w:bookmarkStart w:id="70" w:name="m2.2-testing-gate"/>
+    <w:bookmarkEnd w:id="70"/>
+    <w:bookmarkStart w:id="71" w:name="m2.2-testing-gate"/>
     <w:p>
       <w:pPr>
         <w:pStyle w:val="Heading3"/>
@@ -12251,7 +12363,7 @@
         <w:pStyle w:val="Compact"/>
         <w:numPr>
           <w:ilvl w:val="0"/>
-          <w:numId w:val="1508"/>
+          <w:numId w:val="1512"/>
         </w:numPr>
       </w:pPr>
       <w:r>
@@ -12263,7 +12375,7 @@
         <w:pStyle w:val="Compact"/>
         <w:numPr>
           <w:ilvl w:val="0"/>
-          <w:numId w:val="1509"/>
+          <w:numId w:val="1513"/>
         </w:numPr>
       </w:pPr>
       <w:r>
@@ -12275,7 +12387,7 @@
         <w:pStyle w:val="Compact"/>
         <w:numPr>
           <w:ilvl w:val="0"/>
-          <w:numId w:val="1510"/>
+          <w:numId w:val="1514"/>
         </w:numPr>
       </w:pPr>
       <w:r>
@@ -12287,7 +12399,7 @@
         <w:pStyle w:val="Compact"/>
         <w:numPr>
           <w:ilvl w:val="0"/>
-          <w:numId w:val="1511"/>
+          <w:numId w:val="1515"/>
         </w:numPr>
       </w:pPr>
       <w:r>
@@ -12299,7 +12411,7 @@
         <w:pStyle w:val="Compact"/>
         <w:numPr>
           <w:ilvl w:val="0"/>
-          <w:numId w:val="1512"/>
+          <w:numId w:val="1516"/>
         </w:numPr>
       </w:pPr>
       <w:r>
@@ -12311,7 +12423,7 @@
         <w:pStyle w:val="Compact"/>
         <w:numPr>
           <w:ilvl w:val="0"/>
-          <w:numId w:val="1513"/>
+          <w:numId w:val="1517"/>
         </w:numPr>
       </w:pPr>
       <w:r>
@@ -12323,7 +12435,7 @@
         <w:pStyle w:val="Compact"/>
         <w:numPr>
           <w:ilvl w:val="0"/>
-          <w:numId w:val="1514"/>
+          <w:numId w:val="1518"/>
         </w:numPr>
       </w:pPr>
       <w:r>
@@ -12335,16 +12447,16 @@
         <w:pStyle w:val="Compact"/>
         <w:numPr>
           <w:ilvl w:val="0"/>
-          <w:numId w:val="1515"/>
+          <w:numId w:val="1519"/>
         </w:numPr>
       </w:pPr>
       <w:r>
         <w:t xml:space="preserve">Progress dashboard updated.</w:t>
       </w:r>
     </w:p>
-    <w:bookmarkEnd w:id="70"/>
     <w:bookmarkEnd w:id="71"/>
-    <w:bookmarkStart w:id="82" w:name="m2.3-ai-retarget-campaigns"/>
+    <w:bookmarkEnd w:id="72"/>
+    <w:bookmarkStart w:id="83" w:name="m2.3-ai-retarget-campaigns"/>
     <w:p>
       <w:pPr>
         <w:pStyle w:val="Heading2"/>
@@ -12353,7 +12465,7 @@
         <w:t xml:space="preserve">M2.3 — AI Retarget Campaigns</w:t>
       </w:r>
     </w:p>
-    <w:bookmarkStart w:id="72" w:name="implementation-evidence-2026-05-02-6"/>
+    <w:bookmarkStart w:id="73" w:name="implementation-evidence-2026-05-02-6"/>
     <w:p>
       <w:pPr>
         <w:pStyle w:val="Heading3"/>
@@ -12367,7 +12479,7 @@
         <w:pStyle w:val="Compact"/>
         <w:numPr>
           <w:ilvl w:val="0"/>
-          <w:numId w:val="1516"/>
+          <w:numId w:val="1520"/>
         </w:numPr>
       </w:pPr>
       <w:r>
@@ -12415,7 +12527,7 @@
         <w:pStyle w:val="Compact"/>
         <w:numPr>
           <w:ilvl w:val="0"/>
-          <w:numId w:val="1517"/>
+          <w:numId w:val="1521"/>
         </w:numPr>
       </w:pPr>
       <w:r>
@@ -12427,7 +12539,7 @@
         <w:pStyle w:val="Compact"/>
         <w:numPr>
           <w:ilvl w:val="0"/>
-          <w:numId w:val="1518"/>
+          <w:numId w:val="1522"/>
         </w:numPr>
       </w:pPr>
       <w:r>
@@ -12439,7 +12551,7 @@
         <w:pStyle w:val="Compact"/>
         <w:numPr>
           <w:ilvl w:val="0"/>
-          <w:numId w:val="1519"/>
+          <w:numId w:val="1523"/>
         </w:numPr>
       </w:pPr>
       <w:r>
@@ -12451,7 +12563,7 @@
         <w:pStyle w:val="Compact"/>
         <w:numPr>
           <w:ilvl w:val="0"/>
-          <w:numId w:val="1520"/>
+          <w:numId w:val="1524"/>
         </w:numPr>
       </w:pPr>
       <w:r>
@@ -12463,7 +12575,7 @@
         <w:pStyle w:val="Compact"/>
         <w:numPr>
           <w:ilvl w:val="0"/>
-          <w:numId w:val="1521"/>
+          <w:numId w:val="1525"/>
         </w:numPr>
       </w:pPr>
       <w:r>
@@ -12517,7 +12629,7 @@
         <w:pStyle w:val="Compact"/>
         <w:numPr>
           <w:ilvl w:val="0"/>
-          <w:numId w:val="1522"/>
+          <w:numId w:val="1526"/>
         </w:numPr>
       </w:pPr>
       <w:r>
@@ -12529,7 +12641,7 @@
         <w:pStyle w:val="Compact"/>
         <w:numPr>
           <w:ilvl w:val="0"/>
-          <w:numId w:val="1523"/>
+          <w:numId w:val="1527"/>
         </w:numPr>
       </w:pPr>
       <w:r>
@@ -12556,7 +12668,7 @@
         <w:pStyle w:val="Compact"/>
         <w:numPr>
           <w:ilvl w:val="0"/>
-          <w:numId w:val="1524"/>
+          <w:numId w:val="1528"/>
         </w:numPr>
       </w:pPr>
       <w:r>
@@ -12598,7 +12710,7 @@
         <w:pStyle w:val="Compact"/>
         <w:numPr>
           <w:ilvl w:val="0"/>
-          <w:numId w:val="1525"/>
+          <w:numId w:val="1529"/>
         </w:numPr>
       </w:pPr>
       <w:r>
@@ -12625,7 +12737,7 @@
         <w:pStyle w:val="Compact"/>
         <w:numPr>
           <w:ilvl w:val="0"/>
-          <w:numId w:val="1526"/>
+          <w:numId w:val="1530"/>
         </w:numPr>
       </w:pPr>
       <w:r>
@@ -12637,7 +12749,7 @@
         <w:pStyle w:val="Compact"/>
         <w:numPr>
           <w:ilvl w:val="0"/>
-          <w:numId w:val="1527"/>
+          <w:numId w:val="1531"/>
         </w:numPr>
       </w:pPr>
       <w:r>
@@ -12649,7 +12761,7 @@
         <w:pStyle w:val="Compact"/>
         <w:numPr>
           <w:ilvl w:val="0"/>
-          <w:numId w:val="1528"/>
+          <w:numId w:val="1532"/>
         </w:numPr>
       </w:pPr>
       <w:r>
@@ -12671,8 +12783,8 @@
         <w:t xml:space="preserve">— 5/5 passed after cap tests; server build passed.</w:t>
       </w:r>
     </w:p>
-    <w:bookmarkEnd w:id="72"/>
-    <w:bookmarkStart w:id="73" w:name="scope-lock-for-ai-retarget"/>
+    <w:bookmarkEnd w:id="73"/>
+    <w:bookmarkStart w:id="74" w:name="scope-lock-for-ai-retarget"/>
     <w:p>
       <w:pPr>
         <w:pStyle w:val="Heading3"/>
@@ -12686,7 +12798,7 @@
         <w:pStyle w:val="Compact"/>
         <w:numPr>
           <w:ilvl w:val="0"/>
-          <w:numId w:val="1529"/>
+          <w:numId w:val="1533"/>
         </w:numPr>
       </w:pPr>
       <w:r>
@@ -12698,7 +12810,7 @@
         <w:pStyle w:val="Compact"/>
         <w:numPr>
           <w:ilvl w:val="0"/>
-          <w:numId w:val="1530"/>
+          <w:numId w:val="1534"/>
         </w:numPr>
       </w:pPr>
       <w:r>
@@ -12710,7 +12822,7 @@
         <w:pStyle w:val="Compact"/>
         <w:numPr>
           <w:ilvl w:val="0"/>
-          <w:numId w:val="1531"/>
+          <w:numId w:val="1535"/>
         </w:numPr>
       </w:pPr>
       <w:r>
@@ -12722,7 +12834,7 @@
         <w:pStyle w:val="Compact"/>
         <w:numPr>
           <w:ilvl w:val="0"/>
-          <w:numId w:val="1532"/>
+          <w:numId w:val="1536"/>
         </w:numPr>
       </w:pPr>
       <w:r>
@@ -12734,7 +12846,7 @@
         <w:pStyle w:val="Compact"/>
         <w:numPr>
           <w:ilvl w:val="0"/>
-          <w:numId w:val="1533"/>
+          <w:numId w:val="1537"/>
         </w:numPr>
       </w:pPr>
       <w:r>
@@ -12746,7 +12858,7 @@
         <w:pStyle w:val="Compact"/>
         <w:numPr>
           <w:ilvl w:val="0"/>
-          <w:numId w:val="1534"/>
+          <w:numId w:val="1538"/>
         </w:numPr>
       </w:pPr>
       <w:r>
@@ -12758,7 +12870,7 @@
         <w:pStyle w:val="Compact"/>
         <w:numPr>
           <w:ilvl w:val="1"/>
-          <w:numId w:val="1535"/>
+          <w:numId w:val="1539"/>
         </w:numPr>
       </w:pPr>
       <w:r>
@@ -12785,7 +12897,7 @@
         <w:pStyle w:val="Compact"/>
         <w:numPr>
           <w:ilvl w:val="1"/>
-          <w:numId w:val="1535"/>
+          <w:numId w:val="1539"/>
         </w:numPr>
       </w:pPr>
       <w:r>
@@ -12807,8 +12919,8 @@
         <w:t xml:space="preserve">scoping correctness.</w:t>
       </w:r>
     </w:p>
-    <w:bookmarkEnd w:id="73"/>
-    <w:bookmarkStart w:id="74" w:name="database-model"/>
+    <w:bookmarkEnd w:id="74"/>
+    <w:bookmarkStart w:id="75" w:name="database-model"/>
     <w:p>
       <w:pPr>
         <w:pStyle w:val="Heading3"/>
@@ -12822,7 +12934,7 @@
         <w:pStyle w:val="Compact"/>
         <w:numPr>
           <w:ilvl w:val="0"/>
-          <w:numId w:val="1536"/>
+          <w:numId w:val="1540"/>
         </w:numPr>
       </w:pPr>
       <w:r>
@@ -12864,7 +12976,7 @@
         <w:pStyle w:val="Compact"/>
         <w:numPr>
           <w:ilvl w:val="0"/>
-          <w:numId w:val="1537"/>
+          <w:numId w:val="1541"/>
         </w:numPr>
       </w:pPr>
       <w:r>
@@ -12888,7 +13000,7 @@
         <w:pStyle w:val="Compact"/>
         <w:numPr>
           <w:ilvl w:val="0"/>
-          <w:numId w:val="1538"/>
+          <w:numId w:val="1542"/>
         </w:numPr>
       </w:pPr>
       <w:r>
@@ -12912,7 +13024,7 @@
         <w:pStyle w:val="Compact"/>
         <w:numPr>
           <w:ilvl w:val="0"/>
-          <w:numId w:val="1539"/>
+          <w:numId w:val="1543"/>
         </w:numPr>
       </w:pPr>
       <w:r>
@@ -12924,7 +13036,7 @@
         <w:pStyle w:val="Compact"/>
         <w:numPr>
           <w:ilvl w:val="0"/>
-          <w:numId w:val="1540"/>
+          <w:numId w:val="1544"/>
         </w:numPr>
       </w:pPr>
       <w:r>
@@ -12936,7 +13048,7 @@
         <w:pStyle w:val="Compact"/>
         <w:numPr>
           <w:ilvl w:val="0"/>
-          <w:numId w:val="1541"/>
+          <w:numId w:val="1545"/>
         </w:numPr>
       </w:pPr>
       <w:r>
@@ -12948,7 +13060,7 @@
         <w:pStyle w:val="Compact"/>
         <w:numPr>
           <w:ilvl w:val="0"/>
-          <w:numId w:val="1542"/>
+          <w:numId w:val="1546"/>
         </w:numPr>
       </w:pPr>
       <w:r>
@@ -12960,7 +13072,7 @@
         <w:pStyle w:val="Compact"/>
         <w:numPr>
           <w:ilvl w:val="0"/>
-          <w:numId w:val="1543"/>
+          <w:numId w:val="1547"/>
         </w:numPr>
       </w:pPr>
       <w:r>
@@ -12972,7 +13084,7 @@
         <w:pStyle w:val="Compact"/>
         <w:numPr>
           <w:ilvl w:val="0"/>
-          <w:numId w:val="1544"/>
+          <w:numId w:val="1548"/>
         </w:numPr>
       </w:pPr>
       <w:r>
@@ -12984,7 +13096,7 @@
         <w:pStyle w:val="Compact"/>
         <w:numPr>
           <w:ilvl w:val="0"/>
-          <w:numId w:val="1545"/>
+          <w:numId w:val="1549"/>
         </w:numPr>
       </w:pPr>
       <w:r>
@@ -12996,7 +13108,7 @@
         <w:pStyle w:val="Compact"/>
         <w:numPr>
           <w:ilvl w:val="0"/>
-          <w:numId w:val="1546"/>
+          <w:numId w:val="1550"/>
         </w:numPr>
       </w:pPr>
       <w:r>
@@ -13008,7 +13120,7 @@
         <w:pStyle w:val="Compact"/>
         <w:numPr>
           <w:ilvl w:val="0"/>
-          <w:numId w:val="1547"/>
+          <w:numId w:val="1551"/>
         </w:numPr>
       </w:pPr>
       <w:r>
@@ -13020,7 +13132,7 @@
         <w:pStyle w:val="Compact"/>
         <w:numPr>
           <w:ilvl w:val="0"/>
-          <w:numId w:val="1548"/>
+          <w:numId w:val="1552"/>
         </w:numPr>
       </w:pPr>
       <w:r>
@@ -13032,7 +13144,7 @@
         <w:pStyle w:val="Compact"/>
         <w:numPr>
           <w:ilvl w:val="0"/>
-          <w:numId w:val="1549"/>
+          <w:numId w:val="1553"/>
         </w:numPr>
       </w:pPr>
       <w:r>
@@ -13059,7 +13171,7 @@
         <w:pStyle w:val="Compact"/>
         <w:numPr>
           <w:ilvl w:val="0"/>
-          <w:numId w:val="1550"/>
+          <w:numId w:val="1554"/>
         </w:numPr>
       </w:pPr>
       <w:r>
@@ -13071,15 +13183,15 @@
         <w:pStyle w:val="Compact"/>
         <w:numPr>
           <w:ilvl w:val="0"/>
-          <w:numId w:val="1551"/>
+          <w:numId w:val="1555"/>
         </w:numPr>
       </w:pPr>
       <w:r>
         <w:t xml:space="preserve">Ensure expired cohorts are ignored safely.</w:t>
       </w:r>
     </w:p>
-    <w:bookmarkEnd w:id="74"/>
-    <w:bookmarkStart w:id="75" w:name="cohort-generation"/>
+    <w:bookmarkEnd w:id="75"/>
+    <w:bookmarkStart w:id="76" w:name="cohort-generation"/>
     <w:p>
       <w:pPr>
         <w:pStyle w:val="Heading3"/>
@@ -13093,7 +13205,7 @@
         <w:pStyle w:val="Compact"/>
         <w:numPr>
           <w:ilvl w:val="0"/>
-          <w:numId w:val="1552"/>
+          <w:numId w:val="1556"/>
         </w:numPr>
       </w:pPr>
       <w:r>
@@ -13105,7 +13217,7 @@
         <w:pStyle w:val="Compact"/>
         <w:numPr>
           <w:ilvl w:val="0"/>
-          <w:numId w:val="1553"/>
+          <w:numId w:val="1557"/>
         </w:numPr>
       </w:pPr>
       <w:r>
@@ -13132,7 +13244,7 @@
         <w:pStyle w:val="Compact"/>
         <w:numPr>
           <w:ilvl w:val="0"/>
-          <w:numId w:val="1554"/>
+          <w:numId w:val="1558"/>
         </w:numPr>
       </w:pPr>
       <w:r>
@@ -13159,7 +13271,7 @@
         <w:pStyle w:val="Compact"/>
         <w:numPr>
           <w:ilvl w:val="0"/>
-          <w:numId w:val="1555"/>
+          <w:numId w:val="1559"/>
         </w:numPr>
       </w:pPr>
       <w:r>
@@ -13186,7 +13298,7 @@
         <w:pStyle w:val="Compact"/>
         <w:numPr>
           <w:ilvl w:val="0"/>
-          <w:numId w:val="1556"/>
+          <w:numId w:val="1560"/>
         </w:numPr>
       </w:pPr>
       <w:r>
@@ -13198,7 +13310,7 @@
         <w:pStyle w:val="Compact"/>
         <w:numPr>
           <w:ilvl w:val="1"/>
-          <w:numId w:val="1557"/>
+          <w:numId w:val="1561"/>
         </w:numPr>
       </w:pPr>
       <w:r>
@@ -13210,7 +13322,7 @@
         <w:pStyle w:val="Compact"/>
         <w:numPr>
           <w:ilvl w:val="1"/>
-          <w:numId w:val="1557"/>
+          <w:numId w:val="1561"/>
         </w:numPr>
       </w:pPr>
       <w:r>
@@ -13222,7 +13334,7 @@
         <w:pStyle w:val="Compact"/>
         <w:numPr>
           <w:ilvl w:val="1"/>
-          <w:numId w:val="1557"/>
+          <w:numId w:val="1561"/>
         </w:numPr>
       </w:pPr>
       <w:r>
@@ -13234,7 +13346,7 @@
         <w:pStyle w:val="Compact"/>
         <w:numPr>
           <w:ilvl w:val="0"/>
-          <w:numId w:val="1558"/>
+          <w:numId w:val="1562"/>
         </w:numPr>
       </w:pPr>
       <w:r>
@@ -13246,7 +13358,7 @@
         <w:pStyle w:val="Compact"/>
         <w:numPr>
           <w:ilvl w:val="0"/>
-          <w:numId w:val="1559"/>
+          <w:numId w:val="1563"/>
         </w:numPr>
       </w:pPr>
       <w:r>
@@ -13258,7 +13370,7 @@
         <w:pStyle w:val="Compact"/>
         <w:numPr>
           <w:ilvl w:val="1"/>
-          <w:numId w:val="1560"/>
+          <w:numId w:val="1564"/>
         </w:numPr>
       </w:pPr>
       <w:r>
@@ -13270,7 +13382,7 @@
         <w:pStyle w:val="Compact"/>
         <w:numPr>
           <w:ilvl w:val="1"/>
-          <w:numId w:val="1560"/>
+          <w:numId w:val="1564"/>
         </w:numPr>
       </w:pPr>
       <w:r>
@@ -13282,7 +13394,7 @@
         <w:pStyle w:val="Compact"/>
         <w:numPr>
           <w:ilvl w:val="1"/>
-          <w:numId w:val="1560"/>
+          <w:numId w:val="1564"/>
         </w:numPr>
       </w:pPr>
       <w:r>
@@ -13294,7 +13406,7 @@
         <w:pStyle w:val="Compact"/>
         <w:numPr>
           <w:ilvl w:val="1"/>
-          <w:numId w:val="1560"/>
+          <w:numId w:val="1564"/>
         </w:numPr>
       </w:pPr>
       <w:r>
@@ -13306,7 +13418,7 @@
         <w:pStyle w:val="Compact"/>
         <w:numPr>
           <w:ilvl w:val="1"/>
-          <w:numId w:val="1560"/>
+          <w:numId w:val="1564"/>
         </w:numPr>
       </w:pPr>
       <w:r>
@@ -13318,7 +13430,7 @@
         <w:pStyle w:val="Compact"/>
         <w:numPr>
           <w:ilvl w:val="1"/>
-          <w:numId w:val="1560"/>
+          <w:numId w:val="1564"/>
         </w:numPr>
       </w:pPr>
       <w:r>
@@ -13330,7 +13442,7 @@
         <w:pStyle w:val="Compact"/>
         <w:numPr>
           <w:ilvl w:val="0"/>
-          <w:numId w:val="1561"/>
+          <w:numId w:val="1565"/>
         </w:numPr>
       </w:pPr>
       <w:r>
@@ -13342,7 +13454,7 @@
         <w:pStyle w:val="Compact"/>
         <w:numPr>
           <w:ilvl w:val="0"/>
-          <w:numId w:val="1562"/>
+          <w:numId w:val="1566"/>
         </w:numPr>
       </w:pPr>
       <w:r>
@@ -13354,15 +13466,15 @@
         <w:pStyle w:val="Compact"/>
         <w:numPr>
           <w:ilvl w:val="0"/>
-          <w:numId w:val="1563"/>
+          <w:numId w:val="1567"/>
         </w:numPr>
       </w:pPr>
       <w:r>
         <w:t xml:space="preserve">Ensure predicted funded deals are traceable to historical anchor, not arbitrary text.</w:t>
       </w:r>
     </w:p>
-    <w:bookmarkEnd w:id="75"/>
-    <w:bookmarkStart w:id="76" w:name="cooldowns-and-compliance"/>
+    <w:bookmarkEnd w:id="76"/>
+    <w:bookmarkStart w:id="77" w:name="cooldowns-and-compliance"/>
     <w:p>
       <w:pPr>
         <w:pStyle w:val="Heading3"/>
@@ -13376,7 +13488,7 @@
         <w:pStyle w:val="Compact"/>
         <w:numPr>
           <w:ilvl w:val="0"/>
-          <w:numId w:val="1564"/>
+          <w:numId w:val="1568"/>
         </w:numPr>
       </w:pPr>
       <w:r>
@@ -13388,7 +13500,7 @@
         <w:pStyle w:val="Compact"/>
         <w:numPr>
           <w:ilvl w:val="0"/>
-          <w:numId w:val="1565"/>
+          <w:numId w:val="1569"/>
         </w:numPr>
       </w:pPr>
       <w:r>
@@ -13400,7 +13512,7 @@
         <w:pStyle w:val="Compact"/>
         <w:numPr>
           <w:ilvl w:val="0"/>
-          <w:numId w:val="1566"/>
+          <w:numId w:val="1570"/>
         </w:numPr>
       </w:pPr>
       <w:r>
@@ -13412,7 +13524,7 @@
         <w:pStyle w:val="Compact"/>
         <w:numPr>
           <w:ilvl w:val="0"/>
-          <w:numId w:val="1567"/>
+          <w:numId w:val="1571"/>
         </w:numPr>
       </w:pPr>
       <w:r>
@@ -13424,7 +13536,7 @@
         <w:pStyle w:val="Compact"/>
         <w:numPr>
           <w:ilvl w:val="0"/>
-          <w:numId w:val="1568"/>
+          <w:numId w:val="1572"/>
         </w:numPr>
       </w:pPr>
       <w:r>
@@ -13436,15 +13548,15 @@
         <w:pStyle w:val="Compact"/>
         <w:numPr>
           <w:ilvl w:val="0"/>
-          <w:numId w:val="1569"/>
+          <w:numId w:val="1573"/>
         </w:numPr>
       </w:pPr>
       <w:r>
         <w:t xml:space="preserve">Verify no cohort can re-contact opted-out, DNC, suppressed, or too-recent leads.</w:t>
       </w:r>
     </w:p>
-    <w:bookmarkEnd w:id="76"/>
-    <w:bookmarkStart w:id="77" w:name="two-layer-send-caps"/>
+    <w:bookmarkEnd w:id="77"/>
+    <w:bookmarkStart w:id="78" w:name="two-layer-send-caps"/>
     <w:p>
       <w:pPr>
         <w:pStyle w:val="Heading3"/>
@@ -13458,7 +13570,7 @@
         <w:pStyle w:val="Compact"/>
         <w:numPr>
           <w:ilvl w:val="0"/>
-          <w:numId w:val="1570"/>
+          <w:numId w:val="1574"/>
         </w:numPr>
       </w:pPr>
       <w:r>
@@ -13470,7 +13582,7 @@
         <w:pStyle w:val="Compact"/>
         <w:numPr>
           <w:ilvl w:val="1"/>
-          <w:numId w:val="1571"/>
+          <w:numId w:val="1575"/>
         </w:numPr>
       </w:pPr>
       <w:r>
@@ -13482,7 +13594,7 @@
         <w:pStyle w:val="Compact"/>
         <w:numPr>
           <w:ilvl w:val="1"/>
-          <w:numId w:val="1571"/>
+          <w:numId w:val="1575"/>
         </w:numPr>
       </w:pPr>
       <w:r>
@@ -13494,7 +13606,7 @@
         <w:pStyle w:val="Compact"/>
         <w:numPr>
           <w:ilvl w:val="0"/>
-          <w:numId w:val="1572"/>
+          <w:numId w:val="1576"/>
         </w:numPr>
       </w:pPr>
       <w:r>
@@ -13506,7 +13618,7 @@
         <w:pStyle w:val="Compact"/>
         <w:numPr>
           <w:ilvl w:val="1"/>
-          <w:numId w:val="1573"/>
+          <w:numId w:val="1577"/>
         </w:numPr>
       </w:pPr>
       <w:r>
@@ -13518,7 +13630,7 @@
         <w:pStyle w:val="Compact"/>
         <w:numPr>
           <w:ilvl w:val="1"/>
-          <w:numId w:val="1573"/>
+          <w:numId w:val="1577"/>
         </w:numPr>
       </w:pPr>
       <w:r>
@@ -13530,7 +13642,7 @@
         <w:pStyle w:val="Compact"/>
         <w:numPr>
           <w:ilvl w:val="0"/>
-          <w:numId w:val="1574"/>
+          <w:numId w:val="1578"/>
         </w:numPr>
       </w:pPr>
       <w:r>
@@ -13542,7 +13654,7 @@
         <w:pStyle w:val="Compact"/>
         <w:numPr>
           <w:ilvl w:val="0"/>
-          <w:numId w:val="1575"/>
+          <w:numId w:val="1579"/>
         </w:numPr>
       </w:pPr>
       <w:r>
@@ -13554,7 +13666,7 @@
         <w:pStyle w:val="Compact"/>
         <w:numPr>
           <w:ilvl w:val="0"/>
-          <w:numId w:val="1576"/>
+          <w:numId w:val="1580"/>
         </w:numPr>
       </w:pPr>
       <w:r>
@@ -13566,15 +13678,15 @@
         <w:pStyle w:val="Compact"/>
         <w:numPr>
           <w:ilvl w:val="0"/>
-          <w:numId w:val="1577"/>
+          <w:numId w:val="1581"/>
         </w:numPr>
       </w:pPr>
       <w:r>
         <w:t xml:space="preserve">Cohort card lead count reflects current remaining capacity at render/build time.</w:t>
       </w:r>
     </w:p>
-    <w:bookmarkEnd w:id="77"/>
-    <w:bookmarkStart w:id="78" w:name="ai-reasoning-and-cron"/>
+    <w:bookmarkEnd w:id="78"/>
+    <w:bookmarkStart w:id="79" w:name="ai-reasoning-and-cron"/>
     <w:p>
       <w:pPr>
         <w:pStyle w:val="Heading3"/>
@@ -13588,7 +13700,7 @@
         <w:pStyle w:val="Compact"/>
         <w:numPr>
           <w:ilvl w:val="0"/>
-          <w:numId w:val="1578"/>
+          <w:numId w:val="1582"/>
         </w:numPr>
       </w:pPr>
       <w:r>
@@ -13600,7 +13712,7 @@
         <w:pStyle w:val="Compact"/>
         <w:numPr>
           <w:ilvl w:val="0"/>
-          <w:numId w:val="1579"/>
+          <w:numId w:val="1583"/>
         </w:numPr>
       </w:pPr>
       <w:r>
@@ -13612,7 +13724,7 @@
         <w:pStyle w:val="Compact"/>
         <w:numPr>
           <w:ilvl w:val="0"/>
-          <w:numId w:val="1580"/>
+          <w:numId w:val="1584"/>
         </w:numPr>
       </w:pPr>
       <w:r>
@@ -13624,7 +13736,7 @@
         <w:pStyle w:val="Compact"/>
         <w:numPr>
           <w:ilvl w:val="0"/>
-          <w:numId w:val="1581"/>
+          <w:numId w:val="1585"/>
         </w:numPr>
       </w:pPr>
       <w:r>
@@ -13636,7 +13748,7 @@
         <w:pStyle w:val="Compact"/>
         <w:numPr>
           <w:ilvl w:val="0"/>
-          <w:numId w:val="1582"/>
+          <w:numId w:val="1586"/>
         </w:numPr>
       </w:pPr>
       <w:r>
@@ -13648,7 +13760,7 @@
         <w:pStyle w:val="Compact"/>
         <w:numPr>
           <w:ilvl w:val="0"/>
-          <w:numId w:val="1583"/>
+          <w:numId w:val="1587"/>
         </w:numPr>
       </w:pPr>
       <w:r>
@@ -13660,7 +13772,7 @@
         <w:pStyle w:val="Compact"/>
         <w:numPr>
           <w:ilvl w:val="0"/>
-          <w:numId w:val="1584"/>
+          <w:numId w:val="1588"/>
         </w:numPr>
       </w:pPr>
       <w:r>
@@ -13672,7 +13784,7 @@
         <w:pStyle w:val="Compact"/>
         <w:numPr>
           <w:ilvl w:val="0"/>
-          <w:numId w:val="1585"/>
+          <w:numId w:val="1589"/>
         </w:numPr>
       </w:pPr>
       <w:r>
@@ -13684,15 +13796,15 @@
         <w:pStyle w:val="Compact"/>
         <w:numPr>
           <w:ilvl w:val="0"/>
-          <w:numId w:val="1586"/>
+          <w:numId w:val="1590"/>
         </w:numPr>
       </w:pPr>
       <w:r>
         <w:t xml:space="preserve">Log failures per user/cohort without breaking other cohorts.</w:t>
       </w:r>
     </w:p>
-    <w:bookmarkEnd w:id="78"/>
-    <w:bookmarkStart w:id="79" w:name="ui-1"/>
+    <w:bookmarkEnd w:id="79"/>
+    <w:bookmarkStart w:id="80" w:name="ui-1"/>
     <w:p>
       <w:pPr>
         <w:pStyle w:val="Heading3"/>
@@ -13706,7 +13818,7 @@
         <w:pStyle w:val="Compact"/>
         <w:numPr>
           <w:ilvl w:val="0"/>
-          <w:numId w:val="1587"/>
+          <w:numId w:val="1591"/>
         </w:numPr>
       </w:pPr>
       <w:r>
@@ -13718,7 +13830,7 @@
         <w:pStyle w:val="Compact"/>
         <w:numPr>
           <w:ilvl w:val="0"/>
-          <w:numId w:val="1588"/>
+          <w:numId w:val="1592"/>
         </w:numPr>
       </w:pPr>
       <w:r>
@@ -13730,7 +13842,7 @@
         <w:pStyle w:val="Compact"/>
         <w:numPr>
           <w:ilvl w:val="0"/>
-          <w:numId w:val="1589"/>
+          <w:numId w:val="1593"/>
         </w:numPr>
       </w:pPr>
       <w:r>
@@ -13742,7 +13854,7 @@
         <w:pStyle w:val="Compact"/>
         <w:numPr>
           <w:ilvl w:val="0"/>
-          <w:numId w:val="1590"/>
+          <w:numId w:val="1594"/>
         </w:numPr>
       </w:pPr>
       <w:r>
@@ -13754,7 +13866,7 @@
         <w:pStyle w:val="Compact"/>
         <w:numPr>
           <w:ilvl w:val="0"/>
-          <w:numId w:val="1591"/>
+          <w:numId w:val="1595"/>
         </w:numPr>
       </w:pPr>
       <w:r>
@@ -13766,7 +13878,7 @@
         <w:pStyle w:val="Compact"/>
         <w:numPr>
           <w:ilvl w:val="0"/>
-          <w:numId w:val="1592"/>
+          <w:numId w:val="1596"/>
         </w:numPr>
       </w:pPr>
       <w:r>
@@ -13778,7 +13890,7 @@
         <w:pStyle w:val="Compact"/>
         <w:numPr>
           <w:ilvl w:val="0"/>
-          <w:numId w:val="1593"/>
+          <w:numId w:val="1597"/>
         </w:numPr>
       </w:pPr>
       <w:r>
@@ -13790,7 +13902,7 @@
         <w:pStyle w:val="Compact"/>
         <w:numPr>
           <w:ilvl w:val="0"/>
-          <w:numId w:val="1594"/>
+          <w:numId w:val="1598"/>
         </w:numPr>
       </w:pPr>
       <w:r>
@@ -13802,7 +13914,7 @@
         <w:pStyle w:val="Compact"/>
         <w:numPr>
           <w:ilvl w:val="0"/>
-          <w:numId w:val="1595"/>
+          <w:numId w:val="1599"/>
         </w:numPr>
       </w:pPr>
       <w:r>
@@ -13814,7 +13926,7 @@
         <w:pStyle w:val="Compact"/>
         <w:numPr>
           <w:ilvl w:val="0"/>
-          <w:numId w:val="1596"/>
+          <w:numId w:val="1600"/>
         </w:numPr>
       </w:pPr>
       <w:r>
@@ -13841,7 +13953,7 @@
         <w:pStyle w:val="Compact"/>
         <w:numPr>
           <w:ilvl w:val="0"/>
-          <w:numId w:val="1597"/>
+          <w:numId w:val="1601"/>
         </w:numPr>
       </w:pPr>
       <w:r>
@@ -13862,15 +13974,15 @@
         <w:pStyle w:val="Compact"/>
         <w:numPr>
           <w:ilvl w:val="0"/>
-          <w:numId w:val="1598"/>
+          <w:numId w:val="1602"/>
         </w:numPr>
       </w:pPr>
       <w:r>
         <w:t xml:space="preserve">Existing campaign actions still work: rerun/refresh, start, pause, delete where allowed.</w:t>
       </w:r>
     </w:p>
-    <w:bookmarkEnd w:id="79"/>
-    <w:bookmarkStart w:id="80" w:name="backendapi"/>
+    <w:bookmarkEnd w:id="80"/>
+    <w:bookmarkStart w:id="81" w:name="backendapi"/>
     <w:p>
       <w:pPr>
         <w:pStyle w:val="Heading3"/>
@@ -13884,7 +13996,7 @@
         <w:pStyle w:val="Compact"/>
         <w:numPr>
           <w:ilvl w:val="0"/>
-          <w:numId w:val="1599"/>
+          <w:numId w:val="1603"/>
         </w:numPr>
       </w:pPr>
       <w:r>
@@ -13896,7 +14008,7 @@
         <w:pStyle w:val="Compact"/>
         <w:numPr>
           <w:ilvl w:val="0"/>
-          <w:numId w:val="1600"/>
+          <w:numId w:val="1604"/>
         </w:numPr>
       </w:pPr>
       <w:r>
@@ -13908,7 +14020,7 @@
         <w:pStyle w:val="Compact"/>
         <w:numPr>
           <w:ilvl w:val="0"/>
-          <w:numId w:val="1601"/>
+          <w:numId w:val="1605"/>
         </w:numPr>
       </w:pPr>
       <w:r>
@@ -13920,7 +14032,7 @@
         <w:pStyle w:val="Compact"/>
         <w:numPr>
           <w:ilvl w:val="0"/>
-          <w:numId w:val="1602"/>
+          <w:numId w:val="1606"/>
         </w:numPr>
       </w:pPr>
       <w:r>
@@ -13932,7 +14044,7 @@
         <w:pStyle w:val="Compact"/>
         <w:numPr>
           <w:ilvl w:val="0"/>
-          <w:numId w:val="1603"/>
+          <w:numId w:val="1607"/>
         </w:numPr>
       </w:pPr>
       <w:r>
@@ -13944,7 +14056,7 @@
         <w:pStyle w:val="Compact"/>
         <w:numPr>
           <w:ilvl w:val="0"/>
-          <w:numId w:val="1604"/>
+          <w:numId w:val="1608"/>
         </w:numPr>
       </w:pPr>
       <w:r>
@@ -13956,7 +14068,7 @@
         <w:pStyle w:val="Compact"/>
         <w:numPr>
           <w:ilvl w:val="0"/>
-          <w:numId w:val="1605"/>
+          <w:numId w:val="1609"/>
         </w:numPr>
       </w:pPr>
       <w:r>
@@ -13968,15 +14080,15 @@
         <w:pStyle w:val="Compact"/>
         <w:numPr>
           <w:ilvl w:val="0"/>
-          <w:numId w:val="1606"/>
+          <w:numId w:val="1610"/>
         </w:numPr>
       </w:pPr>
       <w:r>
         <w:t xml:space="preserve">AI Retarget is upstream recommendation only; no auto-send.</w:t>
       </w:r>
     </w:p>
-    <w:bookmarkEnd w:id="80"/>
-    <w:bookmarkStart w:id="81" w:name="m2.3-testing-gate"/>
+    <w:bookmarkEnd w:id="81"/>
+    <w:bookmarkStart w:id="82" w:name="m2.3-testing-gate"/>
     <w:p>
       <w:pPr>
         <w:pStyle w:val="Heading3"/>
@@ -13990,7 +14102,7 @@
         <w:pStyle w:val="Compact"/>
         <w:numPr>
           <w:ilvl w:val="0"/>
-          <w:numId w:val="1607"/>
+          <w:numId w:val="1611"/>
         </w:numPr>
       </w:pPr>
       <w:r>
@@ -14002,7 +14114,7 @@
         <w:pStyle w:val="Compact"/>
         <w:numPr>
           <w:ilvl w:val="0"/>
-          <w:numId w:val="1608"/>
+          <w:numId w:val="1612"/>
         </w:numPr>
       </w:pPr>
       <w:r>
@@ -14014,7 +14126,7 @@
         <w:pStyle w:val="Compact"/>
         <w:numPr>
           <w:ilvl w:val="0"/>
-          <w:numId w:val="1609"/>
+          <w:numId w:val="1613"/>
         </w:numPr>
       </w:pPr>
       <w:r>
@@ -14026,7 +14138,7 @@
         <w:pStyle w:val="Compact"/>
         <w:numPr>
           <w:ilvl w:val="0"/>
-          <w:numId w:val="1610"/>
+          <w:numId w:val="1614"/>
         </w:numPr>
       </w:pPr>
       <w:r>
@@ -14038,7 +14150,7 @@
         <w:pStyle w:val="Compact"/>
         <w:numPr>
           <w:ilvl w:val="0"/>
-          <w:numId w:val="1611"/>
+          <w:numId w:val="1615"/>
         </w:numPr>
       </w:pPr>
       <w:r>
@@ -14050,7 +14162,7 @@
         <w:pStyle w:val="Compact"/>
         <w:numPr>
           <w:ilvl w:val="0"/>
-          <w:numId w:val="1612"/>
+          <w:numId w:val="1616"/>
         </w:numPr>
       </w:pPr>
       <w:r>
@@ -14062,7 +14174,7 @@
         <w:pStyle w:val="Compact"/>
         <w:numPr>
           <w:ilvl w:val="0"/>
-          <w:numId w:val="1613"/>
+          <w:numId w:val="1617"/>
         </w:numPr>
       </w:pPr>
       <w:r>
@@ -14074,7 +14186,7 @@
         <w:pStyle w:val="Compact"/>
         <w:numPr>
           <w:ilvl w:val="0"/>
-          <w:numId w:val="1614"/>
+          <w:numId w:val="1618"/>
         </w:numPr>
       </w:pPr>
       <w:r>
@@ -14086,7 +14198,7 @@
         <w:pStyle w:val="Compact"/>
         <w:numPr>
           <w:ilvl w:val="0"/>
-          <w:numId w:val="1615"/>
+          <w:numId w:val="1619"/>
         </w:numPr>
       </w:pPr>
       <w:r>
@@ -14098,7 +14210,7 @@
         <w:pStyle w:val="Compact"/>
         <w:numPr>
           <w:ilvl w:val="0"/>
-          <w:numId w:val="1616"/>
+          <w:numId w:val="1620"/>
         </w:numPr>
       </w:pPr>
       <w:r>
@@ -14110,7 +14222,7 @@
         <w:pStyle w:val="Compact"/>
         <w:numPr>
           <w:ilvl w:val="0"/>
-          <w:numId w:val="1617"/>
+          <w:numId w:val="1621"/>
         </w:numPr>
       </w:pPr>
       <w:r>
@@ -14122,7 +14234,7 @@
         <w:pStyle w:val="Compact"/>
         <w:numPr>
           <w:ilvl w:val="0"/>
-          <w:numId w:val="1618"/>
+          <w:numId w:val="1622"/>
         </w:numPr>
       </w:pPr>
       <w:r>
@@ -14134,7 +14246,7 @@
         <w:pStyle w:val="Compact"/>
         <w:numPr>
           <w:ilvl w:val="0"/>
-          <w:numId w:val="1619"/>
+          <w:numId w:val="1623"/>
         </w:numPr>
       </w:pPr>
       <w:r>
@@ -14146,7 +14258,7 @@
         <w:pStyle w:val="Compact"/>
         <w:numPr>
           <w:ilvl w:val="0"/>
-          <w:numId w:val="1620"/>
+          <w:numId w:val="1624"/>
         </w:numPr>
       </w:pPr>
       <w:r>
@@ -14158,16 +14270,16 @@
         <w:pStyle w:val="Compact"/>
         <w:numPr>
           <w:ilvl w:val="0"/>
-          <w:numId w:val="1621"/>
+          <w:numId w:val="1625"/>
         </w:numPr>
       </w:pPr>
       <w:r>
         <w:t xml:space="preserve">Progress dashboard updated.</w:t>
       </w:r>
     </w:p>
-    <w:bookmarkEnd w:id="81"/>
     <w:bookmarkEnd w:id="82"/>
-    <w:bookmarkStart w:id="86" w:name="m2.4-m2-full-regression-and-release-gate"/>
+    <w:bookmarkEnd w:id="83"/>
+    <w:bookmarkStart w:id="87" w:name="m2.4-m2-full-regression-and-release-gate"/>
     <w:p>
       <w:pPr>
         <w:pStyle w:val="Heading2"/>
@@ -14176,7 +14288,7 @@
         <w:t xml:space="preserve">M2.4 — M2 Full Regression And Release Gate</w:t>
       </w:r>
     </w:p>
-    <w:bookmarkStart w:id="83" w:name="functional-regression-1"/>
+    <w:bookmarkStart w:id="84" w:name="functional-regression-1"/>
     <w:p>
       <w:pPr>
         <w:pStyle w:val="Heading3"/>
@@ -14190,7 +14302,7 @@
         <w:pStyle w:val="Compact"/>
         <w:numPr>
           <w:ilvl w:val="0"/>
-          <w:numId w:val="1622"/>
+          <w:numId w:val="1626"/>
         </w:numPr>
       </w:pPr>
       <w:r>
@@ -14202,7 +14314,7 @@
         <w:pStyle w:val="Compact"/>
         <w:numPr>
           <w:ilvl w:val="0"/>
-          <w:numId w:val="1623"/>
+          <w:numId w:val="1627"/>
         </w:numPr>
       </w:pPr>
       <w:r>
@@ -14214,7 +14326,7 @@
         <w:pStyle w:val="Compact"/>
         <w:numPr>
           <w:ilvl w:val="0"/>
-          <w:numId w:val="1624"/>
+          <w:numId w:val="1628"/>
         </w:numPr>
       </w:pPr>
       <w:r>
@@ -14226,7 +14338,7 @@
         <w:pStyle w:val="Compact"/>
         <w:numPr>
           <w:ilvl w:val="0"/>
-          <w:numId w:val="1625"/>
+          <w:numId w:val="1629"/>
         </w:numPr>
       </w:pPr>
       <w:r>
@@ -14238,7 +14350,7 @@
         <w:pStyle w:val="Compact"/>
         <w:numPr>
           <w:ilvl w:val="0"/>
-          <w:numId w:val="1626"/>
+          <w:numId w:val="1630"/>
         </w:numPr>
       </w:pPr>
       <w:r>
@@ -14250,7 +14362,7 @@
         <w:pStyle w:val="Compact"/>
         <w:numPr>
           <w:ilvl w:val="0"/>
-          <w:numId w:val="1627"/>
+          <w:numId w:val="1631"/>
         </w:numPr>
       </w:pPr>
       <w:r>
@@ -14262,7 +14374,7 @@
         <w:pStyle w:val="Compact"/>
         <w:numPr>
           <w:ilvl w:val="0"/>
-          <w:numId w:val="1628"/>
+          <w:numId w:val="1632"/>
         </w:numPr>
       </w:pPr>
       <w:r>
@@ -14274,7 +14386,7 @@
         <w:pStyle w:val="Compact"/>
         <w:numPr>
           <w:ilvl w:val="0"/>
-          <w:numId w:val="1629"/>
+          <w:numId w:val="1633"/>
         </w:numPr>
       </w:pPr>
       <w:r>
@@ -14286,7 +14398,7 @@
         <w:pStyle w:val="Compact"/>
         <w:numPr>
           <w:ilvl w:val="0"/>
-          <w:numId w:val="1630"/>
+          <w:numId w:val="1634"/>
         </w:numPr>
       </w:pPr>
       <w:r>
@@ -14298,7 +14410,7 @@
         <w:pStyle w:val="Compact"/>
         <w:numPr>
           <w:ilvl w:val="0"/>
-          <w:numId w:val="1631"/>
+          <w:numId w:val="1635"/>
         </w:numPr>
       </w:pPr>
       <w:r>
@@ -14310,7 +14422,7 @@
         <w:pStyle w:val="Compact"/>
         <w:numPr>
           <w:ilvl w:val="0"/>
-          <w:numId w:val="1632"/>
+          <w:numId w:val="1636"/>
         </w:numPr>
       </w:pPr>
       <w:r>
@@ -14322,7 +14434,7 @@
         <w:pStyle w:val="Compact"/>
         <w:numPr>
           <w:ilvl w:val="0"/>
-          <w:numId w:val="1633"/>
+          <w:numId w:val="1637"/>
         </w:numPr>
       </w:pPr>
       <w:r>
@@ -14334,7 +14446,7 @@
         <w:pStyle w:val="Compact"/>
         <w:numPr>
           <w:ilvl w:val="0"/>
-          <w:numId w:val="1634"/>
+          <w:numId w:val="1638"/>
         </w:numPr>
       </w:pPr>
       <w:r>
@@ -14356,8 +14468,8 @@
         <w:t xml:space="preserve">and test messages.</w:t>
       </w:r>
     </w:p>
-    <w:bookmarkEnd w:id="83"/>
-    <w:bookmarkStart w:id="84" w:name="visual-regression-1"/>
+    <w:bookmarkEnd w:id="84"/>
+    <w:bookmarkStart w:id="85" w:name="visual-regression-1"/>
     <w:p>
       <w:pPr>
         <w:pStyle w:val="Heading3"/>
@@ -14371,7 +14483,7 @@
         <w:pStyle w:val="Compact"/>
         <w:numPr>
           <w:ilvl w:val="0"/>
-          <w:numId w:val="1635"/>
+          <w:numId w:val="1639"/>
         </w:numPr>
       </w:pPr>
       <w:r>
@@ -14383,7 +14495,7 @@
         <w:pStyle w:val="Compact"/>
         <w:numPr>
           <w:ilvl w:val="0"/>
-          <w:numId w:val="1636"/>
+          <w:numId w:val="1640"/>
         </w:numPr>
       </w:pPr>
       <w:r>
@@ -14410,7 +14522,7 @@
         <w:pStyle w:val="Compact"/>
         <w:numPr>
           <w:ilvl w:val="0"/>
-          <w:numId w:val="1637"/>
+          <w:numId w:val="1641"/>
         </w:numPr>
       </w:pPr>
       <w:r>
@@ -14422,7 +14534,7 @@
         <w:pStyle w:val="Compact"/>
         <w:numPr>
           <w:ilvl w:val="0"/>
-          <w:numId w:val="1638"/>
+          <w:numId w:val="1642"/>
         </w:numPr>
       </w:pPr>
       <w:r>
@@ -14434,7 +14546,7 @@
         <w:pStyle w:val="Compact"/>
         <w:numPr>
           <w:ilvl w:val="0"/>
-          <w:numId w:val="1639"/>
+          <w:numId w:val="1643"/>
         </w:numPr>
       </w:pPr>
       <w:r>
@@ -14446,7 +14558,7 @@
         <w:pStyle w:val="Compact"/>
         <w:numPr>
           <w:ilvl w:val="0"/>
-          <w:numId w:val="1640"/>
+          <w:numId w:val="1644"/>
         </w:numPr>
       </w:pPr>
       <w:r>
@@ -14458,7 +14570,7 @@
         <w:pStyle w:val="Compact"/>
         <w:numPr>
           <w:ilvl w:val="0"/>
-          <w:numId w:val="1641"/>
+          <w:numId w:val="1645"/>
         </w:numPr>
       </w:pPr>
       <w:r>
@@ -14470,15 +14582,15 @@
         <w:pStyle w:val="Compact"/>
         <w:numPr>
           <w:ilvl w:val="0"/>
-          <w:numId w:val="1642"/>
+          <w:numId w:val="1646"/>
         </w:numPr>
       </w:pPr>
       <w:r>
         <w:t xml:space="preserve">No unreadable text if current styles fail; scoped style set added if needed.</w:t>
       </w:r>
     </w:p>
-    <w:bookmarkEnd w:id="84"/>
-    <w:bookmarkStart w:id="85" w:name="release-readiness-1"/>
+    <w:bookmarkEnd w:id="85"/>
+    <w:bookmarkStart w:id="86" w:name="release-readiness-1"/>
     <w:p>
       <w:pPr>
         <w:pStyle w:val="Heading3"/>
@@ -14492,7 +14604,7 @@
         <w:pStyle w:val="Compact"/>
         <w:numPr>
           <w:ilvl w:val="0"/>
-          <w:numId w:val="1643"/>
+          <w:numId w:val="1647"/>
         </w:numPr>
       </w:pPr>
       <w:r>
@@ -14504,7 +14616,7 @@
         <w:pStyle w:val="Compact"/>
         <w:numPr>
           <w:ilvl w:val="0"/>
-          <w:numId w:val="1644"/>
+          <w:numId w:val="1648"/>
         </w:numPr>
       </w:pPr>
       <w:r>
@@ -14516,7 +14628,7 @@
         <w:pStyle w:val="Compact"/>
         <w:numPr>
           <w:ilvl w:val="0"/>
-          <w:numId w:val="1645"/>
+          <w:numId w:val="1649"/>
         </w:numPr>
       </w:pPr>
       <w:r>
@@ -14528,7 +14640,7 @@
         <w:pStyle w:val="Compact"/>
         <w:numPr>
           <w:ilvl w:val="0"/>
-          <w:numId w:val="1646"/>
+          <w:numId w:val="1650"/>
         </w:numPr>
       </w:pPr>
       <w:r>
@@ -14540,7 +14652,7 @@
         <w:pStyle w:val="Compact"/>
         <w:numPr>
           <w:ilvl w:val="0"/>
-          <w:numId w:val="1647"/>
+          <w:numId w:val="1651"/>
         </w:numPr>
       </w:pPr>
       <w:r>
@@ -14552,7 +14664,7 @@
         <w:pStyle w:val="Compact"/>
         <w:numPr>
           <w:ilvl w:val="0"/>
-          <w:numId w:val="1648"/>
+          <w:numId w:val="1652"/>
         </w:numPr>
       </w:pPr>
       <w:r>
@@ -14564,7 +14676,7 @@
         <w:pStyle w:val="Compact"/>
         <w:numPr>
           <w:ilvl w:val="0"/>
-          <w:numId w:val="1649"/>
+          <w:numId w:val="1653"/>
         </w:numPr>
       </w:pPr>
       <w:r>
@@ -14576,7 +14688,7 @@
         <w:pStyle w:val="Compact"/>
         <w:numPr>
           <w:ilvl w:val="0"/>
-          <w:numId w:val="1650"/>
+          <w:numId w:val="1654"/>
         </w:numPr>
       </w:pPr>
       <w:r>
@@ -14588,16 +14700,16 @@
         <w:pStyle w:val="Compact"/>
         <w:numPr>
           <w:ilvl w:val="0"/>
-          <w:numId w:val="1651"/>
+          <w:numId w:val="1655"/>
         </w:numPr>
       </w:pPr>
       <w:r>
         <w:t xml:space="preserve">Progress dashboard updated to M2 complete only after all gates pass.</w:t>
       </w:r>
     </w:p>
-    <w:bookmarkEnd w:id="85"/>
     <w:bookmarkEnd w:id="86"/>
-    <w:bookmarkStart w:id="87" w:name="full-final-acceptance"/>
+    <w:bookmarkEnd w:id="87"/>
+    <w:bookmarkStart w:id="88" w:name="full-final-acceptance"/>
     <w:p>
       <w:pPr>
         <w:pStyle w:val="Heading2"/>
@@ -14611,7 +14723,7 @@
         <w:pStyle w:val="Compact"/>
         <w:numPr>
           <w:ilvl w:val="0"/>
-          <w:numId w:val="1652"/>
+          <w:numId w:val="1656"/>
         </w:numPr>
       </w:pPr>
       <w:r>
@@ -14623,7 +14735,7 @@
         <w:pStyle w:val="Compact"/>
         <w:numPr>
           <w:ilvl w:val="0"/>
-          <w:numId w:val="1653"/>
+          <w:numId w:val="1657"/>
         </w:numPr>
       </w:pPr>
       <w:r>
@@ -14635,7 +14747,7 @@
         <w:pStyle w:val="Compact"/>
         <w:numPr>
           <w:ilvl w:val="0"/>
-          <w:numId w:val="1654"/>
+          <w:numId w:val="1658"/>
         </w:numPr>
       </w:pPr>
       <w:r>
@@ -14647,7 +14759,7 @@
         <w:pStyle w:val="Compact"/>
         <w:numPr>
           <w:ilvl w:val="0"/>
-          <w:numId w:val="1655"/>
+          <w:numId w:val="1659"/>
         </w:numPr>
       </w:pPr>
       <w:r>
@@ -14659,7 +14771,7 @@
         <w:pStyle w:val="Compact"/>
         <w:numPr>
           <w:ilvl w:val="0"/>
-          <w:numId w:val="1656"/>
+          <w:numId w:val="1660"/>
         </w:numPr>
       </w:pPr>
       <w:r>
@@ -14671,7 +14783,7 @@
         <w:pStyle w:val="Compact"/>
         <w:numPr>
           <w:ilvl w:val="0"/>
-          <w:numId w:val="1657"/>
+          <w:numId w:val="1661"/>
         </w:numPr>
       </w:pPr>
       <w:r>
@@ -14683,7 +14795,7 @@
         <w:pStyle w:val="Compact"/>
         <w:numPr>
           <w:ilvl w:val="0"/>
-          <w:numId w:val="1658"/>
+          <w:numId w:val="1662"/>
         </w:numPr>
       </w:pPr>
       <w:r>
@@ -14695,7 +14807,7 @@
         <w:pStyle w:val="Compact"/>
         <w:numPr>
           <w:ilvl w:val="0"/>
-          <w:numId w:val="1659"/>
+          <w:numId w:val="1663"/>
         </w:numPr>
       </w:pPr>
       <w:r>
@@ -14707,7 +14819,7 @@
         <w:pStyle w:val="Compact"/>
         <w:numPr>
           <w:ilvl w:val="0"/>
-          <w:numId w:val="1660"/>
+          <w:numId w:val="1664"/>
         </w:numPr>
       </w:pPr>
       <w:r>
@@ -14719,7 +14831,7 @@
         <w:pStyle w:val="Compact"/>
         <w:numPr>
           <w:ilvl w:val="0"/>
-          <w:numId w:val="1661"/>
+          <w:numId w:val="1665"/>
         </w:numPr>
       </w:pPr>
       <w:r>
@@ -14731,15 +14843,15 @@
         <w:pStyle w:val="Compact"/>
         <w:numPr>
           <w:ilvl w:val="0"/>
-          <w:numId w:val="1662"/>
+          <w:numId w:val="1666"/>
         </w:numPr>
       </w:pPr>
       <w:r>
         <w:t xml:space="preserve">Final client-facing summary prepared with what changed, how it was tested, and what is intentionally out of scope.</w:t>
       </w:r>
     </w:p>
-    <w:bookmarkEnd w:id="87"/>
-    <w:bookmarkStart w:id="88" w:name="progress-update-log"/>
+    <w:bookmarkEnd w:id="88"/>
+    <w:bookmarkStart w:id="89" w:name="progress-update-log"/>
     <w:p>
       <w:pPr>
         <w:pStyle w:val="Heading2"/>
@@ -14843,6 +14955,67 @@
               <w:jc w:val="right"/>
             </w:pPr>
             <w:r>
+              <w:t xml:space="preserve">71%</w:t>
+            </w:r>
+          </w:p>
+        </w:tc>
+        <w:tc>
+          <w:tcPr/>
+          <w:p>
+            <w:pPr>
+              <w:pStyle w:val="Compact"/>
+            </w:pPr>
+            <w:r>
+              <w:t xml:space="preserve">M1.6</w:t>
+            </w:r>
+          </w:p>
+        </w:tc>
+        <w:tc>
+          <w:tcPr/>
+          <w:p>
+            <w:pPr>
+              <w:pStyle w:val="Compact"/>
+            </w:pPr>
+            <w:r>
+              <w:t xml:space="preserve">Added drag/drop + Funding History smoke evidence; moved M1.6 from 3/8 to 4/8 while keeping full-env/release gates open.</w:t>
+            </w:r>
+          </w:p>
+        </w:tc>
+        <w:tc>
+          <w:tcPr/>
+          <w:p>
+            <w:pPr>
+              <w:pStyle w:val="Compact"/>
+            </w:pPr>
+            <w:r>
+              <w:rPr>
+                <w:rStyle w:val="VerbatimChar"/>
+              </w:rPr>
+              <w:t xml:space="preserve">audit-screenshots/m16-drag-funding-evidence.json</w:t>
+            </w:r>
+          </w:p>
+        </w:tc>
+      </w:tr>
+      <w:tr>
+        <w:tc>
+          <w:tcPr/>
+          <w:p>
+            <w:pPr>
+              <w:pStyle w:val="Compact"/>
+            </w:pPr>
+            <w:r>
+              <w:t xml:space="preserve">2026-05-02</w:t>
+            </w:r>
+          </w:p>
+        </w:tc>
+        <w:tc>
+          <w:tcPr/>
+          <w:p>
+            <w:pPr>
+              <w:pStyle w:val="Compact"/>
+              <w:jc w:val="right"/>
+            </w:pPr>
+            <w:r>
               <w:t xml:space="preserve">6%</w:t>
             </w:r>
           </w:p>
@@ -14882,8 +15055,8 @@
         </w:tc>
       </w:tr>
     </w:tbl>
-    <w:bookmarkEnd w:id="88"/>
     <w:bookmarkEnd w:id="89"/>
+    <w:bookmarkEnd w:id="90"/>
     <w:sectPr>
       <w:footnotePr>
         <w:numRestart w:val="eachSect"/>
@@ -16474,19 +16647,19 @@
     <w:abstractNumId w:val="993"/>
   </w:num>
   <w:num w:numId="1408">
-    <w:abstractNumId w:val="992"/>
+    <w:abstractNumId w:val="993"/>
   </w:num>
   <w:num w:numId="1409">
-    <w:abstractNumId w:val="992"/>
+    <w:abstractNumId w:val="993"/>
   </w:num>
   <w:num w:numId="1410">
-    <w:abstractNumId w:val="992"/>
+    <w:abstractNumId w:val="993"/>
   </w:num>
   <w:num w:numId="1411">
-    <w:abstractNumId w:val="992"/>
+    <w:abstractNumId w:val="993"/>
   </w:num>
   <w:num w:numId="1412">
-    <w:abstractNumId w:val="992"/>
+    <w:abstractNumId w:val="993"/>
   </w:num>
   <w:num w:numId="1413">
     <w:abstractNumId w:val="992"/>
@@ -16495,7 +16668,7 @@
     <w:abstractNumId w:val="992"/>
   </w:num>
   <w:num w:numId="1415">
-    <w:abstractNumId w:val="992"/>
+    <w:abstractNumId w:val="993"/>
   </w:num>
   <w:num w:numId="1416">
     <w:abstractNumId w:val="992"/>
@@ -16528,7 +16701,7 @@
     <w:abstractNumId w:val="992"/>
   </w:num>
   <w:num w:numId="1426">
-    <w:abstractNumId w:val="993"/>
+    <w:abstractNumId w:val="992"/>
   </w:num>
   <w:num w:numId="1427">
     <w:abstractNumId w:val="992"/>
@@ -16540,28 +16713,28 @@
     <w:abstractNumId w:val="992"/>
   </w:num>
   <w:num w:numId="1430">
-    <w:abstractNumId w:val="992"/>
+    <w:abstractNumId w:val="993"/>
   </w:num>
   <w:num w:numId="1431">
     <w:abstractNumId w:val="992"/>
   </w:num>
   <w:num w:numId="1432">
-    <w:abstractNumId w:val="993"/>
+    <w:abstractNumId w:val="992"/>
   </w:num>
   <w:num w:numId="1433">
-    <w:abstractNumId w:val="993"/>
+    <w:abstractNumId w:val="992"/>
   </w:num>
   <w:num w:numId="1434">
-    <w:abstractNumId w:val="993"/>
+    <w:abstractNumId w:val="992"/>
   </w:num>
   <w:num w:numId="1435">
-    <w:abstractNumId w:val="993"/>
+    <w:abstractNumId w:val="992"/>
   </w:num>
   <w:num w:numId="1436">
-    <w:abstractNumId w:val="992"/>
+    <w:abstractNumId w:val="993"/>
   </w:num>
   <w:num w:numId="1437">
-    <w:abstractNumId w:val="992"/>
+    <w:abstractNumId w:val="993"/>
   </w:num>
   <w:num w:numId="1438">
     <w:abstractNumId w:val="993"/>
@@ -16570,10 +16743,10 @@
     <w:abstractNumId w:val="993"/>
   </w:num>
   <w:num w:numId="1440">
-    <w:abstractNumId w:val="993"/>
+    <w:abstractNumId w:val="992"/>
   </w:num>
   <w:num w:numId="1441">
-    <w:abstractNumId w:val="993"/>
+    <w:abstractNumId w:val="992"/>
   </w:num>
   <w:num w:numId="1442">
     <w:abstractNumId w:val="993"/>
@@ -16606,34 +16779,34 @@
     <w:abstractNumId w:val="993"/>
   </w:num>
   <w:num w:numId="1452">
-    <w:abstractNumId w:val="992"/>
+    <w:abstractNumId w:val="993"/>
   </w:num>
   <w:num w:numId="1453">
+    <w:abstractNumId w:val="993"/>
+  </w:num>
+  <w:num w:numId="1454">
+    <w:abstractNumId w:val="993"/>
+  </w:num>
+  <w:num w:numId="1455">
+    <w:abstractNumId w:val="993"/>
+  </w:num>
+  <w:num w:numId="1456">
+    <w:abstractNumId w:val="992"/>
+  </w:num>
+  <w:num w:numId="1457">
     <w:abstractNumId w:val="991"/>
   </w:num>
-  <w:num w:numId="1454">
-    <w:abstractNumId w:val="993"/>
-  </w:num>
-  <w:num w:numId="1455">
-    <w:abstractNumId w:val="993"/>
-  </w:num>
-  <w:num w:numId="1456">
-    <w:abstractNumId w:val="992"/>
-  </w:num>
-  <w:num w:numId="1457">
-    <w:abstractNumId w:val="992"/>
-  </w:num>
   <w:num w:numId="1458">
-    <w:abstractNumId w:val="992"/>
+    <w:abstractNumId w:val="993"/>
   </w:num>
   <w:num w:numId="1459">
-    <w:abstractNumId w:val="992"/>
+    <w:abstractNumId w:val="993"/>
   </w:num>
   <w:num w:numId="1460">
     <w:abstractNumId w:val="992"/>
   </w:num>
   <w:num w:numId="1461">
-    <w:abstractNumId w:val="993"/>
+    <w:abstractNumId w:val="992"/>
   </w:num>
   <w:num w:numId="1462">
     <w:abstractNumId w:val="992"/>
@@ -16642,16 +16815,16 @@
     <w:abstractNumId w:val="992"/>
   </w:num>
   <w:num w:numId="1464">
-    <w:abstractNumId w:val="993"/>
+    <w:abstractNumId w:val="992"/>
   </w:num>
   <w:num w:numId="1465">
     <w:abstractNumId w:val="993"/>
   </w:num>
   <w:num w:numId="1466">
-    <w:abstractNumId w:val="993"/>
+    <w:abstractNumId w:val="992"/>
   </w:num>
   <w:num w:numId="1467">
-    <w:abstractNumId w:val="993"/>
+    <w:abstractNumId w:val="992"/>
   </w:num>
   <w:num w:numId="1468">
     <w:abstractNumId w:val="993"/>
@@ -16684,7 +16857,7 @@
     <w:abstractNumId w:val="993"/>
   </w:num>
   <w:num w:numId="1478">
-    <w:abstractNumId w:val="991"/>
+    <w:abstractNumId w:val="993"/>
   </w:num>
   <w:num w:numId="1479">
     <w:abstractNumId w:val="993"/>
@@ -16705,35 +16878,35 @@
     <w:abstractNumId w:val="993"/>
   </w:num>
   <w:num w:numId="1485">
-    <w:abstractNumId w:val="992"/>
+    <w:abstractNumId w:val="993"/>
   </w:num>
   <w:num w:numId="1486">
-    <w:abstractNumId w:val="992"/>
+    <w:abstractNumId w:val="991"/>
   </w:num>
   <w:num w:numId="1487">
     <w:abstractNumId w:val="993"/>
   </w:num>
   <w:num w:numId="1488">
+    <w:abstractNumId w:val="993"/>
+  </w:num>
+  <w:num w:numId="1489">
+    <w:abstractNumId w:val="992"/>
+  </w:num>
+  <w:num w:numId="1490">
+    <w:abstractNumId w:val="992"/>
+  </w:num>
+  <w:num w:numId="1491">
+    <w:abstractNumId w:val="993"/>
+  </w:num>
+  <w:num w:numId="1492">
     <w:abstractNumId w:val="991"/>
   </w:num>
-  <w:num w:numId="1489">
-    <w:abstractNumId w:val="993"/>
-  </w:num>
-  <w:num w:numId="1490">
+  <w:num w:numId="1493">
+    <w:abstractNumId w:val="993"/>
+  </w:num>
+  <w:num w:numId="1494">
     <w:abstractNumId w:val="991"/>
   </w:num>
-  <w:num w:numId="1491">
-    <w:abstractNumId w:val="993"/>
-  </w:num>
-  <w:num w:numId="1492">
-    <w:abstractNumId w:val="993"/>
-  </w:num>
-  <w:num w:numId="1493">
-    <w:abstractNumId w:val="993"/>
-  </w:num>
-  <w:num w:numId="1494">
-    <w:abstractNumId w:val="993"/>
-  </w:num>
   <w:num w:numId="1495">
     <w:abstractNumId w:val="993"/>
   </w:num>
@@ -16750,20 +16923,20 @@
     <w:abstractNumId w:val="993"/>
   </w:num>
   <w:num w:numId="1500">
+    <w:abstractNumId w:val="993"/>
+  </w:num>
+  <w:num w:numId="1501">
+    <w:abstractNumId w:val="993"/>
+  </w:num>
+  <w:num w:numId="1502">
+    <w:abstractNumId w:val="993"/>
+  </w:num>
+  <w:num w:numId="1503">
+    <w:abstractNumId w:val="993"/>
+  </w:num>
+  <w:num w:numId="1504">
     <w:abstractNumId w:val="991"/>
   </w:num>
-  <w:num w:numId="1501">
-    <w:abstractNumId w:val="993"/>
-  </w:num>
-  <w:num w:numId="1502">
-    <w:abstractNumId w:val="993"/>
-  </w:num>
-  <w:num w:numId="1503">
-    <w:abstractNumId w:val="992"/>
-  </w:num>
-  <w:num w:numId="1504">
-    <w:abstractNumId w:val="992"/>
-  </w:num>
   <w:num w:numId="1505">
     <w:abstractNumId w:val="993"/>
   </w:num>
@@ -16771,22 +16944,22 @@
     <w:abstractNumId w:val="993"/>
   </w:num>
   <w:num w:numId="1507">
-    <w:abstractNumId w:val="993"/>
+    <w:abstractNumId w:val="992"/>
   </w:num>
   <w:num w:numId="1508">
     <w:abstractNumId w:val="992"/>
   </w:num>
   <w:num w:numId="1509">
-    <w:abstractNumId w:val="992"/>
+    <w:abstractNumId w:val="993"/>
   </w:num>
   <w:num w:numId="1510">
-    <w:abstractNumId w:val="992"/>
+    <w:abstractNumId w:val="993"/>
   </w:num>
   <w:num w:numId="1511">
-    <w:abstractNumId w:val="992"/>
+    <w:abstractNumId w:val="993"/>
   </w:num>
   <w:num w:numId="1512">
-    <w:abstractNumId w:val="993"/>
+    <w:abstractNumId w:val="992"/>
   </w:num>
   <w:num w:numId="1513">
     <w:abstractNumId w:val="992"/>
@@ -16795,16 +16968,16 @@
     <w:abstractNumId w:val="992"/>
   </w:num>
   <w:num w:numId="1515">
-    <w:abstractNumId w:val="993"/>
+    <w:abstractNumId w:val="992"/>
   </w:num>
   <w:num w:numId="1516">
     <w:abstractNumId w:val="993"/>
   </w:num>
   <w:num w:numId="1517">
-    <w:abstractNumId w:val="993"/>
+    <w:abstractNumId w:val="992"/>
   </w:num>
   <w:num w:numId="1518">
-    <w:abstractNumId w:val="993"/>
+    <w:abstractNumId w:val="992"/>
   </w:num>
   <w:num w:numId="1519">
     <w:abstractNumId w:val="993"/>
@@ -16855,20 +17028,20 @@
     <w:abstractNumId w:val="993"/>
   </w:num>
   <w:num w:numId="1535">
+    <w:abstractNumId w:val="993"/>
+  </w:num>
+  <w:num w:numId="1536">
+    <w:abstractNumId w:val="993"/>
+  </w:num>
+  <w:num w:numId="1537">
+    <w:abstractNumId w:val="993"/>
+  </w:num>
+  <w:num w:numId="1538">
+    <w:abstractNumId w:val="993"/>
+  </w:num>
+  <w:num w:numId="1539">
     <w:abstractNumId w:val="991"/>
   </w:num>
-  <w:num w:numId="1536">
-    <w:abstractNumId w:val="992"/>
-  </w:num>
-  <w:num w:numId="1537">
-    <w:abstractNumId w:val="992"/>
-  </w:num>
-  <w:num w:numId="1538">
-    <w:abstractNumId w:val="992"/>
-  </w:num>
-  <w:num w:numId="1539">
-    <w:abstractNumId w:val="992"/>
-  </w:num>
   <w:num w:numId="1540">
     <w:abstractNumId w:val="992"/>
   </w:num>
@@ -16906,44 +17079,44 @@
     <w:abstractNumId w:val="992"/>
   </w:num>
   <w:num w:numId="1552">
-    <w:abstractNumId w:val="993"/>
+    <w:abstractNumId w:val="992"/>
   </w:num>
   <w:num w:numId="1553">
-    <w:abstractNumId w:val="993"/>
+    <w:abstractNumId w:val="992"/>
   </w:num>
   <w:num w:numId="1554">
-    <w:abstractNumId w:val="993"/>
+    <w:abstractNumId w:val="992"/>
   </w:num>
   <w:num w:numId="1555">
-    <w:abstractNumId w:val="993"/>
+    <w:abstractNumId w:val="992"/>
   </w:num>
   <w:num w:numId="1556">
     <w:abstractNumId w:val="993"/>
   </w:num>
   <w:num w:numId="1557">
+    <w:abstractNumId w:val="993"/>
+  </w:num>
+  <w:num w:numId="1558">
+    <w:abstractNumId w:val="993"/>
+  </w:num>
+  <w:num w:numId="1559">
+    <w:abstractNumId w:val="993"/>
+  </w:num>
+  <w:num w:numId="1560">
+    <w:abstractNumId w:val="993"/>
+  </w:num>
+  <w:num w:numId="1561">
     <w:abstractNumId w:val="991"/>
   </w:num>
-  <w:num w:numId="1558">
-    <w:abstractNumId w:val="993"/>
-  </w:num>
-  <w:num w:numId="1559">
-    <w:abstractNumId w:val="993"/>
-  </w:num>
-  <w:num w:numId="1560">
+  <w:num w:numId="1562">
+    <w:abstractNumId w:val="993"/>
+  </w:num>
+  <w:num w:numId="1563">
+    <w:abstractNumId w:val="993"/>
+  </w:num>
+  <w:num w:numId="1564">
     <w:abstractNumId w:val="991"/>
   </w:num>
-  <w:num w:numId="1561">
-    <w:abstractNumId w:val="993"/>
-  </w:num>
-  <w:num w:numId="1562">
-    <w:abstractNumId w:val="993"/>
-  </w:num>
-  <w:num w:numId="1563">
-    <w:abstractNumId w:val="993"/>
-  </w:num>
-  <w:num w:numId="1564">
-    <w:abstractNumId w:val="993"/>
-  </w:num>
   <w:num w:numId="1565">
     <w:abstractNumId w:val="993"/>
   </w:num>
@@ -16963,37 +17136,37 @@
     <w:abstractNumId w:val="993"/>
   </w:num>
   <w:num w:numId="1571">
+    <w:abstractNumId w:val="993"/>
+  </w:num>
+  <w:num w:numId="1572">
+    <w:abstractNumId w:val="993"/>
+  </w:num>
+  <w:num w:numId="1573">
+    <w:abstractNumId w:val="993"/>
+  </w:num>
+  <w:num w:numId="1574">
+    <w:abstractNumId w:val="993"/>
+  </w:num>
+  <w:num w:numId="1575">
     <w:abstractNumId w:val="991"/>
   </w:num>
-  <w:num w:numId="1572">
-    <w:abstractNumId w:val="993"/>
-  </w:num>
-  <w:num w:numId="1573">
+  <w:num w:numId="1576">
+    <w:abstractNumId w:val="993"/>
+  </w:num>
+  <w:num w:numId="1577">
     <w:abstractNumId w:val="991"/>
   </w:num>
-  <w:num w:numId="1574">
-    <w:abstractNumId w:val="993"/>
-  </w:num>
-  <w:num w:numId="1575">
-    <w:abstractNumId w:val="993"/>
-  </w:num>
-  <w:num w:numId="1576">
-    <w:abstractNumId w:val="993"/>
-  </w:num>
-  <w:num w:numId="1577">
-    <w:abstractNumId w:val="993"/>
-  </w:num>
   <w:num w:numId="1578">
-    <w:abstractNumId w:val="992"/>
+    <w:abstractNumId w:val="993"/>
   </w:num>
   <w:num w:numId="1579">
-    <w:abstractNumId w:val="992"/>
+    <w:abstractNumId w:val="993"/>
   </w:num>
   <w:num w:numId="1580">
     <w:abstractNumId w:val="993"/>
   </w:num>
   <w:num w:numId="1581">
-    <w:abstractNumId w:val="992"/>
+    <w:abstractNumId w:val="993"/>
   </w:num>
   <w:num w:numId="1582">
     <w:abstractNumId w:val="992"/>
@@ -17002,7 +17175,7 @@
     <w:abstractNumId w:val="992"/>
   </w:num>
   <w:num w:numId="1584">
-    <w:abstractNumId w:val="992"/>
+    <w:abstractNumId w:val="993"/>
   </w:num>
   <w:num w:numId="1585">
     <w:abstractNumId w:val="992"/>
@@ -17011,16 +17184,16 @@
     <w:abstractNumId w:val="992"/>
   </w:num>
   <w:num w:numId="1587">
-    <w:abstractNumId w:val="993"/>
+    <w:abstractNumId w:val="992"/>
   </w:num>
   <w:num w:numId="1588">
-    <w:abstractNumId w:val="993"/>
+    <w:abstractNumId w:val="992"/>
   </w:num>
   <w:num w:numId="1589">
-    <w:abstractNumId w:val="993"/>
+    <w:abstractNumId w:val="992"/>
   </w:num>
   <w:num w:numId="1590">
-    <w:abstractNumId w:val="993"/>
+    <w:abstractNumId w:val="992"/>
   </w:num>
   <w:num w:numId="1591">
     <w:abstractNumId w:val="993"/>
@@ -17032,7 +17205,7 @@
     <w:abstractNumId w:val="993"/>
   </w:num>
   <w:num w:numId="1594">
-    <w:abstractNumId w:val="992"/>
+    <w:abstractNumId w:val="993"/>
   </w:num>
   <w:num w:numId="1595">
     <w:abstractNumId w:val="993"/>
@@ -17068,7 +17241,7 @@
     <w:abstractNumId w:val="993"/>
   </w:num>
   <w:num w:numId="1606">
-    <w:abstractNumId w:val="993"/>
+    <w:abstractNumId w:val="992"/>
   </w:num>
   <w:num w:numId="1607">
     <w:abstractNumId w:val="993"/>
@@ -17077,43 +17250,43 @@
     <w:abstractNumId w:val="993"/>
   </w:num>
   <w:num w:numId="1609">
-    <w:abstractNumId w:val="992"/>
+    <w:abstractNumId w:val="993"/>
   </w:num>
   <w:num w:numId="1610">
     <w:abstractNumId w:val="993"/>
   </w:num>
   <w:num w:numId="1611">
-    <w:abstractNumId w:val="992"/>
+    <w:abstractNumId w:val="993"/>
   </w:num>
   <w:num w:numId="1612">
-    <w:abstractNumId w:val="992"/>
+    <w:abstractNumId w:val="993"/>
   </w:num>
   <w:num w:numId="1613">
-    <w:abstractNumId w:val="993"/>
+    <w:abstractNumId w:val="992"/>
   </w:num>
   <w:num w:numId="1614">
     <w:abstractNumId w:val="993"/>
   </w:num>
   <w:num w:numId="1615">
-    <w:abstractNumId w:val="993"/>
+    <w:abstractNumId w:val="992"/>
   </w:num>
   <w:num w:numId="1616">
-    <w:abstractNumId w:val="993"/>
+    <w:abstractNumId w:val="992"/>
   </w:num>
   <w:num w:numId="1617">
-    <w:abstractNumId w:val="992"/>
+    <w:abstractNumId w:val="993"/>
   </w:num>
   <w:num w:numId="1618">
-    <w:abstractNumId w:val="992"/>
+    <w:abstractNumId w:val="993"/>
   </w:num>
   <w:num w:numId="1619">
-    <w:abstractNumId w:val="992"/>
+    <w:abstractNumId w:val="993"/>
   </w:num>
   <w:num w:numId="1620">
-    <w:abstractNumId w:val="992"/>
+    <w:abstractNumId w:val="993"/>
   </w:num>
   <w:num w:numId="1621">
-    <w:abstractNumId w:val="993"/>
+    <w:abstractNumId w:val="992"/>
   </w:num>
   <w:num w:numId="1622">
     <w:abstractNumId w:val="992"/>
@@ -17125,7 +17298,7 @@
     <w:abstractNumId w:val="992"/>
   </w:num>
   <w:num w:numId="1625">
-    <w:abstractNumId w:val="992"/>
+    <w:abstractNumId w:val="993"/>
   </w:num>
   <w:num w:numId="1626">
     <w:abstractNumId w:val="992"/>
@@ -17236,6 +17409,18 @@
     <w:abstractNumId w:val="992"/>
   </w:num>
   <w:num w:numId="1662">
+    <w:abstractNumId w:val="992"/>
+  </w:num>
+  <w:num w:numId="1663">
+    <w:abstractNumId w:val="992"/>
+  </w:num>
+  <w:num w:numId="1664">
+    <w:abstractNumId w:val="992"/>
+  </w:num>
+  <w:num w:numId="1665">
+    <w:abstractNumId w:val="992"/>
+  </w:num>
+  <w:num w:numId="1666">
     <w:abstractNumId w:val="992"/>
   </w:num>
 </w:numbering>

</xml_diff>

<commit_message>
Close M1.6 inbox AI policy gate
</commit_message>
<xml_diff>
--- a/MASTER_M1_M2_DELIVERY_CHECKLIST.docx
+++ b/MASTER_M1_M2_DELIVERY_CHECKLIST.docx
@@ -10,7 +10,7 @@
         <w:t xml:space="preserve">© BuyReadySite.com</w:t>
       </w:r>
     </w:p>
-    <w:bookmarkStart w:id="91" w:name="X3d74ce0b4fd94f465ac7edf34b08aa6d5ff209b"/>
+    <w:bookmarkStart w:id="92" w:name="X3d74ce0b4fd94f465ac7edf34b08aa6d5ff209b"/>
     <w:p>
       <w:pPr>
         <w:pStyle w:val="Heading1"/>
@@ -81,10 +81,10 @@
         <w:tblLook w:firstRow="1" w:lastRow="0" w:firstColumn="0" w:lastColumn="0" w:noHBand="0" w:noVBand="0" w:val="0020"/>
       </w:tblPr>
       <w:tblGrid>
-        <w:gridCol w:w="2242"/>
-        <w:gridCol w:w="381"/>
-        <w:gridCol w:w="477"/>
-        <w:gridCol w:w="4818"/>
+        <w:gridCol w:w="2341"/>
+        <w:gridCol w:w="398"/>
+        <w:gridCol w:w="498"/>
+        <w:gridCol w:w="4682"/>
       </w:tblGrid>
       <w:tr>
         <w:trPr>
@@ -457,7 +457,7 @@
               <w:jc w:val="right"/>
             </w:pPr>
             <w:r>
-              <w:t xml:space="preserve">5%</w:t>
+              <w:t xml:space="preserve">6%</w:t>
             </w:r>
           </w:p>
         </w:tc>
@@ -468,7 +468,7 @@
               <w:pStyle w:val="Compact"/>
             </w:pPr>
             <w:r>
-              <w:t xml:space="preserve">Production deploy smoke passed; remaining functional/visual regression gates stay open</w:t>
+              <w:t xml:space="preserve">Inbox AI/email/follow-up policy gate passed; new deal/share/socket/visual gates remain</w:t>
             </w:r>
           </w:p>
         </w:tc>
@@ -709,7 +709,7 @@
                 <w:b/>
                 <w:bCs/>
               </w:rPr>
-              <w:t xml:space="preserve">72%</w:t>
+              <w:t xml:space="preserve">73%</w:t>
             </w:r>
           </w:p>
         </w:tc>
@@ -724,7 +724,7 @@
                 <w:b/>
                 <w:bCs/>
               </w:rPr>
-              <w:t xml:space="preserve">M1.6 production deploy smoke added; remaining functional/visual regression gates stay open</w:t>
+              <w:t xml:space="preserve">M1.6 Inbox AI/email/follow-up policy evidence added; new deal/share/socket/visual remain</w:t>
             </w:r>
           </w:p>
         </w:tc>
@@ -9929,7 +9929,7 @@
     </w:p>
     <w:bookmarkEnd w:id="52"/>
     <w:bookmarkEnd w:id="53"/>
-    <w:bookmarkStart w:id="60" w:name="m1.6-m1-full-regression-and-release-gate"/>
+    <w:bookmarkStart w:id="61" w:name="m1.6-m1-full-regression-and-release-gate"/>
     <w:p>
       <w:pPr>
         <w:pStyle w:val="Heading2"/>
@@ -10568,12 +10568,160 @@
       </w:r>
     </w:p>
     <w:bookmarkEnd w:id="56"/>
-    <w:bookmarkStart w:id="57" w:name="functional-regression"/>
+    <w:bookmarkStart w:id="57" w:name="Xac8aeed6d7d9dfdb65048c34d5016729e7de71c"/>
     <w:p>
       <w:pPr>
         <w:pStyle w:val="Heading3"/>
       </w:pPr>
       <w:r>
+        <w:t xml:space="preserve">Inbox AI / Email CTA / Follow-up policy smoke — 2026-05-02</w:t>
+      </w:r>
+    </w:p>
+    <w:p>
+      <w:pPr>
+        <w:pStyle w:val="Compact"/>
+        <w:numPr>
+          <w:ilvl w:val="0"/>
+          <w:numId w:val="1416"/>
+        </w:numPr>
+      </w:pPr>
+      <w:r>
+        <w:t xml:space="preserve">Evidence JSON added:</w:t>
+      </w:r>
+      <w:r>
+        <w:t xml:space="preserve"> </w:t>
+      </w:r>
+      <w:r>
+        <w:rPr>
+          <w:rStyle w:val="VerbatimChar"/>
+        </w:rPr>
+        <w:t xml:space="preserve">audit-screenshots/m16-inbox-ai-policy-evidence.json</w:t>
+      </w:r>
+      <w:r>
+        <w:t xml:space="preserve">.</w:t>
+      </w:r>
+    </w:p>
+    <w:p>
+      <w:pPr>
+        <w:pStyle w:val="Compact"/>
+        <w:numPr>
+          <w:ilvl w:val="0"/>
+          <w:numId w:val="1417"/>
+        </w:numPr>
+      </w:pPr>
+      <w:r>
+        <w:t xml:space="preserve">Focused policy tests passed 54/54 across AI suggestion repair, conversation email priority, follow-up parsing, quiet-hours reason formatting, and inbound owner retention.</w:t>
+      </w:r>
+    </w:p>
+    <w:p>
+      <w:pPr>
+        <w:pStyle w:val="Compact"/>
+        <w:numPr>
+          <w:ilvl w:val="0"/>
+          <w:numId w:val="1418"/>
+        </w:numPr>
+      </w:pPr>
+      <w:r>
+        <w:t xml:space="preserve">Root production build passed after Inbox/AI changes: server</w:t>
+      </w:r>
+      <w:r>
+        <w:t xml:space="preserve"> </w:t>
+      </w:r>
+      <w:r>
+        <w:rPr>
+          <w:rStyle w:val="VerbatimChar"/>
+        </w:rPr>
+        <w:t xml:space="preserve">tsc</w:t>
+      </w:r>
+      <w:r>
+        <w:t xml:space="preserve"> </w:t>
+      </w:r>
+      <w:r>
+        <w:t xml:space="preserve">plus client</w:t>
+      </w:r>
+      <w:r>
+        <w:t xml:space="preserve"> </w:t>
+      </w:r>
+      <w:r>
+        <w:rPr>
+          <w:rStyle w:val="VerbatimChar"/>
+        </w:rPr>
+        <w:t xml:space="preserve">tsc &amp;&amp; vite build</w:t>
+      </w:r>
+      <w:r>
+        <w:t xml:space="preserve">.</w:t>
+      </w:r>
+    </w:p>
+    <w:p>
+      <w:pPr>
+        <w:pStyle w:val="Compact"/>
+        <w:numPr>
+          <w:ilvl w:val="0"/>
+          <w:numId w:val="1419"/>
+        </w:numPr>
+      </w:pPr>
+      <w:r>
+        <w:t xml:space="preserve">Browser mock smoke passed on fresh production preview: Inbox rendered AI suggestion, texted email</w:t>
+      </w:r>
+      <w:r>
+        <w:t xml:space="preserve"> </w:t>
+      </w:r>
+      <w:r>
+        <w:rPr>
+          <w:rStyle w:val="VerbatimChar"/>
+        </w:rPr>
+        <w:t xml:space="preserve">Shawnthai@gmail.com</w:t>
+      </w:r>
+      <w:r>
+        <w:t xml:space="preserve">, and Gmail CTA generated</w:t>
+      </w:r>
+      <w:r>
+        <w:t xml:space="preserve"> </w:t>
+      </w:r>
+      <w:r>
+        <w:rPr>
+          <w:rStyle w:val="VerbatimChar"/>
+        </w:rPr>
+        <w:t xml:space="preserve">https://mail.google.com/mail/?view=cm&amp;fs=1&amp;to=Shawnthai%40gmail.com</w:t>
+      </w:r>
+      <w:r>
+        <w:t xml:space="preserve"> </w:t>
+      </w:r>
+      <w:r>
+        <w:t xml:space="preserve">without subject/body.</w:t>
+      </w:r>
+    </w:p>
+    <w:p>
+      <w:pPr>
+        <w:pStyle w:val="Compact"/>
+        <w:numPr>
+          <w:ilvl w:val="0"/>
+          <w:numId w:val="1420"/>
+        </w:numPr>
+      </w:pPr>
+      <w:r>
+        <w:t xml:space="preserve">Gmail recipient policy prefers conversation/texted email over lead-list email while preserving lead-list email in response metadata.</w:t>
+      </w:r>
+    </w:p>
+    <w:p>
+      <w:pPr>
+        <w:pStyle w:val="Compact"/>
+        <w:numPr>
+          <w:ilvl w:val="0"/>
+          <w:numId w:val="1421"/>
+        </w:numPr>
+      </w:pPr>
+      <w:r>
+        <w:t xml:space="preserve">Admin/manager self-assign path is allowed only for the current privileged user; ordinary assignment still requires an active REP.</w:t>
+      </w:r>
+    </w:p>
+    <w:bookmarkEnd w:id="57"/>
+    <w:bookmarkStart w:id="58" w:name="functional-regression"/>
+    <w:p>
+      <w:pPr>
+        <w:pStyle w:val="Heading3"/>
+      </w:pPr>
+      <w:r>
         <w:t xml:space="preserve">Functional regression</w:t>
       </w:r>
     </w:p>
@@ -10582,7 +10730,7 @@
         <w:pStyle w:val="Compact"/>
         <w:numPr>
           <w:ilvl w:val="0"/>
-          <w:numId w:val="1416"/>
+          <w:numId w:val="1422"/>
         </w:numPr>
       </w:pPr>
       <w:r>
@@ -10594,7 +10742,7 @@
         <w:pStyle w:val="Compact"/>
         <w:numPr>
           <w:ilvl w:val="0"/>
-          <w:numId w:val="1417"/>
+          <w:numId w:val="1423"/>
         </w:numPr>
       </w:pPr>
       <w:r>
@@ -10606,7 +10754,7 @@
         <w:pStyle w:val="Compact"/>
         <w:numPr>
           <w:ilvl w:val="0"/>
-          <w:numId w:val="1418"/>
+          <w:numId w:val="1424"/>
         </w:numPr>
       </w:pPr>
       <w:r>
@@ -10618,7 +10766,7 @@
         <w:pStyle w:val="Compact"/>
         <w:numPr>
           <w:ilvl w:val="0"/>
-          <w:numId w:val="1419"/>
+          <w:numId w:val="1425"/>
         </w:numPr>
       </w:pPr>
       <w:r>
@@ -10630,7 +10778,7 @@
         <w:pStyle w:val="Compact"/>
         <w:numPr>
           <w:ilvl w:val="0"/>
-          <w:numId w:val="1420"/>
+          <w:numId w:val="1426"/>
         </w:numPr>
       </w:pPr>
       <w:r>
@@ -10642,7 +10790,7 @@
         <w:pStyle w:val="Compact"/>
         <w:numPr>
           <w:ilvl w:val="0"/>
-          <w:numId w:val="1421"/>
+          <w:numId w:val="1427"/>
         </w:numPr>
       </w:pPr>
       <w:r>
@@ -10654,7 +10802,7 @@
         <w:pStyle w:val="Compact"/>
         <w:numPr>
           <w:ilvl w:val="0"/>
-          <w:numId w:val="1422"/>
+          <w:numId w:val="1428"/>
         </w:numPr>
       </w:pPr>
       <w:r>
@@ -10666,7 +10814,7 @@
         <w:pStyle w:val="Compact"/>
         <w:numPr>
           <w:ilvl w:val="0"/>
-          <w:numId w:val="1423"/>
+          <w:numId w:val="1429"/>
         </w:numPr>
       </w:pPr>
       <w:r>
@@ -10678,7 +10826,7 @@
         <w:pStyle w:val="Compact"/>
         <w:numPr>
           <w:ilvl w:val="0"/>
-          <w:numId w:val="1424"/>
+          <w:numId w:val="1430"/>
         </w:numPr>
       </w:pPr>
       <w:r>
@@ -10690,7 +10838,7 @@
         <w:pStyle w:val="Compact"/>
         <w:numPr>
           <w:ilvl w:val="0"/>
-          <w:numId w:val="1425"/>
+          <w:numId w:val="1431"/>
         </w:numPr>
       </w:pPr>
       <w:r>
@@ -10702,7 +10850,7 @@
         <w:pStyle w:val="Compact"/>
         <w:numPr>
           <w:ilvl w:val="0"/>
-          <w:numId w:val="1426"/>
+          <w:numId w:val="1432"/>
         </w:numPr>
       </w:pPr>
       <w:r>
@@ -10714,7 +10862,7 @@
         <w:pStyle w:val="Compact"/>
         <w:numPr>
           <w:ilvl w:val="0"/>
-          <w:numId w:val="1427"/>
+          <w:numId w:val="1433"/>
         </w:numPr>
       </w:pPr>
       <w:r>
@@ -10726,7 +10874,7 @@
         <w:pStyle w:val="Compact"/>
         <w:numPr>
           <w:ilvl w:val="0"/>
-          <w:numId w:val="1428"/>
+          <w:numId w:val="1434"/>
         </w:numPr>
       </w:pPr>
       <w:r>
@@ -10738,7 +10886,7 @@
         <w:pStyle w:val="Compact"/>
         <w:numPr>
           <w:ilvl w:val="0"/>
-          <w:numId w:val="1429"/>
+          <w:numId w:val="1435"/>
         </w:numPr>
       </w:pPr>
       <w:r>
@@ -10750,15 +10898,15 @@
         <w:pStyle w:val="Compact"/>
         <w:numPr>
           <w:ilvl w:val="0"/>
-          <w:numId w:val="1430"/>
+          <w:numId w:val="1436"/>
         </w:numPr>
       </w:pPr>
       <w:r>
         <w:t xml:space="preserve">Socket scoping unaffected.</w:t>
       </w:r>
     </w:p>
-    <w:bookmarkEnd w:id="57"/>
-    <w:bookmarkStart w:id="58" w:name="visual-regression"/>
+    <w:bookmarkEnd w:id="58"/>
+    <w:bookmarkStart w:id="59" w:name="visual-regression"/>
     <w:p>
       <w:pPr>
         <w:pStyle w:val="Heading3"/>
@@ -10772,7 +10920,7 @@
         <w:pStyle w:val="Compact"/>
         <w:numPr>
           <w:ilvl w:val="0"/>
-          <w:numId w:val="1431"/>
+          <w:numId w:val="1437"/>
         </w:numPr>
       </w:pPr>
       <w:r>
@@ -10784,7 +10932,7 @@
         <w:pStyle w:val="Compact"/>
         <w:numPr>
           <w:ilvl w:val="0"/>
-          <w:numId w:val="1432"/>
+          <w:numId w:val="1438"/>
         </w:numPr>
       </w:pPr>
       <w:r>
@@ -10796,7 +10944,7 @@
         <w:pStyle w:val="Compact"/>
         <w:numPr>
           <w:ilvl w:val="0"/>
-          <w:numId w:val="1433"/>
+          <w:numId w:val="1439"/>
         </w:numPr>
       </w:pPr>
       <w:r>
@@ -10808,7 +10956,7 @@
         <w:pStyle w:val="Compact"/>
         <w:numPr>
           <w:ilvl w:val="0"/>
-          <w:numId w:val="1434"/>
+          <w:numId w:val="1440"/>
         </w:numPr>
       </w:pPr>
       <w:r>
@@ -10820,7 +10968,7 @@
         <w:pStyle w:val="Compact"/>
         <w:numPr>
           <w:ilvl w:val="0"/>
-          <w:numId w:val="1435"/>
+          <w:numId w:val="1441"/>
         </w:numPr>
       </w:pPr>
       <w:r>
@@ -10832,7 +10980,7 @@
         <w:pStyle w:val="Compact"/>
         <w:numPr>
           <w:ilvl w:val="0"/>
-          <w:numId w:val="1436"/>
+          <w:numId w:val="1442"/>
         </w:numPr>
       </w:pPr>
       <w:r>
@@ -10844,15 +10992,15 @@
         <w:pStyle w:val="Compact"/>
         <w:numPr>
           <w:ilvl w:val="0"/>
-          <w:numId w:val="1437"/>
+          <w:numId w:val="1443"/>
         </w:numPr>
       </w:pPr>
       <w:r>
         <w:t xml:space="preserve">Sidebar remains unchanged unless intentionally touched.</w:t>
       </w:r>
     </w:p>
-    <w:bookmarkEnd w:id="58"/>
-    <w:bookmarkStart w:id="59" w:name="release-readiness"/>
+    <w:bookmarkEnd w:id="59"/>
+    <w:bookmarkStart w:id="60" w:name="release-readiness"/>
     <w:p>
       <w:pPr>
         <w:pStyle w:val="Heading3"/>
@@ -10866,7 +11014,7 @@
         <w:pStyle w:val="Compact"/>
         <w:numPr>
           <w:ilvl w:val="0"/>
-          <w:numId w:val="1438"/>
+          <w:numId w:val="1444"/>
         </w:numPr>
       </w:pPr>
       <w:r>
@@ -10878,7 +11026,7 @@
         <w:pStyle w:val="Compact"/>
         <w:numPr>
           <w:ilvl w:val="0"/>
-          <w:numId w:val="1439"/>
+          <w:numId w:val="1445"/>
         </w:numPr>
       </w:pPr>
       <w:r>
@@ -10890,7 +11038,7 @@
         <w:pStyle w:val="Compact"/>
         <w:numPr>
           <w:ilvl w:val="0"/>
-          <w:numId w:val="1440"/>
+          <w:numId w:val="1446"/>
         </w:numPr>
       </w:pPr>
       <w:r>
@@ -10902,7 +11050,7 @@
         <w:pStyle w:val="Compact"/>
         <w:numPr>
           <w:ilvl w:val="0"/>
-          <w:numId w:val="1441"/>
+          <w:numId w:val="1447"/>
         </w:numPr>
       </w:pPr>
       <w:r>
@@ -10914,7 +11062,7 @@
         <w:pStyle w:val="Compact"/>
         <w:numPr>
           <w:ilvl w:val="0"/>
-          <w:numId w:val="1442"/>
+          <w:numId w:val="1448"/>
         </w:numPr>
       </w:pPr>
       <w:r>
@@ -10926,7 +11074,7 @@
         <w:pStyle w:val="Compact"/>
         <w:numPr>
           <w:ilvl w:val="0"/>
-          <w:numId w:val="1443"/>
+          <w:numId w:val="1449"/>
         </w:numPr>
       </w:pPr>
       <w:r>
@@ -10938,16 +11086,16 @@
         <w:pStyle w:val="Compact"/>
         <w:numPr>
           <w:ilvl w:val="0"/>
-          <w:numId w:val="1444"/>
+          <w:numId w:val="1450"/>
         </w:numPr>
       </w:pPr>
       <w:r>
         <w:t xml:space="preserve">Progress dashboard updated to M1 complete only after all gates pass.</w:t>
       </w:r>
     </w:p>
-    <w:bookmarkEnd w:id="59"/>
     <w:bookmarkEnd w:id="60"/>
-    <w:bookmarkStart w:id="66" w:name="Xa989490dca5dab2d86ca3d9b72c2ded4f0c555a"/>
+    <w:bookmarkEnd w:id="61"/>
+    <w:bookmarkStart w:id="67" w:name="Xa989490dca5dab2d86ca3d9b72c2ded4f0c555a"/>
     <w:p>
       <w:pPr>
         <w:pStyle w:val="Heading2"/>
@@ -10956,7 +11104,7 @@
         <w:t xml:space="preserve">M2.1 — Leads/Campaign Access And Source Fixes</w:t>
       </w:r>
     </w:p>
-    <w:bookmarkStart w:id="61" w:name="implementation-evidence-2026-05-02-4"/>
+    <w:bookmarkStart w:id="62" w:name="implementation-evidence-2026-05-02-4"/>
     <w:p>
       <w:pPr>
         <w:pStyle w:val="Heading3"/>
@@ -10970,7 +11118,7 @@
         <w:pStyle w:val="Compact"/>
         <w:numPr>
           <w:ilvl w:val="0"/>
-          <w:numId w:val="1445"/>
+          <w:numId w:val="1451"/>
         </w:numPr>
       </w:pPr>
       <w:r>
@@ -11042,7 +11190,7 @@
         <w:pStyle w:val="Compact"/>
         <w:numPr>
           <w:ilvl w:val="0"/>
-          <w:numId w:val="1446"/>
+          <w:numId w:val="1452"/>
         </w:numPr>
       </w:pPr>
       <w:r>
@@ -11054,7 +11202,7 @@
         <w:pStyle w:val="Compact"/>
         <w:numPr>
           <w:ilvl w:val="0"/>
-          <w:numId w:val="1447"/>
+          <w:numId w:val="1453"/>
         </w:numPr>
       </w:pPr>
       <w:r>
@@ -11081,7 +11229,7 @@
         <w:pStyle w:val="Compact"/>
         <w:numPr>
           <w:ilvl w:val="0"/>
-          <w:numId w:val="1448"/>
+          <w:numId w:val="1454"/>
         </w:numPr>
       </w:pPr>
       <w:r>
@@ -11135,7 +11283,7 @@
         <w:pStyle w:val="Compact"/>
         <w:numPr>
           <w:ilvl w:val="0"/>
-          <w:numId w:val="1449"/>
+          <w:numId w:val="1455"/>
         </w:numPr>
       </w:pPr>
       <w:r>
@@ -11147,15 +11295,15 @@
         <w:pStyle w:val="Compact"/>
         <w:numPr>
           <w:ilvl w:val="0"/>
-          <w:numId w:val="1450"/>
+          <w:numId w:val="1456"/>
         </w:numPr>
       </w:pPr>
       <w:r>
         <w:t xml:space="preserve">CSV import smoke pending with two real rep accounts.</w:t>
       </w:r>
     </w:p>
-    <w:bookmarkEnd w:id="61"/>
-    <w:bookmarkStart w:id="62" w:name="leads-ownership-bug"/>
+    <w:bookmarkEnd w:id="62"/>
+    <w:bookmarkStart w:id="63" w:name="leads-ownership-bug"/>
     <w:p>
       <w:pPr>
         <w:pStyle w:val="Heading3"/>
@@ -11169,7 +11317,7 @@
         <w:pStyle w:val="Compact"/>
         <w:numPr>
           <w:ilvl w:val="0"/>
-          <w:numId w:val="1451"/>
+          <w:numId w:val="1457"/>
         </w:numPr>
       </w:pPr>
       <w:r>
@@ -11220,7 +11368,7 @@
         <w:pStyle w:val="Compact"/>
         <w:numPr>
           <w:ilvl w:val="0"/>
-          <w:numId w:val="1452"/>
+          <w:numId w:val="1458"/>
         </w:numPr>
       </w:pPr>
       <w:r>
@@ -11247,7 +11395,7 @@
         <w:pStyle w:val="Compact"/>
         <w:numPr>
           <w:ilvl w:val="0"/>
-          <w:numId w:val="1453"/>
+          <w:numId w:val="1459"/>
         </w:numPr>
       </w:pPr>
       <w:r>
@@ -11259,7 +11407,7 @@
         <w:pStyle w:val="Compact"/>
         <w:numPr>
           <w:ilvl w:val="0"/>
-          <w:numId w:val="1454"/>
+          <w:numId w:val="1460"/>
         </w:numPr>
       </w:pPr>
       <w:r>
@@ -11286,7 +11434,7 @@
         <w:pStyle w:val="Compact"/>
         <w:numPr>
           <w:ilvl w:val="0"/>
-          <w:numId w:val="1455"/>
+          <w:numId w:val="1461"/>
         </w:numPr>
       </w:pPr>
       <w:r>
@@ -11298,7 +11446,7 @@
         <w:pStyle w:val="Compact"/>
         <w:numPr>
           <w:ilvl w:val="0"/>
-          <w:numId w:val="1456"/>
+          <w:numId w:val="1462"/>
         </w:numPr>
       </w:pPr>
       <w:r>
@@ -11310,15 +11458,15 @@
         <w:pStyle w:val="Compact"/>
         <w:numPr>
           <w:ilvl w:val="0"/>
-          <w:numId w:val="1457"/>
+          <w:numId w:val="1463"/>
         </w:numPr>
       </w:pPr>
       <w:r>
         <w:t xml:space="preserve">Manager behavior documented: manager keeps admin-like global visibility for M2.1 unless JB narrows manager scope later.</w:t>
       </w:r>
     </w:p>
-    <w:bookmarkEnd w:id="62"/>
-    <w:bookmarkStart w:id="63" w:name="campaign-ownership-bug"/>
+    <w:bookmarkEnd w:id="63"/>
+    <w:bookmarkStart w:id="64" w:name="campaign-ownership-bug"/>
     <w:p>
       <w:pPr>
         <w:pStyle w:val="Heading3"/>
@@ -11332,7 +11480,7 @@
         <w:pStyle w:val="Compact"/>
         <w:numPr>
           <w:ilvl w:val="0"/>
-          <w:numId w:val="1458"/>
+          <w:numId w:val="1464"/>
         </w:numPr>
       </w:pPr>
       <w:r>
@@ -11356,7 +11504,7 @@
         <w:pStyle w:val="Compact"/>
         <w:numPr>
           <w:ilvl w:val="0"/>
-          <w:numId w:val="1459"/>
+          <w:numId w:val="1465"/>
         </w:numPr>
       </w:pPr>
       <w:r>
@@ -11380,7 +11528,7 @@
         <w:pStyle w:val="Compact"/>
         <w:numPr>
           <w:ilvl w:val="0"/>
-          <w:numId w:val="1460"/>
+          <w:numId w:val="1466"/>
         </w:numPr>
       </w:pPr>
       <w:r>
@@ -11392,7 +11540,7 @@
         <w:pStyle w:val="Compact"/>
         <w:numPr>
           <w:ilvl w:val="0"/>
-          <w:numId w:val="1461"/>
+          <w:numId w:val="1467"/>
         </w:numPr>
       </w:pPr>
       <w:r>
@@ -11404,7 +11552,7 @@
         <w:pStyle w:val="Compact"/>
         <w:numPr>
           <w:ilvl w:val="0"/>
-          <w:numId w:val="1462"/>
+          <w:numId w:val="1468"/>
         </w:numPr>
       </w:pPr>
       <w:r>
@@ -11416,7 +11564,7 @@
         <w:pStyle w:val="Compact"/>
         <w:numPr>
           <w:ilvl w:val="0"/>
-          <w:numId w:val="1463"/>
+          <w:numId w:val="1469"/>
         </w:numPr>
       </w:pPr>
       <w:r>
@@ -11432,8 +11580,8 @@
         <w:t xml:space="preserve">remains compatible.</w:t>
       </w:r>
     </w:p>
-    <w:bookmarkEnd w:id="63"/>
-    <w:bookmarkStart w:id="64" w:name="source-readable-fix"/>
+    <w:bookmarkEnd w:id="64"/>
+    <w:bookmarkStart w:id="65" w:name="source-readable-fix"/>
     <w:p>
       <w:pPr>
         <w:pStyle w:val="Heading3"/>
@@ -11447,7 +11595,7 @@
         <w:pStyle w:val="Compact"/>
         <w:numPr>
           <w:ilvl w:val="0"/>
-          <w:numId w:val="1464"/>
+          <w:numId w:val="1470"/>
         </w:numPr>
       </w:pPr>
       <w:r>
@@ -11459,7 +11607,7 @@
         <w:pStyle w:val="Compact"/>
         <w:numPr>
           <w:ilvl w:val="0"/>
-          <w:numId w:val="1465"/>
+          <w:numId w:val="1471"/>
         </w:numPr>
       </w:pPr>
       <w:r>
@@ -11471,7 +11619,7 @@
         <w:pStyle w:val="Compact"/>
         <w:numPr>
           <w:ilvl w:val="1"/>
-          <w:numId w:val="1466"/>
+          <w:numId w:val="1472"/>
         </w:numPr>
       </w:pPr>
       <w:r>
@@ -11489,7 +11637,7 @@
         <w:pStyle w:val="Compact"/>
         <w:numPr>
           <w:ilvl w:val="1"/>
-          <w:numId w:val="1466"/>
+          <w:numId w:val="1472"/>
         </w:numPr>
       </w:pPr>
       <w:r>
@@ -11507,7 +11655,7 @@
         <w:pStyle w:val="Compact"/>
         <w:numPr>
           <w:ilvl w:val="1"/>
-          <w:numId w:val="1466"/>
+          <w:numId w:val="1472"/>
         </w:numPr>
       </w:pPr>
       <w:r>
@@ -11525,7 +11673,7 @@
         <w:pStyle w:val="Compact"/>
         <w:numPr>
           <w:ilvl w:val="1"/>
-          <w:numId w:val="1466"/>
+          <w:numId w:val="1472"/>
         </w:numPr>
       </w:pPr>
       <w:r>
@@ -11543,7 +11691,7 @@
         <w:pStyle w:val="Compact"/>
         <w:numPr>
           <w:ilvl w:val="0"/>
-          <w:numId w:val="1467"/>
+          <w:numId w:val="1473"/>
         </w:numPr>
       </w:pPr>
       <w:r>
@@ -11555,7 +11703,7 @@
         <w:pStyle w:val="Compact"/>
         <w:numPr>
           <w:ilvl w:val="0"/>
-          <w:numId w:val="1468"/>
+          <w:numId w:val="1474"/>
         </w:numPr>
       </w:pPr>
       <w:r>
@@ -11567,15 +11715,15 @@
         <w:pStyle w:val="Compact"/>
         <w:numPr>
           <w:ilvl w:val="0"/>
-          <w:numId w:val="1469"/>
+          <w:numId w:val="1475"/>
         </w:numPr>
       </w:pPr>
       <w:r>
         <w:t xml:space="preserve">Campaign-created leads preserve campaign/list lineage.</w:t>
       </w:r>
     </w:p>
-    <w:bookmarkEnd w:id="64"/>
-    <w:bookmarkStart w:id="65" w:name="m2.1-testing-gate"/>
+    <w:bookmarkEnd w:id="65"/>
+    <w:bookmarkStart w:id="66" w:name="m2.1-testing-gate"/>
     <w:p>
       <w:pPr>
         <w:pStyle w:val="Heading3"/>
@@ -11589,7 +11737,7 @@
         <w:pStyle w:val="Compact"/>
         <w:numPr>
           <w:ilvl w:val="0"/>
-          <w:numId w:val="1470"/>
+          <w:numId w:val="1476"/>
         </w:numPr>
       </w:pPr>
       <w:r>
@@ -11601,7 +11749,7 @@
         <w:pStyle w:val="Compact"/>
         <w:numPr>
           <w:ilvl w:val="0"/>
-          <w:numId w:val="1471"/>
+          <w:numId w:val="1477"/>
         </w:numPr>
       </w:pPr>
       <w:r>
@@ -11613,7 +11761,7 @@
         <w:pStyle w:val="Compact"/>
         <w:numPr>
           <w:ilvl w:val="0"/>
-          <w:numId w:val="1472"/>
+          <w:numId w:val="1478"/>
         </w:numPr>
       </w:pPr>
       <w:r>
@@ -11625,7 +11773,7 @@
         <w:pStyle w:val="Compact"/>
         <w:numPr>
           <w:ilvl w:val="0"/>
-          <w:numId w:val="1473"/>
+          <w:numId w:val="1479"/>
         </w:numPr>
       </w:pPr>
       <w:r>
@@ -11637,7 +11785,7 @@
         <w:pStyle w:val="Compact"/>
         <w:numPr>
           <w:ilvl w:val="0"/>
-          <w:numId w:val="1474"/>
+          <w:numId w:val="1480"/>
         </w:numPr>
       </w:pPr>
       <w:r>
@@ -11649,7 +11797,7 @@
         <w:pStyle w:val="Compact"/>
         <w:numPr>
           <w:ilvl w:val="0"/>
-          <w:numId w:val="1475"/>
+          <w:numId w:val="1481"/>
         </w:numPr>
       </w:pPr>
       <w:r>
@@ -11661,7 +11809,7 @@
         <w:pStyle w:val="Compact"/>
         <w:numPr>
           <w:ilvl w:val="0"/>
-          <w:numId w:val="1476"/>
+          <w:numId w:val="1482"/>
         </w:numPr>
       </w:pPr>
       <w:r>
@@ -11673,7 +11821,7 @@
         <w:pStyle w:val="Compact"/>
         <w:numPr>
           <w:ilvl w:val="0"/>
-          <w:numId w:val="1477"/>
+          <w:numId w:val="1483"/>
         </w:numPr>
       </w:pPr>
       <w:r>
@@ -11685,16 +11833,16 @@
         <w:pStyle w:val="Compact"/>
         <w:numPr>
           <w:ilvl w:val="0"/>
-          <w:numId w:val="1478"/>
+          <w:numId w:val="1484"/>
         </w:numPr>
       </w:pPr>
       <w:r>
         <w:t xml:space="preserve">Progress dashboard updated.</w:t>
       </w:r>
     </w:p>
-    <w:bookmarkEnd w:id="65"/>
     <w:bookmarkEnd w:id="66"/>
-    <w:bookmarkStart w:id="73" w:name="X80216ddf01e64983419846741e514a0cb2a2ddb"/>
+    <w:bookmarkEnd w:id="67"/>
+    <w:bookmarkStart w:id="74" w:name="X80216ddf01e64983419846741e514a0cb2a2ddb"/>
     <w:p>
       <w:pPr>
         <w:pStyle w:val="Heading2"/>
@@ -11703,7 +11851,7 @@
         <w:t xml:space="preserve">M2.2 — Leads Enrichment Columns And Export CSV</w:t>
       </w:r>
     </w:p>
-    <w:bookmarkStart w:id="67" w:name="implementation-evidence-2026-05-02-5"/>
+    <w:bookmarkStart w:id="68" w:name="implementation-evidence-2026-05-02-5"/>
     <w:p>
       <w:pPr>
         <w:pStyle w:val="Heading3"/>
@@ -11717,7 +11865,7 @@
         <w:pStyle w:val="Compact"/>
         <w:numPr>
           <w:ilvl w:val="0"/>
-          <w:numId w:val="1479"/>
+          <w:numId w:val="1485"/>
         </w:numPr>
       </w:pPr>
       <w:r>
@@ -11744,7 +11892,7 @@
         <w:pStyle w:val="Compact"/>
         <w:numPr>
           <w:ilvl w:val="0"/>
-          <w:numId w:val="1480"/>
+          <w:numId w:val="1486"/>
         </w:numPr>
       </w:pPr>
       <w:r>
@@ -11816,7 +11964,7 @@
         <w:pStyle w:val="Compact"/>
         <w:numPr>
           <w:ilvl w:val="0"/>
-          <w:numId w:val="1481"/>
+          <w:numId w:val="1487"/>
         </w:numPr>
       </w:pPr>
       <w:r>
@@ -11843,7 +11991,7 @@
         <w:pStyle w:val="Compact"/>
         <w:numPr>
           <w:ilvl w:val="0"/>
-          <w:numId w:val="1482"/>
+          <w:numId w:val="1488"/>
         </w:numPr>
       </w:pPr>
       <w:r>
@@ -11855,7 +12003,7 @@
         <w:pStyle w:val="Compact"/>
         <w:numPr>
           <w:ilvl w:val="0"/>
-          <w:numId w:val="1483"/>
+          <w:numId w:val="1489"/>
         </w:numPr>
       </w:pPr>
       <w:r>
@@ -11882,7 +12030,7 @@
         <w:pStyle w:val="Compact"/>
         <w:numPr>
           <w:ilvl w:val="0"/>
-          <w:numId w:val="1484"/>
+          <w:numId w:val="1490"/>
         </w:numPr>
       </w:pPr>
       <w:r>
@@ -11894,7 +12042,7 @@
         <w:pStyle w:val="Compact"/>
         <w:numPr>
           <w:ilvl w:val="0"/>
-          <w:numId w:val="1485"/>
+          <w:numId w:val="1491"/>
         </w:numPr>
       </w:pPr>
       <w:r>
@@ -11921,7 +12069,7 @@
         <w:pStyle w:val="Compact"/>
         <w:numPr>
           <w:ilvl w:val="0"/>
-          <w:numId w:val="1486"/>
+          <w:numId w:val="1492"/>
         </w:numPr>
       </w:pPr>
       <w:r>
@@ -11963,7 +12111,7 @@
         <w:pStyle w:val="Compact"/>
         <w:numPr>
           <w:ilvl w:val="0"/>
-          <w:numId w:val="1487"/>
+          <w:numId w:val="1493"/>
         </w:numPr>
       </w:pPr>
       <w:r>
@@ -11999,15 +12147,15 @@
         <w:pStyle w:val="Compact"/>
         <w:numPr>
           <w:ilvl w:val="0"/>
-          <w:numId w:val="1488"/>
+          <w:numId w:val="1494"/>
         </w:numPr>
       </w:pPr>
       <w:r>
         <w:t xml:space="preserve">Targeted ESLint passed with 0 errors and existing warning debt only.</w:t>
       </w:r>
     </w:p>
-    <w:bookmarkEnd w:id="67"/>
-    <w:bookmarkStart w:id="68" w:name="leads-table-columns"/>
+    <w:bookmarkEnd w:id="68"/>
+    <w:bookmarkStart w:id="69" w:name="leads-table-columns"/>
     <w:p>
       <w:pPr>
         <w:pStyle w:val="Heading3"/>
@@ -12021,7 +12169,7 @@
         <w:pStyle w:val="Compact"/>
         <w:numPr>
           <w:ilvl w:val="0"/>
-          <w:numId w:val="1489"/>
+          <w:numId w:val="1495"/>
         </w:numPr>
       </w:pPr>
       <w:r>
@@ -12033,7 +12181,7 @@
         <w:pStyle w:val="Compact"/>
         <w:numPr>
           <w:ilvl w:val="0"/>
-          <w:numId w:val="1490"/>
+          <w:numId w:val="1496"/>
         </w:numPr>
       </w:pPr>
       <w:r>
@@ -12045,7 +12193,7 @@
         <w:pStyle w:val="Compact"/>
         <w:numPr>
           <w:ilvl w:val="1"/>
-          <w:numId w:val="1491"/>
+          <w:numId w:val="1497"/>
         </w:numPr>
       </w:pPr>
       <w:r>
@@ -12057,7 +12205,7 @@
         <w:pStyle w:val="Compact"/>
         <w:numPr>
           <w:ilvl w:val="1"/>
-          <w:numId w:val="1491"/>
+          <w:numId w:val="1497"/>
         </w:numPr>
       </w:pPr>
       <w:r>
@@ -12069,7 +12217,7 @@
         <w:pStyle w:val="Compact"/>
         <w:numPr>
           <w:ilvl w:val="1"/>
-          <w:numId w:val="1491"/>
+          <w:numId w:val="1497"/>
         </w:numPr>
       </w:pPr>
       <w:r>
@@ -12081,7 +12229,7 @@
         <w:pStyle w:val="Compact"/>
         <w:numPr>
           <w:ilvl w:val="1"/>
-          <w:numId w:val="1491"/>
+          <w:numId w:val="1497"/>
         </w:numPr>
       </w:pPr>
       <w:r>
@@ -12093,7 +12241,7 @@
         <w:pStyle w:val="Compact"/>
         <w:numPr>
           <w:ilvl w:val="1"/>
-          <w:numId w:val="1491"/>
+          <w:numId w:val="1497"/>
         </w:numPr>
       </w:pPr>
       <w:r>
@@ -12105,7 +12253,7 @@
         <w:pStyle w:val="Compact"/>
         <w:numPr>
           <w:ilvl w:val="1"/>
-          <w:numId w:val="1491"/>
+          <w:numId w:val="1497"/>
         </w:numPr>
       </w:pPr>
       <w:r>
@@ -12117,7 +12265,7 @@
         <w:pStyle w:val="Compact"/>
         <w:numPr>
           <w:ilvl w:val="1"/>
-          <w:numId w:val="1491"/>
+          <w:numId w:val="1497"/>
         </w:numPr>
       </w:pPr>
       <w:r>
@@ -12129,7 +12277,7 @@
         <w:pStyle w:val="Compact"/>
         <w:numPr>
           <w:ilvl w:val="1"/>
-          <w:numId w:val="1491"/>
+          <w:numId w:val="1497"/>
         </w:numPr>
       </w:pPr>
       <w:r>
@@ -12141,7 +12289,7 @@
         <w:pStyle w:val="Compact"/>
         <w:numPr>
           <w:ilvl w:val="0"/>
-          <w:numId w:val="1492"/>
+          <w:numId w:val="1498"/>
         </w:numPr>
       </w:pPr>
       <w:r>
@@ -12162,7 +12310,7 @@
         <w:pStyle w:val="Compact"/>
         <w:numPr>
           <w:ilvl w:val="0"/>
-          <w:numId w:val="1493"/>
+          <w:numId w:val="1499"/>
         </w:numPr>
       </w:pPr>
       <w:r>
@@ -12186,129 +12334,11 @@
         <w:pStyle w:val="Compact"/>
         <w:numPr>
           <w:ilvl w:val="0"/>
-          <w:numId w:val="1494"/>
+          <w:numId w:val="1500"/>
         </w:numPr>
       </w:pPr>
       <w:r>
         <w:t xml:space="preserve">Monthly Revenue renders raw/formatted revenue plus provenance chip:</w:t>
-      </w:r>
-    </w:p>
-    <w:p>
-      <w:pPr>
-        <w:pStyle w:val="Compact"/>
-        <w:numPr>
-          <w:ilvl w:val="1"/>
-          <w:numId w:val="1495"/>
-        </w:numPr>
-      </w:pPr>
-      <w:r>
-        <w:t xml:space="preserve">AI;</w:t>
-      </w:r>
-    </w:p>
-    <w:p>
-      <w:pPr>
-        <w:pStyle w:val="Compact"/>
-        <w:numPr>
-          <w:ilvl w:val="1"/>
-          <w:numId w:val="1495"/>
-        </w:numPr>
-      </w:pPr>
-      <w:r>
-        <w:t xml:space="preserve">CSV;</w:t>
-      </w:r>
-    </w:p>
-    <w:p>
-      <w:pPr>
-        <w:pStyle w:val="Compact"/>
-        <w:numPr>
-          <w:ilvl w:val="1"/>
-          <w:numId w:val="1495"/>
-        </w:numPr>
-      </w:pPr>
-      <w:r>
-        <w:t xml:space="preserve">MANUAL.</w:t>
-      </w:r>
-    </w:p>
-    <w:p>
-      <w:pPr>
-        <w:pStyle w:val="Compact"/>
-        <w:numPr>
-          <w:ilvl w:val="0"/>
-          <w:numId w:val="1496"/>
-        </w:numPr>
-      </w:pPr>
-      <w:r>
-        <w:t xml:space="preserve">Empty revenue renders</w:t>
-      </w:r>
-      <w:r>
-        <w:t xml:space="preserve"> </w:t>
-      </w:r>
-      <w:r>
-        <w:rPr>
-          <w:rStyle w:val="VerbatimChar"/>
-        </w:rPr>
-        <w:t xml:space="preserve">—</w:t>
-      </w:r>
-      <w:r>
-        <w:t xml:space="preserve">.</w:t>
-      </w:r>
-    </w:p>
-    <w:p>
-      <w:pPr>
-        <w:pStyle w:val="Compact"/>
-        <w:numPr>
-          <w:ilvl w:val="0"/>
-          <w:numId w:val="1497"/>
-        </w:numPr>
-      </w:pPr>
-      <w:r>
-        <w:t xml:space="preserve">Source cell uses two-line readable source/list pattern.</w:t>
-      </w:r>
-    </w:p>
-    <w:p>
-      <w:pPr>
-        <w:pStyle w:val="Compact"/>
-        <w:numPr>
-          <w:ilvl w:val="0"/>
-          <w:numId w:val="1498"/>
-        </w:numPr>
-      </w:pPr>
-      <w:r>
-        <w:t xml:space="preserve">Status pill styles match prototype.</w:t>
-      </w:r>
-    </w:p>
-    <w:p>
-      <w:pPr>
-        <w:pStyle w:val="Compact"/>
-        <w:numPr>
-          <w:ilvl w:val="0"/>
-          <w:numId w:val="1499"/>
-        </w:numPr>
-      </w:pPr>
-      <w:r>
-        <w:t xml:space="preserve">Avatar initials match prototype density.</w:t>
-      </w:r>
-    </w:p>
-    <w:bookmarkEnd w:id="68"/>
-    <w:bookmarkStart w:id="69" w:name="data-plumbing"/>
-    <w:p>
-      <w:pPr>
-        <w:pStyle w:val="Heading3"/>
-      </w:pPr>
-      <w:r>
-        <w:t xml:space="preserve">Data plumbing</w:t>
-      </w:r>
-    </w:p>
-    <w:p>
-      <w:pPr>
-        <w:pStyle w:val="Compact"/>
-        <w:numPr>
-          <w:ilvl w:val="0"/>
-          <w:numId w:val="1500"/>
-        </w:numPr>
-      </w:pPr>
-      <w:r>
-        <w:t xml:space="preserve">Confirm data source for industry:</w:t>
       </w:r>
     </w:p>
     <w:p>
@@ -12320,7 +12350,7 @@
         </w:numPr>
       </w:pPr>
       <w:r>
-        <w:t xml:space="preserve">existing AI classifier field;</w:t>
+        <w:t xml:space="preserve">AI;</w:t>
       </w:r>
     </w:p>
     <w:p>
@@ -12332,7 +12362,7 @@
         </w:numPr>
       </w:pPr>
       <w:r>
-        <w:t xml:space="preserve">CSV value;</w:t>
+        <w:t xml:space="preserve">CSV;</w:t>
       </w:r>
     </w:p>
     <w:p>
@@ -12344,6 +12374,124 @@
         </w:numPr>
       </w:pPr>
       <w:r>
+        <w:t xml:space="preserve">MANUAL.</w:t>
+      </w:r>
+    </w:p>
+    <w:p>
+      <w:pPr>
+        <w:pStyle w:val="Compact"/>
+        <w:numPr>
+          <w:ilvl w:val="0"/>
+          <w:numId w:val="1502"/>
+        </w:numPr>
+      </w:pPr>
+      <w:r>
+        <w:t xml:space="preserve">Empty revenue renders</w:t>
+      </w:r>
+      <w:r>
+        <w:t xml:space="preserve"> </w:t>
+      </w:r>
+      <w:r>
+        <w:rPr>
+          <w:rStyle w:val="VerbatimChar"/>
+        </w:rPr>
+        <w:t xml:space="preserve">—</w:t>
+      </w:r>
+      <w:r>
+        <w:t xml:space="preserve">.</w:t>
+      </w:r>
+    </w:p>
+    <w:p>
+      <w:pPr>
+        <w:pStyle w:val="Compact"/>
+        <w:numPr>
+          <w:ilvl w:val="0"/>
+          <w:numId w:val="1503"/>
+        </w:numPr>
+      </w:pPr>
+      <w:r>
+        <w:t xml:space="preserve">Source cell uses two-line readable source/list pattern.</w:t>
+      </w:r>
+    </w:p>
+    <w:p>
+      <w:pPr>
+        <w:pStyle w:val="Compact"/>
+        <w:numPr>
+          <w:ilvl w:val="0"/>
+          <w:numId w:val="1504"/>
+        </w:numPr>
+      </w:pPr>
+      <w:r>
+        <w:t xml:space="preserve">Status pill styles match prototype.</w:t>
+      </w:r>
+    </w:p>
+    <w:p>
+      <w:pPr>
+        <w:pStyle w:val="Compact"/>
+        <w:numPr>
+          <w:ilvl w:val="0"/>
+          <w:numId w:val="1505"/>
+        </w:numPr>
+      </w:pPr>
+      <w:r>
+        <w:t xml:space="preserve">Avatar initials match prototype density.</w:t>
+      </w:r>
+    </w:p>
+    <w:bookmarkEnd w:id="69"/>
+    <w:bookmarkStart w:id="70" w:name="data-plumbing"/>
+    <w:p>
+      <w:pPr>
+        <w:pStyle w:val="Heading3"/>
+      </w:pPr>
+      <w:r>
+        <w:t xml:space="preserve">Data plumbing</w:t>
+      </w:r>
+    </w:p>
+    <w:p>
+      <w:pPr>
+        <w:pStyle w:val="Compact"/>
+        <w:numPr>
+          <w:ilvl w:val="0"/>
+          <w:numId w:val="1506"/>
+        </w:numPr>
+      </w:pPr>
+      <w:r>
+        <w:t xml:space="preserve">Confirm data source for industry:</w:t>
+      </w:r>
+    </w:p>
+    <w:p>
+      <w:pPr>
+        <w:pStyle w:val="Compact"/>
+        <w:numPr>
+          <w:ilvl w:val="1"/>
+          <w:numId w:val="1507"/>
+        </w:numPr>
+      </w:pPr>
+      <w:r>
+        <w:t xml:space="preserve">existing AI classifier field;</w:t>
+      </w:r>
+    </w:p>
+    <w:p>
+      <w:pPr>
+        <w:pStyle w:val="Compact"/>
+        <w:numPr>
+          <w:ilvl w:val="1"/>
+          <w:numId w:val="1507"/>
+        </w:numPr>
+      </w:pPr>
+      <w:r>
+        <w:t xml:space="preserve">CSV value;</w:t>
+      </w:r>
+    </w:p>
+    <w:p>
+      <w:pPr>
+        <w:pStyle w:val="Compact"/>
+        <w:numPr>
+          <w:ilvl w:val="1"/>
+          <w:numId w:val="1507"/>
+        </w:numPr>
+      </w:pPr>
+      <w:r>
         <w:t xml:space="preserve">manual override.</w:t>
       </w:r>
     </w:p>
@@ -12352,7 +12500,7 @@
         <w:pStyle w:val="Compact"/>
         <w:numPr>
           <w:ilvl w:val="0"/>
-          <w:numId w:val="1502"/>
+          <w:numId w:val="1508"/>
         </w:numPr>
       </w:pPr>
       <w:r>
@@ -12364,7 +12512,7 @@
         <w:pStyle w:val="Compact"/>
         <w:numPr>
           <w:ilvl w:val="1"/>
-          <w:numId w:val="1503"/>
+          <w:numId w:val="1509"/>
         </w:numPr>
       </w:pPr>
       <w:r>
@@ -12376,7 +12524,7 @@
         <w:pStyle w:val="Compact"/>
         <w:numPr>
           <w:ilvl w:val="1"/>
-          <w:numId w:val="1503"/>
+          <w:numId w:val="1509"/>
         </w:numPr>
       </w:pPr>
       <w:r>
@@ -12388,7 +12536,7 @@
         <w:pStyle w:val="Compact"/>
         <w:numPr>
           <w:ilvl w:val="1"/>
-          <w:numId w:val="1503"/>
+          <w:numId w:val="1509"/>
         </w:numPr>
       </w:pPr>
       <w:r>
@@ -12400,7 +12548,7 @@
         <w:pStyle w:val="Compact"/>
         <w:numPr>
           <w:ilvl w:val="0"/>
-          <w:numId w:val="1504"/>
+          <w:numId w:val="1510"/>
         </w:numPr>
       </w:pPr>
       <w:r>
@@ -12412,7 +12560,7 @@
         <w:pStyle w:val="Compact"/>
         <w:numPr>
           <w:ilvl w:val="0"/>
-          <w:numId w:val="1505"/>
+          <w:numId w:val="1511"/>
         </w:numPr>
       </w:pPr>
       <w:r>
@@ -12424,15 +12572,15 @@
         <w:pStyle w:val="Compact"/>
         <w:numPr>
           <w:ilvl w:val="0"/>
-          <w:numId w:val="1506"/>
+          <w:numId w:val="1512"/>
         </w:numPr>
       </w:pPr>
       <w:r>
         <w:t xml:space="preserve">Rep scope applies to all enrichment queries.</w:t>
       </w:r>
     </w:p>
-    <w:bookmarkEnd w:id="69"/>
-    <w:bookmarkStart w:id="70" w:name="export-csv"/>
+    <w:bookmarkEnd w:id="70"/>
+    <w:bookmarkStart w:id="71" w:name="export-csv"/>
     <w:p>
       <w:pPr>
         <w:pStyle w:val="Heading3"/>
@@ -12446,7 +12594,7 @@
         <w:pStyle w:val="Compact"/>
         <w:numPr>
           <w:ilvl w:val="0"/>
-          <w:numId w:val="1507"/>
+          <w:numId w:val="1513"/>
         </w:numPr>
       </w:pPr>
       <w:r>
@@ -12467,7 +12615,7 @@
         <w:pStyle w:val="Compact"/>
         <w:numPr>
           <w:ilvl w:val="0"/>
-          <w:numId w:val="1508"/>
+          <w:numId w:val="1514"/>
         </w:numPr>
       </w:pPr>
       <w:r>
@@ -12479,7 +12627,7 @@
         <w:pStyle w:val="Compact"/>
         <w:numPr>
           <w:ilvl w:val="0"/>
-          <w:numId w:val="1509"/>
+          <w:numId w:val="1515"/>
         </w:numPr>
       </w:pPr>
       <w:r>
@@ -12491,7 +12639,7 @@
         <w:pStyle w:val="Compact"/>
         <w:numPr>
           <w:ilvl w:val="0"/>
-          <w:numId w:val="1510"/>
+          <w:numId w:val="1516"/>
         </w:numPr>
       </w:pPr>
       <w:r>
@@ -12503,7 +12651,7 @@
         <w:pStyle w:val="Compact"/>
         <w:numPr>
           <w:ilvl w:val="0"/>
-          <w:numId w:val="1511"/>
+          <w:numId w:val="1517"/>
         </w:numPr>
       </w:pPr>
       <w:r>
@@ -12515,7 +12663,7 @@
         <w:pStyle w:val="Compact"/>
         <w:numPr>
           <w:ilvl w:val="0"/>
-          <w:numId w:val="1512"/>
+          <w:numId w:val="1518"/>
         </w:numPr>
       </w:pPr>
       <w:r>
@@ -12527,7 +12675,7 @@
         <w:pStyle w:val="Compact"/>
         <w:numPr>
           <w:ilvl w:val="1"/>
-          <w:numId w:val="1513"/>
+          <w:numId w:val="1519"/>
         </w:numPr>
       </w:pPr>
       <w:r>
@@ -12539,7 +12687,7 @@
         <w:pStyle w:val="Compact"/>
         <w:numPr>
           <w:ilvl w:val="1"/>
-          <w:numId w:val="1513"/>
+          <w:numId w:val="1519"/>
         </w:numPr>
       </w:pPr>
       <w:r>
@@ -12551,7 +12699,7 @@
         <w:pStyle w:val="Compact"/>
         <w:numPr>
           <w:ilvl w:val="1"/>
-          <w:numId w:val="1513"/>
+          <w:numId w:val="1519"/>
         </w:numPr>
       </w:pPr>
       <w:r>
@@ -12563,7 +12711,7 @@
         <w:pStyle w:val="Compact"/>
         <w:numPr>
           <w:ilvl w:val="1"/>
-          <w:numId w:val="1513"/>
+          <w:numId w:val="1519"/>
         </w:numPr>
       </w:pPr>
       <w:r>
@@ -12575,7 +12723,7 @@
         <w:pStyle w:val="Compact"/>
         <w:numPr>
           <w:ilvl w:val="1"/>
-          <w:numId w:val="1513"/>
+          <w:numId w:val="1519"/>
         </w:numPr>
       </w:pPr>
       <w:r>
@@ -12587,7 +12735,7 @@
         <w:pStyle w:val="Compact"/>
         <w:numPr>
           <w:ilvl w:val="1"/>
-          <w:numId w:val="1513"/>
+          <w:numId w:val="1519"/>
         </w:numPr>
       </w:pPr>
       <w:r>
@@ -12599,7 +12747,7 @@
         <w:pStyle w:val="Compact"/>
         <w:numPr>
           <w:ilvl w:val="0"/>
-          <w:numId w:val="1514"/>
+          <w:numId w:val="1520"/>
         </w:numPr>
       </w:pPr>
       <w:r>
@@ -12611,15 +12759,15 @@
         <w:pStyle w:val="Compact"/>
         <w:numPr>
           <w:ilvl w:val="0"/>
-          <w:numId w:val="1515"/>
+          <w:numId w:val="1521"/>
         </w:numPr>
       </w:pPr>
       <w:r>
         <w:t xml:space="preserve">CSV escaping handles commas, quotes, line breaks.</w:t>
       </w:r>
     </w:p>
-    <w:bookmarkEnd w:id="70"/>
-    <w:bookmarkStart w:id="71" w:name="m2.2-style-isolation"/>
+    <w:bookmarkEnd w:id="71"/>
+    <w:bookmarkStart w:id="72" w:name="m2.2-style-isolation"/>
     <w:p>
       <w:pPr>
         <w:pStyle w:val="Heading3"/>
@@ -12633,7 +12781,7 @@
         <w:pStyle w:val="Compact"/>
         <w:numPr>
           <w:ilvl w:val="0"/>
-          <w:numId w:val="1516"/>
+          <w:numId w:val="1522"/>
         </w:numPr>
       </w:pPr>
       <w:r>
@@ -12645,7 +12793,7 @@
         <w:pStyle w:val="Compact"/>
         <w:numPr>
           <w:ilvl w:val="0"/>
-          <w:numId w:val="1517"/>
+          <w:numId w:val="1523"/>
         </w:numPr>
       </w:pPr>
       <w:r>
@@ -12657,7 +12805,7 @@
         <w:pStyle w:val="Compact"/>
         <w:numPr>
           <w:ilvl w:val="0"/>
-          <w:numId w:val="1518"/>
+          <w:numId w:val="1524"/>
         </w:numPr>
       </w:pPr>
       <w:r>
@@ -12669,7 +12817,7 @@
         <w:pStyle w:val="Compact"/>
         <w:numPr>
           <w:ilvl w:val="0"/>
-          <w:numId w:val="1519"/>
+          <w:numId w:val="1525"/>
         </w:numPr>
       </w:pPr>
       <w:r>
@@ -12681,15 +12829,15 @@
         <w:pStyle w:val="Compact"/>
         <w:numPr>
           <w:ilvl w:val="0"/>
-          <w:numId w:val="1520"/>
+          <w:numId w:val="1526"/>
         </w:numPr>
       </w:pPr>
       <w:r>
         <w:t xml:space="preserve">Ensure text truncation/line wrapping is deliberate and not overlapping.</w:t>
       </w:r>
     </w:p>
-    <w:bookmarkEnd w:id="71"/>
-    <w:bookmarkStart w:id="72" w:name="m2.2-testing-gate"/>
+    <w:bookmarkEnd w:id="72"/>
+    <w:bookmarkStart w:id="73" w:name="m2.2-testing-gate"/>
     <w:p>
       <w:pPr>
         <w:pStyle w:val="Heading3"/>
@@ -12703,7 +12851,7 @@
         <w:pStyle w:val="Compact"/>
         <w:numPr>
           <w:ilvl w:val="0"/>
-          <w:numId w:val="1521"/>
+          <w:numId w:val="1527"/>
         </w:numPr>
       </w:pPr>
       <w:r>
@@ -12715,7 +12863,7 @@
         <w:pStyle w:val="Compact"/>
         <w:numPr>
           <w:ilvl w:val="0"/>
-          <w:numId w:val="1522"/>
+          <w:numId w:val="1528"/>
         </w:numPr>
       </w:pPr>
       <w:r>
@@ -12727,7 +12875,7 @@
         <w:pStyle w:val="Compact"/>
         <w:numPr>
           <w:ilvl w:val="0"/>
-          <w:numId w:val="1523"/>
+          <w:numId w:val="1529"/>
         </w:numPr>
       </w:pPr>
       <w:r>
@@ -12739,7 +12887,7 @@
         <w:pStyle w:val="Compact"/>
         <w:numPr>
           <w:ilvl w:val="0"/>
-          <w:numId w:val="1524"/>
+          <w:numId w:val="1530"/>
         </w:numPr>
       </w:pPr>
       <w:r>
@@ -12751,7 +12899,7 @@
         <w:pStyle w:val="Compact"/>
         <w:numPr>
           <w:ilvl w:val="0"/>
-          <w:numId w:val="1525"/>
+          <w:numId w:val="1531"/>
         </w:numPr>
       </w:pPr>
       <w:r>
@@ -12763,7 +12911,7 @@
         <w:pStyle w:val="Compact"/>
         <w:numPr>
           <w:ilvl w:val="0"/>
-          <w:numId w:val="1526"/>
+          <w:numId w:val="1532"/>
         </w:numPr>
       </w:pPr>
       <w:r>
@@ -12775,7 +12923,7 @@
         <w:pStyle w:val="Compact"/>
         <w:numPr>
           <w:ilvl w:val="0"/>
-          <w:numId w:val="1527"/>
+          <w:numId w:val="1533"/>
         </w:numPr>
       </w:pPr>
       <w:r>
@@ -12787,16 +12935,16 @@
         <w:pStyle w:val="Compact"/>
         <w:numPr>
           <w:ilvl w:val="0"/>
-          <w:numId w:val="1528"/>
+          <w:numId w:val="1534"/>
         </w:numPr>
       </w:pPr>
       <w:r>
         <w:t xml:space="preserve">Progress dashboard updated.</w:t>
       </w:r>
     </w:p>
-    <w:bookmarkEnd w:id="72"/>
     <w:bookmarkEnd w:id="73"/>
-    <w:bookmarkStart w:id="84" w:name="m2.3-ai-retarget-campaigns"/>
+    <w:bookmarkEnd w:id="74"/>
+    <w:bookmarkStart w:id="85" w:name="m2.3-ai-retarget-campaigns"/>
     <w:p>
       <w:pPr>
         <w:pStyle w:val="Heading2"/>
@@ -12805,7 +12953,7 @@
         <w:t xml:space="preserve">M2.3 — AI Retarget Campaigns</w:t>
       </w:r>
     </w:p>
-    <w:bookmarkStart w:id="74" w:name="implementation-evidence-2026-05-02-6"/>
+    <w:bookmarkStart w:id="75" w:name="implementation-evidence-2026-05-02-6"/>
     <w:p>
       <w:pPr>
         <w:pStyle w:val="Heading3"/>
@@ -12819,7 +12967,7 @@
         <w:pStyle w:val="Compact"/>
         <w:numPr>
           <w:ilvl w:val="0"/>
-          <w:numId w:val="1529"/>
+          <w:numId w:val="1535"/>
         </w:numPr>
       </w:pPr>
       <w:r>
@@ -12867,7 +13015,7 @@
         <w:pStyle w:val="Compact"/>
         <w:numPr>
           <w:ilvl w:val="0"/>
-          <w:numId w:val="1530"/>
+          <w:numId w:val="1536"/>
         </w:numPr>
       </w:pPr>
       <w:r>
@@ -12879,7 +13027,7 @@
         <w:pStyle w:val="Compact"/>
         <w:numPr>
           <w:ilvl w:val="0"/>
-          <w:numId w:val="1531"/>
+          <w:numId w:val="1537"/>
         </w:numPr>
       </w:pPr>
       <w:r>
@@ -12891,7 +13039,7 @@
         <w:pStyle w:val="Compact"/>
         <w:numPr>
           <w:ilvl w:val="0"/>
-          <w:numId w:val="1532"/>
+          <w:numId w:val="1538"/>
         </w:numPr>
       </w:pPr>
       <w:r>
@@ -12903,7 +13051,7 @@
         <w:pStyle w:val="Compact"/>
         <w:numPr>
           <w:ilvl w:val="0"/>
-          <w:numId w:val="1533"/>
+          <w:numId w:val="1539"/>
         </w:numPr>
       </w:pPr>
       <w:r>
@@ -12915,7 +13063,7 @@
         <w:pStyle w:val="Compact"/>
         <w:numPr>
           <w:ilvl w:val="0"/>
-          <w:numId w:val="1534"/>
+          <w:numId w:val="1540"/>
         </w:numPr>
       </w:pPr>
       <w:r>
@@ -12969,7 +13117,7 @@
         <w:pStyle w:val="Compact"/>
         <w:numPr>
           <w:ilvl w:val="0"/>
-          <w:numId w:val="1535"/>
+          <w:numId w:val="1541"/>
         </w:numPr>
       </w:pPr>
       <w:r>
@@ -12981,7 +13129,7 @@
         <w:pStyle w:val="Compact"/>
         <w:numPr>
           <w:ilvl w:val="0"/>
-          <w:numId w:val="1536"/>
+          <w:numId w:val="1542"/>
         </w:numPr>
       </w:pPr>
       <w:r>
@@ -13008,7 +13156,7 @@
         <w:pStyle w:val="Compact"/>
         <w:numPr>
           <w:ilvl w:val="0"/>
-          <w:numId w:val="1537"/>
+          <w:numId w:val="1543"/>
         </w:numPr>
       </w:pPr>
       <w:r>
@@ -13050,7 +13198,7 @@
         <w:pStyle w:val="Compact"/>
         <w:numPr>
           <w:ilvl w:val="0"/>
-          <w:numId w:val="1538"/>
+          <w:numId w:val="1544"/>
         </w:numPr>
       </w:pPr>
       <w:r>
@@ -13077,7 +13225,7 @@
         <w:pStyle w:val="Compact"/>
         <w:numPr>
           <w:ilvl w:val="0"/>
-          <w:numId w:val="1539"/>
+          <w:numId w:val="1545"/>
         </w:numPr>
       </w:pPr>
       <w:r>
@@ -13089,7 +13237,7 @@
         <w:pStyle w:val="Compact"/>
         <w:numPr>
           <w:ilvl w:val="0"/>
-          <w:numId w:val="1540"/>
+          <w:numId w:val="1546"/>
         </w:numPr>
       </w:pPr>
       <w:r>
@@ -13101,7 +13249,7 @@
         <w:pStyle w:val="Compact"/>
         <w:numPr>
           <w:ilvl w:val="0"/>
-          <w:numId w:val="1541"/>
+          <w:numId w:val="1547"/>
         </w:numPr>
       </w:pPr>
       <w:r>
@@ -13123,8 +13271,8 @@
         <w:t xml:space="preserve">— 5/5 passed after cap tests; server build passed.</w:t>
       </w:r>
     </w:p>
-    <w:bookmarkEnd w:id="74"/>
-    <w:bookmarkStart w:id="75" w:name="scope-lock-for-ai-retarget"/>
+    <w:bookmarkEnd w:id="75"/>
+    <w:bookmarkStart w:id="76" w:name="scope-lock-for-ai-retarget"/>
     <w:p>
       <w:pPr>
         <w:pStyle w:val="Heading3"/>
@@ -13138,7 +13286,7 @@
         <w:pStyle w:val="Compact"/>
         <w:numPr>
           <w:ilvl w:val="0"/>
-          <w:numId w:val="1542"/>
+          <w:numId w:val="1548"/>
         </w:numPr>
       </w:pPr>
       <w:r>
@@ -13150,7 +13298,7 @@
         <w:pStyle w:val="Compact"/>
         <w:numPr>
           <w:ilvl w:val="0"/>
-          <w:numId w:val="1543"/>
+          <w:numId w:val="1549"/>
         </w:numPr>
       </w:pPr>
       <w:r>
@@ -13162,7 +13310,7 @@
         <w:pStyle w:val="Compact"/>
         <w:numPr>
           <w:ilvl w:val="0"/>
-          <w:numId w:val="1544"/>
+          <w:numId w:val="1550"/>
         </w:numPr>
       </w:pPr>
       <w:r>
@@ -13174,7 +13322,7 @@
         <w:pStyle w:val="Compact"/>
         <w:numPr>
           <w:ilvl w:val="0"/>
-          <w:numId w:val="1545"/>
+          <w:numId w:val="1551"/>
         </w:numPr>
       </w:pPr>
       <w:r>
@@ -13186,7 +13334,7 @@
         <w:pStyle w:val="Compact"/>
         <w:numPr>
           <w:ilvl w:val="0"/>
-          <w:numId w:val="1546"/>
+          <w:numId w:val="1552"/>
         </w:numPr>
       </w:pPr>
       <w:r>
@@ -13198,7 +13346,7 @@
         <w:pStyle w:val="Compact"/>
         <w:numPr>
           <w:ilvl w:val="0"/>
-          <w:numId w:val="1547"/>
+          <w:numId w:val="1553"/>
         </w:numPr>
       </w:pPr>
       <w:r>
@@ -13210,7 +13358,7 @@
         <w:pStyle w:val="Compact"/>
         <w:numPr>
           <w:ilvl w:val="1"/>
-          <w:numId w:val="1548"/>
+          <w:numId w:val="1554"/>
         </w:numPr>
       </w:pPr>
       <w:r>
@@ -13237,7 +13385,7 @@
         <w:pStyle w:val="Compact"/>
         <w:numPr>
           <w:ilvl w:val="1"/>
-          <w:numId w:val="1548"/>
+          <w:numId w:val="1554"/>
         </w:numPr>
       </w:pPr>
       <w:r>
@@ -13259,8 +13407,8 @@
         <w:t xml:space="preserve">scoping correctness.</w:t>
       </w:r>
     </w:p>
-    <w:bookmarkEnd w:id="75"/>
-    <w:bookmarkStart w:id="76" w:name="database-model"/>
+    <w:bookmarkEnd w:id="76"/>
+    <w:bookmarkStart w:id="77" w:name="database-model"/>
     <w:p>
       <w:pPr>
         <w:pStyle w:val="Heading3"/>
@@ -13274,7 +13422,7 @@
         <w:pStyle w:val="Compact"/>
         <w:numPr>
           <w:ilvl w:val="0"/>
-          <w:numId w:val="1549"/>
+          <w:numId w:val="1555"/>
         </w:numPr>
       </w:pPr>
       <w:r>
@@ -13316,7 +13464,7 @@
         <w:pStyle w:val="Compact"/>
         <w:numPr>
           <w:ilvl w:val="0"/>
-          <w:numId w:val="1550"/>
+          <w:numId w:val="1556"/>
         </w:numPr>
       </w:pPr>
       <w:r>
@@ -13340,7 +13488,7 @@
         <w:pStyle w:val="Compact"/>
         <w:numPr>
           <w:ilvl w:val="0"/>
-          <w:numId w:val="1551"/>
+          <w:numId w:val="1557"/>
         </w:numPr>
       </w:pPr>
       <w:r>
@@ -13364,7 +13512,7 @@
         <w:pStyle w:val="Compact"/>
         <w:numPr>
           <w:ilvl w:val="0"/>
-          <w:numId w:val="1552"/>
+          <w:numId w:val="1558"/>
         </w:numPr>
       </w:pPr>
       <w:r>
@@ -13376,7 +13524,7 @@
         <w:pStyle w:val="Compact"/>
         <w:numPr>
           <w:ilvl w:val="0"/>
-          <w:numId w:val="1553"/>
+          <w:numId w:val="1559"/>
         </w:numPr>
       </w:pPr>
       <w:r>
@@ -13388,7 +13536,7 @@
         <w:pStyle w:val="Compact"/>
         <w:numPr>
           <w:ilvl w:val="0"/>
-          <w:numId w:val="1554"/>
+          <w:numId w:val="1560"/>
         </w:numPr>
       </w:pPr>
       <w:r>
@@ -13400,7 +13548,7 @@
         <w:pStyle w:val="Compact"/>
         <w:numPr>
           <w:ilvl w:val="0"/>
-          <w:numId w:val="1555"/>
+          <w:numId w:val="1561"/>
         </w:numPr>
       </w:pPr>
       <w:r>
@@ -13412,7 +13560,7 @@
         <w:pStyle w:val="Compact"/>
         <w:numPr>
           <w:ilvl w:val="0"/>
-          <w:numId w:val="1556"/>
+          <w:numId w:val="1562"/>
         </w:numPr>
       </w:pPr>
       <w:r>
@@ -13424,7 +13572,7 @@
         <w:pStyle w:val="Compact"/>
         <w:numPr>
           <w:ilvl w:val="0"/>
-          <w:numId w:val="1557"/>
+          <w:numId w:val="1563"/>
         </w:numPr>
       </w:pPr>
       <w:r>
@@ -13436,7 +13584,7 @@
         <w:pStyle w:val="Compact"/>
         <w:numPr>
           <w:ilvl w:val="0"/>
-          <w:numId w:val="1558"/>
+          <w:numId w:val="1564"/>
         </w:numPr>
       </w:pPr>
       <w:r>
@@ -13448,7 +13596,7 @@
         <w:pStyle w:val="Compact"/>
         <w:numPr>
           <w:ilvl w:val="0"/>
-          <w:numId w:val="1559"/>
+          <w:numId w:val="1565"/>
         </w:numPr>
       </w:pPr>
       <w:r>
@@ -13460,7 +13608,7 @@
         <w:pStyle w:val="Compact"/>
         <w:numPr>
           <w:ilvl w:val="0"/>
-          <w:numId w:val="1560"/>
+          <w:numId w:val="1566"/>
         </w:numPr>
       </w:pPr>
       <w:r>
@@ -13472,7 +13620,7 @@
         <w:pStyle w:val="Compact"/>
         <w:numPr>
           <w:ilvl w:val="0"/>
-          <w:numId w:val="1561"/>
+          <w:numId w:val="1567"/>
         </w:numPr>
       </w:pPr>
       <w:r>
@@ -13484,7 +13632,7 @@
         <w:pStyle w:val="Compact"/>
         <w:numPr>
           <w:ilvl w:val="0"/>
-          <w:numId w:val="1562"/>
+          <w:numId w:val="1568"/>
         </w:numPr>
       </w:pPr>
       <w:r>
@@ -13511,7 +13659,7 @@
         <w:pStyle w:val="Compact"/>
         <w:numPr>
           <w:ilvl w:val="0"/>
-          <w:numId w:val="1563"/>
+          <w:numId w:val="1569"/>
         </w:numPr>
       </w:pPr>
       <w:r>
@@ -13523,15 +13671,15 @@
         <w:pStyle w:val="Compact"/>
         <w:numPr>
           <w:ilvl w:val="0"/>
-          <w:numId w:val="1564"/>
+          <w:numId w:val="1570"/>
         </w:numPr>
       </w:pPr>
       <w:r>
         <w:t xml:space="preserve">Ensure expired cohorts are ignored safely.</w:t>
       </w:r>
     </w:p>
-    <w:bookmarkEnd w:id="76"/>
-    <w:bookmarkStart w:id="77" w:name="cohort-generation"/>
+    <w:bookmarkEnd w:id="77"/>
+    <w:bookmarkStart w:id="78" w:name="cohort-generation"/>
     <w:p>
       <w:pPr>
         <w:pStyle w:val="Heading3"/>
@@ -13545,7 +13693,7 @@
         <w:pStyle w:val="Compact"/>
         <w:numPr>
           <w:ilvl w:val="0"/>
-          <w:numId w:val="1565"/>
+          <w:numId w:val="1571"/>
         </w:numPr>
       </w:pPr>
       <w:r>
@@ -13557,7 +13705,7 @@
         <w:pStyle w:val="Compact"/>
         <w:numPr>
           <w:ilvl w:val="0"/>
-          <w:numId w:val="1566"/>
+          <w:numId w:val="1572"/>
         </w:numPr>
       </w:pPr>
       <w:r>
@@ -13584,7 +13732,7 @@
         <w:pStyle w:val="Compact"/>
         <w:numPr>
           <w:ilvl w:val="0"/>
-          <w:numId w:val="1567"/>
+          <w:numId w:val="1573"/>
         </w:numPr>
       </w:pPr>
       <w:r>
@@ -13611,7 +13759,7 @@
         <w:pStyle w:val="Compact"/>
         <w:numPr>
           <w:ilvl w:val="0"/>
-          <w:numId w:val="1568"/>
+          <w:numId w:val="1574"/>
         </w:numPr>
       </w:pPr>
       <w:r>
@@ -13638,7 +13786,7 @@
         <w:pStyle w:val="Compact"/>
         <w:numPr>
           <w:ilvl w:val="0"/>
-          <w:numId w:val="1569"/>
+          <w:numId w:val="1575"/>
         </w:numPr>
       </w:pPr>
       <w:r>
@@ -13650,7 +13798,7 @@
         <w:pStyle w:val="Compact"/>
         <w:numPr>
           <w:ilvl w:val="1"/>
-          <w:numId w:val="1570"/>
+          <w:numId w:val="1576"/>
         </w:numPr>
       </w:pPr>
       <w:r>
@@ -13662,7 +13810,7 @@
         <w:pStyle w:val="Compact"/>
         <w:numPr>
           <w:ilvl w:val="1"/>
-          <w:numId w:val="1570"/>
+          <w:numId w:val="1576"/>
         </w:numPr>
       </w:pPr>
       <w:r>
@@ -13674,7 +13822,7 @@
         <w:pStyle w:val="Compact"/>
         <w:numPr>
           <w:ilvl w:val="1"/>
-          <w:numId w:val="1570"/>
+          <w:numId w:val="1576"/>
         </w:numPr>
       </w:pPr>
       <w:r>
@@ -13686,7 +13834,7 @@
         <w:pStyle w:val="Compact"/>
         <w:numPr>
           <w:ilvl w:val="0"/>
-          <w:numId w:val="1571"/>
+          <w:numId w:val="1577"/>
         </w:numPr>
       </w:pPr>
       <w:r>
@@ -13698,7 +13846,7 @@
         <w:pStyle w:val="Compact"/>
         <w:numPr>
           <w:ilvl w:val="0"/>
-          <w:numId w:val="1572"/>
+          <w:numId w:val="1578"/>
         </w:numPr>
       </w:pPr>
       <w:r>
@@ -13710,7 +13858,7 @@
         <w:pStyle w:val="Compact"/>
         <w:numPr>
           <w:ilvl w:val="1"/>
-          <w:numId w:val="1573"/>
+          <w:numId w:val="1579"/>
         </w:numPr>
       </w:pPr>
       <w:r>
@@ -13722,7 +13870,7 @@
         <w:pStyle w:val="Compact"/>
         <w:numPr>
           <w:ilvl w:val="1"/>
-          <w:numId w:val="1573"/>
+          <w:numId w:val="1579"/>
         </w:numPr>
       </w:pPr>
       <w:r>
@@ -13734,7 +13882,7 @@
         <w:pStyle w:val="Compact"/>
         <w:numPr>
           <w:ilvl w:val="1"/>
-          <w:numId w:val="1573"/>
+          <w:numId w:val="1579"/>
         </w:numPr>
       </w:pPr>
       <w:r>
@@ -13746,7 +13894,7 @@
         <w:pStyle w:val="Compact"/>
         <w:numPr>
           <w:ilvl w:val="1"/>
-          <w:numId w:val="1573"/>
+          <w:numId w:val="1579"/>
         </w:numPr>
       </w:pPr>
       <w:r>
@@ -13758,7 +13906,7 @@
         <w:pStyle w:val="Compact"/>
         <w:numPr>
           <w:ilvl w:val="1"/>
-          <w:numId w:val="1573"/>
+          <w:numId w:val="1579"/>
         </w:numPr>
       </w:pPr>
       <w:r>
@@ -13770,7 +13918,7 @@
         <w:pStyle w:val="Compact"/>
         <w:numPr>
           <w:ilvl w:val="1"/>
-          <w:numId w:val="1573"/>
+          <w:numId w:val="1579"/>
         </w:numPr>
       </w:pPr>
       <w:r>
@@ -13782,7 +13930,7 @@
         <w:pStyle w:val="Compact"/>
         <w:numPr>
           <w:ilvl w:val="0"/>
-          <w:numId w:val="1574"/>
+          <w:numId w:val="1580"/>
         </w:numPr>
       </w:pPr>
       <w:r>
@@ -13794,7 +13942,7 @@
         <w:pStyle w:val="Compact"/>
         <w:numPr>
           <w:ilvl w:val="0"/>
-          <w:numId w:val="1575"/>
+          <w:numId w:val="1581"/>
         </w:numPr>
       </w:pPr>
       <w:r>
@@ -13806,15 +13954,15 @@
         <w:pStyle w:val="Compact"/>
         <w:numPr>
           <w:ilvl w:val="0"/>
-          <w:numId w:val="1576"/>
+          <w:numId w:val="1582"/>
         </w:numPr>
       </w:pPr>
       <w:r>
         <w:t xml:space="preserve">Ensure predicted funded deals are traceable to historical anchor, not arbitrary text.</w:t>
       </w:r>
     </w:p>
-    <w:bookmarkEnd w:id="77"/>
-    <w:bookmarkStart w:id="78" w:name="cooldowns-and-compliance"/>
+    <w:bookmarkEnd w:id="78"/>
+    <w:bookmarkStart w:id="79" w:name="cooldowns-and-compliance"/>
     <w:p>
       <w:pPr>
         <w:pStyle w:val="Heading3"/>
@@ -13828,7 +13976,7 @@
         <w:pStyle w:val="Compact"/>
         <w:numPr>
           <w:ilvl w:val="0"/>
-          <w:numId w:val="1577"/>
+          <w:numId w:val="1583"/>
         </w:numPr>
       </w:pPr>
       <w:r>
@@ -13840,7 +13988,7 @@
         <w:pStyle w:val="Compact"/>
         <w:numPr>
           <w:ilvl w:val="0"/>
-          <w:numId w:val="1578"/>
+          <w:numId w:val="1584"/>
         </w:numPr>
       </w:pPr>
       <w:r>
@@ -13852,7 +14000,7 @@
         <w:pStyle w:val="Compact"/>
         <w:numPr>
           <w:ilvl w:val="0"/>
-          <w:numId w:val="1579"/>
+          <w:numId w:val="1585"/>
         </w:numPr>
       </w:pPr>
       <w:r>
@@ -13864,7 +14012,7 @@
         <w:pStyle w:val="Compact"/>
         <w:numPr>
           <w:ilvl w:val="0"/>
-          <w:numId w:val="1580"/>
+          <w:numId w:val="1586"/>
         </w:numPr>
       </w:pPr>
       <w:r>
@@ -13876,7 +14024,7 @@
         <w:pStyle w:val="Compact"/>
         <w:numPr>
           <w:ilvl w:val="0"/>
-          <w:numId w:val="1581"/>
+          <w:numId w:val="1587"/>
         </w:numPr>
       </w:pPr>
       <w:r>
@@ -13888,15 +14036,15 @@
         <w:pStyle w:val="Compact"/>
         <w:numPr>
           <w:ilvl w:val="0"/>
-          <w:numId w:val="1582"/>
+          <w:numId w:val="1588"/>
         </w:numPr>
       </w:pPr>
       <w:r>
         <w:t xml:space="preserve">Verify no cohort can re-contact opted-out, DNC, suppressed, or too-recent leads.</w:t>
       </w:r>
     </w:p>
-    <w:bookmarkEnd w:id="78"/>
-    <w:bookmarkStart w:id="79" w:name="two-layer-send-caps"/>
+    <w:bookmarkEnd w:id="79"/>
+    <w:bookmarkStart w:id="80" w:name="two-layer-send-caps"/>
     <w:p>
       <w:pPr>
         <w:pStyle w:val="Heading3"/>
@@ -13910,7 +14058,7 @@
         <w:pStyle w:val="Compact"/>
         <w:numPr>
           <w:ilvl w:val="0"/>
-          <w:numId w:val="1583"/>
+          <w:numId w:val="1589"/>
         </w:numPr>
       </w:pPr>
       <w:r>
@@ -13922,7 +14070,7 @@
         <w:pStyle w:val="Compact"/>
         <w:numPr>
           <w:ilvl w:val="1"/>
-          <w:numId w:val="1584"/>
+          <w:numId w:val="1590"/>
         </w:numPr>
       </w:pPr>
       <w:r>
@@ -13934,7 +14082,7 @@
         <w:pStyle w:val="Compact"/>
         <w:numPr>
           <w:ilvl w:val="1"/>
-          <w:numId w:val="1584"/>
+          <w:numId w:val="1590"/>
         </w:numPr>
       </w:pPr>
       <w:r>
@@ -13946,7 +14094,7 @@
         <w:pStyle w:val="Compact"/>
         <w:numPr>
           <w:ilvl w:val="0"/>
-          <w:numId w:val="1585"/>
+          <w:numId w:val="1591"/>
         </w:numPr>
       </w:pPr>
       <w:r>
@@ -13958,7 +14106,7 @@
         <w:pStyle w:val="Compact"/>
         <w:numPr>
           <w:ilvl w:val="1"/>
-          <w:numId w:val="1586"/>
+          <w:numId w:val="1592"/>
         </w:numPr>
       </w:pPr>
       <w:r>
@@ -13970,7 +14118,7 @@
         <w:pStyle w:val="Compact"/>
         <w:numPr>
           <w:ilvl w:val="1"/>
-          <w:numId w:val="1586"/>
+          <w:numId w:val="1592"/>
         </w:numPr>
       </w:pPr>
       <w:r>
@@ -13982,7 +14130,7 @@
         <w:pStyle w:val="Compact"/>
         <w:numPr>
           <w:ilvl w:val="0"/>
-          <w:numId w:val="1587"/>
+          <w:numId w:val="1593"/>
         </w:numPr>
       </w:pPr>
       <w:r>
@@ -13994,7 +14142,7 @@
         <w:pStyle w:val="Compact"/>
         <w:numPr>
           <w:ilvl w:val="0"/>
-          <w:numId w:val="1588"/>
+          <w:numId w:val="1594"/>
         </w:numPr>
       </w:pPr>
       <w:r>
@@ -14006,7 +14154,7 @@
         <w:pStyle w:val="Compact"/>
         <w:numPr>
           <w:ilvl w:val="0"/>
-          <w:numId w:val="1589"/>
+          <w:numId w:val="1595"/>
         </w:numPr>
       </w:pPr>
       <w:r>
@@ -14018,15 +14166,15 @@
         <w:pStyle w:val="Compact"/>
         <w:numPr>
           <w:ilvl w:val="0"/>
-          <w:numId w:val="1590"/>
+          <w:numId w:val="1596"/>
         </w:numPr>
       </w:pPr>
       <w:r>
         <w:t xml:space="preserve">Cohort card lead count reflects current remaining capacity at render/build time.</w:t>
       </w:r>
     </w:p>
-    <w:bookmarkEnd w:id="79"/>
-    <w:bookmarkStart w:id="80" w:name="ai-reasoning-and-cron"/>
+    <w:bookmarkEnd w:id="80"/>
+    <w:bookmarkStart w:id="81" w:name="ai-reasoning-and-cron"/>
     <w:p>
       <w:pPr>
         <w:pStyle w:val="Heading3"/>
@@ -14040,7 +14188,7 @@
         <w:pStyle w:val="Compact"/>
         <w:numPr>
           <w:ilvl w:val="0"/>
-          <w:numId w:val="1591"/>
+          <w:numId w:val="1597"/>
         </w:numPr>
       </w:pPr>
       <w:r>
@@ -14052,7 +14200,7 @@
         <w:pStyle w:val="Compact"/>
         <w:numPr>
           <w:ilvl w:val="0"/>
-          <w:numId w:val="1592"/>
+          <w:numId w:val="1598"/>
         </w:numPr>
       </w:pPr>
       <w:r>
@@ -14064,7 +14212,7 @@
         <w:pStyle w:val="Compact"/>
         <w:numPr>
           <w:ilvl w:val="0"/>
-          <w:numId w:val="1593"/>
+          <w:numId w:val="1599"/>
         </w:numPr>
       </w:pPr>
       <w:r>
@@ -14076,7 +14224,7 @@
         <w:pStyle w:val="Compact"/>
         <w:numPr>
           <w:ilvl w:val="0"/>
-          <w:numId w:val="1594"/>
+          <w:numId w:val="1600"/>
         </w:numPr>
       </w:pPr>
       <w:r>
@@ -14088,7 +14236,7 @@
         <w:pStyle w:val="Compact"/>
         <w:numPr>
           <w:ilvl w:val="0"/>
-          <w:numId w:val="1595"/>
+          <w:numId w:val="1601"/>
         </w:numPr>
       </w:pPr>
       <w:r>
@@ -14100,7 +14248,7 @@
         <w:pStyle w:val="Compact"/>
         <w:numPr>
           <w:ilvl w:val="0"/>
-          <w:numId w:val="1596"/>
+          <w:numId w:val="1602"/>
         </w:numPr>
       </w:pPr>
       <w:r>
@@ -14112,7 +14260,7 @@
         <w:pStyle w:val="Compact"/>
         <w:numPr>
           <w:ilvl w:val="0"/>
-          <w:numId w:val="1597"/>
+          <w:numId w:val="1603"/>
         </w:numPr>
       </w:pPr>
       <w:r>
@@ -14124,7 +14272,7 @@
         <w:pStyle w:val="Compact"/>
         <w:numPr>
           <w:ilvl w:val="0"/>
-          <w:numId w:val="1598"/>
+          <w:numId w:val="1604"/>
         </w:numPr>
       </w:pPr>
       <w:r>
@@ -14136,15 +14284,15 @@
         <w:pStyle w:val="Compact"/>
         <w:numPr>
           <w:ilvl w:val="0"/>
-          <w:numId w:val="1599"/>
+          <w:numId w:val="1605"/>
         </w:numPr>
       </w:pPr>
       <w:r>
         <w:t xml:space="preserve">Log failures per user/cohort without breaking other cohorts.</w:t>
       </w:r>
     </w:p>
-    <w:bookmarkEnd w:id="80"/>
-    <w:bookmarkStart w:id="81" w:name="ui-1"/>
+    <w:bookmarkEnd w:id="81"/>
+    <w:bookmarkStart w:id="82" w:name="ui-1"/>
     <w:p>
       <w:pPr>
         <w:pStyle w:val="Heading3"/>
@@ -14158,7 +14306,7 @@
         <w:pStyle w:val="Compact"/>
         <w:numPr>
           <w:ilvl w:val="0"/>
-          <w:numId w:val="1600"/>
+          <w:numId w:val="1606"/>
         </w:numPr>
       </w:pPr>
       <w:r>
@@ -14170,7 +14318,7 @@
         <w:pStyle w:val="Compact"/>
         <w:numPr>
           <w:ilvl w:val="0"/>
-          <w:numId w:val="1601"/>
+          <w:numId w:val="1607"/>
         </w:numPr>
       </w:pPr>
       <w:r>
@@ -14182,7 +14330,7 @@
         <w:pStyle w:val="Compact"/>
         <w:numPr>
           <w:ilvl w:val="0"/>
-          <w:numId w:val="1602"/>
+          <w:numId w:val="1608"/>
         </w:numPr>
       </w:pPr>
       <w:r>
@@ -14194,7 +14342,7 @@
         <w:pStyle w:val="Compact"/>
         <w:numPr>
           <w:ilvl w:val="0"/>
-          <w:numId w:val="1603"/>
+          <w:numId w:val="1609"/>
         </w:numPr>
       </w:pPr>
       <w:r>
@@ -14206,7 +14354,7 @@
         <w:pStyle w:val="Compact"/>
         <w:numPr>
           <w:ilvl w:val="0"/>
-          <w:numId w:val="1604"/>
+          <w:numId w:val="1610"/>
         </w:numPr>
       </w:pPr>
       <w:r>
@@ -14218,7 +14366,7 @@
         <w:pStyle w:val="Compact"/>
         <w:numPr>
           <w:ilvl w:val="0"/>
-          <w:numId w:val="1605"/>
+          <w:numId w:val="1611"/>
         </w:numPr>
       </w:pPr>
       <w:r>
@@ -14230,7 +14378,7 @@
         <w:pStyle w:val="Compact"/>
         <w:numPr>
           <w:ilvl w:val="0"/>
-          <w:numId w:val="1606"/>
+          <w:numId w:val="1612"/>
         </w:numPr>
       </w:pPr>
       <w:r>
@@ -14242,7 +14390,7 @@
         <w:pStyle w:val="Compact"/>
         <w:numPr>
           <w:ilvl w:val="0"/>
-          <w:numId w:val="1607"/>
+          <w:numId w:val="1613"/>
         </w:numPr>
       </w:pPr>
       <w:r>
@@ -14254,7 +14402,7 @@
         <w:pStyle w:val="Compact"/>
         <w:numPr>
           <w:ilvl w:val="0"/>
-          <w:numId w:val="1608"/>
+          <w:numId w:val="1614"/>
         </w:numPr>
       </w:pPr>
       <w:r>
@@ -14266,7 +14414,7 @@
         <w:pStyle w:val="Compact"/>
         <w:numPr>
           <w:ilvl w:val="0"/>
-          <w:numId w:val="1609"/>
+          <w:numId w:val="1615"/>
         </w:numPr>
       </w:pPr>
       <w:r>
@@ -14293,7 +14441,7 @@
         <w:pStyle w:val="Compact"/>
         <w:numPr>
           <w:ilvl w:val="0"/>
-          <w:numId w:val="1610"/>
+          <w:numId w:val="1616"/>
         </w:numPr>
       </w:pPr>
       <w:r>
@@ -14314,15 +14462,15 @@
         <w:pStyle w:val="Compact"/>
         <w:numPr>
           <w:ilvl w:val="0"/>
-          <w:numId w:val="1611"/>
+          <w:numId w:val="1617"/>
         </w:numPr>
       </w:pPr>
       <w:r>
         <w:t xml:space="preserve">Existing campaign actions still work: rerun/refresh, start, pause, delete where allowed.</w:t>
       </w:r>
     </w:p>
-    <w:bookmarkEnd w:id="81"/>
-    <w:bookmarkStart w:id="82" w:name="backendapi"/>
+    <w:bookmarkEnd w:id="82"/>
+    <w:bookmarkStart w:id="83" w:name="backendapi"/>
     <w:p>
       <w:pPr>
         <w:pStyle w:val="Heading3"/>
@@ -14336,7 +14484,7 @@
         <w:pStyle w:val="Compact"/>
         <w:numPr>
           <w:ilvl w:val="0"/>
-          <w:numId w:val="1612"/>
+          <w:numId w:val="1618"/>
         </w:numPr>
       </w:pPr>
       <w:r>
@@ -14348,7 +14496,7 @@
         <w:pStyle w:val="Compact"/>
         <w:numPr>
           <w:ilvl w:val="0"/>
-          <w:numId w:val="1613"/>
+          <w:numId w:val="1619"/>
         </w:numPr>
       </w:pPr>
       <w:r>
@@ -14360,7 +14508,7 @@
         <w:pStyle w:val="Compact"/>
         <w:numPr>
           <w:ilvl w:val="0"/>
-          <w:numId w:val="1614"/>
+          <w:numId w:val="1620"/>
         </w:numPr>
       </w:pPr>
       <w:r>
@@ -14372,7 +14520,7 @@
         <w:pStyle w:val="Compact"/>
         <w:numPr>
           <w:ilvl w:val="0"/>
-          <w:numId w:val="1615"/>
+          <w:numId w:val="1621"/>
         </w:numPr>
       </w:pPr>
       <w:r>
@@ -14384,7 +14532,7 @@
         <w:pStyle w:val="Compact"/>
         <w:numPr>
           <w:ilvl w:val="0"/>
-          <w:numId w:val="1616"/>
+          <w:numId w:val="1622"/>
         </w:numPr>
       </w:pPr>
       <w:r>
@@ -14396,7 +14544,7 @@
         <w:pStyle w:val="Compact"/>
         <w:numPr>
           <w:ilvl w:val="0"/>
-          <w:numId w:val="1617"/>
+          <w:numId w:val="1623"/>
         </w:numPr>
       </w:pPr>
       <w:r>
@@ -14408,7 +14556,7 @@
         <w:pStyle w:val="Compact"/>
         <w:numPr>
           <w:ilvl w:val="0"/>
-          <w:numId w:val="1618"/>
+          <w:numId w:val="1624"/>
         </w:numPr>
       </w:pPr>
       <w:r>
@@ -14420,15 +14568,15 @@
         <w:pStyle w:val="Compact"/>
         <w:numPr>
           <w:ilvl w:val="0"/>
-          <w:numId w:val="1619"/>
+          <w:numId w:val="1625"/>
         </w:numPr>
       </w:pPr>
       <w:r>
         <w:t xml:space="preserve">AI Retarget is upstream recommendation only; no auto-send.</w:t>
       </w:r>
     </w:p>
-    <w:bookmarkEnd w:id="82"/>
-    <w:bookmarkStart w:id="83" w:name="m2.3-testing-gate"/>
+    <w:bookmarkEnd w:id="83"/>
+    <w:bookmarkStart w:id="84" w:name="m2.3-testing-gate"/>
     <w:p>
       <w:pPr>
         <w:pStyle w:val="Heading3"/>
@@ -14442,7 +14590,7 @@
         <w:pStyle w:val="Compact"/>
         <w:numPr>
           <w:ilvl w:val="0"/>
-          <w:numId w:val="1620"/>
+          <w:numId w:val="1626"/>
         </w:numPr>
       </w:pPr>
       <w:r>
@@ -14454,7 +14602,7 @@
         <w:pStyle w:val="Compact"/>
         <w:numPr>
           <w:ilvl w:val="0"/>
-          <w:numId w:val="1621"/>
+          <w:numId w:val="1627"/>
         </w:numPr>
       </w:pPr>
       <w:r>
@@ -14466,7 +14614,7 @@
         <w:pStyle w:val="Compact"/>
         <w:numPr>
           <w:ilvl w:val="0"/>
-          <w:numId w:val="1622"/>
+          <w:numId w:val="1628"/>
         </w:numPr>
       </w:pPr>
       <w:r>
@@ -14478,7 +14626,7 @@
         <w:pStyle w:val="Compact"/>
         <w:numPr>
           <w:ilvl w:val="0"/>
-          <w:numId w:val="1623"/>
+          <w:numId w:val="1629"/>
         </w:numPr>
       </w:pPr>
       <w:r>
@@ -14490,7 +14638,7 @@
         <w:pStyle w:val="Compact"/>
         <w:numPr>
           <w:ilvl w:val="0"/>
-          <w:numId w:val="1624"/>
+          <w:numId w:val="1630"/>
         </w:numPr>
       </w:pPr>
       <w:r>
@@ -14502,7 +14650,7 @@
         <w:pStyle w:val="Compact"/>
         <w:numPr>
           <w:ilvl w:val="0"/>
-          <w:numId w:val="1625"/>
+          <w:numId w:val="1631"/>
         </w:numPr>
       </w:pPr>
       <w:r>
@@ -14514,7 +14662,7 @@
         <w:pStyle w:val="Compact"/>
         <w:numPr>
           <w:ilvl w:val="0"/>
-          <w:numId w:val="1626"/>
+          <w:numId w:val="1632"/>
         </w:numPr>
       </w:pPr>
       <w:r>
@@ -14526,7 +14674,7 @@
         <w:pStyle w:val="Compact"/>
         <w:numPr>
           <w:ilvl w:val="0"/>
-          <w:numId w:val="1627"/>
+          <w:numId w:val="1633"/>
         </w:numPr>
       </w:pPr>
       <w:r>
@@ -14538,7 +14686,7 @@
         <w:pStyle w:val="Compact"/>
         <w:numPr>
           <w:ilvl w:val="0"/>
-          <w:numId w:val="1628"/>
+          <w:numId w:val="1634"/>
         </w:numPr>
       </w:pPr>
       <w:r>
@@ -14550,7 +14698,7 @@
         <w:pStyle w:val="Compact"/>
         <w:numPr>
           <w:ilvl w:val="0"/>
-          <w:numId w:val="1629"/>
+          <w:numId w:val="1635"/>
         </w:numPr>
       </w:pPr>
       <w:r>
@@ -14562,7 +14710,7 @@
         <w:pStyle w:val="Compact"/>
         <w:numPr>
           <w:ilvl w:val="0"/>
-          <w:numId w:val="1630"/>
+          <w:numId w:val="1636"/>
         </w:numPr>
       </w:pPr>
       <w:r>
@@ -14574,7 +14722,7 @@
         <w:pStyle w:val="Compact"/>
         <w:numPr>
           <w:ilvl w:val="0"/>
-          <w:numId w:val="1631"/>
+          <w:numId w:val="1637"/>
         </w:numPr>
       </w:pPr>
       <w:r>
@@ -14586,7 +14734,7 @@
         <w:pStyle w:val="Compact"/>
         <w:numPr>
           <w:ilvl w:val="0"/>
-          <w:numId w:val="1632"/>
+          <w:numId w:val="1638"/>
         </w:numPr>
       </w:pPr>
       <w:r>
@@ -14598,7 +14746,7 @@
         <w:pStyle w:val="Compact"/>
         <w:numPr>
           <w:ilvl w:val="0"/>
-          <w:numId w:val="1633"/>
+          <w:numId w:val="1639"/>
         </w:numPr>
       </w:pPr>
       <w:r>
@@ -14610,16 +14758,16 @@
         <w:pStyle w:val="Compact"/>
         <w:numPr>
           <w:ilvl w:val="0"/>
-          <w:numId w:val="1634"/>
+          <w:numId w:val="1640"/>
         </w:numPr>
       </w:pPr>
       <w:r>
         <w:t xml:space="preserve">Progress dashboard updated.</w:t>
       </w:r>
     </w:p>
-    <w:bookmarkEnd w:id="83"/>
     <w:bookmarkEnd w:id="84"/>
-    <w:bookmarkStart w:id="88" w:name="m2.4-m2-full-regression-and-release-gate"/>
+    <w:bookmarkEnd w:id="85"/>
+    <w:bookmarkStart w:id="89" w:name="m2.4-m2-full-regression-and-release-gate"/>
     <w:p>
       <w:pPr>
         <w:pStyle w:val="Heading2"/>
@@ -14628,7 +14776,7 @@
         <w:t xml:space="preserve">M2.4 — M2 Full Regression And Release Gate</w:t>
       </w:r>
     </w:p>
-    <w:bookmarkStart w:id="85" w:name="functional-regression-1"/>
+    <w:bookmarkStart w:id="86" w:name="functional-regression-1"/>
     <w:p>
       <w:pPr>
         <w:pStyle w:val="Heading3"/>
@@ -14642,7 +14790,7 @@
         <w:pStyle w:val="Compact"/>
         <w:numPr>
           <w:ilvl w:val="0"/>
-          <w:numId w:val="1635"/>
+          <w:numId w:val="1641"/>
         </w:numPr>
       </w:pPr>
       <w:r>
@@ -14654,7 +14802,7 @@
         <w:pStyle w:val="Compact"/>
         <w:numPr>
           <w:ilvl w:val="0"/>
-          <w:numId w:val="1636"/>
+          <w:numId w:val="1642"/>
         </w:numPr>
       </w:pPr>
       <w:r>
@@ -14666,7 +14814,7 @@
         <w:pStyle w:val="Compact"/>
         <w:numPr>
           <w:ilvl w:val="0"/>
-          <w:numId w:val="1637"/>
+          <w:numId w:val="1643"/>
         </w:numPr>
       </w:pPr>
       <w:r>
@@ -14678,7 +14826,7 @@
         <w:pStyle w:val="Compact"/>
         <w:numPr>
           <w:ilvl w:val="0"/>
-          <w:numId w:val="1638"/>
+          <w:numId w:val="1644"/>
         </w:numPr>
       </w:pPr>
       <w:r>
@@ -14690,7 +14838,7 @@
         <w:pStyle w:val="Compact"/>
         <w:numPr>
           <w:ilvl w:val="0"/>
-          <w:numId w:val="1639"/>
+          <w:numId w:val="1645"/>
         </w:numPr>
       </w:pPr>
       <w:r>
@@ -14702,7 +14850,7 @@
         <w:pStyle w:val="Compact"/>
         <w:numPr>
           <w:ilvl w:val="0"/>
-          <w:numId w:val="1640"/>
+          <w:numId w:val="1646"/>
         </w:numPr>
       </w:pPr>
       <w:r>
@@ -14714,7 +14862,7 @@
         <w:pStyle w:val="Compact"/>
         <w:numPr>
           <w:ilvl w:val="0"/>
-          <w:numId w:val="1641"/>
+          <w:numId w:val="1647"/>
         </w:numPr>
       </w:pPr>
       <w:r>
@@ -14726,7 +14874,7 @@
         <w:pStyle w:val="Compact"/>
         <w:numPr>
           <w:ilvl w:val="0"/>
-          <w:numId w:val="1642"/>
+          <w:numId w:val="1648"/>
         </w:numPr>
       </w:pPr>
       <w:r>
@@ -14738,7 +14886,7 @@
         <w:pStyle w:val="Compact"/>
         <w:numPr>
           <w:ilvl w:val="0"/>
-          <w:numId w:val="1643"/>
+          <w:numId w:val="1649"/>
         </w:numPr>
       </w:pPr>
       <w:r>
@@ -14750,7 +14898,7 @@
         <w:pStyle w:val="Compact"/>
         <w:numPr>
           <w:ilvl w:val="0"/>
-          <w:numId w:val="1644"/>
+          <w:numId w:val="1650"/>
         </w:numPr>
       </w:pPr>
       <w:r>
@@ -14762,7 +14910,7 @@
         <w:pStyle w:val="Compact"/>
         <w:numPr>
           <w:ilvl w:val="0"/>
-          <w:numId w:val="1645"/>
+          <w:numId w:val="1651"/>
         </w:numPr>
       </w:pPr>
       <w:r>
@@ -14774,7 +14922,7 @@
         <w:pStyle w:val="Compact"/>
         <w:numPr>
           <w:ilvl w:val="0"/>
-          <w:numId w:val="1646"/>
+          <w:numId w:val="1652"/>
         </w:numPr>
       </w:pPr>
       <w:r>
@@ -14786,7 +14934,7 @@
         <w:pStyle w:val="Compact"/>
         <w:numPr>
           <w:ilvl w:val="0"/>
-          <w:numId w:val="1647"/>
+          <w:numId w:val="1653"/>
         </w:numPr>
       </w:pPr>
       <w:r>
@@ -14808,8 +14956,8 @@
         <w:t xml:space="preserve">and test messages.</w:t>
       </w:r>
     </w:p>
-    <w:bookmarkEnd w:id="85"/>
-    <w:bookmarkStart w:id="86" w:name="visual-regression-1"/>
+    <w:bookmarkEnd w:id="86"/>
+    <w:bookmarkStart w:id="87" w:name="visual-regression-1"/>
     <w:p>
       <w:pPr>
         <w:pStyle w:val="Heading3"/>
@@ -14823,7 +14971,7 @@
         <w:pStyle w:val="Compact"/>
         <w:numPr>
           <w:ilvl w:val="0"/>
-          <w:numId w:val="1648"/>
+          <w:numId w:val="1654"/>
         </w:numPr>
       </w:pPr>
       <w:r>
@@ -14835,7 +14983,7 @@
         <w:pStyle w:val="Compact"/>
         <w:numPr>
           <w:ilvl w:val="0"/>
-          <w:numId w:val="1649"/>
+          <w:numId w:val="1655"/>
         </w:numPr>
       </w:pPr>
       <w:r>
@@ -14862,7 +15010,7 @@
         <w:pStyle w:val="Compact"/>
         <w:numPr>
           <w:ilvl w:val="0"/>
-          <w:numId w:val="1650"/>
+          <w:numId w:val="1656"/>
         </w:numPr>
       </w:pPr>
       <w:r>
@@ -14874,7 +15022,7 @@
         <w:pStyle w:val="Compact"/>
         <w:numPr>
           <w:ilvl w:val="0"/>
-          <w:numId w:val="1651"/>
+          <w:numId w:val="1657"/>
         </w:numPr>
       </w:pPr>
       <w:r>
@@ -14886,7 +15034,7 @@
         <w:pStyle w:val="Compact"/>
         <w:numPr>
           <w:ilvl w:val="0"/>
-          <w:numId w:val="1652"/>
+          <w:numId w:val="1658"/>
         </w:numPr>
       </w:pPr>
       <w:r>
@@ -14898,7 +15046,7 @@
         <w:pStyle w:val="Compact"/>
         <w:numPr>
           <w:ilvl w:val="0"/>
-          <w:numId w:val="1653"/>
+          <w:numId w:val="1659"/>
         </w:numPr>
       </w:pPr>
       <w:r>
@@ -14910,7 +15058,7 @@
         <w:pStyle w:val="Compact"/>
         <w:numPr>
           <w:ilvl w:val="0"/>
-          <w:numId w:val="1654"/>
+          <w:numId w:val="1660"/>
         </w:numPr>
       </w:pPr>
       <w:r>
@@ -14922,15 +15070,15 @@
         <w:pStyle w:val="Compact"/>
         <w:numPr>
           <w:ilvl w:val="0"/>
-          <w:numId w:val="1655"/>
+          <w:numId w:val="1661"/>
         </w:numPr>
       </w:pPr>
       <w:r>
         <w:t xml:space="preserve">No unreadable text if current styles fail; scoped style set added if needed.</w:t>
       </w:r>
     </w:p>
-    <w:bookmarkEnd w:id="86"/>
-    <w:bookmarkStart w:id="87" w:name="release-readiness-1"/>
+    <w:bookmarkEnd w:id="87"/>
+    <w:bookmarkStart w:id="88" w:name="release-readiness-1"/>
     <w:p>
       <w:pPr>
         <w:pStyle w:val="Heading3"/>
@@ -14944,7 +15092,7 @@
         <w:pStyle w:val="Compact"/>
         <w:numPr>
           <w:ilvl w:val="0"/>
-          <w:numId w:val="1656"/>
+          <w:numId w:val="1662"/>
         </w:numPr>
       </w:pPr>
       <w:r>
@@ -14956,7 +15104,7 @@
         <w:pStyle w:val="Compact"/>
         <w:numPr>
           <w:ilvl w:val="0"/>
-          <w:numId w:val="1657"/>
+          <w:numId w:val="1663"/>
         </w:numPr>
       </w:pPr>
       <w:r>
@@ -14968,7 +15116,7 @@
         <w:pStyle w:val="Compact"/>
         <w:numPr>
           <w:ilvl w:val="0"/>
-          <w:numId w:val="1658"/>
+          <w:numId w:val="1664"/>
         </w:numPr>
       </w:pPr>
       <w:r>
@@ -14980,7 +15128,7 @@
         <w:pStyle w:val="Compact"/>
         <w:numPr>
           <w:ilvl w:val="0"/>
-          <w:numId w:val="1659"/>
+          <w:numId w:val="1665"/>
         </w:numPr>
       </w:pPr>
       <w:r>
@@ -14992,7 +15140,7 @@
         <w:pStyle w:val="Compact"/>
         <w:numPr>
           <w:ilvl w:val="0"/>
-          <w:numId w:val="1660"/>
+          <w:numId w:val="1666"/>
         </w:numPr>
       </w:pPr>
       <w:r>
@@ -15004,7 +15152,7 @@
         <w:pStyle w:val="Compact"/>
         <w:numPr>
           <w:ilvl w:val="0"/>
-          <w:numId w:val="1661"/>
+          <w:numId w:val="1667"/>
         </w:numPr>
       </w:pPr>
       <w:r>
@@ -15016,7 +15164,7 @@
         <w:pStyle w:val="Compact"/>
         <w:numPr>
           <w:ilvl w:val="0"/>
-          <w:numId w:val="1662"/>
+          <w:numId w:val="1668"/>
         </w:numPr>
       </w:pPr>
       <w:r>
@@ -15028,7 +15176,7 @@
         <w:pStyle w:val="Compact"/>
         <w:numPr>
           <w:ilvl w:val="0"/>
-          <w:numId w:val="1663"/>
+          <w:numId w:val="1669"/>
         </w:numPr>
       </w:pPr>
       <w:r>
@@ -15040,16 +15188,16 @@
         <w:pStyle w:val="Compact"/>
         <w:numPr>
           <w:ilvl w:val="0"/>
-          <w:numId w:val="1664"/>
+          <w:numId w:val="1670"/>
         </w:numPr>
       </w:pPr>
       <w:r>
         <w:t xml:space="preserve">Progress dashboard updated to M2 complete only after all gates pass.</w:t>
       </w:r>
     </w:p>
-    <w:bookmarkEnd w:id="87"/>
     <w:bookmarkEnd w:id="88"/>
-    <w:bookmarkStart w:id="89" w:name="full-final-acceptance"/>
+    <w:bookmarkEnd w:id="89"/>
+    <w:bookmarkStart w:id="90" w:name="full-final-acceptance"/>
     <w:p>
       <w:pPr>
         <w:pStyle w:val="Heading2"/>
@@ -15063,7 +15211,7 @@
         <w:pStyle w:val="Compact"/>
         <w:numPr>
           <w:ilvl w:val="0"/>
-          <w:numId w:val="1665"/>
+          <w:numId w:val="1671"/>
         </w:numPr>
       </w:pPr>
       <w:r>
@@ -15075,7 +15223,7 @@
         <w:pStyle w:val="Compact"/>
         <w:numPr>
           <w:ilvl w:val="0"/>
-          <w:numId w:val="1666"/>
+          <w:numId w:val="1672"/>
         </w:numPr>
       </w:pPr>
       <w:r>
@@ -15087,7 +15235,7 @@
         <w:pStyle w:val="Compact"/>
         <w:numPr>
           <w:ilvl w:val="0"/>
-          <w:numId w:val="1667"/>
+          <w:numId w:val="1673"/>
         </w:numPr>
       </w:pPr>
       <w:r>
@@ -15099,7 +15247,7 @@
         <w:pStyle w:val="Compact"/>
         <w:numPr>
           <w:ilvl w:val="0"/>
-          <w:numId w:val="1668"/>
+          <w:numId w:val="1674"/>
         </w:numPr>
       </w:pPr>
       <w:r>
@@ -15111,7 +15259,7 @@
         <w:pStyle w:val="Compact"/>
         <w:numPr>
           <w:ilvl w:val="0"/>
-          <w:numId w:val="1669"/>
+          <w:numId w:val="1675"/>
         </w:numPr>
       </w:pPr>
       <w:r>
@@ -15123,7 +15271,7 @@
         <w:pStyle w:val="Compact"/>
         <w:numPr>
           <w:ilvl w:val="0"/>
-          <w:numId w:val="1670"/>
+          <w:numId w:val="1676"/>
         </w:numPr>
       </w:pPr>
       <w:r>
@@ -15135,7 +15283,7 @@
         <w:pStyle w:val="Compact"/>
         <w:numPr>
           <w:ilvl w:val="0"/>
-          <w:numId w:val="1671"/>
+          <w:numId w:val="1677"/>
         </w:numPr>
       </w:pPr>
       <w:r>
@@ -15147,7 +15295,7 @@
         <w:pStyle w:val="Compact"/>
         <w:numPr>
           <w:ilvl w:val="0"/>
-          <w:numId w:val="1672"/>
+          <w:numId w:val="1678"/>
         </w:numPr>
       </w:pPr>
       <w:r>
@@ -15159,7 +15307,7 @@
         <w:pStyle w:val="Compact"/>
         <w:numPr>
           <w:ilvl w:val="0"/>
-          <w:numId w:val="1673"/>
+          <w:numId w:val="1679"/>
         </w:numPr>
       </w:pPr>
       <w:r>
@@ -15171,7 +15319,7 @@
         <w:pStyle w:val="Compact"/>
         <w:numPr>
           <w:ilvl w:val="0"/>
-          <w:numId w:val="1674"/>
+          <w:numId w:val="1680"/>
         </w:numPr>
       </w:pPr>
       <w:r>
@@ -15183,15 +15331,15 @@
         <w:pStyle w:val="Compact"/>
         <w:numPr>
           <w:ilvl w:val="0"/>
-          <w:numId w:val="1675"/>
+          <w:numId w:val="1681"/>
         </w:numPr>
       </w:pPr>
       <w:r>
         <w:t xml:space="preserve">Final client-facing summary prepared with what changed, how it was tested, and what is intentionally out of scope.</w:t>
       </w:r>
     </w:p>
-    <w:bookmarkEnd w:id="89"/>
-    <w:bookmarkStart w:id="90" w:name="progress-update-log"/>
+    <w:bookmarkEnd w:id="90"/>
+    <w:bookmarkStart w:id="91" w:name="progress-update-log"/>
     <w:p>
       <w:pPr>
         <w:pStyle w:val="Heading2"/>
@@ -15208,11 +15356,11 @@
         <w:tblLook w:firstRow="1" w:lastRow="0" w:firstColumn="0" w:lastColumn="0" w:noHBand="0" w:noVBand="0" w:val="0020"/>
       </w:tblPr>
       <w:tblGrid>
-        <w:gridCol w:w="384"/>
-        <w:gridCol w:w="307"/>
-        <w:gridCol w:w="307"/>
-        <w:gridCol w:w="4998"/>
-        <w:gridCol w:w="1922"/>
+        <w:gridCol w:w="363"/>
+        <w:gridCol w:w="290"/>
+        <w:gridCol w:w="290"/>
+        <w:gridCol w:w="4977"/>
+        <w:gridCol w:w="1998"/>
       </w:tblGrid>
       <w:tr>
         <w:trPr>
@@ -15444,6 +15592,67 @@
               <w:jc w:val="right"/>
             </w:pPr>
             <w:r>
+              <w:t xml:space="preserve">73%</w:t>
+            </w:r>
+          </w:p>
+        </w:tc>
+        <w:tc>
+          <w:tcPr/>
+          <w:p>
+            <w:pPr>
+              <w:pStyle w:val="Compact"/>
+            </w:pPr>
+            <w:r>
+              <w:t xml:space="preserve">M1.6</w:t>
+            </w:r>
+          </w:p>
+        </w:tc>
+        <w:tc>
+          <w:tcPr/>
+          <w:p>
+            <w:pPr>
+              <w:pStyle w:val="Compact"/>
+            </w:pPr>
+            <w:r>
+              <w:t xml:space="preserve">Added Inbox AI/email CTA/follow-up/quiet-hours/inbound-owner regression evidence and browser Gmail CTA smoke.</w:t>
+            </w:r>
+          </w:p>
+        </w:tc>
+        <w:tc>
+          <w:tcPr/>
+          <w:p>
+            <w:pPr>
+              <w:pStyle w:val="Compact"/>
+            </w:pPr>
+            <w:r>
+              <w:rPr>
+                <w:rStyle w:val="VerbatimChar"/>
+              </w:rPr>
+              <w:t xml:space="preserve">audit-screenshots/m16-inbox-ai-policy-evidence.json</w:t>
+            </w:r>
+          </w:p>
+        </w:tc>
+      </w:tr>
+      <w:tr>
+        <w:tc>
+          <w:tcPr/>
+          <w:p>
+            <w:pPr>
+              <w:pStyle w:val="Compact"/>
+            </w:pPr>
+            <w:r>
+              <w:t xml:space="preserve">2026-05-02</w:t>
+            </w:r>
+          </w:p>
+        </w:tc>
+        <w:tc>
+          <w:tcPr/>
+          <w:p>
+            <w:pPr>
+              <w:pStyle w:val="Compact"/>
+              <w:jc w:val="right"/>
+            </w:pPr>
+            <w:r>
               <w:t xml:space="preserve">6%</w:t>
             </w:r>
           </w:p>
@@ -15483,8 +15692,8 @@
         </w:tc>
       </w:tr>
     </w:tbl>
-    <w:bookmarkEnd w:id="90"/>
     <w:bookmarkEnd w:id="91"/>
+    <w:bookmarkEnd w:id="92"/>
     <w:sectPr>
       <w:footnotePr>
         <w:numRestart w:val="eachSect"/>
@@ -17117,22 +17326,22 @@
     <w:abstractNumId w:val="993"/>
   </w:num>
   <w:num w:numId="1422">
-    <w:abstractNumId w:val="992"/>
+    <w:abstractNumId w:val="993"/>
   </w:num>
   <w:num w:numId="1423">
-    <w:abstractNumId w:val="992"/>
+    <w:abstractNumId w:val="993"/>
   </w:num>
   <w:num w:numId="1424">
     <w:abstractNumId w:val="993"/>
   </w:num>
   <w:num w:numId="1425">
-    <w:abstractNumId w:val="992"/>
+    <w:abstractNumId w:val="993"/>
   </w:num>
   <w:num w:numId="1426">
-    <w:abstractNumId w:val="992"/>
+    <w:abstractNumId w:val="993"/>
   </w:num>
   <w:num w:numId="1427">
-    <w:abstractNumId w:val="992"/>
+    <w:abstractNumId w:val="993"/>
   </w:num>
   <w:num w:numId="1428">
     <w:abstractNumId w:val="992"/>
@@ -17141,22 +17350,22 @@
     <w:abstractNumId w:val="992"/>
   </w:num>
   <w:num w:numId="1430">
-    <w:abstractNumId w:val="992"/>
+    <w:abstractNumId w:val="993"/>
   </w:num>
   <w:num w:numId="1431">
-    <w:abstractNumId w:val="992"/>
+    <w:abstractNumId w:val="993"/>
   </w:num>
   <w:num w:numId="1432">
-    <w:abstractNumId w:val="992"/>
+    <w:abstractNumId w:val="993"/>
   </w:num>
   <w:num w:numId="1433">
-    <w:abstractNumId w:val="992"/>
+    <w:abstractNumId w:val="993"/>
   </w:num>
   <w:num w:numId="1434">
-    <w:abstractNumId w:val="992"/>
+    <w:abstractNumId w:val="993"/>
   </w:num>
   <w:num w:numId="1435">
-    <w:abstractNumId w:val="992"/>
+    <w:abstractNumId w:val="993"/>
   </w:num>
   <w:num w:numId="1436">
     <w:abstractNumId w:val="992"/>
@@ -17168,13 +17377,13 @@
     <w:abstractNumId w:val="992"/>
   </w:num>
   <w:num w:numId="1439">
-    <w:abstractNumId w:val="993"/>
+    <w:abstractNumId w:val="992"/>
   </w:num>
   <w:num w:numId="1440">
-    <w:abstractNumId w:val="993"/>
+    <w:abstractNumId w:val="992"/>
   </w:num>
   <w:num w:numId="1441">
-    <w:abstractNumId w:val="993"/>
+    <w:abstractNumId w:val="992"/>
   </w:num>
   <w:num w:numId="1442">
     <w:abstractNumId w:val="992"/>
@@ -17195,7 +17404,7 @@
     <w:abstractNumId w:val="993"/>
   </w:num>
   <w:num w:numId="1448">
-    <w:abstractNumId w:val="993"/>
+    <w:abstractNumId w:val="992"/>
   </w:num>
   <w:num w:numId="1449">
     <w:abstractNumId w:val="992"/>
@@ -17216,10 +17425,10 @@
     <w:abstractNumId w:val="993"/>
   </w:num>
   <w:num w:numId="1455">
-    <w:abstractNumId w:val="993"/>
+    <w:abstractNumId w:val="992"/>
   </w:num>
   <w:num w:numId="1456">
-    <w:abstractNumId w:val="993"/>
+    <w:abstractNumId w:val="992"/>
   </w:num>
   <w:num w:numId="1457">
     <w:abstractNumId w:val="993"/>
@@ -17246,31 +17455,31 @@
     <w:abstractNumId w:val="993"/>
   </w:num>
   <w:num w:numId="1465">
-    <w:abstractNumId w:val="992"/>
+    <w:abstractNumId w:val="993"/>
   </w:num>
   <w:num w:numId="1466">
+    <w:abstractNumId w:val="993"/>
+  </w:num>
+  <w:num w:numId="1467">
+    <w:abstractNumId w:val="993"/>
+  </w:num>
+  <w:num w:numId="1468">
+    <w:abstractNumId w:val="993"/>
+  </w:num>
+  <w:num w:numId="1469">
+    <w:abstractNumId w:val="993"/>
+  </w:num>
+  <w:num w:numId="1470">
+    <w:abstractNumId w:val="993"/>
+  </w:num>
+  <w:num w:numId="1471">
+    <w:abstractNumId w:val="992"/>
+  </w:num>
+  <w:num w:numId="1472">
     <w:abstractNumId w:val="991"/>
   </w:num>
-  <w:num w:numId="1467">
-    <w:abstractNumId w:val="993"/>
-  </w:num>
-  <w:num w:numId="1468">
-    <w:abstractNumId w:val="993"/>
-  </w:num>
-  <w:num w:numId="1469">
-    <w:abstractNumId w:val="992"/>
-  </w:num>
-  <w:num w:numId="1470">
-    <w:abstractNumId w:val="992"/>
-  </w:num>
-  <w:num w:numId="1471">
-    <w:abstractNumId w:val="992"/>
-  </w:num>
-  <w:num w:numId="1472">
-    <w:abstractNumId w:val="992"/>
-  </w:num>
   <w:num w:numId="1473">
-    <w:abstractNumId w:val="992"/>
+    <w:abstractNumId w:val="993"/>
   </w:num>
   <w:num w:numId="1474">
     <w:abstractNumId w:val="993"/>
@@ -17282,22 +17491,22 @@
     <w:abstractNumId w:val="992"/>
   </w:num>
   <w:num w:numId="1477">
-    <w:abstractNumId w:val="993"/>
+    <w:abstractNumId w:val="992"/>
   </w:num>
   <w:num w:numId="1478">
-    <w:abstractNumId w:val="993"/>
+    <w:abstractNumId w:val="992"/>
   </w:num>
   <w:num w:numId="1479">
-    <w:abstractNumId w:val="993"/>
+    <w:abstractNumId w:val="992"/>
   </w:num>
   <w:num w:numId="1480">
     <w:abstractNumId w:val="993"/>
   </w:num>
   <w:num w:numId="1481">
-    <w:abstractNumId w:val="993"/>
+    <w:abstractNumId w:val="992"/>
   </w:num>
   <w:num w:numId="1482">
-    <w:abstractNumId w:val="993"/>
+    <w:abstractNumId w:val="992"/>
   </w:num>
   <w:num w:numId="1483">
     <w:abstractNumId w:val="993"/>
@@ -17324,31 +17533,31 @@
     <w:abstractNumId w:val="993"/>
   </w:num>
   <w:num w:numId="1491">
+    <w:abstractNumId w:val="993"/>
+  </w:num>
+  <w:num w:numId="1492">
+    <w:abstractNumId w:val="993"/>
+  </w:num>
+  <w:num w:numId="1493">
+    <w:abstractNumId w:val="993"/>
+  </w:num>
+  <w:num w:numId="1494">
+    <w:abstractNumId w:val="993"/>
+  </w:num>
+  <w:num w:numId="1495">
+    <w:abstractNumId w:val="993"/>
+  </w:num>
+  <w:num w:numId="1496">
+    <w:abstractNumId w:val="993"/>
+  </w:num>
+  <w:num w:numId="1497">
     <w:abstractNumId w:val="991"/>
   </w:num>
-  <w:num w:numId="1492">
-    <w:abstractNumId w:val="993"/>
-  </w:num>
-  <w:num w:numId="1493">
-    <w:abstractNumId w:val="993"/>
-  </w:num>
-  <w:num w:numId="1494">
-    <w:abstractNumId w:val="993"/>
-  </w:num>
-  <w:num w:numId="1495">
-    <w:abstractNumId w:val="991"/>
-  </w:num>
-  <w:num w:numId="1496">
-    <w:abstractNumId w:val="993"/>
-  </w:num>
-  <w:num w:numId="1497">
-    <w:abstractNumId w:val="993"/>
-  </w:num>
   <w:num w:numId="1498">
-    <w:abstractNumId w:val="992"/>
+    <w:abstractNumId w:val="993"/>
   </w:num>
   <w:num w:numId="1499">
-    <w:abstractNumId w:val="992"/>
+    <w:abstractNumId w:val="993"/>
   </w:num>
   <w:num w:numId="1500">
     <w:abstractNumId w:val="993"/>
@@ -17360,25 +17569,25 @@
     <w:abstractNumId w:val="993"/>
   </w:num>
   <w:num w:numId="1503">
+    <w:abstractNumId w:val="993"/>
+  </w:num>
+  <w:num w:numId="1504">
+    <w:abstractNumId w:val="992"/>
+  </w:num>
+  <w:num w:numId="1505">
+    <w:abstractNumId w:val="992"/>
+  </w:num>
+  <w:num w:numId="1506">
+    <w:abstractNumId w:val="993"/>
+  </w:num>
+  <w:num w:numId="1507">
     <w:abstractNumId w:val="991"/>
   </w:num>
-  <w:num w:numId="1504">
-    <w:abstractNumId w:val="993"/>
-  </w:num>
-  <w:num w:numId="1505">
-    <w:abstractNumId w:val="993"/>
-  </w:num>
-  <w:num w:numId="1506">
-    <w:abstractNumId w:val="993"/>
-  </w:num>
-  <w:num w:numId="1507">
-    <w:abstractNumId w:val="993"/>
-  </w:num>
   <w:num w:numId="1508">
     <w:abstractNumId w:val="993"/>
   </w:num>
   <w:num w:numId="1509">
-    <w:abstractNumId w:val="993"/>
+    <w:abstractNumId w:val="991"/>
   </w:num>
   <w:num w:numId="1510">
     <w:abstractNumId w:val="993"/>
@@ -17390,31 +17599,31 @@
     <w:abstractNumId w:val="993"/>
   </w:num>
   <w:num w:numId="1513">
+    <w:abstractNumId w:val="993"/>
+  </w:num>
+  <w:num w:numId="1514">
+    <w:abstractNumId w:val="993"/>
+  </w:num>
+  <w:num w:numId="1515">
+    <w:abstractNumId w:val="993"/>
+  </w:num>
+  <w:num w:numId="1516">
+    <w:abstractNumId w:val="993"/>
+  </w:num>
+  <w:num w:numId="1517">
+    <w:abstractNumId w:val="993"/>
+  </w:num>
+  <w:num w:numId="1518">
+    <w:abstractNumId w:val="993"/>
+  </w:num>
+  <w:num w:numId="1519">
     <w:abstractNumId w:val="991"/>
   </w:num>
-  <w:num w:numId="1514">
-    <w:abstractNumId w:val="993"/>
-  </w:num>
-  <w:num w:numId="1515">
-    <w:abstractNumId w:val="993"/>
-  </w:num>
-  <w:num w:numId="1516">
-    <w:abstractNumId w:val="992"/>
-  </w:num>
-  <w:num w:numId="1517">
-    <w:abstractNumId w:val="992"/>
-  </w:num>
-  <w:num w:numId="1518">
-    <w:abstractNumId w:val="993"/>
-  </w:num>
-  <w:num w:numId="1519">
-    <w:abstractNumId w:val="993"/>
-  </w:num>
   <w:num w:numId="1520">
     <w:abstractNumId w:val="993"/>
   </w:num>
   <w:num w:numId="1521">
-    <w:abstractNumId w:val="992"/>
+    <w:abstractNumId w:val="993"/>
   </w:num>
   <w:num w:numId="1522">
     <w:abstractNumId w:val="992"/>
@@ -17423,34 +17632,34 @@
     <w:abstractNumId w:val="992"/>
   </w:num>
   <w:num w:numId="1524">
-    <w:abstractNumId w:val="992"/>
+    <w:abstractNumId w:val="993"/>
   </w:num>
   <w:num w:numId="1525">
     <w:abstractNumId w:val="993"/>
   </w:num>
   <w:num w:numId="1526">
-    <w:abstractNumId w:val="992"/>
+    <w:abstractNumId w:val="993"/>
   </w:num>
   <w:num w:numId="1527">
     <w:abstractNumId w:val="992"/>
   </w:num>
   <w:num w:numId="1528">
-    <w:abstractNumId w:val="993"/>
+    <w:abstractNumId w:val="992"/>
   </w:num>
   <w:num w:numId="1529">
-    <w:abstractNumId w:val="993"/>
+    <w:abstractNumId w:val="992"/>
   </w:num>
   <w:num w:numId="1530">
-    <w:abstractNumId w:val="993"/>
+    <w:abstractNumId w:val="992"/>
   </w:num>
   <w:num w:numId="1531">
     <w:abstractNumId w:val="993"/>
   </w:num>
   <w:num w:numId="1532">
-    <w:abstractNumId w:val="993"/>
+    <w:abstractNumId w:val="992"/>
   </w:num>
   <w:num w:numId="1533">
-    <w:abstractNumId w:val="993"/>
+    <w:abstractNumId w:val="992"/>
   </w:num>
   <w:num w:numId="1534">
     <w:abstractNumId w:val="993"/>
@@ -17495,26 +17704,26 @@
     <w:abstractNumId w:val="993"/>
   </w:num>
   <w:num w:numId="1548">
+    <w:abstractNumId w:val="993"/>
+  </w:num>
+  <w:num w:numId="1549">
+    <w:abstractNumId w:val="993"/>
+  </w:num>
+  <w:num w:numId="1550">
+    <w:abstractNumId w:val="993"/>
+  </w:num>
+  <w:num w:numId="1551">
+    <w:abstractNumId w:val="993"/>
+  </w:num>
+  <w:num w:numId="1552">
+    <w:abstractNumId w:val="993"/>
+  </w:num>
+  <w:num w:numId="1553">
+    <w:abstractNumId w:val="993"/>
+  </w:num>
+  <w:num w:numId="1554">
     <w:abstractNumId w:val="991"/>
   </w:num>
-  <w:num w:numId="1549">
-    <w:abstractNumId w:val="992"/>
-  </w:num>
-  <w:num w:numId="1550">
-    <w:abstractNumId w:val="992"/>
-  </w:num>
-  <w:num w:numId="1551">
-    <w:abstractNumId w:val="992"/>
-  </w:num>
-  <w:num w:numId="1552">
-    <w:abstractNumId w:val="992"/>
-  </w:num>
-  <w:num w:numId="1553">
-    <w:abstractNumId w:val="992"/>
-  </w:num>
-  <w:num w:numId="1554">
-    <w:abstractNumId w:val="992"/>
-  </w:num>
   <w:num w:numId="1555">
     <w:abstractNumId w:val="992"/>
   </w:num>
@@ -17546,50 +17755,50 @@
     <w:abstractNumId w:val="992"/>
   </w:num>
   <w:num w:numId="1565">
-    <w:abstractNumId w:val="993"/>
+    <w:abstractNumId w:val="992"/>
   </w:num>
   <w:num w:numId="1566">
-    <w:abstractNumId w:val="993"/>
+    <w:abstractNumId w:val="992"/>
   </w:num>
   <w:num w:numId="1567">
-    <w:abstractNumId w:val="993"/>
+    <w:abstractNumId w:val="992"/>
   </w:num>
   <w:num w:numId="1568">
-    <w:abstractNumId w:val="993"/>
+    <w:abstractNumId w:val="992"/>
   </w:num>
   <w:num w:numId="1569">
-    <w:abstractNumId w:val="993"/>
+    <w:abstractNumId w:val="992"/>
   </w:num>
   <w:num w:numId="1570">
+    <w:abstractNumId w:val="992"/>
+  </w:num>
+  <w:num w:numId="1571">
+    <w:abstractNumId w:val="993"/>
+  </w:num>
+  <w:num w:numId="1572">
+    <w:abstractNumId w:val="993"/>
+  </w:num>
+  <w:num w:numId="1573">
+    <w:abstractNumId w:val="993"/>
+  </w:num>
+  <w:num w:numId="1574">
+    <w:abstractNumId w:val="993"/>
+  </w:num>
+  <w:num w:numId="1575">
+    <w:abstractNumId w:val="993"/>
+  </w:num>
+  <w:num w:numId="1576">
     <w:abstractNumId w:val="991"/>
   </w:num>
-  <w:num w:numId="1571">
-    <w:abstractNumId w:val="993"/>
-  </w:num>
-  <w:num w:numId="1572">
-    <w:abstractNumId w:val="993"/>
-  </w:num>
-  <w:num w:numId="1573">
+  <w:num w:numId="1577">
+    <w:abstractNumId w:val="993"/>
+  </w:num>
+  <w:num w:numId="1578">
+    <w:abstractNumId w:val="993"/>
+  </w:num>
+  <w:num w:numId="1579">
     <w:abstractNumId w:val="991"/>
   </w:num>
-  <w:num w:numId="1574">
-    <w:abstractNumId w:val="993"/>
-  </w:num>
-  <w:num w:numId="1575">
-    <w:abstractNumId w:val="993"/>
-  </w:num>
-  <w:num w:numId="1576">
-    <w:abstractNumId w:val="993"/>
-  </w:num>
-  <w:num w:numId="1577">
-    <w:abstractNumId w:val="993"/>
-  </w:num>
-  <w:num w:numId="1578">
-    <w:abstractNumId w:val="993"/>
-  </w:num>
-  <w:num w:numId="1579">
-    <w:abstractNumId w:val="993"/>
-  </w:num>
   <w:num w:numId="1580">
     <w:abstractNumId w:val="993"/>
   </w:num>
@@ -17603,43 +17812,43 @@
     <w:abstractNumId w:val="993"/>
   </w:num>
   <w:num w:numId="1584">
+    <w:abstractNumId w:val="993"/>
+  </w:num>
+  <w:num w:numId="1585">
+    <w:abstractNumId w:val="993"/>
+  </w:num>
+  <w:num w:numId="1586">
+    <w:abstractNumId w:val="993"/>
+  </w:num>
+  <w:num w:numId="1587">
+    <w:abstractNumId w:val="993"/>
+  </w:num>
+  <w:num w:numId="1588">
+    <w:abstractNumId w:val="993"/>
+  </w:num>
+  <w:num w:numId="1589">
+    <w:abstractNumId w:val="993"/>
+  </w:num>
+  <w:num w:numId="1590">
     <w:abstractNumId w:val="991"/>
   </w:num>
-  <w:num w:numId="1585">
-    <w:abstractNumId w:val="993"/>
-  </w:num>
-  <w:num w:numId="1586">
+  <w:num w:numId="1591">
+    <w:abstractNumId w:val="993"/>
+  </w:num>
+  <w:num w:numId="1592">
     <w:abstractNumId w:val="991"/>
   </w:num>
-  <w:num w:numId="1587">
-    <w:abstractNumId w:val="993"/>
-  </w:num>
-  <w:num w:numId="1588">
-    <w:abstractNumId w:val="993"/>
-  </w:num>
-  <w:num w:numId="1589">
-    <w:abstractNumId w:val="993"/>
-  </w:num>
-  <w:num w:numId="1590">
-    <w:abstractNumId w:val="993"/>
-  </w:num>
-  <w:num w:numId="1591">
-    <w:abstractNumId w:val="992"/>
-  </w:num>
-  <w:num w:numId="1592">
-    <w:abstractNumId w:val="992"/>
-  </w:num>
   <w:num w:numId="1593">
     <w:abstractNumId w:val="993"/>
   </w:num>
   <w:num w:numId="1594">
-    <w:abstractNumId w:val="992"/>
+    <w:abstractNumId w:val="993"/>
   </w:num>
   <w:num w:numId="1595">
-    <w:abstractNumId w:val="992"/>
+    <w:abstractNumId w:val="993"/>
   </w:num>
   <w:num w:numId="1596">
-    <w:abstractNumId w:val="992"/>
+    <w:abstractNumId w:val="993"/>
   </w:num>
   <w:num w:numId="1597">
     <w:abstractNumId w:val="992"/>
@@ -17648,31 +17857,31 @@
     <w:abstractNumId w:val="992"/>
   </w:num>
   <w:num w:numId="1599">
-    <w:abstractNumId w:val="992"/>
+    <w:abstractNumId w:val="993"/>
   </w:num>
   <w:num w:numId="1600">
-    <w:abstractNumId w:val="993"/>
+    <w:abstractNumId w:val="992"/>
   </w:num>
   <w:num w:numId="1601">
-    <w:abstractNumId w:val="993"/>
+    <w:abstractNumId w:val="992"/>
   </w:num>
   <w:num w:numId="1602">
-    <w:abstractNumId w:val="993"/>
+    <w:abstractNumId w:val="992"/>
   </w:num>
   <w:num w:numId="1603">
-    <w:abstractNumId w:val="993"/>
+    <w:abstractNumId w:val="992"/>
   </w:num>
   <w:num w:numId="1604">
-    <w:abstractNumId w:val="993"/>
+    <w:abstractNumId w:val="992"/>
   </w:num>
   <w:num w:numId="1605">
-    <w:abstractNumId w:val="993"/>
+    <w:abstractNumId w:val="992"/>
   </w:num>
   <w:num w:numId="1606">
     <w:abstractNumId w:val="993"/>
   </w:num>
   <w:num w:numId="1607">
-    <w:abstractNumId w:val="992"/>
+    <w:abstractNumId w:val="993"/>
   </w:num>
   <w:num w:numId="1608">
     <w:abstractNumId w:val="993"/>
@@ -17684,25 +17893,25 @@
     <w:abstractNumId w:val="993"/>
   </w:num>
   <w:num w:numId="1611">
-    <w:abstractNumId w:val="992"/>
+    <w:abstractNumId w:val="993"/>
   </w:num>
   <w:num w:numId="1612">
     <w:abstractNumId w:val="993"/>
   </w:num>
   <w:num w:numId="1613">
-    <w:abstractNumId w:val="993"/>
+    <w:abstractNumId w:val="992"/>
   </w:num>
   <w:num w:numId="1614">
     <w:abstractNumId w:val="993"/>
   </w:num>
   <w:num w:numId="1615">
-    <w:abstractNumId w:val="992"/>
+    <w:abstractNumId w:val="993"/>
   </w:num>
   <w:num w:numId="1616">
     <w:abstractNumId w:val="993"/>
   </w:num>
   <w:num w:numId="1617">
-    <w:abstractNumId w:val="993"/>
+    <w:abstractNumId w:val="992"/>
   </w:num>
   <w:num w:numId="1618">
     <w:abstractNumId w:val="993"/>
@@ -17714,19 +17923,19 @@
     <w:abstractNumId w:val="993"/>
   </w:num>
   <w:num w:numId="1621">
-    <w:abstractNumId w:val="993"/>
+    <w:abstractNumId w:val="992"/>
   </w:num>
   <w:num w:numId="1622">
-    <w:abstractNumId w:val="992"/>
+    <w:abstractNumId w:val="993"/>
   </w:num>
   <w:num w:numId="1623">
     <w:abstractNumId w:val="993"/>
   </w:num>
   <w:num w:numId="1624">
-    <w:abstractNumId w:val="992"/>
+    <w:abstractNumId w:val="993"/>
   </w:num>
   <w:num w:numId="1625">
-    <w:abstractNumId w:val="992"/>
+    <w:abstractNumId w:val="993"/>
   </w:num>
   <w:num w:numId="1626">
     <w:abstractNumId w:val="993"/>
@@ -17735,7 +17944,7 @@
     <w:abstractNumId w:val="993"/>
   </w:num>
   <w:num w:numId="1628">
-    <w:abstractNumId w:val="993"/>
+    <w:abstractNumId w:val="992"/>
   </w:num>
   <w:num w:numId="1629">
     <w:abstractNumId w:val="993"/>
@@ -17747,16 +17956,16 @@
     <w:abstractNumId w:val="992"/>
   </w:num>
   <w:num w:numId="1632">
-    <w:abstractNumId w:val="992"/>
+    <w:abstractNumId w:val="993"/>
   </w:num>
   <w:num w:numId="1633">
-    <w:abstractNumId w:val="992"/>
+    <w:abstractNumId w:val="993"/>
   </w:num>
   <w:num w:numId="1634">
     <w:abstractNumId w:val="993"/>
   </w:num>
   <w:num w:numId="1635">
-    <w:abstractNumId w:val="992"/>
+    <w:abstractNumId w:val="993"/>
   </w:num>
   <w:num w:numId="1636">
     <w:abstractNumId w:val="992"/>
@@ -17771,7 +17980,7 @@
     <w:abstractNumId w:val="992"/>
   </w:num>
   <w:num w:numId="1640">
-    <w:abstractNumId w:val="992"/>
+    <w:abstractNumId w:val="993"/>
   </w:num>
   <w:num w:numId="1641">
     <w:abstractNumId w:val="992"/>
@@ -17876,6 +18085,24 @@
     <w:abstractNumId w:val="992"/>
   </w:num>
   <w:num w:numId="1675">
+    <w:abstractNumId w:val="992"/>
+  </w:num>
+  <w:num w:numId="1676">
+    <w:abstractNumId w:val="992"/>
+  </w:num>
+  <w:num w:numId="1677">
+    <w:abstractNumId w:val="992"/>
+  </w:num>
+  <w:num w:numId="1678">
+    <w:abstractNumId w:val="992"/>
+  </w:num>
+  <w:num w:numId="1679">
+    <w:abstractNumId w:val="992"/>
+  </w:num>
+  <w:num w:numId="1680">
+    <w:abstractNumId w:val="992"/>
+  </w:num>
+  <w:num w:numId="1681">
     <w:abstractNumId w:val="992"/>
   </w:num>
 </w:numbering>

</xml_diff>

<commit_message>
Record M1.6 inbox AI production smoke
</commit_message>
<xml_diff>
--- a/MASTER_M1_M2_DELIVERY_CHECKLIST.docx
+++ b/MASTER_M1_M2_DELIVERY_CHECKLIST.docx
@@ -81,10 +81,10 @@
         <w:tblLook w:firstRow="1" w:lastRow="0" w:firstColumn="0" w:lastColumn="0" w:noHBand="0" w:noVBand="0" w:val="0020"/>
       </w:tblPr>
       <w:tblGrid>
-        <w:gridCol w:w="2341"/>
-        <w:gridCol w:w="398"/>
-        <w:gridCol w:w="498"/>
-        <w:gridCol w:w="4682"/>
+        <w:gridCol w:w="2370"/>
+        <w:gridCol w:w="403"/>
+        <w:gridCol w:w="504"/>
+        <w:gridCol w:w="4641"/>
       </w:tblGrid>
       <w:tr>
         <w:trPr>
@@ -468,7 +468,7 @@
               <w:pStyle w:val="Compact"/>
             </w:pPr>
             <w:r>
-              <w:t xml:space="preserve">Inbox AI/email/follow-up policy gate passed; new deal/share/socket/visual gates remain</w:t>
+              <w:t xml:space="preserve">Inbox AI/email/follow-up policy gate deployed; new deal/share/socket/visual gates remain</w:t>
             </w:r>
           </w:p>
         </w:tc>
@@ -724,7 +724,7 @@
                 <w:b/>
                 <w:bCs/>
               </w:rPr>
-              <w:t xml:space="preserve">M1.6 Inbox AI/email/follow-up policy evidence added; new deal/share/socket/visual remain</w:t>
+              <w:t xml:space="preserve">M1.6 Inbox AI/email/follow-up policy deployed; new deal/share/socket/visual remain</w:t>
             </w:r>
           </w:p>
         </w:tc>
@@ -10700,6 +10700,72 @@
         </w:numPr>
       </w:pPr>
       <w:r>
+        <w:t xml:space="preserve">Production deploy passed for commit</w:t>
+      </w:r>
+      <w:r>
+        <w:t xml:space="preserve"> </w:t>
+      </w:r>
+      <w:r>
+        <w:rPr>
+          <w:rStyle w:val="VerbatimChar"/>
+        </w:rPr>
+        <w:t xml:space="preserve">2f665aaf</w:t>
+      </w:r>
+      <w:r>
+        <w:t xml:space="preserve">: build/restart succeeded,</w:t>
+      </w:r>
+      <w:r>
+        <w:t xml:space="preserve"> </w:t>
+      </w:r>
+      <w:r>
+        <w:rPr>
+          <w:rStyle w:val="VerbatimChar"/>
+        </w:rPr>
+        <w:t xml:space="preserve">/api/health</w:t>
+      </w:r>
+      <w:r>
+        <w:t xml:space="preserve"> </w:t>
+      </w:r>
+      <w:r>
+        <w:t xml:space="preserve">returned HTTP 200 with database</w:t>
+      </w:r>
+      <w:r>
+        <w:t xml:space="preserve"> </w:t>
+      </w:r>
+      <w:r>
+        <w:rPr>
+          <w:rStyle w:val="VerbatimChar"/>
+        </w:rPr>
+        <w:t xml:space="preserve">ok</w:t>
+      </w:r>
+      <w:r>
+        <w:t xml:space="preserve"> </w:t>
+      </w:r>
+      <w:r>
+        <w:t xml:space="preserve">and Redis</w:t>
+      </w:r>
+      <w:r>
+        <w:t xml:space="preserve"> </w:t>
+      </w:r>
+      <w:r>
+        <w:rPr>
+          <w:rStyle w:val="VerbatimChar"/>
+        </w:rPr>
+        <w:t xml:space="preserve">ok</w:t>
+      </w:r>
+      <w:r>
+        <w:t xml:space="preserve">, root HTML returned HTTP 200, and live login UI rendered.</w:t>
+      </w:r>
+    </w:p>
+    <w:p>
+      <w:pPr>
+        <w:pStyle w:val="Compact"/>
+        <w:numPr>
+          <w:ilvl w:val="0"/>
+          <w:numId w:val="1421"/>
+        </w:numPr>
+      </w:pPr>
+      <w:r>
         <w:t xml:space="preserve">Gmail recipient policy prefers conversation/texted email over lead-list email while preserving lead-list email in response metadata.</w:t>
       </w:r>
     </w:p>
@@ -10708,7 +10774,7 @@
         <w:pStyle w:val="Compact"/>
         <w:numPr>
           <w:ilvl w:val="0"/>
-          <w:numId w:val="1421"/>
+          <w:numId w:val="1422"/>
         </w:numPr>
       </w:pPr>
       <w:r>
@@ -10730,7 +10796,7 @@
         <w:pStyle w:val="Compact"/>
         <w:numPr>
           <w:ilvl w:val="0"/>
-          <w:numId w:val="1422"/>
+          <w:numId w:val="1423"/>
         </w:numPr>
       </w:pPr>
       <w:r>
@@ -10742,7 +10808,7 @@
         <w:pStyle w:val="Compact"/>
         <w:numPr>
           <w:ilvl w:val="0"/>
-          <w:numId w:val="1423"/>
+          <w:numId w:val="1424"/>
         </w:numPr>
       </w:pPr>
       <w:r>
@@ -10754,7 +10820,7 @@
         <w:pStyle w:val="Compact"/>
         <w:numPr>
           <w:ilvl w:val="0"/>
-          <w:numId w:val="1424"/>
+          <w:numId w:val="1425"/>
         </w:numPr>
       </w:pPr>
       <w:r>
@@ -10766,7 +10832,7 @@
         <w:pStyle w:val="Compact"/>
         <w:numPr>
           <w:ilvl w:val="0"/>
-          <w:numId w:val="1425"/>
+          <w:numId w:val="1426"/>
         </w:numPr>
       </w:pPr>
       <w:r>
@@ -10778,7 +10844,7 @@
         <w:pStyle w:val="Compact"/>
         <w:numPr>
           <w:ilvl w:val="0"/>
-          <w:numId w:val="1426"/>
+          <w:numId w:val="1427"/>
         </w:numPr>
       </w:pPr>
       <w:r>
@@ -10790,7 +10856,7 @@
         <w:pStyle w:val="Compact"/>
         <w:numPr>
           <w:ilvl w:val="0"/>
-          <w:numId w:val="1427"/>
+          <w:numId w:val="1428"/>
         </w:numPr>
       </w:pPr>
       <w:r>
@@ -10802,7 +10868,7 @@
         <w:pStyle w:val="Compact"/>
         <w:numPr>
           <w:ilvl w:val="0"/>
-          <w:numId w:val="1428"/>
+          <w:numId w:val="1429"/>
         </w:numPr>
       </w:pPr>
       <w:r>
@@ -10814,7 +10880,7 @@
         <w:pStyle w:val="Compact"/>
         <w:numPr>
           <w:ilvl w:val="0"/>
-          <w:numId w:val="1429"/>
+          <w:numId w:val="1430"/>
         </w:numPr>
       </w:pPr>
       <w:r>
@@ -10826,7 +10892,7 @@
         <w:pStyle w:val="Compact"/>
         <w:numPr>
           <w:ilvl w:val="0"/>
-          <w:numId w:val="1430"/>
+          <w:numId w:val="1431"/>
         </w:numPr>
       </w:pPr>
       <w:r>
@@ -10838,7 +10904,7 @@
         <w:pStyle w:val="Compact"/>
         <w:numPr>
           <w:ilvl w:val="0"/>
-          <w:numId w:val="1431"/>
+          <w:numId w:val="1432"/>
         </w:numPr>
       </w:pPr>
       <w:r>
@@ -10850,7 +10916,7 @@
         <w:pStyle w:val="Compact"/>
         <w:numPr>
           <w:ilvl w:val="0"/>
-          <w:numId w:val="1432"/>
+          <w:numId w:val="1433"/>
         </w:numPr>
       </w:pPr>
       <w:r>
@@ -10862,7 +10928,7 @@
         <w:pStyle w:val="Compact"/>
         <w:numPr>
           <w:ilvl w:val="0"/>
-          <w:numId w:val="1433"/>
+          <w:numId w:val="1434"/>
         </w:numPr>
       </w:pPr>
       <w:r>
@@ -10874,7 +10940,7 @@
         <w:pStyle w:val="Compact"/>
         <w:numPr>
           <w:ilvl w:val="0"/>
-          <w:numId w:val="1434"/>
+          <w:numId w:val="1435"/>
         </w:numPr>
       </w:pPr>
       <w:r>
@@ -10886,7 +10952,7 @@
         <w:pStyle w:val="Compact"/>
         <w:numPr>
           <w:ilvl w:val="0"/>
-          <w:numId w:val="1435"/>
+          <w:numId w:val="1436"/>
         </w:numPr>
       </w:pPr>
       <w:r>
@@ -10898,7 +10964,7 @@
         <w:pStyle w:val="Compact"/>
         <w:numPr>
           <w:ilvl w:val="0"/>
-          <w:numId w:val="1436"/>
+          <w:numId w:val="1437"/>
         </w:numPr>
       </w:pPr>
       <w:r>
@@ -10920,7 +10986,7 @@
         <w:pStyle w:val="Compact"/>
         <w:numPr>
           <w:ilvl w:val="0"/>
-          <w:numId w:val="1437"/>
+          <w:numId w:val="1438"/>
         </w:numPr>
       </w:pPr>
       <w:r>
@@ -10932,7 +10998,7 @@
         <w:pStyle w:val="Compact"/>
         <w:numPr>
           <w:ilvl w:val="0"/>
-          <w:numId w:val="1438"/>
+          <w:numId w:val="1439"/>
         </w:numPr>
       </w:pPr>
       <w:r>
@@ -10944,7 +11010,7 @@
         <w:pStyle w:val="Compact"/>
         <w:numPr>
           <w:ilvl w:val="0"/>
-          <w:numId w:val="1439"/>
+          <w:numId w:val="1440"/>
         </w:numPr>
       </w:pPr>
       <w:r>
@@ -10956,7 +11022,7 @@
         <w:pStyle w:val="Compact"/>
         <w:numPr>
           <w:ilvl w:val="0"/>
-          <w:numId w:val="1440"/>
+          <w:numId w:val="1441"/>
         </w:numPr>
       </w:pPr>
       <w:r>
@@ -10968,7 +11034,7 @@
         <w:pStyle w:val="Compact"/>
         <w:numPr>
           <w:ilvl w:val="0"/>
-          <w:numId w:val="1441"/>
+          <w:numId w:val="1442"/>
         </w:numPr>
       </w:pPr>
       <w:r>
@@ -10980,7 +11046,7 @@
         <w:pStyle w:val="Compact"/>
         <w:numPr>
           <w:ilvl w:val="0"/>
-          <w:numId w:val="1442"/>
+          <w:numId w:val="1443"/>
         </w:numPr>
       </w:pPr>
       <w:r>
@@ -10992,7 +11058,7 @@
         <w:pStyle w:val="Compact"/>
         <w:numPr>
           <w:ilvl w:val="0"/>
-          <w:numId w:val="1443"/>
+          <w:numId w:val="1444"/>
         </w:numPr>
       </w:pPr>
       <w:r>
@@ -11014,7 +11080,7 @@
         <w:pStyle w:val="Compact"/>
         <w:numPr>
           <w:ilvl w:val="0"/>
-          <w:numId w:val="1444"/>
+          <w:numId w:val="1445"/>
         </w:numPr>
       </w:pPr>
       <w:r>
@@ -11026,7 +11092,7 @@
         <w:pStyle w:val="Compact"/>
         <w:numPr>
           <w:ilvl w:val="0"/>
-          <w:numId w:val="1445"/>
+          <w:numId w:val="1446"/>
         </w:numPr>
       </w:pPr>
       <w:r>
@@ -11038,7 +11104,7 @@
         <w:pStyle w:val="Compact"/>
         <w:numPr>
           <w:ilvl w:val="0"/>
-          <w:numId w:val="1446"/>
+          <w:numId w:val="1447"/>
         </w:numPr>
       </w:pPr>
       <w:r>
@@ -11050,7 +11116,7 @@
         <w:pStyle w:val="Compact"/>
         <w:numPr>
           <w:ilvl w:val="0"/>
-          <w:numId w:val="1447"/>
+          <w:numId w:val="1448"/>
         </w:numPr>
       </w:pPr>
       <w:r>
@@ -11062,7 +11128,7 @@
         <w:pStyle w:val="Compact"/>
         <w:numPr>
           <w:ilvl w:val="0"/>
-          <w:numId w:val="1448"/>
+          <w:numId w:val="1449"/>
         </w:numPr>
       </w:pPr>
       <w:r>
@@ -11074,7 +11140,7 @@
         <w:pStyle w:val="Compact"/>
         <w:numPr>
           <w:ilvl w:val="0"/>
-          <w:numId w:val="1449"/>
+          <w:numId w:val="1450"/>
         </w:numPr>
       </w:pPr>
       <w:r>
@@ -11086,7 +11152,7 @@
         <w:pStyle w:val="Compact"/>
         <w:numPr>
           <w:ilvl w:val="0"/>
-          <w:numId w:val="1450"/>
+          <w:numId w:val="1451"/>
         </w:numPr>
       </w:pPr>
       <w:r>
@@ -11118,7 +11184,7 @@
         <w:pStyle w:val="Compact"/>
         <w:numPr>
           <w:ilvl w:val="0"/>
-          <w:numId w:val="1451"/>
+          <w:numId w:val="1452"/>
         </w:numPr>
       </w:pPr>
       <w:r>
@@ -11190,7 +11256,7 @@
         <w:pStyle w:val="Compact"/>
         <w:numPr>
           <w:ilvl w:val="0"/>
-          <w:numId w:val="1452"/>
+          <w:numId w:val="1453"/>
         </w:numPr>
       </w:pPr>
       <w:r>
@@ -11202,7 +11268,7 @@
         <w:pStyle w:val="Compact"/>
         <w:numPr>
           <w:ilvl w:val="0"/>
-          <w:numId w:val="1453"/>
+          <w:numId w:val="1454"/>
         </w:numPr>
       </w:pPr>
       <w:r>
@@ -11229,7 +11295,7 @@
         <w:pStyle w:val="Compact"/>
         <w:numPr>
           <w:ilvl w:val="0"/>
-          <w:numId w:val="1454"/>
+          <w:numId w:val="1455"/>
         </w:numPr>
       </w:pPr>
       <w:r>
@@ -11283,7 +11349,7 @@
         <w:pStyle w:val="Compact"/>
         <w:numPr>
           <w:ilvl w:val="0"/>
-          <w:numId w:val="1455"/>
+          <w:numId w:val="1456"/>
         </w:numPr>
       </w:pPr>
       <w:r>
@@ -11295,7 +11361,7 @@
         <w:pStyle w:val="Compact"/>
         <w:numPr>
           <w:ilvl w:val="0"/>
-          <w:numId w:val="1456"/>
+          <w:numId w:val="1457"/>
         </w:numPr>
       </w:pPr>
       <w:r>
@@ -11317,7 +11383,7 @@
         <w:pStyle w:val="Compact"/>
         <w:numPr>
           <w:ilvl w:val="0"/>
-          <w:numId w:val="1457"/>
+          <w:numId w:val="1458"/>
         </w:numPr>
       </w:pPr>
       <w:r>
@@ -11368,7 +11434,7 @@
         <w:pStyle w:val="Compact"/>
         <w:numPr>
           <w:ilvl w:val="0"/>
-          <w:numId w:val="1458"/>
+          <w:numId w:val="1459"/>
         </w:numPr>
       </w:pPr>
       <w:r>
@@ -11395,7 +11461,7 @@
         <w:pStyle w:val="Compact"/>
         <w:numPr>
           <w:ilvl w:val="0"/>
-          <w:numId w:val="1459"/>
+          <w:numId w:val="1460"/>
         </w:numPr>
       </w:pPr>
       <w:r>
@@ -11407,7 +11473,7 @@
         <w:pStyle w:val="Compact"/>
         <w:numPr>
           <w:ilvl w:val="0"/>
-          <w:numId w:val="1460"/>
+          <w:numId w:val="1461"/>
         </w:numPr>
       </w:pPr>
       <w:r>
@@ -11434,7 +11500,7 @@
         <w:pStyle w:val="Compact"/>
         <w:numPr>
           <w:ilvl w:val="0"/>
-          <w:numId w:val="1461"/>
+          <w:numId w:val="1462"/>
         </w:numPr>
       </w:pPr>
       <w:r>
@@ -11446,7 +11512,7 @@
         <w:pStyle w:val="Compact"/>
         <w:numPr>
           <w:ilvl w:val="0"/>
-          <w:numId w:val="1462"/>
+          <w:numId w:val="1463"/>
         </w:numPr>
       </w:pPr>
       <w:r>
@@ -11458,7 +11524,7 @@
         <w:pStyle w:val="Compact"/>
         <w:numPr>
           <w:ilvl w:val="0"/>
-          <w:numId w:val="1463"/>
+          <w:numId w:val="1464"/>
         </w:numPr>
       </w:pPr>
       <w:r>
@@ -11480,7 +11546,7 @@
         <w:pStyle w:val="Compact"/>
         <w:numPr>
           <w:ilvl w:val="0"/>
-          <w:numId w:val="1464"/>
+          <w:numId w:val="1465"/>
         </w:numPr>
       </w:pPr>
       <w:r>
@@ -11504,7 +11570,7 @@
         <w:pStyle w:val="Compact"/>
         <w:numPr>
           <w:ilvl w:val="0"/>
-          <w:numId w:val="1465"/>
+          <w:numId w:val="1466"/>
         </w:numPr>
       </w:pPr>
       <w:r>
@@ -11528,7 +11594,7 @@
         <w:pStyle w:val="Compact"/>
         <w:numPr>
           <w:ilvl w:val="0"/>
-          <w:numId w:val="1466"/>
+          <w:numId w:val="1467"/>
         </w:numPr>
       </w:pPr>
       <w:r>
@@ -11540,7 +11606,7 @@
         <w:pStyle w:val="Compact"/>
         <w:numPr>
           <w:ilvl w:val="0"/>
-          <w:numId w:val="1467"/>
+          <w:numId w:val="1468"/>
         </w:numPr>
       </w:pPr>
       <w:r>
@@ -11552,7 +11618,7 @@
         <w:pStyle w:val="Compact"/>
         <w:numPr>
           <w:ilvl w:val="0"/>
-          <w:numId w:val="1468"/>
+          <w:numId w:val="1469"/>
         </w:numPr>
       </w:pPr>
       <w:r>
@@ -11564,7 +11630,7 @@
         <w:pStyle w:val="Compact"/>
         <w:numPr>
           <w:ilvl w:val="0"/>
-          <w:numId w:val="1469"/>
+          <w:numId w:val="1470"/>
         </w:numPr>
       </w:pPr>
       <w:r>
@@ -11595,7 +11661,7 @@
         <w:pStyle w:val="Compact"/>
         <w:numPr>
           <w:ilvl w:val="0"/>
-          <w:numId w:val="1470"/>
+          <w:numId w:val="1471"/>
         </w:numPr>
       </w:pPr>
       <w:r>
@@ -11607,7 +11673,7 @@
         <w:pStyle w:val="Compact"/>
         <w:numPr>
           <w:ilvl w:val="0"/>
-          <w:numId w:val="1471"/>
+          <w:numId w:val="1472"/>
         </w:numPr>
       </w:pPr>
       <w:r>
@@ -11619,7 +11685,7 @@
         <w:pStyle w:val="Compact"/>
         <w:numPr>
           <w:ilvl w:val="1"/>
-          <w:numId w:val="1472"/>
+          <w:numId w:val="1473"/>
         </w:numPr>
       </w:pPr>
       <w:r>
@@ -11637,7 +11703,7 @@
         <w:pStyle w:val="Compact"/>
         <w:numPr>
           <w:ilvl w:val="1"/>
-          <w:numId w:val="1472"/>
+          <w:numId w:val="1473"/>
         </w:numPr>
       </w:pPr>
       <w:r>
@@ -11655,7 +11721,7 @@
         <w:pStyle w:val="Compact"/>
         <w:numPr>
           <w:ilvl w:val="1"/>
-          <w:numId w:val="1472"/>
+          <w:numId w:val="1473"/>
         </w:numPr>
       </w:pPr>
       <w:r>
@@ -11673,7 +11739,7 @@
         <w:pStyle w:val="Compact"/>
         <w:numPr>
           <w:ilvl w:val="1"/>
-          <w:numId w:val="1472"/>
+          <w:numId w:val="1473"/>
         </w:numPr>
       </w:pPr>
       <w:r>
@@ -11691,7 +11757,7 @@
         <w:pStyle w:val="Compact"/>
         <w:numPr>
           <w:ilvl w:val="0"/>
-          <w:numId w:val="1473"/>
+          <w:numId w:val="1474"/>
         </w:numPr>
       </w:pPr>
       <w:r>
@@ -11703,7 +11769,7 @@
         <w:pStyle w:val="Compact"/>
         <w:numPr>
           <w:ilvl w:val="0"/>
-          <w:numId w:val="1474"/>
+          <w:numId w:val="1475"/>
         </w:numPr>
       </w:pPr>
       <w:r>
@@ -11715,7 +11781,7 @@
         <w:pStyle w:val="Compact"/>
         <w:numPr>
           <w:ilvl w:val="0"/>
-          <w:numId w:val="1475"/>
+          <w:numId w:val="1476"/>
         </w:numPr>
       </w:pPr>
       <w:r>
@@ -11737,7 +11803,7 @@
         <w:pStyle w:val="Compact"/>
         <w:numPr>
           <w:ilvl w:val="0"/>
-          <w:numId w:val="1476"/>
+          <w:numId w:val="1477"/>
         </w:numPr>
       </w:pPr>
       <w:r>
@@ -11749,7 +11815,7 @@
         <w:pStyle w:val="Compact"/>
         <w:numPr>
           <w:ilvl w:val="0"/>
-          <w:numId w:val="1477"/>
+          <w:numId w:val="1478"/>
         </w:numPr>
       </w:pPr>
       <w:r>
@@ -11761,7 +11827,7 @@
         <w:pStyle w:val="Compact"/>
         <w:numPr>
           <w:ilvl w:val="0"/>
-          <w:numId w:val="1478"/>
+          <w:numId w:val="1479"/>
         </w:numPr>
       </w:pPr>
       <w:r>
@@ -11773,7 +11839,7 @@
         <w:pStyle w:val="Compact"/>
         <w:numPr>
           <w:ilvl w:val="0"/>
-          <w:numId w:val="1479"/>
+          <w:numId w:val="1480"/>
         </w:numPr>
       </w:pPr>
       <w:r>
@@ -11785,7 +11851,7 @@
         <w:pStyle w:val="Compact"/>
         <w:numPr>
           <w:ilvl w:val="0"/>
-          <w:numId w:val="1480"/>
+          <w:numId w:val="1481"/>
         </w:numPr>
       </w:pPr>
       <w:r>
@@ -11797,7 +11863,7 @@
         <w:pStyle w:val="Compact"/>
         <w:numPr>
           <w:ilvl w:val="0"/>
-          <w:numId w:val="1481"/>
+          <w:numId w:val="1482"/>
         </w:numPr>
       </w:pPr>
       <w:r>
@@ -11809,7 +11875,7 @@
         <w:pStyle w:val="Compact"/>
         <w:numPr>
           <w:ilvl w:val="0"/>
-          <w:numId w:val="1482"/>
+          <w:numId w:val="1483"/>
         </w:numPr>
       </w:pPr>
       <w:r>
@@ -11821,7 +11887,7 @@
         <w:pStyle w:val="Compact"/>
         <w:numPr>
           <w:ilvl w:val="0"/>
-          <w:numId w:val="1483"/>
+          <w:numId w:val="1484"/>
         </w:numPr>
       </w:pPr>
       <w:r>
@@ -11833,7 +11899,7 @@
         <w:pStyle w:val="Compact"/>
         <w:numPr>
           <w:ilvl w:val="0"/>
-          <w:numId w:val="1484"/>
+          <w:numId w:val="1485"/>
         </w:numPr>
       </w:pPr>
       <w:r>
@@ -11865,7 +11931,7 @@
         <w:pStyle w:val="Compact"/>
         <w:numPr>
           <w:ilvl w:val="0"/>
-          <w:numId w:val="1485"/>
+          <w:numId w:val="1486"/>
         </w:numPr>
       </w:pPr>
       <w:r>
@@ -11892,7 +11958,7 @@
         <w:pStyle w:val="Compact"/>
         <w:numPr>
           <w:ilvl w:val="0"/>
-          <w:numId w:val="1486"/>
+          <w:numId w:val="1487"/>
         </w:numPr>
       </w:pPr>
       <w:r>
@@ -11964,7 +12030,7 @@
         <w:pStyle w:val="Compact"/>
         <w:numPr>
           <w:ilvl w:val="0"/>
-          <w:numId w:val="1487"/>
+          <w:numId w:val="1488"/>
         </w:numPr>
       </w:pPr>
       <w:r>
@@ -11991,7 +12057,7 @@
         <w:pStyle w:val="Compact"/>
         <w:numPr>
           <w:ilvl w:val="0"/>
-          <w:numId w:val="1488"/>
+          <w:numId w:val="1489"/>
         </w:numPr>
       </w:pPr>
       <w:r>
@@ -12003,7 +12069,7 @@
         <w:pStyle w:val="Compact"/>
         <w:numPr>
           <w:ilvl w:val="0"/>
-          <w:numId w:val="1489"/>
+          <w:numId w:val="1490"/>
         </w:numPr>
       </w:pPr>
       <w:r>
@@ -12030,7 +12096,7 @@
         <w:pStyle w:val="Compact"/>
         <w:numPr>
           <w:ilvl w:val="0"/>
-          <w:numId w:val="1490"/>
+          <w:numId w:val="1491"/>
         </w:numPr>
       </w:pPr>
       <w:r>
@@ -12042,7 +12108,7 @@
         <w:pStyle w:val="Compact"/>
         <w:numPr>
           <w:ilvl w:val="0"/>
-          <w:numId w:val="1491"/>
+          <w:numId w:val="1492"/>
         </w:numPr>
       </w:pPr>
       <w:r>
@@ -12069,7 +12135,7 @@
         <w:pStyle w:val="Compact"/>
         <w:numPr>
           <w:ilvl w:val="0"/>
-          <w:numId w:val="1492"/>
+          <w:numId w:val="1493"/>
         </w:numPr>
       </w:pPr>
       <w:r>
@@ -12111,7 +12177,7 @@
         <w:pStyle w:val="Compact"/>
         <w:numPr>
           <w:ilvl w:val="0"/>
-          <w:numId w:val="1493"/>
+          <w:numId w:val="1494"/>
         </w:numPr>
       </w:pPr>
       <w:r>
@@ -12147,7 +12213,7 @@
         <w:pStyle w:val="Compact"/>
         <w:numPr>
           <w:ilvl w:val="0"/>
-          <w:numId w:val="1494"/>
+          <w:numId w:val="1495"/>
         </w:numPr>
       </w:pPr>
       <w:r>
@@ -12169,7 +12235,7 @@
         <w:pStyle w:val="Compact"/>
         <w:numPr>
           <w:ilvl w:val="0"/>
-          <w:numId w:val="1495"/>
+          <w:numId w:val="1496"/>
         </w:numPr>
       </w:pPr>
       <w:r>
@@ -12181,7 +12247,7 @@
         <w:pStyle w:val="Compact"/>
         <w:numPr>
           <w:ilvl w:val="0"/>
-          <w:numId w:val="1496"/>
+          <w:numId w:val="1497"/>
         </w:numPr>
       </w:pPr>
       <w:r>
@@ -12193,7 +12259,7 @@
         <w:pStyle w:val="Compact"/>
         <w:numPr>
           <w:ilvl w:val="1"/>
-          <w:numId w:val="1497"/>
+          <w:numId w:val="1498"/>
         </w:numPr>
       </w:pPr>
       <w:r>
@@ -12205,7 +12271,7 @@
         <w:pStyle w:val="Compact"/>
         <w:numPr>
           <w:ilvl w:val="1"/>
-          <w:numId w:val="1497"/>
+          <w:numId w:val="1498"/>
         </w:numPr>
       </w:pPr>
       <w:r>
@@ -12217,7 +12283,7 @@
         <w:pStyle w:val="Compact"/>
         <w:numPr>
           <w:ilvl w:val="1"/>
-          <w:numId w:val="1497"/>
+          <w:numId w:val="1498"/>
         </w:numPr>
       </w:pPr>
       <w:r>
@@ -12229,7 +12295,7 @@
         <w:pStyle w:val="Compact"/>
         <w:numPr>
           <w:ilvl w:val="1"/>
-          <w:numId w:val="1497"/>
+          <w:numId w:val="1498"/>
         </w:numPr>
       </w:pPr>
       <w:r>
@@ -12241,7 +12307,7 @@
         <w:pStyle w:val="Compact"/>
         <w:numPr>
           <w:ilvl w:val="1"/>
-          <w:numId w:val="1497"/>
+          <w:numId w:val="1498"/>
         </w:numPr>
       </w:pPr>
       <w:r>
@@ -12253,7 +12319,7 @@
         <w:pStyle w:val="Compact"/>
         <w:numPr>
           <w:ilvl w:val="1"/>
-          <w:numId w:val="1497"/>
+          <w:numId w:val="1498"/>
         </w:numPr>
       </w:pPr>
       <w:r>
@@ -12265,7 +12331,7 @@
         <w:pStyle w:val="Compact"/>
         <w:numPr>
           <w:ilvl w:val="1"/>
-          <w:numId w:val="1497"/>
+          <w:numId w:val="1498"/>
         </w:numPr>
       </w:pPr>
       <w:r>
@@ -12277,7 +12343,7 @@
         <w:pStyle w:val="Compact"/>
         <w:numPr>
           <w:ilvl w:val="1"/>
-          <w:numId w:val="1497"/>
+          <w:numId w:val="1498"/>
         </w:numPr>
       </w:pPr>
       <w:r>
@@ -12289,7 +12355,7 @@
         <w:pStyle w:val="Compact"/>
         <w:numPr>
           <w:ilvl w:val="0"/>
-          <w:numId w:val="1498"/>
+          <w:numId w:val="1499"/>
         </w:numPr>
       </w:pPr>
       <w:r>
@@ -12310,7 +12376,7 @@
         <w:pStyle w:val="Compact"/>
         <w:numPr>
           <w:ilvl w:val="0"/>
-          <w:numId w:val="1499"/>
+          <w:numId w:val="1500"/>
         </w:numPr>
       </w:pPr>
       <w:r>
@@ -12334,7 +12400,7 @@
         <w:pStyle w:val="Compact"/>
         <w:numPr>
           <w:ilvl w:val="0"/>
-          <w:numId w:val="1500"/>
+          <w:numId w:val="1501"/>
         </w:numPr>
       </w:pPr>
       <w:r>
@@ -12346,7 +12412,7 @@
         <w:pStyle w:val="Compact"/>
         <w:numPr>
           <w:ilvl w:val="1"/>
-          <w:numId w:val="1501"/>
+          <w:numId w:val="1502"/>
         </w:numPr>
       </w:pPr>
       <w:r>
@@ -12358,7 +12424,7 @@
         <w:pStyle w:val="Compact"/>
         <w:numPr>
           <w:ilvl w:val="1"/>
-          <w:numId w:val="1501"/>
+          <w:numId w:val="1502"/>
         </w:numPr>
       </w:pPr>
       <w:r>
@@ -12370,7 +12436,7 @@
         <w:pStyle w:val="Compact"/>
         <w:numPr>
           <w:ilvl w:val="1"/>
-          <w:numId w:val="1501"/>
+          <w:numId w:val="1502"/>
         </w:numPr>
       </w:pPr>
       <w:r>
@@ -12382,7 +12448,7 @@
         <w:pStyle w:val="Compact"/>
         <w:numPr>
           <w:ilvl w:val="0"/>
-          <w:numId w:val="1502"/>
+          <w:numId w:val="1503"/>
         </w:numPr>
       </w:pPr>
       <w:r>
@@ -12406,7 +12472,7 @@
         <w:pStyle w:val="Compact"/>
         <w:numPr>
           <w:ilvl w:val="0"/>
-          <w:numId w:val="1503"/>
+          <w:numId w:val="1504"/>
         </w:numPr>
       </w:pPr>
       <w:r>
@@ -12418,7 +12484,7 @@
         <w:pStyle w:val="Compact"/>
         <w:numPr>
           <w:ilvl w:val="0"/>
-          <w:numId w:val="1504"/>
+          <w:numId w:val="1505"/>
         </w:numPr>
       </w:pPr>
       <w:r>
@@ -12430,7 +12496,7 @@
         <w:pStyle w:val="Compact"/>
         <w:numPr>
           <w:ilvl w:val="0"/>
-          <w:numId w:val="1505"/>
+          <w:numId w:val="1506"/>
         </w:numPr>
       </w:pPr>
       <w:r>
@@ -12452,7 +12518,7 @@
         <w:pStyle w:val="Compact"/>
         <w:numPr>
           <w:ilvl w:val="0"/>
-          <w:numId w:val="1506"/>
+          <w:numId w:val="1507"/>
         </w:numPr>
       </w:pPr>
       <w:r>
@@ -12464,7 +12530,7 @@
         <w:pStyle w:val="Compact"/>
         <w:numPr>
           <w:ilvl w:val="1"/>
-          <w:numId w:val="1507"/>
+          <w:numId w:val="1508"/>
         </w:numPr>
       </w:pPr>
       <w:r>
@@ -12476,7 +12542,7 @@
         <w:pStyle w:val="Compact"/>
         <w:numPr>
           <w:ilvl w:val="1"/>
-          <w:numId w:val="1507"/>
+          <w:numId w:val="1508"/>
         </w:numPr>
       </w:pPr>
       <w:r>
@@ -12488,7 +12554,7 @@
         <w:pStyle w:val="Compact"/>
         <w:numPr>
           <w:ilvl w:val="1"/>
-          <w:numId w:val="1507"/>
+          <w:numId w:val="1508"/>
         </w:numPr>
       </w:pPr>
       <w:r>
@@ -12500,7 +12566,7 @@
         <w:pStyle w:val="Compact"/>
         <w:numPr>
           <w:ilvl w:val="0"/>
-          <w:numId w:val="1508"/>
+          <w:numId w:val="1509"/>
         </w:numPr>
       </w:pPr>
       <w:r>
@@ -12512,7 +12578,7 @@
         <w:pStyle w:val="Compact"/>
         <w:numPr>
           <w:ilvl w:val="1"/>
-          <w:numId w:val="1509"/>
+          <w:numId w:val="1510"/>
         </w:numPr>
       </w:pPr>
       <w:r>
@@ -12524,7 +12590,7 @@
         <w:pStyle w:val="Compact"/>
         <w:numPr>
           <w:ilvl w:val="1"/>
-          <w:numId w:val="1509"/>
+          <w:numId w:val="1510"/>
         </w:numPr>
       </w:pPr>
       <w:r>
@@ -12536,7 +12602,7 @@
         <w:pStyle w:val="Compact"/>
         <w:numPr>
           <w:ilvl w:val="1"/>
-          <w:numId w:val="1509"/>
+          <w:numId w:val="1510"/>
         </w:numPr>
       </w:pPr>
       <w:r>
@@ -12548,7 +12614,7 @@
         <w:pStyle w:val="Compact"/>
         <w:numPr>
           <w:ilvl w:val="0"/>
-          <w:numId w:val="1510"/>
+          <w:numId w:val="1511"/>
         </w:numPr>
       </w:pPr>
       <w:r>
@@ -12560,7 +12626,7 @@
         <w:pStyle w:val="Compact"/>
         <w:numPr>
           <w:ilvl w:val="0"/>
-          <w:numId w:val="1511"/>
+          <w:numId w:val="1512"/>
         </w:numPr>
       </w:pPr>
       <w:r>
@@ -12572,7 +12638,7 @@
         <w:pStyle w:val="Compact"/>
         <w:numPr>
           <w:ilvl w:val="0"/>
-          <w:numId w:val="1512"/>
+          <w:numId w:val="1513"/>
         </w:numPr>
       </w:pPr>
       <w:r>
@@ -12594,7 +12660,7 @@
         <w:pStyle w:val="Compact"/>
         <w:numPr>
           <w:ilvl w:val="0"/>
-          <w:numId w:val="1513"/>
+          <w:numId w:val="1514"/>
         </w:numPr>
       </w:pPr>
       <w:r>
@@ -12615,7 +12681,7 @@
         <w:pStyle w:val="Compact"/>
         <w:numPr>
           <w:ilvl w:val="0"/>
-          <w:numId w:val="1514"/>
+          <w:numId w:val="1515"/>
         </w:numPr>
       </w:pPr>
       <w:r>
@@ -12627,7 +12693,7 @@
         <w:pStyle w:val="Compact"/>
         <w:numPr>
           <w:ilvl w:val="0"/>
-          <w:numId w:val="1515"/>
+          <w:numId w:val="1516"/>
         </w:numPr>
       </w:pPr>
       <w:r>
@@ -12639,7 +12705,7 @@
         <w:pStyle w:val="Compact"/>
         <w:numPr>
           <w:ilvl w:val="0"/>
-          <w:numId w:val="1516"/>
+          <w:numId w:val="1517"/>
         </w:numPr>
       </w:pPr>
       <w:r>
@@ -12651,7 +12717,7 @@
         <w:pStyle w:val="Compact"/>
         <w:numPr>
           <w:ilvl w:val="0"/>
-          <w:numId w:val="1517"/>
+          <w:numId w:val="1518"/>
         </w:numPr>
       </w:pPr>
       <w:r>
@@ -12663,7 +12729,7 @@
         <w:pStyle w:val="Compact"/>
         <w:numPr>
           <w:ilvl w:val="0"/>
-          <w:numId w:val="1518"/>
+          <w:numId w:val="1519"/>
         </w:numPr>
       </w:pPr>
       <w:r>
@@ -12675,7 +12741,7 @@
         <w:pStyle w:val="Compact"/>
         <w:numPr>
           <w:ilvl w:val="1"/>
-          <w:numId w:val="1519"/>
+          <w:numId w:val="1520"/>
         </w:numPr>
       </w:pPr>
       <w:r>
@@ -12687,7 +12753,7 @@
         <w:pStyle w:val="Compact"/>
         <w:numPr>
           <w:ilvl w:val="1"/>
-          <w:numId w:val="1519"/>
+          <w:numId w:val="1520"/>
         </w:numPr>
       </w:pPr>
       <w:r>
@@ -12699,7 +12765,7 @@
         <w:pStyle w:val="Compact"/>
         <w:numPr>
           <w:ilvl w:val="1"/>
-          <w:numId w:val="1519"/>
+          <w:numId w:val="1520"/>
         </w:numPr>
       </w:pPr>
       <w:r>
@@ -12711,7 +12777,7 @@
         <w:pStyle w:val="Compact"/>
         <w:numPr>
           <w:ilvl w:val="1"/>
-          <w:numId w:val="1519"/>
+          <w:numId w:val="1520"/>
         </w:numPr>
       </w:pPr>
       <w:r>
@@ -12723,7 +12789,7 @@
         <w:pStyle w:val="Compact"/>
         <w:numPr>
           <w:ilvl w:val="1"/>
-          <w:numId w:val="1519"/>
+          <w:numId w:val="1520"/>
         </w:numPr>
       </w:pPr>
       <w:r>
@@ -12735,7 +12801,7 @@
         <w:pStyle w:val="Compact"/>
         <w:numPr>
           <w:ilvl w:val="1"/>
-          <w:numId w:val="1519"/>
+          <w:numId w:val="1520"/>
         </w:numPr>
       </w:pPr>
       <w:r>
@@ -12747,7 +12813,7 @@
         <w:pStyle w:val="Compact"/>
         <w:numPr>
           <w:ilvl w:val="0"/>
-          <w:numId w:val="1520"/>
+          <w:numId w:val="1521"/>
         </w:numPr>
       </w:pPr>
       <w:r>
@@ -12759,7 +12825,7 @@
         <w:pStyle w:val="Compact"/>
         <w:numPr>
           <w:ilvl w:val="0"/>
-          <w:numId w:val="1521"/>
+          <w:numId w:val="1522"/>
         </w:numPr>
       </w:pPr>
       <w:r>
@@ -12781,7 +12847,7 @@
         <w:pStyle w:val="Compact"/>
         <w:numPr>
           <w:ilvl w:val="0"/>
-          <w:numId w:val="1522"/>
+          <w:numId w:val="1523"/>
         </w:numPr>
       </w:pPr>
       <w:r>
@@ -12793,7 +12859,7 @@
         <w:pStyle w:val="Compact"/>
         <w:numPr>
           <w:ilvl w:val="0"/>
-          <w:numId w:val="1523"/>
+          <w:numId w:val="1524"/>
         </w:numPr>
       </w:pPr>
       <w:r>
@@ -12805,7 +12871,7 @@
         <w:pStyle w:val="Compact"/>
         <w:numPr>
           <w:ilvl w:val="0"/>
-          <w:numId w:val="1524"/>
+          <w:numId w:val="1525"/>
         </w:numPr>
       </w:pPr>
       <w:r>
@@ -12817,7 +12883,7 @@
         <w:pStyle w:val="Compact"/>
         <w:numPr>
           <w:ilvl w:val="0"/>
-          <w:numId w:val="1525"/>
+          <w:numId w:val="1526"/>
         </w:numPr>
       </w:pPr>
       <w:r>
@@ -12829,7 +12895,7 @@
         <w:pStyle w:val="Compact"/>
         <w:numPr>
           <w:ilvl w:val="0"/>
-          <w:numId w:val="1526"/>
+          <w:numId w:val="1527"/>
         </w:numPr>
       </w:pPr>
       <w:r>
@@ -12851,7 +12917,7 @@
         <w:pStyle w:val="Compact"/>
         <w:numPr>
           <w:ilvl w:val="0"/>
-          <w:numId w:val="1527"/>
+          <w:numId w:val="1528"/>
         </w:numPr>
       </w:pPr>
       <w:r>
@@ -12863,7 +12929,7 @@
         <w:pStyle w:val="Compact"/>
         <w:numPr>
           <w:ilvl w:val="0"/>
-          <w:numId w:val="1528"/>
+          <w:numId w:val="1529"/>
         </w:numPr>
       </w:pPr>
       <w:r>
@@ -12875,7 +12941,7 @@
         <w:pStyle w:val="Compact"/>
         <w:numPr>
           <w:ilvl w:val="0"/>
-          <w:numId w:val="1529"/>
+          <w:numId w:val="1530"/>
         </w:numPr>
       </w:pPr>
       <w:r>
@@ -12887,7 +12953,7 @@
         <w:pStyle w:val="Compact"/>
         <w:numPr>
           <w:ilvl w:val="0"/>
-          <w:numId w:val="1530"/>
+          <w:numId w:val="1531"/>
         </w:numPr>
       </w:pPr>
       <w:r>
@@ -12899,7 +12965,7 @@
         <w:pStyle w:val="Compact"/>
         <w:numPr>
           <w:ilvl w:val="0"/>
-          <w:numId w:val="1531"/>
+          <w:numId w:val="1532"/>
         </w:numPr>
       </w:pPr>
       <w:r>
@@ -12911,7 +12977,7 @@
         <w:pStyle w:val="Compact"/>
         <w:numPr>
           <w:ilvl w:val="0"/>
-          <w:numId w:val="1532"/>
+          <w:numId w:val="1533"/>
         </w:numPr>
       </w:pPr>
       <w:r>
@@ -12923,7 +12989,7 @@
         <w:pStyle w:val="Compact"/>
         <w:numPr>
           <w:ilvl w:val="0"/>
-          <w:numId w:val="1533"/>
+          <w:numId w:val="1534"/>
         </w:numPr>
       </w:pPr>
       <w:r>
@@ -12935,7 +13001,7 @@
         <w:pStyle w:val="Compact"/>
         <w:numPr>
           <w:ilvl w:val="0"/>
-          <w:numId w:val="1534"/>
+          <w:numId w:val="1535"/>
         </w:numPr>
       </w:pPr>
       <w:r>
@@ -12967,7 +13033,7 @@
         <w:pStyle w:val="Compact"/>
         <w:numPr>
           <w:ilvl w:val="0"/>
-          <w:numId w:val="1535"/>
+          <w:numId w:val="1536"/>
         </w:numPr>
       </w:pPr>
       <w:r>
@@ -13015,7 +13081,7 @@
         <w:pStyle w:val="Compact"/>
         <w:numPr>
           <w:ilvl w:val="0"/>
-          <w:numId w:val="1536"/>
+          <w:numId w:val="1537"/>
         </w:numPr>
       </w:pPr>
       <w:r>
@@ -13027,7 +13093,7 @@
         <w:pStyle w:val="Compact"/>
         <w:numPr>
           <w:ilvl w:val="0"/>
-          <w:numId w:val="1537"/>
+          <w:numId w:val="1538"/>
         </w:numPr>
       </w:pPr>
       <w:r>
@@ -13039,7 +13105,7 @@
         <w:pStyle w:val="Compact"/>
         <w:numPr>
           <w:ilvl w:val="0"/>
-          <w:numId w:val="1538"/>
+          <w:numId w:val="1539"/>
         </w:numPr>
       </w:pPr>
       <w:r>
@@ -13051,7 +13117,7 @@
         <w:pStyle w:val="Compact"/>
         <w:numPr>
           <w:ilvl w:val="0"/>
-          <w:numId w:val="1539"/>
+          <w:numId w:val="1540"/>
         </w:numPr>
       </w:pPr>
       <w:r>
@@ -13063,7 +13129,7 @@
         <w:pStyle w:val="Compact"/>
         <w:numPr>
           <w:ilvl w:val="0"/>
-          <w:numId w:val="1540"/>
+          <w:numId w:val="1541"/>
         </w:numPr>
       </w:pPr>
       <w:r>
@@ -13117,7 +13183,7 @@
         <w:pStyle w:val="Compact"/>
         <w:numPr>
           <w:ilvl w:val="0"/>
-          <w:numId w:val="1541"/>
+          <w:numId w:val="1542"/>
         </w:numPr>
       </w:pPr>
       <w:r>
@@ -13129,7 +13195,7 @@
         <w:pStyle w:val="Compact"/>
         <w:numPr>
           <w:ilvl w:val="0"/>
-          <w:numId w:val="1542"/>
+          <w:numId w:val="1543"/>
         </w:numPr>
       </w:pPr>
       <w:r>
@@ -13156,7 +13222,7 @@
         <w:pStyle w:val="Compact"/>
         <w:numPr>
           <w:ilvl w:val="0"/>
-          <w:numId w:val="1543"/>
+          <w:numId w:val="1544"/>
         </w:numPr>
       </w:pPr>
       <w:r>
@@ -13198,7 +13264,7 @@
         <w:pStyle w:val="Compact"/>
         <w:numPr>
           <w:ilvl w:val="0"/>
-          <w:numId w:val="1544"/>
+          <w:numId w:val="1545"/>
         </w:numPr>
       </w:pPr>
       <w:r>
@@ -13225,7 +13291,7 @@
         <w:pStyle w:val="Compact"/>
         <w:numPr>
           <w:ilvl w:val="0"/>
-          <w:numId w:val="1545"/>
+          <w:numId w:val="1546"/>
         </w:numPr>
       </w:pPr>
       <w:r>
@@ -13237,7 +13303,7 @@
         <w:pStyle w:val="Compact"/>
         <w:numPr>
           <w:ilvl w:val="0"/>
-          <w:numId w:val="1546"/>
+          <w:numId w:val="1547"/>
         </w:numPr>
       </w:pPr>
       <w:r>
@@ -13249,7 +13315,7 @@
         <w:pStyle w:val="Compact"/>
         <w:numPr>
           <w:ilvl w:val="0"/>
-          <w:numId w:val="1547"/>
+          <w:numId w:val="1548"/>
         </w:numPr>
       </w:pPr>
       <w:r>
@@ -13286,7 +13352,7 @@
         <w:pStyle w:val="Compact"/>
         <w:numPr>
           <w:ilvl w:val="0"/>
-          <w:numId w:val="1548"/>
+          <w:numId w:val="1549"/>
         </w:numPr>
       </w:pPr>
       <w:r>
@@ -13298,7 +13364,7 @@
         <w:pStyle w:val="Compact"/>
         <w:numPr>
           <w:ilvl w:val="0"/>
-          <w:numId w:val="1549"/>
+          <w:numId w:val="1550"/>
         </w:numPr>
       </w:pPr>
       <w:r>
@@ -13310,7 +13376,7 @@
         <w:pStyle w:val="Compact"/>
         <w:numPr>
           <w:ilvl w:val="0"/>
-          <w:numId w:val="1550"/>
+          <w:numId w:val="1551"/>
         </w:numPr>
       </w:pPr>
       <w:r>
@@ -13322,7 +13388,7 @@
         <w:pStyle w:val="Compact"/>
         <w:numPr>
           <w:ilvl w:val="0"/>
-          <w:numId w:val="1551"/>
+          <w:numId w:val="1552"/>
         </w:numPr>
       </w:pPr>
       <w:r>
@@ -13334,7 +13400,7 @@
         <w:pStyle w:val="Compact"/>
         <w:numPr>
           <w:ilvl w:val="0"/>
-          <w:numId w:val="1552"/>
+          <w:numId w:val="1553"/>
         </w:numPr>
       </w:pPr>
       <w:r>
@@ -13346,7 +13412,7 @@
         <w:pStyle w:val="Compact"/>
         <w:numPr>
           <w:ilvl w:val="0"/>
-          <w:numId w:val="1553"/>
+          <w:numId w:val="1554"/>
         </w:numPr>
       </w:pPr>
       <w:r>
@@ -13358,7 +13424,7 @@
         <w:pStyle w:val="Compact"/>
         <w:numPr>
           <w:ilvl w:val="1"/>
-          <w:numId w:val="1554"/>
+          <w:numId w:val="1555"/>
         </w:numPr>
       </w:pPr>
       <w:r>
@@ -13385,7 +13451,7 @@
         <w:pStyle w:val="Compact"/>
         <w:numPr>
           <w:ilvl w:val="1"/>
-          <w:numId w:val="1554"/>
+          <w:numId w:val="1555"/>
         </w:numPr>
       </w:pPr>
       <w:r>
@@ -13422,7 +13488,7 @@
         <w:pStyle w:val="Compact"/>
         <w:numPr>
           <w:ilvl w:val="0"/>
-          <w:numId w:val="1555"/>
+          <w:numId w:val="1556"/>
         </w:numPr>
       </w:pPr>
       <w:r>
@@ -13464,7 +13530,7 @@
         <w:pStyle w:val="Compact"/>
         <w:numPr>
           <w:ilvl w:val="0"/>
-          <w:numId w:val="1556"/>
+          <w:numId w:val="1557"/>
         </w:numPr>
       </w:pPr>
       <w:r>
@@ -13488,7 +13554,7 @@
         <w:pStyle w:val="Compact"/>
         <w:numPr>
           <w:ilvl w:val="0"/>
-          <w:numId w:val="1557"/>
+          <w:numId w:val="1558"/>
         </w:numPr>
       </w:pPr>
       <w:r>
@@ -13512,7 +13578,7 @@
         <w:pStyle w:val="Compact"/>
         <w:numPr>
           <w:ilvl w:val="0"/>
-          <w:numId w:val="1558"/>
+          <w:numId w:val="1559"/>
         </w:numPr>
       </w:pPr>
       <w:r>
@@ -13524,7 +13590,7 @@
         <w:pStyle w:val="Compact"/>
         <w:numPr>
           <w:ilvl w:val="0"/>
-          <w:numId w:val="1559"/>
+          <w:numId w:val="1560"/>
         </w:numPr>
       </w:pPr>
       <w:r>
@@ -13536,7 +13602,7 @@
         <w:pStyle w:val="Compact"/>
         <w:numPr>
           <w:ilvl w:val="0"/>
-          <w:numId w:val="1560"/>
+          <w:numId w:val="1561"/>
         </w:numPr>
       </w:pPr>
       <w:r>
@@ -13548,7 +13614,7 @@
         <w:pStyle w:val="Compact"/>
         <w:numPr>
           <w:ilvl w:val="0"/>
-          <w:numId w:val="1561"/>
+          <w:numId w:val="1562"/>
         </w:numPr>
       </w:pPr>
       <w:r>
@@ -13560,7 +13626,7 @@
         <w:pStyle w:val="Compact"/>
         <w:numPr>
           <w:ilvl w:val="0"/>
-          <w:numId w:val="1562"/>
+          <w:numId w:val="1563"/>
         </w:numPr>
       </w:pPr>
       <w:r>
@@ -13572,7 +13638,7 @@
         <w:pStyle w:val="Compact"/>
         <w:numPr>
           <w:ilvl w:val="0"/>
-          <w:numId w:val="1563"/>
+          <w:numId w:val="1564"/>
         </w:numPr>
       </w:pPr>
       <w:r>
@@ -13584,7 +13650,7 @@
         <w:pStyle w:val="Compact"/>
         <w:numPr>
           <w:ilvl w:val="0"/>
-          <w:numId w:val="1564"/>
+          <w:numId w:val="1565"/>
         </w:numPr>
       </w:pPr>
       <w:r>
@@ -13596,7 +13662,7 @@
         <w:pStyle w:val="Compact"/>
         <w:numPr>
           <w:ilvl w:val="0"/>
-          <w:numId w:val="1565"/>
+          <w:numId w:val="1566"/>
         </w:numPr>
       </w:pPr>
       <w:r>
@@ -13608,7 +13674,7 @@
         <w:pStyle w:val="Compact"/>
         <w:numPr>
           <w:ilvl w:val="0"/>
-          <w:numId w:val="1566"/>
+          <w:numId w:val="1567"/>
         </w:numPr>
       </w:pPr>
       <w:r>
@@ -13620,7 +13686,7 @@
         <w:pStyle w:val="Compact"/>
         <w:numPr>
           <w:ilvl w:val="0"/>
-          <w:numId w:val="1567"/>
+          <w:numId w:val="1568"/>
         </w:numPr>
       </w:pPr>
       <w:r>
@@ -13632,7 +13698,7 @@
         <w:pStyle w:val="Compact"/>
         <w:numPr>
           <w:ilvl w:val="0"/>
-          <w:numId w:val="1568"/>
+          <w:numId w:val="1569"/>
         </w:numPr>
       </w:pPr>
       <w:r>
@@ -13659,7 +13725,7 @@
         <w:pStyle w:val="Compact"/>
         <w:numPr>
           <w:ilvl w:val="0"/>
-          <w:numId w:val="1569"/>
+          <w:numId w:val="1570"/>
         </w:numPr>
       </w:pPr>
       <w:r>
@@ -13671,7 +13737,7 @@
         <w:pStyle w:val="Compact"/>
         <w:numPr>
           <w:ilvl w:val="0"/>
-          <w:numId w:val="1570"/>
+          <w:numId w:val="1571"/>
         </w:numPr>
       </w:pPr>
       <w:r>
@@ -13693,7 +13759,7 @@
         <w:pStyle w:val="Compact"/>
         <w:numPr>
           <w:ilvl w:val="0"/>
-          <w:numId w:val="1571"/>
+          <w:numId w:val="1572"/>
         </w:numPr>
       </w:pPr>
       <w:r>
@@ -13705,7 +13771,7 @@
         <w:pStyle w:val="Compact"/>
         <w:numPr>
           <w:ilvl w:val="0"/>
-          <w:numId w:val="1572"/>
+          <w:numId w:val="1573"/>
         </w:numPr>
       </w:pPr>
       <w:r>
@@ -13732,7 +13798,7 @@
         <w:pStyle w:val="Compact"/>
         <w:numPr>
           <w:ilvl w:val="0"/>
-          <w:numId w:val="1573"/>
+          <w:numId w:val="1574"/>
         </w:numPr>
       </w:pPr>
       <w:r>
@@ -13759,7 +13825,7 @@
         <w:pStyle w:val="Compact"/>
         <w:numPr>
           <w:ilvl w:val="0"/>
-          <w:numId w:val="1574"/>
+          <w:numId w:val="1575"/>
         </w:numPr>
       </w:pPr>
       <w:r>
@@ -13786,7 +13852,7 @@
         <w:pStyle w:val="Compact"/>
         <w:numPr>
           <w:ilvl w:val="0"/>
-          <w:numId w:val="1575"/>
+          <w:numId w:val="1576"/>
         </w:numPr>
       </w:pPr>
       <w:r>
@@ -13798,7 +13864,7 @@
         <w:pStyle w:val="Compact"/>
         <w:numPr>
           <w:ilvl w:val="1"/>
-          <w:numId w:val="1576"/>
+          <w:numId w:val="1577"/>
         </w:numPr>
       </w:pPr>
       <w:r>
@@ -13810,7 +13876,7 @@
         <w:pStyle w:val="Compact"/>
         <w:numPr>
           <w:ilvl w:val="1"/>
-          <w:numId w:val="1576"/>
+          <w:numId w:val="1577"/>
         </w:numPr>
       </w:pPr>
       <w:r>
@@ -13822,7 +13888,7 @@
         <w:pStyle w:val="Compact"/>
         <w:numPr>
           <w:ilvl w:val="1"/>
-          <w:numId w:val="1576"/>
+          <w:numId w:val="1577"/>
         </w:numPr>
       </w:pPr>
       <w:r>
@@ -13834,7 +13900,7 @@
         <w:pStyle w:val="Compact"/>
         <w:numPr>
           <w:ilvl w:val="0"/>
-          <w:numId w:val="1577"/>
+          <w:numId w:val="1578"/>
         </w:numPr>
       </w:pPr>
       <w:r>
@@ -13846,7 +13912,7 @@
         <w:pStyle w:val="Compact"/>
         <w:numPr>
           <w:ilvl w:val="0"/>
-          <w:numId w:val="1578"/>
+          <w:numId w:val="1579"/>
         </w:numPr>
       </w:pPr>
       <w:r>
@@ -13858,7 +13924,7 @@
         <w:pStyle w:val="Compact"/>
         <w:numPr>
           <w:ilvl w:val="1"/>
-          <w:numId w:val="1579"/>
+          <w:numId w:val="1580"/>
         </w:numPr>
       </w:pPr>
       <w:r>
@@ -13870,7 +13936,7 @@
         <w:pStyle w:val="Compact"/>
         <w:numPr>
           <w:ilvl w:val="1"/>
-          <w:numId w:val="1579"/>
+          <w:numId w:val="1580"/>
         </w:numPr>
       </w:pPr>
       <w:r>
@@ -13882,7 +13948,7 @@
         <w:pStyle w:val="Compact"/>
         <w:numPr>
           <w:ilvl w:val="1"/>
-          <w:numId w:val="1579"/>
+          <w:numId w:val="1580"/>
         </w:numPr>
       </w:pPr>
       <w:r>
@@ -13894,7 +13960,7 @@
         <w:pStyle w:val="Compact"/>
         <w:numPr>
           <w:ilvl w:val="1"/>
-          <w:numId w:val="1579"/>
+          <w:numId w:val="1580"/>
         </w:numPr>
       </w:pPr>
       <w:r>
@@ -13906,7 +13972,7 @@
         <w:pStyle w:val="Compact"/>
         <w:numPr>
           <w:ilvl w:val="1"/>
-          <w:numId w:val="1579"/>
+          <w:numId w:val="1580"/>
         </w:numPr>
       </w:pPr>
       <w:r>
@@ -13918,7 +13984,7 @@
         <w:pStyle w:val="Compact"/>
         <w:numPr>
           <w:ilvl w:val="1"/>
-          <w:numId w:val="1579"/>
+          <w:numId w:val="1580"/>
         </w:numPr>
       </w:pPr>
       <w:r>
@@ -13930,7 +13996,7 @@
         <w:pStyle w:val="Compact"/>
         <w:numPr>
           <w:ilvl w:val="0"/>
-          <w:numId w:val="1580"/>
+          <w:numId w:val="1581"/>
         </w:numPr>
       </w:pPr>
       <w:r>
@@ -13942,7 +14008,7 @@
         <w:pStyle w:val="Compact"/>
         <w:numPr>
           <w:ilvl w:val="0"/>
-          <w:numId w:val="1581"/>
+          <w:numId w:val="1582"/>
         </w:numPr>
       </w:pPr>
       <w:r>
@@ -13954,7 +14020,7 @@
         <w:pStyle w:val="Compact"/>
         <w:numPr>
           <w:ilvl w:val="0"/>
-          <w:numId w:val="1582"/>
+          <w:numId w:val="1583"/>
         </w:numPr>
       </w:pPr>
       <w:r>
@@ -13976,7 +14042,7 @@
         <w:pStyle w:val="Compact"/>
         <w:numPr>
           <w:ilvl w:val="0"/>
-          <w:numId w:val="1583"/>
+          <w:numId w:val="1584"/>
         </w:numPr>
       </w:pPr>
       <w:r>
@@ -13988,7 +14054,7 @@
         <w:pStyle w:val="Compact"/>
         <w:numPr>
           <w:ilvl w:val="0"/>
-          <w:numId w:val="1584"/>
+          <w:numId w:val="1585"/>
         </w:numPr>
       </w:pPr>
       <w:r>
@@ -14000,7 +14066,7 @@
         <w:pStyle w:val="Compact"/>
         <w:numPr>
           <w:ilvl w:val="0"/>
-          <w:numId w:val="1585"/>
+          <w:numId w:val="1586"/>
         </w:numPr>
       </w:pPr>
       <w:r>
@@ -14012,7 +14078,7 @@
         <w:pStyle w:val="Compact"/>
         <w:numPr>
           <w:ilvl w:val="0"/>
-          <w:numId w:val="1586"/>
+          <w:numId w:val="1587"/>
         </w:numPr>
       </w:pPr>
       <w:r>
@@ -14024,7 +14090,7 @@
         <w:pStyle w:val="Compact"/>
         <w:numPr>
           <w:ilvl w:val="0"/>
-          <w:numId w:val="1587"/>
+          <w:numId w:val="1588"/>
         </w:numPr>
       </w:pPr>
       <w:r>
@@ -14036,7 +14102,7 @@
         <w:pStyle w:val="Compact"/>
         <w:numPr>
           <w:ilvl w:val="0"/>
-          <w:numId w:val="1588"/>
+          <w:numId w:val="1589"/>
         </w:numPr>
       </w:pPr>
       <w:r>
@@ -14058,7 +14124,7 @@
         <w:pStyle w:val="Compact"/>
         <w:numPr>
           <w:ilvl w:val="0"/>
-          <w:numId w:val="1589"/>
+          <w:numId w:val="1590"/>
         </w:numPr>
       </w:pPr>
       <w:r>
@@ -14070,7 +14136,7 @@
         <w:pStyle w:val="Compact"/>
         <w:numPr>
           <w:ilvl w:val="1"/>
-          <w:numId w:val="1590"/>
+          <w:numId w:val="1591"/>
         </w:numPr>
       </w:pPr>
       <w:r>
@@ -14082,7 +14148,7 @@
         <w:pStyle w:val="Compact"/>
         <w:numPr>
           <w:ilvl w:val="1"/>
-          <w:numId w:val="1590"/>
+          <w:numId w:val="1591"/>
         </w:numPr>
       </w:pPr>
       <w:r>
@@ -14094,7 +14160,7 @@
         <w:pStyle w:val="Compact"/>
         <w:numPr>
           <w:ilvl w:val="0"/>
-          <w:numId w:val="1591"/>
+          <w:numId w:val="1592"/>
         </w:numPr>
       </w:pPr>
       <w:r>
@@ -14106,7 +14172,7 @@
         <w:pStyle w:val="Compact"/>
         <w:numPr>
           <w:ilvl w:val="1"/>
-          <w:numId w:val="1592"/>
+          <w:numId w:val="1593"/>
         </w:numPr>
       </w:pPr>
       <w:r>
@@ -14118,7 +14184,7 @@
         <w:pStyle w:val="Compact"/>
         <w:numPr>
           <w:ilvl w:val="1"/>
-          <w:numId w:val="1592"/>
+          <w:numId w:val="1593"/>
         </w:numPr>
       </w:pPr>
       <w:r>
@@ -14130,7 +14196,7 @@
         <w:pStyle w:val="Compact"/>
         <w:numPr>
           <w:ilvl w:val="0"/>
-          <w:numId w:val="1593"/>
+          <w:numId w:val="1594"/>
         </w:numPr>
       </w:pPr>
       <w:r>
@@ -14142,7 +14208,7 @@
         <w:pStyle w:val="Compact"/>
         <w:numPr>
           <w:ilvl w:val="0"/>
-          <w:numId w:val="1594"/>
+          <w:numId w:val="1595"/>
         </w:numPr>
       </w:pPr>
       <w:r>
@@ -14154,7 +14220,7 @@
         <w:pStyle w:val="Compact"/>
         <w:numPr>
           <w:ilvl w:val="0"/>
-          <w:numId w:val="1595"/>
+          <w:numId w:val="1596"/>
         </w:numPr>
       </w:pPr>
       <w:r>
@@ -14166,7 +14232,7 @@
         <w:pStyle w:val="Compact"/>
         <w:numPr>
           <w:ilvl w:val="0"/>
-          <w:numId w:val="1596"/>
+          <w:numId w:val="1597"/>
         </w:numPr>
       </w:pPr>
       <w:r>
@@ -14188,7 +14254,7 @@
         <w:pStyle w:val="Compact"/>
         <w:numPr>
           <w:ilvl w:val="0"/>
-          <w:numId w:val="1597"/>
+          <w:numId w:val="1598"/>
         </w:numPr>
       </w:pPr>
       <w:r>
@@ -14200,7 +14266,7 @@
         <w:pStyle w:val="Compact"/>
         <w:numPr>
           <w:ilvl w:val="0"/>
-          <w:numId w:val="1598"/>
+          <w:numId w:val="1599"/>
         </w:numPr>
       </w:pPr>
       <w:r>
@@ -14212,7 +14278,7 @@
         <w:pStyle w:val="Compact"/>
         <w:numPr>
           <w:ilvl w:val="0"/>
-          <w:numId w:val="1599"/>
+          <w:numId w:val="1600"/>
         </w:numPr>
       </w:pPr>
       <w:r>
@@ -14224,7 +14290,7 @@
         <w:pStyle w:val="Compact"/>
         <w:numPr>
           <w:ilvl w:val="0"/>
-          <w:numId w:val="1600"/>
+          <w:numId w:val="1601"/>
         </w:numPr>
       </w:pPr>
       <w:r>
@@ -14236,7 +14302,7 @@
         <w:pStyle w:val="Compact"/>
         <w:numPr>
           <w:ilvl w:val="0"/>
-          <w:numId w:val="1601"/>
+          <w:numId w:val="1602"/>
         </w:numPr>
       </w:pPr>
       <w:r>
@@ -14248,7 +14314,7 @@
         <w:pStyle w:val="Compact"/>
         <w:numPr>
           <w:ilvl w:val="0"/>
-          <w:numId w:val="1602"/>
+          <w:numId w:val="1603"/>
         </w:numPr>
       </w:pPr>
       <w:r>
@@ -14260,7 +14326,7 @@
         <w:pStyle w:val="Compact"/>
         <w:numPr>
           <w:ilvl w:val="0"/>
-          <w:numId w:val="1603"/>
+          <w:numId w:val="1604"/>
         </w:numPr>
       </w:pPr>
       <w:r>
@@ -14272,7 +14338,7 @@
         <w:pStyle w:val="Compact"/>
         <w:numPr>
           <w:ilvl w:val="0"/>
-          <w:numId w:val="1604"/>
+          <w:numId w:val="1605"/>
         </w:numPr>
       </w:pPr>
       <w:r>
@@ -14284,7 +14350,7 @@
         <w:pStyle w:val="Compact"/>
         <w:numPr>
           <w:ilvl w:val="0"/>
-          <w:numId w:val="1605"/>
+          <w:numId w:val="1606"/>
         </w:numPr>
       </w:pPr>
       <w:r>
@@ -14306,7 +14372,7 @@
         <w:pStyle w:val="Compact"/>
         <w:numPr>
           <w:ilvl w:val="0"/>
-          <w:numId w:val="1606"/>
+          <w:numId w:val="1607"/>
         </w:numPr>
       </w:pPr>
       <w:r>
@@ -14318,7 +14384,7 @@
         <w:pStyle w:val="Compact"/>
         <w:numPr>
           <w:ilvl w:val="0"/>
-          <w:numId w:val="1607"/>
+          <w:numId w:val="1608"/>
         </w:numPr>
       </w:pPr>
       <w:r>
@@ -14330,7 +14396,7 @@
         <w:pStyle w:val="Compact"/>
         <w:numPr>
           <w:ilvl w:val="0"/>
-          <w:numId w:val="1608"/>
+          <w:numId w:val="1609"/>
         </w:numPr>
       </w:pPr>
       <w:r>
@@ -14342,7 +14408,7 @@
         <w:pStyle w:val="Compact"/>
         <w:numPr>
           <w:ilvl w:val="0"/>
-          <w:numId w:val="1609"/>
+          <w:numId w:val="1610"/>
         </w:numPr>
       </w:pPr>
       <w:r>
@@ -14354,7 +14420,7 @@
         <w:pStyle w:val="Compact"/>
         <w:numPr>
           <w:ilvl w:val="0"/>
-          <w:numId w:val="1610"/>
+          <w:numId w:val="1611"/>
         </w:numPr>
       </w:pPr>
       <w:r>
@@ -14366,7 +14432,7 @@
         <w:pStyle w:val="Compact"/>
         <w:numPr>
           <w:ilvl w:val="0"/>
-          <w:numId w:val="1611"/>
+          <w:numId w:val="1612"/>
         </w:numPr>
       </w:pPr>
       <w:r>
@@ -14378,7 +14444,7 @@
         <w:pStyle w:val="Compact"/>
         <w:numPr>
           <w:ilvl w:val="0"/>
-          <w:numId w:val="1612"/>
+          <w:numId w:val="1613"/>
         </w:numPr>
       </w:pPr>
       <w:r>
@@ -14390,7 +14456,7 @@
         <w:pStyle w:val="Compact"/>
         <w:numPr>
           <w:ilvl w:val="0"/>
-          <w:numId w:val="1613"/>
+          <w:numId w:val="1614"/>
         </w:numPr>
       </w:pPr>
       <w:r>
@@ -14402,7 +14468,7 @@
         <w:pStyle w:val="Compact"/>
         <w:numPr>
           <w:ilvl w:val="0"/>
-          <w:numId w:val="1614"/>
+          <w:numId w:val="1615"/>
         </w:numPr>
       </w:pPr>
       <w:r>
@@ -14414,7 +14480,7 @@
         <w:pStyle w:val="Compact"/>
         <w:numPr>
           <w:ilvl w:val="0"/>
-          <w:numId w:val="1615"/>
+          <w:numId w:val="1616"/>
         </w:numPr>
       </w:pPr>
       <w:r>
@@ -14441,7 +14507,7 @@
         <w:pStyle w:val="Compact"/>
         <w:numPr>
           <w:ilvl w:val="0"/>
-          <w:numId w:val="1616"/>
+          <w:numId w:val="1617"/>
         </w:numPr>
       </w:pPr>
       <w:r>
@@ -14462,7 +14528,7 @@
         <w:pStyle w:val="Compact"/>
         <w:numPr>
           <w:ilvl w:val="0"/>
-          <w:numId w:val="1617"/>
+          <w:numId w:val="1618"/>
         </w:numPr>
       </w:pPr>
       <w:r>
@@ -14484,7 +14550,7 @@
         <w:pStyle w:val="Compact"/>
         <w:numPr>
           <w:ilvl w:val="0"/>
-          <w:numId w:val="1618"/>
+          <w:numId w:val="1619"/>
         </w:numPr>
       </w:pPr>
       <w:r>
@@ -14496,7 +14562,7 @@
         <w:pStyle w:val="Compact"/>
         <w:numPr>
           <w:ilvl w:val="0"/>
-          <w:numId w:val="1619"/>
+          <w:numId w:val="1620"/>
         </w:numPr>
       </w:pPr>
       <w:r>
@@ -14508,7 +14574,7 @@
         <w:pStyle w:val="Compact"/>
         <w:numPr>
           <w:ilvl w:val="0"/>
-          <w:numId w:val="1620"/>
+          <w:numId w:val="1621"/>
         </w:numPr>
       </w:pPr>
       <w:r>
@@ -14520,7 +14586,7 @@
         <w:pStyle w:val="Compact"/>
         <w:numPr>
           <w:ilvl w:val="0"/>
-          <w:numId w:val="1621"/>
+          <w:numId w:val="1622"/>
         </w:numPr>
       </w:pPr>
       <w:r>
@@ -14532,7 +14598,7 @@
         <w:pStyle w:val="Compact"/>
         <w:numPr>
           <w:ilvl w:val="0"/>
-          <w:numId w:val="1622"/>
+          <w:numId w:val="1623"/>
         </w:numPr>
       </w:pPr>
       <w:r>
@@ -14544,7 +14610,7 @@
         <w:pStyle w:val="Compact"/>
         <w:numPr>
           <w:ilvl w:val="0"/>
-          <w:numId w:val="1623"/>
+          <w:numId w:val="1624"/>
         </w:numPr>
       </w:pPr>
       <w:r>
@@ -14556,7 +14622,7 @@
         <w:pStyle w:val="Compact"/>
         <w:numPr>
           <w:ilvl w:val="0"/>
-          <w:numId w:val="1624"/>
+          <w:numId w:val="1625"/>
         </w:numPr>
       </w:pPr>
       <w:r>
@@ -14568,7 +14634,7 @@
         <w:pStyle w:val="Compact"/>
         <w:numPr>
           <w:ilvl w:val="0"/>
-          <w:numId w:val="1625"/>
+          <w:numId w:val="1626"/>
         </w:numPr>
       </w:pPr>
       <w:r>
@@ -14590,7 +14656,7 @@
         <w:pStyle w:val="Compact"/>
         <w:numPr>
           <w:ilvl w:val="0"/>
-          <w:numId w:val="1626"/>
+          <w:numId w:val="1627"/>
         </w:numPr>
       </w:pPr>
       <w:r>
@@ -14602,7 +14668,7 @@
         <w:pStyle w:val="Compact"/>
         <w:numPr>
           <w:ilvl w:val="0"/>
-          <w:numId w:val="1627"/>
+          <w:numId w:val="1628"/>
         </w:numPr>
       </w:pPr>
       <w:r>
@@ -14614,7 +14680,7 @@
         <w:pStyle w:val="Compact"/>
         <w:numPr>
           <w:ilvl w:val="0"/>
-          <w:numId w:val="1628"/>
+          <w:numId w:val="1629"/>
         </w:numPr>
       </w:pPr>
       <w:r>
@@ -14626,7 +14692,7 @@
         <w:pStyle w:val="Compact"/>
         <w:numPr>
           <w:ilvl w:val="0"/>
-          <w:numId w:val="1629"/>
+          <w:numId w:val="1630"/>
         </w:numPr>
       </w:pPr>
       <w:r>
@@ -14638,7 +14704,7 @@
         <w:pStyle w:val="Compact"/>
         <w:numPr>
           <w:ilvl w:val="0"/>
-          <w:numId w:val="1630"/>
+          <w:numId w:val="1631"/>
         </w:numPr>
       </w:pPr>
       <w:r>
@@ -14650,7 +14716,7 @@
         <w:pStyle w:val="Compact"/>
         <w:numPr>
           <w:ilvl w:val="0"/>
-          <w:numId w:val="1631"/>
+          <w:numId w:val="1632"/>
         </w:numPr>
       </w:pPr>
       <w:r>
@@ -14662,7 +14728,7 @@
         <w:pStyle w:val="Compact"/>
         <w:numPr>
           <w:ilvl w:val="0"/>
-          <w:numId w:val="1632"/>
+          <w:numId w:val="1633"/>
         </w:numPr>
       </w:pPr>
       <w:r>
@@ -14674,7 +14740,7 @@
         <w:pStyle w:val="Compact"/>
         <w:numPr>
           <w:ilvl w:val="0"/>
-          <w:numId w:val="1633"/>
+          <w:numId w:val="1634"/>
         </w:numPr>
       </w:pPr>
       <w:r>
@@ -14686,7 +14752,7 @@
         <w:pStyle w:val="Compact"/>
         <w:numPr>
           <w:ilvl w:val="0"/>
-          <w:numId w:val="1634"/>
+          <w:numId w:val="1635"/>
         </w:numPr>
       </w:pPr>
       <w:r>
@@ -14698,7 +14764,7 @@
         <w:pStyle w:val="Compact"/>
         <w:numPr>
           <w:ilvl w:val="0"/>
-          <w:numId w:val="1635"/>
+          <w:numId w:val="1636"/>
         </w:numPr>
       </w:pPr>
       <w:r>
@@ -14710,7 +14776,7 @@
         <w:pStyle w:val="Compact"/>
         <w:numPr>
           <w:ilvl w:val="0"/>
-          <w:numId w:val="1636"/>
+          <w:numId w:val="1637"/>
         </w:numPr>
       </w:pPr>
       <w:r>
@@ -14722,7 +14788,7 @@
         <w:pStyle w:val="Compact"/>
         <w:numPr>
           <w:ilvl w:val="0"/>
-          <w:numId w:val="1637"/>
+          <w:numId w:val="1638"/>
         </w:numPr>
       </w:pPr>
       <w:r>
@@ -14734,7 +14800,7 @@
         <w:pStyle w:val="Compact"/>
         <w:numPr>
           <w:ilvl w:val="0"/>
-          <w:numId w:val="1638"/>
+          <w:numId w:val="1639"/>
         </w:numPr>
       </w:pPr>
       <w:r>
@@ -14746,7 +14812,7 @@
         <w:pStyle w:val="Compact"/>
         <w:numPr>
           <w:ilvl w:val="0"/>
-          <w:numId w:val="1639"/>
+          <w:numId w:val="1640"/>
         </w:numPr>
       </w:pPr>
       <w:r>
@@ -14758,7 +14824,7 @@
         <w:pStyle w:val="Compact"/>
         <w:numPr>
           <w:ilvl w:val="0"/>
-          <w:numId w:val="1640"/>
+          <w:numId w:val="1641"/>
         </w:numPr>
       </w:pPr>
       <w:r>
@@ -14790,7 +14856,7 @@
         <w:pStyle w:val="Compact"/>
         <w:numPr>
           <w:ilvl w:val="0"/>
-          <w:numId w:val="1641"/>
+          <w:numId w:val="1642"/>
         </w:numPr>
       </w:pPr>
       <w:r>
@@ -14802,7 +14868,7 @@
         <w:pStyle w:val="Compact"/>
         <w:numPr>
           <w:ilvl w:val="0"/>
-          <w:numId w:val="1642"/>
+          <w:numId w:val="1643"/>
         </w:numPr>
       </w:pPr>
       <w:r>
@@ -14814,7 +14880,7 @@
         <w:pStyle w:val="Compact"/>
         <w:numPr>
           <w:ilvl w:val="0"/>
-          <w:numId w:val="1643"/>
+          <w:numId w:val="1644"/>
         </w:numPr>
       </w:pPr>
       <w:r>
@@ -14826,7 +14892,7 @@
         <w:pStyle w:val="Compact"/>
         <w:numPr>
           <w:ilvl w:val="0"/>
-          <w:numId w:val="1644"/>
+          <w:numId w:val="1645"/>
         </w:numPr>
       </w:pPr>
       <w:r>
@@ -14838,7 +14904,7 @@
         <w:pStyle w:val="Compact"/>
         <w:numPr>
           <w:ilvl w:val="0"/>
-          <w:numId w:val="1645"/>
+          <w:numId w:val="1646"/>
         </w:numPr>
       </w:pPr>
       <w:r>
@@ -14850,7 +14916,7 @@
         <w:pStyle w:val="Compact"/>
         <w:numPr>
           <w:ilvl w:val="0"/>
-          <w:numId w:val="1646"/>
+          <w:numId w:val="1647"/>
         </w:numPr>
       </w:pPr>
       <w:r>
@@ -14862,7 +14928,7 @@
         <w:pStyle w:val="Compact"/>
         <w:numPr>
           <w:ilvl w:val="0"/>
-          <w:numId w:val="1647"/>
+          <w:numId w:val="1648"/>
         </w:numPr>
       </w:pPr>
       <w:r>
@@ -14874,7 +14940,7 @@
         <w:pStyle w:val="Compact"/>
         <w:numPr>
           <w:ilvl w:val="0"/>
-          <w:numId w:val="1648"/>
+          <w:numId w:val="1649"/>
         </w:numPr>
       </w:pPr>
       <w:r>
@@ -14886,7 +14952,7 @@
         <w:pStyle w:val="Compact"/>
         <w:numPr>
           <w:ilvl w:val="0"/>
-          <w:numId w:val="1649"/>
+          <w:numId w:val="1650"/>
         </w:numPr>
       </w:pPr>
       <w:r>
@@ -14898,7 +14964,7 @@
         <w:pStyle w:val="Compact"/>
         <w:numPr>
           <w:ilvl w:val="0"/>
-          <w:numId w:val="1650"/>
+          <w:numId w:val="1651"/>
         </w:numPr>
       </w:pPr>
       <w:r>
@@ -14910,7 +14976,7 @@
         <w:pStyle w:val="Compact"/>
         <w:numPr>
           <w:ilvl w:val="0"/>
-          <w:numId w:val="1651"/>
+          <w:numId w:val="1652"/>
         </w:numPr>
       </w:pPr>
       <w:r>
@@ -14922,7 +14988,7 @@
         <w:pStyle w:val="Compact"/>
         <w:numPr>
           <w:ilvl w:val="0"/>
-          <w:numId w:val="1652"/>
+          <w:numId w:val="1653"/>
         </w:numPr>
       </w:pPr>
       <w:r>
@@ -14934,7 +15000,7 @@
         <w:pStyle w:val="Compact"/>
         <w:numPr>
           <w:ilvl w:val="0"/>
-          <w:numId w:val="1653"/>
+          <w:numId w:val="1654"/>
         </w:numPr>
       </w:pPr>
       <w:r>
@@ -14971,7 +15037,7 @@
         <w:pStyle w:val="Compact"/>
         <w:numPr>
           <w:ilvl w:val="0"/>
-          <w:numId w:val="1654"/>
+          <w:numId w:val="1655"/>
         </w:numPr>
       </w:pPr>
       <w:r>
@@ -14983,7 +15049,7 @@
         <w:pStyle w:val="Compact"/>
         <w:numPr>
           <w:ilvl w:val="0"/>
-          <w:numId w:val="1655"/>
+          <w:numId w:val="1656"/>
         </w:numPr>
       </w:pPr>
       <w:r>
@@ -15010,7 +15076,7 @@
         <w:pStyle w:val="Compact"/>
         <w:numPr>
           <w:ilvl w:val="0"/>
-          <w:numId w:val="1656"/>
+          <w:numId w:val="1657"/>
         </w:numPr>
       </w:pPr>
       <w:r>
@@ -15022,7 +15088,7 @@
         <w:pStyle w:val="Compact"/>
         <w:numPr>
           <w:ilvl w:val="0"/>
-          <w:numId w:val="1657"/>
+          <w:numId w:val="1658"/>
         </w:numPr>
       </w:pPr>
       <w:r>
@@ -15034,7 +15100,7 @@
         <w:pStyle w:val="Compact"/>
         <w:numPr>
           <w:ilvl w:val="0"/>
-          <w:numId w:val="1658"/>
+          <w:numId w:val="1659"/>
         </w:numPr>
       </w:pPr>
       <w:r>
@@ -15046,7 +15112,7 @@
         <w:pStyle w:val="Compact"/>
         <w:numPr>
           <w:ilvl w:val="0"/>
-          <w:numId w:val="1659"/>
+          <w:numId w:val="1660"/>
         </w:numPr>
       </w:pPr>
       <w:r>
@@ -15058,7 +15124,7 @@
         <w:pStyle w:val="Compact"/>
         <w:numPr>
           <w:ilvl w:val="0"/>
-          <w:numId w:val="1660"/>
+          <w:numId w:val="1661"/>
         </w:numPr>
       </w:pPr>
       <w:r>
@@ -15070,7 +15136,7 @@
         <w:pStyle w:val="Compact"/>
         <w:numPr>
           <w:ilvl w:val="0"/>
-          <w:numId w:val="1661"/>
+          <w:numId w:val="1662"/>
         </w:numPr>
       </w:pPr>
       <w:r>
@@ -15092,7 +15158,7 @@
         <w:pStyle w:val="Compact"/>
         <w:numPr>
           <w:ilvl w:val="0"/>
-          <w:numId w:val="1662"/>
+          <w:numId w:val="1663"/>
         </w:numPr>
       </w:pPr>
       <w:r>
@@ -15104,7 +15170,7 @@
         <w:pStyle w:val="Compact"/>
         <w:numPr>
           <w:ilvl w:val="0"/>
-          <w:numId w:val="1663"/>
+          <w:numId w:val="1664"/>
         </w:numPr>
       </w:pPr>
       <w:r>
@@ -15116,7 +15182,7 @@
         <w:pStyle w:val="Compact"/>
         <w:numPr>
           <w:ilvl w:val="0"/>
-          <w:numId w:val="1664"/>
+          <w:numId w:val="1665"/>
         </w:numPr>
       </w:pPr>
       <w:r>
@@ -15128,7 +15194,7 @@
         <w:pStyle w:val="Compact"/>
         <w:numPr>
           <w:ilvl w:val="0"/>
-          <w:numId w:val="1665"/>
+          <w:numId w:val="1666"/>
         </w:numPr>
       </w:pPr>
       <w:r>
@@ -15140,7 +15206,7 @@
         <w:pStyle w:val="Compact"/>
         <w:numPr>
           <w:ilvl w:val="0"/>
-          <w:numId w:val="1666"/>
+          <w:numId w:val="1667"/>
         </w:numPr>
       </w:pPr>
       <w:r>
@@ -15152,7 +15218,7 @@
         <w:pStyle w:val="Compact"/>
         <w:numPr>
           <w:ilvl w:val="0"/>
-          <w:numId w:val="1667"/>
+          <w:numId w:val="1668"/>
         </w:numPr>
       </w:pPr>
       <w:r>
@@ -15164,7 +15230,7 @@
         <w:pStyle w:val="Compact"/>
         <w:numPr>
           <w:ilvl w:val="0"/>
-          <w:numId w:val="1668"/>
+          <w:numId w:val="1669"/>
         </w:numPr>
       </w:pPr>
       <w:r>
@@ -15176,7 +15242,7 @@
         <w:pStyle w:val="Compact"/>
         <w:numPr>
           <w:ilvl w:val="0"/>
-          <w:numId w:val="1669"/>
+          <w:numId w:val="1670"/>
         </w:numPr>
       </w:pPr>
       <w:r>
@@ -15188,7 +15254,7 @@
         <w:pStyle w:val="Compact"/>
         <w:numPr>
           <w:ilvl w:val="0"/>
-          <w:numId w:val="1670"/>
+          <w:numId w:val="1671"/>
         </w:numPr>
       </w:pPr>
       <w:r>
@@ -15211,7 +15277,7 @@
         <w:pStyle w:val="Compact"/>
         <w:numPr>
           <w:ilvl w:val="0"/>
-          <w:numId w:val="1671"/>
+          <w:numId w:val="1672"/>
         </w:numPr>
       </w:pPr>
       <w:r>
@@ -15223,7 +15289,7 @@
         <w:pStyle w:val="Compact"/>
         <w:numPr>
           <w:ilvl w:val="0"/>
-          <w:numId w:val="1672"/>
+          <w:numId w:val="1673"/>
         </w:numPr>
       </w:pPr>
       <w:r>
@@ -15235,7 +15301,7 @@
         <w:pStyle w:val="Compact"/>
         <w:numPr>
           <w:ilvl w:val="0"/>
-          <w:numId w:val="1673"/>
+          <w:numId w:val="1674"/>
         </w:numPr>
       </w:pPr>
       <w:r>
@@ -15247,7 +15313,7 @@
         <w:pStyle w:val="Compact"/>
         <w:numPr>
           <w:ilvl w:val="0"/>
-          <w:numId w:val="1674"/>
+          <w:numId w:val="1675"/>
         </w:numPr>
       </w:pPr>
       <w:r>
@@ -15259,7 +15325,7 @@
         <w:pStyle w:val="Compact"/>
         <w:numPr>
           <w:ilvl w:val="0"/>
-          <w:numId w:val="1675"/>
+          <w:numId w:val="1676"/>
         </w:numPr>
       </w:pPr>
       <w:r>
@@ -15271,7 +15337,7 @@
         <w:pStyle w:val="Compact"/>
         <w:numPr>
           <w:ilvl w:val="0"/>
-          <w:numId w:val="1676"/>
+          <w:numId w:val="1677"/>
         </w:numPr>
       </w:pPr>
       <w:r>
@@ -15283,7 +15349,7 @@
         <w:pStyle w:val="Compact"/>
         <w:numPr>
           <w:ilvl w:val="0"/>
-          <w:numId w:val="1677"/>
+          <w:numId w:val="1678"/>
         </w:numPr>
       </w:pPr>
       <w:r>
@@ -15295,7 +15361,7 @@
         <w:pStyle w:val="Compact"/>
         <w:numPr>
           <w:ilvl w:val="0"/>
-          <w:numId w:val="1678"/>
+          <w:numId w:val="1679"/>
         </w:numPr>
       </w:pPr>
       <w:r>
@@ -15307,7 +15373,7 @@
         <w:pStyle w:val="Compact"/>
         <w:numPr>
           <w:ilvl w:val="0"/>
-          <w:numId w:val="1679"/>
+          <w:numId w:val="1680"/>
         </w:numPr>
       </w:pPr>
       <w:r>
@@ -15319,7 +15385,7 @@
         <w:pStyle w:val="Compact"/>
         <w:numPr>
           <w:ilvl w:val="0"/>
-          <w:numId w:val="1680"/>
+          <w:numId w:val="1681"/>
         </w:numPr>
       </w:pPr>
       <w:r>
@@ -15331,7 +15397,7 @@
         <w:pStyle w:val="Compact"/>
         <w:numPr>
           <w:ilvl w:val="0"/>
-          <w:numId w:val="1681"/>
+          <w:numId w:val="1682"/>
         </w:numPr>
       </w:pPr>
       <w:r>
@@ -15614,7 +15680,19 @@
               <w:pStyle w:val="Compact"/>
             </w:pPr>
             <w:r>
-              <w:t xml:space="preserve">Added Inbox AI/email CTA/follow-up/quiet-hours/inbound-owner regression evidence and browser Gmail CTA smoke.</w:t>
+              <w:t xml:space="preserve">Added and deployed Inbox AI/email CTA/follow-up/quiet-hours/inbound-owner regression evidence; production smoke passed on</w:t>
+            </w:r>
+            <w:r>
+              <w:t xml:space="preserve"> </w:t>
+            </w:r>
+            <w:r>
+              <w:rPr>
+                <w:rStyle w:val="VerbatimChar"/>
+              </w:rPr>
+              <w:t xml:space="preserve">2f665aaf</w:t>
+            </w:r>
+            <w:r>
+              <w:t xml:space="preserve">.</w:t>
             </w:r>
           </w:p>
         </w:tc>
@@ -17344,13 +17422,13 @@
     <w:abstractNumId w:val="993"/>
   </w:num>
   <w:num w:numId="1428">
-    <w:abstractNumId w:val="992"/>
+    <w:abstractNumId w:val="993"/>
   </w:num>
   <w:num w:numId="1429">
     <w:abstractNumId w:val="992"/>
   </w:num>
   <w:num w:numId="1430">
-    <w:abstractNumId w:val="993"/>
+    <w:abstractNumId w:val="992"/>
   </w:num>
   <w:num w:numId="1431">
     <w:abstractNumId w:val="993"/>
@@ -17368,7 +17446,7 @@
     <w:abstractNumId w:val="993"/>
   </w:num>
   <w:num w:numId="1436">
-    <w:abstractNumId w:val="992"/>
+    <w:abstractNumId w:val="993"/>
   </w:num>
   <w:num w:numId="1437">
     <w:abstractNumId w:val="992"/>
@@ -17395,7 +17473,7 @@
     <w:abstractNumId w:val="992"/>
   </w:num>
   <w:num w:numId="1445">
-    <w:abstractNumId w:val="993"/>
+    <w:abstractNumId w:val="992"/>
   </w:num>
   <w:num w:numId="1446">
     <w:abstractNumId w:val="993"/>
@@ -17404,7 +17482,7 @@
     <w:abstractNumId w:val="993"/>
   </w:num>
   <w:num w:numId="1448">
-    <w:abstractNumId w:val="992"/>
+    <w:abstractNumId w:val="993"/>
   </w:num>
   <w:num w:numId="1449">
     <w:abstractNumId w:val="992"/>
@@ -17413,7 +17491,7 @@
     <w:abstractNumId w:val="992"/>
   </w:num>
   <w:num w:numId="1451">
-    <w:abstractNumId w:val="993"/>
+    <w:abstractNumId w:val="992"/>
   </w:num>
   <w:num w:numId="1452">
     <w:abstractNumId w:val="993"/>
@@ -17425,13 +17503,13 @@
     <w:abstractNumId w:val="993"/>
   </w:num>
   <w:num w:numId="1455">
-    <w:abstractNumId w:val="992"/>
+    <w:abstractNumId w:val="993"/>
   </w:num>
   <w:num w:numId="1456">
     <w:abstractNumId w:val="992"/>
   </w:num>
   <w:num w:numId="1457">
-    <w:abstractNumId w:val="993"/>
+    <w:abstractNumId w:val="992"/>
   </w:num>
   <w:num w:numId="1458">
     <w:abstractNumId w:val="993"/>
@@ -17473,19 +17551,19 @@
     <w:abstractNumId w:val="993"/>
   </w:num>
   <w:num w:numId="1471">
-    <w:abstractNumId w:val="992"/>
+    <w:abstractNumId w:val="993"/>
   </w:num>
   <w:num w:numId="1472">
+    <w:abstractNumId w:val="992"/>
+  </w:num>
+  <w:num w:numId="1473">
     <w:abstractNumId w:val="991"/>
   </w:num>
-  <w:num w:numId="1473">
-    <w:abstractNumId w:val="993"/>
-  </w:num>
   <w:num w:numId="1474">
     <w:abstractNumId w:val="993"/>
   </w:num>
   <w:num w:numId="1475">
-    <w:abstractNumId w:val="992"/>
+    <w:abstractNumId w:val="993"/>
   </w:num>
   <w:num w:numId="1476">
     <w:abstractNumId w:val="992"/>
@@ -17500,16 +17578,16 @@
     <w:abstractNumId w:val="992"/>
   </w:num>
   <w:num w:numId="1480">
-    <w:abstractNumId w:val="993"/>
+    <w:abstractNumId w:val="992"/>
   </w:num>
   <w:num w:numId="1481">
-    <w:abstractNumId w:val="992"/>
+    <w:abstractNumId w:val="993"/>
   </w:num>
   <w:num w:numId="1482">
     <w:abstractNumId w:val="992"/>
   </w:num>
   <w:num w:numId="1483">
-    <w:abstractNumId w:val="993"/>
+    <w:abstractNumId w:val="992"/>
   </w:num>
   <w:num w:numId="1484">
     <w:abstractNumId w:val="993"/>
@@ -17551,11 +17629,11 @@
     <w:abstractNumId w:val="993"/>
   </w:num>
   <w:num w:numId="1497">
+    <w:abstractNumId w:val="993"/>
+  </w:num>
+  <w:num w:numId="1498">
     <w:abstractNumId w:val="991"/>
   </w:num>
-  <w:num w:numId="1498">
-    <w:abstractNumId w:val="993"/>
-  </w:num>
   <w:num w:numId="1499">
     <w:abstractNumId w:val="993"/>
   </w:num>
@@ -17563,35 +17641,35 @@
     <w:abstractNumId w:val="993"/>
   </w:num>
   <w:num w:numId="1501">
+    <w:abstractNumId w:val="993"/>
+  </w:num>
+  <w:num w:numId="1502">
     <w:abstractNumId w:val="991"/>
   </w:num>
-  <w:num w:numId="1502">
-    <w:abstractNumId w:val="993"/>
-  </w:num>
   <w:num w:numId="1503">
     <w:abstractNumId w:val="993"/>
   </w:num>
   <w:num w:numId="1504">
-    <w:abstractNumId w:val="992"/>
+    <w:abstractNumId w:val="993"/>
   </w:num>
   <w:num w:numId="1505">
     <w:abstractNumId w:val="992"/>
   </w:num>
   <w:num w:numId="1506">
-    <w:abstractNumId w:val="993"/>
+    <w:abstractNumId w:val="992"/>
   </w:num>
   <w:num w:numId="1507">
+    <w:abstractNumId w:val="993"/>
+  </w:num>
+  <w:num w:numId="1508">
     <w:abstractNumId w:val="991"/>
   </w:num>
-  <w:num w:numId="1508">
-    <w:abstractNumId w:val="993"/>
-  </w:num>
   <w:num w:numId="1509">
+    <w:abstractNumId w:val="993"/>
+  </w:num>
+  <w:num w:numId="1510">
     <w:abstractNumId w:val="991"/>
   </w:num>
-  <w:num w:numId="1510">
-    <w:abstractNumId w:val="993"/>
-  </w:num>
   <w:num w:numId="1511">
     <w:abstractNumId w:val="993"/>
   </w:num>
@@ -17617,22 +17695,22 @@
     <w:abstractNumId w:val="993"/>
   </w:num>
   <w:num w:numId="1519">
+    <w:abstractNumId w:val="993"/>
+  </w:num>
+  <w:num w:numId="1520">
     <w:abstractNumId w:val="991"/>
   </w:num>
-  <w:num w:numId="1520">
-    <w:abstractNumId w:val="993"/>
-  </w:num>
   <w:num w:numId="1521">
     <w:abstractNumId w:val="993"/>
   </w:num>
   <w:num w:numId="1522">
-    <w:abstractNumId w:val="992"/>
+    <w:abstractNumId w:val="993"/>
   </w:num>
   <w:num w:numId="1523">
     <w:abstractNumId w:val="992"/>
   </w:num>
   <w:num w:numId="1524">
-    <w:abstractNumId w:val="993"/>
+    <w:abstractNumId w:val="992"/>
   </w:num>
   <w:num w:numId="1525">
     <w:abstractNumId w:val="993"/>
@@ -17641,7 +17719,7 @@
     <w:abstractNumId w:val="993"/>
   </w:num>
   <w:num w:numId="1527">
-    <w:abstractNumId w:val="992"/>
+    <w:abstractNumId w:val="993"/>
   </w:num>
   <w:num w:numId="1528">
     <w:abstractNumId w:val="992"/>
@@ -17653,16 +17731,16 @@
     <w:abstractNumId w:val="992"/>
   </w:num>
   <w:num w:numId="1531">
-    <w:abstractNumId w:val="993"/>
+    <w:abstractNumId w:val="992"/>
   </w:num>
   <w:num w:numId="1532">
-    <w:abstractNumId w:val="992"/>
+    <w:abstractNumId w:val="993"/>
   </w:num>
   <w:num w:numId="1533">
     <w:abstractNumId w:val="992"/>
   </w:num>
   <w:num w:numId="1534">
-    <w:abstractNumId w:val="993"/>
+    <w:abstractNumId w:val="992"/>
   </w:num>
   <w:num w:numId="1535">
     <w:abstractNumId w:val="993"/>
@@ -17722,11 +17800,11 @@
     <w:abstractNumId w:val="993"/>
   </w:num>
   <w:num w:numId="1554">
+    <w:abstractNumId w:val="993"/>
+  </w:num>
+  <w:num w:numId="1555">
     <w:abstractNumId w:val="991"/>
   </w:num>
-  <w:num w:numId="1555">
-    <w:abstractNumId w:val="992"/>
-  </w:num>
   <w:num w:numId="1556">
     <w:abstractNumId w:val="992"/>
   </w:num>
@@ -17773,7 +17851,7 @@
     <w:abstractNumId w:val="992"/>
   </w:num>
   <w:num w:numId="1571">
-    <w:abstractNumId w:val="993"/>
+    <w:abstractNumId w:val="992"/>
   </w:num>
   <w:num w:numId="1572">
     <w:abstractNumId w:val="993"/>
@@ -17788,20 +17866,20 @@
     <w:abstractNumId w:val="993"/>
   </w:num>
   <w:num w:numId="1576">
+    <w:abstractNumId w:val="993"/>
+  </w:num>
+  <w:num w:numId="1577">
     <w:abstractNumId w:val="991"/>
   </w:num>
-  <w:num w:numId="1577">
-    <w:abstractNumId w:val="993"/>
-  </w:num>
   <w:num w:numId="1578">
     <w:abstractNumId w:val="993"/>
   </w:num>
   <w:num w:numId="1579">
+    <w:abstractNumId w:val="993"/>
+  </w:num>
+  <w:num w:numId="1580">
     <w:abstractNumId w:val="991"/>
   </w:num>
-  <w:num w:numId="1580">
-    <w:abstractNumId w:val="993"/>
-  </w:num>
   <w:num w:numId="1581">
     <w:abstractNumId w:val="993"/>
   </w:num>
@@ -17830,17 +17908,17 @@
     <w:abstractNumId w:val="993"/>
   </w:num>
   <w:num w:numId="1590">
+    <w:abstractNumId w:val="993"/>
+  </w:num>
+  <w:num w:numId="1591">
     <w:abstractNumId w:val="991"/>
   </w:num>
-  <w:num w:numId="1591">
-    <w:abstractNumId w:val="993"/>
-  </w:num>
   <w:num w:numId="1592">
+    <w:abstractNumId w:val="993"/>
+  </w:num>
+  <w:num w:numId="1593">
     <w:abstractNumId w:val="991"/>
   </w:num>
-  <w:num w:numId="1593">
-    <w:abstractNumId w:val="993"/>
-  </w:num>
   <w:num w:numId="1594">
     <w:abstractNumId w:val="993"/>
   </w:num>
@@ -17851,16 +17929,16 @@
     <w:abstractNumId w:val="993"/>
   </w:num>
   <w:num w:numId="1597">
-    <w:abstractNumId w:val="992"/>
+    <w:abstractNumId w:val="993"/>
   </w:num>
   <w:num w:numId="1598">
     <w:abstractNumId w:val="992"/>
   </w:num>
   <w:num w:numId="1599">
-    <w:abstractNumId w:val="993"/>
+    <w:abstractNumId w:val="992"/>
   </w:num>
   <w:num w:numId="1600">
-    <w:abstractNumId w:val="992"/>
+    <w:abstractNumId w:val="993"/>
   </w:num>
   <w:num w:numId="1601">
     <w:abstractNumId w:val="992"/>
@@ -17878,7 +17956,7 @@
     <w:abstractNumId w:val="992"/>
   </w:num>
   <w:num w:numId="1606">
-    <w:abstractNumId w:val="993"/>
+    <w:abstractNumId w:val="992"/>
   </w:num>
   <w:num w:numId="1607">
     <w:abstractNumId w:val="993"/>
@@ -17899,10 +17977,10 @@
     <w:abstractNumId w:val="993"/>
   </w:num>
   <w:num w:numId="1613">
-    <w:abstractNumId w:val="992"/>
+    <w:abstractNumId w:val="993"/>
   </w:num>
   <w:num w:numId="1614">
-    <w:abstractNumId w:val="993"/>
+    <w:abstractNumId w:val="992"/>
   </w:num>
   <w:num w:numId="1615">
     <w:abstractNumId w:val="993"/>
@@ -17911,10 +17989,10 @@
     <w:abstractNumId w:val="993"/>
   </w:num>
   <w:num w:numId="1617">
-    <w:abstractNumId w:val="992"/>
+    <w:abstractNumId w:val="993"/>
   </w:num>
   <w:num w:numId="1618">
-    <w:abstractNumId w:val="993"/>
+    <w:abstractNumId w:val="992"/>
   </w:num>
   <w:num w:numId="1619">
     <w:abstractNumId w:val="993"/>
@@ -17923,10 +18001,10 @@
     <w:abstractNumId w:val="993"/>
   </w:num>
   <w:num w:numId="1621">
-    <w:abstractNumId w:val="992"/>
+    <w:abstractNumId w:val="993"/>
   </w:num>
   <w:num w:numId="1622">
-    <w:abstractNumId w:val="993"/>
+    <w:abstractNumId w:val="992"/>
   </w:num>
   <w:num w:numId="1623">
     <w:abstractNumId w:val="993"/>
@@ -17944,19 +18022,19 @@
     <w:abstractNumId w:val="993"/>
   </w:num>
   <w:num w:numId="1628">
-    <w:abstractNumId w:val="992"/>
+    <w:abstractNumId w:val="993"/>
   </w:num>
   <w:num w:numId="1629">
-    <w:abstractNumId w:val="993"/>
+    <w:abstractNumId w:val="992"/>
   </w:num>
   <w:num w:numId="1630">
-    <w:abstractNumId w:val="992"/>
+    <w:abstractNumId w:val="993"/>
   </w:num>
   <w:num w:numId="1631">
     <w:abstractNumId w:val="992"/>
   </w:num>
   <w:num w:numId="1632">
-    <w:abstractNumId w:val="993"/>
+    <w:abstractNumId w:val="992"/>
   </w:num>
   <w:num w:numId="1633">
     <w:abstractNumId w:val="993"/>
@@ -17968,7 +18046,7 @@
     <w:abstractNumId w:val="993"/>
   </w:num>
   <w:num w:numId="1636">
-    <w:abstractNumId w:val="992"/>
+    <w:abstractNumId w:val="993"/>
   </w:num>
   <w:num w:numId="1637">
     <w:abstractNumId w:val="992"/>
@@ -17980,10 +18058,10 @@
     <w:abstractNumId w:val="992"/>
   </w:num>
   <w:num w:numId="1640">
-    <w:abstractNumId w:val="993"/>
+    <w:abstractNumId w:val="992"/>
   </w:num>
   <w:num w:numId="1641">
-    <w:abstractNumId w:val="992"/>
+    <w:abstractNumId w:val="993"/>
   </w:num>
   <w:num w:numId="1642">
     <w:abstractNumId w:val="992"/>
@@ -18103,6 +18181,9 @@
     <w:abstractNumId w:val="992"/>
   </w:num>
   <w:num w:numId="1681">
+    <w:abstractNumId w:val="992"/>
+  </w:num>
+  <w:num w:numId="1682">
     <w:abstractNumId w:val="992"/>
   </w:num>
 </w:numbering>

</xml_diff>

<commit_message>
fix: scope deal sharing socket updates
</commit_message>
<xml_diff>
--- a/MASTER_M1_M2_DELIVERY_CHECKLIST.docx
+++ b/MASTER_M1_M2_DELIVERY_CHECKLIST.docx
@@ -10,7 +10,7 @@
         <w:t xml:space="preserve">© BuyReadySite.com</w:t>
       </w:r>
     </w:p>
-    <w:bookmarkStart w:id="92" w:name="X3d74ce0b4fd94f465ac7edf34b08aa6d5ff209b"/>
+    <w:bookmarkStart w:id="93" w:name="X3d74ce0b4fd94f465ac7edf34b08aa6d5ff209b"/>
     <w:p>
       <w:pPr>
         <w:pStyle w:val="Heading1"/>
@@ -81,10 +81,10 @@
         <w:tblLook w:firstRow="1" w:lastRow="0" w:firstColumn="0" w:lastColumn="0" w:noHBand="0" w:noVBand="0" w:val="0020"/>
       </w:tblPr>
       <w:tblGrid>
-        <w:gridCol w:w="2370"/>
-        <w:gridCol w:w="403"/>
-        <w:gridCol w:w="504"/>
-        <w:gridCol w:w="4641"/>
+        <w:gridCol w:w="2417"/>
+        <w:gridCol w:w="411"/>
+        <w:gridCol w:w="514"/>
+        <w:gridCol w:w="4577"/>
       </w:tblGrid>
       <w:tr>
         <w:trPr>
@@ -9929,7 +9929,7 @@
     </w:p>
     <w:bookmarkEnd w:id="52"/>
     <w:bookmarkEnd w:id="53"/>
-    <w:bookmarkStart w:id="61" w:name="m1.6-m1-full-regression-and-release-gate"/>
+    <w:bookmarkStart w:id="62" w:name="m1.6-m1-full-regression-and-release-gate"/>
     <w:p>
       <w:pPr>
         <w:pStyle w:val="Heading2"/>
@@ -10782,12 +10782,250 @@
       </w:r>
     </w:p>
     <w:bookmarkEnd w:id="57"/>
-    <w:bookmarkStart w:id="58" w:name="functional-regression"/>
+    <w:bookmarkStart w:id="58" w:name="Xb3191882e2298d705ec60e5e8585ad834a24b9e"/>
     <w:p>
       <w:pPr>
         <w:pStyle w:val="Heading3"/>
       </w:pPr>
       <w:r>
+        <w:t xml:space="preserve">New deal creation / sharing / socket scoping smoke — 2026-05-02</w:t>
+      </w:r>
+    </w:p>
+    <w:p>
+      <w:pPr>
+        <w:pStyle w:val="Compact"/>
+        <w:numPr>
+          <w:ilvl w:val="0"/>
+          <w:numId w:val="1423"/>
+        </w:numPr>
+      </w:pPr>
+      <w:r>
+        <w:t xml:space="preserve">Evidence JSON added:</w:t>
+      </w:r>
+      <w:r>
+        <w:t xml:space="preserve"> </w:t>
+      </w:r>
+      <w:r>
+        <w:rPr>
+          <w:rStyle w:val="VerbatimChar"/>
+        </w:rPr>
+        <w:t xml:space="preserve">audit-screenshots/m16-deal-create-share-socket-evidence.json</w:t>
+      </w:r>
+      <w:r>
+        <w:t xml:space="preserve">.</w:t>
+      </w:r>
+    </w:p>
+    <w:p>
+      <w:pPr>
+        <w:pStyle w:val="Compact"/>
+        <w:numPr>
+          <w:ilvl w:val="0"/>
+          <w:numId w:val="1424"/>
+        </w:numPr>
+      </w:pPr>
+      <w:r>
+        <w:t xml:space="preserve">Backend fix added:</w:t>
+      </w:r>
+      <w:r>
+        <w:t xml:space="preserve"> </w:t>
+      </w:r>
+      <w:r>
+        <w:rPr>
+          <w:rStyle w:val="VerbatimChar"/>
+        </w:rPr>
+        <w:t xml:space="preserve">shareDeal</w:t>
+      </w:r>
+      <w:r>
+        <w:t xml:space="preserve"> </w:t>
+      </w:r>
+      <w:r>
+        <w:t xml:space="preserve">now emits scoped socket updates from the updated deal record, so newly added assisting reps receive</w:t>
+      </w:r>
+      <w:r>
+        <w:t xml:space="preserve"> </w:t>
+      </w:r>
+      <w:r>
+        <w:rPr>
+          <w:rStyle w:val="VerbatimChar"/>
+        </w:rPr>
+        <w:t xml:space="preserve">inbox:{repId}</w:t>
+      </w:r>
+      <w:r>
+        <w:t xml:space="preserve"> </w:t>
+      </w:r>
+      <w:r>
+        <w:t xml:space="preserve">updates.</w:t>
+      </w:r>
+    </w:p>
+    <w:p>
+      <w:pPr>
+        <w:pStyle w:val="Compact"/>
+        <w:numPr>
+          <w:ilvl w:val="0"/>
+          <w:numId w:val="1425"/>
+        </w:numPr>
+      </w:pPr>
+      <w:r>
+        <w:t xml:space="preserve">Focused backend regression passed 14/14 across deal controller scope, deal scope policy, and inbox reply reclassification tests.</w:t>
+      </w:r>
+    </w:p>
+    <w:p>
+      <w:pPr>
+        <w:pStyle w:val="Compact"/>
+        <w:numPr>
+          <w:ilvl w:val="0"/>
+          <w:numId w:val="1426"/>
+        </w:numPr>
+      </w:pPr>
+      <w:r>
+        <w:t xml:space="preserve">Root production build passed after the backend fix: server</w:t>
+      </w:r>
+      <w:r>
+        <w:t xml:space="preserve"> </w:t>
+      </w:r>
+      <w:r>
+        <w:rPr>
+          <w:rStyle w:val="VerbatimChar"/>
+        </w:rPr>
+        <w:t xml:space="preserve">tsc</w:t>
+      </w:r>
+      <w:r>
+        <w:t xml:space="preserve"> </w:t>
+      </w:r>
+      <w:r>
+        <w:t xml:space="preserve">plus client</w:t>
+      </w:r>
+      <w:r>
+        <w:t xml:space="preserve"> </w:t>
+      </w:r>
+      <w:r>
+        <w:rPr>
+          <w:rStyle w:val="VerbatimChar"/>
+        </w:rPr>
+        <w:t xml:space="preserve">tsc &amp;&amp; vite build</w:t>
+      </w:r>
+      <w:r>
+        <w:t xml:space="preserve">.</w:t>
+      </w:r>
+    </w:p>
+    <w:p>
+      <w:pPr>
+        <w:pStyle w:val="Compact"/>
+        <w:numPr>
+          <w:ilvl w:val="0"/>
+          <w:numId w:val="1427"/>
+        </w:numPr>
+      </w:pPr>
+      <w:r>
+        <w:t xml:space="preserve">Browser production-preview smoke passed with mock API: created</w:t>
+      </w:r>
+      <w:r>
+        <w:t xml:space="preserve"> </w:t>
+      </w:r>
+      <w:r>
+        <w:rPr>
+          <w:rStyle w:val="VerbatimChar"/>
+        </w:rPr>
+        <w:t xml:space="preserve">M1.6 Smoke Capital</w:t>
+      </w:r>
+      <w:r>
+        <w:t xml:space="preserve">, captured</w:t>
+      </w:r>
+      <w:r>
+        <w:t xml:space="preserve"> </w:t>
+      </w:r>
+      <w:r>
+        <w:rPr>
+          <w:rStyle w:val="VerbatimChar"/>
+        </w:rPr>
+        <w:t xml:space="preserve">POST /api/deals</w:t>
+      </w:r>
+      <w:r>
+        <w:t xml:space="preserve">, shared</w:t>
+      </w:r>
+      <w:r>
+        <w:t xml:space="preserve"> </w:t>
+      </w:r>
+      <w:r>
+        <w:rPr>
+          <w:rStyle w:val="VerbatimChar"/>
+        </w:rPr>
+        <w:t xml:space="preserve">Atlas Demo Logistics</w:t>
+      </w:r>
+      <w:r>
+        <w:t xml:space="preserve">, and captured</w:t>
+      </w:r>
+      <w:r>
+        <w:t xml:space="preserve"> </w:t>
+      </w:r>
+      <w:r>
+        <w:rPr>
+          <w:rStyle w:val="VerbatimChar"/>
+        </w:rPr>
+        <w:t xml:space="preserve">PUT /api/deals/deal-1/share</w:t>
+      </w:r>
+      <w:r>
+        <w:t xml:space="preserve"> </w:t>
+      </w:r>
+      <w:r>
+        <w:t xml:space="preserve">with</w:t>
+      </w:r>
+      <w:r>
+        <w:t xml:space="preserve"> </w:t>
+      </w:r>
+      <w:r>
+        <w:rPr>
+          <w:rStyle w:val="VerbatimChar"/>
+        </w:rPr>
+        <w:t xml:space="preserve">assistingRepIds: ["rep-2"]</w:t>
+      </w:r>
+      <w:r>
+        <w:t xml:space="preserve">.</w:t>
+      </w:r>
+    </w:p>
+    <w:p>
+      <w:pPr>
+        <w:pStyle w:val="Compact"/>
+        <w:numPr>
+          <w:ilvl w:val="0"/>
+          <w:numId w:val="1428"/>
+        </w:numPr>
+      </w:pPr>
+      <w:r>
+        <w:t xml:space="preserve">Browser screenshot saved:</w:t>
+      </w:r>
+      <w:r>
+        <w:t xml:space="preserve"> </w:t>
+      </w:r>
+      <w:r>
+        <w:rPr>
+          <w:rStyle w:val="VerbatimChar"/>
+        </w:rPr>
+        <w:t xml:space="preserve">audit-screenshots/m16-deal-create-share-browser-smoke.png</w:t>
+      </w:r>
+      <w:r>
+        <w:t xml:space="preserve">.</w:t>
+      </w:r>
+    </w:p>
+    <w:p>
+      <w:pPr>
+        <w:pStyle w:val="Compact"/>
+        <w:numPr>
+          <w:ilvl w:val="0"/>
+          <w:numId w:val="1429"/>
+        </w:numPr>
+      </w:pPr>
+      <w:r>
+        <w:t xml:space="preserve">Production deploy/smoke pending for this gate.</w:t>
+      </w:r>
+    </w:p>
+    <w:bookmarkEnd w:id="58"/>
+    <w:bookmarkStart w:id="59" w:name="functional-regression"/>
+    <w:p>
+      <w:pPr>
+        <w:pStyle w:val="Heading3"/>
+      </w:pPr>
+      <w:r>
         <w:t xml:space="preserve">Functional regression</w:t>
       </w:r>
     </w:p>
@@ -10796,7 +11034,7 @@
         <w:pStyle w:val="Compact"/>
         <w:numPr>
           <w:ilvl w:val="0"/>
-          <w:numId w:val="1423"/>
+          <w:numId w:val="1430"/>
         </w:numPr>
       </w:pPr>
       <w:r>
@@ -10808,7 +11046,7 @@
         <w:pStyle w:val="Compact"/>
         <w:numPr>
           <w:ilvl w:val="0"/>
-          <w:numId w:val="1424"/>
+          <w:numId w:val="1431"/>
         </w:numPr>
       </w:pPr>
       <w:r>
@@ -10820,7 +11058,7 @@
         <w:pStyle w:val="Compact"/>
         <w:numPr>
           <w:ilvl w:val="0"/>
-          <w:numId w:val="1425"/>
+          <w:numId w:val="1432"/>
         </w:numPr>
       </w:pPr>
       <w:r>
@@ -10832,7 +11070,7 @@
         <w:pStyle w:val="Compact"/>
         <w:numPr>
           <w:ilvl w:val="0"/>
-          <w:numId w:val="1426"/>
+          <w:numId w:val="1433"/>
         </w:numPr>
       </w:pPr>
       <w:r>
@@ -10844,7 +11082,7 @@
         <w:pStyle w:val="Compact"/>
         <w:numPr>
           <w:ilvl w:val="0"/>
-          <w:numId w:val="1427"/>
+          <w:numId w:val="1434"/>
         </w:numPr>
       </w:pPr>
       <w:r>
@@ -10856,7 +11094,7 @@
         <w:pStyle w:val="Compact"/>
         <w:numPr>
           <w:ilvl w:val="0"/>
-          <w:numId w:val="1428"/>
+          <w:numId w:val="1435"/>
         </w:numPr>
       </w:pPr>
       <w:r>
@@ -10868,7 +11106,7 @@
         <w:pStyle w:val="Compact"/>
         <w:numPr>
           <w:ilvl w:val="0"/>
-          <w:numId w:val="1429"/>
+          <w:numId w:val="1436"/>
         </w:numPr>
       </w:pPr>
       <w:r>
@@ -10880,7 +11118,7 @@
         <w:pStyle w:val="Compact"/>
         <w:numPr>
           <w:ilvl w:val="0"/>
-          <w:numId w:val="1430"/>
+          <w:numId w:val="1437"/>
         </w:numPr>
       </w:pPr>
       <w:r>
@@ -10892,7 +11130,7 @@
         <w:pStyle w:val="Compact"/>
         <w:numPr>
           <w:ilvl w:val="0"/>
-          <w:numId w:val="1431"/>
+          <w:numId w:val="1438"/>
         </w:numPr>
       </w:pPr>
       <w:r>
@@ -10904,7 +11142,7 @@
         <w:pStyle w:val="Compact"/>
         <w:numPr>
           <w:ilvl w:val="0"/>
-          <w:numId w:val="1432"/>
+          <w:numId w:val="1439"/>
         </w:numPr>
       </w:pPr>
       <w:r>
@@ -10916,7 +11154,7 @@
         <w:pStyle w:val="Compact"/>
         <w:numPr>
           <w:ilvl w:val="0"/>
-          <w:numId w:val="1433"/>
+          <w:numId w:val="1440"/>
         </w:numPr>
       </w:pPr>
       <w:r>
@@ -10928,7 +11166,7 @@
         <w:pStyle w:val="Compact"/>
         <w:numPr>
           <w:ilvl w:val="0"/>
-          <w:numId w:val="1434"/>
+          <w:numId w:val="1441"/>
         </w:numPr>
       </w:pPr>
       <w:r>
@@ -10940,7 +11178,7 @@
         <w:pStyle w:val="Compact"/>
         <w:numPr>
           <w:ilvl w:val="0"/>
-          <w:numId w:val="1435"/>
+          <w:numId w:val="1442"/>
         </w:numPr>
       </w:pPr>
       <w:r>
@@ -10952,7 +11190,7 @@
         <w:pStyle w:val="Compact"/>
         <w:numPr>
           <w:ilvl w:val="0"/>
-          <w:numId w:val="1436"/>
+          <w:numId w:val="1443"/>
         </w:numPr>
       </w:pPr>
       <w:r>
@@ -10964,15 +11202,15 @@
         <w:pStyle w:val="Compact"/>
         <w:numPr>
           <w:ilvl w:val="0"/>
-          <w:numId w:val="1437"/>
+          <w:numId w:val="1444"/>
         </w:numPr>
       </w:pPr>
       <w:r>
         <w:t xml:space="preserve">Socket scoping unaffected.</w:t>
       </w:r>
     </w:p>
-    <w:bookmarkEnd w:id="58"/>
-    <w:bookmarkStart w:id="59" w:name="visual-regression"/>
+    <w:bookmarkEnd w:id="59"/>
+    <w:bookmarkStart w:id="60" w:name="visual-regression"/>
     <w:p>
       <w:pPr>
         <w:pStyle w:val="Heading3"/>
@@ -10986,7 +11224,7 @@
         <w:pStyle w:val="Compact"/>
         <w:numPr>
           <w:ilvl w:val="0"/>
-          <w:numId w:val="1438"/>
+          <w:numId w:val="1445"/>
         </w:numPr>
       </w:pPr>
       <w:r>
@@ -10998,7 +11236,7 @@
         <w:pStyle w:val="Compact"/>
         <w:numPr>
           <w:ilvl w:val="0"/>
-          <w:numId w:val="1439"/>
+          <w:numId w:val="1446"/>
         </w:numPr>
       </w:pPr>
       <w:r>
@@ -11010,7 +11248,7 @@
         <w:pStyle w:val="Compact"/>
         <w:numPr>
           <w:ilvl w:val="0"/>
-          <w:numId w:val="1440"/>
+          <w:numId w:val="1447"/>
         </w:numPr>
       </w:pPr>
       <w:r>
@@ -11022,7 +11260,7 @@
         <w:pStyle w:val="Compact"/>
         <w:numPr>
           <w:ilvl w:val="0"/>
-          <w:numId w:val="1441"/>
+          <w:numId w:val="1448"/>
         </w:numPr>
       </w:pPr>
       <w:r>
@@ -11034,7 +11272,7 @@
         <w:pStyle w:val="Compact"/>
         <w:numPr>
           <w:ilvl w:val="0"/>
-          <w:numId w:val="1442"/>
+          <w:numId w:val="1449"/>
         </w:numPr>
       </w:pPr>
       <w:r>
@@ -11046,7 +11284,7 @@
         <w:pStyle w:val="Compact"/>
         <w:numPr>
           <w:ilvl w:val="0"/>
-          <w:numId w:val="1443"/>
+          <w:numId w:val="1450"/>
         </w:numPr>
       </w:pPr>
       <w:r>
@@ -11058,15 +11296,15 @@
         <w:pStyle w:val="Compact"/>
         <w:numPr>
           <w:ilvl w:val="0"/>
-          <w:numId w:val="1444"/>
+          <w:numId w:val="1451"/>
         </w:numPr>
       </w:pPr>
       <w:r>
         <w:t xml:space="preserve">Sidebar remains unchanged unless intentionally touched.</w:t>
       </w:r>
     </w:p>
-    <w:bookmarkEnd w:id="59"/>
-    <w:bookmarkStart w:id="60" w:name="release-readiness"/>
+    <w:bookmarkEnd w:id="60"/>
+    <w:bookmarkStart w:id="61" w:name="release-readiness"/>
     <w:p>
       <w:pPr>
         <w:pStyle w:val="Heading3"/>
@@ -11080,7 +11318,7 @@
         <w:pStyle w:val="Compact"/>
         <w:numPr>
           <w:ilvl w:val="0"/>
-          <w:numId w:val="1445"/>
+          <w:numId w:val="1452"/>
         </w:numPr>
       </w:pPr>
       <w:r>
@@ -11092,7 +11330,7 @@
         <w:pStyle w:val="Compact"/>
         <w:numPr>
           <w:ilvl w:val="0"/>
-          <w:numId w:val="1446"/>
+          <w:numId w:val="1453"/>
         </w:numPr>
       </w:pPr>
       <w:r>
@@ -11104,7 +11342,7 @@
         <w:pStyle w:val="Compact"/>
         <w:numPr>
           <w:ilvl w:val="0"/>
-          <w:numId w:val="1447"/>
+          <w:numId w:val="1454"/>
         </w:numPr>
       </w:pPr>
       <w:r>
@@ -11116,7 +11354,7 @@
         <w:pStyle w:val="Compact"/>
         <w:numPr>
           <w:ilvl w:val="0"/>
-          <w:numId w:val="1448"/>
+          <w:numId w:val="1455"/>
         </w:numPr>
       </w:pPr>
       <w:r>
@@ -11128,7 +11366,7 @@
         <w:pStyle w:val="Compact"/>
         <w:numPr>
           <w:ilvl w:val="0"/>
-          <w:numId w:val="1449"/>
+          <w:numId w:val="1456"/>
         </w:numPr>
       </w:pPr>
       <w:r>
@@ -11140,7 +11378,7 @@
         <w:pStyle w:val="Compact"/>
         <w:numPr>
           <w:ilvl w:val="0"/>
-          <w:numId w:val="1450"/>
+          <w:numId w:val="1457"/>
         </w:numPr>
       </w:pPr>
       <w:r>
@@ -11152,16 +11390,16 @@
         <w:pStyle w:val="Compact"/>
         <w:numPr>
           <w:ilvl w:val="0"/>
-          <w:numId w:val="1451"/>
+          <w:numId w:val="1458"/>
         </w:numPr>
       </w:pPr>
       <w:r>
         <w:t xml:space="preserve">Progress dashboard updated to M1 complete only after all gates pass.</w:t>
       </w:r>
     </w:p>
-    <w:bookmarkEnd w:id="60"/>
     <w:bookmarkEnd w:id="61"/>
-    <w:bookmarkStart w:id="67" w:name="Xa989490dca5dab2d86ca3d9b72c2ded4f0c555a"/>
+    <w:bookmarkEnd w:id="62"/>
+    <w:bookmarkStart w:id="68" w:name="Xa989490dca5dab2d86ca3d9b72c2ded4f0c555a"/>
     <w:p>
       <w:pPr>
         <w:pStyle w:val="Heading2"/>
@@ -11170,7 +11408,7 @@
         <w:t xml:space="preserve">M2.1 — Leads/Campaign Access And Source Fixes</w:t>
       </w:r>
     </w:p>
-    <w:bookmarkStart w:id="62" w:name="implementation-evidence-2026-05-02-4"/>
+    <w:bookmarkStart w:id="63" w:name="implementation-evidence-2026-05-02-4"/>
     <w:p>
       <w:pPr>
         <w:pStyle w:val="Heading3"/>
@@ -11184,7 +11422,7 @@
         <w:pStyle w:val="Compact"/>
         <w:numPr>
           <w:ilvl w:val="0"/>
-          <w:numId w:val="1452"/>
+          <w:numId w:val="1459"/>
         </w:numPr>
       </w:pPr>
       <w:r>
@@ -11256,7 +11494,7 @@
         <w:pStyle w:val="Compact"/>
         <w:numPr>
           <w:ilvl w:val="0"/>
-          <w:numId w:val="1453"/>
+          <w:numId w:val="1460"/>
         </w:numPr>
       </w:pPr>
       <w:r>
@@ -11268,7 +11506,7 @@
         <w:pStyle w:val="Compact"/>
         <w:numPr>
           <w:ilvl w:val="0"/>
-          <w:numId w:val="1454"/>
+          <w:numId w:val="1461"/>
         </w:numPr>
       </w:pPr>
       <w:r>
@@ -11295,7 +11533,7 @@
         <w:pStyle w:val="Compact"/>
         <w:numPr>
           <w:ilvl w:val="0"/>
-          <w:numId w:val="1455"/>
+          <w:numId w:val="1462"/>
         </w:numPr>
       </w:pPr>
       <w:r>
@@ -11349,7 +11587,7 @@
         <w:pStyle w:val="Compact"/>
         <w:numPr>
           <w:ilvl w:val="0"/>
-          <w:numId w:val="1456"/>
+          <w:numId w:val="1463"/>
         </w:numPr>
       </w:pPr>
       <w:r>
@@ -11361,15 +11599,15 @@
         <w:pStyle w:val="Compact"/>
         <w:numPr>
           <w:ilvl w:val="0"/>
-          <w:numId w:val="1457"/>
+          <w:numId w:val="1464"/>
         </w:numPr>
       </w:pPr>
       <w:r>
         <w:t xml:space="preserve">CSV import smoke pending with two real rep accounts.</w:t>
       </w:r>
     </w:p>
-    <w:bookmarkEnd w:id="62"/>
-    <w:bookmarkStart w:id="63" w:name="leads-ownership-bug"/>
+    <w:bookmarkEnd w:id="63"/>
+    <w:bookmarkStart w:id="64" w:name="leads-ownership-bug"/>
     <w:p>
       <w:pPr>
         <w:pStyle w:val="Heading3"/>
@@ -11383,7 +11621,7 @@
         <w:pStyle w:val="Compact"/>
         <w:numPr>
           <w:ilvl w:val="0"/>
-          <w:numId w:val="1458"/>
+          <w:numId w:val="1465"/>
         </w:numPr>
       </w:pPr>
       <w:r>
@@ -11434,7 +11672,7 @@
         <w:pStyle w:val="Compact"/>
         <w:numPr>
           <w:ilvl w:val="0"/>
-          <w:numId w:val="1459"/>
+          <w:numId w:val="1466"/>
         </w:numPr>
       </w:pPr>
       <w:r>
@@ -11461,7 +11699,7 @@
         <w:pStyle w:val="Compact"/>
         <w:numPr>
           <w:ilvl w:val="0"/>
-          <w:numId w:val="1460"/>
+          <w:numId w:val="1467"/>
         </w:numPr>
       </w:pPr>
       <w:r>
@@ -11473,7 +11711,7 @@
         <w:pStyle w:val="Compact"/>
         <w:numPr>
           <w:ilvl w:val="0"/>
-          <w:numId w:val="1461"/>
+          <w:numId w:val="1468"/>
         </w:numPr>
       </w:pPr>
       <w:r>
@@ -11500,7 +11738,7 @@
         <w:pStyle w:val="Compact"/>
         <w:numPr>
           <w:ilvl w:val="0"/>
-          <w:numId w:val="1462"/>
+          <w:numId w:val="1469"/>
         </w:numPr>
       </w:pPr>
       <w:r>
@@ -11512,7 +11750,7 @@
         <w:pStyle w:val="Compact"/>
         <w:numPr>
           <w:ilvl w:val="0"/>
-          <w:numId w:val="1463"/>
+          <w:numId w:val="1470"/>
         </w:numPr>
       </w:pPr>
       <w:r>
@@ -11524,15 +11762,15 @@
         <w:pStyle w:val="Compact"/>
         <w:numPr>
           <w:ilvl w:val="0"/>
-          <w:numId w:val="1464"/>
+          <w:numId w:val="1471"/>
         </w:numPr>
       </w:pPr>
       <w:r>
         <w:t xml:space="preserve">Manager behavior documented: manager keeps admin-like global visibility for M2.1 unless JB narrows manager scope later.</w:t>
       </w:r>
     </w:p>
-    <w:bookmarkEnd w:id="63"/>
-    <w:bookmarkStart w:id="64" w:name="campaign-ownership-bug"/>
+    <w:bookmarkEnd w:id="64"/>
+    <w:bookmarkStart w:id="65" w:name="campaign-ownership-bug"/>
     <w:p>
       <w:pPr>
         <w:pStyle w:val="Heading3"/>
@@ -11546,7 +11784,7 @@
         <w:pStyle w:val="Compact"/>
         <w:numPr>
           <w:ilvl w:val="0"/>
-          <w:numId w:val="1465"/>
+          <w:numId w:val="1472"/>
         </w:numPr>
       </w:pPr>
       <w:r>
@@ -11570,7 +11808,7 @@
         <w:pStyle w:val="Compact"/>
         <w:numPr>
           <w:ilvl w:val="0"/>
-          <w:numId w:val="1466"/>
+          <w:numId w:val="1473"/>
         </w:numPr>
       </w:pPr>
       <w:r>
@@ -11594,7 +11832,7 @@
         <w:pStyle w:val="Compact"/>
         <w:numPr>
           <w:ilvl w:val="0"/>
-          <w:numId w:val="1467"/>
+          <w:numId w:val="1474"/>
         </w:numPr>
       </w:pPr>
       <w:r>
@@ -11606,7 +11844,7 @@
         <w:pStyle w:val="Compact"/>
         <w:numPr>
           <w:ilvl w:val="0"/>
-          <w:numId w:val="1468"/>
+          <w:numId w:val="1475"/>
         </w:numPr>
       </w:pPr>
       <w:r>
@@ -11618,7 +11856,7 @@
         <w:pStyle w:val="Compact"/>
         <w:numPr>
           <w:ilvl w:val="0"/>
-          <w:numId w:val="1469"/>
+          <w:numId w:val="1476"/>
         </w:numPr>
       </w:pPr>
       <w:r>
@@ -11630,7 +11868,7 @@
         <w:pStyle w:val="Compact"/>
         <w:numPr>
           <w:ilvl w:val="0"/>
-          <w:numId w:val="1470"/>
+          <w:numId w:val="1477"/>
         </w:numPr>
       </w:pPr>
       <w:r>
@@ -11646,8 +11884,8 @@
         <w:t xml:space="preserve">remains compatible.</w:t>
       </w:r>
     </w:p>
-    <w:bookmarkEnd w:id="64"/>
-    <w:bookmarkStart w:id="65" w:name="source-readable-fix"/>
+    <w:bookmarkEnd w:id="65"/>
+    <w:bookmarkStart w:id="66" w:name="source-readable-fix"/>
     <w:p>
       <w:pPr>
         <w:pStyle w:val="Heading3"/>
@@ -11661,7 +11899,7 @@
         <w:pStyle w:val="Compact"/>
         <w:numPr>
           <w:ilvl w:val="0"/>
-          <w:numId w:val="1471"/>
+          <w:numId w:val="1478"/>
         </w:numPr>
       </w:pPr>
       <w:r>
@@ -11673,7 +11911,7 @@
         <w:pStyle w:val="Compact"/>
         <w:numPr>
           <w:ilvl w:val="0"/>
-          <w:numId w:val="1472"/>
+          <w:numId w:val="1479"/>
         </w:numPr>
       </w:pPr>
       <w:r>
@@ -11685,7 +11923,7 @@
         <w:pStyle w:val="Compact"/>
         <w:numPr>
           <w:ilvl w:val="1"/>
-          <w:numId w:val="1473"/>
+          <w:numId w:val="1480"/>
         </w:numPr>
       </w:pPr>
       <w:r>
@@ -11703,7 +11941,7 @@
         <w:pStyle w:val="Compact"/>
         <w:numPr>
           <w:ilvl w:val="1"/>
-          <w:numId w:val="1473"/>
+          <w:numId w:val="1480"/>
         </w:numPr>
       </w:pPr>
       <w:r>
@@ -11721,7 +11959,7 @@
         <w:pStyle w:val="Compact"/>
         <w:numPr>
           <w:ilvl w:val="1"/>
-          <w:numId w:val="1473"/>
+          <w:numId w:val="1480"/>
         </w:numPr>
       </w:pPr>
       <w:r>
@@ -11739,7 +11977,7 @@
         <w:pStyle w:val="Compact"/>
         <w:numPr>
           <w:ilvl w:val="1"/>
-          <w:numId w:val="1473"/>
+          <w:numId w:val="1480"/>
         </w:numPr>
       </w:pPr>
       <w:r>
@@ -11757,7 +11995,7 @@
         <w:pStyle w:val="Compact"/>
         <w:numPr>
           <w:ilvl w:val="0"/>
-          <w:numId w:val="1474"/>
+          <w:numId w:val="1481"/>
         </w:numPr>
       </w:pPr>
       <w:r>
@@ -11769,7 +12007,7 @@
         <w:pStyle w:val="Compact"/>
         <w:numPr>
           <w:ilvl w:val="0"/>
-          <w:numId w:val="1475"/>
+          <w:numId w:val="1482"/>
         </w:numPr>
       </w:pPr>
       <w:r>
@@ -11781,15 +12019,15 @@
         <w:pStyle w:val="Compact"/>
         <w:numPr>
           <w:ilvl w:val="0"/>
-          <w:numId w:val="1476"/>
+          <w:numId w:val="1483"/>
         </w:numPr>
       </w:pPr>
       <w:r>
         <w:t xml:space="preserve">Campaign-created leads preserve campaign/list lineage.</w:t>
       </w:r>
     </w:p>
-    <w:bookmarkEnd w:id="65"/>
-    <w:bookmarkStart w:id="66" w:name="m2.1-testing-gate"/>
+    <w:bookmarkEnd w:id="66"/>
+    <w:bookmarkStart w:id="67" w:name="m2.1-testing-gate"/>
     <w:p>
       <w:pPr>
         <w:pStyle w:val="Heading3"/>
@@ -11803,7 +12041,7 @@
         <w:pStyle w:val="Compact"/>
         <w:numPr>
           <w:ilvl w:val="0"/>
-          <w:numId w:val="1477"/>
+          <w:numId w:val="1484"/>
         </w:numPr>
       </w:pPr>
       <w:r>
@@ -11815,7 +12053,7 @@
         <w:pStyle w:val="Compact"/>
         <w:numPr>
           <w:ilvl w:val="0"/>
-          <w:numId w:val="1478"/>
+          <w:numId w:val="1485"/>
         </w:numPr>
       </w:pPr>
       <w:r>
@@ -11827,7 +12065,7 @@
         <w:pStyle w:val="Compact"/>
         <w:numPr>
           <w:ilvl w:val="0"/>
-          <w:numId w:val="1479"/>
+          <w:numId w:val="1486"/>
         </w:numPr>
       </w:pPr>
       <w:r>
@@ -11839,7 +12077,7 @@
         <w:pStyle w:val="Compact"/>
         <w:numPr>
           <w:ilvl w:val="0"/>
-          <w:numId w:val="1480"/>
+          <w:numId w:val="1487"/>
         </w:numPr>
       </w:pPr>
       <w:r>
@@ -11851,7 +12089,7 @@
         <w:pStyle w:val="Compact"/>
         <w:numPr>
           <w:ilvl w:val="0"/>
-          <w:numId w:val="1481"/>
+          <w:numId w:val="1488"/>
         </w:numPr>
       </w:pPr>
       <w:r>
@@ -11863,7 +12101,7 @@
         <w:pStyle w:val="Compact"/>
         <w:numPr>
           <w:ilvl w:val="0"/>
-          <w:numId w:val="1482"/>
+          <w:numId w:val="1489"/>
         </w:numPr>
       </w:pPr>
       <w:r>
@@ -11875,7 +12113,7 @@
         <w:pStyle w:val="Compact"/>
         <w:numPr>
           <w:ilvl w:val="0"/>
-          <w:numId w:val="1483"/>
+          <w:numId w:val="1490"/>
         </w:numPr>
       </w:pPr>
       <w:r>
@@ -11887,7 +12125,7 @@
         <w:pStyle w:val="Compact"/>
         <w:numPr>
           <w:ilvl w:val="0"/>
-          <w:numId w:val="1484"/>
+          <w:numId w:val="1491"/>
         </w:numPr>
       </w:pPr>
       <w:r>
@@ -11899,16 +12137,16 @@
         <w:pStyle w:val="Compact"/>
         <w:numPr>
           <w:ilvl w:val="0"/>
-          <w:numId w:val="1485"/>
+          <w:numId w:val="1492"/>
         </w:numPr>
       </w:pPr>
       <w:r>
         <w:t xml:space="preserve">Progress dashboard updated.</w:t>
       </w:r>
     </w:p>
-    <w:bookmarkEnd w:id="66"/>
     <w:bookmarkEnd w:id="67"/>
-    <w:bookmarkStart w:id="74" w:name="X80216ddf01e64983419846741e514a0cb2a2ddb"/>
+    <w:bookmarkEnd w:id="68"/>
+    <w:bookmarkStart w:id="75" w:name="X80216ddf01e64983419846741e514a0cb2a2ddb"/>
     <w:p>
       <w:pPr>
         <w:pStyle w:val="Heading2"/>
@@ -11917,7 +12155,7 @@
         <w:t xml:space="preserve">M2.2 — Leads Enrichment Columns And Export CSV</w:t>
       </w:r>
     </w:p>
-    <w:bookmarkStart w:id="68" w:name="implementation-evidence-2026-05-02-5"/>
+    <w:bookmarkStart w:id="69" w:name="implementation-evidence-2026-05-02-5"/>
     <w:p>
       <w:pPr>
         <w:pStyle w:val="Heading3"/>
@@ -11931,7 +12169,7 @@
         <w:pStyle w:val="Compact"/>
         <w:numPr>
           <w:ilvl w:val="0"/>
-          <w:numId w:val="1486"/>
+          <w:numId w:val="1493"/>
         </w:numPr>
       </w:pPr>
       <w:r>
@@ -11958,7 +12196,7 @@
         <w:pStyle w:val="Compact"/>
         <w:numPr>
           <w:ilvl w:val="0"/>
-          <w:numId w:val="1487"/>
+          <w:numId w:val="1494"/>
         </w:numPr>
       </w:pPr>
       <w:r>
@@ -12030,7 +12268,7 @@
         <w:pStyle w:val="Compact"/>
         <w:numPr>
           <w:ilvl w:val="0"/>
-          <w:numId w:val="1488"/>
+          <w:numId w:val="1495"/>
         </w:numPr>
       </w:pPr>
       <w:r>
@@ -12057,7 +12295,7 @@
         <w:pStyle w:val="Compact"/>
         <w:numPr>
           <w:ilvl w:val="0"/>
-          <w:numId w:val="1489"/>
+          <w:numId w:val="1496"/>
         </w:numPr>
       </w:pPr>
       <w:r>
@@ -12069,7 +12307,7 @@
         <w:pStyle w:val="Compact"/>
         <w:numPr>
           <w:ilvl w:val="0"/>
-          <w:numId w:val="1490"/>
+          <w:numId w:val="1497"/>
         </w:numPr>
       </w:pPr>
       <w:r>
@@ -12096,7 +12334,7 @@
         <w:pStyle w:val="Compact"/>
         <w:numPr>
           <w:ilvl w:val="0"/>
-          <w:numId w:val="1491"/>
+          <w:numId w:val="1498"/>
         </w:numPr>
       </w:pPr>
       <w:r>
@@ -12108,7 +12346,7 @@
         <w:pStyle w:val="Compact"/>
         <w:numPr>
           <w:ilvl w:val="0"/>
-          <w:numId w:val="1492"/>
+          <w:numId w:val="1499"/>
         </w:numPr>
       </w:pPr>
       <w:r>
@@ -12135,7 +12373,7 @@
         <w:pStyle w:val="Compact"/>
         <w:numPr>
           <w:ilvl w:val="0"/>
-          <w:numId w:val="1493"/>
+          <w:numId w:val="1500"/>
         </w:numPr>
       </w:pPr>
       <w:r>
@@ -12177,7 +12415,7 @@
         <w:pStyle w:val="Compact"/>
         <w:numPr>
           <w:ilvl w:val="0"/>
-          <w:numId w:val="1494"/>
+          <w:numId w:val="1501"/>
         </w:numPr>
       </w:pPr>
       <w:r>
@@ -12213,15 +12451,15 @@
         <w:pStyle w:val="Compact"/>
         <w:numPr>
           <w:ilvl w:val="0"/>
-          <w:numId w:val="1495"/>
+          <w:numId w:val="1502"/>
         </w:numPr>
       </w:pPr>
       <w:r>
         <w:t xml:space="preserve">Targeted ESLint passed with 0 errors and existing warning debt only.</w:t>
       </w:r>
     </w:p>
-    <w:bookmarkEnd w:id="68"/>
-    <w:bookmarkStart w:id="69" w:name="leads-table-columns"/>
+    <w:bookmarkEnd w:id="69"/>
+    <w:bookmarkStart w:id="70" w:name="leads-table-columns"/>
     <w:p>
       <w:pPr>
         <w:pStyle w:val="Heading3"/>
@@ -12235,7 +12473,7 @@
         <w:pStyle w:val="Compact"/>
         <w:numPr>
           <w:ilvl w:val="0"/>
-          <w:numId w:val="1496"/>
+          <w:numId w:val="1503"/>
         </w:numPr>
       </w:pPr>
       <w:r>
@@ -12247,7 +12485,7 @@
         <w:pStyle w:val="Compact"/>
         <w:numPr>
           <w:ilvl w:val="0"/>
-          <w:numId w:val="1497"/>
+          <w:numId w:val="1504"/>
         </w:numPr>
       </w:pPr>
       <w:r>
@@ -12259,7 +12497,7 @@
         <w:pStyle w:val="Compact"/>
         <w:numPr>
           <w:ilvl w:val="1"/>
-          <w:numId w:val="1498"/>
+          <w:numId w:val="1505"/>
         </w:numPr>
       </w:pPr>
       <w:r>
@@ -12271,7 +12509,7 @@
         <w:pStyle w:val="Compact"/>
         <w:numPr>
           <w:ilvl w:val="1"/>
-          <w:numId w:val="1498"/>
+          <w:numId w:val="1505"/>
         </w:numPr>
       </w:pPr>
       <w:r>
@@ -12283,7 +12521,7 @@
         <w:pStyle w:val="Compact"/>
         <w:numPr>
           <w:ilvl w:val="1"/>
-          <w:numId w:val="1498"/>
+          <w:numId w:val="1505"/>
         </w:numPr>
       </w:pPr>
       <w:r>
@@ -12295,7 +12533,7 @@
         <w:pStyle w:val="Compact"/>
         <w:numPr>
           <w:ilvl w:val="1"/>
-          <w:numId w:val="1498"/>
+          <w:numId w:val="1505"/>
         </w:numPr>
       </w:pPr>
       <w:r>
@@ -12307,7 +12545,7 @@
         <w:pStyle w:val="Compact"/>
         <w:numPr>
           <w:ilvl w:val="1"/>
-          <w:numId w:val="1498"/>
+          <w:numId w:val="1505"/>
         </w:numPr>
       </w:pPr>
       <w:r>
@@ -12319,7 +12557,7 @@
         <w:pStyle w:val="Compact"/>
         <w:numPr>
           <w:ilvl w:val="1"/>
-          <w:numId w:val="1498"/>
+          <w:numId w:val="1505"/>
         </w:numPr>
       </w:pPr>
       <w:r>
@@ -12331,7 +12569,7 @@
         <w:pStyle w:val="Compact"/>
         <w:numPr>
           <w:ilvl w:val="1"/>
-          <w:numId w:val="1498"/>
+          <w:numId w:val="1505"/>
         </w:numPr>
       </w:pPr>
       <w:r>
@@ -12343,7 +12581,7 @@
         <w:pStyle w:val="Compact"/>
         <w:numPr>
           <w:ilvl w:val="1"/>
-          <w:numId w:val="1498"/>
+          <w:numId w:val="1505"/>
         </w:numPr>
       </w:pPr>
       <w:r>
@@ -12355,7 +12593,7 @@
         <w:pStyle w:val="Compact"/>
         <w:numPr>
           <w:ilvl w:val="0"/>
-          <w:numId w:val="1499"/>
+          <w:numId w:val="1506"/>
         </w:numPr>
       </w:pPr>
       <w:r>
@@ -12376,7 +12614,7 @@
         <w:pStyle w:val="Compact"/>
         <w:numPr>
           <w:ilvl w:val="0"/>
-          <w:numId w:val="1500"/>
+          <w:numId w:val="1507"/>
         </w:numPr>
       </w:pPr>
       <w:r>
@@ -12400,7 +12638,7 @@
         <w:pStyle w:val="Compact"/>
         <w:numPr>
           <w:ilvl w:val="0"/>
-          <w:numId w:val="1501"/>
+          <w:numId w:val="1508"/>
         </w:numPr>
       </w:pPr>
       <w:r>
@@ -12412,7 +12650,7 @@
         <w:pStyle w:val="Compact"/>
         <w:numPr>
           <w:ilvl w:val="1"/>
-          <w:numId w:val="1502"/>
+          <w:numId w:val="1509"/>
         </w:numPr>
       </w:pPr>
       <w:r>
@@ -12424,7 +12662,7 @@
         <w:pStyle w:val="Compact"/>
         <w:numPr>
           <w:ilvl w:val="1"/>
-          <w:numId w:val="1502"/>
+          <w:numId w:val="1509"/>
         </w:numPr>
       </w:pPr>
       <w:r>
@@ -12436,7 +12674,7 @@
         <w:pStyle w:val="Compact"/>
         <w:numPr>
           <w:ilvl w:val="1"/>
-          <w:numId w:val="1502"/>
+          <w:numId w:val="1509"/>
         </w:numPr>
       </w:pPr>
       <w:r>
@@ -12448,7 +12686,7 @@
         <w:pStyle w:val="Compact"/>
         <w:numPr>
           <w:ilvl w:val="0"/>
-          <w:numId w:val="1503"/>
+          <w:numId w:val="1510"/>
         </w:numPr>
       </w:pPr>
       <w:r>
@@ -12472,7 +12710,7 @@
         <w:pStyle w:val="Compact"/>
         <w:numPr>
           <w:ilvl w:val="0"/>
-          <w:numId w:val="1504"/>
+          <w:numId w:val="1511"/>
         </w:numPr>
       </w:pPr>
       <w:r>
@@ -12484,7 +12722,7 @@
         <w:pStyle w:val="Compact"/>
         <w:numPr>
           <w:ilvl w:val="0"/>
-          <w:numId w:val="1505"/>
+          <w:numId w:val="1512"/>
         </w:numPr>
       </w:pPr>
       <w:r>
@@ -12496,15 +12734,15 @@
         <w:pStyle w:val="Compact"/>
         <w:numPr>
           <w:ilvl w:val="0"/>
-          <w:numId w:val="1506"/>
+          <w:numId w:val="1513"/>
         </w:numPr>
       </w:pPr>
       <w:r>
         <w:t xml:space="preserve">Avatar initials match prototype density.</w:t>
       </w:r>
     </w:p>
-    <w:bookmarkEnd w:id="69"/>
-    <w:bookmarkStart w:id="70" w:name="data-plumbing"/>
+    <w:bookmarkEnd w:id="70"/>
+    <w:bookmarkStart w:id="71" w:name="data-plumbing"/>
     <w:p>
       <w:pPr>
         <w:pStyle w:val="Heading3"/>
@@ -12518,7 +12756,7 @@
         <w:pStyle w:val="Compact"/>
         <w:numPr>
           <w:ilvl w:val="0"/>
-          <w:numId w:val="1507"/>
+          <w:numId w:val="1514"/>
         </w:numPr>
       </w:pPr>
       <w:r>
@@ -12530,7 +12768,7 @@
         <w:pStyle w:val="Compact"/>
         <w:numPr>
           <w:ilvl w:val="1"/>
-          <w:numId w:val="1508"/>
+          <w:numId w:val="1515"/>
         </w:numPr>
       </w:pPr>
       <w:r>
@@ -12542,7 +12780,7 @@
         <w:pStyle w:val="Compact"/>
         <w:numPr>
           <w:ilvl w:val="1"/>
-          <w:numId w:val="1508"/>
+          <w:numId w:val="1515"/>
         </w:numPr>
       </w:pPr>
       <w:r>
@@ -12554,7 +12792,7 @@
         <w:pStyle w:val="Compact"/>
         <w:numPr>
           <w:ilvl w:val="1"/>
-          <w:numId w:val="1508"/>
+          <w:numId w:val="1515"/>
         </w:numPr>
       </w:pPr>
       <w:r>
@@ -12566,7 +12804,7 @@
         <w:pStyle w:val="Compact"/>
         <w:numPr>
           <w:ilvl w:val="0"/>
-          <w:numId w:val="1509"/>
+          <w:numId w:val="1516"/>
         </w:numPr>
       </w:pPr>
       <w:r>
@@ -12578,7 +12816,7 @@
         <w:pStyle w:val="Compact"/>
         <w:numPr>
           <w:ilvl w:val="1"/>
-          <w:numId w:val="1510"/>
+          <w:numId w:val="1517"/>
         </w:numPr>
       </w:pPr>
       <w:r>
@@ -12590,7 +12828,7 @@
         <w:pStyle w:val="Compact"/>
         <w:numPr>
           <w:ilvl w:val="1"/>
-          <w:numId w:val="1510"/>
+          <w:numId w:val="1517"/>
         </w:numPr>
       </w:pPr>
       <w:r>
@@ -12602,7 +12840,7 @@
         <w:pStyle w:val="Compact"/>
         <w:numPr>
           <w:ilvl w:val="1"/>
-          <w:numId w:val="1510"/>
+          <w:numId w:val="1517"/>
         </w:numPr>
       </w:pPr>
       <w:r>
@@ -12614,7 +12852,7 @@
         <w:pStyle w:val="Compact"/>
         <w:numPr>
           <w:ilvl w:val="0"/>
-          <w:numId w:val="1511"/>
+          <w:numId w:val="1518"/>
         </w:numPr>
       </w:pPr>
       <w:r>
@@ -12626,7 +12864,7 @@
         <w:pStyle w:val="Compact"/>
         <w:numPr>
           <w:ilvl w:val="0"/>
-          <w:numId w:val="1512"/>
+          <w:numId w:val="1519"/>
         </w:numPr>
       </w:pPr>
       <w:r>
@@ -12638,15 +12876,15 @@
         <w:pStyle w:val="Compact"/>
         <w:numPr>
           <w:ilvl w:val="0"/>
-          <w:numId w:val="1513"/>
+          <w:numId w:val="1520"/>
         </w:numPr>
       </w:pPr>
       <w:r>
         <w:t xml:space="preserve">Rep scope applies to all enrichment queries.</w:t>
       </w:r>
     </w:p>
-    <w:bookmarkEnd w:id="70"/>
-    <w:bookmarkStart w:id="71" w:name="export-csv"/>
+    <w:bookmarkEnd w:id="71"/>
+    <w:bookmarkStart w:id="72" w:name="export-csv"/>
     <w:p>
       <w:pPr>
         <w:pStyle w:val="Heading3"/>
@@ -12660,7 +12898,7 @@
         <w:pStyle w:val="Compact"/>
         <w:numPr>
           <w:ilvl w:val="0"/>
-          <w:numId w:val="1514"/>
+          <w:numId w:val="1521"/>
         </w:numPr>
       </w:pPr>
       <w:r>
@@ -12681,7 +12919,7 @@
         <w:pStyle w:val="Compact"/>
         <w:numPr>
           <w:ilvl w:val="0"/>
-          <w:numId w:val="1515"/>
+          <w:numId w:val="1522"/>
         </w:numPr>
       </w:pPr>
       <w:r>
@@ -12693,7 +12931,7 @@
         <w:pStyle w:val="Compact"/>
         <w:numPr>
           <w:ilvl w:val="0"/>
-          <w:numId w:val="1516"/>
+          <w:numId w:val="1523"/>
         </w:numPr>
       </w:pPr>
       <w:r>
@@ -12705,7 +12943,7 @@
         <w:pStyle w:val="Compact"/>
         <w:numPr>
           <w:ilvl w:val="0"/>
-          <w:numId w:val="1517"/>
+          <w:numId w:val="1524"/>
         </w:numPr>
       </w:pPr>
       <w:r>
@@ -12717,7 +12955,7 @@
         <w:pStyle w:val="Compact"/>
         <w:numPr>
           <w:ilvl w:val="0"/>
-          <w:numId w:val="1518"/>
+          <w:numId w:val="1525"/>
         </w:numPr>
       </w:pPr>
       <w:r>
@@ -12729,7 +12967,7 @@
         <w:pStyle w:val="Compact"/>
         <w:numPr>
           <w:ilvl w:val="0"/>
-          <w:numId w:val="1519"/>
+          <w:numId w:val="1526"/>
         </w:numPr>
       </w:pPr>
       <w:r>
@@ -12741,7 +12979,7 @@
         <w:pStyle w:val="Compact"/>
         <w:numPr>
           <w:ilvl w:val="1"/>
-          <w:numId w:val="1520"/>
+          <w:numId w:val="1527"/>
         </w:numPr>
       </w:pPr>
       <w:r>
@@ -12753,7 +12991,7 @@
         <w:pStyle w:val="Compact"/>
         <w:numPr>
           <w:ilvl w:val="1"/>
-          <w:numId w:val="1520"/>
+          <w:numId w:val="1527"/>
         </w:numPr>
       </w:pPr>
       <w:r>
@@ -12765,7 +13003,7 @@
         <w:pStyle w:val="Compact"/>
         <w:numPr>
           <w:ilvl w:val="1"/>
-          <w:numId w:val="1520"/>
+          <w:numId w:val="1527"/>
         </w:numPr>
       </w:pPr>
       <w:r>
@@ -12777,7 +13015,7 @@
         <w:pStyle w:val="Compact"/>
         <w:numPr>
           <w:ilvl w:val="1"/>
-          <w:numId w:val="1520"/>
+          <w:numId w:val="1527"/>
         </w:numPr>
       </w:pPr>
       <w:r>
@@ -12789,7 +13027,7 @@
         <w:pStyle w:val="Compact"/>
         <w:numPr>
           <w:ilvl w:val="1"/>
-          <w:numId w:val="1520"/>
+          <w:numId w:val="1527"/>
         </w:numPr>
       </w:pPr>
       <w:r>
@@ -12801,7 +13039,7 @@
         <w:pStyle w:val="Compact"/>
         <w:numPr>
           <w:ilvl w:val="1"/>
-          <w:numId w:val="1520"/>
+          <w:numId w:val="1527"/>
         </w:numPr>
       </w:pPr>
       <w:r>
@@ -12813,7 +13051,7 @@
         <w:pStyle w:val="Compact"/>
         <w:numPr>
           <w:ilvl w:val="0"/>
-          <w:numId w:val="1521"/>
+          <w:numId w:val="1528"/>
         </w:numPr>
       </w:pPr>
       <w:r>
@@ -12825,15 +13063,15 @@
         <w:pStyle w:val="Compact"/>
         <w:numPr>
           <w:ilvl w:val="0"/>
-          <w:numId w:val="1522"/>
+          <w:numId w:val="1529"/>
         </w:numPr>
       </w:pPr>
       <w:r>
         <w:t xml:space="preserve">CSV escaping handles commas, quotes, line breaks.</w:t>
       </w:r>
     </w:p>
-    <w:bookmarkEnd w:id="71"/>
-    <w:bookmarkStart w:id="72" w:name="m2.2-style-isolation"/>
+    <w:bookmarkEnd w:id="72"/>
+    <w:bookmarkStart w:id="73" w:name="m2.2-style-isolation"/>
     <w:p>
       <w:pPr>
         <w:pStyle w:val="Heading3"/>
@@ -12847,7 +13085,7 @@
         <w:pStyle w:val="Compact"/>
         <w:numPr>
           <w:ilvl w:val="0"/>
-          <w:numId w:val="1523"/>
+          <w:numId w:val="1530"/>
         </w:numPr>
       </w:pPr>
       <w:r>
@@ -12859,7 +13097,7 @@
         <w:pStyle w:val="Compact"/>
         <w:numPr>
           <w:ilvl w:val="0"/>
-          <w:numId w:val="1524"/>
+          <w:numId w:val="1531"/>
         </w:numPr>
       </w:pPr>
       <w:r>
@@ -12871,7 +13109,7 @@
         <w:pStyle w:val="Compact"/>
         <w:numPr>
           <w:ilvl w:val="0"/>
-          <w:numId w:val="1525"/>
+          <w:numId w:val="1532"/>
         </w:numPr>
       </w:pPr>
       <w:r>
@@ -12883,7 +13121,7 @@
         <w:pStyle w:val="Compact"/>
         <w:numPr>
           <w:ilvl w:val="0"/>
-          <w:numId w:val="1526"/>
+          <w:numId w:val="1533"/>
         </w:numPr>
       </w:pPr>
       <w:r>
@@ -12895,15 +13133,15 @@
         <w:pStyle w:val="Compact"/>
         <w:numPr>
           <w:ilvl w:val="0"/>
-          <w:numId w:val="1527"/>
+          <w:numId w:val="1534"/>
         </w:numPr>
       </w:pPr>
       <w:r>
         <w:t xml:space="preserve">Ensure text truncation/line wrapping is deliberate and not overlapping.</w:t>
       </w:r>
     </w:p>
-    <w:bookmarkEnd w:id="72"/>
-    <w:bookmarkStart w:id="73" w:name="m2.2-testing-gate"/>
+    <w:bookmarkEnd w:id="73"/>
+    <w:bookmarkStart w:id="74" w:name="m2.2-testing-gate"/>
     <w:p>
       <w:pPr>
         <w:pStyle w:val="Heading3"/>
@@ -12917,7 +13155,7 @@
         <w:pStyle w:val="Compact"/>
         <w:numPr>
           <w:ilvl w:val="0"/>
-          <w:numId w:val="1528"/>
+          <w:numId w:val="1535"/>
         </w:numPr>
       </w:pPr>
       <w:r>
@@ -12929,7 +13167,7 @@
         <w:pStyle w:val="Compact"/>
         <w:numPr>
           <w:ilvl w:val="0"/>
-          <w:numId w:val="1529"/>
+          <w:numId w:val="1536"/>
         </w:numPr>
       </w:pPr>
       <w:r>
@@ -12941,7 +13179,7 @@
         <w:pStyle w:val="Compact"/>
         <w:numPr>
           <w:ilvl w:val="0"/>
-          <w:numId w:val="1530"/>
+          <w:numId w:val="1537"/>
         </w:numPr>
       </w:pPr>
       <w:r>
@@ -12953,7 +13191,7 @@
         <w:pStyle w:val="Compact"/>
         <w:numPr>
           <w:ilvl w:val="0"/>
-          <w:numId w:val="1531"/>
+          <w:numId w:val="1538"/>
         </w:numPr>
       </w:pPr>
       <w:r>
@@ -12965,7 +13203,7 @@
         <w:pStyle w:val="Compact"/>
         <w:numPr>
           <w:ilvl w:val="0"/>
-          <w:numId w:val="1532"/>
+          <w:numId w:val="1539"/>
         </w:numPr>
       </w:pPr>
       <w:r>
@@ -12977,7 +13215,7 @@
         <w:pStyle w:val="Compact"/>
         <w:numPr>
           <w:ilvl w:val="0"/>
-          <w:numId w:val="1533"/>
+          <w:numId w:val="1540"/>
         </w:numPr>
       </w:pPr>
       <w:r>
@@ -12989,7 +13227,7 @@
         <w:pStyle w:val="Compact"/>
         <w:numPr>
           <w:ilvl w:val="0"/>
-          <w:numId w:val="1534"/>
+          <w:numId w:val="1541"/>
         </w:numPr>
       </w:pPr>
       <w:r>
@@ -13001,16 +13239,16 @@
         <w:pStyle w:val="Compact"/>
         <w:numPr>
           <w:ilvl w:val="0"/>
-          <w:numId w:val="1535"/>
+          <w:numId w:val="1542"/>
         </w:numPr>
       </w:pPr>
       <w:r>
         <w:t xml:space="preserve">Progress dashboard updated.</w:t>
       </w:r>
     </w:p>
-    <w:bookmarkEnd w:id="73"/>
     <w:bookmarkEnd w:id="74"/>
-    <w:bookmarkStart w:id="85" w:name="m2.3-ai-retarget-campaigns"/>
+    <w:bookmarkEnd w:id="75"/>
+    <w:bookmarkStart w:id="86" w:name="m2.3-ai-retarget-campaigns"/>
     <w:p>
       <w:pPr>
         <w:pStyle w:val="Heading2"/>
@@ -13019,7 +13257,7 @@
         <w:t xml:space="preserve">M2.3 — AI Retarget Campaigns</w:t>
       </w:r>
     </w:p>
-    <w:bookmarkStart w:id="75" w:name="implementation-evidence-2026-05-02-6"/>
+    <w:bookmarkStart w:id="76" w:name="implementation-evidence-2026-05-02-6"/>
     <w:p>
       <w:pPr>
         <w:pStyle w:val="Heading3"/>
@@ -13033,7 +13271,7 @@
         <w:pStyle w:val="Compact"/>
         <w:numPr>
           <w:ilvl w:val="0"/>
-          <w:numId w:val="1536"/>
+          <w:numId w:val="1543"/>
         </w:numPr>
       </w:pPr>
       <w:r>
@@ -13081,7 +13319,7 @@
         <w:pStyle w:val="Compact"/>
         <w:numPr>
           <w:ilvl w:val="0"/>
-          <w:numId w:val="1537"/>
+          <w:numId w:val="1544"/>
         </w:numPr>
       </w:pPr>
       <w:r>
@@ -13093,7 +13331,7 @@
         <w:pStyle w:val="Compact"/>
         <w:numPr>
           <w:ilvl w:val="0"/>
-          <w:numId w:val="1538"/>
+          <w:numId w:val="1545"/>
         </w:numPr>
       </w:pPr>
       <w:r>
@@ -13105,7 +13343,7 @@
         <w:pStyle w:val="Compact"/>
         <w:numPr>
           <w:ilvl w:val="0"/>
-          <w:numId w:val="1539"/>
+          <w:numId w:val="1546"/>
         </w:numPr>
       </w:pPr>
       <w:r>
@@ -13117,7 +13355,7 @@
         <w:pStyle w:val="Compact"/>
         <w:numPr>
           <w:ilvl w:val="0"/>
-          <w:numId w:val="1540"/>
+          <w:numId w:val="1547"/>
         </w:numPr>
       </w:pPr>
       <w:r>
@@ -13129,7 +13367,7 @@
         <w:pStyle w:val="Compact"/>
         <w:numPr>
           <w:ilvl w:val="0"/>
-          <w:numId w:val="1541"/>
+          <w:numId w:val="1548"/>
         </w:numPr>
       </w:pPr>
       <w:r>
@@ -13183,7 +13421,7 @@
         <w:pStyle w:val="Compact"/>
         <w:numPr>
           <w:ilvl w:val="0"/>
-          <w:numId w:val="1542"/>
+          <w:numId w:val="1549"/>
         </w:numPr>
       </w:pPr>
       <w:r>
@@ -13195,7 +13433,7 @@
         <w:pStyle w:val="Compact"/>
         <w:numPr>
           <w:ilvl w:val="0"/>
-          <w:numId w:val="1543"/>
+          <w:numId w:val="1550"/>
         </w:numPr>
       </w:pPr>
       <w:r>
@@ -13222,7 +13460,7 @@
         <w:pStyle w:val="Compact"/>
         <w:numPr>
           <w:ilvl w:val="0"/>
-          <w:numId w:val="1544"/>
+          <w:numId w:val="1551"/>
         </w:numPr>
       </w:pPr>
       <w:r>
@@ -13264,7 +13502,7 @@
         <w:pStyle w:val="Compact"/>
         <w:numPr>
           <w:ilvl w:val="0"/>
-          <w:numId w:val="1545"/>
+          <w:numId w:val="1552"/>
         </w:numPr>
       </w:pPr>
       <w:r>
@@ -13291,7 +13529,7 @@
         <w:pStyle w:val="Compact"/>
         <w:numPr>
           <w:ilvl w:val="0"/>
-          <w:numId w:val="1546"/>
+          <w:numId w:val="1553"/>
         </w:numPr>
       </w:pPr>
       <w:r>
@@ -13303,7 +13541,7 @@
         <w:pStyle w:val="Compact"/>
         <w:numPr>
           <w:ilvl w:val="0"/>
-          <w:numId w:val="1547"/>
+          <w:numId w:val="1554"/>
         </w:numPr>
       </w:pPr>
       <w:r>
@@ -13315,7 +13553,7 @@
         <w:pStyle w:val="Compact"/>
         <w:numPr>
           <w:ilvl w:val="0"/>
-          <w:numId w:val="1548"/>
+          <w:numId w:val="1555"/>
         </w:numPr>
       </w:pPr>
       <w:r>
@@ -13337,8 +13575,8 @@
         <w:t xml:space="preserve">— 5/5 passed after cap tests; server build passed.</w:t>
       </w:r>
     </w:p>
-    <w:bookmarkEnd w:id="75"/>
-    <w:bookmarkStart w:id="76" w:name="scope-lock-for-ai-retarget"/>
+    <w:bookmarkEnd w:id="76"/>
+    <w:bookmarkStart w:id="77" w:name="scope-lock-for-ai-retarget"/>
     <w:p>
       <w:pPr>
         <w:pStyle w:val="Heading3"/>
@@ -13352,7 +13590,7 @@
         <w:pStyle w:val="Compact"/>
         <w:numPr>
           <w:ilvl w:val="0"/>
-          <w:numId w:val="1549"/>
+          <w:numId w:val="1556"/>
         </w:numPr>
       </w:pPr>
       <w:r>
@@ -13364,7 +13602,7 @@
         <w:pStyle w:val="Compact"/>
         <w:numPr>
           <w:ilvl w:val="0"/>
-          <w:numId w:val="1550"/>
+          <w:numId w:val="1557"/>
         </w:numPr>
       </w:pPr>
       <w:r>
@@ -13376,7 +13614,7 @@
         <w:pStyle w:val="Compact"/>
         <w:numPr>
           <w:ilvl w:val="0"/>
-          <w:numId w:val="1551"/>
+          <w:numId w:val="1558"/>
         </w:numPr>
       </w:pPr>
       <w:r>
@@ -13388,7 +13626,7 @@
         <w:pStyle w:val="Compact"/>
         <w:numPr>
           <w:ilvl w:val="0"/>
-          <w:numId w:val="1552"/>
+          <w:numId w:val="1559"/>
         </w:numPr>
       </w:pPr>
       <w:r>
@@ -13400,7 +13638,7 @@
         <w:pStyle w:val="Compact"/>
         <w:numPr>
           <w:ilvl w:val="0"/>
-          <w:numId w:val="1553"/>
+          <w:numId w:val="1560"/>
         </w:numPr>
       </w:pPr>
       <w:r>
@@ -13412,7 +13650,7 @@
         <w:pStyle w:val="Compact"/>
         <w:numPr>
           <w:ilvl w:val="0"/>
-          <w:numId w:val="1554"/>
+          <w:numId w:val="1561"/>
         </w:numPr>
       </w:pPr>
       <w:r>
@@ -13424,7 +13662,7 @@
         <w:pStyle w:val="Compact"/>
         <w:numPr>
           <w:ilvl w:val="1"/>
-          <w:numId w:val="1555"/>
+          <w:numId w:val="1562"/>
         </w:numPr>
       </w:pPr>
       <w:r>
@@ -13451,7 +13689,7 @@
         <w:pStyle w:val="Compact"/>
         <w:numPr>
           <w:ilvl w:val="1"/>
-          <w:numId w:val="1555"/>
+          <w:numId w:val="1562"/>
         </w:numPr>
       </w:pPr>
       <w:r>
@@ -13473,8 +13711,8 @@
         <w:t xml:space="preserve">scoping correctness.</w:t>
       </w:r>
     </w:p>
-    <w:bookmarkEnd w:id="76"/>
-    <w:bookmarkStart w:id="77" w:name="database-model"/>
+    <w:bookmarkEnd w:id="77"/>
+    <w:bookmarkStart w:id="78" w:name="database-model"/>
     <w:p>
       <w:pPr>
         <w:pStyle w:val="Heading3"/>
@@ -13488,7 +13726,7 @@
         <w:pStyle w:val="Compact"/>
         <w:numPr>
           <w:ilvl w:val="0"/>
-          <w:numId w:val="1556"/>
+          <w:numId w:val="1563"/>
         </w:numPr>
       </w:pPr>
       <w:r>
@@ -13530,7 +13768,7 @@
         <w:pStyle w:val="Compact"/>
         <w:numPr>
           <w:ilvl w:val="0"/>
-          <w:numId w:val="1557"/>
+          <w:numId w:val="1564"/>
         </w:numPr>
       </w:pPr>
       <w:r>
@@ -13554,7 +13792,7 @@
         <w:pStyle w:val="Compact"/>
         <w:numPr>
           <w:ilvl w:val="0"/>
-          <w:numId w:val="1558"/>
+          <w:numId w:val="1565"/>
         </w:numPr>
       </w:pPr>
       <w:r>
@@ -13578,7 +13816,7 @@
         <w:pStyle w:val="Compact"/>
         <w:numPr>
           <w:ilvl w:val="0"/>
-          <w:numId w:val="1559"/>
+          <w:numId w:val="1566"/>
         </w:numPr>
       </w:pPr>
       <w:r>
@@ -13590,7 +13828,7 @@
         <w:pStyle w:val="Compact"/>
         <w:numPr>
           <w:ilvl w:val="0"/>
-          <w:numId w:val="1560"/>
+          <w:numId w:val="1567"/>
         </w:numPr>
       </w:pPr>
       <w:r>
@@ -13602,7 +13840,7 @@
         <w:pStyle w:val="Compact"/>
         <w:numPr>
           <w:ilvl w:val="0"/>
-          <w:numId w:val="1561"/>
+          <w:numId w:val="1568"/>
         </w:numPr>
       </w:pPr>
       <w:r>
@@ -13614,7 +13852,7 @@
         <w:pStyle w:val="Compact"/>
         <w:numPr>
           <w:ilvl w:val="0"/>
-          <w:numId w:val="1562"/>
+          <w:numId w:val="1569"/>
         </w:numPr>
       </w:pPr>
       <w:r>
@@ -13626,7 +13864,7 @@
         <w:pStyle w:val="Compact"/>
         <w:numPr>
           <w:ilvl w:val="0"/>
-          <w:numId w:val="1563"/>
+          <w:numId w:val="1570"/>
         </w:numPr>
       </w:pPr>
       <w:r>
@@ -13638,7 +13876,7 @@
         <w:pStyle w:val="Compact"/>
         <w:numPr>
           <w:ilvl w:val="0"/>
-          <w:numId w:val="1564"/>
+          <w:numId w:val="1571"/>
         </w:numPr>
       </w:pPr>
       <w:r>
@@ -13650,7 +13888,7 @@
         <w:pStyle w:val="Compact"/>
         <w:numPr>
           <w:ilvl w:val="0"/>
-          <w:numId w:val="1565"/>
+          <w:numId w:val="1572"/>
         </w:numPr>
       </w:pPr>
       <w:r>
@@ -13662,7 +13900,7 @@
         <w:pStyle w:val="Compact"/>
         <w:numPr>
           <w:ilvl w:val="0"/>
-          <w:numId w:val="1566"/>
+          <w:numId w:val="1573"/>
         </w:numPr>
       </w:pPr>
       <w:r>
@@ -13674,7 +13912,7 @@
         <w:pStyle w:val="Compact"/>
         <w:numPr>
           <w:ilvl w:val="0"/>
-          <w:numId w:val="1567"/>
+          <w:numId w:val="1574"/>
         </w:numPr>
       </w:pPr>
       <w:r>
@@ -13686,7 +13924,7 @@
         <w:pStyle w:val="Compact"/>
         <w:numPr>
           <w:ilvl w:val="0"/>
-          <w:numId w:val="1568"/>
+          <w:numId w:val="1575"/>
         </w:numPr>
       </w:pPr>
       <w:r>
@@ -13698,7 +13936,7 @@
         <w:pStyle w:val="Compact"/>
         <w:numPr>
           <w:ilvl w:val="0"/>
-          <w:numId w:val="1569"/>
+          <w:numId w:val="1576"/>
         </w:numPr>
       </w:pPr>
       <w:r>
@@ -13725,7 +13963,7 @@
         <w:pStyle w:val="Compact"/>
         <w:numPr>
           <w:ilvl w:val="0"/>
-          <w:numId w:val="1570"/>
+          <w:numId w:val="1577"/>
         </w:numPr>
       </w:pPr>
       <w:r>
@@ -13737,15 +13975,15 @@
         <w:pStyle w:val="Compact"/>
         <w:numPr>
           <w:ilvl w:val="0"/>
-          <w:numId w:val="1571"/>
+          <w:numId w:val="1578"/>
         </w:numPr>
       </w:pPr>
       <w:r>
         <w:t xml:space="preserve">Ensure expired cohorts are ignored safely.</w:t>
       </w:r>
     </w:p>
-    <w:bookmarkEnd w:id="77"/>
-    <w:bookmarkStart w:id="78" w:name="cohort-generation"/>
+    <w:bookmarkEnd w:id="78"/>
+    <w:bookmarkStart w:id="79" w:name="cohort-generation"/>
     <w:p>
       <w:pPr>
         <w:pStyle w:val="Heading3"/>
@@ -13759,7 +13997,7 @@
         <w:pStyle w:val="Compact"/>
         <w:numPr>
           <w:ilvl w:val="0"/>
-          <w:numId w:val="1572"/>
+          <w:numId w:val="1579"/>
         </w:numPr>
       </w:pPr>
       <w:r>
@@ -13771,7 +14009,7 @@
         <w:pStyle w:val="Compact"/>
         <w:numPr>
           <w:ilvl w:val="0"/>
-          <w:numId w:val="1573"/>
+          <w:numId w:val="1580"/>
         </w:numPr>
       </w:pPr>
       <w:r>
@@ -13798,7 +14036,7 @@
         <w:pStyle w:val="Compact"/>
         <w:numPr>
           <w:ilvl w:val="0"/>
-          <w:numId w:val="1574"/>
+          <w:numId w:val="1581"/>
         </w:numPr>
       </w:pPr>
       <w:r>
@@ -13825,7 +14063,7 @@
         <w:pStyle w:val="Compact"/>
         <w:numPr>
           <w:ilvl w:val="0"/>
-          <w:numId w:val="1575"/>
+          <w:numId w:val="1582"/>
         </w:numPr>
       </w:pPr>
       <w:r>
@@ -13852,7 +14090,7 @@
         <w:pStyle w:val="Compact"/>
         <w:numPr>
           <w:ilvl w:val="0"/>
-          <w:numId w:val="1576"/>
+          <w:numId w:val="1583"/>
         </w:numPr>
       </w:pPr>
       <w:r>
@@ -13864,7 +14102,7 @@
         <w:pStyle w:val="Compact"/>
         <w:numPr>
           <w:ilvl w:val="1"/>
-          <w:numId w:val="1577"/>
+          <w:numId w:val="1584"/>
         </w:numPr>
       </w:pPr>
       <w:r>
@@ -13876,7 +14114,7 @@
         <w:pStyle w:val="Compact"/>
         <w:numPr>
           <w:ilvl w:val="1"/>
-          <w:numId w:val="1577"/>
+          <w:numId w:val="1584"/>
         </w:numPr>
       </w:pPr>
       <w:r>
@@ -13888,7 +14126,7 @@
         <w:pStyle w:val="Compact"/>
         <w:numPr>
           <w:ilvl w:val="1"/>
-          <w:numId w:val="1577"/>
+          <w:numId w:val="1584"/>
         </w:numPr>
       </w:pPr>
       <w:r>
@@ -13900,7 +14138,7 @@
         <w:pStyle w:val="Compact"/>
         <w:numPr>
           <w:ilvl w:val="0"/>
-          <w:numId w:val="1578"/>
+          <w:numId w:val="1585"/>
         </w:numPr>
       </w:pPr>
       <w:r>
@@ -13912,7 +14150,7 @@
         <w:pStyle w:val="Compact"/>
         <w:numPr>
           <w:ilvl w:val="0"/>
-          <w:numId w:val="1579"/>
+          <w:numId w:val="1586"/>
         </w:numPr>
       </w:pPr>
       <w:r>
@@ -13924,7 +14162,7 @@
         <w:pStyle w:val="Compact"/>
         <w:numPr>
           <w:ilvl w:val="1"/>
-          <w:numId w:val="1580"/>
+          <w:numId w:val="1587"/>
         </w:numPr>
       </w:pPr>
       <w:r>
@@ -13936,7 +14174,7 @@
         <w:pStyle w:val="Compact"/>
         <w:numPr>
           <w:ilvl w:val="1"/>
-          <w:numId w:val="1580"/>
+          <w:numId w:val="1587"/>
         </w:numPr>
       </w:pPr>
       <w:r>
@@ -13948,7 +14186,7 @@
         <w:pStyle w:val="Compact"/>
         <w:numPr>
           <w:ilvl w:val="1"/>
-          <w:numId w:val="1580"/>
+          <w:numId w:val="1587"/>
         </w:numPr>
       </w:pPr>
       <w:r>
@@ -13960,7 +14198,7 @@
         <w:pStyle w:val="Compact"/>
         <w:numPr>
           <w:ilvl w:val="1"/>
-          <w:numId w:val="1580"/>
+          <w:numId w:val="1587"/>
         </w:numPr>
       </w:pPr>
       <w:r>
@@ -13972,7 +14210,7 @@
         <w:pStyle w:val="Compact"/>
         <w:numPr>
           <w:ilvl w:val="1"/>
-          <w:numId w:val="1580"/>
+          <w:numId w:val="1587"/>
         </w:numPr>
       </w:pPr>
       <w:r>
@@ -13984,7 +14222,7 @@
         <w:pStyle w:val="Compact"/>
         <w:numPr>
           <w:ilvl w:val="1"/>
-          <w:numId w:val="1580"/>
+          <w:numId w:val="1587"/>
         </w:numPr>
       </w:pPr>
       <w:r>
@@ -13996,7 +14234,7 @@
         <w:pStyle w:val="Compact"/>
         <w:numPr>
           <w:ilvl w:val="0"/>
-          <w:numId w:val="1581"/>
+          <w:numId w:val="1588"/>
         </w:numPr>
       </w:pPr>
       <w:r>
@@ -14008,7 +14246,7 @@
         <w:pStyle w:val="Compact"/>
         <w:numPr>
           <w:ilvl w:val="0"/>
-          <w:numId w:val="1582"/>
+          <w:numId w:val="1589"/>
         </w:numPr>
       </w:pPr>
       <w:r>
@@ -14020,15 +14258,15 @@
         <w:pStyle w:val="Compact"/>
         <w:numPr>
           <w:ilvl w:val="0"/>
-          <w:numId w:val="1583"/>
+          <w:numId w:val="1590"/>
         </w:numPr>
       </w:pPr>
       <w:r>
         <w:t xml:space="preserve">Ensure predicted funded deals are traceable to historical anchor, not arbitrary text.</w:t>
       </w:r>
     </w:p>
-    <w:bookmarkEnd w:id="78"/>
-    <w:bookmarkStart w:id="79" w:name="cooldowns-and-compliance"/>
+    <w:bookmarkEnd w:id="79"/>
+    <w:bookmarkStart w:id="80" w:name="cooldowns-and-compliance"/>
     <w:p>
       <w:pPr>
         <w:pStyle w:val="Heading3"/>
@@ -14042,7 +14280,7 @@
         <w:pStyle w:val="Compact"/>
         <w:numPr>
           <w:ilvl w:val="0"/>
-          <w:numId w:val="1584"/>
+          <w:numId w:val="1591"/>
         </w:numPr>
       </w:pPr>
       <w:r>
@@ -14054,7 +14292,7 @@
         <w:pStyle w:val="Compact"/>
         <w:numPr>
           <w:ilvl w:val="0"/>
-          <w:numId w:val="1585"/>
+          <w:numId w:val="1592"/>
         </w:numPr>
       </w:pPr>
       <w:r>
@@ -14066,7 +14304,7 @@
         <w:pStyle w:val="Compact"/>
         <w:numPr>
           <w:ilvl w:val="0"/>
-          <w:numId w:val="1586"/>
+          <w:numId w:val="1593"/>
         </w:numPr>
       </w:pPr>
       <w:r>
@@ -14078,7 +14316,7 @@
         <w:pStyle w:val="Compact"/>
         <w:numPr>
           <w:ilvl w:val="0"/>
-          <w:numId w:val="1587"/>
+          <w:numId w:val="1594"/>
         </w:numPr>
       </w:pPr>
       <w:r>
@@ -14090,7 +14328,7 @@
         <w:pStyle w:val="Compact"/>
         <w:numPr>
           <w:ilvl w:val="0"/>
-          <w:numId w:val="1588"/>
+          <w:numId w:val="1595"/>
         </w:numPr>
       </w:pPr>
       <w:r>
@@ -14102,15 +14340,15 @@
         <w:pStyle w:val="Compact"/>
         <w:numPr>
           <w:ilvl w:val="0"/>
-          <w:numId w:val="1589"/>
+          <w:numId w:val="1596"/>
         </w:numPr>
       </w:pPr>
       <w:r>
         <w:t xml:space="preserve">Verify no cohort can re-contact opted-out, DNC, suppressed, or too-recent leads.</w:t>
       </w:r>
     </w:p>
-    <w:bookmarkEnd w:id="79"/>
-    <w:bookmarkStart w:id="80" w:name="two-layer-send-caps"/>
+    <w:bookmarkEnd w:id="80"/>
+    <w:bookmarkStart w:id="81" w:name="two-layer-send-caps"/>
     <w:p>
       <w:pPr>
         <w:pStyle w:val="Heading3"/>
@@ -14124,7 +14362,7 @@
         <w:pStyle w:val="Compact"/>
         <w:numPr>
           <w:ilvl w:val="0"/>
-          <w:numId w:val="1590"/>
+          <w:numId w:val="1597"/>
         </w:numPr>
       </w:pPr>
       <w:r>
@@ -14136,7 +14374,7 @@
         <w:pStyle w:val="Compact"/>
         <w:numPr>
           <w:ilvl w:val="1"/>
-          <w:numId w:val="1591"/>
+          <w:numId w:val="1598"/>
         </w:numPr>
       </w:pPr>
       <w:r>
@@ -14148,7 +14386,7 @@
         <w:pStyle w:val="Compact"/>
         <w:numPr>
           <w:ilvl w:val="1"/>
-          <w:numId w:val="1591"/>
+          <w:numId w:val="1598"/>
         </w:numPr>
       </w:pPr>
       <w:r>
@@ -14160,7 +14398,7 @@
         <w:pStyle w:val="Compact"/>
         <w:numPr>
           <w:ilvl w:val="0"/>
-          <w:numId w:val="1592"/>
+          <w:numId w:val="1599"/>
         </w:numPr>
       </w:pPr>
       <w:r>
@@ -14172,7 +14410,7 @@
         <w:pStyle w:val="Compact"/>
         <w:numPr>
           <w:ilvl w:val="1"/>
-          <w:numId w:val="1593"/>
+          <w:numId w:val="1600"/>
         </w:numPr>
       </w:pPr>
       <w:r>
@@ -14184,7 +14422,7 @@
         <w:pStyle w:val="Compact"/>
         <w:numPr>
           <w:ilvl w:val="1"/>
-          <w:numId w:val="1593"/>
+          <w:numId w:val="1600"/>
         </w:numPr>
       </w:pPr>
       <w:r>
@@ -14196,7 +14434,7 @@
         <w:pStyle w:val="Compact"/>
         <w:numPr>
           <w:ilvl w:val="0"/>
-          <w:numId w:val="1594"/>
+          <w:numId w:val="1601"/>
         </w:numPr>
       </w:pPr>
       <w:r>
@@ -14208,7 +14446,7 @@
         <w:pStyle w:val="Compact"/>
         <w:numPr>
           <w:ilvl w:val="0"/>
-          <w:numId w:val="1595"/>
+          <w:numId w:val="1602"/>
         </w:numPr>
       </w:pPr>
       <w:r>
@@ -14220,7 +14458,7 @@
         <w:pStyle w:val="Compact"/>
         <w:numPr>
           <w:ilvl w:val="0"/>
-          <w:numId w:val="1596"/>
+          <w:numId w:val="1603"/>
         </w:numPr>
       </w:pPr>
       <w:r>
@@ -14232,15 +14470,15 @@
         <w:pStyle w:val="Compact"/>
         <w:numPr>
           <w:ilvl w:val="0"/>
-          <w:numId w:val="1597"/>
+          <w:numId w:val="1604"/>
         </w:numPr>
       </w:pPr>
       <w:r>
         <w:t xml:space="preserve">Cohort card lead count reflects current remaining capacity at render/build time.</w:t>
       </w:r>
     </w:p>
-    <w:bookmarkEnd w:id="80"/>
-    <w:bookmarkStart w:id="81" w:name="ai-reasoning-and-cron"/>
+    <w:bookmarkEnd w:id="81"/>
+    <w:bookmarkStart w:id="82" w:name="ai-reasoning-and-cron"/>
     <w:p>
       <w:pPr>
         <w:pStyle w:val="Heading3"/>
@@ -14254,7 +14492,7 @@
         <w:pStyle w:val="Compact"/>
         <w:numPr>
           <w:ilvl w:val="0"/>
-          <w:numId w:val="1598"/>
+          <w:numId w:val="1605"/>
         </w:numPr>
       </w:pPr>
       <w:r>
@@ -14266,7 +14504,7 @@
         <w:pStyle w:val="Compact"/>
         <w:numPr>
           <w:ilvl w:val="0"/>
-          <w:numId w:val="1599"/>
+          <w:numId w:val="1606"/>
         </w:numPr>
       </w:pPr>
       <w:r>
@@ -14278,7 +14516,7 @@
         <w:pStyle w:val="Compact"/>
         <w:numPr>
           <w:ilvl w:val="0"/>
-          <w:numId w:val="1600"/>
+          <w:numId w:val="1607"/>
         </w:numPr>
       </w:pPr>
       <w:r>
@@ -14290,7 +14528,7 @@
         <w:pStyle w:val="Compact"/>
         <w:numPr>
           <w:ilvl w:val="0"/>
-          <w:numId w:val="1601"/>
+          <w:numId w:val="1608"/>
         </w:numPr>
       </w:pPr>
       <w:r>
@@ -14302,7 +14540,7 @@
         <w:pStyle w:val="Compact"/>
         <w:numPr>
           <w:ilvl w:val="0"/>
-          <w:numId w:val="1602"/>
+          <w:numId w:val="1609"/>
         </w:numPr>
       </w:pPr>
       <w:r>
@@ -14314,7 +14552,7 @@
         <w:pStyle w:val="Compact"/>
         <w:numPr>
           <w:ilvl w:val="0"/>
-          <w:numId w:val="1603"/>
+          <w:numId w:val="1610"/>
         </w:numPr>
       </w:pPr>
       <w:r>
@@ -14326,7 +14564,7 @@
         <w:pStyle w:val="Compact"/>
         <w:numPr>
           <w:ilvl w:val="0"/>
-          <w:numId w:val="1604"/>
+          <w:numId w:val="1611"/>
         </w:numPr>
       </w:pPr>
       <w:r>
@@ -14338,7 +14576,7 @@
         <w:pStyle w:val="Compact"/>
         <w:numPr>
           <w:ilvl w:val="0"/>
-          <w:numId w:val="1605"/>
+          <w:numId w:val="1612"/>
         </w:numPr>
       </w:pPr>
       <w:r>
@@ -14350,15 +14588,15 @@
         <w:pStyle w:val="Compact"/>
         <w:numPr>
           <w:ilvl w:val="0"/>
-          <w:numId w:val="1606"/>
+          <w:numId w:val="1613"/>
         </w:numPr>
       </w:pPr>
       <w:r>
         <w:t xml:space="preserve">Log failures per user/cohort without breaking other cohorts.</w:t>
       </w:r>
     </w:p>
-    <w:bookmarkEnd w:id="81"/>
-    <w:bookmarkStart w:id="82" w:name="ui-1"/>
+    <w:bookmarkEnd w:id="82"/>
+    <w:bookmarkStart w:id="83" w:name="ui-1"/>
     <w:p>
       <w:pPr>
         <w:pStyle w:val="Heading3"/>
@@ -14372,7 +14610,7 @@
         <w:pStyle w:val="Compact"/>
         <w:numPr>
           <w:ilvl w:val="0"/>
-          <w:numId w:val="1607"/>
+          <w:numId w:val="1614"/>
         </w:numPr>
       </w:pPr>
       <w:r>
@@ -14384,7 +14622,7 @@
         <w:pStyle w:val="Compact"/>
         <w:numPr>
           <w:ilvl w:val="0"/>
-          <w:numId w:val="1608"/>
+          <w:numId w:val="1615"/>
         </w:numPr>
       </w:pPr>
       <w:r>
@@ -14396,7 +14634,7 @@
         <w:pStyle w:val="Compact"/>
         <w:numPr>
           <w:ilvl w:val="0"/>
-          <w:numId w:val="1609"/>
+          <w:numId w:val="1616"/>
         </w:numPr>
       </w:pPr>
       <w:r>
@@ -14408,7 +14646,7 @@
         <w:pStyle w:val="Compact"/>
         <w:numPr>
           <w:ilvl w:val="0"/>
-          <w:numId w:val="1610"/>
+          <w:numId w:val="1617"/>
         </w:numPr>
       </w:pPr>
       <w:r>
@@ -14420,7 +14658,7 @@
         <w:pStyle w:val="Compact"/>
         <w:numPr>
           <w:ilvl w:val="0"/>
-          <w:numId w:val="1611"/>
+          <w:numId w:val="1618"/>
         </w:numPr>
       </w:pPr>
       <w:r>
@@ -14432,7 +14670,7 @@
         <w:pStyle w:val="Compact"/>
         <w:numPr>
           <w:ilvl w:val="0"/>
-          <w:numId w:val="1612"/>
+          <w:numId w:val="1619"/>
         </w:numPr>
       </w:pPr>
       <w:r>
@@ -14444,7 +14682,7 @@
         <w:pStyle w:val="Compact"/>
         <w:numPr>
           <w:ilvl w:val="0"/>
-          <w:numId w:val="1613"/>
+          <w:numId w:val="1620"/>
         </w:numPr>
       </w:pPr>
       <w:r>
@@ -14456,7 +14694,7 @@
         <w:pStyle w:val="Compact"/>
         <w:numPr>
           <w:ilvl w:val="0"/>
-          <w:numId w:val="1614"/>
+          <w:numId w:val="1621"/>
         </w:numPr>
       </w:pPr>
       <w:r>
@@ -14468,7 +14706,7 @@
         <w:pStyle w:val="Compact"/>
         <w:numPr>
           <w:ilvl w:val="0"/>
-          <w:numId w:val="1615"/>
+          <w:numId w:val="1622"/>
         </w:numPr>
       </w:pPr>
       <w:r>
@@ -14480,7 +14718,7 @@
         <w:pStyle w:val="Compact"/>
         <w:numPr>
           <w:ilvl w:val="0"/>
-          <w:numId w:val="1616"/>
+          <w:numId w:val="1623"/>
         </w:numPr>
       </w:pPr>
       <w:r>
@@ -14507,7 +14745,7 @@
         <w:pStyle w:val="Compact"/>
         <w:numPr>
           <w:ilvl w:val="0"/>
-          <w:numId w:val="1617"/>
+          <w:numId w:val="1624"/>
         </w:numPr>
       </w:pPr>
       <w:r>
@@ -14528,15 +14766,15 @@
         <w:pStyle w:val="Compact"/>
         <w:numPr>
           <w:ilvl w:val="0"/>
-          <w:numId w:val="1618"/>
+          <w:numId w:val="1625"/>
         </w:numPr>
       </w:pPr>
       <w:r>
         <w:t xml:space="preserve">Existing campaign actions still work: rerun/refresh, start, pause, delete where allowed.</w:t>
       </w:r>
     </w:p>
-    <w:bookmarkEnd w:id="82"/>
-    <w:bookmarkStart w:id="83" w:name="backendapi"/>
+    <w:bookmarkEnd w:id="83"/>
+    <w:bookmarkStart w:id="84" w:name="backendapi"/>
     <w:p>
       <w:pPr>
         <w:pStyle w:val="Heading3"/>
@@ -14550,7 +14788,7 @@
         <w:pStyle w:val="Compact"/>
         <w:numPr>
           <w:ilvl w:val="0"/>
-          <w:numId w:val="1619"/>
+          <w:numId w:val="1626"/>
         </w:numPr>
       </w:pPr>
       <w:r>
@@ -14562,7 +14800,7 @@
         <w:pStyle w:val="Compact"/>
         <w:numPr>
           <w:ilvl w:val="0"/>
-          <w:numId w:val="1620"/>
+          <w:numId w:val="1627"/>
         </w:numPr>
       </w:pPr>
       <w:r>
@@ -14574,7 +14812,7 @@
         <w:pStyle w:val="Compact"/>
         <w:numPr>
           <w:ilvl w:val="0"/>
-          <w:numId w:val="1621"/>
+          <w:numId w:val="1628"/>
         </w:numPr>
       </w:pPr>
       <w:r>
@@ -14586,7 +14824,7 @@
         <w:pStyle w:val="Compact"/>
         <w:numPr>
           <w:ilvl w:val="0"/>
-          <w:numId w:val="1622"/>
+          <w:numId w:val="1629"/>
         </w:numPr>
       </w:pPr>
       <w:r>
@@ -14598,7 +14836,7 @@
         <w:pStyle w:val="Compact"/>
         <w:numPr>
           <w:ilvl w:val="0"/>
-          <w:numId w:val="1623"/>
+          <w:numId w:val="1630"/>
         </w:numPr>
       </w:pPr>
       <w:r>
@@ -14610,7 +14848,7 @@
         <w:pStyle w:val="Compact"/>
         <w:numPr>
           <w:ilvl w:val="0"/>
-          <w:numId w:val="1624"/>
+          <w:numId w:val="1631"/>
         </w:numPr>
       </w:pPr>
       <w:r>
@@ -14622,7 +14860,7 @@
         <w:pStyle w:val="Compact"/>
         <w:numPr>
           <w:ilvl w:val="0"/>
-          <w:numId w:val="1625"/>
+          <w:numId w:val="1632"/>
         </w:numPr>
       </w:pPr>
       <w:r>
@@ -14634,15 +14872,15 @@
         <w:pStyle w:val="Compact"/>
         <w:numPr>
           <w:ilvl w:val="0"/>
-          <w:numId w:val="1626"/>
+          <w:numId w:val="1633"/>
         </w:numPr>
       </w:pPr>
       <w:r>
         <w:t xml:space="preserve">AI Retarget is upstream recommendation only; no auto-send.</w:t>
       </w:r>
     </w:p>
-    <w:bookmarkEnd w:id="83"/>
-    <w:bookmarkStart w:id="84" w:name="m2.3-testing-gate"/>
+    <w:bookmarkEnd w:id="84"/>
+    <w:bookmarkStart w:id="85" w:name="m2.3-testing-gate"/>
     <w:p>
       <w:pPr>
         <w:pStyle w:val="Heading3"/>
@@ -14656,7 +14894,7 @@
         <w:pStyle w:val="Compact"/>
         <w:numPr>
           <w:ilvl w:val="0"/>
-          <w:numId w:val="1627"/>
+          <w:numId w:val="1634"/>
         </w:numPr>
       </w:pPr>
       <w:r>
@@ -14668,7 +14906,7 @@
         <w:pStyle w:val="Compact"/>
         <w:numPr>
           <w:ilvl w:val="0"/>
-          <w:numId w:val="1628"/>
+          <w:numId w:val="1635"/>
         </w:numPr>
       </w:pPr>
       <w:r>
@@ -14680,7 +14918,7 @@
         <w:pStyle w:val="Compact"/>
         <w:numPr>
           <w:ilvl w:val="0"/>
-          <w:numId w:val="1629"/>
+          <w:numId w:val="1636"/>
         </w:numPr>
       </w:pPr>
       <w:r>
@@ -14692,7 +14930,7 @@
         <w:pStyle w:val="Compact"/>
         <w:numPr>
           <w:ilvl w:val="0"/>
-          <w:numId w:val="1630"/>
+          <w:numId w:val="1637"/>
         </w:numPr>
       </w:pPr>
       <w:r>
@@ -14704,7 +14942,7 @@
         <w:pStyle w:val="Compact"/>
         <w:numPr>
           <w:ilvl w:val="0"/>
-          <w:numId w:val="1631"/>
+          <w:numId w:val="1638"/>
         </w:numPr>
       </w:pPr>
       <w:r>
@@ -14716,7 +14954,7 @@
         <w:pStyle w:val="Compact"/>
         <w:numPr>
           <w:ilvl w:val="0"/>
-          <w:numId w:val="1632"/>
+          <w:numId w:val="1639"/>
         </w:numPr>
       </w:pPr>
       <w:r>
@@ -14728,7 +14966,7 @@
         <w:pStyle w:val="Compact"/>
         <w:numPr>
           <w:ilvl w:val="0"/>
-          <w:numId w:val="1633"/>
+          <w:numId w:val="1640"/>
         </w:numPr>
       </w:pPr>
       <w:r>
@@ -14740,7 +14978,7 @@
         <w:pStyle w:val="Compact"/>
         <w:numPr>
           <w:ilvl w:val="0"/>
-          <w:numId w:val="1634"/>
+          <w:numId w:val="1641"/>
         </w:numPr>
       </w:pPr>
       <w:r>
@@ -14752,7 +14990,7 @@
         <w:pStyle w:val="Compact"/>
         <w:numPr>
           <w:ilvl w:val="0"/>
-          <w:numId w:val="1635"/>
+          <w:numId w:val="1642"/>
         </w:numPr>
       </w:pPr>
       <w:r>
@@ -14764,7 +15002,7 @@
         <w:pStyle w:val="Compact"/>
         <w:numPr>
           <w:ilvl w:val="0"/>
-          <w:numId w:val="1636"/>
+          <w:numId w:val="1643"/>
         </w:numPr>
       </w:pPr>
       <w:r>
@@ -14776,7 +15014,7 @@
         <w:pStyle w:val="Compact"/>
         <w:numPr>
           <w:ilvl w:val="0"/>
-          <w:numId w:val="1637"/>
+          <w:numId w:val="1644"/>
         </w:numPr>
       </w:pPr>
       <w:r>
@@ -14788,7 +15026,7 @@
         <w:pStyle w:val="Compact"/>
         <w:numPr>
           <w:ilvl w:val="0"/>
-          <w:numId w:val="1638"/>
+          <w:numId w:val="1645"/>
         </w:numPr>
       </w:pPr>
       <w:r>
@@ -14800,7 +15038,7 @@
         <w:pStyle w:val="Compact"/>
         <w:numPr>
           <w:ilvl w:val="0"/>
-          <w:numId w:val="1639"/>
+          <w:numId w:val="1646"/>
         </w:numPr>
       </w:pPr>
       <w:r>
@@ -14812,7 +15050,7 @@
         <w:pStyle w:val="Compact"/>
         <w:numPr>
           <w:ilvl w:val="0"/>
-          <w:numId w:val="1640"/>
+          <w:numId w:val="1647"/>
         </w:numPr>
       </w:pPr>
       <w:r>
@@ -14824,16 +15062,16 @@
         <w:pStyle w:val="Compact"/>
         <w:numPr>
           <w:ilvl w:val="0"/>
-          <w:numId w:val="1641"/>
+          <w:numId w:val="1648"/>
         </w:numPr>
       </w:pPr>
       <w:r>
         <w:t xml:space="preserve">Progress dashboard updated.</w:t>
       </w:r>
     </w:p>
-    <w:bookmarkEnd w:id="84"/>
     <w:bookmarkEnd w:id="85"/>
-    <w:bookmarkStart w:id="89" w:name="m2.4-m2-full-regression-and-release-gate"/>
+    <w:bookmarkEnd w:id="86"/>
+    <w:bookmarkStart w:id="90" w:name="m2.4-m2-full-regression-and-release-gate"/>
     <w:p>
       <w:pPr>
         <w:pStyle w:val="Heading2"/>
@@ -14842,7 +15080,7 @@
         <w:t xml:space="preserve">M2.4 — M2 Full Regression And Release Gate</w:t>
       </w:r>
     </w:p>
-    <w:bookmarkStart w:id="86" w:name="functional-regression-1"/>
+    <w:bookmarkStart w:id="87" w:name="functional-regression-1"/>
     <w:p>
       <w:pPr>
         <w:pStyle w:val="Heading3"/>
@@ -14856,7 +15094,7 @@
         <w:pStyle w:val="Compact"/>
         <w:numPr>
           <w:ilvl w:val="0"/>
-          <w:numId w:val="1642"/>
+          <w:numId w:val="1649"/>
         </w:numPr>
       </w:pPr>
       <w:r>
@@ -14868,7 +15106,7 @@
         <w:pStyle w:val="Compact"/>
         <w:numPr>
           <w:ilvl w:val="0"/>
-          <w:numId w:val="1643"/>
+          <w:numId w:val="1650"/>
         </w:numPr>
       </w:pPr>
       <w:r>
@@ -14880,7 +15118,7 @@
         <w:pStyle w:val="Compact"/>
         <w:numPr>
           <w:ilvl w:val="0"/>
-          <w:numId w:val="1644"/>
+          <w:numId w:val="1651"/>
         </w:numPr>
       </w:pPr>
       <w:r>
@@ -14892,7 +15130,7 @@
         <w:pStyle w:val="Compact"/>
         <w:numPr>
           <w:ilvl w:val="0"/>
-          <w:numId w:val="1645"/>
+          <w:numId w:val="1652"/>
         </w:numPr>
       </w:pPr>
       <w:r>
@@ -14904,7 +15142,7 @@
         <w:pStyle w:val="Compact"/>
         <w:numPr>
           <w:ilvl w:val="0"/>
-          <w:numId w:val="1646"/>
+          <w:numId w:val="1653"/>
         </w:numPr>
       </w:pPr>
       <w:r>
@@ -14916,7 +15154,7 @@
         <w:pStyle w:val="Compact"/>
         <w:numPr>
           <w:ilvl w:val="0"/>
-          <w:numId w:val="1647"/>
+          <w:numId w:val="1654"/>
         </w:numPr>
       </w:pPr>
       <w:r>
@@ -14928,7 +15166,7 @@
         <w:pStyle w:val="Compact"/>
         <w:numPr>
           <w:ilvl w:val="0"/>
-          <w:numId w:val="1648"/>
+          <w:numId w:val="1655"/>
         </w:numPr>
       </w:pPr>
       <w:r>
@@ -14940,7 +15178,7 @@
         <w:pStyle w:val="Compact"/>
         <w:numPr>
           <w:ilvl w:val="0"/>
-          <w:numId w:val="1649"/>
+          <w:numId w:val="1656"/>
         </w:numPr>
       </w:pPr>
       <w:r>
@@ -14952,7 +15190,7 @@
         <w:pStyle w:val="Compact"/>
         <w:numPr>
           <w:ilvl w:val="0"/>
-          <w:numId w:val="1650"/>
+          <w:numId w:val="1657"/>
         </w:numPr>
       </w:pPr>
       <w:r>
@@ -14964,7 +15202,7 @@
         <w:pStyle w:val="Compact"/>
         <w:numPr>
           <w:ilvl w:val="0"/>
-          <w:numId w:val="1651"/>
+          <w:numId w:val="1658"/>
         </w:numPr>
       </w:pPr>
       <w:r>
@@ -14976,7 +15214,7 @@
         <w:pStyle w:val="Compact"/>
         <w:numPr>
           <w:ilvl w:val="0"/>
-          <w:numId w:val="1652"/>
+          <w:numId w:val="1659"/>
         </w:numPr>
       </w:pPr>
       <w:r>
@@ -14988,7 +15226,7 @@
         <w:pStyle w:val="Compact"/>
         <w:numPr>
           <w:ilvl w:val="0"/>
-          <w:numId w:val="1653"/>
+          <w:numId w:val="1660"/>
         </w:numPr>
       </w:pPr>
       <w:r>
@@ -15000,7 +15238,7 @@
         <w:pStyle w:val="Compact"/>
         <w:numPr>
           <w:ilvl w:val="0"/>
-          <w:numId w:val="1654"/>
+          <w:numId w:val="1661"/>
         </w:numPr>
       </w:pPr>
       <w:r>
@@ -15022,8 +15260,8 @@
         <w:t xml:space="preserve">and test messages.</w:t>
       </w:r>
     </w:p>
-    <w:bookmarkEnd w:id="86"/>
-    <w:bookmarkStart w:id="87" w:name="visual-regression-1"/>
+    <w:bookmarkEnd w:id="87"/>
+    <w:bookmarkStart w:id="88" w:name="visual-regression-1"/>
     <w:p>
       <w:pPr>
         <w:pStyle w:val="Heading3"/>
@@ -15037,7 +15275,7 @@
         <w:pStyle w:val="Compact"/>
         <w:numPr>
           <w:ilvl w:val="0"/>
-          <w:numId w:val="1655"/>
+          <w:numId w:val="1662"/>
         </w:numPr>
       </w:pPr>
       <w:r>
@@ -15049,7 +15287,7 @@
         <w:pStyle w:val="Compact"/>
         <w:numPr>
           <w:ilvl w:val="0"/>
-          <w:numId w:val="1656"/>
+          <w:numId w:val="1663"/>
         </w:numPr>
       </w:pPr>
       <w:r>
@@ -15076,7 +15314,7 @@
         <w:pStyle w:val="Compact"/>
         <w:numPr>
           <w:ilvl w:val="0"/>
-          <w:numId w:val="1657"/>
+          <w:numId w:val="1664"/>
         </w:numPr>
       </w:pPr>
       <w:r>
@@ -15088,7 +15326,7 @@
         <w:pStyle w:val="Compact"/>
         <w:numPr>
           <w:ilvl w:val="0"/>
-          <w:numId w:val="1658"/>
+          <w:numId w:val="1665"/>
         </w:numPr>
       </w:pPr>
       <w:r>
@@ -15100,7 +15338,7 @@
         <w:pStyle w:val="Compact"/>
         <w:numPr>
           <w:ilvl w:val="0"/>
-          <w:numId w:val="1659"/>
+          <w:numId w:val="1666"/>
         </w:numPr>
       </w:pPr>
       <w:r>
@@ -15112,7 +15350,7 @@
         <w:pStyle w:val="Compact"/>
         <w:numPr>
           <w:ilvl w:val="0"/>
-          <w:numId w:val="1660"/>
+          <w:numId w:val="1667"/>
         </w:numPr>
       </w:pPr>
       <w:r>
@@ -15124,7 +15362,7 @@
         <w:pStyle w:val="Compact"/>
         <w:numPr>
           <w:ilvl w:val="0"/>
-          <w:numId w:val="1661"/>
+          <w:numId w:val="1668"/>
         </w:numPr>
       </w:pPr>
       <w:r>
@@ -15136,15 +15374,15 @@
         <w:pStyle w:val="Compact"/>
         <w:numPr>
           <w:ilvl w:val="0"/>
-          <w:numId w:val="1662"/>
+          <w:numId w:val="1669"/>
         </w:numPr>
       </w:pPr>
       <w:r>
         <w:t xml:space="preserve">No unreadable text if current styles fail; scoped style set added if needed.</w:t>
       </w:r>
     </w:p>
-    <w:bookmarkEnd w:id="87"/>
-    <w:bookmarkStart w:id="88" w:name="release-readiness-1"/>
+    <w:bookmarkEnd w:id="88"/>
+    <w:bookmarkStart w:id="89" w:name="release-readiness-1"/>
     <w:p>
       <w:pPr>
         <w:pStyle w:val="Heading3"/>
@@ -15158,7 +15396,7 @@
         <w:pStyle w:val="Compact"/>
         <w:numPr>
           <w:ilvl w:val="0"/>
-          <w:numId w:val="1663"/>
+          <w:numId w:val="1670"/>
         </w:numPr>
       </w:pPr>
       <w:r>
@@ -15170,7 +15408,7 @@
         <w:pStyle w:val="Compact"/>
         <w:numPr>
           <w:ilvl w:val="0"/>
-          <w:numId w:val="1664"/>
+          <w:numId w:val="1671"/>
         </w:numPr>
       </w:pPr>
       <w:r>
@@ -15182,7 +15420,7 @@
         <w:pStyle w:val="Compact"/>
         <w:numPr>
           <w:ilvl w:val="0"/>
-          <w:numId w:val="1665"/>
+          <w:numId w:val="1672"/>
         </w:numPr>
       </w:pPr>
       <w:r>
@@ -15194,7 +15432,7 @@
         <w:pStyle w:val="Compact"/>
         <w:numPr>
           <w:ilvl w:val="0"/>
-          <w:numId w:val="1666"/>
+          <w:numId w:val="1673"/>
         </w:numPr>
       </w:pPr>
       <w:r>
@@ -15206,7 +15444,7 @@
         <w:pStyle w:val="Compact"/>
         <w:numPr>
           <w:ilvl w:val="0"/>
-          <w:numId w:val="1667"/>
+          <w:numId w:val="1674"/>
         </w:numPr>
       </w:pPr>
       <w:r>
@@ -15218,7 +15456,7 @@
         <w:pStyle w:val="Compact"/>
         <w:numPr>
           <w:ilvl w:val="0"/>
-          <w:numId w:val="1668"/>
+          <w:numId w:val="1675"/>
         </w:numPr>
       </w:pPr>
       <w:r>
@@ -15230,7 +15468,7 @@
         <w:pStyle w:val="Compact"/>
         <w:numPr>
           <w:ilvl w:val="0"/>
-          <w:numId w:val="1669"/>
+          <w:numId w:val="1676"/>
         </w:numPr>
       </w:pPr>
       <w:r>
@@ -15242,7 +15480,7 @@
         <w:pStyle w:val="Compact"/>
         <w:numPr>
           <w:ilvl w:val="0"/>
-          <w:numId w:val="1670"/>
+          <w:numId w:val="1677"/>
         </w:numPr>
       </w:pPr>
       <w:r>
@@ -15254,16 +15492,16 @@
         <w:pStyle w:val="Compact"/>
         <w:numPr>
           <w:ilvl w:val="0"/>
-          <w:numId w:val="1671"/>
+          <w:numId w:val="1678"/>
         </w:numPr>
       </w:pPr>
       <w:r>
         <w:t xml:space="preserve">Progress dashboard updated to M2 complete only after all gates pass.</w:t>
       </w:r>
     </w:p>
-    <w:bookmarkEnd w:id="88"/>
     <w:bookmarkEnd w:id="89"/>
-    <w:bookmarkStart w:id="90" w:name="full-final-acceptance"/>
+    <w:bookmarkEnd w:id="90"/>
+    <w:bookmarkStart w:id="91" w:name="full-final-acceptance"/>
     <w:p>
       <w:pPr>
         <w:pStyle w:val="Heading2"/>
@@ -15277,7 +15515,7 @@
         <w:pStyle w:val="Compact"/>
         <w:numPr>
           <w:ilvl w:val="0"/>
-          <w:numId w:val="1672"/>
+          <w:numId w:val="1679"/>
         </w:numPr>
       </w:pPr>
       <w:r>
@@ -15289,7 +15527,7 @@
         <w:pStyle w:val="Compact"/>
         <w:numPr>
           <w:ilvl w:val="0"/>
-          <w:numId w:val="1673"/>
+          <w:numId w:val="1680"/>
         </w:numPr>
       </w:pPr>
       <w:r>
@@ -15301,7 +15539,7 @@
         <w:pStyle w:val="Compact"/>
         <w:numPr>
           <w:ilvl w:val="0"/>
-          <w:numId w:val="1674"/>
+          <w:numId w:val="1681"/>
         </w:numPr>
       </w:pPr>
       <w:r>
@@ -15313,7 +15551,7 @@
         <w:pStyle w:val="Compact"/>
         <w:numPr>
           <w:ilvl w:val="0"/>
-          <w:numId w:val="1675"/>
+          <w:numId w:val="1682"/>
         </w:numPr>
       </w:pPr>
       <w:r>
@@ -15325,7 +15563,7 @@
         <w:pStyle w:val="Compact"/>
         <w:numPr>
           <w:ilvl w:val="0"/>
-          <w:numId w:val="1676"/>
+          <w:numId w:val="1683"/>
         </w:numPr>
       </w:pPr>
       <w:r>
@@ -15337,7 +15575,7 @@
         <w:pStyle w:val="Compact"/>
         <w:numPr>
           <w:ilvl w:val="0"/>
-          <w:numId w:val="1677"/>
+          <w:numId w:val="1684"/>
         </w:numPr>
       </w:pPr>
       <w:r>
@@ -15349,7 +15587,7 @@
         <w:pStyle w:val="Compact"/>
         <w:numPr>
           <w:ilvl w:val="0"/>
-          <w:numId w:val="1678"/>
+          <w:numId w:val="1685"/>
         </w:numPr>
       </w:pPr>
       <w:r>
@@ -15361,7 +15599,7 @@
         <w:pStyle w:val="Compact"/>
         <w:numPr>
           <w:ilvl w:val="0"/>
-          <w:numId w:val="1679"/>
+          <w:numId w:val="1686"/>
         </w:numPr>
       </w:pPr>
       <w:r>
@@ -15373,7 +15611,7 @@
         <w:pStyle w:val="Compact"/>
         <w:numPr>
           <w:ilvl w:val="0"/>
-          <w:numId w:val="1680"/>
+          <w:numId w:val="1687"/>
         </w:numPr>
       </w:pPr>
       <w:r>
@@ -15385,7 +15623,7 @@
         <w:pStyle w:val="Compact"/>
         <w:numPr>
           <w:ilvl w:val="0"/>
-          <w:numId w:val="1681"/>
+          <w:numId w:val="1688"/>
         </w:numPr>
       </w:pPr>
       <w:r>
@@ -15397,15 +15635,15 @@
         <w:pStyle w:val="Compact"/>
         <w:numPr>
           <w:ilvl w:val="0"/>
-          <w:numId w:val="1682"/>
+          <w:numId w:val="1689"/>
         </w:numPr>
       </w:pPr>
       <w:r>
         <w:t xml:space="preserve">Final client-facing summary prepared with what changed, how it was tested, and what is intentionally out of scope.</w:t>
       </w:r>
     </w:p>
-    <w:bookmarkEnd w:id="90"/>
-    <w:bookmarkStart w:id="91" w:name="progress-update-log"/>
+    <w:bookmarkEnd w:id="91"/>
+    <w:bookmarkStart w:id="92" w:name="progress-update-log"/>
     <w:p>
       <w:pPr>
         <w:pStyle w:val="Heading2"/>
@@ -15770,8 +16008,8 @@
         </w:tc>
       </w:tr>
     </w:tbl>
-    <w:bookmarkEnd w:id="91"/>
     <w:bookmarkEnd w:id="92"/>
+    <w:bookmarkEnd w:id="93"/>
     <w:sectPr>
       <w:footnotePr>
         <w:numRestart w:val="eachSect"/>
@@ -17428,7 +17666,7 @@
     <w:abstractNumId w:val="992"/>
   </w:num>
   <w:num w:numId="1430">
-    <w:abstractNumId w:val="992"/>
+    <w:abstractNumId w:val="993"/>
   </w:num>
   <w:num w:numId="1431">
     <w:abstractNumId w:val="993"/>
@@ -17449,40 +17687,40 @@
     <w:abstractNumId w:val="993"/>
   </w:num>
   <w:num w:numId="1437">
-    <w:abstractNumId w:val="992"/>
+    <w:abstractNumId w:val="993"/>
   </w:num>
   <w:num w:numId="1438">
-    <w:abstractNumId w:val="992"/>
+    <w:abstractNumId w:val="993"/>
   </w:num>
   <w:num w:numId="1439">
-    <w:abstractNumId w:val="992"/>
+    <w:abstractNumId w:val="993"/>
   </w:num>
   <w:num w:numId="1440">
-    <w:abstractNumId w:val="992"/>
+    <w:abstractNumId w:val="993"/>
   </w:num>
   <w:num w:numId="1441">
-    <w:abstractNumId w:val="992"/>
+    <w:abstractNumId w:val="993"/>
   </w:num>
   <w:num w:numId="1442">
-    <w:abstractNumId w:val="992"/>
+    <w:abstractNumId w:val="993"/>
   </w:num>
   <w:num w:numId="1443">
-    <w:abstractNumId w:val="992"/>
+    <w:abstractNumId w:val="993"/>
   </w:num>
   <w:num w:numId="1444">
-    <w:abstractNumId w:val="992"/>
+    <w:abstractNumId w:val="993"/>
   </w:num>
   <w:num w:numId="1445">
     <w:abstractNumId w:val="992"/>
   </w:num>
   <w:num w:numId="1446">
-    <w:abstractNumId w:val="993"/>
+    <w:abstractNumId w:val="992"/>
   </w:num>
   <w:num w:numId="1447">
-    <w:abstractNumId w:val="993"/>
+    <w:abstractNumId w:val="992"/>
   </w:num>
   <w:num w:numId="1448">
-    <w:abstractNumId w:val="993"/>
+    <w:abstractNumId w:val="992"/>
   </w:num>
   <w:num w:numId="1449">
     <w:abstractNumId w:val="992"/>
@@ -17494,7 +17732,7 @@
     <w:abstractNumId w:val="992"/>
   </w:num>
   <w:num w:numId="1452">
-    <w:abstractNumId w:val="993"/>
+    <w:abstractNumId w:val="992"/>
   </w:num>
   <w:num w:numId="1453">
     <w:abstractNumId w:val="993"/>
@@ -17512,7 +17750,7 @@
     <w:abstractNumId w:val="992"/>
   </w:num>
   <w:num w:numId="1458">
-    <w:abstractNumId w:val="993"/>
+    <w:abstractNumId w:val="992"/>
   </w:num>
   <w:num w:numId="1459">
     <w:abstractNumId w:val="993"/>
@@ -17527,10 +17765,10 @@
     <w:abstractNumId w:val="993"/>
   </w:num>
   <w:num w:numId="1463">
-    <w:abstractNumId w:val="993"/>
+    <w:abstractNumId w:val="992"/>
   </w:num>
   <w:num w:numId="1464">
-    <w:abstractNumId w:val="993"/>
+    <w:abstractNumId w:val="992"/>
   </w:num>
   <w:num w:numId="1465">
     <w:abstractNumId w:val="993"/>
@@ -17554,61 +17792,61 @@
     <w:abstractNumId w:val="993"/>
   </w:num>
   <w:num w:numId="1472">
-    <w:abstractNumId w:val="992"/>
+    <w:abstractNumId w:val="993"/>
   </w:num>
   <w:num w:numId="1473">
+    <w:abstractNumId w:val="993"/>
+  </w:num>
+  <w:num w:numId="1474">
+    <w:abstractNumId w:val="993"/>
+  </w:num>
+  <w:num w:numId="1475">
+    <w:abstractNumId w:val="993"/>
+  </w:num>
+  <w:num w:numId="1476">
+    <w:abstractNumId w:val="993"/>
+  </w:num>
+  <w:num w:numId="1477">
+    <w:abstractNumId w:val="993"/>
+  </w:num>
+  <w:num w:numId="1478">
+    <w:abstractNumId w:val="993"/>
+  </w:num>
+  <w:num w:numId="1479">
+    <w:abstractNumId w:val="992"/>
+  </w:num>
+  <w:num w:numId="1480">
     <w:abstractNumId w:val="991"/>
   </w:num>
-  <w:num w:numId="1474">
-    <w:abstractNumId w:val="993"/>
-  </w:num>
-  <w:num w:numId="1475">
-    <w:abstractNumId w:val="993"/>
-  </w:num>
-  <w:num w:numId="1476">
-    <w:abstractNumId w:val="992"/>
-  </w:num>
-  <w:num w:numId="1477">
-    <w:abstractNumId w:val="992"/>
-  </w:num>
-  <w:num w:numId="1478">
-    <w:abstractNumId w:val="992"/>
-  </w:num>
-  <w:num w:numId="1479">
-    <w:abstractNumId w:val="992"/>
-  </w:num>
-  <w:num w:numId="1480">
-    <w:abstractNumId w:val="992"/>
-  </w:num>
   <w:num w:numId="1481">
     <w:abstractNumId w:val="993"/>
   </w:num>
   <w:num w:numId="1482">
-    <w:abstractNumId w:val="992"/>
+    <w:abstractNumId w:val="993"/>
   </w:num>
   <w:num w:numId="1483">
     <w:abstractNumId w:val="992"/>
   </w:num>
   <w:num w:numId="1484">
-    <w:abstractNumId w:val="993"/>
+    <w:abstractNumId w:val="992"/>
   </w:num>
   <w:num w:numId="1485">
-    <w:abstractNumId w:val="993"/>
+    <w:abstractNumId w:val="992"/>
   </w:num>
   <w:num w:numId="1486">
-    <w:abstractNumId w:val="993"/>
+    <w:abstractNumId w:val="992"/>
   </w:num>
   <w:num w:numId="1487">
-    <w:abstractNumId w:val="993"/>
+    <w:abstractNumId w:val="992"/>
   </w:num>
   <w:num w:numId="1488">
     <w:abstractNumId w:val="993"/>
   </w:num>
   <w:num w:numId="1489">
-    <w:abstractNumId w:val="993"/>
+    <w:abstractNumId w:val="992"/>
   </w:num>
   <w:num w:numId="1490">
-    <w:abstractNumId w:val="993"/>
+    <w:abstractNumId w:val="992"/>
   </w:num>
   <w:num w:numId="1491">
     <w:abstractNumId w:val="993"/>
@@ -17632,65 +17870,65 @@
     <w:abstractNumId w:val="993"/>
   </w:num>
   <w:num w:numId="1498">
+    <w:abstractNumId w:val="993"/>
+  </w:num>
+  <w:num w:numId="1499">
+    <w:abstractNumId w:val="993"/>
+  </w:num>
+  <w:num w:numId="1500">
+    <w:abstractNumId w:val="993"/>
+  </w:num>
+  <w:num w:numId="1501">
+    <w:abstractNumId w:val="993"/>
+  </w:num>
+  <w:num w:numId="1502">
+    <w:abstractNumId w:val="993"/>
+  </w:num>
+  <w:num w:numId="1503">
+    <w:abstractNumId w:val="993"/>
+  </w:num>
+  <w:num w:numId="1504">
+    <w:abstractNumId w:val="993"/>
+  </w:num>
+  <w:num w:numId="1505">
     <w:abstractNumId w:val="991"/>
   </w:num>
-  <w:num w:numId="1499">
-    <w:abstractNumId w:val="993"/>
-  </w:num>
-  <w:num w:numId="1500">
-    <w:abstractNumId w:val="993"/>
-  </w:num>
-  <w:num w:numId="1501">
-    <w:abstractNumId w:val="993"/>
-  </w:num>
-  <w:num w:numId="1502">
+  <w:num w:numId="1506">
+    <w:abstractNumId w:val="993"/>
+  </w:num>
+  <w:num w:numId="1507">
+    <w:abstractNumId w:val="993"/>
+  </w:num>
+  <w:num w:numId="1508">
+    <w:abstractNumId w:val="993"/>
+  </w:num>
+  <w:num w:numId="1509">
     <w:abstractNumId w:val="991"/>
   </w:num>
-  <w:num w:numId="1503">
-    <w:abstractNumId w:val="993"/>
-  </w:num>
-  <w:num w:numId="1504">
-    <w:abstractNumId w:val="993"/>
-  </w:num>
-  <w:num w:numId="1505">
-    <w:abstractNumId w:val="992"/>
-  </w:num>
-  <w:num w:numId="1506">
-    <w:abstractNumId w:val="992"/>
-  </w:num>
-  <w:num w:numId="1507">
-    <w:abstractNumId w:val="993"/>
-  </w:num>
-  <w:num w:numId="1508">
+  <w:num w:numId="1510">
+    <w:abstractNumId w:val="993"/>
+  </w:num>
+  <w:num w:numId="1511">
+    <w:abstractNumId w:val="993"/>
+  </w:num>
+  <w:num w:numId="1512">
+    <w:abstractNumId w:val="992"/>
+  </w:num>
+  <w:num w:numId="1513">
+    <w:abstractNumId w:val="992"/>
+  </w:num>
+  <w:num w:numId="1514">
+    <w:abstractNumId w:val="993"/>
+  </w:num>
+  <w:num w:numId="1515">
     <w:abstractNumId w:val="991"/>
   </w:num>
-  <w:num w:numId="1509">
-    <w:abstractNumId w:val="993"/>
-  </w:num>
-  <w:num w:numId="1510">
+  <w:num w:numId="1516">
+    <w:abstractNumId w:val="993"/>
+  </w:num>
+  <w:num w:numId="1517">
     <w:abstractNumId w:val="991"/>
   </w:num>
-  <w:num w:numId="1511">
-    <w:abstractNumId w:val="993"/>
-  </w:num>
-  <w:num w:numId="1512">
-    <w:abstractNumId w:val="993"/>
-  </w:num>
-  <w:num w:numId="1513">
-    <w:abstractNumId w:val="993"/>
-  </w:num>
-  <w:num w:numId="1514">
-    <w:abstractNumId w:val="993"/>
-  </w:num>
-  <w:num w:numId="1515">
-    <w:abstractNumId w:val="993"/>
-  </w:num>
-  <w:num w:numId="1516">
-    <w:abstractNumId w:val="993"/>
-  </w:num>
-  <w:num w:numId="1517">
-    <w:abstractNumId w:val="993"/>
-  </w:num>
   <w:num w:numId="1518">
     <w:abstractNumId w:val="993"/>
   </w:num>
@@ -17698,34 +17936,34 @@
     <w:abstractNumId w:val="993"/>
   </w:num>
   <w:num w:numId="1520">
+    <w:abstractNumId w:val="993"/>
+  </w:num>
+  <w:num w:numId="1521">
+    <w:abstractNumId w:val="993"/>
+  </w:num>
+  <w:num w:numId="1522">
+    <w:abstractNumId w:val="993"/>
+  </w:num>
+  <w:num w:numId="1523">
+    <w:abstractNumId w:val="993"/>
+  </w:num>
+  <w:num w:numId="1524">
+    <w:abstractNumId w:val="993"/>
+  </w:num>
+  <w:num w:numId="1525">
+    <w:abstractNumId w:val="993"/>
+  </w:num>
+  <w:num w:numId="1526">
+    <w:abstractNumId w:val="993"/>
+  </w:num>
+  <w:num w:numId="1527">
     <w:abstractNumId w:val="991"/>
   </w:num>
-  <w:num w:numId="1521">
-    <w:abstractNumId w:val="993"/>
-  </w:num>
-  <w:num w:numId="1522">
-    <w:abstractNumId w:val="993"/>
-  </w:num>
-  <w:num w:numId="1523">
-    <w:abstractNumId w:val="992"/>
-  </w:num>
-  <w:num w:numId="1524">
-    <w:abstractNumId w:val="992"/>
-  </w:num>
-  <w:num w:numId="1525">
-    <w:abstractNumId w:val="993"/>
-  </w:num>
-  <w:num w:numId="1526">
-    <w:abstractNumId w:val="993"/>
-  </w:num>
-  <w:num w:numId="1527">
-    <w:abstractNumId w:val="993"/>
-  </w:num>
   <w:num w:numId="1528">
-    <w:abstractNumId w:val="992"/>
+    <w:abstractNumId w:val="993"/>
   </w:num>
   <w:num w:numId="1529">
-    <w:abstractNumId w:val="992"/>
+    <w:abstractNumId w:val="993"/>
   </w:num>
   <w:num w:numId="1530">
     <w:abstractNumId w:val="992"/>
@@ -17737,31 +17975,31 @@
     <w:abstractNumId w:val="993"/>
   </w:num>
   <w:num w:numId="1533">
-    <w:abstractNumId w:val="992"/>
+    <w:abstractNumId w:val="993"/>
   </w:num>
   <w:num w:numId="1534">
-    <w:abstractNumId w:val="992"/>
+    <w:abstractNumId w:val="993"/>
   </w:num>
   <w:num w:numId="1535">
-    <w:abstractNumId w:val="993"/>
+    <w:abstractNumId w:val="992"/>
   </w:num>
   <w:num w:numId="1536">
-    <w:abstractNumId w:val="993"/>
+    <w:abstractNumId w:val="992"/>
   </w:num>
   <w:num w:numId="1537">
-    <w:abstractNumId w:val="993"/>
+    <w:abstractNumId w:val="992"/>
   </w:num>
   <w:num w:numId="1538">
-    <w:abstractNumId w:val="993"/>
+    <w:abstractNumId w:val="992"/>
   </w:num>
   <w:num w:numId="1539">
     <w:abstractNumId w:val="993"/>
   </w:num>
   <w:num w:numId="1540">
-    <w:abstractNumId w:val="993"/>
+    <w:abstractNumId w:val="992"/>
   </w:num>
   <w:num w:numId="1541">
-    <w:abstractNumId w:val="993"/>
+    <w:abstractNumId w:val="992"/>
   </w:num>
   <w:num w:numId="1542">
     <w:abstractNumId w:val="993"/>
@@ -17803,29 +18041,29 @@
     <w:abstractNumId w:val="993"/>
   </w:num>
   <w:num w:numId="1555">
+    <w:abstractNumId w:val="993"/>
+  </w:num>
+  <w:num w:numId="1556">
+    <w:abstractNumId w:val="993"/>
+  </w:num>
+  <w:num w:numId="1557">
+    <w:abstractNumId w:val="993"/>
+  </w:num>
+  <w:num w:numId="1558">
+    <w:abstractNumId w:val="993"/>
+  </w:num>
+  <w:num w:numId="1559">
+    <w:abstractNumId w:val="993"/>
+  </w:num>
+  <w:num w:numId="1560">
+    <w:abstractNumId w:val="993"/>
+  </w:num>
+  <w:num w:numId="1561">
+    <w:abstractNumId w:val="993"/>
+  </w:num>
+  <w:num w:numId="1562">
     <w:abstractNumId w:val="991"/>
   </w:num>
-  <w:num w:numId="1556">
-    <w:abstractNumId w:val="992"/>
-  </w:num>
-  <w:num w:numId="1557">
-    <w:abstractNumId w:val="992"/>
-  </w:num>
-  <w:num w:numId="1558">
-    <w:abstractNumId w:val="992"/>
-  </w:num>
-  <w:num w:numId="1559">
-    <w:abstractNumId w:val="992"/>
-  </w:num>
-  <w:num w:numId="1560">
-    <w:abstractNumId w:val="992"/>
-  </w:num>
-  <w:num w:numId="1561">
-    <w:abstractNumId w:val="992"/>
-  </w:num>
-  <w:num w:numId="1562">
-    <w:abstractNumId w:val="992"/>
-  </w:num>
   <w:num w:numId="1563">
     <w:abstractNumId w:val="992"/>
   </w:num>
@@ -17854,53 +18092,53 @@
     <w:abstractNumId w:val="992"/>
   </w:num>
   <w:num w:numId="1572">
-    <w:abstractNumId w:val="993"/>
+    <w:abstractNumId w:val="992"/>
   </w:num>
   <w:num w:numId="1573">
-    <w:abstractNumId w:val="993"/>
+    <w:abstractNumId w:val="992"/>
   </w:num>
   <w:num w:numId="1574">
-    <w:abstractNumId w:val="993"/>
+    <w:abstractNumId w:val="992"/>
   </w:num>
   <w:num w:numId="1575">
-    <w:abstractNumId w:val="993"/>
+    <w:abstractNumId w:val="992"/>
   </w:num>
   <w:num w:numId="1576">
-    <w:abstractNumId w:val="993"/>
+    <w:abstractNumId w:val="992"/>
   </w:num>
   <w:num w:numId="1577">
+    <w:abstractNumId w:val="992"/>
+  </w:num>
+  <w:num w:numId="1578">
+    <w:abstractNumId w:val="992"/>
+  </w:num>
+  <w:num w:numId="1579">
+    <w:abstractNumId w:val="993"/>
+  </w:num>
+  <w:num w:numId="1580">
+    <w:abstractNumId w:val="993"/>
+  </w:num>
+  <w:num w:numId="1581">
+    <w:abstractNumId w:val="993"/>
+  </w:num>
+  <w:num w:numId="1582">
+    <w:abstractNumId w:val="993"/>
+  </w:num>
+  <w:num w:numId="1583">
+    <w:abstractNumId w:val="993"/>
+  </w:num>
+  <w:num w:numId="1584">
     <w:abstractNumId w:val="991"/>
   </w:num>
-  <w:num w:numId="1578">
-    <w:abstractNumId w:val="993"/>
-  </w:num>
-  <w:num w:numId="1579">
-    <w:abstractNumId w:val="993"/>
-  </w:num>
-  <w:num w:numId="1580">
+  <w:num w:numId="1585">
+    <w:abstractNumId w:val="993"/>
+  </w:num>
+  <w:num w:numId="1586">
+    <w:abstractNumId w:val="993"/>
+  </w:num>
+  <w:num w:numId="1587">
     <w:abstractNumId w:val="991"/>
   </w:num>
-  <w:num w:numId="1581">
-    <w:abstractNumId w:val="993"/>
-  </w:num>
-  <w:num w:numId="1582">
-    <w:abstractNumId w:val="993"/>
-  </w:num>
-  <w:num w:numId="1583">
-    <w:abstractNumId w:val="993"/>
-  </w:num>
-  <w:num w:numId="1584">
-    <w:abstractNumId w:val="993"/>
-  </w:num>
-  <w:num w:numId="1585">
-    <w:abstractNumId w:val="993"/>
-  </w:num>
-  <w:num w:numId="1586">
-    <w:abstractNumId w:val="993"/>
-  </w:num>
-  <w:num w:numId="1587">
-    <w:abstractNumId w:val="993"/>
-  </w:num>
   <w:num w:numId="1588">
     <w:abstractNumId w:val="993"/>
   </w:num>
@@ -17911,46 +18149,46 @@
     <w:abstractNumId w:val="993"/>
   </w:num>
   <w:num w:numId="1591">
+    <w:abstractNumId w:val="993"/>
+  </w:num>
+  <w:num w:numId="1592">
+    <w:abstractNumId w:val="993"/>
+  </w:num>
+  <w:num w:numId="1593">
+    <w:abstractNumId w:val="993"/>
+  </w:num>
+  <w:num w:numId="1594">
+    <w:abstractNumId w:val="993"/>
+  </w:num>
+  <w:num w:numId="1595">
+    <w:abstractNumId w:val="993"/>
+  </w:num>
+  <w:num w:numId="1596">
+    <w:abstractNumId w:val="993"/>
+  </w:num>
+  <w:num w:numId="1597">
+    <w:abstractNumId w:val="993"/>
+  </w:num>
+  <w:num w:numId="1598">
     <w:abstractNumId w:val="991"/>
   </w:num>
-  <w:num w:numId="1592">
-    <w:abstractNumId w:val="993"/>
-  </w:num>
-  <w:num w:numId="1593">
+  <w:num w:numId="1599">
+    <w:abstractNumId w:val="993"/>
+  </w:num>
+  <w:num w:numId="1600">
     <w:abstractNumId w:val="991"/>
   </w:num>
-  <w:num w:numId="1594">
-    <w:abstractNumId w:val="993"/>
-  </w:num>
-  <w:num w:numId="1595">
-    <w:abstractNumId w:val="993"/>
-  </w:num>
-  <w:num w:numId="1596">
-    <w:abstractNumId w:val="993"/>
-  </w:num>
-  <w:num w:numId="1597">
-    <w:abstractNumId w:val="993"/>
-  </w:num>
-  <w:num w:numId="1598">
-    <w:abstractNumId w:val="992"/>
-  </w:num>
-  <w:num w:numId="1599">
-    <w:abstractNumId w:val="992"/>
-  </w:num>
-  <w:num w:numId="1600">
-    <w:abstractNumId w:val="993"/>
-  </w:num>
   <w:num w:numId="1601">
-    <w:abstractNumId w:val="992"/>
+    <w:abstractNumId w:val="993"/>
   </w:num>
   <w:num w:numId="1602">
-    <w:abstractNumId w:val="992"/>
+    <w:abstractNumId w:val="993"/>
   </w:num>
   <w:num w:numId="1603">
-    <w:abstractNumId w:val="992"/>
+    <w:abstractNumId w:val="993"/>
   </w:num>
   <w:num w:numId="1604">
-    <w:abstractNumId w:val="992"/>
+    <w:abstractNumId w:val="993"/>
   </w:num>
   <w:num w:numId="1605">
     <w:abstractNumId w:val="992"/>
@@ -17962,25 +18200,25 @@
     <w:abstractNumId w:val="993"/>
   </w:num>
   <w:num w:numId="1608">
-    <w:abstractNumId w:val="993"/>
+    <w:abstractNumId w:val="992"/>
   </w:num>
   <w:num w:numId="1609">
-    <w:abstractNumId w:val="993"/>
+    <w:abstractNumId w:val="992"/>
   </w:num>
   <w:num w:numId="1610">
-    <w:abstractNumId w:val="993"/>
+    <w:abstractNumId w:val="992"/>
   </w:num>
   <w:num w:numId="1611">
-    <w:abstractNumId w:val="993"/>
+    <w:abstractNumId w:val="992"/>
   </w:num>
   <w:num w:numId="1612">
-    <w:abstractNumId w:val="993"/>
+    <w:abstractNumId w:val="992"/>
   </w:num>
   <w:num w:numId="1613">
-    <w:abstractNumId w:val="993"/>
+    <w:abstractNumId w:val="992"/>
   </w:num>
   <w:num w:numId="1614">
-    <w:abstractNumId w:val="992"/>
+    <w:abstractNumId w:val="993"/>
   </w:num>
   <w:num w:numId="1615">
     <w:abstractNumId w:val="993"/>
@@ -17992,7 +18230,7 @@
     <w:abstractNumId w:val="993"/>
   </w:num>
   <w:num w:numId="1618">
-    <w:abstractNumId w:val="992"/>
+    <w:abstractNumId w:val="993"/>
   </w:num>
   <w:num w:numId="1619">
     <w:abstractNumId w:val="993"/>
@@ -18001,10 +18239,10 @@
     <w:abstractNumId w:val="993"/>
   </w:num>
   <w:num w:numId="1621">
-    <w:abstractNumId w:val="993"/>
+    <w:abstractNumId w:val="992"/>
   </w:num>
   <w:num w:numId="1622">
-    <w:abstractNumId w:val="992"/>
+    <w:abstractNumId w:val="993"/>
   </w:num>
   <w:num w:numId="1623">
     <w:abstractNumId w:val="993"/>
@@ -18013,7 +18251,7 @@
     <w:abstractNumId w:val="993"/>
   </w:num>
   <w:num w:numId="1625">
-    <w:abstractNumId w:val="993"/>
+    <w:abstractNumId w:val="992"/>
   </w:num>
   <w:num w:numId="1626">
     <w:abstractNumId w:val="993"/>
@@ -18031,10 +18269,10 @@
     <w:abstractNumId w:val="993"/>
   </w:num>
   <w:num w:numId="1631">
-    <w:abstractNumId w:val="992"/>
+    <w:abstractNumId w:val="993"/>
   </w:num>
   <w:num w:numId="1632">
-    <w:abstractNumId w:val="992"/>
+    <w:abstractNumId w:val="993"/>
   </w:num>
   <w:num w:numId="1633">
     <w:abstractNumId w:val="993"/>
@@ -18046,10 +18284,10 @@
     <w:abstractNumId w:val="993"/>
   </w:num>
   <w:num w:numId="1636">
-    <w:abstractNumId w:val="993"/>
+    <w:abstractNumId w:val="992"/>
   </w:num>
   <w:num w:numId="1637">
-    <w:abstractNumId w:val="992"/>
+    <w:abstractNumId w:val="993"/>
   </w:num>
   <w:num w:numId="1638">
     <w:abstractNumId w:val="992"/>
@@ -18058,16 +18296,16 @@
     <w:abstractNumId w:val="992"/>
   </w:num>
   <w:num w:numId="1640">
-    <w:abstractNumId w:val="992"/>
+    <w:abstractNumId w:val="993"/>
   </w:num>
   <w:num w:numId="1641">
     <w:abstractNumId w:val="993"/>
   </w:num>
   <w:num w:numId="1642">
-    <w:abstractNumId w:val="992"/>
+    <w:abstractNumId w:val="993"/>
   </w:num>
   <w:num w:numId="1643">
-    <w:abstractNumId w:val="992"/>
+    <w:abstractNumId w:val="993"/>
   </w:num>
   <w:num w:numId="1644">
     <w:abstractNumId w:val="992"/>
@@ -18082,7 +18320,7 @@
     <w:abstractNumId w:val="992"/>
   </w:num>
   <w:num w:numId="1648">
-    <w:abstractNumId w:val="992"/>
+    <w:abstractNumId w:val="993"/>
   </w:num>
   <w:num w:numId="1649">
     <w:abstractNumId w:val="992"/>
@@ -18184,6 +18422,27 @@
     <w:abstractNumId w:val="992"/>
   </w:num>
   <w:num w:numId="1682">
+    <w:abstractNumId w:val="992"/>
+  </w:num>
+  <w:num w:numId="1683">
+    <w:abstractNumId w:val="992"/>
+  </w:num>
+  <w:num w:numId="1684">
+    <w:abstractNumId w:val="992"/>
+  </w:num>
+  <w:num w:numId="1685">
+    <w:abstractNumId w:val="992"/>
+  </w:num>
+  <w:num w:numId="1686">
+    <w:abstractNumId w:val="992"/>
+  </w:num>
+  <w:num w:numId="1687">
+    <w:abstractNumId w:val="992"/>
+  </w:num>
+  <w:num w:numId="1688">
+    <w:abstractNumId w:val="992"/>
+  </w:num>
+  <w:num w:numId="1689">
     <w:abstractNumId w:val="992"/>
   </w:num>
 </w:numbering>

</xml_diff>

<commit_message>
docs: record m16 deal sharing production smoke
</commit_message>
<xml_diff>
--- a/MASTER_M1_M2_DELIVERY_CHECKLIST.docx
+++ b/MASTER_M1_M2_DELIVERY_CHECKLIST.docx
@@ -457,7 +457,7 @@
               <w:jc w:val="right"/>
             </w:pPr>
             <w:r>
-              <w:t xml:space="preserve">6%</w:t>
+              <w:t xml:space="preserve">7%</w:t>
             </w:r>
           </w:p>
         </w:tc>
@@ -468,7 +468,7 @@
               <w:pStyle w:val="Compact"/>
             </w:pPr>
             <w:r>
-              <w:t xml:space="preserve">Inbox AI/email/follow-up policy gate deployed; new deal/share/socket/visual gates remain</w:t>
+              <w:t xml:space="preserve">Functional gates deployed through new deal/share/socket; visual gate remains</w:t>
             </w:r>
           </w:p>
         </w:tc>
@@ -709,7 +709,7 @@
                 <w:b/>
                 <w:bCs/>
               </w:rPr>
-              <w:t xml:space="preserve">73%</w:t>
+              <w:t xml:space="preserve">74%</w:t>
             </w:r>
           </w:p>
         </w:tc>
@@ -724,7 +724,7 @@
                 <w:b/>
                 <w:bCs/>
               </w:rPr>
-              <w:t xml:space="preserve">M1.6 Inbox AI/email/follow-up policy deployed; new deal/share/socket/visual remain</w:t>
+              <w:t xml:space="preserve">M1.6 functional gates deployed through new deal/share/socket; visual remains</w:t>
             </w:r>
           </w:p>
         </w:tc>
@@ -11016,7 +11016,115 @@
         </w:numPr>
       </w:pPr>
       <w:r>
-        <w:t xml:space="preserve">Production deploy/smoke pending for this gate.</w:t>
+        <w:t xml:space="preserve">Production deploy passed for commit</w:t>
+      </w:r>
+      <w:r>
+        <w:t xml:space="preserve"> </w:t>
+      </w:r>
+      <w:r>
+        <w:rPr>
+          <w:rStyle w:val="VerbatimChar"/>
+        </w:rPr>
+        <w:t xml:space="preserve">01b6700d</w:t>
+      </w:r>
+      <w:r>
+        <w:t xml:space="preserve">: Git bundle fast-forward, root</w:t>
+      </w:r>
+      <w:r>
+        <w:t xml:space="preserve"> </w:t>
+      </w:r>
+      <w:r>
+        <w:rPr>
+          <w:rStyle w:val="VerbatimChar"/>
+        </w:rPr>
+        <w:t xml:space="preserve">npm run build</w:t>
+      </w:r>
+      <w:r>
+        <w:t xml:space="preserve">, and</w:t>
+      </w:r>
+      <w:r>
+        <w:t xml:space="preserve"> </w:t>
+      </w:r>
+      <w:r>
+        <w:rPr>
+          <w:rStyle w:val="VerbatimChar"/>
+        </w:rPr>
+        <w:t xml:space="preserve">pm2 restart sms-api --update-env</w:t>
+      </w:r>
+      <w:r>
+        <w:t xml:space="preserve"> </w:t>
+      </w:r>
+      <w:r>
+        <w:t xml:space="preserve">all completed successfully.</w:t>
+      </w:r>
+    </w:p>
+    <w:p>
+      <w:pPr>
+        <w:pStyle w:val="Compact"/>
+        <w:numPr>
+          <w:ilvl w:val="0"/>
+          <w:numId w:val="1430"/>
+        </w:numPr>
+      </w:pPr>
+      <w:r>
+        <w:t xml:space="preserve">Production smoke passed:</w:t>
+      </w:r>
+      <w:r>
+        <w:t xml:space="preserve"> </w:t>
+      </w:r>
+      <w:r>
+        <w:rPr>
+          <w:rStyle w:val="VerbatimChar"/>
+        </w:rPr>
+        <w:t xml:space="preserve">/api/health</w:t>
+      </w:r>
+      <w:r>
+        <w:t xml:space="preserve"> </w:t>
+      </w:r>
+      <w:r>
+        <w:t xml:space="preserve">returned HTTP 200 with database</w:t>
+      </w:r>
+      <w:r>
+        <w:t xml:space="preserve"> </w:t>
+      </w:r>
+      <w:r>
+        <w:rPr>
+          <w:rStyle w:val="VerbatimChar"/>
+        </w:rPr>
+        <w:t xml:space="preserve">ok</w:t>
+      </w:r>
+      <w:r>
+        <w:t xml:space="preserve"> </w:t>
+      </w:r>
+      <w:r>
+        <w:t xml:space="preserve">and Redis</w:t>
+      </w:r>
+      <w:r>
+        <w:t xml:space="preserve"> </w:t>
+      </w:r>
+      <w:r>
+        <w:rPr>
+          <w:rStyle w:val="VerbatimChar"/>
+        </w:rPr>
+        <w:t xml:space="preserve">ok</w:t>
+      </w:r>
+      <w:r>
+        <w:t xml:space="preserve">; root HTML returned HTTP 200; live browser opened</w:t>
+      </w:r>
+      <w:r>
+        <w:t xml:space="preserve"> </w:t>
+      </w:r>
+      <w:r>
+        <w:rPr>
+          <w:rStyle w:val="VerbatimChar"/>
+        </w:rPr>
+        <w:t xml:space="preserve">/login</w:t>
+      </w:r>
+      <w:r>
+        <w:t xml:space="preserve"> </w:t>
+      </w:r>
+      <w:r>
+        <w:t xml:space="preserve">and rendered the SCL OTP login screen.</w:t>
       </w:r>
     </w:p>
     <w:bookmarkEnd w:id="58"/>
@@ -11034,7 +11142,7 @@
         <w:pStyle w:val="Compact"/>
         <w:numPr>
           <w:ilvl w:val="0"/>
-          <w:numId w:val="1430"/>
+          <w:numId w:val="1431"/>
         </w:numPr>
       </w:pPr>
       <w:r>
@@ -11046,7 +11154,7 @@
         <w:pStyle w:val="Compact"/>
         <w:numPr>
           <w:ilvl w:val="0"/>
-          <w:numId w:val="1431"/>
+          <w:numId w:val="1432"/>
         </w:numPr>
       </w:pPr>
       <w:r>
@@ -11058,7 +11166,7 @@
         <w:pStyle w:val="Compact"/>
         <w:numPr>
           <w:ilvl w:val="0"/>
-          <w:numId w:val="1432"/>
+          <w:numId w:val="1433"/>
         </w:numPr>
       </w:pPr>
       <w:r>
@@ -11070,7 +11178,7 @@
         <w:pStyle w:val="Compact"/>
         <w:numPr>
           <w:ilvl w:val="0"/>
-          <w:numId w:val="1433"/>
+          <w:numId w:val="1434"/>
         </w:numPr>
       </w:pPr>
       <w:r>
@@ -11082,7 +11190,7 @@
         <w:pStyle w:val="Compact"/>
         <w:numPr>
           <w:ilvl w:val="0"/>
-          <w:numId w:val="1434"/>
+          <w:numId w:val="1435"/>
         </w:numPr>
       </w:pPr>
       <w:r>
@@ -11094,7 +11202,7 @@
         <w:pStyle w:val="Compact"/>
         <w:numPr>
           <w:ilvl w:val="0"/>
-          <w:numId w:val="1435"/>
+          <w:numId w:val="1436"/>
         </w:numPr>
       </w:pPr>
       <w:r>
@@ -11106,7 +11214,7 @@
         <w:pStyle w:val="Compact"/>
         <w:numPr>
           <w:ilvl w:val="0"/>
-          <w:numId w:val="1436"/>
+          <w:numId w:val="1437"/>
         </w:numPr>
       </w:pPr>
       <w:r>
@@ -11118,7 +11226,7 @@
         <w:pStyle w:val="Compact"/>
         <w:numPr>
           <w:ilvl w:val="0"/>
-          <w:numId w:val="1437"/>
+          <w:numId w:val="1438"/>
         </w:numPr>
       </w:pPr>
       <w:r>
@@ -11130,7 +11238,7 @@
         <w:pStyle w:val="Compact"/>
         <w:numPr>
           <w:ilvl w:val="0"/>
-          <w:numId w:val="1438"/>
+          <w:numId w:val="1439"/>
         </w:numPr>
       </w:pPr>
       <w:r>
@@ -11142,7 +11250,7 @@
         <w:pStyle w:val="Compact"/>
         <w:numPr>
           <w:ilvl w:val="0"/>
-          <w:numId w:val="1439"/>
+          <w:numId w:val="1440"/>
         </w:numPr>
       </w:pPr>
       <w:r>
@@ -11154,7 +11262,7 @@
         <w:pStyle w:val="Compact"/>
         <w:numPr>
           <w:ilvl w:val="0"/>
-          <w:numId w:val="1440"/>
+          <w:numId w:val="1441"/>
         </w:numPr>
       </w:pPr>
       <w:r>
@@ -11166,7 +11274,7 @@
         <w:pStyle w:val="Compact"/>
         <w:numPr>
           <w:ilvl w:val="0"/>
-          <w:numId w:val="1441"/>
+          <w:numId w:val="1442"/>
         </w:numPr>
       </w:pPr>
       <w:r>
@@ -11178,7 +11286,7 @@
         <w:pStyle w:val="Compact"/>
         <w:numPr>
           <w:ilvl w:val="0"/>
-          <w:numId w:val="1442"/>
+          <w:numId w:val="1443"/>
         </w:numPr>
       </w:pPr>
       <w:r>
@@ -11190,7 +11298,7 @@
         <w:pStyle w:val="Compact"/>
         <w:numPr>
           <w:ilvl w:val="0"/>
-          <w:numId w:val="1443"/>
+          <w:numId w:val="1444"/>
         </w:numPr>
       </w:pPr>
       <w:r>
@@ -11202,7 +11310,7 @@
         <w:pStyle w:val="Compact"/>
         <w:numPr>
           <w:ilvl w:val="0"/>
-          <w:numId w:val="1444"/>
+          <w:numId w:val="1445"/>
         </w:numPr>
       </w:pPr>
       <w:r>
@@ -11224,7 +11332,7 @@
         <w:pStyle w:val="Compact"/>
         <w:numPr>
           <w:ilvl w:val="0"/>
-          <w:numId w:val="1445"/>
+          <w:numId w:val="1446"/>
         </w:numPr>
       </w:pPr>
       <w:r>
@@ -11236,7 +11344,7 @@
         <w:pStyle w:val="Compact"/>
         <w:numPr>
           <w:ilvl w:val="0"/>
-          <w:numId w:val="1446"/>
+          <w:numId w:val="1447"/>
         </w:numPr>
       </w:pPr>
       <w:r>
@@ -11248,7 +11356,7 @@
         <w:pStyle w:val="Compact"/>
         <w:numPr>
           <w:ilvl w:val="0"/>
-          <w:numId w:val="1447"/>
+          <w:numId w:val="1448"/>
         </w:numPr>
       </w:pPr>
       <w:r>
@@ -11260,7 +11368,7 @@
         <w:pStyle w:val="Compact"/>
         <w:numPr>
           <w:ilvl w:val="0"/>
-          <w:numId w:val="1448"/>
+          <w:numId w:val="1449"/>
         </w:numPr>
       </w:pPr>
       <w:r>
@@ -11272,7 +11380,7 @@
         <w:pStyle w:val="Compact"/>
         <w:numPr>
           <w:ilvl w:val="0"/>
-          <w:numId w:val="1449"/>
+          <w:numId w:val="1450"/>
         </w:numPr>
       </w:pPr>
       <w:r>
@@ -11284,7 +11392,7 @@
         <w:pStyle w:val="Compact"/>
         <w:numPr>
           <w:ilvl w:val="0"/>
-          <w:numId w:val="1450"/>
+          <w:numId w:val="1451"/>
         </w:numPr>
       </w:pPr>
       <w:r>
@@ -11296,7 +11404,7 @@
         <w:pStyle w:val="Compact"/>
         <w:numPr>
           <w:ilvl w:val="0"/>
-          <w:numId w:val="1451"/>
+          <w:numId w:val="1452"/>
         </w:numPr>
       </w:pPr>
       <w:r>
@@ -11318,7 +11426,7 @@
         <w:pStyle w:val="Compact"/>
         <w:numPr>
           <w:ilvl w:val="0"/>
-          <w:numId w:val="1452"/>
+          <w:numId w:val="1453"/>
         </w:numPr>
       </w:pPr>
       <w:r>
@@ -11330,7 +11438,7 @@
         <w:pStyle w:val="Compact"/>
         <w:numPr>
           <w:ilvl w:val="0"/>
-          <w:numId w:val="1453"/>
+          <w:numId w:val="1454"/>
         </w:numPr>
       </w:pPr>
       <w:r>
@@ -11342,7 +11450,7 @@
         <w:pStyle w:val="Compact"/>
         <w:numPr>
           <w:ilvl w:val="0"/>
-          <w:numId w:val="1454"/>
+          <w:numId w:val="1455"/>
         </w:numPr>
       </w:pPr>
       <w:r>
@@ -11354,7 +11462,7 @@
         <w:pStyle w:val="Compact"/>
         <w:numPr>
           <w:ilvl w:val="0"/>
-          <w:numId w:val="1455"/>
+          <w:numId w:val="1456"/>
         </w:numPr>
       </w:pPr>
       <w:r>
@@ -11366,7 +11474,7 @@
         <w:pStyle w:val="Compact"/>
         <w:numPr>
           <w:ilvl w:val="0"/>
-          <w:numId w:val="1456"/>
+          <w:numId w:val="1457"/>
         </w:numPr>
       </w:pPr>
       <w:r>
@@ -11378,7 +11486,7 @@
         <w:pStyle w:val="Compact"/>
         <w:numPr>
           <w:ilvl w:val="0"/>
-          <w:numId w:val="1457"/>
+          <w:numId w:val="1458"/>
         </w:numPr>
       </w:pPr>
       <w:r>
@@ -11390,7 +11498,7 @@
         <w:pStyle w:val="Compact"/>
         <w:numPr>
           <w:ilvl w:val="0"/>
-          <w:numId w:val="1458"/>
+          <w:numId w:val="1459"/>
         </w:numPr>
       </w:pPr>
       <w:r>
@@ -11422,7 +11530,7 @@
         <w:pStyle w:val="Compact"/>
         <w:numPr>
           <w:ilvl w:val="0"/>
-          <w:numId w:val="1459"/>
+          <w:numId w:val="1460"/>
         </w:numPr>
       </w:pPr>
       <w:r>
@@ -11494,7 +11602,7 @@
         <w:pStyle w:val="Compact"/>
         <w:numPr>
           <w:ilvl w:val="0"/>
-          <w:numId w:val="1460"/>
+          <w:numId w:val="1461"/>
         </w:numPr>
       </w:pPr>
       <w:r>
@@ -11506,7 +11614,7 @@
         <w:pStyle w:val="Compact"/>
         <w:numPr>
           <w:ilvl w:val="0"/>
-          <w:numId w:val="1461"/>
+          <w:numId w:val="1462"/>
         </w:numPr>
       </w:pPr>
       <w:r>
@@ -11533,7 +11641,7 @@
         <w:pStyle w:val="Compact"/>
         <w:numPr>
           <w:ilvl w:val="0"/>
-          <w:numId w:val="1462"/>
+          <w:numId w:val="1463"/>
         </w:numPr>
       </w:pPr>
       <w:r>
@@ -11587,7 +11695,7 @@
         <w:pStyle w:val="Compact"/>
         <w:numPr>
           <w:ilvl w:val="0"/>
-          <w:numId w:val="1463"/>
+          <w:numId w:val="1464"/>
         </w:numPr>
       </w:pPr>
       <w:r>
@@ -11599,7 +11707,7 @@
         <w:pStyle w:val="Compact"/>
         <w:numPr>
           <w:ilvl w:val="0"/>
-          <w:numId w:val="1464"/>
+          <w:numId w:val="1465"/>
         </w:numPr>
       </w:pPr>
       <w:r>
@@ -11621,7 +11729,7 @@
         <w:pStyle w:val="Compact"/>
         <w:numPr>
           <w:ilvl w:val="0"/>
-          <w:numId w:val="1465"/>
+          <w:numId w:val="1466"/>
         </w:numPr>
       </w:pPr>
       <w:r>
@@ -11672,7 +11780,7 @@
         <w:pStyle w:val="Compact"/>
         <w:numPr>
           <w:ilvl w:val="0"/>
-          <w:numId w:val="1466"/>
+          <w:numId w:val="1467"/>
         </w:numPr>
       </w:pPr>
       <w:r>
@@ -11699,7 +11807,7 @@
         <w:pStyle w:val="Compact"/>
         <w:numPr>
           <w:ilvl w:val="0"/>
-          <w:numId w:val="1467"/>
+          <w:numId w:val="1468"/>
         </w:numPr>
       </w:pPr>
       <w:r>
@@ -11711,7 +11819,7 @@
         <w:pStyle w:val="Compact"/>
         <w:numPr>
           <w:ilvl w:val="0"/>
-          <w:numId w:val="1468"/>
+          <w:numId w:val="1469"/>
         </w:numPr>
       </w:pPr>
       <w:r>
@@ -11738,7 +11846,7 @@
         <w:pStyle w:val="Compact"/>
         <w:numPr>
           <w:ilvl w:val="0"/>
-          <w:numId w:val="1469"/>
+          <w:numId w:val="1470"/>
         </w:numPr>
       </w:pPr>
       <w:r>
@@ -11750,7 +11858,7 @@
         <w:pStyle w:val="Compact"/>
         <w:numPr>
           <w:ilvl w:val="0"/>
-          <w:numId w:val="1470"/>
+          <w:numId w:val="1471"/>
         </w:numPr>
       </w:pPr>
       <w:r>
@@ -11762,7 +11870,7 @@
         <w:pStyle w:val="Compact"/>
         <w:numPr>
           <w:ilvl w:val="0"/>
-          <w:numId w:val="1471"/>
+          <w:numId w:val="1472"/>
         </w:numPr>
       </w:pPr>
       <w:r>
@@ -11784,7 +11892,7 @@
         <w:pStyle w:val="Compact"/>
         <w:numPr>
           <w:ilvl w:val="0"/>
-          <w:numId w:val="1472"/>
+          <w:numId w:val="1473"/>
         </w:numPr>
       </w:pPr>
       <w:r>
@@ -11808,7 +11916,7 @@
         <w:pStyle w:val="Compact"/>
         <w:numPr>
           <w:ilvl w:val="0"/>
-          <w:numId w:val="1473"/>
+          <w:numId w:val="1474"/>
         </w:numPr>
       </w:pPr>
       <w:r>
@@ -11832,7 +11940,7 @@
         <w:pStyle w:val="Compact"/>
         <w:numPr>
           <w:ilvl w:val="0"/>
-          <w:numId w:val="1474"/>
+          <w:numId w:val="1475"/>
         </w:numPr>
       </w:pPr>
       <w:r>
@@ -11844,7 +11952,7 @@
         <w:pStyle w:val="Compact"/>
         <w:numPr>
           <w:ilvl w:val="0"/>
-          <w:numId w:val="1475"/>
+          <w:numId w:val="1476"/>
         </w:numPr>
       </w:pPr>
       <w:r>
@@ -11856,7 +11964,7 @@
         <w:pStyle w:val="Compact"/>
         <w:numPr>
           <w:ilvl w:val="0"/>
-          <w:numId w:val="1476"/>
+          <w:numId w:val="1477"/>
         </w:numPr>
       </w:pPr>
       <w:r>
@@ -11868,7 +11976,7 @@
         <w:pStyle w:val="Compact"/>
         <w:numPr>
           <w:ilvl w:val="0"/>
-          <w:numId w:val="1477"/>
+          <w:numId w:val="1478"/>
         </w:numPr>
       </w:pPr>
       <w:r>
@@ -11899,7 +12007,7 @@
         <w:pStyle w:val="Compact"/>
         <w:numPr>
           <w:ilvl w:val="0"/>
-          <w:numId w:val="1478"/>
+          <w:numId w:val="1479"/>
         </w:numPr>
       </w:pPr>
       <w:r>
@@ -11911,7 +12019,7 @@
         <w:pStyle w:val="Compact"/>
         <w:numPr>
           <w:ilvl w:val="0"/>
-          <w:numId w:val="1479"/>
+          <w:numId w:val="1480"/>
         </w:numPr>
       </w:pPr>
       <w:r>
@@ -11923,7 +12031,7 @@
         <w:pStyle w:val="Compact"/>
         <w:numPr>
           <w:ilvl w:val="1"/>
-          <w:numId w:val="1480"/>
+          <w:numId w:val="1481"/>
         </w:numPr>
       </w:pPr>
       <w:r>
@@ -11941,7 +12049,7 @@
         <w:pStyle w:val="Compact"/>
         <w:numPr>
           <w:ilvl w:val="1"/>
-          <w:numId w:val="1480"/>
+          <w:numId w:val="1481"/>
         </w:numPr>
       </w:pPr>
       <w:r>
@@ -11959,7 +12067,7 @@
         <w:pStyle w:val="Compact"/>
         <w:numPr>
           <w:ilvl w:val="1"/>
-          <w:numId w:val="1480"/>
+          <w:numId w:val="1481"/>
         </w:numPr>
       </w:pPr>
       <w:r>
@@ -11977,7 +12085,7 @@
         <w:pStyle w:val="Compact"/>
         <w:numPr>
           <w:ilvl w:val="1"/>
-          <w:numId w:val="1480"/>
+          <w:numId w:val="1481"/>
         </w:numPr>
       </w:pPr>
       <w:r>
@@ -11995,7 +12103,7 @@
         <w:pStyle w:val="Compact"/>
         <w:numPr>
           <w:ilvl w:val="0"/>
-          <w:numId w:val="1481"/>
+          <w:numId w:val="1482"/>
         </w:numPr>
       </w:pPr>
       <w:r>
@@ -12007,7 +12115,7 @@
         <w:pStyle w:val="Compact"/>
         <w:numPr>
           <w:ilvl w:val="0"/>
-          <w:numId w:val="1482"/>
+          <w:numId w:val="1483"/>
         </w:numPr>
       </w:pPr>
       <w:r>
@@ -12019,7 +12127,7 @@
         <w:pStyle w:val="Compact"/>
         <w:numPr>
           <w:ilvl w:val="0"/>
-          <w:numId w:val="1483"/>
+          <w:numId w:val="1484"/>
         </w:numPr>
       </w:pPr>
       <w:r>
@@ -12041,7 +12149,7 @@
         <w:pStyle w:val="Compact"/>
         <w:numPr>
           <w:ilvl w:val="0"/>
-          <w:numId w:val="1484"/>
+          <w:numId w:val="1485"/>
         </w:numPr>
       </w:pPr>
       <w:r>
@@ -12053,7 +12161,7 @@
         <w:pStyle w:val="Compact"/>
         <w:numPr>
           <w:ilvl w:val="0"/>
-          <w:numId w:val="1485"/>
+          <w:numId w:val="1486"/>
         </w:numPr>
       </w:pPr>
       <w:r>
@@ -12065,7 +12173,7 @@
         <w:pStyle w:val="Compact"/>
         <w:numPr>
           <w:ilvl w:val="0"/>
-          <w:numId w:val="1486"/>
+          <w:numId w:val="1487"/>
         </w:numPr>
       </w:pPr>
       <w:r>
@@ -12077,7 +12185,7 @@
         <w:pStyle w:val="Compact"/>
         <w:numPr>
           <w:ilvl w:val="0"/>
-          <w:numId w:val="1487"/>
+          <w:numId w:val="1488"/>
         </w:numPr>
       </w:pPr>
       <w:r>
@@ -12089,7 +12197,7 @@
         <w:pStyle w:val="Compact"/>
         <w:numPr>
           <w:ilvl w:val="0"/>
-          <w:numId w:val="1488"/>
+          <w:numId w:val="1489"/>
         </w:numPr>
       </w:pPr>
       <w:r>
@@ -12101,7 +12209,7 @@
         <w:pStyle w:val="Compact"/>
         <w:numPr>
           <w:ilvl w:val="0"/>
-          <w:numId w:val="1489"/>
+          <w:numId w:val="1490"/>
         </w:numPr>
       </w:pPr>
       <w:r>
@@ -12113,7 +12221,7 @@
         <w:pStyle w:val="Compact"/>
         <w:numPr>
           <w:ilvl w:val="0"/>
-          <w:numId w:val="1490"/>
+          <w:numId w:val="1491"/>
         </w:numPr>
       </w:pPr>
       <w:r>
@@ -12125,7 +12233,7 @@
         <w:pStyle w:val="Compact"/>
         <w:numPr>
           <w:ilvl w:val="0"/>
-          <w:numId w:val="1491"/>
+          <w:numId w:val="1492"/>
         </w:numPr>
       </w:pPr>
       <w:r>
@@ -12137,7 +12245,7 @@
         <w:pStyle w:val="Compact"/>
         <w:numPr>
           <w:ilvl w:val="0"/>
-          <w:numId w:val="1492"/>
+          <w:numId w:val="1493"/>
         </w:numPr>
       </w:pPr>
       <w:r>
@@ -12169,7 +12277,7 @@
         <w:pStyle w:val="Compact"/>
         <w:numPr>
           <w:ilvl w:val="0"/>
-          <w:numId w:val="1493"/>
+          <w:numId w:val="1494"/>
         </w:numPr>
       </w:pPr>
       <w:r>
@@ -12196,7 +12304,7 @@
         <w:pStyle w:val="Compact"/>
         <w:numPr>
           <w:ilvl w:val="0"/>
-          <w:numId w:val="1494"/>
+          <w:numId w:val="1495"/>
         </w:numPr>
       </w:pPr>
       <w:r>
@@ -12268,7 +12376,7 @@
         <w:pStyle w:val="Compact"/>
         <w:numPr>
           <w:ilvl w:val="0"/>
-          <w:numId w:val="1495"/>
+          <w:numId w:val="1496"/>
         </w:numPr>
       </w:pPr>
       <w:r>
@@ -12295,7 +12403,7 @@
         <w:pStyle w:val="Compact"/>
         <w:numPr>
           <w:ilvl w:val="0"/>
-          <w:numId w:val="1496"/>
+          <w:numId w:val="1497"/>
         </w:numPr>
       </w:pPr>
       <w:r>
@@ -12307,7 +12415,7 @@
         <w:pStyle w:val="Compact"/>
         <w:numPr>
           <w:ilvl w:val="0"/>
-          <w:numId w:val="1497"/>
+          <w:numId w:val="1498"/>
         </w:numPr>
       </w:pPr>
       <w:r>
@@ -12334,7 +12442,7 @@
         <w:pStyle w:val="Compact"/>
         <w:numPr>
           <w:ilvl w:val="0"/>
-          <w:numId w:val="1498"/>
+          <w:numId w:val="1499"/>
         </w:numPr>
       </w:pPr>
       <w:r>
@@ -12346,7 +12454,7 @@
         <w:pStyle w:val="Compact"/>
         <w:numPr>
           <w:ilvl w:val="0"/>
-          <w:numId w:val="1499"/>
+          <w:numId w:val="1500"/>
         </w:numPr>
       </w:pPr>
       <w:r>
@@ -12373,7 +12481,7 @@
         <w:pStyle w:val="Compact"/>
         <w:numPr>
           <w:ilvl w:val="0"/>
-          <w:numId w:val="1500"/>
+          <w:numId w:val="1501"/>
         </w:numPr>
       </w:pPr>
       <w:r>
@@ -12415,7 +12523,7 @@
         <w:pStyle w:val="Compact"/>
         <w:numPr>
           <w:ilvl w:val="0"/>
-          <w:numId w:val="1501"/>
+          <w:numId w:val="1502"/>
         </w:numPr>
       </w:pPr>
       <w:r>
@@ -12451,7 +12559,7 @@
         <w:pStyle w:val="Compact"/>
         <w:numPr>
           <w:ilvl w:val="0"/>
-          <w:numId w:val="1502"/>
+          <w:numId w:val="1503"/>
         </w:numPr>
       </w:pPr>
       <w:r>
@@ -12473,7 +12581,7 @@
         <w:pStyle w:val="Compact"/>
         <w:numPr>
           <w:ilvl w:val="0"/>
-          <w:numId w:val="1503"/>
+          <w:numId w:val="1504"/>
         </w:numPr>
       </w:pPr>
       <w:r>
@@ -12485,7 +12593,7 @@
         <w:pStyle w:val="Compact"/>
         <w:numPr>
           <w:ilvl w:val="0"/>
-          <w:numId w:val="1504"/>
+          <w:numId w:val="1505"/>
         </w:numPr>
       </w:pPr>
       <w:r>
@@ -12497,7 +12605,7 @@
         <w:pStyle w:val="Compact"/>
         <w:numPr>
           <w:ilvl w:val="1"/>
-          <w:numId w:val="1505"/>
+          <w:numId w:val="1506"/>
         </w:numPr>
       </w:pPr>
       <w:r>
@@ -12509,7 +12617,7 @@
         <w:pStyle w:val="Compact"/>
         <w:numPr>
           <w:ilvl w:val="1"/>
-          <w:numId w:val="1505"/>
+          <w:numId w:val="1506"/>
         </w:numPr>
       </w:pPr>
       <w:r>
@@ -12521,7 +12629,7 @@
         <w:pStyle w:val="Compact"/>
         <w:numPr>
           <w:ilvl w:val="1"/>
-          <w:numId w:val="1505"/>
+          <w:numId w:val="1506"/>
         </w:numPr>
       </w:pPr>
       <w:r>
@@ -12533,7 +12641,7 @@
         <w:pStyle w:val="Compact"/>
         <w:numPr>
           <w:ilvl w:val="1"/>
-          <w:numId w:val="1505"/>
+          <w:numId w:val="1506"/>
         </w:numPr>
       </w:pPr>
       <w:r>
@@ -12545,7 +12653,7 @@
         <w:pStyle w:val="Compact"/>
         <w:numPr>
           <w:ilvl w:val="1"/>
-          <w:numId w:val="1505"/>
+          <w:numId w:val="1506"/>
         </w:numPr>
       </w:pPr>
       <w:r>
@@ -12557,7 +12665,7 @@
         <w:pStyle w:val="Compact"/>
         <w:numPr>
           <w:ilvl w:val="1"/>
-          <w:numId w:val="1505"/>
+          <w:numId w:val="1506"/>
         </w:numPr>
       </w:pPr>
       <w:r>
@@ -12569,7 +12677,7 @@
         <w:pStyle w:val="Compact"/>
         <w:numPr>
           <w:ilvl w:val="1"/>
-          <w:numId w:val="1505"/>
+          <w:numId w:val="1506"/>
         </w:numPr>
       </w:pPr>
       <w:r>
@@ -12581,7 +12689,7 @@
         <w:pStyle w:val="Compact"/>
         <w:numPr>
           <w:ilvl w:val="1"/>
-          <w:numId w:val="1505"/>
+          <w:numId w:val="1506"/>
         </w:numPr>
       </w:pPr>
       <w:r>
@@ -12593,7 +12701,7 @@
         <w:pStyle w:val="Compact"/>
         <w:numPr>
           <w:ilvl w:val="0"/>
-          <w:numId w:val="1506"/>
+          <w:numId w:val="1507"/>
         </w:numPr>
       </w:pPr>
       <w:r>
@@ -12614,7 +12722,7 @@
         <w:pStyle w:val="Compact"/>
         <w:numPr>
           <w:ilvl w:val="0"/>
-          <w:numId w:val="1507"/>
+          <w:numId w:val="1508"/>
         </w:numPr>
       </w:pPr>
       <w:r>
@@ -12638,7 +12746,7 @@
         <w:pStyle w:val="Compact"/>
         <w:numPr>
           <w:ilvl w:val="0"/>
-          <w:numId w:val="1508"/>
+          <w:numId w:val="1509"/>
         </w:numPr>
       </w:pPr>
       <w:r>
@@ -12650,7 +12758,7 @@
         <w:pStyle w:val="Compact"/>
         <w:numPr>
           <w:ilvl w:val="1"/>
-          <w:numId w:val="1509"/>
+          <w:numId w:val="1510"/>
         </w:numPr>
       </w:pPr>
       <w:r>
@@ -12662,7 +12770,7 @@
         <w:pStyle w:val="Compact"/>
         <w:numPr>
           <w:ilvl w:val="1"/>
-          <w:numId w:val="1509"/>
+          <w:numId w:val="1510"/>
         </w:numPr>
       </w:pPr>
       <w:r>
@@ -12674,7 +12782,7 @@
         <w:pStyle w:val="Compact"/>
         <w:numPr>
           <w:ilvl w:val="1"/>
-          <w:numId w:val="1509"/>
+          <w:numId w:val="1510"/>
         </w:numPr>
       </w:pPr>
       <w:r>
@@ -12686,7 +12794,7 @@
         <w:pStyle w:val="Compact"/>
         <w:numPr>
           <w:ilvl w:val="0"/>
-          <w:numId w:val="1510"/>
+          <w:numId w:val="1511"/>
         </w:numPr>
       </w:pPr>
       <w:r>
@@ -12710,7 +12818,7 @@
         <w:pStyle w:val="Compact"/>
         <w:numPr>
           <w:ilvl w:val="0"/>
-          <w:numId w:val="1511"/>
+          <w:numId w:val="1512"/>
         </w:numPr>
       </w:pPr>
       <w:r>
@@ -12722,7 +12830,7 @@
         <w:pStyle w:val="Compact"/>
         <w:numPr>
           <w:ilvl w:val="0"/>
-          <w:numId w:val="1512"/>
+          <w:numId w:val="1513"/>
         </w:numPr>
       </w:pPr>
       <w:r>
@@ -12734,7 +12842,7 @@
         <w:pStyle w:val="Compact"/>
         <w:numPr>
           <w:ilvl w:val="0"/>
-          <w:numId w:val="1513"/>
+          <w:numId w:val="1514"/>
         </w:numPr>
       </w:pPr>
       <w:r>
@@ -12756,7 +12864,7 @@
         <w:pStyle w:val="Compact"/>
         <w:numPr>
           <w:ilvl w:val="0"/>
-          <w:numId w:val="1514"/>
+          <w:numId w:val="1515"/>
         </w:numPr>
       </w:pPr>
       <w:r>
@@ -12768,7 +12876,7 @@
         <w:pStyle w:val="Compact"/>
         <w:numPr>
           <w:ilvl w:val="1"/>
-          <w:numId w:val="1515"/>
+          <w:numId w:val="1516"/>
         </w:numPr>
       </w:pPr>
       <w:r>
@@ -12780,7 +12888,7 @@
         <w:pStyle w:val="Compact"/>
         <w:numPr>
           <w:ilvl w:val="1"/>
-          <w:numId w:val="1515"/>
+          <w:numId w:val="1516"/>
         </w:numPr>
       </w:pPr>
       <w:r>
@@ -12792,7 +12900,7 @@
         <w:pStyle w:val="Compact"/>
         <w:numPr>
           <w:ilvl w:val="1"/>
-          <w:numId w:val="1515"/>
+          <w:numId w:val="1516"/>
         </w:numPr>
       </w:pPr>
       <w:r>
@@ -12804,7 +12912,7 @@
         <w:pStyle w:val="Compact"/>
         <w:numPr>
           <w:ilvl w:val="0"/>
-          <w:numId w:val="1516"/>
+          <w:numId w:val="1517"/>
         </w:numPr>
       </w:pPr>
       <w:r>
@@ -12816,7 +12924,7 @@
         <w:pStyle w:val="Compact"/>
         <w:numPr>
           <w:ilvl w:val="1"/>
-          <w:numId w:val="1517"/>
+          <w:numId w:val="1518"/>
         </w:numPr>
       </w:pPr>
       <w:r>
@@ -12828,7 +12936,7 @@
         <w:pStyle w:val="Compact"/>
         <w:numPr>
           <w:ilvl w:val="1"/>
-          <w:numId w:val="1517"/>
+          <w:numId w:val="1518"/>
         </w:numPr>
       </w:pPr>
       <w:r>
@@ -12840,7 +12948,7 @@
         <w:pStyle w:val="Compact"/>
         <w:numPr>
           <w:ilvl w:val="1"/>
-          <w:numId w:val="1517"/>
+          <w:numId w:val="1518"/>
         </w:numPr>
       </w:pPr>
       <w:r>
@@ -12852,7 +12960,7 @@
         <w:pStyle w:val="Compact"/>
         <w:numPr>
           <w:ilvl w:val="0"/>
-          <w:numId w:val="1518"/>
+          <w:numId w:val="1519"/>
         </w:numPr>
       </w:pPr>
       <w:r>
@@ -12864,7 +12972,7 @@
         <w:pStyle w:val="Compact"/>
         <w:numPr>
           <w:ilvl w:val="0"/>
-          <w:numId w:val="1519"/>
+          <w:numId w:val="1520"/>
         </w:numPr>
       </w:pPr>
       <w:r>
@@ -12876,7 +12984,7 @@
         <w:pStyle w:val="Compact"/>
         <w:numPr>
           <w:ilvl w:val="0"/>
-          <w:numId w:val="1520"/>
+          <w:numId w:val="1521"/>
         </w:numPr>
       </w:pPr>
       <w:r>
@@ -12898,7 +13006,7 @@
         <w:pStyle w:val="Compact"/>
         <w:numPr>
           <w:ilvl w:val="0"/>
-          <w:numId w:val="1521"/>
+          <w:numId w:val="1522"/>
         </w:numPr>
       </w:pPr>
       <w:r>
@@ -12919,7 +13027,7 @@
         <w:pStyle w:val="Compact"/>
         <w:numPr>
           <w:ilvl w:val="0"/>
-          <w:numId w:val="1522"/>
+          <w:numId w:val="1523"/>
         </w:numPr>
       </w:pPr>
       <w:r>
@@ -12931,7 +13039,7 @@
         <w:pStyle w:val="Compact"/>
         <w:numPr>
           <w:ilvl w:val="0"/>
-          <w:numId w:val="1523"/>
+          <w:numId w:val="1524"/>
         </w:numPr>
       </w:pPr>
       <w:r>
@@ -12943,7 +13051,7 @@
         <w:pStyle w:val="Compact"/>
         <w:numPr>
           <w:ilvl w:val="0"/>
-          <w:numId w:val="1524"/>
+          <w:numId w:val="1525"/>
         </w:numPr>
       </w:pPr>
       <w:r>
@@ -12955,7 +13063,7 @@
         <w:pStyle w:val="Compact"/>
         <w:numPr>
           <w:ilvl w:val="0"/>
-          <w:numId w:val="1525"/>
+          <w:numId w:val="1526"/>
         </w:numPr>
       </w:pPr>
       <w:r>
@@ -12967,7 +13075,7 @@
         <w:pStyle w:val="Compact"/>
         <w:numPr>
           <w:ilvl w:val="0"/>
-          <w:numId w:val="1526"/>
+          <w:numId w:val="1527"/>
         </w:numPr>
       </w:pPr>
       <w:r>
@@ -12979,7 +13087,7 @@
         <w:pStyle w:val="Compact"/>
         <w:numPr>
           <w:ilvl w:val="1"/>
-          <w:numId w:val="1527"/>
+          <w:numId w:val="1528"/>
         </w:numPr>
       </w:pPr>
       <w:r>
@@ -12991,7 +13099,7 @@
         <w:pStyle w:val="Compact"/>
         <w:numPr>
           <w:ilvl w:val="1"/>
-          <w:numId w:val="1527"/>
+          <w:numId w:val="1528"/>
         </w:numPr>
       </w:pPr>
       <w:r>
@@ -13003,7 +13111,7 @@
         <w:pStyle w:val="Compact"/>
         <w:numPr>
           <w:ilvl w:val="1"/>
-          <w:numId w:val="1527"/>
+          <w:numId w:val="1528"/>
         </w:numPr>
       </w:pPr>
       <w:r>
@@ -13015,7 +13123,7 @@
         <w:pStyle w:val="Compact"/>
         <w:numPr>
           <w:ilvl w:val="1"/>
-          <w:numId w:val="1527"/>
+          <w:numId w:val="1528"/>
         </w:numPr>
       </w:pPr>
       <w:r>
@@ -13027,7 +13135,7 @@
         <w:pStyle w:val="Compact"/>
         <w:numPr>
           <w:ilvl w:val="1"/>
-          <w:numId w:val="1527"/>
+          <w:numId w:val="1528"/>
         </w:numPr>
       </w:pPr>
       <w:r>
@@ -13039,7 +13147,7 @@
         <w:pStyle w:val="Compact"/>
         <w:numPr>
           <w:ilvl w:val="1"/>
-          <w:numId w:val="1527"/>
+          <w:numId w:val="1528"/>
         </w:numPr>
       </w:pPr>
       <w:r>
@@ -13051,7 +13159,7 @@
         <w:pStyle w:val="Compact"/>
         <w:numPr>
           <w:ilvl w:val="0"/>
-          <w:numId w:val="1528"/>
+          <w:numId w:val="1529"/>
         </w:numPr>
       </w:pPr>
       <w:r>
@@ -13063,7 +13171,7 @@
         <w:pStyle w:val="Compact"/>
         <w:numPr>
           <w:ilvl w:val="0"/>
-          <w:numId w:val="1529"/>
+          <w:numId w:val="1530"/>
         </w:numPr>
       </w:pPr>
       <w:r>
@@ -13085,7 +13193,7 @@
         <w:pStyle w:val="Compact"/>
         <w:numPr>
           <w:ilvl w:val="0"/>
-          <w:numId w:val="1530"/>
+          <w:numId w:val="1531"/>
         </w:numPr>
       </w:pPr>
       <w:r>
@@ -13097,7 +13205,7 @@
         <w:pStyle w:val="Compact"/>
         <w:numPr>
           <w:ilvl w:val="0"/>
-          <w:numId w:val="1531"/>
+          <w:numId w:val="1532"/>
         </w:numPr>
       </w:pPr>
       <w:r>
@@ -13109,7 +13217,7 @@
         <w:pStyle w:val="Compact"/>
         <w:numPr>
           <w:ilvl w:val="0"/>
-          <w:numId w:val="1532"/>
+          <w:numId w:val="1533"/>
         </w:numPr>
       </w:pPr>
       <w:r>
@@ -13121,7 +13229,7 @@
         <w:pStyle w:val="Compact"/>
         <w:numPr>
           <w:ilvl w:val="0"/>
-          <w:numId w:val="1533"/>
+          <w:numId w:val="1534"/>
         </w:numPr>
       </w:pPr>
       <w:r>
@@ -13133,7 +13241,7 @@
         <w:pStyle w:val="Compact"/>
         <w:numPr>
           <w:ilvl w:val="0"/>
-          <w:numId w:val="1534"/>
+          <w:numId w:val="1535"/>
         </w:numPr>
       </w:pPr>
       <w:r>
@@ -13155,7 +13263,7 @@
         <w:pStyle w:val="Compact"/>
         <w:numPr>
           <w:ilvl w:val="0"/>
-          <w:numId w:val="1535"/>
+          <w:numId w:val="1536"/>
         </w:numPr>
       </w:pPr>
       <w:r>
@@ -13167,7 +13275,7 @@
         <w:pStyle w:val="Compact"/>
         <w:numPr>
           <w:ilvl w:val="0"/>
-          <w:numId w:val="1536"/>
+          <w:numId w:val="1537"/>
         </w:numPr>
       </w:pPr>
       <w:r>
@@ -13179,7 +13287,7 @@
         <w:pStyle w:val="Compact"/>
         <w:numPr>
           <w:ilvl w:val="0"/>
-          <w:numId w:val="1537"/>
+          <w:numId w:val="1538"/>
         </w:numPr>
       </w:pPr>
       <w:r>
@@ -13191,7 +13299,7 @@
         <w:pStyle w:val="Compact"/>
         <w:numPr>
           <w:ilvl w:val="0"/>
-          <w:numId w:val="1538"/>
+          <w:numId w:val="1539"/>
         </w:numPr>
       </w:pPr>
       <w:r>
@@ -13203,7 +13311,7 @@
         <w:pStyle w:val="Compact"/>
         <w:numPr>
           <w:ilvl w:val="0"/>
-          <w:numId w:val="1539"/>
+          <w:numId w:val="1540"/>
         </w:numPr>
       </w:pPr>
       <w:r>
@@ -13215,7 +13323,7 @@
         <w:pStyle w:val="Compact"/>
         <w:numPr>
           <w:ilvl w:val="0"/>
-          <w:numId w:val="1540"/>
+          <w:numId w:val="1541"/>
         </w:numPr>
       </w:pPr>
       <w:r>
@@ -13227,7 +13335,7 @@
         <w:pStyle w:val="Compact"/>
         <w:numPr>
           <w:ilvl w:val="0"/>
-          <w:numId w:val="1541"/>
+          <w:numId w:val="1542"/>
         </w:numPr>
       </w:pPr>
       <w:r>
@@ -13239,7 +13347,7 @@
         <w:pStyle w:val="Compact"/>
         <w:numPr>
           <w:ilvl w:val="0"/>
-          <w:numId w:val="1542"/>
+          <w:numId w:val="1543"/>
         </w:numPr>
       </w:pPr>
       <w:r>
@@ -13271,7 +13379,7 @@
         <w:pStyle w:val="Compact"/>
         <w:numPr>
           <w:ilvl w:val="0"/>
-          <w:numId w:val="1543"/>
+          <w:numId w:val="1544"/>
         </w:numPr>
       </w:pPr>
       <w:r>
@@ -13319,7 +13427,7 @@
         <w:pStyle w:val="Compact"/>
         <w:numPr>
           <w:ilvl w:val="0"/>
-          <w:numId w:val="1544"/>
+          <w:numId w:val="1545"/>
         </w:numPr>
       </w:pPr>
       <w:r>
@@ -13331,7 +13439,7 @@
         <w:pStyle w:val="Compact"/>
         <w:numPr>
           <w:ilvl w:val="0"/>
-          <w:numId w:val="1545"/>
+          <w:numId w:val="1546"/>
         </w:numPr>
       </w:pPr>
       <w:r>
@@ -13343,7 +13451,7 @@
         <w:pStyle w:val="Compact"/>
         <w:numPr>
           <w:ilvl w:val="0"/>
-          <w:numId w:val="1546"/>
+          <w:numId w:val="1547"/>
         </w:numPr>
       </w:pPr>
       <w:r>
@@ -13355,7 +13463,7 @@
         <w:pStyle w:val="Compact"/>
         <w:numPr>
           <w:ilvl w:val="0"/>
-          <w:numId w:val="1547"/>
+          <w:numId w:val="1548"/>
         </w:numPr>
       </w:pPr>
       <w:r>
@@ -13367,7 +13475,7 @@
         <w:pStyle w:val="Compact"/>
         <w:numPr>
           <w:ilvl w:val="0"/>
-          <w:numId w:val="1548"/>
+          <w:numId w:val="1549"/>
         </w:numPr>
       </w:pPr>
       <w:r>
@@ -13421,7 +13529,7 @@
         <w:pStyle w:val="Compact"/>
         <w:numPr>
           <w:ilvl w:val="0"/>
-          <w:numId w:val="1549"/>
+          <w:numId w:val="1550"/>
         </w:numPr>
       </w:pPr>
       <w:r>
@@ -13433,7 +13541,7 @@
         <w:pStyle w:val="Compact"/>
         <w:numPr>
           <w:ilvl w:val="0"/>
-          <w:numId w:val="1550"/>
+          <w:numId w:val="1551"/>
         </w:numPr>
       </w:pPr>
       <w:r>
@@ -13460,7 +13568,7 @@
         <w:pStyle w:val="Compact"/>
         <w:numPr>
           <w:ilvl w:val="0"/>
-          <w:numId w:val="1551"/>
+          <w:numId w:val="1552"/>
         </w:numPr>
       </w:pPr>
       <w:r>
@@ -13502,7 +13610,7 @@
         <w:pStyle w:val="Compact"/>
         <w:numPr>
           <w:ilvl w:val="0"/>
-          <w:numId w:val="1552"/>
+          <w:numId w:val="1553"/>
         </w:numPr>
       </w:pPr>
       <w:r>
@@ -13529,7 +13637,7 @@
         <w:pStyle w:val="Compact"/>
         <w:numPr>
           <w:ilvl w:val="0"/>
-          <w:numId w:val="1553"/>
+          <w:numId w:val="1554"/>
         </w:numPr>
       </w:pPr>
       <w:r>
@@ -13541,7 +13649,7 @@
         <w:pStyle w:val="Compact"/>
         <w:numPr>
           <w:ilvl w:val="0"/>
-          <w:numId w:val="1554"/>
+          <w:numId w:val="1555"/>
         </w:numPr>
       </w:pPr>
       <w:r>
@@ -13553,7 +13661,7 @@
         <w:pStyle w:val="Compact"/>
         <w:numPr>
           <w:ilvl w:val="0"/>
-          <w:numId w:val="1555"/>
+          <w:numId w:val="1556"/>
         </w:numPr>
       </w:pPr>
       <w:r>
@@ -13590,7 +13698,7 @@
         <w:pStyle w:val="Compact"/>
         <w:numPr>
           <w:ilvl w:val="0"/>
-          <w:numId w:val="1556"/>
+          <w:numId w:val="1557"/>
         </w:numPr>
       </w:pPr>
       <w:r>
@@ -13602,7 +13710,7 @@
         <w:pStyle w:val="Compact"/>
         <w:numPr>
           <w:ilvl w:val="0"/>
-          <w:numId w:val="1557"/>
+          <w:numId w:val="1558"/>
         </w:numPr>
       </w:pPr>
       <w:r>
@@ -13614,7 +13722,7 @@
         <w:pStyle w:val="Compact"/>
         <w:numPr>
           <w:ilvl w:val="0"/>
-          <w:numId w:val="1558"/>
+          <w:numId w:val="1559"/>
         </w:numPr>
       </w:pPr>
       <w:r>
@@ -13626,7 +13734,7 @@
         <w:pStyle w:val="Compact"/>
         <w:numPr>
           <w:ilvl w:val="0"/>
-          <w:numId w:val="1559"/>
+          <w:numId w:val="1560"/>
         </w:numPr>
       </w:pPr>
       <w:r>
@@ -13638,7 +13746,7 @@
         <w:pStyle w:val="Compact"/>
         <w:numPr>
           <w:ilvl w:val="0"/>
-          <w:numId w:val="1560"/>
+          <w:numId w:val="1561"/>
         </w:numPr>
       </w:pPr>
       <w:r>
@@ -13650,7 +13758,7 @@
         <w:pStyle w:val="Compact"/>
         <w:numPr>
           <w:ilvl w:val="0"/>
-          <w:numId w:val="1561"/>
+          <w:numId w:val="1562"/>
         </w:numPr>
       </w:pPr>
       <w:r>
@@ -13662,7 +13770,7 @@
         <w:pStyle w:val="Compact"/>
         <w:numPr>
           <w:ilvl w:val="1"/>
-          <w:numId w:val="1562"/>
+          <w:numId w:val="1563"/>
         </w:numPr>
       </w:pPr>
       <w:r>
@@ -13689,7 +13797,7 @@
         <w:pStyle w:val="Compact"/>
         <w:numPr>
           <w:ilvl w:val="1"/>
-          <w:numId w:val="1562"/>
+          <w:numId w:val="1563"/>
         </w:numPr>
       </w:pPr>
       <w:r>
@@ -13726,7 +13834,7 @@
         <w:pStyle w:val="Compact"/>
         <w:numPr>
           <w:ilvl w:val="0"/>
-          <w:numId w:val="1563"/>
+          <w:numId w:val="1564"/>
         </w:numPr>
       </w:pPr>
       <w:r>
@@ -13768,7 +13876,7 @@
         <w:pStyle w:val="Compact"/>
         <w:numPr>
           <w:ilvl w:val="0"/>
-          <w:numId w:val="1564"/>
+          <w:numId w:val="1565"/>
         </w:numPr>
       </w:pPr>
       <w:r>
@@ -13792,7 +13900,7 @@
         <w:pStyle w:val="Compact"/>
         <w:numPr>
           <w:ilvl w:val="0"/>
-          <w:numId w:val="1565"/>
+          <w:numId w:val="1566"/>
         </w:numPr>
       </w:pPr>
       <w:r>
@@ -13816,7 +13924,7 @@
         <w:pStyle w:val="Compact"/>
         <w:numPr>
           <w:ilvl w:val="0"/>
-          <w:numId w:val="1566"/>
+          <w:numId w:val="1567"/>
         </w:numPr>
       </w:pPr>
       <w:r>
@@ -13828,7 +13936,7 @@
         <w:pStyle w:val="Compact"/>
         <w:numPr>
           <w:ilvl w:val="0"/>
-          <w:numId w:val="1567"/>
+          <w:numId w:val="1568"/>
         </w:numPr>
       </w:pPr>
       <w:r>
@@ -13840,7 +13948,7 @@
         <w:pStyle w:val="Compact"/>
         <w:numPr>
           <w:ilvl w:val="0"/>
-          <w:numId w:val="1568"/>
+          <w:numId w:val="1569"/>
         </w:numPr>
       </w:pPr>
       <w:r>
@@ -13852,7 +13960,7 @@
         <w:pStyle w:val="Compact"/>
         <w:numPr>
           <w:ilvl w:val="0"/>
-          <w:numId w:val="1569"/>
+          <w:numId w:val="1570"/>
         </w:numPr>
       </w:pPr>
       <w:r>
@@ -13864,7 +13972,7 @@
         <w:pStyle w:val="Compact"/>
         <w:numPr>
           <w:ilvl w:val="0"/>
-          <w:numId w:val="1570"/>
+          <w:numId w:val="1571"/>
         </w:numPr>
       </w:pPr>
       <w:r>
@@ -13876,7 +13984,7 @@
         <w:pStyle w:val="Compact"/>
         <w:numPr>
           <w:ilvl w:val="0"/>
-          <w:numId w:val="1571"/>
+          <w:numId w:val="1572"/>
         </w:numPr>
       </w:pPr>
       <w:r>
@@ -13888,7 +13996,7 @@
         <w:pStyle w:val="Compact"/>
         <w:numPr>
           <w:ilvl w:val="0"/>
-          <w:numId w:val="1572"/>
+          <w:numId w:val="1573"/>
         </w:numPr>
       </w:pPr>
       <w:r>
@@ -13900,7 +14008,7 @@
         <w:pStyle w:val="Compact"/>
         <w:numPr>
           <w:ilvl w:val="0"/>
-          <w:numId w:val="1573"/>
+          <w:numId w:val="1574"/>
         </w:numPr>
       </w:pPr>
       <w:r>
@@ -13912,7 +14020,7 @@
         <w:pStyle w:val="Compact"/>
         <w:numPr>
           <w:ilvl w:val="0"/>
-          <w:numId w:val="1574"/>
+          <w:numId w:val="1575"/>
         </w:numPr>
       </w:pPr>
       <w:r>
@@ -13924,7 +14032,7 @@
         <w:pStyle w:val="Compact"/>
         <w:numPr>
           <w:ilvl w:val="0"/>
-          <w:numId w:val="1575"/>
+          <w:numId w:val="1576"/>
         </w:numPr>
       </w:pPr>
       <w:r>
@@ -13936,7 +14044,7 @@
         <w:pStyle w:val="Compact"/>
         <w:numPr>
           <w:ilvl w:val="0"/>
-          <w:numId w:val="1576"/>
+          <w:numId w:val="1577"/>
         </w:numPr>
       </w:pPr>
       <w:r>
@@ -13963,7 +14071,7 @@
         <w:pStyle w:val="Compact"/>
         <w:numPr>
           <w:ilvl w:val="0"/>
-          <w:numId w:val="1577"/>
+          <w:numId w:val="1578"/>
         </w:numPr>
       </w:pPr>
       <w:r>
@@ -13975,7 +14083,7 @@
         <w:pStyle w:val="Compact"/>
         <w:numPr>
           <w:ilvl w:val="0"/>
-          <w:numId w:val="1578"/>
+          <w:numId w:val="1579"/>
         </w:numPr>
       </w:pPr>
       <w:r>
@@ -13997,7 +14105,7 @@
         <w:pStyle w:val="Compact"/>
         <w:numPr>
           <w:ilvl w:val="0"/>
-          <w:numId w:val="1579"/>
+          <w:numId w:val="1580"/>
         </w:numPr>
       </w:pPr>
       <w:r>
@@ -14009,7 +14117,7 @@
         <w:pStyle w:val="Compact"/>
         <w:numPr>
           <w:ilvl w:val="0"/>
-          <w:numId w:val="1580"/>
+          <w:numId w:val="1581"/>
         </w:numPr>
       </w:pPr>
       <w:r>
@@ -14036,7 +14144,7 @@
         <w:pStyle w:val="Compact"/>
         <w:numPr>
           <w:ilvl w:val="0"/>
-          <w:numId w:val="1581"/>
+          <w:numId w:val="1582"/>
         </w:numPr>
       </w:pPr>
       <w:r>
@@ -14063,7 +14171,7 @@
         <w:pStyle w:val="Compact"/>
         <w:numPr>
           <w:ilvl w:val="0"/>
-          <w:numId w:val="1582"/>
+          <w:numId w:val="1583"/>
         </w:numPr>
       </w:pPr>
       <w:r>
@@ -14090,7 +14198,7 @@
         <w:pStyle w:val="Compact"/>
         <w:numPr>
           <w:ilvl w:val="0"/>
-          <w:numId w:val="1583"/>
+          <w:numId w:val="1584"/>
         </w:numPr>
       </w:pPr>
       <w:r>
@@ -14102,7 +14210,7 @@
         <w:pStyle w:val="Compact"/>
         <w:numPr>
           <w:ilvl w:val="1"/>
-          <w:numId w:val="1584"/>
+          <w:numId w:val="1585"/>
         </w:numPr>
       </w:pPr>
       <w:r>
@@ -14114,7 +14222,7 @@
         <w:pStyle w:val="Compact"/>
         <w:numPr>
           <w:ilvl w:val="1"/>
-          <w:numId w:val="1584"/>
+          <w:numId w:val="1585"/>
         </w:numPr>
       </w:pPr>
       <w:r>
@@ -14126,7 +14234,7 @@
         <w:pStyle w:val="Compact"/>
         <w:numPr>
           <w:ilvl w:val="1"/>
-          <w:numId w:val="1584"/>
+          <w:numId w:val="1585"/>
         </w:numPr>
       </w:pPr>
       <w:r>
@@ -14138,7 +14246,7 @@
         <w:pStyle w:val="Compact"/>
         <w:numPr>
           <w:ilvl w:val="0"/>
-          <w:numId w:val="1585"/>
+          <w:numId w:val="1586"/>
         </w:numPr>
       </w:pPr>
       <w:r>
@@ -14150,7 +14258,7 @@
         <w:pStyle w:val="Compact"/>
         <w:numPr>
           <w:ilvl w:val="0"/>
-          <w:numId w:val="1586"/>
+          <w:numId w:val="1587"/>
         </w:numPr>
       </w:pPr>
       <w:r>
@@ -14162,7 +14270,7 @@
         <w:pStyle w:val="Compact"/>
         <w:numPr>
           <w:ilvl w:val="1"/>
-          <w:numId w:val="1587"/>
+          <w:numId w:val="1588"/>
         </w:numPr>
       </w:pPr>
       <w:r>
@@ -14174,7 +14282,7 @@
         <w:pStyle w:val="Compact"/>
         <w:numPr>
           <w:ilvl w:val="1"/>
-          <w:numId w:val="1587"/>
+          <w:numId w:val="1588"/>
         </w:numPr>
       </w:pPr>
       <w:r>
@@ -14186,7 +14294,7 @@
         <w:pStyle w:val="Compact"/>
         <w:numPr>
           <w:ilvl w:val="1"/>
-          <w:numId w:val="1587"/>
+          <w:numId w:val="1588"/>
         </w:numPr>
       </w:pPr>
       <w:r>
@@ -14198,7 +14306,7 @@
         <w:pStyle w:val="Compact"/>
         <w:numPr>
           <w:ilvl w:val="1"/>
-          <w:numId w:val="1587"/>
+          <w:numId w:val="1588"/>
         </w:numPr>
       </w:pPr>
       <w:r>
@@ -14210,7 +14318,7 @@
         <w:pStyle w:val="Compact"/>
         <w:numPr>
           <w:ilvl w:val="1"/>
-          <w:numId w:val="1587"/>
+          <w:numId w:val="1588"/>
         </w:numPr>
       </w:pPr>
       <w:r>
@@ -14222,7 +14330,7 @@
         <w:pStyle w:val="Compact"/>
         <w:numPr>
           <w:ilvl w:val="1"/>
-          <w:numId w:val="1587"/>
+          <w:numId w:val="1588"/>
         </w:numPr>
       </w:pPr>
       <w:r>
@@ -14234,7 +14342,7 @@
         <w:pStyle w:val="Compact"/>
         <w:numPr>
           <w:ilvl w:val="0"/>
-          <w:numId w:val="1588"/>
+          <w:numId w:val="1589"/>
         </w:numPr>
       </w:pPr>
       <w:r>
@@ -14246,7 +14354,7 @@
         <w:pStyle w:val="Compact"/>
         <w:numPr>
           <w:ilvl w:val="0"/>
-          <w:numId w:val="1589"/>
+          <w:numId w:val="1590"/>
         </w:numPr>
       </w:pPr>
       <w:r>
@@ -14258,7 +14366,7 @@
         <w:pStyle w:val="Compact"/>
         <w:numPr>
           <w:ilvl w:val="0"/>
-          <w:numId w:val="1590"/>
+          <w:numId w:val="1591"/>
         </w:numPr>
       </w:pPr>
       <w:r>
@@ -14280,7 +14388,7 @@
         <w:pStyle w:val="Compact"/>
         <w:numPr>
           <w:ilvl w:val="0"/>
-          <w:numId w:val="1591"/>
+          <w:numId w:val="1592"/>
         </w:numPr>
       </w:pPr>
       <w:r>
@@ -14292,7 +14400,7 @@
         <w:pStyle w:val="Compact"/>
         <w:numPr>
           <w:ilvl w:val="0"/>
-          <w:numId w:val="1592"/>
+          <w:numId w:val="1593"/>
         </w:numPr>
       </w:pPr>
       <w:r>
@@ -14304,7 +14412,7 @@
         <w:pStyle w:val="Compact"/>
         <w:numPr>
           <w:ilvl w:val="0"/>
-          <w:numId w:val="1593"/>
+          <w:numId w:val="1594"/>
         </w:numPr>
       </w:pPr>
       <w:r>
@@ -14316,7 +14424,7 @@
         <w:pStyle w:val="Compact"/>
         <w:numPr>
           <w:ilvl w:val="0"/>
-          <w:numId w:val="1594"/>
+          <w:numId w:val="1595"/>
         </w:numPr>
       </w:pPr>
       <w:r>
@@ -14328,7 +14436,7 @@
         <w:pStyle w:val="Compact"/>
         <w:numPr>
           <w:ilvl w:val="0"/>
-          <w:numId w:val="1595"/>
+          <w:numId w:val="1596"/>
         </w:numPr>
       </w:pPr>
       <w:r>
@@ -14340,7 +14448,7 @@
         <w:pStyle w:val="Compact"/>
         <w:numPr>
           <w:ilvl w:val="0"/>
-          <w:numId w:val="1596"/>
+          <w:numId w:val="1597"/>
         </w:numPr>
       </w:pPr>
       <w:r>
@@ -14362,7 +14470,7 @@
         <w:pStyle w:val="Compact"/>
         <w:numPr>
           <w:ilvl w:val="0"/>
-          <w:numId w:val="1597"/>
+          <w:numId w:val="1598"/>
         </w:numPr>
       </w:pPr>
       <w:r>
@@ -14374,7 +14482,7 @@
         <w:pStyle w:val="Compact"/>
         <w:numPr>
           <w:ilvl w:val="1"/>
-          <w:numId w:val="1598"/>
+          <w:numId w:val="1599"/>
         </w:numPr>
       </w:pPr>
       <w:r>
@@ -14386,7 +14494,7 @@
         <w:pStyle w:val="Compact"/>
         <w:numPr>
           <w:ilvl w:val="1"/>
-          <w:numId w:val="1598"/>
+          <w:numId w:val="1599"/>
         </w:numPr>
       </w:pPr>
       <w:r>
@@ -14398,7 +14506,7 @@
         <w:pStyle w:val="Compact"/>
         <w:numPr>
           <w:ilvl w:val="0"/>
-          <w:numId w:val="1599"/>
+          <w:numId w:val="1600"/>
         </w:numPr>
       </w:pPr>
       <w:r>
@@ -14410,7 +14518,7 @@
         <w:pStyle w:val="Compact"/>
         <w:numPr>
           <w:ilvl w:val="1"/>
-          <w:numId w:val="1600"/>
+          <w:numId w:val="1601"/>
         </w:numPr>
       </w:pPr>
       <w:r>
@@ -14422,7 +14530,7 @@
         <w:pStyle w:val="Compact"/>
         <w:numPr>
           <w:ilvl w:val="1"/>
-          <w:numId w:val="1600"/>
+          <w:numId w:val="1601"/>
         </w:numPr>
       </w:pPr>
       <w:r>
@@ -14434,7 +14542,7 @@
         <w:pStyle w:val="Compact"/>
         <w:numPr>
           <w:ilvl w:val="0"/>
-          <w:numId w:val="1601"/>
+          <w:numId w:val="1602"/>
         </w:numPr>
       </w:pPr>
       <w:r>
@@ -14446,7 +14554,7 @@
         <w:pStyle w:val="Compact"/>
         <w:numPr>
           <w:ilvl w:val="0"/>
-          <w:numId w:val="1602"/>
+          <w:numId w:val="1603"/>
         </w:numPr>
       </w:pPr>
       <w:r>
@@ -14458,7 +14566,7 @@
         <w:pStyle w:val="Compact"/>
         <w:numPr>
           <w:ilvl w:val="0"/>
-          <w:numId w:val="1603"/>
+          <w:numId w:val="1604"/>
         </w:numPr>
       </w:pPr>
       <w:r>
@@ -14470,7 +14578,7 @@
         <w:pStyle w:val="Compact"/>
         <w:numPr>
           <w:ilvl w:val="0"/>
-          <w:numId w:val="1604"/>
+          <w:numId w:val="1605"/>
         </w:numPr>
       </w:pPr>
       <w:r>
@@ -14492,7 +14600,7 @@
         <w:pStyle w:val="Compact"/>
         <w:numPr>
           <w:ilvl w:val="0"/>
-          <w:numId w:val="1605"/>
+          <w:numId w:val="1606"/>
         </w:numPr>
       </w:pPr>
       <w:r>
@@ -14504,7 +14612,7 @@
         <w:pStyle w:val="Compact"/>
         <w:numPr>
           <w:ilvl w:val="0"/>
-          <w:numId w:val="1606"/>
+          <w:numId w:val="1607"/>
         </w:numPr>
       </w:pPr>
       <w:r>
@@ -14516,7 +14624,7 @@
         <w:pStyle w:val="Compact"/>
         <w:numPr>
           <w:ilvl w:val="0"/>
-          <w:numId w:val="1607"/>
+          <w:numId w:val="1608"/>
         </w:numPr>
       </w:pPr>
       <w:r>
@@ -14528,7 +14636,7 @@
         <w:pStyle w:val="Compact"/>
         <w:numPr>
           <w:ilvl w:val="0"/>
-          <w:numId w:val="1608"/>
+          <w:numId w:val="1609"/>
         </w:numPr>
       </w:pPr>
       <w:r>
@@ -14540,7 +14648,7 @@
         <w:pStyle w:val="Compact"/>
         <w:numPr>
           <w:ilvl w:val="0"/>
-          <w:numId w:val="1609"/>
+          <w:numId w:val="1610"/>
         </w:numPr>
       </w:pPr>
       <w:r>
@@ -14552,7 +14660,7 @@
         <w:pStyle w:val="Compact"/>
         <w:numPr>
           <w:ilvl w:val="0"/>
-          <w:numId w:val="1610"/>
+          <w:numId w:val="1611"/>
         </w:numPr>
       </w:pPr>
       <w:r>
@@ -14564,7 +14672,7 @@
         <w:pStyle w:val="Compact"/>
         <w:numPr>
           <w:ilvl w:val="0"/>
-          <w:numId w:val="1611"/>
+          <w:numId w:val="1612"/>
         </w:numPr>
       </w:pPr>
       <w:r>
@@ -14576,7 +14684,7 @@
         <w:pStyle w:val="Compact"/>
         <w:numPr>
           <w:ilvl w:val="0"/>
-          <w:numId w:val="1612"/>
+          <w:numId w:val="1613"/>
         </w:numPr>
       </w:pPr>
       <w:r>
@@ -14588,7 +14696,7 @@
         <w:pStyle w:val="Compact"/>
         <w:numPr>
           <w:ilvl w:val="0"/>
-          <w:numId w:val="1613"/>
+          <w:numId w:val="1614"/>
         </w:numPr>
       </w:pPr>
       <w:r>
@@ -14610,7 +14718,7 @@
         <w:pStyle w:val="Compact"/>
         <w:numPr>
           <w:ilvl w:val="0"/>
-          <w:numId w:val="1614"/>
+          <w:numId w:val="1615"/>
         </w:numPr>
       </w:pPr>
       <w:r>
@@ -14622,7 +14730,7 @@
         <w:pStyle w:val="Compact"/>
         <w:numPr>
           <w:ilvl w:val="0"/>
-          <w:numId w:val="1615"/>
+          <w:numId w:val="1616"/>
         </w:numPr>
       </w:pPr>
       <w:r>
@@ -14634,7 +14742,7 @@
         <w:pStyle w:val="Compact"/>
         <w:numPr>
           <w:ilvl w:val="0"/>
-          <w:numId w:val="1616"/>
+          <w:numId w:val="1617"/>
         </w:numPr>
       </w:pPr>
       <w:r>
@@ -14646,7 +14754,7 @@
         <w:pStyle w:val="Compact"/>
         <w:numPr>
           <w:ilvl w:val="0"/>
-          <w:numId w:val="1617"/>
+          <w:numId w:val="1618"/>
         </w:numPr>
       </w:pPr>
       <w:r>
@@ -14658,7 +14766,7 @@
         <w:pStyle w:val="Compact"/>
         <w:numPr>
           <w:ilvl w:val="0"/>
-          <w:numId w:val="1618"/>
+          <w:numId w:val="1619"/>
         </w:numPr>
       </w:pPr>
       <w:r>
@@ -14670,7 +14778,7 @@
         <w:pStyle w:val="Compact"/>
         <w:numPr>
           <w:ilvl w:val="0"/>
-          <w:numId w:val="1619"/>
+          <w:numId w:val="1620"/>
         </w:numPr>
       </w:pPr>
       <w:r>
@@ -14682,7 +14790,7 @@
         <w:pStyle w:val="Compact"/>
         <w:numPr>
           <w:ilvl w:val="0"/>
-          <w:numId w:val="1620"/>
+          <w:numId w:val="1621"/>
         </w:numPr>
       </w:pPr>
       <w:r>
@@ -14694,7 +14802,7 @@
         <w:pStyle w:val="Compact"/>
         <w:numPr>
           <w:ilvl w:val="0"/>
-          <w:numId w:val="1621"/>
+          <w:numId w:val="1622"/>
         </w:numPr>
       </w:pPr>
       <w:r>
@@ -14706,7 +14814,7 @@
         <w:pStyle w:val="Compact"/>
         <w:numPr>
           <w:ilvl w:val="0"/>
-          <w:numId w:val="1622"/>
+          <w:numId w:val="1623"/>
         </w:numPr>
       </w:pPr>
       <w:r>
@@ -14718,7 +14826,7 @@
         <w:pStyle w:val="Compact"/>
         <w:numPr>
           <w:ilvl w:val="0"/>
-          <w:numId w:val="1623"/>
+          <w:numId w:val="1624"/>
         </w:numPr>
       </w:pPr>
       <w:r>
@@ -14745,7 +14853,7 @@
         <w:pStyle w:val="Compact"/>
         <w:numPr>
           <w:ilvl w:val="0"/>
-          <w:numId w:val="1624"/>
+          <w:numId w:val="1625"/>
         </w:numPr>
       </w:pPr>
       <w:r>
@@ -14766,7 +14874,7 @@
         <w:pStyle w:val="Compact"/>
         <w:numPr>
           <w:ilvl w:val="0"/>
-          <w:numId w:val="1625"/>
+          <w:numId w:val="1626"/>
         </w:numPr>
       </w:pPr>
       <w:r>
@@ -14788,7 +14896,7 @@
         <w:pStyle w:val="Compact"/>
         <w:numPr>
           <w:ilvl w:val="0"/>
-          <w:numId w:val="1626"/>
+          <w:numId w:val="1627"/>
         </w:numPr>
       </w:pPr>
       <w:r>
@@ -14800,7 +14908,7 @@
         <w:pStyle w:val="Compact"/>
         <w:numPr>
           <w:ilvl w:val="0"/>
-          <w:numId w:val="1627"/>
+          <w:numId w:val="1628"/>
         </w:numPr>
       </w:pPr>
       <w:r>
@@ -14812,7 +14920,7 @@
         <w:pStyle w:val="Compact"/>
         <w:numPr>
           <w:ilvl w:val="0"/>
-          <w:numId w:val="1628"/>
+          <w:numId w:val="1629"/>
         </w:numPr>
       </w:pPr>
       <w:r>
@@ -14824,7 +14932,7 @@
         <w:pStyle w:val="Compact"/>
         <w:numPr>
           <w:ilvl w:val="0"/>
-          <w:numId w:val="1629"/>
+          <w:numId w:val="1630"/>
         </w:numPr>
       </w:pPr>
       <w:r>
@@ -14836,7 +14944,7 @@
         <w:pStyle w:val="Compact"/>
         <w:numPr>
           <w:ilvl w:val="0"/>
-          <w:numId w:val="1630"/>
+          <w:numId w:val="1631"/>
         </w:numPr>
       </w:pPr>
       <w:r>
@@ -14848,7 +14956,7 @@
         <w:pStyle w:val="Compact"/>
         <w:numPr>
           <w:ilvl w:val="0"/>
-          <w:numId w:val="1631"/>
+          <w:numId w:val="1632"/>
         </w:numPr>
       </w:pPr>
       <w:r>
@@ -14860,7 +14968,7 @@
         <w:pStyle w:val="Compact"/>
         <w:numPr>
           <w:ilvl w:val="0"/>
-          <w:numId w:val="1632"/>
+          <w:numId w:val="1633"/>
         </w:numPr>
       </w:pPr>
       <w:r>
@@ -14872,7 +14980,7 @@
         <w:pStyle w:val="Compact"/>
         <w:numPr>
           <w:ilvl w:val="0"/>
-          <w:numId w:val="1633"/>
+          <w:numId w:val="1634"/>
         </w:numPr>
       </w:pPr>
       <w:r>
@@ -14894,7 +15002,7 @@
         <w:pStyle w:val="Compact"/>
         <w:numPr>
           <w:ilvl w:val="0"/>
-          <w:numId w:val="1634"/>
+          <w:numId w:val="1635"/>
         </w:numPr>
       </w:pPr>
       <w:r>
@@ -14906,7 +15014,7 @@
         <w:pStyle w:val="Compact"/>
         <w:numPr>
           <w:ilvl w:val="0"/>
-          <w:numId w:val="1635"/>
+          <w:numId w:val="1636"/>
         </w:numPr>
       </w:pPr>
       <w:r>
@@ -14918,7 +15026,7 @@
         <w:pStyle w:val="Compact"/>
         <w:numPr>
           <w:ilvl w:val="0"/>
-          <w:numId w:val="1636"/>
+          <w:numId w:val="1637"/>
         </w:numPr>
       </w:pPr>
       <w:r>
@@ -14930,7 +15038,7 @@
         <w:pStyle w:val="Compact"/>
         <w:numPr>
           <w:ilvl w:val="0"/>
-          <w:numId w:val="1637"/>
+          <w:numId w:val="1638"/>
         </w:numPr>
       </w:pPr>
       <w:r>
@@ -14942,7 +15050,7 @@
         <w:pStyle w:val="Compact"/>
         <w:numPr>
           <w:ilvl w:val="0"/>
-          <w:numId w:val="1638"/>
+          <w:numId w:val="1639"/>
         </w:numPr>
       </w:pPr>
       <w:r>
@@ -14954,7 +15062,7 @@
         <w:pStyle w:val="Compact"/>
         <w:numPr>
           <w:ilvl w:val="0"/>
-          <w:numId w:val="1639"/>
+          <w:numId w:val="1640"/>
         </w:numPr>
       </w:pPr>
       <w:r>
@@ -14966,7 +15074,7 @@
         <w:pStyle w:val="Compact"/>
         <w:numPr>
           <w:ilvl w:val="0"/>
-          <w:numId w:val="1640"/>
+          <w:numId w:val="1641"/>
         </w:numPr>
       </w:pPr>
       <w:r>
@@ -14978,7 +15086,7 @@
         <w:pStyle w:val="Compact"/>
         <w:numPr>
           <w:ilvl w:val="0"/>
-          <w:numId w:val="1641"/>
+          <w:numId w:val="1642"/>
         </w:numPr>
       </w:pPr>
       <w:r>
@@ -14990,7 +15098,7 @@
         <w:pStyle w:val="Compact"/>
         <w:numPr>
           <w:ilvl w:val="0"/>
-          <w:numId w:val="1642"/>
+          <w:numId w:val="1643"/>
         </w:numPr>
       </w:pPr>
       <w:r>
@@ -15002,7 +15110,7 @@
         <w:pStyle w:val="Compact"/>
         <w:numPr>
           <w:ilvl w:val="0"/>
-          <w:numId w:val="1643"/>
+          <w:numId w:val="1644"/>
         </w:numPr>
       </w:pPr>
       <w:r>
@@ -15014,7 +15122,7 @@
         <w:pStyle w:val="Compact"/>
         <w:numPr>
           <w:ilvl w:val="0"/>
-          <w:numId w:val="1644"/>
+          <w:numId w:val="1645"/>
         </w:numPr>
       </w:pPr>
       <w:r>
@@ -15026,7 +15134,7 @@
         <w:pStyle w:val="Compact"/>
         <w:numPr>
           <w:ilvl w:val="0"/>
-          <w:numId w:val="1645"/>
+          <w:numId w:val="1646"/>
         </w:numPr>
       </w:pPr>
       <w:r>
@@ -15038,7 +15146,7 @@
         <w:pStyle w:val="Compact"/>
         <w:numPr>
           <w:ilvl w:val="0"/>
-          <w:numId w:val="1646"/>
+          <w:numId w:val="1647"/>
         </w:numPr>
       </w:pPr>
       <w:r>
@@ -15050,7 +15158,7 @@
         <w:pStyle w:val="Compact"/>
         <w:numPr>
           <w:ilvl w:val="0"/>
-          <w:numId w:val="1647"/>
+          <w:numId w:val="1648"/>
         </w:numPr>
       </w:pPr>
       <w:r>
@@ -15062,7 +15170,7 @@
         <w:pStyle w:val="Compact"/>
         <w:numPr>
           <w:ilvl w:val="0"/>
-          <w:numId w:val="1648"/>
+          <w:numId w:val="1649"/>
         </w:numPr>
       </w:pPr>
       <w:r>
@@ -15094,7 +15202,7 @@
         <w:pStyle w:val="Compact"/>
         <w:numPr>
           <w:ilvl w:val="0"/>
-          <w:numId w:val="1649"/>
+          <w:numId w:val="1650"/>
         </w:numPr>
       </w:pPr>
       <w:r>
@@ -15106,7 +15214,7 @@
         <w:pStyle w:val="Compact"/>
         <w:numPr>
           <w:ilvl w:val="0"/>
-          <w:numId w:val="1650"/>
+          <w:numId w:val="1651"/>
         </w:numPr>
       </w:pPr>
       <w:r>
@@ -15118,7 +15226,7 @@
         <w:pStyle w:val="Compact"/>
         <w:numPr>
           <w:ilvl w:val="0"/>
-          <w:numId w:val="1651"/>
+          <w:numId w:val="1652"/>
         </w:numPr>
       </w:pPr>
       <w:r>
@@ -15130,7 +15238,7 @@
         <w:pStyle w:val="Compact"/>
         <w:numPr>
           <w:ilvl w:val="0"/>
-          <w:numId w:val="1652"/>
+          <w:numId w:val="1653"/>
         </w:numPr>
       </w:pPr>
       <w:r>
@@ -15142,7 +15250,7 @@
         <w:pStyle w:val="Compact"/>
         <w:numPr>
           <w:ilvl w:val="0"/>
-          <w:numId w:val="1653"/>
+          <w:numId w:val="1654"/>
         </w:numPr>
       </w:pPr>
       <w:r>
@@ -15154,7 +15262,7 @@
         <w:pStyle w:val="Compact"/>
         <w:numPr>
           <w:ilvl w:val="0"/>
-          <w:numId w:val="1654"/>
+          <w:numId w:val="1655"/>
         </w:numPr>
       </w:pPr>
       <w:r>
@@ -15166,7 +15274,7 @@
         <w:pStyle w:val="Compact"/>
         <w:numPr>
           <w:ilvl w:val="0"/>
-          <w:numId w:val="1655"/>
+          <w:numId w:val="1656"/>
         </w:numPr>
       </w:pPr>
       <w:r>
@@ -15178,7 +15286,7 @@
         <w:pStyle w:val="Compact"/>
         <w:numPr>
           <w:ilvl w:val="0"/>
-          <w:numId w:val="1656"/>
+          <w:numId w:val="1657"/>
         </w:numPr>
       </w:pPr>
       <w:r>
@@ -15190,7 +15298,7 @@
         <w:pStyle w:val="Compact"/>
         <w:numPr>
           <w:ilvl w:val="0"/>
-          <w:numId w:val="1657"/>
+          <w:numId w:val="1658"/>
         </w:numPr>
       </w:pPr>
       <w:r>
@@ -15202,7 +15310,7 @@
         <w:pStyle w:val="Compact"/>
         <w:numPr>
           <w:ilvl w:val="0"/>
-          <w:numId w:val="1658"/>
+          <w:numId w:val="1659"/>
         </w:numPr>
       </w:pPr>
       <w:r>
@@ -15214,7 +15322,7 @@
         <w:pStyle w:val="Compact"/>
         <w:numPr>
           <w:ilvl w:val="0"/>
-          <w:numId w:val="1659"/>
+          <w:numId w:val="1660"/>
         </w:numPr>
       </w:pPr>
       <w:r>
@@ -15226,7 +15334,7 @@
         <w:pStyle w:val="Compact"/>
         <w:numPr>
           <w:ilvl w:val="0"/>
-          <w:numId w:val="1660"/>
+          <w:numId w:val="1661"/>
         </w:numPr>
       </w:pPr>
       <w:r>
@@ -15238,7 +15346,7 @@
         <w:pStyle w:val="Compact"/>
         <w:numPr>
           <w:ilvl w:val="0"/>
-          <w:numId w:val="1661"/>
+          <w:numId w:val="1662"/>
         </w:numPr>
       </w:pPr>
       <w:r>
@@ -15275,7 +15383,7 @@
         <w:pStyle w:val="Compact"/>
         <w:numPr>
           <w:ilvl w:val="0"/>
-          <w:numId w:val="1662"/>
+          <w:numId w:val="1663"/>
         </w:numPr>
       </w:pPr>
       <w:r>
@@ -15287,7 +15395,7 @@
         <w:pStyle w:val="Compact"/>
         <w:numPr>
           <w:ilvl w:val="0"/>
-          <w:numId w:val="1663"/>
+          <w:numId w:val="1664"/>
         </w:numPr>
       </w:pPr>
       <w:r>
@@ -15314,7 +15422,7 @@
         <w:pStyle w:val="Compact"/>
         <w:numPr>
           <w:ilvl w:val="0"/>
-          <w:numId w:val="1664"/>
+          <w:numId w:val="1665"/>
         </w:numPr>
       </w:pPr>
       <w:r>
@@ -15326,7 +15434,7 @@
         <w:pStyle w:val="Compact"/>
         <w:numPr>
           <w:ilvl w:val="0"/>
-          <w:numId w:val="1665"/>
+          <w:numId w:val="1666"/>
         </w:numPr>
       </w:pPr>
       <w:r>
@@ -15338,7 +15446,7 @@
         <w:pStyle w:val="Compact"/>
         <w:numPr>
           <w:ilvl w:val="0"/>
-          <w:numId w:val="1666"/>
+          <w:numId w:val="1667"/>
         </w:numPr>
       </w:pPr>
       <w:r>
@@ -15350,7 +15458,7 @@
         <w:pStyle w:val="Compact"/>
         <w:numPr>
           <w:ilvl w:val="0"/>
-          <w:numId w:val="1667"/>
+          <w:numId w:val="1668"/>
         </w:numPr>
       </w:pPr>
       <w:r>
@@ -15362,7 +15470,7 @@
         <w:pStyle w:val="Compact"/>
         <w:numPr>
           <w:ilvl w:val="0"/>
-          <w:numId w:val="1668"/>
+          <w:numId w:val="1669"/>
         </w:numPr>
       </w:pPr>
       <w:r>
@@ -15374,7 +15482,7 @@
         <w:pStyle w:val="Compact"/>
         <w:numPr>
           <w:ilvl w:val="0"/>
-          <w:numId w:val="1669"/>
+          <w:numId w:val="1670"/>
         </w:numPr>
       </w:pPr>
       <w:r>
@@ -15396,7 +15504,7 @@
         <w:pStyle w:val="Compact"/>
         <w:numPr>
           <w:ilvl w:val="0"/>
-          <w:numId w:val="1670"/>
+          <w:numId w:val="1671"/>
         </w:numPr>
       </w:pPr>
       <w:r>
@@ -15408,7 +15516,7 @@
         <w:pStyle w:val="Compact"/>
         <w:numPr>
           <w:ilvl w:val="0"/>
-          <w:numId w:val="1671"/>
+          <w:numId w:val="1672"/>
         </w:numPr>
       </w:pPr>
       <w:r>
@@ -15420,7 +15528,7 @@
         <w:pStyle w:val="Compact"/>
         <w:numPr>
           <w:ilvl w:val="0"/>
-          <w:numId w:val="1672"/>
+          <w:numId w:val="1673"/>
         </w:numPr>
       </w:pPr>
       <w:r>
@@ -15432,7 +15540,7 @@
         <w:pStyle w:val="Compact"/>
         <w:numPr>
           <w:ilvl w:val="0"/>
-          <w:numId w:val="1673"/>
+          <w:numId w:val="1674"/>
         </w:numPr>
       </w:pPr>
       <w:r>
@@ -15444,7 +15552,7 @@
         <w:pStyle w:val="Compact"/>
         <w:numPr>
           <w:ilvl w:val="0"/>
-          <w:numId w:val="1674"/>
+          <w:numId w:val="1675"/>
         </w:numPr>
       </w:pPr>
       <w:r>
@@ -15456,7 +15564,7 @@
         <w:pStyle w:val="Compact"/>
         <w:numPr>
           <w:ilvl w:val="0"/>
-          <w:numId w:val="1675"/>
+          <w:numId w:val="1676"/>
         </w:numPr>
       </w:pPr>
       <w:r>
@@ -15468,7 +15576,7 @@
         <w:pStyle w:val="Compact"/>
         <w:numPr>
           <w:ilvl w:val="0"/>
-          <w:numId w:val="1676"/>
+          <w:numId w:val="1677"/>
         </w:numPr>
       </w:pPr>
       <w:r>
@@ -15480,7 +15588,7 @@
         <w:pStyle w:val="Compact"/>
         <w:numPr>
           <w:ilvl w:val="0"/>
-          <w:numId w:val="1677"/>
+          <w:numId w:val="1678"/>
         </w:numPr>
       </w:pPr>
       <w:r>
@@ -15492,7 +15600,7 @@
         <w:pStyle w:val="Compact"/>
         <w:numPr>
           <w:ilvl w:val="0"/>
-          <w:numId w:val="1678"/>
+          <w:numId w:val="1679"/>
         </w:numPr>
       </w:pPr>
       <w:r>
@@ -15515,7 +15623,7 @@
         <w:pStyle w:val="Compact"/>
         <w:numPr>
           <w:ilvl w:val="0"/>
-          <w:numId w:val="1679"/>
+          <w:numId w:val="1680"/>
         </w:numPr>
       </w:pPr>
       <w:r>
@@ -15527,7 +15635,7 @@
         <w:pStyle w:val="Compact"/>
         <w:numPr>
           <w:ilvl w:val="0"/>
-          <w:numId w:val="1680"/>
+          <w:numId w:val="1681"/>
         </w:numPr>
       </w:pPr>
       <w:r>
@@ -15539,7 +15647,7 @@
         <w:pStyle w:val="Compact"/>
         <w:numPr>
           <w:ilvl w:val="0"/>
-          <w:numId w:val="1681"/>
+          <w:numId w:val="1682"/>
         </w:numPr>
       </w:pPr>
       <w:r>
@@ -15551,7 +15659,7 @@
         <w:pStyle w:val="Compact"/>
         <w:numPr>
           <w:ilvl w:val="0"/>
-          <w:numId w:val="1682"/>
+          <w:numId w:val="1683"/>
         </w:numPr>
       </w:pPr>
       <w:r>
@@ -15563,7 +15671,7 @@
         <w:pStyle w:val="Compact"/>
         <w:numPr>
           <w:ilvl w:val="0"/>
-          <w:numId w:val="1683"/>
+          <w:numId w:val="1684"/>
         </w:numPr>
       </w:pPr>
       <w:r>
@@ -15575,7 +15683,7 @@
         <w:pStyle w:val="Compact"/>
         <w:numPr>
           <w:ilvl w:val="0"/>
-          <w:numId w:val="1684"/>
+          <w:numId w:val="1685"/>
         </w:numPr>
       </w:pPr>
       <w:r>
@@ -15587,7 +15695,7 @@
         <w:pStyle w:val="Compact"/>
         <w:numPr>
           <w:ilvl w:val="0"/>
-          <w:numId w:val="1685"/>
+          <w:numId w:val="1686"/>
         </w:numPr>
       </w:pPr>
       <w:r>
@@ -15599,7 +15707,7 @@
         <w:pStyle w:val="Compact"/>
         <w:numPr>
           <w:ilvl w:val="0"/>
-          <w:numId w:val="1686"/>
+          <w:numId w:val="1687"/>
         </w:numPr>
       </w:pPr>
       <w:r>
@@ -15611,7 +15719,7 @@
         <w:pStyle w:val="Compact"/>
         <w:numPr>
           <w:ilvl w:val="0"/>
-          <w:numId w:val="1687"/>
+          <w:numId w:val="1688"/>
         </w:numPr>
       </w:pPr>
       <w:r>
@@ -15623,7 +15731,7 @@
         <w:pStyle w:val="Compact"/>
         <w:numPr>
           <w:ilvl w:val="0"/>
-          <w:numId w:val="1688"/>
+          <w:numId w:val="1689"/>
         </w:numPr>
       </w:pPr>
       <w:r>
@@ -15635,7 +15743,7 @@
         <w:pStyle w:val="Compact"/>
         <w:numPr>
           <w:ilvl w:val="0"/>
-          <w:numId w:val="1689"/>
+          <w:numId w:val="1690"/>
         </w:numPr>
       </w:pPr>
       <w:r>
@@ -17663,7 +17771,7 @@
     <w:abstractNumId w:val="993"/>
   </w:num>
   <w:num w:numId="1429">
-    <w:abstractNumId w:val="992"/>
+    <w:abstractNumId w:val="993"/>
   </w:num>
   <w:num w:numId="1430">
     <w:abstractNumId w:val="993"/>
@@ -17711,7 +17819,7 @@
     <w:abstractNumId w:val="993"/>
   </w:num>
   <w:num w:numId="1445">
-    <w:abstractNumId w:val="992"/>
+    <w:abstractNumId w:val="993"/>
   </w:num>
   <w:num w:numId="1446">
     <w:abstractNumId w:val="992"/>
@@ -17735,7 +17843,7 @@
     <w:abstractNumId w:val="992"/>
   </w:num>
   <w:num w:numId="1453">
-    <w:abstractNumId w:val="993"/>
+    <w:abstractNumId w:val="992"/>
   </w:num>
   <w:num w:numId="1454">
     <w:abstractNumId w:val="993"/>
@@ -17744,7 +17852,7 @@
     <w:abstractNumId w:val="993"/>
   </w:num>
   <w:num w:numId="1456">
-    <w:abstractNumId w:val="992"/>
+    <w:abstractNumId w:val="993"/>
   </w:num>
   <w:num w:numId="1457">
     <w:abstractNumId w:val="992"/>
@@ -17753,7 +17861,7 @@
     <w:abstractNumId w:val="992"/>
   </w:num>
   <w:num w:numId="1459">
-    <w:abstractNumId w:val="993"/>
+    <w:abstractNumId w:val="992"/>
   </w:num>
   <w:num w:numId="1460">
     <w:abstractNumId w:val="993"/>
@@ -17765,13 +17873,13 @@
     <w:abstractNumId w:val="993"/>
   </w:num>
   <w:num w:numId="1463">
-    <w:abstractNumId w:val="992"/>
+    <w:abstractNumId w:val="993"/>
   </w:num>
   <w:num w:numId="1464">
     <w:abstractNumId w:val="992"/>
   </w:num>
   <w:num w:numId="1465">
-    <w:abstractNumId w:val="993"/>
+    <w:abstractNumId w:val="992"/>
   </w:num>
   <w:num w:numId="1466">
     <w:abstractNumId w:val="993"/>
@@ -17813,19 +17921,19 @@
     <w:abstractNumId w:val="993"/>
   </w:num>
   <w:num w:numId="1479">
-    <w:abstractNumId w:val="992"/>
+    <w:abstractNumId w:val="993"/>
   </w:num>
   <w:num w:numId="1480">
+    <w:abstractNumId w:val="992"/>
+  </w:num>
+  <w:num w:numId="1481">
     <w:abstractNumId w:val="991"/>
   </w:num>
-  <w:num w:numId="1481">
-    <w:abstractNumId w:val="993"/>
-  </w:num>
   <w:num w:numId="1482">
     <w:abstractNumId w:val="993"/>
   </w:num>
   <w:num w:numId="1483">
-    <w:abstractNumId w:val="992"/>
+    <w:abstractNumId w:val="993"/>
   </w:num>
   <w:num w:numId="1484">
     <w:abstractNumId w:val="992"/>
@@ -17840,16 +17948,16 @@
     <w:abstractNumId w:val="992"/>
   </w:num>
   <w:num w:numId="1488">
-    <w:abstractNumId w:val="993"/>
+    <w:abstractNumId w:val="992"/>
   </w:num>
   <w:num w:numId="1489">
-    <w:abstractNumId w:val="992"/>
+    <w:abstractNumId w:val="993"/>
   </w:num>
   <w:num w:numId="1490">
     <w:abstractNumId w:val="992"/>
   </w:num>
   <w:num w:numId="1491">
-    <w:abstractNumId w:val="993"/>
+    <w:abstractNumId w:val="992"/>
   </w:num>
   <w:num w:numId="1492">
     <w:abstractNumId w:val="993"/>
@@ -17891,11 +17999,11 @@
     <w:abstractNumId w:val="993"/>
   </w:num>
   <w:num w:numId="1505">
+    <w:abstractNumId w:val="993"/>
+  </w:num>
+  <w:num w:numId="1506">
     <w:abstractNumId w:val="991"/>
   </w:num>
-  <w:num w:numId="1506">
-    <w:abstractNumId w:val="993"/>
-  </w:num>
   <w:num w:numId="1507">
     <w:abstractNumId w:val="993"/>
   </w:num>
@@ -17903,35 +18011,35 @@
     <w:abstractNumId w:val="993"/>
   </w:num>
   <w:num w:numId="1509">
+    <w:abstractNumId w:val="993"/>
+  </w:num>
+  <w:num w:numId="1510">
     <w:abstractNumId w:val="991"/>
   </w:num>
-  <w:num w:numId="1510">
-    <w:abstractNumId w:val="993"/>
-  </w:num>
   <w:num w:numId="1511">
     <w:abstractNumId w:val="993"/>
   </w:num>
   <w:num w:numId="1512">
-    <w:abstractNumId w:val="992"/>
+    <w:abstractNumId w:val="993"/>
   </w:num>
   <w:num w:numId="1513">
     <w:abstractNumId w:val="992"/>
   </w:num>
   <w:num w:numId="1514">
-    <w:abstractNumId w:val="993"/>
+    <w:abstractNumId w:val="992"/>
   </w:num>
   <w:num w:numId="1515">
+    <w:abstractNumId w:val="993"/>
+  </w:num>
+  <w:num w:numId="1516">
     <w:abstractNumId w:val="991"/>
   </w:num>
-  <w:num w:numId="1516">
-    <w:abstractNumId w:val="993"/>
-  </w:num>
   <w:num w:numId="1517">
+    <w:abstractNumId w:val="993"/>
+  </w:num>
+  <w:num w:numId="1518">
     <w:abstractNumId w:val="991"/>
   </w:num>
-  <w:num w:numId="1518">
-    <w:abstractNumId w:val="993"/>
-  </w:num>
   <w:num w:numId="1519">
     <w:abstractNumId w:val="993"/>
   </w:num>
@@ -17957,22 +18065,22 @@
     <w:abstractNumId w:val="993"/>
   </w:num>
   <w:num w:numId="1527">
+    <w:abstractNumId w:val="993"/>
+  </w:num>
+  <w:num w:numId="1528">
     <w:abstractNumId w:val="991"/>
   </w:num>
-  <w:num w:numId="1528">
-    <w:abstractNumId w:val="993"/>
-  </w:num>
   <w:num w:numId="1529">
     <w:abstractNumId w:val="993"/>
   </w:num>
   <w:num w:numId="1530">
-    <w:abstractNumId w:val="992"/>
+    <w:abstractNumId w:val="993"/>
   </w:num>
   <w:num w:numId="1531">
     <w:abstractNumId w:val="992"/>
   </w:num>
   <w:num w:numId="1532">
-    <w:abstractNumId w:val="993"/>
+    <w:abstractNumId w:val="992"/>
   </w:num>
   <w:num w:numId="1533">
     <w:abstractNumId w:val="993"/>
@@ -17981,7 +18089,7 @@
     <w:abstractNumId w:val="993"/>
   </w:num>
   <w:num w:numId="1535">
-    <w:abstractNumId w:val="992"/>
+    <w:abstractNumId w:val="993"/>
   </w:num>
   <w:num w:numId="1536">
     <w:abstractNumId w:val="992"/>
@@ -17993,16 +18101,16 @@
     <w:abstractNumId w:val="992"/>
   </w:num>
   <w:num w:numId="1539">
-    <w:abstractNumId w:val="993"/>
+    <w:abstractNumId w:val="992"/>
   </w:num>
   <w:num w:numId="1540">
-    <w:abstractNumId w:val="992"/>
+    <w:abstractNumId w:val="993"/>
   </w:num>
   <w:num w:numId="1541">
     <w:abstractNumId w:val="992"/>
   </w:num>
   <w:num w:numId="1542">
-    <w:abstractNumId w:val="993"/>
+    <w:abstractNumId w:val="992"/>
   </w:num>
   <w:num w:numId="1543">
     <w:abstractNumId w:val="993"/>
@@ -18062,11 +18170,11 @@
     <w:abstractNumId w:val="993"/>
   </w:num>
   <w:num w:numId="1562">
+    <w:abstractNumId w:val="993"/>
+  </w:num>
+  <w:num w:numId="1563">
     <w:abstractNumId w:val="991"/>
   </w:num>
-  <w:num w:numId="1563">
-    <w:abstractNumId w:val="992"/>
-  </w:num>
   <w:num w:numId="1564">
     <w:abstractNumId w:val="992"/>
   </w:num>
@@ -18113,7 +18221,7 @@
     <w:abstractNumId w:val="992"/>
   </w:num>
   <w:num w:numId="1579">
-    <w:abstractNumId w:val="993"/>
+    <w:abstractNumId w:val="992"/>
   </w:num>
   <w:num w:numId="1580">
     <w:abstractNumId w:val="993"/>
@@ -18128,20 +18236,20 @@
     <w:abstractNumId w:val="993"/>
   </w:num>
   <w:num w:numId="1584">
+    <w:abstractNumId w:val="993"/>
+  </w:num>
+  <w:num w:numId="1585">
     <w:abstractNumId w:val="991"/>
   </w:num>
-  <w:num w:numId="1585">
-    <w:abstractNumId w:val="993"/>
-  </w:num>
   <w:num w:numId="1586">
     <w:abstractNumId w:val="993"/>
   </w:num>
   <w:num w:numId="1587">
+    <w:abstractNumId w:val="993"/>
+  </w:num>
+  <w:num w:numId="1588">
     <w:abstractNumId w:val="991"/>
   </w:num>
-  <w:num w:numId="1588">
-    <w:abstractNumId w:val="993"/>
-  </w:num>
   <w:num w:numId="1589">
     <w:abstractNumId w:val="993"/>
   </w:num>
@@ -18170,17 +18278,17 @@
     <w:abstractNumId w:val="993"/>
   </w:num>
   <w:num w:numId="1598">
+    <w:abstractNumId w:val="993"/>
+  </w:num>
+  <w:num w:numId="1599">
     <w:abstractNumId w:val="991"/>
   </w:num>
-  <w:num w:numId="1599">
-    <w:abstractNumId w:val="993"/>
-  </w:num>
   <w:num w:numId="1600">
+    <w:abstractNumId w:val="993"/>
+  </w:num>
+  <w:num w:numId="1601">
     <w:abstractNumId w:val="991"/>
   </w:num>
-  <w:num w:numId="1601">
-    <w:abstractNumId w:val="993"/>
-  </w:num>
   <w:num w:numId="1602">
     <w:abstractNumId w:val="993"/>
   </w:num>
@@ -18191,16 +18299,16 @@
     <w:abstractNumId w:val="993"/>
   </w:num>
   <w:num w:numId="1605">
-    <w:abstractNumId w:val="992"/>
+    <w:abstractNumId w:val="993"/>
   </w:num>
   <w:num w:numId="1606">
     <w:abstractNumId w:val="992"/>
   </w:num>
   <w:num w:numId="1607">
-    <w:abstractNumId w:val="993"/>
+    <w:abstractNumId w:val="992"/>
   </w:num>
   <w:num w:numId="1608">
-    <w:abstractNumId w:val="992"/>
+    <w:abstractNumId w:val="993"/>
   </w:num>
   <w:num w:numId="1609">
     <w:abstractNumId w:val="992"/>
@@ -18218,7 +18326,7 @@
     <w:abstractNumId w:val="992"/>
   </w:num>
   <w:num w:numId="1614">
-    <w:abstractNumId w:val="993"/>
+    <w:abstractNumId w:val="992"/>
   </w:num>
   <w:num w:numId="1615">
     <w:abstractNumId w:val="993"/>
@@ -18239,10 +18347,10 @@
     <w:abstractNumId w:val="993"/>
   </w:num>
   <w:num w:numId="1621">
-    <w:abstractNumId w:val="992"/>
+    <w:abstractNumId w:val="993"/>
   </w:num>
   <w:num w:numId="1622">
-    <w:abstractNumId w:val="993"/>
+    <w:abstractNumId w:val="992"/>
   </w:num>
   <w:num w:numId="1623">
     <w:abstractNumId w:val="993"/>
@@ -18251,10 +18359,10 @@
     <w:abstractNumId w:val="993"/>
   </w:num>
   <w:num w:numId="1625">
-    <w:abstractNumId w:val="992"/>
+    <w:abstractNumId w:val="993"/>
   </w:num>
   <w:num w:numId="1626">
-    <w:abstractNumId w:val="993"/>
+    <w:abstractNumId w:val="992"/>
   </w:num>
   <w:num w:numId="1627">
     <w:abstractNumId w:val="993"/>
@@ -18263,10 +18371,10 @@
     <w:abstractNumId w:val="993"/>
   </w:num>
   <w:num w:numId="1629">
-    <w:abstractNumId w:val="992"/>
+    <w:abstractNumId w:val="993"/>
   </w:num>
   <w:num w:numId="1630">
-    <w:abstractNumId w:val="993"/>
+    <w:abstractNumId w:val="992"/>
   </w:num>
   <w:num w:numId="1631">
     <w:abstractNumId w:val="993"/>
@@ -18284,19 +18392,19 @@
     <w:abstractNumId w:val="993"/>
   </w:num>
   <w:num w:numId="1636">
-    <w:abstractNumId w:val="992"/>
+    <w:abstractNumId w:val="993"/>
   </w:num>
   <w:num w:numId="1637">
-    <w:abstractNumId w:val="993"/>
+    <w:abstractNumId w:val="992"/>
   </w:num>
   <w:num w:numId="1638">
-    <w:abstractNumId w:val="992"/>
+    <w:abstractNumId w:val="993"/>
   </w:num>
   <w:num w:numId="1639">
     <w:abstractNumId w:val="992"/>
   </w:num>
   <w:num w:numId="1640">
-    <w:abstractNumId w:val="993"/>
+    <w:abstractNumId w:val="992"/>
   </w:num>
   <w:num w:numId="1641">
     <w:abstractNumId w:val="993"/>
@@ -18308,7 +18416,7 @@
     <w:abstractNumId w:val="993"/>
   </w:num>
   <w:num w:numId="1644">
-    <w:abstractNumId w:val="992"/>
+    <w:abstractNumId w:val="993"/>
   </w:num>
   <w:num w:numId="1645">
     <w:abstractNumId w:val="992"/>
@@ -18320,10 +18428,10 @@
     <w:abstractNumId w:val="992"/>
   </w:num>
   <w:num w:numId="1648">
-    <w:abstractNumId w:val="993"/>
+    <w:abstractNumId w:val="992"/>
   </w:num>
   <w:num w:numId="1649">
-    <w:abstractNumId w:val="992"/>
+    <w:abstractNumId w:val="993"/>
   </w:num>
   <w:num w:numId="1650">
     <w:abstractNumId w:val="992"/>
@@ -18443,6 +18551,9 @@
     <w:abstractNumId w:val="992"/>
   </w:num>
   <w:num w:numId="1689">
+    <w:abstractNumId w:val="992"/>
+  </w:num>
+  <w:num w:numId="1690">
     <w:abstractNumId w:val="992"/>
   </w:num>
 </w:numbering>

</xml_diff>

<commit_message>
docs: record m16 visual regression gate
</commit_message>
<xml_diff>
--- a/MASTER_M1_M2_DELIVERY_CHECKLIST.docx
+++ b/MASTER_M1_M2_DELIVERY_CHECKLIST.docx
@@ -10,7 +10,7 @@
         <w:t xml:space="preserve">© BuyReadySite.com</w:t>
       </w:r>
     </w:p>
-    <w:bookmarkStart w:id="93" w:name="X3d74ce0b4fd94f465ac7edf34b08aa6d5ff209b"/>
+    <w:bookmarkStart w:id="94" w:name="X3d74ce0b4fd94f465ac7edf34b08aa6d5ff209b"/>
     <w:p>
       <w:pPr>
         <w:pStyle w:val="Heading1"/>
@@ -457,7 +457,7 @@
               <w:jc w:val="right"/>
             </w:pPr>
             <w:r>
-              <w:t xml:space="preserve">7%</w:t>
+              <w:t xml:space="preserve">8%</w:t>
             </w:r>
           </w:p>
         </w:tc>
@@ -468,7 +468,7 @@
               <w:pStyle w:val="Compact"/>
             </w:pPr>
             <w:r>
-              <w:t xml:space="preserve">Functional gates deployed through new deal/share/socket; visual gate remains</w:t>
+              <w:t xml:space="preserve">Done — functional and visual gates verified; full-env suite limitation remains documented</w:t>
             </w:r>
           </w:p>
         </w:tc>
@@ -709,7 +709,7 @@
                 <w:b/>
                 <w:bCs/>
               </w:rPr>
-              <w:t xml:space="preserve">74%</w:t>
+              <w:t xml:space="preserve">75%</w:t>
             </w:r>
           </w:p>
         </w:tc>
@@ -724,7 +724,7 @@
                 <w:b/>
                 <w:bCs/>
               </w:rPr>
-              <w:t xml:space="preserve">M1.6 functional gates deployed through new deal/share/socket; visual remains</w:t>
+              <w:t xml:space="preserve">M1.6 visual gate complete; remaining work shifts to M1.1, M1.4, and M2 gates</w:t>
             </w:r>
           </w:p>
         </w:tc>
@@ -9929,7 +9929,7 @@
     </w:p>
     <w:bookmarkEnd w:id="52"/>
     <w:bookmarkEnd w:id="53"/>
-    <w:bookmarkStart w:id="62" w:name="m1.6-m1-full-regression-and-release-gate"/>
+    <w:bookmarkStart w:id="63" w:name="m1.6-m1-full-regression-and-release-gate"/>
     <w:p>
       <w:pPr>
         <w:pStyle w:val="Heading2"/>
@@ -11128,12 +11128,205 @@
       </w:r>
     </w:p>
     <w:bookmarkEnd w:id="58"/>
-    <w:bookmarkStart w:id="59" w:name="functional-regression"/>
+    <w:bookmarkStart w:id="59" w:name="visual-regression-smoke-2026-05-02"/>
     <w:p>
       <w:pPr>
         <w:pStyle w:val="Heading3"/>
       </w:pPr>
       <w:r>
+        <w:t xml:space="preserve">Visual regression smoke — 2026-05-02</w:t>
+      </w:r>
+    </w:p>
+    <w:p>
+      <w:pPr>
+        <w:pStyle w:val="Compact"/>
+        <w:numPr>
+          <w:ilvl w:val="0"/>
+          <w:numId w:val="1431"/>
+        </w:numPr>
+      </w:pPr>
+      <w:r>
+        <w:t xml:space="preserve">Evidence JSON added:</w:t>
+      </w:r>
+      <w:r>
+        <w:t xml:space="preserve"> </w:t>
+      </w:r>
+      <w:r>
+        <w:rPr>
+          <w:rStyle w:val="VerbatimChar"/>
+        </w:rPr>
+        <w:t xml:space="preserve">audit-screenshots/m16-visual-regression-evidence.json</w:t>
+      </w:r>
+      <w:r>
+        <w:t xml:space="preserve">.</w:t>
+      </w:r>
+    </w:p>
+    <w:p>
+      <w:pPr>
+        <w:pStyle w:val="Compact"/>
+        <w:numPr>
+          <w:ilvl w:val="0"/>
+          <w:numId w:val="1432"/>
+        </w:numPr>
+      </w:pPr>
+      <w:r>
+        <w:t xml:space="preserve">Desktop 1440px Pipeline screenshot captured and visually reviewed:</w:t>
+      </w:r>
+      <w:r>
+        <w:t xml:space="preserve"> </w:t>
+      </w:r>
+      <w:r>
+        <w:rPr>
+          <w:rStyle w:val="VerbatimChar"/>
+        </w:rPr>
+        <w:t xml:space="preserve">audit-screenshots/m16-pipeline-desktop-1440.png</w:t>
+      </w:r>
+      <w:r>
+        <w:t xml:space="preserve">.</w:t>
+      </w:r>
+    </w:p>
+    <w:p>
+      <w:pPr>
+        <w:pStyle w:val="Compact"/>
+        <w:numPr>
+          <w:ilvl w:val="0"/>
+          <w:numId w:val="1433"/>
+        </w:numPr>
+      </w:pPr>
+      <w:r>
+        <w:t xml:space="preserve">Half-screen 960px Pipeline screenshot captured and visually reviewed:</w:t>
+      </w:r>
+      <w:r>
+        <w:t xml:space="preserve"> </w:t>
+      </w:r>
+      <w:r>
+        <w:rPr>
+          <w:rStyle w:val="VerbatimChar"/>
+        </w:rPr>
+        <w:t xml:space="preserve">audit-screenshots/m16-pipeline-half-960.png</w:t>
+      </w:r>
+      <w:r>
+        <w:t xml:space="preserve">.</w:t>
+      </w:r>
+    </w:p>
+    <w:p>
+      <w:pPr>
+        <w:pStyle w:val="Compact"/>
+        <w:numPr>
+          <w:ilvl w:val="0"/>
+          <w:numId w:val="1434"/>
+        </w:numPr>
+      </w:pPr>
+      <w:r>
+        <w:t xml:space="preserve">DealPanel screenshot captured and visually reviewed:</w:t>
+      </w:r>
+      <w:r>
+        <w:t xml:space="preserve"> </w:t>
+      </w:r>
+      <w:r>
+        <w:rPr>
+          <w:rStyle w:val="VerbatimChar"/>
+        </w:rPr>
+        <w:t xml:space="preserve">audit-screenshots/m16-deal-panel-desktop-1440.png</w:t>
+      </w:r>
+      <w:r>
+        <w:t xml:space="preserve">.</w:t>
+      </w:r>
+    </w:p>
+    <w:p>
+      <w:pPr>
+        <w:pStyle w:val="Compact"/>
+        <w:numPr>
+          <w:ilvl w:val="0"/>
+          <w:numId w:val="1435"/>
+        </w:numPr>
+      </w:pPr>
+      <w:r>
+        <w:t xml:space="preserve">DealCard stacking + attempt banner screenshot captured and visually reviewed:</w:t>
+      </w:r>
+      <w:r>
+        <w:t xml:space="preserve"> </w:t>
+      </w:r>
+      <w:r>
+        <w:rPr>
+          <w:rStyle w:val="VerbatimChar"/>
+        </w:rPr>
+        <w:t xml:space="preserve">audit-screenshots/m16-deal-card-stacking-attempt.png</w:t>
+      </w:r>
+      <w:r>
+        <w:t xml:space="preserve">.</w:t>
+      </w:r>
+    </w:p>
+    <w:p>
+      <w:pPr>
+        <w:pStyle w:val="Compact"/>
+        <w:numPr>
+          <w:ilvl w:val="0"/>
+          <w:numId w:val="1436"/>
+        </w:numPr>
+      </w:pPr>
+      <w:r>
+        <w:t xml:space="preserve">Playwright DOM audit passed for desktop and half-screen: no document horizontal overflow, no unexpected text overflow, 8 visible columns, 8 visible cards, and layout shift score</w:t>
+      </w:r>
+      <w:r>
+        <w:t xml:space="preserve"> </w:t>
+      </w:r>
+      <w:r>
+        <w:rPr>
+          <w:rStyle w:val="VerbatimChar"/>
+        </w:rPr>
+        <w:t xml:space="preserve">0</w:t>
+      </w:r>
+      <w:r>
+        <w:t xml:space="preserve">.</w:t>
+      </w:r>
+    </w:p>
+    <w:p>
+      <w:pPr>
+        <w:pStyle w:val="Compact"/>
+        <w:numPr>
+          <w:ilvl w:val="0"/>
+          <w:numId w:val="1437"/>
+        </w:numPr>
+      </w:pPr>
+      <w:r>
+        <w:t xml:space="preserve">Stacking chip and</w:t>
+      </w:r>
+      <w:r>
+        <w:t xml:space="preserve"> </w:t>
+      </w:r>
+      <w:r>
+        <w:rPr>
+          <w:rStyle w:val="VerbatimChar"/>
+        </w:rPr>
+        <w:t xml:space="preserve">WAITING 8/10 ATTEMPTS</w:t>
+      </w:r>
+      <w:r>
+        <w:t xml:space="preserve"> </w:t>
+      </w:r>
+      <w:r>
+        <w:t xml:space="preserve">banner remain inside the card; next action row stays below the attempt banner.</w:t>
+      </w:r>
+    </w:p>
+    <w:p>
+      <w:pPr>
+        <w:pStyle w:val="Compact"/>
+        <w:numPr>
+          <w:ilvl w:val="0"/>
+          <w:numId w:val="1438"/>
+        </w:numPr>
+      </w:pPr>
+      <w:r>
+        <w:t xml:space="preserve">Sidebar/nav links remained unchanged in the visual audit surface.</w:t>
+      </w:r>
+    </w:p>
+    <w:bookmarkEnd w:id="59"/>
+    <w:bookmarkStart w:id="60" w:name="functional-regression"/>
+    <w:p>
+      <w:pPr>
+        <w:pStyle w:val="Heading3"/>
+      </w:pPr>
+      <w:r>
         <w:t xml:space="preserve">Functional regression</w:t>
       </w:r>
     </w:p>
@@ -11142,7 +11335,7 @@
         <w:pStyle w:val="Compact"/>
         <w:numPr>
           <w:ilvl w:val="0"/>
-          <w:numId w:val="1431"/>
+          <w:numId w:val="1439"/>
         </w:numPr>
       </w:pPr>
       <w:r>
@@ -11154,7 +11347,7 @@
         <w:pStyle w:val="Compact"/>
         <w:numPr>
           <w:ilvl w:val="0"/>
-          <w:numId w:val="1432"/>
+          <w:numId w:val="1440"/>
         </w:numPr>
       </w:pPr>
       <w:r>
@@ -11166,7 +11359,7 @@
         <w:pStyle w:val="Compact"/>
         <w:numPr>
           <w:ilvl w:val="0"/>
-          <w:numId w:val="1433"/>
+          <w:numId w:val="1441"/>
         </w:numPr>
       </w:pPr>
       <w:r>
@@ -11178,7 +11371,7 @@
         <w:pStyle w:val="Compact"/>
         <w:numPr>
           <w:ilvl w:val="0"/>
-          <w:numId w:val="1434"/>
+          <w:numId w:val="1442"/>
         </w:numPr>
       </w:pPr>
       <w:r>
@@ -11190,7 +11383,7 @@
         <w:pStyle w:val="Compact"/>
         <w:numPr>
           <w:ilvl w:val="0"/>
-          <w:numId w:val="1435"/>
+          <w:numId w:val="1443"/>
         </w:numPr>
       </w:pPr>
       <w:r>
@@ -11202,7 +11395,7 @@
         <w:pStyle w:val="Compact"/>
         <w:numPr>
           <w:ilvl w:val="0"/>
-          <w:numId w:val="1436"/>
+          <w:numId w:val="1444"/>
         </w:numPr>
       </w:pPr>
       <w:r>
@@ -11214,7 +11407,7 @@
         <w:pStyle w:val="Compact"/>
         <w:numPr>
           <w:ilvl w:val="0"/>
-          <w:numId w:val="1437"/>
+          <w:numId w:val="1445"/>
         </w:numPr>
       </w:pPr>
       <w:r>
@@ -11226,7 +11419,7 @@
         <w:pStyle w:val="Compact"/>
         <w:numPr>
           <w:ilvl w:val="0"/>
-          <w:numId w:val="1438"/>
+          <w:numId w:val="1446"/>
         </w:numPr>
       </w:pPr>
       <w:r>
@@ -11238,7 +11431,7 @@
         <w:pStyle w:val="Compact"/>
         <w:numPr>
           <w:ilvl w:val="0"/>
-          <w:numId w:val="1439"/>
+          <w:numId w:val="1447"/>
         </w:numPr>
       </w:pPr>
       <w:r>
@@ -11250,7 +11443,7 @@
         <w:pStyle w:val="Compact"/>
         <w:numPr>
           <w:ilvl w:val="0"/>
-          <w:numId w:val="1440"/>
+          <w:numId w:val="1448"/>
         </w:numPr>
       </w:pPr>
       <w:r>
@@ -11262,7 +11455,7 @@
         <w:pStyle w:val="Compact"/>
         <w:numPr>
           <w:ilvl w:val="0"/>
-          <w:numId w:val="1441"/>
+          <w:numId w:val="1449"/>
         </w:numPr>
       </w:pPr>
       <w:r>
@@ -11274,7 +11467,7 @@
         <w:pStyle w:val="Compact"/>
         <w:numPr>
           <w:ilvl w:val="0"/>
-          <w:numId w:val="1442"/>
+          <w:numId w:val="1450"/>
         </w:numPr>
       </w:pPr>
       <w:r>
@@ -11286,7 +11479,7 @@
         <w:pStyle w:val="Compact"/>
         <w:numPr>
           <w:ilvl w:val="0"/>
-          <w:numId w:val="1443"/>
+          <w:numId w:val="1451"/>
         </w:numPr>
       </w:pPr>
       <w:r>
@@ -11298,7 +11491,7 @@
         <w:pStyle w:val="Compact"/>
         <w:numPr>
           <w:ilvl w:val="0"/>
-          <w:numId w:val="1444"/>
+          <w:numId w:val="1452"/>
         </w:numPr>
       </w:pPr>
       <w:r>
@@ -11310,15 +11503,15 @@
         <w:pStyle w:val="Compact"/>
         <w:numPr>
           <w:ilvl w:val="0"/>
-          <w:numId w:val="1445"/>
+          <w:numId w:val="1453"/>
         </w:numPr>
       </w:pPr>
       <w:r>
         <w:t xml:space="preserve">Socket scoping unaffected.</w:t>
       </w:r>
     </w:p>
-    <w:bookmarkEnd w:id="59"/>
-    <w:bookmarkStart w:id="60" w:name="visual-regression"/>
+    <w:bookmarkEnd w:id="60"/>
+    <w:bookmarkStart w:id="61" w:name="visual-regression"/>
     <w:p>
       <w:pPr>
         <w:pStyle w:val="Heading3"/>
@@ -11332,7 +11525,7 @@
         <w:pStyle w:val="Compact"/>
         <w:numPr>
           <w:ilvl w:val="0"/>
-          <w:numId w:val="1446"/>
+          <w:numId w:val="1454"/>
         </w:numPr>
       </w:pPr>
       <w:r>
@@ -11344,7 +11537,7 @@
         <w:pStyle w:val="Compact"/>
         <w:numPr>
           <w:ilvl w:val="0"/>
-          <w:numId w:val="1447"/>
+          <w:numId w:val="1455"/>
         </w:numPr>
       </w:pPr>
       <w:r>
@@ -11356,7 +11549,7 @@
         <w:pStyle w:val="Compact"/>
         <w:numPr>
           <w:ilvl w:val="0"/>
-          <w:numId w:val="1448"/>
+          <w:numId w:val="1456"/>
         </w:numPr>
       </w:pPr>
       <w:r>
@@ -11368,7 +11561,7 @@
         <w:pStyle w:val="Compact"/>
         <w:numPr>
           <w:ilvl w:val="0"/>
-          <w:numId w:val="1449"/>
+          <w:numId w:val="1457"/>
         </w:numPr>
       </w:pPr>
       <w:r>
@@ -11380,7 +11573,7 @@
         <w:pStyle w:val="Compact"/>
         <w:numPr>
           <w:ilvl w:val="0"/>
-          <w:numId w:val="1450"/>
+          <w:numId w:val="1458"/>
         </w:numPr>
       </w:pPr>
       <w:r>
@@ -11392,7 +11585,7 @@
         <w:pStyle w:val="Compact"/>
         <w:numPr>
           <w:ilvl w:val="0"/>
-          <w:numId w:val="1451"/>
+          <w:numId w:val="1459"/>
         </w:numPr>
       </w:pPr>
       <w:r>
@@ -11404,15 +11597,15 @@
         <w:pStyle w:val="Compact"/>
         <w:numPr>
           <w:ilvl w:val="0"/>
-          <w:numId w:val="1452"/>
+          <w:numId w:val="1460"/>
         </w:numPr>
       </w:pPr>
       <w:r>
         <w:t xml:space="preserve">Sidebar remains unchanged unless intentionally touched.</w:t>
       </w:r>
     </w:p>
-    <w:bookmarkEnd w:id="60"/>
-    <w:bookmarkStart w:id="61" w:name="release-readiness"/>
+    <w:bookmarkEnd w:id="61"/>
+    <w:bookmarkStart w:id="62" w:name="release-readiness"/>
     <w:p>
       <w:pPr>
         <w:pStyle w:val="Heading3"/>
@@ -11426,7 +11619,7 @@
         <w:pStyle w:val="Compact"/>
         <w:numPr>
           <w:ilvl w:val="0"/>
-          <w:numId w:val="1453"/>
+          <w:numId w:val="1461"/>
         </w:numPr>
       </w:pPr>
       <w:r>
@@ -11438,7 +11631,7 @@
         <w:pStyle w:val="Compact"/>
         <w:numPr>
           <w:ilvl w:val="0"/>
-          <w:numId w:val="1454"/>
+          <w:numId w:val="1462"/>
         </w:numPr>
       </w:pPr>
       <w:r>
@@ -11450,7 +11643,7 @@
         <w:pStyle w:val="Compact"/>
         <w:numPr>
           <w:ilvl w:val="0"/>
-          <w:numId w:val="1455"/>
+          <w:numId w:val="1463"/>
         </w:numPr>
       </w:pPr>
       <w:r>
@@ -11462,7 +11655,7 @@
         <w:pStyle w:val="Compact"/>
         <w:numPr>
           <w:ilvl w:val="0"/>
-          <w:numId w:val="1456"/>
+          <w:numId w:val="1464"/>
         </w:numPr>
       </w:pPr>
       <w:r>
@@ -11474,7 +11667,7 @@
         <w:pStyle w:val="Compact"/>
         <w:numPr>
           <w:ilvl w:val="0"/>
-          <w:numId w:val="1457"/>
+          <w:numId w:val="1465"/>
         </w:numPr>
       </w:pPr>
       <w:r>
@@ -11486,7 +11679,7 @@
         <w:pStyle w:val="Compact"/>
         <w:numPr>
           <w:ilvl w:val="0"/>
-          <w:numId w:val="1458"/>
+          <w:numId w:val="1466"/>
         </w:numPr>
       </w:pPr>
       <w:r>
@@ -11498,16 +11691,16 @@
         <w:pStyle w:val="Compact"/>
         <w:numPr>
           <w:ilvl w:val="0"/>
-          <w:numId w:val="1459"/>
+          <w:numId w:val="1467"/>
         </w:numPr>
       </w:pPr>
       <w:r>
         <w:t xml:space="preserve">Progress dashboard updated to M1 complete only after all gates pass.</w:t>
       </w:r>
     </w:p>
-    <w:bookmarkEnd w:id="61"/>
     <w:bookmarkEnd w:id="62"/>
-    <w:bookmarkStart w:id="68" w:name="Xa989490dca5dab2d86ca3d9b72c2ded4f0c555a"/>
+    <w:bookmarkEnd w:id="63"/>
+    <w:bookmarkStart w:id="69" w:name="Xa989490dca5dab2d86ca3d9b72c2ded4f0c555a"/>
     <w:p>
       <w:pPr>
         <w:pStyle w:val="Heading2"/>
@@ -11516,7 +11709,7 @@
         <w:t xml:space="preserve">M2.1 — Leads/Campaign Access And Source Fixes</w:t>
       </w:r>
     </w:p>
-    <w:bookmarkStart w:id="63" w:name="implementation-evidence-2026-05-02-4"/>
+    <w:bookmarkStart w:id="64" w:name="implementation-evidence-2026-05-02-4"/>
     <w:p>
       <w:pPr>
         <w:pStyle w:val="Heading3"/>
@@ -11530,7 +11723,7 @@
         <w:pStyle w:val="Compact"/>
         <w:numPr>
           <w:ilvl w:val="0"/>
-          <w:numId w:val="1460"/>
+          <w:numId w:val="1468"/>
         </w:numPr>
       </w:pPr>
       <w:r>
@@ -11602,7 +11795,7 @@
         <w:pStyle w:val="Compact"/>
         <w:numPr>
           <w:ilvl w:val="0"/>
-          <w:numId w:val="1461"/>
+          <w:numId w:val="1469"/>
         </w:numPr>
       </w:pPr>
       <w:r>
@@ -11614,7 +11807,7 @@
         <w:pStyle w:val="Compact"/>
         <w:numPr>
           <w:ilvl w:val="0"/>
-          <w:numId w:val="1462"/>
+          <w:numId w:val="1470"/>
         </w:numPr>
       </w:pPr>
       <w:r>
@@ -11641,7 +11834,7 @@
         <w:pStyle w:val="Compact"/>
         <w:numPr>
           <w:ilvl w:val="0"/>
-          <w:numId w:val="1463"/>
+          <w:numId w:val="1471"/>
         </w:numPr>
       </w:pPr>
       <w:r>
@@ -11695,7 +11888,7 @@
         <w:pStyle w:val="Compact"/>
         <w:numPr>
           <w:ilvl w:val="0"/>
-          <w:numId w:val="1464"/>
+          <w:numId w:val="1472"/>
         </w:numPr>
       </w:pPr>
       <w:r>
@@ -11707,15 +11900,15 @@
         <w:pStyle w:val="Compact"/>
         <w:numPr>
           <w:ilvl w:val="0"/>
-          <w:numId w:val="1465"/>
+          <w:numId w:val="1473"/>
         </w:numPr>
       </w:pPr>
       <w:r>
         <w:t xml:space="preserve">CSV import smoke pending with two real rep accounts.</w:t>
       </w:r>
     </w:p>
-    <w:bookmarkEnd w:id="63"/>
-    <w:bookmarkStart w:id="64" w:name="leads-ownership-bug"/>
+    <w:bookmarkEnd w:id="64"/>
+    <w:bookmarkStart w:id="65" w:name="leads-ownership-bug"/>
     <w:p>
       <w:pPr>
         <w:pStyle w:val="Heading3"/>
@@ -11729,7 +11922,7 @@
         <w:pStyle w:val="Compact"/>
         <w:numPr>
           <w:ilvl w:val="0"/>
-          <w:numId w:val="1466"/>
+          <w:numId w:val="1474"/>
         </w:numPr>
       </w:pPr>
       <w:r>
@@ -11780,7 +11973,7 @@
         <w:pStyle w:val="Compact"/>
         <w:numPr>
           <w:ilvl w:val="0"/>
-          <w:numId w:val="1467"/>
+          <w:numId w:val="1475"/>
         </w:numPr>
       </w:pPr>
       <w:r>
@@ -11807,7 +12000,7 @@
         <w:pStyle w:val="Compact"/>
         <w:numPr>
           <w:ilvl w:val="0"/>
-          <w:numId w:val="1468"/>
+          <w:numId w:val="1476"/>
         </w:numPr>
       </w:pPr>
       <w:r>
@@ -11819,7 +12012,7 @@
         <w:pStyle w:val="Compact"/>
         <w:numPr>
           <w:ilvl w:val="0"/>
-          <w:numId w:val="1469"/>
+          <w:numId w:val="1477"/>
         </w:numPr>
       </w:pPr>
       <w:r>
@@ -11846,7 +12039,7 @@
         <w:pStyle w:val="Compact"/>
         <w:numPr>
           <w:ilvl w:val="0"/>
-          <w:numId w:val="1470"/>
+          <w:numId w:val="1478"/>
         </w:numPr>
       </w:pPr>
       <w:r>
@@ -11858,7 +12051,7 @@
         <w:pStyle w:val="Compact"/>
         <w:numPr>
           <w:ilvl w:val="0"/>
-          <w:numId w:val="1471"/>
+          <w:numId w:val="1479"/>
         </w:numPr>
       </w:pPr>
       <w:r>
@@ -11870,15 +12063,15 @@
         <w:pStyle w:val="Compact"/>
         <w:numPr>
           <w:ilvl w:val="0"/>
-          <w:numId w:val="1472"/>
+          <w:numId w:val="1480"/>
         </w:numPr>
       </w:pPr>
       <w:r>
         <w:t xml:space="preserve">Manager behavior documented: manager keeps admin-like global visibility for M2.1 unless JB narrows manager scope later.</w:t>
       </w:r>
     </w:p>
-    <w:bookmarkEnd w:id="64"/>
-    <w:bookmarkStart w:id="65" w:name="campaign-ownership-bug"/>
+    <w:bookmarkEnd w:id="65"/>
+    <w:bookmarkStart w:id="66" w:name="campaign-ownership-bug"/>
     <w:p>
       <w:pPr>
         <w:pStyle w:val="Heading3"/>
@@ -11892,7 +12085,7 @@
         <w:pStyle w:val="Compact"/>
         <w:numPr>
           <w:ilvl w:val="0"/>
-          <w:numId w:val="1473"/>
+          <w:numId w:val="1481"/>
         </w:numPr>
       </w:pPr>
       <w:r>
@@ -11916,7 +12109,7 @@
         <w:pStyle w:val="Compact"/>
         <w:numPr>
           <w:ilvl w:val="0"/>
-          <w:numId w:val="1474"/>
+          <w:numId w:val="1482"/>
         </w:numPr>
       </w:pPr>
       <w:r>
@@ -11940,7 +12133,7 @@
         <w:pStyle w:val="Compact"/>
         <w:numPr>
           <w:ilvl w:val="0"/>
-          <w:numId w:val="1475"/>
+          <w:numId w:val="1483"/>
         </w:numPr>
       </w:pPr>
       <w:r>
@@ -11952,7 +12145,7 @@
         <w:pStyle w:val="Compact"/>
         <w:numPr>
           <w:ilvl w:val="0"/>
-          <w:numId w:val="1476"/>
+          <w:numId w:val="1484"/>
         </w:numPr>
       </w:pPr>
       <w:r>
@@ -11964,7 +12157,7 @@
         <w:pStyle w:val="Compact"/>
         <w:numPr>
           <w:ilvl w:val="0"/>
-          <w:numId w:val="1477"/>
+          <w:numId w:val="1485"/>
         </w:numPr>
       </w:pPr>
       <w:r>
@@ -11976,7 +12169,7 @@
         <w:pStyle w:val="Compact"/>
         <w:numPr>
           <w:ilvl w:val="0"/>
-          <w:numId w:val="1478"/>
+          <w:numId w:val="1486"/>
         </w:numPr>
       </w:pPr>
       <w:r>
@@ -11992,8 +12185,8 @@
         <w:t xml:space="preserve">remains compatible.</w:t>
       </w:r>
     </w:p>
-    <w:bookmarkEnd w:id="65"/>
-    <w:bookmarkStart w:id="66" w:name="source-readable-fix"/>
+    <w:bookmarkEnd w:id="66"/>
+    <w:bookmarkStart w:id="67" w:name="source-readable-fix"/>
     <w:p>
       <w:pPr>
         <w:pStyle w:val="Heading3"/>
@@ -12007,7 +12200,7 @@
         <w:pStyle w:val="Compact"/>
         <w:numPr>
           <w:ilvl w:val="0"/>
-          <w:numId w:val="1479"/>
+          <w:numId w:val="1487"/>
         </w:numPr>
       </w:pPr>
       <w:r>
@@ -12019,7 +12212,7 @@
         <w:pStyle w:val="Compact"/>
         <w:numPr>
           <w:ilvl w:val="0"/>
-          <w:numId w:val="1480"/>
+          <w:numId w:val="1488"/>
         </w:numPr>
       </w:pPr>
       <w:r>
@@ -12031,7 +12224,7 @@
         <w:pStyle w:val="Compact"/>
         <w:numPr>
           <w:ilvl w:val="1"/>
-          <w:numId w:val="1481"/>
+          <w:numId w:val="1489"/>
         </w:numPr>
       </w:pPr>
       <w:r>
@@ -12049,7 +12242,7 @@
         <w:pStyle w:val="Compact"/>
         <w:numPr>
           <w:ilvl w:val="1"/>
-          <w:numId w:val="1481"/>
+          <w:numId w:val="1489"/>
         </w:numPr>
       </w:pPr>
       <w:r>
@@ -12067,7 +12260,7 @@
         <w:pStyle w:val="Compact"/>
         <w:numPr>
           <w:ilvl w:val="1"/>
-          <w:numId w:val="1481"/>
+          <w:numId w:val="1489"/>
         </w:numPr>
       </w:pPr>
       <w:r>
@@ -12085,7 +12278,7 @@
         <w:pStyle w:val="Compact"/>
         <w:numPr>
           <w:ilvl w:val="1"/>
-          <w:numId w:val="1481"/>
+          <w:numId w:val="1489"/>
         </w:numPr>
       </w:pPr>
       <w:r>
@@ -12103,7 +12296,7 @@
         <w:pStyle w:val="Compact"/>
         <w:numPr>
           <w:ilvl w:val="0"/>
-          <w:numId w:val="1482"/>
+          <w:numId w:val="1490"/>
         </w:numPr>
       </w:pPr>
       <w:r>
@@ -12115,7 +12308,7 @@
         <w:pStyle w:val="Compact"/>
         <w:numPr>
           <w:ilvl w:val="0"/>
-          <w:numId w:val="1483"/>
+          <w:numId w:val="1491"/>
         </w:numPr>
       </w:pPr>
       <w:r>
@@ -12127,15 +12320,15 @@
         <w:pStyle w:val="Compact"/>
         <w:numPr>
           <w:ilvl w:val="0"/>
-          <w:numId w:val="1484"/>
+          <w:numId w:val="1492"/>
         </w:numPr>
       </w:pPr>
       <w:r>
         <w:t xml:space="preserve">Campaign-created leads preserve campaign/list lineage.</w:t>
       </w:r>
     </w:p>
-    <w:bookmarkEnd w:id="66"/>
-    <w:bookmarkStart w:id="67" w:name="m2.1-testing-gate"/>
+    <w:bookmarkEnd w:id="67"/>
+    <w:bookmarkStart w:id="68" w:name="m2.1-testing-gate"/>
     <w:p>
       <w:pPr>
         <w:pStyle w:val="Heading3"/>
@@ -12149,7 +12342,7 @@
         <w:pStyle w:val="Compact"/>
         <w:numPr>
           <w:ilvl w:val="0"/>
-          <w:numId w:val="1485"/>
+          <w:numId w:val="1493"/>
         </w:numPr>
       </w:pPr>
       <w:r>
@@ -12161,7 +12354,7 @@
         <w:pStyle w:val="Compact"/>
         <w:numPr>
           <w:ilvl w:val="0"/>
-          <w:numId w:val="1486"/>
+          <w:numId w:val="1494"/>
         </w:numPr>
       </w:pPr>
       <w:r>
@@ -12173,7 +12366,7 @@
         <w:pStyle w:val="Compact"/>
         <w:numPr>
           <w:ilvl w:val="0"/>
-          <w:numId w:val="1487"/>
+          <w:numId w:val="1495"/>
         </w:numPr>
       </w:pPr>
       <w:r>
@@ -12185,7 +12378,7 @@
         <w:pStyle w:val="Compact"/>
         <w:numPr>
           <w:ilvl w:val="0"/>
-          <w:numId w:val="1488"/>
+          <w:numId w:val="1496"/>
         </w:numPr>
       </w:pPr>
       <w:r>
@@ -12197,7 +12390,7 @@
         <w:pStyle w:val="Compact"/>
         <w:numPr>
           <w:ilvl w:val="0"/>
-          <w:numId w:val="1489"/>
+          <w:numId w:val="1497"/>
         </w:numPr>
       </w:pPr>
       <w:r>
@@ -12209,7 +12402,7 @@
         <w:pStyle w:val="Compact"/>
         <w:numPr>
           <w:ilvl w:val="0"/>
-          <w:numId w:val="1490"/>
+          <w:numId w:val="1498"/>
         </w:numPr>
       </w:pPr>
       <w:r>
@@ -12221,7 +12414,7 @@
         <w:pStyle w:val="Compact"/>
         <w:numPr>
           <w:ilvl w:val="0"/>
-          <w:numId w:val="1491"/>
+          <w:numId w:val="1499"/>
         </w:numPr>
       </w:pPr>
       <w:r>
@@ -12233,7 +12426,7 @@
         <w:pStyle w:val="Compact"/>
         <w:numPr>
           <w:ilvl w:val="0"/>
-          <w:numId w:val="1492"/>
+          <w:numId w:val="1500"/>
         </w:numPr>
       </w:pPr>
       <w:r>
@@ -12245,16 +12438,16 @@
         <w:pStyle w:val="Compact"/>
         <w:numPr>
           <w:ilvl w:val="0"/>
-          <w:numId w:val="1493"/>
+          <w:numId w:val="1501"/>
         </w:numPr>
       </w:pPr>
       <w:r>
         <w:t xml:space="preserve">Progress dashboard updated.</w:t>
       </w:r>
     </w:p>
-    <w:bookmarkEnd w:id="67"/>
     <w:bookmarkEnd w:id="68"/>
-    <w:bookmarkStart w:id="75" w:name="X80216ddf01e64983419846741e514a0cb2a2ddb"/>
+    <w:bookmarkEnd w:id="69"/>
+    <w:bookmarkStart w:id="76" w:name="X80216ddf01e64983419846741e514a0cb2a2ddb"/>
     <w:p>
       <w:pPr>
         <w:pStyle w:val="Heading2"/>
@@ -12263,7 +12456,7 @@
         <w:t xml:space="preserve">M2.2 — Leads Enrichment Columns And Export CSV</w:t>
       </w:r>
     </w:p>
-    <w:bookmarkStart w:id="69" w:name="implementation-evidence-2026-05-02-5"/>
+    <w:bookmarkStart w:id="70" w:name="implementation-evidence-2026-05-02-5"/>
     <w:p>
       <w:pPr>
         <w:pStyle w:val="Heading3"/>
@@ -12277,7 +12470,7 @@
         <w:pStyle w:val="Compact"/>
         <w:numPr>
           <w:ilvl w:val="0"/>
-          <w:numId w:val="1494"/>
+          <w:numId w:val="1502"/>
         </w:numPr>
       </w:pPr>
       <w:r>
@@ -12304,7 +12497,7 @@
         <w:pStyle w:val="Compact"/>
         <w:numPr>
           <w:ilvl w:val="0"/>
-          <w:numId w:val="1495"/>
+          <w:numId w:val="1503"/>
         </w:numPr>
       </w:pPr>
       <w:r>
@@ -12376,7 +12569,7 @@
         <w:pStyle w:val="Compact"/>
         <w:numPr>
           <w:ilvl w:val="0"/>
-          <w:numId w:val="1496"/>
+          <w:numId w:val="1504"/>
         </w:numPr>
       </w:pPr>
       <w:r>
@@ -12403,7 +12596,7 @@
         <w:pStyle w:val="Compact"/>
         <w:numPr>
           <w:ilvl w:val="0"/>
-          <w:numId w:val="1497"/>
+          <w:numId w:val="1505"/>
         </w:numPr>
       </w:pPr>
       <w:r>
@@ -12415,7 +12608,7 @@
         <w:pStyle w:val="Compact"/>
         <w:numPr>
           <w:ilvl w:val="0"/>
-          <w:numId w:val="1498"/>
+          <w:numId w:val="1506"/>
         </w:numPr>
       </w:pPr>
       <w:r>
@@ -12442,7 +12635,7 @@
         <w:pStyle w:val="Compact"/>
         <w:numPr>
           <w:ilvl w:val="0"/>
-          <w:numId w:val="1499"/>
+          <w:numId w:val="1507"/>
         </w:numPr>
       </w:pPr>
       <w:r>
@@ -12454,7 +12647,7 @@
         <w:pStyle w:val="Compact"/>
         <w:numPr>
           <w:ilvl w:val="0"/>
-          <w:numId w:val="1500"/>
+          <w:numId w:val="1508"/>
         </w:numPr>
       </w:pPr>
       <w:r>
@@ -12481,7 +12674,7 @@
         <w:pStyle w:val="Compact"/>
         <w:numPr>
           <w:ilvl w:val="0"/>
-          <w:numId w:val="1501"/>
+          <w:numId w:val="1509"/>
         </w:numPr>
       </w:pPr>
       <w:r>
@@ -12523,7 +12716,7 @@
         <w:pStyle w:val="Compact"/>
         <w:numPr>
           <w:ilvl w:val="0"/>
-          <w:numId w:val="1502"/>
+          <w:numId w:val="1510"/>
         </w:numPr>
       </w:pPr>
       <w:r>
@@ -12559,15 +12752,15 @@
         <w:pStyle w:val="Compact"/>
         <w:numPr>
           <w:ilvl w:val="0"/>
-          <w:numId w:val="1503"/>
+          <w:numId w:val="1511"/>
         </w:numPr>
       </w:pPr>
       <w:r>
         <w:t xml:space="preserve">Targeted ESLint passed with 0 errors and existing warning debt only.</w:t>
       </w:r>
     </w:p>
-    <w:bookmarkEnd w:id="69"/>
-    <w:bookmarkStart w:id="70" w:name="leads-table-columns"/>
+    <w:bookmarkEnd w:id="70"/>
+    <w:bookmarkStart w:id="71" w:name="leads-table-columns"/>
     <w:p>
       <w:pPr>
         <w:pStyle w:val="Heading3"/>
@@ -12581,7 +12774,7 @@
         <w:pStyle w:val="Compact"/>
         <w:numPr>
           <w:ilvl w:val="0"/>
-          <w:numId w:val="1504"/>
+          <w:numId w:val="1512"/>
         </w:numPr>
       </w:pPr>
       <w:r>
@@ -12593,7 +12786,7 @@
         <w:pStyle w:val="Compact"/>
         <w:numPr>
           <w:ilvl w:val="0"/>
-          <w:numId w:val="1505"/>
+          <w:numId w:val="1513"/>
         </w:numPr>
       </w:pPr>
       <w:r>
@@ -12605,7 +12798,7 @@
         <w:pStyle w:val="Compact"/>
         <w:numPr>
           <w:ilvl w:val="1"/>
-          <w:numId w:val="1506"/>
+          <w:numId w:val="1514"/>
         </w:numPr>
       </w:pPr>
       <w:r>
@@ -12617,7 +12810,7 @@
         <w:pStyle w:val="Compact"/>
         <w:numPr>
           <w:ilvl w:val="1"/>
-          <w:numId w:val="1506"/>
+          <w:numId w:val="1514"/>
         </w:numPr>
       </w:pPr>
       <w:r>
@@ -12629,7 +12822,7 @@
         <w:pStyle w:val="Compact"/>
         <w:numPr>
           <w:ilvl w:val="1"/>
-          <w:numId w:val="1506"/>
+          <w:numId w:val="1514"/>
         </w:numPr>
       </w:pPr>
       <w:r>
@@ -12641,7 +12834,7 @@
         <w:pStyle w:val="Compact"/>
         <w:numPr>
           <w:ilvl w:val="1"/>
-          <w:numId w:val="1506"/>
+          <w:numId w:val="1514"/>
         </w:numPr>
       </w:pPr>
       <w:r>
@@ -12653,7 +12846,7 @@
         <w:pStyle w:val="Compact"/>
         <w:numPr>
           <w:ilvl w:val="1"/>
-          <w:numId w:val="1506"/>
+          <w:numId w:val="1514"/>
         </w:numPr>
       </w:pPr>
       <w:r>
@@ -12665,7 +12858,7 @@
         <w:pStyle w:val="Compact"/>
         <w:numPr>
           <w:ilvl w:val="1"/>
-          <w:numId w:val="1506"/>
+          <w:numId w:val="1514"/>
         </w:numPr>
       </w:pPr>
       <w:r>
@@ -12677,7 +12870,7 @@
         <w:pStyle w:val="Compact"/>
         <w:numPr>
           <w:ilvl w:val="1"/>
-          <w:numId w:val="1506"/>
+          <w:numId w:val="1514"/>
         </w:numPr>
       </w:pPr>
       <w:r>
@@ -12689,7 +12882,7 @@
         <w:pStyle w:val="Compact"/>
         <w:numPr>
           <w:ilvl w:val="1"/>
-          <w:numId w:val="1506"/>
+          <w:numId w:val="1514"/>
         </w:numPr>
       </w:pPr>
       <w:r>
@@ -12701,7 +12894,7 @@
         <w:pStyle w:val="Compact"/>
         <w:numPr>
           <w:ilvl w:val="0"/>
-          <w:numId w:val="1507"/>
+          <w:numId w:val="1515"/>
         </w:numPr>
       </w:pPr>
       <w:r>
@@ -12722,7 +12915,7 @@
         <w:pStyle w:val="Compact"/>
         <w:numPr>
           <w:ilvl w:val="0"/>
-          <w:numId w:val="1508"/>
+          <w:numId w:val="1516"/>
         </w:numPr>
       </w:pPr>
       <w:r>
@@ -12746,177 +12939,11 @@
         <w:pStyle w:val="Compact"/>
         <w:numPr>
           <w:ilvl w:val="0"/>
-          <w:numId w:val="1509"/>
+          <w:numId w:val="1517"/>
         </w:numPr>
       </w:pPr>
       <w:r>
         <w:t xml:space="preserve">Monthly Revenue renders raw/formatted revenue plus provenance chip:</w:t>
-      </w:r>
-    </w:p>
-    <w:p>
-      <w:pPr>
-        <w:pStyle w:val="Compact"/>
-        <w:numPr>
-          <w:ilvl w:val="1"/>
-          <w:numId w:val="1510"/>
-        </w:numPr>
-      </w:pPr>
-      <w:r>
-        <w:t xml:space="preserve">AI;</w:t>
-      </w:r>
-    </w:p>
-    <w:p>
-      <w:pPr>
-        <w:pStyle w:val="Compact"/>
-        <w:numPr>
-          <w:ilvl w:val="1"/>
-          <w:numId w:val="1510"/>
-        </w:numPr>
-      </w:pPr>
-      <w:r>
-        <w:t xml:space="preserve">CSV;</w:t>
-      </w:r>
-    </w:p>
-    <w:p>
-      <w:pPr>
-        <w:pStyle w:val="Compact"/>
-        <w:numPr>
-          <w:ilvl w:val="1"/>
-          <w:numId w:val="1510"/>
-        </w:numPr>
-      </w:pPr>
-      <w:r>
-        <w:t xml:space="preserve">MANUAL.</w:t>
-      </w:r>
-    </w:p>
-    <w:p>
-      <w:pPr>
-        <w:pStyle w:val="Compact"/>
-        <w:numPr>
-          <w:ilvl w:val="0"/>
-          <w:numId w:val="1511"/>
-        </w:numPr>
-      </w:pPr>
-      <w:r>
-        <w:t xml:space="preserve">Empty revenue renders</w:t>
-      </w:r>
-      <w:r>
-        <w:t xml:space="preserve"> </w:t>
-      </w:r>
-      <w:r>
-        <w:rPr>
-          <w:rStyle w:val="VerbatimChar"/>
-        </w:rPr>
-        <w:t xml:space="preserve">—</w:t>
-      </w:r>
-      <w:r>
-        <w:t xml:space="preserve">.</w:t>
-      </w:r>
-    </w:p>
-    <w:p>
-      <w:pPr>
-        <w:pStyle w:val="Compact"/>
-        <w:numPr>
-          <w:ilvl w:val="0"/>
-          <w:numId w:val="1512"/>
-        </w:numPr>
-      </w:pPr>
-      <w:r>
-        <w:t xml:space="preserve">Source cell uses two-line readable source/list pattern.</w:t>
-      </w:r>
-    </w:p>
-    <w:p>
-      <w:pPr>
-        <w:pStyle w:val="Compact"/>
-        <w:numPr>
-          <w:ilvl w:val="0"/>
-          <w:numId w:val="1513"/>
-        </w:numPr>
-      </w:pPr>
-      <w:r>
-        <w:t xml:space="preserve">Status pill styles match prototype.</w:t>
-      </w:r>
-    </w:p>
-    <w:p>
-      <w:pPr>
-        <w:pStyle w:val="Compact"/>
-        <w:numPr>
-          <w:ilvl w:val="0"/>
-          <w:numId w:val="1514"/>
-        </w:numPr>
-      </w:pPr>
-      <w:r>
-        <w:t xml:space="preserve">Avatar initials match prototype density.</w:t>
-      </w:r>
-    </w:p>
-    <w:bookmarkEnd w:id="70"/>
-    <w:bookmarkStart w:id="71" w:name="data-plumbing"/>
-    <w:p>
-      <w:pPr>
-        <w:pStyle w:val="Heading3"/>
-      </w:pPr>
-      <w:r>
-        <w:t xml:space="preserve">Data plumbing</w:t>
-      </w:r>
-    </w:p>
-    <w:p>
-      <w:pPr>
-        <w:pStyle w:val="Compact"/>
-        <w:numPr>
-          <w:ilvl w:val="0"/>
-          <w:numId w:val="1515"/>
-        </w:numPr>
-      </w:pPr>
-      <w:r>
-        <w:t xml:space="preserve">Confirm data source for industry:</w:t>
-      </w:r>
-    </w:p>
-    <w:p>
-      <w:pPr>
-        <w:pStyle w:val="Compact"/>
-        <w:numPr>
-          <w:ilvl w:val="1"/>
-          <w:numId w:val="1516"/>
-        </w:numPr>
-      </w:pPr>
-      <w:r>
-        <w:t xml:space="preserve">existing AI classifier field;</w:t>
-      </w:r>
-    </w:p>
-    <w:p>
-      <w:pPr>
-        <w:pStyle w:val="Compact"/>
-        <w:numPr>
-          <w:ilvl w:val="1"/>
-          <w:numId w:val="1516"/>
-        </w:numPr>
-      </w:pPr>
-      <w:r>
-        <w:t xml:space="preserve">CSV value;</w:t>
-      </w:r>
-    </w:p>
-    <w:p>
-      <w:pPr>
-        <w:pStyle w:val="Compact"/>
-        <w:numPr>
-          <w:ilvl w:val="1"/>
-          <w:numId w:val="1516"/>
-        </w:numPr>
-      </w:pPr>
-      <w:r>
-        <w:t xml:space="preserve">manual override.</w:t>
-      </w:r>
-    </w:p>
-    <w:p>
-      <w:pPr>
-        <w:pStyle w:val="Compact"/>
-        <w:numPr>
-          <w:ilvl w:val="0"/>
-          <w:numId w:val="1517"/>
-        </w:numPr>
-      </w:pPr>
-      <w:r>
-        <w:t xml:space="preserve">Confirm data source for monthly revenue:</w:t>
       </w:r>
     </w:p>
     <w:p>
@@ -12928,7 +12955,7 @@
         </w:numPr>
       </w:pPr>
       <w:r>
-        <w:t xml:space="preserve">existing AI extraction;</w:t>
+        <w:t xml:space="preserve">AI;</w:t>
       </w:r>
     </w:p>
     <w:p>
@@ -12940,7 +12967,7 @@
         </w:numPr>
       </w:pPr>
       <w:r>
-        <w:t xml:space="preserve">CSV import;</w:t>
+        <w:t xml:space="preserve">CSV;</w:t>
       </w:r>
     </w:p>
     <w:p>
@@ -12952,6 +12979,172 @@
         </w:numPr>
       </w:pPr>
       <w:r>
+        <w:t xml:space="preserve">MANUAL.</w:t>
+      </w:r>
+    </w:p>
+    <w:p>
+      <w:pPr>
+        <w:pStyle w:val="Compact"/>
+        <w:numPr>
+          <w:ilvl w:val="0"/>
+          <w:numId w:val="1519"/>
+        </w:numPr>
+      </w:pPr>
+      <w:r>
+        <w:t xml:space="preserve">Empty revenue renders</w:t>
+      </w:r>
+      <w:r>
+        <w:t xml:space="preserve"> </w:t>
+      </w:r>
+      <w:r>
+        <w:rPr>
+          <w:rStyle w:val="VerbatimChar"/>
+        </w:rPr>
+        <w:t xml:space="preserve">—</w:t>
+      </w:r>
+      <w:r>
+        <w:t xml:space="preserve">.</w:t>
+      </w:r>
+    </w:p>
+    <w:p>
+      <w:pPr>
+        <w:pStyle w:val="Compact"/>
+        <w:numPr>
+          <w:ilvl w:val="0"/>
+          <w:numId w:val="1520"/>
+        </w:numPr>
+      </w:pPr>
+      <w:r>
+        <w:t xml:space="preserve">Source cell uses two-line readable source/list pattern.</w:t>
+      </w:r>
+    </w:p>
+    <w:p>
+      <w:pPr>
+        <w:pStyle w:val="Compact"/>
+        <w:numPr>
+          <w:ilvl w:val="0"/>
+          <w:numId w:val="1521"/>
+        </w:numPr>
+      </w:pPr>
+      <w:r>
+        <w:t xml:space="preserve">Status pill styles match prototype.</w:t>
+      </w:r>
+    </w:p>
+    <w:p>
+      <w:pPr>
+        <w:pStyle w:val="Compact"/>
+        <w:numPr>
+          <w:ilvl w:val="0"/>
+          <w:numId w:val="1522"/>
+        </w:numPr>
+      </w:pPr>
+      <w:r>
+        <w:t xml:space="preserve">Avatar initials match prototype density.</w:t>
+      </w:r>
+    </w:p>
+    <w:bookmarkEnd w:id="71"/>
+    <w:bookmarkStart w:id="72" w:name="data-plumbing"/>
+    <w:p>
+      <w:pPr>
+        <w:pStyle w:val="Heading3"/>
+      </w:pPr>
+      <w:r>
+        <w:t xml:space="preserve">Data plumbing</w:t>
+      </w:r>
+    </w:p>
+    <w:p>
+      <w:pPr>
+        <w:pStyle w:val="Compact"/>
+        <w:numPr>
+          <w:ilvl w:val="0"/>
+          <w:numId w:val="1523"/>
+        </w:numPr>
+      </w:pPr>
+      <w:r>
+        <w:t xml:space="preserve">Confirm data source for industry:</w:t>
+      </w:r>
+    </w:p>
+    <w:p>
+      <w:pPr>
+        <w:pStyle w:val="Compact"/>
+        <w:numPr>
+          <w:ilvl w:val="1"/>
+          <w:numId w:val="1524"/>
+        </w:numPr>
+      </w:pPr>
+      <w:r>
+        <w:t xml:space="preserve">existing AI classifier field;</w:t>
+      </w:r>
+    </w:p>
+    <w:p>
+      <w:pPr>
+        <w:pStyle w:val="Compact"/>
+        <w:numPr>
+          <w:ilvl w:val="1"/>
+          <w:numId w:val="1524"/>
+        </w:numPr>
+      </w:pPr>
+      <w:r>
+        <w:t xml:space="preserve">CSV value;</w:t>
+      </w:r>
+    </w:p>
+    <w:p>
+      <w:pPr>
+        <w:pStyle w:val="Compact"/>
+        <w:numPr>
+          <w:ilvl w:val="1"/>
+          <w:numId w:val="1524"/>
+        </w:numPr>
+      </w:pPr>
+      <w:r>
+        <w:t xml:space="preserve">manual override.</w:t>
+      </w:r>
+    </w:p>
+    <w:p>
+      <w:pPr>
+        <w:pStyle w:val="Compact"/>
+        <w:numPr>
+          <w:ilvl w:val="0"/>
+          <w:numId w:val="1525"/>
+        </w:numPr>
+      </w:pPr>
+      <w:r>
+        <w:t xml:space="preserve">Confirm data source for monthly revenue:</w:t>
+      </w:r>
+    </w:p>
+    <w:p>
+      <w:pPr>
+        <w:pStyle w:val="Compact"/>
+        <w:numPr>
+          <w:ilvl w:val="1"/>
+          <w:numId w:val="1526"/>
+        </w:numPr>
+      </w:pPr>
+      <w:r>
+        <w:t xml:space="preserve">existing AI extraction;</w:t>
+      </w:r>
+    </w:p>
+    <w:p>
+      <w:pPr>
+        <w:pStyle w:val="Compact"/>
+        <w:numPr>
+          <w:ilvl w:val="1"/>
+          <w:numId w:val="1526"/>
+        </w:numPr>
+      </w:pPr>
+      <w:r>
+        <w:t xml:space="preserve">CSV import;</w:t>
+      </w:r>
+    </w:p>
+    <w:p>
+      <w:pPr>
+        <w:pStyle w:val="Compact"/>
+        <w:numPr>
+          <w:ilvl w:val="1"/>
+          <w:numId w:val="1526"/>
+        </w:numPr>
+      </w:pPr>
+      <w:r>
         <w:t xml:space="preserve">manual field.</w:t>
       </w:r>
     </w:p>
@@ -12960,7 +13153,7 @@
         <w:pStyle w:val="Compact"/>
         <w:numPr>
           <w:ilvl w:val="0"/>
-          <w:numId w:val="1519"/>
+          <w:numId w:val="1527"/>
         </w:numPr>
       </w:pPr>
       <w:r>
@@ -12972,7 +13165,7 @@
         <w:pStyle w:val="Compact"/>
         <w:numPr>
           <w:ilvl w:val="0"/>
-          <w:numId w:val="1520"/>
+          <w:numId w:val="1528"/>
         </w:numPr>
       </w:pPr>
       <w:r>
@@ -12984,15 +13177,15 @@
         <w:pStyle w:val="Compact"/>
         <w:numPr>
           <w:ilvl w:val="0"/>
-          <w:numId w:val="1521"/>
+          <w:numId w:val="1529"/>
         </w:numPr>
       </w:pPr>
       <w:r>
         <w:t xml:space="preserve">Rep scope applies to all enrichment queries.</w:t>
       </w:r>
     </w:p>
-    <w:bookmarkEnd w:id="71"/>
-    <w:bookmarkStart w:id="72" w:name="export-csv"/>
+    <w:bookmarkEnd w:id="72"/>
+    <w:bookmarkStart w:id="73" w:name="export-csv"/>
     <w:p>
       <w:pPr>
         <w:pStyle w:val="Heading3"/>
@@ -13006,7 +13199,7 @@
         <w:pStyle w:val="Compact"/>
         <w:numPr>
           <w:ilvl w:val="0"/>
-          <w:numId w:val="1522"/>
+          <w:numId w:val="1530"/>
         </w:numPr>
       </w:pPr>
       <w:r>
@@ -13027,7 +13220,7 @@
         <w:pStyle w:val="Compact"/>
         <w:numPr>
           <w:ilvl w:val="0"/>
-          <w:numId w:val="1523"/>
+          <w:numId w:val="1531"/>
         </w:numPr>
       </w:pPr>
       <w:r>
@@ -13039,7 +13232,7 @@
         <w:pStyle w:val="Compact"/>
         <w:numPr>
           <w:ilvl w:val="0"/>
-          <w:numId w:val="1524"/>
+          <w:numId w:val="1532"/>
         </w:numPr>
       </w:pPr>
       <w:r>
@@ -13051,7 +13244,7 @@
         <w:pStyle w:val="Compact"/>
         <w:numPr>
           <w:ilvl w:val="0"/>
-          <w:numId w:val="1525"/>
+          <w:numId w:val="1533"/>
         </w:numPr>
       </w:pPr>
       <w:r>
@@ -13063,7 +13256,7 @@
         <w:pStyle w:val="Compact"/>
         <w:numPr>
           <w:ilvl w:val="0"/>
-          <w:numId w:val="1526"/>
+          <w:numId w:val="1534"/>
         </w:numPr>
       </w:pPr>
       <w:r>
@@ -13075,7 +13268,7 @@
         <w:pStyle w:val="Compact"/>
         <w:numPr>
           <w:ilvl w:val="0"/>
-          <w:numId w:val="1527"/>
+          <w:numId w:val="1535"/>
         </w:numPr>
       </w:pPr>
       <w:r>
@@ -13087,7 +13280,7 @@
         <w:pStyle w:val="Compact"/>
         <w:numPr>
           <w:ilvl w:val="1"/>
-          <w:numId w:val="1528"/>
+          <w:numId w:val="1536"/>
         </w:numPr>
       </w:pPr>
       <w:r>
@@ -13099,7 +13292,7 @@
         <w:pStyle w:val="Compact"/>
         <w:numPr>
           <w:ilvl w:val="1"/>
-          <w:numId w:val="1528"/>
+          <w:numId w:val="1536"/>
         </w:numPr>
       </w:pPr>
       <w:r>
@@ -13111,7 +13304,7 @@
         <w:pStyle w:val="Compact"/>
         <w:numPr>
           <w:ilvl w:val="1"/>
-          <w:numId w:val="1528"/>
+          <w:numId w:val="1536"/>
         </w:numPr>
       </w:pPr>
       <w:r>
@@ -13123,7 +13316,7 @@
         <w:pStyle w:val="Compact"/>
         <w:numPr>
           <w:ilvl w:val="1"/>
-          <w:numId w:val="1528"/>
+          <w:numId w:val="1536"/>
         </w:numPr>
       </w:pPr>
       <w:r>
@@ -13135,7 +13328,7 @@
         <w:pStyle w:val="Compact"/>
         <w:numPr>
           <w:ilvl w:val="1"/>
-          <w:numId w:val="1528"/>
+          <w:numId w:val="1536"/>
         </w:numPr>
       </w:pPr>
       <w:r>
@@ -13147,7 +13340,7 @@
         <w:pStyle w:val="Compact"/>
         <w:numPr>
           <w:ilvl w:val="1"/>
-          <w:numId w:val="1528"/>
+          <w:numId w:val="1536"/>
         </w:numPr>
       </w:pPr>
       <w:r>
@@ -13159,7 +13352,7 @@
         <w:pStyle w:val="Compact"/>
         <w:numPr>
           <w:ilvl w:val="0"/>
-          <w:numId w:val="1529"/>
+          <w:numId w:val="1537"/>
         </w:numPr>
       </w:pPr>
       <w:r>
@@ -13171,15 +13364,15 @@
         <w:pStyle w:val="Compact"/>
         <w:numPr>
           <w:ilvl w:val="0"/>
-          <w:numId w:val="1530"/>
+          <w:numId w:val="1538"/>
         </w:numPr>
       </w:pPr>
       <w:r>
         <w:t xml:space="preserve">CSV escaping handles commas, quotes, line breaks.</w:t>
       </w:r>
     </w:p>
-    <w:bookmarkEnd w:id="72"/>
-    <w:bookmarkStart w:id="73" w:name="m2.2-style-isolation"/>
+    <w:bookmarkEnd w:id="73"/>
+    <w:bookmarkStart w:id="74" w:name="m2.2-style-isolation"/>
     <w:p>
       <w:pPr>
         <w:pStyle w:val="Heading3"/>
@@ -13193,7 +13386,7 @@
         <w:pStyle w:val="Compact"/>
         <w:numPr>
           <w:ilvl w:val="0"/>
-          <w:numId w:val="1531"/>
+          <w:numId w:val="1539"/>
         </w:numPr>
       </w:pPr>
       <w:r>
@@ -13205,7 +13398,7 @@
         <w:pStyle w:val="Compact"/>
         <w:numPr>
           <w:ilvl w:val="0"/>
-          <w:numId w:val="1532"/>
+          <w:numId w:val="1540"/>
         </w:numPr>
       </w:pPr>
       <w:r>
@@ -13217,7 +13410,7 @@
         <w:pStyle w:val="Compact"/>
         <w:numPr>
           <w:ilvl w:val="0"/>
-          <w:numId w:val="1533"/>
+          <w:numId w:val="1541"/>
         </w:numPr>
       </w:pPr>
       <w:r>
@@ -13229,7 +13422,7 @@
         <w:pStyle w:val="Compact"/>
         <w:numPr>
           <w:ilvl w:val="0"/>
-          <w:numId w:val="1534"/>
+          <w:numId w:val="1542"/>
         </w:numPr>
       </w:pPr>
       <w:r>
@@ -13241,15 +13434,15 @@
         <w:pStyle w:val="Compact"/>
         <w:numPr>
           <w:ilvl w:val="0"/>
-          <w:numId w:val="1535"/>
+          <w:numId w:val="1543"/>
         </w:numPr>
       </w:pPr>
       <w:r>
         <w:t xml:space="preserve">Ensure text truncation/line wrapping is deliberate and not overlapping.</w:t>
       </w:r>
     </w:p>
-    <w:bookmarkEnd w:id="73"/>
-    <w:bookmarkStart w:id="74" w:name="m2.2-testing-gate"/>
+    <w:bookmarkEnd w:id="74"/>
+    <w:bookmarkStart w:id="75" w:name="m2.2-testing-gate"/>
     <w:p>
       <w:pPr>
         <w:pStyle w:val="Heading3"/>
@@ -13263,7 +13456,7 @@
         <w:pStyle w:val="Compact"/>
         <w:numPr>
           <w:ilvl w:val="0"/>
-          <w:numId w:val="1536"/>
+          <w:numId w:val="1544"/>
         </w:numPr>
       </w:pPr>
       <w:r>
@@ -13275,7 +13468,7 @@
         <w:pStyle w:val="Compact"/>
         <w:numPr>
           <w:ilvl w:val="0"/>
-          <w:numId w:val="1537"/>
+          <w:numId w:val="1545"/>
         </w:numPr>
       </w:pPr>
       <w:r>
@@ -13287,7 +13480,7 @@
         <w:pStyle w:val="Compact"/>
         <w:numPr>
           <w:ilvl w:val="0"/>
-          <w:numId w:val="1538"/>
+          <w:numId w:val="1546"/>
         </w:numPr>
       </w:pPr>
       <w:r>
@@ -13299,7 +13492,7 @@
         <w:pStyle w:val="Compact"/>
         <w:numPr>
           <w:ilvl w:val="0"/>
-          <w:numId w:val="1539"/>
+          <w:numId w:val="1547"/>
         </w:numPr>
       </w:pPr>
       <w:r>
@@ -13311,7 +13504,7 @@
         <w:pStyle w:val="Compact"/>
         <w:numPr>
           <w:ilvl w:val="0"/>
-          <w:numId w:val="1540"/>
+          <w:numId w:val="1548"/>
         </w:numPr>
       </w:pPr>
       <w:r>
@@ -13323,7 +13516,7 @@
         <w:pStyle w:val="Compact"/>
         <w:numPr>
           <w:ilvl w:val="0"/>
-          <w:numId w:val="1541"/>
+          <w:numId w:val="1549"/>
         </w:numPr>
       </w:pPr>
       <w:r>
@@ -13335,7 +13528,7 @@
         <w:pStyle w:val="Compact"/>
         <w:numPr>
           <w:ilvl w:val="0"/>
-          <w:numId w:val="1542"/>
+          <w:numId w:val="1550"/>
         </w:numPr>
       </w:pPr>
       <w:r>
@@ -13347,16 +13540,16 @@
         <w:pStyle w:val="Compact"/>
         <w:numPr>
           <w:ilvl w:val="0"/>
-          <w:numId w:val="1543"/>
+          <w:numId w:val="1551"/>
         </w:numPr>
       </w:pPr>
       <w:r>
         <w:t xml:space="preserve">Progress dashboard updated.</w:t>
       </w:r>
     </w:p>
-    <w:bookmarkEnd w:id="74"/>
     <w:bookmarkEnd w:id="75"/>
-    <w:bookmarkStart w:id="86" w:name="m2.3-ai-retarget-campaigns"/>
+    <w:bookmarkEnd w:id="76"/>
+    <w:bookmarkStart w:id="87" w:name="m2.3-ai-retarget-campaigns"/>
     <w:p>
       <w:pPr>
         <w:pStyle w:val="Heading2"/>
@@ -13365,7 +13558,7 @@
         <w:t xml:space="preserve">M2.3 — AI Retarget Campaigns</w:t>
       </w:r>
     </w:p>
-    <w:bookmarkStart w:id="76" w:name="implementation-evidence-2026-05-02-6"/>
+    <w:bookmarkStart w:id="77" w:name="implementation-evidence-2026-05-02-6"/>
     <w:p>
       <w:pPr>
         <w:pStyle w:val="Heading3"/>
@@ -13379,7 +13572,7 @@
         <w:pStyle w:val="Compact"/>
         <w:numPr>
           <w:ilvl w:val="0"/>
-          <w:numId w:val="1544"/>
+          <w:numId w:val="1552"/>
         </w:numPr>
       </w:pPr>
       <w:r>
@@ -13427,7 +13620,7 @@
         <w:pStyle w:val="Compact"/>
         <w:numPr>
           <w:ilvl w:val="0"/>
-          <w:numId w:val="1545"/>
+          <w:numId w:val="1553"/>
         </w:numPr>
       </w:pPr>
       <w:r>
@@ -13439,7 +13632,7 @@
         <w:pStyle w:val="Compact"/>
         <w:numPr>
           <w:ilvl w:val="0"/>
-          <w:numId w:val="1546"/>
+          <w:numId w:val="1554"/>
         </w:numPr>
       </w:pPr>
       <w:r>
@@ -13451,7 +13644,7 @@
         <w:pStyle w:val="Compact"/>
         <w:numPr>
           <w:ilvl w:val="0"/>
-          <w:numId w:val="1547"/>
+          <w:numId w:val="1555"/>
         </w:numPr>
       </w:pPr>
       <w:r>
@@ -13463,7 +13656,7 @@
         <w:pStyle w:val="Compact"/>
         <w:numPr>
           <w:ilvl w:val="0"/>
-          <w:numId w:val="1548"/>
+          <w:numId w:val="1556"/>
         </w:numPr>
       </w:pPr>
       <w:r>
@@ -13475,7 +13668,7 @@
         <w:pStyle w:val="Compact"/>
         <w:numPr>
           <w:ilvl w:val="0"/>
-          <w:numId w:val="1549"/>
+          <w:numId w:val="1557"/>
         </w:numPr>
       </w:pPr>
       <w:r>
@@ -13529,7 +13722,7 @@
         <w:pStyle w:val="Compact"/>
         <w:numPr>
           <w:ilvl w:val="0"/>
-          <w:numId w:val="1550"/>
+          <w:numId w:val="1558"/>
         </w:numPr>
       </w:pPr>
       <w:r>
@@ -13541,7 +13734,7 @@
         <w:pStyle w:val="Compact"/>
         <w:numPr>
           <w:ilvl w:val="0"/>
-          <w:numId w:val="1551"/>
+          <w:numId w:val="1559"/>
         </w:numPr>
       </w:pPr>
       <w:r>
@@ -13568,7 +13761,7 @@
         <w:pStyle w:val="Compact"/>
         <w:numPr>
           <w:ilvl w:val="0"/>
-          <w:numId w:val="1552"/>
+          <w:numId w:val="1560"/>
         </w:numPr>
       </w:pPr>
       <w:r>
@@ -13610,7 +13803,7 @@
         <w:pStyle w:val="Compact"/>
         <w:numPr>
           <w:ilvl w:val="0"/>
-          <w:numId w:val="1553"/>
+          <w:numId w:val="1561"/>
         </w:numPr>
       </w:pPr>
       <w:r>
@@ -13637,7 +13830,7 @@
         <w:pStyle w:val="Compact"/>
         <w:numPr>
           <w:ilvl w:val="0"/>
-          <w:numId w:val="1554"/>
+          <w:numId w:val="1562"/>
         </w:numPr>
       </w:pPr>
       <w:r>
@@ -13649,7 +13842,7 @@
         <w:pStyle w:val="Compact"/>
         <w:numPr>
           <w:ilvl w:val="0"/>
-          <w:numId w:val="1555"/>
+          <w:numId w:val="1563"/>
         </w:numPr>
       </w:pPr>
       <w:r>
@@ -13661,7 +13854,7 @@
         <w:pStyle w:val="Compact"/>
         <w:numPr>
           <w:ilvl w:val="0"/>
-          <w:numId w:val="1556"/>
+          <w:numId w:val="1564"/>
         </w:numPr>
       </w:pPr>
       <w:r>
@@ -13683,8 +13876,8 @@
         <w:t xml:space="preserve">— 5/5 passed after cap tests; server build passed.</w:t>
       </w:r>
     </w:p>
-    <w:bookmarkEnd w:id="76"/>
-    <w:bookmarkStart w:id="77" w:name="scope-lock-for-ai-retarget"/>
+    <w:bookmarkEnd w:id="77"/>
+    <w:bookmarkStart w:id="78" w:name="scope-lock-for-ai-retarget"/>
     <w:p>
       <w:pPr>
         <w:pStyle w:val="Heading3"/>
@@ -13698,7 +13891,7 @@
         <w:pStyle w:val="Compact"/>
         <w:numPr>
           <w:ilvl w:val="0"/>
-          <w:numId w:val="1557"/>
+          <w:numId w:val="1565"/>
         </w:numPr>
       </w:pPr>
       <w:r>
@@ -13710,7 +13903,7 @@
         <w:pStyle w:val="Compact"/>
         <w:numPr>
           <w:ilvl w:val="0"/>
-          <w:numId w:val="1558"/>
+          <w:numId w:val="1566"/>
         </w:numPr>
       </w:pPr>
       <w:r>
@@ -13722,7 +13915,7 @@
         <w:pStyle w:val="Compact"/>
         <w:numPr>
           <w:ilvl w:val="0"/>
-          <w:numId w:val="1559"/>
+          <w:numId w:val="1567"/>
         </w:numPr>
       </w:pPr>
       <w:r>
@@ -13734,7 +13927,7 @@
         <w:pStyle w:val="Compact"/>
         <w:numPr>
           <w:ilvl w:val="0"/>
-          <w:numId w:val="1560"/>
+          <w:numId w:val="1568"/>
         </w:numPr>
       </w:pPr>
       <w:r>
@@ -13746,7 +13939,7 @@
         <w:pStyle w:val="Compact"/>
         <w:numPr>
           <w:ilvl w:val="0"/>
-          <w:numId w:val="1561"/>
+          <w:numId w:val="1569"/>
         </w:numPr>
       </w:pPr>
       <w:r>
@@ -13758,7 +13951,7 @@
         <w:pStyle w:val="Compact"/>
         <w:numPr>
           <w:ilvl w:val="0"/>
-          <w:numId w:val="1562"/>
+          <w:numId w:val="1570"/>
         </w:numPr>
       </w:pPr>
       <w:r>
@@ -13770,7 +13963,7 @@
         <w:pStyle w:val="Compact"/>
         <w:numPr>
           <w:ilvl w:val="1"/>
-          <w:numId w:val="1563"/>
+          <w:numId w:val="1571"/>
         </w:numPr>
       </w:pPr>
       <w:r>
@@ -13797,7 +13990,7 @@
         <w:pStyle w:val="Compact"/>
         <w:numPr>
           <w:ilvl w:val="1"/>
-          <w:numId w:val="1563"/>
+          <w:numId w:val="1571"/>
         </w:numPr>
       </w:pPr>
       <w:r>
@@ -13819,8 +14012,8 @@
         <w:t xml:space="preserve">scoping correctness.</w:t>
       </w:r>
     </w:p>
-    <w:bookmarkEnd w:id="77"/>
-    <w:bookmarkStart w:id="78" w:name="database-model"/>
+    <w:bookmarkEnd w:id="78"/>
+    <w:bookmarkStart w:id="79" w:name="database-model"/>
     <w:p>
       <w:pPr>
         <w:pStyle w:val="Heading3"/>
@@ -13834,7 +14027,7 @@
         <w:pStyle w:val="Compact"/>
         <w:numPr>
           <w:ilvl w:val="0"/>
-          <w:numId w:val="1564"/>
+          <w:numId w:val="1572"/>
         </w:numPr>
       </w:pPr>
       <w:r>
@@ -13876,7 +14069,7 @@
         <w:pStyle w:val="Compact"/>
         <w:numPr>
           <w:ilvl w:val="0"/>
-          <w:numId w:val="1565"/>
+          <w:numId w:val="1573"/>
         </w:numPr>
       </w:pPr>
       <w:r>
@@ -13900,7 +14093,7 @@
         <w:pStyle w:val="Compact"/>
         <w:numPr>
           <w:ilvl w:val="0"/>
-          <w:numId w:val="1566"/>
+          <w:numId w:val="1574"/>
         </w:numPr>
       </w:pPr>
       <w:r>
@@ -13924,7 +14117,7 @@
         <w:pStyle w:val="Compact"/>
         <w:numPr>
           <w:ilvl w:val="0"/>
-          <w:numId w:val="1567"/>
+          <w:numId w:val="1575"/>
         </w:numPr>
       </w:pPr>
       <w:r>
@@ -13936,7 +14129,7 @@
         <w:pStyle w:val="Compact"/>
         <w:numPr>
           <w:ilvl w:val="0"/>
-          <w:numId w:val="1568"/>
+          <w:numId w:val="1576"/>
         </w:numPr>
       </w:pPr>
       <w:r>
@@ -13948,7 +14141,7 @@
         <w:pStyle w:val="Compact"/>
         <w:numPr>
           <w:ilvl w:val="0"/>
-          <w:numId w:val="1569"/>
+          <w:numId w:val="1577"/>
         </w:numPr>
       </w:pPr>
       <w:r>
@@ -13960,7 +14153,7 @@
         <w:pStyle w:val="Compact"/>
         <w:numPr>
           <w:ilvl w:val="0"/>
-          <w:numId w:val="1570"/>
+          <w:numId w:val="1578"/>
         </w:numPr>
       </w:pPr>
       <w:r>
@@ -13972,7 +14165,7 @@
         <w:pStyle w:val="Compact"/>
         <w:numPr>
           <w:ilvl w:val="0"/>
-          <w:numId w:val="1571"/>
+          <w:numId w:val="1579"/>
         </w:numPr>
       </w:pPr>
       <w:r>
@@ -13984,7 +14177,7 @@
         <w:pStyle w:val="Compact"/>
         <w:numPr>
           <w:ilvl w:val="0"/>
-          <w:numId w:val="1572"/>
+          <w:numId w:val="1580"/>
         </w:numPr>
       </w:pPr>
       <w:r>
@@ -13996,7 +14189,7 @@
         <w:pStyle w:val="Compact"/>
         <w:numPr>
           <w:ilvl w:val="0"/>
-          <w:numId w:val="1573"/>
+          <w:numId w:val="1581"/>
         </w:numPr>
       </w:pPr>
       <w:r>
@@ -14008,7 +14201,7 @@
         <w:pStyle w:val="Compact"/>
         <w:numPr>
           <w:ilvl w:val="0"/>
-          <w:numId w:val="1574"/>
+          <w:numId w:val="1582"/>
         </w:numPr>
       </w:pPr>
       <w:r>
@@ -14020,7 +14213,7 @@
         <w:pStyle w:val="Compact"/>
         <w:numPr>
           <w:ilvl w:val="0"/>
-          <w:numId w:val="1575"/>
+          <w:numId w:val="1583"/>
         </w:numPr>
       </w:pPr>
       <w:r>
@@ -14032,7 +14225,7 @@
         <w:pStyle w:val="Compact"/>
         <w:numPr>
           <w:ilvl w:val="0"/>
-          <w:numId w:val="1576"/>
+          <w:numId w:val="1584"/>
         </w:numPr>
       </w:pPr>
       <w:r>
@@ -14044,7 +14237,7 @@
         <w:pStyle w:val="Compact"/>
         <w:numPr>
           <w:ilvl w:val="0"/>
-          <w:numId w:val="1577"/>
+          <w:numId w:val="1585"/>
         </w:numPr>
       </w:pPr>
       <w:r>
@@ -14071,7 +14264,7 @@
         <w:pStyle w:val="Compact"/>
         <w:numPr>
           <w:ilvl w:val="0"/>
-          <w:numId w:val="1578"/>
+          <w:numId w:val="1586"/>
         </w:numPr>
       </w:pPr>
       <w:r>
@@ -14083,15 +14276,15 @@
         <w:pStyle w:val="Compact"/>
         <w:numPr>
           <w:ilvl w:val="0"/>
-          <w:numId w:val="1579"/>
+          <w:numId w:val="1587"/>
         </w:numPr>
       </w:pPr>
       <w:r>
         <w:t xml:space="preserve">Ensure expired cohorts are ignored safely.</w:t>
       </w:r>
     </w:p>
-    <w:bookmarkEnd w:id="78"/>
-    <w:bookmarkStart w:id="79" w:name="cohort-generation"/>
+    <w:bookmarkEnd w:id="79"/>
+    <w:bookmarkStart w:id="80" w:name="cohort-generation"/>
     <w:p>
       <w:pPr>
         <w:pStyle w:val="Heading3"/>
@@ -14105,7 +14298,7 @@
         <w:pStyle w:val="Compact"/>
         <w:numPr>
           <w:ilvl w:val="0"/>
-          <w:numId w:val="1580"/>
+          <w:numId w:val="1588"/>
         </w:numPr>
       </w:pPr>
       <w:r>
@@ -14117,7 +14310,7 @@
         <w:pStyle w:val="Compact"/>
         <w:numPr>
           <w:ilvl w:val="0"/>
-          <w:numId w:val="1581"/>
+          <w:numId w:val="1589"/>
         </w:numPr>
       </w:pPr>
       <w:r>
@@ -14144,7 +14337,7 @@
         <w:pStyle w:val="Compact"/>
         <w:numPr>
           <w:ilvl w:val="0"/>
-          <w:numId w:val="1582"/>
+          <w:numId w:val="1590"/>
         </w:numPr>
       </w:pPr>
       <w:r>
@@ -14171,7 +14364,7 @@
         <w:pStyle w:val="Compact"/>
         <w:numPr>
           <w:ilvl w:val="0"/>
-          <w:numId w:val="1583"/>
+          <w:numId w:val="1591"/>
         </w:numPr>
       </w:pPr>
       <w:r>
@@ -14198,7 +14391,7 @@
         <w:pStyle w:val="Compact"/>
         <w:numPr>
           <w:ilvl w:val="0"/>
-          <w:numId w:val="1584"/>
+          <w:numId w:val="1592"/>
         </w:numPr>
       </w:pPr>
       <w:r>
@@ -14210,7 +14403,7 @@
         <w:pStyle w:val="Compact"/>
         <w:numPr>
           <w:ilvl w:val="1"/>
-          <w:numId w:val="1585"/>
+          <w:numId w:val="1593"/>
         </w:numPr>
       </w:pPr>
       <w:r>
@@ -14222,7 +14415,7 @@
         <w:pStyle w:val="Compact"/>
         <w:numPr>
           <w:ilvl w:val="1"/>
-          <w:numId w:val="1585"/>
+          <w:numId w:val="1593"/>
         </w:numPr>
       </w:pPr>
       <w:r>
@@ -14234,7 +14427,7 @@
         <w:pStyle w:val="Compact"/>
         <w:numPr>
           <w:ilvl w:val="1"/>
-          <w:numId w:val="1585"/>
+          <w:numId w:val="1593"/>
         </w:numPr>
       </w:pPr>
       <w:r>
@@ -14246,7 +14439,7 @@
         <w:pStyle w:val="Compact"/>
         <w:numPr>
           <w:ilvl w:val="0"/>
-          <w:numId w:val="1586"/>
+          <w:numId w:val="1594"/>
         </w:numPr>
       </w:pPr>
       <w:r>
@@ -14258,7 +14451,7 @@
         <w:pStyle w:val="Compact"/>
         <w:numPr>
           <w:ilvl w:val="0"/>
-          <w:numId w:val="1587"/>
+          <w:numId w:val="1595"/>
         </w:numPr>
       </w:pPr>
       <w:r>
@@ -14270,7 +14463,7 @@
         <w:pStyle w:val="Compact"/>
         <w:numPr>
           <w:ilvl w:val="1"/>
-          <w:numId w:val="1588"/>
+          <w:numId w:val="1596"/>
         </w:numPr>
       </w:pPr>
       <w:r>
@@ -14282,7 +14475,7 @@
         <w:pStyle w:val="Compact"/>
         <w:numPr>
           <w:ilvl w:val="1"/>
-          <w:numId w:val="1588"/>
+          <w:numId w:val="1596"/>
         </w:numPr>
       </w:pPr>
       <w:r>
@@ -14294,7 +14487,7 @@
         <w:pStyle w:val="Compact"/>
         <w:numPr>
           <w:ilvl w:val="1"/>
-          <w:numId w:val="1588"/>
+          <w:numId w:val="1596"/>
         </w:numPr>
       </w:pPr>
       <w:r>
@@ -14306,7 +14499,7 @@
         <w:pStyle w:val="Compact"/>
         <w:numPr>
           <w:ilvl w:val="1"/>
-          <w:numId w:val="1588"/>
+          <w:numId w:val="1596"/>
         </w:numPr>
       </w:pPr>
       <w:r>
@@ -14318,7 +14511,7 @@
         <w:pStyle w:val="Compact"/>
         <w:numPr>
           <w:ilvl w:val="1"/>
-          <w:numId w:val="1588"/>
+          <w:numId w:val="1596"/>
         </w:numPr>
       </w:pPr>
       <w:r>
@@ -14330,7 +14523,7 @@
         <w:pStyle w:val="Compact"/>
         <w:numPr>
           <w:ilvl w:val="1"/>
-          <w:numId w:val="1588"/>
+          <w:numId w:val="1596"/>
         </w:numPr>
       </w:pPr>
       <w:r>
@@ -14342,7 +14535,7 @@
         <w:pStyle w:val="Compact"/>
         <w:numPr>
           <w:ilvl w:val="0"/>
-          <w:numId w:val="1589"/>
+          <w:numId w:val="1597"/>
         </w:numPr>
       </w:pPr>
       <w:r>
@@ -14354,7 +14547,7 @@
         <w:pStyle w:val="Compact"/>
         <w:numPr>
           <w:ilvl w:val="0"/>
-          <w:numId w:val="1590"/>
+          <w:numId w:val="1598"/>
         </w:numPr>
       </w:pPr>
       <w:r>
@@ -14366,15 +14559,15 @@
         <w:pStyle w:val="Compact"/>
         <w:numPr>
           <w:ilvl w:val="0"/>
-          <w:numId w:val="1591"/>
+          <w:numId w:val="1599"/>
         </w:numPr>
       </w:pPr>
       <w:r>
         <w:t xml:space="preserve">Ensure predicted funded deals are traceable to historical anchor, not arbitrary text.</w:t>
       </w:r>
     </w:p>
-    <w:bookmarkEnd w:id="79"/>
-    <w:bookmarkStart w:id="80" w:name="cooldowns-and-compliance"/>
+    <w:bookmarkEnd w:id="80"/>
+    <w:bookmarkStart w:id="81" w:name="cooldowns-and-compliance"/>
     <w:p>
       <w:pPr>
         <w:pStyle w:val="Heading3"/>
@@ -14388,7 +14581,7 @@
         <w:pStyle w:val="Compact"/>
         <w:numPr>
           <w:ilvl w:val="0"/>
-          <w:numId w:val="1592"/>
+          <w:numId w:val="1600"/>
         </w:numPr>
       </w:pPr>
       <w:r>
@@ -14400,7 +14593,7 @@
         <w:pStyle w:val="Compact"/>
         <w:numPr>
           <w:ilvl w:val="0"/>
-          <w:numId w:val="1593"/>
+          <w:numId w:val="1601"/>
         </w:numPr>
       </w:pPr>
       <w:r>
@@ -14412,7 +14605,7 @@
         <w:pStyle w:val="Compact"/>
         <w:numPr>
           <w:ilvl w:val="0"/>
-          <w:numId w:val="1594"/>
+          <w:numId w:val="1602"/>
         </w:numPr>
       </w:pPr>
       <w:r>
@@ -14424,7 +14617,7 @@
         <w:pStyle w:val="Compact"/>
         <w:numPr>
           <w:ilvl w:val="0"/>
-          <w:numId w:val="1595"/>
+          <w:numId w:val="1603"/>
         </w:numPr>
       </w:pPr>
       <w:r>
@@ -14436,7 +14629,7 @@
         <w:pStyle w:val="Compact"/>
         <w:numPr>
           <w:ilvl w:val="0"/>
-          <w:numId w:val="1596"/>
+          <w:numId w:val="1604"/>
         </w:numPr>
       </w:pPr>
       <w:r>
@@ -14448,15 +14641,15 @@
         <w:pStyle w:val="Compact"/>
         <w:numPr>
           <w:ilvl w:val="0"/>
-          <w:numId w:val="1597"/>
+          <w:numId w:val="1605"/>
         </w:numPr>
       </w:pPr>
       <w:r>
         <w:t xml:space="preserve">Verify no cohort can re-contact opted-out, DNC, suppressed, or too-recent leads.</w:t>
       </w:r>
     </w:p>
-    <w:bookmarkEnd w:id="80"/>
-    <w:bookmarkStart w:id="81" w:name="two-layer-send-caps"/>
+    <w:bookmarkEnd w:id="81"/>
+    <w:bookmarkStart w:id="82" w:name="two-layer-send-caps"/>
     <w:p>
       <w:pPr>
         <w:pStyle w:val="Heading3"/>
@@ -14470,7 +14663,7 @@
         <w:pStyle w:val="Compact"/>
         <w:numPr>
           <w:ilvl w:val="0"/>
-          <w:numId w:val="1598"/>
+          <w:numId w:val="1606"/>
         </w:numPr>
       </w:pPr>
       <w:r>
@@ -14482,7 +14675,7 @@
         <w:pStyle w:val="Compact"/>
         <w:numPr>
           <w:ilvl w:val="1"/>
-          <w:numId w:val="1599"/>
+          <w:numId w:val="1607"/>
         </w:numPr>
       </w:pPr>
       <w:r>
@@ -14494,7 +14687,7 @@
         <w:pStyle w:val="Compact"/>
         <w:numPr>
           <w:ilvl w:val="1"/>
-          <w:numId w:val="1599"/>
+          <w:numId w:val="1607"/>
         </w:numPr>
       </w:pPr>
       <w:r>
@@ -14506,7 +14699,7 @@
         <w:pStyle w:val="Compact"/>
         <w:numPr>
           <w:ilvl w:val="0"/>
-          <w:numId w:val="1600"/>
+          <w:numId w:val="1608"/>
         </w:numPr>
       </w:pPr>
       <w:r>
@@ -14518,7 +14711,7 @@
         <w:pStyle w:val="Compact"/>
         <w:numPr>
           <w:ilvl w:val="1"/>
-          <w:numId w:val="1601"/>
+          <w:numId w:val="1609"/>
         </w:numPr>
       </w:pPr>
       <w:r>
@@ -14530,7 +14723,7 @@
         <w:pStyle w:val="Compact"/>
         <w:numPr>
           <w:ilvl w:val="1"/>
-          <w:numId w:val="1601"/>
+          <w:numId w:val="1609"/>
         </w:numPr>
       </w:pPr>
       <w:r>
@@ -14542,7 +14735,7 @@
         <w:pStyle w:val="Compact"/>
         <w:numPr>
           <w:ilvl w:val="0"/>
-          <w:numId w:val="1602"/>
+          <w:numId w:val="1610"/>
         </w:numPr>
       </w:pPr>
       <w:r>
@@ -14554,7 +14747,7 @@
         <w:pStyle w:val="Compact"/>
         <w:numPr>
           <w:ilvl w:val="0"/>
-          <w:numId w:val="1603"/>
+          <w:numId w:val="1611"/>
         </w:numPr>
       </w:pPr>
       <w:r>
@@ -14566,7 +14759,7 @@
         <w:pStyle w:val="Compact"/>
         <w:numPr>
           <w:ilvl w:val="0"/>
-          <w:numId w:val="1604"/>
+          <w:numId w:val="1612"/>
         </w:numPr>
       </w:pPr>
       <w:r>
@@ -14578,15 +14771,15 @@
         <w:pStyle w:val="Compact"/>
         <w:numPr>
           <w:ilvl w:val="0"/>
-          <w:numId w:val="1605"/>
+          <w:numId w:val="1613"/>
         </w:numPr>
       </w:pPr>
       <w:r>
         <w:t xml:space="preserve">Cohort card lead count reflects current remaining capacity at render/build time.</w:t>
       </w:r>
     </w:p>
-    <w:bookmarkEnd w:id="81"/>
-    <w:bookmarkStart w:id="82" w:name="ai-reasoning-and-cron"/>
+    <w:bookmarkEnd w:id="82"/>
+    <w:bookmarkStart w:id="83" w:name="ai-reasoning-and-cron"/>
     <w:p>
       <w:pPr>
         <w:pStyle w:val="Heading3"/>
@@ -14600,7 +14793,7 @@
         <w:pStyle w:val="Compact"/>
         <w:numPr>
           <w:ilvl w:val="0"/>
-          <w:numId w:val="1606"/>
+          <w:numId w:val="1614"/>
         </w:numPr>
       </w:pPr>
       <w:r>
@@ -14612,7 +14805,7 @@
         <w:pStyle w:val="Compact"/>
         <w:numPr>
           <w:ilvl w:val="0"/>
-          <w:numId w:val="1607"/>
+          <w:numId w:val="1615"/>
         </w:numPr>
       </w:pPr>
       <w:r>
@@ -14624,7 +14817,7 @@
         <w:pStyle w:val="Compact"/>
         <w:numPr>
           <w:ilvl w:val="0"/>
-          <w:numId w:val="1608"/>
+          <w:numId w:val="1616"/>
         </w:numPr>
       </w:pPr>
       <w:r>
@@ -14636,7 +14829,7 @@
         <w:pStyle w:val="Compact"/>
         <w:numPr>
           <w:ilvl w:val="0"/>
-          <w:numId w:val="1609"/>
+          <w:numId w:val="1617"/>
         </w:numPr>
       </w:pPr>
       <w:r>
@@ -14648,7 +14841,7 @@
         <w:pStyle w:val="Compact"/>
         <w:numPr>
           <w:ilvl w:val="0"/>
-          <w:numId w:val="1610"/>
+          <w:numId w:val="1618"/>
         </w:numPr>
       </w:pPr>
       <w:r>
@@ -14660,7 +14853,7 @@
         <w:pStyle w:val="Compact"/>
         <w:numPr>
           <w:ilvl w:val="0"/>
-          <w:numId w:val="1611"/>
+          <w:numId w:val="1619"/>
         </w:numPr>
       </w:pPr>
       <w:r>
@@ -14672,7 +14865,7 @@
         <w:pStyle w:val="Compact"/>
         <w:numPr>
           <w:ilvl w:val="0"/>
-          <w:numId w:val="1612"/>
+          <w:numId w:val="1620"/>
         </w:numPr>
       </w:pPr>
       <w:r>
@@ -14684,7 +14877,7 @@
         <w:pStyle w:val="Compact"/>
         <w:numPr>
           <w:ilvl w:val="0"/>
-          <w:numId w:val="1613"/>
+          <w:numId w:val="1621"/>
         </w:numPr>
       </w:pPr>
       <w:r>
@@ -14696,15 +14889,15 @@
         <w:pStyle w:val="Compact"/>
         <w:numPr>
           <w:ilvl w:val="0"/>
-          <w:numId w:val="1614"/>
+          <w:numId w:val="1622"/>
         </w:numPr>
       </w:pPr>
       <w:r>
         <w:t xml:space="preserve">Log failures per user/cohort without breaking other cohorts.</w:t>
       </w:r>
     </w:p>
-    <w:bookmarkEnd w:id="82"/>
-    <w:bookmarkStart w:id="83" w:name="ui-1"/>
+    <w:bookmarkEnd w:id="83"/>
+    <w:bookmarkStart w:id="84" w:name="ui-1"/>
     <w:p>
       <w:pPr>
         <w:pStyle w:val="Heading3"/>
@@ -14718,7 +14911,7 @@
         <w:pStyle w:val="Compact"/>
         <w:numPr>
           <w:ilvl w:val="0"/>
-          <w:numId w:val="1615"/>
+          <w:numId w:val="1623"/>
         </w:numPr>
       </w:pPr>
       <w:r>
@@ -14730,7 +14923,7 @@
         <w:pStyle w:val="Compact"/>
         <w:numPr>
           <w:ilvl w:val="0"/>
-          <w:numId w:val="1616"/>
+          <w:numId w:val="1624"/>
         </w:numPr>
       </w:pPr>
       <w:r>
@@ -14742,7 +14935,7 @@
         <w:pStyle w:val="Compact"/>
         <w:numPr>
           <w:ilvl w:val="0"/>
-          <w:numId w:val="1617"/>
+          <w:numId w:val="1625"/>
         </w:numPr>
       </w:pPr>
       <w:r>
@@ -14754,7 +14947,7 @@
         <w:pStyle w:val="Compact"/>
         <w:numPr>
           <w:ilvl w:val="0"/>
-          <w:numId w:val="1618"/>
+          <w:numId w:val="1626"/>
         </w:numPr>
       </w:pPr>
       <w:r>
@@ -14766,7 +14959,7 @@
         <w:pStyle w:val="Compact"/>
         <w:numPr>
           <w:ilvl w:val="0"/>
-          <w:numId w:val="1619"/>
+          <w:numId w:val="1627"/>
         </w:numPr>
       </w:pPr>
       <w:r>
@@ -14778,7 +14971,7 @@
         <w:pStyle w:val="Compact"/>
         <w:numPr>
           <w:ilvl w:val="0"/>
-          <w:numId w:val="1620"/>
+          <w:numId w:val="1628"/>
         </w:numPr>
       </w:pPr>
       <w:r>
@@ -14790,7 +14983,7 @@
         <w:pStyle w:val="Compact"/>
         <w:numPr>
           <w:ilvl w:val="0"/>
-          <w:numId w:val="1621"/>
+          <w:numId w:val="1629"/>
         </w:numPr>
       </w:pPr>
       <w:r>
@@ -14802,7 +14995,7 @@
         <w:pStyle w:val="Compact"/>
         <w:numPr>
           <w:ilvl w:val="0"/>
-          <w:numId w:val="1622"/>
+          <w:numId w:val="1630"/>
         </w:numPr>
       </w:pPr>
       <w:r>
@@ -14814,7 +15007,7 @@
         <w:pStyle w:val="Compact"/>
         <w:numPr>
           <w:ilvl w:val="0"/>
-          <w:numId w:val="1623"/>
+          <w:numId w:val="1631"/>
         </w:numPr>
       </w:pPr>
       <w:r>
@@ -14826,7 +15019,7 @@
         <w:pStyle w:val="Compact"/>
         <w:numPr>
           <w:ilvl w:val="0"/>
-          <w:numId w:val="1624"/>
+          <w:numId w:val="1632"/>
         </w:numPr>
       </w:pPr>
       <w:r>
@@ -14853,7 +15046,7 @@
         <w:pStyle w:val="Compact"/>
         <w:numPr>
           <w:ilvl w:val="0"/>
-          <w:numId w:val="1625"/>
+          <w:numId w:val="1633"/>
         </w:numPr>
       </w:pPr>
       <w:r>
@@ -14874,15 +15067,15 @@
         <w:pStyle w:val="Compact"/>
         <w:numPr>
           <w:ilvl w:val="0"/>
-          <w:numId w:val="1626"/>
+          <w:numId w:val="1634"/>
         </w:numPr>
       </w:pPr>
       <w:r>
         <w:t xml:space="preserve">Existing campaign actions still work: rerun/refresh, start, pause, delete where allowed.</w:t>
       </w:r>
     </w:p>
-    <w:bookmarkEnd w:id="83"/>
-    <w:bookmarkStart w:id="84" w:name="backendapi"/>
+    <w:bookmarkEnd w:id="84"/>
+    <w:bookmarkStart w:id="85" w:name="backendapi"/>
     <w:p>
       <w:pPr>
         <w:pStyle w:val="Heading3"/>
@@ -14896,7 +15089,7 @@
         <w:pStyle w:val="Compact"/>
         <w:numPr>
           <w:ilvl w:val="0"/>
-          <w:numId w:val="1627"/>
+          <w:numId w:val="1635"/>
         </w:numPr>
       </w:pPr>
       <w:r>
@@ -14908,7 +15101,7 @@
         <w:pStyle w:val="Compact"/>
         <w:numPr>
           <w:ilvl w:val="0"/>
-          <w:numId w:val="1628"/>
+          <w:numId w:val="1636"/>
         </w:numPr>
       </w:pPr>
       <w:r>
@@ -14920,7 +15113,7 @@
         <w:pStyle w:val="Compact"/>
         <w:numPr>
           <w:ilvl w:val="0"/>
-          <w:numId w:val="1629"/>
+          <w:numId w:val="1637"/>
         </w:numPr>
       </w:pPr>
       <w:r>
@@ -14932,7 +15125,7 @@
         <w:pStyle w:val="Compact"/>
         <w:numPr>
           <w:ilvl w:val="0"/>
-          <w:numId w:val="1630"/>
+          <w:numId w:val="1638"/>
         </w:numPr>
       </w:pPr>
       <w:r>
@@ -14944,7 +15137,7 @@
         <w:pStyle w:val="Compact"/>
         <w:numPr>
           <w:ilvl w:val="0"/>
-          <w:numId w:val="1631"/>
+          <w:numId w:val="1639"/>
         </w:numPr>
       </w:pPr>
       <w:r>
@@ -14956,7 +15149,7 @@
         <w:pStyle w:val="Compact"/>
         <w:numPr>
           <w:ilvl w:val="0"/>
-          <w:numId w:val="1632"/>
+          <w:numId w:val="1640"/>
         </w:numPr>
       </w:pPr>
       <w:r>
@@ -14968,7 +15161,7 @@
         <w:pStyle w:val="Compact"/>
         <w:numPr>
           <w:ilvl w:val="0"/>
-          <w:numId w:val="1633"/>
+          <w:numId w:val="1641"/>
         </w:numPr>
       </w:pPr>
       <w:r>
@@ -14980,15 +15173,15 @@
         <w:pStyle w:val="Compact"/>
         <w:numPr>
           <w:ilvl w:val="0"/>
-          <w:numId w:val="1634"/>
+          <w:numId w:val="1642"/>
         </w:numPr>
       </w:pPr>
       <w:r>
         <w:t xml:space="preserve">AI Retarget is upstream recommendation only; no auto-send.</w:t>
       </w:r>
     </w:p>
-    <w:bookmarkEnd w:id="84"/>
-    <w:bookmarkStart w:id="85" w:name="m2.3-testing-gate"/>
+    <w:bookmarkEnd w:id="85"/>
+    <w:bookmarkStart w:id="86" w:name="m2.3-testing-gate"/>
     <w:p>
       <w:pPr>
         <w:pStyle w:val="Heading3"/>
@@ -15002,7 +15195,7 @@
         <w:pStyle w:val="Compact"/>
         <w:numPr>
           <w:ilvl w:val="0"/>
-          <w:numId w:val="1635"/>
+          <w:numId w:val="1643"/>
         </w:numPr>
       </w:pPr>
       <w:r>
@@ -15014,7 +15207,7 @@
         <w:pStyle w:val="Compact"/>
         <w:numPr>
           <w:ilvl w:val="0"/>
-          <w:numId w:val="1636"/>
+          <w:numId w:val="1644"/>
         </w:numPr>
       </w:pPr>
       <w:r>
@@ -15026,7 +15219,7 @@
         <w:pStyle w:val="Compact"/>
         <w:numPr>
           <w:ilvl w:val="0"/>
-          <w:numId w:val="1637"/>
+          <w:numId w:val="1645"/>
         </w:numPr>
       </w:pPr>
       <w:r>
@@ -15038,7 +15231,7 @@
         <w:pStyle w:val="Compact"/>
         <w:numPr>
           <w:ilvl w:val="0"/>
-          <w:numId w:val="1638"/>
+          <w:numId w:val="1646"/>
         </w:numPr>
       </w:pPr>
       <w:r>
@@ -15050,7 +15243,7 @@
         <w:pStyle w:val="Compact"/>
         <w:numPr>
           <w:ilvl w:val="0"/>
-          <w:numId w:val="1639"/>
+          <w:numId w:val="1647"/>
         </w:numPr>
       </w:pPr>
       <w:r>
@@ -15062,7 +15255,7 @@
         <w:pStyle w:val="Compact"/>
         <w:numPr>
           <w:ilvl w:val="0"/>
-          <w:numId w:val="1640"/>
+          <w:numId w:val="1648"/>
         </w:numPr>
       </w:pPr>
       <w:r>
@@ -15074,7 +15267,7 @@
         <w:pStyle w:val="Compact"/>
         <w:numPr>
           <w:ilvl w:val="0"/>
-          <w:numId w:val="1641"/>
+          <w:numId w:val="1649"/>
         </w:numPr>
       </w:pPr>
       <w:r>
@@ -15086,7 +15279,7 @@
         <w:pStyle w:val="Compact"/>
         <w:numPr>
           <w:ilvl w:val="0"/>
-          <w:numId w:val="1642"/>
+          <w:numId w:val="1650"/>
         </w:numPr>
       </w:pPr>
       <w:r>
@@ -15098,7 +15291,7 @@
         <w:pStyle w:val="Compact"/>
         <w:numPr>
           <w:ilvl w:val="0"/>
-          <w:numId w:val="1643"/>
+          <w:numId w:val="1651"/>
         </w:numPr>
       </w:pPr>
       <w:r>
@@ -15110,7 +15303,7 @@
         <w:pStyle w:val="Compact"/>
         <w:numPr>
           <w:ilvl w:val="0"/>
-          <w:numId w:val="1644"/>
+          <w:numId w:val="1652"/>
         </w:numPr>
       </w:pPr>
       <w:r>
@@ -15122,7 +15315,7 @@
         <w:pStyle w:val="Compact"/>
         <w:numPr>
           <w:ilvl w:val="0"/>
-          <w:numId w:val="1645"/>
+          <w:numId w:val="1653"/>
         </w:numPr>
       </w:pPr>
       <w:r>
@@ -15134,7 +15327,7 @@
         <w:pStyle w:val="Compact"/>
         <w:numPr>
           <w:ilvl w:val="0"/>
-          <w:numId w:val="1646"/>
+          <w:numId w:val="1654"/>
         </w:numPr>
       </w:pPr>
       <w:r>
@@ -15146,7 +15339,7 @@
         <w:pStyle w:val="Compact"/>
         <w:numPr>
           <w:ilvl w:val="0"/>
-          <w:numId w:val="1647"/>
+          <w:numId w:val="1655"/>
         </w:numPr>
       </w:pPr>
       <w:r>
@@ -15158,7 +15351,7 @@
         <w:pStyle w:val="Compact"/>
         <w:numPr>
           <w:ilvl w:val="0"/>
-          <w:numId w:val="1648"/>
+          <w:numId w:val="1656"/>
         </w:numPr>
       </w:pPr>
       <w:r>
@@ -15170,16 +15363,16 @@
         <w:pStyle w:val="Compact"/>
         <w:numPr>
           <w:ilvl w:val="0"/>
-          <w:numId w:val="1649"/>
+          <w:numId w:val="1657"/>
         </w:numPr>
       </w:pPr>
       <w:r>
         <w:t xml:space="preserve">Progress dashboard updated.</w:t>
       </w:r>
     </w:p>
-    <w:bookmarkEnd w:id="85"/>
     <w:bookmarkEnd w:id="86"/>
-    <w:bookmarkStart w:id="90" w:name="m2.4-m2-full-regression-and-release-gate"/>
+    <w:bookmarkEnd w:id="87"/>
+    <w:bookmarkStart w:id="91" w:name="m2.4-m2-full-regression-and-release-gate"/>
     <w:p>
       <w:pPr>
         <w:pStyle w:val="Heading2"/>
@@ -15188,7 +15381,7 @@
         <w:t xml:space="preserve">M2.4 — M2 Full Regression And Release Gate</w:t>
       </w:r>
     </w:p>
-    <w:bookmarkStart w:id="87" w:name="functional-regression-1"/>
+    <w:bookmarkStart w:id="88" w:name="functional-regression-1"/>
     <w:p>
       <w:pPr>
         <w:pStyle w:val="Heading3"/>
@@ -15202,7 +15395,7 @@
         <w:pStyle w:val="Compact"/>
         <w:numPr>
           <w:ilvl w:val="0"/>
-          <w:numId w:val="1650"/>
+          <w:numId w:val="1658"/>
         </w:numPr>
       </w:pPr>
       <w:r>
@@ -15214,7 +15407,7 @@
         <w:pStyle w:val="Compact"/>
         <w:numPr>
           <w:ilvl w:val="0"/>
-          <w:numId w:val="1651"/>
+          <w:numId w:val="1659"/>
         </w:numPr>
       </w:pPr>
       <w:r>
@@ -15226,7 +15419,7 @@
         <w:pStyle w:val="Compact"/>
         <w:numPr>
           <w:ilvl w:val="0"/>
-          <w:numId w:val="1652"/>
+          <w:numId w:val="1660"/>
         </w:numPr>
       </w:pPr>
       <w:r>
@@ -15238,7 +15431,7 @@
         <w:pStyle w:val="Compact"/>
         <w:numPr>
           <w:ilvl w:val="0"/>
-          <w:numId w:val="1653"/>
+          <w:numId w:val="1661"/>
         </w:numPr>
       </w:pPr>
       <w:r>
@@ -15250,7 +15443,7 @@
         <w:pStyle w:val="Compact"/>
         <w:numPr>
           <w:ilvl w:val="0"/>
-          <w:numId w:val="1654"/>
+          <w:numId w:val="1662"/>
         </w:numPr>
       </w:pPr>
       <w:r>
@@ -15262,7 +15455,7 @@
         <w:pStyle w:val="Compact"/>
         <w:numPr>
           <w:ilvl w:val="0"/>
-          <w:numId w:val="1655"/>
+          <w:numId w:val="1663"/>
         </w:numPr>
       </w:pPr>
       <w:r>
@@ -15274,7 +15467,7 @@
         <w:pStyle w:val="Compact"/>
         <w:numPr>
           <w:ilvl w:val="0"/>
-          <w:numId w:val="1656"/>
+          <w:numId w:val="1664"/>
         </w:numPr>
       </w:pPr>
       <w:r>
@@ -15286,7 +15479,7 @@
         <w:pStyle w:val="Compact"/>
         <w:numPr>
           <w:ilvl w:val="0"/>
-          <w:numId w:val="1657"/>
+          <w:numId w:val="1665"/>
         </w:numPr>
       </w:pPr>
       <w:r>
@@ -15298,7 +15491,7 @@
         <w:pStyle w:val="Compact"/>
         <w:numPr>
           <w:ilvl w:val="0"/>
-          <w:numId w:val="1658"/>
+          <w:numId w:val="1666"/>
         </w:numPr>
       </w:pPr>
       <w:r>
@@ -15310,7 +15503,7 @@
         <w:pStyle w:val="Compact"/>
         <w:numPr>
           <w:ilvl w:val="0"/>
-          <w:numId w:val="1659"/>
+          <w:numId w:val="1667"/>
         </w:numPr>
       </w:pPr>
       <w:r>
@@ -15322,7 +15515,7 @@
         <w:pStyle w:val="Compact"/>
         <w:numPr>
           <w:ilvl w:val="0"/>
-          <w:numId w:val="1660"/>
+          <w:numId w:val="1668"/>
         </w:numPr>
       </w:pPr>
       <w:r>
@@ -15334,7 +15527,7 @@
         <w:pStyle w:val="Compact"/>
         <w:numPr>
           <w:ilvl w:val="0"/>
-          <w:numId w:val="1661"/>
+          <w:numId w:val="1669"/>
         </w:numPr>
       </w:pPr>
       <w:r>
@@ -15346,7 +15539,7 @@
         <w:pStyle w:val="Compact"/>
         <w:numPr>
           <w:ilvl w:val="0"/>
-          <w:numId w:val="1662"/>
+          <w:numId w:val="1670"/>
         </w:numPr>
       </w:pPr>
       <w:r>
@@ -15368,8 +15561,8 @@
         <w:t xml:space="preserve">and test messages.</w:t>
       </w:r>
     </w:p>
-    <w:bookmarkEnd w:id="87"/>
-    <w:bookmarkStart w:id="88" w:name="visual-regression-1"/>
+    <w:bookmarkEnd w:id="88"/>
+    <w:bookmarkStart w:id="89" w:name="visual-regression-1"/>
     <w:p>
       <w:pPr>
         <w:pStyle w:val="Heading3"/>
@@ -15383,7 +15576,7 @@
         <w:pStyle w:val="Compact"/>
         <w:numPr>
           <w:ilvl w:val="0"/>
-          <w:numId w:val="1663"/>
+          <w:numId w:val="1671"/>
         </w:numPr>
       </w:pPr>
       <w:r>
@@ -15395,7 +15588,7 @@
         <w:pStyle w:val="Compact"/>
         <w:numPr>
           <w:ilvl w:val="0"/>
-          <w:numId w:val="1664"/>
+          <w:numId w:val="1672"/>
         </w:numPr>
       </w:pPr>
       <w:r>
@@ -15422,7 +15615,7 @@
         <w:pStyle w:val="Compact"/>
         <w:numPr>
           <w:ilvl w:val="0"/>
-          <w:numId w:val="1665"/>
+          <w:numId w:val="1673"/>
         </w:numPr>
       </w:pPr>
       <w:r>
@@ -15434,7 +15627,7 @@
         <w:pStyle w:val="Compact"/>
         <w:numPr>
           <w:ilvl w:val="0"/>
-          <w:numId w:val="1666"/>
+          <w:numId w:val="1674"/>
         </w:numPr>
       </w:pPr>
       <w:r>
@@ -15446,7 +15639,7 @@
         <w:pStyle w:val="Compact"/>
         <w:numPr>
           <w:ilvl w:val="0"/>
-          <w:numId w:val="1667"/>
+          <w:numId w:val="1675"/>
         </w:numPr>
       </w:pPr>
       <w:r>
@@ -15458,7 +15651,7 @@
         <w:pStyle w:val="Compact"/>
         <w:numPr>
           <w:ilvl w:val="0"/>
-          <w:numId w:val="1668"/>
+          <w:numId w:val="1676"/>
         </w:numPr>
       </w:pPr>
       <w:r>
@@ -15470,7 +15663,7 @@
         <w:pStyle w:val="Compact"/>
         <w:numPr>
           <w:ilvl w:val="0"/>
-          <w:numId w:val="1669"/>
+          <w:numId w:val="1677"/>
         </w:numPr>
       </w:pPr>
       <w:r>
@@ -15482,15 +15675,15 @@
         <w:pStyle w:val="Compact"/>
         <w:numPr>
           <w:ilvl w:val="0"/>
-          <w:numId w:val="1670"/>
+          <w:numId w:val="1678"/>
         </w:numPr>
       </w:pPr>
       <w:r>
         <w:t xml:space="preserve">No unreadable text if current styles fail; scoped style set added if needed.</w:t>
       </w:r>
     </w:p>
-    <w:bookmarkEnd w:id="88"/>
-    <w:bookmarkStart w:id="89" w:name="release-readiness-1"/>
+    <w:bookmarkEnd w:id="89"/>
+    <w:bookmarkStart w:id="90" w:name="release-readiness-1"/>
     <w:p>
       <w:pPr>
         <w:pStyle w:val="Heading3"/>
@@ -15504,7 +15697,7 @@
         <w:pStyle w:val="Compact"/>
         <w:numPr>
           <w:ilvl w:val="0"/>
-          <w:numId w:val="1671"/>
+          <w:numId w:val="1679"/>
         </w:numPr>
       </w:pPr>
       <w:r>
@@ -15516,7 +15709,7 @@
         <w:pStyle w:val="Compact"/>
         <w:numPr>
           <w:ilvl w:val="0"/>
-          <w:numId w:val="1672"/>
+          <w:numId w:val="1680"/>
         </w:numPr>
       </w:pPr>
       <w:r>
@@ -15528,7 +15721,7 @@
         <w:pStyle w:val="Compact"/>
         <w:numPr>
           <w:ilvl w:val="0"/>
-          <w:numId w:val="1673"/>
+          <w:numId w:val="1681"/>
         </w:numPr>
       </w:pPr>
       <w:r>
@@ -15540,7 +15733,7 @@
         <w:pStyle w:val="Compact"/>
         <w:numPr>
           <w:ilvl w:val="0"/>
-          <w:numId w:val="1674"/>
+          <w:numId w:val="1682"/>
         </w:numPr>
       </w:pPr>
       <w:r>
@@ -15552,7 +15745,7 @@
         <w:pStyle w:val="Compact"/>
         <w:numPr>
           <w:ilvl w:val="0"/>
-          <w:numId w:val="1675"/>
+          <w:numId w:val="1683"/>
         </w:numPr>
       </w:pPr>
       <w:r>
@@ -15564,7 +15757,7 @@
         <w:pStyle w:val="Compact"/>
         <w:numPr>
           <w:ilvl w:val="0"/>
-          <w:numId w:val="1676"/>
+          <w:numId w:val="1684"/>
         </w:numPr>
       </w:pPr>
       <w:r>
@@ -15576,7 +15769,7 @@
         <w:pStyle w:val="Compact"/>
         <w:numPr>
           <w:ilvl w:val="0"/>
-          <w:numId w:val="1677"/>
+          <w:numId w:val="1685"/>
         </w:numPr>
       </w:pPr>
       <w:r>
@@ -15588,7 +15781,7 @@
         <w:pStyle w:val="Compact"/>
         <w:numPr>
           <w:ilvl w:val="0"/>
-          <w:numId w:val="1678"/>
+          <w:numId w:val="1686"/>
         </w:numPr>
       </w:pPr>
       <w:r>
@@ -15600,16 +15793,16 @@
         <w:pStyle w:val="Compact"/>
         <w:numPr>
           <w:ilvl w:val="0"/>
-          <w:numId w:val="1679"/>
+          <w:numId w:val="1687"/>
         </w:numPr>
       </w:pPr>
       <w:r>
         <w:t xml:space="preserve">Progress dashboard updated to M2 complete only after all gates pass.</w:t>
       </w:r>
     </w:p>
-    <w:bookmarkEnd w:id="89"/>
     <w:bookmarkEnd w:id="90"/>
-    <w:bookmarkStart w:id="91" w:name="full-final-acceptance"/>
+    <w:bookmarkEnd w:id="91"/>
+    <w:bookmarkStart w:id="92" w:name="full-final-acceptance"/>
     <w:p>
       <w:pPr>
         <w:pStyle w:val="Heading2"/>
@@ -15623,7 +15816,7 @@
         <w:pStyle w:val="Compact"/>
         <w:numPr>
           <w:ilvl w:val="0"/>
-          <w:numId w:val="1680"/>
+          <w:numId w:val="1688"/>
         </w:numPr>
       </w:pPr>
       <w:r>
@@ -15635,7 +15828,7 @@
         <w:pStyle w:val="Compact"/>
         <w:numPr>
           <w:ilvl w:val="0"/>
-          <w:numId w:val="1681"/>
+          <w:numId w:val="1689"/>
         </w:numPr>
       </w:pPr>
       <w:r>
@@ -15647,7 +15840,7 @@
         <w:pStyle w:val="Compact"/>
         <w:numPr>
           <w:ilvl w:val="0"/>
-          <w:numId w:val="1682"/>
+          <w:numId w:val="1690"/>
         </w:numPr>
       </w:pPr>
       <w:r>
@@ -15659,7 +15852,7 @@
         <w:pStyle w:val="Compact"/>
         <w:numPr>
           <w:ilvl w:val="0"/>
-          <w:numId w:val="1683"/>
+          <w:numId w:val="1691"/>
         </w:numPr>
       </w:pPr>
       <w:r>
@@ -15671,7 +15864,7 @@
         <w:pStyle w:val="Compact"/>
         <w:numPr>
           <w:ilvl w:val="0"/>
-          <w:numId w:val="1684"/>
+          <w:numId w:val="1692"/>
         </w:numPr>
       </w:pPr>
       <w:r>
@@ -15683,7 +15876,7 @@
         <w:pStyle w:val="Compact"/>
         <w:numPr>
           <w:ilvl w:val="0"/>
-          <w:numId w:val="1685"/>
+          <w:numId w:val="1693"/>
         </w:numPr>
       </w:pPr>
       <w:r>
@@ -15695,7 +15888,7 @@
         <w:pStyle w:val="Compact"/>
         <w:numPr>
           <w:ilvl w:val="0"/>
-          <w:numId w:val="1686"/>
+          <w:numId w:val="1694"/>
         </w:numPr>
       </w:pPr>
       <w:r>
@@ -15707,7 +15900,7 @@
         <w:pStyle w:val="Compact"/>
         <w:numPr>
           <w:ilvl w:val="0"/>
-          <w:numId w:val="1687"/>
+          <w:numId w:val="1695"/>
         </w:numPr>
       </w:pPr>
       <w:r>
@@ -15719,7 +15912,7 @@
         <w:pStyle w:val="Compact"/>
         <w:numPr>
           <w:ilvl w:val="0"/>
-          <w:numId w:val="1688"/>
+          <w:numId w:val="1696"/>
         </w:numPr>
       </w:pPr>
       <w:r>
@@ -15731,7 +15924,7 @@
         <w:pStyle w:val="Compact"/>
         <w:numPr>
           <w:ilvl w:val="0"/>
-          <w:numId w:val="1689"/>
+          <w:numId w:val="1697"/>
         </w:numPr>
       </w:pPr>
       <w:r>
@@ -15743,15 +15936,15 @@
         <w:pStyle w:val="Compact"/>
         <w:numPr>
           <w:ilvl w:val="0"/>
-          <w:numId w:val="1690"/>
+          <w:numId w:val="1698"/>
         </w:numPr>
       </w:pPr>
       <w:r>
         <w:t xml:space="preserve">Final client-facing summary prepared with what changed, how it was tested, and what is intentionally out of scope.</w:t>
       </w:r>
     </w:p>
-    <w:bookmarkEnd w:id="91"/>
-    <w:bookmarkStart w:id="92" w:name="progress-update-log"/>
+    <w:bookmarkEnd w:id="92"/>
+    <w:bookmarkStart w:id="93" w:name="progress-update-log"/>
     <w:p>
       <w:pPr>
         <w:pStyle w:val="Heading2"/>
@@ -16077,6 +16270,140 @@
               <w:jc w:val="right"/>
             </w:pPr>
             <w:r>
+              <w:t xml:space="preserve">74%</w:t>
+            </w:r>
+          </w:p>
+        </w:tc>
+        <w:tc>
+          <w:tcPr/>
+          <w:p>
+            <w:pPr>
+              <w:pStyle w:val="Compact"/>
+            </w:pPr>
+            <w:r>
+              <w:t xml:space="preserve">M1.6</w:t>
+            </w:r>
+          </w:p>
+        </w:tc>
+        <w:tc>
+          <w:tcPr/>
+          <w:p>
+            <w:pPr>
+              <w:pStyle w:val="Compact"/>
+            </w:pPr>
+            <w:r>
+              <w:t xml:space="preserve">Added and deployed new deal creation/sharing/socket scoping evidence; production smoke passed on</w:t>
+            </w:r>
+            <w:r>
+              <w:t xml:space="preserve"> </w:t>
+            </w:r>
+            <w:r>
+              <w:rPr>
+                <w:rStyle w:val="VerbatimChar"/>
+              </w:rPr>
+              <w:t xml:space="preserve">01b6700d</w:t>
+            </w:r>
+            <w:r>
+              <w:t xml:space="preserve">.</w:t>
+            </w:r>
+          </w:p>
+        </w:tc>
+        <w:tc>
+          <w:tcPr/>
+          <w:p>
+            <w:pPr>
+              <w:pStyle w:val="Compact"/>
+            </w:pPr>
+            <w:r>
+              <w:rPr>
+                <w:rStyle w:val="VerbatimChar"/>
+              </w:rPr>
+              <w:t xml:space="preserve">audit-screenshots/m16-deal-create-share-socket-evidence.json</w:t>
+            </w:r>
+          </w:p>
+        </w:tc>
+      </w:tr>
+      <w:tr>
+        <w:tc>
+          <w:tcPr/>
+          <w:p>
+            <w:pPr>
+              <w:pStyle w:val="Compact"/>
+            </w:pPr>
+            <w:r>
+              <w:t xml:space="preserve">2026-05-02</w:t>
+            </w:r>
+          </w:p>
+        </w:tc>
+        <w:tc>
+          <w:tcPr/>
+          <w:p>
+            <w:pPr>
+              <w:pStyle w:val="Compact"/>
+              <w:jc w:val="right"/>
+            </w:pPr>
+            <w:r>
+              <w:t xml:space="preserve">75%</w:t>
+            </w:r>
+          </w:p>
+        </w:tc>
+        <w:tc>
+          <w:tcPr/>
+          <w:p>
+            <w:pPr>
+              <w:pStyle w:val="Compact"/>
+            </w:pPr>
+            <w:r>
+              <w:t xml:space="preserve">M1.6</w:t>
+            </w:r>
+          </w:p>
+        </w:tc>
+        <w:tc>
+          <w:tcPr/>
+          <w:p>
+            <w:pPr>
+              <w:pStyle w:val="Compact"/>
+            </w:pPr>
+            <w:r>
+              <w:t xml:space="preserve">Added visual regression evidence for Pipeline 1440/960, DealPanel, DealCard, overlap/layout-shift, and sidebar checks.</w:t>
+            </w:r>
+          </w:p>
+        </w:tc>
+        <w:tc>
+          <w:tcPr/>
+          <w:p>
+            <w:pPr>
+              <w:pStyle w:val="Compact"/>
+            </w:pPr>
+            <w:r>
+              <w:rPr>
+                <w:rStyle w:val="VerbatimChar"/>
+              </w:rPr>
+              <w:t xml:space="preserve">audit-screenshots/m16-visual-regression-evidence.json</w:t>
+            </w:r>
+          </w:p>
+        </w:tc>
+      </w:tr>
+      <w:tr>
+        <w:tc>
+          <w:tcPr/>
+          <w:p>
+            <w:pPr>
+              <w:pStyle w:val="Compact"/>
+            </w:pPr>
+            <w:r>
+              <w:t xml:space="preserve">2026-05-02</w:t>
+            </w:r>
+          </w:p>
+        </w:tc>
+        <w:tc>
+          <w:tcPr/>
+          <w:p>
+            <w:pPr>
+              <w:pStyle w:val="Compact"/>
+              <w:jc w:val="right"/>
+            </w:pPr>
+            <w:r>
               <w:t xml:space="preserve">6%</w:t>
             </w:r>
           </w:p>
@@ -16116,8 +16443,8 @@
         </w:tc>
       </w:tr>
     </w:tbl>
-    <w:bookmarkEnd w:id="92"/>
     <w:bookmarkEnd w:id="93"/>
+    <w:bookmarkEnd w:id="94"/>
     <w:sectPr>
       <w:footnotePr>
         <w:numRestart w:val="eachSect"/>
@@ -17822,89 +18149,89 @@
     <w:abstractNumId w:val="993"/>
   </w:num>
   <w:num w:numId="1446">
+    <w:abstractNumId w:val="993"/>
+  </w:num>
+  <w:num w:numId="1447">
+    <w:abstractNumId w:val="993"/>
+  </w:num>
+  <w:num w:numId="1448">
+    <w:abstractNumId w:val="993"/>
+  </w:num>
+  <w:num w:numId="1449">
+    <w:abstractNumId w:val="993"/>
+  </w:num>
+  <w:num w:numId="1450">
+    <w:abstractNumId w:val="993"/>
+  </w:num>
+  <w:num w:numId="1451">
+    <w:abstractNumId w:val="993"/>
+  </w:num>
+  <w:num w:numId="1452">
+    <w:abstractNumId w:val="993"/>
+  </w:num>
+  <w:num w:numId="1453">
+    <w:abstractNumId w:val="993"/>
+  </w:num>
+  <w:num w:numId="1454">
+    <w:abstractNumId w:val="993"/>
+  </w:num>
+  <w:num w:numId="1455">
+    <w:abstractNumId w:val="993"/>
+  </w:num>
+  <w:num w:numId="1456">
+    <w:abstractNumId w:val="993"/>
+  </w:num>
+  <w:num w:numId="1457">
+    <w:abstractNumId w:val="993"/>
+  </w:num>
+  <w:num w:numId="1458">
+    <w:abstractNumId w:val="993"/>
+  </w:num>
+  <w:num w:numId="1459">
+    <w:abstractNumId w:val="993"/>
+  </w:num>
+  <w:num w:numId="1460">
+    <w:abstractNumId w:val="993"/>
+  </w:num>
+  <w:num w:numId="1461">
     <w:abstractNumId w:val="992"/>
   </w:num>
-  <w:num w:numId="1447">
+  <w:num w:numId="1462">
+    <w:abstractNumId w:val="993"/>
+  </w:num>
+  <w:num w:numId="1463">
+    <w:abstractNumId w:val="993"/>
+  </w:num>
+  <w:num w:numId="1464">
+    <w:abstractNumId w:val="993"/>
+  </w:num>
+  <w:num w:numId="1465">
+    <w:abstractNumId w:val="993"/>
+  </w:num>
+  <w:num w:numId="1466">
     <w:abstractNumId w:val="992"/>
   </w:num>
-  <w:num w:numId="1448">
+  <w:num w:numId="1467">
     <w:abstractNumId w:val="992"/>
   </w:num>
-  <w:num w:numId="1449">
+  <w:num w:numId="1468">
+    <w:abstractNumId w:val="993"/>
+  </w:num>
+  <w:num w:numId="1469">
+    <w:abstractNumId w:val="993"/>
+  </w:num>
+  <w:num w:numId="1470">
+    <w:abstractNumId w:val="993"/>
+  </w:num>
+  <w:num w:numId="1471">
+    <w:abstractNumId w:val="993"/>
+  </w:num>
+  <w:num w:numId="1472">
     <w:abstractNumId w:val="992"/>
   </w:num>
-  <w:num w:numId="1450">
+  <w:num w:numId="1473">
     <w:abstractNumId w:val="992"/>
   </w:num>
-  <w:num w:numId="1451">
-    <w:abstractNumId w:val="992"/>
-  </w:num>
-  <w:num w:numId="1452">
-    <w:abstractNumId w:val="992"/>
-  </w:num>
-  <w:num w:numId="1453">
-    <w:abstractNumId w:val="992"/>
-  </w:num>
-  <w:num w:numId="1454">
-    <w:abstractNumId w:val="993"/>
-  </w:num>
-  <w:num w:numId="1455">
-    <w:abstractNumId w:val="993"/>
-  </w:num>
-  <w:num w:numId="1456">
-    <w:abstractNumId w:val="993"/>
-  </w:num>
-  <w:num w:numId="1457">
-    <w:abstractNumId w:val="992"/>
-  </w:num>
-  <w:num w:numId="1458">
-    <w:abstractNumId w:val="992"/>
-  </w:num>
-  <w:num w:numId="1459">
-    <w:abstractNumId w:val="992"/>
-  </w:num>
-  <w:num w:numId="1460">
-    <w:abstractNumId w:val="993"/>
-  </w:num>
-  <w:num w:numId="1461">
-    <w:abstractNumId w:val="993"/>
-  </w:num>
-  <w:num w:numId="1462">
-    <w:abstractNumId w:val="993"/>
-  </w:num>
-  <w:num w:numId="1463">
-    <w:abstractNumId w:val="993"/>
-  </w:num>
-  <w:num w:numId="1464">
-    <w:abstractNumId w:val="992"/>
-  </w:num>
-  <w:num w:numId="1465">
-    <w:abstractNumId w:val="992"/>
-  </w:num>
-  <w:num w:numId="1466">
-    <w:abstractNumId w:val="993"/>
-  </w:num>
-  <w:num w:numId="1467">
-    <w:abstractNumId w:val="993"/>
-  </w:num>
-  <w:num w:numId="1468">
-    <w:abstractNumId w:val="993"/>
-  </w:num>
-  <w:num w:numId="1469">
-    <w:abstractNumId w:val="993"/>
-  </w:num>
-  <w:num w:numId="1470">
-    <w:abstractNumId w:val="993"/>
-  </w:num>
-  <w:num w:numId="1471">
-    <w:abstractNumId w:val="993"/>
-  </w:num>
-  <w:num w:numId="1472">
-    <w:abstractNumId w:val="993"/>
-  </w:num>
-  <w:num w:numId="1473">
-    <w:abstractNumId w:val="993"/>
-  </w:num>
   <w:num w:numId="1474">
     <w:abstractNumId w:val="993"/>
   </w:num>
@@ -17924,10 +18251,10 @@
     <w:abstractNumId w:val="993"/>
   </w:num>
   <w:num w:numId="1480">
-    <w:abstractNumId w:val="992"/>
+    <w:abstractNumId w:val="993"/>
   </w:num>
   <w:num w:numId="1481">
-    <w:abstractNumId w:val="991"/>
+    <w:abstractNumId w:val="993"/>
   </w:num>
   <w:num w:numId="1482">
     <w:abstractNumId w:val="993"/>
@@ -17936,52 +18263,52 @@
     <w:abstractNumId w:val="993"/>
   </w:num>
   <w:num w:numId="1484">
-    <w:abstractNumId w:val="992"/>
+    <w:abstractNumId w:val="993"/>
   </w:num>
   <w:num w:numId="1485">
-    <w:abstractNumId w:val="992"/>
+    <w:abstractNumId w:val="993"/>
   </w:num>
   <w:num w:numId="1486">
-    <w:abstractNumId w:val="992"/>
+    <w:abstractNumId w:val="993"/>
   </w:num>
   <w:num w:numId="1487">
-    <w:abstractNumId w:val="992"/>
+    <w:abstractNumId w:val="993"/>
   </w:num>
   <w:num w:numId="1488">
     <w:abstractNumId w:val="992"/>
   </w:num>
   <w:num w:numId="1489">
-    <w:abstractNumId w:val="993"/>
+    <w:abstractNumId w:val="991"/>
   </w:num>
   <w:num w:numId="1490">
+    <w:abstractNumId w:val="993"/>
+  </w:num>
+  <w:num w:numId="1491">
+    <w:abstractNumId w:val="993"/>
+  </w:num>
+  <w:num w:numId="1492">
     <w:abstractNumId w:val="992"/>
   </w:num>
-  <w:num w:numId="1491">
+  <w:num w:numId="1493">
     <w:abstractNumId w:val="992"/>
   </w:num>
-  <w:num w:numId="1492">
-    <w:abstractNumId w:val="993"/>
-  </w:num>
-  <w:num w:numId="1493">
-    <w:abstractNumId w:val="993"/>
-  </w:num>
   <w:num w:numId="1494">
-    <w:abstractNumId w:val="993"/>
+    <w:abstractNumId w:val="992"/>
   </w:num>
   <w:num w:numId="1495">
-    <w:abstractNumId w:val="993"/>
+    <w:abstractNumId w:val="992"/>
   </w:num>
   <w:num w:numId="1496">
-    <w:abstractNumId w:val="993"/>
+    <w:abstractNumId w:val="992"/>
   </w:num>
   <w:num w:numId="1497">
     <w:abstractNumId w:val="993"/>
   </w:num>
   <w:num w:numId="1498">
-    <w:abstractNumId w:val="993"/>
+    <w:abstractNumId w:val="992"/>
   </w:num>
   <w:num w:numId="1499">
-    <w:abstractNumId w:val="993"/>
+    <w:abstractNumId w:val="992"/>
   </w:num>
   <w:num w:numId="1500">
     <w:abstractNumId w:val="993"/>
@@ -18002,37 +18329,37 @@
     <w:abstractNumId w:val="993"/>
   </w:num>
   <w:num w:numId="1506">
+    <w:abstractNumId w:val="993"/>
+  </w:num>
+  <w:num w:numId="1507">
+    <w:abstractNumId w:val="993"/>
+  </w:num>
+  <w:num w:numId="1508">
+    <w:abstractNumId w:val="993"/>
+  </w:num>
+  <w:num w:numId="1509">
+    <w:abstractNumId w:val="993"/>
+  </w:num>
+  <w:num w:numId="1510">
+    <w:abstractNumId w:val="993"/>
+  </w:num>
+  <w:num w:numId="1511">
+    <w:abstractNumId w:val="993"/>
+  </w:num>
+  <w:num w:numId="1512">
+    <w:abstractNumId w:val="993"/>
+  </w:num>
+  <w:num w:numId="1513">
+    <w:abstractNumId w:val="993"/>
+  </w:num>
+  <w:num w:numId="1514">
     <w:abstractNumId w:val="991"/>
   </w:num>
-  <w:num w:numId="1507">
-    <w:abstractNumId w:val="993"/>
-  </w:num>
-  <w:num w:numId="1508">
-    <w:abstractNumId w:val="993"/>
-  </w:num>
-  <w:num w:numId="1509">
-    <w:abstractNumId w:val="993"/>
-  </w:num>
-  <w:num w:numId="1510">
-    <w:abstractNumId w:val="991"/>
-  </w:num>
-  <w:num w:numId="1511">
-    <w:abstractNumId w:val="993"/>
-  </w:num>
-  <w:num w:numId="1512">
-    <w:abstractNumId w:val="993"/>
-  </w:num>
-  <w:num w:numId="1513">
-    <w:abstractNumId w:val="992"/>
-  </w:num>
-  <w:num w:numId="1514">
-    <w:abstractNumId w:val="992"/>
-  </w:num>
   <w:num w:numId="1515">
     <w:abstractNumId w:val="993"/>
   </w:num>
   <w:num w:numId="1516">
-    <w:abstractNumId w:val="991"/>
+    <w:abstractNumId w:val="993"/>
   </w:num>
   <w:num w:numId="1517">
     <w:abstractNumId w:val="993"/>
@@ -18047,94 +18374,94 @@
     <w:abstractNumId w:val="993"/>
   </w:num>
   <w:num w:numId="1521">
-    <w:abstractNumId w:val="993"/>
+    <w:abstractNumId w:val="992"/>
   </w:num>
   <w:num w:numId="1522">
-    <w:abstractNumId w:val="993"/>
+    <w:abstractNumId w:val="992"/>
   </w:num>
   <w:num w:numId="1523">
     <w:abstractNumId w:val="993"/>
   </w:num>
   <w:num w:numId="1524">
-    <w:abstractNumId w:val="993"/>
+    <w:abstractNumId w:val="991"/>
   </w:num>
   <w:num w:numId="1525">
     <w:abstractNumId w:val="993"/>
   </w:num>
   <w:num w:numId="1526">
-    <w:abstractNumId w:val="993"/>
+    <w:abstractNumId w:val="991"/>
   </w:num>
   <w:num w:numId="1527">
     <w:abstractNumId w:val="993"/>
   </w:num>
   <w:num w:numId="1528">
+    <w:abstractNumId w:val="993"/>
+  </w:num>
+  <w:num w:numId="1529">
+    <w:abstractNumId w:val="993"/>
+  </w:num>
+  <w:num w:numId="1530">
+    <w:abstractNumId w:val="993"/>
+  </w:num>
+  <w:num w:numId="1531">
+    <w:abstractNumId w:val="993"/>
+  </w:num>
+  <w:num w:numId="1532">
+    <w:abstractNumId w:val="993"/>
+  </w:num>
+  <w:num w:numId="1533">
+    <w:abstractNumId w:val="993"/>
+  </w:num>
+  <w:num w:numId="1534">
+    <w:abstractNumId w:val="993"/>
+  </w:num>
+  <w:num w:numId="1535">
+    <w:abstractNumId w:val="993"/>
+  </w:num>
+  <w:num w:numId="1536">
     <w:abstractNumId w:val="991"/>
   </w:num>
-  <w:num w:numId="1529">
-    <w:abstractNumId w:val="993"/>
-  </w:num>
-  <w:num w:numId="1530">
-    <w:abstractNumId w:val="993"/>
-  </w:num>
-  <w:num w:numId="1531">
-    <w:abstractNumId w:val="992"/>
-  </w:num>
-  <w:num w:numId="1532">
-    <w:abstractNumId w:val="992"/>
-  </w:num>
-  <w:num w:numId="1533">
-    <w:abstractNumId w:val="993"/>
-  </w:num>
-  <w:num w:numId="1534">
-    <w:abstractNumId w:val="993"/>
-  </w:num>
-  <w:num w:numId="1535">
-    <w:abstractNumId w:val="993"/>
-  </w:num>
-  <w:num w:numId="1536">
-    <w:abstractNumId w:val="992"/>
-  </w:num>
   <w:num w:numId="1537">
-    <w:abstractNumId w:val="992"/>
+    <w:abstractNumId w:val="993"/>
   </w:num>
   <w:num w:numId="1538">
-    <w:abstractNumId w:val="992"/>
+    <w:abstractNumId w:val="993"/>
   </w:num>
   <w:num w:numId="1539">
     <w:abstractNumId w:val="992"/>
   </w:num>
   <w:num w:numId="1540">
-    <w:abstractNumId w:val="993"/>
+    <w:abstractNumId w:val="992"/>
   </w:num>
   <w:num w:numId="1541">
+    <w:abstractNumId w:val="993"/>
+  </w:num>
+  <w:num w:numId="1542">
+    <w:abstractNumId w:val="993"/>
+  </w:num>
+  <w:num w:numId="1543">
+    <w:abstractNumId w:val="993"/>
+  </w:num>
+  <w:num w:numId="1544">
     <w:abstractNumId w:val="992"/>
   </w:num>
-  <w:num w:numId="1542">
+  <w:num w:numId="1545">
     <w:abstractNumId w:val="992"/>
   </w:num>
-  <w:num w:numId="1543">
-    <w:abstractNumId w:val="993"/>
-  </w:num>
-  <w:num w:numId="1544">
-    <w:abstractNumId w:val="993"/>
-  </w:num>
-  <w:num w:numId="1545">
-    <w:abstractNumId w:val="993"/>
-  </w:num>
   <w:num w:numId="1546">
-    <w:abstractNumId w:val="993"/>
+    <w:abstractNumId w:val="992"/>
   </w:num>
   <w:num w:numId="1547">
-    <w:abstractNumId w:val="993"/>
+    <w:abstractNumId w:val="992"/>
   </w:num>
   <w:num w:numId="1548">
     <w:abstractNumId w:val="993"/>
   </w:num>
   <w:num w:numId="1549">
-    <w:abstractNumId w:val="993"/>
+    <w:abstractNumId w:val="992"/>
   </w:num>
   <w:num w:numId="1550">
-    <w:abstractNumId w:val="993"/>
+    <w:abstractNumId w:val="992"/>
   </w:num>
   <w:num w:numId="1551">
     <w:abstractNumId w:val="993"/>
@@ -18173,31 +18500,31 @@
     <w:abstractNumId w:val="993"/>
   </w:num>
   <w:num w:numId="1563">
+    <w:abstractNumId w:val="993"/>
+  </w:num>
+  <w:num w:numId="1564">
+    <w:abstractNumId w:val="993"/>
+  </w:num>
+  <w:num w:numId="1565">
+    <w:abstractNumId w:val="993"/>
+  </w:num>
+  <w:num w:numId="1566">
+    <w:abstractNumId w:val="993"/>
+  </w:num>
+  <w:num w:numId="1567">
+    <w:abstractNumId w:val="993"/>
+  </w:num>
+  <w:num w:numId="1568">
+    <w:abstractNumId w:val="993"/>
+  </w:num>
+  <w:num w:numId="1569">
+    <w:abstractNumId w:val="993"/>
+  </w:num>
+  <w:num w:numId="1570">
+    <w:abstractNumId w:val="993"/>
+  </w:num>
+  <w:num w:numId="1571">
     <w:abstractNumId w:val="991"/>
-  </w:num>
-  <w:num w:numId="1564">
-    <w:abstractNumId w:val="992"/>
-  </w:num>
-  <w:num w:numId="1565">
-    <w:abstractNumId w:val="992"/>
-  </w:num>
-  <w:num w:numId="1566">
-    <w:abstractNumId w:val="992"/>
-  </w:num>
-  <w:num w:numId="1567">
-    <w:abstractNumId w:val="992"/>
-  </w:num>
-  <w:num w:numId="1568">
-    <w:abstractNumId w:val="992"/>
-  </w:num>
-  <w:num w:numId="1569">
-    <w:abstractNumId w:val="992"/>
-  </w:num>
-  <w:num w:numId="1570">
-    <w:abstractNumId w:val="992"/>
-  </w:num>
-  <w:num w:numId="1571">
-    <w:abstractNumId w:val="992"/>
   </w:num>
   <w:num w:numId="1572">
     <w:abstractNumId w:val="992"/>
@@ -18224,56 +18551,56 @@
     <w:abstractNumId w:val="992"/>
   </w:num>
   <w:num w:numId="1580">
-    <w:abstractNumId w:val="993"/>
+    <w:abstractNumId w:val="992"/>
   </w:num>
   <w:num w:numId="1581">
-    <w:abstractNumId w:val="993"/>
+    <w:abstractNumId w:val="992"/>
   </w:num>
   <w:num w:numId="1582">
-    <w:abstractNumId w:val="993"/>
+    <w:abstractNumId w:val="992"/>
   </w:num>
   <w:num w:numId="1583">
-    <w:abstractNumId w:val="993"/>
+    <w:abstractNumId w:val="992"/>
   </w:num>
   <w:num w:numId="1584">
-    <w:abstractNumId w:val="993"/>
+    <w:abstractNumId w:val="992"/>
   </w:num>
   <w:num w:numId="1585">
+    <w:abstractNumId w:val="992"/>
+  </w:num>
+  <w:num w:numId="1586">
+    <w:abstractNumId w:val="992"/>
+  </w:num>
+  <w:num w:numId="1587">
+    <w:abstractNumId w:val="992"/>
+  </w:num>
+  <w:num w:numId="1588">
+    <w:abstractNumId w:val="993"/>
+  </w:num>
+  <w:num w:numId="1589">
+    <w:abstractNumId w:val="993"/>
+  </w:num>
+  <w:num w:numId="1590">
+    <w:abstractNumId w:val="993"/>
+  </w:num>
+  <w:num w:numId="1591">
+    <w:abstractNumId w:val="993"/>
+  </w:num>
+  <w:num w:numId="1592">
+    <w:abstractNumId w:val="993"/>
+  </w:num>
+  <w:num w:numId="1593">
     <w:abstractNumId w:val="991"/>
   </w:num>
-  <w:num w:numId="1586">
-    <w:abstractNumId w:val="993"/>
-  </w:num>
-  <w:num w:numId="1587">
-    <w:abstractNumId w:val="993"/>
-  </w:num>
-  <w:num w:numId="1588">
+  <w:num w:numId="1594">
+    <w:abstractNumId w:val="993"/>
+  </w:num>
+  <w:num w:numId="1595">
+    <w:abstractNumId w:val="993"/>
+  </w:num>
+  <w:num w:numId="1596">
     <w:abstractNumId w:val="991"/>
   </w:num>
-  <w:num w:numId="1589">
-    <w:abstractNumId w:val="993"/>
-  </w:num>
-  <w:num w:numId="1590">
-    <w:abstractNumId w:val="993"/>
-  </w:num>
-  <w:num w:numId="1591">
-    <w:abstractNumId w:val="993"/>
-  </w:num>
-  <w:num w:numId="1592">
-    <w:abstractNumId w:val="993"/>
-  </w:num>
-  <w:num w:numId="1593">
-    <w:abstractNumId w:val="993"/>
-  </w:num>
-  <w:num w:numId="1594">
-    <w:abstractNumId w:val="993"/>
-  </w:num>
-  <w:num w:numId="1595">
-    <w:abstractNumId w:val="993"/>
-  </w:num>
-  <w:num w:numId="1596">
-    <w:abstractNumId w:val="993"/>
-  </w:num>
   <w:num w:numId="1597">
     <w:abstractNumId w:val="993"/>
   </w:num>
@@ -18281,73 +18608,73 @@
     <w:abstractNumId w:val="993"/>
   </w:num>
   <w:num w:numId="1599">
+    <w:abstractNumId w:val="993"/>
+  </w:num>
+  <w:num w:numId="1600">
+    <w:abstractNumId w:val="993"/>
+  </w:num>
+  <w:num w:numId="1601">
+    <w:abstractNumId w:val="993"/>
+  </w:num>
+  <w:num w:numId="1602">
+    <w:abstractNumId w:val="993"/>
+  </w:num>
+  <w:num w:numId="1603">
+    <w:abstractNumId w:val="993"/>
+  </w:num>
+  <w:num w:numId="1604">
+    <w:abstractNumId w:val="993"/>
+  </w:num>
+  <w:num w:numId="1605">
+    <w:abstractNumId w:val="993"/>
+  </w:num>
+  <w:num w:numId="1606">
+    <w:abstractNumId w:val="993"/>
+  </w:num>
+  <w:num w:numId="1607">
     <w:abstractNumId w:val="991"/>
   </w:num>
-  <w:num w:numId="1600">
-    <w:abstractNumId w:val="993"/>
-  </w:num>
-  <w:num w:numId="1601">
+  <w:num w:numId="1608">
+    <w:abstractNumId w:val="993"/>
+  </w:num>
+  <w:num w:numId="1609">
     <w:abstractNumId w:val="991"/>
   </w:num>
-  <w:num w:numId="1602">
-    <w:abstractNumId w:val="993"/>
-  </w:num>
-  <w:num w:numId="1603">
-    <w:abstractNumId w:val="993"/>
-  </w:num>
-  <w:num w:numId="1604">
-    <w:abstractNumId w:val="993"/>
-  </w:num>
-  <w:num w:numId="1605">
-    <w:abstractNumId w:val="993"/>
-  </w:num>
-  <w:num w:numId="1606">
-    <w:abstractNumId w:val="992"/>
-  </w:num>
-  <w:num w:numId="1607">
-    <w:abstractNumId w:val="992"/>
-  </w:num>
-  <w:num w:numId="1608">
-    <w:abstractNumId w:val="993"/>
-  </w:num>
-  <w:num w:numId="1609">
-    <w:abstractNumId w:val="992"/>
-  </w:num>
   <w:num w:numId="1610">
-    <w:abstractNumId w:val="992"/>
+    <w:abstractNumId w:val="993"/>
   </w:num>
   <w:num w:numId="1611">
-    <w:abstractNumId w:val="992"/>
+    <w:abstractNumId w:val="993"/>
   </w:num>
   <w:num w:numId="1612">
-    <w:abstractNumId w:val="992"/>
+    <w:abstractNumId w:val="993"/>
   </w:num>
   <w:num w:numId="1613">
-    <w:abstractNumId w:val="992"/>
+    <w:abstractNumId w:val="993"/>
   </w:num>
   <w:num w:numId="1614">
     <w:abstractNumId w:val="992"/>
   </w:num>
   <w:num w:numId="1615">
-    <w:abstractNumId w:val="993"/>
+    <w:abstractNumId w:val="992"/>
   </w:num>
   <w:num w:numId="1616">
     <w:abstractNumId w:val="993"/>
   </w:num>
   <w:num w:numId="1617">
-    <w:abstractNumId w:val="993"/>
+    <w:abstractNumId w:val="992"/>
   </w:num>
   <w:num w:numId="1618">
-    <w:abstractNumId w:val="993"/>
+    <w:abstractNumId w:val="992"/>
   </w:num>
   <w:num w:numId="1619">
-    <w:abstractNumId w:val="993"/>
+    <w:abstractNumId w:val="992"/>
   </w:num>
   <w:num w:numId="1620">
-    <w:abstractNumId w:val="993"/>
+    <w:abstractNumId w:val="992"/>
   </w:num>
   <w:num w:numId="1621">
-    <w:abstractNumId w:val="993"/>
+    <w:abstractNumId w:val="992"/>
   </w:num>
   <w:num w:numId="1622">
     <w:abstractNumId w:val="992"/>
@@ -18362,7 +18689,7 @@
     <w:abstractNumId w:val="993"/>
   </w:num>
   <w:num w:numId="1626">
-    <w:abstractNumId w:val="992"/>
+    <w:abstractNumId w:val="993"/>
   </w:num>
   <w:num w:numId="1627">
     <w:abstractNumId w:val="993"/>
@@ -18386,7 +18713,7 @@
     <w:abstractNumId w:val="993"/>
   </w:num>
   <w:num w:numId="1634">
-    <w:abstractNumId w:val="993"/>
+    <w:abstractNumId w:val="992"/>
   </w:num>
   <w:num w:numId="1635">
     <w:abstractNumId w:val="993"/>
@@ -18395,16 +18722,16 @@
     <w:abstractNumId w:val="993"/>
   </w:num>
   <w:num w:numId="1637">
+    <w:abstractNumId w:val="993"/>
+  </w:num>
+  <w:num w:numId="1638">
     <w:abstractNumId w:val="992"/>
   </w:num>
-  <w:num w:numId="1638">
-    <w:abstractNumId w:val="993"/>
-  </w:num>
   <w:num w:numId="1639">
-    <w:abstractNumId w:val="992"/>
+    <w:abstractNumId w:val="993"/>
   </w:num>
   <w:num w:numId="1640">
-    <w:abstractNumId w:val="992"/>
+    <w:abstractNumId w:val="993"/>
   </w:num>
   <w:num w:numId="1641">
     <w:abstractNumId w:val="993"/>
@@ -18422,7 +18749,7 @@
     <w:abstractNumId w:val="992"/>
   </w:num>
   <w:num w:numId="1646">
-    <w:abstractNumId w:val="992"/>
+    <w:abstractNumId w:val="993"/>
   </w:num>
   <w:num w:numId="1647">
     <w:abstractNumId w:val="992"/>
@@ -18434,13 +18761,13 @@
     <w:abstractNumId w:val="993"/>
   </w:num>
   <w:num w:numId="1650">
-    <w:abstractNumId w:val="992"/>
+    <w:abstractNumId w:val="993"/>
   </w:num>
   <w:num w:numId="1651">
-    <w:abstractNumId w:val="992"/>
+    <w:abstractNumId w:val="993"/>
   </w:num>
   <w:num w:numId="1652">
-    <w:abstractNumId w:val="992"/>
+    <w:abstractNumId w:val="993"/>
   </w:num>
   <w:num w:numId="1653">
     <w:abstractNumId w:val="992"/>
@@ -18455,7 +18782,7 @@
     <w:abstractNumId w:val="992"/>
   </w:num>
   <w:num w:numId="1657">
-    <w:abstractNumId w:val="992"/>
+    <w:abstractNumId w:val="993"/>
   </w:num>
   <w:num w:numId="1658">
     <w:abstractNumId w:val="992"/>
@@ -18554,6 +18881,30 @@
     <w:abstractNumId w:val="992"/>
   </w:num>
   <w:num w:numId="1690">
+    <w:abstractNumId w:val="992"/>
+  </w:num>
+  <w:num w:numId="1691">
+    <w:abstractNumId w:val="992"/>
+  </w:num>
+  <w:num w:numId="1692">
+    <w:abstractNumId w:val="992"/>
+  </w:num>
+  <w:num w:numId="1693">
+    <w:abstractNumId w:val="992"/>
+  </w:num>
+  <w:num w:numId="1694">
+    <w:abstractNumId w:val="992"/>
+  </w:num>
+  <w:num w:numId="1695">
+    <w:abstractNumId w:val="992"/>
+  </w:num>
+  <w:num w:numId="1696">
+    <w:abstractNumId w:val="992"/>
+  </w:num>
+  <w:num w:numId="1697">
+    <w:abstractNumId w:val="992"/>
+  </w:num>
+  <w:num w:numId="1698">
     <w:abstractNumId w:val="992"/>
   </w:num>
 </w:numbering>

</xml_diff>

<commit_message>
Record AI repair production smoke
</commit_message>
<xml_diff>
--- a/MASTER_M1_M2_DELIVERY_CHECKLIST.docx
+++ b/MASTER_M1_M2_DELIVERY_CHECKLIST.docx
@@ -81,10 +81,10 @@
         <w:tblLook w:firstRow="1" w:lastRow="0" w:firstColumn="0" w:lastColumn="0" w:noHBand="0" w:noVBand="0" w:val="0020"/>
       </w:tblPr>
       <w:tblGrid>
-        <w:gridCol w:w="2164"/>
-        <w:gridCol w:w="368"/>
-        <w:gridCol w:w="460"/>
-        <w:gridCol w:w="4926"/>
+        <w:gridCol w:w="1990"/>
+        <w:gridCol w:w="338"/>
+        <w:gridCol w:w="423"/>
+        <w:gridCol w:w="5167"/>
       </w:tblGrid>
       <w:tr>
         <w:trPr>
@@ -8498,6 +8498,102 @@
         </w:numPr>
       </w:pPr>
       <w:r>
+        <w:t xml:space="preserve">Production deploy/smoke passed on</w:t>
+      </w:r>
+      <w:r>
+        <w:t xml:space="preserve"> </w:t>
+      </w:r>
+      <w:r>
+        <w:rPr>
+          <w:rStyle w:val="VerbatimChar"/>
+        </w:rPr>
+        <w:t xml:space="preserve">c30692315</w:t>
+      </w:r>
+      <w:r>
+        <w:t xml:space="preserve">:</w:t>
+      </w:r>
+      <w:r>
+        <w:t xml:space="preserve"> </w:t>
+      </w:r>
+      <w:r>
+        <w:rPr>
+          <w:rStyle w:val="VerbatimChar"/>
+        </w:rPr>
+        <w:t xml:space="preserve">/api/health</w:t>
+      </w:r>
+      <w:r>
+        <w:t xml:space="preserve"> </w:t>
+      </w:r>
+      <w:r>
+        <w:t xml:space="preserve">database/Redis ok,</w:t>
+      </w:r>
+      <w:r>
+        <w:t xml:space="preserve"> </w:t>
+      </w:r>
+      <w:r>
+        <w:rPr>
+          <w:rStyle w:val="VerbatimChar"/>
+        </w:rPr>
+        <w:t xml:space="preserve">/</w:t>
+      </w:r>
+      <w:r>
+        <w:t xml:space="preserve"> </w:t>
+      </w:r>
+      <w:r>
+        <w:t xml:space="preserve">200,</w:t>
+      </w:r>
+      <w:r>
+        <w:t xml:space="preserve"> </w:t>
+      </w:r>
+      <w:r>
+        <w:rPr>
+          <w:rStyle w:val="VerbatimChar"/>
+        </w:rPr>
+        <w:t xml:space="preserve">/login</w:t>
+      </w:r>
+      <w:r>
+        <w:t xml:space="preserve"> </w:t>
+      </w:r>
+      <w:r>
+        <w:t xml:space="preserve">200,</w:t>
+      </w:r>
+      <w:r>
+        <w:t xml:space="preserve"> </w:t>
+      </w:r>
+      <w:r>
+        <w:rPr>
+          <w:rStyle w:val="VerbatimChar"/>
+        </w:rPr>
+        <w:t xml:space="preserve">/api/auth/dev-login</w:t>
+      </w:r>
+      <w:r>
+        <w:t xml:space="preserve"> </w:t>
+      </w:r>
+      <w:r>
+        <w:t xml:space="preserve">404, live login UI dev button count</w:t>
+      </w:r>
+      <w:r>
+        <w:t xml:space="preserve"> </w:t>
+      </w:r>
+      <w:r>
+        <w:rPr>
+          <w:rStyle w:val="VerbatimChar"/>
+        </w:rPr>
+        <w:t xml:space="preserve">0</w:t>
+      </w:r>
+      <w:r>
+        <w:t xml:space="preserve">.</w:t>
+      </w:r>
+    </w:p>
+    <w:p>
+      <w:pPr>
+        <w:pStyle w:val="Compact"/>
+        <w:numPr>
+          <w:ilvl w:val="0"/>
+          <w:numId w:val="1333"/>
+        </w:numPr>
+      </w:pPr>
+      <w:r>
         <w:t xml:space="preserve">Evidence JSON added:</w:t>
       </w:r>
       <w:r>
@@ -8528,7 +8624,7 @@
         <w:pStyle w:val="Compact"/>
         <w:numPr>
           <w:ilvl w:val="0"/>
-          <w:numId w:val="1333"/>
+          <w:numId w:val="1334"/>
         </w:numPr>
       </w:pPr>
       <w:r>
@@ -8552,7 +8648,7 @@
         <w:pStyle w:val="Compact"/>
         <w:numPr>
           <w:ilvl w:val="0"/>
-          <w:numId w:val="1334"/>
+          <w:numId w:val="1335"/>
         </w:numPr>
       </w:pPr>
       <w:r>
@@ -8576,7 +8672,7 @@
         <w:pStyle w:val="Compact"/>
         <w:numPr>
           <w:ilvl w:val="0"/>
-          <w:numId w:val="1335"/>
+          <w:numId w:val="1336"/>
         </w:numPr>
       </w:pPr>
       <w:r>
@@ -8603,7 +8699,7 @@
         <w:pStyle w:val="Compact"/>
         <w:numPr>
           <w:ilvl w:val="0"/>
-          <w:numId w:val="1336"/>
+          <w:numId w:val="1337"/>
         </w:numPr>
       </w:pPr>
       <w:r>
@@ -8627,7 +8723,7 @@
         <w:pStyle w:val="Compact"/>
         <w:numPr>
           <w:ilvl w:val="0"/>
-          <w:numId w:val="1337"/>
+          <w:numId w:val="1338"/>
         </w:numPr>
       </w:pPr>
       <w:r>
@@ -8639,7 +8735,7 @@
         <w:pStyle w:val="Compact"/>
         <w:numPr>
           <w:ilvl w:val="0"/>
-          <w:numId w:val="1338"/>
+          <w:numId w:val="1339"/>
         </w:numPr>
       </w:pPr>
       <w:r>
@@ -8666,7 +8762,7 @@
         <w:pStyle w:val="Compact"/>
         <w:numPr>
           <w:ilvl w:val="0"/>
-          <w:numId w:val="1339"/>
+          <w:numId w:val="1340"/>
         </w:numPr>
       </w:pPr>
       <w:r>
@@ -8678,7 +8774,7 @@
         <w:pStyle w:val="Compact"/>
         <w:numPr>
           <w:ilvl w:val="1"/>
-          <w:numId w:val="1340"/>
+          <w:numId w:val="1341"/>
         </w:numPr>
       </w:pPr>
       <w:r>
@@ -8696,7 +8792,7 @@
         <w:pStyle w:val="Compact"/>
         <w:numPr>
           <w:ilvl w:val="1"/>
-          <w:numId w:val="1340"/>
+          <w:numId w:val="1341"/>
         </w:numPr>
       </w:pPr>
       <w:r>
@@ -8714,7 +8810,7 @@
         <w:pStyle w:val="Compact"/>
         <w:numPr>
           <w:ilvl w:val="0"/>
-          <w:numId w:val="1341"/>
+          <w:numId w:val="1342"/>
         </w:numPr>
       </w:pPr>
       <w:r>
@@ -8741,7 +8837,7 @@
         <w:pStyle w:val="Compact"/>
         <w:numPr>
           <w:ilvl w:val="0"/>
-          <w:numId w:val="1342"/>
+          <w:numId w:val="1343"/>
         </w:numPr>
       </w:pPr>
       <w:r>
@@ -8768,7 +8864,7 @@
         <w:pStyle w:val="Compact"/>
         <w:numPr>
           <w:ilvl w:val="0"/>
-          <w:numId w:val="1343"/>
+          <w:numId w:val="1344"/>
         </w:numPr>
       </w:pPr>
       <w:r>
@@ -8795,7 +8891,7 @@
         <w:pStyle w:val="Compact"/>
         <w:numPr>
           <w:ilvl w:val="0"/>
-          <w:numId w:val="1344"/>
+          <w:numId w:val="1345"/>
         </w:numPr>
       </w:pPr>
       <w:r>
@@ -8807,7 +8903,7 @@
         <w:pStyle w:val="Compact"/>
         <w:numPr>
           <w:ilvl w:val="0"/>
-          <w:numId w:val="1345"/>
+          <w:numId w:val="1346"/>
         </w:numPr>
       </w:pPr>
       <w:r>
@@ -8819,7 +8915,7 @@
         <w:pStyle w:val="Compact"/>
         <w:numPr>
           <w:ilvl w:val="0"/>
-          <w:numId w:val="1346"/>
+          <w:numId w:val="1347"/>
         </w:numPr>
       </w:pPr>
       <w:r>
@@ -8841,7 +8937,7 @@
         <w:pStyle w:val="Compact"/>
         <w:numPr>
           <w:ilvl w:val="0"/>
-          <w:numId w:val="1347"/>
+          <w:numId w:val="1348"/>
         </w:numPr>
       </w:pPr>
       <w:r>
@@ -8865,7 +8961,7 @@
         <w:pStyle w:val="Compact"/>
         <w:numPr>
           <w:ilvl w:val="0"/>
-          <w:numId w:val="1348"/>
+          <w:numId w:val="1349"/>
         </w:numPr>
       </w:pPr>
       <w:r>
@@ -8889,7 +8985,7 @@
         <w:pStyle w:val="Compact"/>
         <w:numPr>
           <w:ilvl w:val="0"/>
-          <w:numId w:val="1349"/>
+          <w:numId w:val="1350"/>
         </w:numPr>
       </w:pPr>
       <w:r>
@@ -8901,7 +8997,7 @@
         <w:pStyle w:val="Compact"/>
         <w:numPr>
           <w:ilvl w:val="0"/>
-          <w:numId w:val="1350"/>
+          <w:numId w:val="1351"/>
         </w:numPr>
       </w:pPr>
       <w:r>
@@ -8937,7 +9033,7 @@
         <w:pStyle w:val="Compact"/>
         <w:numPr>
           <w:ilvl w:val="0"/>
-          <w:numId w:val="1351"/>
+          <w:numId w:val="1352"/>
         </w:numPr>
       </w:pPr>
       <w:r>
@@ -8964,7 +9060,7 @@
         <w:pStyle w:val="Compact"/>
         <w:numPr>
           <w:ilvl w:val="0"/>
-          <w:numId w:val="1352"/>
+          <w:numId w:val="1353"/>
         </w:numPr>
       </w:pPr>
       <w:r>
@@ -8986,7 +9082,7 @@
         <w:pStyle w:val="Compact"/>
         <w:numPr>
           <w:ilvl w:val="0"/>
-          <w:numId w:val="1353"/>
+          <w:numId w:val="1354"/>
         </w:numPr>
       </w:pPr>
       <w:r>
@@ -9013,7 +9109,7 @@
         <w:pStyle w:val="Compact"/>
         <w:numPr>
           <w:ilvl w:val="0"/>
-          <w:numId w:val="1354"/>
+          <w:numId w:val="1355"/>
         </w:numPr>
       </w:pPr>
       <w:r>
@@ -9040,7 +9136,7 @@
         <w:pStyle w:val="Compact"/>
         <w:numPr>
           <w:ilvl w:val="0"/>
-          <w:numId w:val="1355"/>
+          <w:numId w:val="1356"/>
         </w:numPr>
       </w:pPr>
       <w:r>
@@ -9067,7 +9163,7 @@
         <w:pStyle w:val="Compact"/>
         <w:numPr>
           <w:ilvl w:val="0"/>
-          <w:numId w:val="1356"/>
+          <w:numId w:val="1357"/>
         </w:numPr>
       </w:pPr>
       <w:r>
@@ -9079,7 +9175,7 @@
         <w:pStyle w:val="Compact"/>
         <w:numPr>
           <w:ilvl w:val="0"/>
-          <w:numId w:val="1357"/>
+          <w:numId w:val="1358"/>
         </w:numPr>
       </w:pPr>
       <w:r>
@@ -9091,7 +9187,7 @@
         <w:pStyle w:val="Compact"/>
         <w:numPr>
           <w:ilvl w:val="0"/>
-          <w:numId w:val="1358"/>
+          <w:numId w:val="1359"/>
         </w:numPr>
       </w:pPr>
       <w:r>
@@ -9103,7 +9199,7 @@
         <w:pStyle w:val="Compact"/>
         <w:numPr>
           <w:ilvl w:val="0"/>
-          <w:numId w:val="1359"/>
+          <w:numId w:val="1360"/>
         </w:numPr>
       </w:pPr>
       <w:r>
@@ -9115,7 +9211,7 @@
         <w:pStyle w:val="Compact"/>
         <w:numPr>
           <w:ilvl w:val="0"/>
-          <w:numId w:val="1360"/>
+          <w:numId w:val="1361"/>
         </w:numPr>
       </w:pPr>
       <w:r>
@@ -9127,7 +9223,7 @@
         <w:pStyle w:val="Compact"/>
         <w:numPr>
           <w:ilvl w:val="0"/>
-          <w:numId w:val="1361"/>
+          <w:numId w:val="1362"/>
         </w:numPr>
       </w:pPr>
       <w:r>
@@ -9179,7 +9275,7 @@
         <w:pStyle w:val="Compact"/>
         <w:numPr>
           <w:ilvl w:val="0"/>
-          <w:numId w:val="1362"/>
+          <w:numId w:val="1363"/>
         </w:numPr>
       </w:pPr>
       <w:r>
@@ -9218,7 +9314,7 @@
         <w:pStyle w:val="Compact"/>
         <w:numPr>
           <w:ilvl w:val="0"/>
-          <w:numId w:val="1363"/>
+          <w:numId w:val="1364"/>
         </w:numPr>
       </w:pPr>
       <w:r>
@@ -9230,7 +9326,7 @@
         <w:pStyle w:val="Compact"/>
         <w:numPr>
           <w:ilvl w:val="0"/>
-          <w:numId w:val="1364"/>
+          <w:numId w:val="1365"/>
         </w:numPr>
       </w:pPr>
       <w:r>
@@ -9242,7 +9338,7 @@
         <w:pStyle w:val="Compact"/>
         <w:numPr>
           <w:ilvl w:val="0"/>
-          <w:numId w:val="1365"/>
+          <w:numId w:val="1366"/>
         </w:numPr>
       </w:pPr>
       <w:r>
@@ -9254,7 +9350,7 @@
         <w:pStyle w:val="Compact"/>
         <w:numPr>
           <w:ilvl w:val="0"/>
-          <w:numId w:val="1366"/>
+          <w:numId w:val="1367"/>
         </w:numPr>
       </w:pPr>
       <w:r>
@@ -9266,7 +9362,7 @@
         <w:pStyle w:val="Compact"/>
         <w:numPr>
           <w:ilvl w:val="0"/>
-          <w:numId w:val="1367"/>
+          <w:numId w:val="1368"/>
         </w:numPr>
       </w:pPr>
       <w:r>
@@ -9278,7 +9374,7 @@
         <w:pStyle w:val="Compact"/>
         <w:numPr>
           <w:ilvl w:val="1"/>
-          <w:numId w:val="1368"/>
+          <w:numId w:val="1369"/>
         </w:numPr>
       </w:pPr>
       <w:r>
@@ -9311,7 +9407,7 @@
         <w:pStyle w:val="Compact"/>
         <w:numPr>
           <w:ilvl w:val="1"/>
-          <w:numId w:val="1368"/>
+          <w:numId w:val="1369"/>
         </w:numPr>
       </w:pPr>
       <w:r>
@@ -9344,7 +9440,7 @@
         <w:pStyle w:val="Compact"/>
         <w:numPr>
           <w:ilvl w:val="1"/>
-          <w:numId w:val="1368"/>
+          <w:numId w:val="1369"/>
         </w:numPr>
       </w:pPr>
       <w:r>
@@ -9377,7 +9473,7 @@
         <w:pStyle w:val="Compact"/>
         <w:numPr>
           <w:ilvl w:val="1"/>
-          <w:numId w:val="1368"/>
+          <w:numId w:val="1369"/>
         </w:numPr>
       </w:pPr>
       <w:r>
@@ -9410,7 +9506,7 @@
         <w:pStyle w:val="Compact"/>
         <w:numPr>
           <w:ilvl w:val="1"/>
-          <w:numId w:val="1368"/>
+          <w:numId w:val="1369"/>
         </w:numPr>
       </w:pPr>
       <w:r>
@@ -9443,7 +9539,7 @@
         <w:pStyle w:val="Compact"/>
         <w:numPr>
           <w:ilvl w:val="0"/>
-          <w:numId w:val="1369"/>
+          <w:numId w:val="1370"/>
         </w:numPr>
       </w:pPr>
       <w:r>
@@ -9497,7 +9593,7 @@
         <w:pStyle w:val="Compact"/>
         <w:numPr>
           <w:ilvl w:val="0"/>
-          <w:numId w:val="1370"/>
+          <w:numId w:val="1371"/>
         </w:numPr>
       </w:pPr>
       <w:r>
@@ -9509,7 +9605,7 @@
         <w:pStyle w:val="Compact"/>
         <w:numPr>
           <w:ilvl w:val="0"/>
-          <w:numId w:val="1371"/>
+          <w:numId w:val="1372"/>
         </w:numPr>
       </w:pPr>
       <w:r>
@@ -9521,7 +9617,7 @@
         <w:pStyle w:val="Compact"/>
         <w:numPr>
           <w:ilvl w:val="0"/>
-          <w:numId w:val="1372"/>
+          <w:numId w:val="1373"/>
         </w:numPr>
       </w:pPr>
       <w:r>
@@ -9533,7 +9629,7 @@
         <w:pStyle w:val="Compact"/>
         <w:numPr>
           <w:ilvl w:val="0"/>
-          <w:numId w:val="1373"/>
+          <w:numId w:val="1374"/>
         </w:numPr>
       </w:pPr>
       <w:r>
@@ -9545,7 +9641,7 @@
         <w:pStyle w:val="Compact"/>
         <w:numPr>
           <w:ilvl w:val="0"/>
-          <w:numId w:val="1374"/>
+          <w:numId w:val="1375"/>
         </w:numPr>
       </w:pPr>
       <w:r>
@@ -9567,7 +9663,7 @@
         <w:pStyle w:val="Compact"/>
         <w:numPr>
           <w:ilvl w:val="0"/>
-          <w:numId w:val="1375"/>
+          <w:numId w:val="1376"/>
         </w:numPr>
       </w:pPr>
       <w:r>
@@ -9579,7 +9675,7 @@
         <w:pStyle w:val="Compact"/>
         <w:numPr>
           <w:ilvl w:val="0"/>
-          <w:numId w:val="1376"/>
+          <w:numId w:val="1377"/>
         </w:numPr>
       </w:pPr>
       <w:r>
@@ -9591,7 +9687,7 @@
         <w:pStyle w:val="Compact"/>
         <w:numPr>
           <w:ilvl w:val="0"/>
-          <w:numId w:val="1377"/>
+          <w:numId w:val="1378"/>
         </w:numPr>
       </w:pPr>
       <w:r>
@@ -9603,7 +9699,7 @@
         <w:pStyle w:val="Compact"/>
         <w:numPr>
           <w:ilvl w:val="0"/>
-          <w:numId w:val="1378"/>
+          <w:numId w:val="1379"/>
         </w:numPr>
       </w:pPr>
       <w:r>
@@ -9615,7 +9711,7 @@
         <w:pStyle w:val="Compact"/>
         <w:numPr>
           <w:ilvl w:val="0"/>
-          <w:numId w:val="1379"/>
+          <w:numId w:val="1380"/>
         </w:numPr>
       </w:pPr>
       <w:r>
@@ -9627,7 +9723,7 @@
         <w:pStyle w:val="Compact"/>
         <w:numPr>
           <w:ilvl w:val="0"/>
-          <w:numId w:val="1380"/>
+          <w:numId w:val="1381"/>
         </w:numPr>
       </w:pPr>
       <w:r>
@@ -9639,7 +9735,7 @@
         <w:pStyle w:val="Compact"/>
         <w:numPr>
           <w:ilvl w:val="0"/>
-          <w:numId w:val="1381"/>
+          <w:numId w:val="1382"/>
         </w:numPr>
       </w:pPr>
       <w:r>
@@ -9651,7 +9747,7 @@
         <w:pStyle w:val="Compact"/>
         <w:numPr>
           <w:ilvl w:val="0"/>
-          <w:numId w:val="1382"/>
+          <w:numId w:val="1383"/>
         </w:numPr>
       </w:pPr>
       <w:r>
@@ -9663,7 +9759,7 @@
         <w:pStyle w:val="Compact"/>
         <w:numPr>
           <w:ilvl w:val="0"/>
-          <w:numId w:val="1383"/>
+          <w:numId w:val="1384"/>
         </w:numPr>
       </w:pPr>
       <w:r>
@@ -9675,7 +9771,7 @@
         <w:pStyle w:val="Compact"/>
         <w:numPr>
           <w:ilvl w:val="0"/>
-          <w:numId w:val="1384"/>
+          <w:numId w:val="1385"/>
         </w:numPr>
       </w:pPr>
       <w:r>
@@ -9687,7 +9783,7 @@
         <w:pStyle w:val="Compact"/>
         <w:numPr>
           <w:ilvl w:val="0"/>
-          <w:numId w:val="1385"/>
+          <w:numId w:val="1386"/>
         </w:numPr>
       </w:pPr>
       <w:r>
@@ -9699,7 +9795,7 @@
         <w:pStyle w:val="Compact"/>
         <w:numPr>
           <w:ilvl w:val="0"/>
-          <w:numId w:val="1386"/>
+          <w:numId w:val="1387"/>
         </w:numPr>
       </w:pPr>
       <w:r>
@@ -9711,7 +9807,7 @@
         <w:pStyle w:val="Compact"/>
         <w:numPr>
           <w:ilvl w:val="0"/>
-          <w:numId w:val="1387"/>
+          <w:numId w:val="1388"/>
         </w:numPr>
       </w:pPr>
       <w:r>
@@ -9723,7 +9819,7 @@
         <w:pStyle w:val="Compact"/>
         <w:numPr>
           <w:ilvl w:val="0"/>
-          <w:numId w:val="1388"/>
+          <w:numId w:val="1389"/>
         </w:numPr>
       </w:pPr>
       <w:r>
@@ -9735,7 +9831,7 @@
         <w:pStyle w:val="Compact"/>
         <w:numPr>
           <w:ilvl w:val="0"/>
-          <w:numId w:val="1389"/>
+          <w:numId w:val="1390"/>
         </w:numPr>
       </w:pPr>
       <w:r>
@@ -9747,7 +9843,7 @@
         <w:pStyle w:val="Compact"/>
         <w:numPr>
           <w:ilvl w:val="0"/>
-          <w:numId w:val="1390"/>
+          <w:numId w:val="1391"/>
         </w:numPr>
       </w:pPr>
       <w:r>
@@ -9759,7 +9855,7 @@
         <w:pStyle w:val="Compact"/>
         <w:numPr>
           <w:ilvl w:val="0"/>
-          <w:numId w:val="1391"/>
+          <w:numId w:val="1392"/>
         </w:numPr>
       </w:pPr>
       <w:r>
@@ -9771,7 +9867,7 @@
         <w:pStyle w:val="Compact"/>
         <w:numPr>
           <w:ilvl w:val="0"/>
-          <w:numId w:val="1392"/>
+          <w:numId w:val="1393"/>
         </w:numPr>
       </w:pPr>
       <w:r>
@@ -9798,7 +9894,7 @@
         <w:pStyle w:val="Compact"/>
         <w:numPr>
           <w:ilvl w:val="0"/>
-          <w:numId w:val="1393"/>
+          <w:numId w:val="1394"/>
         </w:numPr>
       </w:pPr>
       <w:r>
@@ -9830,7 +9926,7 @@
         <w:pStyle w:val="Compact"/>
         <w:numPr>
           <w:ilvl w:val="0"/>
-          <w:numId w:val="1394"/>
+          <w:numId w:val="1395"/>
         </w:numPr>
       </w:pPr>
       <w:r>
@@ -9878,7 +9974,7 @@
         <w:pStyle w:val="Compact"/>
         <w:numPr>
           <w:ilvl w:val="0"/>
-          <w:numId w:val="1395"/>
+          <w:numId w:val="1396"/>
         </w:numPr>
       </w:pPr>
       <w:r>
@@ -9905,7 +10001,7 @@
         <w:pStyle w:val="Compact"/>
         <w:numPr>
           <w:ilvl w:val="0"/>
-          <w:numId w:val="1396"/>
+          <w:numId w:val="1397"/>
         </w:numPr>
       </w:pPr>
       <w:r>
@@ -9977,7 +10073,7 @@
         <w:pStyle w:val="Compact"/>
         <w:numPr>
           <w:ilvl w:val="0"/>
-          <w:numId w:val="1397"/>
+          <w:numId w:val="1398"/>
         </w:numPr>
       </w:pPr>
       <w:r>
@@ -10022,7 +10118,7 @@
         <w:pStyle w:val="Compact"/>
         <w:numPr>
           <w:ilvl w:val="0"/>
-          <w:numId w:val="1398"/>
+          <w:numId w:val="1399"/>
         </w:numPr>
       </w:pPr>
       <w:r>
@@ -10055,7 +10151,7 @@
         <w:pStyle w:val="Compact"/>
         <w:numPr>
           <w:ilvl w:val="0"/>
-          <w:numId w:val="1399"/>
+          <w:numId w:val="1400"/>
         </w:numPr>
       </w:pPr>
       <w:r>
@@ -10088,7 +10184,7 @@
         <w:pStyle w:val="Compact"/>
         <w:numPr>
           <w:ilvl w:val="0"/>
-          <w:numId w:val="1400"/>
+          <w:numId w:val="1401"/>
         </w:numPr>
       </w:pPr>
       <w:r>
@@ -10115,7 +10211,7 @@
         <w:pStyle w:val="Compact"/>
         <w:numPr>
           <w:ilvl w:val="0"/>
-          <w:numId w:val="1401"/>
+          <w:numId w:val="1402"/>
         </w:numPr>
       </w:pPr>
       <w:r>
@@ -10127,7 +10223,7 @@
         <w:pStyle w:val="Compact"/>
         <w:numPr>
           <w:ilvl w:val="0"/>
-          <w:numId w:val="1402"/>
+          <w:numId w:val="1403"/>
         </w:numPr>
       </w:pPr>
       <w:r>
@@ -10154,7 +10250,7 @@
         <w:pStyle w:val="Compact"/>
         <w:numPr>
           <w:ilvl w:val="0"/>
-          <w:numId w:val="1403"/>
+          <w:numId w:val="1404"/>
         </w:numPr>
       </w:pPr>
       <w:r>
@@ -10166,7 +10262,7 @@
         <w:pStyle w:val="Compact"/>
         <w:numPr>
           <w:ilvl w:val="0"/>
-          <w:numId w:val="1404"/>
+          <w:numId w:val="1405"/>
         </w:numPr>
       </w:pPr>
       <w:r>
@@ -10193,7 +10289,7 @@
         <w:pStyle w:val="Compact"/>
         <w:numPr>
           <w:ilvl w:val="0"/>
-          <w:numId w:val="1405"/>
+          <w:numId w:val="1406"/>
         </w:numPr>
       </w:pPr>
       <w:r>
@@ -10220,7 +10316,7 @@
         <w:pStyle w:val="Compact"/>
         <w:numPr>
           <w:ilvl w:val="0"/>
-          <w:numId w:val="1406"/>
+          <w:numId w:val="1407"/>
         </w:numPr>
       </w:pPr>
       <w:r>
@@ -10244,7 +10340,7 @@
         <w:pStyle w:val="Compact"/>
         <w:numPr>
           <w:ilvl w:val="0"/>
-          <w:numId w:val="1407"/>
+          <w:numId w:val="1408"/>
         </w:numPr>
       </w:pPr>
       <w:r>
@@ -10286,7 +10382,7 @@
         <w:pStyle w:val="Compact"/>
         <w:numPr>
           <w:ilvl w:val="0"/>
-          <w:numId w:val="1408"/>
+          <w:numId w:val="1409"/>
         </w:numPr>
       </w:pPr>
       <w:r>
@@ -10325,7 +10421,7 @@
         <w:pStyle w:val="Compact"/>
         <w:numPr>
           <w:ilvl w:val="0"/>
-          <w:numId w:val="1409"/>
+          <w:numId w:val="1410"/>
         </w:numPr>
       </w:pPr>
       <w:r>
@@ -10367,7 +10463,7 @@
         <w:pStyle w:val="Compact"/>
         <w:numPr>
           <w:ilvl w:val="0"/>
-          <w:numId w:val="1410"/>
+          <w:numId w:val="1411"/>
         </w:numPr>
       </w:pPr>
       <w:r>
@@ -10409,7 +10505,7 @@
         <w:pStyle w:val="Compact"/>
         <w:numPr>
           <w:ilvl w:val="0"/>
-          <w:numId w:val="1411"/>
+          <w:numId w:val="1412"/>
         </w:numPr>
       </w:pPr>
       <w:r>
@@ -10451,7 +10547,7 @@
         <w:pStyle w:val="Compact"/>
         <w:numPr>
           <w:ilvl w:val="0"/>
-          <w:numId w:val="1412"/>
+          <w:numId w:val="1413"/>
         </w:numPr>
       </w:pPr>
       <w:r>
@@ -10463,7 +10559,7 @@
         <w:pStyle w:val="Compact"/>
         <w:numPr>
           <w:ilvl w:val="0"/>
-          <w:numId w:val="1413"/>
+          <w:numId w:val="1414"/>
         </w:numPr>
       </w:pPr>
       <w:r>
@@ -10511,7 +10607,7 @@
         <w:pStyle w:val="Compact"/>
         <w:numPr>
           <w:ilvl w:val="0"/>
-          <w:numId w:val="1414"/>
+          <w:numId w:val="1415"/>
         </w:numPr>
       </w:pPr>
       <w:r>
@@ -10523,7 +10619,7 @@
         <w:pStyle w:val="Compact"/>
         <w:numPr>
           <w:ilvl w:val="0"/>
-          <w:numId w:val="1415"/>
+          <w:numId w:val="1416"/>
         </w:numPr>
       </w:pPr>
       <w:r>
@@ -10574,7 +10670,7 @@
         <w:pStyle w:val="Compact"/>
         <w:numPr>
           <w:ilvl w:val="0"/>
-          <w:numId w:val="1416"/>
+          <w:numId w:val="1417"/>
         </w:numPr>
       </w:pPr>
       <w:r>
@@ -10586,7 +10682,7 @@
         <w:pStyle w:val="Compact"/>
         <w:numPr>
           <w:ilvl w:val="0"/>
-          <w:numId w:val="1417"/>
+          <w:numId w:val="1418"/>
         </w:numPr>
       </w:pPr>
       <w:r>
@@ -10613,7 +10709,7 @@
         <w:pStyle w:val="Compact"/>
         <w:numPr>
           <w:ilvl w:val="0"/>
-          <w:numId w:val="1418"/>
+          <w:numId w:val="1419"/>
         </w:numPr>
       </w:pPr>
       <w:r>
@@ -10667,7 +10763,7 @@
         <w:pStyle w:val="Compact"/>
         <w:numPr>
           <w:ilvl w:val="0"/>
-          <w:numId w:val="1419"/>
+          <w:numId w:val="1420"/>
         </w:numPr>
       </w:pPr>
       <w:r>
@@ -10706,7 +10802,7 @@
         <w:pStyle w:val="Compact"/>
         <w:numPr>
           <w:ilvl w:val="0"/>
-          <w:numId w:val="1420"/>
+          <w:numId w:val="1421"/>
         </w:numPr>
       </w:pPr>
       <w:r>
@@ -10728,7 +10824,7 @@
         <w:pStyle w:val="Compact"/>
         <w:numPr>
           <w:ilvl w:val="0"/>
-          <w:numId w:val="1421"/>
+          <w:numId w:val="1422"/>
         </w:numPr>
       </w:pPr>
       <w:r>
@@ -10767,7 +10863,7 @@
         <w:pStyle w:val="Compact"/>
         <w:numPr>
           <w:ilvl w:val="0"/>
-          <w:numId w:val="1422"/>
+          <w:numId w:val="1423"/>
         </w:numPr>
       </w:pPr>
       <w:r>
@@ -10806,7 +10902,7 @@
         <w:pStyle w:val="Compact"/>
         <w:numPr>
           <w:ilvl w:val="0"/>
-          <w:numId w:val="1423"/>
+          <w:numId w:val="1424"/>
         </w:numPr>
       </w:pPr>
       <w:r>
@@ -10830,7 +10926,7 @@
         <w:pStyle w:val="Compact"/>
         <w:numPr>
           <w:ilvl w:val="0"/>
-          <w:numId w:val="1424"/>
+          <w:numId w:val="1425"/>
         </w:numPr>
       </w:pPr>
       <w:r>
@@ -10887,7 +10983,7 @@
         <w:pStyle w:val="Compact"/>
         <w:numPr>
           <w:ilvl w:val="0"/>
-          <w:numId w:val="1425"/>
+          <w:numId w:val="1426"/>
         </w:numPr>
       </w:pPr>
       <w:r>
@@ -10911,7 +11007,7 @@
         <w:pStyle w:val="Compact"/>
         <w:numPr>
           <w:ilvl w:val="0"/>
-          <w:numId w:val="1426"/>
+          <w:numId w:val="1427"/>
         </w:numPr>
       </w:pPr>
       <w:r>
@@ -10923,7 +11019,7 @@
         <w:pStyle w:val="Compact"/>
         <w:numPr>
           <w:ilvl w:val="1"/>
-          <w:numId w:val="1427"/>
+          <w:numId w:val="1428"/>
         </w:numPr>
       </w:pPr>
       <w:r>
@@ -10935,7 +11031,7 @@
         <w:pStyle w:val="Compact"/>
         <w:numPr>
           <w:ilvl w:val="1"/>
-          <w:numId w:val="1427"/>
+          <w:numId w:val="1428"/>
         </w:numPr>
       </w:pPr>
       <w:r>
@@ -10947,7 +11043,7 @@
         <w:pStyle w:val="Compact"/>
         <w:numPr>
           <w:ilvl w:val="1"/>
-          <w:numId w:val="1427"/>
+          <w:numId w:val="1428"/>
         </w:numPr>
       </w:pPr>
       <w:r>
@@ -10959,7 +11055,7 @@
         <w:pStyle w:val="Compact"/>
         <w:numPr>
           <w:ilvl w:val="1"/>
-          <w:numId w:val="1427"/>
+          <w:numId w:val="1428"/>
         </w:numPr>
       </w:pPr>
       <w:r>
@@ -10971,7 +11067,7 @@
         <w:pStyle w:val="Compact"/>
         <w:numPr>
           <w:ilvl w:val="1"/>
-          <w:numId w:val="1427"/>
+          <w:numId w:val="1428"/>
         </w:numPr>
       </w:pPr>
       <w:r>
@@ -10983,7 +11079,7 @@
         <w:pStyle w:val="Compact"/>
         <w:numPr>
           <w:ilvl w:val="0"/>
-          <w:numId w:val="1428"/>
+          <w:numId w:val="1429"/>
         </w:numPr>
       </w:pPr>
       <w:r>
@@ -11028,7 +11124,7 @@
         <w:pStyle w:val="Compact"/>
         <w:numPr>
           <w:ilvl w:val="0"/>
-          <w:numId w:val="1429"/>
+          <w:numId w:val="1430"/>
         </w:numPr>
       </w:pPr>
       <w:r>
@@ -11061,7 +11157,7 @@
         <w:pStyle w:val="Compact"/>
         <w:numPr>
           <w:ilvl w:val="0"/>
-          <w:numId w:val="1430"/>
+          <w:numId w:val="1431"/>
         </w:numPr>
       </w:pPr>
       <w:r>
@@ -11094,7 +11190,7 @@
         <w:pStyle w:val="Compact"/>
         <w:numPr>
           <w:ilvl w:val="0"/>
-          <w:numId w:val="1431"/>
+          <w:numId w:val="1432"/>
         </w:numPr>
       </w:pPr>
       <w:r>
@@ -11121,7 +11217,7 @@
         <w:pStyle w:val="Compact"/>
         <w:numPr>
           <w:ilvl w:val="0"/>
-          <w:numId w:val="1432"/>
+          <w:numId w:val="1433"/>
         </w:numPr>
       </w:pPr>
       <w:r>
@@ -11133,7 +11229,7 @@
         <w:pStyle w:val="Compact"/>
         <w:numPr>
           <w:ilvl w:val="0"/>
-          <w:numId w:val="1433"/>
+          <w:numId w:val="1434"/>
         </w:numPr>
       </w:pPr>
       <w:r>
@@ -11145,7 +11241,7 @@
         <w:pStyle w:val="Compact"/>
         <w:numPr>
           <w:ilvl w:val="0"/>
-          <w:numId w:val="1434"/>
+          <w:numId w:val="1435"/>
         </w:numPr>